<commit_message>
Sincroniza com a produção — Fase 1 de detalhamento do cronograma (tarefas dentro de um marco)
Co-Authored-By: Claude Sonnet 5 <noreply@anthropic.com>
</commit_message>
<xml_diff>
--- a/Manual de Uso - Ferramenta de Gestao de Projetos.docx
+++ b/Manual de Uso - Ferramenta de Gestao de Projetos.docx
@@ -229,7 +229,7 @@
         <w:rPr>
           <w:noProof/>
         </w:rPr>
-        <w:instrText xml:space="preserve"> PAGEREF _Toc240049576 \h </w:instrText>
+        <w:instrText xml:space="preserve"> PAGEREF _Toc240271765 \h </w:instrText>
       </w:r>
       <w:r>
         <w:rPr>
@@ -290,7 +290,7 @@
         <w:rPr>
           <w:noProof/>
         </w:rPr>
-        <w:instrText xml:space="preserve"> PAGEREF _Toc240049577 \h </w:instrText>
+        <w:instrText xml:space="preserve"> PAGEREF _Toc240271766 \h </w:instrText>
       </w:r>
       <w:r>
         <w:rPr>
@@ -351,7 +351,7 @@
         <w:rPr>
           <w:noProof/>
         </w:rPr>
-        <w:instrText xml:space="preserve"> PAGEREF _Toc240049578 \h </w:instrText>
+        <w:instrText xml:space="preserve"> PAGEREF _Toc240271767 \h </w:instrText>
       </w:r>
       <w:r>
         <w:rPr>
@@ -412,7 +412,7 @@
         <w:rPr>
           <w:noProof/>
         </w:rPr>
-        <w:instrText xml:space="preserve"> PAGEREF _Toc240049579 \h </w:instrText>
+        <w:instrText xml:space="preserve"> PAGEREF _Toc240271768 \h </w:instrText>
       </w:r>
       <w:r>
         <w:rPr>
@@ -473,7 +473,7 @@
         <w:rPr>
           <w:noProof/>
         </w:rPr>
-        <w:instrText xml:space="preserve"> PAGEREF _Toc240049580 \h </w:instrText>
+        <w:instrText xml:space="preserve"> PAGEREF _Toc240271769 \h </w:instrText>
       </w:r>
       <w:r>
         <w:rPr>
@@ -534,7 +534,7 @@
         <w:rPr>
           <w:noProof/>
         </w:rPr>
-        <w:instrText xml:space="preserve"> PAGEREF _Toc240049581 \h </w:instrText>
+        <w:instrText xml:space="preserve"> PAGEREF _Toc240271770 \h </w:instrText>
       </w:r>
       <w:r>
         <w:rPr>
@@ -595,7 +595,7 @@
         <w:rPr>
           <w:noProof/>
         </w:rPr>
-        <w:instrText xml:space="preserve"> PAGEREF _Toc240049582 \h </w:instrText>
+        <w:instrText xml:space="preserve"> PAGEREF _Toc240271771 \h </w:instrText>
       </w:r>
       <w:r>
         <w:rPr>
@@ -656,7 +656,7 @@
         <w:rPr>
           <w:noProof/>
         </w:rPr>
-        <w:instrText xml:space="preserve"> PAGEREF _Toc240049583 \h </w:instrText>
+        <w:instrText xml:space="preserve"> PAGEREF _Toc240271772 \h </w:instrText>
       </w:r>
       <w:r>
         <w:rPr>
@@ -717,7 +717,7 @@
         <w:rPr>
           <w:noProof/>
         </w:rPr>
-        <w:instrText xml:space="preserve"> PAGEREF _Toc240049584 \h </w:instrText>
+        <w:instrText xml:space="preserve"> PAGEREF _Toc240271773 \h </w:instrText>
       </w:r>
       <w:r>
         <w:rPr>
@@ -778,7 +778,7 @@
         <w:rPr>
           <w:noProof/>
         </w:rPr>
-        <w:instrText xml:space="preserve"> PAGEREF _Toc240049585 \h </w:instrText>
+        <w:instrText xml:space="preserve"> PAGEREF _Toc240271774 \h </w:instrText>
       </w:r>
       <w:r>
         <w:rPr>
@@ -839,7 +839,7 @@
         <w:rPr>
           <w:noProof/>
         </w:rPr>
-        <w:instrText xml:space="preserve"> PAGEREF _Toc240049586 \h </w:instrText>
+        <w:instrText xml:space="preserve"> PAGEREF _Toc240271775 \h </w:instrText>
       </w:r>
       <w:r>
         <w:rPr>
@@ -900,7 +900,7 @@
         <w:rPr>
           <w:noProof/>
         </w:rPr>
-        <w:instrText xml:space="preserve"> PAGEREF _Toc240049587 \h </w:instrText>
+        <w:instrText xml:space="preserve"> PAGEREF _Toc240271776 \h </w:instrText>
       </w:r>
       <w:r>
         <w:rPr>
@@ -961,7 +961,7 @@
         <w:rPr>
           <w:noProof/>
         </w:rPr>
-        <w:instrText xml:space="preserve"> PAGEREF _Toc240049588 \h </w:instrText>
+        <w:instrText xml:space="preserve"> PAGEREF _Toc240271777 \h </w:instrText>
       </w:r>
       <w:r>
         <w:rPr>
@@ -1022,7 +1022,7 @@
         <w:rPr>
           <w:noProof/>
         </w:rPr>
-        <w:instrText xml:space="preserve"> PAGEREF _Toc240049589 \h </w:instrText>
+        <w:instrText xml:space="preserve"> PAGEREF _Toc240271778 \h </w:instrText>
       </w:r>
       <w:r>
         <w:rPr>
@@ -1083,7 +1083,7 @@
         <w:rPr>
           <w:noProof/>
         </w:rPr>
-        <w:instrText xml:space="preserve"> PAGEREF _Toc240049590 \h </w:instrText>
+        <w:instrText xml:space="preserve"> PAGEREF _Toc240271779 \h </w:instrText>
       </w:r>
       <w:r>
         <w:rPr>
@@ -1144,7 +1144,7 @@
         <w:rPr>
           <w:noProof/>
         </w:rPr>
-        <w:instrText xml:space="preserve"> PAGEREF _Toc240049591 \h </w:instrText>
+        <w:instrText xml:space="preserve"> PAGEREF _Toc240271780 \h </w:instrText>
       </w:r>
       <w:r>
         <w:rPr>
@@ -1205,7 +1205,7 @@
         <w:rPr>
           <w:noProof/>
         </w:rPr>
-        <w:instrText xml:space="preserve"> PAGEREF _Toc240049592 \h </w:instrText>
+        <w:instrText xml:space="preserve"> PAGEREF _Toc240271781 \h </w:instrText>
       </w:r>
       <w:r>
         <w:rPr>
@@ -1266,7 +1266,7 @@
         <w:rPr>
           <w:noProof/>
         </w:rPr>
-        <w:instrText xml:space="preserve"> PAGEREF _Toc240049593 \h </w:instrText>
+        <w:instrText xml:space="preserve"> PAGEREF _Toc240271782 \h </w:instrText>
       </w:r>
       <w:r>
         <w:rPr>
@@ -1327,7 +1327,7 @@
         <w:rPr>
           <w:noProof/>
         </w:rPr>
-        <w:instrText xml:space="preserve"> PAGEREF _Toc240049594 \h </w:instrText>
+        <w:instrText xml:space="preserve"> PAGEREF _Toc240271783 \h </w:instrText>
       </w:r>
       <w:r>
         <w:rPr>
@@ -1388,7 +1388,7 @@
         <w:rPr>
           <w:noProof/>
         </w:rPr>
-        <w:instrText xml:space="preserve"> PAGEREF _Toc240049595 \h </w:instrText>
+        <w:instrText xml:space="preserve"> PAGEREF _Toc240271784 \h </w:instrText>
       </w:r>
       <w:r>
         <w:rPr>
@@ -1449,7 +1449,7 @@
         <w:rPr>
           <w:noProof/>
         </w:rPr>
-        <w:instrText xml:space="preserve"> PAGEREF _Toc240049596 \h </w:instrText>
+        <w:instrText xml:space="preserve"> PAGEREF _Toc240271785 \h </w:instrText>
       </w:r>
       <w:r>
         <w:rPr>
@@ -1510,7 +1510,7 @@
         <w:rPr>
           <w:noProof/>
         </w:rPr>
-        <w:instrText xml:space="preserve"> PAGEREF _Toc240049597 \h </w:instrText>
+        <w:instrText xml:space="preserve"> PAGEREF _Toc240271786 \h </w:instrText>
       </w:r>
       <w:r>
         <w:rPr>
@@ -1571,7 +1571,7 @@
         <w:rPr>
           <w:noProof/>
         </w:rPr>
-        <w:instrText xml:space="preserve"> PAGEREF _Toc240049598 \h </w:instrText>
+        <w:instrText xml:space="preserve"> PAGEREF _Toc240271787 \h </w:instrText>
       </w:r>
       <w:r>
         <w:rPr>
@@ -1632,7 +1632,7 @@
         <w:rPr>
           <w:noProof/>
         </w:rPr>
-        <w:instrText xml:space="preserve"> PAGEREF _Toc240049599 \h </w:instrText>
+        <w:instrText xml:space="preserve"> PAGEREF _Toc240271788 \h </w:instrText>
       </w:r>
       <w:r>
         <w:rPr>
@@ -1693,7 +1693,7 @@
         <w:rPr>
           <w:noProof/>
         </w:rPr>
-        <w:instrText xml:space="preserve"> PAGEREF _Toc240049600 \h </w:instrText>
+        <w:instrText xml:space="preserve"> PAGEREF _Toc240271789 \h </w:instrText>
       </w:r>
       <w:r>
         <w:rPr>
@@ -1755,7 +1755,7 @@
         <w:rPr>
           <w:noProof/>
         </w:rPr>
-        <w:instrText xml:space="preserve"> PAGEREF _Toc240049601 \h </w:instrText>
+        <w:instrText xml:space="preserve"> PAGEREF _Toc240271790 \h </w:instrText>
       </w:r>
       <w:r>
         <w:rPr>
@@ -1816,7 +1816,7 @@
         <w:rPr>
           <w:noProof/>
         </w:rPr>
-        <w:instrText xml:space="preserve"> PAGEREF _Toc240049602 \h </w:instrText>
+        <w:instrText xml:space="preserve"> PAGEREF _Toc240271791 \h </w:instrText>
       </w:r>
       <w:r>
         <w:rPr>
@@ -1877,7 +1877,7 @@
         <w:rPr>
           <w:noProof/>
         </w:rPr>
-        <w:instrText xml:space="preserve"> PAGEREF _Toc240049603 \h </w:instrText>
+        <w:instrText xml:space="preserve"> PAGEREF _Toc240271792 \h </w:instrText>
       </w:r>
       <w:r>
         <w:rPr>
@@ -1938,7 +1938,7 @@
         <w:rPr>
           <w:noProof/>
         </w:rPr>
-        <w:instrText xml:space="preserve"> PAGEREF _Toc240049604 \h </w:instrText>
+        <w:instrText xml:space="preserve"> PAGEREF _Toc240271793 \h </w:instrText>
       </w:r>
       <w:r>
         <w:rPr>
@@ -1999,7 +1999,7 @@
         <w:rPr>
           <w:noProof/>
         </w:rPr>
-        <w:instrText xml:space="preserve"> PAGEREF _Toc240049605 \h </w:instrText>
+        <w:instrText xml:space="preserve"> PAGEREF _Toc240271794 \h </w:instrText>
       </w:r>
       <w:r>
         <w:rPr>
@@ -2060,7 +2060,7 @@
         <w:rPr>
           <w:noProof/>
         </w:rPr>
-        <w:instrText xml:space="preserve"> PAGEREF _Toc240049606 \h </w:instrText>
+        <w:instrText xml:space="preserve"> PAGEREF _Toc240271795 \h </w:instrText>
       </w:r>
       <w:r>
         <w:rPr>
@@ -2121,7 +2121,7 @@
         <w:rPr>
           <w:noProof/>
         </w:rPr>
-        <w:instrText xml:space="preserve"> PAGEREF _Toc240049607 \h </w:instrText>
+        <w:instrText xml:space="preserve"> PAGEREF _Toc240271796 \h </w:instrText>
       </w:r>
       <w:r>
         <w:rPr>
@@ -2182,7 +2182,7 @@
         <w:rPr>
           <w:noProof/>
         </w:rPr>
-        <w:instrText xml:space="preserve"> PAGEREF _Toc240049608 \h </w:instrText>
+        <w:instrText xml:space="preserve"> PAGEREF _Toc240271797 \h </w:instrText>
       </w:r>
       <w:r>
         <w:rPr>
@@ -2243,7 +2243,7 @@
         <w:rPr>
           <w:noProof/>
         </w:rPr>
-        <w:instrText xml:space="preserve"> PAGEREF _Toc240049609 \h </w:instrText>
+        <w:instrText xml:space="preserve"> PAGEREF _Toc240271798 \h </w:instrText>
       </w:r>
       <w:r>
         <w:rPr>
@@ -2304,7 +2304,7 @@
         <w:rPr>
           <w:noProof/>
         </w:rPr>
-        <w:instrText xml:space="preserve"> PAGEREF _Toc240049610 \h </w:instrText>
+        <w:instrText xml:space="preserve"> PAGEREF _Toc240271799 \h </w:instrText>
       </w:r>
       <w:r>
         <w:rPr>
@@ -2365,7 +2365,7 @@
         <w:rPr>
           <w:noProof/>
         </w:rPr>
-        <w:instrText xml:space="preserve"> PAGEREF _Toc240049611 \h </w:instrText>
+        <w:instrText xml:space="preserve"> PAGEREF _Toc240271800 \h </w:instrText>
       </w:r>
       <w:r>
         <w:rPr>
@@ -2426,7 +2426,7 @@
         <w:rPr>
           <w:noProof/>
         </w:rPr>
-        <w:instrText xml:space="preserve"> PAGEREF _Toc240049612 \h </w:instrText>
+        <w:instrText xml:space="preserve"> PAGEREF _Toc240271801 \h </w:instrText>
       </w:r>
       <w:r>
         <w:rPr>
@@ -2487,7 +2487,7 @@
         <w:rPr>
           <w:noProof/>
         </w:rPr>
-        <w:instrText xml:space="preserve"> PAGEREF _Toc240049613 \h </w:instrText>
+        <w:instrText xml:space="preserve"> PAGEREF _Toc240271802 \h </w:instrText>
       </w:r>
       <w:r>
         <w:rPr>
@@ -2548,7 +2548,7 @@
         <w:rPr>
           <w:noProof/>
         </w:rPr>
-        <w:instrText xml:space="preserve"> PAGEREF _Toc240049614 \h </w:instrText>
+        <w:instrText xml:space="preserve"> PAGEREF _Toc240271803 \h </w:instrText>
       </w:r>
       <w:r>
         <w:rPr>
@@ -2609,7 +2609,7 @@
         <w:rPr>
           <w:noProof/>
         </w:rPr>
-        <w:instrText xml:space="preserve"> PAGEREF _Toc240049615 \h </w:instrText>
+        <w:instrText xml:space="preserve"> PAGEREF _Toc240271804 \h </w:instrText>
       </w:r>
       <w:r>
         <w:rPr>
@@ -2670,7 +2670,7 @@
         <w:rPr>
           <w:noProof/>
         </w:rPr>
-        <w:instrText xml:space="preserve"> PAGEREF _Toc240049616 \h </w:instrText>
+        <w:instrText xml:space="preserve"> PAGEREF _Toc240271805 \h </w:instrText>
       </w:r>
       <w:r>
         <w:rPr>
@@ -2731,7 +2731,7 @@
         <w:rPr>
           <w:noProof/>
         </w:rPr>
-        <w:instrText xml:space="preserve"> PAGEREF _Toc240049617 \h </w:instrText>
+        <w:instrText xml:space="preserve"> PAGEREF _Toc240271806 \h </w:instrText>
       </w:r>
       <w:r>
         <w:rPr>
@@ -2792,7 +2792,7 @@
         <w:rPr>
           <w:noProof/>
         </w:rPr>
-        <w:instrText xml:space="preserve"> PAGEREF _Toc240049618 \h </w:instrText>
+        <w:instrText xml:space="preserve"> PAGEREF _Toc240271807 \h </w:instrText>
       </w:r>
       <w:r>
         <w:rPr>
@@ -2853,7 +2853,7 @@
         <w:rPr>
           <w:noProof/>
         </w:rPr>
-        <w:instrText xml:space="preserve"> PAGEREF _Toc240049619 \h </w:instrText>
+        <w:instrText xml:space="preserve"> PAGEREF _Toc240271808 \h </w:instrText>
       </w:r>
       <w:r>
         <w:rPr>
@@ -2914,7 +2914,7 @@
         <w:rPr>
           <w:noProof/>
         </w:rPr>
-        <w:instrText xml:space="preserve"> PAGEREF _Toc240049620 \h </w:instrText>
+        <w:instrText xml:space="preserve"> PAGEREF _Toc240271809 \h </w:instrText>
       </w:r>
       <w:r>
         <w:rPr>
@@ -2975,7 +2975,7 @@
         <w:rPr>
           <w:noProof/>
         </w:rPr>
-        <w:instrText xml:space="preserve"> PAGEREF _Toc240049621 \h </w:instrText>
+        <w:instrText xml:space="preserve"> PAGEREF _Toc240271810 \h </w:instrText>
       </w:r>
       <w:r>
         <w:rPr>
@@ -3036,7 +3036,7 @@
         <w:rPr>
           <w:noProof/>
         </w:rPr>
-        <w:instrText xml:space="preserve"> PAGEREF _Toc240049622 \h </w:instrText>
+        <w:instrText xml:space="preserve"> PAGEREF _Toc240271811 \h </w:instrText>
       </w:r>
       <w:r>
         <w:rPr>
@@ -3097,7 +3097,7 @@
         <w:rPr>
           <w:noProof/>
         </w:rPr>
-        <w:instrText xml:space="preserve"> PAGEREF _Toc240049623 \h </w:instrText>
+        <w:instrText xml:space="preserve"> PAGEREF _Toc240271812 \h </w:instrText>
       </w:r>
       <w:r>
         <w:rPr>
@@ -3173,7 +3173,7 @@
           <w:sz w:val="34"/>
         </w:rPr>
       </w:pPr>
-      <w:bookmarkStart w:id="0" w:name="_Toc240049576"/>
+      <w:bookmarkStart w:id="0" w:name="_Toc240271765"/>
       <w:r>
         <w:rPr>
           <w:rFonts w:ascii="Montserrat" w:hAnsi="Montserrat"/>
@@ -3197,7 +3197,7 @@
           <w:sz w:val="27"/>
         </w:rPr>
       </w:pPr>
-      <w:bookmarkStart w:id="1" w:name="_Toc240049577"/>
+      <w:bookmarkStart w:id="1" w:name="_Toc240271766"/>
       <w:r>
         <w:rPr>
           <w:rFonts w:ascii="Montserrat" w:hAnsi="Montserrat"/>
@@ -4521,6 +4521,24 @@
           <w:color w:val="1A1A1A"/>
           <w:sz w:val="22"/>
         </w:rPr>
+        <w:t>Esta e a versao 2.65 do manual. Em relacao a versao 2.64 (11/09/2026), a tabela de Cronograma do Planejamento (Passo 4, aba 3) ganhou a Fase 1 de uma nova proposta de melhoria: um marco pode, opcionalmente, ganhar uma lista de tarefas internas (nome e concluida), aberta pelo botao + Tarefas na ultima coluna, sem data ou responsavel proprios - quem tem isso e o marco. O botao mostra quantas ja foram concluidas (ex.: Tarefas (2/3)) e fica com contorno laranja enquanto houver pendencia. Nao aparece no espelho do TAP nem no Relatorio de Situacao ainda - fica so na tabela de edicao do Planejamento por enquanto.</w:t>
+      </w:r>
+    </w:p>
+    <w:p>
+      <w:pPr>
+        <w:spacing w:line="280" w:lineRule="auto"/>
+        <w:rPr>
+          <w:rFonts w:ascii="Montserrat" w:hAnsi="Montserrat"/>
+          <w:color w:val="1A1A1A"/>
+          <w:sz w:val="22"/>
+        </w:rPr>
+      </w:pPr>
+      <w:r>
+        <w:rPr>
+          <w:rFonts w:ascii="Montserrat" w:hAnsi="Montserrat"/>
+          <w:color w:val="1A1A1A"/>
+          <w:sz w:val="22"/>
+        </w:rPr>
         <w:t>O manual nao substitui as Diretrizes para a Gestao de Projetos da UNIALFA (documento institucional que define o framework D01 a D07) nem o documento Regras de Acesso e Permissoes (que detalha cada regra de controle de acesso); ele e o guia operacional de como usar cada ferramenta na pratica.</w:t>
       </w:r>
     </w:p>
@@ -4535,7 +4553,7 @@
           <w:sz w:val="27"/>
         </w:rPr>
       </w:pPr>
-      <w:bookmarkStart w:id="2" w:name="_Toc240049578"/>
+      <w:bookmarkStart w:id="2" w:name="_Toc240271767"/>
       <w:r>
         <w:rPr>
           <w:rFonts w:ascii="Montserrat" w:hAnsi="Montserrat"/>
@@ -4732,16 +4750,16 @@
         </w:rPr>
         <w:lastRenderedPageBreak/>
         <w:drawing>
-          <wp:inline distT="0" distB="0" distL="0" distR="0" wp14:anchorId="19E6564F" wp14:editId="391E2C86">
+          <wp:inline distT="0" distB="0" distL="0" distR="0" wp14:anchorId="3B0B53B8" wp14:editId="0F770723">
             <wp:extent cx="5303520" cy="4792851"/>
             <wp:effectExtent l="19050" t="19050" r="11430" b="27305"/>
-            <wp:docPr id="1254256258" name="Imagem 1"/>
+            <wp:docPr id="864351137" name="Imagem 1"/>
             <wp:cNvGraphicFramePr/>
             <a:graphic xmlns:a="http://schemas.openxmlformats.org/drawingml/2006/main">
               <a:graphicData uri="http://schemas.openxmlformats.org/drawingml/2006/picture">
                 <pic:pic xmlns:pic="http://schemas.openxmlformats.org/drawingml/2006/picture">
                   <pic:nvPicPr>
-                    <pic:cNvPr id="1254256258" name=""/>
+                    <pic:cNvPr id="864351137" name=""/>
                     <pic:cNvPicPr/>
                   </pic:nvPicPr>
                   <pic:blipFill>
@@ -4809,7 +4827,7 @@
           <w:sz w:val="27"/>
         </w:rPr>
       </w:pPr>
-      <w:bookmarkStart w:id="3" w:name="_Toc240049579"/>
+      <w:bookmarkStart w:id="3" w:name="_Toc240271768"/>
       <w:r>
         <w:rPr>
           <w:rFonts w:ascii="Montserrat" w:hAnsi="Montserrat"/>
@@ -4850,16 +4868,16 @@
         </w:rPr>
         <w:lastRenderedPageBreak/>
         <w:drawing>
-          <wp:inline distT="0" distB="0" distL="0" distR="0" wp14:anchorId="6CFE27B6" wp14:editId="12B890C7">
+          <wp:inline distT="0" distB="0" distL="0" distR="0" wp14:anchorId="6D3C2800" wp14:editId="25CA602B">
             <wp:extent cx="4206240" cy="3801227"/>
             <wp:effectExtent l="19050" t="19050" r="22860" b="27940"/>
-            <wp:docPr id="696900203" name="Imagem 2"/>
+            <wp:docPr id="2022227929" name="Imagem 2"/>
             <wp:cNvGraphicFramePr/>
             <a:graphic xmlns:a="http://schemas.openxmlformats.org/drawingml/2006/main">
               <a:graphicData uri="http://schemas.openxmlformats.org/drawingml/2006/picture">
                 <pic:pic xmlns:pic="http://schemas.openxmlformats.org/drawingml/2006/picture">
                   <pic:nvPicPr>
-                    <pic:cNvPr id="696900203" name=""/>
+                    <pic:cNvPr id="2022227929" name=""/>
                     <pic:cNvPicPr/>
                   </pic:nvPicPr>
                   <pic:blipFill>
@@ -5032,7 +5050,7 @@
           <w:sz w:val="27"/>
         </w:rPr>
       </w:pPr>
-      <w:bookmarkStart w:id="4" w:name="_Toc240049580"/>
+      <w:bookmarkStart w:id="4" w:name="_Toc240271769"/>
       <w:r>
         <w:rPr>
           <w:rFonts w:ascii="Montserrat" w:hAnsi="Montserrat"/>
@@ -6271,7 +6289,7 @@
           <w:sz w:val="34"/>
         </w:rPr>
       </w:pPr>
-      <w:bookmarkStart w:id="5" w:name="_Toc240049581"/>
+      <w:bookmarkStart w:id="5" w:name="_Toc240271770"/>
       <w:r>
         <w:rPr>
           <w:rFonts w:ascii="Montserrat" w:hAnsi="Montserrat"/>
@@ -6295,7 +6313,7 @@
           <w:sz w:val="27"/>
         </w:rPr>
       </w:pPr>
-      <w:bookmarkStart w:id="6" w:name="_Toc240049582"/>
+      <w:bookmarkStart w:id="6" w:name="_Toc240271771"/>
       <w:r>
         <w:rPr>
           <w:rFonts w:ascii="Montserrat" w:hAnsi="Montserrat"/>
@@ -6336,7 +6354,7 @@
           <w:sz w:val="27"/>
         </w:rPr>
       </w:pPr>
-      <w:bookmarkStart w:id="7" w:name="_Toc240049583"/>
+      <w:bookmarkStart w:id="7" w:name="_Toc240271772"/>
       <w:r>
         <w:rPr>
           <w:rFonts w:ascii="Montserrat" w:hAnsi="Montserrat"/>
@@ -6455,7 +6473,7 @@
           <w:sz w:val="27"/>
         </w:rPr>
       </w:pPr>
-      <w:bookmarkStart w:id="8" w:name="_Toc240049584"/>
+      <w:bookmarkStart w:id="8" w:name="_Toc240271773"/>
       <w:r>
         <w:rPr>
           <w:rFonts w:ascii="Montserrat" w:hAnsi="Montserrat"/>
@@ -7068,7 +7086,7 @@
           <w:sz w:val="27"/>
         </w:rPr>
       </w:pPr>
-      <w:bookmarkStart w:id="9" w:name="_Toc240049585"/>
+      <w:bookmarkStart w:id="9" w:name="_Toc240271774"/>
       <w:r>
         <w:rPr>
           <w:rFonts w:ascii="Montserrat" w:hAnsi="Montserrat"/>
@@ -7157,16 +7175,16 @@
         </w:rPr>
         <w:lastRenderedPageBreak/>
         <w:drawing>
-          <wp:inline distT="0" distB="0" distL="0" distR="0" wp14:anchorId="04668F84" wp14:editId="04DF6A51">
+          <wp:inline distT="0" distB="0" distL="0" distR="0" wp14:anchorId="39703DBE" wp14:editId="1FEC73FF">
             <wp:extent cx="4937760" cy="4462310"/>
             <wp:effectExtent l="19050" t="19050" r="15240" b="14605"/>
-            <wp:docPr id="231505247" name="Imagem 3"/>
+            <wp:docPr id="756738982" name="Imagem 3"/>
             <wp:cNvGraphicFramePr/>
             <a:graphic xmlns:a="http://schemas.openxmlformats.org/drawingml/2006/main">
               <a:graphicData uri="http://schemas.openxmlformats.org/drawingml/2006/picture">
                 <pic:pic xmlns:pic="http://schemas.openxmlformats.org/drawingml/2006/picture">
                   <pic:nvPicPr>
-                    <pic:cNvPr id="231505247" name=""/>
+                    <pic:cNvPr id="756738982" name=""/>
                     <pic:cNvPicPr/>
                   </pic:nvPicPr>
                   <pic:blipFill>
@@ -7234,7 +7252,7 @@
           <w:sz w:val="27"/>
         </w:rPr>
       </w:pPr>
-      <w:bookmarkStart w:id="10" w:name="_Toc240049586"/>
+      <w:bookmarkStart w:id="10" w:name="_Toc240271775"/>
       <w:r>
         <w:rPr>
           <w:rFonts w:ascii="Montserrat" w:hAnsi="Montserrat"/>
@@ -7275,16 +7293,16 @@
         </w:rPr>
         <w:lastRenderedPageBreak/>
         <w:drawing>
-          <wp:inline distT="0" distB="0" distL="0" distR="0" wp14:anchorId="3329968F" wp14:editId="5CC8D8E9">
+          <wp:inline distT="0" distB="0" distL="0" distR="0" wp14:anchorId="6AB92ABC" wp14:editId="502D82B9">
             <wp:extent cx="5120640" cy="4627581"/>
             <wp:effectExtent l="19050" t="19050" r="22860" b="20955"/>
-            <wp:docPr id="1217221689" name="Imagem 4"/>
+            <wp:docPr id="2038557052" name="Imagem 4"/>
             <wp:cNvGraphicFramePr/>
             <a:graphic xmlns:a="http://schemas.openxmlformats.org/drawingml/2006/main">
               <a:graphicData uri="http://schemas.openxmlformats.org/drawingml/2006/picture">
                 <pic:pic xmlns:pic="http://schemas.openxmlformats.org/drawingml/2006/picture">
                   <pic:nvPicPr>
-                    <pic:cNvPr id="1217221689" name=""/>
+                    <pic:cNvPr id="2038557052" name=""/>
                     <pic:cNvPicPr/>
                   </pic:nvPicPr>
                   <pic:blipFill>
@@ -7452,7 +7470,7 @@
           <w:sz w:val="27"/>
         </w:rPr>
       </w:pPr>
-      <w:bookmarkStart w:id="11" w:name="_Toc240049587"/>
+      <w:bookmarkStart w:id="11" w:name="_Toc240271776"/>
       <w:r>
         <w:rPr>
           <w:rFonts w:ascii="Montserrat" w:hAnsi="Montserrat"/>
@@ -7492,16 +7510,16 @@
           <w:noProof/>
         </w:rPr>
         <w:drawing>
-          <wp:inline distT="0" distB="0" distL="0" distR="0" wp14:anchorId="229690E0" wp14:editId="742A3823">
+          <wp:inline distT="0" distB="0" distL="0" distR="0" wp14:anchorId="007DEB53" wp14:editId="5EBA2280">
             <wp:extent cx="4206240" cy="3801227"/>
             <wp:effectExtent l="19050" t="19050" r="22860" b="27940"/>
-            <wp:docPr id="2002121552" name="Imagem 5"/>
+            <wp:docPr id="300753498" name="Imagem 5"/>
             <wp:cNvGraphicFramePr/>
             <a:graphic xmlns:a="http://schemas.openxmlformats.org/drawingml/2006/main">
               <a:graphicData uri="http://schemas.openxmlformats.org/drawingml/2006/picture">
                 <pic:pic xmlns:pic="http://schemas.openxmlformats.org/drawingml/2006/picture">
                   <pic:nvPicPr>
-                    <pic:cNvPr id="2002121552" name=""/>
+                    <pic:cNvPr id="300753498" name=""/>
                     <pic:cNvPicPr/>
                   </pic:nvPicPr>
                   <pic:blipFill>
@@ -7569,16 +7587,16 @@
         </w:rPr>
         <w:lastRenderedPageBreak/>
         <w:drawing>
-          <wp:inline distT="0" distB="0" distL="0" distR="0" wp14:anchorId="04F85BE2" wp14:editId="319D21E6">
+          <wp:inline distT="0" distB="0" distL="0" distR="0" wp14:anchorId="7484DF33" wp14:editId="0134B96C">
             <wp:extent cx="4206240" cy="3801227"/>
             <wp:effectExtent l="19050" t="19050" r="22860" b="27940"/>
-            <wp:docPr id="1201220968" name="Imagem 6"/>
+            <wp:docPr id="2003091386" name="Imagem 6"/>
             <wp:cNvGraphicFramePr/>
             <a:graphic xmlns:a="http://schemas.openxmlformats.org/drawingml/2006/main">
               <a:graphicData uri="http://schemas.openxmlformats.org/drawingml/2006/picture">
                 <pic:pic xmlns:pic="http://schemas.openxmlformats.org/drawingml/2006/picture">
                   <pic:nvPicPr>
-                    <pic:cNvPr id="1201220968" name=""/>
+                    <pic:cNvPr id="2003091386" name=""/>
                     <pic:cNvPicPr/>
                   </pic:nvPicPr>
                   <pic:blipFill>
@@ -7694,7 +7712,7 @@
           <w:sz w:val="27"/>
         </w:rPr>
       </w:pPr>
-      <w:bookmarkStart w:id="12" w:name="_Toc240049588"/>
+      <w:bookmarkStart w:id="12" w:name="_Toc240271777"/>
       <w:r>
         <w:rPr>
           <w:rFonts w:ascii="Montserrat" w:hAnsi="Montserrat"/>
@@ -7762,7 +7780,7 @@
           <w:sz w:val="27"/>
         </w:rPr>
       </w:pPr>
-      <w:bookmarkStart w:id="13" w:name="_Toc240049589"/>
+      <w:bookmarkStart w:id="13" w:name="_Toc240271778"/>
       <w:r>
         <w:rPr>
           <w:rFonts w:ascii="Montserrat" w:hAnsi="Montserrat"/>
@@ -7989,7 +8007,7 @@
           <w:sz w:val="27"/>
         </w:rPr>
       </w:pPr>
-      <w:bookmarkStart w:id="14" w:name="_Toc240049590"/>
+      <w:bookmarkStart w:id="14" w:name="_Toc240271779"/>
       <w:r>
         <w:rPr>
           <w:rFonts w:ascii="Montserrat" w:hAnsi="Montserrat"/>
@@ -8148,7 +8166,7 @@
           <w:sz w:val="27"/>
         </w:rPr>
       </w:pPr>
-      <w:bookmarkStart w:id="15" w:name="_Toc240049591"/>
+      <w:bookmarkStart w:id="15" w:name="_Toc240271780"/>
       <w:r>
         <w:rPr>
           <w:rFonts w:ascii="Montserrat" w:hAnsi="Montserrat"/>
@@ -8340,7 +8358,7 @@
           <w:sz w:val="27"/>
         </w:rPr>
       </w:pPr>
-      <w:bookmarkStart w:id="16" w:name="_Toc240049592"/>
+      <w:bookmarkStart w:id="16" w:name="_Toc240271781"/>
       <w:r>
         <w:rPr>
           <w:rFonts w:ascii="Montserrat" w:hAnsi="Montserrat"/>
@@ -8468,7 +8486,7 @@
           <w:sz w:val="27"/>
         </w:rPr>
       </w:pPr>
-      <w:bookmarkStart w:id="17" w:name="_Toc240049593"/>
+      <w:bookmarkStart w:id="17" w:name="_Toc240271782"/>
       <w:r>
         <w:rPr>
           <w:rFonts w:ascii="Montserrat" w:hAnsi="Montserrat"/>
@@ -8798,7 +8816,7 @@
           <w:sz w:val="27"/>
         </w:rPr>
       </w:pPr>
-      <w:bookmarkStart w:id="18" w:name="_Toc240049594"/>
+      <w:bookmarkStart w:id="18" w:name="_Toc240271783"/>
       <w:r>
         <w:rPr>
           <w:rFonts w:ascii="Montserrat" w:hAnsi="Montserrat"/>
@@ -8939,7 +8957,7 @@
           <w:sz w:val="34"/>
         </w:rPr>
       </w:pPr>
-      <w:bookmarkStart w:id="19" w:name="_Toc240049595"/>
+      <w:bookmarkStart w:id="19" w:name="_Toc240271784"/>
       <w:r>
         <w:rPr>
           <w:rFonts w:ascii="Montserrat" w:hAnsi="Montserrat"/>
@@ -8981,7 +8999,7 @@
           <w:sz w:val="27"/>
         </w:rPr>
       </w:pPr>
-      <w:bookmarkStart w:id="20" w:name="_Toc240049596"/>
+      <w:bookmarkStart w:id="20" w:name="_Toc240271785"/>
       <w:r>
         <w:rPr>
           <w:rFonts w:ascii="Montserrat" w:hAnsi="Montserrat"/>
@@ -10061,16 +10079,16 @@
         </w:rPr>
         <w:lastRenderedPageBreak/>
         <w:drawing>
-          <wp:inline distT="0" distB="0" distL="0" distR="0" wp14:anchorId="3533AE5D" wp14:editId="20FC7D56">
+          <wp:inline distT="0" distB="0" distL="0" distR="0" wp14:anchorId="04119F65" wp14:editId="67D3CB11">
             <wp:extent cx="5120640" cy="4627581"/>
             <wp:effectExtent l="19050" t="19050" r="22860" b="20955"/>
-            <wp:docPr id="910579056" name="Imagem 7"/>
+            <wp:docPr id="605153851" name="Imagem 7"/>
             <wp:cNvGraphicFramePr/>
             <a:graphic xmlns:a="http://schemas.openxmlformats.org/drawingml/2006/main">
               <a:graphicData uri="http://schemas.openxmlformats.org/drawingml/2006/picture">
                 <pic:pic xmlns:pic="http://schemas.openxmlformats.org/drawingml/2006/picture">
                   <pic:nvPicPr>
-                    <pic:cNvPr id="910579056" name=""/>
+                    <pic:cNvPr id="605153851" name=""/>
                     <pic:cNvPicPr/>
                   </pic:nvPicPr>
                   <pic:blipFill>
@@ -10138,16 +10156,16 @@
         </w:rPr>
         <w:lastRenderedPageBreak/>
         <w:drawing>
-          <wp:inline distT="0" distB="0" distL="0" distR="0" wp14:anchorId="73AF95A7" wp14:editId="37F8FD6C">
+          <wp:inline distT="0" distB="0" distL="0" distR="0" wp14:anchorId="271298F2" wp14:editId="54388568">
             <wp:extent cx="5120640" cy="4627581"/>
             <wp:effectExtent l="19050" t="19050" r="22860" b="20955"/>
-            <wp:docPr id="1861804642" name="Imagem 8"/>
+            <wp:docPr id="86856867" name="Imagem 8"/>
             <wp:cNvGraphicFramePr/>
             <a:graphic xmlns:a="http://schemas.openxmlformats.org/drawingml/2006/main">
               <a:graphicData uri="http://schemas.openxmlformats.org/drawingml/2006/picture">
                 <pic:pic xmlns:pic="http://schemas.openxmlformats.org/drawingml/2006/picture">
                   <pic:nvPicPr>
-                    <pic:cNvPr id="1861804642" name=""/>
+                    <pic:cNvPr id="86856867" name=""/>
                     <pic:cNvPicPr/>
                   </pic:nvPicPr>
                   <pic:blipFill>
@@ -10355,7 +10373,7 @@
           <w:sz w:val="27"/>
         </w:rPr>
       </w:pPr>
-      <w:bookmarkStart w:id="21" w:name="_Toc240049597"/>
+      <w:bookmarkStart w:id="21" w:name="_Toc240271786"/>
       <w:r>
         <w:rPr>
           <w:rFonts w:ascii="Montserrat" w:hAnsi="Montserrat"/>
@@ -11280,16 +11298,16 @@
           <w:noProof/>
         </w:rPr>
         <w:drawing>
-          <wp:inline distT="0" distB="0" distL="0" distR="0" wp14:anchorId="786A0DF3" wp14:editId="487658D4">
+          <wp:inline distT="0" distB="0" distL="0" distR="0" wp14:anchorId="399AF928" wp14:editId="7AE18CD0">
             <wp:extent cx="5120640" cy="4627581"/>
             <wp:effectExtent l="19050" t="19050" r="22860" b="20955"/>
-            <wp:docPr id="1880454577" name="Imagem 9"/>
+            <wp:docPr id="807359041" name="Imagem 9"/>
             <wp:cNvGraphicFramePr/>
             <a:graphic xmlns:a="http://schemas.openxmlformats.org/drawingml/2006/main">
               <a:graphicData uri="http://schemas.openxmlformats.org/drawingml/2006/picture">
                 <pic:pic xmlns:pic="http://schemas.openxmlformats.org/drawingml/2006/picture">
                   <pic:nvPicPr>
-                    <pic:cNvPr id="1880454577" name=""/>
+                    <pic:cNvPr id="807359041" name=""/>
                     <pic:cNvPicPr/>
                   </pic:nvPicPr>
                   <pic:blipFill>
@@ -11357,16 +11375,16 @@
         </w:rPr>
         <w:lastRenderedPageBreak/>
         <w:drawing>
-          <wp:inline distT="0" distB="0" distL="0" distR="0" wp14:anchorId="414D4AB2" wp14:editId="668BBEC2">
+          <wp:inline distT="0" distB="0" distL="0" distR="0" wp14:anchorId="2A7AF876" wp14:editId="5A122644">
             <wp:extent cx="5120640" cy="4627581"/>
             <wp:effectExtent l="19050" t="19050" r="22860" b="20955"/>
-            <wp:docPr id="627935207" name="Imagem 10"/>
+            <wp:docPr id="22871508" name="Imagem 10"/>
             <wp:cNvGraphicFramePr/>
             <a:graphic xmlns:a="http://schemas.openxmlformats.org/drawingml/2006/main">
               <a:graphicData uri="http://schemas.openxmlformats.org/drawingml/2006/picture">
                 <pic:pic xmlns:pic="http://schemas.openxmlformats.org/drawingml/2006/picture">
                   <pic:nvPicPr>
-                    <pic:cNvPr id="627935207" name=""/>
+                    <pic:cNvPr id="22871508" name=""/>
                     <pic:cNvPicPr/>
                   </pic:nvPicPr>
                   <pic:blipFill>
@@ -11500,7 +11518,7 @@
           <w:sz w:val="27"/>
         </w:rPr>
       </w:pPr>
-      <w:bookmarkStart w:id="22" w:name="_Toc240049598"/>
+      <w:bookmarkStart w:id="22" w:name="_Toc240271787"/>
       <w:r>
         <w:rPr>
           <w:rFonts w:ascii="Montserrat" w:hAnsi="Montserrat"/>
@@ -12566,16 +12584,16 @@
           <w:noProof/>
         </w:rPr>
         <w:drawing>
-          <wp:inline distT="0" distB="0" distL="0" distR="0" wp14:anchorId="17A08CB6" wp14:editId="0D3F540E">
+          <wp:inline distT="0" distB="0" distL="0" distR="0" wp14:anchorId="14B52547" wp14:editId="0F339612">
             <wp:extent cx="5120640" cy="3338440"/>
             <wp:effectExtent l="19050" t="19050" r="22860" b="14605"/>
-            <wp:docPr id="1438507157" name="Imagem 11"/>
+            <wp:docPr id="1272294864" name="Imagem 11"/>
             <wp:cNvGraphicFramePr/>
             <a:graphic xmlns:a="http://schemas.openxmlformats.org/drawingml/2006/main">
               <a:graphicData uri="http://schemas.openxmlformats.org/drawingml/2006/picture">
                 <pic:pic xmlns:pic="http://schemas.openxmlformats.org/drawingml/2006/picture">
                   <pic:nvPicPr>
-                    <pic:cNvPr id="1438507157" name=""/>
+                    <pic:cNvPr id="1272294864" name=""/>
                     <pic:cNvPicPr/>
                   </pic:nvPicPr>
                   <pic:blipFill>
@@ -12643,16 +12661,16 @@
         </w:rPr>
         <w:lastRenderedPageBreak/>
         <w:drawing>
-          <wp:inline distT="0" distB="0" distL="0" distR="0" wp14:anchorId="342C782E" wp14:editId="18089B13">
+          <wp:inline distT="0" distB="0" distL="0" distR="0" wp14:anchorId="73CAAB5A" wp14:editId="4A850370">
             <wp:extent cx="5120640" cy="4627581"/>
             <wp:effectExtent l="19050" t="19050" r="22860" b="20955"/>
-            <wp:docPr id="76703547" name="Imagem 12"/>
+            <wp:docPr id="826508146" name="Imagem 12"/>
             <wp:cNvGraphicFramePr/>
             <a:graphic xmlns:a="http://schemas.openxmlformats.org/drawingml/2006/main">
               <a:graphicData uri="http://schemas.openxmlformats.org/drawingml/2006/picture">
                 <pic:pic xmlns:pic="http://schemas.openxmlformats.org/drawingml/2006/picture">
                   <pic:nvPicPr>
-                    <pic:cNvPr id="76703547" name=""/>
+                    <pic:cNvPr id="826508146" name=""/>
                     <pic:cNvPicPr/>
                   </pic:nvPicPr>
                   <pic:blipFill>
@@ -12856,7 +12874,7 @@
           <w:sz w:val="27"/>
         </w:rPr>
       </w:pPr>
-      <w:bookmarkStart w:id="23" w:name="_Toc240049599"/>
+      <w:bookmarkStart w:id="23" w:name="_Toc240271788"/>
       <w:r>
         <w:rPr>
           <w:rFonts w:ascii="Montserrat" w:hAnsi="Montserrat"/>
@@ -13417,16 +13435,16 @@
           <w:noProof/>
         </w:rPr>
         <w:drawing>
-          <wp:inline distT="0" distB="0" distL="0" distR="0" wp14:anchorId="2671C961" wp14:editId="51203AED">
+          <wp:inline distT="0" distB="0" distL="0" distR="0" wp14:anchorId="0568D60D" wp14:editId="32E0A8D7">
             <wp:extent cx="5120640" cy="4627581"/>
             <wp:effectExtent l="19050" t="19050" r="22860" b="20955"/>
-            <wp:docPr id="9227325" name="Imagem 13"/>
+            <wp:docPr id="911430367" name="Imagem 13"/>
             <wp:cNvGraphicFramePr/>
             <a:graphic xmlns:a="http://schemas.openxmlformats.org/drawingml/2006/main">
               <a:graphicData uri="http://schemas.openxmlformats.org/drawingml/2006/picture">
                 <pic:pic xmlns:pic="http://schemas.openxmlformats.org/drawingml/2006/picture">
                   <pic:nvPicPr>
-                    <pic:cNvPr id="9227325" name=""/>
+                    <pic:cNvPr id="911430367" name=""/>
                     <pic:cNvPicPr/>
                   </pic:nvPicPr>
                   <pic:blipFill>
@@ -13494,16 +13512,16 @@
         </w:rPr>
         <w:lastRenderedPageBreak/>
         <w:drawing>
-          <wp:inline distT="0" distB="0" distL="0" distR="0" wp14:anchorId="16B6468F" wp14:editId="77D11DF8">
+          <wp:inline distT="0" distB="0" distL="0" distR="0" wp14:anchorId="375CDAEC" wp14:editId="61327B31">
             <wp:extent cx="5120640" cy="4627581"/>
             <wp:effectExtent l="19050" t="19050" r="22860" b="20955"/>
-            <wp:docPr id="45022830" name="Imagem 14"/>
+            <wp:docPr id="1609640852" name="Imagem 14"/>
             <wp:cNvGraphicFramePr/>
             <a:graphic xmlns:a="http://schemas.openxmlformats.org/drawingml/2006/main">
               <a:graphicData uri="http://schemas.openxmlformats.org/drawingml/2006/picture">
                 <pic:pic xmlns:pic="http://schemas.openxmlformats.org/drawingml/2006/picture">
                   <pic:nvPicPr>
-                    <pic:cNvPr id="45022830" name=""/>
+                    <pic:cNvPr id="1609640852" name=""/>
                     <pic:cNvPicPr/>
                   </pic:nvPicPr>
                   <pic:blipFill>
@@ -13703,6 +13721,24 @@
     </w:p>
     <w:p>
       <w:pPr>
+        <w:spacing w:line="280" w:lineRule="auto"/>
+        <w:rPr>
+          <w:rFonts w:ascii="Montserrat" w:hAnsi="Montserrat"/>
+          <w:color w:val="1A1A1A"/>
+          <w:sz w:val="22"/>
+        </w:rPr>
+      </w:pPr>
+      <w:r>
+        <w:rPr>
+          <w:rFonts w:ascii="Montserrat" w:hAnsi="Montserrat"/>
+          <w:color w:val="1A1A1A"/>
+          <w:sz w:val="22"/>
+        </w:rPr>
+        <w:t>Tarefas dentro de um marco: quando um marco precisar de mais detalhe, o botao + Tarefas (ultima coluna da tabela) abre uma lista simples logo abaixo da linha - nome da tarefa e uma caixa de concluida, sem data ou responsavel proprios (quem tem isso e o marco). O botao muda para Tarefas (2/3), por exemplo, mostrando quantas ja foram concluidas, e fica com contorno laranja enquanto houver alguma pendente. E totalmente opcional - um marco sem nenhuma tarefa continua funcionando normalmente.</w:t>
+      </w:r>
+    </w:p>
+    <w:p>
+      <w:pPr>
         <w:pStyle w:val="PargrafodaLista"/>
         <w:numPr>
           <w:ilvl w:val="0"/>
@@ -13722,7 +13758,16 @@
           <w:color w:val="1A1A1A"/>
           <w:sz w:val="22"/>
         </w:rPr>
-        <w:t>Assistente de preenchimento por IA: apos selecionar o Projeto vinculado, o botao Sugerir com IA le a Solicitacao de Demanda, o TAP, o Canvas e as Atas de Reuniao do projeto e sugere o Solicitante (capa), o preenchimento da aba Pre-projeto (incluindo Macro fases, resumidas dos entregaveis/escopo do TAP), um rascunho inicial do cronograma (aba 3, quando ainda vazio) e a Introducao/Situacao atual/Proposta de mudanca/Beneficios na aba Viabilidade. O campo Negocio (capa) fica de fora, por nao ter fonte confiavel nos documentos (secao 2.12).</w:t>
+        <w:t xml:space="preserve">Assistente de preenchimento por IA: apos selecionar o Projeto vinculado, o botao Sugerir com IA le a Solicitacao de Demanda, o TAP, o Canvas e as </w:t>
+      </w:r>
+      <w:r>
+        <w:rPr>
+          <w:rFonts w:ascii="Montserrat" w:hAnsi="Montserrat"/>
+          <w:color w:val="1A1A1A"/>
+          <w:sz w:val="22"/>
+        </w:rPr>
+        <w:lastRenderedPageBreak/>
+        <w:t>Atas de Reuniao do projeto e sugere o Solicitante (capa), o preenchimento da aba Pre-projeto (incluindo Macro fases, resumidas dos entregaveis/escopo do TAP), um rascunho inicial do cronograma (aba 3, quando ainda vazio) e a Introducao/Situacao atual/Proposta de mudanca/Beneficios na aba Viabilidade. O campo Negocio (capa) fica de fora, por nao ter fonte confiavel nos documentos (secao 2.12).</w:t>
       </w:r>
     </w:p>
     <w:p>
@@ -13736,7 +13781,7 @@
           <w:sz w:val="27"/>
         </w:rPr>
       </w:pPr>
-      <w:bookmarkStart w:id="24" w:name="_Toc240049600"/>
+      <w:bookmarkStart w:id="24" w:name="_Toc240271789"/>
       <w:r>
         <w:rPr>
           <w:rFonts w:ascii="Montserrat" w:hAnsi="Montserrat"/>
@@ -13744,7 +13789,6 @@
           <w:color w:val="B91D2E"/>
           <w:sz w:val="27"/>
         </w:rPr>
-        <w:lastRenderedPageBreak/>
         <w:t>Passo 5 - EAP, Estrutura Analitica do Projeto</w:t>
       </w:r>
       <w:bookmarkEnd w:id="24"/>
@@ -13777,16 +13821,16 @@
           <w:noProof/>
         </w:rPr>
         <w:drawing>
-          <wp:inline distT="0" distB="0" distL="0" distR="0" wp14:anchorId="5345644F" wp14:editId="48F06735">
+          <wp:inline distT="0" distB="0" distL="0" distR="0" wp14:anchorId="3951FFD4" wp14:editId="53411A2C">
             <wp:extent cx="5120640" cy="4627581"/>
             <wp:effectExtent l="19050" t="19050" r="22860" b="20955"/>
-            <wp:docPr id="2098255733" name="Imagem 15"/>
+            <wp:docPr id="1385978473" name="Imagem 15"/>
             <wp:cNvGraphicFramePr/>
             <a:graphic xmlns:a="http://schemas.openxmlformats.org/drawingml/2006/main">
               <a:graphicData uri="http://schemas.openxmlformats.org/drawingml/2006/picture">
                 <pic:pic xmlns:pic="http://schemas.openxmlformats.org/drawingml/2006/picture">
                   <pic:nvPicPr>
-                    <pic:cNvPr id="2098255733" name=""/>
+                    <pic:cNvPr id="1385978473" name=""/>
                     <pic:cNvPicPr/>
                   </pic:nvPicPr>
                   <pic:blipFill>
@@ -13854,16 +13898,16 @@
         </w:rPr>
         <w:lastRenderedPageBreak/>
         <w:drawing>
-          <wp:inline distT="0" distB="0" distL="0" distR="0" wp14:anchorId="21B9AD49" wp14:editId="668E0472">
+          <wp:inline distT="0" distB="0" distL="0" distR="0" wp14:anchorId="30D75338" wp14:editId="47CE71C5">
             <wp:extent cx="5120640" cy="4627581"/>
             <wp:effectExtent l="19050" t="19050" r="22860" b="20955"/>
-            <wp:docPr id="1258856537" name="Imagem 16"/>
+            <wp:docPr id="1194232451" name="Imagem 16"/>
             <wp:cNvGraphicFramePr/>
             <a:graphic xmlns:a="http://schemas.openxmlformats.org/drawingml/2006/main">
               <a:graphicData uri="http://schemas.openxmlformats.org/drawingml/2006/picture">
                 <pic:pic xmlns:pic="http://schemas.openxmlformats.org/drawingml/2006/picture">
                   <pic:nvPicPr>
-                    <pic:cNvPr id="1258856537" name=""/>
+                    <pic:cNvPr id="1194232451" name=""/>
                     <pic:cNvPicPr/>
                   </pic:nvPicPr>
                   <pic:blipFill>
@@ -14027,16 +14071,16 @@
         </w:rPr>
         <w:lastRenderedPageBreak/>
         <w:drawing>
-          <wp:inline distT="0" distB="0" distL="0" distR="0" wp14:anchorId="6A408721" wp14:editId="7EB34F8C">
+          <wp:inline distT="0" distB="0" distL="0" distR="0" wp14:anchorId="4E4C4715" wp14:editId="5BC68E3B">
             <wp:extent cx="5120640" cy="3282818"/>
             <wp:effectExtent l="19050" t="19050" r="22860" b="13335"/>
-            <wp:docPr id="1139749955" name="Imagem 17"/>
+            <wp:docPr id="1536224730" name="Imagem 17"/>
             <wp:cNvGraphicFramePr/>
             <a:graphic xmlns:a="http://schemas.openxmlformats.org/drawingml/2006/main">
               <a:graphicData uri="http://schemas.openxmlformats.org/drawingml/2006/picture">
                 <pic:pic xmlns:pic="http://schemas.openxmlformats.org/drawingml/2006/picture">
                   <pic:nvPicPr>
-                    <pic:cNvPr id="1139749955" name=""/>
+                    <pic:cNvPr id="1536224730" name=""/>
                     <pic:cNvPicPr/>
                   </pic:nvPicPr>
                   <pic:blipFill>
@@ -14203,7 +14247,7 @@
           <w:sz w:val="27"/>
         </w:rPr>
       </w:pPr>
-      <w:bookmarkStart w:id="25" w:name="_Toc240049601"/>
+      <w:bookmarkStart w:id="25" w:name="_Toc240271790"/>
       <w:r>
         <w:rPr>
           <w:rFonts w:ascii="Montserrat" w:hAnsi="Montserrat"/>
@@ -14243,16 +14287,16 @@
           <w:noProof/>
         </w:rPr>
         <w:drawing>
-          <wp:inline distT="0" distB="0" distL="0" distR="0" wp14:anchorId="3B1EAFEC" wp14:editId="6132A40E">
+          <wp:inline distT="0" distB="0" distL="0" distR="0" wp14:anchorId="6589BB81" wp14:editId="03AD860A">
             <wp:extent cx="5120640" cy="4627581"/>
             <wp:effectExtent l="19050" t="19050" r="22860" b="20955"/>
-            <wp:docPr id="1884913323" name="Imagem 18"/>
+            <wp:docPr id="176872524" name="Imagem 18"/>
             <wp:cNvGraphicFramePr/>
             <a:graphic xmlns:a="http://schemas.openxmlformats.org/drawingml/2006/main">
               <a:graphicData uri="http://schemas.openxmlformats.org/drawingml/2006/picture">
                 <pic:pic xmlns:pic="http://schemas.openxmlformats.org/drawingml/2006/picture">
                   <pic:nvPicPr>
-                    <pic:cNvPr id="1884913323" name=""/>
+                    <pic:cNvPr id="176872524" name=""/>
                     <pic:cNvPicPr/>
                   </pic:nvPicPr>
                   <pic:blipFill>
@@ -14320,16 +14364,16 @@
         </w:rPr>
         <w:lastRenderedPageBreak/>
         <w:drawing>
-          <wp:inline distT="0" distB="0" distL="0" distR="0" wp14:anchorId="1EA1E7AF" wp14:editId="42E7BC70">
+          <wp:inline distT="0" distB="0" distL="0" distR="0" wp14:anchorId="00950A3B" wp14:editId="7A2D176A">
             <wp:extent cx="5120640" cy="4627581"/>
             <wp:effectExtent l="19050" t="19050" r="22860" b="20955"/>
-            <wp:docPr id="1297586656" name="Imagem 19"/>
+            <wp:docPr id="332157880" name="Imagem 19"/>
             <wp:cNvGraphicFramePr/>
             <a:graphic xmlns:a="http://schemas.openxmlformats.org/drawingml/2006/main">
               <a:graphicData uri="http://schemas.openxmlformats.org/drawingml/2006/picture">
                 <pic:pic xmlns:pic="http://schemas.openxmlformats.org/drawingml/2006/picture">
                   <pic:nvPicPr>
-                    <pic:cNvPr id="1297586656" name=""/>
+                    <pic:cNvPr id="332157880" name=""/>
                     <pic:cNvPicPr/>
                   </pic:nvPicPr>
                   <pic:blipFill>
@@ -14512,7 +14556,7 @@
           <w:sz w:val="27"/>
         </w:rPr>
       </w:pPr>
-      <w:bookmarkStart w:id="26" w:name="_Toc240049602"/>
+      <w:bookmarkStart w:id="26" w:name="_Toc240271791"/>
       <w:r>
         <w:rPr>
           <w:rFonts w:ascii="Montserrat" w:hAnsi="Montserrat"/>
@@ -14552,16 +14596,16 @@
           <w:noProof/>
         </w:rPr>
         <w:drawing>
-          <wp:inline distT="0" distB="0" distL="0" distR="0" wp14:anchorId="3673634F" wp14:editId="1A6010F3">
+          <wp:inline distT="0" distB="0" distL="0" distR="0" wp14:anchorId="3A40D904" wp14:editId="639614C7">
             <wp:extent cx="5120640" cy="4627581"/>
             <wp:effectExtent l="19050" t="19050" r="22860" b="20955"/>
-            <wp:docPr id="214890838" name="Imagem 20"/>
+            <wp:docPr id="1363550287" name="Imagem 20"/>
             <wp:cNvGraphicFramePr/>
             <a:graphic xmlns:a="http://schemas.openxmlformats.org/drawingml/2006/main">
               <a:graphicData uri="http://schemas.openxmlformats.org/drawingml/2006/picture">
                 <pic:pic xmlns:pic="http://schemas.openxmlformats.org/drawingml/2006/picture">
                   <pic:nvPicPr>
-                    <pic:cNvPr id="214890838" name=""/>
+                    <pic:cNvPr id="1363550287" name=""/>
                     <pic:cNvPicPr/>
                   </pic:nvPicPr>
                   <pic:blipFill>
@@ -14629,16 +14673,16 @@
         </w:rPr>
         <w:lastRenderedPageBreak/>
         <w:drawing>
-          <wp:inline distT="0" distB="0" distL="0" distR="0" wp14:anchorId="61A24FC5" wp14:editId="1020002A">
+          <wp:inline distT="0" distB="0" distL="0" distR="0" wp14:anchorId="621DF5A3" wp14:editId="78F54BA6">
             <wp:extent cx="5120640" cy="4627581"/>
             <wp:effectExtent l="19050" t="19050" r="22860" b="20955"/>
-            <wp:docPr id="66520935" name="Imagem 21"/>
+            <wp:docPr id="713880905" name="Imagem 21"/>
             <wp:cNvGraphicFramePr/>
             <a:graphic xmlns:a="http://schemas.openxmlformats.org/drawingml/2006/main">
               <a:graphicData uri="http://schemas.openxmlformats.org/drawingml/2006/picture">
                 <pic:pic xmlns:pic="http://schemas.openxmlformats.org/drawingml/2006/picture">
                   <pic:nvPicPr>
-                    <pic:cNvPr id="66520935" name=""/>
+                    <pic:cNvPr id="713880905" name=""/>
                     <pic:cNvPicPr/>
                   </pic:nvPicPr>
                   <pic:blipFill>
@@ -14844,16 +14888,16 @@
           <w:noProof/>
         </w:rPr>
         <w:drawing>
-          <wp:inline distT="0" distB="0" distL="0" distR="0" wp14:anchorId="485AD369" wp14:editId="413E6E84">
+          <wp:inline distT="0" distB="0" distL="0" distR="0" wp14:anchorId="35DF9EF2" wp14:editId="2C13AFC0">
             <wp:extent cx="5120640" cy="1757287"/>
             <wp:effectExtent l="19050" t="19050" r="22860" b="14605"/>
-            <wp:docPr id="426537453" name="Imagem 22"/>
+            <wp:docPr id="966086596" name="Imagem 22"/>
             <wp:cNvGraphicFramePr/>
             <a:graphic xmlns:a="http://schemas.openxmlformats.org/drawingml/2006/main">
               <a:graphicData uri="http://schemas.openxmlformats.org/drawingml/2006/picture">
                 <pic:pic xmlns:pic="http://schemas.openxmlformats.org/drawingml/2006/picture">
                   <pic:nvPicPr>
-                    <pic:cNvPr id="426537453" name=""/>
+                    <pic:cNvPr id="966086596" name=""/>
                     <pic:cNvPicPr/>
                   </pic:nvPicPr>
                   <pic:blipFill>
@@ -14966,7 +15010,7 @@
           <w:sz w:val="27"/>
         </w:rPr>
       </w:pPr>
-      <w:bookmarkStart w:id="27" w:name="_Toc240049603"/>
+      <w:bookmarkStart w:id="27" w:name="_Toc240271792"/>
       <w:r>
         <w:rPr>
           <w:rFonts w:ascii="Montserrat" w:hAnsi="Montserrat"/>
@@ -15007,16 +15051,16 @@
         </w:rPr>
         <w:lastRenderedPageBreak/>
         <w:drawing>
-          <wp:inline distT="0" distB="0" distL="0" distR="0" wp14:anchorId="3E2C8B16" wp14:editId="2A8149DD">
+          <wp:inline distT="0" distB="0" distL="0" distR="0" wp14:anchorId="48C23574" wp14:editId="048134E2">
             <wp:extent cx="5120640" cy="4627581"/>
             <wp:effectExtent l="19050" t="19050" r="22860" b="20955"/>
-            <wp:docPr id="1473786483" name="Imagem 23"/>
+            <wp:docPr id="1447229964" name="Imagem 23"/>
             <wp:cNvGraphicFramePr/>
             <a:graphic xmlns:a="http://schemas.openxmlformats.org/drawingml/2006/main">
               <a:graphicData uri="http://schemas.openxmlformats.org/drawingml/2006/picture">
                 <pic:pic xmlns:pic="http://schemas.openxmlformats.org/drawingml/2006/picture">
                   <pic:nvPicPr>
-                    <pic:cNvPr id="1473786483" name=""/>
+                    <pic:cNvPr id="1447229964" name=""/>
                     <pic:cNvPicPr/>
                   </pic:nvPicPr>
                   <pic:blipFill>
@@ -15084,16 +15128,16 @@
         </w:rPr>
         <w:lastRenderedPageBreak/>
         <w:drawing>
-          <wp:inline distT="0" distB="0" distL="0" distR="0" wp14:anchorId="6B121800" wp14:editId="6E544CD2">
+          <wp:inline distT="0" distB="0" distL="0" distR="0" wp14:anchorId="0EC9630B" wp14:editId="5B1D2F9D">
             <wp:extent cx="5120640" cy="4627581"/>
             <wp:effectExtent l="19050" t="19050" r="22860" b="20955"/>
-            <wp:docPr id="527241614" name="Imagem 24"/>
+            <wp:docPr id="668219511" name="Imagem 24"/>
             <wp:cNvGraphicFramePr/>
             <a:graphic xmlns:a="http://schemas.openxmlformats.org/drawingml/2006/main">
               <a:graphicData uri="http://schemas.openxmlformats.org/drawingml/2006/picture">
                 <pic:pic xmlns:pic="http://schemas.openxmlformats.org/drawingml/2006/picture">
                   <pic:nvPicPr>
-                    <pic:cNvPr id="527241614" name=""/>
+                    <pic:cNvPr id="668219511" name=""/>
                     <pic:cNvPicPr/>
                   </pic:nvPicPr>
                   <pic:blipFill>
@@ -15330,7 +15374,7 @@
           <w:sz w:val="27"/>
         </w:rPr>
       </w:pPr>
-      <w:bookmarkStart w:id="28" w:name="_Toc240049604"/>
+      <w:bookmarkStart w:id="28" w:name="_Toc240271793"/>
       <w:r>
         <w:rPr>
           <w:rFonts w:ascii="Montserrat" w:hAnsi="Montserrat"/>
@@ -15370,16 +15414,16 @@
           <w:noProof/>
         </w:rPr>
         <w:drawing>
-          <wp:inline distT="0" distB="0" distL="0" distR="0" wp14:anchorId="36EE484B" wp14:editId="1E058D8E">
+          <wp:inline distT="0" distB="0" distL="0" distR="0" wp14:anchorId="77C27D25" wp14:editId="0CF14584">
             <wp:extent cx="5120640" cy="4627581"/>
             <wp:effectExtent l="19050" t="19050" r="22860" b="20955"/>
-            <wp:docPr id="408103975" name="Imagem 25"/>
+            <wp:docPr id="1274196707" name="Imagem 25"/>
             <wp:cNvGraphicFramePr/>
             <a:graphic xmlns:a="http://schemas.openxmlformats.org/drawingml/2006/main">
               <a:graphicData uri="http://schemas.openxmlformats.org/drawingml/2006/picture">
                 <pic:pic xmlns:pic="http://schemas.openxmlformats.org/drawingml/2006/picture">
                   <pic:nvPicPr>
-                    <pic:cNvPr id="408103975" name=""/>
+                    <pic:cNvPr id="1274196707" name=""/>
                     <pic:cNvPicPr/>
                   </pic:nvPicPr>
                   <pic:blipFill>
@@ -15447,16 +15491,16 @@
         </w:rPr>
         <w:lastRenderedPageBreak/>
         <w:drawing>
-          <wp:inline distT="0" distB="0" distL="0" distR="0" wp14:anchorId="4F0CA17D" wp14:editId="7A7006D6">
+          <wp:inline distT="0" distB="0" distL="0" distR="0" wp14:anchorId="7B1B97C7" wp14:editId="102117D2">
             <wp:extent cx="5120640" cy="4627581"/>
             <wp:effectExtent l="19050" t="19050" r="22860" b="20955"/>
-            <wp:docPr id="90967007" name="Imagem 26"/>
+            <wp:docPr id="74889192" name="Imagem 26"/>
             <wp:cNvGraphicFramePr/>
             <a:graphic xmlns:a="http://schemas.openxmlformats.org/drawingml/2006/main">
               <a:graphicData uri="http://schemas.openxmlformats.org/drawingml/2006/picture">
                 <pic:pic xmlns:pic="http://schemas.openxmlformats.org/drawingml/2006/picture">
                   <pic:nvPicPr>
-                    <pic:cNvPr id="90967007" name=""/>
+                    <pic:cNvPr id="74889192" name=""/>
                     <pic:cNvPicPr/>
                   </pic:nvPicPr>
                   <pic:blipFill>
@@ -15647,7 +15691,7 @@
           <w:sz w:val="27"/>
         </w:rPr>
       </w:pPr>
-      <w:bookmarkStart w:id="29" w:name="_Toc240049605"/>
+      <w:bookmarkStart w:id="29" w:name="_Toc240271794"/>
       <w:r>
         <w:rPr>
           <w:rFonts w:ascii="Montserrat" w:hAnsi="Montserrat"/>
@@ -15687,16 +15731,16 @@
           <w:noProof/>
         </w:rPr>
         <w:drawing>
-          <wp:inline distT="0" distB="0" distL="0" distR="0" wp14:anchorId="0760D259" wp14:editId="05ABF9DC">
+          <wp:inline distT="0" distB="0" distL="0" distR="0" wp14:anchorId="7352C2CC" wp14:editId="6DB2D8D1">
             <wp:extent cx="5120640" cy="4000682"/>
             <wp:effectExtent l="19050" t="19050" r="22860" b="19050"/>
-            <wp:docPr id="1664963739" name="Imagem 27"/>
+            <wp:docPr id="8542076" name="Imagem 27"/>
             <wp:cNvGraphicFramePr/>
             <a:graphic xmlns:a="http://schemas.openxmlformats.org/drawingml/2006/main">
               <a:graphicData uri="http://schemas.openxmlformats.org/drawingml/2006/picture">
                 <pic:pic xmlns:pic="http://schemas.openxmlformats.org/drawingml/2006/picture">
                   <pic:nvPicPr>
-                    <pic:cNvPr id="1664963739" name=""/>
+                    <pic:cNvPr id="8542076" name=""/>
                     <pic:cNvPicPr/>
                   </pic:nvPicPr>
                   <pic:blipFill>
@@ -16220,7 +16264,7 @@
           <w:sz w:val="34"/>
         </w:rPr>
       </w:pPr>
-      <w:bookmarkStart w:id="30" w:name="_Toc240049606"/>
+      <w:bookmarkStart w:id="30" w:name="_Toc240271795"/>
       <w:r>
         <w:rPr>
           <w:rFonts w:ascii="Montserrat" w:hAnsi="Montserrat"/>
@@ -16262,7 +16306,7 @@
           <w:sz w:val="27"/>
         </w:rPr>
       </w:pPr>
-      <w:bookmarkStart w:id="31" w:name="_Toc240049607"/>
+      <w:bookmarkStart w:id="31" w:name="_Toc240271796"/>
       <w:r>
         <w:rPr>
           <w:rFonts w:ascii="Montserrat" w:hAnsi="Montserrat"/>
@@ -16302,16 +16346,16 @@
           <w:noProof/>
         </w:rPr>
         <w:drawing>
-          <wp:inline distT="0" distB="0" distL="0" distR="0" wp14:anchorId="55403869" wp14:editId="534E222D">
+          <wp:inline distT="0" distB="0" distL="0" distR="0" wp14:anchorId="6E1A4807" wp14:editId="14E2261F">
             <wp:extent cx="5120640" cy="4627581"/>
             <wp:effectExtent l="19050" t="19050" r="22860" b="20955"/>
-            <wp:docPr id="1081433957" name="Imagem 28"/>
+            <wp:docPr id="678299912" name="Imagem 28"/>
             <wp:cNvGraphicFramePr/>
             <a:graphic xmlns:a="http://schemas.openxmlformats.org/drawingml/2006/main">
               <a:graphicData uri="http://schemas.openxmlformats.org/drawingml/2006/picture">
                 <pic:pic xmlns:pic="http://schemas.openxmlformats.org/drawingml/2006/picture">
                   <pic:nvPicPr>
-                    <pic:cNvPr id="1081433957" name=""/>
+                    <pic:cNvPr id="678299912" name=""/>
                     <pic:cNvPicPr/>
                   </pic:nvPicPr>
                   <pic:blipFill>
@@ -16379,16 +16423,16 @@
         </w:rPr>
         <w:lastRenderedPageBreak/>
         <w:drawing>
-          <wp:inline distT="0" distB="0" distL="0" distR="0" wp14:anchorId="6BA7D77D" wp14:editId="70F26315">
+          <wp:inline distT="0" distB="0" distL="0" distR="0" wp14:anchorId="394F44AE" wp14:editId="4705724B">
             <wp:extent cx="5120640" cy="4627581"/>
             <wp:effectExtent l="19050" t="19050" r="22860" b="20955"/>
-            <wp:docPr id="1162688299" name="Imagem 29"/>
+            <wp:docPr id="1585218433" name="Imagem 29"/>
             <wp:cNvGraphicFramePr/>
             <a:graphic xmlns:a="http://schemas.openxmlformats.org/drawingml/2006/main">
               <a:graphicData uri="http://schemas.openxmlformats.org/drawingml/2006/picture">
                 <pic:pic xmlns:pic="http://schemas.openxmlformats.org/drawingml/2006/picture">
                   <pic:nvPicPr>
-                    <pic:cNvPr id="1162688299" name=""/>
+                    <pic:cNvPr id="1585218433" name=""/>
                     <pic:cNvPicPr/>
                   </pic:nvPicPr>
                   <pic:blipFill>
@@ -16456,16 +16500,16 @@
         </w:rPr>
         <w:lastRenderedPageBreak/>
         <w:drawing>
-          <wp:inline distT="0" distB="0" distL="0" distR="0" wp14:anchorId="7948B4CC" wp14:editId="5CD9175E">
+          <wp:inline distT="0" distB="0" distL="0" distR="0" wp14:anchorId="76DFF770" wp14:editId="3485A344">
             <wp:extent cx="5120640" cy="4627581"/>
             <wp:effectExtent l="19050" t="19050" r="22860" b="20955"/>
-            <wp:docPr id="479208658" name="Imagem 30"/>
+            <wp:docPr id="865425936" name="Imagem 30"/>
             <wp:cNvGraphicFramePr/>
             <a:graphic xmlns:a="http://schemas.openxmlformats.org/drawingml/2006/main">
               <a:graphicData uri="http://schemas.openxmlformats.org/drawingml/2006/picture">
                 <pic:pic xmlns:pic="http://schemas.openxmlformats.org/drawingml/2006/picture">
                   <pic:nvPicPr>
-                    <pic:cNvPr id="479208658" name=""/>
+                    <pic:cNvPr id="865425936" name=""/>
                     <pic:cNvPicPr/>
                   </pic:nvPicPr>
                   <pic:blipFill>
@@ -16667,16 +16711,16 @@
           <w:noProof/>
         </w:rPr>
         <w:drawing>
-          <wp:inline distT="0" distB="0" distL="0" distR="0" wp14:anchorId="24F37FB9" wp14:editId="0A8FA4F7">
+          <wp:inline distT="0" distB="0" distL="0" distR="0" wp14:anchorId="263AB19E" wp14:editId="0B376B71">
             <wp:extent cx="5120640" cy="1715571"/>
             <wp:effectExtent l="19050" t="19050" r="22860" b="18415"/>
-            <wp:docPr id="395509540" name="Imagem 31"/>
+            <wp:docPr id="950185871" name="Imagem 31"/>
             <wp:cNvGraphicFramePr/>
             <a:graphic xmlns:a="http://schemas.openxmlformats.org/drawingml/2006/main">
               <a:graphicData uri="http://schemas.openxmlformats.org/drawingml/2006/picture">
                 <pic:pic xmlns:pic="http://schemas.openxmlformats.org/drawingml/2006/picture">
                   <pic:nvPicPr>
-                    <pic:cNvPr id="395509540" name=""/>
+                    <pic:cNvPr id="950185871" name=""/>
                     <pic:cNvPicPr/>
                   </pic:nvPicPr>
                   <pic:blipFill>
@@ -16813,16 +16857,16 @@
           <w:noProof/>
         </w:rPr>
         <w:drawing>
-          <wp:inline distT="0" distB="0" distL="0" distR="0" wp14:anchorId="7A796326" wp14:editId="72EB0C47">
+          <wp:inline distT="0" distB="0" distL="0" distR="0" wp14:anchorId="16BD4418" wp14:editId="5EF63DF2">
             <wp:extent cx="5120640" cy="3282818"/>
             <wp:effectExtent l="19050" t="19050" r="22860" b="13335"/>
-            <wp:docPr id="954354088" name="Imagem 32"/>
+            <wp:docPr id="1141734422" name="Imagem 32"/>
             <wp:cNvGraphicFramePr/>
             <a:graphic xmlns:a="http://schemas.openxmlformats.org/drawingml/2006/main">
               <a:graphicData uri="http://schemas.openxmlformats.org/drawingml/2006/picture">
                 <pic:pic xmlns:pic="http://schemas.openxmlformats.org/drawingml/2006/picture">
                   <pic:nvPicPr>
-                    <pic:cNvPr id="954354088" name=""/>
+                    <pic:cNvPr id="1141734422" name=""/>
                     <pic:cNvPicPr/>
                   </pic:nvPicPr>
                   <pic:blipFill>
@@ -16956,16 +17000,16 @@
           <w:noProof/>
         </w:rPr>
         <w:drawing>
-          <wp:inline distT="0" distB="0" distL="0" distR="0" wp14:anchorId="1ED254BA" wp14:editId="48CB9D49">
+          <wp:inline distT="0" distB="0" distL="0" distR="0" wp14:anchorId="320F492E" wp14:editId="75792E2B">
             <wp:extent cx="5120640" cy="951357"/>
             <wp:effectExtent l="19050" t="19050" r="22860" b="20320"/>
-            <wp:docPr id="646266511" name="Imagem 33"/>
+            <wp:docPr id="1339836688" name="Imagem 33"/>
             <wp:cNvGraphicFramePr/>
             <a:graphic xmlns:a="http://schemas.openxmlformats.org/drawingml/2006/main">
               <a:graphicData uri="http://schemas.openxmlformats.org/drawingml/2006/picture">
                 <pic:pic xmlns:pic="http://schemas.openxmlformats.org/drawingml/2006/picture">
                   <pic:nvPicPr>
-                    <pic:cNvPr id="646266511" name=""/>
+                    <pic:cNvPr id="1339836688" name=""/>
                     <pic:cNvPicPr/>
                   </pic:nvPicPr>
                   <pic:blipFill>
@@ -17077,16 +17121,16 @@
           <w:noProof/>
         </w:rPr>
         <w:drawing>
-          <wp:inline distT="0" distB="0" distL="0" distR="0" wp14:anchorId="664B3F2E" wp14:editId="7A48E20B">
+          <wp:inline distT="0" distB="0" distL="0" distR="0" wp14:anchorId="72C06110" wp14:editId="65C947E1">
             <wp:extent cx="5120640" cy="1515102"/>
             <wp:effectExtent l="19050" t="19050" r="22860" b="28575"/>
-            <wp:docPr id="875402541" name="Imagem 34"/>
+            <wp:docPr id="653566059" name="Imagem 34"/>
             <wp:cNvGraphicFramePr/>
             <a:graphic xmlns:a="http://schemas.openxmlformats.org/drawingml/2006/main">
               <a:graphicData uri="http://schemas.openxmlformats.org/drawingml/2006/picture">
                 <pic:pic xmlns:pic="http://schemas.openxmlformats.org/drawingml/2006/picture">
                   <pic:nvPicPr>
-                    <pic:cNvPr id="875402541" name=""/>
+                    <pic:cNvPr id="653566059" name=""/>
                     <pic:cNvPicPr/>
                   </pic:nvPicPr>
                   <pic:blipFill>
@@ -17199,16 +17243,16 @@
           <w:noProof/>
         </w:rPr>
         <w:drawing>
-          <wp:inline distT="0" distB="0" distL="0" distR="0" wp14:anchorId="6EA008CB" wp14:editId="28D96130">
+          <wp:inline distT="0" distB="0" distL="0" distR="0" wp14:anchorId="37EC0D8D" wp14:editId="7BB4DA1A">
             <wp:extent cx="5120640" cy="1391113"/>
             <wp:effectExtent l="19050" t="19050" r="22860" b="19050"/>
-            <wp:docPr id="1693503559" name="Imagem 35"/>
+            <wp:docPr id="651331923" name="Imagem 35"/>
             <wp:cNvGraphicFramePr/>
             <a:graphic xmlns:a="http://schemas.openxmlformats.org/drawingml/2006/main">
               <a:graphicData uri="http://schemas.openxmlformats.org/drawingml/2006/picture">
                 <pic:pic xmlns:pic="http://schemas.openxmlformats.org/drawingml/2006/picture">
                   <pic:nvPicPr>
-                    <pic:cNvPr id="1693503559" name=""/>
+                    <pic:cNvPr id="651331923" name=""/>
                     <pic:cNvPicPr/>
                   </pic:nvPicPr>
                   <pic:blipFill>
@@ -17320,16 +17364,16 @@
           <w:noProof/>
         </w:rPr>
         <w:drawing>
-          <wp:inline distT="0" distB="0" distL="0" distR="0" wp14:anchorId="2ECF6460" wp14:editId="466CEB29">
+          <wp:inline distT="0" distB="0" distL="0" distR="0" wp14:anchorId="3F6E3CC1" wp14:editId="403EFA16">
             <wp:extent cx="5120640" cy="1125174"/>
             <wp:effectExtent l="19050" t="19050" r="22860" b="18415"/>
-            <wp:docPr id="1330932254" name="Imagem 36"/>
+            <wp:docPr id="1232139232" name="Imagem 36"/>
             <wp:cNvGraphicFramePr/>
             <a:graphic xmlns:a="http://schemas.openxmlformats.org/drawingml/2006/main">
               <a:graphicData uri="http://schemas.openxmlformats.org/drawingml/2006/picture">
                 <pic:pic xmlns:pic="http://schemas.openxmlformats.org/drawingml/2006/picture">
                   <pic:nvPicPr>
-                    <pic:cNvPr id="1330932254" name=""/>
+                    <pic:cNvPr id="1232139232" name=""/>
                     <pic:cNvPicPr/>
                   </pic:nvPicPr>
                   <pic:blipFill>
@@ -17419,7 +17463,7 @@
           <w:sz w:val="27"/>
         </w:rPr>
       </w:pPr>
-      <w:bookmarkStart w:id="32" w:name="_Toc240049608"/>
+      <w:bookmarkStart w:id="32" w:name="_Toc240271797"/>
       <w:r>
         <w:rPr>
           <w:rFonts w:ascii="Montserrat" w:hAnsi="Montserrat"/>
@@ -17459,16 +17503,16 @@
           <w:noProof/>
         </w:rPr>
         <w:drawing>
-          <wp:inline distT="0" distB="0" distL="0" distR="0" wp14:anchorId="0AAE20ED" wp14:editId="3EDE1A81">
+          <wp:inline distT="0" distB="0" distL="0" distR="0" wp14:anchorId="515A375E" wp14:editId="693C206D">
             <wp:extent cx="5120640" cy="4627581"/>
             <wp:effectExtent l="19050" t="19050" r="22860" b="20955"/>
-            <wp:docPr id="563353647" name="Imagem 37"/>
+            <wp:docPr id="980673893" name="Imagem 37"/>
             <wp:cNvGraphicFramePr/>
             <a:graphic xmlns:a="http://schemas.openxmlformats.org/drawingml/2006/main">
               <a:graphicData uri="http://schemas.openxmlformats.org/drawingml/2006/picture">
                 <pic:pic xmlns:pic="http://schemas.openxmlformats.org/drawingml/2006/picture">
                   <pic:nvPicPr>
-                    <pic:cNvPr id="563353647" name=""/>
+                    <pic:cNvPr id="980673893" name=""/>
                     <pic:cNvPicPr/>
                   </pic:nvPicPr>
                   <pic:blipFill>
@@ -17536,16 +17580,16 @@
         </w:rPr>
         <w:lastRenderedPageBreak/>
         <w:drawing>
-          <wp:inline distT="0" distB="0" distL="0" distR="0" wp14:anchorId="3F7AA3D6" wp14:editId="790082EC">
+          <wp:inline distT="0" distB="0" distL="0" distR="0" wp14:anchorId="7E0CD8FA" wp14:editId="6C48DA54">
             <wp:extent cx="5120640" cy="4627581"/>
             <wp:effectExtent l="19050" t="19050" r="22860" b="20955"/>
-            <wp:docPr id="743364038" name="Imagem 38"/>
+            <wp:docPr id="308321103" name="Imagem 38"/>
             <wp:cNvGraphicFramePr/>
             <a:graphic xmlns:a="http://schemas.openxmlformats.org/drawingml/2006/main">
               <a:graphicData uri="http://schemas.openxmlformats.org/drawingml/2006/picture">
                 <pic:pic xmlns:pic="http://schemas.openxmlformats.org/drawingml/2006/picture">
                   <pic:nvPicPr>
-                    <pic:cNvPr id="743364038" name=""/>
+                    <pic:cNvPr id="308321103" name=""/>
                     <pic:cNvPicPr/>
                   </pic:nvPicPr>
                   <pic:blipFill>
@@ -17714,16 +17758,16 @@
           <w:noProof/>
         </w:rPr>
         <w:drawing>
-          <wp:inline distT="0" distB="0" distL="0" distR="0" wp14:anchorId="7CE11231" wp14:editId="63CDBB25">
+          <wp:inline distT="0" distB="0" distL="0" distR="0" wp14:anchorId="4EFBF513" wp14:editId="010FD91A">
             <wp:extent cx="5120640" cy="2144319"/>
             <wp:effectExtent l="19050" t="19050" r="22860" b="27940"/>
-            <wp:docPr id="52252772" name="Imagem 39"/>
+            <wp:docPr id="88830923" name="Imagem 39"/>
             <wp:cNvGraphicFramePr/>
             <a:graphic xmlns:a="http://schemas.openxmlformats.org/drawingml/2006/main">
               <a:graphicData uri="http://schemas.openxmlformats.org/drawingml/2006/picture">
                 <pic:pic xmlns:pic="http://schemas.openxmlformats.org/drawingml/2006/picture">
                   <pic:nvPicPr>
-                    <pic:cNvPr id="52252772" name=""/>
+                    <pic:cNvPr id="88830923" name=""/>
                     <pic:cNvPicPr/>
                   </pic:nvPicPr>
                   <pic:blipFill>
@@ -17811,16 +17855,16 @@
           <w:noProof/>
         </w:rPr>
         <w:drawing>
-          <wp:inline distT="0" distB="0" distL="0" distR="0" wp14:anchorId="7BA23347" wp14:editId="55FC29BF">
+          <wp:inline distT="0" distB="0" distL="0" distR="0" wp14:anchorId="4DC45981" wp14:editId="424E43B6">
             <wp:extent cx="5120640" cy="1055647"/>
             <wp:effectExtent l="19050" t="19050" r="22860" b="11430"/>
-            <wp:docPr id="776044081" name="Imagem 40"/>
+            <wp:docPr id="914810173" name="Imagem 40"/>
             <wp:cNvGraphicFramePr/>
             <a:graphic xmlns:a="http://schemas.openxmlformats.org/drawingml/2006/main">
               <a:graphicData uri="http://schemas.openxmlformats.org/drawingml/2006/picture">
                 <pic:pic xmlns:pic="http://schemas.openxmlformats.org/drawingml/2006/picture">
                   <pic:nvPicPr>
-                    <pic:cNvPr id="776044081" name=""/>
+                    <pic:cNvPr id="914810173" name=""/>
                     <pic:cNvPicPr/>
                   </pic:nvPicPr>
                   <pic:blipFill>
@@ -17942,16 +17986,16 @@
           <w:noProof/>
         </w:rPr>
         <w:drawing>
-          <wp:inline distT="0" distB="0" distL="0" distR="0" wp14:anchorId="5BA159BB" wp14:editId="1E15E61D">
+          <wp:inline distT="0" distB="0" distL="0" distR="0" wp14:anchorId="311FDEF9" wp14:editId="3B3F8900">
             <wp:extent cx="5120640" cy="3282818"/>
             <wp:effectExtent l="19050" t="19050" r="22860" b="13335"/>
-            <wp:docPr id="492375652" name="Imagem 41"/>
+            <wp:docPr id="1655174973" name="Imagem 41"/>
             <wp:cNvGraphicFramePr/>
             <a:graphic xmlns:a="http://schemas.openxmlformats.org/drawingml/2006/main">
               <a:graphicData uri="http://schemas.openxmlformats.org/drawingml/2006/picture">
                 <pic:pic xmlns:pic="http://schemas.openxmlformats.org/drawingml/2006/picture">
                   <pic:nvPicPr>
-                    <pic:cNvPr id="492375652" name=""/>
+                    <pic:cNvPr id="1655174973" name=""/>
                     <pic:cNvPicPr/>
                   </pic:nvPicPr>
                   <pic:blipFill>
@@ -18085,16 +18129,16 @@
         </w:rPr>
         <w:lastRenderedPageBreak/>
         <w:drawing>
-          <wp:inline distT="0" distB="0" distL="0" distR="0" wp14:anchorId="36FEEC70" wp14:editId="6F5C3BA5">
+          <wp:inline distT="0" distB="0" distL="0" distR="0" wp14:anchorId="7CC42D72" wp14:editId="275256E5">
             <wp:extent cx="5120640" cy="1978034"/>
             <wp:effectExtent l="19050" t="19050" r="22860" b="22225"/>
-            <wp:docPr id="1334258134" name="Imagem 42"/>
+            <wp:docPr id="664606378" name="Imagem 42"/>
             <wp:cNvGraphicFramePr/>
             <a:graphic xmlns:a="http://schemas.openxmlformats.org/drawingml/2006/main">
               <a:graphicData uri="http://schemas.openxmlformats.org/drawingml/2006/picture">
                 <pic:pic xmlns:pic="http://schemas.openxmlformats.org/drawingml/2006/picture">
                   <pic:nvPicPr>
-                    <pic:cNvPr id="1334258134" name=""/>
+                    <pic:cNvPr id="664606378" name=""/>
                     <pic:cNvPicPr/>
                   </pic:nvPicPr>
                   <pic:blipFill>
@@ -18166,7 +18210,7 @@
           <w:sz w:val="34"/>
         </w:rPr>
       </w:pPr>
-      <w:bookmarkStart w:id="33" w:name="_Toc240049609"/>
+      <w:bookmarkStart w:id="33" w:name="_Toc240271798"/>
       <w:r>
         <w:rPr>
           <w:rFonts w:ascii="Montserrat" w:hAnsi="Montserrat"/>
@@ -18226,7 +18270,7 @@
           <w:sz w:val="27"/>
         </w:rPr>
       </w:pPr>
-      <w:bookmarkStart w:id="34" w:name="_Toc240049610"/>
+      <w:bookmarkStart w:id="34" w:name="_Toc240271799"/>
       <w:r>
         <w:rPr>
           <w:rFonts w:ascii="Montserrat" w:hAnsi="Montserrat"/>
@@ -18266,16 +18310,16 @@
           <w:noProof/>
         </w:rPr>
         <w:drawing>
-          <wp:inline distT="0" distB="0" distL="0" distR="0" wp14:anchorId="7D0768DC" wp14:editId="4DCBD224">
+          <wp:inline distT="0" distB="0" distL="0" distR="0" wp14:anchorId="4E2B0DBE" wp14:editId="3B61485C">
             <wp:extent cx="5303520" cy="4792851"/>
             <wp:effectExtent l="19050" t="19050" r="11430" b="27305"/>
-            <wp:docPr id="841502385" name="Imagem 43"/>
+            <wp:docPr id="656519138" name="Imagem 43"/>
             <wp:cNvGraphicFramePr/>
             <a:graphic xmlns:a="http://schemas.openxmlformats.org/drawingml/2006/main">
               <a:graphicData uri="http://schemas.openxmlformats.org/drawingml/2006/picture">
                 <pic:pic xmlns:pic="http://schemas.openxmlformats.org/drawingml/2006/picture">
                   <pic:nvPicPr>
-                    <pic:cNvPr id="841502385" name=""/>
+                    <pic:cNvPr id="656519138" name=""/>
                     <pic:cNvPicPr/>
                   </pic:nvPicPr>
                   <pic:blipFill>
@@ -18344,7 +18388,7 @@
           <w:sz w:val="27"/>
         </w:rPr>
       </w:pPr>
-      <w:bookmarkStart w:id="35" w:name="_Toc240049611"/>
+      <w:bookmarkStart w:id="35" w:name="_Toc240271800"/>
       <w:r>
         <w:rPr>
           <w:rFonts w:ascii="Montserrat" w:hAnsi="Montserrat"/>
@@ -18384,16 +18428,16 @@
           <w:noProof/>
         </w:rPr>
         <w:drawing>
-          <wp:inline distT="0" distB="0" distL="0" distR="0" wp14:anchorId="7C0F5304" wp14:editId="40D6DBFC">
+          <wp:inline distT="0" distB="0" distL="0" distR="0" wp14:anchorId="30A31846" wp14:editId="0BE9F049">
             <wp:extent cx="5303520" cy="4792851"/>
             <wp:effectExtent l="19050" t="19050" r="11430" b="27305"/>
-            <wp:docPr id="1409593917" name="Imagem 44"/>
+            <wp:docPr id="1736933434" name="Imagem 44"/>
             <wp:cNvGraphicFramePr/>
             <a:graphic xmlns:a="http://schemas.openxmlformats.org/drawingml/2006/main">
               <a:graphicData uri="http://schemas.openxmlformats.org/drawingml/2006/picture">
                 <pic:pic xmlns:pic="http://schemas.openxmlformats.org/drawingml/2006/picture">
                   <pic:nvPicPr>
-                    <pic:cNvPr id="1409593917" name=""/>
+                    <pic:cNvPr id="1736933434" name=""/>
                     <pic:cNvPicPr/>
                   </pic:nvPicPr>
                   <pic:blipFill>
@@ -18461,7 +18505,7 @@
           <w:sz w:val="27"/>
         </w:rPr>
       </w:pPr>
-      <w:bookmarkStart w:id="36" w:name="_Toc240049612"/>
+      <w:bookmarkStart w:id="36" w:name="_Toc240271801"/>
       <w:r>
         <w:rPr>
           <w:rFonts w:ascii="Montserrat" w:hAnsi="Montserrat"/>
@@ -18502,16 +18546,16 @@
         </w:rPr>
         <w:lastRenderedPageBreak/>
         <w:drawing>
-          <wp:inline distT="0" distB="0" distL="0" distR="0" wp14:anchorId="6F653DCD" wp14:editId="625D9B2D">
+          <wp:inline distT="0" distB="0" distL="0" distR="0" wp14:anchorId="709E14BA" wp14:editId="14879EE4">
             <wp:extent cx="5303520" cy="4792851"/>
             <wp:effectExtent l="19050" t="19050" r="11430" b="27305"/>
-            <wp:docPr id="1262847105" name="Imagem 45"/>
+            <wp:docPr id="453373921" name="Imagem 45"/>
             <wp:cNvGraphicFramePr/>
             <a:graphic xmlns:a="http://schemas.openxmlformats.org/drawingml/2006/main">
               <a:graphicData uri="http://schemas.openxmlformats.org/drawingml/2006/picture">
                 <pic:pic xmlns:pic="http://schemas.openxmlformats.org/drawingml/2006/picture">
                   <pic:nvPicPr>
-                    <pic:cNvPr id="1262847105" name=""/>
+                    <pic:cNvPr id="453373921" name=""/>
                     <pic:cNvPicPr/>
                   </pic:nvPicPr>
                   <pic:blipFill>
@@ -18579,16 +18623,16 @@
         </w:rPr>
         <w:lastRenderedPageBreak/>
         <w:drawing>
-          <wp:inline distT="0" distB="0" distL="0" distR="0" wp14:anchorId="343F9387" wp14:editId="15123C52">
+          <wp:inline distT="0" distB="0" distL="0" distR="0" wp14:anchorId="40BE8B1E" wp14:editId="5D67E180">
             <wp:extent cx="5303520" cy="4792851"/>
             <wp:effectExtent l="19050" t="19050" r="11430" b="27305"/>
-            <wp:docPr id="1648727858" name="Imagem 46"/>
+            <wp:docPr id="44632739" name="Imagem 46"/>
             <wp:cNvGraphicFramePr/>
             <a:graphic xmlns:a="http://schemas.openxmlformats.org/drawingml/2006/main">
               <a:graphicData uri="http://schemas.openxmlformats.org/drawingml/2006/picture">
                 <pic:pic xmlns:pic="http://schemas.openxmlformats.org/drawingml/2006/picture">
                   <pic:nvPicPr>
-                    <pic:cNvPr id="1648727858" name=""/>
+                    <pic:cNvPr id="44632739" name=""/>
                     <pic:cNvPicPr/>
                   </pic:nvPicPr>
                   <pic:blipFill>
@@ -18681,7 +18725,7 @@
           <w:sz w:val="34"/>
         </w:rPr>
       </w:pPr>
-      <w:bookmarkStart w:id="37" w:name="_Toc240049613"/>
+      <w:bookmarkStart w:id="37" w:name="_Toc240271802"/>
       <w:r>
         <w:rPr>
           <w:rFonts w:ascii="Montserrat" w:hAnsi="Montserrat"/>
@@ -18723,7 +18767,7 @@
           <w:sz w:val="27"/>
         </w:rPr>
       </w:pPr>
-      <w:bookmarkStart w:id="38" w:name="_Toc240049614"/>
+      <w:bookmarkStart w:id="38" w:name="_Toc240271803"/>
       <w:r>
         <w:rPr>
           <w:rFonts w:ascii="Montserrat" w:hAnsi="Montserrat"/>
@@ -18763,16 +18807,16 @@
           <w:noProof/>
         </w:rPr>
         <w:drawing>
-          <wp:inline distT="0" distB="0" distL="0" distR="0" wp14:anchorId="1950FE83" wp14:editId="69693FD1">
+          <wp:inline distT="0" distB="0" distL="0" distR="0" wp14:anchorId="1FC21BA1" wp14:editId="2C4E8F73">
             <wp:extent cx="5303520" cy="4792851"/>
             <wp:effectExtent l="19050" t="19050" r="11430" b="27305"/>
-            <wp:docPr id="414810996" name="Imagem 47"/>
+            <wp:docPr id="1098746300" name="Imagem 47"/>
             <wp:cNvGraphicFramePr/>
             <a:graphic xmlns:a="http://schemas.openxmlformats.org/drawingml/2006/main">
               <a:graphicData uri="http://schemas.openxmlformats.org/drawingml/2006/picture">
                 <pic:pic xmlns:pic="http://schemas.openxmlformats.org/drawingml/2006/picture">
                   <pic:nvPicPr>
-                    <pic:cNvPr id="414810996" name=""/>
+                    <pic:cNvPr id="1098746300" name=""/>
                     <pic:cNvPicPr/>
                   </pic:nvPicPr>
                   <pic:blipFill>
@@ -19001,7 +19045,7 @@
           <w:sz w:val="27"/>
         </w:rPr>
       </w:pPr>
-      <w:bookmarkStart w:id="39" w:name="_Toc240049615"/>
+      <w:bookmarkStart w:id="39" w:name="_Toc240271804"/>
       <w:r>
         <w:rPr>
           <w:rFonts w:ascii="Montserrat" w:hAnsi="Montserrat"/>
@@ -19041,16 +19085,16 @@
           <w:noProof/>
         </w:rPr>
         <w:drawing>
-          <wp:inline distT="0" distB="0" distL="0" distR="0" wp14:anchorId="580C9ECF" wp14:editId="2F9770E3">
+          <wp:inline distT="0" distB="0" distL="0" distR="0" wp14:anchorId="7D6E4188" wp14:editId="7E8A1405">
             <wp:extent cx="5303520" cy="4792851"/>
             <wp:effectExtent l="19050" t="19050" r="11430" b="27305"/>
-            <wp:docPr id="1594304813" name="Imagem 48"/>
+            <wp:docPr id="1138777497" name="Imagem 48"/>
             <wp:cNvGraphicFramePr/>
             <a:graphic xmlns:a="http://schemas.openxmlformats.org/drawingml/2006/main">
               <a:graphicData uri="http://schemas.openxmlformats.org/drawingml/2006/picture">
                 <pic:pic xmlns:pic="http://schemas.openxmlformats.org/drawingml/2006/picture">
                   <pic:nvPicPr>
-                    <pic:cNvPr id="1594304813" name=""/>
+                    <pic:cNvPr id="1138777497" name=""/>
                     <pic:cNvPicPr/>
                   </pic:nvPicPr>
                   <pic:blipFill>
@@ -19118,7 +19162,7 @@
           <w:sz w:val="27"/>
         </w:rPr>
       </w:pPr>
-      <w:bookmarkStart w:id="40" w:name="_Toc240049616"/>
+      <w:bookmarkStart w:id="40" w:name="_Toc240271805"/>
       <w:r>
         <w:rPr>
           <w:rFonts w:ascii="Montserrat" w:hAnsi="Montserrat"/>
@@ -19159,16 +19203,16 @@
         </w:rPr>
         <w:lastRenderedPageBreak/>
         <w:drawing>
-          <wp:inline distT="0" distB="0" distL="0" distR="0" wp14:anchorId="193AEB69" wp14:editId="6C390465">
+          <wp:inline distT="0" distB="0" distL="0" distR="0" wp14:anchorId="7FB65C45" wp14:editId="138173F6">
             <wp:extent cx="5303520" cy="4792851"/>
             <wp:effectExtent l="19050" t="19050" r="11430" b="27305"/>
-            <wp:docPr id="1133015648" name="Imagem 49"/>
+            <wp:docPr id="189159711" name="Imagem 49"/>
             <wp:cNvGraphicFramePr/>
             <a:graphic xmlns:a="http://schemas.openxmlformats.org/drawingml/2006/main">
               <a:graphicData uri="http://schemas.openxmlformats.org/drawingml/2006/picture">
                 <pic:pic xmlns:pic="http://schemas.openxmlformats.org/drawingml/2006/picture">
                   <pic:nvPicPr>
-                    <pic:cNvPr id="1133015648" name=""/>
+                    <pic:cNvPr id="189159711" name=""/>
                     <pic:cNvPicPr/>
                   </pic:nvPicPr>
                   <pic:blipFill>
@@ -19312,7 +19356,7 @@
           <w:sz w:val="27"/>
         </w:rPr>
       </w:pPr>
-      <w:bookmarkStart w:id="41" w:name="_Toc240049617"/>
+      <w:bookmarkStart w:id="41" w:name="_Toc240271806"/>
       <w:r>
         <w:rPr>
           <w:rFonts w:ascii="Montserrat" w:hAnsi="Montserrat"/>
@@ -19553,16 +19597,16 @@
           <w:noProof/>
         </w:rPr>
         <w:drawing>
-          <wp:inline distT="0" distB="0" distL="0" distR="0" wp14:anchorId="2728ACAB" wp14:editId="2E0E8B0E">
+          <wp:inline distT="0" distB="0" distL="0" distR="0" wp14:anchorId="37BA94EE" wp14:editId="66BCFC96">
             <wp:extent cx="5303520" cy="4267180"/>
             <wp:effectExtent l="19050" t="19050" r="11430" b="19685"/>
-            <wp:docPr id="584141677" name="Imagem 50"/>
+            <wp:docPr id="663499361" name="Imagem 50"/>
             <wp:cNvGraphicFramePr/>
             <a:graphic xmlns:a="http://schemas.openxmlformats.org/drawingml/2006/main">
               <a:graphicData uri="http://schemas.openxmlformats.org/drawingml/2006/picture">
                 <pic:pic xmlns:pic="http://schemas.openxmlformats.org/drawingml/2006/picture">
                   <pic:nvPicPr>
-                    <pic:cNvPr id="584141677" name=""/>
+                    <pic:cNvPr id="663499361" name=""/>
                     <pic:cNvPicPr/>
                   </pic:nvPicPr>
                   <pic:blipFill>
@@ -19630,16 +19674,16 @@
         </w:rPr>
         <w:lastRenderedPageBreak/>
         <w:drawing>
-          <wp:inline distT="0" distB="0" distL="0" distR="0" wp14:anchorId="14854560" wp14:editId="2351F375">
+          <wp:inline distT="0" distB="0" distL="0" distR="0" wp14:anchorId="7217EA46" wp14:editId="182918DB">
             <wp:extent cx="5303520" cy="3382059"/>
             <wp:effectExtent l="19050" t="19050" r="11430" b="27940"/>
-            <wp:docPr id="1175486656" name="Imagem 51"/>
+            <wp:docPr id="728302586" name="Imagem 51"/>
             <wp:cNvGraphicFramePr/>
             <a:graphic xmlns:a="http://schemas.openxmlformats.org/drawingml/2006/main">
               <a:graphicData uri="http://schemas.openxmlformats.org/drawingml/2006/picture">
                 <pic:pic xmlns:pic="http://schemas.openxmlformats.org/drawingml/2006/picture">
                   <pic:nvPicPr>
-                    <pic:cNvPr id="1175486656" name=""/>
+                    <pic:cNvPr id="728302586" name=""/>
                     <pic:cNvPicPr/>
                   </pic:nvPicPr>
                   <pic:blipFill>
@@ -19707,16 +19751,16 @@
         </w:rPr>
         <w:lastRenderedPageBreak/>
         <w:drawing>
-          <wp:inline distT="0" distB="0" distL="0" distR="0" wp14:anchorId="4F457F74" wp14:editId="164CED33">
+          <wp:inline distT="0" distB="0" distL="0" distR="0" wp14:anchorId="41EDE741" wp14:editId="40A0AB34">
             <wp:extent cx="5303520" cy="4417800"/>
             <wp:effectExtent l="19050" t="19050" r="11430" b="20955"/>
-            <wp:docPr id="1404119351" name="Imagem 52"/>
+            <wp:docPr id="364310822" name="Imagem 52"/>
             <wp:cNvGraphicFramePr/>
             <a:graphic xmlns:a="http://schemas.openxmlformats.org/drawingml/2006/main">
               <a:graphicData uri="http://schemas.openxmlformats.org/drawingml/2006/picture">
                 <pic:pic xmlns:pic="http://schemas.openxmlformats.org/drawingml/2006/picture">
                   <pic:nvPicPr>
-                    <pic:cNvPr id="1404119351" name=""/>
+                    <pic:cNvPr id="364310822" name=""/>
                     <pic:cNvPicPr/>
                   </pic:nvPicPr>
                   <pic:blipFill>
@@ -19826,7 +19870,7 @@
           <w:sz w:val="27"/>
         </w:rPr>
       </w:pPr>
-      <w:bookmarkStart w:id="42" w:name="_Toc240049618"/>
+      <w:bookmarkStart w:id="42" w:name="_Toc240271807"/>
       <w:r>
         <w:rPr>
           <w:rFonts w:ascii="Montserrat" w:hAnsi="Montserrat"/>
@@ -20092,16 +20136,16 @@
         </w:rPr>
         <w:lastRenderedPageBreak/>
         <w:drawing>
-          <wp:inline distT="0" distB="0" distL="0" distR="0" wp14:anchorId="68470264" wp14:editId="35951B8D">
+          <wp:inline distT="0" distB="0" distL="0" distR="0" wp14:anchorId="532A647D" wp14:editId="4B55DF7E">
             <wp:extent cx="5303520" cy="7628836"/>
             <wp:effectExtent l="19050" t="19050" r="11430" b="10795"/>
-            <wp:docPr id="151056872" name="Imagem 53"/>
+            <wp:docPr id="12075880" name="Imagem 53"/>
             <wp:cNvGraphicFramePr/>
             <a:graphic xmlns:a="http://schemas.openxmlformats.org/drawingml/2006/main">
               <a:graphicData uri="http://schemas.openxmlformats.org/drawingml/2006/picture">
                 <pic:pic xmlns:pic="http://schemas.openxmlformats.org/drawingml/2006/picture">
                   <pic:nvPicPr>
-                    <pic:cNvPr id="151056872" name=""/>
+                    <pic:cNvPr id="12075880" name=""/>
                     <pic:cNvPicPr/>
                   </pic:nvPicPr>
                   <pic:blipFill>
@@ -20233,7 +20277,7 @@
           <w:sz w:val="27"/>
         </w:rPr>
       </w:pPr>
-      <w:bookmarkStart w:id="43" w:name="_Toc240049619"/>
+      <w:bookmarkStart w:id="43" w:name="_Toc240271808"/>
       <w:r>
         <w:rPr>
           <w:rFonts w:ascii="Montserrat" w:hAnsi="Montserrat"/>
@@ -20386,7 +20430,7 @@
           <w:sz w:val="27"/>
         </w:rPr>
       </w:pPr>
-      <w:bookmarkStart w:id="44" w:name="_Toc240049620"/>
+      <w:bookmarkStart w:id="44" w:name="_Toc240271809"/>
       <w:r>
         <w:rPr>
           <w:rFonts w:ascii="Montserrat" w:hAnsi="Montserrat"/>
@@ -20679,16 +20723,16 @@
           <w:noProof/>
         </w:rPr>
         <w:drawing>
-          <wp:inline distT="0" distB="0" distL="0" distR="0" wp14:anchorId="41E364C1" wp14:editId="15F61197">
+          <wp:inline distT="0" distB="0" distL="0" distR="0" wp14:anchorId="261F8659" wp14:editId="08A43A62">
             <wp:extent cx="5303520" cy="1351384"/>
             <wp:effectExtent l="19050" t="19050" r="11430" b="20320"/>
-            <wp:docPr id="1893255187" name="Imagem 54"/>
+            <wp:docPr id="171758088" name="Imagem 54"/>
             <wp:cNvGraphicFramePr/>
             <a:graphic xmlns:a="http://schemas.openxmlformats.org/drawingml/2006/main">
               <a:graphicData uri="http://schemas.openxmlformats.org/drawingml/2006/picture">
                 <pic:pic xmlns:pic="http://schemas.openxmlformats.org/drawingml/2006/picture">
                   <pic:nvPicPr>
-                    <pic:cNvPr id="1893255187" name=""/>
+                    <pic:cNvPr id="171758088" name=""/>
                     <pic:cNvPicPr/>
                   </pic:nvPicPr>
                   <pic:blipFill>
@@ -20756,7 +20800,7 @@
           <w:sz w:val="27"/>
         </w:rPr>
       </w:pPr>
-      <w:bookmarkStart w:id="45" w:name="_Toc240049621"/>
+      <w:bookmarkStart w:id="45" w:name="_Toc240271810"/>
       <w:r>
         <w:rPr>
           <w:rFonts w:ascii="Montserrat" w:hAnsi="Montserrat"/>
@@ -20901,16 +20945,16 @@
           <w:noProof/>
         </w:rPr>
         <w:drawing>
-          <wp:inline distT="0" distB="0" distL="0" distR="0" wp14:anchorId="676D4D24" wp14:editId="78FAA681">
+          <wp:inline distT="0" distB="0" distL="0" distR="0" wp14:anchorId="43E2220F" wp14:editId="54DF9FFE">
             <wp:extent cx="5303520" cy="1422793"/>
             <wp:effectExtent l="19050" t="19050" r="11430" b="25400"/>
-            <wp:docPr id="713750539" name="Imagem 55"/>
+            <wp:docPr id="2046298595" name="Imagem 55"/>
             <wp:cNvGraphicFramePr/>
             <a:graphic xmlns:a="http://schemas.openxmlformats.org/drawingml/2006/main">
               <a:graphicData uri="http://schemas.openxmlformats.org/drawingml/2006/picture">
                 <pic:pic xmlns:pic="http://schemas.openxmlformats.org/drawingml/2006/picture">
                   <pic:nvPicPr>
-                    <pic:cNvPr id="713750539" name=""/>
+                    <pic:cNvPr id="2046298595" name=""/>
                     <pic:cNvPicPr/>
                   </pic:nvPicPr>
                   <pic:blipFill>
@@ -21065,16 +21109,16 @@
         </w:rPr>
         <w:lastRenderedPageBreak/>
         <w:drawing>
-          <wp:inline distT="0" distB="0" distL="0" distR="0" wp14:anchorId="34143B4F" wp14:editId="6DA9230E">
+          <wp:inline distT="0" distB="0" distL="0" distR="0" wp14:anchorId="5B6EB8DF" wp14:editId="3624364B">
             <wp:extent cx="5303520" cy="1841050"/>
             <wp:effectExtent l="19050" t="19050" r="11430" b="26035"/>
-            <wp:docPr id="993438404" name="Imagem 56"/>
+            <wp:docPr id="219106208" name="Imagem 56"/>
             <wp:cNvGraphicFramePr/>
             <a:graphic xmlns:a="http://schemas.openxmlformats.org/drawingml/2006/main">
               <a:graphicData uri="http://schemas.openxmlformats.org/drawingml/2006/picture">
                 <pic:pic xmlns:pic="http://schemas.openxmlformats.org/drawingml/2006/picture">
                   <pic:nvPicPr>
-                    <pic:cNvPr id="993438404" name=""/>
+                    <pic:cNvPr id="219106208" name=""/>
                     <pic:cNvPicPr/>
                   </pic:nvPicPr>
                   <pic:blipFill>
@@ -21228,16 +21272,16 @@
           <w:noProof/>
         </w:rPr>
         <w:drawing>
-          <wp:inline distT="0" distB="0" distL="0" distR="0" wp14:anchorId="5C65DBB2" wp14:editId="15BE77DF">
+          <wp:inline distT="0" distB="0" distL="0" distR="0" wp14:anchorId="78D739B1" wp14:editId="3149D49B">
             <wp:extent cx="5303520" cy="303041"/>
             <wp:effectExtent l="19050" t="19050" r="11430" b="20955"/>
-            <wp:docPr id="704292313" name="Imagem 57"/>
+            <wp:docPr id="2107088426" name="Imagem 57"/>
             <wp:cNvGraphicFramePr/>
             <a:graphic xmlns:a="http://schemas.openxmlformats.org/drawingml/2006/main">
               <a:graphicData uri="http://schemas.openxmlformats.org/drawingml/2006/picture">
                 <pic:pic xmlns:pic="http://schemas.openxmlformats.org/drawingml/2006/picture">
                   <pic:nvPicPr>
-                    <pic:cNvPr id="704292313" name=""/>
+                    <pic:cNvPr id="2107088426" name=""/>
                     <pic:cNvPicPr/>
                   </pic:nvPicPr>
                   <pic:blipFill>
@@ -21305,16 +21349,16 @@
         </w:rPr>
         <w:lastRenderedPageBreak/>
         <w:drawing>
-          <wp:inline distT="0" distB="0" distL="0" distR="0" wp14:anchorId="194A8048" wp14:editId="6D698F51">
+          <wp:inline distT="0" distB="0" distL="0" distR="0" wp14:anchorId="32BA5C5F" wp14:editId="38E96ACC">
             <wp:extent cx="5303520" cy="2983005"/>
             <wp:effectExtent l="19050" t="19050" r="11430" b="27305"/>
-            <wp:docPr id="955334109" name="Imagem 58"/>
+            <wp:docPr id="1257754771" name="Imagem 58"/>
             <wp:cNvGraphicFramePr/>
             <a:graphic xmlns:a="http://schemas.openxmlformats.org/drawingml/2006/main">
               <a:graphicData uri="http://schemas.openxmlformats.org/drawingml/2006/picture">
                 <pic:pic xmlns:pic="http://schemas.openxmlformats.org/drawingml/2006/picture">
                   <pic:nvPicPr>
-                    <pic:cNvPr id="955334109" name=""/>
+                    <pic:cNvPr id="1257754771" name=""/>
                     <pic:cNvPicPr/>
                   </pic:nvPicPr>
                   <pic:blipFill>
@@ -21386,7 +21430,7 @@
           <w:sz w:val="34"/>
         </w:rPr>
       </w:pPr>
-      <w:bookmarkStart w:id="46" w:name="_Toc240049622"/>
+      <w:bookmarkStart w:id="46" w:name="_Toc240271811"/>
       <w:r>
         <w:rPr>
           <w:rFonts w:ascii="Montserrat" w:hAnsi="Montserrat"/>
@@ -21630,7 +21674,7 @@
           <w:sz w:val="34"/>
         </w:rPr>
       </w:pPr>
-      <w:bookmarkStart w:id="47" w:name="_Toc240049623"/>
+      <w:bookmarkStart w:id="47" w:name="_Toc240271812"/>
       <w:r>
         <w:rPr>
           <w:rFonts w:ascii="Montserrat" w:hAnsi="Montserrat"/>
@@ -23418,7 +23462,7 @@
 <file path=word/numbering.xml><?xml version="1.0" encoding="utf-8"?>
 <w:numbering xmlns:wpc="http://schemas.microsoft.com/office/word/2010/wordprocessingCanvas" xmlns:cx="http://schemas.microsoft.com/office/drawing/2014/chartex" xmlns:cx1="http://schemas.microsoft.com/office/drawing/2015/9/8/chartex" xmlns:cx2="http://schemas.microsoft.com/office/drawing/2015/10/21/chartex" xmlns:cx3="http://schemas.microsoft.com/office/drawing/2016/5/9/chartex" xmlns:cx4="http://schemas.microsoft.com/office/drawing/2016/5/10/chartex" xmlns:cx5="http://schemas.microsoft.com/office/drawing/2016/5/11/chartex" xmlns:cx6="http://schemas.microsoft.com/office/drawing/2016/5/12/chartex" xmlns:cx7="http://schemas.microsoft.com/office/drawing/2016/5/13/chartex" xmlns:cx8="http://schemas.microsoft.com/office/drawing/2016/5/14/chartex" xmlns:mc="http://schemas.openxmlformats.org/markup-compatibility/2006" xmlns:aink="http://schemas.microsoft.com/office/drawing/2016/ink" xmlns:am3d="http://schemas.microsoft.com/office/drawing/2017/model3d" xmlns:o="urn:schemas-microsoft-com:office:office" xmlns:oel="http://schemas.microsoft.com/office/2019/extlst" xmlns:r="http://schemas.openxmlformats.org/officeDocument/2006/relationships" xmlns:m="http://schemas.openxmlformats.org/officeDocument/2006/math" xmlns:v="urn:schemas-microsoft-com:vml" xmlns:wp14="http://schemas.microsoft.com/office/word/2010/wordprocessingDrawing" xmlns:wp="http://schemas.openxmlformats.org/drawingml/2006/wordprocessingDrawing" xmlns:w10="urn:schemas-microsoft-com:office:word" xmlns:w="http://schemas.openxmlformats.org/wordprocessingml/2006/main" xmlns:w14="http://schemas.microsoft.com/office/word/2010/wordml" xmlns:w15="http://schemas.microsoft.com/office/word/2012/wordml" xmlns:w16cex="http://schemas.microsoft.com/office/word/2018/wordml/cex" xmlns:w16cid="http://schemas.microsoft.com/office/word/2016/wordml/cid" xmlns:w16="http://schemas.microsoft.com/office/word/2018/wordml" xmlns:w16du="http://schemas.microsoft.com/office/word/2023/wordml/word16du" xmlns:w16sdtdh="http://schemas.microsoft.com/office/word/2020/wordml/sdtdatahash" xmlns:w16sdtfl="http://schemas.microsoft.com/office/word/2024/wordml/sdtformatlock" xmlns:w16se="http://schemas.microsoft.com/office/word/2015/wordml/symex" xmlns:wpg="http://schemas.microsoft.com/office/word/2010/wordprocessingGroup" xmlns:wpi="http://schemas.microsoft.com/office/word/2010/wordprocessingInk" xmlns:wne="http://schemas.microsoft.com/office/word/2006/wordml" xmlns:wps="http://schemas.microsoft.com/office/word/2010/wordprocessingShape" mc:Ignorable="w14 w15 w16se w16cid w16 w16cex w16sdtdh w16sdtfl w16du wp14">
   <w:abstractNum w:abstractNumId="0" w15:restartNumberingAfterBreak="0">
-    <w:nsid w:val="011121F9"/>
+    <w:nsid w:val="0A1C15EA"/>
     <w:multiLevelType w:val="singleLevel"/>
     <w:tmpl w:val="04160001"/>
     <w:lvl w:ilvl="0">
@@ -23435,7 +23479,7 @@
     </w:lvl>
   </w:abstractNum>
   <w:abstractNum w:abstractNumId="1" w15:restartNumberingAfterBreak="0">
-    <w:nsid w:val="051811B5"/>
+    <w:nsid w:val="0D27529F"/>
     <w:multiLevelType w:val="singleLevel"/>
     <w:tmpl w:val="04160001"/>
     <w:lvl w:ilvl="0">
@@ -23452,7 +23496,7 @@
     </w:lvl>
   </w:abstractNum>
   <w:abstractNum w:abstractNumId="2" w15:restartNumberingAfterBreak="0">
-    <w:nsid w:val="06EB1FA0"/>
+    <w:nsid w:val="108F03EF"/>
     <w:multiLevelType w:val="singleLevel"/>
     <w:tmpl w:val="04160001"/>
     <w:lvl w:ilvl="0">
@@ -23469,7 +23513,7 @@
     </w:lvl>
   </w:abstractNum>
   <w:abstractNum w:abstractNumId="3" w15:restartNumberingAfterBreak="0">
-    <w:nsid w:val="1001239C"/>
+    <w:nsid w:val="13AA1450"/>
     <w:multiLevelType w:val="singleLevel"/>
     <w:tmpl w:val="04160001"/>
     <w:lvl w:ilvl="0">
@@ -23486,7 +23530,7 @@
     </w:lvl>
   </w:abstractNum>
   <w:abstractNum w:abstractNumId="4" w15:restartNumberingAfterBreak="0">
-    <w:nsid w:val="10D91253"/>
+    <w:nsid w:val="13CD500F"/>
     <w:multiLevelType w:val="singleLevel"/>
     <w:tmpl w:val="04160001"/>
     <w:lvl w:ilvl="0">
@@ -23503,7 +23547,7 @@
     </w:lvl>
   </w:abstractNum>
   <w:abstractNum w:abstractNumId="5" w15:restartNumberingAfterBreak="0">
-    <w:nsid w:val="169F0272"/>
+    <w:nsid w:val="156B4F41"/>
     <w:multiLevelType w:val="singleLevel"/>
     <w:tmpl w:val="04160001"/>
     <w:lvl w:ilvl="0">
@@ -23520,7 +23564,7 @@
     </w:lvl>
   </w:abstractNum>
   <w:abstractNum w:abstractNumId="6" w15:restartNumberingAfterBreak="0">
-    <w:nsid w:val="184F36C4"/>
+    <w:nsid w:val="1F384D54"/>
     <w:multiLevelType w:val="singleLevel"/>
     <w:tmpl w:val="04160001"/>
     <w:lvl w:ilvl="0">
@@ -23537,7 +23581,7 @@
     </w:lvl>
   </w:abstractNum>
   <w:abstractNum w:abstractNumId="7" w15:restartNumberingAfterBreak="0">
-    <w:nsid w:val="23815704"/>
+    <w:nsid w:val="1FC7507B"/>
     <w:multiLevelType w:val="singleLevel"/>
     <w:tmpl w:val="04160001"/>
     <w:lvl w:ilvl="0">
@@ -23554,7 +23598,7 @@
     </w:lvl>
   </w:abstractNum>
   <w:abstractNum w:abstractNumId="8" w15:restartNumberingAfterBreak="0">
-    <w:nsid w:val="2AFE1838"/>
+    <w:nsid w:val="208D727B"/>
     <w:multiLevelType w:val="singleLevel"/>
     <w:tmpl w:val="04160001"/>
     <w:lvl w:ilvl="0">
@@ -23571,7 +23615,7 @@
     </w:lvl>
   </w:abstractNum>
   <w:abstractNum w:abstractNumId="9" w15:restartNumberingAfterBreak="0">
-    <w:nsid w:val="2CEB7163"/>
+    <w:nsid w:val="22501D9A"/>
     <w:multiLevelType w:val="singleLevel"/>
     <w:tmpl w:val="04160001"/>
     <w:lvl w:ilvl="0">
@@ -23588,7 +23632,7 @@
     </w:lvl>
   </w:abstractNum>
   <w:abstractNum w:abstractNumId="10" w15:restartNumberingAfterBreak="0">
-    <w:nsid w:val="2E8900F2"/>
+    <w:nsid w:val="269846A0"/>
     <w:multiLevelType w:val="singleLevel"/>
     <w:tmpl w:val="04160001"/>
     <w:lvl w:ilvl="0">
@@ -23605,7 +23649,7 @@
     </w:lvl>
   </w:abstractNum>
   <w:abstractNum w:abstractNumId="11" w15:restartNumberingAfterBreak="0">
-    <w:nsid w:val="31BF1CAB"/>
+    <w:nsid w:val="297A78D1"/>
     <w:multiLevelType w:val="singleLevel"/>
     <w:tmpl w:val="04160001"/>
     <w:lvl w:ilvl="0">
@@ -23622,7 +23666,7 @@
     </w:lvl>
   </w:abstractNum>
   <w:abstractNum w:abstractNumId="12" w15:restartNumberingAfterBreak="0">
-    <w:nsid w:val="32680F7A"/>
+    <w:nsid w:val="29ED1FF4"/>
     <w:multiLevelType w:val="singleLevel"/>
     <w:tmpl w:val="04160001"/>
     <w:lvl w:ilvl="0">
@@ -23639,7 +23683,7 @@
     </w:lvl>
   </w:abstractNum>
   <w:abstractNum w:abstractNumId="13" w15:restartNumberingAfterBreak="0">
-    <w:nsid w:val="36330EFA"/>
+    <w:nsid w:val="2AB1127C"/>
     <w:multiLevelType w:val="singleLevel"/>
     <w:tmpl w:val="04160001"/>
     <w:lvl w:ilvl="0">
@@ -23656,7 +23700,7 @@
     </w:lvl>
   </w:abstractNum>
   <w:abstractNum w:abstractNumId="14" w15:restartNumberingAfterBreak="0">
-    <w:nsid w:val="3ECE2219"/>
+    <w:nsid w:val="323E3D6C"/>
     <w:multiLevelType w:val="singleLevel"/>
     <w:tmpl w:val="04160001"/>
     <w:lvl w:ilvl="0">
@@ -23673,7 +23717,7 @@
     </w:lvl>
   </w:abstractNum>
   <w:abstractNum w:abstractNumId="15" w15:restartNumberingAfterBreak="0">
-    <w:nsid w:val="413D158C"/>
+    <w:nsid w:val="3C6C3C20"/>
     <w:multiLevelType w:val="singleLevel"/>
     <w:tmpl w:val="04160001"/>
     <w:lvl w:ilvl="0">
@@ -23690,7 +23734,7 @@
     </w:lvl>
   </w:abstractNum>
   <w:abstractNum w:abstractNumId="16" w15:restartNumberingAfterBreak="0">
-    <w:nsid w:val="43042B9A"/>
+    <w:nsid w:val="40EC597D"/>
     <w:multiLevelType w:val="singleLevel"/>
     <w:tmpl w:val="04160001"/>
     <w:lvl w:ilvl="0">
@@ -23707,7 +23751,7 @@
     </w:lvl>
   </w:abstractNum>
   <w:abstractNum w:abstractNumId="17" w15:restartNumberingAfterBreak="0">
-    <w:nsid w:val="43E4364B"/>
+    <w:nsid w:val="46130AE6"/>
     <w:multiLevelType w:val="singleLevel"/>
     <w:tmpl w:val="04160001"/>
     <w:lvl w:ilvl="0">
@@ -23724,7 +23768,7 @@
     </w:lvl>
   </w:abstractNum>
   <w:abstractNum w:abstractNumId="18" w15:restartNumberingAfterBreak="0">
-    <w:nsid w:val="4704231C"/>
+    <w:nsid w:val="46207C56"/>
     <w:multiLevelType w:val="singleLevel"/>
     <w:tmpl w:val="04160001"/>
     <w:lvl w:ilvl="0">
@@ -23741,7 +23785,7 @@
     </w:lvl>
   </w:abstractNum>
   <w:abstractNum w:abstractNumId="19" w15:restartNumberingAfterBreak="0">
-    <w:nsid w:val="47F65DD3"/>
+    <w:nsid w:val="48733367"/>
     <w:multiLevelType w:val="singleLevel"/>
     <w:tmpl w:val="04160001"/>
     <w:lvl w:ilvl="0">
@@ -23758,7 +23802,7 @@
     </w:lvl>
   </w:abstractNum>
   <w:abstractNum w:abstractNumId="20" w15:restartNumberingAfterBreak="0">
-    <w:nsid w:val="4A8819D3"/>
+    <w:nsid w:val="52055699"/>
     <w:multiLevelType w:val="singleLevel"/>
     <w:tmpl w:val="04160001"/>
     <w:lvl w:ilvl="0">
@@ -23775,7 +23819,7 @@
     </w:lvl>
   </w:abstractNum>
   <w:abstractNum w:abstractNumId="21" w15:restartNumberingAfterBreak="0">
-    <w:nsid w:val="4E060CAB"/>
+    <w:nsid w:val="54493B4F"/>
     <w:multiLevelType w:val="singleLevel"/>
     <w:tmpl w:val="04160001"/>
     <w:lvl w:ilvl="0">
@@ -23792,7 +23836,7 @@
     </w:lvl>
   </w:abstractNum>
   <w:abstractNum w:abstractNumId="22" w15:restartNumberingAfterBreak="0">
-    <w:nsid w:val="4E2F32B6"/>
+    <w:nsid w:val="5FEA4E4E"/>
     <w:multiLevelType w:val="singleLevel"/>
     <w:tmpl w:val="04160001"/>
     <w:lvl w:ilvl="0">
@@ -23809,7 +23853,7 @@
     </w:lvl>
   </w:abstractNum>
   <w:abstractNum w:abstractNumId="23" w15:restartNumberingAfterBreak="0">
-    <w:nsid w:val="4E4D1623"/>
+    <w:nsid w:val="631F67F8"/>
     <w:multiLevelType w:val="singleLevel"/>
     <w:tmpl w:val="04160001"/>
     <w:lvl w:ilvl="0">
@@ -23826,7 +23870,7 @@
     </w:lvl>
   </w:abstractNum>
   <w:abstractNum w:abstractNumId="24" w15:restartNumberingAfterBreak="0">
-    <w:nsid w:val="53F6552E"/>
+    <w:nsid w:val="63284FAD"/>
     <w:multiLevelType w:val="singleLevel"/>
     <w:tmpl w:val="04160001"/>
     <w:lvl w:ilvl="0">
@@ -23843,7 +23887,7 @@
     </w:lvl>
   </w:abstractNum>
   <w:abstractNum w:abstractNumId="25" w15:restartNumberingAfterBreak="0">
-    <w:nsid w:val="5A1B1501"/>
+    <w:nsid w:val="682942F7"/>
     <w:multiLevelType w:val="singleLevel"/>
     <w:tmpl w:val="04160001"/>
     <w:lvl w:ilvl="0">
@@ -23860,7 +23904,7 @@
     </w:lvl>
   </w:abstractNum>
   <w:abstractNum w:abstractNumId="26" w15:restartNumberingAfterBreak="0">
-    <w:nsid w:val="61997F2D"/>
+    <w:nsid w:val="69FF29FF"/>
     <w:multiLevelType w:val="singleLevel"/>
     <w:tmpl w:val="04160001"/>
     <w:lvl w:ilvl="0">
@@ -23877,7 +23921,7 @@
     </w:lvl>
   </w:abstractNum>
   <w:abstractNum w:abstractNumId="27" w15:restartNumberingAfterBreak="0">
-    <w:nsid w:val="661D3D7E"/>
+    <w:nsid w:val="6BF84F3C"/>
     <w:multiLevelType w:val="singleLevel"/>
     <w:tmpl w:val="04160001"/>
     <w:lvl w:ilvl="0">
@@ -23894,7 +23938,7 @@
     </w:lvl>
   </w:abstractNum>
   <w:abstractNum w:abstractNumId="28" w15:restartNumberingAfterBreak="0">
-    <w:nsid w:val="677C4E11"/>
+    <w:nsid w:val="6D582959"/>
     <w:multiLevelType w:val="singleLevel"/>
     <w:tmpl w:val="04160001"/>
     <w:lvl w:ilvl="0">
@@ -23911,7 +23955,7 @@
     </w:lvl>
   </w:abstractNum>
   <w:abstractNum w:abstractNumId="29" w15:restartNumberingAfterBreak="0">
-    <w:nsid w:val="6EF86AD8"/>
+    <w:nsid w:val="73C51742"/>
     <w:multiLevelType w:val="singleLevel"/>
     <w:tmpl w:val="04160001"/>
     <w:lvl w:ilvl="0">
@@ -23928,7 +23972,7 @@
     </w:lvl>
   </w:abstractNum>
   <w:abstractNum w:abstractNumId="30" w15:restartNumberingAfterBreak="0">
-    <w:nsid w:val="6F0A2DBC"/>
+    <w:nsid w:val="7FEA0E20"/>
     <w:multiLevelType w:val="singleLevel"/>
     <w:tmpl w:val="04160001"/>
     <w:lvl w:ilvl="0">
@@ -23945,7 +23989,7 @@
     </w:lvl>
   </w:abstractNum>
   <w:abstractNum w:abstractNumId="31" w15:restartNumberingAfterBreak="0">
-    <w:nsid w:val="7DF147AA"/>
+    <w:nsid w:val="7FF94FFF"/>
     <w:multiLevelType w:val="singleLevel"/>
     <w:tmpl w:val="04160001"/>
     <w:lvl w:ilvl="0">
@@ -23961,101 +24005,101 @@
       </w:rPr>
     </w:lvl>
   </w:abstractNum>
-  <w:num w:numId="1" w16cid:durableId="1330402032">
+  <w:num w:numId="1" w16cid:durableId="1449347989">
+    <w:abstractNumId w:val="20"/>
+  </w:num>
+  <w:num w:numId="2" w16cid:durableId="528756796">
+    <w:abstractNumId w:val="11"/>
+  </w:num>
+  <w:num w:numId="3" w16cid:durableId="413432067">
+    <w:abstractNumId w:val="17"/>
+  </w:num>
+  <w:num w:numId="4" w16cid:durableId="1562714277">
+    <w:abstractNumId w:val="8"/>
+  </w:num>
+  <w:num w:numId="5" w16cid:durableId="1090391186">
+    <w:abstractNumId w:val="22"/>
+  </w:num>
+  <w:num w:numId="6" w16cid:durableId="1810975458">
+    <w:abstractNumId w:val="0"/>
+  </w:num>
+  <w:num w:numId="7" w16cid:durableId="212929096">
+    <w:abstractNumId w:val="7"/>
+  </w:num>
+  <w:num w:numId="8" w16cid:durableId="496068637">
+    <w:abstractNumId w:val="28"/>
+  </w:num>
+  <w:num w:numId="9" w16cid:durableId="198013406">
+    <w:abstractNumId w:val="5"/>
+  </w:num>
+  <w:num w:numId="10" w16cid:durableId="1910261411">
+    <w:abstractNumId w:val="3"/>
+  </w:num>
+  <w:num w:numId="11" w16cid:durableId="1398895354">
+    <w:abstractNumId w:val="6"/>
+  </w:num>
+  <w:num w:numId="12" w16cid:durableId="1163080223">
+    <w:abstractNumId w:val="4"/>
+  </w:num>
+  <w:num w:numId="13" w16cid:durableId="427392440">
+    <w:abstractNumId w:val="19"/>
+  </w:num>
+  <w:num w:numId="14" w16cid:durableId="518662920">
+    <w:abstractNumId w:val="1"/>
+  </w:num>
+  <w:num w:numId="15" w16cid:durableId="32386285">
+    <w:abstractNumId w:val="14"/>
+  </w:num>
+  <w:num w:numId="16" w16cid:durableId="1029062031">
+    <w:abstractNumId w:val="18"/>
+  </w:num>
+  <w:num w:numId="17" w16cid:durableId="1032464006">
+    <w:abstractNumId w:val="13"/>
+  </w:num>
+  <w:num w:numId="18" w16cid:durableId="960307581">
+    <w:abstractNumId w:val="27"/>
+  </w:num>
+  <w:num w:numId="19" w16cid:durableId="1957179724">
+    <w:abstractNumId w:val="24"/>
+  </w:num>
+  <w:num w:numId="20" w16cid:durableId="715275899">
+    <w:abstractNumId w:val="16"/>
+  </w:num>
+  <w:num w:numId="21" w16cid:durableId="804591211">
+    <w:abstractNumId w:val="12"/>
+  </w:num>
+  <w:num w:numId="22" w16cid:durableId="1700935549">
+    <w:abstractNumId w:val="26"/>
+  </w:num>
+  <w:num w:numId="23" w16cid:durableId="1284725356">
+    <w:abstractNumId w:val="10"/>
+  </w:num>
+  <w:num w:numId="24" w16cid:durableId="297802649">
+    <w:abstractNumId w:val="31"/>
+  </w:num>
+  <w:num w:numId="25" w16cid:durableId="1931353405">
+    <w:abstractNumId w:val="25"/>
+  </w:num>
+  <w:num w:numId="26" w16cid:durableId="1156264456">
     <w:abstractNumId w:val="2"/>
   </w:num>
-  <w:num w:numId="2" w16cid:durableId="417796591">
+  <w:num w:numId="27" w16cid:durableId="1554461133">
+    <w:abstractNumId w:val="21"/>
+  </w:num>
+  <w:num w:numId="28" w16cid:durableId="1600873678">
+    <w:abstractNumId w:val="30"/>
+  </w:num>
+  <w:num w:numId="29" w16cid:durableId="814419211">
     <w:abstractNumId w:val="9"/>
   </w:num>
-  <w:num w:numId="3" w16cid:durableId="535894737">
-    <w:abstractNumId w:val="0"/>
-  </w:num>
-  <w:num w:numId="4" w16cid:durableId="38363941">
-    <w:abstractNumId w:val="24"/>
-  </w:num>
-  <w:num w:numId="5" w16cid:durableId="600262200">
-    <w:abstractNumId w:val="3"/>
-  </w:num>
-  <w:num w:numId="6" w16cid:durableId="842429598">
-    <w:abstractNumId w:val="4"/>
-  </w:num>
-  <w:num w:numId="7" w16cid:durableId="330330343">
-    <w:abstractNumId w:val="7"/>
-  </w:num>
-  <w:num w:numId="8" w16cid:durableId="51082172">
-    <w:abstractNumId w:val="21"/>
-  </w:num>
-  <w:num w:numId="9" w16cid:durableId="388580194">
-    <w:abstractNumId w:val="18"/>
-  </w:num>
-  <w:num w:numId="10" w16cid:durableId="265502405">
-    <w:abstractNumId w:val="25"/>
-  </w:num>
-  <w:num w:numId="11" w16cid:durableId="2117631884">
-    <w:abstractNumId w:val="27"/>
-  </w:num>
-  <w:num w:numId="12" w16cid:durableId="35856239">
-    <w:abstractNumId w:val="5"/>
-  </w:num>
-  <w:num w:numId="13" w16cid:durableId="269438431">
-    <w:abstractNumId w:val="6"/>
-  </w:num>
-  <w:num w:numId="14" w16cid:durableId="1313946712">
-    <w:abstractNumId w:val="12"/>
-  </w:num>
-  <w:num w:numId="15" w16cid:durableId="201019992">
-    <w:abstractNumId w:val="20"/>
-  </w:num>
-  <w:num w:numId="16" w16cid:durableId="2085837272">
-    <w:abstractNumId w:val="30"/>
-  </w:num>
-  <w:num w:numId="17" w16cid:durableId="1287346703">
-    <w:abstractNumId w:val="17"/>
-  </w:num>
-  <w:num w:numId="18" w16cid:durableId="1270434319">
-    <w:abstractNumId w:val="26"/>
-  </w:num>
-  <w:num w:numId="19" w16cid:durableId="2039963700">
-    <w:abstractNumId w:val="31"/>
-  </w:num>
-  <w:num w:numId="20" w16cid:durableId="398552169">
-    <w:abstractNumId w:val="22"/>
-  </w:num>
-  <w:num w:numId="21" w16cid:durableId="2056465401">
-    <w:abstractNumId w:val="10"/>
-  </w:num>
-  <w:num w:numId="22" w16cid:durableId="732897697">
-    <w:abstractNumId w:val="28"/>
-  </w:num>
-  <w:num w:numId="23" w16cid:durableId="956137301">
-    <w:abstractNumId w:val="16"/>
-  </w:num>
-  <w:num w:numId="24" w16cid:durableId="1534879579">
-    <w:abstractNumId w:val="23"/>
-  </w:num>
-  <w:num w:numId="25" w16cid:durableId="1230187347">
-    <w:abstractNumId w:val="19"/>
-  </w:num>
-  <w:num w:numId="26" w16cid:durableId="1800878845">
-    <w:abstractNumId w:val="14"/>
-  </w:num>
-  <w:num w:numId="27" w16cid:durableId="24059679">
-    <w:abstractNumId w:val="8"/>
-  </w:num>
-  <w:num w:numId="28" w16cid:durableId="602152307">
-    <w:abstractNumId w:val="1"/>
-  </w:num>
-  <w:num w:numId="29" w16cid:durableId="1733311903">
-    <w:abstractNumId w:val="13"/>
-  </w:num>
-  <w:num w:numId="30" w16cid:durableId="448015563">
-    <w:abstractNumId w:val="11"/>
-  </w:num>
-  <w:num w:numId="31" w16cid:durableId="1761835085">
+  <w:num w:numId="30" w16cid:durableId="8989597">
     <w:abstractNumId w:val="29"/>
   </w:num>
-  <w:num w:numId="32" w16cid:durableId="142553996">
+  <w:num w:numId="31" w16cid:durableId="1012495549">
     <w:abstractNumId w:val="15"/>
+  </w:num>
+  <w:num w:numId="32" w16cid:durableId="1902710032">
+    <w:abstractNumId w:val="23"/>
   </w:num>
 </w:numbering>
 </file>
@@ -24468,7 +24512,7 @@
     <w:link w:val="Ttulo1Char"/>
     <w:uiPriority w:val="9"/>
     <w:qFormat/>
-    <w:rsid w:val="00912CFA"/>
+    <w:rsid w:val="005C1A20"/>
     <w:pPr>
       <w:keepNext/>
       <w:keepLines/>
@@ -24490,7 +24534,7 @@
     <w:uiPriority w:val="9"/>
     <w:unhideWhenUsed/>
     <w:qFormat/>
-    <w:rsid w:val="00912CFA"/>
+    <w:rsid w:val="005C1A20"/>
     <w:pPr>
       <w:keepNext/>
       <w:keepLines/>
@@ -24513,7 +24557,7 @@
     <w:semiHidden/>
     <w:unhideWhenUsed/>
     <w:qFormat/>
-    <w:rsid w:val="00912CFA"/>
+    <w:rsid w:val="005C1A20"/>
     <w:pPr>
       <w:keepNext/>
       <w:keepLines/>
@@ -24536,7 +24580,7 @@
     <w:semiHidden/>
     <w:unhideWhenUsed/>
     <w:qFormat/>
-    <w:rsid w:val="00912CFA"/>
+    <w:rsid w:val="005C1A20"/>
     <w:pPr>
       <w:keepNext/>
       <w:keepLines/>
@@ -24559,7 +24603,7 @@
     <w:semiHidden/>
     <w:unhideWhenUsed/>
     <w:qFormat/>
-    <w:rsid w:val="00912CFA"/>
+    <w:rsid w:val="005C1A20"/>
     <w:pPr>
       <w:keepNext/>
       <w:keepLines/>
@@ -24580,7 +24624,7 @@
     <w:semiHidden/>
     <w:unhideWhenUsed/>
     <w:qFormat/>
-    <w:rsid w:val="00912CFA"/>
+    <w:rsid w:val="005C1A20"/>
     <w:pPr>
       <w:keepNext/>
       <w:keepLines/>
@@ -24603,7 +24647,7 @@
     <w:semiHidden/>
     <w:unhideWhenUsed/>
     <w:qFormat/>
-    <w:rsid w:val="00912CFA"/>
+    <w:rsid w:val="005C1A20"/>
     <w:pPr>
       <w:keepNext/>
       <w:keepLines/>
@@ -24624,7 +24668,7 @@
     <w:semiHidden/>
     <w:unhideWhenUsed/>
     <w:qFormat/>
-    <w:rsid w:val="00912CFA"/>
+    <w:rsid w:val="005C1A20"/>
     <w:pPr>
       <w:keepNext/>
       <w:keepLines/>
@@ -24647,7 +24691,7 @@
     <w:semiHidden/>
     <w:unhideWhenUsed/>
     <w:qFormat/>
-    <w:rsid w:val="00912CFA"/>
+    <w:rsid w:val="005C1A20"/>
     <w:pPr>
       <w:keepNext/>
       <w:keepLines/>
@@ -24691,7 +24735,7 @@
     <w:basedOn w:val="Fontepargpadro"/>
     <w:link w:val="Ttulo1"/>
     <w:uiPriority w:val="9"/>
-    <w:rsid w:val="00912CFA"/>
+    <w:rsid w:val="005C1A20"/>
     <w:rPr>
       <w:rFonts w:asciiTheme="majorHAnsi" w:eastAsiaTheme="majorEastAsia" w:hAnsiTheme="majorHAnsi" w:cstheme="majorBidi"/>
       <w:color w:val="0F4761" w:themeColor="accent1" w:themeShade="BF"/>
@@ -24704,7 +24748,7 @@
     <w:basedOn w:val="Fontepargpadro"/>
     <w:link w:val="Ttulo2"/>
     <w:uiPriority w:val="9"/>
-    <w:rsid w:val="00912CFA"/>
+    <w:rsid w:val="005C1A20"/>
     <w:rPr>
       <w:rFonts w:asciiTheme="majorHAnsi" w:eastAsiaTheme="majorEastAsia" w:hAnsiTheme="majorHAnsi" w:cstheme="majorBidi"/>
       <w:color w:val="0F4761" w:themeColor="accent1" w:themeShade="BF"/>
@@ -24718,7 +24762,7 @@
     <w:link w:val="Ttulo3"/>
     <w:uiPriority w:val="9"/>
     <w:semiHidden/>
-    <w:rsid w:val="00912CFA"/>
+    <w:rsid w:val="005C1A20"/>
     <w:rPr>
       <w:rFonts w:eastAsiaTheme="majorEastAsia" w:cstheme="majorBidi"/>
       <w:color w:val="0F4761" w:themeColor="accent1" w:themeShade="BF"/>
@@ -24732,7 +24776,7 @@
     <w:link w:val="Ttulo4"/>
     <w:uiPriority w:val="9"/>
     <w:semiHidden/>
-    <w:rsid w:val="00912CFA"/>
+    <w:rsid w:val="005C1A20"/>
     <w:rPr>
       <w:rFonts w:eastAsiaTheme="majorEastAsia" w:cstheme="majorBidi"/>
       <w:i/>
@@ -24746,7 +24790,7 @@
     <w:link w:val="Ttulo5"/>
     <w:uiPriority w:val="9"/>
     <w:semiHidden/>
-    <w:rsid w:val="00912CFA"/>
+    <w:rsid w:val="005C1A20"/>
     <w:rPr>
       <w:rFonts w:eastAsiaTheme="majorEastAsia" w:cstheme="majorBidi"/>
       <w:color w:val="0F4761" w:themeColor="accent1" w:themeShade="BF"/>
@@ -24758,7 +24802,7 @@
     <w:link w:val="Ttulo6"/>
     <w:uiPriority w:val="9"/>
     <w:semiHidden/>
-    <w:rsid w:val="00912CFA"/>
+    <w:rsid w:val="005C1A20"/>
     <w:rPr>
       <w:rFonts w:eastAsiaTheme="majorEastAsia" w:cstheme="majorBidi"/>
       <w:i/>
@@ -24772,7 +24816,7 @@
     <w:link w:val="Ttulo7"/>
     <w:uiPriority w:val="9"/>
     <w:semiHidden/>
-    <w:rsid w:val="00912CFA"/>
+    <w:rsid w:val="005C1A20"/>
     <w:rPr>
       <w:rFonts w:eastAsiaTheme="majorEastAsia" w:cstheme="majorBidi"/>
       <w:color w:val="595959" w:themeColor="text1" w:themeTint="A6"/>
@@ -24784,7 +24828,7 @@
     <w:link w:val="Ttulo8"/>
     <w:uiPriority w:val="9"/>
     <w:semiHidden/>
-    <w:rsid w:val="00912CFA"/>
+    <w:rsid w:val="005C1A20"/>
     <w:rPr>
       <w:rFonts w:eastAsiaTheme="majorEastAsia" w:cstheme="majorBidi"/>
       <w:i/>
@@ -24798,7 +24842,7 @@
     <w:link w:val="Ttulo9"/>
     <w:uiPriority w:val="9"/>
     <w:semiHidden/>
-    <w:rsid w:val="00912CFA"/>
+    <w:rsid w:val="005C1A20"/>
     <w:rPr>
       <w:rFonts w:eastAsiaTheme="majorEastAsia" w:cstheme="majorBidi"/>
       <w:color w:val="272727" w:themeColor="text1" w:themeTint="D8"/>
@@ -24811,7 +24855,7 @@
     <w:link w:val="TtuloChar"/>
     <w:uiPriority w:val="10"/>
     <w:qFormat/>
-    <w:rsid w:val="00912CFA"/>
+    <w:rsid w:val="005C1A20"/>
     <w:pPr>
       <w:spacing w:after="80" w:line="240" w:lineRule="auto"/>
       <w:contextualSpacing/>
@@ -24829,7 +24873,7 @@
     <w:basedOn w:val="Fontepargpadro"/>
     <w:link w:val="Ttulo"/>
     <w:uiPriority w:val="10"/>
-    <w:rsid w:val="00912CFA"/>
+    <w:rsid w:val="005C1A20"/>
     <w:rPr>
       <w:rFonts w:asciiTheme="majorHAnsi" w:eastAsiaTheme="majorEastAsia" w:hAnsiTheme="majorHAnsi" w:cstheme="majorBidi"/>
       <w:spacing w:val="-10"/>
@@ -24845,7 +24889,7 @@
     <w:link w:val="SubttuloChar"/>
     <w:uiPriority w:val="11"/>
     <w:qFormat/>
-    <w:rsid w:val="00912CFA"/>
+    <w:rsid w:val="005C1A20"/>
     <w:pPr>
       <w:numPr>
         <w:ilvl w:val="1"/>
@@ -24864,7 +24908,7 @@
     <w:basedOn w:val="Fontepargpadro"/>
     <w:link w:val="Subttulo"/>
     <w:uiPriority w:val="11"/>
-    <w:rsid w:val="00912CFA"/>
+    <w:rsid w:val="005C1A20"/>
     <w:rPr>
       <w:rFonts w:eastAsiaTheme="majorEastAsia" w:cstheme="majorBidi"/>
       <w:color w:val="595959" w:themeColor="text1" w:themeTint="A6"/>
@@ -24880,7 +24924,7 @@
     <w:link w:val="CitaoChar"/>
     <w:uiPriority w:val="29"/>
     <w:qFormat/>
-    <w:rsid w:val="00912CFA"/>
+    <w:rsid w:val="005C1A20"/>
     <w:pPr>
       <w:spacing w:before="160"/>
       <w:jc w:val="center"/>
@@ -24896,7 +24940,7 @@
     <w:basedOn w:val="Fontepargpadro"/>
     <w:link w:val="Citao"/>
     <w:uiPriority w:val="29"/>
-    <w:rsid w:val="00912CFA"/>
+    <w:rsid w:val="005C1A20"/>
     <w:rPr>
       <w:i/>
       <w:iCs/>
@@ -24908,7 +24952,7 @@
     <w:basedOn w:val="Normal"/>
     <w:uiPriority w:val="34"/>
     <w:qFormat/>
-    <w:rsid w:val="00912CFA"/>
+    <w:rsid w:val="005C1A20"/>
     <w:pPr>
       <w:ind w:left="720"/>
       <w:contextualSpacing/>
@@ -24919,7 +24963,7 @@
     <w:basedOn w:val="Fontepargpadro"/>
     <w:uiPriority w:val="21"/>
     <w:qFormat/>
-    <w:rsid w:val="00912CFA"/>
+    <w:rsid w:val="005C1A20"/>
     <w:rPr>
       <w:i/>
       <w:iCs/>
@@ -24933,7 +24977,7 @@
     <w:link w:val="CitaoIntensaChar"/>
     <w:uiPriority w:val="30"/>
     <w:qFormat/>
-    <w:rsid w:val="00912CFA"/>
+    <w:rsid w:val="005C1A20"/>
     <w:pPr>
       <w:pBdr>
         <w:top w:val="single" w:sz="4" w:space="10" w:color="0F4761" w:themeColor="accent1" w:themeShade="BF"/>
@@ -24954,7 +24998,7 @@
     <w:basedOn w:val="Fontepargpadro"/>
     <w:link w:val="CitaoIntensa"/>
     <w:uiPriority w:val="30"/>
-    <w:rsid w:val="00912CFA"/>
+    <w:rsid w:val="005C1A20"/>
     <w:rPr>
       <w:i/>
       <w:iCs/>
@@ -24966,7 +25010,7 @@
     <w:basedOn w:val="Fontepargpadro"/>
     <w:uiPriority w:val="32"/>
     <w:qFormat/>
-    <w:rsid w:val="00912CFA"/>
+    <w:rsid w:val="005C1A20"/>
     <w:rPr>
       <w:b/>
       <w:bCs/>
@@ -24981,7 +25025,7 @@
     <w:link w:val="CabealhoChar"/>
     <w:uiPriority w:val="99"/>
     <w:unhideWhenUsed/>
-    <w:rsid w:val="00912CFA"/>
+    <w:rsid w:val="005C1A20"/>
     <w:pPr>
       <w:tabs>
         <w:tab w:val="center" w:pos="4252"/>
@@ -24995,7 +25039,7 @@
     <w:basedOn w:val="Fontepargpadro"/>
     <w:link w:val="Cabealho"/>
     <w:uiPriority w:val="99"/>
-    <w:rsid w:val="00912CFA"/>
+    <w:rsid w:val="005C1A20"/>
   </w:style>
   <w:style w:type="paragraph" w:styleId="Rodap">
     <w:name w:val="footer"/>
@@ -25003,7 +25047,7 @@
     <w:link w:val="RodapChar"/>
     <w:uiPriority w:val="99"/>
     <w:unhideWhenUsed/>
-    <w:rsid w:val="00912CFA"/>
+    <w:rsid w:val="005C1A20"/>
     <w:pPr>
       <w:tabs>
         <w:tab w:val="center" w:pos="4252"/>
@@ -25017,7 +25061,7 @@
     <w:basedOn w:val="Fontepargpadro"/>
     <w:link w:val="Rodap"/>
     <w:uiPriority w:val="99"/>
-    <w:rsid w:val="00912CFA"/>
+    <w:rsid w:val="005C1A20"/>
   </w:style>
   <w:style w:type="paragraph" w:styleId="Sumrio1">
     <w:name w:val="toc 1"/>
@@ -25026,7 +25070,7 @@
     <w:autoRedefine/>
     <w:uiPriority w:val="39"/>
     <w:unhideWhenUsed/>
-    <w:rsid w:val="00912CFA"/>
+    <w:rsid w:val="005C1A20"/>
     <w:pPr>
       <w:spacing w:after="100"/>
     </w:pPr>
@@ -25038,7 +25082,7 @@
     <w:autoRedefine/>
     <w:uiPriority w:val="39"/>
     <w:unhideWhenUsed/>
-    <w:rsid w:val="00912CFA"/>
+    <w:rsid w:val="005C1A20"/>
     <w:pPr>
       <w:spacing w:after="100"/>
       <w:ind w:left="240"/>

</xml_diff>

<commit_message>
Sincroniza com a produção — Fase 2 de detalhamento do cronograma (status automático da Atividade na EAP, fecha a proposta)
Co-Authored-By: Claude Sonnet 5 <noreply@anthropic.com>
</commit_message>
<xml_diff>
--- a/Manual de Uso - Ferramenta de Gestao de Projetos.docx
+++ b/Manual de Uso - Ferramenta de Gestao de Projetos.docx
@@ -229,7 +229,7 @@
         <w:rPr>
           <w:noProof/>
         </w:rPr>
-        <w:instrText xml:space="preserve"> PAGEREF _Toc240271765 \h </w:instrText>
+        <w:instrText xml:space="preserve"> PAGEREF _Toc240273001 \h </w:instrText>
       </w:r>
       <w:r>
         <w:rPr>
@@ -290,7 +290,7 @@
         <w:rPr>
           <w:noProof/>
         </w:rPr>
-        <w:instrText xml:space="preserve"> PAGEREF _Toc240271766 \h </w:instrText>
+        <w:instrText xml:space="preserve"> PAGEREF _Toc240273002 \h </w:instrText>
       </w:r>
       <w:r>
         <w:rPr>
@@ -351,7 +351,7 @@
         <w:rPr>
           <w:noProof/>
         </w:rPr>
-        <w:instrText xml:space="preserve"> PAGEREF _Toc240271767 \h </w:instrText>
+        <w:instrText xml:space="preserve"> PAGEREF _Toc240273003 \h </w:instrText>
       </w:r>
       <w:r>
         <w:rPr>
@@ -412,7 +412,7 @@
         <w:rPr>
           <w:noProof/>
         </w:rPr>
-        <w:instrText xml:space="preserve"> PAGEREF _Toc240271768 \h </w:instrText>
+        <w:instrText xml:space="preserve"> PAGEREF _Toc240273004 \h </w:instrText>
       </w:r>
       <w:r>
         <w:rPr>
@@ -473,7 +473,7 @@
         <w:rPr>
           <w:noProof/>
         </w:rPr>
-        <w:instrText xml:space="preserve"> PAGEREF _Toc240271769 \h </w:instrText>
+        <w:instrText xml:space="preserve"> PAGEREF _Toc240273005 \h </w:instrText>
       </w:r>
       <w:r>
         <w:rPr>
@@ -534,7 +534,7 @@
         <w:rPr>
           <w:noProof/>
         </w:rPr>
-        <w:instrText xml:space="preserve"> PAGEREF _Toc240271770 \h </w:instrText>
+        <w:instrText xml:space="preserve"> PAGEREF _Toc240273006 \h </w:instrText>
       </w:r>
       <w:r>
         <w:rPr>
@@ -595,7 +595,7 @@
         <w:rPr>
           <w:noProof/>
         </w:rPr>
-        <w:instrText xml:space="preserve"> PAGEREF _Toc240271771 \h </w:instrText>
+        <w:instrText xml:space="preserve"> PAGEREF _Toc240273007 \h </w:instrText>
       </w:r>
       <w:r>
         <w:rPr>
@@ -656,7 +656,7 @@
         <w:rPr>
           <w:noProof/>
         </w:rPr>
-        <w:instrText xml:space="preserve"> PAGEREF _Toc240271772 \h </w:instrText>
+        <w:instrText xml:space="preserve"> PAGEREF _Toc240273008 \h </w:instrText>
       </w:r>
       <w:r>
         <w:rPr>
@@ -717,7 +717,7 @@
         <w:rPr>
           <w:noProof/>
         </w:rPr>
-        <w:instrText xml:space="preserve"> PAGEREF _Toc240271773 \h </w:instrText>
+        <w:instrText xml:space="preserve"> PAGEREF _Toc240273009 \h </w:instrText>
       </w:r>
       <w:r>
         <w:rPr>
@@ -778,7 +778,7 @@
         <w:rPr>
           <w:noProof/>
         </w:rPr>
-        <w:instrText xml:space="preserve"> PAGEREF _Toc240271774 \h </w:instrText>
+        <w:instrText xml:space="preserve"> PAGEREF _Toc240273010 \h </w:instrText>
       </w:r>
       <w:r>
         <w:rPr>
@@ -839,7 +839,7 @@
         <w:rPr>
           <w:noProof/>
         </w:rPr>
-        <w:instrText xml:space="preserve"> PAGEREF _Toc240271775 \h </w:instrText>
+        <w:instrText xml:space="preserve"> PAGEREF _Toc240273011 \h </w:instrText>
       </w:r>
       <w:r>
         <w:rPr>
@@ -900,7 +900,7 @@
         <w:rPr>
           <w:noProof/>
         </w:rPr>
-        <w:instrText xml:space="preserve"> PAGEREF _Toc240271776 \h </w:instrText>
+        <w:instrText xml:space="preserve"> PAGEREF _Toc240273012 \h </w:instrText>
       </w:r>
       <w:r>
         <w:rPr>
@@ -961,7 +961,7 @@
         <w:rPr>
           <w:noProof/>
         </w:rPr>
-        <w:instrText xml:space="preserve"> PAGEREF _Toc240271777 \h </w:instrText>
+        <w:instrText xml:space="preserve"> PAGEREF _Toc240273013 \h </w:instrText>
       </w:r>
       <w:r>
         <w:rPr>
@@ -1022,7 +1022,7 @@
         <w:rPr>
           <w:noProof/>
         </w:rPr>
-        <w:instrText xml:space="preserve"> PAGEREF _Toc240271778 \h </w:instrText>
+        <w:instrText xml:space="preserve"> PAGEREF _Toc240273014 \h </w:instrText>
       </w:r>
       <w:r>
         <w:rPr>
@@ -1083,7 +1083,7 @@
         <w:rPr>
           <w:noProof/>
         </w:rPr>
-        <w:instrText xml:space="preserve"> PAGEREF _Toc240271779 \h </w:instrText>
+        <w:instrText xml:space="preserve"> PAGEREF _Toc240273015 \h </w:instrText>
       </w:r>
       <w:r>
         <w:rPr>
@@ -1144,7 +1144,7 @@
         <w:rPr>
           <w:noProof/>
         </w:rPr>
-        <w:instrText xml:space="preserve"> PAGEREF _Toc240271780 \h </w:instrText>
+        <w:instrText xml:space="preserve"> PAGEREF _Toc240273016 \h </w:instrText>
       </w:r>
       <w:r>
         <w:rPr>
@@ -1205,7 +1205,7 @@
         <w:rPr>
           <w:noProof/>
         </w:rPr>
-        <w:instrText xml:space="preserve"> PAGEREF _Toc240271781 \h </w:instrText>
+        <w:instrText xml:space="preserve"> PAGEREF _Toc240273017 \h </w:instrText>
       </w:r>
       <w:r>
         <w:rPr>
@@ -1266,7 +1266,7 @@
         <w:rPr>
           <w:noProof/>
         </w:rPr>
-        <w:instrText xml:space="preserve"> PAGEREF _Toc240271782 \h </w:instrText>
+        <w:instrText xml:space="preserve"> PAGEREF _Toc240273018 \h </w:instrText>
       </w:r>
       <w:r>
         <w:rPr>
@@ -1327,7 +1327,7 @@
         <w:rPr>
           <w:noProof/>
         </w:rPr>
-        <w:instrText xml:space="preserve"> PAGEREF _Toc240271783 \h </w:instrText>
+        <w:instrText xml:space="preserve"> PAGEREF _Toc240273019 \h </w:instrText>
       </w:r>
       <w:r>
         <w:rPr>
@@ -1388,7 +1388,7 @@
         <w:rPr>
           <w:noProof/>
         </w:rPr>
-        <w:instrText xml:space="preserve"> PAGEREF _Toc240271784 \h </w:instrText>
+        <w:instrText xml:space="preserve"> PAGEREF _Toc240273020 \h </w:instrText>
       </w:r>
       <w:r>
         <w:rPr>
@@ -1449,7 +1449,7 @@
         <w:rPr>
           <w:noProof/>
         </w:rPr>
-        <w:instrText xml:space="preserve"> PAGEREF _Toc240271785 \h </w:instrText>
+        <w:instrText xml:space="preserve"> PAGEREF _Toc240273021 \h </w:instrText>
       </w:r>
       <w:r>
         <w:rPr>
@@ -1510,7 +1510,7 @@
         <w:rPr>
           <w:noProof/>
         </w:rPr>
-        <w:instrText xml:space="preserve"> PAGEREF _Toc240271786 \h </w:instrText>
+        <w:instrText xml:space="preserve"> PAGEREF _Toc240273022 \h </w:instrText>
       </w:r>
       <w:r>
         <w:rPr>
@@ -1571,7 +1571,7 @@
         <w:rPr>
           <w:noProof/>
         </w:rPr>
-        <w:instrText xml:space="preserve"> PAGEREF _Toc240271787 \h </w:instrText>
+        <w:instrText xml:space="preserve"> PAGEREF _Toc240273023 \h </w:instrText>
       </w:r>
       <w:r>
         <w:rPr>
@@ -1632,7 +1632,7 @@
         <w:rPr>
           <w:noProof/>
         </w:rPr>
-        <w:instrText xml:space="preserve"> PAGEREF _Toc240271788 \h </w:instrText>
+        <w:instrText xml:space="preserve"> PAGEREF _Toc240273024 \h </w:instrText>
       </w:r>
       <w:r>
         <w:rPr>
@@ -1693,7 +1693,7 @@
         <w:rPr>
           <w:noProof/>
         </w:rPr>
-        <w:instrText xml:space="preserve"> PAGEREF _Toc240271789 \h </w:instrText>
+        <w:instrText xml:space="preserve"> PAGEREF _Toc240273025 \h </w:instrText>
       </w:r>
       <w:r>
         <w:rPr>
@@ -1755,7 +1755,7 @@
         <w:rPr>
           <w:noProof/>
         </w:rPr>
-        <w:instrText xml:space="preserve"> PAGEREF _Toc240271790 \h </w:instrText>
+        <w:instrText xml:space="preserve"> PAGEREF _Toc240273026 \h </w:instrText>
       </w:r>
       <w:r>
         <w:rPr>
@@ -1816,7 +1816,7 @@
         <w:rPr>
           <w:noProof/>
         </w:rPr>
-        <w:instrText xml:space="preserve"> PAGEREF _Toc240271791 \h </w:instrText>
+        <w:instrText xml:space="preserve"> PAGEREF _Toc240273027 \h </w:instrText>
       </w:r>
       <w:r>
         <w:rPr>
@@ -1877,7 +1877,7 @@
         <w:rPr>
           <w:noProof/>
         </w:rPr>
-        <w:instrText xml:space="preserve"> PAGEREF _Toc240271792 \h </w:instrText>
+        <w:instrText xml:space="preserve"> PAGEREF _Toc240273028 \h </w:instrText>
       </w:r>
       <w:r>
         <w:rPr>
@@ -1938,7 +1938,7 @@
         <w:rPr>
           <w:noProof/>
         </w:rPr>
-        <w:instrText xml:space="preserve"> PAGEREF _Toc240271793 \h </w:instrText>
+        <w:instrText xml:space="preserve"> PAGEREF _Toc240273029 \h </w:instrText>
       </w:r>
       <w:r>
         <w:rPr>
@@ -1999,7 +1999,7 @@
         <w:rPr>
           <w:noProof/>
         </w:rPr>
-        <w:instrText xml:space="preserve"> PAGEREF _Toc240271794 \h </w:instrText>
+        <w:instrText xml:space="preserve"> PAGEREF _Toc240273030 \h </w:instrText>
       </w:r>
       <w:r>
         <w:rPr>
@@ -2060,7 +2060,7 @@
         <w:rPr>
           <w:noProof/>
         </w:rPr>
-        <w:instrText xml:space="preserve"> PAGEREF _Toc240271795 \h </w:instrText>
+        <w:instrText xml:space="preserve"> PAGEREF _Toc240273031 \h </w:instrText>
       </w:r>
       <w:r>
         <w:rPr>
@@ -2121,7 +2121,7 @@
         <w:rPr>
           <w:noProof/>
         </w:rPr>
-        <w:instrText xml:space="preserve"> PAGEREF _Toc240271796 \h </w:instrText>
+        <w:instrText xml:space="preserve"> PAGEREF _Toc240273032 \h </w:instrText>
       </w:r>
       <w:r>
         <w:rPr>
@@ -2182,7 +2182,7 @@
         <w:rPr>
           <w:noProof/>
         </w:rPr>
-        <w:instrText xml:space="preserve"> PAGEREF _Toc240271797 \h </w:instrText>
+        <w:instrText xml:space="preserve"> PAGEREF _Toc240273033 \h </w:instrText>
       </w:r>
       <w:r>
         <w:rPr>
@@ -2243,7 +2243,7 @@
         <w:rPr>
           <w:noProof/>
         </w:rPr>
-        <w:instrText xml:space="preserve"> PAGEREF _Toc240271798 \h </w:instrText>
+        <w:instrText xml:space="preserve"> PAGEREF _Toc240273034 \h </w:instrText>
       </w:r>
       <w:r>
         <w:rPr>
@@ -2304,7 +2304,7 @@
         <w:rPr>
           <w:noProof/>
         </w:rPr>
-        <w:instrText xml:space="preserve"> PAGEREF _Toc240271799 \h </w:instrText>
+        <w:instrText xml:space="preserve"> PAGEREF _Toc240273035 \h </w:instrText>
       </w:r>
       <w:r>
         <w:rPr>
@@ -2365,7 +2365,7 @@
         <w:rPr>
           <w:noProof/>
         </w:rPr>
-        <w:instrText xml:space="preserve"> PAGEREF _Toc240271800 \h </w:instrText>
+        <w:instrText xml:space="preserve"> PAGEREF _Toc240273036 \h </w:instrText>
       </w:r>
       <w:r>
         <w:rPr>
@@ -2426,7 +2426,7 @@
         <w:rPr>
           <w:noProof/>
         </w:rPr>
-        <w:instrText xml:space="preserve"> PAGEREF _Toc240271801 \h </w:instrText>
+        <w:instrText xml:space="preserve"> PAGEREF _Toc240273037 \h </w:instrText>
       </w:r>
       <w:r>
         <w:rPr>
@@ -2487,7 +2487,7 @@
         <w:rPr>
           <w:noProof/>
         </w:rPr>
-        <w:instrText xml:space="preserve"> PAGEREF _Toc240271802 \h </w:instrText>
+        <w:instrText xml:space="preserve"> PAGEREF _Toc240273038 \h </w:instrText>
       </w:r>
       <w:r>
         <w:rPr>
@@ -2548,7 +2548,7 @@
         <w:rPr>
           <w:noProof/>
         </w:rPr>
-        <w:instrText xml:space="preserve"> PAGEREF _Toc240271803 \h </w:instrText>
+        <w:instrText xml:space="preserve"> PAGEREF _Toc240273039 \h </w:instrText>
       </w:r>
       <w:r>
         <w:rPr>
@@ -2609,7 +2609,7 @@
         <w:rPr>
           <w:noProof/>
         </w:rPr>
-        <w:instrText xml:space="preserve"> PAGEREF _Toc240271804 \h </w:instrText>
+        <w:instrText xml:space="preserve"> PAGEREF _Toc240273040 \h </w:instrText>
       </w:r>
       <w:r>
         <w:rPr>
@@ -2670,7 +2670,7 @@
         <w:rPr>
           <w:noProof/>
         </w:rPr>
-        <w:instrText xml:space="preserve"> PAGEREF _Toc240271805 \h </w:instrText>
+        <w:instrText xml:space="preserve"> PAGEREF _Toc240273041 \h </w:instrText>
       </w:r>
       <w:r>
         <w:rPr>
@@ -2731,7 +2731,7 @@
         <w:rPr>
           <w:noProof/>
         </w:rPr>
-        <w:instrText xml:space="preserve"> PAGEREF _Toc240271806 \h </w:instrText>
+        <w:instrText xml:space="preserve"> PAGEREF _Toc240273042 \h </w:instrText>
       </w:r>
       <w:r>
         <w:rPr>
@@ -2792,7 +2792,7 @@
         <w:rPr>
           <w:noProof/>
         </w:rPr>
-        <w:instrText xml:space="preserve"> PAGEREF _Toc240271807 \h </w:instrText>
+        <w:instrText xml:space="preserve"> PAGEREF _Toc240273043 \h </w:instrText>
       </w:r>
       <w:r>
         <w:rPr>
@@ -2853,7 +2853,7 @@
         <w:rPr>
           <w:noProof/>
         </w:rPr>
-        <w:instrText xml:space="preserve"> PAGEREF _Toc240271808 \h </w:instrText>
+        <w:instrText xml:space="preserve"> PAGEREF _Toc240273044 \h </w:instrText>
       </w:r>
       <w:r>
         <w:rPr>
@@ -2914,7 +2914,7 @@
         <w:rPr>
           <w:noProof/>
         </w:rPr>
-        <w:instrText xml:space="preserve"> PAGEREF _Toc240271809 \h </w:instrText>
+        <w:instrText xml:space="preserve"> PAGEREF _Toc240273045 \h </w:instrText>
       </w:r>
       <w:r>
         <w:rPr>
@@ -2975,7 +2975,7 @@
         <w:rPr>
           <w:noProof/>
         </w:rPr>
-        <w:instrText xml:space="preserve"> PAGEREF _Toc240271810 \h </w:instrText>
+        <w:instrText xml:space="preserve"> PAGEREF _Toc240273046 \h </w:instrText>
       </w:r>
       <w:r>
         <w:rPr>
@@ -3036,7 +3036,7 @@
         <w:rPr>
           <w:noProof/>
         </w:rPr>
-        <w:instrText xml:space="preserve"> PAGEREF _Toc240271811 \h </w:instrText>
+        <w:instrText xml:space="preserve"> PAGEREF _Toc240273047 \h </w:instrText>
       </w:r>
       <w:r>
         <w:rPr>
@@ -3097,7 +3097,7 @@
         <w:rPr>
           <w:noProof/>
         </w:rPr>
-        <w:instrText xml:space="preserve"> PAGEREF _Toc240271812 \h </w:instrText>
+        <w:instrText xml:space="preserve"> PAGEREF _Toc240273048 \h </w:instrText>
       </w:r>
       <w:r>
         <w:rPr>
@@ -3173,7 +3173,7 @@
           <w:sz w:val="34"/>
         </w:rPr>
       </w:pPr>
-      <w:bookmarkStart w:id="0" w:name="_Toc240271765"/>
+      <w:bookmarkStart w:id="0" w:name="_Toc240273001"/>
       <w:r>
         <w:rPr>
           <w:rFonts w:ascii="Montserrat" w:hAnsi="Montserrat"/>
@@ -3197,7 +3197,7 @@
           <w:sz w:val="27"/>
         </w:rPr>
       </w:pPr>
-      <w:bookmarkStart w:id="1" w:name="_Toc240271766"/>
+      <w:bookmarkStart w:id="1" w:name="_Toc240273002"/>
       <w:r>
         <w:rPr>
           <w:rFonts w:ascii="Montserrat" w:hAnsi="Montserrat"/>
@@ -4539,6 +4539,24 @@
           <w:color w:val="1A1A1A"/>
           <w:sz w:val="22"/>
         </w:rPr>
+        <w:t>Esta e a versao 2.66 do manual. Em relacao a versao 2.65 (14/09/2026), a Fase 2 fecha a proposta de detalhamento do cronograma: a Atividade (nivel 3) da EAP (Passo 5) ganhou o mesmo status automatico que a Entrega ja tinha, um nivel mais fundo - casando pelo nome da atividade com uma tarefa de qualquer marco do cronograma (Passo 4). Como tarefa nao tem data, os selos possiveis sao so Concluida, Pendente ou Sem tarefa vinculada - sem o estado Atrasada que a Entrega tem. Fecha a amarracao pedida: agora da para ver na EAP o que ficou pendente no detalhamento do cronograma.</w:t>
+      </w:r>
+    </w:p>
+    <w:p>
+      <w:pPr>
+        <w:spacing w:line="280" w:lineRule="auto"/>
+        <w:rPr>
+          <w:rFonts w:ascii="Montserrat" w:hAnsi="Montserrat"/>
+          <w:color w:val="1A1A1A"/>
+          <w:sz w:val="22"/>
+        </w:rPr>
+      </w:pPr>
+      <w:r>
+        <w:rPr>
+          <w:rFonts w:ascii="Montserrat" w:hAnsi="Montserrat"/>
+          <w:color w:val="1A1A1A"/>
+          <w:sz w:val="22"/>
+        </w:rPr>
         <w:t>O manual nao substitui as Diretrizes para a Gestao de Projetos da UNIALFA (documento institucional que define o framework D01 a D07) nem o documento Regras de Acesso e Permissoes (que detalha cada regra de controle de acesso); ele e o guia operacional de como usar cada ferramenta na pratica.</w:t>
       </w:r>
     </w:p>
@@ -4553,7 +4571,7 @@
           <w:sz w:val="27"/>
         </w:rPr>
       </w:pPr>
-      <w:bookmarkStart w:id="2" w:name="_Toc240271767"/>
+      <w:bookmarkStart w:id="2" w:name="_Toc240273003"/>
       <w:r>
         <w:rPr>
           <w:rFonts w:ascii="Montserrat" w:hAnsi="Montserrat"/>
@@ -4718,6 +4736,7 @@
           <w:color w:val="1A1A1A"/>
           <w:sz w:val="22"/>
         </w:rPr>
+        <w:lastRenderedPageBreak/>
         <w:t>Cada formulario de registro tem duas partes: uma tela de preenchimento (+Novo...) e uma tela de consulta (...cadastrados), onde ficam listados todos os registros ja salvos, com opcao de abrir, editar o status ou excluir cada um.</w:t>
       </w:r>
     </w:p>
@@ -4748,18 +4767,17 @@
         <w:rPr>
           <w:noProof/>
         </w:rPr>
-        <w:lastRenderedPageBreak/>
         <w:drawing>
-          <wp:inline distT="0" distB="0" distL="0" distR="0" wp14:anchorId="3B0B53B8" wp14:editId="0F770723">
+          <wp:inline distT="0" distB="0" distL="0" distR="0" wp14:anchorId="7E328FCC" wp14:editId="1886E558">
             <wp:extent cx="5303520" cy="4792851"/>
             <wp:effectExtent l="19050" t="19050" r="11430" b="27305"/>
-            <wp:docPr id="864351137" name="Imagem 1"/>
+            <wp:docPr id="1259996565" name="Imagem 1"/>
             <wp:cNvGraphicFramePr/>
             <a:graphic xmlns:a="http://schemas.openxmlformats.org/drawingml/2006/main">
               <a:graphicData uri="http://schemas.openxmlformats.org/drawingml/2006/picture">
                 <pic:pic xmlns:pic="http://schemas.openxmlformats.org/drawingml/2006/picture">
                   <pic:nvPicPr>
-                    <pic:cNvPr id="864351137" name=""/>
+                    <pic:cNvPr id="1259996565" name=""/>
                     <pic:cNvPicPr/>
                   </pic:nvPicPr>
                   <pic:blipFill>
@@ -4827,7 +4845,7 @@
           <w:sz w:val="27"/>
         </w:rPr>
       </w:pPr>
-      <w:bookmarkStart w:id="3" w:name="_Toc240271768"/>
+      <w:bookmarkStart w:id="3" w:name="_Toc240273004"/>
       <w:r>
         <w:rPr>
           <w:rFonts w:ascii="Montserrat" w:hAnsi="Montserrat"/>
@@ -4868,16 +4886,16 @@
         </w:rPr>
         <w:lastRenderedPageBreak/>
         <w:drawing>
-          <wp:inline distT="0" distB="0" distL="0" distR="0" wp14:anchorId="6D3C2800" wp14:editId="25CA602B">
+          <wp:inline distT="0" distB="0" distL="0" distR="0" wp14:anchorId="421E09B6" wp14:editId="77C5B73A">
             <wp:extent cx="4206240" cy="3801227"/>
             <wp:effectExtent l="19050" t="19050" r="22860" b="27940"/>
-            <wp:docPr id="2022227929" name="Imagem 2"/>
+            <wp:docPr id="250181409" name="Imagem 2"/>
             <wp:cNvGraphicFramePr/>
             <a:graphic xmlns:a="http://schemas.openxmlformats.org/drawingml/2006/main">
               <a:graphicData uri="http://schemas.openxmlformats.org/drawingml/2006/picture">
                 <pic:pic xmlns:pic="http://schemas.openxmlformats.org/drawingml/2006/picture">
                   <pic:nvPicPr>
-                    <pic:cNvPr id="2022227929" name=""/>
+                    <pic:cNvPr id="250181409" name=""/>
                     <pic:cNvPicPr/>
                   </pic:nvPicPr>
                   <pic:blipFill>
@@ -5050,7 +5068,7 @@
           <w:sz w:val="27"/>
         </w:rPr>
       </w:pPr>
-      <w:bookmarkStart w:id="4" w:name="_Toc240271769"/>
+      <w:bookmarkStart w:id="4" w:name="_Toc240273005"/>
       <w:r>
         <w:rPr>
           <w:rFonts w:ascii="Montserrat" w:hAnsi="Montserrat"/>
@@ -6289,7 +6307,7 @@
           <w:sz w:val="34"/>
         </w:rPr>
       </w:pPr>
-      <w:bookmarkStart w:id="5" w:name="_Toc240271770"/>
+      <w:bookmarkStart w:id="5" w:name="_Toc240273006"/>
       <w:r>
         <w:rPr>
           <w:rFonts w:ascii="Montserrat" w:hAnsi="Montserrat"/>
@@ -6313,7 +6331,7 @@
           <w:sz w:val="27"/>
         </w:rPr>
       </w:pPr>
-      <w:bookmarkStart w:id="6" w:name="_Toc240271771"/>
+      <w:bookmarkStart w:id="6" w:name="_Toc240273007"/>
       <w:r>
         <w:rPr>
           <w:rFonts w:ascii="Montserrat" w:hAnsi="Montserrat"/>
@@ -6354,7 +6372,7 @@
           <w:sz w:val="27"/>
         </w:rPr>
       </w:pPr>
-      <w:bookmarkStart w:id="7" w:name="_Toc240271772"/>
+      <w:bookmarkStart w:id="7" w:name="_Toc240273008"/>
       <w:r>
         <w:rPr>
           <w:rFonts w:ascii="Montserrat" w:hAnsi="Montserrat"/>
@@ -6473,7 +6491,7 @@
           <w:sz w:val="27"/>
         </w:rPr>
       </w:pPr>
-      <w:bookmarkStart w:id="8" w:name="_Toc240271773"/>
+      <w:bookmarkStart w:id="8" w:name="_Toc240273009"/>
       <w:r>
         <w:rPr>
           <w:rFonts w:ascii="Montserrat" w:hAnsi="Montserrat"/>
@@ -7086,7 +7104,7 @@
           <w:sz w:val="27"/>
         </w:rPr>
       </w:pPr>
-      <w:bookmarkStart w:id="9" w:name="_Toc240271774"/>
+      <w:bookmarkStart w:id="9" w:name="_Toc240273010"/>
       <w:r>
         <w:rPr>
           <w:rFonts w:ascii="Montserrat" w:hAnsi="Montserrat"/>
@@ -7175,16 +7193,16 @@
         </w:rPr>
         <w:lastRenderedPageBreak/>
         <w:drawing>
-          <wp:inline distT="0" distB="0" distL="0" distR="0" wp14:anchorId="39703DBE" wp14:editId="1FEC73FF">
+          <wp:inline distT="0" distB="0" distL="0" distR="0" wp14:anchorId="205DB4F4" wp14:editId="4DDE0005">
             <wp:extent cx="4937760" cy="4462310"/>
             <wp:effectExtent l="19050" t="19050" r="15240" b="14605"/>
-            <wp:docPr id="756738982" name="Imagem 3"/>
+            <wp:docPr id="3391484" name="Imagem 3"/>
             <wp:cNvGraphicFramePr/>
             <a:graphic xmlns:a="http://schemas.openxmlformats.org/drawingml/2006/main">
               <a:graphicData uri="http://schemas.openxmlformats.org/drawingml/2006/picture">
                 <pic:pic xmlns:pic="http://schemas.openxmlformats.org/drawingml/2006/picture">
                   <pic:nvPicPr>
-                    <pic:cNvPr id="756738982" name=""/>
+                    <pic:cNvPr id="3391484" name=""/>
                     <pic:cNvPicPr/>
                   </pic:nvPicPr>
                   <pic:blipFill>
@@ -7252,7 +7270,7 @@
           <w:sz w:val="27"/>
         </w:rPr>
       </w:pPr>
-      <w:bookmarkStart w:id="10" w:name="_Toc240271775"/>
+      <w:bookmarkStart w:id="10" w:name="_Toc240273011"/>
       <w:r>
         <w:rPr>
           <w:rFonts w:ascii="Montserrat" w:hAnsi="Montserrat"/>
@@ -7293,16 +7311,16 @@
         </w:rPr>
         <w:lastRenderedPageBreak/>
         <w:drawing>
-          <wp:inline distT="0" distB="0" distL="0" distR="0" wp14:anchorId="6AB92ABC" wp14:editId="502D82B9">
+          <wp:inline distT="0" distB="0" distL="0" distR="0" wp14:anchorId="384FD3B0" wp14:editId="356F31F0">
             <wp:extent cx="5120640" cy="4627581"/>
             <wp:effectExtent l="19050" t="19050" r="22860" b="20955"/>
-            <wp:docPr id="2038557052" name="Imagem 4"/>
+            <wp:docPr id="1588117104" name="Imagem 4"/>
             <wp:cNvGraphicFramePr/>
             <a:graphic xmlns:a="http://schemas.openxmlformats.org/drawingml/2006/main">
               <a:graphicData uri="http://schemas.openxmlformats.org/drawingml/2006/picture">
                 <pic:pic xmlns:pic="http://schemas.openxmlformats.org/drawingml/2006/picture">
                   <pic:nvPicPr>
-                    <pic:cNvPr id="2038557052" name=""/>
+                    <pic:cNvPr id="1588117104" name=""/>
                     <pic:cNvPicPr/>
                   </pic:nvPicPr>
                   <pic:blipFill>
@@ -7470,7 +7488,7 @@
           <w:sz w:val="27"/>
         </w:rPr>
       </w:pPr>
-      <w:bookmarkStart w:id="11" w:name="_Toc240271776"/>
+      <w:bookmarkStart w:id="11" w:name="_Toc240273012"/>
       <w:r>
         <w:rPr>
           <w:rFonts w:ascii="Montserrat" w:hAnsi="Montserrat"/>
@@ -7510,16 +7528,16 @@
           <w:noProof/>
         </w:rPr>
         <w:drawing>
-          <wp:inline distT="0" distB="0" distL="0" distR="0" wp14:anchorId="007DEB53" wp14:editId="5EBA2280">
+          <wp:inline distT="0" distB="0" distL="0" distR="0" wp14:anchorId="732322D7" wp14:editId="375FF84F">
             <wp:extent cx="4206240" cy="3801227"/>
             <wp:effectExtent l="19050" t="19050" r="22860" b="27940"/>
-            <wp:docPr id="300753498" name="Imagem 5"/>
+            <wp:docPr id="1941429040" name="Imagem 5"/>
             <wp:cNvGraphicFramePr/>
             <a:graphic xmlns:a="http://schemas.openxmlformats.org/drawingml/2006/main">
               <a:graphicData uri="http://schemas.openxmlformats.org/drawingml/2006/picture">
                 <pic:pic xmlns:pic="http://schemas.openxmlformats.org/drawingml/2006/picture">
                   <pic:nvPicPr>
-                    <pic:cNvPr id="300753498" name=""/>
+                    <pic:cNvPr id="1941429040" name=""/>
                     <pic:cNvPicPr/>
                   </pic:nvPicPr>
                   <pic:blipFill>
@@ -7587,16 +7605,16 @@
         </w:rPr>
         <w:lastRenderedPageBreak/>
         <w:drawing>
-          <wp:inline distT="0" distB="0" distL="0" distR="0" wp14:anchorId="7484DF33" wp14:editId="0134B96C">
+          <wp:inline distT="0" distB="0" distL="0" distR="0" wp14:anchorId="55AFEBDF" wp14:editId="4A54EEF5">
             <wp:extent cx="4206240" cy="3801227"/>
             <wp:effectExtent l="19050" t="19050" r="22860" b="27940"/>
-            <wp:docPr id="2003091386" name="Imagem 6"/>
+            <wp:docPr id="47580427" name="Imagem 6"/>
             <wp:cNvGraphicFramePr/>
             <a:graphic xmlns:a="http://schemas.openxmlformats.org/drawingml/2006/main">
               <a:graphicData uri="http://schemas.openxmlformats.org/drawingml/2006/picture">
                 <pic:pic xmlns:pic="http://schemas.openxmlformats.org/drawingml/2006/picture">
                   <pic:nvPicPr>
-                    <pic:cNvPr id="2003091386" name=""/>
+                    <pic:cNvPr id="47580427" name=""/>
                     <pic:cNvPicPr/>
                   </pic:nvPicPr>
                   <pic:blipFill>
@@ -7712,7 +7730,7 @@
           <w:sz w:val="27"/>
         </w:rPr>
       </w:pPr>
-      <w:bookmarkStart w:id="12" w:name="_Toc240271777"/>
+      <w:bookmarkStart w:id="12" w:name="_Toc240273013"/>
       <w:r>
         <w:rPr>
           <w:rFonts w:ascii="Montserrat" w:hAnsi="Montserrat"/>
@@ -7780,7 +7798,7 @@
           <w:sz w:val="27"/>
         </w:rPr>
       </w:pPr>
-      <w:bookmarkStart w:id="13" w:name="_Toc240271778"/>
+      <w:bookmarkStart w:id="13" w:name="_Toc240273014"/>
       <w:r>
         <w:rPr>
           <w:rFonts w:ascii="Montserrat" w:hAnsi="Montserrat"/>
@@ -8007,7 +8025,7 @@
           <w:sz w:val="27"/>
         </w:rPr>
       </w:pPr>
-      <w:bookmarkStart w:id="14" w:name="_Toc240271779"/>
+      <w:bookmarkStart w:id="14" w:name="_Toc240273015"/>
       <w:r>
         <w:rPr>
           <w:rFonts w:ascii="Montserrat" w:hAnsi="Montserrat"/>
@@ -8166,7 +8184,7 @@
           <w:sz w:val="27"/>
         </w:rPr>
       </w:pPr>
-      <w:bookmarkStart w:id="15" w:name="_Toc240271780"/>
+      <w:bookmarkStart w:id="15" w:name="_Toc240273016"/>
       <w:r>
         <w:rPr>
           <w:rFonts w:ascii="Montserrat" w:hAnsi="Montserrat"/>
@@ -8358,7 +8376,7 @@
           <w:sz w:val="27"/>
         </w:rPr>
       </w:pPr>
-      <w:bookmarkStart w:id="16" w:name="_Toc240271781"/>
+      <w:bookmarkStart w:id="16" w:name="_Toc240273017"/>
       <w:r>
         <w:rPr>
           <w:rFonts w:ascii="Montserrat" w:hAnsi="Montserrat"/>
@@ -8486,7 +8504,7 @@
           <w:sz w:val="27"/>
         </w:rPr>
       </w:pPr>
-      <w:bookmarkStart w:id="17" w:name="_Toc240271782"/>
+      <w:bookmarkStart w:id="17" w:name="_Toc240273018"/>
       <w:r>
         <w:rPr>
           <w:rFonts w:ascii="Montserrat" w:hAnsi="Montserrat"/>
@@ -8816,7 +8834,7 @@
           <w:sz w:val="27"/>
         </w:rPr>
       </w:pPr>
-      <w:bookmarkStart w:id="18" w:name="_Toc240271783"/>
+      <w:bookmarkStart w:id="18" w:name="_Toc240273019"/>
       <w:r>
         <w:rPr>
           <w:rFonts w:ascii="Montserrat" w:hAnsi="Montserrat"/>
@@ -8957,7 +8975,7 @@
           <w:sz w:val="34"/>
         </w:rPr>
       </w:pPr>
-      <w:bookmarkStart w:id="19" w:name="_Toc240271784"/>
+      <w:bookmarkStart w:id="19" w:name="_Toc240273020"/>
       <w:r>
         <w:rPr>
           <w:rFonts w:ascii="Montserrat" w:hAnsi="Montserrat"/>
@@ -8999,7 +9017,7 @@
           <w:sz w:val="27"/>
         </w:rPr>
       </w:pPr>
-      <w:bookmarkStart w:id="20" w:name="_Toc240271785"/>
+      <w:bookmarkStart w:id="20" w:name="_Toc240273021"/>
       <w:r>
         <w:rPr>
           <w:rFonts w:ascii="Montserrat" w:hAnsi="Montserrat"/>
@@ -10079,16 +10097,16 @@
         </w:rPr>
         <w:lastRenderedPageBreak/>
         <w:drawing>
-          <wp:inline distT="0" distB="0" distL="0" distR="0" wp14:anchorId="04119F65" wp14:editId="67D3CB11">
+          <wp:inline distT="0" distB="0" distL="0" distR="0" wp14:anchorId="38063904" wp14:editId="670D6EC0">
             <wp:extent cx="5120640" cy="4627581"/>
             <wp:effectExtent l="19050" t="19050" r="22860" b="20955"/>
-            <wp:docPr id="605153851" name="Imagem 7"/>
+            <wp:docPr id="1973627620" name="Imagem 7"/>
             <wp:cNvGraphicFramePr/>
             <a:graphic xmlns:a="http://schemas.openxmlformats.org/drawingml/2006/main">
               <a:graphicData uri="http://schemas.openxmlformats.org/drawingml/2006/picture">
                 <pic:pic xmlns:pic="http://schemas.openxmlformats.org/drawingml/2006/picture">
                   <pic:nvPicPr>
-                    <pic:cNvPr id="605153851" name=""/>
+                    <pic:cNvPr id="1973627620" name=""/>
                     <pic:cNvPicPr/>
                   </pic:nvPicPr>
                   <pic:blipFill>
@@ -10156,16 +10174,16 @@
         </w:rPr>
         <w:lastRenderedPageBreak/>
         <w:drawing>
-          <wp:inline distT="0" distB="0" distL="0" distR="0" wp14:anchorId="271298F2" wp14:editId="54388568">
+          <wp:inline distT="0" distB="0" distL="0" distR="0" wp14:anchorId="4C7BBC81" wp14:editId="5F134AEB">
             <wp:extent cx="5120640" cy="4627581"/>
             <wp:effectExtent l="19050" t="19050" r="22860" b="20955"/>
-            <wp:docPr id="86856867" name="Imagem 8"/>
+            <wp:docPr id="2119875759" name="Imagem 8"/>
             <wp:cNvGraphicFramePr/>
             <a:graphic xmlns:a="http://schemas.openxmlformats.org/drawingml/2006/main">
               <a:graphicData uri="http://schemas.openxmlformats.org/drawingml/2006/picture">
                 <pic:pic xmlns:pic="http://schemas.openxmlformats.org/drawingml/2006/picture">
                   <pic:nvPicPr>
-                    <pic:cNvPr id="86856867" name=""/>
+                    <pic:cNvPr id="2119875759" name=""/>
                     <pic:cNvPicPr/>
                   </pic:nvPicPr>
                   <pic:blipFill>
@@ -10373,7 +10391,7 @@
           <w:sz w:val="27"/>
         </w:rPr>
       </w:pPr>
-      <w:bookmarkStart w:id="21" w:name="_Toc240271786"/>
+      <w:bookmarkStart w:id="21" w:name="_Toc240273022"/>
       <w:r>
         <w:rPr>
           <w:rFonts w:ascii="Montserrat" w:hAnsi="Montserrat"/>
@@ -11298,16 +11316,16 @@
           <w:noProof/>
         </w:rPr>
         <w:drawing>
-          <wp:inline distT="0" distB="0" distL="0" distR="0" wp14:anchorId="399AF928" wp14:editId="7AE18CD0">
+          <wp:inline distT="0" distB="0" distL="0" distR="0" wp14:anchorId="73914A81" wp14:editId="54D07978">
             <wp:extent cx="5120640" cy="4627581"/>
             <wp:effectExtent l="19050" t="19050" r="22860" b="20955"/>
-            <wp:docPr id="807359041" name="Imagem 9"/>
+            <wp:docPr id="1426034607" name="Imagem 9"/>
             <wp:cNvGraphicFramePr/>
             <a:graphic xmlns:a="http://schemas.openxmlformats.org/drawingml/2006/main">
               <a:graphicData uri="http://schemas.openxmlformats.org/drawingml/2006/picture">
                 <pic:pic xmlns:pic="http://schemas.openxmlformats.org/drawingml/2006/picture">
                   <pic:nvPicPr>
-                    <pic:cNvPr id="807359041" name=""/>
+                    <pic:cNvPr id="1426034607" name=""/>
                     <pic:cNvPicPr/>
                   </pic:nvPicPr>
                   <pic:blipFill>
@@ -11375,16 +11393,16 @@
         </w:rPr>
         <w:lastRenderedPageBreak/>
         <w:drawing>
-          <wp:inline distT="0" distB="0" distL="0" distR="0" wp14:anchorId="2A7AF876" wp14:editId="5A122644">
+          <wp:inline distT="0" distB="0" distL="0" distR="0" wp14:anchorId="19BFF35C" wp14:editId="3CF4176D">
             <wp:extent cx="5120640" cy="4627581"/>
             <wp:effectExtent l="19050" t="19050" r="22860" b="20955"/>
-            <wp:docPr id="22871508" name="Imagem 10"/>
+            <wp:docPr id="264034636" name="Imagem 10"/>
             <wp:cNvGraphicFramePr/>
             <a:graphic xmlns:a="http://schemas.openxmlformats.org/drawingml/2006/main">
               <a:graphicData uri="http://schemas.openxmlformats.org/drawingml/2006/picture">
                 <pic:pic xmlns:pic="http://schemas.openxmlformats.org/drawingml/2006/picture">
                   <pic:nvPicPr>
-                    <pic:cNvPr id="22871508" name=""/>
+                    <pic:cNvPr id="264034636" name=""/>
                     <pic:cNvPicPr/>
                   </pic:nvPicPr>
                   <pic:blipFill>
@@ -11518,7 +11536,7 @@
           <w:sz w:val="27"/>
         </w:rPr>
       </w:pPr>
-      <w:bookmarkStart w:id="22" w:name="_Toc240271787"/>
+      <w:bookmarkStart w:id="22" w:name="_Toc240273023"/>
       <w:r>
         <w:rPr>
           <w:rFonts w:ascii="Montserrat" w:hAnsi="Montserrat"/>
@@ -12584,16 +12602,16 @@
           <w:noProof/>
         </w:rPr>
         <w:drawing>
-          <wp:inline distT="0" distB="0" distL="0" distR="0" wp14:anchorId="14B52547" wp14:editId="0F339612">
+          <wp:inline distT="0" distB="0" distL="0" distR="0" wp14:anchorId="5A6FB1EA" wp14:editId="0DF0E938">
             <wp:extent cx="5120640" cy="3338440"/>
             <wp:effectExtent l="19050" t="19050" r="22860" b="14605"/>
-            <wp:docPr id="1272294864" name="Imagem 11"/>
+            <wp:docPr id="2071947788" name="Imagem 11"/>
             <wp:cNvGraphicFramePr/>
             <a:graphic xmlns:a="http://schemas.openxmlformats.org/drawingml/2006/main">
               <a:graphicData uri="http://schemas.openxmlformats.org/drawingml/2006/picture">
                 <pic:pic xmlns:pic="http://schemas.openxmlformats.org/drawingml/2006/picture">
                   <pic:nvPicPr>
-                    <pic:cNvPr id="1272294864" name=""/>
+                    <pic:cNvPr id="2071947788" name=""/>
                     <pic:cNvPicPr/>
                   </pic:nvPicPr>
                   <pic:blipFill>
@@ -12661,16 +12679,16 @@
         </w:rPr>
         <w:lastRenderedPageBreak/>
         <w:drawing>
-          <wp:inline distT="0" distB="0" distL="0" distR="0" wp14:anchorId="73CAAB5A" wp14:editId="4A850370">
+          <wp:inline distT="0" distB="0" distL="0" distR="0" wp14:anchorId="469CAD8E" wp14:editId="509EB995">
             <wp:extent cx="5120640" cy="4627581"/>
             <wp:effectExtent l="19050" t="19050" r="22860" b="20955"/>
-            <wp:docPr id="826508146" name="Imagem 12"/>
+            <wp:docPr id="793886308" name="Imagem 12"/>
             <wp:cNvGraphicFramePr/>
             <a:graphic xmlns:a="http://schemas.openxmlformats.org/drawingml/2006/main">
               <a:graphicData uri="http://schemas.openxmlformats.org/drawingml/2006/picture">
                 <pic:pic xmlns:pic="http://schemas.openxmlformats.org/drawingml/2006/picture">
                   <pic:nvPicPr>
-                    <pic:cNvPr id="826508146" name=""/>
+                    <pic:cNvPr id="793886308" name=""/>
                     <pic:cNvPicPr/>
                   </pic:nvPicPr>
                   <pic:blipFill>
@@ -12874,7 +12892,7 @@
           <w:sz w:val="27"/>
         </w:rPr>
       </w:pPr>
-      <w:bookmarkStart w:id="23" w:name="_Toc240271788"/>
+      <w:bookmarkStart w:id="23" w:name="_Toc240273024"/>
       <w:r>
         <w:rPr>
           <w:rFonts w:ascii="Montserrat" w:hAnsi="Montserrat"/>
@@ -13435,16 +13453,16 @@
           <w:noProof/>
         </w:rPr>
         <w:drawing>
-          <wp:inline distT="0" distB="0" distL="0" distR="0" wp14:anchorId="0568D60D" wp14:editId="32E0A8D7">
+          <wp:inline distT="0" distB="0" distL="0" distR="0" wp14:anchorId="25104844" wp14:editId="78B2EAC1">
             <wp:extent cx="5120640" cy="4627581"/>
             <wp:effectExtent l="19050" t="19050" r="22860" b="20955"/>
-            <wp:docPr id="911430367" name="Imagem 13"/>
+            <wp:docPr id="1819239155" name="Imagem 13"/>
             <wp:cNvGraphicFramePr/>
             <a:graphic xmlns:a="http://schemas.openxmlformats.org/drawingml/2006/main">
               <a:graphicData uri="http://schemas.openxmlformats.org/drawingml/2006/picture">
                 <pic:pic xmlns:pic="http://schemas.openxmlformats.org/drawingml/2006/picture">
                   <pic:nvPicPr>
-                    <pic:cNvPr id="911430367" name=""/>
+                    <pic:cNvPr id="1819239155" name=""/>
                     <pic:cNvPicPr/>
                   </pic:nvPicPr>
                   <pic:blipFill>
@@ -13512,16 +13530,16 @@
         </w:rPr>
         <w:lastRenderedPageBreak/>
         <w:drawing>
-          <wp:inline distT="0" distB="0" distL="0" distR="0" wp14:anchorId="375CDAEC" wp14:editId="61327B31">
+          <wp:inline distT="0" distB="0" distL="0" distR="0" wp14:anchorId="39EDF35F" wp14:editId="7E068887">
             <wp:extent cx="5120640" cy="4627581"/>
             <wp:effectExtent l="19050" t="19050" r="22860" b="20955"/>
-            <wp:docPr id="1609640852" name="Imagem 14"/>
+            <wp:docPr id="502262728" name="Imagem 14"/>
             <wp:cNvGraphicFramePr/>
             <a:graphic xmlns:a="http://schemas.openxmlformats.org/drawingml/2006/main">
               <a:graphicData uri="http://schemas.openxmlformats.org/drawingml/2006/picture">
                 <pic:pic xmlns:pic="http://schemas.openxmlformats.org/drawingml/2006/picture">
                   <pic:nvPicPr>
-                    <pic:cNvPr id="1609640852" name=""/>
+                    <pic:cNvPr id="502262728" name=""/>
                     <pic:cNvPicPr/>
                   </pic:nvPicPr>
                   <pic:blipFill>
@@ -13781,7 +13799,7 @@
           <w:sz w:val="27"/>
         </w:rPr>
       </w:pPr>
-      <w:bookmarkStart w:id="24" w:name="_Toc240271789"/>
+      <w:bookmarkStart w:id="24" w:name="_Toc240273025"/>
       <w:r>
         <w:rPr>
           <w:rFonts w:ascii="Montserrat" w:hAnsi="Montserrat"/>
@@ -13821,16 +13839,16 @@
           <w:noProof/>
         </w:rPr>
         <w:drawing>
-          <wp:inline distT="0" distB="0" distL="0" distR="0" wp14:anchorId="3951FFD4" wp14:editId="53411A2C">
+          <wp:inline distT="0" distB="0" distL="0" distR="0" wp14:anchorId="6B73619A" wp14:editId="30151D36">
             <wp:extent cx="5120640" cy="4627581"/>
             <wp:effectExtent l="19050" t="19050" r="22860" b="20955"/>
-            <wp:docPr id="1385978473" name="Imagem 15"/>
+            <wp:docPr id="432038931" name="Imagem 15"/>
             <wp:cNvGraphicFramePr/>
             <a:graphic xmlns:a="http://schemas.openxmlformats.org/drawingml/2006/main">
               <a:graphicData uri="http://schemas.openxmlformats.org/drawingml/2006/picture">
                 <pic:pic xmlns:pic="http://schemas.openxmlformats.org/drawingml/2006/picture">
                   <pic:nvPicPr>
-                    <pic:cNvPr id="1385978473" name=""/>
+                    <pic:cNvPr id="432038931" name=""/>
                     <pic:cNvPicPr/>
                   </pic:nvPicPr>
                   <pic:blipFill>
@@ -13898,16 +13916,16 @@
         </w:rPr>
         <w:lastRenderedPageBreak/>
         <w:drawing>
-          <wp:inline distT="0" distB="0" distL="0" distR="0" wp14:anchorId="30D75338" wp14:editId="47CE71C5">
+          <wp:inline distT="0" distB="0" distL="0" distR="0" wp14:anchorId="01939227" wp14:editId="39AC6263">
             <wp:extent cx="5120640" cy="4627581"/>
             <wp:effectExtent l="19050" t="19050" r="22860" b="20955"/>
-            <wp:docPr id="1194232451" name="Imagem 16"/>
+            <wp:docPr id="56770420" name="Imagem 16"/>
             <wp:cNvGraphicFramePr/>
             <a:graphic xmlns:a="http://schemas.openxmlformats.org/drawingml/2006/main">
               <a:graphicData uri="http://schemas.openxmlformats.org/drawingml/2006/picture">
                 <pic:pic xmlns:pic="http://schemas.openxmlformats.org/drawingml/2006/picture">
                   <pic:nvPicPr>
-                    <pic:cNvPr id="1194232451" name=""/>
+                    <pic:cNvPr id="56770420" name=""/>
                     <pic:cNvPicPr/>
                   </pic:nvPicPr>
                   <pic:blipFill>
@@ -14071,16 +14089,16 @@
         </w:rPr>
         <w:lastRenderedPageBreak/>
         <w:drawing>
-          <wp:inline distT="0" distB="0" distL="0" distR="0" wp14:anchorId="4E4C4715" wp14:editId="5BC68E3B">
+          <wp:inline distT="0" distB="0" distL="0" distR="0" wp14:anchorId="7F4D3097" wp14:editId="007C72D3">
             <wp:extent cx="5120640" cy="3282818"/>
             <wp:effectExtent l="19050" t="19050" r="22860" b="13335"/>
-            <wp:docPr id="1536224730" name="Imagem 17"/>
+            <wp:docPr id="1462588455" name="Imagem 17"/>
             <wp:cNvGraphicFramePr/>
             <a:graphic xmlns:a="http://schemas.openxmlformats.org/drawingml/2006/main">
               <a:graphicData uri="http://schemas.openxmlformats.org/drawingml/2006/picture">
                 <pic:pic xmlns:pic="http://schemas.openxmlformats.org/drawingml/2006/picture">
                   <pic:nvPicPr>
-                    <pic:cNvPr id="1536224730" name=""/>
+                    <pic:cNvPr id="1462588455" name=""/>
                     <pic:cNvPicPr/>
                   </pic:nvPicPr>
                   <pic:blipFill>
@@ -14158,25 +14176,7 @@
           <w:color w:val="1A1A1A"/>
           <w:sz w:val="22"/>
         </w:rPr>
-        <w:t>Status automatico da entrega: ao clicar em Visualizar arvore (ou ao abrir uma EAP ja registrada), cada Entrega (nivel 2) ganha um selo - Concluida, Atrasada, No prazo ou Sem cronograma vinculado - calculado automaticamente a partir do cronograma do Planejamento (Passo 4), casando pelo nome da entrega com o nome do marco. Nao ha nenhum campo novo para preencher na EAP: uma entrega fica Concluida se o marco correspondente tiver Conclusao real preenchida no cronograma, Atrasada se nao tiver conclusao e o Termino previsto ja tiver passado, e Sem cronograma vinculado se nao houver marco com o mesmo nome. Um resumo no topo da arvore mostra o percentual de entregas concluidas do projeto. So o nivel 2 (Entrega) recebe esse status - o nivel 3 (Atividade) nao tem hoje nenhuma outra fonte de dado no sistema que permita calcular automaticamente.</w:t>
-      </w:r>
-    </w:p>
-    <w:p>
-      <w:pPr>
-        <w:spacing w:line="280" w:lineRule="auto"/>
-        <w:rPr>
-          <w:rFonts w:ascii="Montserrat" w:hAnsi="Montserrat"/>
-          <w:color w:val="1A1A1A"/>
-          <w:sz w:val="22"/>
-        </w:rPr>
-      </w:pPr>
-      <w:r>
-        <w:rPr>
-          <w:rFonts w:ascii="Montserrat" w:hAnsi="Montserrat"/>
-          <w:color w:val="1A1A1A"/>
-          <w:sz w:val="22"/>
-        </w:rPr>
-        <w:t>Clique em Registrar EAP para gerar o protocolo.</w:t>
+        <w:t>Status automatico da entrega: ao clicar em Visualizar arvore (ou ao abrir uma EAP ja registrada), cada Entrega (nivel 2) ganha um selo - Concluida, Atrasada, No prazo ou Sem cronograma vinculado - calculado automaticamente a partir do cronograma do Planejamento (Passo 4), casando pelo nome da entrega com o nome do marco. Nao ha nenhum campo novo para preencher na EAP: uma entrega fica Concluida se o marco correspondente tiver Conclusao real preenchida no cronograma, Atrasada se nao tiver conclusao e o Termino previsto ja tiver passado, e Sem cronograma vinculado se nao houver marco com o mesmo nome. Um resumo no topo da arvore mostra o percentual de entregas concluidas do projeto.</w:t>
       </w:r>
     </w:p>
     <w:p>
@@ -14200,7 +14200,25 @@
           <w:color w:val="1A1A1A"/>
           <w:sz w:val="22"/>
         </w:rPr>
-        <w:t>No rodape do painel de detalhes de uma EAP, os botoes Imprimir e Exportar Word geram um documento com a arvore hierarquica completa (pacotes, entregas e atividades, com a prioridade de cada uma), pronto para impressao ou para abrir no Word. Este artefato nao tem um FORALF oficial - o layout segue o padrao visual dos demais documentos gerados pelo sistema.</w:t>
+        <w:t>Status automatico da atividade: o mesmo casamento por nome desce mais um nivel - cada Atividade (nivel 3) ganha um selo Concluida, Pendente ou Sem tarefa vinculada, casando pelo nome da atividade com uma tarefa cadastrada dentro de qualquer marco do cronograma (botao + Tarefas de cada marco, Passo 4, secao 3). Como tarefa nao tem data - so nome e concluida - nao existe estado Atrasada aqui, so Concluida/Pendente. Tambem sem nenhum campo novo para preencher na EAP.</w:t>
+      </w:r>
+    </w:p>
+    <w:p>
+      <w:pPr>
+        <w:spacing w:line="280" w:lineRule="auto"/>
+        <w:rPr>
+          <w:rFonts w:ascii="Montserrat" w:hAnsi="Montserrat"/>
+          <w:color w:val="1A1A1A"/>
+          <w:sz w:val="22"/>
+        </w:rPr>
+      </w:pPr>
+      <w:r>
+        <w:rPr>
+          <w:rFonts w:ascii="Montserrat" w:hAnsi="Montserrat"/>
+          <w:color w:val="1A1A1A"/>
+          <w:sz w:val="22"/>
+        </w:rPr>
+        <w:t>Clique em Registrar EAP para gerar o protocolo.</w:t>
       </w:r>
     </w:p>
     <w:p>
@@ -14208,7 +14226,7 @@
         <w:pStyle w:val="PargrafodaLista"/>
         <w:numPr>
           <w:ilvl w:val="0"/>
-          <w:numId w:val="18"/>
+          <w:numId w:val="19"/>
         </w:numPr>
         <w:spacing w:after="80" w:line="260" w:lineRule="auto"/>
         <w:ind w:left="700"/>
@@ -14224,7 +14242,7 @@
           <w:color w:val="1A1A1A"/>
           <w:sz w:val="22"/>
         </w:rPr>
-        <w:t xml:space="preserve">Assistente de preenchimento por IA: apos selecionar o Projeto vinculado, o botao Sugerir com IA le o Planejamento e o TAP do projeto e sugere </w:t>
+        <w:t xml:space="preserve">No rodape do painel de detalhes de uma EAP, os botoes Imprimir e Exportar Word geram um documento com a arvore hierarquica completa </w:t>
       </w:r>
       <w:r>
         <w:rPr>
@@ -14233,7 +14251,31 @@
           <w:sz w:val="22"/>
         </w:rPr>
         <w:lastRenderedPageBreak/>
-        <w:t>pacotes de trabalho (nivel 1) e entregas (nivel 2) - nunca atividades (nivel 3). So funciona se a arvore estiver totalmente vazia; se ja houver qualquer pacote ou entrega digitado, a sugestao e recusada (secao 2.12).</w:t>
+        <w:t>(pacotes, entregas e atividades, com a prioridade de cada uma), pronto para impressao ou para abrir no Word. Este artefato nao tem um FORALF oficial - o layout segue o padrao visual dos demais documentos gerados pelo sistema.</w:t>
+      </w:r>
+    </w:p>
+    <w:p>
+      <w:pPr>
+        <w:pStyle w:val="PargrafodaLista"/>
+        <w:numPr>
+          <w:ilvl w:val="0"/>
+          <w:numId w:val="19"/>
+        </w:numPr>
+        <w:spacing w:after="80" w:line="260" w:lineRule="auto"/>
+        <w:ind w:left="700"/>
+        <w:rPr>
+          <w:rFonts w:ascii="Montserrat" w:hAnsi="Montserrat"/>
+          <w:color w:val="1A1A1A"/>
+          <w:sz w:val="22"/>
+        </w:rPr>
+      </w:pPr>
+      <w:r>
+        <w:rPr>
+          <w:rFonts w:ascii="Montserrat" w:hAnsi="Montserrat"/>
+          <w:color w:val="1A1A1A"/>
+          <w:sz w:val="22"/>
+        </w:rPr>
+        <w:t>Assistente de preenchimento por IA: apos selecionar o Projeto vinculado, o botao Sugerir com IA le o Planejamento e o TAP do projeto e sugere pacotes de trabalho (nivel 1) e entregas (nivel 2) - nunca atividades (nivel 3). So funciona se a arvore estiver totalmente vazia; se ja houver qualquer pacote ou entrega digitado, a sugestao e recusada (secao 2.12).</w:t>
       </w:r>
     </w:p>
     <w:p>
@@ -14247,7 +14289,7 @@
           <w:sz w:val="27"/>
         </w:rPr>
       </w:pPr>
-      <w:bookmarkStart w:id="25" w:name="_Toc240271790"/>
+      <w:bookmarkStart w:id="25" w:name="_Toc240273026"/>
       <w:r>
         <w:rPr>
           <w:rFonts w:ascii="Montserrat" w:hAnsi="Montserrat"/>
@@ -14287,16 +14329,16 @@
           <w:noProof/>
         </w:rPr>
         <w:drawing>
-          <wp:inline distT="0" distB="0" distL="0" distR="0" wp14:anchorId="6589BB81" wp14:editId="03AD860A">
+          <wp:inline distT="0" distB="0" distL="0" distR="0" wp14:anchorId="7EAEF0AE" wp14:editId="74DC94B3">
             <wp:extent cx="5120640" cy="4627581"/>
             <wp:effectExtent l="19050" t="19050" r="22860" b="20955"/>
-            <wp:docPr id="176872524" name="Imagem 18"/>
+            <wp:docPr id="1993849305" name="Imagem 18"/>
             <wp:cNvGraphicFramePr/>
             <a:graphic xmlns:a="http://schemas.openxmlformats.org/drawingml/2006/main">
               <a:graphicData uri="http://schemas.openxmlformats.org/drawingml/2006/picture">
                 <pic:pic xmlns:pic="http://schemas.openxmlformats.org/drawingml/2006/picture">
                   <pic:nvPicPr>
-                    <pic:cNvPr id="176872524" name=""/>
+                    <pic:cNvPr id="1993849305" name=""/>
                     <pic:cNvPicPr/>
                   </pic:nvPicPr>
                   <pic:blipFill>
@@ -14364,16 +14406,16 @@
         </w:rPr>
         <w:lastRenderedPageBreak/>
         <w:drawing>
-          <wp:inline distT="0" distB="0" distL="0" distR="0" wp14:anchorId="00950A3B" wp14:editId="7A2D176A">
+          <wp:inline distT="0" distB="0" distL="0" distR="0" wp14:anchorId="30EA343F" wp14:editId="35478DB9">
             <wp:extent cx="5120640" cy="4627581"/>
             <wp:effectExtent l="19050" t="19050" r="22860" b="20955"/>
-            <wp:docPr id="332157880" name="Imagem 19"/>
+            <wp:docPr id="493406443" name="Imagem 19"/>
             <wp:cNvGraphicFramePr/>
             <a:graphic xmlns:a="http://schemas.openxmlformats.org/drawingml/2006/main">
               <a:graphicData uri="http://schemas.openxmlformats.org/drawingml/2006/picture">
                 <pic:pic xmlns:pic="http://schemas.openxmlformats.org/drawingml/2006/picture">
                   <pic:nvPicPr>
-                    <pic:cNvPr id="332157880" name=""/>
+                    <pic:cNvPr id="493406443" name=""/>
                     <pic:cNvPicPr/>
                   </pic:nvPicPr>
                   <pic:blipFill>
@@ -14435,7 +14477,7 @@
         <w:pStyle w:val="PargrafodaLista"/>
         <w:numPr>
           <w:ilvl w:val="0"/>
-          <w:numId w:val="19"/>
+          <w:numId w:val="20"/>
         </w:numPr>
         <w:spacing w:after="80" w:line="260" w:lineRule="auto"/>
         <w:ind w:left="700"/>
@@ -14452,72 +14494,6 @@
           <w:sz w:val="22"/>
         </w:rPr>
         <w:t>Selecione a(s) unidade(s) envolvidas, preencha Pauta e Projeto (obrigatorios), participantes, resumo, encaminhamentos e entraves.</w:t>
-      </w:r>
-    </w:p>
-    <w:p>
-      <w:pPr>
-        <w:pStyle w:val="PargrafodaLista"/>
-        <w:numPr>
-          <w:ilvl w:val="0"/>
-          <w:numId w:val="19"/>
-        </w:numPr>
-        <w:spacing w:after="80" w:line="260" w:lineRule="auto"/>
-        <w:ind w:left="700"/>
-        <w:rPr>
-          <w:rFonts w:ascii="Montserrat" w:hAnsi="Montserrat"/>
-          <w:color w:val="1A1A1A"/>
-          <w:sz w:val="22"/>
-        </w:rPr>
-      </w:pPr>
-      <w:r>
-        <w:rPr>
-          <w:rFonts w:ascii="Montserrat" w:hAnsi="Montserrat"/>
-          <w:color w:val="1A1A1A"/>
-          <w:sz w:val="22"/>
-        </w:rPr>
-        <w:t>Nas tabelas de Encaminhamentos e Entraves, a coluna SEQ e preenchida automaticamente - numera em sequencia (01, 02...) assim que o Encaminhamento/Entrave da linha e digitado, sem precisar informar o numero manualmente. Uma linha ainda vazia nao entra na contagem; reordenar (â–²/â–¼) ou remover uma linha renumera as demais automaticamente.</w:t>
-      </w:r>
-    </w:p>
-    <w:p>
-      <w:pPr>
-        <w:pStyle w:val="PargrafodaLista"/>
-        <w:numPr>
-          <w:ilvl w:val="0"/>
-          <w:numId w:val="19"/>
-        </w:numPr>
-        <w:spacing w:after="80" w:line="260" w:lineRule="auto"/>
-        <w:ind w:left="700"/>
-        <w:rPr>
-          <w:rFonts w:ascii="Montserrat" w:hAnsi="Montserrat"/>
-          <w:color w:val="1A1A1A"/>
-          <w:sz w:val="22"/>
-        </w:rPr>
-      </w:pPr>
-      <w:r>
-        <w:rPr>
-          <w:rFonts w:ascii="Montserrat" w:hAnsi="Montserrat"/>
-          <w:color w:val="1A1A1A"/>
-          <w:sz w:val="22"/>
-        </w:rPr>
-        <w:t>Opcional, quando habilitado pelo Admin: em Importar transcricao da reuniao, cole o texto, anexe um arquivo .txt/.docx/.pdf, ou anexe o audio da gravacao (.mp3/.m4a/.aac/.wav/.ogg) para transcricao automatica (secao 2.11), depois clique em Analisar e preencher - a IA sugere pauta, data/horario (se mencionados), participantes, resumo, encaminhamentos e entraves. Revise sempre os dados sugeridos antes de registrar (secao 2.10).</w:t>
-      </w:r>
-    </w:p>
-    <w:p>
-      <w:pPr>
-        <w:spacing w:line="280" w:lineRule="auto"/>
-        <w:rPr>
-          <w:rFonts w:ascii="Montserrat" w:hAnsi="Montserrat"/>
-          <w:color w:val="1A1A1A"/>
-          <w:sz w:val="22"/>
-        </w:rPr>
-      </w:pPr>
-      <w:r>
-        <w:rPr>
-          <w:rFonts w:ascii="Montserrat" w:hAnsi="Montserrat"/>
-          <w:color w:val="1A1A1A"/>
-          <w:sz w:val="22"/>
-        </w:rPr>
-        <w:t>Clique em Registrar ata para gerar o protocolo.</w:t>
       </w:r>
     </w:p>
     <w:p>
@@ -14541,6 +14517,72 @@
           <w:color w:val="1A1A1A"/>
           <w:sz w:val="22"/>
         </w:rPr>
+        <w:t>Nas tabelas de Encaminhamentos e Entraves, a coluna SEQ e preenchida automaticamente - numera em sequencia (01, 02...) assim que o Encaminhamento/Entrave da linha e digitado, sem precisar informar o numero manualmente. Uma linha ainda vazia nao entra na contagem; reordenar (â–²/â–¼) ou remover uma linha renumera as demais automaticamente.</w:t>
+      </w:r>
+    </w:p>
+    <w:p>
+      <w:pPr>
+        <w:pStyle w:val="PargrafodaLista"/>
+        <w:numPr>
+          <w:ilvl w:val="0"/>
+          <w:numId w:val="20"/>
+        </w:numPr>
+        <w:spacing w:after="80" w:line="260" w:lineRule="auto"/>
+        <w:ind w:left="700"/>
+        <w:rPr>
+          <w:rFonts w:ascii="Montserrat" w:hAnsi="Montserrat"/>
+          <w:color w:val="1A1A1A"/>
+          <w:sz w:val="22"/>
+        </w:rPr>
+      </w:pPr>
+      <w:r>
+        <w:rPr>
+          <w:rFonts w:ascii="Montserrat" w:hAnsi="Montserrat"/>
+          <w:color w:val="1A1A1A"/>
+          <w:sz w:val="22"/>
+        </w:rPr>
+        <w:t>Opcional, quando habilitado pelo Admin: em Importar transcricao da reuniao, cole o texto, anexe um arquivo .txt/.docx/.pdf, ou anexe o audio da gravacao (.mp3/.m4a/.aac/.wav/.ogg) para transcricao automatica (secao 2.11), depois clique em Analisar e preencher - a IA sugere pauta, data/horario (se mencionados), participantes, resumo, encaminhamentos e entraves. Revise sempre os dados sugeridos antes de registrar (secao 2.10).</w:t>
+      </w:r>
+    </w:p>
+    <w:p>
+      <w:pPr>
+        <w:spacing w:line="280" w:lineRule="auto"/>
+        <w:rPr>
+          <w:rFonts w:ascii="Montserrat" w:hAnsi="Montserrat"/>
+          <w:color w:val="1A1A1A"/>
+          <w:sz w:val="22"/>
+        </w:rPr>
+      </w:pPr>
+      <w:r>
+        <w:rPr>
+          <w:rFonts w:ascii="Montserrat" w:hAnsi="Montserrat"/>
+          <w:color w:val="1A1A1A"/>
+          <w:sz w:val="22"/>
+        </w:rPr>
+        <w:t>Clique em Registrar ata para gerar o protocolo.</w:t>
+      </w:r>
+    </w:p>
+    <w:p>
+      <w:pPr>
+        <w:pStyle w:val="PargrafodaLista"/>
+        <w:numPr>
+          <w:ilvl w:val="0"/>
+          <w:numId w:val="21"/>
+        </w:numPr>
+        <w:spacing w:after="80" w:line="260" w:lineRule="auto"/>
+        <w:ind w:left="700"/>
+        <w:rPr>
+          <w:rFonts w:ascii="Montserrat" w:hAnsi="Montserrat"/>
+          <w:color w:val="1A1A1A"/>
+          <w:sz w:val="22"/>
+        </w:rPr>
+      </w:pPr>
+      <w:r>
+        <w:rPr>
+          <w:rFonts w:ascii="Montserrat" w:hAnsi="Montserrat"/>
+          <w:color w:val="1A1A1A"/>
+          <w:sz w:val="22"/>
+        </w:rPr>
         <w:lastRenderedPageBreak/>
         <w:t>Na lista Atas cadastradas, clique numa ata para abri-la e usar os botoes Imprimir e Exportar Word, no rodape do painel lateral: ambos geram o documento no formato oficial do FORALF00340 (cabecalho, unidade, pauta, participantes, descricao, saidas e entraves), pronto para impressao ou para abrir no Word.</w:t>
       </w:r>
@@ -14556,7 +14598,7 @@
           <w:sz w:val="27"/>
         </w:rPr>
       </w:pPr>
-      <w:bookmarkStart w:id="26" w:name="_Toc240271791"/>
+      <w:bookmarkStart w:id="26" w:name="_Toc240273027"/>
       <w:r>
         <w:rPr>
           <w:rFonts w:ascii="Montserrat" w:hAnsi="Montserrat"/>
@@ -14596,16 +14638,16 @@
           <w:noProof/>
         </w:rPr>
         <w:drawing>
-          <wp:inline distT="0" distB="0" distL="0" distR="0" wp14:anchorId="3A40D904" wp14:editId="639614C7">
+          <wp:inline distT="0" distB="0" distL="0" distR="0" wp14:anchorId="73B87808" wp14:editId="370C49CF">
             <wp:extent cx="5120640" cy="4627581"/>
             <wp:effectExtent l="19050" t="19050" r="22860" b="20955"/>
-            <wp:docPr id="1363550287" name="Imagem 20"/>
+            <wp:docPr id="768912268" name="Imagem 20"/>
             <wp:cNvGraphicFramePr/>
             <a:graphic xmlns:a="http://schemas.openxmlformats.org/drawingml/2006/main">
               <a:graphicData uri="http://schemas.openxmlformats.org/drawingml/2006/picture">
                 <pic:pic xmlns:pic="http://schemas.openxmlformats.org/drawingml/2006/picture">
                   <pic:nvPicPr>
-                    <pic:cNvPr id="1363550287" name=""/>
+                    <pic:cNvPr id="768912268" name=""/>
                     <pic:cNvPicPr/>
                   </pic:nvPicPr>
                   <pic:blipFill>
@@ -14673,16 +14715,16 @@
         </w:rPr>
         <w:lastRenderedPageBreak/>
         <w:drawing>
-          <wp:inline distT="0" distB="0" distL="0" distR="0" wp14:anchorId="621DF5A3" wp14:editId="78F54BA6">
+          <wp:inline distT="0" distB="0" distL="0" distR="0" wp14:anchorId="4C2FCA84" wp14:editId="7CBE1604">
             <wp:extent cx="5120640" cy="4627581"/>
             <wp:effectExtent l="19050" t="19050" r="22860" b="20955"/>
-            <wp:docPr id="713880905" name="Imagem 21"/>
+            <wp:docPr id="641264765" name="Imagem 21"/>
             <wp:cNvGraphicFramePr/>
             <a:graphic xmlns:a="http://schemas.openxmlformats.org/drawingml/2006/main">
               <a:graphicData uri="http://schemas.openxmlformats.org/drawingml/2006/picture">
                 <pic:pic xmlns:pic="http://schemas.openxmlformats.org/drawingml/2006/picture">
                   <pic:nvPicPr>
-                    <pic:cNvPr id="713880905" name=""/>
+                    <pic:cNvPr id="641264765" name=""/>
                     <pic:cNvPicPr/>
                   </pic:nvPicPr>
                   <pic:blipFill>
@@ -14744,7 +14786,7 @@
         <w:pStyle w:val="PargrafodaLista"/>
         <w:numPr>
           <w:ilvl w:val="0"/>
-          <w:numId w:val="20"/>
+          <w:numId w:val="21"/>
         </w:numPr>
         <w:spacing w:after="80" w:line="260" w:lineRule="auto"/>
         <w:ind w:left="700"/>
@@ -14761,96 +14803,6 @@
           <w:sz w:val="22"/>
         </w:rPr>
         <w:t>Identifique o projeto e a mudanca (titulo e solicitante sao obrigatorios); descreva a mudanca, os beneficios e o impacto de nao implementa-la.</w:t>
-      </w:r>
-    </w:p>
-    <w:p>
-      <w:pPr>
-        <w:pStyle w:val="PargrafodaLista"/>
-        <w:numPr>
-          <w:ilvl w:val="0"/>
-          <w:numId w:val="20"/>
-        </w:numPr>
-        <w:spacing w:after="80" w:line="260" w:lineRule="auto"/>
-        <w:ind w:left="700"/>
-        <w:rPr>
-          <w:rFonts w:ascii="Montserrat" w:hAnsi="Montserrat"/>
-          <w:color w:val="1A1A1A"/>
-          <w:sz w:val="22"/>
-        </w:rPr>
-      </w:pPr>
-      <w:r>
-        <w:rPr>
-          <w:rFonts w:ascii="Montserrat" w:hAnsi="Montserrat"/>
-          <w:color w:val="1A1A1A"/>
-          <w:sz w:val="22"/>
-        </w:rPr>
-        <w:t>Preencha a analise de impactos nas 8 dimensoes: objetivo, cronograma, escopo, custo, alinhamento estrategico, qualidade, riscos e outros impactos.</w:t>
-      </w:r>
-    </w:p>
-    <w:p>
-      <w:pPr>
-        <w:pStyle w:val="PargrafodaLista"/>
-        <w:numPr>
-          <w:ilvl w:val="0"/>
-          <w:numId w:val="20"/>
-        </w:numPr>
-        <w:spacing w:after="80" w:line="260" w:lineRule="auto"/>
-        <w:ind w:left="700"/>
-        <w:rPr>
-          <w:rFonts w:ascii="Montserrat" w:hAnsi="Montserrat"/>
-          <w:color w:val="1A1A1A"/>
-          <w:sz w:val="22"/>
-        </w:rPr>
-      </w:pPr>
-      <w:r>
-        <w:rPr>
-          <w:rFonts w:ascii="Montserrat" w:hAnsi="Montserrat"/>
-          <w:color w:val="1A1A1A"/>
-          <w:sz w:val="22"/>
-        </w:rPr>
-        <w:t>Marque a decisao: Aprovada, Nao aprovada ou Pendente de avaliacao, com justificativa.</w:t>
-      </w:r>
-    </w:p>
-    <w:p>
-      <w:pPr>
-        <w:pStyle w:val="PargrafodaLista"/>
-        <w:numPr>
-          <w:ilvl w:val="0"/>
-          <w:numId w:val="20"/>
-        </w:numPr>
-        <w:spacing w:after="80" w:line="260" w:lineRule="auto"/>
-        <w:ind w:left="700"/>
-        <w:rPr>
-          <w:rFonts w:ascii="Montserrat" w:hAnsi="Montserrat"/>
-          <w:color w:val="1A1A1A"/>
-          <w:sz w:val="22"/>
-        </w:rPr>
-      </w:pPr>
-      <w:r>
-        <w:rPr>
-          <w:rFonts w:ascii="Montserrat" w:hAnsi="Montserrat"/>
-          <w:color w:val="1A1A1A"/>
-          <w:sz w:val="22"/>
-        </w:rPr>
-        <w:t>Assistente de preenchimento por IA: apos selecionar o Projeto vinculado, o botao Sugerir com IA procura nas Atas de Reuniao mais recentes alguma mudanca sendo discutida em relacao ao combinado no TAP/Planejamento, e sugere a descricao da mudanca e a analise de impactos - se nao houver mudanca clara sendo discutida, nenhum campo e preenchido (secao 2.12).</w:t>
-      </w:r>
-    </w:p>
-    <w:p>
-      <w:pPr>
-        <w:spacing w:line="280" w:lineRule="auto"/>
-        <w:rPr>
-          <w:rFonts w:ascii="Montserrat" w:hAnsi="Montserrat"/>
-          <w:color w:val="1A1A1A"/>
-          <w:sz w:val="22"/>
-        </w:rPr>
-      </w:pPr>
-      <w:r>
-        <w:rPr>
-          <w:rFonts w:ascii="Montserrat" w:hAnsi="Montserrat"/>
-          <w:color w:val="1A1A1A"/>
-          <w:sz w:val="22"/>
-        </w:rPr>
-        <w:t>Clique em Registrar SMP - o status do registro acompanha automaticamente a decisao marcada.</w:t>
       </w:r>
     </w:p>
     <w:p>
@@ -14874,6 +14826,96 @@
           <w:color w:val="1A1A1A"/>
           <w:sz w:val="22"/>
         </w:rPr>
+        <w:t>Preencha a analise de impactos nas 8 dimensoes: objetivo, cronograma, escopo, custo, alinhamento estrategico, qualidade, riscos e outros impactos.</w:t>
+      </w:r>
+    </w:p>
+    <w:p>
+      <w:pPr>
+        <w:pStyle w:val="PargrafodaLista"/>
+        <w:numPr>
+          <w:ilvl w:val="0"/>
+          <w:numId w:val="21"/>
+        </w:numPr>
+        <w:spacing w:after="80" w:line="260" w:lineRule="auto"/>
+        <w:ind w:left="700"/>
+        <w:rPr>
+          <w:rFonts w:ascii="Montserrat" w:hAnsi="Montserrat"/>
+          <w:color w:val="1A1A1A"/>
+          <w:sz w:val="22"/>
+        </w:rPr>
+      </w:pPr>
+      <w:r>
+        <w:rPr>
+          <w:rFonts w:ascii="Montserrat" w:hAnsi="Montserrat"/>
+          <w:color w:val="1A1A1A"/>
+          <w:sz w:val="22"/>
+        </w:rPr>
+        <w:t>Marque a decisao: Aprovada, Nao aprovada ou Pendente de avaliacao, com justificativa.</w:t>
+      </w:r>
+    </w:p>
+    <w:p>
+      <w:pPr>
+        <w:pStyle w:val="PargrafodaLista"/>
+        <w:numPr>
+          <w:ilvl w:val="0"/>
+          <w:numId w:val="21"/>
+        </w:numPr>
+        <w:spacing w:after="80" w:line="260" w:lineRule="auto"/>
+        <w:ind w:left="700"/>
+        <w:rPr>
+          <w:rFonts w:ascii="Montserrat" w:hAnsi="Montserrat"/>
+          <w:color w:val="1A1A1A"/>
+          <w:sz w:val="22"/>
+        </w:rPr>
+      </w:pPr>
+      <w:r>
+        <w:rPr>
+          <w:rFonts w:ascii="Montserrat" w:hAnsi="Montserrat"/>
+          <w:color w:val="1A1A1A"/>
+          <w:sz w:val="22"/>
+        </w:rPr>
+        <w:t>Assistente de preenchimento por IA: apos selecionar o Projeto vinculado, o botao Sugerir com IA procura nas Atas de Reuniao mais recentes alguma mudanca sendo discutida em relacao ao combinado no TAP/Planejamento, e sugere a descricao da mudanca e a analise de impactos - se nao houver mudanca clara sendo discutida, nenhum campo e preenchido (secao 2.12).</w:t>
+      </w:r>
+    </w:p>
+    <w:p>
+      <w:pPr>
+        <w:spacing w:line="280" w:lineRule="auto"/>
+        <w:rPr>
+          <w:rFonts w:ascii="Montserrat" w:hAnsi="Montserrat"/>
+          <w:color w:val="1A1A1A"/>
+          <w:sz w:val="22"/>
+        </w:rPr>
+      </w:pPr>
+      <w:r>
+        <w:rPr>
+          <w:rFonts w:ascii="Montserrat" w:hAnsi="Montserrat"/>
+          <w:color w:val="1A1A1A"/>
+          <w:sz w:val="22"/>
+        </w:rPr>
+        <w:t>Clique em Registrar SMP - o status do registro acompanha automaticamente a decisao marcada.</w:t>
+      </w:r>
+    </w:p>
+    <w:p>
+      <w:pPr>
+        <w:pStyle w:val="PargrafodaLista"/>
+        <w:numPr>
+          <w:ilvl w:val="0"/>
+          <w:numId w:val="22"/>
+        </w:numPr>
+        <w:spacing w:after="80" w:line="260" w:lineRule="auto"/>
+        <w:ind w:left="700"/>
+        <w:rPr>
+          <w:rFonts w:ascii="Montserrat" w:hAnsi="Montserrat"/>
+          <w:color w:val="1A1A1A"/>
+          <w:sz w:val="22"/>
+        </w:rPr>
+      </w:pPr>
+      <w:r>
+        <w:rPr>
+          <w:rFonts w:ascii="Montserrat" w:hAnsi="Montserrat"/>
+          <w:color w:val="1A1A1A"/>
+          <w:sz w:val="22"/>
+        </w:rPr>
         <w:lastRenderedPageBreak/>
         <w:t>Anexos: mesmo recurso ja usado na Solicitacao de Demanda (Passo 1) - o botao Anexar arquivo, na secao Anexos, envia o arquivo direto para um repositorio proprio do sistema (ate 15 MB, .txt/.docx/.pdf), com opcoes Baixar e Remover tanto no formulario quanto no painel de detalhes do registro. O campo de texto Links de documentos continua disponivel a parte, para links que nao sao um arquivo enviado.</w:t>
       </w:r>
@@ -14888,16 +14930,16 @@
           <w:noProof/>
         </w:rPr>
         <w:drawing>
-          <wp:inline distT="0" distB="0" distL="0" distR="0" wp14:anchorId="35DF9EF2" wp14:editId="2C13AFC0">
+          <wp:inline distT="0" distB="0" distL="0" distR="0" wp14:anchorId="47F29C72" wp14:editId="17FD7333">
             <wp:extent cx="5120640" cy="1757287"/>
             <wp:effectExtent l="19050" t="19050" r="22860" b="14605"/>
-            <wp:docPr id="966086596" name="Imagem 22"/>
+            <wp:docPr id="1267043313" name="Imagem 22"/>
             <wp:cNvGraphicFramePr/>
             <a:graphic xmlns:a="http://schemas.openxmlformats.org/drawingml/2006/main">
               <a:graphicData uri="http://schemas.openxmlformats.org/drawingml/2006/picture">
                 <pic:pic xmlns:pic="http://schemas.openxmlformats.org/drawingml/2006/picture">
                   <pic:nvPicPr>
-                    <pic:cNvPr id="966086596" name=""/>
+                    <pic:cNvPr id="1267043313" name=""/>
                     <pic:cNvPicPr/>
                   </pic:nvPicPr>
                   <pic:blipFill>
@@ -14959,7 +15001,7 @@
         <w:pStyle w:val="PargrafodaLista"/>
         <w:numPr>
           <w:ilvl w:val="0"/>
-          <w:numId w:val="21"/>
+          <w:numId w:val="22"/>
         </w:numPr>
         <w:spacing w:after="80" w:line="260" w:lineRule="auto"/>
         <w:ind w:left="700"/>
@@ -15010,7 +15052,7 @@
           <w:sz w:val="27"/>
         </w:rPr>
       </w:pPr>
-      <w:bookmarkStart w:id="27" w:name="_Toc240271792"/>
+      <w:bookmarkStart w:id="27" w:name="_Toc240273028"/>
       <w:r>
         <w:rPr>
           <w:rFonts w:ascii="Montserrat" w:hAnsi="Montserrat"/>
@@ -15051,16 +15093,16 @@
         </w:rPr>
         <w:lastRenderedPageBreak/>
         <w:drawing>
-          <wp:inline distT="0" distB="0" distL="0" distR="0" wp14:anchorId="48C23574" wp14:editId="048134E2">
+          <wp:inline distT="0" distB="0" distL="0" distR="0" wp14:anchorId="103E5D97" wp14:editId="238B8C6C">
             <wp:extent cx="5120640" cy="4627581"/>
             <wp:effectExtent l="19050" t="19050" r="22860" b="20955"/>
-            <wp:docPr id="1447229964" name="Imagem 23"/>
+            <wp:docPr id="2014002192" name="Imagem 23"/>
             <wp:cNvGraphicFramePr/>
             <a:graphic xmlns:a="http://schemas.openxmlformats.org/drawingml/2006/main">
               <a:graphicData uri="http://schemas.openxmlformats.org/drawingml/2006/picture">
                 <pic:pic xmlns:pic="http://schemas.openxmlformats.org/drawingml/2006/picture">
                   <pic:nvPicPr>
-                    <pic:cNvPr id="1447229964" name=""/>
+                    <pic:cNvPr id="2014002192" name=""/>
                     <pic:cNvPicPr/>
                   </pic:nvPicPr>
                   <pic:blipFill>
@@ -15128,16 +15170,16 @@
         </w:rPr>
         <w:lastRenderedPageBreak/>
         <w:drawing>
-          <wp:inline distT="0" distB="0" distL="0" distR="0" wp14:anchorId="0EC9630B" wp14:editId="5B1D2F9D">
+          <wp:inline distT="0" distB="0" distL="0" distR="0" wp14:anchorId="380E062F" wp14:editId="672BA4BC">
             <wp:extent cx="5120640" cy="4627581"/>
             <wp:effectExtent l="19050" t="19050" r="22860" b="20955"/>
-            <wp:docPr id="668219511" name="Imagem 24"/>
+            <wp:docPr id="1660137531" name="Imagem 24"/>
             <wp:cNvGraphicFramePr/>
             <a:graphic xmlns:a="http://schemas.openxmlformats.org/drawingml/2006/main">
               <a:graphicData uri="http://schemas.openxmlformats.org/drawingml/2006/picture">
                 <pic:pic xmlns:pic="http://schemas.openxmlformats.org/drawingml/2006/picture">
                   <pic:nvPicPr>
-                    <pic:cNvPr id="668219511" name=""/>
+                    <pic:cNvPr id="1660137531" name=""/>
                     <pic:cNvPicPr/>
                   </pic:nvPicPr>
                   <pic:blipFill>
@@ -15199,7 +15241,7 @@
         <w:pStyle w:val="PargrafodaLista"/>
         <w:numPr>
           <w:ilvl w:val="0"/>
-          <w:numId w:val="21"/>
+          <w:numId w:val="22"/>
         </w:numPr>
         <w:spacing w:after="80" w:line="260" w:lineRule="auto"/>
         <w:ind w:left="700"/>
@@ -15216,127 +15258,6 @@
           <w:sz w:val="22"/>
         </w:rPr>
         <w:t>Preencha a identificacao e o programa vinculado, se houver; selecione o tipo de encerramento (Concluido, Paralisado ou Cancelado).</w:t>
-      </w:r>
-    </w:p>
-    <w:p>
-      <w:pPr>
-        <w:pStyle w:val="PargrafodaLista"/>
-        <w:numPr>
-          <w:ilvl w:val="0"/>
-          <w:numId w:val="21"/>
-        </w:numPr>
-        <w:spacing w:after="80" w:line="260" w:lineRule="auto"/>
-        <w:ind w:left="700"/>
-        <w:rPr>
-          <w:rFonts w:ascii="Montserrat" w:hAnsi="Montserrat"/>
-          <w:color w:val="1A1A1A"/>
-          <w:sz w:val="22"/>
-        </w:rPr>
-      </w:pPr>
-      <w:r>
-        <w:rPr>
-          <w:rFonts w:ascii="Montserrat" w:hAnsi="Montserrat"/>
-          <w:color w:val="1A1A1A"/>
-          <w:sz w:val="22"/>
-        </w:rPr>
-        <w:t>Se Paralisado ou Cancelado, o campo Justificativa aparece automaticamente.</w:t>
-      </w:r>
-    </w:p>
-    <w:p>
-      <w:pPr>
-        <w:pStyle w:val="PargrafodaLista"/>
-        <w:numPr>
-          <w:ilvl w:val="0"/>
-          <w:numId w:val="21"/>
-        </w:numPr>
-        <w:spacing w:after="80" w:line="260" w:lineRule="auto"/>
-        <w:ind w:left="700"/>
-        <w:rPr>
-          <w:rFonts w:ascii="Montserrat" w:hAnsi="Montserrat"/>
-          <w:color w:val="1A1A1A"/>
-          <w:sz w:val="22"/>
-        </w:rPr>
-      </w:pPr>
-      <w:r>
-        <w:rPr>
-          <w:rFonts w:ascii="Montserrat" w:hAnsi="Montserrat"/>
-          <w:color w:val="1A1A1A"/>
-          <w:sz w:val="22"/>
-        </w:rPr>
-        <w:t>Registre entregas de resultados, atividades encerradas, o link da pasta do projeto e a analise de efetividade.</w:t>
-      </w:r>
-    </w:p>
-    <w:p>
-      <w:pPr>
-        <w:pStyle w:val="PargrafodaLista"/>
-        <w:numPr>
-          <w:ilvl w:val="0"/>
-          <w:numId w:val="21"/>
-        </w:numPr>
-        <w:spacing w:after="80" w:line="260" w:lineRule="auto"/>
-        <w:ind w:left="700"/>
-        <w:rPr>
-          <w:rFonts w:ascii="Montserrat" w:hAnsi="Montserrat"/>
-          <w:color w:val="1A1A1A"/>
-          <w:sz w:val="22"/>
-        </w:rPr>
-      </w:pPr>
-      <w:r>
-        <w:rPr>
-          <w:rFonts w:ascii="Montserrat" w:hAnsi="Montserrat"/>
-          <w:color w:val="1A1A1A"/>
-          <w:sz w:val="22"/>
-        </w:rPr>
-        <w:t>Assistente de preenchimento por IA: apos selecionar o Projeto vinculado, o botao Sugerir com IA compara o TAP, o Planejamento e a EAP com o que as Atas mais recentes confirmam realizado, sugerindo a justificativa de encerramento, as atividades encerradas e as consideracoes finais (secao 2.12).</w:t>
-      </w:r>
-    </w:p>
-    <w:p>
-      <w:pPr>
-        <w:spacing w:line="280" w:lineRule="auto"/>
-        <w:rPr>
-          <w:rFonts w:ascii="Montserrat" w:hAnsi="Montserrat"/>
-          <w:color w:val="1A1A1A"/>
-          <w:sz w:val="22"/>
-        </w:rPr>
-      </w:pPr>
-      <w:r>
-        <w:rPr>
-          <w:rFonts w:ascii="Montserrat" w:hAnsi="Montserrat"/>
-          <w:color w:val="1A1A1A"/>
-          <w:sz w:val="22"/>
-        </w:rPr>
-        <w:t>Clique em Registrar TEP para gerar o protocolo. O registro de um novo TEP dispara um e-mail de notificacao (secao 2.8).</w:t>
-      </w:r>
-    </w:p>
-    <w:p>
-      <w:pPr>
-        <w:spacing w:before="160" w:after="200"/>
-        <w:ind w:left="283"/>
-        <w:rPr>
-          <w:rFonts w:ascii="Montserrat" w:hAnsi="Montserrat"/>
-          <w:i/>
-          <w:color w:val="6A6A70"/>
-          <w:sz w:val="21"/>
-        </w:rPr>
-      </w:pPr>
-      <w:r>
-        <w:rPr>
-          <w:rFonts w:ascii="Montserrat" w:hAnsi="Montserrat"/>
-          <w:i/>
-          <w:color w:val="6A6A70"/>
-          <w:sz w:val="21"/>
-        </w:rPr>
-        <w:t xml:space="preserve">Encerra o projeto no cadastro compartilhado: ao registrar o TEP, o projeto vinculado passa a refletir o tipo de encerramento escolhido </w:t>
-      </w:r>
-      <w:r>
-        <w:rPr>
-          <w:rFonts w:ascii="Montserrat" w:hAnsi="Montserrat"/>
-          <w:i/>
-          <w:color w:val="6A6A70"/>
-          <w:sz w:val="21"/>
-        </w:rPr>
-        <w:lastRenderedPageBreak/>
-        <w:t>(Concluido/Paralisado/Cancelado) e some da lista de Projeto vinculado para novos registros nos demais formularios (secao 2.5).</w:t>
       </w:r>
     </w:p>
     <w:p>
@@ -15360,6 +15281,127 @@
           <w:color w:val="1A1A1A"/>
           <w:sz w:val="22"/>
         </w:rPr>
+        <w:t>Se Paralisado ou Cancelado, o campo Justificativa aparece automaticamente.</w:t>
+      </w:r>
+    </w:p>
+    <w:p>
+      <w:pPr>
+        <w:pStyle w:val="PargrafodaLista"/>
+        <w:numPr>
+          <w:ilvl w:val="0"/>
+          <w:numId w:val="22"/>
+        </w:numPr>
+        <w:spacing w:after="80" w:line="260" w:lineRule="auto"/>
+        <w:ind w:left="700"/>
+        <w:rPr>
+          <w:rFonts w:ascii="Montserrat" w:hAnsi="Montserrat"/>
+          <w:color w:val="1A1A1A"/>
+          <w:sz w:val="22"/>
+        </w:rPr>
+      </w:pPr>
+      <w:r>
+        <w:rPr>
+          <w:rFonts w:ascii="Montserrat" w:hAnsi="Montserrat"/>
+          <w:color w:val="1A1A1A"/>
+          <w:sz w:val="22"/>
+        </w:rPr>
+        <w:t>Registre entregas de resultados, atividades encerradas, o link da pasta do projeto e a analise de efetividade.</w:t>
+      </w:r>
+    </w:p>
+    <w:p>
+      <w:pPr>
+        <w:pStyle w:val="PargrafodaLista"/>
+        <w:numPr>
+          <w:ilvl w:val="0"/>
+          <w:numId w:val="22"/>
+        </w:numPr>
+        <w:spacing w:after="80" w:line="260" w:lineRule="auto"/>
+        <w:ind w:left="700"/>
+        <w:rPr>
+          <w:rFonts w:ascii="Montserrat" w:hAnsi="Montserrat"/>
+          <w:color w:val="1A1A1A"/>
+          <w:sz w:val="22"/>
+        </w:rPr>
+      </w:pPr>
+      <w:r>
+        <w:rPr>
+          <w:rFonts w:ascii="Montserrat" w:hAnsi="Montserrat"/>
+          <w:color w:val="1A1A1A"/>
+          <w:sz w:val="22"/>
+        </w:rPr>
+        <w:t>Assistente de preenchimento por IA: apos selecionar o Projeto vinculado, o botao Sugerir com IA compara o TAP, o Planejamento e a EAP com o que as Atas mais recentes confirmam realizado, sugerindo a justificativa de encerramento, as atividades encerradas e as consideracoes finais (secao 2.12).</w:t>
+      </w:r>
+    </w:p>
+    <w:p>
+      <w:pPr>
+        <w:spacing w:line="280" w:lineRule="auto"/>
+        <w:rPr>
+          <w:rFonts w:ascii="Montserrat" w:hAnsi="Montserrat"/>
+          <w:color w:val="1A1A1A"/>
+          <w:sz w:val="22"/>
+        </w:rPr>
+      </w:pPr>
+      <w:r>
+        <w:rPr>
+          <w:rFonts w:ascii="Montserrat" w:hAnsi="Montserrat"/>
+          <w:color w:val="1A1A1A"/>
+          <w:sz w:val="22"/>
+        </w:rPr>
+        <w:t>Clique em Registrar TEP para gerar o protocolo. O registro de um novo TEP dispara um e-mail de notificacao (secao 2.8).</w:t>
+      </w:r>
+    </w:p>
+    <w:p>
+      <w:pPr>
+        <w:spacing w:before="160" w:after="200"/>
+        <w:ind w:left="283"/>
+        <w:rPr>
+          <w:rFonts w:ascii="Montserrat" w:hAnsi="Montserrat"/>
+          <w:i/>
+          <w:color w:val="6A6A70"/>
+          <w:sz w:val="21"/>
+        </w:rPr>
+      </w:pPr>
+      <w:r>
+        <w:rPr>
+          <w:rFonts w:ascii="Montserrat" w:hAnsi="Montserrat"/>
+          <w:i/>
+          <w:color w:val="6A6A70"/>
+          <w:sz w:val="21"/>
+        </w:rPr>
+        <w:t xml:space="preserve">Encerra o projeto no cadastro compartilhado: ao registrar o TEP, o projeto vinculado passa a refletir o tipo de encerramento escolhido </w:t>
+      </w:r>
+      <w:r>
+        <w:rPr>
+          <w:rFonts w:ascii="Montserrat" w:hAnsi="Montserrat"/>
+          <w:i/>
+          <w:color w:val="6A6A70"/>
+          <w:sz w:val="21"/>
+        </w:rPr>
+        <w:lastRenderedPageBreak/>
+        <w:t>(Concluido/Paralisado/Cancelado) e some da lista de Projeto vinculado para novos registros nos demais formularios (secao 2.5).</w:t>
+      </w:r>
+    </w:p>
+    <w:p>
+      <w:pPr>
+        <w:pStyle w:val="PargrafodaLista"/>
+        <w:numPr>
+          <w:ilvl w:val="0"/>
+          <w:numId w:val="23"/>
+        </w:numPr>
+        <w:spacing w:after="80" w:line="260" w:lineRule="auto"/>
+        <w:ind w:left="700"/>
+        <w:rPr>
+          <w:rFonts w:ascii="Montserrat" w:hAnsi="Montserrat"/>
+          <w:color w:val="1A1A1A"/>
+          <w:sz w:val="22"/>
+        </w:rPr>
+      </w:pPr>
+      <w:r>
+        <w:rPr>
+          <w:rFonts w:ascii="Montserrat" w:hAnsi="Montserrat"/>
+          <w:color w:val="1A1A1A"/>
+          <w:sz w:val="22"/>
+        </w:rPr>
         <w:t>No rodape do painel de detalhes de um TEP, os botoes Imprimir e Exportar Word geram o documento no formato oficial do FORALF00341, pronto para impressao ou para abrir no Word.</w:t>
       </w:r>
     </w:p>
@@ -15374,7 +15416,7 @@
           <w:sz w:val="27"/>
         </w:rPr>
       </w:pPr>
-      <w:bookmarkStart w:id="28" w:name="_Toc240271793"/>
+      <w:bookmarkStart w:id="28" w:name="_Toc240273029"/>
       <w:r>
         <w:rPr>
           <w:rFonts w:ascii="Montserrat" w:hAnsi="Montserrat"/>
@@ -15414,16 +15456,16 @@
           <w:noProof/>
         </w:rPr>
         <w:drawing>
-          <wp:inline distT="0" distB="0" distL="0" distR="0" wp14:anchorId="77C27D25" wp14:editId="0CF14584">
+          <wp:inline distT="0" distB="0" distL="0" distR="0" wp14:anchorId="678EAF5E" wp14:editId="7136BA8E">
             <wp:extent cx="5120640" cy="4627581"/>
             <wp:effectExtent l="19050" t="19050" r="22860" b="20955"/>
-            <wp:docPr id="1274196707" name="Imagem 25"/>
+            <wp:docPr id="949326298" name="Imagem 25"/>
             <wp:cNvGraphicFramePr/>
             <a:graphic xmlns:a="http://schemas.openxmlformats.org/drawingml/2006/main">
               <a:graphicData uri="http://schemas.openxmlformats.org/drawingml/2006/picture">
                 <pic:pic xmlns:pic="http://schemas.openxmlformats.org/drawingml/2006/picture">
                   <pic:nvPicPr>
-                    <pic:cNvPr id="1274196707" name=""/>
+                    <pic:cNvPr id="949326298" name=""/>
                     <pic:cNvPicPr/>
                   </pic:nvPicPr>
                   <pic:blipFill>
@@ -15491,16 +15533,16 @@
         </w:rPr>
         <w:lastRenderedPageBreak/>
         <w:drawing>
-          <wp:inline distT="0" distB="0" distL="0" distR="0" wp14:anchorId="7B1B97C7" wp14:editId="102117D2">
+          <wp:inline distT="0" distB="0" distL="0" distR="0" wp14:anchorId="7E8BB937" wp14:editId="358A002C">
             <wp:extent cx="5120640" cy="4627581"/>
             <wp:effectExtent l="19050" t="19050" r="22860" b="20955"/>
-            <wp:docPr id="74889192" name="Imagem 26"/>
+            <wp:docPr id="2071574274" name="Imagem 26"/>
             <wp:cNvGraphicFramePr/>
             <a:graphic xmlns:a="http://schemas.openxmlformats.org/drawingml/2006/main">
               <a:graphicData uri="http://schemas.openxmlformats.org/drawingml/2006/picture">
                 <pic:pic xmlns:pic="http://schemas.openxmlformats.org/drawingml/2006/picture">
                   <pic:nvPicPr>
-                    <pic:cNvPr id="74889192" name=""/>
+                    <pic:cNvPr id="2071574274" name=""/>
                     <pic:cNvPicPr/>
                   </pic:nvPicPr>
                   <pic:blipFill>
@@ -15562,7 +15604,7 @@
         <w:pStyle w:val="PargrafodaLista"/>
         <w:numPr>
           <w:ilvl w:val="0"/>
-          <w:numId w:val="22"/>
+          <w:numId w:val="23"/>
         </w:numPr>
         <w:spacing w:after="80" w:line="260" w:lineRule="auto"/>
         <w:ind w:left="700"/>
@@ -15579,72 +15621,6 @@
           <w:sz w:val="22"/>
         </w:rPr>
         <w:t>Responda as perguntas abertas dos blocos Visao geral, Destaques, Desafios e Pos-projeto.</w:t>
-      </w:r>
-    </w:p>
-    <w:p>
-      <w:pPr>
-        <w:pStyle w:val="PargrafodaLista"/>
-        <w:numPr>
-          <w:ilvl w:val="0"/>
-          <w:numId w:val="22"/>
-        </w:numPr>
-        <w:spacing w:after="80" w:line="260" w:lineRule="auto"/>
-        <w:ind w:left="700"/>
-        <w:rPr>
-          <w:rFonts w:ascii="Montserrat" w:hAnsi="Montserrat"/>
-          <w:color w:val="1A1A1A"/>
-          <w:sz w:val="22"/>
-        </w:rPr>
-      </w:pPr>
-      <w:r>
-        <w:rPr>
-          <w:rFonts w:ascii="Montserrat" w:hAnsi="Montserrat"/>
-          <w:color w:val="1A1A1A"/>
-          <w:sz w:val="22"/>
-        </w:rPr>
-        <w:t>Nos blocos de avaliacao estruturada, marque Sim/Nao/Parcial/N-A para cada afirmacao - cada bloco calcula automaticamente um placar percentual.</w:t>
-      </w:r>
-    </w:p>
-    <w:p>
-      <w:pPr>
-        <w:pStyle w:val="PargrafodaLista"/>
-        <w:numPr>
-          <w:ilvl w:val="0"/>
-          <w:numId w:val="22"/>
-        </w:numPr>
-        <w:spacing w:after="80" w:line="260" w:lineRule="auto"/>
-        <w:ind w:left="700"/>
-        <w:rPr>
-          <w:rFonts w:ascii="Montserrat" w:hAnsi="Montserrat"/>
-          <w:color w:val="1A1A1A"/>
-          <w:sz w:val="22"/>
-        </w:rPr>
-      </w:pPr>
-      <w:r>
-        <w:rPr>
-          <w:rFonts w:ascii="Montserrat" w:hAnsi="Montserrat"/>
-          <w:color w:val="1A1A1A"/>
-          <w:sz w:val="22"/>
-        </w:rPr>
-        <w:t>Assistente de preenchimento por IA: apos selecionar o Projeto vinculado, o botao Sugerir com IA le o TEP, as Atas e todas as SMPs do projeto para sugerir as respostas das 4 secoes de texto livre - Visao geral, Destaques, Desafios e Tarefas pos-projeto. Os blocos de avaliacao estruturada Sim/Nao/Parcial (secoes 6 a 9, com placar percentual) nao sao preenchidos pela IA - continuam sendo uma autoavaliacao manual da equipe (secao 2.12).</w:t>
-      </w:r>
-    </w:p>
-    <w:p>
-      <w:pPr>
-        <w:spacing w:line="280" w:lineRule="auto"/>
-        <w:rPr>
-          <w:rFonts w:ascii="Montserrat" w:hAnsi="Montserrat"/>
-          <w:color w:val="1A1A1A"/>
-          <w:sz w:val="22"/>
-        </w:rPr>
-      </w:pPr>
-      <w:r>
-        <w:rPr>
-          <w:rFonts w:ascii="Montserrat" w:hAnsi="Montserrat"/>
-          <w:color w:val="1A1A1A"/>
-          <w:sz w:val="22"/>
-        </w:rPr>
-        <w:t>Clique em Registrar RLA. O score global fica salvo junto com o registro.</w:t>
       </w:r>
     </w:p>
     <w:p>
@@ -15668,6 +15644,72 @@
           <w:color w:val="1A1A1A"/>
           <w:sz w:val="22"/>
         </w:rPr>
+        <w:t>Nos blocos de avaliacao estruturada, marque Sim/Nao/Parcial/N-A para cada afirmacao - cada bloco calcula automaticamente um placar percentual.</w:t>
+      </w:r>
+    </w:p>
+    <w:p>
+      <w:pPr>
+        <w:pStyle w:val="PargrafodaLista"/>
+        <w:numPr>
+          <w:ilvl w:val="0"/>
+          <w:numId w:val="23"/>
+        </w:numPr>
+        <w:spacing w:after="80" w:line="260" w:lineRule="auto"/>
+        <w:ind w:left="700"/>
+        <w:rPr>
+          <w:rFonts w:ascii="Montserrat" w:hAnsi="Montserrat"/>
+          <w:color w:val="1A1A1A"/>
+          <w:sz w:val="22"/>
+        </w:rPr>
+      </w:pPr>
+      <w:r>
+        <w:rPr>
+          <w:rFonts w:ascii="Montserrat" w:hAnsi="Montserrat"/>
+          <w:color w:val="1A1A1A"/>
+          <w:sz w:val="22"/>
+        </w:rPr>
+        <w:t>Assistente de preenchimento por IA: apos selecionar o Projeto vinculado, o botao Sugerir com IA le o TEP, as Atas e todas as SMPs do projeto para sugerir as respostas das 4 secoes de texto livre - Visao geral, Destaques, Desafios e Tarefas pos-projeto. Os blocos de avaliacao estruturada Sim/Nao/Parcial (secoes 6 a 9, com placar percentual) nao sao preenchidos pela IA - continuam sendo uma autoavaliacao manual da equipe (secao 2.12).</w:t>
+      </w:r>
+    </w:p>
+    <w:p>
+      <w:pPr>
+        <w:spacing w:line="280" w:lineRule="auto"/>
+        <w:rPr>
+          <w:rFonts w:ascii="Montserrat" w:hAnsi="Montserrat"/>
+          <w:color w:val="1A1A1A"/>
+          <w:sz w:val="22"/>
+        </w:rPr>
+      </w:pPr>
+      <w:r>
+        <w:rPr>
+          <w:rFonts w:ascii="Montserrat" w:hAnsi="Montserrat"/>
+          <w:color w:val="1A1A1A"/>
+          <w:sz w:val="22"/>
+        </w:rPr>
+        <w:t>Clique em Registrar RLA. O score global fica salvo junto com o registro.</w:t>
+      </w:r>
+    </w:p>
+    <w:p>
+      <w:pPr>
+        <w:pStyle w:val="PargrafodaLista"/>
+        <w:numPr>
+          <w:ilvl w:val="0"/>
+          <w:numId w:val="24"/>
+        </w:numPr>
+        <w:spacing w:after="80" w:line="260" w:lineRule="auto"/>
+        <w:ind w:left="700"/>
+        <w:rPr>
+          <w:rFonts w:ascii="Montserrat" w:hAnsi="Montserrat"/>
+          <w:color w:val="1A1A1A"/>
+          <w:sz w:val="22"/>
+        </w:rPr>
+      </w:pPr>
+      <w:r>
+        <w:rPr>
+          <w:rFonts w:ascii="Montserrat" w:hAnsi="Montserrat"/>
+          <w:color w:val="1A1A1A"/>
+          <w:sz w:val="22"/>
+        </w:rPr>
         <w:t xml:space="preserve">No rodape do painel de detalhes de um RLA, os botoes Imprimir e Exportar Word geram o documento no formato oficial do FORALF00342 </w:t>
       </w:r>
       <w:r>
@@ -15691,7 +15733,7 @@
           <w:sz w:val="27"/>
         </w:rPr>
       </w:pPr>
-      <w:bookmarkStart w:id="29" w:name="_Toc240271794"/>
+      <w:bookmarkStart w:id="29" w:name="_Toc240273030"/>
       <w:r>
         <w:rPr>
           <w:rFonts w:ascii="Montserrat" w:hAnsi="Montserrat"/>
@@ -15731,16 +15773,16 @@
           <w:noProof/>
         </w:rPr>
         <w:drawing>
-          <wp:inline distT="0" distB="0" distL="0" distR="0" wp14:anchorId="7352C2CC" wp14:editId="6DB2D8D1">
+          <wp:inline distT="0" distB="0" distL="0" distR="0" wp14:anchorId="276FE48F" wp14:editId="737E2B6D">
             <wp:extent cx="5120640" cy="4000682"/>
             <wp:effectExtent l="19050" t="19050" r="22860" b="19050"/>
-            <wp:docPr id="8542076" name="Imagem 27"/>
+            <wp:docPr id="1490569739" name="Imagem 27"/>
             <wp:cNvGraphicFramePr/>
             <a:graphic xmlns:a="http://schemas.openxmlformats.org/drawingml/2006/main">
               <a:graphicData uri="http://schemas.openxmlformats.org/drawingml/2006/picture">
                 <pic:pic xmlns:pic="http://schemas.openxmlformats.org/drawingml/2006/picture">
                   <pic:nvPicPr>
-                    <pic:cNvPr id="8542076" name=""/>
+                    <pic:cNvPr id="1490569739" name=""/>
                     <pic:cNvPicPr/>
                   </pic:nvPicPr>
                   <pic:blipFill>
@@ -16264,7 +16306,7 @@
           <w:sz w:val="34"/>
         </w:rPr>
       </w:pPr>
-      <w:bookmarkStart w:id="30" w:name="_Toc240271795"/>
+      <w:bookmarkStart w:id="30" w:name="_Toc240273031"/>
       <w:r>
         <w:rPr>
           <w:rFonts w:ascii="Montserrat" w:hAnsi="Montserrat"/>
@@ -16306,7 +16348,7 @@
           <w:sz w:val="27"/>
         </w:rPr>
       </w:pPr>
-      <w:bookmarkStart w:id="31" w:name="_Toc240271796"/>
+      <w:bookmarkStart w:id="31" w:name="_Toc240273032"/>
       <w:r>
         <w:rPr>
           <w:rFonts w:ascii="Montserrat" w:hAnsi="Montserrat"/>
@@ -16346,16 +16388,16 @@
           <w:noProof/>
         </w:rPr>
         <w:drawing>
-          <wp:inline distT="0" distB="0" distL="0" distR="0" wp14:anchorId="6E1A4807" wp14:editId="14E2261F">
+          <wp:inline distT="0" distB="0" distL="0" distR="0" wp14:anchorId="7498DE04" wp14:editId="03DB45A7">
             <wp:extent cx="5120640" cy="4627581"/>
             <wp:effectExtent l="19050" t="19050" r="22860" b="20955"/>
-            <wp:docPr id="678299912" name="Imagem 28"/>
+            <wp:docPr id="1866758044" name="Imagem 28"/>
             <wp:cNvGraphicFramePr/>
             <a:graphic xmlns:a="http://schemas.openxmlformats.org/drawingml/2006/main">
               <a:graphicData uri="http://schemas.openxmlformats.org/drawingml/2006/picture">
                 <pic:pic xmlns:pic="http://schemas.openxmlformats.org/drawingml/2006/picture">
                   <pic:nvPicPr>
-                    <pic:cNvPr id="678299912" name=""/>
+                    <pic:cNvPr id="1866758044" name=""/>
                     <pic:cNvPicPr/>
                   </pic:nvPicPr>
                   <pic:blipFill>
@@ -16423,16 +16465,16 @@
         </w:rPr>
         <w:lastRenderedPageBreak/>
         <w:drawing>
-          <wp:inline distT="0" distB="0" distL="0" distR="0" wp14:anchorId="394F44AE" wp14:editId="4705724B">
+          <wp:inline distT="0" distB="0" distL="0" distR="0" wp14:anchorId="3DBE1894" wp14:editId="6FA2F20D">
             <wp:extent cx="5120640" cy="4627581"/>
             <wp:effectExtent l="19050" t="19050" r="22860" b="20955"/>
-            <wp:docPr id="1585218433" name="Imagem 29"/>
+            <wp:docPr id="836383561" name="Imagem 29"/>
             <wp:cNvGraphicFramePr/>
             <a:graphic xmlns:a="http://schemas.openxmlformats.org/drawingml/2006/main">
               <a:graphicData uri="http://schemas.openxmlformats.org/drawingml/2006/picture">
                 <pic:pic xmlns:pic="http://schemas.openxmlformats.org/drawingml/2006/picture">
                   <pic:nvPicPr>
-                    <pic:cNvPr id="1585218433" name=""/>
+                    <pic:cNvPr id="836383561" name=""/>
                     <pic:cNvPicPr/>
                   </pic:nvPicPr>
                   <pic:blipFill>
@@ -16500,16 +16542,16 @@
         </w:rPr>
         <w:lastRenderedPageBreak/>
         <w:drawing>
-          <wp:inline distT="0" distB="0" distL="0" distR="0" wp14:anchorId="76DFF770" wp14:editId="3485A344">
+          <wp:inline distT="0" distB="0" distL="0" distR="0" wp14:anchorId="0A998001" wp14:editId="231E1A70">
             <wp:extent cx="5120640" cy="4627581"/>
             <wp:effectExtent l="19050" t="19050" r="22860" b="20955"/>
-            <wp:docPr id="865425936" name="Imagem 30"/>
+            <wp:docPr id="455794968" name="Imagem 30"/>
             <wp:cNvGraphicFramePr/>
             <a:graphic xmlns:a="http://schemas.openxmlformats.org/drawingml/2006/main">
               <a:graphicData uri="http://schemas.openxmlformats.org/drawingml/2006/picture">
                 <pic:pic xmlns:pic="http://schemas.openxmlformats.org/drawingml/2006/picture">
                   <pic:nvPicPr>
-                    <pic:cNvPr id="865425936" name=""/>
+                    <pic:cNvPr id="455794968" name=""/>
                     <pic:cNvPicPr/>
                   </pic:nvPicPr>
                   <pic:blipFill>
@@ -16571,7 +16613,7 @@
         <w:pStyle w:val="PargrafodaLista"/>
         <w:numPr>
           <w:ilvl w:val="0"/>
-          <w:numId w:val="23"/>
+          <w:numId w:val="24"/>
         </w:numPr>
         <w:spacing w:after="80" w:line="260" w:lineRule="auto"/>
         <w:ind w:left="700"/>
@@ -16588,61 +16630,6 @@
           <w:sz w:val="22"/>
         </w:rPr>
         <w:t>Preencha o cabecalho (mes/ano de referencia, responsavel, previsao financeira, entregas planejadas).</w:t>
-      </w:r>
-    </w:p>
-    <w:p>
-      <w:pPr>
-        <w:pStyle w:val="PargrafodaLista"/>
-        <w:numPr>
-          <w:ilvl w:val="0"/>
-          <w:numId w:val="23"/>
-        </w:numPr>
-        <w:spacing w:after="80" w:line="260" w:lineRule="auto"/>
-        <w:ind w:left="700"/>
-        <w:rPr>
-          <w:rFonts w:ascii="Montserrat" w:hAnsi="Montserrat"/>
-          <w:color w:val="1A1A1A"/>
-          <w:sz w:val="22"/>
-        </w:rPr>
-      </w:pPr>
-      <w:r>
-        <w:rPr>
-          <w:rFonts w:ascii="Montserrat" w:hAnsi="Montserrat"/>
-          <w:color w:val="1A1A1A"/>
-          <w:sz w:val="22"/>
-        </w:rPr>
-        <w:t>Adicione cada projeto do portfolio, com status, % execucao, datas e os campos Merece atencao e Merece destaque.</w:t>
-      </w:r>
-    </w:p>
-    <w:p>
-      <w:pPr>
-        <w:spacing w:before="160" w:after="200"/>
-        <w:ind w:left="283"/>
-        <w:rPr>
-          <w:rFonts w:ascii="Montserrat" w:hAnsi="Montserrat"/>
-          <w:i/>
-          <w:color w:val="6A6A70"/>
-          <w:sz w:val="21"/>
-        </w:rPr>
-      </w:pPr>
-      <w:r>
-        <w:rPr>
-          <w:rFonts w:ascii="Montserrat" w:hAnsi="Montserrat"/>
-          <w:i/>
-          <w:color w:val="6A6A70"/>
-          <w:sz w:val="21"/>
-        </w:rPr>
-        <w:t xml:space="preserve">Projeto vinculado (Gate 1) - opcional: cada linha de projeto pode, opcionalmente, ser associada a um Projeto ja Aprovado no Gate 1 (o mesmo cadastro compartilhado usado pelo Canvas, TAP, Planejamento, EAP, SMP, TEP e RLA - secao 2.5). Ao selecionar um projeto na lista, os campos Nome do projeto, Responsavel (a partir do gestor do projeto) e Inicio previsto/Termino previsto (a partir da menor e maior data do cronograma de entregas macro do Planejamento vinculado, se houver) sao preenchidos automaticamente - sempre so nos campos ainda vazios, sem sobrescrever o que ja foi digitado. Tambem aparece o botao Ver historico, que mostra as alteracoes desse projeto vindas de qualquer outro formulario vinculado a ele. Deixar em Nenhum mantem o comportamento anterior - o projeto do Relatorio de Situacao </w:t>
-      </w:r>
-      <w:r>
-        <w:rPr>
-          <w:rFonts w:ascii="Montserrat" w:hAnsi="Montserrat"/>
-          <w:i/>
-          <w:color w:val="6A6A70"/>
-          <w:sz w:val="21"/>
-        </w:rPr>
-        <w:lastRenderedPageBreak/>
-        <w:t>continua sendo texto livre, sem vinculo. Se o Planejamento nao tiver nenhuma data de cronograma preenchida, Inicio previsto e Termino previsto ficam em branco para preenchimento manual - o sistema nao tenta adivinhar a partir de outro documento.</w:t>
       </w:r>
     </w:p>
     <w:p>
@@ -16666,7 +16653,38 @@
           <w:color w:val="1A1A1A"/>
           <w:sz w:val="22"/>
         </w:rPr>
-        <w:t>Assistente de preenchimento por IA: com um Projeto vinculado selecionado, o botao Sugerir com IA le o TAP e as Atas daquele projeto, mais a situacao ja digitada na linha, para sugerir o que Merece atencao e o que Merece destaque (secao 2.12).</w:t>
+        <w:t>Adicione cada projeto do portfolio, com status, % execucao, datas e os campos Merece atencao e Merece destaque.</w:t>
+      </w:r>
+    </w:p>
+    <w:p>
+      <w:pPr>
+        <w:spacing w:before="160" w:after="200"/>
+        <w:ind w:left="283"/>
+        <w:rPr>
+          <w:rFonts w:ascii="Montserrat" w:hAnsi="Montserrat"/>
+          <w:i/>
+          <w:color w:val="6A6A70"/>
+          <w:sz w:val="21"/>
+        </w:rPr>
+      </w:pPr>
+      <w:r>
+        <w:rPr>
+          <w:rFonts w:ascii="Montserrat" w:hAnsi="Montserrat"/>
+          <w:i/>
+          <w:color w:val="6A6A70"/>
+          <w:sz w:val="21"/>
+        </w:rPr>
+        <w:t xml:space="preserve">Projeto vinculado (Gate 1) - opcional: cada linha de projeto pode, opcionalmente, ser associada a um Projeto ja Aprovado no Gate 1 (o mesmo cadastro compartilhado usado pelo Canvas, TAP, Planejamento, EAP, SMP, TEP e RLA - secao 2.5). Ao selecionar um projeto na lista, os campos Nome do projeto, Responsavel (a partir do gestor do projeto) e Inicio previsto/Termino previsto (a partir da menor e maior data do cronograma de entregas macro do Planejamento vinculado, se houver) sao preenchidos automaticamente - sempre so nos campos ainda vazios, sem sobrescrever o que ja foi digitado. Tambem aparece o botao Ver historico, que mostra as alteracoes desse projeto vindas de qualquer outro formulario vinculado a ele. Deixar em Nenhum mantem o comportamento anterior - o projeto do Relatorio de Situacao </w:t>
+      </w:r>
+      <w:r>
+        <w:rPr>
+          <w:rFonts w:ascii="Montserrat" w:hAnsi="Montserrat"/>
+          <w:i/>
+          <w:color w:val="6A6A70"/>
+          <w:sz w:val="21"/>
+        </w:rPr>
+        <w:lastRenderedPageBreak/>
+        <w:t>continua sendo texto livre, sem vinculo. Se o Planejamento nao tiver nenhuma data de cronograma preenchida, Inicio previsto e Termino previsto ficam em branco para preenchimento manual - o sistema nao tenta adivinhar a partir de outro documento.</w:t>
       </w:r>
     </w:p>
     <w:p>
@@ -16674,7 +16692,7 @@
         <w:pStyle w:val="PargrafodaLista"/>
         <w:numPr>
           <w:ilvl w:val="0"/>
-          <w:numId w:val="24"/>
+          <w:numId w:val="25"/>
         </w:numPr>
         <w:spacing w:after="80" w:line="260" w:lineRule="auto"/>
         <w:ind w:left="700"/>
@@ -16690,6 +16708,30 @@
           <w:color w:val="1A1A1A"/>
           <w:sz w:val="22"/>
         </w:rPr>
+        <w:t>Assistente de preenchimento por IA: com um Projeto vinculado selecionado, o botao Sugerir com IA le o TAP e as Atas daquele projeto, mais a situacao ja digitada na linha, para sugerir o que Merece atencao e o que Merece destaque (secao 2.12).</w:t>
+      </w:r>
+    </w:p>
+    <w:p>
+      <w:pPr>
+        <w:pStyle w:val="PargrafodaLista"/>
+        <w:numPr>
+          <w:ilvl w:val="0"/>
+          <w:numId w:val="25"/>
+        </w:numPr>
+        <w:spacing w:after="80" w:line="260" w:lineRule="auto"/>
+        <w:ind w:left="700"/>
+        <w:rPr>
+          <w:rFonts w:ascii="Montserrat" w:hAnsi="Montserrat"/>
+          <w:color w:val="1A1A1A"/>
+          <w:sz w:val="22"/>
+        </w:rPr>
+      </w:pPr>
+      <w:r>
+        <w:rPr>
+          <w:rFonts w:ascii="Montserrat" w:hAnsi="Montserrat"/>
+          <w:color w:val="1A1A1A"/>
+          <w:sz w:val="22"/>
+        </w:rPr>
         <w:t>Marcos vem do Planejamento: a secao Marcos de cada linha de projeto mostra, automaticamente (sem botao de importar), os marcos do cronograma de entregas macro do Planejamento e Desenvolvimento de Projeto daquele projeto - nome, Inicio/Termino previsto e Conclusao real vem sempre ao vivo do Planejamento (para mudar um marco, edite o Planejamento). O unico campo proprio aqui e o Status de cada marco (A iniciar, No prazo, Atrasado, Paralisado, Concluido ou Cancelado), que continua sendo ajustado manualmente. Um marco com dependencia bloqueada (</w:t>
       </w:r>
       <w:r>
@@ -16711,16 +16753,16 @@
           <w:noProof/>
         </w:rPr>
         <w:drawing>
-          <wp:inline distT="0" distB="0" distL="0" distR="0" wp14:anchorId="263AB19E" wp14:editId="0B376B71">
+          <wp:inline distT="0" distB="0" distL="0" distR="0" wp14:anchorId="1882B780" wp14:editId="16485963">
             <wp:extent cx="5120640" cy="1715571"/>
             <wp:effectExtent l="19050" t="19050" r="22860" b="18415"/>
-            <wp:docPr id="950185871" name="Imagem 31"/>
+            <wp:docPr id="1365738868" name="Imagem 31"/>
             <wp:cNvGraphicFramePr/>
             <a:graphic xmlns:a="http://schemas.openxmlformats.org/drawingml/2006/main">
               <a:graphicData uri="http://schemas.openxmlformats.org/drawingml/2006/picture">
                 <pic:pic xmlns:pic="http://schemas.openxmlformats.org/drawingml/2006/picture">
                   <pic:nvPicPr>
-                    <pic:cNvPr id="950185871" name=""/>
+                    <pic:cNvPr id="1365738868" name=""/>
                     <pic:cNvPicPr/>
                   </pic:nvPicPr>
                   <pic:blipFill>
@@ -16782,7 +16824,7 @@
         <w:pStyle w:val="PargrafodaLista"/>
         <w:numPr>
           <w:ilvl w:val="0"/>
-          <w:numId w:val="25"/>
+          <w:numId w:val="26"/>
         </w:numPr>
         <w:spacing w:after="80" w:line="260" w:lineRule="auto"/>
         <w:ind w:left="700"/>
@@ -16806,7 +16848,7 @@
         <w:pStyle w:val="PargrafodaLista"/>
         <w:numPr>
           <w:ilvl w:val="0"/>
-          <w:numId w:val="25"/>
+          <w:numId w:val="26"/>
         </w:numPr>
         <w:spacing w:after="80" w:line="260" w:lineRule="auto"/>
         <w:ind w:left="700"/>
@@ -16857,16 +16899,16 @@
           <w:noProof/>
         </w:rPr>
         <w:drawing>
-          <wp:inline distT="0" distB="0" distL="0" distR="0" wp14:anchorId="16BD4418" wp14:editId="5EF63DF2">
+          <wp:inline distT="0" distB="0" distL="0" distR="0" wp14:anchorId="3E9D55F9" wp14:editId="427E6621">
             <wp:extent cx="5120640" cy="3282818"/>
             <wp:effectExtent l="19050" t="19050" r="22860" b="13335"/>
-            <wp:docPr id="1141734422" name="Imagem 32"/>
+            <wp:docPr id="1561426651" name="Imagem 32"/>
             <wp:cNvGraphicFramePr/>
             <a:graphic xmlns:a="http://schemas.openxmlformats.org/drawingml/2006/main">
               <a:graphicData uri="http://schemas.openxmlformats.org/drawingml/2006/picture">
                 <pic:pic xmlns:pic="http://schemas.openxmlformats.org/drawingml/2006/picture">
                   <pic:nvPicPr>
-                    <pic:cNvPr id="1141734422" name=""/>
+                    <pic:cNvPr id="1561426651" name=""/>
                     <pic:cNvPicPr/>
                   </pic:nvPicPr>
                   <pic:blipFill>
@@ -16928,7 +16970,7 @@
         <w:pStyle w:val="PargrafodaLista"/>
         <w:numPr>
           <w:ilvl w:val="0"/>
-          <w:numId w:val="26"/>
+          <w:numId w:val="27"/>
         </w:numPr>
         <w:spacing w:after="80" w:line="260" w:lineRule="auto"/>
         <w:ind w:left="700"/>
@@ -17000,16 +17042,16 @@
           <w:noProof/>
         </w:rPr>
         <w:drawing>
-          <wp:inline distT="0" distB="0" distL="0" distR="0" wp14:anchorId="320F492E" wp14:editId="75792E2B">
+          <wp:inline distT="0" distB="0" distL="0" distR="0" wp14:anchorId="3F053971" wp14:editId="154FB8FA">
             <wp:extent cx="5120640" cy="951357"/>
             <wp:effectExtent l="19050" t="19050" r="22860" b="20320"/>
-            <wp:docPr id="1339836688" name="Imagem 33"/>
+            <wp:docPr id="827840657" name="Imagem 33"/>
             <wp:cNvGraphicFramePr/>
             <a:graphic xmlns:a="http://schemas.openxmlformats.org/drawingml/2006/main">
               <a:graphicData uri="http://schemas.openxmlformats.org/drawingml/2006/picture">
                 <pic:pic xmlns:pic="http://schemas.openxmlformats.org/drawingml/2006/picture">
                   <pic:nvPicPr>
-                    <pic:cNvPr id="1339836688" name=""/>
+                    <pic:cNvPr id="827840657" name=""/>
                     <pic:cNvPicPr/>
                   </pic:nvPicPr>
                   <pic:blipFill>
@@ -17071,7 +17113,7 @@
         <w:pStyle w:val="PargrafodaLista"/>
         <w:numPr>
           <w:ilvl w:val="0"/>
-          <w:numId w:val="26"/>
+          <w:numId w:val="27"/>
         </w:numPr>
         <w:spacing w:after="80" w:line="260" w:lineRule="auto"/>
         <w:ind w:left="700"/>
@@ -17121,16 +17163,16 @@
           <w:noProof/>
         </w:rPr>
         <w:drawing>
-          <wp:inline distT="0" distB="0" distL="0" distR="0" wp14:anchorId="72C06110" wp14:editId="65C947E1">
+          <wp:inline distT="0" distB="0" distL="0" distR="0" wp14:anchorId="385E678F" wp14:editId="096833DF">
             <wp:extent cx="5120640" cy="1515102"/>
             <wp:effectExtent l="19050" t="19050" r="22860" b="28575"/>
-            <wp:docPr id="653566059" name="Imagem 34"/>
+            <wp:docPr id="641833573" name="Imagem 34"/>
             <wp:cNvGraphicFramePr/>
             <a:graphic xmlns:a="http://schemas.openxmlformats.org/drawingml/2006/main">
               <a:graphicData uri="http://schemas.openxmlformats.org/drawingml/2006/picture">
                 <pic:pic xmlns:pic="http://schemas.openxmlformats.org/drawingml/2006/picture">
                   <pic:nvPicPr>
-                    <pic:cNvPr id="653566059" name=""/>
+                    <pic:cNvPr id="641833573" name=""/>
                     <pic:cNvPicPr/>
                   </pic:nvPicPr>
                   <pic:blipFill>
@@ -17192,7 +17234,7 @@
         <w:pStyle w:val="PargrafodaLista"/>
         <w:numPr>
           <w:ilvl w:val="0"/>
-          <w:numId w:val="26"/>
+          <w:numId w:val="27"/>
         </w:numPr>
         <w:spacing w:after="80" w:line="260" w:lineRule="auto"/>
         <w:ind w:left="700"/>
@@ -17243,16 +17285,16 @@
           <w:noProof/>
         </w:rPr>
         <w:drawing>
-          <wp:inline distT="0" distB="0" distL="0" distR="0" wp14:anchorId="37EC0D8D" wp14:editId="7BB4DA1A">
+          <wp:inline distT="0" distB="0" distL="0" distR="0" wp14:anchorId="5454B385" wp14:editId="17588E26">
             <wp:extent cx="5120640" cy="1391113"/>
             <wp:effectExtent l="19050" t="19050" r="22860" b="19050"/>
-            <wp:docPr id="651331923" name="Imagem 35"/>
+            <wp:docPr id="1873422028" name="Imagem 35"/>
             <wp:cNvGraphicFramePr/>
             <a:graphic xmlns:a="http://schemas.openxmlformats.org/drawingml/2006/main">
               <a:graphicData uri="http://schemas.openxmlformats.org/drawingml/2006/picture">
                 <pic:pic xmlns:pic="http://schemas.openxmlformats.org/drawingml/2006/picture">
                   <pic:nvPicPr>
-                    <pic:cNvPr id="651331923" name=""/>
+                    <pic:cNvPr id="1873422028" name=""/>
                     <pic:cNvPicPr/>
                   </pic:nvPicPr>
                   <pic:blipFill>
@@ -17314,7 +17356,7 @@
         <w:pStyle w:val="PargrafodaLista"/>
         <w:numPr>
           <w:ilvl w:val="0"/>
-          <w:numId w:val="26"/>
+          <w:numId w:val="27"/>
         </w:numPr>
         <w:spacing w:after="80" w:line="260" w:lineRule="auto"/>
         <w:ind w:left="700"/>
@@ -17364,16 +17406,16 @@
           <w:noProof/>
         </w:rPr>
         <w:drawing>
-          <wp:inline distT="0" distB="0" distL="0" distR="0" wp14:anchorId="3F6E3CC1" wp14:editId="403EFA16">
+          <wp:inline distT="0" distB="0" distL="0" distR="0" wp14:anchorId="050E6322" wp14:editId="07252776">
             <wp:extent cx="5120640" cy="1125174"/>
             <wp:effectExtent l="19050" t="19050" r="22860" b="18415"/>
-            <wp:docPr id="1232139232" name="Imagem 36"/>
+            <wp:docPr id="2092549791" name="Imagem 36"/>
             <wp:cNvGraphicFramePr/>
             <a:graphic xmlns:a="http://schemas.openxmlformats.org/drawingml/2006/main">
               <a:graphicData uri="http://schemas.openxmlformats.org/drawingml/2006/picture">
                 <pic:pic xmlns:pic="http://schemas.openxmlformats.org/drawingml/2006/picture">
                   <pic:nvPicPr>
-                    <pic:cNvPr id="1232139232" name=""/>
+                    <pic:cNvPr id="2092549791" name=""/>
                     <pic:cNvPicPr/>
                   </pic:nvPicPr>
                   <pic:blipFill>
@@ -17463,7 +17505,7 @@
           <w:sz w:val="27"/>
         </w:rPr>
       </w:pPr>
-      <w:bookmarkStart w:id="32" w:name="_Toc240271797"/>
+      <w:bookmarkStart w:id="32" w:name="_Toc240273033"/>
       <w:r>
         <w:rPr>
           <w:rFonts w:ascii="Montserrat" w:hAnsi="Montserrat"/>
@@ -17503,16 +17545,16 @@
           <w:noProof/>
         </w:rPr>
         <w:drawing>
-          <wp:inline distT="0" distB="0" distL="0" distR="0" wp14:anchorId="515A375E" wp14:editId="693C206D">
+          <wp:inline distT="0" distB="0" distL="0" distR="0" wp14:anchorId="2239D2D4" wp14:editId="41C78BEA">
             <wp:extent cx="5120640" cy="4627581"/>
             <wp:effectExtent l="19050" t="19050" r="22860" b="20955"/>
-            <wp:docPr id="980673893" name="Imagem 37"/>
+            <wp:docPr id="1301434274" name="Imagem 37"/>
             <wp:cNvGraphicFramePr/>
             <a:graphic xmlns:a="http://schemas.openxmlformats.org/drawingml/2006/main">
               <a:graphicData uri="http://schemas.openxmlformats.org/drawingml/2006/picture">
                 <pic:pic xmlns:pic="http://schemas.openxmlformats.org/drawingml/2006/picture">
                   <pic:nvPicPr>
-                    <pic:cNvPr id="980673893" name=""/>
+                    <pic:cNvPr id="1301434274" name=""/>
                     <pic:cNvPicPr/>
                   </pic:nvPicPr>
                   <pic:blipFill>
@@ -17580,16 +17622,16 @@
         </w:rPr>
         <w:lastRenderedPageBreak/>
         <w:drawing>
-          <wp:inline distT="0" distB="0" distL="0" distR="0" wp14:anchorId="7E0CD8FA" wp14:editId="6C48DA54">
+          <wp:inline distT="0" distB="0" distL="0" distR="0" wp14:anchorId="4892D95A" wp14:editId="1F3FC9C1">
             <wp:extent cx="5120640" cy="4627581"/>
             <wp:effectExtent l="19050" t="19050" r="22860" b="20955"/>
-            <wp:docPr id="308321103" name="Imagem 38"/>
+            <wp:docPr id="2017366057" name="Imagem 38"/>
             <wp:cNvGraphicFramePr/>
             <a:graphic xmlns:a="http://schemas.openxmlformats.org/drawingml/2006/main">
               <a:graphicData uri="http://schemas.openxmlformats.org/drawingml/2006/picture">
                 <pic:pic xmlns:pic="http://schemas.openxmlformats.org/drawingml/2006/picture">
                   <pic:nvPicPr>
-                    <pic:cNvPr id="308321103" name=""/>
+                    <pic:cNvPr id="2017366057" name=""/>
                     <pic:cNvPicPr/>
                   </pic:nvPicPr>
                   <pic:blipFill>
@@ -17651,7 +17693,7 @@
         <w:pStyle w:val="PargrafodaLista"/>
         <w:numPr>
           <w:ilvl w:val="0"/>
-          <w:numId w:val="26"/>
+          <w:numId w:val="27"/>
         </w:numPr>
         <w:spacing w:after="80" w:line="260" w:lineRule="auto"/>
         <w:ind w:left="700"/>
@@ -17668,51 +17710,6 @@
           <w:sz w:val="22"/>
         </w:rPr>
         <w:t>Preencha a Ficha do Programa (codigo, nome, unidade, responsavel, justificativa, objetivo, alinhamento estrategico).</w:t>
-      </w:r>
-    </w:p>
-    <w:p>
-      <w:pPr>
-        <w:pStyle w:val="PargrafodaLista"/>
-        <w:numPr>
-          <w:ilvl w:val="0"/>
-          <w:numId w:val="26"/>
-        </w:numPr>
-        <w:spacing w:after="80" w:line="260" w:lineRule="auto"/>
-        <w:ind w:left="700"/>
-        <w:rPr>
-          <w:rFonts w:ascii="Montserrat" w:hAnsi="Montserrat"/>
-          <w:color w:val="1A1A1A"/>
-          <w:sz w:val="22"/>
-        </w:rPr>
-      </w:pPr>
-      <w:r>
-        <w:rPr>
-          <w:rFonts w:ascii="Montserrat" w:hAnsi="Montserrat"/>
-          <w:color w:val="1A1A1A"/>
-          <w:sz w:val="22"/>
-        </w:rPr>
-        <w:t>Cadastre indicadores e valores estimados do programa, depois cada projeto vinculado (com suas proprias entregas, indicadores e valores).</w:t>
-      </w:r>
-    </w:p>
-    <w:p>
-      <w:pPr>
-        <w:spacing w:before="160" w:after="200"/>
-        <w:ind w:left="283"/>
-        <w:rPr>
-          <w:rFonts w:ascii="Montserrat" w:hAnsi="Montserrat"/>
-          <w:i/>
-          <w:color w:val="6A6A70"/>
-          <w:sz w:val="21"/>
-        </w:rPr>
-      </w:pPr>
-      <w:r>
-        <w:rPr>
-          <w:rFonts w:ascii="Montserrat" w:hAnsi="Montserrat"/>
-          <w:i/>
-          <w:color w:val="6A6A70"/>
-          <w:sz w:val="21"/>
-        </w:rPr>
-        <w:t>Projeto vinculado (Gate 1) - opcional: assim como no Relatorio de Situacao (secao 4.1), cada projeto cadastrado aqui pode ser associado a um Projeto ja Aprovado no Gate 1. A selecao preenche automaticamente o Nome do projeto, o Responsavel pelo projeto (a partir do gestor do projeto) e, a partir do TAP vinculado, o Objetivo, o Publico-alvo e um resumo dos Riscos em aberto (status Aberto ou Monitorando) - sempre so nos campos ainda vazios. Tambem libera o botao Ver historico, mostrando as alteracoes feitas nesse projeto em qualquer outro formulario vinculado a ele - incluindo decisoes de SMP (Passo 7).</w:t>
       </w:r>
     </w:p>
     <w:p>
@@ -17736,6 +17733,51 @@
           <w:color w:val="1A1A1A"/>
           <w:sz w:val="22"/>
         </w:rPr>
+        <w:t>Cadastre indicadores e valores estimados do programa, depois cada projeto vinculado (com suas proprias entregas, indicadores e valores).</w:t>
+      </w:r>
+    </w:p>
+    <w:p>
+      <w:pPr>
+        <w:spacing w:before="160" w:after="200"/>
+        <w:ind w:left="283"/>
+        <w:rPr>
+          <w:rFonts w:ascii="Montserrat" w:hAnsi="Montserrat"/>
+          <w:i/>
+          <w:color w:val="6A6A70"/>
+          <w:sz w:val="21"/>
+        </w:rPr>
+      </w:pPr>
+      <w:r>
+        <w:rPr>
+          <w:rFonts w:ascii="Montserrat" w:hAnsi="Montserrat"/>
+          <w:i/>
+          <w:color w:val="6A6A70"/>
+          <w:sz w:val="21"/>
+        </w:rPr>
+        <w:t>Projeto vinculado (Gate 1) - opcional: assim como no Relatorio de Situacao (secao 4.1), cada projeto cadastrado aqui pode ser associado a um Projeto ja Aprovado no Gate 1. A selecao preenche automaticamente o Nome do projeto, o Responsavel pelo projeto (a partir do gestor do projeto) e, a partir do TAP vinculado, o Objetivo, o Publico-alvo e um resumo dos Riscos em aberto (status Aberto ou Monitorando) - sempre so nos campos ainda vazios. Tambem libera o botao Ver historico, mostrando as alteracoes feitas nesse projeto em qualquer outro formulario vinculado a ele - incluindo decisoes de SMP (Passo 7).</w:t>
+      </w:r>
+    </w:p>
+    <w:p>
+      <w:pPr>
+        <w:pStyle w:val="PargrafodaLista"/>
+        <w:numPr>
+          <w:ilvl w:val="0"/>
+          <w:numId w:val="28"/>
+        </w:numPr>
+        <w:spacing w:after="80" w:line="260" w:lineRule="auto"/>
+        <w:ind w:left="700"/>
+        <w:rPr>
+          <w:rFonts w:ascii="Montserrat" w:hAnsi="Montserrat"/>
+          <w:color w:val="1A1A1A"/>
+          <w:sz w:val="22"/>
+        </w:rPr>
+      </w:pPr>
+      <w:r>
+        <w:rPr>
+          <w:rFonts w:ascii="Montserrat" w:hAnsi="Montserrat"/>
+          <w:color w:val="1A1A1A"/>
+          <w:sz w:val="22"/>
+        </w:rPr>
         <w:t xml:space="preserve">Assistente de preenchimento por IA: com um Projeto vinculado selecionado, o botao Sugerir com IA le o TAP e as Atas daquele projeto para sugerir o Impacto/Resultado do projeto - sempre redigido como </w:t>
       </w:r>
       <w:r>
@@ -17758,16 +17800,16 @@
           <w:noProof/>
         </w:rPr>
         <w:drawing>
-          <wp:inline distT="0" distB="0" distL="0" distR="0" wp14:anchorId="4EFBF513" wp14:editId="010FD91A">
+          <wp:inline distT="0" distB="0" distL="0" distR="0" wp14:anchorId="0E0D1202" wp14:editId="4D8161FF">
             <wp:extent cx="5120640" cy="2144319"/>
             <wp:effectExtent l="19050" t="19050" r="22860" b="27940"/>
-            <wp:docPr id="88830923" name="Imagem 39"/>
+            <wp:docPr id="652629132" name="Imagem 39"/>
             <wp:cNvGraphicFramePr/>
             <a:graphic xmlns:a="http://schemas.openxmlformats.org/drawingml/2006/main">
               <a:graphicData uri="http://schemas.openxmlformats.org/drawingml/2006/picture">
                 <pic:pic xmlns:pic="http://schemas.openxmlformats.org/drawingml/2006/picture">
                   <pic:nvPicPr>
-                    <pic:cNvPr id="88830923" name=""/>
+                    <pic:cNvPr id="652629132" name=""/>
                     <pic:cNvPicPr/>
                   </pic:nvPicPr>
                   <pic:blipFill>
@@ -17855,16 +17897,16 @@
           <w:noProof/>
         </w:rPr>
         <w:drawing>
-          <wp:inline distT="0" distB="0" distL="0" distR="0" wp14:anchorId="4DC45981" wp14:editId="424E43B6">
+          <wp:inline distT="0" distB="0" distL="0" distR="0" wp14:anchorId="1EABF42D" wp14:editId="36546960">
             <wp:extent cx="5120640" cy="1055647"/>
             <wp:effectExtent l="19050" t="19050" r="22860" b="11430"/>
-            <wp:docPr id="914810173" name="Imagem 40"/>
+            <wp:docPr id="1549145493" name="Imagem 40"/>
             <wp:cNvGraphicFramePr/>
             <a:graphic xmlns:a="http://schemas.openxmlformats.org/drawingml/2006/main">
               <a:graphicData uri="http://schemas.openxmlformats.org/drawingml/2006/picture">
                 <pic:pic xmlns:pic="http://schemas.openxmlformats.org/drawingml/2006/picture">
                   <pic:nvPicPr>
-                    <pic:cNvPr id="914810173" name=""/>
+                    <pic:cNvPr id="1549145493" name=""/>
                     <pic:cNvPicPr/>
                   </pic:nvPicPr>
                   <pic:blipFill>
@@ -17926,7 +17968,7 @@
         <w:pStyle w:val="PargrafodaLista"/>
         <w:numPr>
           <w:ilvl w:val="0"/>
-          <w:numId w:val="27"/>
+          <w:numId w:val="28"/>
         </w:numPr>
         <w:spacing w:after="80" w:line="260" w:lineRule="auto"/>
         <w:ind w:left="700"/>
@@ -17986,16 +18028,16 @@
           <w:noProof/>
         </w:rPr>
         <w:drawing>
-          <wp:inline distT="0" distB="0" distL="0" distR="0" wp14:anchorId="311FDEF9" wp14:editId="3B3F8900">
+          <wp:inline distT="0" distB="0" distL="0" distR="0" wp14:anchorId="14C0DCE5" wp14:editId="44E87A09">
             <wp:extent cx="5120640" cy="3282818"/>
             <wp:effectExtent l="19050" t="19050" r="22860" b="13335"/>
-            <wp:docPr id="1655174973" name="Imagem 41"/>
+            <wp:docPr id="890119134" name="Imagem 41"/>
             <wp:cNvGraphicFramePr/>
             <a:graphic xmlns:a="http://schemas.openxmlformats.org/drawingml/2006/main">
               <a:graphicData uri="http://schemas.openxmlformats.org/drawingml/2006/picture">
                 <pic:pic xmlns:pic="http://schemas.openxmlformats.org/drawingml/2006/picture">
                   <pic:nvPicPr>
-                    <pic:cNvPr id="1655174973" name=""/>
+                    <pic:cNvPr id="890119134" name=""/>
                     <pic:cNvPicPr/>
                   </pic:nvPicPr>
                   <pic:blipFill>
@@ -18078,7 +18120,7 @@
         <w:pStyle w:val="PargrafodaLista"/>
         <w:numPr>
           <w:ilvl w:val="0"/>
-          <w:numId w:val="27"/>
+          <w:numId w:val="28"/>
         </w:numPr>
         <w:spacing w:after="80" w:line="260" w:lineRule="auto"/>
         <w:ind w:left="700"/>
@@ -18129,16 +18171,16 @@
         </w:rPr>
         <w:lastRenderedPageBreak/>
         <w:drawing>
-          <wp:inline distT="0" distB="0" distL="0" distR="0" wp14:anchorId="7CC42D72" wp14:editId="275256E5">
+          <wp:inline distT="0" distB="0" distL="0" distR="0" wp14:anchorId="3315FFEF" wp14:editId="7F7CB038">
             <wp:extent cx="5120640" cy="1978034"/>
             <wp:effectExtent l="19050" t="19050" r="22860" b="22225"/>
-            <wp:docPr id="664606378" name="Imagem 42"/>
+            <wp:docPr id="1676298028" name="Imagem 42"/>
             <wp:cNvGraphicFramePr/>
             <a:graphic xmlns:a="http://schemas.openxmlformats.org/drawingml/2006/main">
               <a:graphicData uri="http://schemas.openxmlformats.org/drawingml/2006/picture">
                 <pic:pic xmlns:pic="http://schemas.openxmlformats.org/drawingml/2006/picture">
                   <pic:nvPicPr>
-                    <pic:cNvPr id="664606378" name=""/>
+                    <pic:cNvPr id="1676298028" name=""/>
                     <pic:cNvPicPr/>
                   </pic:nvPicPr>
                   <pic:blipFill>
@@ -18210,7 +18252,7 @@
           <w:sz w:val="34"/>
         </w:rPr>
       </w:pPr>
-      <w:bookmarkStart w:id="33" w:name="_Toc240271798"/>
+      <w:bookmarkStart w:id="33" w:name="_Toc240273034"/>
       <w:r>
         <w:rPr>
           <w:rFonts w:ascii="Montserrat" w:hAnsi="Montserrat"/>
@@ -18270,7 +18312,7 @@
           <w:sz w:val="27"/>
         </w:rPr>
       </w:pPr>
-      <w:bookmarkStart w:id="34" w:name="_Toc240271799"/>
+      <w:bookmarkStart w:id="34" w:name="_Toc240273035"/>
       <w:r>
         <w:rPr>
           <w:rFonts w:ascii="Montserrat" w:hAnsi="Montserrat"/>
@@ -18310,16 +18352,16 @@
           <w:noProof/>
         </w:rPr>
         <w:drawing>
-          <wp:inline distT="0" distB="0" distL="0" distR="0" wp14:anchorId="4E2B0DBE" wp14:editId="3B61485C">
+          <wp:inline distT="0" distB="0" distL="0" distR="0" wp14:anchorId="13ECBF96" wp14:editId="6081C447">
             <wp:extent cx="5303520" cy="4792851"/>
             <wp:effectExtent l="19050" t="19050" r="11430" b="27305"/>
-            <wp:docPr id="656519138" name="Imagem 43"/>
+            <wp:docPr id="1118470604" name="Imagem 43"/>
             <wp:cNvGraphicFramePr/>
             <a:graphic xmlns:a="http://schemas.openxmlformats.org/drawingml/2006/main">
               <a:graphicData uri="http://schemas.openxmlformats.org/drawingml/2006/picture">
                 <pic:pic xmlns:pic="http://schemas.openxmlformats.org/drawingml/2006/picture">
                   <pic:nvPicPr>
-                    <pic:cNvPr id="656519138" name=""/>
+                    <pic:cNvPr id="1118470604" name=""/>
                     <pic:cNvPicPr/>
                   </pic:nvPicPr>
                   <pic:blipFill>
@@ -18388,7 +18430,7 @@
           <w:sz w:val="27"/>
         </w:rPr>
       </w:pPr>
-      <w:bookmarkStart w:id="35" w:name="_Toc240271800"/>
+      <w:bookmarkStart w:id="35" w:name="_Toc240273036"/>
       <w:r>
         <w:rPr>
           <w:rFonts w:ascii="Montserrat" w:hAnsi="Montserrat"/>
@@ -18428,16 +18470,16 @@
           <w:noProof/>
         </w:rPr>
         <w:drawing>
-          <wp:inline distT="0" distB="0" distL="0" distR="0" wp14:anchorId="30A31846" wp14:editId="0BE9F049">
+          <wp:inline distT="0" distB="0" distL="0" distR="0" wp14:anchorId="035D5A9B" wp14:editId="16E1DD8E">
             <wp:extent cx="5303520" cy="4792851"/>
             <wp:effectExtent l="19050" t="19050" r="11430" b="27305"/>
-            <wp:docPr id="1736933434" name="Imagem 44"/>
+            <wp:docPr id="1871285996" name="Imagem 44"/>
             <wp:cNvGraphicFramePr/>
             <a:graphic xmlns:a="http://schemas.openxmlformats.org/drawingml/2006/main">
               <a:graphicData uri="http://schemas.openxmlformats.org/drawingml/2006/picture">
                 <pic:pic xmlns:pic="http://schemas.openxmlformats.org/drawingml/2006/picture">
                   <pic:nvPicPr>
-                    <pic:cNvPr id="1736933434" name=""/>
+                    <pic:cNvPr id="1871285996" name=""/>
                     <pic:cNvPicPr/>
                   </pic:nvPicPr>
                   <pic:blipFill>
@@ -18505,7 +18547,7 @@
           <w:sz w:val="27"/>
         </w:rPr>
       </w:pPr>
-      <w:bookmarkStart w:id="36" w:name="_Toc240271801"/>
+      <w:bookmarkStart w:id="36" w:name="_Toc240273037"/>
       <w:r>
         <w:rPr>
           <w:rFonts w:ascii="Montserrat" w:hAnsi="Montserrat"/>
@@ -18546,16 +18588,16 @@
         </w:rPr>
         <w:lastRenderedPageBreak/>
         <w:drawing>
-          <wp:inline distT="0" distB="0" distL="0" distR="0" wp14:anchorId="709E14BA" wp14:editId="14879EE4">
+          <wp:inline distT="0" distB="0" distL="0" distR="0" wp14:anchorId="7F8AD5D5" wp14:editId="1AB7B0E7">
             <wp:extent cx="5303520" cy="4792851"/>
             <wp:effectExtent l="19050" t="19050" r="11430" b="27305"/>
-            <wp:docPr id="453373921" name="Imagem 45"/>
+            <wp:docPr id="2002020555" name="Imagem 45"/>
             <wp:cNvGraphicFramePr/>
             <a:graphic xmlns:a="http://schemas.openxmlformats.org/drawingml/2006/main">
               <a:graphicData uri="http://schemas.openxmlformats.org/drawingml/2006/picture">
                 <pic:pic xmlns:pic="http://schemas.openxmlformats.org/drawingml/2006/picture">
                   <pic:nvPicPr>
-                    <pic:cNvPr id="453373921" name=""/>
+                    <pic:cNvPr id="2002020555" name=""/>
                     <pic:cNvPicPr/>
                   </pic:nvPicPr>
                   <pic:blipFill>
@@ -18623,16 +18665,16 @@
         </w:rPr>
         <w:lastRenderedPageBreak/>
         <w:drawing>
-          <wp:inline distT="0" distB="0" distL="0" distR="0" wp14:anchorId="40BE8B1E" wp14:editId="5D67E180">
+          <wp:inline distT="0" distB="0" distL="0" distR="0" wp14:anchorId="067EC50F" wp14:editId="1A53938B">
             <wp:extent cx="5303520" cy="4792851"/>
             <wp:effectExtent l="19050" t="19050" r="11430" b="27305"/>
-            <wp:docPr id="44632739" name="Imagem 46"/>
+            <wp:docPr id="317145968" name="Imagem 46"/>
             <wp:cNvGraphicFramePr/>
             <a:graphic xmlns:a="http://schemas.openxmlformats.org/drawingml/2006/main">
               <a:graphicData uri="http://schemas.openxmlformats.org/drawingml/2006/picture">
                 <pic:pic xmlns:pic="http://schemas.openxmlformats.org/drawingml/2006/picture">
                   <pic:nvPicPr>
-                    <pic:cNvPr id="44632739" name=""/>
+                    <pic:cNvPr id="317145968" name=""/>
                     <pic:cNvPicPr/>
                   </pic:nvPicPr>
                   <pic:blipFill>
@@ -18725,7 +18767,7 @@
           <w:sz w:val="34"/>
         </w:rPr>
       </w:pPr>
-      <w:bookmarkStart w:id="37" w:name="_Toc240271802"/>
+      <w:bookmarkStart w:id="37" w:name="_Toc240273038"/>
       <w:r>
         <w:rPr>
           <w:rFonts w:ascii="Montserrat" w:hAnsi="Montserrat"/>
@@ -18767,7 +18809,7 @@
           <w:sz w:val="27"/>
         </w:rPr>
       </w:pPr>
-      <w:bookmarkStart w:id="38" w:name="_Toc240271803"/>
+      <w:bookmarkStart w:id="38" w:name="_Toc240273039"/>
       <w:r>
         <w:rPr>
           <w:rFonts w:ascii="Montserrat" w:hAnsi="Montserrat"/>
@@ -18807,16 +18849,16 @@
           <w:noProof/>
         </w:rPr>
         <w:drawing>
-          <wp:inline distT="0" distB="0" distL="0" distR="0" wp14:anchorId="1FC21BA1" wp14:editId="2C4E8F73">
+          <wp:inline distT="0" distB="0" distL="0" distR="0" wp14:anchorId="4A0405B7" wp14:editId="65604817">
             <wp:extent cx="5303520" cy="4792851"/>
             <wp:effectExtent l="19050" t="19050" r="11430" b="27305"/>
-            <wp:docPr id="1098746300" name="Imagem 47"/>
+            <wp:docPr id="621077587" name="Imagem 47"/>
             <wp:cNvGraphicFramePr/>
             <a:graphic xmlns:a="http://schemas.openxmlformats.org/drawingml/2006/main">
               <a:graphicData uri="http://schemas.openxmlformats.org/drawingml/2006/picture">
                 <pic:pic xmlns:pic="http://schemas.openxmlformats.org/drawingml/2006/picture">
                   <pic:nvPicPr>
-                    <pic:cNvPr id="1098746300" name=""/>
+                    <pic:cNvPr id="621077587" name=""/>
                     <pic:cNvPicPr/>
                   </pic:nvPicPr>
                   <pic:blipFill>
@@ -19045,7 +19087,7 @@
           <w:sz w:val="27"/>
         </w:rPr>
       </w:pPr>
-      <w:bookmarkStart w:id="39" w:name="_Toc240271804"/>
+      <w:bookmarkStart w:id="39" w:name="_Toc240273040"/>
       <w:r>
         <w:rPr>
           <w:rFonts w:ascii="Montserrat" w:hAnsi="Montserrat"/>
@@ -19085,16 +19127,16 @@
           <w:noProof/>
         </w:rPr>
         <w:drawing>
-          <wp:inline distT="0" distB="0" distL="0" distR="0" wp14:anchorId="7D6E4188" wp14:editId="7E8A1405">
+          <wp:inline distT="0" distB="0" distL="0" distR="0" wp14:anchorId="4758F0C6" wp14:editId="3238DDE5">
             <wp:extent cx="5303520" cy="4792851"/>
             <wp:effectExtent l="19050" t="19050" r="11430" b="27305"/>
-            <wp:docPr id="1138777497" name="Imagem 48"/>
+            <wp:docPr id="1436300641" name="Imagem 48"/>
             <wp:cNvGraphicFramePr/>
             <a:graphic xmlns:a="http://schemas.openxmlformats.org/drawingml/2006/main">
               <a:graphicData uri="http://schemas.openxmlformats.org/drawingml/2006/picture">
                 <pic:pic xmlns:pic="http://schemas.openxmlformats.org/drawingml/2006/picture">
                   <pic:nvPicPr>
-                    <pic:cNvPr id="1138777497" name=""/>
+                    <pic:cNvPr id="1436300641" name=""/>
                     <pic:cNvPicPr/>
                   </pic:nvPicPr>
                   <pic:blipFill>
@@ -19162,7 +19204,7 @@
           <w:sz w:val="27"/>
         </w:rPr>
       </w:pPr>
-      <w:bookmarkStart w:id="40" w:name="_Toc240271805"/>
+      <w:bookmarkStart w:id="40" w:name="_Toc240273041"/>
       <w:r>
         <w:rPr>
           <w:rFonts w:ascii="Montserrat" w:hAnsi="Montserrat"/>
@@ -19203,16 +19245,16 @@
         </w:rPr>
         <w:lastRenderedPageBreak/>
         <w:drawing>
-          <wp:inline distT="0" distB="0" distL="0" distR="0" wp14:anchorId="7FB65C45" wp14:editId="138173F6">
+          <wp:inline distT="0" distB="0" distL="0" distR="0" wp14:anchorId="743DD1CD" wp14:editId="2CF3DC8F">
             <wp:extent cx="5303520" cy="4792851"/>
             <wp:effectExtent l="19050" t="19050" r="11430" b="27305"/>
-            <wp:docPr id="189159711" name="Imagem 49"/>
+            <wp:docPr id="741746170" name="Imagem 49"/>
             <wp:cNvGraphicFramePr/>
             <a:graphic xmlns:a="http://schemas.openxmlformats.org/drawingml/2006/main">
               <a:graphicData uri="http://schemas.openxmlformats.org/drawingml/2006/picture">
                 <pic:pic xmlns:pic="http://schemas.openxmlformats.org/drawingml/2006/picture">
                   <pic:nvPicPr>
-                    <pic:cNvPr id="189159711" name=""/>
+                    <pic:cNvPr id="741746170" name=""/>
                     <pic:cNvPicPr/>
                   </pic:nvPicPr>
                   <pic:blipFill>
@@ -19356,7 +19398,7 @@
           <w:sz w:val="27"/>
         </w:rPr>
       </w:pPr>
-      <w:bookmarkStart w:id="41" w:name="_Toc240271806"/>
+      <w:bookmarkStart w:id="41" w:name="_Toc240273042"/>
       <w:r>
         <w:rPr>
           <w:rFonts w:ascii="Montserrat" w:hAnsi="Montserrat"/>
@@ -19391,7 +19433,7 @@
         <w:pStyle w:val="PargrafodaLista"/>
         <w:numPr>
           <w:ilvl w:val="0"/>
-          <w:numId w:val="27"/>
+          <w:numId w:val="28"/>
         </w:numPr>
         <w:spacing w:after="80" w:line="260" w:lineRule="auto"/>
         <w:ind w:left="700"/>
@@ -19415,7 +19457,7 @@
         <w:pStyle w:val="PargrafodaLista"/>
         <w:numPr>
           <w:ilvl w:val="0"/>
-          <w:numId w:val="27"/>
+          <w:numId w:val="28"/>
         </w:numPr>
         <w:spacing w:after="80" w:line="260" w:lineRule="auto"/>
         <w:ind w:left="700"/>
@@ -19439,7 +19481,7 @@
         <w:pStyle w:val="PargrafodaLista"/>
         <w:numPr>
           <w:ilvl w:val="0"/>
-          <w:numId w:val="27"/>
+          <w:numId w:val="28"/>
         </w:numPr>
         <w:spacing w:after="80" w:line="260" w:lineRule="auto"/>
         <w:ind w:left="700"/>
@@ -19463,7 +19505,7 @@
         <w:pStyle w:val="PargrafodaLista"/>
         <w:numPr>
           <w:ilvl w:val="0"/>
-          <w:numId w:val="27"/>
+          <w:numId w:val="28"/>
         </w:numPr>
         <w:spacing w:after="80" w:line="260" w:lineRule="auto"/>
         <w:ind w:left="700"/>
@@ -19487,7 +19529,7 @@
         <w:pStyle w:val="PargrafodaLista"/>
         <w:numPr>
           <w:ilvl w:val="0"/>
-          <w:numId w:val="27"/>
+          <w:numId w:val="28"/>
         </w:numPr>
         <w:spacing w:after="80" w:line="260" w:lineRule="auto"/>
         <w:ind w:left="700"/>
@@ -19520,7 +19562,7 @@
         <w:pStyle w:val="PargrafodaLista"/>
         <w:numPr>
           <w:ilvl w:val="0"/>
-          <w:numId w:val="27"/>
+          <w:numId w:val="28"/>
         </w:numPr>
         <w:spacing w:after="80" w:line="260" w:lineRule="auto"/>
         <w:ind w:left="700"/>
@@ -19544,7 +19586,7 @@
         <w:pStyle w:val="PargrafodaLista"/>
         <w:numPr>
           <w:ilvl w:val="0"/>
-          <w:numId w:val="27"/>
+          <w:numId w:val="28"/>
         </w:numPr>
         <w:spacing w:after="80" w:line="260" w:lineRule="auto"/>
         <w:ind w:left="700"/>
@@ -19568,7 +19610,7 @@
         <w:pStyle w:val="PargrafodaLista"/>
         <w:numPr>
           <w:ilvl w:val="0"/>
-          <w:numId w:val="27"/>
+          <w:numId w:val="28"/>
         </w:numPr>
         <w:spacing w:after="80" w:line="260" w:lineRule="auto"/>
         <w:ind w:left="700"/>
@@ -19597,16 +19639,16 @@
           <w:noProof/>
         </w:rPr>
         <w:drawing>
-          <wp:inline distT="0" distB="0" distL="0" distR="0" wp14:anchorId="37BA94EE" wp14:editId="66BCFC96">
+          <wp:inline distT="0" distB="0" distL="0" distR="0" wp14:anchorId="5B2E48E2" wp14:editId="0EFD417B">
             <wp:extent cx="5303520" cy="4267180"/>
             <wp:effectExtent l="19050" t="19050" r="11430" b="19685"/>
-            <wp:docPr id="663499361" name="Imagem 50"/>
+            <wp:docPr id="496772326" name="Imagem 50"/>
             <wp:cNvGraphicFramePr/>
             <a:graphic xmlns:a="http://schemas.openxmlformats.org/drawingml/2006/main">
               <a:graphicData uri="http://schemas.openxmlformats.org/drawingml/2006/picture">
                 <pic:pic xmlns:pic="http://schemas.openxmlformats.org/drawingml/2006/picture">
                   <pic:nvPicPr>
-                    <pic:cNvPr id="663499361" name=""/>
+                    <pic:cNvPr id="496772326" name=""/>
                     <pic:cNvPicPr/>
                   </pic:nvPicPr>
                   <pic:blipFill>
@@ -19674,16 +19716,16 @@
         </w:rPr>
         <w:lastRenderedPageBreak/>
         <w:drawing>
-          <wp:inline distT="0" distB="0" distL="0" distR="0" wp14:anchorId="7217EA46" wp14:editId="182918DB">
+          <wp:inline distT="0" distB="0" distL="0" distR="0" wp14:anchorId="7A97084F" wp14:editId="66A75CCA">
             <wp:extent cx="5303520" cy="3382059"/>
             <wp:effectExtent l="19050" t="19050" r="11430" b="27940"/>
-            <wp:docPr id="728302586" name="Imagem 51"/>
+            <wp:docPr id="165676715" name="Imagem 51"/>
             <wp:cNvGraphicFramePr/>
             <a:graphic xmlns:a="http://schemas.openxmlformats.org/drawingml/2006/main">
               <a:graphicData uri="http://schemas.openxmlformats.org/drawingml/2006/picture">
                 <pic:pic xmlns:pic="http://schemas.openxmlformats.org/drawingml/2006/picture">
                   <pic:nvPicPr>
-                    <pic:cNvPr id="728302586" name=""/>
+                    <pic:cNvPr id="165676715" name=""/>
                     <pic:cNvPicPr/>
                   </pic:nvPicPr>
                   <pic:blipFill>
@@ -19751,16 +19793,16 @@
         </w:rPr>
         <w:lastRenderedPageBreak/>
         <w:drawing>
-          <wp:inline distT="0" distB="0" distL="0" distR="0" wp14:anchorId="41EDE741" wp14:editId="40A0AB34">
+          <wp:inline distT="0" distB="0" distL="0" distR="0" wp14:anchorId="3463532A" wp14:editId="5A9C468D">
             <wp:extent cx="5303520" cy="4417800"/>
             <wp:effectExtent l="19050" t="19050" r="11430" b="20955"/>
-            <wp:docPr id="364310822" name="Imagem 52"/>
+            <wp:docPr id="2037561575" name="Imagem 52"/>
             <wp:cNvGraphicFramePr/>
             <a:graphic xmlns:a="http://schemas.openxmlformats.org/drawingml/2006/main">
               <a:graphicData uri="http://schemas.openxmlformats.org/drawingml/2006/picture">
                 <pic:pic xmlns:pic="http://schemas.openxmlformats.org/drawingml/2006/picture">
                   <pic:nvPicPr>
-                    <pic:cNvPr id="364310822" name=""/>
+                    <pic:cNvPr id="2037561575" name=""/>
                     <pic:cNvPicPr/>
                   </pic:nvPicPr>
                   <pic:blipFill>
@@ -19870,7 +19912,7 @@
           <w:sz w:val="27"/>
         </w:rPr>
       </w:pPr>
-      <w:bookmarkStart w:id="42" w:name="_Toc240271807"/>
+      <w:bookmarkStart w:id="42" w:name="_Toc240273043"/>
       <w:r>
         <w:rPr>
           <w:rFonts w:ascii="Montserrat" w:hAnsi="Montserrat"/>
@@ -19914,7 +19956,7 @@
         <w:pStyle w:val="PargrafodaLista"/>
         <w:numPr>
           <w:ilvl w:val="0"/>
-          <w:numId w:val="28"/>
+          <w:numId w:val="29"/>
         </w:numPr>
         <w:spacing w:after="80" w:line="260" w:lineRule="auto"/>
         <w:ind w:left="700"/>
@@ -19938,7 +19980,7 @@
         <w:pStyle w:val="PargrafodaLista"/>
         <w:numPr>
           <w:ilvl w:val="0"/>
-          <w:numId w:val="28"/>
+          <w:numId w:val="29"/>
         </w:numPr>
         <w:spacing w:after="80" w:line="260" w:lineRule="auto"/>
         <w:ind w:left="700"/>
@@ -19962,7 +20004,7 @@
         <w:pStyle w:val="PargrafodaLista"/>
         <w:numPr>
           <w:ilvl w:val="0"/>
-          <w:numId w:val="28"/>
+          <w:numId w:val="29"/>
         </w:numPr>
         <w:spacing w:after="80" w:line="260" w:lineRule="auto"/>
         <w:ind w:left="700"/>
@@ -19986,7 +20028,7 @@
         <w:pStyle w:val="PargrafodaLista"/>
         <w:numPr>
           <w:ilvl w:val="0"/>
-          <w:numId w:val="28"/>
+          <w:numId w:val="29"/>
         </w:numPr>
         <w:spacing w:after="80" w:line="260" w:lineRule="auto"/>
         <w:ind w:left="700"/>
@@ -20010,7 +20052,7 @@
         <w:pStyle w:val="PargrafodaLista"/>
         <w:numPr>
           <w:ilvl w:val="0"/>
-          <w:numId w:val="28"/>
+          <w:numId w:val="29"/>
         </w:numPr>
         <w:spacing w:after="80" w:line="260" w:lineRule="auto"/>
         <w:ind w:left="700"/>
@@ -20034,7 +20076,7 @@
         <w:pStyle w:val="PargrafodaLista"/>
         <w:numPr>
           <w:ilvl w:val="0"/>
-          <w:numId w:val="28"/>
+          <w:numId w:val="29"/>
         </w:numPr>
         <w:spacing w:after="80" w:line="260" w:lineRule="auto"/>
         <w:ind w:left="700"/>
@@ -20058,7 +20100,7 @@
         <w:pStyle w:val="PargrafodaLista"/>
         <w:numPr>
           <w:ilvl w:val="0"/>
-          <w:numId w:val="28"/>
+          <w:numId w:val="29"/>
         </w:numPr>
         <w:spacing w:after="80" w:line="260" w:lineRule="auto"/>
         <w:ind w:left="700"/>
@@ -20082,7 +20124,7 @@
         <w:pStyle w:val="PargrafodaLista"/>
         <w:numPr>
           <w:ilvl w:val="0"/>
-          <w:numId w:val="28"/>
+          <w:numId w:val="29"/>
         </w:numPr>
         <w:spacing w:after="80" w:line="260" w:lineRule="auto"/>
         <w:ind w:left="700"/>
@@ -20106,7 +20148,7 @@
         <w:pStyle w:val="PargrafodaLista"/>
         <w:numPr>
           <w:ilvl w:val="0"/>
-          <w:numId w:val="28"/>
+          <w:numId w:val="29"/>
         </w:numPr>
         <w:spacing w:after="80" w:line="260" w:lineRule="auto"/>
         <w:ind w:left="700"/>
@@ -20136,16 +20178,16 @@
         </w:rPr>
         <w:lastRenderedPageBreak/>
         <w:drawing>
-          <wp:inline distT="0" distB="0" distL="0" distR="0" wp14:anchorId="532A647D" wp14:editId="4B55DF7E">
+          <wp:inline distT="0" distB="0" distL="0" distR="0" wp14:anchorId="1D0185E4" wp14:editId="472711B3">
             <wp:extent cx="5303520" cy="7628836"/>
             <wp:effectExtent l="19050" t="19050" r="11430" b="10795"/>
-            <wp:docPr id="12075880" name="Imagem 53"/>
+            <wp:docPr id="123502563" name="Imagem 53"/>
             <wp:cNvGraphicFramePr/>
             <a:graphic xmlns:a="http://schemas.openxmlformats.org/drawingml/2006/main">
               <a:graphicData uri="http://schemas.openxmlformats.org/drawingml/2006/picture">
                 <pic:pic xmlns:pic="http://schemas.openxmlformats.org/drawingml/2006/picture">
                   <pic:nvPicPr>
-                    <pic:cNvPr id="12075880" name=""/>
+                    <pic:cNvPr id="123502563" name=""/>
                     <pic:cNvPicPr/>
                   </pic:nvPicPr>
                   <pic:blipFill>
@@ -20277,7 +20319,7 @@
           <w:sz w:val="27"/>
         </w:rPr>
       </w:pPr>
-      <w:bookmarkStart w:id="43" w:name="_Toc240271808"/>
+      <w:bookmarkStart w:id="43" w:name="_Toc240273044"/>
       <w:r>
         <w:rPr>
           <w:rFonts w:ascii="Montserrat" w:hAnsi="Montserrat"/>
@@ -20323,141 +20365,6 @@
           <w:sz w:val="22"/>
         </w:rPr>
         <w:t>Quando a Administracao e acessada em producao, aparece uma quarta aba, Ambiente de Treino, com um unico botao: Resetar ambiente de treinamento. Ao clicar (e confirmar o aviso), o sistema apaga todos os projetos e registros de formulario atualmente no ambiente de treinamento e recria os 7 projetos de exemplo do zero - util para deixar o ambiente limpo antes de uma nova turma, sem precisar rodar nenhum comando manualmente.</w:t>
-      </w:r>
-    </w:p>
-    <w:p>
-      <w:pPr>
-        <w:pStyle w:val="PargrafodaLista"/>
-        <w:numPr>
-          <w:ilvl w:val="0"/>
-          <w:numId w:val="29"/>
-        </w:numPr>
-        <w:spacing w:after="80" w:line="260" w:lineRule="auto"/>
-        <w:ind w:left="700"/>
-        <w:rPr>
-          <w:rFonts w:ascii="Montserrat" w:hAnsi="Montserrat"/>
-          <w:color w:val="1A1A1A"/>
-          <w:sz w:val="22"/>
-        </w:rPr>
-      </w:pPr>
-      <w:r>
-        <w:rPr>
-          <w:rFonts w:ascii="Montserrat" w:hAnsi="Montserrat"/>
-          <w:color w:val="1A1A1A"/>
-          <w:sz w:val="22"/>
-        </w:rPr>
-        <w:t>A aba so aparece quando a Administracao e acessada pelo endereco de producao - quem acessa a Administracao pelo proprio ambiente de treinamento nao ve essa opcao.</w:t>
-      </w:r>
-    </w:p>
-    <w:p>
-      <w:pPr>
-        <w:pStyle w:val="PargrafodaLista"/>
-        <w:numPr>
-          <w:ilvl w:val="0"/>
-          <w:numId w:val="29"/>
-        </w:numPr>
-        <w:spacing w:after="80" w:line="260" w:lineRule="auto"/>
-        <w:ind w:left="700"/>
-        <w:rPr>
-          <w:rFonts w:ascii="Montserrat" w:hAnsi="Montserrat"/>
-          <w:color w:val="1A1A1A"/>
-          <w:sz w:val="22"/>
-        </w:rPr>
-      </w:pPr>
-      <w:r>
-        <w:rPr>
-          <w:rFonts w:ascii="Montserrat" w:hAnsi="Montserrat"/>
-          <w:color w:val="1A1A1A"/>
-          <w:sz w:val="22"/>
-        </w:rPr>
-        <w:lastRenderedPageBreak/>
-        <w:t>Nao afeta nenhum dado de producao em nenhuma hipotese - a acao roda numa Edge Function que so tem permissao de escrita no banco do ambiente de treinamento.</w:t>
-      </w:r>
-    </w:p>
-    <w:p>
-      <w:pPr>
-        <w:pStyle w:val="PargrafodaLista"/>
-        <w:numPr>
-          <w:ilvl w:val="0"/>
-          <w:numId w:val="29"/>
-        </w:numPr>
-        <w:spacing w:after="80" w:line="260" w:lineRule="auto"/>
-        <w:ind w:left="700"/>
-        <w:rPr>
-          <w:rFonts w:ascii="Montserrat" w:hAnsi="Montserrat"/>
-          <w:color w:val="1A1A1A"/>
-          <w:sz w:val="22"/>
-        </w:rPr>
-      </w:pPr>
-      <w:r>
-        <w:rPr>
-          <w:rFonts w:ascii="Montserrat" w:hAnsi="Montserrat"/>
-          <w:color w:val="1A1A1A"/>
-          <w:sz w:val="22"/>
-        </w:rPr>
-        <w:t>As 6 contas fixas de treinamento e as configuracoes do ambiente de treino nao sao apagadas pelo reset - so os projetos e os registros de formulario.</w:t>
-      </w:r>
-    </w:p>
-    <w:p>
-      <w:pPr>
-        <w:spacing w:before="160" w:after="200"/>
-        <w:ind w:left="283"/>
-        <w:rPr>
-          <w:rFonts w:ascii="Montserrat" w:hAnsi="Montserrat"/>
-          <w:i/>
-          <w:color w:val="6A6A70"/>
-          <w:sz w:val="21"/>
-        </w:rPr>
-      </w:pPr>
-      <w:r>
-        <w:rPr>
-          <w:rFonts w:ascii="Montserrat" w:hAnsi="Montserrat"/>
-          <w:i/>
-          <w:color w:val="6A6A70"/>
-          <w:sz w:val="21"/>
-        </w:rPr>
-        <w:t>Assim como as outras acoes exclusivas de Admin, a Edge Function confere o papel do usuario direto no banco de producao antes de fazer qualquer alteracao - nao basta ver o botao na tela.</w:t>
-      </w:r>
-    </w:p>
-    <w:p>
-      <w:pPr>
-        <w:pStyle w:val="Ttulo2"/>
-        <w:spacing w:before="320" w:after="120"/>
-        <w:rPr>
-          <w:rFonts w:ascii="Montserrat" w:hAnsi="Montserrat"/>
-          <w:b/>
-          <w:color w:val="B91D2E"/>
-          <w:sz w:val="27"/>
-        </w:rPr>
-      </w:pPr>
-      <w:bookmarkStart w:id="44" w:name="_Toc240271809"/>
-      <w:r>
-        <w:rPr>
-          <w:rFonts w:ascii="Montserrat" w:hAnsi="Montserrat"/>
-          <w:b/>
-          <w:color w:val="B91D2E"/>
-          <w:sz w:val="27"/>
-        </w:rPr>
-        <w:t>6.6 Backup automatizado</w:t>
-      </w:r>
-      <w:bookmarkEnd w:id="44"/>
-    </w:p>
-    <w:p>
-      <w:pPr>
-        <w:spacing w:line="280" w:lineRule="auto"/>
-        <w:rPr>
-          <w:rFonts w:ascii="Montserrat" w:hAnsi="Montserrat"/>
-          <w:color w:val="1A1A1A"/>
-          <w:sz w:val="22"/>
-        </w:rPr>
-      </w:pPr>
-      <w:r>
-        <w:rPr>
-          <w:rFonts w:ascii="Montserrat" w:hAnsi="Montserrat"/>
-          <w:color w:val="1A1A1A"/>
-          <w:sz w:val="22"/>
-        </w:rPr>
-        <w:t>No fim da aba Configuracoes (secao 6.3), um bloco separado deixa o Admin/PMO definir os parametros de uma rotina de backup periodico do sistema inteiro (banco de dados, arquivos anexados e codigo-fonte) para um destino fora do GitHub - complemento operacional a proposta Backup Automatizado entregue separadamente.</w:t>
       </w:r>
     </w:p>
     <w:p>
@@ -20481,7 +20388,7 @@
           <w:color w:val="1A1A1A"/>
           <w:sz w:val="22"/>
         </w:rPr>
-        <w:t>Habilitar backup automatizado: interruptor geral da rotina.</w:t>
+        <w:t>A aba so aparece quando a Administracao e acessada pelo endereco de producao - quem acessa a Administracao pelo proprio ambiente de treinamento nao ve essa opcao.</w:t>
       </w:r>
     </w:p>
     <w:p>
@@ -20505,7 +20412,8 @@
           <w:color w:val="1A1A1A"/>
           <w:sz w:val="22"/>
         </w:rPr>
-        <w:t>Destino: OneDrive/SharePoint institucional, outro armazenamento de nuvem ou servidor da instituicao, mais o caminho/pasta exato onde gravar.</w:t>
+        <w:lastRenderedPageBreak/>
+        <w:t>Nao afeta nenhum dado de producao em nenhuma hipotese - a acao roda numa Edge Function que so tem permissao de escrita no banco do ambiente de treinamento.</w:t>
       </w:r>
     </w:p>
     <w:p>
@@ -20529,7 +20437,69 @@
           <w:color w:val="1A1A1A"/>
           <w:sz w:val="22"/>
         </w:rPr>
-        <w:t>Frequencia: diaria ou semanal.</w:t>
+        <w:t>As 6 contas fixas de treinamento e as configuracoes do ambiente de treino nao sao apagadas pelo reset - so os projetos e os registros de formulario.</w:t>
+      </w:r>
+    </w:p>
+    <w:p>
+      <w:pPr>
+        <w:spacing w:before="160" w:after="200"/>
+        <w:ind w:left="283"/>
+        <w:rPr>
+          <w:rFonts w:ascii="Montserrat" w:hAnsi="Montserrat"/>
+          <w:i/>
+          <w:color w:val="6A6A70"/>
+          <w:sz w:val="21"/>
+        </w:rPr>
+      </w:pPr>
+      <w:r>
+        <w:rPr>
+          <w:rFonts w:ascii="Montserrat" w:hAnsi="Montserrat"/>
+          <w:i/>
+          <w:color w:val="6A6A70"/>
+          <w:sz w:val="21"/>
+        </w:rPr>
+        <w:t>Assim como as outras acoes exclusivas de Admin, a Edge Function confere o papel do usuario direto no banco de producao antes de fazer qualquer alteracao - nao basta ver o botao na tela.</w:t>
+      </w:r>
+    </w:p>
+    <w:p>
+      <w:pPr>
+        <w:pStyle w:val="Ttulo2"/>
+        <w:spacing w:before="320" w:after="120"/>
+        <w:rPr>
+          <w:rFonts w:ascii="Montserrat" w:hAnsi="Montserrat"/>
+          <w:b/>
+          <w:color w:val="B91D2E"/>
+          <w:sz w:val="27"/>
+        </w:rPr>
+      </w:pPr>
+      <w:bookmarkStart w:id="44" w:name="_Toc240273045"/>
+      <w:r>
+        <w:rPr>
+          <w:rFonts w:ascii="Montserrat" w:hAnsi="Montserrat"/>
+          <w:b/>
+          <w:color w:val="B91D2E"/>
+          <w:sz w:val="27"/>
+        </w:rPr>
+        <w:t>6.6 Backup automatizado</w:t>
+      </w:r>
+      <w:bookmarkEnd w:id="44"/>
+    </w:p>
+    <w:p>
+      <w:pPr>
+        <w:spacing w:line="280" w:lineRule="auto"/>
+        <w:rPr>
+          <w:rFonts w:ascii="Montserrat" w:hAnsi="Montserrat"/>
+          <w:color w:val="1A1A1A"/>
+          <w:sz w:val="22"/>
+        </w:rPr>
+      </w:pPr>
+      <w:r>
+        <w:rPr>
+          <w:rFonts w:ascii="Montserrat" w:hAnsi="Montserrat"/>
+          <w:color w:val="1A1A1A"/>
+          <w:sz w:val="22"/>
+        </w:rPr>
+        <w:t>No fim da aba Configuracoes (secao 6.3), um bloco separado deixa o Admin/PMO definir os parametros de uma rotina de backup periodico do sistema inteiro (banco de dados, arquivos anexados e codigo-fonte) para um destino fora do GitHub - complemento operacional a proposta Backup Automatizado entregue separadamente.</w:t>
       </w:r>
     </w:p>
     <w:p>
@@ -20537,7 +20507,7 @@
         <w:pStyle w:val="PargrafodaLista"/>
         <w:numPr>
           <w:ilvl w:val="0"/>
-          <w:numId w:val="30"/>
+          <w:numId w:val="31"/>
         </w:numPr>
         <w:spacing w:after="80" w:line="260" w:lineRule="auto"/>
         <w:ind w:left="700"/>
@@ -20553,7 +20523,7 @@
           <w:color w:val="1A1A1A"/>
           <w:sz w:val="22"/>
         </w:rPr>
-        <w:t>Retencao (dias, opcional): depois de quantos dias os backups antigos podem ser descartados; vazio mantem tudo indefinidamente.</w:t>
+        <w:t>Habilitar backup automatizado: interruptor geral da rotina.</w:t>
       </w:r>
     </w:p>
     <w:p>
@@ -20561,7 +20531,7 @@
         <w:pStyle w:val="PargrafodaLista"/>
         <w:numPr>
           <w:ilvl w:val="0"/>
-          <w:numId w:val="30"/>
+          <w:numId w:val="31"/>
         </w:numPr>
         <w:spacing w:after="80" w:line="260" w:lineRule="auto"/>
         <w:ind w:left="700"/>
@@ -20577,7 +20547,7 @@
           <w:color w:val="1A1A1A"/>
           <w:sz w:val="22"/>
         </w:rPr>
-        <w:t>E-mail de alerta: para onde avisar automaticamente se uma execucao falhar.</w:t>
+        <w:t>Destino: OneDrive/SharePoint institucional, outro armazenamento de nuvem ou servidor da instituicao, mais o caminho/pasta exato onde gravar.</w:t>
       </w:r>
     </w:p>
     <w:p>
@@ -20585,7 +20555,7 @@
         <w:pStyle w:val="PargrafodaLista"/>
         <w:numPr>
           <w:ilvl w:val="0"/>
-          <w:numId w:val="30"/>
+          <w:numId w:val="31"/>
         </w:numPr>
         <w:spacing w:after="80" w:line="260" w:lineRule="auto"/>
         <w:ind w:left="700"/>
@@ -20601,7 +20571,7 @@
           <w:color w:val="1A1A1A"/>
           <w:sz w:val="22"/>
         </w:rPr>
-        <w:t>E-mails com acesso ao destino externo: campo de registro/referencia de quem deveria ter permissao na pasta de destino - conceder esse acesso de fato continua sendo feito manualmente onde o destino estiver (OneDrive, repositorio etc.).</w:t>
+        <w:t>Frequencia: diaria ou semanal.</w:t>
       </w:r>
     </w:p>
     <w:p>
@@ -20609,7 +20579,7 @@
         <w:pStyle w:val="PargrafodaLista"/>
         <w:numPr>
           <w:ilvl w:val="0"/>
-          <w:numId w:val="30"/>
+          <w:numId w:val="31"/>
         </w:numPr>
         <w:spacing w:after="80" w:line="260" w:lineRule="auto"/>
         <w:ind w:left="700"/>
@@ -20625,7 +20595,7 @@
           <w:color w:val="1A1A1A"/>
           <w:sz w:val="22"/>
         </w:rPr>
-        <w:t>Quem pode gerenciar essas configuracoes: papeis liberados para alterar esta tela, alem do PMO/Admin, que sempre tem acesso.</w:t>
+        <w:t>Retencao (dias, opcional): depois de quantos dias os backups antigos podem ser descartados; vazio mantem tudo indefinidamente.</w:t>
       </w:r>
     </w:p>
     <w:p>
@@ -20633,7 +20603,7 @@
         <w:pStyle w:val="PargrafodaLista"/>
         <w:numPr>
           <w:ilvl w:val="0"/>
-          <w:numId w:val="30"/>
+          <w:numId w:val="31"/>
         </w:numPr>
         <w:spacing w:after="80" w:line="260" w:lineRule="auto"/>
         <w:ind w:left="700"/>
@@ -20649,6 +20619,78 @@
           <w:color w:val="1A1A1A"/>
           <w:sz w:val="22"/>
         </w:rPr>
+        <w:t>E-mail de alerta: para onde avisar automaticamente se uma execucao falhar.</w:t>
+      </w:r>
+    </w:p>
+    <w:p>
+      <w:pPr>
+        <w:pStyle w:val="PargrafodaLista"/>
+        <w:numPr>
+          <w:ilvl w:val="0"/>
+          <w:numId w:val="31"/>
+        </w:numPr>
+        <w:spacing w:after="80" w:line="260" w:lineRule="auto"/>
+        <w:ind w:left="700"/>
+        <w:rPr>
+          <w:rFonts w:ascii="Montserrat" w:hAnsi="Montserrat"/>
+          <w:color w:val="1A1A1A"/>
+          <w:sz w:val="22"/>
+        </w:rPr>
+      </w:pPr>
+      <w:r>
+        <w:rPr>
+          <w:rFonts w:ascii="Montserrat" w:hAnsi="Montserrat"/>
+          <w:color w:val="1A1A1A"/>
+          <w:sz w:val="22"/>
+        </w:rPr>
+        <w:t>E-mails com acesso ao destino externo: campo de registro/referencia de quem deveria ter permissao na pasta de destino - conceder esse acesso de fato continua sendo feito manualmente onde o destino estiver (OneDrive, repositorio etc.).</w:t>
+      </w:r>
+    </w:p>
+    <w:p>
+      <w:pPr>
+        <w:pStyle w:val="PargrafodaLista"/>
+        <w:numPr>
+          <w:ilvl w:val="0"/>
+          <w:numId w:val="31"/>
+        </w:numPr>
+        <w:spacing w:after="80" w:line="260" w:lineRule="auto"/>
+        <w:ind w:left="700"/>
+        <w:rPr>
+          <w:rFonts w:ascii="Montserrat" w:hAnsi="Montserrat"/>
+          <w:color w:val="1A1A1A"/>
+          <w:sz w:val="22"/>
+        </w:rPr>
+      </w:pPr>
+      <w:r>
+        <w:rPr>
+          <w:rFonts w:ascii="Montserrat" w:hAnsi="Montserrat"/>
+          <w:color w:val="1A1A1A"/>
+          <w:sz w:val="22"/>
+        </w:rPr>
+        <w:t>Quem pode gerenciar essas configuracoes: papeis liberados para alterar esta tela, alem do PMO/Admin, que sempre tem acesso.</w:t>
+      </w:r>
+    </w:p>
+    <w:p>
+      <w:pPr>
+        <w:pStyle w:val="PargrafodaLista"/>
+        <w:numPr>
+          <w:ilvl w:val="0"/>
+          <w:numId w:val="31"/>
+        </w:numPr>
+        <w:spacing w:after="80" w:line="260" w:lineRule="auto"/>
+        <w:ind w:left="700"/>
+        <w:rPr>
+          <w:rFonts w:ascii="Montserrat" w:hAnsi="Montserrat"/>
+          <w:color w:val="1A1A1A"/>
+          <w:sz w:val="22"/>
+        </w:rPr>
+      </w:pPr>
+      <w:r>
+        <w:rPr>
+          <w:rFonts w:ascii="Montserrat" w:hAnsi="Montserrat"/>
+          <w:color w:val="1A1A1A"/>
+          <w:sz w:val="22"/>
+        </w:rPr>
         <w:t>Ultima execucao: data/hora e status (sucesso ou falha) da ultima vez que a rotina automatizada rodou, preenchido por ela mesma.</w:t>
       </w:r>
     </w:p>
@@ -20723,16 +20765,16 @@
           <w:noProof/>
         </w:rPr>
         <w:drawing>
-          <wp:inline distT="0" distB="0" distL="0" distR="0" wp14:anchorId="261F8659" wp14:editId="08A43A62">
+          <wp:inline distT="0" distB="0" distL="0" distR="0" wp14:anchorId="26FAC842" wp14:editId="0FD51E7A">
             <wp:extent cx="5303520" cy="1351384"/>
             <wp:effectExtent l="19050" t="19050" r="11430" b="20320"/>
-            <wp:docPr id="171758088" name="Imagem 54"/>
+            <wp:docPr id="2002634895" name="Imagem 54"/>
             <wp:cNvGraphicFramePr/>
             <a:graphic xmlns:a="http://schemas.openxmlformats.org/drawingml/2006/main">
               <a:graphicData uri="http://schemas.openxmlformats.org/drawingml/2006/picture">
                 <pic:pic xmlns:pic="http://schemas.openxmlformats.org/drawingml/2006/picture">
                   <pic:nvPicPr>
-                    <pic:cNvPr id="171758088" name=""/>
+                    <pic:cNvPr id="2002634895" name=""/>
                     <pic:cNvPicPr/>
                   </pic:nvPicPr>
                   <pic:blipFill>
@@ -20800,7 +20842,7 @@
           <w:sz w:val="27"/>
         </w:rPr>
       </w:pPr>
-      <w:bookmarkStart w:id="45" w:name="_Toc240271810"/>
+      <w:bookmarkStart w:id="45" w:name="_Toc240273046"/>
       <w:r>
         <w:rPr>
           <w:rFonts w:ascii="Montserrat" w:hAnsi="Montserrat"/>
@@ -20835,7 +20877,7 @@
         <w:pStyle w:val="PargrafodaLista"/>
         <w:numPr>
           <w:ilvl w:val="0"/>
-          <w:numId w:val="31"/>
+          <w:numId w:val="32"/>
         </w:numPr>
         <w:spacing w:after="80" w:line="260" w:lineRule="auto"/>
         <w:ind w:left="700"/>
@@ -20859,7 +20901,7 @@
         <w:pStyle w:val="PargrafodaLista"/>
         <w:numPr>
           <w:ilvl w:val="0"/>
-          <w:numId w:val="31"/>
+          <w:numId w:val="32"/>
         </w:numPr>
         <w:spacing w:after="80" w:line="260" w:lineRule="auto"/>
         <w:ind w:left="700"/>
@@ -20883,7 +20925,7 @@
         <w:pStyle w:val="PargrafodaLista"/>
         <w:numPr>
           <w:ilvl w:val="0"/>
-          <w:numId w:val="31"/>
+          <w:numId w:val="32"/>
         </w:numPr>
         <w:spacing w:after="80" w:line="260" w:lineRule="auto"/>
         <w:ind w:left="700"/>
@@ -20907,7 +20949,7 @@
         <w:pStyle w:val="PargrafodaLista"/>
         <w:numPr>
           <w:ilvl w:val="0"/>
-          <w:numId w:val="31"/>
+          <w:numId w:val="32"/>
         </w:numPr>
         <w:spacing w:after="80" w:line="260" w:lineRule="auto"/>
         <w:ind w:left="700"/>
@@ -20945,16 +20987,16 @@
           <w:noProof/>
         </w:rPr>
         <w:drawing>
-          <wp:inline distT="0" distB="0" distL="0" distR="0" wp14:anchorId="43E2220F" wp14:editId="54DF9FFE">
+          <wp:inline distT="0" distB="0" distL="0" distR="0" wp14:anchorId="5197DB7D" wp14:editId="27D123C4">
             <wp:extent cx="5303520" cy="1422793"/>
             <wp:effectExtent l="19050" t="19050" r="11430" b="25400"/>
-            <wp:docPr id="2046298595" name="Imagem 55"/>
+            <wp:docPr id="1597859587" name="Imagem 55"/>
             <wp:cNvGraphicFramePr/>
             <a:graphic xmlns:a="http://schemas.openxmlformats.org/drawingml/2006/main">
               <a:graphicData uri="http://schemas.openxmlformats.org/drawingml/2006/picture">
                 <pic:pic xmlns:pic="http://schemas.openxmlformats.org/drawingml/2006/picture">
                   <pic:nvPicPr>
-                    <pic:cNvPr id="2046298595" name=""/>
+                    <pic:cNvPr id="1597859587" name=""/>
                     <pic:cNvPicPr/>
                   </pic:nvPicPr>
                   <pic:blipFill>
@@ -21079,7 +21121,7 @@
         <w:pStyle w:val="PargrafodaLista"/>
         <w:numPr>
           <w:ilvl w:val="0"/>
-          <w:numId w:val="32"/>
+          <w:numId w:val="33"/>
         </w:numPr>
         <w:spacing w:after="80" w:line="260" w:lineRule="auto"/>
         <w:ind w:left="700"/>
@@ -21109,16 +21151,16 @@
         </w:rPr>
         <w:lastRenderedPageBreak/>
         <w:drawing>
-          <wp:inline distT="0" distB="0" distL="0" distR="0" wp14:anchorId="5B6EB8DF" wp14:editId="3624364B">
+          <wp:inline distT="0" distB="0" distL="0" distR="0" wp14:anchorId="26AA93F7" wp14:editId="20669FAC">
             <wp:extent cx="5303520" cy="1841050"/>
             <wp:effectExtent l="19050" t="19050" r="11430" b="26035"/>
-            <wp:docPr id="219106208" name="Imagem 56"/>
+            <wp:docPr id="146544788" name="Imagem 56"/>
             <wp:cNvGraphicFramePr/>
             <a:graphic xmlns:a="http://schemas.openxmlformats.org/drawingml/2006/main">
               <a:graphicData uri="http://schemas.openxmlformats.org/drawingml/2006/picture">
                 <pic:pic xmlns:pic="http://schemas.openxmlformats.org/drawingml/2006/picture">
                   <pic:nvPicPr>
-                    <pic:cNvPr id="219106208" name=""/>
+                    <pic:cNvPr id="146544788" name=""/>
                     <pic:cNvPicPr/>
                   </pic:nvPicPr>
                   <pic:blipFill>
@@ -21219,7 +21261,7 @@
         <w:pStyle w:val="PargrafodaLista"/>
         <w:numPr>
           <w:ilvl w:val="0"/>
-          <w:numId w:val="32"/>
+          <w:numId w:val="33"/>
         </w:numPr>
         <w:spacing w:after="80" w:line="260" w:lineRule="auto"/>
         <w:ind w:left="700"/>
@@ -21243,7 +21285,7 @@
         <w:pStyle w:val="PargrafodaLista"/>
         <w:numPr>
           <w:ilvl w:val="0"/>
-          <w:numId w:val="32"/>
+          <w:numId w:val="33"/>
         </w:numPr>
         <w:spacing w:after="80" w:line="260" w:lineRule="auto"/>
         <w:ind w:left="700"/>
@@ -21272,16 +21314,16 @@
           <w:noProof/>
         </w:rPr>
         <w:drawing>
-          <wp:inline distT="0" distB="0" distL="0" distR="0" wp14:anchorId="78D739B1" wp14:editId="3149D49B">
+          <wp:inline distT="0" distB="0" distL="0" distR="0" wp14:anchorId="6A74B0DC" wp14:editId="4D2EC554">
             <wp:extent cx="5303520" cy="303041"/>
             <wp:effectExtent l="19050" t="19050" r="11430" b="20955"/>
-            <wp:docPr id="2107088426" name="Imagem 57"/>
+            <wp:docPr id="1436258506" name="Imagem 57"/>
             <wp:cNvGraphicFramePr/>
             <a:graphic xmlns:a="http://schemas.openxmlformats.org/drawingml/2006/main">
               <a:graphicData uri="http://schemas.openxmlformats.org/drawingml/2006/picture">
                 <pic:pic xmlns:pic="http://schemas.openxmlformats.org/drawingml/2006/picture">
                   <pic:nvPicPr>
-                    <pic:cNvPr id="2107088426" name=""/>
+                    <pic:cNvPr id="1436258506" name=""/>
                     <pic:cNvPicPr/>
                   </pic:nvPicPr>
                   <pic:blipFill>
@@ -21349,16 +21391,16 @@
         </w:rPr>
         <w:lastRenderedPageBreak/>
         <w:drawing>
-          <wp:inline distT="0" distB="0" distL="0" distR="0" wp14:anchorId="32BA5C5F" wp14:editId="38E96ACC">
+          <wp:inline distT="0" distB="0" distL="0" distR="0" wp14:anchorId="3B8E699C" wp14:editId="64AD9D73">
             <wp:extent cx="5303520" cy="2983005"/>
             <wp:effectExtent l="19050" t="19050" r="11430" b="27305"/>
-            <wp:docPr id="1257754771" name="Imagem 58"/>
+            <wp:docPr id="1320239481" name="Imagem 58"/>
             <wp:cNvGraphicFramePr/>
             <a:graphic xmlns:a="http://schemas.openxmlformats.org/drawingml/2006/main">
               <a:graphicData uri="http://schemas.openxmlformats.org/drawingml/2006/picture">
                 <pic:pic xmlns:pic="http://schemas.openxmlformats.org/drawingml/2006/picture">
                   <pic:nvPicPr>
-                    <pic:cNvPr id="1257754771" name=""/>
+                    <pic:cNvPr id="1320239481" name=""/>
                     <pic:cNvPicPr/>
                   </pic:nvPicPr>
                   <pic:blipFill>
@@ -21430,7 +21472,7 @@
           <w:sz w:val="34"/>
         </w:rPr>
       </w:pPr>
-      <w:bookmarkStart w:id="46" w:name="_Toc240271811"/>
+      <w:bookmarkStart w:id="46" w:name="_Toc240273047"/>
       <w:r>
         <w:rPr>
           <w:rFonts w:ascii="Montserrat" w:hAnsi="Montserrat"/>
@@ -21674,7 +21716,7 @@
           <w:sz w:val="34"/>
         </w:rPr>
       </w:pPr>
-      <w:bookmarkStart w:id="47" w:name="_Toc240271812"/>
+      <w:bookmarkStart w:id="47" w:name="_Toc240273048"/>
       <w:r>
         <w:rPr>
           <w:rFonts w:ascii="Montserrat" w:hAnsi="Montserrat"/>
@@ -23462,7 +23504,7 @@
 <file path=word/numbering.xml><?xml version="1.0" encoding="utf-8"?>
 <w:numbering xmlns:wpc="http://schemas.microsoft.com/office/word/2010/wordprocessingCanvas" xmlns:cx="http://schemas.microsoft.com/office/drawing/2014/chartex" xmlns:cx1="http://schemas.microsoft.com/office/drawing/2015/9/8/chartex" xmlns:cx2="http://schemas.microsoft.com/office/drawing/2015/10/21/chartex" xmlns:cx3="http://schemas.microsoft.com/office/drawing/2016/5/9/chartex" xmlns:cx4="http://schemas.microsoft.com/office/drawing/2016/5/10/chartex" xmlns:cx5="http://schemas.microsoft.com/office/drawing/2016/5/11/chartex" xmlns:cx6="http://schemas.microsoft.com/office/drawing/2016/5/12/chartex" xmlns:cx7="http://schemas.microsoft.com/office/drawing/2016/5/13/chartex" xmlns:cx8="http://schemas.microsoft.com/office/drawing/2016/5/14/chartex" xmlns:mc="http://schemas.openxmlformats.org/markup-compatibility/2006" xmlns:aink="http://schemas.microsoft.com/office/drawing/2016/ink" xmlns:am3d="http://schemas.microsoft.com/office/drawing/2017/model3d" xmlns:o="urn:schemas-microsoft-com:office:office" xmlns:oel="http://schemas.microsoft.com/office/2019/extlst" xmlns:r="http://schemas.openxmlformats.org/officeDocument/2006/relationships" xmlns:m="http://schemas.openxmlformats.org/officeDocument/2006/math" xmlns:v="urn:schemas-microsoft-com:vml" xmlns:wp14="http://schemas.microsoft.com/office/word/2010/wordprocessingDrawing" xmlns:wp="http://schemas.openxmlformats.org/drawingml/2006/wordprocessingDrawing" xmlns:w10="urn:schemas-microsoft-com:office:word" xmlns:w="http://schemas.openxmlformats.org/wordprocessingml/2006/main" xmlns:w14="http://schemas.microsoft.com/office/word/2010/wordml" xmlns:w15="http://schemas.microsoft.com/office/word/2012/wordml" xmlns:w16cex="http://schemas.microsoft.com/office/word/2018/wordml/cex" xmlns:w16cid="http://schemas.microsoft.com/office/word/2016/wordml/cid" xmlns:w16="http://schemas.microsoft.com/office/word/2018/wordml" xmlns:w16du="http://schemas.microsoft.com/office/word/2023/wordml/word16du" xmlns:w16sdtdh="http://schemas.microsoft.com/office/word/2020/wordml/sdtdatahash" xmlns:w16sdtfl="http://schemas.microsoft.com/office/word/2024/wordml/sdtformatlock" xmlns:w16se="http://schemas.microsoft.com/office/word/2015/wordml/symex" xmlns:wpg="http://schemas.microsoft.com/office/word/2010/wordprocessingGroup" xmlns:wpi="http://schemas.microsoft.com/office/word/2010/wordprocessingInk" xmlns:wne="http://schemas.microsoft.com/office/word/2006/wordml" xmlns:wps="http://schemas.microsoft.com/office/word/2010/wordprocessingShape" mc:Ignorable="w14 w15 w16se w16cid w16 w16cex w16sdtdh w16sdtfl w16du wp14">
   <w:abstractNum w:abstractNumId="0" w15:restartNumberingAfterBreak="0">
-    <w:nsid w:val="0A1C15EA"/>
+    <w:nsid w:val="00C53D2E"/>
     <w:multiLevelType w:val="singleLevel"/>
     <w:tmpl w:val="04160001"/>
     <w:lvl w:ilvl="0">
@@ -23479,7 +23521,7 @@
     </w:lvl>
   </w:abstractNum>
   <w:abstractNum w:abstractNumId="1" w15:restartNumberingAfterBreak="0">
-    <w:nsid w:val="0D27529F"/>
+    <w:nsid w:val="0740462F"/>
     <w:multiLevelType w:val="singleLevel"/>
     <w:tmpl w:val="04160001"/>
     <w:lvl w:ilvl="0">
@@ -23496,7 +23538,7 @@
     </w:lvl>
   </w:abstractNum>
   <w:abstractNum w:abstractNumId="2" w15:restartNumberingAfterBreak="0">
-    <w:nsid w:val="108F03EF"/>
+    <w:nsid w:val="09233D20"/>
     <w:multiLevelType w:val="singleLevel"/>
     <w:tmpl w:val="04160001"/>
     <w:lvl w:ilvl="0">
@@ -23513,7 +23555,7 @@
     </w:lvl>
   </w:abstractNum>
   <w:abstractNum w:abstractNumId="3" w15:restartNumberingAfterBreak="0">
-    <w:nsid w:val="13AA1450"/>
+    <w:nsid w:val="0AA33520"/>
     <w:multiLevelType w:val="singleLevel"/>
     <w:tmpl w:val="04160001"/>
     <w:lvl w:ilvl="0">
@@ -23530,7 +23572,7 @@
     </w:lvl>
   </w:abstractNum>
   <w:abstractNum w:abstractNumId="4" w15:restartNumberingAfterBreak="0">
-    <w:nsid w:val="13CD500F"/>
+    <w:nsid w:val="1C1171FD"/>
     <w:multiLevelType w:val="singleLevel"/>
     <w:tmpl w:val="04160001"/>
     <w:lvl w:ilvl="0">
@@ -23547,7 +23589,7 @@
     </w:lvl>
   </w:abstractNum>
   <w:abstractNum w:abstractNumId="5" w15:restartNumberingAfterBreak="0">
-    <w:nsid w:val="156B4F41"/>
+    <w:nsid w:val="1DDC44ED"/>
     <w:multiLevelType w:val="singleLevel"/>
     <w:tmpl w:val="04160001"/>
     <w:lvl w:ilvl="0">
@@ -23564,7 +23606,7 @@
     </w:lvl>
   </w:abstractNum>
   <w:abstractNum w:abstractNumId="6" w15:restartNumberingAfterBreak="0">
-    <w:nsid w:val="1F384D54"/>
+    <w:nsid w:val="1E5F5D55"/>
     <w:multiLevelType w:val="singleLevel"/>
     <w:tmpl w:val="04160001"/>
     <w:lvl w:ilvl="0">
@@ -23581,7 +23623,7 @@
     </w:lvl>
   </w:abstractNum>
   <w:abstractNum w:abstractNumId="7" w15:restartNumberingAfterBreak="0">
-    <w:nsid w:val="1FC7507B"/>
+    <w:nsid w:val="202A2755"/>
     <w:multiLevelType w:val="singleLevel"/>
     <w:tmpl w:val="04160001"/>
     <w:lvl w:ilvl="0">
@@ -23598,7 +23640,7 @@
     </w:lvl>
   </w:abstractNum>
   <w:abstractNum w:abstractNumId="8" w15:restartNumberingAfterBreak="0">
-    <w:nsid w:val="208D727B"/>
+    <w:nsid w:val="23FD5EE8"/>
     <w:multiLevelType w:val="singleLevel"/>
     <w:tmpl w:val="04160001"/>
     <w:lvl w:ilvl="0">
@@ -23615,7 +23657,7 @@
     </w:lvl>
   </w:abstractNum>
   <w:abstractNum w:abstractNumId="9" w15:restartNumberingAfterBreak="0">
-    <w:nsid w:val="22501D9A"/>
+    <w:nsid w:val="26013775"/>
     <w:multiLevelType w:val="singleLevel"/>
     <w:tmpl w:val="04160001"/>
     <w:lvl w:ilvl="0">
@@ -23632,7 +23674,7 @@
     </w:lvl>
   </w:abstractNum>
   <w:abstractNum w:abstractNumId="10" w15:restartNumberingAfterBreak="0">
-    <w:nsid w:val="269846A0"/>
+    <w:nsid w:val="34143182"/>
     <w:multiLevelType w:val="singleLevel"/>
     <w:tmpl w:val="04160001"/>
     <w:lvl w:ilvl="0">
@@ -23649,7 +23691,7 @@
     </w:lvl>
   </w:abstractNum>
   <w:abstractNum w:abstractNumId="11" w15:restartNumberingAfterBreak="0">
-    <w:nsid w:val="297A78D1"/>
+    <w:nsid w:val="34415215"/>
     <w:multiLevelType w:val="singleLevel"/>
     <w:tmpl w:val="04160001"/>
     <w:lvl w:ilvl="0">
@@ -23666,7 +23708,7 @@
     </w:lvl>
   </w:abstractNum>
   <w:abstractNum w:abstractNumId="12" w15:restartNumberingAfterBreak="0">
-    <w:nsid w:val="29ED1FF4"/>
+    <w:nsid w:val="344163CC"/>
     <w:multiLevelType w:val="singleLevel"/>
     <w:tmpl w:val="04160001"/>
     <w:lvl w:ilvl="0">
@@ -23683,7 +23725,7 @@
     </w:lvl>
   </w:abstractNum>
   <w:abstractNum w:abstractNumId="13" w15:restartNumberingAfterBreak="0">
-    <w:nsid w:val="2AB1127C"/>
+    <w:nsid w:val="34D03D22"/>
     <w:multiLevelType w:val="singleLevel"/>
     <w:tmpl w:val="04160001"/>
     <w:lvl w:ilvl="0">
@@ -23700,7 +23742,7 @@
     </w:lvl>
   </w:abstractNum>
   <w:abstractNum w:abstractNumId="14" w15:restartNumberingAfterBreak="0">
-    <w:nsid w:val="323E3D6C"/>
+    <w:nsid w:val="3FF96929"/>
     <w:multiLevelType w:val="singleLevel"/>
     <w:tmpl w:val="04160001"/>
     <w:lvl w:ilvl="0">
@@ -23717,7 +23759,7 @@
     </w:lvl>
   </w:abstractNum>
   <w:abstractNum w:abstractNumId="15" w15:restartNumberingAfterBreak="0">
-    <w:nsid w:val="3C6C3C20"/>
+    <w:nsid w:val="407E6EBC"/>
     <w:multiLevelType w:val="singleLevel"/>
     <w:tmpl w:val="04160001"/>
     <w:lvl w:ilvl="0">
@@ -23734,7 +23776,7 @@
     </w:lvl>
   </w:abstractNum>
   <w:abstractNum w:abstractNumId="16" w15:restartNumberingAfterBreak="0">
-    <w:nsid w:val="40EC597D"/>
+    <w:nsid w:val="411915A4"/>
     <w:multiLevelType w:val="singleLevel"/>
     <w:tmpl w:val="04160001"/>
     <w:lvl w:ilvl="0">
@@ -23751,7 +23793,7 @@
     </w:lvl>
   </w:abstractNum>
   <w:abstractNum w:abstractNumId="17" w15:restartNumberingAfterBreak="0">
-    <w:nsid w:val="46130AE6"/>
+    <w:nsid w:val="47427F1B"/>
     <w:multiLevelType w:val="singleLevel"/>
     <w:tmpl w:val="04160001"/>
     <w:lvl w:ilvl="0">
@@ -23768,7 +23810,7 @@
     </w:lvl>
   </w:abstractNum>
   <w:abstractNum w:abstractNumId="18" w15:restartNumberingAfterBreak="0">
-    <w:nsid w:val="46207C56"/>
+    <w:nsid w:val="48861249"/>
     <w:multiLevelType w:val="singleLevel"/>
     <w:tmpl w:val="04160001"/>
     <w:lvl w:ilvl="0">
@@ -23785,7 +23827,7 @@
     </w:lvl>
   </w:abstractNum>
   <w:abstractNum w:abstractNumId="19" w15:restartNumberingAfterBreak="0">
-    <w:nsid w:val="48733367"/>
+    <w:nsid w:val="493A6DC1"/>
     <w:multiLevelType w:val="singleLevel"/>
     <w:tmpl w:val="04160001"/>
     <w:lvl w:ilvl="0">
@@ -23802,7 +23844,7 @@
     </w:lvl>
   </w:abstractNum>
   <w:abstractNum w:abstractNumId="20" w15:restartNumberingAfterBreak="0">
-    <w:nsid w:val="52055699"/>
+    <w:nsid w:val="4DB72287"/>
     <w:multiLevelType w:val="singleLevel"/>
     <w:tmpl w:val="04160001"/>
     <w:lvl w:ilvl="0">
@@ -23819,7 +23861,7 @@
     </w:lvl>
   </w:abstractNum>
   <w:abstractNum w:abstractNumId="21" w15:restartNumberingAfterBreak="0">
-    <w:nsid w:val="54493B4F"/>
+    <w:nsid w:val="50EF1A86"/>
     <w:multiLevelType w:val="singleLevel"/>
     <w:tmpl w:val="04160001"/>
     <w:lvl w:ilvl="0">
@@ -23836,7 +23878,7 @@
     </w:lvl>
   </w:abstractNum>
   <w:abstractNum w:abstractNumId="22" w15:restartNumberingAfterBreak="0">
-    <w:nsid w:val="5FEA4E4E"/>
+    <w:nsid w:val="575765F3"/>
     <w:multiLevelType w:val="singleLevel"/>
     <w:tmpl w:val="04160001"/>
     <w:lvl w:ilvl="0">
@@ -23853,7 +23895,7 @@
     </w:lvl>
   </w:abstractNum>
   <w:abstractNum w:abstractNumId="23" w15:restartNumberingAfterBreak="0">
-    <w:nsid w:val="631F67F8"/>
+    <w:nsid w:val="585F7B7A"/>
     <w:multiLevelType w:val="singleLevel"/>
     <w:tmpl w:val="04160001"/>
     <w:lvl w:ilvl="0">
@@ -23870,7 +23912,7 @@
     </w:lvl>
   </w:abstractNum>
   <w:abstractNum w:abstractNumId="24" w15:restartNumberingAfterBreak="0">
-    <w:nsid w:val="63284FAD"/>
+    <w:nsid w:val="5B935A0C"/>
     <w:multiLevelType w:val="singleLevel"/>
     <w:tmpl w:val="04160001"/>
     <w:lvl w:ilvl="0">
@@ -23887,7 +23929,7 @@
     </w:lvl>
   </w:abstractNum>
   <w:abstractNum w:abstractNumId="25" w15:restartNumberingAfterBreak="0">
-    <w:nsid w:val="682942F7"/>
+    <w:nsid w:val="63A90C8E"/>
     <w:multiLevelType w:val="singleLevel"/>
     <w:tmpl w:val="04160001"/>
     <w:lvl w:ilvl="0">
@@ -23904,7 +23946,7 @@
     </w:lvl>
   </w:abstractNum>
   <w:abstractNum w:abstractNumId="26" w15:restartNumberingAfterBreak="0">
-    <w:nsid w:val="69FF29FF"/>
+    <w:nsid w:val="64D46D87"/>
     <w:multiLevelType w:val="singleLevel"/>
     <w:tmpl w:val="04160001"/>
     <w:lvl w:ilvl="0">
@@ -23921,7 +23963,7 @@
     </w:lvl>
   </w:abstractNum>
   <w:abstractNum w:abstractNumId="27" w15:restartNumberingAfterBreak="0">
-    <w:nsid w:val="6BF84F3C"/>
+    <w:nsid w:val="66800C37"/>
     <w:multiLevelType w:val="singleLevel"/>
     <w:tmpl w:val="04160001"/>
     <w:lvl w:ilvl="0">
@@ -23938,7 +23980,7 @@
     </w:lvl>
   </w:abstractNum>
   <w:abstractNum w:abstractNumId="28" w15:restartNumberingAfterBreak="0">
-    <w:nsid w:val="6D582959"/>
+    <w:nsid w:val="6AAB6551"/>
     <w:multiLevelType w:val="singleLevel"/>
     <w:tmpl w:val="04160001"/>
     <w:lvl w:ilvl="0">
@@ -23955,7 +23997,7 @@
     </w:lvl>
   </w:abstractNum>
   <w:abstractNum w:abstractNumId="29" w15:restartNumberingAfterBreak="0">
-    <w:nsid w:val="73C51742"/>
+    <w:nsid w:val="6DA80D08"/>
     <w:multiLevelType w:val="singleLevel"/>
     <w:tmpl w:val="04160001"/>
     <w:lvl w:ilvl="0">
@@ -23972,7 +24014,7 @@
     </w:lvl>
   </w:abstractNum>
   <w:abstractNum w:abstractNumId="30" w15:restartNumberingAfterBreak="0">
-    <w:nsid w:val="7FEA0E20"/>
+    <w:nsid w:val="6E063C53"/>
     <w:multiLevelType w:val="singleLevel"/>
     <w:tmpl w:val="04160001"/>
     <w:lvl w:ilvl="0">
@@ -23989,7 +24031,7 @@
     </w:lvl>
   </w:abstractNum>
   <w:abstractNum w:abstractNumId="31" w15:restartNumberingAfterBreak="0">
-    <w:nsid w:val="7FF94FFF"/>
+    <w:nsid w:val="6F931EBB"/>
     <w:multiLevelType w:val="singleLevel"/>
     <w:tmpl w:val="04160001"/>
     <w:lvl w:ilvl="0">
@@ -24005,101 +24047,121 @@
       </w:rPr>
     </w:lvl>
   </w:abstractNum>
-  <w:num w:numId="1" w16cid:durableId="1449347989">
+  <w:abstractNum w:abstractNumId="32" w15:restartNumberingAfterBreak="0">
+    <w:nsid w:val="6FC242D3"/>
+    <w:multiLevelType w:val="singleLevel"/>
+    <w:tmpl w:val="04160001"/>
+    <w:lvl w:ilvl="0">
+      <w:start w:val="1"/>
+      <w:numFmt w:val="bullet"/>
+      <w:lvlText w:val=""/>
+      <w:lvlJc w:val="left"/>
+      <w:pPr>
+        <w:ind w:left="720" w:hanging="360"/>
+      </w:pPr>
+      <w:rPr>
+        <w:rFonts w:ascii="Symbol" w:hAnsi="Symbol" w:hint="default"/>
+      </w:rPr>
+    </w:lvl>
+  </w:abstractNum>
+  <w:num w:numId="1" w16cid:durableId="1343974490">
+    <w:abstractNumId w:val="0"/>
+  </w:num>
+  <w:num w:numId="2" w16cid:durableId="388654472">
+    <w:abstractNumId w:val="25"/>
+  </w:num>
+  <w:num w:numId="3" w16cid:durableId="766852192">
+    <w:abstractNumId w:val="30"/>
+  </w:num>
+  <w:num w:numId="4" w16cid:durableId="2119250244">
+    <w:abstractNumId w:val="17"/>
+  </w:num>
+  <w:num w:numId="5" w16cid:durableId="582686002">
+    <w:abstractNumId w:val="24"/>
+  </w:num>
+  <w:num w:numId="6" w16cid:durableId="1120339832">
+    <w:abstractNumId w:val="19"/>
+  </w:num>
+  <w:num w:numId="7" w16cid:durableId="1496259072">
+    <w:abstractNumId w:val="7"/>
+  </w:num>
+  <w:num w:numId="8" w16cid:durableId="551886889">
+    <w:abstractNumId w:val="29"/>
+  </w:num>
+  <w:num w:numId="9" w16cid:durableId="1068193421">
+    <w:abstractNumId w:val="4"/>
+  </w:num>
+  <w:num w:numId="10" w16cid:durableId="1953122899">
+    <w:abstractNumId w:val="8"/>
+  </w:num>
+  <w:num w:numId="11" w16cid:durableId="1050573320">
+    <w:abstractNumId w:val="23"/>
+  </w:num>
+  <w:num w:numId="12" w16cid:durableId="1394229496">
+    <w:abstractNumId w:val="9"/>
+  </w:num>
+  <w:num w:numId="13" w16cid:durableId="1112283255">
+    <w:abstractNumId w:val="12"/>
+  </w:num>
+  <w:num w:numId="14" w16cid:durableId="2048993177">
+    <w:abstractNumId w:val="14"/>
+  </w:num>
+  <w:num w:numId="15" w16cid:durableId="449203869">
+    <w:abstractNumId w:val="6"/>
+  </w:num>
+  <w:num w:numId="16" w16cid:durableId="912472776">
     <w:abstractNumId w:val="20"/>
   </w:num>
-  <w:num w:numId="2" w16cid:durableId="528756796">
+  <w:num w:numId="17" w16cid:durableId="1225988727">
+    <w:abstractNumId w:val="28"/>
+  </w:num>
+  <w:num w:numId="18" w16cid:durableId="1514879610">
+    <w:abstractNumId w:val="3"/>
+  </w:num>
+  <w:num w:numId="19" w16cid:durableId="823088151">
     <w:abstractNumId w:val="11"/>
   </w:num>
-  <w:num w:numId="3" w16cid:durableId="413432067">
-    <w:abstractNumId w:val="17"/>
+  <w:num w:numId="20" w16cid:durableId="205306">
+    <w:abstractNumId w:val="10"/>
   </w:num>
-  <w:num w:numId="4" w16cid:durableId="1562714277">
-    <w:abstractNumId w:val="8"/>
+  <w:num w:numId="21" w16cid:durableId="598491278">
+    <w:abstractNumId w:val="16"/>
   </w:num>
-  <w:num w:numId="5" w16cid:durableId="1090391186">
-    <w:abstractNumId w:val="22"/>
+  <w:num w:numId="22" w16cid:durableId="289408449">
+    <w:abstractNumId w:val="32"/>
   </w:num>
-  <w:num w:numId="6" w16cid:durableId="1810975458">
-    <w:abstractNumId w:val="0"/>
+  <w:num w:numId="23" w16cid:durableId="475681569">
+    <w:abstractNumId w:val="27"/>
   </w:num>
-  <w:num w:numId="7" w16cid:durableId="212929096">
-    <w:abstractNumId w:val="7"/>
+  <w:num w:numId="24" w16cid:durableId="1942566873">
+    <w:abstractNumId w:val="21"/>
   </w:num>
-  <w:num w:numId="8" w16cid:durableId="496068637">
-    <w:abstractNumId w:val="28"/>
+  <w:num w:numId="25" w16cid:durableId="1213074668">
+    <w:abstractNumId w:val="31"/>
   </w:num>
-  <w:num w:numId="9" w16cid:durableId="198013406">
+  <w:num w:numId="26" w16cid:durableId="436371034">
+    <w:abstractNumId w:val="2"/>
+  </w:num>
+  <w:num w:numId="27" w16cid:durableId="1176189033">
+    <w:abstractNumId w:val="15"/>
+  </w:num>
+  <w:num w:numId="28" w16cid:durableId="1254053257">
     <w:abstractNumId w:val="5"/>
   </w:num>
-  <w:num w:numId="10" w16cid:durableId="1910261411">
-    <w:abstractNumId w:val="3"/>
-  </w:num>
-  <w:num w:numId="11" w16cid:durableId="1398895354">
-    <w:abstractNumId w:val="6"/>
-  </w:num>
-  <w:num w:numId="12" w16cid:durableId="1163080223">
-    <w:abstractNumId w:val="4"/>
-  </w:num>
-  <w:num w:numId="13" w16cid:durableId="427392440">
-    <w:abstractNumId w:val="19"/>
-  </w:num>
-  <w:num w:numId="14" w16cid:durableId="518662920">
+  <w:num w:numId="29" w16cid:durableId="2103409215">
     <w:abstractNumId w:val="1"/>
   </w:num>
-  <w:num w:numId="15" w16cid:durableId="32386285">
-    <w:abstractNumId w:val="14"/>
+  <w:num w:numId="30" w16cid:durableId="1930112258">
+    <w:abstractNumId w:val="26"/>
   </w:num>
-  <w:num w:numId="16" w16cid:durableId="1029062031">
+  <w:num w:numId="31" w16cid:durableId="467237013">
     <w:abstractNumId w:val="18"/>
   </w:num>
-  <w:num w:numId="17" w16cid:durableId="1032464006">
+  <w:num w:numId="32" w16cid:durableId="652611088">
     <w:abstractNumId w:val="13"/>
   </w:num>
-  <w:num w:numId="18" w16cid:durableId="960307581">
-    <w:abstractNumId w:val="27"/>
-  </w:num>
-  <w:num w:numId="19" w16cid:durableId="1957179724">
-    <w:abstractNumId w:val="24"/>
-  </w:num>
-  <w:num w:numId="20" w16cid:durableId="715275899">
-    <w:abstractNumId w:val="16"/>
-  </w:num>
-  <w:num w:numId="21" w16cid:durableId="804591211">
-    <w:abstractNumId w:val="12"/>
-  </w:num>
-  <w:num w:numId="22" w16cid:durableId="1700935549">
-    <w:abstractNumId w:val="26"/>
-  </w:num>
-  <w:num w:numId="23" w16cid:durableId="1284725356">
-    <w:abstractNumId w:val="10"/>
-  </w:num>
-  <w:num w:numId="24" w16cid:durableId="297802649">
-    <w:abstractNumId w:val="31"/>
-  </w:num>
-  <w:num w:numId="25" w16cid:durableId="1931353405">
-    <w:abstractNumId w:val="25"/>
-  </w:num>
-  <w:num w:numId="26" w16cid:durableId="1156264456">
-    <w:abstractNumId w:val="2"/>
-  </w:num>
-  <w:num w:numId="27" w16cid:durableId="1554461133">
-    <w:abstractNumId w:val="21"/>
-  </w:num>
-  <w:num w:numId="28" w16cid:durableId="1600873678">
-    <w:abstractNumId w:val="30"/>
-  </w:num>
-  <w:num w:numId="29" w16cid:durableId="814419211">
-    <w:abstractNumId w:val="9"/>
-  </w:num>
-  <w:num w:numId="30" w16cid:durableId="8989597">
-    <w:abstractNumId w:val="29"/>
-  </w:num>
-  <w:num w:numId="31" w16cid:durableId="1012495549">
-    <w:abstractNumId w:val="15"/>
-  </w:num>
-  <w:num w:numId="32" w16cid:durableId="1902710032">
-    <w:abstractNumId w:val="23"/>
+  <w:num w:numId="33" w16cid:durableId="1579712375">
+    <w:abstractNumId w:val="22"/>
   </w:num>
 </w:numbering>
 </file>
@@ -24512,7 +24574,7 @@
     <w:link w:val="Ttulo1Char"/>
     <w:uiPriority w:val="9"/>
     <w:qFormat/>
-    <w:rsid w:val="005C1A20"/>
+    <w:rsid w:val="00A30922"/>
     <w:pPr>
       <w:keepNext/>
       <w:keepLines/>
@@ -24534,7 +24596,7 @@
     <w:uiPriority w:val="9"/>
     <w:unhideWhenUsed/>
     <w:qFormat/>
-    <w:rsid w:val="005C1A20"/>
+    <w:rsid w:val="00A30922"/>
     <w:pPr>
       <w:keepNext/>
       <w:keepLines/>
@@ -24557,7 +24619,7 @@
     <w:semiHidden/>
     <w:unhideWhenUsed/>
     <w:qFormat/>
-    <w:rsid w:val="005C1A20"/>
+    <w:rsid w:val="00A30922"/>
     <w:pPr>
       <w:keepNext/>
       <w:keepLines/>
@@ -24580,7 +24642,7 @@
     <w:semiHidden/>
     <w:unhideWhenUsed/>
     <w:qFormat/>
-    <w:rsid w:val="005C1A20"/>
+    <w:rsid w:val="00A30922"/>
     <w:pPr>
       <w:keepNext/>
       <w:keepLines/>
@@ -24603,7 +24665,7 @@
     <w:semiHidden/>
     <w:unhideWhenUsed/>
     <w:qFormat/>
-    <w:rsid w:val="005C1A20"/>
+    <w:rsid w:val="00A30922"/>
     <w:pPr>
       <w:keepNext/>
       <w:keepLines/>
@@ -24624,7 +24686,7 @@
     <w:semiHidden/>
     <w:unhideWhenUsed/>
     <w:qFormat/>
-    <w:rsid w:val="005C1A20"/>
+    <w:rsid w:val="00A30922"/>
     <w:pPr>
       <w:keepNext/>
       <w:keepLines/>
@@ -24647,7 +24709,7 @@
     <w:semiHidden/>
     <w:unhideWhenUsed/>
     <w:qFormat/>
-    <w:rsid w:val="005C1A20"/>
+    <w:rsid w:val="00A30922"/>
     <w:pPr>
       <w:keepNext/>
       <w:keepLines/>
@@ -24668,7 +24730,7 @@
     <w:semiHidden/>
     <w:unhideWhenUsed/>
     <w:qFormat/>
-    <w:rsid w:val="005C1A20"/>
+    <w:rsid w:val="00A30922"/>
     <w:pPr>
       <w:keepNext/>
       <w:keepLines/>
@@ -24691,7 +24753,7 @@
     <w:semiHidden/>
     <w:unhideWhenUsed/>
     <w:qFormat/>
-    <w:rsid w:val="005C1A20"/>
+    <w:rsid w:val="00A30922"/>
     <w:pPr>
       <w:keepNext/>
       <w:keepLines/>
@@ -24735,7 +24797,7 @@
     <w:basedOn w:val="Fontepargpadro"/>
     <w:link w:val="Ttulo1"/>
     <w:uiPriority w:val="9"/>
-    <w:rsid w:val="005C1A20"/>
+    <w:rsid w:val="00A30922"/>
     <w:rPr>
       <w:rFonts w:asciiTheme="majorHAnsi" w:eastAsiaTheme="majorEastAsia" w:hAnsiTheme="majorHAnsi" w:cstheme="majorBidi"/>
       <w:color w:val="0F4761" w:themeColor="accent1" w:themeShade="BF"/>
@@ -24748,7 +24810,7 @@
     <w:basedOn w:val="Fontepargpadro"/>
     <w:link w:val="Ttulo2"/>
     <w:uiPriority w:val="9"/>
-    <w:rsid w:val="005C1A20"/>
+    <w:rsid w:val="00A30922"/>
     <w:rPr>
       <w:rFonts w:asciiTheme="majorHAnsi" w:eastAsiaTheme="majorEastAsia" w:hAnsiTheme="majorHAnsi" w:cstheme="majorBidi"/>
       <w:color w:val="0F4761" w:themeColor="accent1" w:themeShade="BF"/>
@@ -24762,7 +24824,7 @@
     <w:link w:val="Ttulo3"/>
     <w:uiPriority w:val="9"/>
     <w:semiHidden/>
-    <w:rsid w:val="005C1A20"/>
+    <w:rsid w:val="00A30922"/>
     <w:rPr>
       <w:rFonts w:eastAsiaTheme="majorEastAsia" w:cstheme="majorBidi"/>
       <w:color w:val="0F4761" w:themeColor="accent1" w:themeShade="BF"/>
@@ -24776,7 +24838,7 @@
     <w:link w:val="Ttulo4"/>
     <w:uiPriority w:val="9"/>
     <w:semiHidden/>
-    <w:rsid w:val="005C1A20"/>
+    <w:rsid w:val="00A30922"/>
     <w:rPr>
       <w:rFonts w:eastAsiaTheme="majorEastAsia" w:cstheme="majorBidi"/>
       <w:i/>
@@ -24790,7 +24852,7 @@
     <w:link w:val="Ttulo5"/>
     <w:uiPriority w:val="9"/>
     <w:semiHidden/>
-    <w:rsid w:val="005C1A20"/>
+    <w:rsid w:val="00A30922"/>
     <w:rPr>
       <w:rFonts w:eastAsiaTheme="majorEastAsia" w:cstheme="majorBidi"/>
       <w:color w:val="0F4761" w:themeColor="accent1" w:themeShade="BF"/>
@@ -24802,7 +24864,7 @@
     <w:link w:val="Ttulo6"/>
     <w:uiPriority w:val="9"/>
     <w:semiHidden/>
-    <w:rsid w:val="005C1A20"/>
+    <w:rsid w:val="00A30922"/>
     <w:rPr>
       <w:rFonts w:eastAsiaTheme="majorEastAsia" w:cstheme="majorBidi"/>
       <w:i/>
@@ -24816,7 +24878,7 @@
     <w:link w:val="Ttulo7"/>
     <w:uiPriority w:val="9"/>
     <w:semiHidden/>
-    <w:rsid w:val="005C1A20"/>
+    <w:rsid w:val="00A30922"/>
     <w:rPr>
       <w:rFonts w:eastAsiaTheme="majorEastAsia" w:cstheme="majorBidi"/>
       <w:color w:val="595959" w:themeColor="text1" w:themeTint="A6"/>
@@ -24828,7 +24890,7 @@
     <w:link w:val="Ttulo8"/>
     <w:uiPriority w:val="9"/>
     <w:semiHidden/>
-    <w:rsid w:val="005C1A20"/>
+    <w:rsid w:val="00A30922"/>
     <w:rPr>
       <w:rFonts w:eastAsiaTheme="majorEastAsia" w:cstheme="majorBidi"/>
       <w:i/>
@@ -24842,7 +24904,7 @@
     <w:link w:val="Ttulo9"/>
     <w:uiPriority w:val="9"/>
     <w:semiHidden/>
-    <w:rsid w:val="005C1A20"/>
+    <w:rsid w:val="00A30922"/>
     <w:rPr>
       <w:rFonts w:eastAsiaTheme="majorEastAsia" w:cstheme="majorBidi"/>
       <w:color w:val="272727" w:themeColor="text1" w:themeTint="D8"/>
@@ -24855,7 +24917,7 @@
     <w:link w:val="TtuloChar"/>
     <w:uiPriority w:val="10"/>
     <w:qFormat/>
-    <w:rsid w:val="005C1A20"/>
+    <w:rsid w:val="00A30922"/>
     <w:pPr>
       <w:spacing w:after="80" w:line="240" w:lineRule="auto"/>
       <w:contextualSpacing/>
@@ -24873,7 +24935,7 @@
     <w:basedOn w:val="Fontepargpadro"/>
     <w:link w:val="Ttulo"/>
     <w:uiPriority w:val="10"/>
-    <w:rsid w:val="005C1A20"/>
+    <w:rsid w:val="00A30922"/>
     <w:rPr>
       <w:rFonts w:asciiTheme="majorHAnsi" w:eastAsiaTheme="majorEastAsia" w:hAnsiTheme="majorHAnsi" w:cstheme="majorBidi"/>
       <w:spacing w:val="-10"/>
@@ -24889,7 +24951,7 @@
     <w:link w:val="SubttuloChar"/>
     <w:uiPriority w:val="11"/>
     <w:qFormat/>
-    <w:rsid w:val="005C1A20"/>
+    <w:rsid w:val="00A30922"/>
     <w:pPr>
       <w:numPr>
         <w:ilvl w:val="1"/>
@@ -24908,7 +24970,7 @@
     <w:basedOn w:val="Fontepargpadro"/>
     <w:link w:val="Subttulo"/>
     <w:uiPriority w:val="11"/>
-    <w:rsid w:val="005C1A20"/>
+    <w:rsid w:val="00A30922"/>
     <w:rPr>
       <w:rFonts w:eastAsiaTheme="majorEastAsia" w:cstheme="majorBidi"/>
       <w:color w:val="595959" w:themeColor="text1" w:themeTint="A6"/>
@@ -24924,7 +24986,7 @@
     <w:link w:val="CitaoChar"/>
     <w:uiPriority w:val="29"/>
     <w:qFormat/>
-    <w:rsid w:val="005C1A20"/>
+    <w:rsid w:val="00A30922"/>
     <w:pPr>
       <w:spacing w:before="160"/>
       <w:jc w:val="center"/>
@@ -24940,7 +25002,7 @@
     <w:basedOn w:val="Fontepargpadro"/>
     <w:link w:val="Citao"/>
     <w:uiPriority w:val="29"/>
-    <w:rsid w:val="005C1A20"/>
+    <w:rsid w:val="00A30922"/>
     <w:rPr>
       <w:i/>
       <w:iCs/>
@@ -24952,7 +25014,7 @@
     <w:basedOn w:val="Normal"/>
     <w:uiPriority w:val="34"/>
     <w:qFormat/>
-    <w:rsid w:val="005C1A20"/>
+    <w:rsid w:val="00A30922"/>
     <w:pPr>
       <w:ind w:left="720"/>
       <w:contextualSpacing/>
@@ -24963,7 +25025,7 @@
     <w:basedOn w:val="Fontepargpadro"/>
     <w:uiPriority w:val="21"/>
     <w:qFormat/>
-    <w:rsid w:val="005C1A20"/>
+    <w:rsid w:val="00A30922"/>
     <w:rPr>
       <w:i/>
       <w:iCs/>
@@ -24977,7 +25039,7 @@
     <w:link w:val="CitaoIntensaChar"/>
     <w:uiPriority w:val="30"/>
     <w:qFormat/>
-    <w:rsid w:val="005C1A20"/>
+    <w:rsid w:val="00A30922"/>
     <w:pPr>
       <w:pBdr>
         <w:top w:val="single" w:sz="4" w:space="10" w:color="0F4761" w:themeColor="accent1" w:themeShade="BF"/>
@@ -24998,7 +25060,7 @@
     <w:basedOn w:val="Fontepargpadro"/>
     <w:link w:val="CitaoIntensa"/>
     <w:uiPriority w:val="30"/>
-    <w:rsid w:val="005C1A20"/>
+    <w:rsid w:val="00A30922"/>
     <w:rPr>
       <w:i/>
       <w:iCs/>
@@ -25010,7 +25072,7 @@
     <w:basedOn w:val="Fontepargpadro"/>
     <w:uiPriority w:val="32"/>
     <w:qFormat/>
-    <w:rsid w:val="005C1A20"/>
+    <w:rsid w:val="00A30922"/>
     <w:rPr>
       <w:b/>
       <w:bCs/>
@@ -25025,7 +25087,7 @@
     <w:link w:val="CabealhoChar"/>
     <w:uiPriority w:val="99"/>
     <w:unhideWhenUsed/>
-    <w:rsid w:val="005C1A20"/>
+    <w:rsid w:val="00A30922"/>
     <w:pPr>
       <w:tabs>
         <w:tab w:val="center" w:pos="4252"/>
@@ -25039,7 +25101,7 @@
     <w:basedOn w:val="Fontepargpadro"/>
     <w:link w:val="Cabealho"/>
     <w:uiPriority w:val="99"/>
-    <w:rsid w:val="005C1A20"/>
+    <w:rsid w:val="00A30922"/>
   </w:style>
   <w:style w:type="paragraph" w:styleId="Rodap">
     <w:name w:val="footer"/>
@@ -25047,7 +25109,7 @@
     <w:link w:val="RodapChar"/>
     <w:uiPriority w:val="99"/>
     <w:unhideWhenUsed/>
-    <w:rsid w:val="005C1A20"/>
+    <w:rsid w:val="00A30922"/>
     <w:pPr>
       <w:tabs>
         <w:tab w:val="center" w:pos="4252"/>
@@ -25061,7 +25123,7 @@
     <w:basedOn w:val="Fontepargpadro"/>
     <w:link w:val="Rodap"/>
     <w:uiPriority w:val="99"/>
-    <w:rsid w:val="005C1A20"/>
+    <w:rsid w:val="00A30922"/>
   </w:style>
   <w:style w:type="paragraph" w:styleId="Sumrio1">
     <w:name w:val="toc 1"/>
@@ -25070,7 +25132,7 @@
     <w:autoRedefine/>
     <w:uiPriority w:val="39"/>
     <w:unhideWhenUsed/>
-    <w:rsid w:val="005C1A20"/>
+    <w:rsid w:val="00A30922"/>
     <w:pPr>
       <w:spacing w:after="100"/>
     </w:pPr>
@@ -25082,7 +25144,7 @@
     <w:autoRedefine/>
     <w:uiPriority w:val="39"/>
     <w:unhideWhenUsed/>
-    <w:rsid w:val="005C1A20"/>
+    <w:rsid w:val="00A30922"/>
     <w:pPr>
       <w:spacing w:after="100"/>
       <w:ind w:left="240"/>

</xml_diff>

<commit_message>
Sincroniza com a produção — Fase 3 de detalhamento do cronograma (resumo de tarefas + rollup de portfólio, fecha a proposta)
Co-Authored-By: Claude Sonnet 5 <noreply@anthropic.com>
</commit_message>
<xml_diff>
--- a/Manual de Uso - Ferramenta de Gestao de Projetos.docx
+++ b/Manual de Uso - Ferramenta de Gestao de Projetos.docx
@@ -229,7 +229,7 @@
         <w:rPr>
           <w:noProof/>
         </w:rPr>
-        <w:instrText xml:space="preserve"> PAGEREF _Toc240273001 \h </w:instrText>
+        <w:instrText xml:space="preserve"> PAGEREF _Toc240274103 \h </w:instrText>
       </w:r>
       <w:r>
         <w:rPr>
@@ -290,7 +290,7 @@
         <w:rPr>
           <w:noProof/>
         </w:rPr>
-        <w:instrText xml:space="preserve"> PAGEREF _Toc240273002 \h </w:instrText>
+        <w:instrText xml:space="preserve"> PAGEREF _Toc240274104 \h </w:instrText>
       </w:r>
       <w:r>
         <w:rPr>
@@ -351,7 +351,7 @@
         <w:rPr>
           <w:noProof/>
         </w:rPr>
-        <w:instrText xml:space="preserve"> PAGEREF _Toc240273003 \h </w:instrText>
+        <w:instrText xml:space="preserve"> PAGEREF _Toc240274105 \h </w:instrText>
       </w:r>
       <w:r>
         <w:rPr>
@@ -412,7 +412,7 @@
         <w:rPr>
           <w:noProof/>
         </w:rPr>
-        <w:instrText xml:space="preserve"> PAGEREF _Toc240273004 \h </w:instrText>
+        <w:instrText xml:space="preserve"> PAGEREF _Toc240274106 \h </w:instrText>
       </w:r>
       <w:r>
         <w:rPr>
@@ -429,7 +429,7 @@
         <w:rPr>
           <w:noProof/>
         </w:rPr>
-        <w:t>18</w:t>
+        <w:t>19</w:t>
       </w:r>
       <w:r>
         <w:rPr>
@@ -473,7 +473,7 @@
         <w:rPr>
           <w:noProof/>
         </w:rPr>
-        <w:instrText xml:space="preserve"> PAGEREF _Toc240273005 \h </w:instrText>
+        <w:instrText xml:space="preserve"> PAGEREF _Toc240274107 \h </w:instrText>
       </w:r>
       <w:r>
         <w:rPr>
@@ -490,7 +490,7 @@
         <w:rPr>
           <w:noProof/>
         </w:rPr>
-        <w:t>19</w:t>
+        <w:t>20</w:t>
       </w:r>
       <w:r>
         <w:rPr>
@@ -534,7 +534,7 @@
         <w:rPr>
           <w:noProof/>
         </w:rPr>
-        <w:instrText xml:space="preserve"> PAGEREF _Toc240273006 \h </w:instrText>
+        <w:instrText xml:space="preserve"> PAGEREF _Toc240274108 \h </w:instrText>
       </w:r>
       <w:r>
         <w:rPr>
@@ -595,7 +595,7 @@
         <w:rPr>
           <w:noProof/>
         </w:rPr>
-        <w:instrText xml:space="preserve"> PAGEREF _Toc240273007 \h </w:instrText>
+        <w:instrText xml:space="preserve"> PAGEREF _Toc240274109 \h </w:instrText>
       </w:r>
       <w:r>
         <w:rPr>
@@ -656,7 +656,7 @@
         <w:rPr>
           <w:noProof/>
         </w:rPr>
-        <w:instrText xml:space="preserve"> PAGEREF _Toc240273008 \h </w:instrText>
+        <w:instrText xml:space="preserve"> PAGEREF _Toc240274110 \h </w:instrText>
       </w:r>
       <w:r>
         <w:rPr>
@@ -717,7 +717,7 @@
         <w:rPr>
           <w:noProof/>
         </w:rPr>
-        <w:instrText xml:space="preserve"> PAGEREF _Toc240273009 \h </w:instrText>
+        <w:instrText xml:space="preserve"> PAGEREF _Toc240274111 \h </w:instrText>
       </w:r>
       <w:r>
         <w:rPr>
@@ -778,7 +778,7 @@
         <w:rPr>
           <w:noProof/>
         </w:rPr>
-        <w:instrText xml:space="preserve"> PAGEREF _Toc240273010 \h </w:instrText>
+        <w:instrText xml:space="preserve"> PAGEREF _Toc240274112 \h </w:instrText>
       </w:r>
       <w:r>
         <w:rPr>
@@ -839,7 +839,7 @@
         <w:rPr>
           <w:noProof/>
         </w:rPr>
-        <w:instrText xml:space="preserve"> PAGEREF _Toc240273011 \h </w:instrText>
+        <w:instrText xml:space="preserve"> PAGEREF _Toc240274113 \h </w:instrText>
       </w:r>
       <w:r>
         <w:rPr>
@@ -900,7 +900,7 @@
         <w:rPr>
           <w:noProof/>
         </w:rPr>
-        <w:instrText xml:space="preserve"> PAGEREF _Toc240273012 \h </w:instrText>
+        <w:instrText xml:space="preserve"> PAGEREF _Toc240274114 \h </w:instrText>
       </w:r>
       <w:r>
         <w:rPr>
@@ -961,7 +961,7 @@
         <w:rPr>
           <w:noProof/>
         </w:rPr>
-        <w:instrText xml:space="preserve"> PAGEREF _Toc240273013 \h </w:instrText>
+        <w:instrText xml:space="preserve"> PAGEREF _Toc240274115 \h </w:instrText>
       </w:r>
       <w:r>
         <w:rPr>
@@ -1022,7 +1022,7 @@
         <w:rPr>
           <w:noProof/>
         </w:rPr>
-        <w:instrText xml:space="preserve"> PAGEREF _Toc240273014 \h </w:instrText>
+        <w:instrText xml:space="preserve"> PAGEREF _Toc240274116 \h </w:instrText>
       </w:r>
       <w:r>
         <w:rPr>
@@ -1083,7 +1083,7 @@
         <w:rPr>
           <w:noProof/>
         </w:rPr>
-        <w:instrText xml:space="preserve"> PAGEREF _Toc240273015 \h </w:instrText>
+        <w:instrText xml:space="preserve"> PAGEREF _Toc240274117 \h </w:instrText>
       </w:r>
       <w:r>
         <w:rPr>
@@ -1144,7 +1144,7 @@
         <w:rPr>
           <w:noProof/>
         </w:rPr>
-        <w:instrText xml:space="preserve"> PAGEREF _Toc240273016 \h </w:instrText>
+        <w:instrText xml:space="preserve"> PAGEREF _Toc240274118 \h </w:instrText>
       </w:r>
       <w:r>
         <w:rPr>
@@ -1205,7 +1205,7 @@
         <w:rPr>
           <w:noProof/>
         </w:rPr>
-        <w:instrText xml:space="preserve"> PAGEREF _Toc240273017 \h </w:instrText>
+        <w:instrText xml:space="preserve"> PAGEREF _Toc240274119 \h </w:instrText>
       </w:r>
       <w:r>
         <w:rPr>
@@ -1266,7 +1266,7 @@
         <w:rPr>
           <w:noProof/>
         </w:rPr>
-        <w:instrText xml:space="preserve"> PAGEREF _Toc240273018 \h </w:instrText>
+        <w:instrText xml:space="preserve"> PAGEREF _Toc240274120 \h </w:instrText>
       </w:r>
       <w:r>
         <w:rPr>
@@ -1327,7 +1327,7 @@
         <w:rPr>
           <w:noProof/>
         </w:rPr>
-        <w:instrText xml:space="preserve"> PAGEREF _Toc240273019 \h </w:instrText>
+        <w:instrText xml:space="preserve"> PAGEREF _Toc240274121 \h </w:instrText>
       </w:r>
       <w:r>
         <w:rPr>
@@ -1388,7 +1388,7 @@
         <w:rPr>
           <w:noProof/>
         </w:rPr>
-        <w:instrText xml:space="preserve"> PAGEREF _Toc240273020 \h </w:instrText>
+        <w:instrText xml:space="preserve"> PAGEREF _Toc240274122 \h </w:instrText>
       </w:r>
       <w:r>
         <w:rPr>
@@ -1449,7 +1449,7 @@
         <w:rPr>
           <w:noProof/>
         </w:rPr>
-        <w:instrText xml:space="preserve"> PAGEREF _Toc240273021 \h </w:instrText>
+        <w:instrText xml:space="preserve"> PAGEREF _Toc240274123 \h </w:instrText>
       </w:r>
       <w:r>
         <w:rPr>
@@ -1510,7 +1510,7 @@
         <w:rPr>
           <w:noProof/>
         </w:rPr>
-        <w:instrText xml:space="preserve"> PAGEREF _Toc240273022 \h </w:instrText>
+        <w:instrText xml:space="preserve"> PAGEREF _Toc240274124 \h </w:instrText>
       </w:r>
       <w:r>
         <w:rPr>
@@ -1571,7 +1571,7 @@
         <w:rPr>
           <w:noProof/>
         </w:rPr>
-        <w:instrText xml:space="preserve"> PAGEREF _Toc240273023 \h </w:instrText>
+        <w:instrText xml:space="preserve"> PAGEREF _Toc240274125 \h </w:instrText>
       </w:r>
       <w:r>
         <w:rPr>
@@ -1632,7 +1632,7 @@
         <w:rPr>
           <w:noProof/>
         </w:rPr>
-        <w:instrText xml:space="preserve"> PAGEREF _Toc240273024 \h </w:instrText>
+        <w:instrText xml:space="preserve"> PAGEREF _Toc240274126 \h </w:instrText>
       </w:r>
       <w:r>
         <w:rPr>
@@ -1693,7 +1693,7 @@
         <w:rPr>
           <w:noProof/>
         </w:rPr>
-        <w:instrText xml:space="preserve"> PAGEREF _Toc240273025 \h </w:instrText>
+        <w:instrText xml:space="preserve"> PAGEREF _Toc240274127 \h </w:instrText>
       </w:r>
       <w:r>
         <w:rPr>
@@ -1755,7 +1755,7 @@
         <w:rPr>
           <w:noProof/>
         </w:rPr>
-        <w:instrText xml:space="preserve"> PAGEREF _Toc240273026 \h </w:instrText>
+        <w:instrText xml:space="preserve"> PAGEREF _Toc240274128 \h </w:instrText>
       </w:r>
       <w:r>
         <w:rPr>
@@ -1816,7 +1816,7 @@
         <w:rPr>
           <w:noProof/>
         </w:rPr>
-        <w:instrText xml:space="preserve"> PAGEREF _Toc240273027 \h </w:instrText>
+        <w:instrText xml:space="preserve"> PAGEREF _Toc240274129 \h </w:instrText>
       </w:r>
       <w:r>
         <w:rPr>
@@ -1877,7 +1877,7 @@
         <w:rPr>
           <w:noProof/>
         </w:rPr>
-        <w:instrText xml:space="preserve"> PAGEREF _Toc240273028 \h </w:instrText>
+        <w:instrText xml:space="preserve"> PAGEREF _Toc240274130 \h </w:instrText>
       </w:r>
       <w:r>
         <w:rPr>
@@ -1938,7 +1938,7 @@
         <w:rPr>
           <w:noProof/>
         </w:rPr>
-        <w:instrText xml:space="preserve"> PAGEREF _Toc240273029 \h </w:instrText>
+        <w:instrText xml:space="preserve"> PAGEREF _Toc240274131 \h </w:instrText>
       </w:r>
       <w:r>
         <w:rPr>
@@ -1999,7 +1999,7 @@
         <w:rPr>
           <w:noProof/>
         </w:rPr>
-        <w:instrText xml:space="preserve"> PAGEREF _Toc240273030 \h </w:instrText>
+        <w:instrText xml:space="preserve"> PAGEREF _Toc240274132 \h </w:instrText>
       </w:r>
       <w:r>
         <w:rPr>
@@ -2060,7 +2060,7 @@
         <w:rPr>
           <w:noProof/>
         </w:rPr>
-        <w:instrText xml:space="preserve"> PAGEREF _Toc240273031 \h </w:instrText>
+        <w:instrText xml:space="preserve"> PAGEREF _Toc240274133 \h </w:instrText>
       </w:r>
       <w:r>
         <w:rPr>
@@ -2121,7 +2121,7 @@
         <w:rPr>
           <w:noProof/>
         </w:rPr>
-        <w:instrText xml:space="preserve"> PAGEREF _Toc240273032 \h </w:instrText>
+        <w:instrText xml:space="preserve"> PAGEREF _Toc240274134 \h </w:instrText>
       </w:r>
       <w:r>
         <w:rPr>
@@ -2182,7 +2182,7 @@
         <w:rPr>
           <w:noProof/>
         </w:rPr>
-        <w:instrText xml:space="preserve"> PAGEREF _Toc240273033 \h </w:instrText>
+        <w:instrText xml:space="preserve"> PAGEREF _Toc240274135 \h </w:instrText>
       </w:r>
       <w:r>
         <w:rPr>
@@ -2243,7 +2243,7 @@
         <w:rPr>
           <w:noProof/>
         </w:rPr>
-        <w:instrText xml:space="preserve"> PAGEREF _Toc240273034 \h </w:instrText>
+        <w:instrText xml:space="preserve"> PAGEREF _Toc240274136 \h </w:instrText>
       </w:r>
       <w:r>
         <w:rPr>
@@ -2304,7 +2304,7 @@
         <w:rPr>
           <w:noProof/>
         </w:rPr>
-        <w:instrText xml:space="preserve"> PAGEREF _Toc240273035 \h </w:instrText>
+        <w:instrText xml:space="preserve"> PAGEREF _Toc240274137 \h </w:instrText>
       </w:r>
       <w:r>
         <w:rPr>
@@ -2365,7 +2365,7 @@
         <w:rPr>
           <w:noProof/>
         </w:rPr>
-        <w:instrText xml:space="preserve"> PAGEREF _Toc240273036 \h </w:instrText>
+        <w:instrText xml:space="preserve"> PAGEREF _Toc240274138 \h </w:instrText>
       </w:r>
       <w:r>
         <w:rPr>
@@ -2426,7 +2426,7 @@
         <w:rPr>
           <w:noProof/>
         </w:rPr>
-        <w:instrText xml:space="preserve"> PAGEREF _Toc240273037 \h </w:instrText>
+        <w:instrText xml:space="preserve"> PAGEREF _Toc240274139 \h </w:instrText>
       </w:r>
       <w:r>
         <w:rPr>
@@ -2487,7 +2487,7 @@
         <w:rPr>
           <w:noProof/>
         </w:rPr>
-        <w:instrText xml:space="preserve"> PAGEREF _Toc240273038 \h </w:instrText>
+        <w:instrText xml:space="preserve"> PAGEREF _Toc240274140 \h </w:instrText>
       </w:r>
       <w:r>
         <w:rPr>
@@ -2548,7 +2548,7 @@
         <w:rPr>
           <w:noProof/>
         </w:rPr>
-        <w:instrText xml:space="preserve"> PAGEREF _Toc240273039 \h </w:instrText>
+        <w:instrText xml:space="preserve"> PAGEREF _Toc240274141 \h </w:instrText>
       </w:r>
       <w:r>
         <w:rPr>
@@ -2609,7 +2609,7 @@
         <w:rPr>
           <w:noProof/>
         </w:rPr>
-        <w:instrText xml:space="preserve"> PAGEREF _Toc240273040 \h </w:instrText>
+        <w:instrText xml:space="preserve"> PAGEREF _Toc240274142 \h </w:instrText>
       </w:r>
       <w:r>
         <w:rPr>
@@ -2670,7 +2670,7 @@
         <w:rPr>
           <w:noProof/>
         </w:rPr>
-        <w:instrText xml:space="preserve"> PAGEREF _Toc240273041 \h </w:instrText>
+        <w:instrText xml:space="preserve"> PAGEREF _Toc240274143 \h </w:instrText>
       </w:r>
       <w:r>
         <w:rPr>
@@ -2731,7 +2731,7 @@
         <w:rPr>
           <w:noProof/>
         </w:rPr>
-        <w:instrText xml:space="preserve"> PAGEREF _Toc240273042 \h </w:instrText>
+        <w:instrText xml:space="preserve"> PAGEREF _Toc240274144 \h </w:instrText>
       </w:r>
       <w:r>
         <w:rPr>
@@ -2792,7 +2792,7 @@
         <w:rPr>
           <w:noProof/>
         </w:rPr>
-        <w:instrText xml:space="preserve"> PAGEREF _Toc240273043 \h </w:instrText>
+        <w:instrText xml:space="preserve"> PAGEREF _Toc240274145 \h </w:instrText>
       </w:r>
       <w:r>
         <w:rPr>
@@ -2853,7 +2853,7 @@
         <w:rPr>
           <w:noProof/>
         </w:rPr>
-        <w:instrText xml:space="preserve"> PAGEREF _Toc240273044 \h </w:instrText>
+        <w:instrText xml:space="preserve"> PAGEREF _Toc240274146 \h </w:instrText>
       </w:r>
       <w:r>
         <w:rPr>
@@ -2914,7 +2914,7 @@
         <w:rPr>
           <w:noProof/>
         </w:rPr>
-        <w:instrText xml:space="preserve"> PAGEREF _Toc240273045 \h </w:instrText>
+        <w:instrText xml:space="preserve"> PAGEREF _Toc240274147 \h </w:instrText>
       </w:r>
       <w:r>
         <w:rPr>
@@ -2975,7 +2975,7 @@
         <w:rPr>
           <w:noProof/>
         </w:rPr>
-        <w:instrText xml:space="preserve"> PAGEREF _Toc240273046 \h </w:instrText>
+        <w:instrText xml:space="preserve"> PAGEREF _Toc240274148 \h </w:instrText>
       </w:r>
       <w:r>
         <w:rPr>
@@ -3036,7 +3036,7 @@
         <w:rPr>
           <w:noProof/>
         </w:rPr>
-        <w:instrText xml:space="preserve"> PAGEREF _Toc240273047 \h </w:instrText>
+        <w:instrText xml:space="preserve"> PAGEREF _Toc240274149 \h </w:instrText>
       </w:r>
       <w:r>
         <w:rPr>
@@ -3097,7 +3097,7 @@
         <w:rPr>
           <w:noProof/>
         </w:rPr>
-        <w:instrText xml:space="preserve"> PAGEREF _Toc240273048 \h </w:instrText>
+        <w:instrText xml:space="preserve"> PAGEREF _Toc240274150 \h </w:instrText>
       </w:r>
       <w:r>
         <w:rPr>
@@ -3173,7 +3173,7 @@
           <w:sz w:val="34"/>
         </w:rPr>
       </w:pPr>
-      <w:bookmarkStart w:id="0" w:name="_Toc240273001"/>
+      <w:bookmarkStart w:id="0" w:name="_Toc240274103"/>
       <w:r>
         <w:rPr>
           <w:rFonts w:ascii="Montserrat" w:hAnsi="Montserrat"/>
@@ -3197,7 +3197,7 @@
           <w:sz w:val="27"/>
         </w:rPr>
       </w:pPr>
-      <w:bookmarkStart w:id="1" w:name="_Toc240273002"/>
+      <w:bookmarkStart w:id="1" w:name="_Toc240274104"/>
       <w:r>
         <w:rPr>
           <w:rFonts w:ascii="Montserrat" w:hAnsi="Montserrat"/>
@@ -4557,6 +4557,24 @@
           <w:color w:val="1A1A1A"/>
           <w:sz w:val="22"/>
         </w:rPr>
+        <w:t>Esta e a versao 2.67 do manual. Em relacao a versao 2.66 (14/09/2026), a Fase 3 (opcional) fecha de vez a proposta de detalhamento do cronograma: a tabela de Cronograma do Planejamento (Passo 4, aba 3) ganhou um resumo do percentual de tarefas concluidas somando todos os marcos, ao lado do botao + Adicionar linha, e o Painel Executivo (secao 6.4) ganhou a secao Tarefas do cronograma (portfolio), com o mesmo percentual agregado de todos os projetos e em quantos deles existe pelo menos uma tarefa pendente.</w:t>
+      </w:r>
+    </w:p>
+    <w:p>
+      <w:pPr>
+        <w:spacing w:line="280" w:lineRule="auto"/>
+        <w:rPr>
+          <w:rFonts w:ascii="Montserrat" w:hAnsi="Montserrat"/>
+          <w:color w:val="1A1A1A"/>
+          <w:sz w:val="22"/>
+        </w:rPr>
+      </w:pPr>
+      <w:r>
+        <w:rPr>
+          <w:rFonts w:ascii="Montserrat" w:hAnsi="Montserrat"/>
+          <w:color w:val="1A1A1A"/>
+          <w:sz w:val="22"/>
+        </w:rPr>
         <w:t>O manual nao substitui as Diretrizes para a Gestao de Projetos da UNIALFA (documento institucional que define o framework D01 a D07) nem o documento Regras de Acesso e Permissoes (que detalha cada regra de controle de acesso); ele e o guia operacional de como usar cada ferramenta na pratica.</w:t>
       </w:r>
     </w:p>
@@ -4571,7 +4589,7 @@
           <w:sz w:val="27"/>
         </w:rPr>
       </w:pPr>
-      <w:bookmarkStart w:id="2" w:name="_Toc240273003"/>
+      <w:bookmarkStart w:id="2" w:name="_Toc240274105"/>
       <w:r>
         <w:rPr>
           <w:rFonts w:ascii="Montserrat" w:hAnsi="Montserrat"/>
@@ -4670,6 +4688,7 @@
           <w:color w:val="1A1A1A"/>
           <w:sz w:val="22"/>
         </w:rPr>
+        <w:lastRenderedPageBreak/>
         <w:t>1 pagina de Administracao, restrita a Admin, para gerenciar usuarios, equipes e configuracoes do sistema.</w:t>
       </w:r>
     </w:p>
@@ -4736,7 +4755,6 @@
           <w:color w:val="1A1A1A"/>
           <w:sz w:val="22"/>
         </w:rPr>
-        <w:lastRenderedPageBreak/>
         <w:t>Cada formulario de registro tem duas partes: uma tela de preenchimento (+Novo...) e uma tela de consulta (...cadastrados), onde ficam listados todos os registros ja salvos, com opcao de abrir, editar o status ou excluir cada um.</w:t>
       </w:r>
     </w:p>
@@ -4768,16 +4786,16 @@
           <w:noProof/>
         </w:rPr>
         <w:drawing>
-          <wp:inline distT="0" distB="0" distL="0" distR="0" wp14:anchorId="7E328FCC" wp14:editId="1886E558">
+          <wp:inline distT="0" distB="0" distL="0" distR="0" wp14:anchorId="36376B64" wp14:editId="280E5290">
             <wp:extent cx="5303520" cy="4792851"/>
             <wp:effectExtent l="19050" t="19050" r="11430" b="27305"/>
-            <wp:docPr id="1259996565" name="Imagem 1"/>
+            <wp:docPr id="1583428360" name="Imagem 1"/>
             <wp:cNvGraphicFramePr/>
             <a:graphic xmlns:a="http://schemas.openxmlformats.org/drawingml/2006/main">
               <a:graphicData uri="http://schemas.openxmlformats.org/drawingml/2006/picture">
                 <pic:pic xmlns:pic="http://schemas.openxmlformats.org/drawingml/2006/picture">
                   <pic:nvPicPr>
-                    <pic:cNvPr id="1259996565" name=""/>
+                    <pic:cNvPr id="1583428360" name=""/>
                     <pic:cNvPicPr/>
                   </pic:nvPicPr>
                   <pic:blipFill>
@@ -4845,7 +4863,7 @@
           <w:sz w:val="27"/>
         </w:rPr>
       </w:pPr>
-      <w:bookmarkStart w:id="3" w:name="_Toc240273004"/>
+      <w:bookmarkStart w:id="3" w:name="_Toc240274106"/>
       <w:r>
         <w:rPr>
           <w:rFonts w:ascii="Montserrat" w:hAnsi="Montserrat"/>
@@ -4853,6 +4871,7 @@
           <w:color w:val="B91D2E"/>
           <w:sz w:val="27"/>
         </w:rPr>
+        <w:lastRenderedPageBreak/>
         <w:t>1.3 Como acessar e fazer login</w:t>
       </w:r>
       <w:bookmarkEnd w:id="3"/>
@@ -4884,18 +4903,17 @@
         <w:rPr>
           <w:noProof/>
         </w:rPr>
-        <w:lastRenderedPageBreak/>
         <w:drawing>
-          <wp:inline distT="0" distB="0" distL="0" distR="0" wp14:anchorId="421E09B6" wp14:editId="77C5B73A">
+          <wp:inline distT="0" distB="0" distL="0" distR="0" wp14:anchorId="147F1A92" wp14:editId="09D8FEC8">
             <wp:extent cx="4206240" cy="3801227"/>
             <wp:effectExtent l="19050" t="19050" r="22860" b="27940"/>
-            <wp:docPr id="250181409" name="Imagem 2"/>
+            <wp:docPr id="621358444" name="Imagem 2"/>
             <wp:cNvGraphicFramePr/>
             <a:graphic xmlns:a="http://schemas.openxmlformats.org/drawingml/2006/main">
               <a:graphicData uri="http://schemas.openxmlformats.org/drawingml/2006/picture">
                 <pic:pic xmlns:pic="http://schemas.openxmlformats.org/drawingml/2006/picture">
                   <pic:nvPicPr>
-                    <pic:cNvPr id="250181409" name=""/>
+                    <pic:cNvPr id="621358444" name=""/>
                     <pic:cNvPicPr/>
                   </pic:nvPicPr>
                   <pic:blipFill>
@@ -5068,7 +5086,7 @@
           <w:sz w:val="27"/>
         </w:rPr>
       </w:pPr>
-      <w:bookmarkStart w:id="4" w:name="_Toc240273005"/>
+      <w:bookmarkStart w:id="4" w:name="_Toc240274107"/>
       <w:r>
         <w:rPr>
           <w:rFonts w:ascii="Montserrat" w:hAnsi="Montserrat"/>
@@ -5076,6 +5094,7 @@
           <w:color w:val="B91D2E"/>
           <w:sz w:val="27"/>
         </w:rPr>
+        <w:lastRenderedPageBreak/>
         <w:t>1.4 Como a ferramenta se relaciona com as Diretrizes (D01-D07)</w:t>
       </w:r>
       <w:bookmarkEnd w:id="4"/>
@@ -5150,7 +5169,6 @@
                 <w:color w:val="FFFFFF"/>
                 <w:sz w:val="19"/>
               </w:rPr>
-              <w:lastRenderedPageBreak/>
               <w:t>Passo</w:t>
             </w:r>
           </w:p>
@@ -6307,7 +6325,7 @@
           <w:sz w:val="34"/>
         </w:rPr>
       </w:pPr>
-      <w:bookmarkStart w:id="5" w:name="_Toc240273006"/>
+      <w:bookmarkStart w:id="5" w:name="_Toc240274108"/>
       <w:r>
         <w:rPr>
           <w:rFonts w:ascii="Montserrat" w:hAnsi="Montserrat"/>
@@ -6331,7 +6349,7 @@
           <w:sz w:val="27"/>
         </w:rPr>
       </w:pPr>
-      <w:bookmarkStart w:id="6" w:name="_Toc240273007"/>
+      <w:bookmarkStart w:id="6" w:name="_Toc240274109"/>
       <w:r>
         <w:rPr>
           <w:rFonts w:ascii="Montserrat" w:hAnsi="Montserrat"/>
@@ -6372,7 +6390,7 @@
           <w:sz w:val="27"/>
         </w:rPr>
       </w:pPr>
-      <w:bookmarkStart w:id="7" w:name="_Toc240273008"/>
+      <w:bookmarkStart w:id="7" w:name="_Toc240274110"/>
       <w:r>
         <w:rPr>
           <w:rFonts w:ascii="Montserrat" w:hAnsi="Montserrat"/>
@@ -6491,7 +6509,7 @@
           <w:sz w:val="27"/>
         </w:rPr>
       </w:pPr>
-      <w:bookmarkStart w:id="8" w:name="_Toc240273009"/>
+      <w:bookmarkStart w:id="8" w:name="_Toc240274111"/>
       <w:r>
         <w:rPr>
           <w:rFonts w:ascii="Montserrat" w:hAnsi="Montserrat"/>
@@ -7104,7 +7122,7 @@
           <w:sz w:val="27"/>
         </w:rPr>
       </w:pPr>
-      <w:bookmarkStart w:id="9" w:name="_Toc240273010"/>
+      <w:bookmarkStart w:id="9" w:name="_Toc240274112"/>
       <w:r>
         <w:rPr>
           <w:rFonts w:ascii="Montserrat" w:hAnsi="Montserrat"/>
@@ -7193,16 +7211,16 @@
         </w:rPr>
         <w:lastRenderedPageBreak/>
         <w:drawing>
-          <wp:inline distT="0" distB="0" distL="0" distR="0" wp14:anchorId="205DB4F4" wp14:editId="4DDE0005">
+          <wp:inline distT="0" distB="0" distL="0" distR="0" wp14:anchorId="18EFAF1C" wp14:editId="1EEDB83C">
             <wp:extent cx="4937760" cy="4462310"/>
             <wp:effectExtent l="19050" t="19050" r="15240" b="14605"/>
-            <wp:docPr id="3391484" name="Imagem 3"/>
+            <wp:docPr id="1383274013" name="Imagem 3"/>
             <wp:cNvGraphicFramePr/>
             <a:graphic xmlns:a="http://schemas.openxmlformats.org/drawingml/2006/main">
               <a:graphicData uri="http://schemas.openxmlformats.org/drawingml/2006/picture">
                 <pic:pic xmlns:pic="http://schemas.openxmlformats.org/drawingml/2006/picture">
                   <pic:nvPicPr>
-                    <pic:cNvPr id="3391484" name=""/>
+                    <pic:cNvPr id="1383274013" name=""/>
                     <pic:cNvPicPr/>
                   </pic:nvPicPr>
                   <pic:blipFill>
@@ -7270,7 +7288,7 @@
           <w:sz w:val="27"/>
         </w:rPr>
       </w:pPr>
-      <w:bookmarkStart w:id="10" w:name="_Toc240273011"/>
+      <w:bookmarkStart w:id="10" w:name="_Toc240274113"/>
       <w:r>
         <w:rPr>
           <w:rFonts w:ascii="Montserrat" w:hAnsi="Montserrat"/>
@@ -7311,16 +7329,16 @@
         </w:rPr>
         <w:lastRenderedPageBreak/>
         <w:drawing>
-          <wp:inline distT="0" distB="0" distL="0" distR="0" wp14:anchorId="384FD3B0" wp14:editId="356F31F0">
+          <wp:inline distT="0" distB="0" distL="0" distR="0" wp14:anchorId="5E800777" wp14:editId="7989DAD1">
             <wp:extent cx="5120640" cy="4627581"/>
             <wp:effectExtent l="19050" t="19050" r="22860" b="20955"/>
-            <wp:docPr id="1588117104" name="Imagem 4"/>
+            <wp:docPr id="1893630054" name="Imagem 4"/>
             <wp:cNvGraphicFramePr/>
             <a:graphic xmlns:a="http://schemas.openxmlformats.org/drawingml/2006/main">
               <a:graphicData uri="http://schemas.openxmlformats.org/drawingml/2006/picture">
                 <pic:pic xmlns:pic="http://schemas.openxmlformats.org/drawingml/2006/picture">
                   <pic:nvPicPr>
-                    <pic:cNvPr id="1588117104" name=""/>
+                    <pic:cNvPr id="1893630054" name=""/>
                     <pic:cNvPicPr/>
                   </pic:nvPicPr>
                   <pic:blipFill>
@@ -7488,7 +7506,7 @@
           <w:sz w:val="27"/>
         </w:rPr>
       </w:pPr>
-      <w:bookmarkStart w:id="11" w:name="_Toc240273012"/>
+      <w:bookmarkStart w:id="11" w:name="_Toc240274114"/>
       <w:r>
         <w:rPr>
           <w:rFonts w:ascii="Montserrat" w:hAnsi="Montserrat"/>
@@ -7528,16 +7546,16 @@
           <w:noProof/>
         </w:rPr>
         <w:drawing>
-          <wp:inline distT="0" distB="0" distL="0" distR="0" wp14:anchorId="732322D7" wp14:editId="375FF84F">
+          <wp:inline distT="0" distB="0" distL="0" distR="0" wp14:anchorId="4856ED94" wp14:editId="2AEE0F98">
             <wp:extent cx="4206240" cy="3801227"/>
             <wp:effectExtent l="19050" t="19050" r="22860" b="27940"/>
-            <wp:docPr id="1941429040" name="Imagem 5"/>
+            <wp:docPr id="1385831276" name="Imagem 5"/>
             <wp:cNvGraphicFramePr/>
             <a:graphic xmlns:a="http://schemas.openxmlformats.org/drawingml/2006/main">
               <a:graphicData uri="http://schemas.openxmlformats.org/drawingml/2006/picture">
                 <pic:pic xmlns:pic="http://schemas.openxmlformats.org/drawingml/2006/picture">
                   <pic:nvPicPr>
-                    <pic:cNvPr id="1941429040" name=""/>
+                    <pic:cNvPr id="1385831276" name=""/>
                     <pic:cNvPicPr/>
                   </pic:nvPicPr>
                   <pic:blipFill>
@@ -7605,16 +7623,16 @@
         </w:rPr>
         <w:lastRenderedPageBreak/>
         <w:drawing>
-          <wp:inline distT="0" distB="0" distL="0" distR="0" wp14:anchorId="55AFEBDF" wp14:editId="4A54EEF5">
+          <wp:inline distT="0" distB="0" distL="0" distR="0" wp14:anchorId="784E56CB" wp14:editId="3A996CC2">
             <wp:extent cx="4206240" cy="3801227"/>
             <wp:effectExtent l="19050" t="19050" r="22860" b="27940"/>
-            <wp:docPr id="47580427" name="Imagem 6"/>
+            <wp:docPr id="1922985015" name="Imagem 6"/>
             <wp:cNvGraphicFramePr/>
             <a:graphic xmlns:a="http://schemas.openxmlformats.org/drawingml/2006/main">
               <a:graphicData uri="http://schemas.openxmlformats.org/drawingml/2006/picture">
                 <pic:pic xmlns:pic="http://schemas.openxmlformats.org/drawingml/2006/picture">
                   <pic:nvPicPr>
-                    <pic:cNvPr id="47580427" name=""/>
+                    <pic:cNvPr id="1922985015" name=""/>
                     <pic:cNvPicPr/>
                   </pic:nvPicPr>
                   <pic:blipFill>
@@ -7730,7 +7748,7 @@
           <w:sz w:val="27"/>
         </w:rPr>
       </w:pPr>
-      <w:bookmarkStart w:id="12" w:name="_Toc240273013"/>
+      <w:bookmarkStart w:id="12" w:name="_Toc240274115"/>
       <w:r>
         <w:rPr>
           <w:rFonts w:ascii="Montserrat" w:hAnsi="Montserrat"/>
@@ -7798,7 +7816,7 @@
           <w:sz w:val="27"/>
         </w:rPr>
       </w:pPr>
-      <w:bookmarkStart w:id="13" w:name="_Toc240273014"/>
+      <w:bookmarkStart w:id="13" w:name="_Toc240274116"/>
       <w:r>
         <w:rPr>
           <w:rFonts w:ascii="Montserrat" w:hAnsi="Montserrat"/>
@@ -8025,7 +8043,7 @@
           <w:sz w:val="27"/>
         </w:rPr>
       </w:pPr>
-      <w:bookmarkStart w:id="14" w:name="_Toc240273015"/>
+      <w:bookmarkStart w:id="14" w:name="_Toc240274117"/>
       <w:r>
         <w:rPr>
           <w:rFonts w:ascii="Montserrat" w:hAnsi="Montserrat"/>
@@ -8184,7 +8202,7 @@
           <w:sz w:val="27"/>
         </w:rPr>
       </w:pPr>
-      <w:bookmarkStart w:id="15" w:name="_Toc240273016"/>
+      <w:bookmarkStart w:id="15" w:name="_Toc240274118"/>
       <w:r>
         <w:rPr>
           <w:rFonts w:ascii="Montserrat" w:hAnsi="Montserrat"/>
@@ -8376,7 +8394,7 @@
           <w:sz w:val="27"/>
         </w:rPr>
       </w:pPr>
-      <w:bookmarkStart w:id="16" w:name="_Toc240273017"/>
+      <w:bookmarkStart w:id="16" w:name="_Toc240274119"/>
       <w:r>
         <w:rPr>
           <w:rFonts w:ascii="Montserrat" w:hAnsi="Montserrat"/>
@@ -8504,7 +8522,7 @@
           <w:sz w:val="27"/>
         </w:rPr>
       </w:pPr>
-      <w:bookmarkStart w:id="17" w:name="_Toc240273018"/>
+      <w:bookmarkStart w:id="17" w:name="_Toc240274120"/>
       <w:r>
         <w:rPr>
           <w:rFonts w:ascii="Montserrat" w:hAnsi="Montserrat"/>
@@ -8834,7 +8852,7 @@
           <w:sz w:val="27"/>
         </w:rPr>
       </w:pPr>
-      <w:bookmarkStart w:id="18" w:name="_Toc240273019"/>
+      <w:bookmarkStart w:id="18" w:name="_Toc240274121"/>
       <w:r>
         <w:rPr>
           <w:rFonts w:ascii="Montserrat" w:hAnsi="Montserrat"/>
@@ -8975,7 +8993,7 @@
           <w:sz w:val="34"/>
         </w:rPr>
       </w:pPr>
-      <w:bookmarkStart w:id="19" w:name="_Toc240273020"/>
+      <w:bookmarkStart w:id="19" w:name="_Toc240274122"/>
       <w:r>
         <w:rPr>
           <w:rFonts w:ascii="Montserrat" w:hAnsi="Montserrat"/>
@@ -9017,7 +9035,7 @@
           <w:sz w:val="27"/>
         </w:rPr>
       </w:pPr>
-      <w:bookmarkStart w:id="20" w:name="_Toc240273021"/>
+      <w:bookmarkStart w:id="20" w:name="_Toc240274123"/>
       <w:r>
         <w:rPr>
           <w:rFonts w:ascii="Montserrat" w:hAnsi="Montserrat"/>
@@ -10097,16 +10115,16 @@
         </w:rPr>
         <w:lastRenderedPageBreak/>
         <w:drawing>
-          <wp:inline distT="0" distB="0" distL="0" distR="0" wp14:anchorId="38063904" wp14:editId="670D6EC0">
+          <wp:inline distT="0" distB="0" distL="0" distR="0" wp14:anchorId="0451861E" wp14:editId="3B8267B8">
             <wp:extent cx="5120640" cy="4627581"/>
             <wp:effectExtent l="19050" t="19050" r="22860" b="20955"/>
-            <wp:docPr id="1973627620" name="Imagem 7"/>
+            <wp:docPr id="1583043190" name="Imagem 7"/>
             <wp:cNvGraphicFramePr/>
             <a:graphic xmlns:a="http://schemas.openxmlformats.org/drawingml/2006/main">
               <a:graphicData uri="http://schemas.openxmlformats.org/drawingml/2006/picture">
                 <pic:pic xmlns:pic="http://schemas.openxmlformats.org/drawingml/2006/picture">
                   <pic:nvPicPr>
-                    <pic:cNvPr id="1973627620" name=""/>
+                    <pic:cNvPr id="1583043190" name=""/>
                     <pic:cNvPicPr/>
                   </pic:nvPicPr>
                   <pic:blipFill>
@@ -10174,16 +10192,16 @@
         </w:rPr>
         <w:lastRenderedPageBreak/>
         <w:drawing>
-          <wp:inline distT="0" distB="0" distL="0" distR="0" wp14:anchorId="4C7BBC81" wp14:editId="5F134AEB">
+          <wp:inline distT="0" distB="0" distL="0" distR="0" wp14:anchorId="6030AE88" wp14:editId="4FB28D69">
             <wp:extent cx="5120640" cy="4627581"/>
             <wp:effectExtent l="19050" t="19050" r="22860" b="20955"/>
-            <wp:docPr id="2119875759" name="Imagem 8"/>
+            <wp:docPr id="7938079" name="Imagem 8"/>
             <wp:cNvGraphicFramePr/>
             <a:graphic xmlns:a="http://schemas.openxmlformats.org/drawingml/2006/main">
               <a:graphicData uri="http://schemas.openxmlformats.org/drawingml/2006/picture">
                 <pic:pic xmlns:pic="http://schemas.openxmlformats.org/drawingml/2006/picture">
                   <pic:nvPicPr>
-                    <pic:cNvPr id="2119875759" name=""/>
+                    <pic:cNvPr id="7938079" name=""/>
                     <pic:cNvPicPr/>
                   </pic:nvPicPr>
                   <pic:blipFill>
@@ -10391,7 +10409,7 @@
           <w:sz w:val="27"/>
         </w:rPr>
       </w:pPr>
-      <w:bookmarkStart w:id="21" w:name="_Toc240273022"/>
+      <w:bookmarkStart w:id="21" w:name="_Toc240274124"/>
       <w:r>
         <w:rPr>
           <w:rFonts w:ascii="Montserrat" w:hAnsi="Montserrat"/>
@@ -11316,16 +11334,16 @@
           <w:noProof/>
         </w:rPr>
         <w:drawing>
-          <wp:inline distT="0" distB="0" distL="0" distR="0" wp14:anchorId="73914A81" wp14:editId="54D07978">
+          <wp:inline distT="0" distB="0" distL="0" distR="0" wp14:anchorId="64380455" wp14:editId="47544E5E">
             <wp:extent cx="5120640" cy="4627581"/>
             <wp:effectExtent l="19050" t="19050" r="22860" b="20955"/>
-            <wp:docPr id="1426034607" name="Imagem 9"/>
+            <wp:docPr id="1788256600" name="Imagem 9"/>
             <wp:cNvGraphicFramePr/>
             <a:graphic xmlns:a="http://schemas.openxmlformats.org/drawingml/2006/main">
               <a:graphicData uri="http://schemas.openxmlformats.org/drawingml/2006/picture">
                 <pic:pic xmlns:pic="http://schemas.openxmlformats.org/drawingml/2006/picture">
                   <pic:nvPicPr>
-                    <pic:cNvPr id="1426034607" name=""/>
+                    <pic:cNvPr id="1788256600" name=""/>
                     <pic:cNvPicPr/>
                   </pic:nvPicPr>
                   <pic:blipFill>
@@ -11393,16 +11411,16 @@
         </w:rPr>
         <w:lastRenderedPageBreak/>
         <w:drawing>
-          <wp:inline distT="0" distB="0" distL="0" distR="0" wp14:anchorId="19BFF35C" wp14:editId="3CF4176D">
+          <wp:inline distT="0" distB="0" distL="0" distR="0" wp14:anchorId="31E30CEF" wp14:editId="18E63944">
             <wp:extent cx="5120640" cy="4627581"/>
             <wp:effectExtent l="19050" t="19050" r="22860" b="20955"/>
-            <wp:docPr id="264034636" name="Imagem 10"/>
+            <wp:docPr id="997255079" name="Imagem 10"/>
             <wp:cNvGraphicFramePr/>
             <a:graphic xmlns:a="http://schemas.openxmlformats.org/drawingml/2006/main">
               <a:graphicData uri="http://schemas.openxmlformats.org/drawingml/2006/picture">
                 <pic:pic xmlns:pic="http://schemas.openxmlformats.org/drawingml/2006/picture">
                   <pic:nvPicPr>
-                    <pic:cNvPr id="264034636" name=""/>
+                    <pic:cNvPr id="997255079" name=""/>
                     <pic:cNvPicPr/>
                   </pic:nvPicPr>
                   <pic:blipFill>
@@ -11536,7 +11554,7 @@
           <w:sz w:val="27"/>
         </w:rPr>
       </w:pPr>
-      <w:bookmarkStart w:id="22" w:name="_Toc240273023"/>
+      <w:bookmarkStart w:id="22" w:name="_Toc240274125"/>
       <w:r>
         <w:rPr>
           <w:rFonts w:ascii="Montserrat" w:hAnsi="Montserrat"/>
@@ -12602,16 +12620,16 @@
           <w:noProof/>
         </w:rPr>
         <w:drawing>
-          <wp:inline distT="0" distB="0" distL="0" distR="0" wp14:anchorId="5A6FB1EA" wp14:editId="0DF0E938">
+          <wp:inline distT="0" distB="0" distL="0" distR="0" wp14:anchorId="75DC1DA1" wp14:editId="77F36441">
             <wp:extent cx="5120640" cy="3338440"/>
             <wp:effectExtent l="19050" t="19050" r="22860" b="14605"/>
-            <wp:docPr id="2071947788" name="Imagem 11"/>
+            <wp:docPr id="1497066616" name="Imagem 11"/>
             <wp:cNvGraphicFramePr/>
             <a:graphic xmlns:a="http://schemas.openxmlformats.org/drawingml/2006/main">
               <a:graphicData uri="http://schemas.openxmlformats.org/drawingml/2006/picture">
                 <pic:pic xmlns:pic="http://schemas.openxmlformats.org/drawingml/2006/picture">
                   <pic:nvPicPr>
-                    <pic:cNvPr id="2071947788" name=""/>
+                    <pic:cNvPr id="1497066616" name=""/>
                     <pic:cNvPicPr/>
                   </pic:nvPicPr>
                   <pic:blipFill>
@@ -12679,16 +12697,16 @@
         </w:rPr>
         <w:lastRenderedPageBreak/>
         <w:drawing>
-          <wp:inline distT="0" distB="0" distL="0" distR="0" wp14:anchorId="469CAD8E" wp14:editId="509EB995">
+          <wp:inline distT="0" distB="0" distL="0" distR="0" wp14:anchorId="7623D016" wp14:editId="75928151">
             <wp:extent cx="5120640" cy="4627581"/>
             <wp:effectExtent l="19050" t="19050" r="22860" b="20955"/>
-            <wp:docPr id="793886308" name="Imagem 12"/>
+            <wp:docPr id="1176866289" name="Imagem 12"/>
             <wp:cNvGraphicFramePr/>
             <a:graphic xmlns:a="http://schemas.openxmlformats.org/drawingml/2006/main">
               <a:graphicData uri="http://schemas.openxmlformats.org/drawingml/2006/picture">
                 <pic:pic xmlns:pic="http://schemas.openxmlformats.org/drawingml/2006/picture">
                   <pic:nvPicPr>
-                    <pic:cNvPr id="793886308" name=""/>
+                    <pic:cNvPr id="1176866289" name=""/>
                     <pic:cNvPicPr/>
                   </pic:nvPicPr>
                   <pic:blipFill>
@@ -12892,7 +12910,7 @@
           <w:sz w:val="27"/>
         </w:rPr>
       </w:pPr>
-      <w:bookmarkStart w:id="23" w:name="_Toc240273024"/>
+      <w:bookmarkStart w:id="23" w:name="_Toc240274126"/>
       <w:r>
         <w:rPr>
           <w:rFonts w:ascii="Montserrat" w:hAnsi="Montserrat"/>
@@ -13453,16 +13471,16 @@
           <w:noProof/>
         </w:rPr>
         <w:drawing>
-          <wp:inline distT="0" distB="0" distL="0" distR="0" wp14:anchorId="25104844" wp14:editId="78B2EAC1">
+          <wp:inline distT="0" distB="0" distL="0" distR="0" wp14:anchorId="5713F115" wp14:editId="2048A888">
             <wp:extent cx="5120640" cy="4627581"/>
             <wp:effectExtent l="19050" t="19050" r="22860" b="20955"/>
-            <wp:docPr id="1819239155" name="Imagem 13"/>
+            <wp:docPr id="160206885" name="Imagem 13"/>
             <wp:cNvGraphicFramePr/>
             <a:graphic xmlns:a="http://schemas.openxmlformats.org/drawingml/2006/main">
               <a:graphicData uri="http://schemas.openxmlformats.org/drawingml/2006/picture">
                 <pic:pic xmlns:pic="http://schemas.openxmlformats.org/drawingml/2006/picture">
                   <pic:nvPicPr>
-                    <pic:cNvPr id="1819239155" name=""/>
+                    <pic:cNvPr id="160206885" name=""/>
                     <pic:cNvPicPr/>
                   </pic:nvPicPr>
                   <pic:blipFill>
@@ -13530,16 +13548,16 @@
         </w:rPr>
         <w:lastRenderedPageBreak/>
         <w:drawing>
-          <wp:inline distT="0" distB="0" distL="0" distR="0" wp14:anchorId="39EDF35F" wp14:editId="7E068887">
+          <wp:inline distT="0" distB="0" distL="0" distR="0" wp14:anchorId="5E270B2D" wp14:editId="5108FA58">
             <wp:extent cx="5120640" cy="4627581"/>
             <wp:effectExtent l="19050" t="19050" r="22860" b="20955"/>
-            <wp:docPr id="502262728" name="Imagem 14"/>
+            <wp:docPr id="2043860408" name="Imagem 14"/>
             <wp:cNvGraphicFramePr/>
             <a:graphic xmlns:a="http://schemas.openxmlformats.org/drawingml/2006/main">
               <a:graphicData uri="http://schemas.openxmlformats.org/drawingml/2006/picture">
                 <pic:pic xmlns:pic="http://schemas.openxmlformats.org/drawingml/2006/picture">
                   <pic:nvPicPr>
-                    <pic:cNvPr id="502262728" name=""/>
+                    <pic:cNvPr id="2043860408" name=""/>
                     <pic:cNvPicPr/>
                   </pic:nvPicPr>
                   <pic:blipFill>
@@ -13752,7 +13770,7 @@
           <w:color w:val="1A1A1A"/>
           <w:sz w:val="22"/>
         </w:rPr>
-        <w:t>Tarefas dentro de um marco: quando um marco precisar de mais detalhe, o botao + Tarefas (ultima coluna da tabela) abre uma lista simples logo abaixo da linha - nome da tarefa e uma caixa de concluida, sem data ou responsavel proprios (quem tem isso e o marco). O botao muda para Tarefas (2/3), por exemplo, mostrando quantas ja foram concluidas, e fica com contorno laranja enquanto houver alguma pendente. E totalmente opcional - um marco sem nenhuma tarefa continua funcionando normalmente.</w:t>
+        <w:t>Tarefas dentro de um marco: quando um marco precisar de mais detalhe, o botao + Tarefas (ultima coluna da tabela) abre uma lista simples logo abaixo da linha - nome da tarefa e uma caixa de concluida, sem data ou responsavel proprios (quem tem isso e o marco). O botao muda para Tarefas (2/3), por exemplo, mostrando quantas ja foram concluidas, e fica com contorno laranja enquanto houver alguma pendente. E totalmente opcional - um marco sem nenhuma tarefa continua funcionando normalmente. Ao lado do botao + Adicionar linha, um resumo mostra o percentual de tarefas concluidas somando todos os marcos do cronograma.</w:t>
       </w:r>
     </w:p>
     <w:p>
@@ -13776,16 +13794,8 @@
           <w:color w:val="1A1A1A"/>
           <w:sz w:val="22"/>
         </w:rPr>
-        <w:t xml:space="preserve">Assistente de preenchimento por IA: apos selecionar o Projeto vinculado, o botao Sugerir com IA le a Solicitacao de Demanda, o TAP, o Canvas e as </w:t>
-      </w:r>
-      <w:r>
-        <w:rPr>
-          <w:rFonts w:ascii="Montserrat" w:hAnsi="Montserrat"/>
-          <w:color w:val="1A1A1A"/>
-          <w:sz w:val="22"/>
-        </w:rPr>
         <w:lastRenderedPageBreak/>
-        <w:t>Atas de Reuniao do projeto e sugere o Solicitante (capa), o preenchimento da aba Pre-projeto (incluindo Macro fases, resumidas dos entregaveis/escopo do TAP), um rascunho inicial do cronograma (aba 3, quando ainda vazio) e a Introducao/Situacao atual/Proposta de mudanca/Beneficios na aba Viabilidade. O campo Negocio (capa) fica de fora, por nao ter fonte confiavel nos documentos (secao 2.12).</w:t>
+        <w:t>Assistente de preenchimento por IA: apos selecionar o Projeto vinculado, o botao Sugerir com IA le a Solicitacao de Demanda, o TAP, o Canvas e as Atas de Reuniao do projeto e sugere o Solicitante (capa), o preenchimento da aba Pre-projeto (incluindo Macro fases, resumidas dos entregaveis/escopo do TAP), um rascunho inicial do cronograma (aba 3, quando ainda vazio) e a Introducao/Situacao atual/Proposta de mudanca/Beneficios na aba Viabilidade. O campo Negocio (capa) fica de fora, por nao ter fonte confiavel nos documentos (secao 2.12).</w:t>
       </w:r>
     </w:p>
     <w:p>
@@ -13799,7 +13809,7 @@
           <w:sz w:val="27"/>
         </w:rPr>
       </w:pPr>
-      <w:bookmarkStart w:id="24" w:name="_Toc240273025"/>
+      <w:bookmarkStart w:id="24" w:name="_Toc240274127"/>
       <w:r>
         <w:rPr>
           <w:rFonts w:ascii="Montserrat" w:hAnsi="Montserrat"/>
@@ -13839,16 +13849,16 @@
           <w:noProof/>
         </w:rPr>
         <w:drawing>
-          <wp:inline distT="0" distB="0" distL="0" distR="0" wp14:anchorId="6B73619A" wp14:editId="30151D36">
+          <wp:inline distT="0" distB="0" distL="0" distR="0" wp14:anchorId="29105E5F" wp14:editId="3C4E599A">
             <wp:extent cx="5120640" cy="4627581"/>
             <wp:effectExtent l="19050" t="19050" r="22860" b="20955"/>
-            <wp:docPr id="432038931" name="Imagem 15"/>
+            <wp:docPr id="1214562771" name="Imagem 15"/>
             <wp:cNvGraphicFramePr/>
             <a:graphic xmlns:a="http://schemas.openxmlformats.org/drawingml/2006/main">
               <a:graphicData uri="http://schemas.openxmlformats.org/drawingml/2006/picture">
                 <pic:pic xmlns:pic="http://schemas.openxmlformats.org/drawingml/2006/picture">
                   <pic:nvPicPr>
-                    <pic:cNvPr id="432038931" name=""/>
+                    <pic:cNvPr id="1214562771" name=""/>
                     <pic:cNvPicPr/>
                   </pic:nvPicPr>
                   <pic:blipFill>
@@ -13916,16 +13926,16 @@
         </w:rPr>
         <w:lastRenderedPageBreak/>
         <w:drawing>
-          <wp:inline distT="0" distB="0" distL="0" distR="0" wp14:anchorId="01939227" wp14:editId="39AC6263">
+          <wp:inline distT="0" distB="0" distL="0" distR="0" wp14:anchorId="49A9C470" wp14:editId="172E1BCF">
             <wp:extent cx="5120640" cy="4627581"/>
             <wp:effectExtent l="19050" t="19050" r="22860" b="20955"/>
-            <wp:docPr id="56770420" name="Imagem 16"/>
+            <wp:docPr id="54522264" name="Imagem 16"/>
             <wp:cNvGraphicFramePr/>
             <a:graphic xmlns:a="http://schemas.openxmlformats.org/drawingml/2006/main">
               <a:graphicData uri="http://schemas.openxmlformats.org/drawingml/2006/picture">
                 <pic:pic xmlns:pic="http://schemas.openxmlformats.org/drawingml/2006/picture">
                   <pic:nvPicPr>
-                    <pic:cNvPr id="56770420" name=""/>
+                    <pic:cNvPr id="54522264" name=""/>
                     <pic:cNvPicPr/>
                   </pic:nvPicPr>
                   <pic:blipFill>
@@ -14089,16 +14099,16 @@
         </w:rPr>
         <w:lastRenderedPageBreak/>
         <w:drawing>
-          <wp:inline distT="0" distB="0" distL="0" distR="0" wp14:anchorId="7F4D3097" wp14:editId="007C72D3">
+          <wp:inline distT="0" distB="0" distL="0" distR="0" wp14:anchorId="62A67B17" wp14:editId="7598DFBC">
             <wp:extent cx="5120640" cy="3282818"/>
             <wp:effectExtent l="19050" t="19050" r="22860" b="13335"/>
-            <wp:docPr id="1462588455" name="Imagem 17"/>
+            <wp:docPr id="1807411149" name="Imagem 17"/>
             <wp:cNvGraphicFramePr/>
             <a:graphic xmlns:a="http://schemas.openxmlformats.org/drawingml/2006/main">
               <a:graphicData uri="http://schemas.openxmlformats.org/drawingml/2006/picture">
                 <pic:pic xmlns:pic="http://schemas.openxmlformats.org/drawingml/2006/picture">
                   <pic:nvPicPr>
-                    <pic:cNvPr id="1462588455" name=""/>
+                    <pic:cNvPr id="1807411149" name=""/>
                     <pic:cNvPicPr/>
                   </pic:nvPicPr>
                   <pic:blipFill>
@@ -14289,7 +14299,7 @@
           <w:sz w:val="27"/>
         </w:rPr>
       </w:pPr>
-      <w:bookmarkStart w:id="25" w:name="_Toc240273026"/>
+      <w:bookmarkStart w:id="25" w:name="_Toc240274128"/>
       <w:r>
         <w:rPr>
           <w:rFonts w:ascii="Montserrat" w:hAnsi="Montserrat"/>
@@ -14329,16 +14339,16 @@
           <w:noProof/>
         </w:rPr>
         <w:drawing>
-          <wp:inline distT="0" distB="0" distL="0" distR="0" wp14:anchorId="7EAEF0AE" wp14:editId="74DC94B3">
+          <wp:inline distT="0" distB="0" distL="0" distR="0" wp14:anchorId="6F502C5B" wp14:editId="2D397EAA">
             <wp:extent cx="5120640" cy="4627581"/>
             <wp:effectExtent l="19050" t="19050" r="22860" b="20955"/>
-            <wp:docPr id="1993849305" name="Imagem 18"/>
+            <wp:docPr id="13754951" name="Imagem 18"/>
             <wp:cNvGraphicFramePr/>
             <a:graphic xmlns:a="http://schemas.openxmlformats.org/drawingml/2006/main">
               <a:graphicData uri="http://schemas.openxmlformats.org/drawingml/2006/picture">
                 <pic:pic xmlns:pic="http://schemas.openxmlformats.org/drawingml/2006/picture">
                   <pic:nvPicPr>
-                    <pic:cNvPr id="1993849305" name=""/>
+                    <pic:cNvPr id="13754951" name=""/>
                     <pic:cNvPicPr/>
                   </pic:nvPicPr>
                   <pic:blipFill>
@@ -14406,16 +14416,16 @@
         </w:rPr>
         <w:lastRenderedPageBreak/>
         <w:drawing>
-          <wp:inline distT="0" distB="0" distL="0" distR="0" wp14:anchorId="30EA343F" wp14:editId="35478DB9">
+          <wp:inline distT="0" distB="0" distL="0" distR="0" wp14:anchorId="46B9D86A" wp14:editId="7A7576F5">
             <wp:extent cx="5120640" cy="4627581"/>
             <wp:effectExtent l="19050" t="19050" r="22860" b="20955"/>
-            <wp:docPr id="493406443" name="Imagem 19"/>
+            <wp:docPr id="1244851144" name="Imagem 19"/>
             <wp:cNvGraphicFramePr/>
             <a:graphic xmlns:a="http://schemas.openxmlformats.org/drawingml/2006/main">
               <a:graphicData uri="http://schemas.openxmlformats.org/drawingml/2006/picture">
                 <pic:pic xmlns:pic="http://schemas.openxmlformats.org/drawingml/2006/picture">
                   <pic:nvPicPr>
-                    <pic:cNvPr id="493406443" name=""/>
+                    <pic:cNvPr id="1244851144" name=""/>
                     <pic:cNvPicPr/>
                   </pic:nvPicPr>
                   <pic:blipFill>
@@ -14598,7 +14608,7 @@
           <w:sz w:val="27"/>
         </w:rPr>
       </w:pPr>
-      <w:bookmarkStart w:id="26" w:name="_Toc240273027"/>
+      <w:bookmarkStart w:id="26" w:name="_Toc240274129"/>
       <w:r>
         <w:rPr>
           <w:rFonts w:ascii="Montserrat" w:hAnsi="Montserrat"/>
@@ -14638,16 +14648,16 @@
           <w:noProof/>
         </w:rPr>
         <w:drawing>
-          <wp:inline distT="0" distB="0" distL="0" distR="0" wp14:anchorId="73B87808" wp14:editId="370C49CF">
+          <wp:inline distT="0" distB="0" distL="0" distR="0" wp14:anchorId="5BA403AA" wp14:editId="4D8D8AF5">
             <wp:extent cx="5120640" cy="4627581"/>
             <wp:effectExtent l="19050" t="19050" r="22860" b="20955"/>
-            <wp:docPr id="768912268" name="Imagem 20"/>
+            <wp:docPr id="464430020" name="Imagem 20"/>
             <wp:cNvGraphicFramePr/>
             <a:graphic xmlns:a="http://schemas.openxmlformats.org/drawingml/2006/main">
               <a:graphicData uri="http://schemas.openxmlformats.org/drawingml/2006/picture">
                 <pic:pic xmlns:pic="http://schemas.openxmlformats.org/drawingml/2006/picture">
                   <pic:nvPicPr>
-                    <pic:cNvPr id="768912268" name=""/>
+                    <pic:cNvPr id="464430020" name=""/>
                     <pic:cNvPicPr/>
                   </pic:nvPicPr>
                   <pic:blipFill>
@@ -14715,16 +14725,16 @@
         </w:rPr>
         <w:lastRenderedPageBreak/>
         <w:drawing>
-          <wp:inline distT="0" distB="0" distL="0" distR="0" wp14:anchorId="4C2FCA84" wp14:editId="7CBE1604">
+          <wp:inline distT="0" distB="0" distL="0" distR="0" wp14:anchorId="6FD99EAB" wp14:editId="1397C59A">
             <wp:extent cx="5120640" cy="4627581"/>
             <wp:effectExtent l="19050" t="19050" r="22860" b="20955"/>
-            <wp:docPr id="641264765" name="Imagem 21"/>
+            <wp:docPr id="224077535" name="Imagem 21"/>
             <wp:cNvGraphicFramePr/>
             <a:graphic xmlns:a="http://schemas.openxmlformats.org/drawingml/2006/main">
               <a:graphicData uri="http://schemas.openxmlformats.org/drawingml/2006/picture">
                 <pic:pic xmlns:pic="http://schemas.openxmlformats.org/drawingml/2006/picture">
                   <pic:nvPicPr>
-                    <pic:cNvPr id="641264765" name=""/>
+                    <pic:cNvPr id="224077535" name=""/>
                     <pic:cNvPicPr/>
                   </pic:nvPicPr>
                   <pic:blipFill>
@@ -14930,16 +14940,16 @@
           <w:noProof/>
         </w:rPr>
         <w:drawing>
-          <wp:inline distT="0" distB="0" distL="0" distR="0" wp14:anchorId="47F29C72" wp14:editId="17FD7333">
+          <wp:inline distT="0" distB="0" distL="0" distR="0" wp14:anchorId="03AAD448" wp14:editId="53D52B48">
             <wp:extent cx="5120640" cy="1757287"/>
             <wp:effectExtent l="19050" t="19050" r="22860" b="14605"/>
-            <wp:docPr id="1267043313" name="Imagem 22"/>
+            <wp:docPr id="722778374" name="Imagem 22"/>
             <wp:cNvGraphicFramePr/>
             <a:graphic xmlns:a="http://schemas.openxmlformats.org/drawingml/2006/main">
               <a:graphicData uri="http://schemas.openxmlformats.org/drawingml/2006/picture">
                 <pic:pic xmlns:pic="http://schemas.openxmlformats.org/drawingml/2006/picture">
                   <pic:nvPicPr>
-                    <pic:cNvPr id="1267043313" name=""/>
+                    <pic:cNvPr id="722778374" name=""/>
                     <pic:cNvPicPr/>
                   </pic:nvPicPr>
                   <pic:blipFill>
@@ -15052,7 +15062,7 @@
           <w:sz w:val="27"/>
         </w:rPr>
       </w:pPr>
-      <w:bookmarkStart w:id="27" w:name="_Toc240273028"/>
+      <w:bookmarkStart w:id="27" w:name="_Toc240274130"/>
       <w:r>
         <w:rPr>
           <w:rFonts w:ascii="Montserrat" w:hAnsi="Montserrat"/>
@@ -15093,16 +15103,16 @@
         </w:rPr>
         <w:lastRenderedPageBreak/>
         <w:drawing>
-          <wp:inline distT="0" distB="0" distL="0" distR="0" wp14:anchorId="103E5D97" wp14:editId="238B8C6C">
+          <wp:inline distT="0" distB="0" distL="0" distR="0" wp14:anchorId="6FB20CDF" wp14:editId="3F5014EB">
             <wp:extent cx="5120640" cy="4627581"/>
             <wp:effectExtent l="19050" t="19050" r="22860" b="20955"/>
-            <wp:docPr id="2014002192" name="Imagem 23"/>
+            <wp:docPr id="474510234" name="Imagem 23"/>
             <wp:cNvGraphicFramePr/>
             <a:graphic xmlns:a="http://schemas.openxmlformats.org/drawingml/2006/main">
               <a:graphicData uri="http://schemas.openxmlformats.org/drawingml/2006/picture">
                 <pic:pic xmlns:pic="http://schemas.openxmlformats.org/drawingml/2006/picture">
                   <pic:nvPicPr>
-                    <pic:cNvPr id="2014002192" name=""/>
+                    <pic:cNvPr id="474510234" name=""/>
                     <pic:cNvPicPr/>
                   </pic:nvPicPr>
                   <pic:blipFill>
@@ -15170,16 +15180,16 @@
         </w:rPr>
         <w:lastRenderedPageBreak/>
         <w:drawing>
-          <wp:inline distT="0" distB="0" distL="0" distR="0" wp14:anchorId="380E062F" wp14:editId="672BA4BC">
+          <wp:inline distT="0" distB="0" distL="0" distR="0" wp14:anchorId="1CCECD48" wp14:editId="6AA47D49">
             <wp:extent cx="5120640" cy="4627581"/>
             <wp:effectExtent l="19050" t="19050" r="22860" b="20955"/>
-            <wp:docPr id="1660137531" name="Imagem 24"/>
+            <wp:docPr id="1259417313" name="Imagem 24"/>
             <wp:cNvGraphicFramePr/>
             <a:graphic xmlns:a="http://schemas.openxmlformats.org/drawingml/2006/main">
               <a:graphicData uri="http://schemas.openxmlformats.org/drawingml/2006/picture">
                 <pic:pic xmlns:pic="http://schemas.openxmlformats.org/drawingml/2006/picture">
                   <pic:nvPicPr>
-                    <pic:cNvPr id="1660137531" name=""/>
+                    <pic:cNvPr id="1259417313" name=""/>
                     <pic:cNvPicPr/>
                   </pic:nvPicPr>
                   <pic:blipFill>
@@ -15416,7 +15426,7 @@
           <w:sz w:val="27"/>
         </w:rPr>
       </w:pPr>
-      <w:bookmarkStart w:id="28" w:name="_Toc240273029"/>
+      <w:bookmarkStart w:id="28" w:name="_Toc240274131"/>
       <w:r>
         <w:rPr>
           <w:rFonts w:ascii="Montserrat" w:hAnsi="Montserrat"/>
@@ -15456,16 +15466,16 @@
           <w:noProof/>
         </w:rPr>
         <w:drawing>
-          <wp:inline distT="0" distB="0" distL="0" distR="0" wp14:anchorId="678EAF5E" wp14:editId="7136BA8E">
+          <wp:inline distT="0" distB="0" distL="0" distR="0" wp14:anchorId="22413437" wp14:editId="19E4C036">
             <wp:extent cx="5120640" cy="4627581"/>
             <wp:effectExtent l="19050" t="19050" r="22860" b="20955"/>
-            <wp:docPr id="949326298" name="Imagem 25"/>
+            <wp:docPr id="644890361" name="Imagem 25"/>
             <wp:cNvGraphicFramePr/>
             <a:graphic xmlns:a="http://schemas.openxmlformats.org/drawingml/2006/main">
               <a:graphicData uri="http://schemas.openxmlformats.org/drawingml/2006/picture">
                 <pic:pic xmlns:pic="http://schemas.openxmlformats.org/drawingml/2006/picture">
                   <pic:nvPicPr>
-                    <pic:cNvPr id="949326298" name=""/>
+                    <pic:cNvPr id="644890361" name=""/>
                     <pic:cNvPicPr/>
                   </pic:nvPicPr>
                   <pic:blipFill>
@@ -15533,16 +15543,16 @@
         </w:rPr>
         <w:lastRenderedPageBreak/>
         <w:drawing>
-          <wp:inline distT="0" distB="0" distL="0" distR="0" wp14:anchorId="7E8BB937" wp14:editId="358A002C">
+          <wp:inline distT="0" distB="0" distL="0" distR="0" wp14:anchorId="572E3438" wp14:editId="1EA06F33">
             <wp:extent cx="5120640" cy="4627581"/>
             <wp:effectExtent l="19050" t="19050" r="22860" b="20955"/>
-            <wp:docPr id="2071574274" name="Imagem 26"/>
+            <wp:docPr id="178377308" name="Imagem 26"/>
             <wp:cNvGraphicFramePr/>
             <a:graphic xmlns:a="http://schemas.openxmlformats.org/drawingml/2006/main">
               <a:graphicData uri="http://schemas.openxmlformats.org/drawingml/2006/picture">
                 <pic:pic xmlns:pic="http://schemas.openxmlformats.org/drawingml/2006/picture">
                   <pic:nvPicPr>
-                    <pic:cNvPr id="2071574274" name=""/>
+                    <pic:cNvPr id="178377308" name=""/>
                     <pic:cNvPicPr/>
                   </pic:nvPicPr>
                   <pic:blipFill>
@@ -15733,7 +15743,7 @@
           <w:sz w:val="27"/>
         </w:rPr>
       </w:pPr>
-      <w:bookmarkStart w:id="29" w:name="_Toc240273030"/>
+      <w:bookmarkStart w:id="29" w:name="_Toc240274132"/>
       <w:r>
         <w:rPr>
           <w:rFonts w:ascii="Montserrat" w:hAnsi="Montserrat"/>
@@ -15773,16 +15783,16 @@
           <w:noProof/>
         </w:rPr>
         <w:drawing>
-          <wp:inline distT="0" distB="0" distL="0" distR="0" wp14:anchorId="276FE48F" wp14:editId="737E2B6D">
+          <wp:inline distT="0" distB="0" distL="0" distR="0" wp14:anchorId="5821E253" wp14:editId="02B37B9A">
             <wp:extent cx="5120640" cy="4000682"/>
             <wp:effectExtent l="19050" t="19050" r="22860" b="19050"/>
-            <wp:docPr id="1490569739" name="Imagem 27"/>
+            <wp:docPr id="626713925" name="Imagem 27"/>
             <wp:cNvGraphicFramePr/>
             <a:graphic xmlns:a="http://schemas.openxmlformats.org/drawingml/2006/main">
               <a:graphicData uri="http://schemas.openxmlformats.org/drawingml/2006/picture">
                 <pic:pic xmlns:pic="http://schemas.openxmlformats.org/drawingml/2006/picture">
                   <pic:nvPicPr>
-                    <pic:cNvPr id="1490569739" name=""/>
+                    <pic:cNvPr id="626713925" name=""/>
                     <pic:cNvPicPr/>
                   </pic:nvPicPr>
                   <pic:blipFill>
@@ -16306,7 +16316,7 @@
           <w:sz w:val="34"/>
         </w:rPr>
       </w:pPr>
-      <w:bookmarkStart w:id="30" w:name="_Toc240273031"/>
+      <w:bookmarkStart w:id="30" w:name="_Toc240274133"/>
       <w:r>
         <w:rPr>
           <w:rFonts w:ascii="Montserrat" w:hAnsi="Montserrat"/>
@@ -16348,7 +16358,7 @@
           <w:sz w:val="27"/>
         </w:rPr>
       </w:pPr>
-      <w:bookmarkStart w:id="31" w:name="_Toc240273032"/>
+      <w:bookmarkStart w:id="31" w:name="_Toc240274134"/>
       <w:r>
         <w:rPr>
           <w:rFonts w:ascii="Montserrat" w:hAnsi="Montserrat"/>
@@ -16388,16 +16398,16 @@
           <w:noProof/>
         </w:rPr>
         <w:drawing>
-          <wp:inline distT="0" distB="0" distL="0" distR="0" wp14:anchorId="7498DE04" wp14:editId="03DB45A7">
+          <wp:inline distT="0" distB="0" distL="0" distR="0" wp14:anchorId="2E657728" wp14:editId="7C8E7B49">
             <wp:extent cx="5120640" cy="4627581"/>
             <wp:effectExtent l="19050" t="19050" r="22860" b="20955"/>
-            <wp:docPr id="1866758044" name="Imagem 28"/>
+            <wp:docPr id="693246389" name="Imagem 28"/>
             <wp:cNvGraphicFramePr/>
             <a:graphic xmlns:a="http://schemas.openxmlformats.org/drawingml/2006/main">
               <a:graphicData uri="http://schemas.openxmlformats.org/drawingml/2006/picture">
                 <pic:pic xmlns:pic="http://schemas.openxmlformats.org/drawingml/2006/picture">
                   <pic:nvPicPr>
-                    <pic:cNvPr id="1866758044" name=""/>
+                    <pic:cNvPr id="693246389" name=""/>
                     <pic:cNvPicPr/>
                   </pic:nvPicPr>
                   <pic:blipFill>
@@ -16465,16 +16475,16 @@
         </w:rPr>
         <w:lastRenderedPageBreak/>
         <w:drawing>
-          <wp:inline distT="0" distB="0" distL="0" distR="0" wp14:anchorId="3DBE1894" wp14:editId="6FA2F20D">
+          <wp:inline distT="0" distB="0" distL="0" distR="0" wp14:anchorId="4397799F" wp14:editId="34961003">
             <wp:extent cx="5120640" cy="4627581"/>
             <wp:effectExtent l="19050" t="19050" r="22860" b="20955"/>
-            <wp:docPr id="836383561" name="Imagem 29"/>
+            <wp:docPr id="2048938934" name="Imagem 29"/>
             <wp:cNvGraphicFramePr/>
             <a:graphic xmlns:a="http://schemas.openxmlformats.org/drawingml/2006/main">
               <a:graphicData uri="http://schemas.openxmlformats.org/drawingml/2006/picture">
                 <pic:pic xmlns:pic="http://schemas.openxmlformats.org/drawingml/2006/picture">
                   <pic:nvPicPr>
-                    <pic:cNvPr id="836383561" name=""/>
+                    <pic:cNvPr id="2048938934" name=""/>
                     <pic:cNvPicPr/>
                   </pic:nvPicPr>
                   <pic:blipFill>
@@ -16542,16 +16552,16 @@
         </w:rPr>
         <w:lastRenderedPageBreak/>
         <w:drawing>
-          <wp:inline distT="0" distB="0" distL="0" distR="0" wp14:anchorId="0A998001" wp14:editId="231E1A70">
+          <wp:inline distT="0" distB="0" distL="0" distR="0" wp14:anchorId="01FC8DAF" wp14:editId="21814AEB">
             <wp:extent cx="5120640" cy="4627581"/>
             <wp:effectExtent l="19050" t="19050" r="22860" b="20955"/>
-            <wp:docPr id="455794968" name="Imagem 30"/>
+            <wp:docPr id="1938740622" name="Imagem 30"/>
             <wp:cNvGraphicFramePr/>
             <a:graphic xmlns:a="http://schemas.openxmlformats.org/drawingml/2006/main">
               <a:graphicData uri="http://schemas.openxmlformats.org/drawingml/2006/picture">
                 <pic:pic xmlns:pic="http://schemas.openxmlformats.org/drawingml/2006/picture">
                   <pic:nvPicPr>
-                    <pic:cNvPr id="455794968" name=""/>
+                    <pic:cNvPr id="1938740622" name=""/>
                     <pic:cNvPicPr/>
                   </pic:nvPicPr>
                   <pic:blipFill>
@@ -16753,16 +16763,16 @@
           <w:noProof/>
         </w:rPr>
         <w:drawing>
-          <wp:inline distT="0" distB="0" distL="0" distR="0" wp14:anchorId="1882B780" wp14:editId="16485963">
+          <wp:inline distT="0" distB="0" distL="0" distR="0" wp14:anchorId="474AE071" wp14:editId="67191DBA">
             <wp:extent cx="5120640" cy="1715571"/>
             <wp:effectExtent l="19050" t="19050" r="22860" b="18415"/>
-            <wp:docPr id="1365738868" name="Imagem 31"/>
+            <wp:docPr id="934688444" name="Imagem 31"/>
             <wp:cNvGraphicFramePr/>
             <a:graphic xmlns:a="http://schemas.openxmlformats.org/drawingml/2006/main">
               <a:graphicData uri="http://schemas.openxmlformats.org/drawingml/2006/picture">
                 <pic:pic xmlns:pic="http://schemas.openxmlformats.org/drawingml/2006/picture">
                   <pic:nvPicPr>
-                    <pic:cNvPr id="1365738868" name=""/>
+                    <pic:cNvPr id="934688444" name=""/>
                     <pic:cNvPicPr/>
                   </pic:nvPicPr>
                   <pic:blipFill>
@@ -16899,16 +16909,16 @@
           <w:noProof/>
         </w:rPr>
         <w:drawing>
-          <wp:inline distT="0" distB="0" distL="0" distR="0" wp14:anchorId="3E9D55F9" wp14:editId="427E6621">
+          <wp:inline distT="0" distB="0" distL="0" distR="0" wp14:anchorId="346E724E" wp14:editId="068EFD47">
             <wp:extent cx="5120640" cy="3282818"/>
             <wp:effectExtent l="19050" t="19050" r="22860" b="13335"/>
-            <wp:docPr id="1561426651" name="Imagem 32"/>
+            <wp:docPr id="801260604" name="Imagem 32"/>
             <wp:cNvGraphicFramePr/>
             <a:graphic xmlns:a="http://schemas.openxmlformats.org/drawingml/2006/main">
               <a:graphicData uri="http://schemas.openxmlformats.org/drawingml/2006/picture">
                 <pic:pic xmlns:pic="http://schemas.openxmlformats.org/drawingml/2006/picture">
                   <pic:nvPicPr>
-                    <pic:cNvPr id="1561426651" name=""/>
+                    <pic:cNvPr id="801260604" name=""/>
                     <pic:cNvPicPr/>
                   </pic:nvPicPr>
                   <pic:blipFill>
@@ -17042,16 +17052,16 @@
           <w:noProof/>
         </w:rPr>
         <w:drawing>
-          <wp:inline distT="0" distB="0" distL="0" distR="0" wp14:anchorId="3F053971" wp14:editId="154FB8FA">
+          <wp:inline distT="0" distB="0" distL="0" distR="0" wp14:anchorId="7EF09BFE" wp14:editId="5034E962">
             <wp:extent cx="5120640" cy="951357"/>
             <wp:effectExtent l="19050" t="19050" r="22860" b="20320"/>
-            <wp:docPr id="827840657" name="Imagem 33"/>
+            <wp:docPr id="935809322" name="Imagem 33"/>
             <wp:cNvGraphicFramePr/>
             <a:graphic xmlns:a="http://schemas.openxmlformats.org/drawingml/2006/main">
               <a:graphicData uri="http://schemas.openxmlformats.org/drawingml/2006/picture">
                 <pic:pic xmlns:pic="http://schemas.openxmlformats.org/drawingml/2006/picture">
                   <pic:nvPicPr>
-                    <pic:cNvPr id="827840657" name=""/>
+                    <pic:cNvPr id="935809322" name=""/>
                     <pic:cNvPicPr/>
                   </pic:nvPicPr>
                   <pic:blipFill>
@@ -17163,16 +17173,16 @@
           <w:noProof/>
         </w:rPr>
         <w:drawing>
-          <wp:inline distT="0" distB="0" distL="0" distR="0" wp14:anchorId="385E678F" wp14:editId="096833DF">
+          <wp:inline distT="0" distB="0" distL="0" distR="0" wp14:anchorId="0514AD0B" wp14:editId="5A380017">
             <wp:extent cx="5120640" cy="1515102"/>
             <wp:effectExtent l="19050" t="19050" r="22860" b="28575"/>
-            <wp:docPr id="641833573" name="Imagem 34"/>
+            <wp:docPr id="1860177679" name="Imagem 34"/>
             <wp:cNvGraphicFramePr/>
             <a:graphic xmlns:a="http://schemas.openxmlformats.org/drawingml/2006/main">
               <a:graphicData uri="http://schemas.openxmlformats.org/drawingml/2006/picture">
                 <pic:pic xmlns:pic="http://schemas.openxmlformats.org/drawingml/2006/picture">
                   <pic:nvPicPr>
-                    <pic:cNvPr id="641833573" name=""/>
+                    <pic:cNvPr id="1860177679" name=""/>
                     <pic:cNvPicPr/>
                   </pic:nvPicPr>
                   <pic:blipFill>
@@ -17285,16 +17295,16 @@
           <w:noProof/>
         </w:rPr>
         <w:drawing>
-          <wp:inline distT="0" distB="0" distL="0" distR="0" wp14:anchorId="5454B385" wp14:editId="17588E26">
+          <wp:inline distT="0" distB="0" distL="0" distR="0" wp14:anchorId="5E566869" wp14:editId="596F24B8">
             <wp:extent cx="5120640" cy="1391113"/>
             <wp:effectExtent l="19050" t="19050" r="22860" b="19050"/>
-            <wp:docPr id="1873422028" name="Imagem 35"/>
+            <wp:docPr id="1398143445" name="Imagem 35"/>
             <wp:cNvGraphicFramePr/>
             <a:graphic xmlns:a="http://schemas.openxmlformats.org/drawingml/2006/main">
               <a:graphicData uri="http://schemas.openxmlformats.org/drawingml/2006/picture">
                 <pic:pic xmlns:pic="http://schemas.openxmlformats.org/drawingml/2006/picture">
                   <pic:nvPicPr>
-                    <pic:cNvPr id="1873422028" name=""/>
+                    <pic:cNvPr id="1398143445" name=""/>
                     <pic:cNvPicPr/>
                   </pic:nvPicPr>
                   <pic:blipFill>
@@ -17406,16 +17416,16 @@
           <w:noProof/>
         </w:rPr>
         <w:drawing>
-          <wp:inline distT="0" distB="0" distL="0" distR="0" wp14:anchorId="050E6322" wp14:editId="07252776">
+          <wp:inline distT="0" distB="0" distL="0" distR="0" wp14:anchorId="100E1E6F" wp14:editId="6C38DD3C">
             <wp:extent cx="5120640" cy="1125174"/>
             <wp:effectExtent l="19050" t="19050" r="22860" b="18415"/>
-            <wp:docPr id="2092549791" name="Imagem 36"/>
+            <wp:docPr id="1296784826" name="Imagem 36"/>
             <wp:cNvGraphicFramePr/>
             <a:graphic xmlns:a="http://schemas.openxmlformats.org/drawingml/2006/main">
               <a:graphicData uri="http://schemas.openxmlformats.org/drawingml/2006/picture">
                 <pic:pic xmlns:pic="http://schemas.openxmlformats.org/drawingml/2006/picture">
                   <pic:nvPicPr>
-                    <pic:cNvPr id="2092549791" name=""/>
+                    <pic:cNvPr id="1296784826" name=""/>
                     <pic:cNvPicPr/>
                   </pic:nvPicPr>
                   <pic:blipFill>
@@ -17505,7 +17515,7 @@
           <w:sz w:val="27"/>
         </w:rPr>
       </w:pPr>
-      <w:bookmarkStart w:id="32" w:name="_Toc240273033"/>
+      <w:bookmarkStart w:id="32" w:name="_Toc240274135"/>
       <w:r>
         <w:rPr>
           <w:rFonts w:ascii="Montserrat" w:hAnsi="Montserrat"/>
@@ -17545,16 +17555,16 @@
           <w:noProof/>
         </w:rPr>
         <w:drawing>
-          <wp:inline distT="0" distB="0" distL="0" distR="0" wp14:anchorId="2239D2D4" wp14:editId="41C78BEA">
+          <wp:inline distT="0" distB="0" distL="0" distR="0" wp14:anchorId="36B6CA51" wp14:editId="2EF45A5C">
             <wp:extent cx="5120640" cy="4627581"/>
             <wp:effectExtent l="19050" t="19050" r="22860" b="20955"/>
-            <wp:docPr id="1301434274" name="Imagem 37"/>
+            <wp:docPr id="729885765" name="Imagem 37"/>
             <wp:cNvGraphicFramePr/>
             <a:graphic xmlns:a="http://schemas.openxmlformats.org/drawingml/2006/main">
               <a:graphicData uri="http://schemas.openxmlformats.org/drawingml/2006/picture">
                 <pic:pic xmlns:pic="http://schemas.openxmlformats.org/drawingml/2006/picture">
                   <pic:nvPicPr>
-                    <pic:cNvPr id="1301434274" name=""/>
+                    <pic:cNvPr id="729885765" name=""/>
                     <pic:cNvPicPr/>
                   </pic:nvPicPr>
                   <pic:blipFill>
@@ -17622,16 +17632,16 @@
         </w:rPr>
         <w:lastRenderedPageBreak/>
         <w:drawing>
-          <wp:inline distT="0" distB="0" distL="0" distR="0" wp14:anchorId="4892D95A" wp14:editId="1F3FC9C1">
+          <wp:inline distT="0" distB="0" distL="0" distR="0" wp14:anchorId="6368F047" wp14:editId="24604EC6">
             <wp:extent cx="5120640" cy="4627581"/>
             <wp:effectExtent l="19050" t="19050" r="22860" b="20955"/>
-            <wp:docPr id="2017366057" name="Imagem 38"/>
+            <wp:docPr id="2058562116" name="Imagem 38"/>
             <wp:cNvGraphicFramePr/>
             <a:graphic xmlns:a="http://schemas.openxmlformats.org/drawingml/2006/main">
               <a:graphicData uri="http://schemas.openxmlformats.org/drawingml/2006/picture">
                 <pic:pic xmlns:pic="http://schemas.openxmlformats.org/drawingml/2006/picture">
                   <pic:nvPicPr>
-                    <pic:cNvPr id="2017366057" name=""/>
+                    <pic:cNvPr id="2058562116" name=""/>
                     <pic:cNvPicPr/>
                   </pic:nvPicPr>
                   <pic:blipFill>
@@ -17800,16 +17810,16 @@
           <w:noProof/>
         </w:rPr>
         <w:drawing>
-          <wp:inline distT="0" distB="0" distL="0" distR="0" wp14:anchorId="0E0D1202" wp14:editId="4D8161FF">
+          <wp:inline distT="0" distB="0" distL="0" distR="0" wp14:anchorId="00B64CFA" wp14:editId="5E9B6A79">
             <wp:extent cx="5120640" cy="2144319"/>
             <wp:effectExtent l="19050" t="19050" r="22860" b="27940"/>
-            <wp:docPr id="652629132" name="Imagem 39"/>
+            <wp:docPr id="1861929800" name="Imagem 39"/>
             <wp:cNvGraphicFramePr/>
             <a:graphic xmlns:a="http://schemas.openxmlformats.org/drawingml/2006/main">
               <a:graphicData uri="http://schemas.openxmlformats.org/drawingml/2006/picture">
                 <pic:pic xmlns:pic="http://schemas.openxmlformats.org/drawingml/2006/picture">
                   <pic:nvPicPr>
-                    <pic:cNvPr id="652629132" name=""/>
+                    <pic:cNvPr id="1861929800" name=""/>
                     <pic:cNvPicPr/>
                   </pic:nvPicPr>
                   <pic:blipFill>
@@ -17897,16 +17907,16 @@
           <w:noProof/>
         </w:rPr>
         <w:drawing>
-          <wp:inline distT="0" distB="0" distL="0" distR="0" wp14:anchorId="1EABF42D" wp14:editId="36546960">
+          <wp:inline distT="0" distB="0" distL="0" distR="0" wp14:anchorId="7068829C" wp14:editId="709027C3">
             <wp:extent cx="5120640" cy="1055647"/>
             <wp:effectExtent l="19050" t="19050" r="22860" b="11430"/>
-            <wp:docPr id="1549145493" name="Imagem 40"/>
+            <wp:docPr id="653141895" name="Imagem 40"/>
             <wp:cNvGraphicFramePr/>
             <a:graphic xmlns:a="http://schemas.openxmlformats.org/drawingml/2006/main">
               <a:graphicData uri="http://schemas.openxmlformats.org/drawingml/2006/picture">
                 <pic:pic xmlns:pic="http://schemas.openxmlformats.org/drawingml/2006/picture">
                   <pic:nvPicPr>
-                    <pic:cNvPr id="1549145493" name=""/>
+                    <pic:cNvPr id="653141895" name=""/>
                     <pic:cNvPicPr/>
                   </pic:nvPicPr>
                   <pic:blipFill>
@@ -18028,16 +18038,16 @@
           <w:noProof/>
         </w:rPr>
         <w:drawing>
-          <wp:inline distT="0" distB="0" distL="0" distR="0" wp14:anchorId="14C0DCE5" wp14:editId="44E87A09">
+          <wp:inline distT="0" distB="0" distL="0" distR="0" wp14:anchorId="4FD021C4" wp14:editId="6E0D986B">
             <wp:extent cx="5120640" cy="3282818"/>
             <wp:effectExtent l="19050" t="19050" r="22860" b="13335"/>
-            <wp:docPr id="890119134" name="Imagem 41"/>
+            <wp:docPr id="858749964" name="Imagem 41"/>
             <wp:cNvGraphicFramePr/>
             <a:graphic xmlns:a="http://schemas.openxmlformats.org/drawingml/2006/main">
               <a:graphicData uri="http://schemas.openxmlformats.org/drawingml/2006/picture">
                 <pic:pic xmlns:pic="http://schemas.openxmlformats.org/drawingml/2006/picture">
                   <pic:nvPicPr>
-                    <pic:cNvPr id="890119134" name=""/>
+                    <pic:cNvPr id="858749964" name=""/>
                     <pic:cNvPicPr/>
                   </pic:nvPicPr>
                   <pic:blipFill>
@@ -18171,16 +18181,16 @@
         </w:rPr>
         <w:lastRenderedPageBreak/>
         <w:drawing>
-          <wp:inline distT="0" distB="0" distL="0" distR="0" wp14:anchorId="3315FFEF" wp14:editId="7F7CB038">
+          <wp:inline distT="0" distB="0" distL="0" distR="0" wp14:anchorId="59F7F33B" wp14:editId="5640ADBF">
             <wp:extent cx="5120640" cy="1978034"/>
             <wp:effectExtent l="19050" t="19050" r="22860" b="22225"/>
-            <wp:docPr id="1676298028" name="Imagem 42"/>
+            <wp:docPr id="1720165883" name="Imagem 42"/>
             <wp:cNvGraphicFramePr/>
             <a:graphic xmlns:a="http://schemas.openxmlformats.org/drawingml/2006/main">
               <a:graphicData uri="http://schemas.openxmlformats.org/drawingml/2006/picture">
                 <pic:pic xmlns:pic="http://schemas.openxmlformats.org/drawingml/2006/picture">
                   <pic:nvPicPr>
-                    <pic:cNvPr id="1676298028" name=""/>
+                    <pic:cNvPr id="1720165883" name=""/>
                     <pic:cNvPicPr/>
                   </pic:nvPicPr>
                   <pic:blipFill>
@@ -18252,7 +18262,7 @@
           <w:sz w:val="34"/>
         </w:rPr>
       </w:pPr>
-      <w:bookmarkStart w:id="33" w:name="_Toc240273034"/>
+      <w:bookmarkStart w:id="33" w:name="_Toc240274136"/>
       <w:r>
         <w:rPr>
           <w:rFonts w:ascii="Montserrat" w:hAnsi="Montserrat"/>
@@ -18312,7 +18322,7 @@
           <w:sz w:val="27"/>
         </w:rPr>
       </w:pPr>
-      <w:bookmarkStart w:id="34" w:name="_Toc240273035"/>
+      <w:bookmarkStart w:id="34" w:name="_Toc240274137"/>
       <w:r>
         <w:rPr>
           <w:rFonts w:ascii="Montserrat" w:hAnsi="Montserrat"/>
@@ -18352,16 +18362,16 @@
           <w:noProof/>
         </w:rPr>
         <w:drawing>
-          <wp:inline distT="0" distB="0" distL="0" distR="0" wp14:anchorId="13ECBF96" wp14:editId="6081C447">
+          <wp:inline distT="0" distB="0" distL="0" distR="0" wp14:anchorId="2BF1EA3F" wp14:editId="1BBF911F">
             <wp:extent cx="5303520" cy="4792851"/>
             <wp:effectExtent l="19050" t="19050" r="11430" b="27305"/>
-            <wp:docPr id="1118470604" name="Imagem 43"/>
+            <wp:docPr id="272048358" name="Imagem 43"/>
             <wp:cNvGraphicFramePr/>
             <a:graphic xmlns:a="http://schemas.openxmlformats.org/drawingml/2006/main">
               <a:graphicData uri="http://schemas.openxmlformats.org/drawingml/2006/picture">
                 <pic:pic xmlns:pic="http://schemas.openxmlformats.org/drawingml/2006/picture">
                   <pic:nvPicPr>
-                    <pic:cNvPr id="1118470604" name=""/>
+                    <pic:cNvPr id="272048358" name=""/>
                     <pic:cNvPicPr/>
                   </pic:nvPicPr>
                   <pic:blipFill>
@@ -18430,7 +18440,7 @@
           <w:sz w:val="27"/>
         </w:rPr>
       </w:pPr>
-      <w:bookmarkStart w:id="35" w:name="_Toc240273036"/>
+      <w:bookmarkStart w:id="35" w:name="_Toc240274138"/>
       <w:r>
         <w:rPr>
           <w:rFonts w:ascii="Montserrat" w:hAnsi="Montserrat"/>
@@ -18470,16 +18480,16 @@
           <w:noProof/>
         </w:rPr>
         <w:drawing>
-          <wp:inline distT="0" distB="0" distL="0" distR="0" wp14:anchorId="035D5A9B" wp14:editId="16E1DD8E">
+          <wp:inline distT="0" distB="0" distL="0" distR="0" wp14:anchorId="392308A5" wp14:editId="4A1D5195">
             <wp:extent cx="5303520" cy="4792851"/>
             <wp:effectExtent l="19050" t="19050" r="11430" b="27305"/>
-            <wp:docPr id="1871285996" name="Imagem 44"/>
+            <wp:docPr id="1981185239" name="Imagem 44"/>
             <wp:cNvGraphicFramePr/>
             <a:graphic xmlns:a="http://schemas.openxmlformats.org/drawingml/2006/main">
               <a:graphicData uri="http://schemas.openxmlformats.org/drawingml/2006/picture">
                 <pic:pic xmlns:pic="http://schemas.openxmlformats.org/drawingml/2006/picture">
                   <pic:nvPicPr>
-                    <pic:cNvPr id="1871285996" name=""/>
+                    <pic:cNvPr id="1981185239" name=""/>
                     <pic:cNvPicPr/>
                   </pic:nvPicPr>
                   <pic:blipFill>
@@ -18547,7 +18557,7 @@
           <w:sz w:val="27"/>
         </w:rPr>
       </w:pPr>
-      <w:bookmarkStart w:id="36" w:name="_Toc240273037"/>
+      <w:bookmarkStart w:id="36" w:name="_Toc240274139"/>
       <w:r>
         <w:rPr>
           <w:rFonts w:ascii="Montserrat" w:hAnsi="Montserrat"/>
@@ -18588,16 +18598,16 @@
         </w:rPr>
         <w:lastRenderedPageBreak/>
         <w:drawing>
-          <wp:inline distT="0" distB="0" distL="0" distR="0" wp14:anchorId="7F8AD5D5" wp14:editId="1AB7B0E7">
+          <wp:inline distT="0" distB="0" distL="0" distR="0" wp14:anchorId="615FD74E" wp14:editId="6B71B070">
             <wp:extent cx="5303520" cy="4792851"/>
             <wp:effectExtent l="19050" t="19050" r="11430" b="27305"/>
-            <wp:docPr id="2002020555" name="Imagem 45"/>
+            <wp:docPr id="900075873" name="Imagem 45"/>
             <wp:cNvGraphicFramePr/>
             <a:graphic xmlns:a="http://schemas.openxmlformats.org/drawingml/2006/main">
               <a:graphicData uri="http://schemas.openxmlformats.org/drawingml/2006/picture">
                 <pic:pic xmlns:pic="http://schemas.openxmlformats.org/drawingml/2006/picture">
                   <pic:nvPicPr>
-                    <pic:cNvPr id="2002020555" name=""/>
+                    <pic:cNvPr id="900075873" name=""/>
                     <pic:cNvPicPr/>
                   </pic:nvPicPr>
                   <pic:blipFill>
@@ -18665,16 +18675,16 @@
         </w:rPr>
         <w:lastRenderedPageBreak/>
         <w:drawing>
-          <wp:inline distT="0" distB="0" distL="0" distR="0" wp14:anchorId="067EC50F" wp14:editId="1A53938B">
+          <wp:inline distT="0" distB="0" distL="0" distR="0" wp14:anchorId="0FE9AA61" wp14:editId="253F9C3A">
             <wp:extent cx="5303520" cy="4792851"/>
             <wp:effectExtent l="19050" t="19050" r="11430" b="27305"/>
-            <wp:docPr id="317145968" name="Imagem 46"/>
+            <wp:docPr id="2092546294" name="Imagem 46"/>
             <wp:cNvGraphicFramePr/>
             <a:graphic xmlns:a="http://schemas.openxmlformats.org/drawingml/2006/main">
               <a:graphicData uri="http://schemas.openxmlformats.org/drawingml/2006/picture">
                 <pic:pic xmlns:pic="http://schemas.openxmlformats.org/drawingml/2006/picture">
                   <pic:nvPicPr>
-                    <pic:cNvPr id="317145968" name=""/>
+                    <pic:cNvPr id="2092546294" name=""/>
                     <pic:cNvPicPr/>
                   </pic:nvPicPr>
                   <pic:blipFill>
@@ -18767,7 +18777,7 @@
           <w:sz w:val="34"/>
         </w:rPr>
       </w:pPr>
-      <w:bookmarkStart w:id="37" w:name="_Toc240273038"/>
+      <w:bookmarkStart w:id="37" w:name="_Toc240274140"/>
       <w:r>
         <w:rPr>
           <w:rFonts w:ascii="Montserrat" w:hAnsi="Montserrat"/>
@@ -18809,7 +18819,7 @@
           <w:sz w:val="27"/>
         </w:rPr>
       </w:pPr>
-      <w:bookmarkStart w:id="38" w:name="_Toc240273039"/>
+      <w:bookmarkStart w:id="38" w:name="_Toc240274141"/>
       <w:r>
         <w:rPr>
           <w:rFonts w:ascii="Montserrat" w:hAnsi="Montserrat"/>
@@ -18849,16 +18859,16 @@
           <w:noProof/>
         </w:rPr>
         <w:drawing>
-          <wp:inline distT="0" distB="0" distL="0" distR="0" wp14:anchorId="4A0405B7" wp14:editId="65604817">
+          <wp:inline distT="0" distB="0" distL="0" distR="0" wp14:anchorId="40444066" wp14:editId="276EBF19">
             <wp:extent cx="5303520" cy="4792851"/>
             <wp:effectExtent l="19050" t="19050" r="11430" b="27305"/>
-            <wp:docPr id="621077587" name="Imagem 47"/>
+            <wp:docPr id="393189363" name="Imagem 47"/>
             <wp:cNvGraphicFramePr/>
             <a:graphic xmlns:a="http://schemas.openxmlformats.org/drawingml/2006/main">
               <a:graphicData uri="http://schemas.openxmlformats.org/drawingml/2006/picture">
                 <pic:pic xmlns:pic="http://schemas.openxmlformats.org/drawingml/2006/picture">
                   <pic:nvPicPr>
-                    <pic:cNvPr id="621077587" name=""/>
+                    <pic:cNvPr id="393189363" name=""/>
                     <pic:cNvPicPr/>
                   </pic:nvPicPr>
                   <pic:blipFill>
@@ -19087,7 +19097,7 @@
           <w:sz w:val="27"/>
         </w:rPr>
       </w:pPr>
-      <w:bookmarkStart w:id="39" w:name="_Toc240273040"/>
+      <w:bookmarkStart w:id="39" w:name="_Toc240274142"/>
       <w:r>
         <w:rPr>
           <w:rFonts w:ascii="Montserrat" w:hAnsi="Montserrat"/>
@@ -19127,16 +19137,16 @@
           <w:noProof/>
         </w:rPr>
         <w:drawing>
-          <wp:inline distT="0" distB="0" distL="0" distR="0" wp14:anchorId="4758F0C6" wp14:editId="3238DDE5">
+          <wp:inline distT="0" distB="0" distL="0" distR="0" wp14:anchorId="163FE8E4" wp14:editId="21AB243E">
             <wp:extent cx="5303520" cy="4792851"/>
             <wp:effectExtent l="19050" t="19050" r="11430" b="27305"/>
-            <wp:docPr id="1436300641" name="Imagem 48"/>
+            <wp:docPr id="1379879903" name="Imagem 48"/>
             <wp:cNvGraphicFramePr/>
             <a:graphic xmlns:a="http://schemas.openxmlformats.org/drawingml/2006/main">
               <a:graphicData uri="http://schemas.openxmlformats.org/drawingml/2006/picture">
                 <pic:pic xmlns:pic="http://schemas.openxmlformats.org/drawingml/2006/picture">
                   <pic:nvPicPr>
-                    <pic:cNvPr id="1436300641" name=""/>
+                    <pic:cNvPr id="1379879903" name=""/>
                     <pic:cNvPicPr/>
                   </pic:nvPicPr>
                   <pic:blipFill>
@@ -19204,7 +19214,7 @@
           <w:sz w:val="27"/>
         </w:rPr>
       </w:pPr>
-      <w:bookmarkStart w:id="40" w:name="_Toc240273041"/>
+      <w:bookmarkStart w:id="40" w:name="_Toc240274143"/>
       <w:r>
         <w:rPr>
           <w:rFonts w:ascii="Montserrat" w:hAnsi="Montserrat"/>
@@ -19245,16 +19255,16 @@
         </w:rPr>
         <w:lastRenderedPageBreak/>
         <w:drawing>
-          <wp:inline distT="0" distB="0" distL="0" distR="0" wp14:anchorId="743DD1CD" wp14:editId="2CF3DC8F">
+          <wp:inline distT="0" distB="0" distL="0" distR="0" wp14:anchorId="161353B0" wp14:editId="5533F50E">
             <wp:extent cx="5303520" cy="4792851"/>
             <wp:effectExtent l="19050" t="19050" r="11430" b="27305"/>
-            <wp:docPr id="741746170" name="Imagem 49"/>
+            <wp:docPr id="702920757" name="Imagem 49"/>
             <wp:cNvGraphicFramePr/>
             <a:graphic xmlns:a="http://schemas.openxmlformats.org/drawingml/2006/main">
               <a:graphicData uri="http://schemas.openxmlformats.org/drawingml/2006/picture">
                 <pic:pic xmlns:pic="http://schemas.openxmlformats.org/drawingml/2006/picture">
                   <pic:nvPicPr>
-                    <pic:cNvPr id="741746170" name=""/>
+                    <pic:cNvPr id="702920757" name=""/>
                     <pic:cNvPicPr/>
                   </pic:nvPicPr>
                   <pic:blipFill>
@@ -19398,7 +19408,7 @@
           <w:sz w:val="27"/>
         </w:rPr>
       </w:pPr>
-      <w:bookmarkStart w:id="41" w:name="_Toc240273042"/>
+      <w:bookmarkStart w:id="41" w:name="_Toc240274144"/>
       <w:r>
         <w:rPr>
           <w:rFonts w:ascii="Montserrat" w:hAnsi="Montserrat"/>
@@ -19578,7 +19588,7 @@
           <w:color w:val="1A1A1A"/>
           <w:sz w:val="22"/>
         </w:rPr>
-        <w:t>Registros por formulario: uma linha por artefato (Canvas, TAP, Planejamento, EAP, SMP, Ata de Reuniao, TEP, RLA, alem da propria Solicitacao de Demanda), com o total e a contagem por status de cada um.</w:t>
+        <w:t>Tarefas do cronograma (portfolio): soma as tarefas cadastradas dentro dos marcos do cronograma do Planejamento (Passo 4, aba 3) de todos os projetos, mostrando o percentual concluido e em quantos projetos existe pelo menos uma tarefa pendente.</w:t>
       </w:r>
     </w:p>
     <w:p>
@@ -19602,7 +19612,7 @@
           <w:color w:val="1A1A1A"/>
           <w:sz w:val="22"/>
         </w:rPr>
-        <w:t>Portfolio de projetos: contagem de projetos Aprovados, Encerrados (Concluido/Paralisado/Cancelado, via TEP), Reprovados e em avaliacao no Gate 1, a partir do cadastro compartilhado (secao 2.5).</w:t>
+        <w:t>Registros por formulario: uma linha por artefato (Canvas, TAP, Planejamento, EAP, SMP, Ata de Reuniao, TEP, RLA, alem da propria Solicitacao de Demanda), com o total e a contagem por status de cada um.</w:t>
       </w:r>
     </w:p>
     <w:p>
@@ -19626,6 +19636,30 @@
           <w:color w:val="1A1A1A"/>
           <w:sz w:val="22"/>
         </w:rPr>
+        <w:t>Portfolio de projetos: contagem de projetos Aprovados, Encerrados (Concluido/Paralisado/Cancelado, via TEP), Reprovados e em avaliacao no Gate 1, a partir do cadastro compartilhado (secao 2.5).</w:t>
+      </w:r>
+    </w:p>
+    <w:p>
+      <w:pPr>
+        <w:pStyle w:val="PargrafodaLista"/>
+        <w:numPr>
+          <w:ilvl w:val="0"/>
+          <w:numId w:val="28"/>
+        </w:numPr>
+        <w:spacing w:after="80" w:line="260" w:lineRule="auto"/>
+        <w:ind w:left="700"/>
+        <w:rPr>
+          <w:rFonts w:ascii="Montserrat" w:hAnsi="Montserrat"/>
+          <w:color w:val="1A1A1A"/>
+          <w:sz w:val="22"/>
+        </w:rPr>
+      </w:pPr>
+      <w:r>
+        <w:rPr>
+          <w:rFonts w:ascii="Montserrat" w:hAnsi="Montserrat"/>
+          <w:color w:val="1A1A1A"/>
+          <w:sz w:val="22"/>
+        </w:rPr>
         <w:t>Visao atual por projeto: uma linha por projeto do cadastro compartilhado, com Status do cadastro, Situacao mais recente do Relatorio de Situacao (secao 4.1, com o percentual concluido quando ja reportado), Saude do projeto (secao 6.4.1) e Progresso do ciclo de vida - quantos dos 9 formularios (Demanda a RLA) ja tem registro vinculado aquele projeto, com a lista do que ainda falta.</w:t>
       </w:r>
     </w:p>
@@ -19639,16 +19673,16 @@
           <w:noProof/>
         </w:rPr>
         <w:drawing>
-          <wp:inline distT="0" distB="0" distL="0" distR="0" wp14:anchorId="5B2E48E2" wp14:editId="0EFD417B">
+          <wp:inline distT="0" distB="0" distL="0" distR="0" wp14:anchorId="24B38A8C" wp14:editId="46D52CD9">
             <wp:extent cx="5303520" cy="4267180"/>
             <wp:effectExtent l="19050" t="19050" r="11430" b="19685"/>
-            <wp:docPr id="496772326" name="Imagem 50"/>
+            <wp:docPr id="364071279" name="Imagem 50"/>
             <wp:cNvGraphicFramePr/>
             <a:graphic xmlns:a="http://schemas.openxmlformats.org/drawingml/2006/main">
               <a:graphicData uri="http://schemas.openxmlformats.org/drawingml/2006/picture">
                 <pic:pic xmlns:pic="http://schemas.openxmlformats.org/drawingml/2006/picture">
                   <pic:nvPicPr>
-                    <pic:cNvPr id="496772326" name=""/>
+                    <pic:cNvPr id="364071279" name=""/>
                     <pic:cNvPicPr/>
                   </pic:nvPicPr>
                   <pic:blipFill>
@@ -19702,6 +19736,7 @@
           <w:color w:val="6A6A70"/>
           <w:sz w:val="19"/>
         </w:rPr>
+        <w:lastRenderedPageBreak/>
         <w:t>Painel Executivo: Gates de aprovacao e indicadores de governanca do Relatorio de Situacao.</w:t>
       </w:r>
     </w:p>
@@ -19714,18 +19749,17 @@
         <w:rPr>
           <w:noProof/>
         </w:rPr>
-        <w:lastRenderedPageBreak/>
         <w:drawing>
-          <wp:inline distT="0" distB="0" distL="0" distR="0" wp14:anchorId="7A97084F" wp14:editId="66A75CCA">
+          <wp:inline distT="0" distB="0" distL="0" distR="0" wp14:anchorId="757E1043" wp14:editId="603AE18D">
             <wp:extent cx="5303520" cy="3382059"/>
             <wp:effectExtent l="19050" t="19050" r="11430" b="27940"/>
-            <wp:docPr id="165676715" name="Imagem 51"/>
+            <wp:docPr id="1358254188" name="Imagem 51"/>
             <wp:cNvGraphicFramePr/>
             <a:graphic xmlns:a="http://schemas.openxmlformats.org/drawingml/2006/main">
               <a:graphicData uri="http://schemas.openxmlformats.org/drawingml/2006/picture">
                 <pic:pic xmlns:pic="http://schemas.openxmlformats.org/drawingml/2006/picture">
                   <pic:nvPicPr>
-                    <pic:cNvPr id="165676715" name=""/>
+                    <pic:cNvPr id="1358254188" name=""/>
                     <pic:cNvPicPr/>
                   </pic:nvPicPr>
                   <pic:blipFill>
@@ -19793,16 +19827,16 @@
         </w:rPr>
         <w:lastRenderedPageBreak/>
         <w:drawing>
-          <wp:inline distT="0" distB="0" distL="0" distR="0" wp14:anchorId="3463532A" wp14:editId="5A9C468D">
+          <wp:inline distT="0" distB="0" distL="0" distR="0" wp14:anchorId="6F55C88B" wp14:editId="5CDBCF6C">
             <wp:extent cx="5303520" cy="4417800"/>
             <wp:effectExtent l="19050" t="19050" r="11430" b="20955"/>
-            <wp:docPr id="2037561575" name="Imagem 52"/>
+            <wp:docPr id="750444578" name="Imagem 52"/>
             <wp:cNvGraphicFramePr/>
             <a:graphic xmlns:a="http://schemas.openxmlformats.org/drawingml/2006/main">
               <a:graphicData uri="http://schemas.openxmlformats.org/drawingml/2006/picture">
                 <pic:pic xmlns:pic="http://schemas.openxmlformats.org/drawingml/2006/picture">
                   <pic:nvPicPr>
-                    <pic:cNvPr id="2037561575" name=""/>
+                    <pic:cNvPr id="750444578" name=""/>
                     <pic:cNvPicPr/>
                   </pic:nvPicPr>
                   <pic:blipFill>
@@ -19912,7 +19946,7 @@
           <w:sz w:val="27"/>
         </w:rPr>
       </w:pPr>
-      <w:bookmarkStart w:id="42" w:name="_Toc240273043"/>
+      <w:bookmarkStart w:id="42" w:name="_Toc240274145"/>
       <w:r>
         <w:rPr>
           <w:rFonts w:ascii="Montserrat" w:hAnsi="Montserrat"/>
@@ -20178,16 +20212,16 @@
         </w:rPr>
         <w:lastRenderedPageBreak/>
         <w:drawing>
-          <wp:inline distT="0" distB="0" distL="0" distR="0" wp14:anchorId="1D0185E4" wp14:editId="472711B3">
+          <wp:inline distT="0" distB="0" distL="0" distR="0" wp14:anchorId="10BB1EA7" wp14:editId="61B77960">
             <wp:extent cx="5303520" cy="7628836"/>
             <wp:effectExtent l="19050" t="19050" r="11430" b="10795"/>
-            <wp:docPr id="123502563" name="Imagem 53"/>
+            <wp:docPr id="544095145" name="Imagem 53"/>
             <wp:cNvGraphicFramePr/>
             <a:graphic xmlns:a="http://schemas.openxmlformats.org/drawingml/2006/main">
               <a:graphicData uri="http://schemas.openxmlformats.org/drawingml/2006/picture">
                 <pic:pic xmlns:pic="http://schemas.openxmlformats.org/drawingml/2006/picture">
                   <pic:nvPicPr>
-                    <pic:cNvPr id="123502563" name=""/>
+                    <pic:cNvPr id="544095145" name=""/>
                     <pic:cNvPicPr/>
                   </pic:nvPicPr>
                   <pic:blipFill>
@@ -20319,7 +20353,7 @@
           <w:sz w:val="27"/>
         </w:rPr>
       </w:pPr>
-      <w:bookmarkStart w:id="43" w:name="_Toc240273044"/>
+      <w:bookmarkStart w:id="43" w:name="_Toc240274146"/>
       <w:r>
         <w:rPr>
           <w:rFonts w:ascii="Montserrat" w:hAnsi="Montserrat"/>
@@ -20472,7 +20506,7 @@
           <w:sz w:val="27"/>
         </w:rPr>
       </w:pPr>
-      <w:bookmarkStart w:id="44" w:name="_Toc240273045"/>
+      <w:bookmarkStart w:id="44" w:name="_Toc240274147"/>
       <w:r>
         <w:rPr>
           <w:rFonts w:ascii="Montserrat" w:hAnsi="Montserrat"/>
@@ -20765,16 +20799,16 @@
           <w:noProof/>
         </w:rPr>
         <w:drawing>
-          <wp:inline distT="0" distB="0" distL="0" distR="0" wp14:anchorId="26FAC842" wp14:editId="0FD51E7A">
+          <wp:inline distT="0" distB="0" distL="0" distR="0" wp14:anchorId="788F819F" wp14:editId="0E743286">
             <wp:extent cx="5303520" cy="1351384"/>
             <wp:effectExtent l="19050" t="19050" r="11430" b="20320"/>
-            <wp:docPr id="2002634895" name="Imagem 54"/>
+            <wp:docPr id="242507938" name="Imagem 54"/>
             <wp:cNvGraphicFramePr/>
             <a:graphic xmlns:a="http://schemas.openxmlformats.org/drawingml/2006/main">
               <a:graphicData uri="http://schemas.openxmlformats.org/drawingml/2006/picture">
                 <pic:pic xmlns:pic="http://schemas.openxmlformats.org/drawingml/2006/picture">
                   <pic:nvPicPr>
-                    <pic:cNvPr id="2002634895" name=""/>
+                    <pic:cNvPr id="242507938" name=""/>
                     <pic:cNvPicPr/>
                   </pic:nvPicPr>
                   <pic:blipFill>
@@ -20842,7 +20876,7 @@
           <w:sz w:val="27"/>
         </w:rPr>
       </w:pPr>
-      <w:bookmarkStart w:id="45" w:name="_Toc240273046"/>
+      <w:bookmarkStart w:id="45" w:name="_Toc240274148"/>
       <w:r>
         <w:rPr>
           <w:rFonts w:ascii="Montserrat" w:hAnsi="Montserrat"/>
@@ -20987,16 +21021,16 @@
           <w:noProof/>
         </w:rPr>
         <w:drawing>
-          <wp:inline distT="0" distB="0" distL="0" distR="0" wp14:anchorId="5197DB7D" wp14:editId="27D123C4">
+          <wp:inline distT="0" distB="0" distL="0" distR="0" wp14:anchorId="7BCA21FD" wp14:editId="1129462C">
             <wp:extent cx="5303520" cy="1422793"/>
             <wp:effectExtent l="19050" t="19050" r="11430" b="25400"/>
-            <wp:docPr id="1597859587" name="Imagem 55"/>
+            <wp:docPr id="698161555" name="Imagem 55"/>
             <wp:cNvGraphicFramePr/>
             <a:graphic xmlns:a="http://schemas.openxmlformats.org/drawingml/2006/main">
               <a:graphicData uri="http://schemas.openxmlformats.org/drawingml/2006/picture">
                 <pic:pic xmlns:pic="http://schemas.openxmlformats.org/drawingml/2006/picture">
                   <pic:nvPicPr>
-                    <pic:cNvPr id="1597859587" name=""/>
+                    <pic:cNvPr id="698161555" name=""/>
                     <pic:cNvPicPr/>
                   </pic:nvPicPr>
                   <pic:blipFill>
@@ -21151,16 +21185,16 @@
         </w:rPr>
         <w:lastRenderedPageBreak/>
         <w:drawing>
-          <wp:inline distT="0" distB="0" distL="0" distR="0" wp14:anchorId="26AA93F7" wp14:editId="20669FAC">
+          <wp:inline distT="0" distB="0" distL="0" distR="0" wp14:anchorId="7FCE5F4B" wp14:editId="54573191">
             <wp:extent cx="5303520" cy="1841050"/>
             <wp:effectExtent l="19050" t="19050" r="11430" b="26035"/>
-            <wp:docPr id="146544788" name="Imagem 56"/>
+            <wp:docPr id="1512457001" name="Imagem 56"/>
             <wp:cNvGraphicFramePr/>
             <a:graphic xmlns:a="http://schemas.openxmlformats.org/drawingml/2006/main">
               <a:graphicData uri="http://schemas.openxmlformats.org/drawingml/2006/picture">
                 <pic:pic xmlns:pic="http://schemas.openxmlformats.org/drawingml/2006/picture">
                   <pic:nvPicPr>
-                    <pic:cNvPr id="146544788" name=""/>
+                    <pic:cNvPr id="1512457001" name=""/>
                     <pic:cNvPicPr/>
                   </pic:nvPicPr>
                   <pic:blipFill>
@@ -21314,16 +21348,16 @@
           <w:noProof/>
         </w:rPr>
         <w:drawing>
-          <wp:inline distT="0" distB="0" distL="0" distR="0" wp14:anchorId="6A74B0DC" wp14:editId="4D2EC554">
+          <wp:inline distT="0" distB="0" distL="0" distR="0" wp14:anchorId="6D60CC57" wp14:editId="0D97F8B2">
             <wp:extent cx="5303520" cy="303041"/>
             <wp:effectExtent l="19050" t="19050" r="11430" b="20955"/>
-            <wp:docPr id="1436258506" name="Imagem 57"/>
+            <wp:docPr id="910337274" name="Imagem 57"/>
             <wp:cNvGraphicFramePr/>
             <a:graphic xmlns:a="http://schemas.openxmlformats.org/drawingml/2006/main">
               <a:graphicData uri="http://schemas.openxmlformats.org/drawingml/2006/picture">
                 <pic:pic xmlns:pic="http://schemas.openxmlformats.org/drawingml/2006/picture">
                   <pic:nvPicPr>
-                    <pic:cNvPr id="1436258506" name=""/>
+                    <pic:cNvPr id="910337274" name=""/>
                     <pic:cNvPicPr/>
                   </pic:nvPicPr>
                   <pic:blipFill>
@@ -21391,16 +21425,16 @@
         </w:rPr>
         <w:lastRenderedPageBreak/>
         <w:drawing>
-          <wp:inline distT="0" distB="0" distL="0" distR="0" wp14:anchorId="3B8E699C" wp14:editId="64AD9D73">
+          <wp:inline distT="0" distB="0" distL="0" distR="0" wp14:anchorId="7482939E" wp14:editId="5E5875FE">
             <wp:extent cx="5303520" cy="2983005"/>
             <wp:effectExtent l="19050" t="19050" r="11430" b="27305"/>
-            <wp:docPr id="1320239481" name="Imagem 58"/>
+            <wp:docPr id="1998269807" name="Imagem 58"/>
             <wp:cNvGraphicFramePr/>
             <a:graphic xmlns:a="http://schemas.openxmlformats.org/drawingml/2006/main">
               <a:graphicData uri="http://schemas.openxmlformats.org/drawingml/2006/picture">
                 <pic:pic xmlns:pic="http://schemas.openxmlformats.org/drawingml/2006/picture">
                   <pic:nvPicPr>
-                    <pic:cNvPr id="1320239481" name=""/>
+                    <pic:cNvPr id="1998269807" name=""/>
                     <pic:cNvPicPr/>
                   </pic:nvPicPr>
                   <pic:blipFill>
@@ -21472,7 +21506,7 @@
           <w:sz w:val="34"/>
         </w:rPr>
       </w:pPr>
-      <w:bookmarkStart w:id="46" w:name="_Toc240273047"/>
+      <w:bookmarkStart w:id="46" w:name="_Toc240274149"/>
       <w:r>
         <w:rPr>
           <w:rFonts w:ascii="Montserrat" w:hAnsi="Montserrat"/>
@@ -21716,7 +21750,7 @@
           <w:sz w:val="34"/>
         </w:rPr>
       </w:pPr>
-      <w:bookmarkStart w:id="47" w:name="_Toc240273048"/>
+      <w:bookmarkStart w:id="47" w:name="_Toc240274150"/>
       <w:r>
         <w:rPr>
           <w:rFonts w:ascii="Montserrat" w:hAnsi="Montserrat"/>
@@ -23504,7 +23538,7 @@
 <file path=word/numbering.xml><?xml version="1.0" encoding="utf-8"?>
 <w:numbering xmlns:wpc="http://schemas.microsoft.com/office/word/2010/wordprocessingCanvas" xmlns:cx="http://schemas.microsoft.com/office/drawing/2014/chartex" xmlns:cx1="http://schemas.microsoft.com/office/drawing/2015/9/8/chartex" xmlns:cx2="http://schemas.microsoft.com/office/drawing/2015/10/21/chartex" xmlns:cx3="http://schemas.microsoft.com/office/drawing/2016/5/9/chartex" xmlns:cx4="http://schemas.microsoft.com/office/drawing/2016/5/10/chartex" xmlns:cx5="http://schemas.microsoft.com/office/drawing/2016/5/11/chartex" xmlns:cx6="http://schemas.microsoft.com/office/drawing/2016/5/12/chartex" xmlns:cx7="http://schemas.microsoft.com/office/drawing/2016/5/13/chartex" xmlns:cx8="http://schemas.microsoft.com/office/drawing/2016/5/14/chartex" xmlns:mc="http://schemas.openxmlformats.org/markup-compatibility/2006" xmlns:aink="http://schemas.microsoft.com/office/drawing/2016/ink" xmlns:am3d="http://schemas.microsoft.com/office/drawing/2017/model3d" xmlns:o="urn:schemas-microsoft-com:office:office" xmlns:oel="http://schemas.microsoft.com/office/2019/extlst" xmlns:r="http://schemas.openxmlformats.org/officeDocument/2006/relationships" xmlns:m="http://schemas.openxmlformats.org/officeDocument/2006/math" xmlns:v="urn:schemas-microsoft-com:vml" xmlns:wp14="http://schemas.microsoft.com/office/word/2010/wordprocessingDrawing" xmlns:wp="http://schemas.openxmlformats.org/drawingml/2006/wordprocessingDrawing" xmlns:w10="urn:schemas-microsoft-com:office:word" xmlns:w="http://schemas.openxmlformats.org/wordprocessingml/2006/main" xmlns:w14="http://schemas.microsoft.com/office/word/2010/wordml" xmlns:w15="http://schemas.microsoft.com/office/word/2012/wordml" xmlns:w16cex="http://schemas.microsoft.com/office/word/2018/wordml/cex" xmlns:w16cid="http://schemas.microsoft.com/office/word/2016/wordml/cid" xmlns:w16="http://schemas.microsoft.com/office/word/2018/wordml" xmlns:w16du="http://schemas.microsoft.com/office/word/2023/wordml/word16du" xmlns:w16sdtdh="http://schemas.microsoft.com/office/word/2020/wordml/sdtdatahash" xmlns:w16sdtfl="http://schemas.microsoft.com/office/word/2024/wordml/sdtformatlock" xmlns:w16se="http://schemas.microsoft.com/office/word/2015/wordml/symex" xmlns:wpg="http://schemas.microsoft.com/office/word/2010/wordprocessingGroup" xmlns:wpi="http://schemas.microsoft.com/office/word/2010/wordprocessingInk" xmlns:wne="http://schemas.microsoft.com/office/word/2006/wordml" xmlns:wps="http://schemas.microsoft.com/office/word/2010/wordprocessingShape" mc:Ignorable="w14 w15 w16se w16cid w16 w16cex w16sdtdh w16sdtfl w16du wp14">
   <w:abstractNum w:abstractNumId="0" w15:restartNumberingAfterBreak="0">
-    <w:nsid w:val="00C53D2E"/>
+    <w:nsid w:val="06494D01"/>
     <w:multiLevelType w:val="singleLevel"/>
     <w:tmpl w:val="04160001"/>
     <w:lvl w:ilvl="0">
@@ -23521,7 +23555,7 @@
     </w:lvl>
   </w:abstractNum>
   <w:abstractNum w:abstractNumId="1" w15:restartNumberingAfterBreak="0">
-    <w:nsid w:val="0740462F"/>
+    <w:nsid w:val="0B0D1312"/>
     <w:multiLevelType w:val="singleLevel"/>
     <w:tmpl w:val="04160001"/>
     <w:lvl w:ilvl="0">
@@ -23538,7 +23572,7 @@
     </w:lvl>
   </w:abstractNum>
   <w:abstractNum w:abstractNumId="2" w15:restartNumberingAfterBreak="0">
-    <w:nsid w:val="09233D20"/>
+    <w:nsid w:val="0DE835F4"/>
     <w:multiLevelType w:val="singleLevel"/>
     <w:tmpl w:val="04160001"/>
     <w:lvl w:ilvl="0">
@@ -23555,7 +23589,7 @@
     </w:lvl>
   </w:abstractNum>
   <w:abstractNum w:abstractNumId="3" w15:restartNumberingAfterBreak="0">
-    <w:nsid w:val="0AA33520"/>
+    <w:nsid w:val="0E161953"/>
     <w:multiLevelType w:val="singleLevel"/>
     <w:tmpl w:val="04160001"/>
     <w:lvl w:ilvl="0">
@@ -23572,7 +23606,7 @@
     </w:lvl>
   </w:abstractNum>
   <w:abstractNum w:abstractNumId="4" w15:restartNumberingAfterBreak="0">
-    <w:nsid w:val="1C1171FD"/>
+    <w:nsid w:val="11A10CB6"/>
     <w:multiLevelType w:val="singleLevel"/>
     <w:tmpl w:val="04160001"/>
     <w:lvl w:ilvl="0">
@@ -23589,7 +23623,7 @@
     </w:lvl>
   </w:abstractNum>
   <w:abstractNum w:abstractNumId="5" w15:restartNumberingAfterBreak="0">
-    <w:nsid w:val="1DDC44ED"/>
+    <w:nsid w:val="12A91E22"/>
     <w:multiLevelType w:val="singleLevel"/>
     <w:tmpl w:val="04160001"/>
     <w:lvl w:ilvl="0">
@@ -23606,7 +23640,7 @@
     </w:lvl>
   </w:abstractNum>
   <w:abstractNum w:abstractNumId="6" w15:restartNumberingAfterBreak="0">
-    <w:nsid w:val="1E5F5D55"/>
+    <w:nsid w:val="206D2913"/>
     <w:multiLevelType w:val="singleLevel"/>
     <w:tmpl w:val="04160001"/>
     <w:lvl w:ilvl="0">
@@ -23623,7 +23657,7 @@
     </w:lvl>
   </w:abstractNum>
   <w:abstractNum w:abstractNumId="7" w15:restartNumberingAfterBreak="0">
-    <w:nsid w:val="202A2755"/>
+    <w:nsid w:val="20A47789"/>
     <w:multiLevelType w:val="singleLevel"/>
     <w:tmpl w:val="04160001"/>
     <w:lvl w:ilvl="0">
@@ -23640,7 +23674,7 @@
     </w:lvl>
   </w:abstractNum>
   <w:abstractNum w:abstractNumId="8" w15:restartNumberingAfterBreak="0">
-    <w:nsid w:val="23FD5EE8"/>
+    <w:nsid w:val="25BC6128"/>
     <w:multiLevelType w:val="singleLevel"/>
     <w:tmpl w:val="04160001"/>
     <w:lvl w:ilvl="0">
@@ -23657,7 +23691,7 @@
     </w:lvl>
   </w:abstractNum>
   <w:abstractNum w:abstractNumId="9" w15:restartNumberingAfterBreak="0">
-    <w:nsid w:val="26013775"/>
+    <w:nsid w:val="27A654B8"/>
     <w:multiLevelType w:val="singleLevel"/>
     <w:tmpl w:val="04160001"/>
     <w:lvl w:ilvl="0">
@@ -23674,7 +23708,7 @@
     </w:lvl>
   </w:abstractNum>
   <w:abstractNum w:abstractNumId="10" w15:restartNumberingAfterBreak="0">
-    <w:nsid w:val="34143182"/>
+    <w:nsid w:val="300B4093"/>
     <w:multiLevelType w:val="singleLevel"/>
     <w:tmpl w:val="04160001"/>
     <w:lvl w:ilvl="0">
@@ -23691,7 +23725,7 @@
     </w:lvl>
   </w:abstractNum>
   <w:abstractNum w:abstractNumId="11" w15:restartNumberingAfterBreak="0">
-    <w:nsid w:val="34415215"/>
+    <w:nsid w:val="34EB6236"/>
     <w:multiLevelType w:val="singleLevel"/>
     <w:tmpl w:val="04160001"/>
     <w:lvl w:ilvl="0">
@@ -23708,7 +23742,7 @@
     </w:lvl>
   </w:abstractNum>
   <w:abstractNum w:abstractNumId="12" w15:restartNumberingAfterBreak="0">
-    <w:nsid w:val="344163CC"/>
+    <w:nsid w:val="38AB49C9"/>
     <w:multiLevelType w:val="singleLevel"/>
     <w:tmpl w:val="04160001"/>
     <w:lvl w:ilvl="0">
@@ -23725,7 +23759,7 @@
     </w:lvl>
   </w:abstractNum>
   <w:abstractNum w:abstractNumId="13" w15:restartNumberingAfterBreak="0">
-    <w:nsid w:val="34D03D22"/>
+    <w:nsid w:val="3C2A5902"/>
     <w:multiLevelType w:val="singleLevel"/>
     <w:tmpl w:val="04160001"/>
     <w:lvl w:ilvl="0">
@@ -23742,7 +23776,7 @@
     </w:lvl>
   </w:abstractNum>
   <w:abstractNum w:abstractNumId="14" w15:restartNumberingAfterBreak="0">
-    <w:nsid w:val="3FF96929"/>
+    <w:nsid w:val="45C0273E"/>
     <w:multiLevelType w:val="singleLevel"/>
     <w:tmpl w:val="04160001"/>
     <w:lvl w:ilvl="0">
@@ -23759,7 +23793,7 @@
     </w:lvl>
   </w:abstractNum>
   <w:abstractNum w:abstractNumId="15" w15:restartNumberingAfterBreak="0">
-    <w:nsid w:val="407E6EBC"/>
+    <w:nsid w:val="4775272B"/>
     <w:multiLevelType w:val="singleLevel"/>
     <w:tmpl w:val="04160001"/>
     <w:lvl w:ilvl="0">
@@ -23776,7 +23810,7 @@
     </w:lvl>
   </w:abstractNum>
   <w:abstractNum w:abstractNumId="16" w15:restartNumberingAfterBreak="0">
-    <w:nsid w:val="411915A4"/>
+    <w:nsid w:val="479C6FB6"/>
     <w:multiLevelType w:val="singleLevel"/>
     <w:tmpl w:val="04160001"/>
     <w:lvl w:ilvl="0">
@@ -23793,7 +23827,7 @@
     </w:lvl>
   </w:abstractNum>
   <w:abstractNum w:abstractNumId="17" w15:restartNumberingAfterBreak="0">
-    <w:nsid w:val="47427F1B"/>
+    <w:nsid w:val="4A863BFC"/>
     <w:multiLevelType w:val="singleLevel"/>
     <w:tmpl w:val="04160001"/>
     <w:lvl w:ilvl="0">
@@ -23810,7 +23844,7 @@
     </w:lvl>
   </w:abstractNum>
   <w:abstractNum w:abstractNumId="18" w15:restartNumberingAfterBreak="0">
-    <w:nsid w:val="48861249"/>
+    <w:nsid w:val="4D7B249D"/>
     <w:multiLevelType w:val="singleLevel"/>
     <w:tmpl w:val="04160001"/>
     <w:lvl w:ilvl="0">
@@ -23827,7 +23861,7 @@
     </w:lvl>
   </w:abstractNum>
   <w:abstractNum w:abstractNumId="19" w15:restartNumberingAfterBreak="0">
-    <w:nsid w:val="493A6DC1"/>
+    <w:nsid w:val="514B6F60"/>
     <w:multiLevelType w:val="singleLevel"/>
     <w:tmpl w:val="04160001"/>
     <w:lvl w:ilvl="0">
@@ -23844,7 +23878,7 @@
     </w:lvl>
   </w:abstractNum>
   <w:abstractNum w:abstractNumId="20" w15:restartNumberingAfterBreak="0">
-    <w:nsid w:val="4DB72287"/>
+    <w:nsid w:val="52AA02BB"/>
     <w:multiLevelType w:val="singleLevel"/>
     <w:tmpl w:val="04160001"/>
     <w:lvl w:ilvl="0">
@@ -23861,7 +23895,7 @@
     </w:lvl>
   </w:abstractNum>
   <w:abstractNum w:abstractNumId="21" w15:restartNumberingAfterBreak="0">
-    <w:nsid w:val="50EF1A86"/>
+    <w:nsid w:val="531227DB"/>
     <w:multiLevelType w:val="singleLevel"/>
     <w:tmpl w:val="04160001"/>
     <w:lvl w:ilvl="0">
@@ -23878,7 +23912,7 @@
     </w:lvl>
   </w:abstractNum>
   <w:abstractNum w:abstractNumId="22" w15:restartNumberingAfterBreak="0">
-    <w:nsid w:val="575765F3"/>
+    <w:nsid w:val="54551A0C"/>
     <w:multiLevelType w:val="singleLevel"/>
     <w:tmpl w:val="04160001"/>
     <w:lvl w:ilvl="0">
@@ -23895,7 +23929,7 @@
     </w:lvl>
   </w:abstractNum>
   <w:abstractNum w:abstractNumId="23" w15:restartNumberingAfterBreak="0">
-    <w:nsid w:val="585F7B7A"/>
+    <w:nsid w:val="5A8577A9"/>
     <w:multiLevelType w:val="singleLevel"/>
     <w:tmpl w:val="04160001"/>
     <w:lvl w:ilvl="0">
@@ -23912,7 +23946,7 @@
     </w:lvl>
   </w:abstractNum>
   <w:abstractNum w:abstractNumId="24" w15:restartNumberingAfterBreak="0">
-    <w:nsid w:val="5B935A0C"/>
+    <w:nsid w:val="61AB28B2"/>
     <w:multiLevelType w:val="singleLevel"/>
     <w:tmpl w:val="04160001"/>
     <w:lvl w:ilvl="0">
@@ -23929,7 +23963,7 @@
     </w:lvl>
   </w:abstractNum>
   <w:abstractNum w:abstractNumId="25" w15:restartNumberingAfterBreak="0">
-    <w:nsid w:val="63A90C8E"/>
+    <w:nsid w:val="662C7BA1"/>
     <w:multiLevelType w:val="singleLevel"/>
     <w:tmpl w:val="04160001"/>
     <w:lvl w:ilvl="0">
@@ -23946,7 +23980,7 @@
     </w:lvl>
   </w:abstractNum>
   <w:abstractNum w:abstractNumId="26" w15:restartNumberingAfterBreak="0">
-    <w:nsid w:val="64D46D87"/>
+    <w:nsid w:val="6A1F6DDC"/>
     <w:multiLevelType w:val="singleLevel"/>
     <w:tmpl w:val="04160001"/>
     <w:lvl w:ilvl="0">
@@ -23963,7 +23997,7 @@
     </w:lvl>
   </w:abstractNum>
   <w:abstractNum w:abstractNumId="27" w15:restartNumberingAfterBreak="0">
-    <w:nsid w:val="66800C37"/>
+    <w:nsid w:val="71D66DA1"/>
     <w:multiLevelType w:val="singleLevel"/>
     <w:tmpl w:val="04160001"/>
     <w:lvl w:ilvl="0">
@@ -23980,7 +24014,7 @@
     </w:lvl>
   </w:abstractNum>
   <w:abstractNum w:abstractNumId="28" w15:restartNumberingAfterBreak="0">
-    <w:nsid w:val="6AAB6551"/>
+    <w:nsid w:val="728F25A6"/>
     <w:multiLevelType w:val="singleLevel"/>
     <w:tmpl w:val="04160001"/>
     <w:lvl w:ilvl="0">
@@ -23997,7 +24031,7 @@
     </w:lvl>
   </w:abstractNum>
   <w:abstractNum w:abstractNumId="29" w15:restartNumberingAfterBreak="0">
-    <w:nsid w:val="6DA80D08"/>
+    <w:nsid w:val="74B10A13"/>
     <w:multiLevelType w:val="singleLevel"/>
     <w:tmpl w:val="04160001"/>
     <w:lvl w:ilvl="0">
@@ -24014,7 +24048,7 @@
     </w:lvl>
   </w:abstractNum>
   <w:abstractNum w:abstractNumId="30" w15:restartNumberingAfterBreak="0">
-    <w:nsid w:val="6E063C53"/>
+    <w:nsid w:val="769C1494"/>
     <w:multiLevelType w:val="singleLevel"/>
     <w:tmpl w:val="04160001"/>
     <w:lvl w:ilvl="0">
@@ -24031,7 +24065,7 @@
     </w:lvl>
   </w:abstractNum>
   <w:abstractNum w:abstractNumId="31" w15:restartNumberingAfterBreak="0">
-    <w:nsid w:val="6F931EBB"/>
+    <w:nsid w:val="77024EF7"/>
     <w:multiLevelType w:val="singleLevel"/>
     <w:tmpl w:val="04160001"/>
     <w:lvl w:ilvl="0">
@@ -24048,7 +24082,7 @@
     </w:lvl>
   </w:abstractNum>
   <w:abstractNum w:abstractNumId="32" w15:restartNumberingAfterBreak="0">
-    <w:nsid w:val="6FC242D3"/>
+    <w:nsid w:val="7F0D79AA"/>
     <w:multiLevelType w:val="singleLevel"/>
     <w:tmpl w:val="04160001"/>
     <w:lvl w:ilvl="0">
@@ -24064,104 +24098,104 @@
       </w:rPr>
     </w:lvl>
   </w:abstractNum>
-  <w:num w:numId="1" w16cid:durableId="1343974490">
+  <w:num w:numId="1" w16cid:durableId="1559631420">
+    <w:abstractNumId w:val="11"/>
+  </w:num>
+  <w:num w:numId="2" w16cid:durableId="706678550">
+    <w:abstractNumId w:val="24"/>
+  </w:num>
+  <w:num w:numId="3" w16cid:durableId="2319725">
+    <w:abstractNumId w:val="20"/>
+  </w:num>
+  <w:num w:numId="4" w16cid:durableId="20398541">
+    <w:abstractNumId w:val="9"/>
+  </w:num>
+  <w:num w:numId="5" w16cid:durableId="1502819912">
+    <w:abstractNumId w:val="12"/>
+  </w:num>
+  <w:num w:numId="6" w16cid:durableId="192690616">
+    <w:abstractNumId w:val="5"/>
+  </w:num>
+  <w:num w:numId="7" w16cid:durableId="971053456">
+    <w:abstractNumId w:val="26"/>
+  </w:num>
+  <w:num w:numId="8" w16cid:durableId="1786390570">
+    <w:abstractNumId w:val="2"/>
+  </w:num>
+  <w:num w:numId="9" w16cid:durableId="1310094715">
+    <w:abstractNumId w:val="16"/>
+  </w:num>
+  <w:num w:numId="10" w16cid:durableId="540289286">
     <w:abstractNumId w:val="0"/>
   </w:num>
-  <w:num w:numId="2" w16cid:durableId="388654472">
+  <w:num w:numId="11" w16cid:durableId="732124726">
+    <w:abstractNumId w:val="1"/>
+  </w:num>
+  <w:num w:numId="12" w16cid:durableId="1246957771">
+    <w:abstractNumId w:val="28"/>
+  </w:num>
+  <w:num w:numId="13" w16cid:durableId="526065510">
+    <w:abstractNumId w:val="19"/>
+  </w:num>
+  <w:num w:numId="14" w16cid:durableId="2108964369">
+    <w:abstractNumId w:val="14"/>
+  </w:num>
+  <w:num w:numId="15" w16cid:durableId="1167405948">
+    <w:abstractNumId w:val="18"/>
+  </w:num>
+  <w:num w:numId="16" w16cid:durableId="1422019659">
+    <w:abstractNumId w:val="10"/>
+  </w:num>
+  <w:num w:numId="17" w16cid:durableId="374231210">
+    <w:abstractNumId w:val="17"/>
+  </w:num>
+  <w:num w:numId="18" w16cid:durableId="1484590873">
+    <w:abstractNumId w:val="22"/>
+  </w:num>
+  <w:num w:numId="19" w16cid:durableId="310446907">
+    <w:abstractNumId w:val="31"/>
+  </w:num>
+  <w:num w:numId="20" w16cid:durableId="1070269279">
+    <w:abstractNumId w:val="30"/>
+  </w:num>
+  <w:num w:numId="21" w16cid:durableId="537744543">
+    <w:abstractNumId w:val="3"/>
+  </w:num>
+  <w:num w:numId="22" w16cid:durableId="2010330266">
+    <w:abstractNumId w:val="8"/>
+  </w:num>
+  <w:num w:numId="23" w16cid:durableId="1718624997">
+    <w:abstractNumId w:val="27"/>
+  </w:num>
+  <w:num w:numId="24" w16cid:durableId="1552692902">
+    <w:abstractNumId w:val="13"/>
+  </w:num>
+  <w:num w:numId="25" w16cid:durableId="1601841371">
+    <w:abstractNumId w:val="7"/>
+  </w:num>
+  <w:num w:numId="26" w16cid:durableId="1542014915">
+    <w:abstractNumId w:val="15"/>
+  </w:num>
+  <w:num w:numId="27" w16cid:durableId="211036958">
+    <w:abstractNumId w:val="23"/>
+  </w:num>
+  <w:num w:numId="28" w16cid:durableId="2128354859">
+    <w:abstractNumId w:val="32"/>
+  </w:num>
+  <w:num w:numId="29" w16cid:durableId="402340272">
+    <w:abstractNumId w:val="21"/>
+  </w:num>
+  <w:num w:numId="30" w16cid:durableId="42216567">
+    <w:abstractNumId w:val="4"/>
+  </w:num>
+  <w:num w:numId="31" w16cid:durableId="816915448">
+    <w:abstractNumId w:val="6"/>
+  </w:num>
+  <w:num w:numId="32" w16cid:durableId="467555936">
     <w:abstractNumId w:val="25"/>
   </w:num>
-  <w:num w:numId="3" w16cid:durableId="766852192">
-    <w:abstractNumId w:val="30"/>
-  </w:num>
-  <w:num w:numId="4" w16cid:durableId="2119250244">
-    <w:abstractNumId w:val="17"/>
-  </w:num>
-  <w:num w:numId="5" w16cid:durableId="582686002">
-    <w:abstractNumId w:val="24"/>
-  </w:num>
-  <w:num w:numId="6" w16cid:durableId="1120339832">
-    <w:abstractNumId w:val="19"/>
-  </w:num>
-  <w:num w:numId="7" w16cid:durableId="1496259072">
-    <w:abstractNumId w:val="7"/>
-  </w:num>
-  <w:num w:numId="8" w16cid:durableId="551886889">
+  <w:num w:numId="33" w16cid:durableId="534008096">
     <w:abstractNumId w:val="29"/>
-  </w:num>
-  <w:num w:numId="9" w16cid:durableId="1068193421">
-    <w:abstractNumId w:val="4"/>
-  </w:num>
-  <w:num w:numId="10" w16cid:durableId="1953122899">
-    <w:abstractNumId w:val="8"/>
-  </w:num>
-  <w:num w:numId="11" w16cid:durableId="1050573320">
-    <w:abstractNumId w:val="23"/>
-  </w:num>
-  <w:num w:numId="12" w16cid:durableId="1394229496">
-    <w:abstractNumId w:val="9"/>
-  </w:num>
-  <w:num w:numId="13" w16cid:durableId="1112283255">
-    <w:abstractNumId w:val="12"/>
-  </w:num>
-  <w:num w:numId="14" w16cid:durableId="2048993177">
-    <w:abstractNumId w:val="14"/>
-  </w:num>
-  <w:num w:numId="15" w16cid:durableId="449203869">
-    <w:abstractNumId w:val="6"/>
-  </w:num>
-  <w:num w:numId="16" w16cid:durableId="912472776">
-    <w:abstractNumId w:val="20"/>
-  </w:num>
-  <w:num w:numId="17" w16cid:durableId="1225988727">
-    <w:abstractNumId w:val="28"/>
-  </w:num>
-  <w:num w:numId="18" w16cid:durableId="1514879610">
-    <w:abstractNumId w:val="3"/>
-  </w:num>
-  <w:num w:numId="19" w16cid:durableId="823088151">
-    <w:abstractNumId w:val="11"/>
-  </w:num>
-  <w:num w:numId="20" w16cid:durableId="205306">
-    <w:abstractNumId w:val="10"/>
-  </w:num>
-  <w:num w:numId="21" w16cid:durableId="598491278">
-    <w:abstractNumId w:val="16"/>
-  </w:num>
-  <w:num w:numId="22" w16cid:durableId="289408449">
-    <w:abstractNumId w:val="32"/>
-  </w:num>
-  <w:num w:numId="23" w16cid:durableId="475681569">
-    <w:abstractNumId w:val="27"/>
-  </w:num>
-  <w:num w:numId="24" w16cid:durableId="1942566873">
-    <w:abstractNumId w:val="21"/>
-  </w:num>
-  <w:num w:numId="25" w16cid:durableId="1213074668">
-    <w:abstractNumId w:val="31"/>
-  </w:num>
-  <w:num w:numId="26" w16cid:durableId="436371034">
-    <w:abstractNumId w:val="2"/>
-  </w:num>
-  <w:num w:numId="27" w16cid:durableId="1176189033">
-    <w:abstractNumId w:val="15"/>
-  </w:num>
-  <w:num w:numId="28" w16cid:durableId="1254053257">
-    <w:abstractNumId w:val="5"/>
-  </w:num>
-  <w:num w:numId="29" w16cid:durableId="2103409215">
-    <w:abstractNumId w:val="1"/>
-  </w:num>
-  <w:num w:numId="30" w16cid:durableId="1930112258">
-    <w:abstractNumId w:val="26"/>
-  </w:num>
-  <w:num w:numId="31" w16cid:durableId="467237013">
-    <w:abstractNumId w:val="18"/>
-  </w:num>
-  <w:num w:numId="32" w16cid:durableId="652611088">
-    <w:abstractNumId w:val="13"/>
-  </w:num>
-  <w:num w:numId="33" w16cid:durableId="1579712375">
-    <w:abstractNumId w:val="22"/>
   </w:num>
 </w:numbering>
 </file>
@@ -24574,7 +24608,7 @@
     <w:link w:val="Ttulo1Char"/>
     <w:uiPriority w:val="9"/>
     <w:qFormat/>
-    <w:rsid w:val="00A30922"/>
+    <w:rsid w:val="005A7C0F"/>
     <w:pPr>
       <w:keepNext/>
       <w:keepLines/>
@@ -24596,7 +24630,7 @@
     <w:uiPriority w:val="9"/>
     <w:unhideWhenUsed/>
     <w:qFormat/>
-    <w:rsid w:val="00A30922"/>
+    <w:rsid w:val="005A7C0F"/>
     <w:pPr>
       <w:keepNext/>
       <w:keepLines/>
@@ -24619,7 +24653,7 @@
     <w:semiHidden/>
     <w:unhideWhenUsed/>
     <w:qFormat/>
-    <w:rsid w:val="00A30922"/>
+    <w:rsid w:val="005A7C0F"/>
     <w:pPr>
       <w:keepNext/>
       <w:keepLines/>
@@ -24642,7 +24676,7 @@
     <w:semiHidden/>
     <w:unhideWhenUsed/>
     <w:qFormat/>
-    <w:rsid w:val="00A30922"/>
+    <w:rsid w:val="005A7C0F"/>
     <w:pPr>
       <w:keepNext/>
       <w:keepLines/>
@@ -24665,7 +24699,7 @@
     <w:semiHidden/>
     <w:unhideWhenUsed/>
     <w:qFormat/>
-    <w:rsid w:val="00A30922"/>
+    <w:rsid w:val="005A7C0F"/>
     <w:pPr>
       <w:keepNext/>
       <w:keepLines/>
@@ -24686,7 +24720,7 @@
     <w:semiHidden/>
     <w:unhideWhenUsed/>
     <w:qFormat/>
-    <w:rsid w:val="00A30922"/>
+    <w:rsid w:val="005A7C0F"/>
     <w:pPr>
       <w:keepNext/>
       <w:keepLines/>
@@ -24709,7 +24743,7 @@
     <w:semiHidden/>
     <w:unhideWhenUsed/>
     <w:qFormat/>
-    <w:rsid w:val="00A30922"/>
+    <w:rsid w:val="005A7C0F"/>
     <w:pPr>
       <w:keepNext/>
       <w:keepLines/>
@@ -24730,7 +24764,7 @@
     <w:semiHidden/>
     <w:unhideWhenUsed/>
     <w:qFormat/>
-    <w:rsid w:val="00A30922"/>
+    <w:rsid w:val="005A7C0F"/>
     <w:pPr>
       <w:keepNext/>
       <w:keepLines/>
@@ -24753,7 +24787,7 @@
     <w:semiHidden/>
     <w:unhideWhenUsed/>
     <w:qFormat/>
-    <w:rsid w:val="00A30922"/>
+    <w:rsid w:val="005A7C0F"/>
     <w:pPr>
       <w:keepNext/>
       <w:keepLines/>
@@ -24797,7 +24831,7 @@
     <w:basedOn w:val="Fontepargpadro"/>
     <w:link w:val="Ttulo1"/>
     <w:uiPriority w:val="9"/>
-    <w:rsid w:val="00A30922"/>
+    <w:rsid w:val="005A7C0F"/>
     <w:rPr>
       <w:rFonts w:asciiTheme="majorHAnsi" w:eastAsiaTheme="majorEastAsia" w:hAnsiTheme="majorHAnsi" w:cstheme="majorBidi"/>
       <w:color w:val="0F4761" w:themeColor="accent1" w:themeShade="BF"/>
@@ -24810,7 +24844,7 @@
     <w:basedOn w:val="Fontepargpadro"/>
     <w:link w:val="Ttulo2"/>
     <w:uiPriority w:val="9"/>
-    <w:rsid w:val="00A30922"/>
+    <w:rsid w:val="005A7C0F"/>
     <w:rPr>
       <w:rFonts w:asciiTheme="majorHAnsi" w:eastAsiaTheme="majorEastAsia" w:hAnsiTheme="majorHAnsi" w:cstheme="majorBidi"/>
       <w:color w:val="0F4761" w:themeColor="accent1" w:themeShade="BF"/>
@@ -24824,7 +24858,7 @@
     <w:link w:val="Ttulo3"/>
     <w:uiPriority w:val="9"/>
     <w:semiHidden/>
-    <w:rsid w:val="00A30922"/>
+    <w:rsid w:val="005A7C0F"/>
     <w:rPr>
       <w:rFonts w:eastAsiaTheme="majorEastAsia" w:cstheme="majorBidi"/>
       <w:color w:val="0F4761" w:themeColor="accent1" w:themeShade="BF"/>
@@ -24838,7 +24872,7 @@
     <w:link w:val="Ttulo4"/>
     <w:uiPriority w:val="9"/>
     <w:semiHidden/>
-    <w:rsid w:val="00A30922"/>
+    <w:rsid w:val="005A7C0F"/>
     <w:rPr>
       <w:rFonts w:eastAsiaTheme="majorEastAsia" w:cstheme="majorBidi"/>
       <w:i/>
@@ -24852,7 +24886,7 @@
     <w:link w:val="Ttulo5"/>
     <w:uiPriority w:val="9"/>
     <w:semiHidden/>
-    <w:rsid w:val="00A30922"/>
+    <w:rsid w:val="005A7C0F"/>
     <w:rPr>
       <w:rFonts w:eastAsiaTheme="majorEastAsia" w:cstheme="majorBidi"/>
       <w:color w:val="0F4761" w:themeColor="accent1" w:themeShade="BF"/>
@@ -24864,7 +24898,7 @@
     <w:link w:val="Ttulo6"/>
     <w:uiPriority w:val="9"/>
     <w:semiHidden/>
-    <w:rsid w:val="00A30922"/>
+    <w:rsid w:val="005A7C0F"/>
     <w:rPr>
       <w:rFonts w:eastAsiaTheme="majorEastAsia" w:cstheme="majorBidi"/>
       <w:i/>
@@ -24878,7 +24912,7 @@
     <w:link w:val="Ttulo7"/>
     <w:uiPriority w:val="9"/>
     <w:semiHidden/>
-    <w:rsid w:val="00A30922"/>
+    <w:rsid w:val="005A7C0F"/>
     <w:rPr>
       <w:rFonts w:eastAsiaTheme="majorEastAsia" w:cstheme="majorBidi"/>
       <w:color w:val="595959" w:themeColor="text1" w:themeTint="A6"/>
@@ -24890,7 +24924,7 @@
     <w:link w:val="Ttulo8"/>
     <w:uiPriority w:val="9"/>
     <w:semiHidden/>
-    <w:rsid w:val="00A30922"/>
+    <w:rsid w:val="005A7C0F"/>
     <w:rPr>
       <w:rFonts w:eastAsiaTheme="majorEastAsia" w:cstheme="majorBidi"/>
       <w:i/>
@@ -24904,7 +24938,7 @@
     <w:link w:val="Ttulo9"/>
     <w:uiPriority w:val="9"/>
     <w:semiHidden/>
-    <w:rsid w:val="00A30922"/>
+    <w:rsid w:val="005A7C0F"/>
     <w:rPr>
       <w:rFonts w:eastAsiaTheme="majorEastAsia" w:cstheme="majorBidi"/>
       <w:color w:val="272727" w:themeColor="text1" w:themeTint="D8"/>
@@ -24917,7 +24951,7 @@
     <w:link w:val="TtuloChar"/>
     <w:uiPriority w:val="10"/>
     <w:qFormat/>
-    <w:rsid w:val="00A30922"/>
+    <w:rsid w:val="005A7C0F"/>
     <w:pPr>
       <w:spacing w:after="80" w:line="240" w:lineRule="auto"/>
       <w:contextualSpacing/>
@@ -24935,7 +24969,7 @@
     <w:basedOn w:val="Fontepargpadro"/>
     <w:link w:val="Ttulo"/>
     <w:uiPriority w:val="10"/>
-    <w:rsid w:val="00A30922"/>
+    <w:rsid w:val="005A7C0F"/>
     <w:rPr>
       <w:rFonts w:asciiTheme="majorHAnsi" w:eastAsiaTheme="majorEastAsia" w:hAnsiTheme="majorHAnsi" w:cstheme="majorBidi"/>
       <w:spacing w:val="-10"/>
@@ -24951,7 +24985,7 @@
     <w:link w:val="SubttuloChar"/>
     <w:uiPriority w:val="11"/>
     <w:qFormat/>
-    <w:rsid w:val="00A30922"/>
+    <w:rsid w:val="005A7C0F"/>
     <w:pPr>
       <w:numPr>
         <w:ilvl w:val="1"/>
@@ -24970,7 +25004,7 @@
     <w:basedOn w:val="Fontepargpadro"/>
     <w:link w:val="Subttulo"/>
     <w:uiPriority w:val="11"/>
-    <w:rsid w:val="00A30922"/>
+    <w:rsid w:val="005A7C0F"/>
     <w:rPr>
       <w:rFonts w:eastAsiaTheme="majorEastAsia" w:cstheme="majorBidi"/>
       <w:color w:val="595959" w:themeColor="text1" w:themeTint="A6"/>
@@ -24986,7 +25020,7 @@
     <w:link w:val="CitaoChar"/>
     <w:uiPriority w:val="29"/>
     <w:qFormat/>
-    <w:rsid w:val="00A30922"/>
+    <w:rsid w:val="005A7C0F"/>
     <w:pPr>
       <w:spacing w:before="160"/>
       <w:jc w:val="center"/>
@@ -25002,7 +25036,7 @@
     <w:basedOn w:val="Fontepargpadro"/>
     <w:link w:val="Citao"/>
     <w:uiPriority w:val="29"/>
-    <w:rsid w:val="00A30922"/>
+    <w:rsid w:val="005A7C0F"/>
     <w:rPr>
       <w:i/>
       <w:iCs/>
@@ -25014,7 +25048,7 @@
     <w:basedOn w:val="Normal"/>
     <w:uiPriority w:val="34"/>
     <w:qFormat/>
-    <w:rsid w:val="00A30922"/>
+    <w:rsid w:val="005A7C0F"/>
     <w:pPr>
       <w:ind w:left="720"/>
       <w:contextualSpacing/>
@@ -25025,7 +25059,7 @@
     <w:basedOn w:val="Fontepargpadro"/>
     <w:uiPriority w:val="21"/>
     <w:qFormat/>
-    <w:rsid w:val="00A30922"/>
+    <w:rsid w:val="005A7C0F"/>
     <w:rPr>
       <w:i/>
       <w:iCs/>
@@ -25039,7 +25073,7 @@
     <w:link w:val="CitaoIntensaChar"/>
     <w:uiPriority w:val="30"/>
     <w:qFormat/>
-    <w:rsid w:val="00A30922"/>
+    <w:rsid w:val="005A7C0F"/>
     <w:pPr>
       <w:pBdr>
         <w:top w:val="single" w:sz="4" w:space="10" w:color="0F4761" w:themeColor="accent1" w:themeShade="BF"/>
@@ -25060,7 +25094,7 @@
     <w:basedOn w:val="Fontepargpadro"/>
     <w:link w:val="CitaoIntensa"/>
     <w:uiPriority w:val="30"/>
-    <w:rsid w:val="00A30922"/>
+    <w:rsid w:val="005A7C0F"/>
     <w:rPr>
       <w:i/>
       <w:iCs/>
@@ -25072,7 +25106,7 @@
     <w:basedOn w:val="Fontepargpadro"/>
     <w:uiPriority w:val="32"/>
     <w:qFormat/>
-    <w:rsid w:val="00A30922"/>
+    <w:rsid w:val="005A7C0F"/>
     <w:rPr>
       <w:b/>
       <w:bCs/>
@@ -25087,7 +25121,7 @@
     <w:link w:val="CabealhoChar"/>
     <w:uiPriority w:val="99"/>
     <w:unhideWhenUsed/>
-    <w:rsid w:val="00A30922"/>
+    <w:rsid w:val="005A7C0F"/>
     <w:pPr>
       <w:tabs>
         <w:tab w:val="center" w:pos="4252"/>
@@ -25101,7 +25135,7 @@
     <w:basedOn w:val="Fontepargpadro"/>
     <w:link w:val="Cabealho"/>
     <w:uiPriority w:val="99"/>
-    <w:rsid w:val="00A30922"/>
+    <w:rsid w:val="005A7C0F"/>
   </w:style>
   <w:style w:type="paragraph" w:styleId="Rodap">
     <w:name w:val="footer"/>
@@ -25109,7 +25143,7 @@
     <w:link w:val="RodapChar"/>
     <w:uiPriority w:val="99"/>
     <w:unhideWhenUsed/>
-    <w:rsid w:val="00A30922"/>
+    <w:rsid w:val="005A7C0F"/>
     <w:pPr>
       <w:tabs>
         <w:tab w:val="center" w:pos="4252"/>
@@ -25123,7 +25157,7 @@
     <w:basedOn w:val="Fontepargpadro"/>
     <w:link w:val="Rodap"/>
     <w:uiPriority w:val="99"/>
-    <w:rsid w:val="00A30922"/>
+    <w:rsid w:val="005A7C0F"/>
   </w:style>
   <w:style w:type="paragraph" w:styleId="Sumrio1">
     <w:name w:val="toc 1"/>
@@ -25132,7 +25166,7 @@
     <w:autoRedefine/>
     <w:uiPriority w:val="39"/>
     <w:unhideWhenUsed/>
-    <w:rsid w:val="00A30922"/>
+    <w:rsid w:val="005A7C0F"/>
     <w:pPr>
       <w:spacing w:after="100"/>
     </w:pPr>
@@ -25144,7 +25178,7 @@
     <w:autoRedefine/>
     <w:uiPriority w:val="39"/>
     <w:unhideWhenUsed/>
-    <w:rsid w:val="00A30922"/>
+    <w:rsid w:val="005A7C0F"/>
     <w:pPr>
       <w:spacing w:after="100"/>
       <w:ind w:left="240"/>

</xml_diff>

<commit_message>
Sincroniza com a produção — correção de layout na tabela de Cronograma do Planejamento
Co-Authored-By: Claude Sonnet 5 <noreply@anthropic.com>
</commit_message>
<xml_diff>
--- a/Manual de Uso - Ferramenta de Gestao de Projetos.docx
+++ b/Manual de Uso - Ferramenta de Gestao de Projetos.docx
@@ -229,7 +229,7 @@
         <w:rPr>
           <w:noProof/>
         </w:rPr>
-        <w:instrText xml:space="preserve"> PAGEREF _Toc240274103 \h </w:instrText>
+        <w:instrText xml:space="preserve"> PAGEREF _Toc240275425 \h </w:instrText>
       </w:r>
       <w:r>
         <w:rPr>
@@ -290,7 +290,7 @@
         <w:rPr>
           <w:noProof/>
         </w:rPr>
-        <w:instrText xml:space="preserve"> PAGEREF _Toc240274104 \h </w:instrText>
+        <w:instrText xml:space="preserve"> PAGEREF _Toc240275426 \h </w:instrText>
       </w:r>
       <w:r>
         <w:rPr>
@@ -351,7 +351,7 @@
         <w:rPr>
           <w:noProof/>
         </w:rPr>
-        <w:instrText xml:space="preserve"> PAGEREF _Toc240274105 \h </w:instrText>
+        <w:instrText xml:space="preserve"> PAGEREF _Toc240275427 \h </w:instrText>
       </w:r>
       <w:r>
         <w:rPr>
@@ -368,7 +368,7 @@
         <w:rPr>
           <w:noProof/>
         </w:rPr>
-        <w:t>17</w:t>
+        <w:t>18</w:t>
       </w:r>
       <w:r>
         <w:rPr>
@@ -412,7 +412,7 @@
         <w:rPr>
           <w:noProof/>
         </w:rPr>
-        <w:instrText xml:space="preserve"> PAGEREF _Toc240274106 \h </w:instrText>
+        <w:instrText xml:space="preserve"> PAGEREF _Toc240275428 \h </w:instrText>
       </w:r>
       <w:r>
         <w:rPr>
@@ -473,7 +473,7 @@
         <w:rPr>
           <w:noProof/>
         </w:rPr>
-        <w:instrText xml:space="preserve"> PAGEREF _Toc240274107 \h </w:instrText>
+        <w:instrText xml:space="preserve"> PAGEREF _Toc240275429 \h </w:instrText>
       </w:r>
       <w:r>
         <w:rPr>
@@ -534,7 +534,7 @@
         <w:rPr>
           <w:noProof/>
         </w:rPr>
-        <w:instrText xml:space="preserve"> PAGEREF _Toc240274108 \h </w:instrText>
+        <w:instrText xml:space="preserve"> PAGEREF _Toc240275430 \h </w:instrText>
       </w:r>
       <w:r>
         <w:rPr>
@@ -551,7 +551,7 @@
         <w:rPr>
           <w:noProof/>
         </w:rPr>
-        <w:t>21</w:t>
+        <w:t>22</w:t>
       </w:r>
       <w:r>
         <w:rPr>
@@ -595,7 +595,7 @@
         <w:rPr>
           <w:noProof/>
         </w:rPr>
-        <w:instrText xml:space="preserve"> PAGEREF _Toc240274109 \h </w:instrText>
+        <w:instrText xml:space="preserve"> PAGEREF _Toc240275431 \h </w:instrText>
       </w:r>
       <w:r>
         <w:rPr>
@@ -612,7 +612,7 @@
         <w:rPr>
           <w:noProof/>
         </w:rPr>
-        <w:t>21</w:t>
+        <w:t>22</w:t>
       </w:r>
       <w:r>
         <w:rPr>
@@ -656,7 +656,7 @@
         <w:rPr>
           <w:noProof/>
         </w:rPr>
-        <w:instrText xml:space="preserve"> PAGEREF _Toc240274110 \h </w:instrText>
+        <w:instrText xml:space="preserve"> PAGEREF _Toc240275432 \h </w:instrText>
       </w:r>
       <w:r>
         <w:rPr>
@@ -673,7 +673,7 @@
         <w:rPr>
           <w:noProof/>
         </w:rPr>
-        <w:t>21</w:t>
+        <w:t>22</w:t>
       </w:r>
       <w:r>
         <w:rPr>
@@ -717,7 +717,7 @@
         <w:rPr>
           <w:noProof/>
         </w:rPr>
-        <w:instrText xml:space="preserve"> PAGEREF _Toc240274111 \h </w:instrText>
+        <w:instrText xml:space="preserve"> PAGEREF _Toc240275433 \h </w:instrText>
       </w:r>
       <w:r>
         <w:rPr>
@@ -734,7 +734,7 @@
         <w:rPr>
           <w:noProof/>
         </w:rPr>
-        <w:t>21</w:t>
+        <w:t>22</w:t>
       </w:r>
       <w:r>
         <w:rPr>
@@ -778,7 +778,7 @@
         <w:rPr>
           <w:noProof/>
         </w:rPr>
-        <w:instrText xml:space="preserve"> PAGEREF _Toc240274112 \h </w:instrText>
+        <w:instrText xml:space="preserve"> PAGEREF _Toc240275434 \h </w:instrText>
       </w:r>
       <w:r>
         <w:rPr>
@@ -795,7 +795,7 @@
         <w:rPr>
           <w:noProof/>
         </w:rPr>
-        <w:t>22</w:t>
+        <w:t>23</w:t>
       </w:r>
       <w:r>
         <w:rPr>
@@ -839,7 +839,7 @@
         <w:rPr>
           <w:noProof/>
         </w:rPr>
-        <w:instrText xml:space="preserve"> PAGEREF _Toc240274113 \h </w:instrText>
+        <w:instrText xml:space="preserve"> PAGEREF _Toc240275435 \h </w:instrText>
       </w:r>
       <w:r>
         <w:rPr>
@@ -856,7 +856,7 @@
         <w:rPr>
           <w:noProof/>
         </w:rPr>
-        <w:t>23</w:t>
+        <w:t>24</w:t>
       </w:r>
       <w:r>
         <w:rPr>
@@ -900,7 +900,7 @@
         <w:rPr>
           <w:noProof/>
         </w:rPr>
-        <w:instrText xml:space="preserve"> PAGEREF _Toc240274114 \h </w:instrText>
+        <w:instrText xml:space="preserve"> PAGEREF _Toc240275436 \h </w:instrText>
       </w:r>
       <w:r>
         <w:rPr>
@@ -917,7 +917,7 @@
         <w:rPr>
           <w:noProof/>
         </w:rPr>
-        <w:t>25</w:t>
+        <w:t>26</w:t>
       </w:r>
       <w:r>
         <w:rPr>
@@ -961,7 +961,7 @@
         <w:rPr>
           <w:noProof/>
         </w:rPr>
-        <w:instrText xml:space="preserve"> PAGEREF _Toc240274115 \h </w:instrText>
+        <w:instrText xml:space="preserve"> PAGEREF _Toc240275437 \h </w:instrText>
       </w:r>
       <w:r>
         <w:rPr>
@@ -978,7 +978,7 @@
         <w:rPr>
           <w:noProof/>
         </w:rPr>
-        <w:t>26</w:t>
+        <w:t>27</w:t>
       </w:r>
       <w:r>
         <w:rPr>
@@ -1022,7 +1022,7 @@
         <w:rPr>
           <w:noProof/>
         </w:rPr>
-        <w:instrText xml:space="preserve"> PAGEREF _Toc240274116 \h </w:instrText>
+        <w:instrText xml:space="preserve"> PAGEREF _Toc240275438 \h </w:instrText>
       </w:r>
       <w:r>
         <w:rPr>
@@ -1039,7 +1039,7 @@
         <w:rPr>
           <w:noProof/>
         </w:rPr>
-        <w:t>27</w:t>
+        <w:t>28</w:t>
       </w:r>
       <w:r>
         <w:rPr>
@@ -1083,7 +1083,7 @@
         <w:rPr>
           <w:noProof/>
         </w:rPr>
-        <w:instrText xml:space="preserve"> PAGEREF _Toc240274117 \h </w:instrText>
+        <w:instrText xml:space="preserve"> PAGEREF _Toc240275439 \h </w:instrText>
       </w:r>
       <w:r>
         <w:rPr>
@@ -1100,7 +1100,7 @@
         <w:rPr>
           <w:noProof/>
         </w:rPr>
-        <w:t>27</w:t>
+        <w:t>28</w:t>
       </w:r>
       <w:r>
         <w:rPr>
@@ -1144,7 +1144,7 @@
         <w:rPr>
           <w:noProof/>
         </w:rPr>
-        <w:instrText xml:space="preserve"> PAGEREF _Toc240274118 \h </w:instrText>
+        <w:instrText xml:space="preserve"> PAGEREF _Toc240275440 \h </w:instrText>
       </w:r>
       <w:r>
         <w:rPr>
@@ -1161,7 +1161,7 @@
         <w:rPr>
           <w:noProof/>
         </w:rPr>
-        <w:t>28</w:t>
+        <w:t>29</w:t>
       </w:r>
       <w:r>
         <w:rPr>
@@ -1205,7 +1205,7 @@
         <w:rPr>
           <w:noProof/>
         </w:rPr>
-        <w:instrText xml:space="preserve"> PAGEREF _Toc240274119 \h </w:instrText>
+        <w:instrText xml:space="preserve"> PAGEREF _Toc240275441 \h </w:instrText>
       </w:r>
       <w:r>
         <w:rPr>
@@ -1222,7 +1222,7 @@
         <w:rPr>
           <w:noProof/>
         </w:rPr>
-        <w:t>29</w:t>
+        <w:t>30</w:t>
       </w:r>
       <w:r>
         <w:rPr>
@@ -1266,7 +1266,7 @@
         <w:rPr>
           <w:noProof/>
         </w:rPr>
-        <w:instrText xml:space="preserve"> PAGEREF _Toc240274120 \h </w:instrText>
+        <w:instrText xml:space="preserve"> PAGEREF _Toc240275442 \h </w:instrText>
       </w:r>
       <w:r>
         <w:rPr>
@@ -1283,7 +1283,7 @@
         <w:rPr>
           <w:noProof/>
         </w:rPr>
-        <w:t>29</w:t>
+        <w:t>30</w:t>
       </w:r>
       <w:r>
         <w:rPr>
@@ -1327,7 +1327,7 @@
         <w:rPr>
           <w:noProof/>
         </w:rPr>
-        <w:instrText xml:space="preserve"> PAGEREF _Toc240274121 \h </w:instrText>
+        <w:instrText xml:space="preserve"> PAGEREF _Toc240275443 \h </w:instrText>
       </w:r>
       <w:r>
         <w:rPr>
@@ -1344,7 +1344,7 @@
         <w:rPr>
           <w:noProof/>
         </w:rPr>
-        <w:t>31</w:t>
+        <w:t>32</w:t>
       </w:r>
       <w:r>
         <w:rPr>
@@ -1388,7 +1388,7 @@
         <w:rPr>
           <w:noProof/>
         </w:rPr>
-        <w:instrText xml:space="preserve"> PAGEREF _Toc240274122 \h </w:instrText>
+        <w:instrText xml:space="preserve"> PAGEREF _Toc240275444 \h </w:instrText>
       </w:r>
       <w:r>
         <w:rPr>
@@ -1405,7 +1405,7 @@
         <w:rPr>
           <w:noProof/>
         </w:rPr>
-        <w:t>33</w:t>
+        <w:t>34</w:t>
       </w:r>
       <w:r>
         <w:rPr>
@@ -1449,7 +1449,7 @@
         <w:rPr>
           <w:noProof/>
         </w:rPr>
-        <w:instrText xml:space="preserve"> PAGEREF _Toc240274123 \h </w:instrText>
+        <w:instrText xml:space="preserve"> PAGEREF _Toc240275445 \h </w:instrText>
       </w:r>
       <w:r>
         <w:rPr>
@@ -1466,7 +1466,7 @@
         <w:rPr>
           <w:noProof/>
         </w:rPr>
-        <w:t>33</w:t>
+        <w:t>34</w:t>
       </w:r>
       <w:r>
         <w:rPr>
@@ -1510,7 +1510,7 @@
         <w:rPr>
           <w:noProof/>
         </w:rPr>
-        <w:instrText xml:space="preserve"> PAGEREF _Toc240274124 \h </w:instrText>
+        <w:instrText xml:space="preserve"> PAGEREF _Toc240275446 \h </w:instrText>
       </w:r>
       <w:r>
         <w:rPr>
@@ -1527,7 +1527,7 @@
         <w:rPr>
           <w:noProof/>
         </w:rPr>
-        <w:t>36</w:t>
+        <w:t>37</w:t>
       </w:r>
       <w:r>
         <w:rPr>
@@ -1571,7 +1571,7 @@
         <w:rPr>
           <w:noProof/>
         </w:rPr>
-        <w:instrText xml:space="preserve"> PAGEREF _Toc240274125 \h </w:instrText>
+        <w:instrText xml:space="preserve"> PAGEREF _Toc240275447 \h </w:instrText>
       </w:r>
       <w:r>
         <w:rPr>
@@ -1588,7 +1588,7 @@
         <w:rPr>
           <w:noProof/>
         </w:rPr>
-        <w:t>38</w:t>
+        <w:t>39</w:t>
       </w:r>
       <w:r>
         <w:rPr>
@@ -1632,7 +1632,7 @@
         <w:rPr>
           <w:noProof/>
         </w:rPr>
-        <w:instrText xml:space="preserve"> PAGEREF _Toc240274126 \h </w:instrText>
+        <w:instrText xml:space="preserve"> PAGEREF _Toc240275448 \h </w:instrText>
       </w:r>
       <w:r>
         <w:rPr>
@@ -1649,7 +1649,7 @@
         <w:rPr>
           <w:noProof/>
         </w:rPr>
-        <w:t>42</w:t>
+        <w:t>43</w:t>
       </w:r>
       <w:r>
         <w:rPr>
@@ -1693,7 +1693,7 @@
         <w:rPr>
           <w:noProof/>
         </w:rPr>
-        <w:instrText xml:space="preserve"> PAGEREF _Toc240274127 \h </w:instrText>
+        <w:instrText xml:space="preserve"> PAGEREF _Toc240275449 \h </w:instrText>
       </w:r>
       <w:r>
         <w:rPr>
@@ -1710,7 +1710,7 @@
         <w:rPr>
           <w:noProof/>
         </w:rPr>
-        <w:t>46</w:t>
+        <w:t>47</w:t>
       </w:r>
       <w:r>
         <w:rPr>
@@ -1755,7 +1755,7 @@
         <w:rPr>
           <w:noProof/>
         </w:rPr>
-        <w:instrText xml:space="preserve"> PAGEREF _Toc240274128 \h </w:instrText>
+        <w:instrText xml:space="preserve"> PAGEREF _Toc240275450 \h </w:instrText>
       </w:r>
       <w:r>
         <w:rPr>
@@ -1772,7 +1772,7 @@
         <w:rPr>
           <w:noProof/>
         </w:rPr>
-        <w:t>49</w:t>
+        <w:t>50</w:t>
       </w:r>
       <w:r>
         <w:rPr>
@@ -1816,7 +1816,7 @@
         <w:rPr>
           <w:noProof/>
         </w:rPr>
-        <w:instrText xml:space="preserve"> PAGEREF _Toc240274129 \h </w:instrText>
+        <w:instrText xml:space="preserve"> PAGEREF _Toc240275451 \h </w:instrText>
       </w:r>
       <w:r>
         <w:rPr>
@@ -1833,7 +1833,7 @@
         <w:rPr>
           <w:noProof/>
         </w:rPr>
-        <w:t>51</w:t>
+        <w:t>52</w:t>
       </w:r>
       <w:r>
         <w:rPr>
@@ -1877,7 +1877,7 @@
         <w:rPr>
           <w:noProof/>
         </w:rPr>
-        <w:instrText xml:space="preserve"> PAGEREF _Toc240274130 \h </w:instrText>
+        <w:instrText xml:space="preserve"> PAGEREF _Toc240275452 \h </w:instrText>
       </w:r>
       <w:r>
         <w:rPr>
@@ -1894,7 +1894,7 @@
         <w:rPr>
           <w:noProof/>
         </w:rPr>
-        <w:t>53</w:t>
+        <w:t>54</w:t>
       </w:r>
       <w:r>
         <w:rPr>
@@ -1938,7 +1938,7 @@
         <w:rPr>
           <w:noProof/>
         </w:rPr>
-        <w:instrText xml:space="preserve"> PAGEREF _Toc240274131 \h </w:instrText>
+        <w:instrText xml:space="preserve"> PAGEREF _Toc240275453 \h </w:instrText>
       </w:r>
       <w:r>
         <w:rPr>
@@ -1955,7 +1955,7 @@
         <w:rPr>
           <w:noProof/>
         </w:rPr>
-        <w:t>56</w:t>
+        <w:t>57</w:t>
       </w:r>
       <w:r>
         <w:rPr>
@@ -1999,7 +1999,7 @@
         <w:rPr>
           <w:noProof/>
         </w:rPr>
-        <w:instrText xml:space="preserve"> PAGEREF _Toc240274132 \h </w:instrText>
+        <w:instrText xml:space="preserve"> PAGEREF _Toc240275454 \h </w:instrText>
       </w:r>
       <w:r>
         <w:rPr>
@@ -2016,7 +2016,7 @@
         <w:rPr>
           <w:noProof/>
         </w:rPr>
-        <w:t>58</w:t>
+        <w:t>59</w:t>
       </w:r>
       <w:r>
         <w:rPr>
@@ -2060,7 +2060,7 @@
         <w:rPr>
           <w:noProof/>
         </w:rPr>
-        <w:instrText xml:space="preserve"> PAGEREF _Toc240274133 \h </w:instrText>
+        <w:instrText xml:space="preserve"> PAGEREF _Toc240275455 \h </w:instrText>
       </w:r>
       <w:r>
         <w:rPr>
@@ -2077,7 +2077,7 @@
         <w:rPr>
           <w:noProof/>
         </w:rPr>
-        <w:t>60</w:t>
+        <w:t>61</w:t>
       </w:r>
       <w:r>
         <w:rPr>
@@ -2121,7 +2121,7 @@
         <w:rPr>
           <w:noProof/>
         </w:rPr>
-        <w:instrText xml:space="preserve"> PAGEREF _Toc240274134 \h </w:instrText>
+        <w:instrText xml:space="preserve"> PAGEREF _Toc240275456 \h </w:instrText>
       </w:r>
       <w:r>
         <w:rPr>
@@ -2138,7 +2138,7 @@
         <w:rPr>
           <w:noProof/>
         </w:rPr>
-        <w:t>60</w:t>
+        <w:t>61</w:t>
       </w:r>
       <w:r>
         <w:rPr>
@@ -2182,7 +2182,7 @@
         <w:rPr>
           <w:noProof/>
         </w:rPr>
-        <w:instrText xml:space="preserve"> PAGEREF _Toc240274135 \h </w:instrText>
+        <w:instrText xml:space="preserve"> PAGEREF _Toc240275457 \h </w:instrText>
       </w:r>
       <w:r>
         <w:rPr>
@@ -2199,7 +2199,7 @@
         <w:rPr>
           <w:noProof/>
         </w:rPr>
-        <w:t>67</w:t>
+        <w:t>68</w:t>
       </w:r>
       <w:r>
         <w:rPr>
@@ -2243,7 +2243,7 @@
         <w:rPr>
           <w:noProof/>
         </w:rPr>
-        <w:instrText xml:space="preserve"> PAGEREF _Toc240274136 \h </w:instrText>
+        <w:instrText xml:space="preserve"> PAGEREF _Toc240275458 \h </w:instrText>
       </w:r>
       <w:r>
         <w:rPr>
@@ -2260,7 +2260,7 @@
         <w:rPr>
           <w:noProof/>
         </w:rPr>
-        <w:t>72</w:t>
+        <w:t>73</w:t>
       </w:r>
       <w:r>
         <w:rPr>
@@ -2304,7 +2304,7 @@
         <w:rPr>
           <w:noProof/>
         </w:rPr>
-        <w:instrText xml:space="preserve"> PAGEREF _Toc240274137 \h </w:instrText>
+        <w:instrText xml:space="preserve"> PAGEREF _Toc240275459 \h </w:instrText>
       </w:r>
       <w:r>
         <w:rPr>
@@ -2321,7 +2321,7 @@
         <w:rPr>
           <w:noProof/>
         </w:rPr>
-        <w:t>72</w:t>
+        <w:t>73</w:t>
       </w:r>
       <w:r>
         <w:rPr>
@@ -2365,7 +2365,7 @@
         <w:rPr>
           <w:noProof/>
         </w:rPr>
-        <w:instrText xml:space="preserve"> PAGEREF _Toc240274138 \h </w:instrText>
+        <w:instrText xml:space="preserve"> PAGEREF _Toc240275460 \h </w:instrText>
       </w:r>
       <w:r>
         <w:rPr>
@@ -2382,7 +2382,7 @@
         <w:rPr>
           <w:noProof/>
         </w:rPr>
-        <w:t>73</w:t>
+        <w:t>74</w:t>
       </w:r>
       <w:r>
         <w:rPr>
@@ -2426,7 +2426,7 @@
         <w:rPr>
           <w:noProof/>
         </w:rPr>
-        <w:instrText xml:space="preserve"> PAGEREF _Toc240274139 \h </w:instrText>
+        <w:instrText xml:space="preserve"> PAGEREF _Toc240275461 \h </w:instrText>
       </w:r>
       <w:r>
         <w:rPr>
@@ -2443,7 +2443,7 @@
         <w:rPr>
           <w:noProof/>
         </w:rPr>
-        <w:t>73</w:t>
+        <w:t>74</w:t>
       </w:r>
       <w:r>
         <w:rPr>
@@ -2487,7 +2487,7 @@
         <w:rPr>
           <w:noProof/>
         </w:rPr>
-        <w:instrText xml:space="preserve"> PAGEREF _Toc240274140 \h </w:instrText>
+        <w:instrText xml:space="preserve"> PAGEREF _Toc240275462 \h </w:instrText>
       </w:r>
       <w:r>
         <w:rPr>
@@ -2504,7 +2504,7 @@
         <w:rPr>
           <w:noProof/>
         </w:rPr>
-        <w:t>76</w:t>
+        <w:t>77</w:t>
       </w:r>
       <w:r>
         <w:rPr>
@@ -2548,7 +2548,7 @@
         <w:rPr>
           <w:noProof/>
         </w:rPr>
-        <w:instrText xml:space="preserve"> PAGEREF _Toc240274141 \h </w:instrText>
+        <w:instrText xml:space="preserve"> PAGEREF _Toc240275463 \h </w:instrText>
       </w:r>
       <w:r>
         <w:rPr>
@@ -2565,7 +2565,7 @@
         <w:rPr>
           <w:noProof/>
         </w:rPr>
-        <w:t>76</w:t>
+        <w:t>77</w:t>
       </w:r>
       <w:r>
         <w:rPr>
@@ -2609,7 +2609,7 @@
         <w:rPr>
           <w:noProof/>
         </w:rPr>
-        <w:instrText xml:space="preserve"> PAGEREF _Toc240274142 \h </w:instrText>
+        <w:instrText xml:space="preserve"> PAGEREF _Toc240275464 \h </w:instrText>
       </w:r>
       <w:r>
         <w:rPr>
@@ -2626,7 +2626,7 @@
         <w:rPr>
           <w:noProof/>
         </w:rPr>
-        <w:t>78</w:t>
+        <w:t>79</w:t>
       </w:r>
       <w:r>
         <w:rPr>
@@ -2670,7 +2670,7 @@
         <w:rPr>
           <w:noProof/>
         </w:rPr>
-        <w:instrText xml:space="preserve"> PAGEREF _Toc240274143 \h </w:instrText>
+        <w:instrText xml:space="preserve"> PAGEREF _Toc240275465 \h </w:instrText>
       </w:r>
       <w:r>
         <w:rPr>
@@ -2687,7 +2687,7 @@
         <w:rPr>
           <w:noProof/>
         </w:rPr>
-        <w:t>78</w:t>
+        <w:t>79</w:t>
       </w:r>
       <w:r>
         <w:rPr>
@@ -2731,7 +2731,7 @@
         <w:rPr>
           <w:noProof/>
         </w:rPr>
-        <w:instrText xml:space="preserve"> PAGEREF _Toc240274144 \h </w:instrText>
+        <w:instrText xml:space="preserve"> PAGEREF _Toc240275466 \h </w:instrText>
       </w:r>
       <w:r>
         <w:rPr>
@@ -2748,7 +2748,7 @@
         <w:rPr>
           <w:noProof/>
         </w:rPr>
-        <w:t>80</w:t>
+        <w:t>81</w:t>
       </w:r>
       <w:r>
         <w:rPr>
@@ -2792,7 +2792,7 @@
         <w:rPr>
           <w:noProof/>
         </w:rPr>
-        <w:instrText xml:space="preserve"> PAGEREF _Toc240274145 \h </w:instrText>
+        <w:instrText xml:space="preserve"> PAGEREF _Toc240275467 \h </w:instrText>
       </w:r>
       <w:r>
         <w:rPr>
@@ -2809,7 +2809,7 @@
         <w:rPr>
           <w:noProof/>
         </w:rPr>
-        <w:t>83</w:t>
+        <w:t>84</w:t>
       </w:r>
       <w:r>
         <w:rPr>
@@ -2853,7 +2853,7 @@
         <w:rPr>
           <w:noProof/>
         </w:rPr>
-        <w:instrText xml:space="preserve"> PAGEREF _Toc240274146 \h </w:instrText>
+        <w:instrText xml:space="preserve"> PAGEREF _Toc240275468 \h </w:instrText>
       </w:r>
       <w:r>
         <w:rPr>
@@ -2870,7 +2870,7 @@
         <w:rPr>
           <w:noProof/>
         </w:rPr>
-        <w:t>86</w:t>
+        <w:t>87</w:t>
       </w:r>
       <w:r>
         <w:rPr>
@@ -2914,7 +2914,7 @@
         <w:rPr>
           <w:noProof/>
         </w:rPr>
-        <w:instrText xml:space="preserve"> PAGEREF _Toc240274147 \h </w:instrText>
+        <w:instrText xml:space="preserve"> PAGEREF _Toc240275469 \h </w:instrText>
       </w:r>
       <w:r>
         <w:rPr>
@@ -2931,7 +2931,7 @@
         <w:rPr>
           <w:noProof/>
         </w:rPr>
-        <w:t>87</w:t>
+        <w:t>88</w:t>
       </w:r>
       <w:r>
         <w:rPr>
@@ -2975,7 +2975,7 @@
         <w:rPr>
           <w:noProof/>
         </w:rPr>
-        <w:instrText xml:space="preserve"> PAGEREF _Toc240274148 \h </w:instrText>
+        <w:instrText xml:space="preserve"> PAGEREF _Toc240275470 \h </w:instrText>
       </w:r>
       <w:r>
         <w:rPr>
@@ -2992,7 +2992,7 @@
         <w:rPr>
           <w:noProof/>
         </w:rPr>
-        <w:t>88</w:t>
+        <w:t>89</w:t>
       </w:r>
       <w:r>
         <w:rPr>
@@ -3036,7 +3036,7 @@
         <w:rPr>
           <w:noProof/>
         </w:rPr>
-        <w:instrText xml:space="preserve"> PAGEREF _Toc240274149 \h </w:instrText>
+        <w:instrText xml:space="preserve"> PAGEREF _Toc240275471 \h </w:instrText>
       </w:r>
       <w:r>
         <w:rPr>
@@ -3053,7 +3053,7 @@
         <w:rPr>
           <w:noProof/>
         </w:rPr>
-        <w:t>92</w:t>
+        <w:t>93</w:t>
       </w:r>
       <w:r>
         <w:rPr>
@@ -3097,7 +3097,7 @@
         <w:rPr>
           <w:noProof/>
         </w:rPr>
-        <w:instrText xml:space="preserve"> PAGEREF _Toc240274150 \h </w:instrText>
+        <w:instrText xml:space="preserve"> PAGEREF _Toc240275472 \h </w:instrText>
       </w:r>
       <w:r>
         <w:rPr>
@@ -3114,7 +3114,7 @@
         <w:rPr>
           <w:noProof/>
         </w:rPr>
-        <w:t>93</w:t>
+        <w:t>94</w:t>
       </w:r>
       <w:r>
         <w:rPr>
@@ -3173,7 +3173,7 @@
           <w:sz w:val="34"/>
         </w:rPr>
       </w:pPr>
-      <w:bookmarkStart w:id="0" w:name="_Toc240274103"/>
+      <w:bookmarkStart w:id="0" w:name="_Toc240275425"/>
       <w:r>
         <w:rPr>
           <w:rFonts w:ascii="Montserrat" w:hAnsi="Montserrat"/>
@@ -3197,7 +3197,7 @@
           <w:sz w:val="27"/>
         </w:rPr>
       </w:pPr>
-      <w:bookmarkStart w:id="1" w:name="_Toc240274104"/>
+      <w:bookmarkStart w:id="1" w:name="_Toc240275426"/>
       <w:r>
         <w:rPr>
           <w:rFonts w:ascii="Montserrat" w:hAnsi="Montserrat"/>
@@ -4575,6 +4575,24 @@
           <w:color w:val="1A1A1A"/>
           <w:sz w:val="22"/>
         </w:rPr>
+        <w:t>Esta e a versao 2.68 do manual. Em relacao a versao 2.67 (14/09/2026), foi corrigido um aperto de layout na tabela de Cronograma do Planejamento (Passo 4, aba 3): a largura minima da tabela aumentou (para acomodar as 9 colunas de forma legivel, apos a coluna Tarefas ter sido adicionada na Fase 1 do detalhamento do cronograma) e as colunas Marco/Entrega, Responsavel e as tres datas ganharam mais espaco relativo, as custas de Custo e Depende nÂº, que normalmente tem conteudo mais curto. Sem mudanca de comportamento - apenas ajuste de layout, corrigindo texto cortado/muito espremido em campos com nomes ou responsaveis mais longos.</w:t>
+      </w:r>
+    </w:p>
+    <w:p>
+      <w:pPr>
+        <w:spacing w:line="280" w:lineRule="auto"/>
+        <w:rPr>
+          <w:rFonts w:ascii="Montserrat" w:hAnsi="Montserrat"/>
+          <w:color w:val="1A1A1A"/>
+          <w:sz w:val="22"/>
+        </w:rPr>
+      </w:pPr>
+      <w:r>
+        <w:rPr>
+          <w:rFonts w:ascii="Montserrat" w:hAnsi="Montserrat"/>
+          <w:color w:val="1A1A1A"/>
+          <w:sz w:val="22"/>
+        </w:rPr>
         <w:t>O manual nao substitui as Diretrizes para a Gestao de Projetos da UNIALFA (documento institucional que define o framework D01 a D07) nem o documento Regras de Acesso e Permissoes (que detalha cada regra de controle de acesso); ele e o guia operacional de como usar cada ferramenta na pratica.</w:t>
       </w:r>
     </w:p>
@@ -4589,7 +4607,7 @@
           <w:sz w:val="27"/>
         </w:rPr>
       </w:pPr>
-      <w:bookmarkStart w:id="2" w:name="_Toc240274105"/>
+      <w:bookmarkStart w:id="2" w:name="_Toc240275427"/>
       <w:r>
         <w:rPr>
           <w:rFonts w:ascii="Montserrat" w:hAnsi="Montserrat"/>
@@ -4597,6 +4615,7 @@
           <w:color w:val="B91D2E"/>
           <w:sz w:val="27"/>
         </w:rPr>
+        <w:lastRenderedPageBreak/>
         <w:t>1.2 Visao geral da ferramenta</w:t>
       </w:r>
       <w:bookmarkEnd w:id="2"/>
@@ -4688,7 +4707,6 @@
           <w:color w:val="1A1A1A"/>
           <w:sz w:val="22"/>
         </w:rPr>
-        <w:lastRenderedPageBreak/>
         <w:t>1 pagina de Administracao, restrita a Admin, para gerenciar usuarios, equipes e configuracoes do sistema.</w:t>
       </w:r>
     </w:p>
@@ -4785,17 +4803,18 @@
         <w:rPr>
           <w:noProof/>
         </w:rPr>
+        <w:lastRenderedPageBreak/>
         <w:drawing>
-          <wp:inline distT="0" distB="0" distL="0" distR="0" wp14:anchorId="36376B64" wp14:editId="280E5290">
+          <wp:inline distT="0" distB="0" distL="0" distR="0" wp14:anchorId="1DC219B3" wp14:editId="45ED97BC">
             <wp:extent cx="5303520" cy="4792851"/>
             <wp:effectExtent l="19050" t="19050" r="11430" b="27305"/>
-            <wp:docPr id="1583428360" name="Imagem 1"/>
+            <wp:docPr id="2055485955" name="Imagem 1"/>
             <wp:cNvGraphicFramePr/>
             <a:graphic xmlns:a="http://schemas.openxmlformats.org/drawingml/2006/main">
               <a:graphicData uri="http://schemas.openxmlformats.org/drawingml/2006/picture">
                 <pic:pic xmlns:pic="http://schemas.openxmlformats.org/drawingml/2006/picture">
                   <pic:nvPicPr>
-                    <pic:cNvPr id="1583428360" name=""/>
+                    <pic:cNvPr id="2055485955" name=""/>
                     <pic:cNvPicPr/>
                   </pic:nvPicPr>
                   <pic:blipFill>
@@ -4863,7 +4882,7 @@
           <w:sz w:val="27"/>
         </w:rPr>
       </w:pPr>
-      <w:bookmarkStart w:id="3" w:name="_Toc240274106"/>
+      <w:bookmarkStart w:id="3" w:name="_Toc240275428"/>
       <w:r>
         <w:rPr>
           <w:rFonts w:ascii="Montserrat" w:hAnsi="Montserrat"/>
@@ -4871,7 +4890,6 @@
           <w:color w:val="B91D2E"/>
           <w:sz w:val="27"/>
         </w:rPr>
-        <w:lastRenderedPageBreak/>
         <w:t>1.3 Como acessar e fazer login</w:t>
       </w:r>
       <w:bookmarkEnd w:id="3"/>
@@ -4903,17 +4921,18 @@
         <w:rPr>
           <w:noProof/>
         </w:rPr>
+        <w:lastRenderedPageBreak/>
         <w:drawing>
-          <wp:inline distT="0" distB="0" distL="0" distR="0" wp14:anchorId="147F1A92" wp14:editId="09D8FEC8">
+          <wp:inline distT="0" distB="0" distL="0" distR="0" wp14:anchorId="314100B1" wp14:editId="059D44A6">
             <wp:extent cx="4206240" cy="3801227"/>
             <wp:effectExtent l="19050" t="19050" r="22860" b="27940"/>
-            <wp:docPr id="621358444" name="Imagem 2"/>
+            <wp:docPr id="1916909051" name="Imagem 2"/>
             <wp:cNvGraphicFramePr/>
             <a:graphic xmlns:a="http://schemas.openxmlformats.org/drawingml/2006/main">
               <a:graphicData uri="http://schemas.openxmlformats.org/drawingml/2006/picture">
                 <pic:pic xmlns:pic="http://schemas.openxmlformats.org/drawingml/2006/picture">
                   <pic:nvPicPr>
-                    <pic:cNvPr id="621358444" name=""/>
+                    <pic:cNvPr id="1916909051" name=""/>
                     <pic:cNvPicPr/>
                   </pic:nvPicPr>
                   <pic:blipFill>
@@ -5086,7 +5105,7 @@
           <w:sz w:val="27"/>
         </w:rPr>
       </w:pPr>
-      <w:bookmarkStart w:id="4" w:name="_Toc240274107"/>
+      <w:bookmarkStart w:id="4" w:name="_Toc240275429"/>
       <w:r>
         <w:rPr>
           <w:rFonts w:ascii="Montserrat" w:hAnsi="Montserrat"/>
@@ -5094,7 +5113,6 @@
           <w:color w:val="B91D2E"/>
           <w:sz w:val="27"/>
         </w:rPr>
-        <w:lastRenderedPageBreak/>
         <w:t>1.4 Como a ferramenta se relaciona com as Diretrizes (D01-D07)</w:t>
       </w:r>
       <w:bookmarkEnd w:id="4"/>
@@ -5169,6 +5187,7 @@
                 <w:color w:val="FFFFFF"/>
                 <w:sz w:val="19"/>
               </w:rPr>
+              <w:lastRenderedPageBreak/>
               <w:t>Passo</w:t>
             </w:r>
           </w:p>
@@ -6325,7 +6344,7 @@
           <w:sz w:val="34"/>
         </w:rPr>
       </w:pPr>
-      <w:bookmarkStart w:id="5" w:name="_Toc240274108"/>
+      <w:bookmarkStart w:id="5" w:name="_Toc240275430"/>
       <w:r>
         <w:rPr>
           <w:rFonts w:ascii="Montserrat" w:hAnsi="Montserrat"/>
@@ -6349,7 +6368,7 @@
           <w:sz w:val="27"/>
         </w:rPr>
       </w:pPr>
-      <w:bookmarkStart w:id="6" w:name="_Toc240274109"/>
+      <w:bookmarkStart w:id="6" w:name="_Toc240275431"/>
       <w:r>
         <w:rPr>
           <w:rFonts w:ascii="Montserrat" w:hAnsi="Montserrat"/>
@@ -6390,7 +6409,7 @@
           <w:sz w:val="27"/>
         </w:rPr>
       </w:pPr>
-      <w:bookmarkStart w:id="7" w:name="_Toc240274110"/>
+      <w:bookmarkStart w:id="7" w:name="_Toc240275432"/>
       <w:r>
         <w:rPr>
           <w:rFonts w:ascii="Montserrat" w:hAnsi="Montserrat"/>
@@ -6509,7 +6528,7 @@
           <w:sz w:val="27"/>
         </w:rPr>
       </w:pPr>
-      <w:bookmarkStart w:id="8" w:name="_Toc240274111"/>
+      <w:bookmarkStart w:id="8" w:name="_Toc240275433"/>
       <w:r>
         <w:rPr>
           <w:rFonts w:ascii="Montserrat" w:hAnsi="Montserrat"/>
@@ -7122,7 +7141,7 @@
           <w:sz w:val="27"/>
         </w:rPr>
       </w:pPr>
-      <w:bookmarkStart w:id="9" w:name="_Toc240274112"/>
+      <w:bookmarkStart w:id="9" w:name="_Toc240275434"/>
       <w:r>
         <w:rPr>
           <w:rFonts w:ascii="Montserrat" w:hAnsi="Montserrat"/>
@@ -7211,16 +7230,16 @@
         </w:rPr>
         <w:lastRenderedPageBreak/>
         <w:drawing>
-          <wp:inline distT="0" distB="0" distL="0" distR="0" wp14:anchorId="18EFAF1C" wp14:editId="1EEDB83C">
+          <wp:inline distT="0" distB="0" distL="0" distR="0" wp14:anchorId="5088DAD2" wp14:editId="24FFF1BC">
             <wp:extent cx="4937760" cy="4462310"/>
             <wp:effectExtent l="19050" t="19050" r="15240" b="14605"/>
-            <wp:docPr id="1383274013" name="Imagem 3"/>
+            <wp:docPr id="985358177" name="Imagem 3"/>
             <wp:cNvGraphicFramePr/>
             <a:graphic xmlns:a="http://schemas.openxmlformats.org/drawingml/2006/main">
               <a:graphicData uri="http://schemas.openxmlformats.org/drawingml/2006/picture">
                 <pic:pic xmlns:pic="http://schemas.openxmlformats.org/drawingml/2006/picture">
                   <pic:nvPicPr>
-                    <pic:cNvPr id="1383274013" name=""/>
+                    <pic:cNvPr id="985358177" name=""/>
                     <pic:cNvPicPr/>
                   </pic:nvPicPr>
                   <pic:blipFill>
@@ -7288,7 +7307,7 @@
           <w:sz w:val="27"/>
         </w:rPr>
       </w:pPr>
-      <w:bookmarkStart w:id="10" w:name="_Toc240274113"/>
+      <w:bookmarkStart w:id="10" w:name="_Toc240275435"/>
       <w:r>
         <w:rPr>
           <w:rFonts w:ascii="Montserrat" w:hAnsi="Montserrat"/>
@@ -7329,16 +7348,16 @@
         </w:rPr>
         <w:lastRenderedPageBreak/>
         <w:drawing>
-          <wp:inline distT="0" distB="0" distL="0" distR="0" wp14:anchorId="5E800777" wp14:editId="7989DAD1">
+          <wp:inline distT="0" distB="0" distL="0" distR="0" wp14:anchorId="6D80DF07" wp14:editId="2AEFEC4A">
             <wp:extent cx="5120640" cy="4627581"/>
             <wp:effectExtent l="19050" t="19050" r="22860" b="20955"/>
-            <wp:docPr id="1893630054" name="Imagem 4"/>
+            <wp:docPr id="210257309" name="Imagem 4"/>
             <wp:cNvGraphicFramePr/>
             <a:graphic xmlns:a="http://schemas.openxmlformats.org/drawingml/2006/main">
               <a:graphicData uri="http://schemas.openxmlformats.org/drawingml/2006/picture">
                 <pic:pic xmlns:pic="http://schemas.openxmlformats.org/drawingml/2006/picture">
                   <pic:nvPicPr>
-                    <pic:cNvPr id="1893630054" name=""/>
+                    <pic:cNvPr id="210257309" name=""/>
                     <pic:cNvPicPr/>
                   </pic:nvPicPr>
                   <pic:blipFill>
@@ -7506,7 +7525,7 @@
           <w:sz w:val="27"/>
         </w:rPr>
       </w:pPr>
-      <w:bookmarkStart w:id="11" w:name="_Toc240274114"/>
+      <w:bookmarkStart w:id="11" w:name="_Toc240275436"/>
       <w:r>
         <w:rPr>
           <w:rFonts w:ascii="Montserrat" w:hAnsi="Montserrat"/>
@@ -7546,16 +7565,16 @@
           <w:noProof/>
         </w:rPr>
         <w:drawing>
-          <wp:inline distT="0" distB="0" distL="0" distR="0" wp14:anchorId="4856ED94" wp14:editId="2AEE0F98">
+          <wp:inline distT="0" distB="0" distL="0" distR="0" wp14:anchorId="65FA5280" wp14:editId="06FBD168">
             <wp:extent cx="4206240" cy="3801227"/>
             <wp:effectExtent l="19050" t="19050" r="22860" b="27940"/>
-            <wp:docPr id="1385831276" name="Imagem 5"/>
+            <wp:docPr id="1995683262" name="Imagem 5"/>
             <wp:cNvGraphicFramePr/>
             <a:graphic xmlns:a="http://schemas.openxmlformats.org/drawingml/2006/main">
               <a:graphicData uri="http://schemas.openxmlformats.org/drawingml/2006/picture">
                 <pic:pic xmlns:pic="http://schemas.openxmlformats.org/drawingml/2006/picture">
                   <pic:nvPicPr>
-                    <pic:cNvPr id="1385831276" name=""/>
+                    <pic:cNvPr id="1995683262" name=""/>
                     <pic:cNvPicPr/>
                   </pic:nvPicPr>
                   <pic:blipFill>
@@ -7623,16 +7642,16 @@
         </w:rPr>
         <w:lastRenderedPageBreak/>
         <w:drawing>
-          <wp:inline distT="0" distB="0" distL="0" distR="0" wp14:anchorId="784E56CB" wp14:editId="3A996CC2">
+          <wp:inline distT="0" distB="0" distL="0" distR="0" wp14:anchorId="02757E9A" wp14:editId="6EF6A3EE">
             <wp:extent cx="4206240" cy="3801227"/>
             <wp:effectExtent l="19050" t="19050" r="22860" b="27940"/>
-            <wp:docPr id="1922985015" name="Imagem 6"/>
+            <wp:docPr id="1849133266" name="Imagem 6"/>
             <wp:cNvGraphicFramePr/>
             <a:graphic xmlns:a="http://schemas.openxmlformats.org/drawingml/2006/main">
               <a:graphicData uri="http://schemas.openxmlformats.org/drawingml/2006/picture">
                 <pic:pic xmlns:pic="http://schemas.openxmlformats.org/drawingml/2006/picture">
                   <pic:nvPicPr>
-                    <pic:cNvPr id="1922985015" name=""/>
+                    <pic:cNvPr id="1849133266" name=""/>
                     <pic:cNvPicPr/>
                   </pic:nvPicPr>
                   <pic:blipFill>
@@ -7748,7 +7767,7 @@
           <w:sz w:val="27"/>
         </w:rPr>
       </w:pPr>
-      <w:bookmarkStart w:id="12" w:name="_Toc240274115"/>
+      <w:bookmarkStart w:id="12" w:name="_Toc240275437"/>
       <w:r>
         <w:rPr>
           <w:rFonts w:ascii="Montserrat" w:hAnsi="Montserrat"/>
@@ -7816,7 +7835,7 @@
           <w:sz w:val="27"/>
         </w:rPr>
       </w:pPr>
-      <w:bookmarkStart w:id="13" w:name="_Toc240274116"/>
+      <w:bookmarkStart w:id="13" w:name="_Toc240275438"/>
       <w:r>
         <w:rPr>
           <w:rFonts w:ascii="Montserrat" w:hAnsi="Montserrat"/>
@@ -8043,7 +8062,7 @@
           <w:sz w:val="27"/>
         </w:rPr>
       </w:pPr>
-      <w:bookmarkStart w:id="14" w:name="_Toc240274117"/>
+      <w:bookmarkStart w:id="14" w:name="_Toc240275439"/>
       <w:r>
         <w:rPr>
           <w:rFonts w:ascii="Montserrat" w:hAnsi="Montserrat"/>
@@ -8202,7 +8221,7 @@
           <w:sz w:val="27"/>
         </w:rPr>
       </w:pPr>
-      <w:bookmarkStart w:id="15" w:name="_Toc240274118"/>
+      <w:bookmarkStart w:id="15" w:name="_Toc240275440"/>
       <w:r>
         <w:rPr>
           <w:rFonts w:ascii="Montserrat" w:hAnsi="Montserrat"/>
@@ -8394,7 +8413,7 @@
           <w:sz w:val="27"/>
         </w:rPr>
       </w:pPr>
-      <w:bookmarkStart w:id="16" w:name="_Toc240274119"/>
+      <w:bookmarkStart w:id="16" w:name="_Toc240275441"/>
       <w:r>
         <w:rPr>
           <w:rFonts w:ascii="Montserrat" w:hAnsi="Montserrat"/>
@@ -8522,7 +8541,7 @@
           <w:sz w:val="27"/>
         </w:rPr>
       </w:pPr>
-      <w:bookmarkStart w:id="17" w:name="_Toc240274120"/>
+      <w:bookmarkStart w:id="17" w:name="_Toc240275442"/>
       <w:r>
         <w:rPr>
           <w:rFonts w:ascii="Montserrat" w:hAnsi="Montserrat"/>
@@ -8852,7 +8871,7 @@
           <w:sz w:val="27"/>
         </w:rPr>
       </w:pPr>
-      <w:bookmarkStart w:id="18" w:name="_Toc240274121"/>
+      <w:bookmarkStart w:id="18" w:name="_Toc240275443"/>
       <w:r>
         <w:rPr>
           <w:rFonts w:ascii="Montserrat" w:hAnsi="Montserrat"/>
@@ -8993,7 +9012,7 @@
           <w:sz w:val="34"/>
         </w:rPr>
       </w:pPr>
-      <w:bookmarkStart w:id="19" w:name="_Toc240274122"/>
+      <w:bookmarkStart w:id="19" w:name="_Toc240275444"/>
       <w:r>
         <w:rPr>
           <w:rFonts w:ascii="Montserrat" w:hAnsi="Montserrat"/>
@@ -9035,7 +9054,7 @@
           <w:sz w:val="27"/>
         </w:rPr>
       </w:pPr>
-      <w:bookmarkStart w:id="20" w:name="_Toc240274123"/>
+      <w:bookmarkStart w:id="20" w:name="_Toc240275445"/>
       <w:r>
         <w:rPr>
           <w:rFonts w:ascii="Montserrat" w:hAnsi="Montserrat"/>
@@ -10115,16 +10134,16 @@
         </w:rPr>
         <w:lastRenderedPageBreak/>
         <w:drawing>
-          <wp:inline distT="0" distB="0" distL="0" distR="0" wp14:anchorId="0451861E" wp14:editId="3B8267B8">
+          <wp:inline distT="0" distB="0" distL="0" distR="0" wp14:anchorId="7D0172E7" wp14:editId="6DEDD271">
             <wp:extent cx="5120640" cy="4627581"/>
             <wp:effectExtent l="19050" t="19050" r="22860" b="20955"/>
-            <wp:docPr id="1583043190" name="Imagem 7"/>
+            <wp:docPr id="2111149256" name="Imagem 7"/>
             <wp:cNvGraphicFramePr/>
             <a:graphic xmlns:a="http://schemas.openxmlformats.org/drawingml/2006/main">
               <a:graphicData uri="http://schemas.openxmlformats.org/drawingml/2006/picture">
                 <pic:pic xmlns:pic="http://schemas.openxmlformats.org/drawingml/2006/picture">
                   <pic:nvPicPr>
-                    <pic:cNvPr id="1583043190" name=""/>
+                    <pic:cNvPr id="2111149256" name=""/>
                     <pic:cNvPicPr/>
                   </pic:nvPicPr>
                   <pic:blipFill>
@@ -10192,16 +10211,16 @@
         </w:rPr>
         <w:lastRenderedPageBreak/>
         <w:drawing>
-          <wp:inline distT="0" distB="0" distL="0" distR="0" wp14:anchorId="6030AE88" wp14:editId="4FB28D69">
+          <wp:inline distT="0" distB="0" distL="0" distR="0" wp14:anchorId="3B5D858E" wp14:editId="0FAE9637">
             <wp:extent cx="5120640" cy="4627581"/>
             <wp:effectExtent l="19050" t="19050" r="22860" b="20955"/>
-            <wp:docPr id="7938079" name="Imagem 8"/>
+            <wp:docPr id="1417423510" name="Imagem 8"/>
             <wp:cNvGraphicFramePr/>
             <a:graphic xmlns:a="http://schemas.openxmlformats.org/drawingml/2006/main">
               <a:graphicData uri="http://schemas.openxmlformats.org/drawingml/2006/picture">
                 <pic:pic xmlns:pic="http://schemas.openxmlformats.org/drawingml/2006/picture">
                   <pic:nvPicPr>
-                    <pic:cNvPr id="7938079" name=""/>
+                    <pic:cNvPr id="1417423510" name=""/>
                     <pic:cNvPicPr/>
                   </pic:nvPicPr>
                   <pic:blipFill>
@@ -10409,7 +10428,7 @@
           <w:sz w:val="27"/>
         </w:rPr>
       </w:pPr>
-      <w:bookmarkStart w:id="21" w:name="_Toc240274124"/>
+      <w:bookmarkStart w:id="21" w:name="_Toc240275446"/>
       <w:r>
         <w:rPr>
           <w:rFonts w:ascii="Montserrat" w:hAnsi="Montserrat"/>
@@ -11334,16 +11353,16 @@
           <w:noProof/>
         </w:rPr>
         <w:drawing>
-          <wp:inline distT="0" distB="0" distL="0" distR="0" wp14:anchorId="64380455" wp14:editId="47544E5E">
+          <wp:inline distT="0" distB="0" distL="0" distR="0" wp14:anchorId="5C8F8FF1" wp14:editId="12C9114D">
             <wp:extent cx="5120640" cy="4627581"/>
             <wp:effectExtent l="19050" t="19050" r="22860" b="20955"/>
-            <wp:docPr id="1788256600" name="Imagem 9"/>
+            <wp:docPr id="1483262122" name="Imagem 9"/>
             <wp:cNvGraphicFramePr/>
             <a:graphic xmlns:a="http://schemas.openxmlformats.org/drawingml/2006/main">
               <a:graphicData uri="http://schemas.openxmlformats.org/drawingml/2006/picture">
                 <pic:pic xmlns:pic="http://schemas.openxmlformats.org/drawingml/2006/picture">
                   <pic:nvPicPr>
-                    <pic:cNvPr id="1788256600" name=""/>
+                    <pic:cNvPr id="1483262122" name=""/>
                     <pic:cNvPicPr/>
                   </pic:nvPicPr>
                   <pic:blipFill>
@@ -11411,16 +11430,16 @@
         </w:rPr>
         <w:lastRenderedPageBreak/>
         <w:drawing>
-          <wp:inline distT="0" distB="0" distL="0" distR="0" wp14:anchorId="31E30CEF" wp14:editId="18E63944">
+          <wp:inline distT="0" distB="0" distL="0" distR="0" wp14:anchorId="61ADA6DB" wp14:editId="56155998">
             <wp:extent cx="5120640" cy="4627581"/>
             <wp:effectExtent l="19050" t="19050" r="22860" b="20955"/>
-            <wp:docPr id="997255079" name="Imagem 10"/>
+            <wp:docPr id="499925638" name="Imagem 10"/>
             <wp:cNvGraphicFramePr/>
             <a:graphic xmlns:a="http://schemas.openxmlformats.org/drawingml/2006/main">
               <a:graphicData uri="http://schemas.openxmlformats.org/drawingml/2006/picture">
                 <pic:pic xmlns:pic="http://schemas.openxmlformats.org/drawingml/2006/picture">
                   <pic:nvPicPr>
-                    <pic:cNvPr id="997255079" name=""/>
+                    <pic:cNvPr id="499925638" name=""/>
                     <pic:cNvPicPr/>
                   </pic:nvPicPr>
                   <pic:blipFill>
@@ -11554,7 +11573,7 @@
           <w:sz w:val="27"/>
         </w:rPr>
       </w:pPr>
-      <w:bookmarkStart w:id="22" w:name="_Toc240274125"/>
+      <w:bookmarkStart w:id="22" w:name="_Toc240275447"/>
       <w:r>
         <w:rPr>
           <w:rFonts w:ascii="Montserrat" w:hAnsi="Montserrat"/>
@@ -12620,16 +12639,16 @@
           <w:noProof/>
         </w:rPr>
         <w:drawing>
-          <wp:inline distT="0" distB="0" distL="0" distR="0" wp14:anchorId="75DC1DA1" wp14:editId="77F36441">
+          <wp:inline distT="0" distB="0" distL="0" distR="0" wp14:anchorId="2BAF624D" wp14:editId="3BB74F43">
             <wp:extent cx="5120640" cy="3338440"/>
             <wp:effectExtent l="19050" t="19050" r="22860" b="14605"/>
-            <wp:docPr id="1497066616" name="Imagem 11"/>
+            <wp:docPr id="1534108310" name="Imagem 11"/>
             <wp:cNvGraphicFramePr/>
             <a:graphic xmlns:a="http://schemas.openxmlformats.org/drawingml/2006/main">
               <a:graphicData uri="http://schemas.openxmlformats.org/drawingml/2006/picture">
                 <pic:pic xmlns:pic="http://schemas.openxmlformats.org/drawingml/2006/picture">
                   <pic:nvPicPr>
-                    <pic:cNvPr id="1497066616" name=""/>
+                    <pic:cNvPr id="1534108310" name=""/>
                     <pic:cNvPicPr/>
                   </pic:nvPicPr>
                   <pic:blipFill>
@@ -12697,16 +12716,16 @@
         </w:rPr>
         <w:lastRenderedPageBreak/>
         <w:drawing>
-          <wp:inline distT="0" distB="0" distL="0" distR="0" wp14:anchorId="7623D016" wp14:editId="75928151">
+          <wp:inline distT="0" distB="0" distL="0" distR="0" wp14:anchorId="5635F99A" wp14:editId="73F64567">
             <wp:extent cx="5120640" cy="4627581"/>
             <wp:effectExtent l="19050" t="19050" r="22860" b="20955"/>
-            <wp:docPr id="1176866289" name="Imagem 12"/>
+            <wp:docPr id="1862155335" name="Imagem 12"/>
             <wp:cNvGraphicFramePr/>
             <a:graphic xmlns:a="http://schemas.openxmlformats.org/drawingml/2006/main">
               <a:graphicData uri="http://schemas.openxmlformats.org/drawingml/2006/picture">
                 <pic:pic xmlns:pic="http://schemas.openxmlformats.org/drawingml/2006/picture">
                   <pic:nvPicPr>
-                    <pic:cNvPr id="1176866289" name=""/>
+                    <pic:cNvPr id="1862155335" name=""/>
                     <pic:cNvPicPr/>
                   </pic:nvPicPr>
                   <pic:blipFill>
@@ -12910,7 +12929,7 @@
           <w:sz w:val="27"/>
         </w:rPr>
       </w:pPr>
-      <w:bookmarkStart w:id="23" w:name="_Toc240274126"/>
+      <w:bookmarkStart w:id="23" w:name="_Toc240275448"/>
       <w:r>
         <w:rPr>
           <w:rFonts w:ascii="Montserrat" w:hAnsi="Montserrat"/>
@@ -13471,16 +13490,16 @@
           <w:noProof/>
         </w:rPr>
         <w:drawing>
-          <wp:inline distT="0" distB="0" distL="0" distR="0" wp14:anchorId="5713F115" wp14:editId="2048A888">
+          <wp:inline distT="0" distB="0" distL="0" distR="0" wp14:anchorId="05260B1E" wp14:editId="40BE77BC">
             <wp:extent cx="5120640" cy="4627581"/>
             <wp:effectExtent l="19050" t="19050" r="22860" b="20955"/>
-            <wp:docPr id="160206885" name="Imagem 13"/>
+            <wp:docPr id="1510387647" name="Imagem 13"/>
             <wp:cNvGraphicFramePr/>
             <a:graphic xmlns:a="http://schemas.openxmlformats.org/drawingml/2006/main">
               <a:graphicData uri="http://schemas.openxmlformats.org/drawingml/2006/picture">
                 <pic:pic xmlns:pic="http://schemas.openxmlformats.org/drawingml/2006/picture">
                   <pic:nvPicPr>
-                    <pic:cNvPr id="160206885" name=""/>
+                    <pic:cNvPr id="1510387647" name=""/>
                     <pic:cNvPicPr/>
                   </pic:nvPicPr>
                   <pic:blipFill>
@@ -13548,16 +13567,16 @@
         </w:rPr>
         <w:lastRenderedPageBreak/>
         <w:drawing>
-          <wp:inline distT="0" distB="0" distL="0" distR="0" wp14:anchorId="5E270B2D" wp14:editId="5108FA58">
+          <wp:inline distT="0" distB="0" distL="0" distR="0" wp14:anchorId="685B0A45" wp14:editId="567CA7B8">
             <wp:extent cx="5120640" cy="4627581"/>
             <wp:effectExtent l="19050" t="19050" r="22860" b="20955"/>
-            <wp:docPr id="2043860408" name="Imagem 14"/>
+            <wp:docPr id="607867935" name="Imagem 14"/>
             <wp:cNvGraphicFramePr/>
             <a:graphic xmlns:a="http://schemas.openxmlformats.org/drawingml/2006/main">
               <a:graphicData uri="http://schemas.openxmlformats.org/drawingml/2006/picture">
                 <pic:pic xmlns:pic="http://schemas.openxmlformats.org/drawingml/2006/picture">
                   <pic:nvPicPr>
-                    <pic:cNvPr id="2043860408" name=""/>
+                    <pic:cNvPr id="607867935" name=""/>
                     <pic:cNvPicPr/>
                   </pic:nvPicPr>
                   <pic:blipFill>
@@ -13809,7 +13828,7 @@
           <w:sz w:val="27"/>
         </w:rPr>
       </w:pPr>
-      <w:bookmarkStart w:id="24" w:name="_Toc240274127"/>
+      <w:bookmarkStart w:id="24" w:name="_Toc240275449"/>
       <w:r>
         <w:rPr>
           <w:rFonts w:ascii="Montserrat" w:hAnsi="Montserrat"/>
@@ -13849,16 +13868,16 @@
           <w:noProof/>
         </w:rPr>
         <w:drawing>
-          <wp:inline distT="0" distB="0" distL="0" distR="0" wp14:anchorId="29105E5F" wp14:editId="3C4E599A">
+          <wp:inline distT="0" distB="0" distL="0" distR="0" wp14:anchorId="4B45EF89" wp14:editId="75D21869">
             <wp:extent cx="5120640" cy="4627581"/>
             <wp:effectExtent l="19050" t="19050" r="22860" b="20955"/>
-            <wp:docPr id="1214562771" name="Imagem 15"/>
+            <wp:docPr id="2061609950" name="Imagem 15"/>
             <wp:cNvGraphicFramePr/>
             <a:graphic xmlns:a="http://schemas.openxmlformats.org/drawingml/2006/main">
               <a:graphicData uri="http://schemas.openxmlformats.org/drawingml/2006/picture">
                 <pic:pic xmlns:pic="http://schemas.openxmlformats.org/drawingml/2006/picture">
                   <pic:nvPicPr>
-                    <pic:cNvPr id="1214562771" name=""/>
+                    <pic:cNvPr id="2061609950" name=""/>
                     <pic:cNvPicPr/>
                   </pic:nvPicPr>
                   <pic:blipFill>
@@ -13926,16 +13945,16 @@
         </w:rPr>
         <w:lastRenderedPageBreak/>
         <w:drawing>
-          <wp:inline distT="0" distB="0" distL="0" distR="0" wp14:anchorId="49A9C470" wp14:editId="172E1BCF">
+          <wp:inline distT="0" distB="0" distL="0" distR="0" wp14:anchorId="4517D9B5" wp14:editId="67048F8E">
             <wp:extent cx="5120640" cy="4627581"/>
             <wp:effectExtent l="19050" t="19050" r="22860" b="20955"/>
-            <wp:docPr id="54522264" name="Imagem 16"/>
+            <wp:docPr id="1271182538" name="Imagem 16"/>
             <wp:cNvGraphicFramePr/>
             <a:graphic xmlns:a="http://schemas.openxmlformats.org/drawingml/2006/main">
               <a:graphicData uri="http://schemas.openxmlformats.org/drawingml/2006/picture">
                 <pic:pic xmlns:pic="http://schemas.openxmlformats.org/drawingml/2006/picture">
                   <pic:nvPicPr>
-                    <pic:cNvPr id="54522264" name=""/>
+                    <pic:cNvPr id="1271182538" name=""/>
                     <pic:cNvPicPr/>
                   </pic:nvPicPr>
                   <pic:blipFill>
@@ -14099,16 +14118,16 @@
         </w:rPr>
         <w:lastRenderedPageBreak/>
         <w:drawing>
-          <wp:inline distT="0" distB="0" distL="0" distR="0" wp14:anchorId="62A67B17" wp14:editId="7598DFBC">
+          <wp:inline distT="0" distB="0" distL="0" distR="0" wp14:anchorId="6A62B440" wp14:editId="46C9FB02">
             <wp:extent cx="5120640" cy="3282818"/>
             <wp:effectExtent l="19050" t="19050" r="22860" b="13335"/>
-            <wp:docPr id="1807411149" name="Imagem 17"/>
+            <wp:docPr id="1524474721" name="Imagem 17"/>
             <wp:cNvGraphicFramePr/>
             <a:graphic xmlns:a="http://schemas.openxmlformats.org/drawingml/2006/main">
               <a:graphicData uri="http://schemas.openxmlformats.org/drawingml/2006/picture">
                 <pic:pic xmlns:pic="http://schemas.openxmlformats.org/drawingml/2006/picture">
                   <pic:nvPicPr>
-                    <pic:cNvPr id="1807411149" name=""/>
+                    <pic:cNvPr id="1524474721" name=""/>
                     <pic:cNvPicPr/>
                   </pic:nvPicPr>
                   <pic:blipFill>
@@ -14299,7 +14318,7 @@
           <w:sz w:val="27"/>
         </w:rPr>
       </w:pPr>
-      <w:bookmarkStart w:id="25" w:name="_Toc240274128"/>
+      <w:bookmarkStart w:id="25" w:name="_Toc240275450"/>
       <w:r>
         <w:rPr>
           <w:rFonts w:ascii="Montserrat" w:hAnsi="Montserrat"/>
@@ -14339,16 +14358,16 @@
           <w:noProof/>
         </w:rPr>
         <w:drawing>
-          <wp:inline distT="0" distB="0" distL="0" distR="0" wp14:anchorId="6F502C5B" wp14:editId="2D397EAA">
+          <wp:inline distT="0" distB="0" distL="0" distR="0" wp14:anchorId="5BDACCBD" wp14:editId="68DC7C5D">
             <wp:extent cx="5120640" cy="4627581"/>
             <wp:effectExtent l="19050" t="19050" r="22860" b="20955"/>
-            <wp:docPr id="13754951" name="Imagem 18"/>
+            <wp:docPr id="883269976" name="Imagem 18"/>
             <wp:cNvGraphicFramePr/>
             <a:graphic xmlns:a="http://schemas.openxmlformats.org/drawingml/2006/main">
               <a:graphicData uri="http://schemas.openxmlformats.org/drawingml/2006/picture">
                 <pic:pic xmlns:pic="http://schemas.openxmlformats.org/drawingml/2006/picture">
                   <pic:nvPicPr>
-                    <pic:cNvPr id="13754951" name=""/>
+                    <pic:cNvPr id="883269976" name=""/>
                     <pic:cNvPicPr/>
                   </pic:nvPicPr>
                   <pic:blipFill>
@@ -14416,16 +14435,16 @@
         </w:rPr>
         <w:lastRenderedPageBreak/>
         <w:drawing>
-          <wp:inline distT="0" distB="0" distL="0" distR="0" wp14:anchorId="46B9D86A" wp14:editId="7A7576F5">
+          <wp:inline distT="0" distB="0" distL="0" distR="0" wp14:anchorId="3FBEF9AB" wp14:editId="73475451">
             <wp:extent cx="5120640" cy="4627581"/>
             <wp:effectExtent l="19050" t="19050" r="22860" b="20955"/>
-            <wp:docPr id="1244851144" name="Imagem 19"/>
+            <wp:docPr id="1179078365" name="Imagem 19"/>
             <wp:cNvGraphicFramePr/>
             <a:graphic xmlns:a="http://schemas.openxmlformats.org/drawingml/2006/main">
               <a:graphicData uri="http://schemas.openxmlformats.org/drawingml/2006/picture">
                 <pic:pic xmlns:pic="http://schemas.openxmlformats.org/drawingml/2006/picture">
                   <pic:nvPicPr>
-                    <pic:cNvPr id="1244851144" name=""/>
+                    <pic:cNvPr id="1179078365" name=""/>
                     <pic:cNvPicPr/>
                   </pic:nvPicPr>
                   <pic:blipFill>
@@ -14608,7 +14627,7 @@
           <w:sz w:val="27"/>
         </w:rPr>
       </w:pPr>
-      <w:bookmarkStart w:id="26" w:name="_Toc240274129"/>
+      <w:bookmarkStart w:id="26" w:name="_Toc240275451"/>
       <w:r>
         <w:rPr>
           <w:rFonts w:ascii="Montserrat" w:hAnsi="Montserrat"/>
@@ -14648,16 +14667,16 @@
           <w:noProof/>
         </w:rPr>
         <w:drawing>
-          <wp:inline distT="0" distB="0" distL="0" distR="0" wp14:anchorId="5BA403AA" wp14:editId="4D8D8AF5">
+          <wp:inline distT="0" distB="0" distL="0" distR="0" wp14:anchorId="136D1C22" wp14:editId="306C4F8C">
             <wp:extent cx="5120640" cy="4627581"/>
             <wp:effectExtent l="19050" t="19050" r="22860" b="20955"/>
-            <wp:docPr id="464430020" name="Imagem 20"/>
+            <wp:docPr id="553406053" name="Imagem 20"/>
             <wp:cNvGraphicFramePr/>
             <a:graphic xmlns:a="http://schemas.openxmlformats.org/drawingml/2006/main">
               <a:graphicData uri="http://schemas.openxmlformats.org/drawingml/2006/picture">
                 <pic:pic xmlns:pic="http://schemas.openxmlformats.org/drawingml/2006/picture">
                   <pic:nvPicPr>
-                    <pic:cNvPr id="464430020" name=""/>
+                    <pic:cNvPr id="553406053" name=""/>
                     <pic:cNvPicPr/>
                   </pic:nvPicPr>
                   <pic:blipFill>
@@ -14725,16 +14744,16 @@
         </w:rPr>
         <w:lastRenderedPageBreak/>
         <w:drawing>
-          <wp:inline distT="0" distB="0" distL="0" distR="0" wp14:anchorId="6FD99EAB" wp14:editId="1397C59A">
+          <wp:inline distT="0" distB="0" distL="0" distR="0" wp14:anchorId="6389718B" wp14:editId="4776062C">
             <wp:extent cx="5120640" cy="4627581"/>
             <wp:effectExtent l="19050" t="19050" r="22860" b="20955"/>
-            <wp:docPr id="224077535" name="Imagem 21"/>
+            <wp:docPr id="1359582470" name="Imagem 21"/>
             <wp:cNvGraphicFramePr/>
             <a:graphic xmlns:a="http://schemas.openxmlformats.org/drawingml/2006/main">
               <a:graphicData uri="http://schemas.openxmlformats.org/drawingml/2006/picture">
                 <pic:pic xmlns:pic="http://schemas.openxmlformats.org/drawingml/2006/picture">
                   <pic:nvPicPr>
-                    <pic:cNvPr id="224077535" name=""/>
+                    <pic:cNvPr id="1359582470" name=""/>
                     <pic:cNvPicPr/>
                   </pic:nvPicPr>
                   <pic:blipFill>
@@ -14940,16 +14959,16 @@
           <w:noProof/>
         </w:rPr>
         <w:drawing>
-          <wp:inline distT="0" distB="0" distL="0" distR="0" wp14:anchorId="03AAD448" wp14:editId="53D52B48">
+          <wp:inline distT="0" distB="0" distL="0" distR="0" wp14:anchorId="459EF739" wp14:editId="76D3167A">
             <wp:extent cx="5120640" cy="1757287"/>
             <wp:effectExtent l="19050" t="19050" r="22860" b="14605"/>
-            <wp:docPr id="722778374" name="Imagem 22"/>
+            <wp:docPr id="2057466218" name="Imagem 22"/>
             <wp:cNvGraphicFramePr/>
             <a:graphic xmlns:a="http://schemas.openxmlformats.org/drawingml/2006/main">
               <a:graphicData uri="http://schemas.openxmlformats.org/drawingml/2006/picture">
                 <pic:pic xmlns:pic="http://schemas.openxmlformats.org/drawingml/2006/picture">
                   <pic:nvPicPr>
-                    <pic:cNvPr id="722778374" name=""/>
+                    <pic:cNvPr id="2057466218" name=""/>
                     <pic:cNvPicPr/>
                   </pic:nvPicPr>
                   <pic:blipFill>
@@ -15062,7 +15081,7 @@
           <w:sz w:val="27"/>
         </w:rPr>
       </w:pPr>
-      <w:bookmarkStart w:id="27" w:name="_Toc240274130"/>
+      <w:bookmarkStart w:id="27" w:name="_Toc240275452"/>
       <w:r>
         <w:rPr>
           <w:rFonts w:ascii="Montserrat" w:hAnsi="Montserrat"/>
@@ -15103,16 +15122,16 @@
         </w:rPr>
         <w:lastRenderedPageBreak/>
         <w:drawing>
-          <wp:inline distT="0" distB="0" distL="0" distR="0" wp14:anchorId="6FB20CDF" wp14:editId="3F5014EB">
+          <wp:inline distT="0" distB="0" distL="0" distR="0" wp14:anchorId="6B66FD4F" wp14:editId="17CE1B0B">
             <wp:extent cx="5120640" cy="4627581"/>
             <wp:effectExtent l="19050" t="19050" r="22860" b="20955"/>
-            <wp:docPr id="474510234" name="Imagem 23"/>
+            <wp:docPr id="1114238631" name="Imagem 23"/>
             <wp:cNvGraphicFramePr/>
             <a:graphic xmlns:a="http://schemas.openxmlformats.org/drawingml/2006/main">
               <a:graphicData uri="http://schemas.openxmlformats.org/drawingml/2006/picture">
                 <pic:pic xmlns:pic="http://schemas.openxmlformats.org/drawingml/2006/picture">
                   <pic:nvPicPr>
-                    <pic:cNvPr id="474510234" name=""/>
+                    <pic:cNvPr id="1114238631" name=""/>
                     <pic:cNvPicPr/>
                   </pic:nvPicPr>
                   <pic:blipFill>
@@ -15180,16 +15199,16 @@
         </w:rPr>
         <w:lastRenderedPageBreak/>
         <w:drawing>
-          <wp:inline distT="0" distB="0" distL="0" distR="0" wp14:anchorId="1CCECD48" wp14:editId="6AA47D49">
+          <wp:inline distT="0" distB="0" distL="0" distR="0" wp14:anchorId="023E2EF6" wp14:editId="438D70F3">
             <wp:extent cx="5120640" cy="4627581"/>
             <wp:effectExtent l="19050" t="19050" r="22860" b="20955"/>
-            <wp:docPr id="1259417313" name="Imagem 24"/>
+            <wp:docPr id="736778441" name="Imagem 24"/>
             <wp:cNvGraphicFramePr/>
             <a:graphic xmlns:a="http://schemas.openxmlformats.org/drawingml/2006/main">
               <a:graphicData uri="http://schemas.openxmlformats.org/drawingml/2006/picture">
                 <pic:pic xmlns:pic="http://schemas.openxmlformats.org/drawingml/2006/picture">
                   <pic:nvPicPr>
-                    <pic:cNvPr id="1259417313" name=""/>
+                    <pic:cNvPr id="736778441" name=""/>
                     <pic:cNvPicPr/>
                   </pic:nvPicPr>
                   <pic:blipFill>
@@ -15426,7 +15445,7 @@
           <w:sz w:val="27"/>
         </w:rPr>
       </w:pPr>
-      <w:bookmarkStart w:id="28" w:name="_Toc240274131"/>
+      <w:bookmarkStart w:id="28" w:name="_Toc240275453"/>
       <w:r>
         <w:rPr>
           <w:rFonts w:ascii="Montserrat" w:hAnsi="Montserrat"/>
@@ -15466,16 +15485,16 @@
           <w:noProof/>
         </w:rPr>
         <w:drawing>
-          <wp:inline distT="0" distB="0" distL="0" distR="0" wp14:anchorId="22413437" wp14:editId="19E4C036">
+          <wp:inline distT="0" distB="0" distL="0" distR="0" wp14:anchorId="2C2F63F5" wp14:editId="452A3EDD">
             <wp:extent cx="5120640" cy="4627581"/>
             <wp:effectExtent l="19050" t="19050" r="22860" b="20955"/>
-            <wp:docPr id="644890361" name="Imagem 25"/>
+            <wp:docPr id="1357433894" name="Imagem 25"/>
             <wp:cNvGraphicFramePr/>
             <a:graphic xmlns:a="http://schemas.openxmlformats.org/drawingml/2006/main">
               <a:graphicData uri="http://schemas.openxmlformats.org/drawingml/2006/picture">
                 <pic:pic xmlns:pic="http://schemas.openxmlformats.org/drawingml/2006/picture">
                   <pic:nvPicPr>
-                    <pic:cNvPr id="644890361" name=""/>
+                    <pic:cNvPr id="1357433894" name=""/>
                     <pic:cNvPicPr/>
                   </pic:nvPicPr>
                   <pic:blipFill>
@@ -15543,16 +15562,16 @@
         </w:rPr>
         <w:lastRenderedPageBreak/>
         <w:drawing>
-          <wp:inline distT="0" distB="0" distL="0" distR="0" wp14:anchorId="572E3438" wp14:editId="1EA06F33">
+          <wp:inline distT="0" distB="0" distL="0" distR="0" wp14:anchorId="29DCA5FB" wp14:editId="4636DA68">
             <wp:extent cx="5120640" cy="4627581"/>
             <wp:effectExtent l="19050" t="19050" r="22860" b="20955"/>
-            <wp:docPr id="178377308" name="Imagem 26"/>
+            <wp:docPr id="1426194965" name="Imagem 26"/>
             <wp:cNvGraphicFramePr/>
             <a:graphic xmlns:a="http://schemas.openxmlformats.org/drawingml/2006/main">
               <a:graphicData uri="http://schemas.openxmlformats.org/drawingml/2006/picture">
                 <pic:pic xmlns:pic="http://schemas.openxmlformats.org/drawingml/2006/picture">
                   <pic:nvPicPr>
-                    <pic:cNvPr id="178377308" name=""/>
+                    <pic:cNvPr id="1426194965" name=""/>
                     <pic:cNvPicPr/>
                   </pic:nvPicPr>
                   <pic:blipFill>
@@ -15743,7 +15762,7 @@
           <w:sz w:val="27"/>
         </w:rPr>
       </w:pPr>
-      <w:bookmarkStart w:id="29" w:name="_Toc240274132"/>
+      <w:bookmarkStart w:id="29" w:name="_Toc240275454"/>
       <w:r>
         <w:rPr>
           <w:rFonts w:ascii="Montserrat" w:hAnsi="Montserrat"/>
@@ -15783,16 +15802,16 @@
           <w:noProof/>
         </w:rPr>
         <w:drawing>
-          <wp:inline distT="0" distB="0" distL="0" distR="0" wp14:anchorId="5821E253" wp14:editId="02B37B9A">
+          <wp:inline distT="0" distB="0" distL="0" distR="0" wp14:anchorId="18300800" wp14:editId="339B7C27">
             <wp:extent cx="5120640" cy="4000682"/>
             <wp:effectExtent l="19050" t="19050" r="22860" b="19050"/>
-            <wp:docPr id="626713925" name="Imagem 27"/>
+            <wp:docPr id="444219429" name="Imagem 27"/>
             <wp:cNvGraphicFramePr/>
             <a:graphic xmlns:a="http://schemas.openxmlformats.org/drawingml/2006/main">
               <a:graphicData uri="http://schemas.openxmlformats.org/drawingml/2006/picture">
                 <pic:pic xmlns:pic="http://schemas.openxmlformats.org/drawingml/2006/picture">
                   <pic:nvPicPr>
-                    <pic:cNvPr id="626713925" name=""/>
+                    <pic:cNvPr id="444219429" name=""/>
                     <pic:cNvPicPr/>
                   </pic:nvPicPr>
                   <pic:blipFill>
@@ -16316,7 +16335,7 @@
           <w:sz w:val="34"/>
         </w:rPr>
       </w:pPr>
-      <w:bookmarkStart w:id="30" w:name="_Toc240274133"/>
+      <w:bookmarkStart w:id="30" w:name="_Toc240275455"/>
       <w:r>
         <w:rPr>
           <w:rFonts w:ascii="Montserrat" w:hAnsi="Montserrat"/>
@@ -16358,7 +16377,7 @@
           <w:sz w:val="27"/>
         </w:rPr>
       </w:pPr>
-      <w:bookmarkStart w:id="31" w:name="_Toc240274134"/>
+      <w:bookmarkStart w:id="31" w:name="_Toc240275456"/>
       <w:r>
         <w:rPr>
           <w:rFonts w:ascii="Montserrat" w:hAnsi="Montserrat"/>
@@ -16398,16 +16417,16 @@
           <w:noProof/>
         </w:rPr>
         <w:drawing>
-          <wp:inline distT="0" distB="0" distL="0" distR="0" wp14:anchorId="2E657728" wp14:editId="7C8E7B49">
+          <wp:inline distT="0" distB="0" distL="0" distR="0" wp14:anchorId="1A33C6E2" wp14:editId="6F8E78BD">
             <wp:extent cx="5120640" cy="4627581"/>
             <wp:effectExtent l="19050" t="19050" r="22860" b="20955"/>
-            <wp:docPr id="693246389" name="Imagem 28"/>
+            <wp:docPr id="2021264087" name="Imagem 28"/>
             <wp:cNvGraphicFramePr/>
             <a:graphic xmlns:a="http://schemas.openxmlformats.org/drawingml/2006/main">
               <a:graphicData uri="http://schemas.openxmlformats.org/drawingml/2006/picture">
                 <pic:pic xmlns:pic="http://schemas.openxmlformats.org/drawingml/2006/picture">
                   <pic:nvPicPr>
-                    <pic:cNvPr id="693246389" name=""/>
+                    <pic:cNvPr id="2021264087" name=""/>
                     <pic:cNvPicPr/>
                   </pic:nvPicPr>
                   <pic:blipFill>
@@ -16475,16 +16494,16 @@
         </w:rPr>
         <w:lastRenderedPageBreak/>
         <w:drawing>
-          <wp:inline distT="0" distB="0" distL="0" distR="0" wp14:anchorId="4397799F" wp14:editId="34961003">
+          <wp:inline distT="0" distB="0" distL="0" distR="0" wp14:anchorId="6982B3E9" wp14:editId="36BDC196">
             <wp:extent cx="5120640" cy="4627581"/>
             <wp:effectExtent l="19050" t="19050" r="22860" b="20955"/>
-            <wp:docPr id="2048938934" name="Imagem 29"/>
+            <wp:docPr id="1705274251" name="Imagem 29"/>
             <wp:cNvGraphicFramePr/>
             <a:graphic xmlns:a="http://schemas.openxmlformats.org/drawingml/2006/main">
               <a:graphicData uri="http://schemas.openxmlformats.org/drawingml/2006/picture">
                 <pic:pic xmlns:pic="http://schemas.openxmlformats.org/drawingml/2006/picture">
                   <pic:nvPicPr>
-                    <pic:cNvPr id="2048938934" name=""/>
+                    <pic:cNvPr id="1705274251" name=""/>
                     <pic:cNvPicPr/>
                   </pic:nvPicPr>
                   <pic:blipFill>
@@ -16552,16 +16571,16 @@
         </w:rPr>
         <w:lastRenderedPageBreak/>
         <w:drawing>
-          <wp:inline distT="0" distB="0" distL="0" distR="0" wp14:anchorId="01FC8DAF" wp14:editId="21814AEB">
+          <wp:inline distT="0" distB="0" distL="0" distR="0" wp14:anchorId="121D2C62" wp14:editId="282BEDB7">
             <wp:extent cx="5120640" cy="4627581"/>
             <wp:effectExtent l="19050" t="19050" r="22860" b="20955"/>
-            <wp:docPr id="1938740622" name="Imagem 30"/>
+            <wp:docPr id="374789312" name="Imagem 30"/>
             <wp:cNvGraphicFramePr/>
             <a:graphic xmlns:a="http://schemas.openxmlformats.org/drawingml/2006/main">
               <a:graphicData uri="http://schemas.openxmlformats.org/drawingml/2006/picture">
                 <pic:pic xmlns:pic="http://schemas.openxmlformats.org/drawingml/2006/picture">
                   <pic:nvPicPr>
-                    <pic:cNvPr id="1938740622" name=""/>
+                    <pic:cNvPr id="374789312" name=""/>
                     <pic:cNvPicPr/>
                   </pic:nvPicPr>
                   <pic:blipFill>
@@ -16763,16 +16782,16 @@
           <w:noProof/>
         </w:rPr>
         <w:drawing>
-          <wp:inline distT="0" distB="0" distL="0" distR="0" wp14:anchorId="474AE071" wp14:editId="67191DBA">
+          <wp:inline distT="0" distB="0" distL="0" distR="0" wp14:anchorId="059CCED1" wp14:editId="636F3FAB">
             <wp:extent cx="5120640" cy="1715571"/>
             <wp:effectExtent l="19050" t="19050" r="22860" b="18415"/>
-            <wp:docPr id="934688444" name="Imagem 31"/>
+            <wp:docPr id="478676267" name="Imagem 31"/>
             <wp:cNvGraphicFramePr/>
             <a:graphic xmlns:a="http://schemas.openxmlformats.org/drawingml/2006/main">
               <a:graphicData uri="http://schemas.openxmlformats.org/drawingml/2006/picture">
                 <pic:pic xmlns:pic="http://schemas.openxmlformats.org/drawingml/2006/picture">
                   <pic:nvPicPr>
-                    <pic:cNvPr id="934688444" name=""/>
+                    <pic:cNvPr id="478676267" name=""/>
                     <pic:cNvPicPr/>
                   </pic:nvPicPr>
                   <pic:blipFill>
@@ -16909,16 +16928,16 @@
           <w:noProof/>
         </w:rPr>
         <w:drawing>
-          <wp:inline distT="0" distB="0" distL="0" distR="0" wp14:anchorId="346E724E" wp14:editId="068EFD47">
+          <wp:inline distT="0" distB="0" distL="0" distR="0" wp14:anchorId="4B3B8E3E" wp14:editId="336750E1">
             <wp:extent cx="5120640" cy="3282818"/>
             <wp:effectExtent l="19050" t="19050" r="22860" b="13335"/>
-            <wp:docPr id="801260604" name="Imagem 32"/>
+            <wp:docPr id="849753028" name="Imagem 32"/>
             <wp:cNvGraphicFramePr/>
             <a:graphic xmlns:a="http://schemas.openxmlformats.org/drawingml/2006/main">
               <a:graphicData uri="http://schemas.openxmlformats.org/drawingml/2006/picture">
                 <pic:pic xmlns:pic="http://schemas.openxmlformats.org/drawingml/2006/picture">
                   <pic:nvPicPr>
-                    <pic:cNvPr id="801260604" name=""/>
+                    <pic:cNvPr id="849753028" name=""/>
                     <pic:cNvPicPr/>
                   </pic:nvPicPr>
                   <pic:blipFill>
@@ -17052,16 +17071,16 @@
           <w:noProof/>
         </w:rPr>
         <w:drawing>
-          <wp:inline distT="0" distB="0" distL="0" distR="0" wp14:anchorId="7EF09BFE" wp14:editId="5034E962">
+          <wp:inline distT="0" distB="0" distL="0" distR="0" wp14:anchorId="1F56D8D8" wp14:editId="5BCF4488">
             <wp:extent cx="5120640" cy="951357"/>
             <wp:effectExtent l="19050" t="19050" r="22860" b="20320"/>
-            <wp:docPr id="935809322" name="Imagem 33"/>
+            <wp:docPr id="1469159744" name="Imagem 33"/>
             <wp:cNvGraphicFramePr/>
             <a:graphic xmlns:a="http://schemas.openxmlformats.org/drawingml/2006/main">
               <a:graphicData uri="http://schemas.openxmlformats.org/drawingml/2006/picture">
                 <pic:pic xmlns:pic="http://schemas.openxmlformats.org/drawingml/2006/picture">
                   <pic:nvPicPr>
-                    <pic:cNvPr id="935809322" name=""/>
+                    <pic:cNvPr id="1469159744" name=""/>
                     <pic:cNvPicPr/>
                   </pic:nvPicPr>
                   <pic:blipFill>
@@ -17173,16 +17192,16 @@
           <w:noProof/>
         </w:rPr>
         <w:drawing>
-          <wp:inline distT="0" distB="0" distL="0" distR="0" wp14:anchorId="0514AD0B" wp14:editId="5A380017">
+          <wp:inline distT="0" distB="0" distL="0" distR="0" wp14:anchorId="1DD18676" wp14:editId="27BFBD0A">
             <wp:extent cx="5120640" cy="1515102"/>
             <wp:effectExtent l="19050" t="19050" r="22860" b="28575"/>
-            <wp:docPr id="1860177679" name="Imagem 34"/>
+            <wp:docPr id="799237127" name="Imagem 34"/>
             <wp:cNvGraphicFramePr/>
             <a:graphic xmlns:a="http://schemas.openxmlformats.org/drawingml/2006/main">
               <a:graphicData uri="http://schemas.openxmlformats.org/drawingml/2006/picture">
                 <pic:pic xmlns:pic="http://schemas.openxmlformats.org/drawingml/2006/picture">
                   <pic:nvPicPr>
-                    <pic:cNvPr id="1860177679" name=""/>
+                    <pic:cNvPr id="799237127" name=""/>
                     <pic:cNvPicPr/>
                   </pic:nvPicPr>
                   <pic:blipFill>
@@ -17295,16 +17314,16 @@
           <w:noProof/>
         </w:rPr>
         <w:drawing>
-          <wp:inline distT="0" distB="0" distL="0" distR="0" wp14:anchorId="5E566869" wp14:editId="596F24B8">
+          <wp:inline distT="0" distB="0" distL="0" distR="0" wp14:anchorId="40BFDF1A" wp14:editId="592F5D0C">
             <wp:extent cx="5120640" cy="1391113"/>
             <wp:effectExtent l="19050" t="19050" r="22860" b="19050"/>
-            <wp:docPr id="1398143445" name="Imagem 35"/>
+            <wp:docPr id="1650777336" name="Imagem 35"/>
             <wp:cNvGraphicFramePr/>
             <a:graphic xmlns:a="http://schemas.openxmlformats.org/drawingml/2006/main">
               <a:graphicData uri="http://schemas.openxmlformats.org/drawingml/2006/picture">
                 <pic:pic xmlns:pic="http://schemas.openxmlformats.org/drawingml/2006/picture">
                   <pic:nvPicPr>
-                    <pic:cNvPr id="1398143445" name=""/>
+                    <pic:cNvPr id="1650777336" name=""/>
                     <pic:cNvPicPr/>
                   </pic:nvPicPr>
                   <pic:blipFill>
@@ -17416,16 +17435,16 @@
           <w:noProof/>
         </w:rPr>
         <w:drawing>
-          <wp:inline distT="0" distB="0" distL="0" distR="0" wp14:anchorId="100E1E6F" wp14:editId="6C38DD3C">
+          <wp:inline distT="0" distB="0" distL="0" distR="0" wp14:anchorId="66689284" wp14:editId="018FD679">
             <wp:extent cx="5120640" cy="1125174"/>
             <wp:effectExtent l="19050" t="19050" r="22860" b="18415"/>
-            <wp:docPr id="1296784826" name="Imagem 36"/>
+            <wp:docPr id="1806261792" name="Imagem 36"/>
             <wp:cNvGraphicFramePr/>
             <a:graphic xmlns:a="http://schemas.openxmlformats.org/drawingml/2006/main">
               <a:graphicData uri="http://schemas.openxmlformats.org/drawingml/2006/picture">
                 <pic:pic xmlns:pic="http://schemas.openxmlformats.org/drawingml/2006/picture">
                   <pic:nvPicPr>
-                    <pic:cNvPr id="1296784826" name=""/>
+                    <pic:cNvPr id="1806261792" name=""/>
                     <pic:cNvPicPr/>
                   </pic:nvPicPr>
                   <pic:blipFill>
@@ -17515,7 +17534,7 @@
           <w:sz w:val="27"/>
         </w:rPr>
       </w:pPr>
-      <w:bookmarkStart w:id="32" w:name="_Toc240274135"/>
+      <w:bookmarkStart w:id="32" w:name="_Toc240275457"/>
       <w:r>
         <w:rPr>
           <w:rFonts w:ascii="Montserrat" w:hAnsi="Montserrat"/>
@@ -17555,16 +17574,16 @@
           <w:noProof/>
         </w:rPr>
         <w:drawing>
-          <wp:inline distT="0" distB="0" distL="0" distR="0" wp14:anchorId="36B6CA51" wp14:editId="2EF45A5C">
+          <wp:inline distT="0" distB="0" distL="0" distR="0" wp14:anchorId="43E39686" wp14:editId="7FBA2012">
             <wp:extent cx="5120640" cy="4627581"/>
             <wp:effectExtent l="19050" t="19050" r="22860" b="20955"/>
-            <wp:docPr id="729885765" name="Imagem 37"/>
+            <wp:docPr id="763673534" name="Imagem 37"/>
             <wp:cNvGraphicFramePr/>
             <a:graphic xmlns:a="http://schemas.openxmlformats.org/drawingml/2006/main">
               <a:graphicData uri="http://schemas.openxmlformats.org/drawingml/2006/picture">
                 <pic:pic xmlns:pic="http://schemas.openxmlformats.org/drawingml/2006/picture">
                   <pic:nvPicPr>
-                    <pic:cNvPr id="729885765" name=""/>
+                    <pic:cNvPr id="763673534" name=""/>
                     <pic:cNvPicPr/>
                   </pic:nvPicPr>
                   <pic:blipFill>
@@ -17632,16 +17651,16 @@
         </w:rPr>
         <w:lastRenderedPageBreak/>
         <w:drawing>
-          <wp:inline distT="0" distB="0" distL="0" distR="0" wp14:anchorId="6368F047" wp14:editId="24604EC6">
+          <wp:inline distT="0" distB="0" distL="0" distR="0" wp14:anchorId="4C4C3B9D" wp14:editId="5B14054A">
             <wp:extent cx="5120640" cy="4627581"/>
             <wp:effectExtent l="19050" t="19050" r="22860" b="20955"/>
-            <wp:docPr id="2058562116" name="Imagem 38"/>
+            <wp:docPr id="721017978" name="Imagem 38"/>
             <wp:cNvGraphicFramePr/>
             <a:graphic xmlns:a="http://schemas.openxmlformats.org/drawingml/2006/main">
               <a:graphicData uri="http://schemas.openxmlformats.org/drawingml/2006/picture">
                 <pic:pic xmlns:pic="http://schemas.openxmlformats.org/drawingml/2006/picture">
                   <pic:nvPicPr>
-                    <pic:cNvPr id="2058562116" name=""/>
+                    <pic:cNvPr id="721017978" name=""/>
                     <pic:cNvPicPr/>
                   </pic:nvPicPr>
                   <pic:blipFill>
@@ -17810,16 +17829,16 @@
           <w:noProof/>
         </w:rPr>
         <w:drawing>
-          <wp:inline distT="0" distB="0" distL="0" distR="0" wp14:anchorId="00B64CFA" wp14:editId="5E9B6A79">
+          <wp:inline distT="0" distB="0" distL="0" distR="0" wp14:anchorId="691C95E6" wp14:editId="04A9BF0F">
             <wp:extent cx="5120640" cy="2144319"/>
             <wp:effectExtent l="19050" t="19050" r="22860" b="27940"/>
-            <wp:docPr id="1861929800" name="Imagem 39"/>
+            <wp:docPr id="1694611548" name="Imagem 39"/>
             <wp:cNvGraphicFramePr/>
             <a:graphic xmlns:a="http://schemas.openxmlformats.org/drawingml/2006/main">
               <a:graphicData uri="http://schemas.openxmlformats.org/drawingml/2006/picture">
                 <pic:pic xmlns:pic="http://schemas.openxmlformats.org/drawingml/2006/picture">
                   <pic:nvPicPr>
-                    <pic:cNvPr id="1861929800" name=""/>
+                    <pic:cNvPr id="1694611548" name=""/>
                     <pic:cNvPicPr/>
                   </pic:nvPicPr>
                   <pic:blipFill>
@@ -17907,16 +17926,16 @@
           <w:noProof/>
         </w:rPr>
         <w:drawing>
-          <wp:inline distT="0" distB="0" distL="0" distR="0" wp14:anchorId="7068829C" wp14:editId="709027C3">
+          <wp:inline distT="0" distB="0" distL="0" distR="0" wp14:anchorId="5DD6D9A2" wp14:editId="6BE81DAB">
             <wp:extent cx="5120640" cy="1055647"/>
             <wp:effectExtent l="19050" t="19050" r="22860" b="11430"/>
-            <wp:docPr id="653141895" name="Imagem 40"/>
+            <wp:docPr id="590843359" name="Imagem 40"/>
             <wp:cNvGraphicFramePr/>
             <a:graphic xmlns:a="http://schemas.openxmlformats.org/drawingml/2006/main">
               <a:graphicData uri="http://schemas.openxmlformats.org/drawingml/2006/picture">
                 <pic:pic xmlns:pic="http://schemas.openxmlformats.org/drawingml/2006/picture">
                   <pic:nvPicPr>
-                    <pic:cNvPr id="653141895" name=""/>
+                    <pic:cNvPr id="590843359" name=""/>
                     <pic:cNvPicPr/>
                   </pic:nvPicPr>
                   <pic:blipFill>
@@ -18038,16 +18057,16 @@
           <w:noProof/>
         </w:rPr>
         <w:drawing>
-          <wp:inline distT="0" distB="0" distL="0" distR="0" wp14:anchorId="4FD021C4" wp14:editId="6E0D986B">
+          <wp:inline distT="0" distB="0" distL="0" distR="0" wp14:anchorId="20F49807" wp14:editId="2F916E8A">
             <wp:extent cx="5120640" cy="3282818"/>
             <wp:effectExtent l="19050" t="19050" r="22860" b="13335"/>
-            <wp:docPr id="858749964" name="Imagem 41"/>
+            <wp:docPr id="755788070" name="Imagem 41"/>
             <wp:cNvGraphicFramePr/>
             <a:graphic xmlns:a="http://schemas.openxmlformats.org/drawingml/2006/main">
               <a:graphicData uri="http://schemas.openxmlformats.org/drawingml/2006/picture">
                 <pic:pic xmlns:pic="http://schemas.openxmlformats.org/drawingml/2006/picture">
                   <pic:nvPicPr>
-                    <pic:cNvPr id="858749964" name=""/>
+                    <pic:cNvPr id="755788070" name=""/>
                     <pic:cNvPicPr/>
                   </pic:nvPicPr>
                   <pic:blipFill>
@@ -18181,16 +18200,16 @@
         </w:rPr>
         <w:lastRenderedPageBreak/>
         <w:drawing>
-          <wp:inline distT="0" distB="0" distL="0" distR="0" wp14:anchorId="59F7F33B" wp14:editId="5640ADBF">
+          <wp:inline distT="0" distB="0" distL="0" distR="0" wp14:anchorId="77ECD8DB" wp14:editId="49DE9163">
             <wp:extent cx="5120640" cy="1978034"/>
             <wp:effectExtent l="19050" t="19050" r="22860" b="22225"/>
-            <wp:docPr id="1720165883" name="Imagem 42"/>
+            <wp:docPr id="1694494694" name="Imagem 42"/>
             <wp:cNvGraphicFramePr/>
             <a:graphic xmlns:a="http://schemas.openxmlformats.org/drawingml/2006/main">
               <a:graphicData uri="http://schemas.openxmlformats.org/drawingml/2006/picture">
                 <pic:pic xmlns:pic="http://schemas.openxmlformats.org/drawingml/2006/picture">
                   <pic:nvPicPr>
-                    <pic:cNvPr id="1720165883" name=""/>
+                    <pic:cNvPr id="1694494694" name=""/>
                     <pic:cNvPicPr/>
                   </pic:nvPicPr>
                   <pic:blipFill>
@@ -18262,7 +18281,7 @@
           <w:sz w:val="34"/>
         </w:rPr>
       </w:pPr>
-      <w:bookmarkStart w:id="33" w:name="_Toc240274136"/>
+      <w:bookmarkStart w:id="33" w:name="_Toc240275458"/>
       <w:r>
         <w:rPr>
           <w:rFonts w:ascii="Montserrat" w:hAnsi="Montserrat"/>
@@ -18322,7 +18341,7 @@
           <w:sz w:val="27"/>
         </w:rPr>
       </w:pPr>
-      <w:bookmarkStart w:id="34" w:name="_Toc240274137"/>
+      <w:bookmarkStart w:id="34" w:name="_Toc240275459"/>
       <w:r>
         <w:rPr>
           <w:rFonts w:ascii="Montserrat" w:hAnsi="Montserrat"/>
@@ -18362,16 +18381,16 @@
           <w:noProof/>
         </w:rPr>
         <w:drawing>
-          <wp:inline distT="0" distB="0" distL="0" distR="0" wp14:anchorId="2BF1EA3F" wp14:editId="1BBF911F">
+          <wp:inline distT="0" distB="0" distL="0" distR="0" wp14:anchorId="020FCD0D" wp14:editId="109CF082">
             <wp:extent cx="5303520" cy="4792851"/>
             <wp:effectExtent l="19050" t="19050" r="11430" b="27305"/>
-            <wp:docPr id="272048358" name="Imagem 43"/>
+            <wp:docPr id="304763050" name="Imagem 43"/>
             <wp:cNvGraphicFramePr/>
             <a:graphic xmlns:a="http://schemas.openxmlformats.org/drawingml/2006/main">
               <a:graphicData uri="http://schemas.openxmlformats.org/drawingml/2006/picture">
                 <pic:pic xmlns:pic="http://schemas.openxmlformats.org/drawingml/2006/picture">
                   <pic:nvPicPr>
-                    <pic:cNvPr id="272048358" name=""/>
+                    <pic:cNvPr id="304763050" name=""/>
                     <pic:cNvPicPr/>
                   </pic:nvPicPr>
                   <pic:blipFill>
@@ -18440,7 +18459,7 @@
           <w:sz w:val="27"/>
         </w:rPr>
       </w:pPr>
-      <w:bookmarkStart w:id="35" w:name="_Toc240274138"/>
+      <w:bookmarkStart w:id="35" w:name="_Toc240275460"/>
       <w:r>
         <w:rPr>
           <w:rFonts w:ascii="Montserrat" w:hAnsi="Montserrat"/>
@@ -18480,16 +18499,16 @@
           <w:noProof/>
         </w:rPr>
         <w:drawing>
-          <wp:inline distT="0" distB="0" distL="0" distR="0" wp14:anchorId="392308A5" wp14:editId="4A1D5195">
+          <wp:inline distT="0" distB="0" distL="0" distR="0" wp14:anchorId="1ADB0E54" wp14:editId="1AAC7F2C">
             <wp:extent cx="5303520" cy="4792851"/>
             <wp:effectExtent l="19050" t="19050" r="11430" b="27305"/>
-            <wp:docPr id="1981185239" name="Imagem 44"/>
+            <wp:docPr id="302334463" name="Imagem 44"/>
             <wp:cNvGraphicFramePr/>
             <a:graphic xmlns:a="http://schemas.openxmlformats.org/drawingml/2006/main">
               <a:graphicData uri="http://schemas.openxmlformats.org/drawingml/2006/picture">
                 <pic:pic xmlns:pic="http://schemas.openxmlformats.org/drawingml/2006/picture">
                   <pic:nvPicPr>
-                    <pic:cNvPr id="1981185239" name=""/>
+                    <pic:cNvPr id="302334463" name=""/>
                     <pic:cNvPicPr/>
                   </pic:nvPicPr>
                   <pic:blipFill>
@@ -18557,7 +18576,7 @@
           <w:sz w:val="27"/>
         </w:rPr>
       </w:pPr>
-      <w:bookmarkStart w:id="36" w:name="_Toc240274139"/>
+      <w:bookmarkStart w:id="36" w:name="_Toc240275461"/>
       <w:r>
         <w:rPr>
           <w:rFonts w:ascii="Montserrat" w:hAnsi="Montserrat"/>
@@ -18598,16 +18617,16 @@
         </w:rPr>
         <w:lastRenderedPageBreak/>
         <w:drawing>
-          <wp:inline distT="0" distB="0" distL="0" distR="0" wp14:anchorId="615FD74E" wp14:editId="6B71B070">
+          <wp:inline distT="0" distB="0" distL="0" distR="0" wp14:anchorId="00772F25" wp14:editId="25EC51C1">
             <wp:extent cx="5303520" cy="4792851"/>
             <wp:effectExtent l="19050" t="19050" r="11430" b="27305"/>
-            <wp:docPr id="900075873" name="Imagem 45"/>
+            <wp:docPr id="1019308751" name="Imagem 45"/>
             <wp:cNvGraphicFramePr/>
             <a:graphic xmlns:a="http://schemas.openxmlformats.org/drawingml/2006/main">
               <a:graphicData uri="http://schemas.openxmlformats.org/drawingml/2006/picture">
                 <pic:pic xmlns:pic="http://schemas.openxmlformats.org/drawingml/2006/picture">
                   <pic:nvPicPr>
-                    <pic:cNvPr id="900075873" name=""/>
+                    <pic:cNvPr id="1019308751" name=""/>
                     <pic:cNvPicPr/>
                   </pic:nvPicPr>
                   <pic:blipFill>
@@ -18675,16 +18694,16 @@
         </w:rPr>
         <w:lastRenderedPageBreak/>
         <w:drawing>
-          <wp:inline distT="0" distB="0" distL="0" distR="0" wp14:anchorId="0FE9AA61" wp14:editId="253F9C3A">
+          <wp:inline distT="0" distB="0" distL="0" distR="0" wp14:anchorId="35B8FBFE" wp14:editId="18CB7E70">
             <wp:extent cx="5303520" cy="4792851"/>
             <wp:effectExtent l="19050" t="19050" r="11430" b="27305"/>
-            <wp:docPr id="2092546294" name="Imagem 46"/>
+            <wp:docPr id="505046591" name="Imagem 46"/>
             <wp:cNvGraphicFramePr/>
             <a:graphic xmlns:a="http://schemas.openxmlformats.org/drawingml/2006/main">
               <a:graphicData uri="http://schemas.openxmlformats.org/drawingml/2006/picture">
                 <pic:pic xmlns:pic="http://schemas.openxmlformats.org/drawingml/2006/picture">
                   <pic:nvPicPr>
-                    <pic:cNvPr id="2092546294" name=""/>
+                    <pic:cNvPr id="505046591" name=""/>
                     <pic:cNvPicPr/>
                   </pic:nvPicPr>
                   <pic:blipFill>
@@ -18777,7 +18796,7 @@
           <w:sz w:val="34"/>
         </w:rPr>
       </w:pPr>
-      <w:bookmarkStart w:id="37" w:name="_Toc240274140"/>
+      <w:bookmarkStart w:id="37" w:name="_Toc240275462"/>
       <w:r>
         <w:rPr>
           <w:rFonts w:ascii="Montserrat" w:hAnsi="Montserrat"/>
@@ -18819,7 +18838,7 @@
           <w:sz w:val="27"/>
         </w:rPr>
       </w:pPr>
-      <w:bookmarkStart w:id="38" w:name="_Toc240274141"/>
+      <w:bookmarkStart w:id="38" w:name="_Toc240275463"/>
       <w:r>
         <w:rPr>
           <w:rFonts w:ascii="Montserrat" w:hAnsi="Montserrat"/>
@@ -18859,16 +18878,16 @@
           <w:noProof/>
         </w:rPr>
         <w:drawing>
-          <wp:inline distT="0" distB="0" distL="0" distR="0" wp14:anchorId="40444066" wp14:editId="276EBF19">
+          <wp:inline distT="0" distB="0" distL="0" distR="0" wp14:anchorId="2BD96623" wp14:editId="44DEE68A">
             <wp:extent cx="5303520" cy="4792851"/>
             <wp:effectExtent l="19050" t="19050" r="11430" b="27305"/>
-            <wp:docPr id="393189363" name="Imagem 47"/>
+            <wp:docPr id="1309063155" name="Imagem 47"/>
             <wp:cNvGraphicFramePr/>
             <a:graphic xmlns:a="http://schemas.openxmlformats.org/drawingml/2006/main">
               <a:graphicData uri="http://schemas.openxmlformats.org/drawingml/2006/picture">
                 <pic:pic xmlns:pic="http://schemas.openxmlformats.org/drawingml/2006/picture">
                   <pic:nvPicPr>
-                    <pic:cNvPr id="393189363" name=""/>
+                    <pic:cNvPr id="1309063155" name=""/>
                     <pic:cNvPicPr/>
                   </pic:nvPicPr>
                   <pic:blipFill>
@@ -19097,7 +19116,7 @@
           <w:sz w:val="27"/>
         </w:rPr>
       </w:pPr>
-      <w:bookmarkStart w:id="39" w:name="_Toc240274142"/>
+      <w:bookmarkStart w:id="39" w:name="_Toc240275464"/>
       <w:r>
         <w:rPr>
           <w:rFonts w:ascii="Montserrat" w:hAnsi="Montserrat"/>
@@ -19137,16 +19156,16 @@
           <w:noProof/>
         </w:rPr>
         <w:drawing>
-          <wp:inline distT="0" distB="0" distL="0" distR="0" wp14:anchorId="163FE8E4" wp14:editId="21AB243E">
+          <wp:inline distT="0" distB="0" distL="0" distR="0" wp14:anchorId="3690B784" wp14:editId="6DB80F7C">
             <wp:extent cx="5303520" cy="4792851"/>
             <wp:effectExtent l="19050" t="19050" r="11430" b="27305"/>
-            <wp:docPr id="1379879903" name="Imagem 48"/>
+            <wp:docPr id="1810224478" name="Imagem 48"/>
             <wp:cNvGraphicFramePr/>
             <a:graphic xmlns:a="http://schemas.openxmlformats.org/drawingml/2006/main">
               <a:graphicData uri="http://schemas.openxmlformats.org/drawingml/2006/picture">
                 <pic:pic xmlns:pic="http://schemas.openxmlformats.org/drawingml/2006/picture">
                   <pic:nvPicPr>
-                    <pic:cNvPr id="1379879903" name=""/>
+                    <pic:cNvPr id="1810224478" name=""/>
                     <pic:cNvPicPr/>
                   </pic:nvPicPr>
                   <pic:blipFill>
@@ -19214,7 +19233,7 @@
           <w:sz w:val="27"/>
         </w:rPr>
       </w:pPr>
-      <w:bookmarkStart w:id="40" w:name="_Toc240274143"/>
+      <w:bookmarkStart w:id="40" w:name="_Toc240275465"/>
       <w:r>
         <w:rPr>
           <w:rFonts w:ascii="Montserrat" w:hAnsi="Montserrat"/>
@@ -19255,16 +19274,16 @@
         </w:rPr>
         <w:lastRenderedPageBreak/>
         <w:drawing>
-          <wp:inline distT="0" distB="0" distL="0" distR="0" wp14:anchorId="161353B0" wp14:editId="5533F50E">
+          <wp:inline distT="0" distB="0" distL="0" distR="0" wp14:anchorId="1E8AA9EE" wp14:editId="7754CDBC">
             <wp:extent cx="5303520" cy="4792851"/>
             <wp:effectExtent l="19050" t="19050" r="11430" b="27305"/>
-            <wp:docPr id="702920757" name="Imagem 49"/>
+            <wp:docPr id="232444497" name="Imagem 49"/>
             <wp:cNvGraphicFramePr/>
             <a:graphic xmlns:a="http://schemas.openxmlformats.org/drawingml/2006/main">
               <a:graphicData uri="http://schemas.openxmlformats.org/drawingml/2006/picture">
                 <pic:pic xmlns:pic="http://schemas.openxmlformats.org/drawingml/2006/picture">
                   <pic:nvPicPr>
-                    <pic:cNvPr id="702920757" name=""/>
+                    <pic:cNvPr id="232444497" name=""/>
                     <pic:cNvPicPr/>
                   </pic:nvPicPr>
                   <pic:blipFill>
@@ -19408,7 +19427,7 @@
           <w:sz w:val="27"/>
         </w:rPr>
       </w:pPr>
-      <w:bookmarkStart w:id="41" w:name="_Toc240274144"/>
+      <w:bookmarkStart w:id="41" w:name="_Toc240275466"/>
       <w:r>
         <w:rPr>
           <w:rFonts w:ascii="Montserrat" w:hAnsi="Montserrat"/>
@@ -19673,16 +19692,16 @@
           <w:noProof/>
         </w:rPr>
         <w:drawing>
-          <wp:inline distT="0" distB="0" distL="0" distR="0" wp14:anchorId="24B38A8C" wp14:editId="46D52CD9">
+          <wp:inline distT="0" distB="0" distL="0" distR="0" wp14:anchorId="7673629A" wp14:editId="5597A727">
             <wp:extent cx="5303520" cy="4267180"/>
             <wp:effectExtent l="19050" t="19050" r="11430" b="19685"/>
-            <wp:docPr id="364071279" name="Imagem 50"/>
+            <wp:docPr id="1476041260" name="Imagem 50"/>
             <wp:cNvGraphicFramePr/>
             <a:graphic xmlns:a="http://schemas.openxmlformats.org/drawingml/2006/main">
               <a:graphicData uri="http://schemas.openxmlformats.org/drawingml/2006/picture">
                 <pic:pic xmlns:pic="http://schemas.openxmlformats.org/drawingml/2006/picture">
                   <pic:nvPicPr>
-                    <pic:cNvPr id="364071279" name=""/>
+                    <pic:cNvPr id="1476041260" name=""/>
                     <pic:cNvPicPr/>
                   </pic:nvPicPr>
                   <pic:blipFill>
@@ -19750,16 +19769,16 @@
           <w:noProof/>
         </w:rPr>
         <w:drawing>
-          <wp:inline distT="0" distB="0" distL="0" distR="0" wp14:anchorId="757E1043" wp14:editId="603AE18D">
+          <wp:inline distT="0" distB="0" distL="0" distR="0" wp14:anchorId="74BE17A1" wp14:editId="73B7AFF3">
             <wp:extent cx="5303520" cy="3382059"/>
             <wp:effectExtent l="19050" t="19050" r="11430" b="27940"/>
-            <wp:docPr id="1358254188" name="Imagem 51"/>
+            <wp:docPr id="99214307" name="Imagem 51"/>
             <wp:cNvGraphicFramePr/>
             <a:graphic xmlns:a="http://schemas.openxmlformats.org/drawingml/2006/main">
               <a:graphicData uri="http://schemas.openxmlformats.org/drawingml/2006/picture">
                 <pic:pic xmlns:pic="http://schemas.openxmlformats.org/drawingml/2006/picture">
                   <pic:nvPicPr>
-                    <pic:cNvPr id="1358254188" name=""/>
+                    <pic:cNvPr id="99214307" name=""/>
                     <pic:cNvPicPr/>
                   </pic:nvPicPr>
                   <pic:blipFill>
@@ -19827,16 +19846,16 @@
         </w:rPr>
         <w:lastRenderedPageBreak/>
         <w:drawing>
-          <wp:inline distT="0" distB="0" distL="0" distR="0" wp14:anchorId="6F55C88B" wp14:editId="5CDBCF6C">
+          <wp:inline distT="0" distB="0" distL="0" distR="0" wp14:anchorId="0023A61C" wp14:editId="4042414B">
             <wp:extent cx="5303520" cy="4417800"/>
             <wp:effectExtent l="19050" t="19050" r="11430" b="20955"/>
-            <wp:docPr id="750444578" name="Imagem 52"/>
+            <wp:docPr id="257937320" name="Imagem 52"/>
             <wp:cNvGraphicFramePr/>
             <a:graphic xmlns:a="http://schemas.openxmlformats.org/drawingml/2006/main">
               <a:graphicData uri="http://schemas.openxmlformats.org/drawingml/2006/picture">
                 <pic:pic xmlns:pic="http://schemas.openxmlformats.org/drawingml/2006/picture">
                   <pic:nvPicPr>
-                    <pic:cNvPr id="750444578" name=""/>
+                    <pic:cNvPr id="257937320" name=""/>
                     <pic:cNvPicPr/>
                   </pic:nvPicPr>
                   <pic:blipFill>
@@ -19946,7 +19965,7 @@
           <w:sz w:val="27"/>
         </w:rPr>
       </w:pPr>
-      <w:bookmarkStart w:id="42" w:name="_Toc240274145"/>
+      <w:bookmarkStart w:id="42" w:name="_Toc240275467"/>
       <w:r>
         <w:rPr>
           <w:rFonts w:ascii="Montserrat" w:hAnsi="Montserrat"/>
@@ -20212,16 +20231,16 @@
         </w:rPr>
         <w:lastRenderedPageBreak/>
         <w:drawing>
-          <wp:inline distT="0" distB="0" distL="0" distR="0" wp14:anchorId="10BB1EA7" wp14:editId="61B77960">
+          <wp:inline distT="0" distB="0" distL="0" distR="0" wp14:anchorId="398280F9" wp14:editId="5697681B">
             <wp:extent cx="5303520" cy="7628836"/>
             <wp:effectExtent l="19050" t="19050" r="11430" b="10795"/>
-            <wp:docPr id="544095145" name="Imagem 53"/>
+            <wp:docPr id="1249476107" name="Imagem 53"/>
             <wp:cNvGraphicFramePr/>
             <a:graphic xmlns:a="http://schemas.openxmlformats.org/drawingml/2006/main">
               <a:graphicData uri="http://schemas.openxmlformats.org/drawingml/2006/picture">
                 <pic:pic xmlns:pic="http://schemas.openxmlformats.org/drawingml/2006/picture">
                   <pic:nvPicPr>
-                    <pic:cNvPr id="544095145" name=""/>
+                    <pic:cNvPr id="1249476107" name=""/>
                     <pic:cNvPicPr/>
                   </pic:nvPicPr>
                   <pic:blipFill>
@@ -20353,7 +20372,7 @@
           <w:sz w:val="27"/>
         </w:rPr>
       </w:pPr>
-      <w:bookmarkStart w:id="43" w:name="_Toc240274146"/>
+      <w:bookmarkStart w:id="43" w:name="_Toc240275468"/>
       <w:r>
         <w:rPr>
           <w:rFonts w:ascii="Montserrat" w:hAnsi="Montserrat"/>
@@ -20506,7 +20525,7 @@
           <w:sz w:val="27"/>
         </w:rPr>
       </w:pPr>
-      <w:bookmarkStart w:id="44" w:name="_Toc240274147"/>
+      <w:bookmarkStart w:id="44" w:name="_Toc240275469"/>
       <w:r>
         <w:rPr>
           <w:rFonts w:ascii="Montserrat" w:hAnsi="Montserrat"/>
@@ -20799,16 +20818,16 @@
           <w:noProof/>
         </w:rPr>
         <w:drawing>
-          <wp:inline distT="0" distB="0" distL="0" distR="0" wp14:anchorId="788F819F" wp14:editId="0E743286">
+          <wp:inline distT="0" distB="0" distL="0" distR="0" wp14:anchorId="7B856E9A" wp14:editId="15575368">
             <wp:extent cx="5303520" cy="1351384"/>
             <wp:effectExtent l="19050" t="19050" r="11430" b="20320"/>
-            <wp:docPr id="242507938" name="Imagem 54"/>
+            <wp:docPr id="1826309163" name="Imagem 54"/>
             <wp:cNvGraphicFramePr/>
             <a:graphic xmlns:a="http://schemas.openxmlformats.org/drawingml/2006/main">
               <a:graphicData uri="http://schemas.openxmlformats.org/drawingml/2006/picture">
                 <pic:pic xmlns:pic="http://schemas.openxmlformats.org/drawingml/2006/picture">
                   <pic:nvPicPr>
-                    <pic:cNvPr id="242507938" name=""/>
+                    <pic:cNvPr id="1826309163" name=""/>
                     <pic:cNvPicPr/>
                   </pic:nvPicPr>
                   <pic:blipFill>
@@ -20876,7 +20895,7 @@
           <w:sz w:val="27"/>
         </w:rPr>
       </w:pPr>
-      <w:bookmarkStart w:id="45" w:name="_Toc240274148"/>
+      <w:bookmarkStart w:id="45" w:name="_Toc240275470"/>
       <w:r>
         <w:rPr>
           <w:rFonts w:ascii="Montserrat" w:hAnsi="Montserrat"/>
@@ -21021,16 +21040,16 @@
           <w:noProof/>
         </w:rPr>
         <w:drawing>
-          <wp:inline distT="0" distB="0" distL="0" distR="0" wp14:anchorId="7BCA21FD" wp14:editId="1129462C">
+          <wp:inline distT="0" distB="0" distL="0" distR="0" wp14:anchorId="483D261D" wp14:editId="583D4309">
             <wp:extent cx="5303520" cy="1422793"/>
             <wp:effectExtent l="19050" t="19050" r="11430" b="25400"/>
-            <wp:docPr id="698161555" name="Imagem 55"/>
+            <wp:docPr id="13401751" name="Imagem 55"/>
             <wp:cNvGraphicFramePr/>
             <a:graphic xmlns:a="http://schemas.openxmlformats.org/drawingml/2006/main">
               <a:graphicData uri="http://schemas.openxmlformats.org/drawingml/2006/picture">
                 <pic:pic xmlns:pic="http://schemas.openxmlformats.org/drawingml/2006/picture">
                   <pic:nvPicPr>
-                    <pic:cNvPr id="698161555" name=""/>
+                    <pic:cNvPr id="13401751" name=""/>
                     <pic:cNvPicPr/>
                   </pic:nvPicPr>
                   <pic:blipFill>
@@ -21185,16 +21204,16 @@
         </w:rPr>
         <w:lastRenderedPageBreak/>
         <w:drawing>
-          <wp:inline distT="0" distB="0" distL="0" distR="0" wp14:anchorId="7FCE5F4B" wp14:editId="54573191">
+          <wp:inline distT="0" distB="0" distL="0" distR="0" wp14:anchorId="71409F47" wp14:editId="6725E058">
             <wp:extent cx="5303520" cy="1841050"/>
             <wp:effectExtent l="19050" t="19050" r="11430" b="26035"/>
-            <wp:docPr id="1512457001" name="Imagem 56"/>
+            <wp:docPr id="94736405" name="Imagem 56"/>
             <wp:cNvGraphicFramePr/>
             <a:graphic xmlns:a="http://schemas.openxmlformats.org/drawingml/2006/main">
               <a:graphicData uri="http://schemas.openxmlformats.org/drawingml/2006/picture">
                 <pic:pic xmlns:pic="http://schemas.openxmlformats.org/drawingml/2006/picture">
                   <pic:nvPicPr>
-                    <pic:cNvPr id="1512457001" name=""/>
+                    <pic:cNvPr id="94736405" name=""/>
                     <pic:cNvPicPr/>
                   </pic:nvPicPr>
                   <pic:blipFill>
@@ -21348,16 +21367,16 @@
           <w:noProof/>
         </w:rPr>
         <w:drawing>
-          <wp:inline distT="0" distB="0" distL="0" distR="0" wp14:anchorId="6D60CC57" wp14:editId="0D97F8B2">
+          <wp:inline distT="0" distB="0" distL="0" distR="0" wp14:anchorId="218607DB" wp14:editId="32780F4C">
             <wp:extent cx="5303520" cy="303041"/>
             <wp:effectExtent l="19050" t="19050" r="11430" b="20955"/>
-            <wp:docPr id="910337274" name="Imagem 57"/>
+            <wp:docPr id="63078352" name="Imagem 57"/>
             <wp:cNvGraphicFramePr/>
             <a:graphic xmlns:a="http://schemas.openxmlformats.org/drawingml/2006/main">
               <a:graphicData uri="http://schemas.openxmlformats.org/drawingml/2006/picture">
                 <pic:pic xmlns:pic="http://schemas.openxmlformats.org/drawingml/2006/picture">
                   <pic:nvPicPr>
-                    <pic:cNvPr id="910337274" name=""/>
+                    <pic:cNvPr id="63078352" name=""/>
                     <pic:cNvPicPr/>
                   </pic:nvPicPr>
                   <pic:blipFill>
@@ -21425,16 +21444,16 @@
         </w:rPr>
         <w:lastRenderedPageBreak/>
         <w:drawing>
-          <wp:inline distT="0" distB="0" distL="0" distR="0" wp14:anchorId="7482939E" wp14:editId="5E5875FE">
+          <wp:inline distT="0" distB="0" distL="0" distR="0" wp14:anchorId="4AEFC2DD" wp14:editId="66C87774">
             <wp:extent cx="5303520" cy="2983005"/>
             <wp:effectExtent l="19050" t="19050" r="11430" b="27305"/>
-            <wp:docPr id="1998269807" name="Imagem 58"/>
+            <wp:docPr id="1628718773" name="Imagem 58"/>
             <wp:cNvGraphicFramePr/>
             <a:graphic xmlns:a="http://schemas.openxmlformats.org/drawingml/2006/main">
               <a:graphicData uri="http://schemas.openxmlformats.org/drawingml/2006/picture">
                 <pic:pic xmlns:pic="http://schemas.openxmlformats.org/drawingml/2006/picture">
                   <pic:nvPicPr>
-                    <pic:cNvPr id="1998269807" name=""/>
+                    <pic:cNvPr id="1628718773" name=""/>
                     <pic:cNvPicPr/>
                   </pic:nvPicPr>
                   <pic:blipFill>
@@ -21506,7 +21525,7 @@
           <w:sz w:val="34"/>
         </w:rPr>
       </w:pPr>
-      <w:bookmarkStart w:id="46" w:name="_Toc240274149"/>
+      <w:bookmarkStart w:id="46" w:name="_Toc240275471"/>
       <w:r>
         <w:rPr>
           <w:rFonts w:ascii="Montserrat" w:hAnsi="Montserrat"/>
@@ -21750,7 +21769,7 @@
           <w:sz w:val="34"/>
         </w:rPr>
       </w:pPr>
-      <w:bookmarkStart w:id="47" w:name="_Toc240274150"/>
+      <w:bookmarkStart w:id="47" w:name="_Toc240275472"/>
       <w:r>
         <w:rPr>
           <w:rFonts w:ascii="Montserrat" w:hAnsi="Montserrat"/>
@@ -23538,7 +23557,7 @@
 <file path=word/numbering.xml><?xml version="1.0" encoding="utf-8"?>
 <w:numbering xmlns:wpc="http://schemas.microsoft.com/office/word/2010/wordprocessingCanvas" xmlns:cx="http://schemas.microsoft.com/office/drawing/2014/chartex" xmlns:cx1="http://schemas.microsoft.com/office/drawing/2015/9/8/chartex" xmlns:cx2="http://schemas.microsoft.com/office/drawing/2015/10/21/chartex" xmlns:cx3="http://schemas.microsoft.com/office/drawing/2016/5/9/chartex" xmlns:cx4="http://schemas.microsoft.com/office/drawing/2016/5/10/chartex" xmlns:cx5="http://schemas.microsoft.com/office/drawing/2016/5/11/chartex" xmlns:cx6="http://schemas.microsoft.com/office/drawing/2016/5/12/chartex" xmlns:cx7="http://schemas.microsoft.com/office/drawing/2016/5/13/chartex" xmlns:cx8="http://schemas.microsoft.com/office/drawing/2016/5/14/chartex" xmlns:mc="http://schemas.openxmlformats.org/markup-compatibility/2006" xmlns:aink="http://schemas.microsoft.com/office/drawing/2016/ink" xmlns:am3d="http://schemas.microsoft.com/office/drawing/2017/model3d" xmlns:o="urn:schemas-microsoft-com:office:office" xmlns:oel="http://schemas.microsoft.com/office/2019/extlst" xmlns:r="http://schemas.openxmlformats.org/officeDocument/2006/relationships" xmlns:m="http://schemas.openxmlformats.org/officeDocument/2006/math" xmlns:v="urn:schemas-microsoft-com:vml" xmlns:wp14="http://schemas.microsoft.com/office/word/2010/wordprocessingDrawing" xmlns:wp="http://schemas.openxmlformats.org/drawingml/2006/wordprocessingDrawing" xmlns:w10="urn:schemas-microsoft-com:office:word" xmlns:w="http://schemas.openxmlformats.org/wordprocessingml/2006/main" xmlns:w14="http://schemas.microsoft.com/office/word/2010/wordml" xmlns:w15="http://schemas.microsoft.com/office/word/2012/wordml" xmlns:w16cex="http://schemas.microsoft.com/office/word/2018/wordml/cex" xmlns:w16cid="http://schemas.microsoft.com/office/word/2016/wordml/cid" xmlns:w16="http://schemas.microsoft.com/office/word/2018/wordml" xmlns:w16du="http://schemas.microsoft.com/office/word/2023/wordml/word16du" xmlns:w16sdtdh="http://schemas.microsoft.com/office/word/2020/wordml/sdtdatahash" xmlns:w16sdtfl="http://schemas.microsoft.com/office/word/2024/wordml/sdtformatlock" xmlns:w16se="http://schemas.microsoft.com/office/word/2015/wordml/symex" xmlns:wpg="http://schemas.microsoft.com/office/word/2010/wordprocessingGroup" xmlns:wpi="http://schemas.microsoft.com/office/word/2010/wordprocessingInk" xmlns:wne="http://schemas.microsoft.com/office/word/2006/wordml" xmlns:wps="http://schemas.microsoft.com/office/word/2010/wordprocessingShape" mc:Ignorable="w14 w15 w16se w16cid w16 w16cex w16sdtdh w16sdtfl w16du wp14">
   <w:abstractNum w:abstractNumId="0" w15:restartNumberingAfterBreak="0">
-    <w:nsid w:val="06494D01"/>
+    <w:nsid w:val="001A1AA2"/>
     <w:multiLevelType w:val="singleLevel"/>
     <w:tmpl w:val="04160001"/>
     <w:lvl w:ilvl="0">
@@ -23555,7 +23574,7 @@
     </w:lvl>
   </w:abstractNum>
   <w:abstractNum w:abstractNumId="1" w15:restartNumberingAfterBreak="0">
-    <w:nsid w:val="0B0D1312"/>
+    <w:nsid w:val="013B6708"/>
     <w:multiLevelType w:val="singleLevel"/>
     <w:tmpl w:val="04160001"/>
     <w:lvl w:ilvl="0">
@@ -23572,7 +23591,7 @@
     </w:lvl>
   </w:abstractNum>
   <w:abstractNum w:abstractNumId="2" w15:restartNumberingAfterBreak="0">
-    <w:nsid w:val="0DE835F4"/>
+    <w:nsid w:val="01443507"/>
     <w:multiLevelType w:val="singleLevel"/>
     <w:tmpl w:val="04160001"/>
     <w:lvl w:ilvl="0">
@@ -23589,7 +23608,7 @@
     </w:lvl>
   </w:abstractNum>
   <w:abstractNum w:abstractNumId="3" w15:restartNumberingAfterBreak="0">
-    <w:nsid w:val="0E161953"/>
+    <w:nsid w:val="043220D9"/>
     <w:multiLevelType w:val="singleLevel"/>
     <w:tmpl w:val="04160001"/>
     <w:lvl w:ilvl="0">
@@ -23606,7 +23625,7 @@
     </w:lvl>
   </w:abstractNum>
   <w:abstractNum w:abstractNumId="4" w15:restartNumberingAfterBreak="0">
-    <w:nsid w:val="11A10CB6"/>
+    <w:nsid w:val="08973A15"/>
     <w:multiLevelType w:val="singleLevel"/>
     <w:tmpl w:val="04160001"/>
     <w:lvl w:ilvl="0">
@@ -23623,7 +23642,7 @@
     </w:lvl>
   </w:abstractNum>
   <w:abstractNum w:abstractNumId="5" w15:restartNumberingAfterBreak="0">
-    <w:nsid w:val="12A91E22"/>
+    <w:nsid w:val="0C4F728A"/>
     <w:multiLevelType w:val="singleLevel"/>
     <w:tmpl w:val="04160001"/>
     <w:lvl w:ilvl="0">
@@ -23640,7 +23659,7 @@
     </w:lvl>
   </w:abstractNum>
   <w:abstractNum w:abstractNumId="6" w15:restartNumberingAfterBreak="0">
-    <w:nsid w:val="206D2913"/>
+    <w:nsid w:val="13C770C8"/>
     <w:multiLevelType w:val="singleLevel"/>
     <w:tmpl w:val="04160001"/>
     <w:lvl w:ilvl="0">
@@ -23657,7 +23676,7 @@
     </w:lvl>
   </w:abstractNum>
   <w:abstractNum w:abstractNumId="7" w15:restartNumberingAfterBreak="0">
-    <w:nsid w:val="20A47789"/>
+    <w:nsid w:val="13FC5AE9"/>
     <w:multiLevelType w:val="singleLevel"/>
     <w:tmpl w:val="04160001"/>
     <w:lvl w:ilvl="0">
@@ -23674,7 +23693,7 @@
     </w:lvl>
   </w:abstractNum>
   <w:abstractNum w:abstractNumId="8" w15:restartNumberingAfterBreak="0">
-    <w:nsid w:val="25BC6128"/>
+    <w:nsid w:val="149423E7"/>
     <w:multiLevelType w:val="singleLevel"/>
     <w:tmpl w:val="04160001"/>
     <w:lvl w:ilvl="0">
@@ -23691,7 +23710,7 @@
     </w:lvl>
   </w:abstractNum>
   <w:abstractNum w:abstractNumId="9" w15:restartNumberingAfterBreak="0">
-    <w:nsid w:val="27A654B8"/>
+    <w:nsid w:val="183D238F"/>
     <w:multiLevelType w:val="singleLevel"/>
     <w:tmpl w:val="04160001"/>
     <w:lvl w:ilvl="0">
@@ -23708,7 +23727,7 @@
     </w:lvl>
   </w:abstractNum>
   <w:abstractNum w:abstractNumId="10" w15:restartNumberingAfterBreak="0">
-    <w:nsid w:val="300B4093"/>
+    <w:nsid w:val="21B31A01"/>
     <w:multiLevelType w:val="singleLevel"/>
     <w:tmpl w:val="04160001"/>
     <w:lvl w:ilvl="0">
@@ -23725,7 +23744,7 @@
     </w:lvl>
   </w:abstractNum>
   <w:abstractNum w:abstractNumId="11" w15:restartNumberingAfterBreak="0">
-    <w:nsid w:val="34EB6236"/>
+    <w:nsid w:val="23FE7C4C"/>
     <w:multiLevelType w:val="singleLevel"/>
     <w:tmpl w:val="04160001"/>
     <w:lvl w:ilvl="0">
@@ -23742,7 +23761,7 @@
     </w:lvl>
   </w:abstractNum>
   <w:abstractNum w:abstractNumId="12" w15:restartNumberingAfterBreak="0">
-    <w:nsid w:val="38AB49C9"/>
+    <w:nsid w:val="2E0F21C6"/>
     <w:multiLevelType w:val="singleLevel"/>
     <w:tmpl w:val="04160001"/>
     <w:lvl w:ilvl="0">
@@ -23759,7 +23778,7 @@
     </w:lvl>
   </w:abstractNum>
   <w:abstractNum w:abstractNumId="13" w15:restartNumberingAfterBreak="0">
-    <w:nsid w:val="3C2A5902"/>
+    <w:nsid w:val="30C81457"/>
     <w:multiLevelType w:val="singleLevel"/>
     <w:tmpl w:val="04160001"/>
     <w:lvl w:ilvl="0">
@@ -23776,7 +23795,7 @@
     </w:lvl>
   </w:abstractNum>
   <w:abstractNum w:abstractNumId="14" w15:restartNumberingAfterBreak="0">
-    <w:nsid w:val="45C0273E"/>
+    <w:nsid w:val="32B80A4F"/>
     <w:multiLevelType w:val="singleLevel"/>
     <w:tmpl w:val="04160001"/>
     <w:lvl w:ilvl="0">
@@ -23793,7 +23812,7 @@
     </w:lvl>
   </w:abstractNum>
   <w:abstractNum w:abstractNumId="15" w15:restartNumberingAfterBreak="0">
-    <w:nsid w:val="4775272B"/>
+    <w:nsid w:val="34ED2739"/>
     <w:multiLevelType w:val="singleLevel"/>
     <w:tmpl w:val="04160001"/>
     <w:lvl w:ilvl="0">
@@ -23810,7 +23829,7 @@
     </w:lvl>
   </w:abstractNum>
   <w:abstractNum w:abstractNumId="16" w15:restartNumberingAfterBreak="0">
-    <w:nsid w:val="479C6FB6"/>
+    <w:nsid w:val="3A2E2DF6"/>
     <w:multiLevelType w:val="singleLevel"/>
     <w:tmpl w:val="04160001"/>
     <w:lvl w:ilvl="0">
@@ -23827,7 +23846,7 @@
     </w:lvl>
   </w:abstractNum>
   <w:abstractNum w:abstractNumId="17" w15:restartNumberingAfterBreak="0">
-    <w:nsid w:val="4A863BFC"/>
+    <w:nsid w:val="3FCC3041"/>
     <w:multiLevelType w:val="singleLevel"/>
     <w:tmpl w:val="04160001"/>
     <w:lvl w:ilvl="0">
@@ -23844,7 +23863,7 @@
     </w:lvl>
   </w:abstractNum>
   <w:abstractNum w:abstractNumId="18" w15:restartNumberingAfterBreak="0">
-    <w:nsid w:val="4D7B249D"/>
+    <w:nsid w:val="42B84E91"/>
     <w:multiLevelType w:val="singleLevel"/>
     <w:tmpl w:val="04160001"/>
     <w:lvl w:ilvl="0">
@@ -23861,7 +23880,7 @@
     </w:lvl>
   </w:abstractNum>
   <w:abstractNum w:abstractNumId="19" w15:restartNumberingAfterBreak="0">
-    <w:nsid w:val="514B6F60"/>
+    <w:nsid w:val="44F11B2D"/>
     <w:multiLevelType w:val="singleLevel"/>
     <w:tmpl w:val="04160001"/>
     <w:lvl w:ilvl="0">
@@ -23878,7 +23897,7 @@
     </w:lvl>
   </w:abstractNum>
   <w:abstractNum w:abstractNumId="20" w15:restartNumberingAfterBreak="0">
-    <w:nsid w:val="52AA02BB"/>
+    <w:nsid w:val="49C72BC6"/>
     <w:multiLevelType w:val="singleLevel"/>
     <w:tmpl w:val="04160001"/>
     <w:lvl w:ilvl="0">
@@ -23895,7 +23914,7 @@
     </w:lvl>
   </w:abstractNum>
   <w:abstractNum w:abstractNumId="21" w15:restartNumberingAfterBreak="0">
-    <w:nsid w:val="531227DB"/>
+    <w:nsid w:val="4AE624C2"/>
     <w:multiLevelType w:val="singleLevel"/>
     <w:tmpl w:val="04160001"/>
     <w:lvl w:ilvl="0">
@@ -23912,7 +23931,7 @@
     </w:lvl>
   </w:abstractNum>
   <w:abstractNum w:abstractNumId="22" w15:restartNumberingAfterBreak="0">
-    <w:nsid w:val="54551A0C"/>
+    <w:nsid w:val="4F8148A2"/>
     <w:multiLevelType w:val="singleLevel"/>
     <w:tmpl w:val="04160001"/>
     <w:lvl w:ilvl="0">
@@ -23929,7 +23948,7 @@
     </w:lvl>
   </w:abstractNum>
   <w:abstractNum w:abstractNumId="23" w15:restartNumberingAfterBreak="0">
-    <w:nsid w:val="5A8577A9"/>
+    <w:nsid w:val="5F9066B4"/>
     <w:multiLevelType w:val="singleLevel"/>
     <w:tmpl w:val="04160001"/>
     <w:lvl w:ilvl="0">
@@ -23946,7 +23965,7 @@
     </w:lvl>
   </w:abstractNum>
   <w:abstractNum w:abstractNumId="24" w15:restartNumberingAfterBreak="0">
-    <w:nsid w:val="61AB28B2"/>
+    <w:nsid w:val="5FCC6E8A"/>
     <w:multiLevelType w:val="singleLevel"/>
     <w:tmpl w:val="04160001"/>
     <w:lvl w:ilvl="0">
@@ -23963,7 +23982,7 @@
     </w:lvl>
   </w:abstractNum>
   <w:abstractNum w:abstractNumId="25" w15:restartNumberingAfterBreak="0">
-    <w:nsid w:val="662C7BA1"/>
+    <w:nsid w:val="5FFF723C"/>
     <w:multiLevelType w:val="singleLevel"/>
     <w:tmpl w:val="04160001"/>
     <w:lvl w:ilvl="0">
@@ -23980,7 +23999,7 @@
     </w:lvl>
   </w:abstractNum>
   <w:abstractNum w:abstractNumId="26" w15:restartNumberingAfterBreak="0">
-    <w:nsid w:val="6A1F6DDC"/>
+    <w:nsid w:val="68136ECF"/>
     <w:multiLevelType w:val="singleLevel"/>
     <w:tmpl w:val="04160001"/>
     <w:lvl w:ilvl="0">
@@ -23997,7 +24016,7 @@
     </w:lvl>
   </w:abstractNum>
   <w:abstractNum w:abstractNumId="27" w15:restartNumberingAfterBreak="0">
-    <w:nsid w:val="71D66DA1"/>
+    <w:nsid w:val="681717E0"/>
     <w:multiLevelType w:val="singleLevel"/>
     <w:tmpl w:val="04160001"/>
     <w:lvl w:ilvl="0">
@@ -24014,7 +24033,7 @@
     </w:lvl>
   </w:abstractNum>
   <w:abstractNum w:abstractNumId="28" w15:restartNumberingAfterBreak="0">
-    <w:nsid w:val="728F25A6"/>
+    <w:nsid w:val="6B70799E"/>
     <w:multiLevelType w:val="singleLevel"/>
     <w:tmpl w:val="04160001"/>
     <w:lvl w:ilvl="0">
@@ -24031,7 +24050,7 @@
     </w:lvl>
   </w:abstractNum>
   <w:abstractNum w:abstractNumId="29" w15:restartNumberingAfterBreak="0">
-    <w:nsid w:val="74B10A13"/>
+    <w:nsid w:val="6C4E465B"/>
     <w:multiLevelType w:val="singleLevel"/>
     <w:tmpl w:val="04160001"/>
     <w:lvl w:ilvl="0">
@@ -24048,7 +24067,7 @@
     </w:lvl>
   </w:abstractNum>
   <w:abstractNum w:abstractNumId="30" w15:restartNumberingAfterBreak="0">
-    <w:nsid w:val="769C1494"/>
+    <w:nsid w:val="733337D7"/>
     <w:multiLevelType w:val="singleLevel"/>
     <w:tmpl w:val="04160001"/>
     <w:lvl w:ilvl="0">
@@ -24065,7 +24084,7 @@
     </w:lvl>
   </w:abstractNum>
   <w:abstractNum w:abstractNumId="31" w15:restartNumberingAfterBreak="0">
-    <w:nsid w:val="77024EF7"/>
+    <w:nsid w:val="77CF0F2A"/>
     <w:multiLevelType w:val="singleLevel"/>
     <w:tmpl w:val="04160001"/>
     <w:lvl w:ilvl="0">
@@ -24082,7 +24101,7 @@
     </w:lvl>
   </w:abstractNum>
   <w:abstractNum w:abstractNumId="32" w15:restartNumberingAfterBreak="0">
-    <w:nsid w:val="7F0D79AA"/>
+    <w:nsid w:val="77E729B9"/>
     <w:multiLevelType w:val="singleLevel"/>
     <w:tmpl w:val="04160001"/>
     <w:lvl w:ilvl="0">
@@ -24098,104 +24117,104 @@
       </w:rPr>
     </w:lvl>
   </w:abstractNum>
-  <w:num w:numId="1" w16cid:durableId="1559631420">
+  <w:num w:numId="1" w16cid:durableId="1099981576">
+    <w:abstractNumId w:val="29"/>
+  </w:num>
+  <w:num w:numId="2" w16cid:durableId="928270619">
+    <w:abstractNumId w:val="25"/>
+  </w:num>
+  <w:num w:numId="3" w16cid:durableId="231543458">
+    <w:abstractNumId w:val="2"/>
+  </w:num>
+  <w:num w:numId="4" w16cid:durableId="1269510937">
+    <w:abstractNumId w:val="1"/>
+  </w:num>
+  <w:num w:numId="5" w16cid:durableId="1419983274">
+    <w:abstractNumId w:val="27"/>
+  </w:num>
+  <w:num w:numId="6" w16cid:durableId="77871286">
+    <w:abstractNumId w:val="26"/>
+  </w:num>
+  <w:num w:numId="7" w16cid:durableId="1249802842">
+    <w:abstractNumId w:val="12"/>
+  </w:num>
+  <w:num w:numId="8" w16cid:durableId="97872315">
+    <w:abstractNumId w:val="4"/>
+  </w:num>
+  <w:num w:numId="9" w16cid:durableId="634724899">
+    <w:abstractNumId w:val="18"/>
+  </w:num>
+  <w:num w:numId="10" w16cid:durableId="1586458435">
     <w:abstractNumId w:val="11"/>
   </w:num>
-  <w:num w:numId="2" w16cid:durableId="706678550">
+  <w:num w:numId="11" w16cid:durableId="1533684858">
+    <w:abstractNumId w:val="32"/>
+  </w:num>
+  <w:num w:numId="12" w16cid:durableId="544409961">
+    <w:abstractNumId w:val="15"/>
+  </w:num>
+  <w:num w:numId="13" w16cid:durableId="585457560">
+    <w:abstractNumId w:val="3"/>
+  </w:num>
+  <w:num w:numId="14" w16cid:durableId="2005936318">
+    <w:abstractNumId w:val="17"/>
+  </w:num>
+  <w:num w:numId="15" w16cid:durableId="3867077">
+    <w:abstractNumId w:val="0"/>
+  </w:num>
+  <w:num w:numId="16" w16cid:durableId="473176721">
+    <w:abstractNumId w:val="30"/>
+  </w:num>
+  <w:num w:numId="17" w16cid:durableId="2014137532">
+    <w:abstractNumId w:val="9"/>
+  </w:num>
+  <w:num w:numId="18" w16cid:durableId="966086922">
+    <w:abstractNumId w:val="13"/>
+  </w:num>
+  <w:num w:numId="19" w16cid:durableId="1741637486">
+    <w:abstractNumId w:val="7"/>
+  </w:num>
+  <w:num w:numId="20" w16cid:durableId="122165104">
+    <w:abstractNumId w:val="28"/>
+  </w:num>
+  <w:num w:numId="21" w16cid:durableId="605843531">
+    <w:abstractNumId w:val="14"/>
+  </w:num>
+  <w:num w:numId="22" w16cid:durableId="918056435">
+    <w:abstractNumId w:val="21"/>
+  </w:num>
+  <w:num w:numId="23" w16cid:durableId="130295740">
+    <w:abstractNumId w:val="5"/>
+  </w:num>
+  <w:num w:numId="24" w16cid:durableId="514808311">
+    <w:abstractNumId w:val="8"/>
+  </w:num>
+  <w:num w:numId="25" w16cid:durableId="1307199030">
+    <w:abstractNumId w:val="22"/>
+  </w:num>
+  <w:num w:numId="26" w16cid:durableId="244267971">
+    <w:abstractNumId w:val="31"/>
+  </w:num>
+  <w:num w:numId="27" w16cid:durableId="1617982120">
     <w:abstractNumId w:val="24"/>
   </w:num>
-  <w:num w:numId="3" w16cid:durableId="2319725">
+  <w:num w:numId="28" w16cid:durableId="896818771">
+    <w:abstractNumId w:val="23"/>
+  </w:num>
+  <w:num w:numId="29" w16cid:durableId="771973246">
+    <w:abstractNumId w:val="6"/>
+  </w:num>
+  <w:num w:numId="30" w16cid:durableId="598417370">
+    <w:abstractNumId w:val="10"/>
+  </w:num>
+  <w:num w:numId="31" w16cid:durableId="49693548">
+    <w:abstractNumId w:val="16"/>
+  </w:num>
+  <w:num w:numId="32" w16cid:durableId="282347336">
     <w:abstractNumId w:val="20"/>
   </w:num>
-  <w:num w:numId="4" w16cid:durableId="20398541">
-    <w:abstractNumId w:val="9"/>
-  </w:num>
-  <w:num w:numId="5" w16cid:durableId="1502819912">
-    <w:abstractNumId w:val="12"/>
-  </w:num>
-  <w:num w:numId="6" w16cid:durableId="192690616">
-    <w:abstractNumId w:val="5"/>
-  </w:num>
-  <w:num w:numId="7" w16cid:durableId="971053456">
-    <w:abstractNumId w:val="26"/>
-  </w:num>
-  <w:num w:numId="8" w16cid:durableId="1786390570">
-    <w:abstractNumId w:val="2"/>
-  </w:num>
-  <w:num w:numId="9" w16cid:durableId="1310094715">
-    <w:abstractNumId w:val="16"/>
-  </w:num>
-  <w:num w:numId="10" w16cid:durableId="540289286">
-    <w:abstractNumId w:val="0"/>
-  </w:num>
-  <w:num w:numId="11" w16cid:durableId="732124726">
-    <w:abstractNumId w:val="1"/>
-  </w:num>
-  <w:num w:numId="12" w16cid:durableId="1246957771">
-    <w:abstractNumId w:val="28"/>
-  </w:num>
-  <w:num w:numId="13" w16cid:durableId="526065510">
+  <w:num w:numId="33" w16cid:durableId="186599310">
     <w:abstractNumId w:val="19"/>
-  </w:num>
-  <w:num w:numId="14" w16cid:durableId="2108964369">
-    <w:abstractNumId w:val="14"/>
-  </w:num>
-  <w:num w:numId="15" w16cid:durableId="1167405948">
-    <w:abstractNumId w:val="18"/>
-  </w:num>
-  <w:num w:numId="16" w16cid:durableId="1422019659">
-    <w:abstractNumId w:val="10"/>
-  </w:num>
-  <w:num w:numId="17" w16cid:durableId="374231210">
-    <w:abstractNumId w:val="17"/>
-  </w:num>
-  <w:num w:numId="18" w16cid:durableId="1484590873">
-    <w:abstractNumId w:val="22"/>
-  </w:num>
-  <w:num w:numId="19" w16cid:durableId="310446907">
-    <w:abstractNumId w:val="31"/>
-  </w:num>
-  <w:num w:numId="20" w16cid:durableId="1070269279">
-    <w:abstractNumId w:val="30"/>
-  </w:num>
-  <w:num w:numId="21" w16cid:durableId="537744543">
-    <w:abstractNumId w:val="3"/>
-  </w:num>
-  <w:num w:numId="22" w16cid:durableId="2010330266">
-    <w:abstractNumId w:val="8"/>
-  </w:num>
-  <w:num w:numId="23" w16cid:durableId="1718624997">
-    <w:abstractNumId w:val="27"/>
-  </w:num>
-  <w:num w:numId="24" w16cid:durableId="1552692902">
-    <w:abstractNumId w:val="13"/>
-  </w:num>
-  <w:num w:numId="25" w16cid:durableId="1601841371">
-    <w:abstractNumId w:val="7"/>
-  </w:num>
-  <w:num w:numId="26" w16cid:durableId="1542014915">
-    <w:abstractNumId w:val="15"/>
-  </w:num>
-  <w:num w:numId="27" w16cid:durableId="211036958">
-    <w:abstractNumId w:val="23"/>
-  </w:num>
-  <w:num w:numId="28" w16cid:durableId="2128354859">
-    <w:abstractNumId w:val="32"/>
-  </w:num>
-  <w:num w:numId="29" w16cid:durableId="402340272">
-    <w:abstractNumId w:val="21"/>
-  </w:num>
-  <w:num w:numId="30" w16cid:durableId="42216567">
-    <w:abstractNumId w:val="4"/>
-  </w:num>
-  <w:num w:numId="31" w16cid:durableId="816915448">
-    <w:abstractNumId w:val="6"/>
-  </w:num>
-  <w:num w:numId="32" w16cid:durableId="467555936">
-    <w:abstractNumId w:val="25"/>
-  </w:num>
-  <w:num w:numId="33" w16cid:durableId="534008096">
-    <w:abstractNumId w:val="29"/>
   </w:num>
 </w:numbering>
 </file>
@@ -24608,7 +24627,7 @@
     <w:link w:val="Ttulo1Char"/>
     <w:uiPriority w:val="9"/>
     <w:qFormat/>
-    <w:rsid w:val="005A7C0F"/>
+    <w:rsid w:val="0047292B"/>
     <w:pPr>
       <w:keepNext/>
       <w:keepLines/>
@@ -24630,7 +24649,7 @@
     <w:uiPriority w:val="9"/>
     <w:unhideWhenUsed/>
     <w:qFormat/>
-    <w:rsid w:val="005A7C0F"/>
+    <w:rsid w:val="0047292B"/>
     <w:pPr>
       <w:keepNext/>
       <w:keepLines/>
@@ -24653,7 +24672,7 @@
     <w:semiHidden/>
     <w:unhideWhenUsed/>
     <w:qFormat/>
-    <w:rsid w:val="005A7C0F"/>
+    <w:rsid w:val="0047292B"/>
     <w:pPr>
       <w:keepNext/>
       <w:keepLines/>
@@ -24676,7 +24695,7 @@
     <w:semiHidden/>
     <w:unhideWhenUsed/>
     <w:qFormat/>
-    <w:rsid w:val="005A7C0F"/>
+    <w:rsid w:val="0047292B"/>
     <w:pPr>
       <w:keepNext/>
       <w:keepLines/>
@@ -24699,7 +24718,7 @@
     <w:semiHidden/>
     <w:unhideWhenUsed/>
     <w:qFormat/>
-    <w:rsid w:val="005A7C0F"/>
+    <w:rsid w:val="0047292B"/>
     <w:pPr>
       <w:keepNext/>
       <w:keepLines/>
@@ -24720,7 +24739,7 @@
     <w:semiHidden/>
     <w:unhideWhenUsed/>
     <w:qFormat/>
-    <w:rsid w:val="005A7C0F"/>
+    <w:rsid w:val="0047292B"/>
     <w:pPr>
       <w:keepNext/>
       <w:keepLines/>
@@ -24743,7 +24762,7 @@
     <w:semiHidden/>
     <w:unhideWhenUsed/>
     <w:qFormat/>
-    <w:rsid w:val="005A7C0F"/>
+    <w:rsid w:val="0047292B"/>
     <w:pPr>
       <w:keepNext/>
       <w:keepLines/>
@@ -24764,7 +24783,7 @@
     <w:semiHidden/>
     <w:unhideWhenUsed/>
     <w:qFormat/>
-    <w:rsid w:val="005A7C0F"/>
+    <w:rsid w:val="0047292B"/>
     <w:pPr>
       <w:keepNext/>
       <w:keepLines/>
@@ -24787,7 +24806,7 @@
     <w:semiHidden/>
     <w:unhideWhenUsed/>
     <w:qFormat/>
-    <w:rsid w:val="005A7C0F"/>
+    <w:rsid w:val="0047292B"/>
     <w:pPr>
       <w:keepNext/>
       <w:keepLines/>
@@ -24831,7 +24850,7 @@
     <w:basedOn w:val="Fontepargpadro"/>
     <w:link w:val="Ttulo1"/>
     <w:uiPriority w:val="9"/>
-    <w:rsid w:val="005A7C0F"/>
+    <w:rsid w:val="0047292B"/>
     <w:rPr>
       <w:rFonts w:asciiTheme="majorHAnsi" w:eastAsiaTheme="majorEastAsia" w:hAnsiTheme="majorHAnsi" w:cstheme="majorBidi"/>
       <w:color w:val="0F4761" w:themeColor="accent1" w:themeShade="BF"/>
@@ -24844,7 +24863,7 @@
     <w:basedOn w:val="Fontepargpadro"/>
     <w:link w:val="Ttulo2"/>
     <w:uiPriority w:val="9"/>
-    <w:rsid w:val="005A7C0F"/>
+    <w:rsid w:val="0047292B"/>
     <w:rPr>
       <w:rFonts w:asciiTheme="majorHAnsi" w:eastAsiaTheme="majorEastAsia" w:hAnsiTheme="majorHAnsi" w:cstheme="majorBidi"/>
       <w:color w:val="0F4761" w:themeColor="accent1" w:themeShade="BF"/>
@@ -24858,7 +24877,7 @@
     <w:link w:val="Ttulo3"/>
     <w:uiPriority w:val="9"/>
     <w:semiHidden/>
-    <w:rsid w:val="005A7C0F"/>
+    <w:rsid w:val="0047292B"/>
     <w:rPr>
       <w:rFonts w:eastAsiaTheme="majorEastAsia" w:cstheme="majorBidi"/>
       <w:color w:val="0F4761" w:themeColor="accent1" w:themeShade="BF"/>
@@ -24872,7 +24891,7 @@
     <w:link w:val="Ttulo4"/>
     <w:uiPriority w:val="9"/>
     <w:semiHidden/>
-    <w:rsid w:val="005A7C0F"/>
+    <w:rsid w:val="0047292B"/>
     <w:rPr>
       <w:rFonts w:eastAsiaTheme="majorEastAsia" w:cstheme="majorBidi"/>
       <w:i/>
@@ -24886,7 +24905,7 @@
     <w:link w:val="Ttulo5"/>
     <w:uiPriority w:val="9"/>
     <w:semiHidden/>
-    <w:rsid w:val="005A7C0F"/>
+    <w:rsid w:val="0047292B"/>
     <w:rPr>
       <w:rFonts w:eastAsiaTheme="majorEastAsia" w:cstheme="majorBidi"/>
       <w:color w:val="0F4761" w:themeColor="accent1" w:themeShade="BF"/>
@@ -24898,7 +24917,7 @@
     <w:link w:val="Ttulo6"/>
     <w:uiPriority w:val="9"/>
     <w:semiHidden/>
-    <w:rsid w:val="005A7C0F"/>
+    <w:rsid w:val="0047292B"/>
     <w:rPr>
       <w:rFonts w:eastAsiaTheme="majorEastAsia" w:cstheme="majorBidi"/>
       <w:i/>
@@ -24912,7 +24931,7 @@
     <w:link w:val="Ttulo7"/>
     <w:uiPriority w:val="9"/>
     <w:semiHidden/>
-    <w:rsid w:val="005A7C0F"/>
+    <w:rsid w:val="0047292B"/>
     <w:rPr>
       <w:rFonts w:eastAsiaTheme="majorEastAsia" w:cstheme="majorBidi"/>
       <w:color w:val="595959" w:themeColor="text1" w:themeTint="A6"/>
@@ -24924,7 +24943,7 @@
     <w:link w:val="Ttulo8"/>
     <w:uiPriority w:val="9"/>
     <w:semiHidden/>
-    <w:rsid w:val="005A7C0F"/>
+    <w:rsid w:val="0047292B"/>
     <w:rPr>
       <w:rFonts w:eastAsiaTheme="majorEastAsia" w:cstheme="majorBidi"/>
       <w:i/>
@@ -24938,7 +24957,7 @@
     <w:link w:val="Ttulo9"/>
     <w:uiPriority w:val="9"/>
     <w:semiHidden/>
-    <w:rsid w:val="005A7C0F"/>
+    <w:rsid w:val="0047292B"/>
     <w:rPr>
       <w:rFonts w:eastAsiaTheme="majorEastAsia" w:cstheme="majorBidi"/>
       <w:color w:val="272727" w:themeColor="text1" w:themeTint="D8"/>
@@ -24951,7 +24970,7 @@
     <w:link w:val="TtuloChar"/>
     <w:uiPriority w:val="10"/>
     <w:qFormat/>
-    <w:rsid w:val="005A7C0F"/>
+    <w:rsid w:val="0047292B"/>
     <w:pPr>
       <w:spacing w:after="80" w:line="240" w:lineRule="auto"/>
       <w:contextualSpacing/>
@@ -24969,7 +24988,7 @@
     <w:basedOn w:val="Fontepargpadro"/>
     <w:link w:val="Ttulo"/>
     <w:uiPriority w:val="10"/>
-    <w:rsid w:val="005A7C0F"/>
+    <w:rsid w:val="0047292B"/>
     <w:rPr>
       <w:rFonts w:asciiTheme="majorHAnsi" w:eastAsiaTheme="majorEastAsia" w:hAnsiTheme="majorHAnsi" w:cstheme="majorBidi"/>
       <w:spacing w:val="-10"/>
@@ -24985,7 +25004,7 @@
     <w:link w:val="SubttuloChar"/>
     <w:uiPriority w:val="11"/>
     <w:qFormat/>
-    <w:rsid w:val="005A7C0F"/>
+    <w:rsid w:val="0047292B"/>
     <w:pPr>
       <w:numPr>
         <w:ilvl w:val="1"/>
@@ -25004,7 +25023,7 @@
     <w:basedOn w:val="Fontepargpadro"/>
     <w:link w:val="Subttulo"/>
     <w:uiPriority w:val="11"/>
-    <w:rsid w:val="005A7C0F"/>
+    <w:rsid w:val="0047292B"/>
     <w:rPr>
       <w:rFonts w:eastAsiaTheme="majorEastAsia" w:cstheme="majorBidi"/>
       <w:color w:val="595959" w:themeColor="text1" w:themeTint="A6"/>
@@ -25020,7 +25039,7 @@
     <w:link w:val="CitaoChar"/>
     <w:uiPriority w:val="29"/>
     <w:qFormat/>
-    <w:rsid w:val="005A7C0F"/>
+    <w:rsid w:val="0047292B"/>
     <w:pPr>
       <w:spacing w:before="160"/>
       <w:jc w:val="center"/>
@@ -25036,7 +25055,7 @@
     <w:basedOn w:val="Fontepargpadro"/>
     <w:link w:val="Citao"/>
     <w:uiPriority w:val="29"/>
-    <w:rsid w:val="005A7C0F"/>
+    <w:rsid w:val="0047292B"/>
     <w:rPr>
       <w:i/>
       <w:iCs/>
@@ -25048,7 +25067,7 @@
     <w:basedOn w:val="Normal"/>
     <w:uiPriority w:val="34"/>
     <w:qFormat/>
-    <w:rsid w:val="005A7C0F"/>
+    <w:rsid w:val="0047292B"/>
     <w:pPr>
       <w:ind w:left="720"/>
       <w:contextualSpacing/>
@@ -25059,7 +25078,7 @@
     <w:basedOn w:val="Fontepargpadro"/>
     <w:uiPriority w:val="21"/>
     <w:qFormat/>
-    <w:rsid w:val="005A7C0F"/>
+    <w:rsid w:val="0047292B"/>
     <w:rPr>
       <w:i/>
       <w:iCs/>
@@ -25073,7 +25092,7 @@
     <w:link w:val="CitaoIntensaChar"/>
     <w:uiPriority w:val="30"/>
     <w:qFormat/>
-    <w:rsid w:val="005A7C0F"/>
+    <w:rsid w:val="0047292B"/>
     <w:pPr>
       <w:pBdr>
         <w:top w:val="single" w:sz="4" w:space="10" w:color="0F4761" w:themeColor="accent1" w:themeShade="BF"/>
@@ -25094,7 +25113,7 @@
     <w:basedOn w:val="Fontepargpadro"/>
     <w:link w:val="CitaoIntensa"/>
     <w:uiPriority w:val="30"/>
-    <w:rsid w:val="005A7C0F"/>
+    <w:rsid w:val="0047292B"/>
     <w:rPr>
       <w:i/>
       <w:iCs/>
@@ -25106,7 +25125,7 @@
     <w:basedOn w:val="Fontepargpadro"/>
     <w:uiPriority w:val="32"/>
     <w:qFormat/>
-    <w:rsid w:val="005A7C0F"/>
+    <w:rsid w:val="0047292B"/>
     <w:rPr>
       <w:b/>
       <w:bCs/>
@@ -25121,7 +25140,7 @@
     <w:link w:val="CabealhoChar"/>
     <w:uiPriority w:val="99"/>
     <w:unhideWhenUsed/>
-    <w:rsid w:val="005A7C0F"/>
+    <w:rsid w:val="0047292B"/>
     <w:pPr>
       <w:tabs>
         <w:tab w:val="center" w:pos="4252"/>
@@ -25135,7 +25154,7 @@
     <w:basedOn w:val="Fontepargpadro"/>
     <w:link w:val="Cabealho"/>
     <w:uiPriority w:val="99"/>
-    <w:rsid w:val="005A7C0F"/>
+    <w:rsid w:val="0047292B"/>
   </w:style>
   <w:style w:type="paragraph" w:styleId="Rodap">
     <w:name w:val="footer"/>
@@ -25143,7 +25162,7 @@
     <w:link w:val="RodapChar"/>
     <w:uiPriority w:val="99"/>
     <w:unhideWhenUsed/>
-    <w:rsid w:val="005A7C0F"/>
+    <w:rsid w:val="0047292B"/>
     <w:pPr>
       <w:tabs>
         <w:tab w:val="center" w:pos="4252"/>
@@ -25157,7 +25176,7 @@
     <w:basedOn w:val="Fontepargpadro"/>
     <w:link w:val="Rodap"/>
     <w:uiPriority w:val="99"/>
-    <w:rsid w:val="005A7C0F"/>
+    <w:rsid w:val="0047292B"/>
   </w:style>
   <w:style w:type="paragraph" w:styleId="Sumrio1">
     <w:name w:val="toc 1"/>
@@ -25166,7 +25185,7 @@
     <w:autoRedefine/>
     <w:uiPriority w:val="39"/>
     <w:unhideWhenUsed/>
-    <w:rsid w:val="005A7C0F"/>
+    <w:rsid w:val="0047292B"/>
     <w:pPr>
       <w:spacing w:after="100"/>
     </w:pPr>
@@ -25178,7 +25197,7 @@
     <w:autoRedefine/>
     <w:uiPriority w:val="39"/>
     <w:unhideWhenUsed/>
-    <w:rsid w:val="005A7C0F"/>
+    <w:rsid w:val="0047292B"/>
     <w:pPr>
       <w:spacing w:after="100"/>
       <w:ind w:left="240"/>

</xml_diff>

<commit_message>
Sincroniza com a produção — correção de layout nas tabelas de Verificação, Análise Crítica, Saídas e Validação
Co-Authored-By: Claude Sonnet 5 <noreply@anthropic.com>
</commit_message>
<xml_diff>
--- a/Manual de Uso - Ferramenta de Gestao de Projetos.docx
+++ b/Manual de Uso - Ferramenta de Gestao de Projetos.docx
@@ -229,7 +229,7 @@
         <w:rPr>
           <w:noProof/>
         </w:rPr>
-        <w:instrText xml:space="preserve"> PAGEREF _Toc240275425 \h </w:instrText>
+        <w:instrText xml:space="preserve"> PAGEREF _Toc240276707 \h </w:instrText>
       </w:r>
       <w:r>
         <w:rPr>
@@ -290,7 +290,7 @@
         <w:rPr>
           <w:noProof/>
         </w:rPr>
-        <w:instrText xml:space="preserve"> PAGEREF _Toc240275426 \h </w:instrText>
+        <w:instrText xml:space="preserve"> PAGEREF _Toc240276708 \h </w:instrText>
       </w:r>
       <w:r>
         <w:rPr>
@@ -351,7 +351,7 @@
         <w:rPr>
           <w:noProof/>
         </w:rPr>
-        <w:instrText xml:space="preserve"> PAGEREF _Toc240275427 \h </w:instrText>
+        <w:instrText xml:space="preserve"> PAGEREF _Toc240276709 \h </w:instrText>
       </w:r>
       <w:r>
         <w:rPr>
@@ -412,7 +412,7 @@
         <w:rPr>
           <w:noProof/>
         </w:rPr>
-        <w:instrText xml:space="preserve"> PAGEREF _Toc240275428 \h </w:instrText>
+        <w:instrText xml:space="preserve"> PAGEREF _Toc240276710 \h </w:instrText>
       </w:r>
       <w:r>
         <w:rPr>
@@ -473,7 +473,7 @@
         <w:rPr>
           <w:noProof/>
         </w:rPr>
-        <w:instrText xml:space="preserve"> PAGEREF _Toc240275429 \h </w:instrText>
+        <w:instrText xml:space="preserve"> PAGEREF _Toc240276711 \h </w:instrText>
       </w:r>
       <w:r>
         <w:rPr>
@@ -534,7 +534,7 @@
         <w:rPr>
           <w:noProof/>
         </w:rPr>
-        <w:instrText xml:space="preserve"> PAGEREF _Toc240275430 \h </w:instrText>
+        <w:instrText xml:space="preserve"> PAGEREF _Toc240276712 \h </w:instrText>
       </w:r>
       <w:r>
         <w:rPr>
@@ -595,7 +595,7 @@
         <w:rPr>
           <w:noProof/>
         </w:rPr>
-        <w:instrText xml:space="preserve"> PAGEREF _Toc240275431 \h </w:instrText>
+        <w:instrText xml:space="preserve"> PAGEREF _Toc240276713 \h </w:instrText>
       </w:r>
       <w:r>
         <w:rPr>
@@ -656,7 +656,7 @@
         <w:rPr>
           <w:noProof/>
         </w:rPr>
-        <w:instrText xml:space="preserve"> PAGEREF _Toc240275432 \h </w:instrText>
+        <w:instrText xml:space="preserve"> PAGEREF _Toc240276714 \h </w:instrText>
       </w:r>
       <w:r>
         <w:rPr>
@@ -717,7 +717,7 @@
         <w:rPr>
           <w:noProof/>
         </w:rPr>
-        <w:instrText xml:space="preserve"> PAGEREF _Toc240275433 \h </w:instrText>
+        <w:instrText xml:space="preserve"> PAGEREF _Toc240276715 \h </w:instrText>
       </w:r>
       <w:r>
         <w:rPr>
@@ -778,7 +778,7 @@
         <w:rPr>
           <w:noProof/>
         </w:rPr>
-        <w:instrText xml:space="preserve"> PAGEREF _Toc240275434 \h </w:instrText>
+        <w:instrText xml:space="preserve"> PAGEREF _Toc240276716 \h </w:instrText>
       </w:r>
       <w:r>
         <w:rPr>
@@ -839,7 +839,7 @@
         <w:rPr>
           <w:noProof/>
         </w:rPr>
-        <w:instrText xml:space="preserve"> PAGEREF _Toc240275435 \h </w:instrText>
+        <w:instrText xml:space="preserve"> PAGEREF _Toc240276717 \h </w:instrText>
       </w:r>
       <w:r>
         <w:rPr>
@@ -900,7 +900,7 @@
         <w:rPr>
           <w:noProof/>
         </w:rPr>
-        <w:instrText xml:space="preserve"> PAGEREF _Toc240275436 \h </w:instrText>
+        <w:instrText xml:space="preserve"> PAGEREF _Toc240276718 \h </w:instrText>
       </w:r>
       <w:r>
         <w:rPr>
@@ -961,7 +961,7 @@
         <w:rPr>
           <w:noProof/>
         </w:rPr>
-        <w:instrText xml:space="preserve"> PAGEREF _Toc240275437 \h </w:instrText>
+        <w:instrText xml:space="preserve"> PAGEREF _Toc240276719 \h </w:instrText>
       </w:r>
       <w:r>
         <w:rPr>
@@ -1022,7 +1022,7 @@
         <w:rPr>
           <w:noProof/>
         </w:rPr>
-        <w:instrText xml:space="preserve"> PAGEREF _Toc240275438 \h </w:instrText>
+        <w:instrText xml:space="preserve"> PAGEREF _Toc240276720 \h </w:instrText>
       </w:r>
       <w:r>
         <w:rPr>
@@ -1083,7 +1083,7 @@
         <w:rPr>
           <w:noProof/>
         </w:rPr>
-        <w:instrText xml:space="preserve"> PAGEREF _Toc240275439 \h </w:instrText>
+        <w:instrText xml:space="preserve"> PAGEREF _Toc240276721 \h </w:instrText>
       </w:r>
       <w:r>
         <w:rPr>
@@ -1144,7 +1144,7 @@
         <w:rPr>
           <w:noProof/>
         </w:rPr>
-        <w:instrText xml:space="preserve"> PAGEREF _Toc240275440 \h </w:instrText>
+        <w:instrText xml:space="preserve"> PAGEREF _Toc240276722 \h </w:instrText>
       </w:r>
       <w:r>
         <w:rPr>
@@ -1205,7 +1205,7 @@
         <w:rPr>
           <w:noProof/>
         </w:rPr>
-        <w:instrText xml:space="preserve"> PAGEREF _Toc240275441 \h </w:instrText>
+        <w:instrText xml:space="preserve"> PAGEREF _Toc240276723 \h </w:instrText>
       </w:r>
       <w:r>
         <w:rPr>
@@ -1266,7 +1266,7 @@
         <w:rPr>
           <w:noProof/>
         </w:rPr>
-        <w:instrText xml:space="preserve"> PAGEREF _Toc240275442 \h </w:instrText>
+        <w:instrText xml:space="preserve"> PAGEREF _Toc240276724 \h </w:instrText>
       </w:r>
       <w:r>
         <w:rPr>
@@ -1327,7 +1327,7 @@
         <w:rPr>
           <w:noProof/>
         </w:rPr>
-        <w:instrText xml:space="preserve"> PAGEREF _Toc240275443 \h </w:instrText>
+        <w:instrText xml:space="preserve"> PAGEREF _Toc240276725 \h </w:instrText>
       </w:r>
       <w:r>
         <w:rPr>
@@ -1388,7 +1388,7 @@
         <w:rPr>
           <w:noProof/>
         </w:rPr>
-        <w:instrText xml:space="preserve"> PAGEREF _Toc240275444 \h </w:instrText>
+        <w:instrText xml:space="preserve"> PAGEREF _Toc240276726 \h </w:instrText>
       </w:r>
       <w:r>
         <w:rPr>
@@ -1449,7 +1449,7 @@
         <w:rPr>
           <w:noProof/>
         </w:rPr>
-        <w:instrText xml:space="preserve"> PAGEREF _Toc240275445 \h </w:instrText>
+        <w:instrText xml:space="preserve"> PAGEREF _Toc240276727 \h </w:instrText>
       </w:r>
       <w:r>
         <w:rPr>
@@ -1510,7 +1510,7 @@
         <w:rPr>
           <w:noProof/>
         </w:rPr>
-        <w:instrText xml:space="preserve"> PAGEREF _Toc240275446 \h </w:instrText>
+        <w:instrText xml:space="preserve"> PAGEREF _Toc240276728 \h </w:instrText>
       </w:r>
       <w:r>
         <w:rPr>
@@ -1571,7 +1571,7 @@
         <w:rPr>
           <w:noProof/>
         </w:rPr>
-        <w:instrText xml:space="preserve"> PAGEREF _Toc240275447 \h </w:instrText>
+        <w:instrText xml:space="preserve"> PAGEREF _Toc240276729 \h </w:instrText>
       </w:r>
       <w:r>
         <w:rPr>
@@ -1632,7 +1632,7 @@
         <w:rPr>
           <w:noProof/>
         </w:rPr>
-        <w:instrText xml:space="preserve"> PAGEREF _Toc240275448 \h </w:instrText>
+        <w:instrText xml:space="preserve"> PAGEREF _Toc240276730 \h </w:instrText>
       </w:r>
       <w:r>
         <w:rPr>
@@ -1693,7 +1693,7 @@
         <w:rPr>
           <w:noProof/>
         </w:rPr>
-        <w:instrText xml:space="preserve"> PAGEREF _Toc240275449 \h </w:instrText>
+        <w:instrText xml:space="preserve"> PAGEREF _Toc240276731 \h </w:instrText>
       </w:r>
       <w:r>
         <w:rPr>
@@ -1755,7 +1755,7 @@
         <w:rPr>
           <w:noProof/>
         </w:rPr>
-        <w:instrText xml:space="preserve"> PAGEREF _Toc240275450 \h </w:instrText>
+        <w:instrText xml:space="preserve"> PAGEREF _Toc240276732 \h </w:instrText>
       </w:r>
       <w:r>
         <w:rPr>
@@ -1816,7 +1816,7 @@
         <w:rPr>
           <w:noProof/>
         </w:rPr>
-        <w:instrText xml:space="preserve"> PAGEREF _Toc240275451 \h </w:instrText>
+        <w:instrText xml:space="preserve"> PAGEREF _Toc240276733 \h </w:instrText>
       </w:r>
       <w:r>
         <w:rPr>
@@ -1877,7 +1877,7 @@
         <w:rPr>
           <w:noProof/>
         </w:rPr>
-        <w:instrText xml:space="preserve"> PAGEREF _Toc240275452 \h </w:instrText>
+        <w:instrText xml:space="preserve"> PAGEREF _Toc240276734 \h </w:instrText>
       </w:r>
       <w:r>
         <w:rPr>
@@ -1938,7 +1938,7 @@
         <w:rPr>
           <w:noProof/>
         </w:rPr>
-        <w:instrText xml:space="preserve"> PAGEREF _Toc240275453 \h </w:instrText>
+        <w:instrText xml:space="preserve"> PAGEREF _Toc240276735 \h </w:instrText>
       </w:r>
       <w:r>
         <w:rPr>
@@ -1999,7 +1999,7 @@
         <w:rPr>
           <w:noProof/>
         </w:rPr>
-        <w:instrText xml:space="preserve"> PAGEREF _Toc240275454 \h </w:instrText>
+        <w:instrText xml:space="preserve"> PAGEREF _Toc240276736 \h </w:instrText>
       </w:r>
       <w:r>
         <w:rPr>
@@ -2060,7 +2060,7 @@
         <w:rPr>
           <w:noProof/>
         </w:rPr>
-        <w:instrText xml:space="preserve"> PAGEREF _Toc240275455 \h </w:instrText>
+        <w:instrText xml:space="preserve"> PAGEREF _Toc240276737 \h </w:instrText>
       </w:r>
       <w:r>
         <w:rPr>
@@ -2121,7 +2121,7 @@
         <w:rPr>
           <w:noProof/>
         </w:rPr>
-        <w:instrText xml:space="preserve"> PAGEREF _Toc240275456 \h </w:instrText>
+        <w:instrText xml:space="preserve"> PAGEREF _Toc240276738 \h </w:instrText>
       </w:r>
       <w:r>
         <w:rPr>
@@ -2182,7 +2182,7 @@
         <w:rPr>
           <w:noProof/>
         </w:rPr>
-        <w:instrText xml:space="preserve"> PAGEREF _Toc240275457 \h </w:instrText>
+        <w:instrText xml:space="preserve"> PAGEREF _Toc240276739 \h </w:instrText>
       </w:r>
       <w:r>
         <w:rPr>
@@ -2243,7 +2243,7 @@
         <w:rPr>
           <w:noProof/>
         </w:rPr>
-        <w:instrText xml:space="preserve"> PAGEREF _Toc240275458 \h </w:instrText>
+        <w:instrText xml:space="preserve"> PAGEREF _Toc240276740 \h </w:instrText>
       </w:r>
       <w:r>
         <w:rPr>
@@ -2304,7 +2304,7 @@
         <w:rPr>
           <w:noProof/>
         </w:rPr>
-        <w:instrText xml:space="preserve"> PAGEREF _Toc240275459 \h </w:instrText>
+        <w:instrText xml:space="preserve"> PAGEREF _Toc240276741 \h </w:instrText>
       </w:r>
       <w:r>
         <w:rPr>
@@ -2365,7 +2365,7 @@
         <w:rPr>
           <w:noProof/>
         </w:rPr>
-        <w:instrText xml:space="preserve"> PAGEREF _Toc240275460 \h </w:instrText>
+        <w:instrText xml:space="preserve"> PAGEREF _Toc240276742 \h </w:instrText>
       </w:r>
       <w:r>
         <w:rPr>
@@ -2426,7 +2426,7 @@
         <w:rPr>
           <w:noProof/>
         </w:rPr>
-        <w:instrText xml:space="preserve"> PAGEREF _Toc240275461 \h </w:instrText>
+        <w:instrText xml:space="preserve"> PAGEREF _Toc240276743 \h </w:instrText>
       </w:r>
       <w:r>
         <w:rPr>
@@ -2487,7 +2487,7 @@
         <w:rPr>
           <w:noProof/>
         </w:rPr>
-        <w:instrText xml:space="preserve"> PAGEREF _Toc240275462 \h </w:instrText>
+        <w:instrText xml:space="preserve"> PAGEREF _Toc240276744 \h </w:instrText>
       </w:r>
       <w:r>
         <w:rPr>
@@ -2548,7 +2548,7 @@
         <w:rPr>
           <w:noProof/>
         </w:rPr>
-        <w:instrText xml:space="preserve"> PAGEREF _Toc240275463 \h </w:instrText>
+        <w:instrText xml:space="preserve"> PAGEREF _Toc240276745 \h </w:instrText>
       </w:r>
       <w:r>
         <w:rPr>
@@ -2609,7 +2609,7 @@
         <w:rPr>
           <w:noProof/>
         </w:rPr>
-        <w:instrText xml:space="preserve"> PAGEREF _Toc240275464 \h </w:instrText>
+        <w:instrText xml:space="preserve"> PAGEREF _Toc240276746 \h </w:instrText>
       </w:r>
       <w:r>
         <w:rPr>
@@ -2670,7 +2670,7 @@
         <w:rPr>
           <w:noProof/>
         </w:rPr>
-        <w:instrText xml:space="preserve"> PAGEREF _Toc240275465 \h </w:instrText>
+        <w:instrText xml:space="preserve"> PAGEREF _Toc240276747 \h </w:instrText>
       </w:r>
       <w:r>
         <w:rPr>
@@ -2731,7 +2731,7 @@
         <w:rPr>
           <w:noProof/>
         </w:rPr>
-        <w:instrText xml:space="preserve"> PAGEREF _Toc240275466 \h </w:instrText>
+        <w:instrText xml:space="preserve"> PAGEREF _Toc240276748 \h </w:instrText>
       </w:r>
       <w:r>
         <w:rPr>
@@ -2792,7 +2792,7 @@
         <w:rPr>
           <w:noProof/>
         </w:rPr>
-        <w:instrText xml:space="preserve"> PAGEREF _Toc240275467 \h </w:instrText>
+        <w:instrText xml:space="preserve"> PAGEREF _Toc240276749 \h </w:instrText>
       </w:r>
       <w:r>
         <w:rPr>
@@ -2853,7 +2853,7 @@
         <w:rPr>
           <w:noProof/>
         </w:rPr>
-        <w:instrText xml:space="preserve"> PAGEREF _Toc240275468 \h </w:instrText>
+        <w:instrText xml:space="preserve"> PAGEREF _Toc240276750 \h </w:instrText>
       </w:r>
       <w:r>
         <w:rPr>
@@ -2914,7 +2914,7 @@
         <w:rPr>
           <w:noProof/>
         </w:rPr>
-        <w:instrText xml:space="preserve"> PAGEREF _Toc240275469 \h </w:instrText>
+        <w:instrText xml:space="preserve"> PAGEREF _Toc240276751 \h </w:instrText>
       </w:r>
       <w:r>
         <w:rPr>
@@ -2975,7 +2975,7 @@
         <w:rPr>
           <w:noProof/>
         </w:rPr>
-        <w:instrText xml:space="preserve"> PAGEREF _Toc240275470 \h </w:instrText>
+        <w:instrText xml:space="preserve"> PAGEREF _Toc240276752 \h </w:instrText>
       </w:r>
       <w:r>
         <w:rPr>
@@ -3036,7 +3036,7 @@
         <w:rPr>
           <w:noProof/>
         </w:rPr>
-        <w:instrText xml:space="preserve"> PAGEREF _Toc240275471 \h </w:instrText>
+        <w:instrText xml:space="preserve"> PAGEREF _Toc240276753 \h </w:instrText>
       </w:r>
       <w:r>
         <w:rPr>
@@ -3097,7 +3097,7 @@
         <w:rPr>
           <w:noProof/>
         </w:rPr>
-        <w:instrText xml:space="preserve"> PAGEREF _Toc240275472 \h </w:instrText>
+        <w:instrText xml:space="preserve"> PAGEREF _Toc240276754 \h </w:instrText>
       </w:r>
       <w:r>
         <w:rPr>
@@ -3173,7 +3173,7 @@
           <w:sz w:val="34"/>
         </w:rPr>
       </w:pPr>
-      <w:bookmarkStart w:id="0" w:name="_Toc240275425"/>
+      <w:bookmarkStart w:id="0" w:name="_Toc240276707"/>
       <w:r>
         <w:rPr>
           <w:rFonts w:ascii="Montserrat" w:hAnsi="Montserrat"/>
@@ -3197,7 +3197,7 @@
           <w:sz w:val="27"/>
         </w:rPr>
       </w:pPr>
-      <w:bookmarkStart w:id="1" w:name="_Toc240275426"/>
+      <w:bookmarkStart w:id="1" w:name="_Toc240276708"/>
       <w:r>
         <w:rPr>
           <w:rFonts w:ascii="Montserrat" w:hAnsi="Montserrat"/>
@@ -4593,6 +4593,33 @@
           <w:color w:val="1A1A1A"/>
           <w:sz w:val="22"/>
         </w:rPr>
+        <w:t xml:space="preserve">Esta e a versao 2.69 do manual. Em relacao a versao 2.68 (14/09/2026), o mesmo ajuste de layout foi estendido as tabelas de Verificacao e Analise Critica do Planejamento (Passo 4, abas 6 e 8), que tinham o mesmo problema: a largura minima de ambas aumentou e suas colunas de texto mais longas ganharam </w:t>
+      </w:r>
+      <w:r>
+        <w:rPr>
+          <w:rFonts w:ascii="Montserrat" w:hAnsi="Montserrat"/>
+          <w:color w:val="1A1A1A"/>
+          <w:sz w:val="22"/>
+        </w:rPr>
+        <w:lastRenderedPageBreak/>
+        <w:t>mais espaco relativo. As tabelas de Saidas e Validacao (abas 5 e 7) tambem receberam um ajuste menor, dando largura propria as colunas de selecao (Status/Resultado/Aprovacao), que antes ficavam mais estreitas que o restante sem necessidade. Sem mudanca de comportamento - apenas ajuste de layout.</w:t>
+      </w:r>
+    </w:p>
+    <w:p>
+      <w:pPr>
+        <w:spacing w:line="280" w:lineRule="auto"/>
+        <w:rPr>
+          <w:rFonts w:ascii="Montserrat" w:hAnsi="Montserrat"/>
+          <w:color w:val="1A1A1A"/>
+          <w:sz w:val="22"/>
+        </w:rPr>
+      </w:pPr>
+      <w:r>
+        <w:rPr>
+          <w:rFonts w:ascii="Montserrat" w:hAnsi="Montserrat"/>
+          <w:color w:val="1A1A1A"/>
+          <w:sz w:val="22"/>
+        </w:rPr>
         <w:t>O manual nao substitui as Diretrizes para a Gestao de Projetos da UNIALFA (documento institucional que define o framework D01 a D07) nem o documento Regras de Acesso e Permissoes (que detalha cada regra de controle de acesso); ele e o guia operacional de como usar cada ferramenta na pratica.</w:t>
       </w:r>
     </w:p>
@@ -4607,7 +4634,7 @@
           <w:sz w:val="27"/>
         </w:rPr>
       </w:pPr>
-      <w:bookmarkStart w:id="2" w:name="_Toc240275427"/>
+      <w:bookmarkStart w:id="2" w:name="_Toc240276709"/>
       <w:r>
         <w:rPr>
           <w:rFonts w:ascii="Montserrat" w:hAnsi="Montserrat"/>
@@ -4615,7 +4642,6 @@
           <w:color w:val="B91D2E"/>
           <w:sz w:val="27"/>
         </w:rPr>
-        <w:lastRenderedPageBreak/>
         <w:t>1.2 Visao geral da ferramenta</w:t>
       </w:r>
       <w:bookmarkEnd w:id="2"/>
@@ -4805,16 +4831,16 @@
         </w:rPr>
         <w:lastRenderedPageBreak/>
         <w:drawing>
-          <wp:inline distT="0" distB="0" distL="0" distR="0" wp14:anchorId="1DC219B3" wp14:editId="45ED97BC">
+          <wp:inline distT="0" distB="0" distL="0" distR="0" wp14:anchorId="1664D1F7" wp14:editId="72734BC2">
             <wp:extent cx="5303520" cy="4792851"/>
             <wp:effectExtent l="19050" t="19050" r="11430" b="27305"/>
-            <wp:docPr id="2055485955" name="Imagem 1"/>
+            <wp:docPr id="2021969999" name="Imagem 1"/>
             <wp:cNvGraphicFramePr/>
             <a:graphic xmlns:a="http://schemas.openxmlformats.org/drawingml/2006/main">
               <a:graphicData uri="http://schemas.openxmlformats.org/drawingml/2006/picture">
                 <pic:pic xmlns:pic="http://schemas.openxmlformats.org/drawingml/2006/picture">
                   <pic:nvPicPr>
-                    <pic:cNvPr id="2055485955" name=""/>
+                    <pic:cNvPr id="2021969999" name=""/>
                     <pic:cNvPicPr/>
                   </pic:nvPicPr>
                   <pic:blipFill>
@@ -4882,7 +4908,7 @@
           <w:sz w:val="27"/>
         </w:rPr>
       </w:pPr>
-      <w:bookmarkStart w:id="3" w:name="_Toc240275428"/>
+      <w:bookmarkStart w:id="3" w:name="_Toc240276710"/>
       <w:r>
         <w:rPr>
           <w:rFonts w:ascii="Montserrat" w:hAnsi="Montserrat"/>
@@ -4923,16 +4949,16 @@
         </w:rPr>
         <w:lastRenderedPageBreak/>
         <w:drawing>
-          <wp:inline distT="0" distB="0" distL="0" distR="0" wp14:anchorId="314100B1" wp14:editId="059D44A6">
+          <wp:inline distT="0" distB="0" distL="0" distR="0" wp14:anchorId="20F18972" wp14:editId="0DA782D0">
             <wp:extent cx="4206240" cy="3801227"/>
             <wp:effectExtent l="19050" t="19050" r="22860" b="27940"/>
-            <wp:docPr id="1916909051" name="Imagem 2"/>
+            <wp:docPr id="703103711" name="Imagem 2"/>
             <wp:cNvGraphicFramePr/>
             <a:graphic xmlns:a="http://schemas.openxmlformats.org/drawingml/2006/main">
               <a:graphicData uri="http://schemas.openxmlformats.org/drawingml/2006/picture">
                 <pic:pic xmlns:pic="http://schemas.openxmlformats.org/drawingml/2006/picture">
                   <pic:nvPicPr>
-                    <pic:cNvPr id="1916909051" name=""/>
+                    <pic:cNvPr id="703103711" name=""/>
                     <pic:cNvPicPr/>
                   </pic:nvPicPr>
                   <pic:blipFill>
@@ -5105,7 +5131,7 @@
           <w:sz w:val="27"/>
         </w:rPr>
       </w:pPr>
-      <w:bookmarkStart w:id="4" w:name="_Toc240275429"/>
+      <w:bookmarkStart w:id="4" w:name="_Toc240276711"/>
       <w:r>
         <w:rPr>
           <w:rFonts w:ascii="Montserrat" w:hAnsi="Montserrat"/>
@@ -6344,7 +6370,7 @@
           <w:sz w:val="34"/>
         </w:rPr>
       </w:pPr>
-      <w:bookmarkStart w:id="5" w:name="_Toc240275430"/>
+      <w:bookmarkStart w:id="5" w:name="_Toc240276712"/>
       <w:r>
         <w:rPr>
           <w:rFonts w:ascii="Montserrat" w:hAnsi="Montserrat"/>
@@ -6368,7 +6394,7 @@
           <w:sz w:val="27"/>
         </w:rPr>
       </w:pPr>
-      <w:bookmarkStart w:id="6" w:name="_Toc240275431"/>
+      <w:bookmarkStart w:id="6" w:name="_Toc240276713"/>
       <w:r>
         <w:rPr>
           <w:rFonts w:ascii="Montserrat" w:hAnsi="Montserrat"/>
@@ -6409,7 +6435,7 @@
           <w:sz w:val="27"/>
         </w:rPr>
       </w:pPr>
-      <w:bookmarkStart w:id="7" w:name="_Toc240275432"/>
+      <w:bookmarkStart w:id="7" w:name="_Toc240276714"/>
       <w:r>
         <w:rPr>
           <w:rFonts w:ascii="Montserrat" w:hAnsi="Montserrat"/>
@@ -6528,7 +6554,7 @@
           <w:sz w:val="27"/>
         </w:rPr>
       </w:pPr>
-      <w:bookmarkStart w:id="8" w:name="_Toc240275433"/>
+      <w:bookmarkStart w:id="8" w:name="_Toc240276715"/>
       <w:r>
         <w:rPr>
           <w:rFonts w:ascii="Montserrat" w:hAnsi="Montserrat"/>
@@ -7141,7 +7167,7 @@
           <w:sz w:val="27"/>
         </w:rPr>
       </w:pPr>
-      <w:bookmarkStart w:id="9" w:name="_Toc240275434"/>
+      <w:bookmarkStart w:id="9" w:name="_Toc240276716"/>
       <w:r>
         <w:rPr>
           <w:rFonts w:ascii="Montserrat" w:hAnsi="Montserrat"/>
@@ -7230,16 +7256,16 @@
         </w:rPr>
         <w:lastRenderedPageBreak/>
         <w:drawing>
-          <wp:inline distT="0" distB="0" distL="0" distR="0" wp14:anchorId="5088DAD2" wp14:editId="24FFF1BC">
+          <wp:inline distT="0" distB="0" distL="0" distR="0" wp14:anchorId="44E0BE5C" wp14:editId="104B8D4F">
             <wp:extent cx="4937760" cy="4462310"/>
             <wp:effectExtent l="19050" t="19050" r="15240" b="14605"/>
-            <wp:docPr id="985358177" name="Imagem 3"/>
+            <wp:docPr id="761251167" name="Imagem 3"/>
             <wp:cNvGraphicFramePr/>
             <a:graphic xmlns:a="http://schemas.openxmlformats.org/drawingml/2006/main">
               <a:graphicData uri="http://schemas.openxmlformats.org/drawingml/2006/picture">
                 <pic:pic xmlns:pic="http://schemas.openxmlformats.org/drawingml/2006/picture">
                   <pic:nvPicPr>
-                    <pic:cNvPr id="985358177" name=""/>
+                    <pic:cNvPr id="761251167" name=""/>
                     <pic:cNvPicPr/>
                   </pic:nvPicPr>
                   <pic:blipFill>
@@ -7307,7 +7333,7 @@
           <w:sz w:val="27"/>
         </w:rPr>
       </w:pPr>
-      <w:bookmarkStart w:id="10" w:name="_Toc240275435"/>
+      <w:bookmarkStart w:id="10" w:name="_Toc240276717"/>
       <w:r>
         <w:rPr>
           <w:rFonts w:ascii="Montserrat" w:hAnsi="Montserrat"/>
@@ -7348,16 +7374,16 @@
         </w:rPr>
         <w:lastRenderedPageBreak/>
         <w:drawing>
-          <wp:inline distT="0" distB="0" distL="0" distR="0" wp14:anchorId="6D80DF07" wp14:editId="2AEFEC4A">
+          <wp:inline distT="0" distB="0" distL="0" distR="0" wp14:anchorId="583589D2" wp14:editId="1B6BACFC">
             <wp:extent cx="5120640" cy="4627581"/>
             <wp:effectExtent l="19050" t="19050" r="22860" b="20955"/>
-            <wp:docPr id="210257309" name="Imagem 4"/>
+            <wp:docPr id="975756007" name="Imagem 4"/>
             <wp:cNvGraphicFramePr/>
             <a:graphic xmlns:a="http://schemas.openxmlformats.org/drawingml/2006/main">
               <a:graphicData uri="http://schemas.openxmlformats.org/drawingml/2006/picture">
                 <pic:pic xmlns:pic="http://schemas.openxmlformats.org/drawingml/2006/picture">
                   <pic:nvPicPr>
-                    <pic:cNvPr id="210257309" name=""/>
+                    <pic:cNvPr id="975756007" name=""/>
                     <pic:cNvPicPr/>
                   </pic:nvPicPr>
                   <pic:blipFill>
@@ -7525,7 +7551,7 @@
           <w:sz w:val="27"/>
         </w:rPr>
       </w:pPr>
-      <w:bookmarkStart w:id="11" w:name="_Toc240275436"/>
+      <w:bookmarkStart w:id="11" w:name="_Toc240276718"/>
       <w:r>
         <w:rPr>
           <w:rFonts w:ascii="Montserrat" w:hAnsi="Montserrat"/>
@@ -7565,16 +7591,16 @@
           <w:noProof/>
         </w:rPr>
         <w:drawing>
-          <wp:inline distT="0" distB="0" distL="0" distR="0" wp14:anchorId="65FA5280" wp14:editId="06FBD168">
+          <wp:inline distT="0" distB="0" distL="0" distR="0" wp14:anchorId="09321B93" wp14:editId="17540744">
             <wp:extent cx="4206240" cy="3801227"/>
             <wp:effectExtent l="19050" t="19050" r="22860" b="27940"/>
-            <wp:docPr id="1995683262" name="Imagem 5"/>
+            <wp:docPr id="428314659" name="Imagem 5"/>
             <wp:cNvGraphicFramePr/>
             <a:graphic xmlns:a="http://schemas.openxmlformats.org/drawingml/2006/main">
               <a:graphicData uri="http://schemas.openxmlformats.org/drawingml/2006/picture">
                 <pic:pic xmlns:pic="http://schemas.openxmlformats.org/drawingml/2006/picture">
                   <pic:nvPicPr>
-                    <pic:cNvPr id="1995683262" name=""/>
+                    <pic:cNvPr id="428314659" name=""/>
                     <pic:cNvPicPr/>
                   </pic:nvPicPr>
                   <pic:blipFill>
@@ -7642,16 +7668,16 @@
         </w:rPr>
         <w:lastRenderedPageBreak/>
         <w:drawing>
-          <wp:inline distT="0" distB="0" distL="0" distR="0" wp14:anchorId="02757E9A" wp14:editId="6EF6A3EE">
+          <wp:inline distT="0" distB="0" distL="0" distR="0" wp14:anchorId="3E53FCF1" wp14:editId="4808DEB1">
             <wp:extent cx="4206240" cy="3801227"/>
             <wp:effectExtent l="19050" t="19050" r="22860" b="27940"/>
-            <wp:docPr id="1849133266" name="Imagem 6"/>
+            <wp:docPr id="1282379987" name="Imagem 6"/>
             <wp:cNvGraphicFramePr/>
             <a:graphic xmlns:a="http://schemas.openxmlformats.org/drawingml/2006/main">
               <a:graphicData uri="http://schemas.openxmlformats.org/drawingml/2006/picture">
                 <pic:pic xmlns:pic="http://schemas.openxmlformats.org/drawingml/2006/picture">
                   <pic:nvPicPr>
-                    <pic:cNvPr id="1849133266" name=""/>
+                    <pic:cNvPr id="1282379987" name=""/>
                     <pic:cNvPicPr/>
                   </pic:nvPicPr>
                   <pic:blipFill>
@@ -7767,7 +7793,7 @@
           <w:sz w:val="27"/>
         </w:rPr>
       </w:pPr>
-      <w:bookmarkStart w:id="12" w:name="_Toc240275437"/>
+      <w:bookmarkStart w:id="12" w:name="_Toc240276719"/>
       <w:r>
         <w:rPr>
           <w:rFonts w:ascii="Montserrat" w:hAnsi="Montserrat"/>
@@ -7835,7 +7861,7 @@
           <w:sz w:val="27"/>
         </w:rPr>
       </w:pPr>
-      <w:bookmarkStart w:id="13" w:name="_Toc240275438"/>
+      <w:bookmarkStart w:id="13" w:name="_Toc240276720"/>
       <w:r>
         <w:rPr>
           <w:rFonts w:ascii="Montserrat" w:hAnsi="Montserrat"/>
@@ -8062,7 +8088,7 @@
           <w:sz w:val="27"/>
         </w:rPr>
       </w:pPr>
-      <w:bookmarkStart w:id="14" w:name="_Toc240275439"/>
+      <w:bookmarkStart w:id="14" w:name="_Toc240276721"/>
       <w:r>
         <w:rPr>
           <w:rFonts w:ascii="Montserrat" w:hAnsi="Montserrat"/>
@@ -8221,7 +8247,7 @@
           <w:sz w:val="27"/>
         </w:rPr>
       </w:pPr>
-      <w:bookmarkStart w:id="15" w:name="_Toc240275440"/>
+      <w:bookmarkStart w:id="15" w:name="_Toc240276722"/>
       <w:r>
         <w:rPr>
           <w:rFonts w:ascii="Montserrat" w:hAnsi="Montserrat"/>
@@ -8413,7 +8439,7 @@
           <w:sz w:val="27"/>
         </w:rPr>
       </w:pPr>
-      <w:bookmarkStart w:id="16" w:name="_Toc240275441"/>
+      <w:bookmarkStart w:id="16" w:name="_Toc240276723"/>
       <w:r>
         <w:rPr>
           <w:rFonts w:ascii="Montserrat" w:hAnsi="Montserrat"/>
@@ -8541,7 +8567,7 @@
           <w:sz w:val="27"/>
         </w:rPr>
       </w:pPr>
-      <w:bookmarkStart w:id="17" w:name="_Toc240275442"/>
+      <w:bookmarkStart w:id="17" w:name="_Toc240276724"/>
       <w:r>
         <w:rPr>
           <w:rFonts w:ascii="Montserrat" w:hAnsi="Montserrat"/>
@@ -8871,7 +8897,7 @@
           <w:sz w:val="27"/>
         </w:rPr>
       </w:pPr>
-      <w:bookmarkStart w:id="18" w:name="_Toc240275443"/>
+      <w:bookmarkStart w:id="18" w:name="_Toc240276725"/>
       <w:r>
         <w:rPr>
           <w:rFonts w:ascii="Montserrat" w:hAnsi="Montserrat"/>
@@ -9012,7 +9038,7 @@
           <w:sz w:val="34"/>
         </w:rPr>
       </w:pPr>
-      <w:bookmarkStart w:id="19" w:name="_Toc240275444"/>
+      <w:bookmarkStart w:id="19" w:name="_Toc240276726"/>
       <w:r>
         <w:rPr>
           <w:rFonts w:ascii="Montserrat" w:hAnsi="Montserrat"/>
@@ -9054,7 +9080,7 @@
           <w:sz w:val="27"/>
         </w:rPr>
       </w:pPr>
-      <w:bookmarkStart w:id="20" w:name="_Toc240275445"/>
+      <w:bookmarkStart w:id="20" w:name="_Toc240276727"/>
       <w:r>
         <w:rPr>
           <w:rFonts w:ascii="Montserrat" w:hAnsi="Montserrat"/>
@@ -10134,16 +10160,16 @@
         </w:rPr>
         <w:lastRenderedPageBreak/>
         <w:drawing>
-          <wp:inline distT="0" distB="0" distL="0" distR="0" wp14:anchorId="7D0172E7" wp14:editId="6DEDD271">
+          <wp:inline distT="0" distB="0" distL="0" distR="0" wp14:anchorId="33AA3A30" wp14:editId="36C81F6F">
             <wp:extent cx="5120640" cy="4627581"/>
             <wp:effectExtent l="19050" t="19050" r="22860" b="20955"/>
-            <wp:docPr id="2111149256" name="Imagem 7"/>
+            <wp:docPr id="269794865" name="Imagem 7"/>
             <wp:cNvGraphicFramePr/>
             <a:graphic xmlns:a="http://schemas.openxmlformats.org/drawingml/2006/main">
               <a:graphicData uri="http://schemas.openxmlformats.org/drawingml/2006/picture">
                 <pic:pic xmlns:pic="http://schemas.openxmlformats.org/drawingml/2006/picture">
                   <pic:nvPicPr>
-                    <pic:cNvPr id="2111149256" name=""/>
+                    <pic:cNvPr id="269794865" name=""/>
                     <pic:cNvPicPr/>
                   </pic:nvPicPr>
                   <pic:blipFill>
@@ -10211,16 +10237,16 @@
         </w:rPr>
         <w:lastRenderedPageBreak/>
         <w:drawing>
-          <wp:inline distT="0" distB="0" distL="0" distR="0" wp14:anchorId="3B5D858E" wp14:editId="0FAE9637">
+          <wp:inline distT="0" distB="0" distL="0" distR="0" wp14:anchorId="1CA4F13C" wp14:editId="2084FBBA">
             <wp:extent cx="5120640" cy="4627581"/>
             <wp:effectExtent l="19050" t="19050" r="22860" b="20955"/>
-            <wp:docPr id="1417423510" name="Imagem 8"/>
+            <wp:docPr id="748110702" name="Imagem 8"/>
             <wp:cNvGraphicFramePr/>
             <a:graphic xmlns:a="http://schemas.openxmlformats.org/drawingml/2006/main">
               <a:graphicData uri="http://schemas.openxmlformats.org/drawingml/2006/picture">
                 <pic:pic xmlns:pic="http://schemas.openxmlformats.org/drawingml/2006/picture">
                   <pic:nvPicPr>
-                    <pic:cNvPr id="1417423510" name=""/>
+                    <pic:cNvPr id="748110702" name=""/>
                     <pic:cNvPicPr/>
                   </pic:nvPicPr>
                   <pic:blipFill>
@@ -10428,7 +10454,7 @@
           <w:sz w:val="27"/>
         </w:rPr>
       </w:pPr>
-      <w:bookmarkStart w:id="21" w:name="_Toc240275446"/>
+      <w:bookmarkStart w:id="21" w:name="_Toc240276728"/>
       <w:r>
         <w:rPr>
           <w:rFonts w:ascii="Montserrat" w:hAnsi="Montserrat"/>
@@ -11353,16 +11379,16 @@
           <w:noProof/>
         </w:rPr>
         <w:drawing>
-          <wp:inline distT="0" distB="0" distL="0" distR="0" wp14:anchorId="5C8F8FF1" wp14:editId="12C9114D">
+          <wp:inline distT="0" distB="0" distL="0" distR="0" wp14:anchorId="422CC7A4" wp14:editId="6BF6AC75">
             <wp:extent cx="5120640" cy="4627581"/>
             <wp:effectExtent l="19050" t="19050" r="22860" b="20955"/>
-            <wp:docPr id="1483262122" name="Imagem 9"/>
+            <wp:docPr id="639881493" name="Imagem 9"/>
             <wp:cNvGraphicFramePr/>
             <a:graphic xmlns:a="http://schemas.openxmlformats.org/drawingml/2006/main">
               <a:graphicData uri="http://schemas.openxmlformats.org/drawingml/2006/picture">
                 <pic:pic xmlns:pic="http://schemas.openxmlformats.org/drawingml/2006/picture">
                   <pic:nvPicPr>
-                    <pic:cNvPr id="1483262122" name=""/>
+                    <pic:cNvPr id="639881493" name=""/>
                     <pic:cNvPicPr/>
                   </pic:nvPicPr>
                   <pic:blipFill>
@@ -11430,16 +11456,16 @@
         </w:rPr>
         <w:lastRenderedPageBreak/>
         <w:drawing>
-          <wp:inline distT="0" distB="0" distL="0" distR="0" wp14:anchorId="61ADA6DB" wp14:editId="56155998">
+          <wp:inline distT="0" distB="0" distL="0" distR="0" wp14:anchorId="6607F83B" wp14:editId="2FE67132">
             <wp:extent cx="5120640" cy="4627581"/>
             <wp:effectExtent l="19050" t="19050" r="22860" b="20955"/>
-            <wp:docPr id="499925638" name="Imagem 10"/>
+            <wp:docPr id="2069276417" name="Imagem 10"/>
             <wp:cNvGraphicFramePr/>
             <a:graphic xmlns:a="http://schemas.openxmlformats.org/drawingml/2006/main">
               <a:graphicData uri="http://schemas.openxmlformats.org/drawingml/2006/picture">
                 <pic:pic xmlns:pic="http://schemas.openxmlformats.org/drawingml/2006/picture">
                   <pic:nvPicPr>
-                    <pic:cNvPr id="499925638" name=""/>
+                    <pic:cNvPr id="2069276417" name=""/>
                     <pic:cNvPicPr/>
                   </pic:nvPicPr>
                   <pic:blipFill>
@@ -11573,7 +11599,7 @@
           <w:sz w:val="27"/>
         </w:rPr>
       </w:pPr>
-      <w:bookmarkStart w:id="22" w:name="_Toc240275447"/>
+      <w:bookmarkStart w:id="22" w:name="_Toc240276729"/>
       <w:r>
         <w:rPr>
           <w:rFonts w:ascii="Montserrat" w:hAnsi="Montserrat"/>
@@ -12639,16 +12665,16 @@
           <w:noProof/>
         </w:rPr>
         <w:drawing>
-          <wp:inline distT="0" distB="0" distL="0" distR="0" wp14:anchorId="2BAF624D" wp14:editId="3BB74F43">
+          <wp:inline distT="0" distB="0" distL="0" distR="0" wp14:anchorId="26BA409B" wp14:editId="224DAFBB">
             <wp:extent cx="5120640" cy="3338440"/>
             <wp:effectExtent l="19050" t="19050" r="22860" b="14605"/>
-            <wp:docPr id="1534108310" name="Imagem 11"/>
+            <wp:docPr id="611077745" name="Imagem 11"/>
             <wp:cNvGraphicFramePr/>
             <a:graphic xmlns:a="http://schemas.openxmlformats.org/drawingml/2006/main">
               <a:graphicData uri="http://schemas.openxmlformats.org/drawingml/2006/picture">
                 <pic:pic xmlns:pic="http://schemas.openxmlformats.org/drawingml/2006/picture">
                   <pic:nvPicPr>
-                    <pic:cNvPr id="1534108310" name=""/>
+                    <pic:cNvPr id="611077745" name=""/>
                     <pic:cNvPicPr/>
                   </pic:nvPicPr>
                   <pic:blipFill>
@@ -12716,16 +12742,16 @@
         </w:rPr>
         <w:lastRenderedPageBreak/>
         <w:drawing>
-          <wp:inline distT="0" distB="0" distL="0" distR="0" wp14:anchorId="5635F99A" wp14:editId="73F64567">
+          <wp:inline distT="0" distB="0" distL="0" distR="0" wp14:anchorId="1D976B00" wp14:editId="1828C9C5">
             <wp:extent cx="5120640" cy="4627581"/>
             <wp:effectExtent l="19050" t="19050" r="22860" b="20955"/>
-            <wp:docPr id="1862155335" name="Imagem 12"/>
+            <wp:docPr id="1320902086" name="Imagem 12"/>
             <wp:cNvGraphicFramePr/>
             <a:graphic xmlns:a="http://schemas.openxmlformats.org/drawingml/2006/main">
               <a:graphicData uri="http://schemas.openxmlformats.org/drawingml/2006/picture">
                 <pic:pic xmlns:pic="http://schemas.openxmlformats.org/drawingml/2006/picture">
                   <pic:nvPicPr>
-                    <pic:cNvPr id="1862155335" name=""/>
+                    <pic:cNvPr id="1320902086" name=""/>
                     <pic:cNvPicPr/>
                   </pic:nvPicPr>
                   <pic:blipFill>
@@ -12929,7 +12955,7 @@
           <w:sz w:val="27"/>
         </w:rPr>
       </w:pPr>
-      <w:bookmarkStart w:id="23" w:name="_Toc240275448"/>
+      <w:bookmarkStart w:id="23" w:name="_Toc240276730"/>
       <w:r>
         <w:rPr>
           <w:rFonts w:ascii="Montserrat" w:hAnsi="Montserrat"/>
@@ -13490,16 +13516,16 @@
           <w:noProof/>
         </w:rPr>
         <w:drawing>
-          <wp:inline distT="0" distB="0" distL="0" distR="0" wp14:anchorId="05260B1E" wp14:editId="40BE77BC">
+          <wp:inline distT="0" distB="0" distL="0" distR="0" wp14:anchorId="4396F78F" wp14:editId="223FAB6A">
             <wp:extent cx="5120640" cy="4627581"/>
             <wp:effectExtent l="19050" t="19050" r="22860" b="20955"/>
-            <wp:docPr id="1510387647" name="Imagem 13"/>
+            <wp:docPr id="560462022" name="Imagem 13"/>
             <wp:cNvGraphicFramePr/>
             <a:graphic xmlns:a="http://schemas.openxmlformats.org/drawingml/2006/main">
               <a:graphicData uri="http://schemas.openxmlformats.org/drawingml/2006/picture">
                 <pic:pic xmlns:pic="http://schemas.openxmlformats.org/drawingml/2006/picture">
                   <pic:nvPicPr>
-                    <pic:cNvPr id="1510387647" name=""/>
+                    <pic:cNvPr id="560462022" name=""/>
                     <pic:cNvPicPr/>
                   </pic:nvPicPr>
                   <pic:blipFill>
@@ -13567,16 +13593,16 @@
         </w:rPr>
         <w:lastRenderedPageBreak/>
         <w:drawing>
-          <wp:inline distT="0" distB="0" distL="0" distR="0" wp14:anchorId="685B0A45" wp14:editId="567CA7B8">
+          <wp:inline distT="0" distB="0" distL="0" distR="0" wp14:anchorId="42B837D7" wp14:editId="73CD43DE">
             <wp:extent cx="5120640" cy="4627581"/>
             <wp:effectExtent l="19050" t="19050" r="22860" b="20955"/>
-            <wp:docPr id="607867935" name="Imagem 14"/>
+            <wp:docPr id="1025243832" name="Imagem 14"/>
             <wp:cNvGraphicFramePr/>
             <a:graphic xmlns:a="http://schemas.openxmlformats.org/drawingml/2006/main">
               <a:graphicData uri="http://schemas.openxmlformats.org/drawingml/2006/picture">
                 <pic:pic xmlns:pic="http://schemas.openxmlformats.org/drawingml/2006/picture">
                   <pic:nvPicPr>
-                    <pic:cNvPr id="607867935" name=""/>
+                    <pic:cNvPr id="1025243832" name=""/>
                     <pic:cNvPicPr/>
                   </pic:nvPicPr>
                   <pic:blipFill>
@@ -13828,7 +13854,7 @@
           <w:sz w:val="27"/>
         </w:rPr>
       </w:pPr>
-      <w:bookmarkStart w:id="24" w:name="_Toc240275449"/>
+      <w:bookmarkStart w:id="24" w:name="_Toc240276731"/>
       <w:r>
         <w:rPr>
           <w:rFonts w:ascii="Montserrat" w:hAnsi="Montserrat"/>
@@ -13868,16 +13894,16 @@
           <w:noProof/>
         </w:rPr>
         <w:drawing>
-          <wp:inline distT="0" distB="0" distL="0" distR="0" wp14:anchorId="4B45EF89" wp14:editId="75D21869">
+          <wp:inline distT="0" distB="0" distL="0" distR="0" wp14:anchorId="5207AB49" wp14:editId="586A333E">
             <wp:extent cx="5120640" cy="4627581"/>
             <wp:effectExtent l="19050" t="19050" r="22860" b="20955"/>
-            <wp:docPr id="2061609950" name="Imagem 15"/>
+            <wp:docPr id="274729445" name="Imagem 15"/>
             <wp:cNvGraphicFramePr/>
             <a:graphic xmlns:a="http://schemas.openxmlformats.org/drawingml/2006/main">
               <a:graphicData uri="http://schemas.openxmlformats.org/drawingml/2006/picture">
                 <pic:pic xmlns:pic="http://schemas.openxmlformats.org/drawingml/2006/picture">
                   <pic:nvPicPr>
-                    <pic:cNvPr id="2061609950" name=""/>
+                    <pic:cNvPr id="274729445" name=""/>
                     <pic:cNvPicPr/>
                   </pic:nvPicPr>
                   <pic:blipFill>
@@ -13945,16 +13971,16 @@
         </w:rPr>
         <w:lastRenderedPageBreak/>
         <w:drawing>
-          <wp:inline distT="0" distB="0" distL="0" distR="0" wp14:anchorId="4517D9B5" wp14:editId="67048F8E">
+          <wp:inline distT="0" distB="0" distL="0" distR="0" wp14:anchorId="336C1EEB" wp14:editId="2AF96C11">
             <wp:extent cx="5120640" cy="4627581"/>
             <wp:effectExtent l="19050" t="19050" r="22860" b="20955"/>
-            <wp:docPr id="1271182538" name="Imagem 16"/>
+            <wp:docPr id="1174302781" name="Imagem 16"/>
             <wp:cNvGraphicFramePr/>
             <a:graphic xmlns:a="http://schemas.openxmlformats.org/drawingml/2006/main">
               <a:graphicData uri="http://schemas.openxmlformats.org/drawingml/2006/picture">
                 <pic:pic xmlns:pic="http://schemas.openxmlformats.org/drawingml/2006/picture">
                   <pic:nvPicPr>
-                    <pic:cNvPr id="1271182538" name=""/>
+                    <pic:cNvPr id="1174302781" name=""/>
                     <pic:cNvPicPr/>
                   </pic:nvPicPr>
                   <pic:blipFill>
@@ -14118,16 +14144,16 @@
         </w:rPr>
         <w:lastRenderedPageBreak/>
         <w:drawing>
-          <wp:inline distT="0" distB="0" distL="0" distR="0" wp14:anchorId="6A62B440" wp14:editId="46C9FB02">
+          <wp:inline distT="0" distB="0" distL="0" distR="0" wp14:anchorId="19C3AEC9" wp14:editId="03F40A42">
             <wp:extent cx="5120640" cy="3282818"/>
             <wp:effectExtent l="19050" t="19050" r="22860" b="13335"/>
-            <wp:docPr id="1524474721" name="Imagem 17"/>
+            <wp:docPr id="257225244" name="Imagem 17"/>
             <wp:cNvGraphicFramePr/>
             <a:graphic xmlns:a="http://schemas.openxmlformats.org/drawingml/2006/main">
               <a:graphicData uri="http://schemas.openxmlformats.org/drawingml/2006/picture">
                 <pic:pic xmlns:pic="http://schemas.openxmlformats.org/drawingml/2006/picture">
                   <pic:nvPicPr>
-                    <pic:cNvPr id="1524474721" name=""/>
+                    <pic:cNvPr id="257225244" name=""/>
                     <pic:cNvPicPr/>
                   </pic:nvPicPr>
                   <pic:blipFill>
@@ -14318,7 +14344,7 @@
           <w:sz w:val="27"/>
         </w:rPr>
       </w:pPr>
-      <w:bookmarkStart w:id="25" w:name="_Toc240275450"/>
+      <w:bookmarkStart w:id="25" w:name="_Toc240276732"/>
       <w:r>
         <w:rPr>
           <w:rFonts w:ascii="Montserrat" w:hAnsi="Montserrat"/>
@@ -14358,16 +14384,16 @@
           <w:noProof/>
         </w:rPr>
         <w:drawing>
-          <wp:inline distT="0" distB="0" distL="0" distR="0" wp14:anchorId="5BDACCBD" wp14:editId="68DC7C5D">
+          <wp:inline distT="0" distB="0" distL="0" distR="0" wp14:anchorId="0212664C" wp14:editId="3CDA67AA">
             <wp:extent cx="5120640" cy="4627581"/>
             <wp:effectExtent l="19050" t="19050" r="22860" b="20955"/>
-            <wp:docPr id="883269976" name="Imagem 18"/>
+            <wp:docPr id="864114339" name="Imagem 18"/>
             <wp:cNvGraphicFramePr/>
             <a:graphic xmlns:a="http://schemas.openxmlformats.org/drawingml/2006/main">
               <a:graphicData uri="http://schemas.openxmlformats.org/drawingml/2006/picture">
                 <pic:pic xmlns:pic="http://schemas.openxmlformats.org/drawingml/2006/picture">
                   <pic:nvPicPr>
-                    <pic:cNvPr id="883269976" name=""/>
+                    <pic:cNvPr id="864114339" name=""/>
                     <pic:cNvPicPr/>
                   </pic:nvPicPr>
                   <pic:blipFill>
@@ -14435,16 +14461,16 @@
         </w:rPr>
         <w:lastRenderedPageBreak/>
         <w:drawing>
-          <wp:inline distT="0" distB="0" distL="0" distR="0" wp14:anchorId="3FBEF9AB" wp14:editId="73475451">
+          <wp:inline distT="0" distB="0" distL="0" distR="0" wp14:anchorId="35119A21" wp14:editId="4E08A899">
             <wp:extent cx="5120640" cy="4627581"/>
             <wp:effectExtent l="19050" t="19050" r="22860" b="20955"/>
-            <wp:docPr id="1179078365" name="Imagem 19"/>
+            <wp:docPr id="1113808096" name="Imagem 19"/>
             <wp:cNvGraphicFramePr/>
             <a:graphic xmlns:a="http://schemas.openxmlformats.org/drawingml/2006/main">
               <a:graphicData uri="http://schemas.openxmlformats.org/drawingml/2006/picture">
                 <pic:pic xmlns:pic="http://schemas.openxmlformats.org/drawingml/2006/picture">
                   <pic:nvPicPr>
-                    <pic:cNvPr id="1179078365" name=""/>
+                    <pic:cNvPr id="1113808096" name=""/>
                     <pic:cNvPicPr/>
                   </pic:nvPicPr>
                   <pic:blipFill>
@@ -14627,7 +14653,7 @@
           <w:sz w:val="27"/>
         </w:rPr>
       </w:pPr>
-      <w:bookmarkStart w:id="26" w:name="_Toc240275451"/>
+      <w:bookmarkStart w:id="26" w:name="_Toc240276733"/>
       <w:r>
         <w:rPr>
           <w:rFonts w:ascii="Montserrat" w:hAnsi="Montserrat"/>
@@ -14667,16 +14693,16 @@
           <w:noProof/>
         </w:rPr>
         <w:drawing>
-          <wp:inline distT="0" distB="0" distL="0" distR="0" wp14:anchorId="136D1C22" wp14:editId="306C4F8C">
+          <wp:inline distT="0" distB="0" distL="0" distR="0" wp14:anchorId="59458903" wp14:editId="204CB7C6">
             <wp:extent cx="5120640" cy="4627581"/>
             <wp:effectExtent l="19050" t="19050" r="22860" b="20955"/>
-            <wp:docPr id="553406053" name="Imagem 20"/>
+            <wp:docPr id="594904499" name="Imagem 20"/>
             <wp:cNvGraphicFramePr/>
             <a:graphic xmlns:a="http://schemas.openxmlformats.org/drawingml/2006/main">
               <a:graphicData uri="http://schemas.openxmlformats.org/drawingml/2006/picture">
                 <pic:pic xmlns:pic="http://schemas.openxmlformats.org/drawingml/2006/picture">
                   <pic:nvPicPr>
-                    <pic:cNvPr id="553406053" name=""/>
+                    <pic:cNvPr id="594904499" name=""/>
                     <pic:cNvPicPr/>
                   </pic:nvPicPr>
                   <pic:blipFill>
@@ -14744,16 +14770,16 @@
         </w:rPr>
         <w:lastRenderedPageBreak/>
         <w:drawing>
-          <wp:inline distT="0" distB="0" distL="0" distR="0" wp14:anchorId="6389718B" wp14:editId="4776062C">
+          <wp:inline distT="0" distB="0" distL="0" distR="0" wp14:anchorId="0E8811CC" wp14:editId="67EA263D">
             <wp:extent cx="5120640" cy="4627581"/>
             <wp:effectExtent l="19050" t="19050" r="22860" b="20955"/>
-            <wp:docPr id="1359582470" name="Imagem 21"/>
+            <wp:docPr id="1980619442" name="Imagem 21"/>
             <wp:cNvGraphicFramePr/>
             <a:graphic xmlns:a="http://schemas.openxmlformats.org/drawingml/2006/main">
               <a:graphicData uri="http://schemas.openxmlformats.org/drawingml/2006/picture">
                 <pic:pic xmlns:pic="http://schemas.openxmlformats.org/drawingml/2006/picture">
                   <pic:nvPicPr>
-                    <pic:cNvPr id="1359582470" name=""/>
+                    <pic:cNvPr id="1980619442" name=""/>
                     <pic:cNvPicPr/>
                   </pic:nvPicPr>
                   <pic:blipFill>
@@ -14959,16 +14985,16 @@
           <w:noProof/>
         </w:rPr>
         <w:drawing>
-          <wp:inline distT="0" distB="0" distL="0" distR="0" wp14:anchorId="459EF739" wp14:editId="76D3167A">
+          <wp:inline distT="0" distB="0" distL="0" distR="0" wp14:anchorId="454AA833" wp14:editId="0302EDBD">
             <wp:extent cx="5120640" cy="1757287"/>
             <wp:effectExtent l="19050" t="19050" r="22860" b="14605"/>
-            <wp:docPr id="2057466218" name="Imagem 22"/>
+            <wp:docPr id="1267536859" name="Imagem 22"/>
             <wp:cNvGraphicFramePr/>
             <a:graphic xmlns:a="http://schemas.openxmlformats.org/drawingml/2006/main">
               <a:graphicData uri="http://schemas.openxmlformats.org/drawingml/2006/picture">
                 <pic:pic xmlns:pic="http://schemas.openxmlformats.org/drawingml/2006/picture">
                   <pic:nvPicPr>
-                    <pic:cNvPr id="2057466218" name=""/>
+                    <pic:cNvPr id="1267536859" name=""/>
                     <pic:cNvPicPr/>
                   </pic:nvPicPr>
                   <pic:blipFill>
@@ -15081,7 +15107,7 @@
           <w:sz w:val="27"/>
         </w:rPr>
       </w:pPr>
-      <w:bookmarkStart w:id="27" w:name="_Toc240275452"/>
+      <w:bookmarkStart w:id="27" w:name="_Toc240276734"/>
       <w:r>
         <w:rPr>
           <w:rFonts w:ascii="Montserrat" w:hAnsi="Montserrat"/>
@@ -15122,16 +15148,16 @@
         </w:rPr>
         <w:lastRenderedPageBreak/>
         <w:drawing>
-          <wp:inline distT="0" distB="0" distL="0" distR="0" wp14:anchorId="6B66FD4F" wp14:editId="17CE1B0B">
+          <wp:inline distT="0" distB="0" distL="0" distR="0" wp14:anchorId="0F34BD6F" wp14:editId="19A44163">
             <wp:extent cx="5120640" cy="4627581"/>
             <wp:effectExtent l="19050" t="19050" r="22860" b="20955"/>
-            <wp:docPr id="1114238631" name="Imagem 23"/>
+            <wp:docPr id="1807829882" name="Imagem 23"/>
             <wp:cNvGraphicFramePr/>
             <a:graphic xmlns:a="http://schemas.openxmlformats.org/drawingml/2006/main">
               <a:graphicData uri="http://schemas.openxmlformats.org/drawingml/2006/picture">
                 <pic:pic xmlns:pic="http://schemas.openxmlformats.org/drawingml/2006/picture">
                   <pic:nvPicPr>
-                    <pic:cNvPr id="1114238631" name=""/>
+                    <pic:cNvPr id="1807829882" name=""/>
                     <pic:cNvPicPr/>
                   </pic:nvPicPr>
                   <pic:blipFill>
@@ -15199,16 +15225,16 @@
         </w:rPr>
         <w:lastRenderedPageBreak/>
         <w:drawing>
-          <wp:inline distT="0" distB="0" distL="0" distR="0" wp14:anchorId="023E2EF6" wp14:editId="438D70F3">
+          <wp:inline distT="0" distB="0" distL="0" distR="0" wp14:anchorId="403F2343" wp14:editId="54A94CE7">
             <wp:extent cx="5120640" cy="4627581"/>
             <wp:effectExtent l="19050" t="19050" r="22860" b="20955"/>
-            <wp:docPr id="736778441" name="Imagem 24"/>
+            <wp:docPr id="1672042865" name="Imagem 24"/>
             <wp:cNvGraphicFramePr/>
             <a:graphic xmlns:a="http://schemas.openxmlformats.org/drawingml/2006/main">
               <a:graphicData uri="http://schemas.openxmlformats.org/drawingml/2006/picture">
                 <pic:pic xmlns:pic="http://schemas.openxmlformats.org/drawingml/2006/picture">
                   <pic:nvPicPr>
-                    <pic:cNvPr id="736778441" name=""/>
+                    <pic:cNvPr id="1672042865" name=""/>
                     <pic:cNvPicPr/>
                   </pic:nvPicPr>
                   <pic:blipFill>
@@ -15445,7 +15471,7 @@
           <w:sz w:val="27"/>
         </w:rPr>
       </w:pPr>
-      <w:bookmarkStart w:id="28" w:name="_Toc240275453"/>
+      <w:bookmarkStart w:id="28" w:name="_Toc240276735"/>
       <w:r>
         <w:rPr>
           <w:rFonts w:ascii="Montserrat" w:hAnsi="Montserrat"/>
@@ -15485,16 +15511,16 @@
           <w:noProof/>
         </w:rPr>
         <w:drawing>
-          <wp:inline distT="0" distB="0" distL="0" distR="0" wp14:anchorId="2C2F63F5" wp14:editId="452A3EDD">
+          <wp:inline distT="0" distB="0" distL="0" distR="0" wp14:anchorId="78608A9E" wp14:editId="53EE9C6F">
             <wp:extent cx="5120640" cy="4627581"/>
             <wp:effectExtent l="19050" t="19050" r="22860" b="20955"/>
-            <wp:docPr id="1357433894" name="Imagem 25"/>
+            <wp:docPr id="1316326119" name="Imagem 25"/>
             <wp:cNvGraphicFramePr/>
             <a:graphic xmlns:a="http://schemas.openxmlformats.org/drawingml/2006/main">
               <a:graphicData uri="http://schemas.openxmlformats.org/drawingml/2006/picture">
                 <pic:pic xmlns:pic="http://schemas.openxmlformats.org/drawingml/2006/picture">
                   <pic:nvPicPr>
-                    <pic:cNvPr id="1357433894" name=""/>
+                    <pic:cNvPr id="1316326119" name=""/>
                     <pic:cNvPicPr/>
                   </pic:nvPicPr>
                   <pic:blipFill>
@@ -15562,16 +15588,16 @@
         </w:rPr>
         <w:lastRenderedPageBreak/>
         <w:drawing>
-          <wp:inline distT="0" distB="0" distL="0" distR="0" wp14:anchorId="29DCA5FB" wp14:editId="4636DA68">
+          <wp:inline distT="0" distB="0" distL="0" distR="0" wp14:anchorId="266768B5" wp14:editId="1AFEE6BB">
             <wp:extent cx="5120640" cy="4627581"/>
             <wp:effectExtent l="19050" t="19050" r="22860" b="20955"/>
-            <wp:docPr id="1426194965" name="Imagem 26"/>
+            <wp:docPr id="957654351" name="Imagem 26"/>
             <wp:cNvGraphicFramePr/>
             <a:graphic xmlns:a="http://schemas.openxmlformats.org/drawingml/2006/main">
               <a:graphicData uri="http://schemas.openxmlformats.org/drawingml/2006/picture">
                 <pic:pic xmlns:pic="http://schemas.openxmlformats.org/drawingml/2006/picture">
                   <pic:nvPicPr>
-                    <pic:cNvPr id="1426194965" name=""/>
+                    <pic:cNvPr id="957654351" name=""/>
                     <pic:cNvPicPr/>
                   </pic:nvPicPr>
                   <pic:blipFill>
@@ -15762,7 +15788,7 @@
           <w:sz w:val="27"/>
         </w:rPr>
       </w:pPr>
-      <w:bookmarkStart w:id="29" w:name="_Toc240275454"/>
+      <w:bookmarkStart w:id="29" w:name="_Toc240276736"/>
       <w:r>
         <w:rPr>
           <w:rFonts w:ascii="Montserrat" w:hAnsi="Montserrat"/>
@@ -15802,16 +15828,16 @@
           <w:noProof/>
         </w:rPr>
         <w:drawing>
-          <wp:inline distT="0" distB="0" distL="0" distR="0" wp14:anchorId="18300800" wp14:editId="339B7C27">
+          <wp:inline distT="0" distB="0" distL="0" distR="0" wp14:anchorId="2F13E4F1" wp14:editId="174B8A64">
             <wp:extent cx="5120640" cy="4000682"/>
             <wp:effectExtent l="19050" t="19050" r="22860" b="19050"/>
-            <wp:docPr id="444219429" name="Imagem 27"/>
+            <wp:docPr id="529421586" name="Imagem 27"/>
             <wp:cNvGraphicFramePr/>
             <a:graphic xmlns:a="http://schemas.openxmlformats.org/drawingml/2006/main">
               <a:graphicData uri="http://schemas.openxmlformats.org/drawingml/2006/picture">
                 <pic:pic xmlns:pic="http://schemas.openxmlformats.org/drawingml/2006/picture">
                   <pic:nvPicPr>
-                    <pic:cNvPr id="444219429" name=""/>
+                    <pic:cNvPr id="529421586" name=""/>
                     <pic:cNvPicPr/>
                   </pic:nvPicPr>
                   <pic:blipFill>
@@ -16335,7 +16361,7 @@
           <w:sz w:val="34"/>
         </w:rPr>
       </w:pPr>
-      <w:bookmarkStart w:id="30" w:name="_Toc240275455"/>
+      <w:bookmarkStart w:id="30" w:name="_Toc240276737"/>
       <w:r>
         <w:rPr>
           <w:rFonts w:ascii="Montserrat" w:hAnsi="Montserrat"/>
@@ -16377,7 +16403,7 @@
           <w:sz w:val="27"/>
         </w:rPr>
       </w:pPr>
-      <w:bookmarkStart w:id="31" w:name="_Toc240275456"/>
+      <w:bookmarkStart w:id="31" w:name="_Toc240276738"/>
       <w:r>
         <w:rPr>
           <w:rFonts w:ascii="Montserrat" w:hAnsi="Montserrat"/>
@@ -16417,16 +16443,16 @@
           <w:noProof/>
         </w:rPr>
         <w:drawing>
-          <wp:inline distT="0" distB="0" distL="0" distR="0" wp14:anchorId="1A33C6E2" wp14:editId="6F8E78BD">
+          <wp:inline distT="0" distB="0" distL="0" distR="0" wp14:anchorId="6BAEEC43" wp14:editId="7BDEE0D0">
             <wp:extent cx="5120640" cy="4627581"/>
             <wp:effectExtent l="19050" t="19050" r="22860" b="20955"/>
-            <wp:docPr id="2021264087" name="Imagem 28"/>
+            <wp:docPr id="1137471906" name="Imagem 28"/>
             <wp:cNvGraphicFramePr/>
             <a:graphic xmlns:a="http://schemas.openxmlformats.org/drawingml/2006/main">
               <a:graphicData uri="http://schemas.openxmlformats.org/drawingml/2006/picture">
                 <pic:pic xmlns:pic="http://schemas.openxmlformats.org/drawingml/2006/picture">
                   <pic:nvPicPr>
-                    <pic:cNvPr id="2021264087" name=""/>
+                    <pic:cNvPr id="1137471906" name=""/>
                     <pic:cNvPicPr/>
                   </pic:nvPicPr>
                   <pic:blipFill>
@@ -16494,16 +16520,16 @@
         </w:rPr>
         <w:lastRenderedPageBreak/>
         <w:drawing>
-          <wp:inline distT="0" distB="0" distL="0" distR="0" wp14:anchorId="6982B3E9" wp14:editId="36BDC196">
+          <wp:inline distT="0" distB="0" distL="0" distR="0" wp14:anchorId="2139E589" wp14:editId="5E855123">
             <wp:extent cx="5120640" cy="4627581"/>
             <wp:effectExtent l="19050" t="19050" r="22860" b="20955"/>
-            <wp:docPr id="1705274251" name="Imagem 29"/>
+            <wp:docPr id="985396927" name="Imagem 29"/>
             <wp:cNvGraphicFramePr/>
             <a:graphic xmlns:a="http://schemas.openxmlformats.org/drawingml/2006/main">
               <a:graphicData uri="http://schemas.openxmlformats.org/drawingml/2006/picture">
                 <pic:pic xmlns:pic="http://schemas.openxmlformats.org/drawingml/2006/picture">
                   <pic:nvPicPr>
-                    <pic:cNvPr id="1705274251" name=""/>
+                    <pic:cNvPr id="985396927" name=""/>
                     <pic:cNvPicPr/>
                   </pic:nvPicPr>
                   <pic:blipFill>
@@ -16571,16 +16597,16 @@
         </w:rPr>
         <w:lastRenderedPageBreak/>
         <w:drawing>
-          <wp:inline distT="0" distB="0" distL="0" distR="0" wp14:anchorId="121D2C62" wp14:editId="282BEDB7">
+          <wp:inline distT="0" distB="0" distL="0" distR="0" wp14:anchorId="15A2F36E" wp14:editId="0DE8E9E0">
             <wp:extent cx="5120640" cy="4627581"/>
             <wp:effectExtent l="19050" t="19050" r="22860" b="20955"/>
-            <wp:docPr id="374789312" name="Imagem 30"/>
+            <wp:docPr id="97604531" name="Imagem 30"/>
             <wp:cNvGraphicFramePr/>
             <a:graphic xmlns:a="http://schemas.openxmlformats.org/drawingml/2006/main">
               <a:graphicData uri="http://schemas.openxmlformats.org/drawingml/2006/picture">
                 <pic:pic xmlns:pic="http://schemas.openxmlformats.org/drawingml/2006/picture">
                   <pic:nvPicPr>
-                    <pic:cNvPr id="374789312" name=""/>
+                    <pic:cNvPr id="97604531" name=""/>
                     <pic:cNvPicPr/>
                   </pic:nvPicPr>
                   <pic:blipFill>
@@ -16782,16 +16808,16 @@
           <w:noProof/>
         </w:rPr>
         <w:drawing>
-          <wp:inline distT="0" distB="0" distL="0" distR="0" wp14:anchorId="059CCED1" wp14:editId="636F3FAB">
+          <wp:inline distT="0" distB="0" distL="0" distR="0" wp14:anchorId="3C0021B3" wp14:editId="35B604D7">
             <wp:extent cx="5120640" cy="1715571"/>
             <wp:effectExtent l="19050" t="19050" r="22860" b="18415"/>
-            <wp:docPr id="478676267" name="Imagem 31"/>
+            <wp:docPr id="125498442" name="Imagem 31"/>
             <wp:cNvGraphicFramePr/>
             <a:graphic xmlns:a="http://schemas.openxmlformats.org/drawingml/2006/main">
               <a:graphicData uri="http://schemas.openxmlformats.org/drawingml/2006/picture">
                 <pic:pic xmlns:pic="http://schemas.openxmlformats.org/drawingml/2006/picture">
                   <pic:nvPicPr>
-                    <pic:cNvPr id="478676267" name=""/>
+                    <pic:cNvPr id="125498442" name=""/>
                     <pic:cNvPicPr/>
                   </pic:nvPicPr>
                   <pic:blipFill>
@@ -16928,16 +16954,16 @@
           <w:noProof/>
         </w:rPr>
         <w:drawing>
-          <wp:inline distT="0" distB="0" distL="0" distR="0" wp14:anchorId="4B3B8E3E" wp14:editId="336750E1">
+          <wp:inline distT="0" distB="0" distL="0" distR="0" wp14:anchorId="3CE2E46C" wp14:editId="7A602BD7">
             <wp:extent cx="5120640" cy="3282818"/>
             <wp:effectExtent l="19050" t="19050" r="22860" b="13335"/>
-            <wp:docPr id="849753028" name="Imagem 32"/>
+            <wp:docPr id="655151944" name="Imagem 32"/>
             <wp:cNvGraphicFramePr/>
             <a:graphic xmlns:a="http://schemas.openxmlformats.org/drawingml/2006/main">
               <a:graphicData uri="http://schemas.openxmlformats.org/drawingml/2006/picture">
                 <pic:pic xmlns:pic="http://schemas.openxmlformats.org/drawingml/2006/picture">
                   <pic:nvPicPr>
-                    <pic:cNvPr id="849753028" name=""/>
+                    <pic:cNvPr id="655151944" name=""/>
                     <pic:cNvPicPr/>
                   </pic:nvPicPr>
                   <pic:blipFill>
@@ -17071,16 +17097,16 @@
           <w:noProof/>
         </w:rPr>
         <w:drawing>
-          <wp:inline distT="0" distB="0" distL="0" distR="0" wp14:anchorId="1F56D8D8" wp14:editId="5BCF4488">
+          <wp:inline distT="0" distB="0" distL="0" distR="0" wp14:anchorId="76695414" wp14:editId="61EF7739">
             <wp:extent cx="5120640" cy="951357"/>
             <wp:effectExtent l="19050" t="19050" r="22860" b="20320"/>
-            <wp:docPr id="1469159744" name="Imagem 33"/>
+            <wp:docPr id="1298191697" name="Imagem 33"/>
             <wp:cNvGraphicFramePr/>
             <a:graphic xmlns:a="http://schemas.openxmlformats.org/drawingml/2006/main">
               <a:graphicData uri="http://schemas.openxmlformats.org/drawingml/2006/picture">
                 <pic:pic xmlns:pic="http://schemas.openxmlformats.org/drawingml/2006/picture">
                   <pic:nvPicPr>
-                    <pic:cNvPr id="1469159744" name=""/>
+                    <pic:cNvPr id="1298191697" name=""/>
                     <pic:cNvPicPr/>
                   </pic:nvPicPr>
                   <pic:blipFill>
@@ -17192,16 +17218,16 @@
           <w:noProof/>
         </w:rPr>
         <w:drawing>
-          <wp:inline distT="0" distB="0" distL="0" distR="0" wp14:anchorId="1DD18676" wp14:editId="27BFBD0A">
+          <wp:inline distT="0" distB="0" distL="0" distR="0" wp14:anchorId="545F3A28" wp14:editId="317DC31E">
             <wp:extent cx="5120640" cy="1515102"/>
             <wp:effectExtent l="19050" t="19050" r="22860" b="28575"/>
-            <wp:docPr id="799237127" name="Imagem 34"/>
+            <wp:docPr id="432099923" name="Imagem 34"/>
             <wp:cNvGraphicFramePr/>
             <a:graphic xmlns:a="http://schemas.openxmlformats.org/drawingml/2006/main">
               <a:graphicData uri="http://schemas.openxmlformats.org/drawingml/2006/picture">
                 <pic:pic xmlns:pic="http://schemas.openxmlformats.org/drawingml/2006/picture">
                   <pic:nvPicPr>
-                    <pic:cNvPr id="799237127" name=""/>
+                    <pic:cNvPr id="432099923" name=""/>
                     <pic:cNvPicPr/>
                   </pic:nvPicPr>
                   <pic:blipFill>
@@ -17314,16 +17340,16 @@
           <w:noProof/>
         </w:rPr>
         <w:drawing>
-          <wp:inline distT="0" distB="0" distL="0" distR="0" wp14:anchorId="40BFDF1A" wp14:editId="592F5D0C">
+          <wp:inline distT="0" distB="0" distL="0" distR="0" wp14:anchorId="4354E4AB" wp14:editId="539AC53D">
             <wp:extent cx="5120640" cy="1391113"/>
             <wp:effectExtent l="19050" t="19050" r="22860" b="19050"/>
-            <wp:docPr id="1650777336" name="Imagem 35"/>
+            <wp:docPr id="1797352224" name="Imagem 35"/>
             <wp:cNvGraphicFramePr/>
             <a:graphic xmlns:a="http://schemas.openxmlformats.org/drawingml/2006/main">
               <a:graphicData uri="http://schemas.openxmlformats.org/drawingml/2006/picture">
                 <pic:pic xmlns:pic="http://schemas.openxmlformats.org/drawingml/2006/picture">
                   <pic:nvPicPr>
-                    <pic:cNvPr id="1650777336" name=""/>
+                    <pic:cNvPr id="1797352224" name=""/>
                     <pic:cNvPicPr/>
                   </pic:nvPicPr>
                   <pic:blipFill>
@@ -17435,16 +17461,16 @@
           <w:noProof/>
         </w:rPr>
         <w:drawing>
-          <wp:inline distT="0" distB="0" distL="0" distR="0" wp14:anchorId="66689284" wp14:editId="018FD679">
+          <wp:inline distT="0" distB="0" distL="0" distR="0" wp14:anchorId="5761D2C3" wp14:editId="2E6EBC0A">
             <wp:extent cx="5120640" cy="1125174"/>
             <wp:effectExtent l="19050" t="19050" r="22860" b="18415"/>
-            <wp:docPr id="1806261792" name="Imagem 36"/>
+            <wp:docPr id="1590816501" name="Imagem 36"/>
             <wp:cNvGraphicFramePr/>
             <a:graphic xmlns:a="http://schemas.openxmlformats.org/drawingml/2006/main">
               <a:graphicData uri="http://schemas.openxmlformats.org/drawingml/2006/picture">
                 <pic:pic xmlns:pic="http://schemas.openxmlformats.org/drawingml/2006/picture">
                   <pic:nvPicPr>
-                    <pic:cNvPr id="1806261792" name=""/>
+                    <pic:cNvPr id="1590816501" name=""/>
                     <pic:cNvPicPr/>
                   </pic:nvPicPr>
                   <pic:blipFill>
@@ -17534,7 +17560,7 @@
           <w:sz w:val="27"/>
         </w:rPr>
       </w:pPr>
-      <w:bookmarkStart w:id="32" w:name="_Toc240275457"/>
+      <w:bookmarkStart w:id="32" w:name="_Toc240276739"/>
       <w:r>
         <w:rPr>
           <w:rFonts w:ascii="Montserrat" w:hAnsi="Montserrat"/>
@@ -17574,16 +17600,16 @@
           <w:noProof/>
         </w:rPr>
         <w:drawing>
-          <wp:inline distT="0" distB="0" distL="0" distR="0" wp14:anchorId="43E39686" wp14:editId="7FBA2012">
+          <wp:inline distT="0" distB="0" distL="0" distR="0" wp14:anchorId="06A78DEF" wp14:editId="2F59AA04">
             <wp:extent cx="5120640" cy="4627581"/>
             <wp:effectExtent l="19050" t="19050" r="22860" b="20955"/>
-            <wp:docPr id="763673534" name="Imagem 37"/>
+            <wp:docPr id="1125713913" name="Imagem 37"/>
             <wp:cNvGraphicFramePr/>
             <a:graphic xmlns:a="http://schemas.openxmlformats.org/drawingml/2006/main">
               <a:graphicData uri="http://schemas.openxmlformats.org/drawingml/2006/picture">
                 <pic:pic xmlns:pic="http://schemas.openxmlformats.org/drawingml/2006/picture">
                   <pic:nvPicPr>
-                    <pic:cNvPr id="763673534" name=""/>
+                    <pic:cNvPr id="1125713913" name=""/>
                     <pic:cNvPicPr/>
                   </pic:nvPicPr>
                   <pic:blipFill>
@@ -17651,16 +17677,16 @@
         </w:rPr>
         <w:lastRenderedPageBreak/>
         <w:drawing>
-          <wp:inline distT="0" distB="0" distL="0" distR="0" wp14:anchorId="4C4C3B9D" wp14:editId="5B14054A">
+          <wp:inline distT="0" distB="0" distL="0" distR="0" wp14:anchorId="72D64610" wp14:editId="3D44ABA2">
             <wp:extent cx="5120640" cy="4627581"/>
             <wp:effectExtent l="19050" t="19050" r="22860" b="20955"/>
-            <wp:docPr id="721017978" name="Imagem 38"/>
+            <wp:docPr id="809764846" name="Imagem 38"/>
             <wp:cNvGraphicFramePr/>
             <a:graphic xmlns:a="http://schemas.openxmlformats.org/drawingml/2006/main">
               <a:graphicData uri="http://schemas.openxmlformats.org/drawingml/2006/picture">
                 <pic:pic xmlns:pic="http://schemas.openxmlformats.org/drawingml/2006/picture">
                   <pic:nvPicPr>
-                    <pic:cNvPr id="721017978" name=""/>
+                    <pic:cNvPr id="809764846" name=""/>
                     <pic:cNvPicPr/>
                   </pic:nvPicPr>
                   <pic:blipFill>
@@ -17829,16 +17855,16 @@
           <w:noProof/>
         </w:rPr>
         <w:drawing>
-          <wp:inline distT="0" distB="0" distL="0" distR="0" wp14:anchorId="691C95E6" wp14:editId="04A9BF0F">
+          <wp:inline distT="0" distB="0" distL="0" distR="0" wp14:anchorId="2E7F1C9A" wp14:editId="40AD41DF">
             <wp:extent cx="5120640" cy="2144319"/>
             <wp:effectExtent l="19050" t="19050" r="22860" b="27940"/>
-            <wp:docPr id="1694611548" name="Imagem 39"/>
+            <wp:docPr id="1721764758" name="Imagem 39"/>
             <wp:cNvGraphicFramePr/>
             <a:graphic xmlns:a="http://schemas.openxmlformats.org/drawingml/2006/main">
               <a:graphicData uri="http://schemas.openxmlformats.org/drawingml/2006/picture">
                 <pic:pic xmlns:pic="http://schemas.openxmlformats.org/drawingml/2006/picture">
                   <pic:nvPicPr>
-                    <pic:cNvPr id="1694611548" name=""/>
+                    <pic:cNvPr id="1721764758" name=""/>
                     <pic:cNvPicPr/>
                   </pic:nvPicPr>
                   <pic:blipFill>
@@ -17926,16 +17952,16 @@
           <w:noProof/>
         </w:rPr>
         <w:drawing>
-          <wp:inline distT="0" distB="0" distL="0" distR="0" wp14:anchorId="5DD6D9A2" wp14:editId="6BE81DAB">
+          <wp:inline distT="0" distB="0" distL="0" distR="0" wp14:anchorId="53E290B8" wp14:editId="5D20B458">
             <wp:extent cx="5120640" cy="1055647"/>
             <wp:effectExtent l="19050" t="19050" r="22860" b="11430"/>
-            <wp:docPr id="590843359" name="Imagem 40"/>
+            <wp:docPr id="745841791" name="Imagem 40"/>
             <wp:cNvGraphicFramePr/>
             <a:graphic xmlns:a="http://schemas.openxmlformats.org/drawingml/2006/main">
               <a:graphicData uri="http://schemas.openxmlformats.org/drawingml/2006/picture">
                 <pic:pic xmlns:pic="http://schemas.openxmlformats.org/drawingml/2006/picture">
                   <pic:nvPicPr>
-                    <pic:cNvPr id="590843359" name=""/>
+                    <pic:cNvPr id="745841791" name=""/>
                     <pic:cNvPicPr/>
                   </pic:nvPicPr>
                   <pic:blipFill>
@@ -18057,16 +18083,16 @@
           <w:noProof/>
         </w:rPr>
         <w:drawing>
-          <wp:inline distT="0" distB="0" distL="0" distR="0" wp14:anchorId="20F49807" wp14:editId="2F916E8A">
+          <wp:inline distT="0" distB="0" distL="0" distR="0" wp14:anchorId="4FDD2D0C" wp14:editId="2DE6E508">
             <wp:extent cx="5120640" cy="3282818"/>
             <wp:effectExtent l="19050" t="19050" r="22860" b="13335"/>
-            <wp:docPr id="755788070" name="Imagem 41"/>
+            <wp:docPr id="933288124" name="Imagem 41"/>
             <wp:cNvGraphicFramePr/>
             <a:graphic xmlns:a="http://schemas.openxmlformats.org/drawingml/2006/main">
               <a:graphicData uri="http://schemas.openxmlformats.org/drawingml/2006/picture">
                 <pic:pic xmlns:pic="http://schemas.openxmlformats.org/drawingml/2006/picture">
                   <pic:nvPicPr>
-                    <pic:cNvPr id="755788070" name=""/>
+                    <pic:cNvPr id="933288124" name=""/>
                     <pic:cNvPicPr/>
                   </pic:nvPicPr>
                   <pic:blipFill>
@@ -18200,16 +18226,16 @@
         </w:rPr>
         <w:lastRenderedPageBreak/>
         <w:drawing>
-          <wp:inline distT="0" distB="0" distL="0" distR="0" wp14:anchorId="77ECD8DB" wp14:editId="49DE9163">
+          <wp:inline distT="0" distB="0" distL="0" distR="0" wp14:anchorId="66BC38C3" wp14:editId="4B3E8CED">
             <wp:extent cx="5120640" cy="1978034"/>
             <wp:effectExtent l="19050" t="19050" r="22860" b="22225"/>
-            <wp:docPr id="1694494694" name="Imagem 42"/>
+            <wp:docPr id="279666101" name="Imagem 42"/>
             <wp:cNvGraphicFramePr/>
             <a:graphic xmlns:a="http://schemas.openxmlformats.org/drawingml/2006/main">
               <a:graphicData uri="http://schemas.openxmlformats.org/drawingml/2006/picture">
                 <pic:pic xmlns:pic="http://schemas.openxmlformats.org/drawingml/2006/picture">
                   <pic:nvPicPr>
-                    <pic:cNvPr id="1694494694" name=""/>
+                    <pic:cNvPr id="279666101" name=""/>
                     <pic:cNvPicPr/>
                   </pic:nvPicPr>
                   <pic:blipFill>
@@ -18281,7 +18307,7 @@
           <w:sz w:val="34"/>
         </w:rPr>
       </w:pPr>
-      <w:bookmarkStart w:id="33" w:name="_Toc240275458"/>
+      <w:bookmarkStart w:id="33" w:name="_Toc240276740"/>
       <w:r>
         <w:rPr>
           <w:rFonts w:ascii="Montserrat" w:hAnsi="Montserrat"/>
@@ -18341,7 +18367,7 @@
           <w:sz w:val="27"/>
         </w:rPr>
       </w:pPr>
-      <w:bookmarkStart w:id="34" w:name="_Toc240275459"/>
+      <w:bookmarkStart w:id="34" w:name="_Toc240276741"/>
       <w:r>
         <w:rPr>
           <w:rFonts w:ascii="Montserrat" w:hAnsi="Montserrat"/>
@@ -18381,16 +18407,16 @@
           <w:noProof/>
         </w:rPr>
         <w:drawing>
-          <wp:inline distT="0" distB="0" distL="0" distR="0" wp14:anchorId="020FCD0D" wp14:editId="109CF082">
+          <wp:inline distT="0" distB="0" distL="0" distR="0" wp14:anchorId="5AA69728" wp14:editId="5A1AA1F1">
             <wp:extent cx="5303520" cy="4792851"/>
             <wp:effectExtent l="19050" t="19050" r="11430" b="27305"/>
-            <wp:docPr id="304763050" name="Imagem 43"/>
+            <wp:docPr id="312166570" name="Imagem 43"/>
             <wp:cNvGraphicFramePr/>
             <a:graphic xmlns:a="http://schemas.openxmlformats.org/drawingml/2006/main">
               <a:graphicData uri="http://schemas.openxmlformats.org/drawingml/2006/picture">
                 <pic:pic xmlns:pic="http://schemas.openxmlformats.org/drawingml/2006/picture">
                   <pic:nvPicPr>
-                    <pic:cNvPr id="304763050" name=""/>
+                    <pic:cNvPr id="312166570" name=""/>
                     <pic:cNvPicPr/>
                   </pic:nvPicPr>
                   <pic:blipFill>
@@ -18459,7 +18485,7 @@
           <w:sz w:val="27"/>
         </w:rPr>
       </w:pPr>
-      <w:bookmarkStart w:id="35" w:name="_Toc240275460"/>
+      <w:bookmarkStart w:id="35" w:name="_Toc240276742"/>
       <w:r>
         <w:rPr>
           <w:rFonts w:ascii="Montserrat" w:hAnsi="Montserrat"/>
@@ -18499,16 +18525,16 @@
           <w:noProof/>
         </w:rPr>
         <w:drawing>
-          <wp:inline distT="0" distB="0" distL="0" distR="0" wp14:anchorId="1ADB0E54" wp14:editId="1AAC7F2C">
+          <wp:inline distT="0" distB="0" distL="0" distR="0" wp14:anchorId="0BBAC2C3" wp14:editId="01197315">
             <wp:extent cx="5303520" cy="4792851"/>
             <wp:effectExtent l="19050" t="19050" r="11430" b="27305"/>
-            <wp:docPr id="302334463" name="Imagem 44"/>
+            <wp:docPr id="46211123" name="Imagem 44"/>
             <wp:cNvGraphicFramePr/>
             <a:graphic xmlns:a="http://schemas.openxmlformats.org/drawingml/2006/main">
               <a:graphicData uri="http://schemas.openxmlformats.org/drawingml/2006/picture">
                 <pic:pic xmlns:pic="http://schemas.openxmlformats.org/drawingml/2006/picture">
                   <pic:nvPicPr>
-                    <pic:cNvPr id="302334463" name=""/>
+                    <pic:cNvPr id="46211123" name=""/>
                     <pic:cNvPicPr/>
                   </pic:nvPicPr>
                   <pic:blipFill>
@@ -18576,7 +18602,7 @@
           <w:sz w:val="27"/>
         </w:rPr>
       </w:pPr>
-      <w:bookmarkStart w:id="36" w:name="_Toc240275461"/>
+      <w:bookmarkStart w:id="36" w:name="_Toc240276743"/>
       <w:r>
         <w:rPr>
           <w:rFonts w:ascii="Montserrat" w:hAnsi="Montserrat"/>
@@ -18617,16 +18643,16 @@
         </w:rPr>
         <w:lastRenderedPageBreak/>
         <w:drawing>
-          <wp:inline distT="0" distB="0" distL="0" distR="0" wp14:anchorId="00772F25" wp14:editId="25EC51C1">
+          <wp:inline distT="0" distB="0" distL="0" distR="0" wp14:anchorId="7032612D" wp14:editId="4221D21A">
             <wp:extent cx="5303520" cy="4792851"/>
             <wp:effectExtent l="19050" t="19050" r="11430" b="27305"/>
-            <wp:docPr id="1019308751" name="Imagem 45"/>
+            <wp:docPr id="2046047921" name="Imagem 45"/>
             <wp:cNvGraphicFramePr/>
             <a:graphic xmlns:a="http://schemas.openxmlformats.org/drawingml/2006/main">
               <a:graphicData uri="http://schemas.openxmlformats.org/drawingml/2006/picture">
                 <pic:pic xmlns:pic="http://schemas.openxmlformats.org/drawingml/2006/picture">
                   <pic:nvPicPr>
-                    <pic:cNvPr id="1019308751" name=""/>
+                    <pic:cNvPr id="2046047921" name=""/>
                     <pic:cNvPicPr/>
                   </pic:nvPicPr>
                   <pic:blipFill>
@@ -18694,16 +18720,16 @@
         </w:rPr>
         <w:lastRenderedPageBreak/>
         <w:drawing>
-          <wp:inline distT="0" distB="0" distL="0" distR="0" wp14:anchorId="35B8FBFE" wp14:editId="18CB7E70">
+          <wp:inline distT="0" distB="0" distL="0" distR="0" wp14:anchorId="19F60D51" wp14:editId="0FD5B02B">
             <wp:extent cx="5303520" cy="4792851"/>
             <wp:effectExtent l="19050" t="19050" r="11430" b="27305"/>
-            <wp:docPr id="505046591" name="Imagem 46"/>
+            <wp:docPr id="1493895599" name="Imagem 46"/>
             <wp:cNvGraphicFramePr/>
             <a:graphic xmlns:a="http://schemas.openxmlformats.org/drawingml/2006/main">
               <a:graphicData uri="http://schemas.openxmlformats.org/drawingml/2006/picture">
                 <pic:pic xmlns:pic="http://schemas.openxmlformats.org/drawingml/2006/picture">
                   <pic:nvPicPr>
-                    <pic:cNvPr id="505046591" name=""/>
+                    <pic:cNvPr id="1493895599" name=""/>
                     <pic:cNvPicPr/>
                   </pic:nvPicPr>
                   <pic:blipFill>
@@ -18796,7 +18822,7 @@
           <w:sz w:val="34"/>
         </w:rPr>
       </w:pPr>
-      <w:bookmarkStart w:id="37" w:name="_Toc240275462"/>
+      <w:bookmarkStart w:id="37" w:name="_Toc240276744"/>
       <w:r>
         <w:rPr>
           <w:rFonts w:ascii="Montserrat" w:hAnsi="Montserrat"/>
@@ -18838,7 +18864,7 @@
           <w:sz w:val="27"/>
         </w:rPr>
       </w:pPr>
-      <w:bookmarkStart w:id="38" w:name="_Toc240275463"/>
+      <w:bookmarkStart w:id="38" w:name="_Toc240276745"/>
       <w:r>
         <w:rPr>
           <w:rFonts w:ascii="Montserrat" w:hAnsi="Montserrat"/>
@@ -18878,16 +18904,16 @@
           <w:noProof/>
         </w:rPr>
         <w:drawing>
-          <wp:inline distT="0" distB="0" distL="0" distR="0" wp14:anchorId="2BD96623" wp14:editId="44DEE68A">
+          <wp:inline distT="0" distB="0" distL="0" distR="0" wp14:anchorId="42F56F05" wp14:editId="033CF5D5">
             <wp:extent cx="5303520" cy="4792851"/>
             <wp:effectExtent l="19050" t="19050" r="11430" b="27305"/>
-            <wp:docPr id="1309063155" name="Imagem 47"/>
+            <wp:docPr id="635646713" name="Imagem 47"/>
             <wp:cNvGraphicFramePr/>
             <a:graphic xmlns:a="http://schemas.openxmlformats.org/drawingml/2006/main">
               <a:graphicData uri="http://schemas.openxmlformats.org/drawingml/2006/picture">
                 <pic:pic xmlns:pic="http://schemas.openxmlformats.org/drawingml/2006/picture">
                   <pic:nvPicPr>
-                    <pic:cNvPr id="1309063155" name=""/>
+                    <pic:cNvPr id="635646713" name=""/>
                     <pic:cNvPicPr/>
                   </pic:nvPicPr>
                   <pic:blipFill>
@@ -19116,7 +19142,7 @@
           <w:sz w:val="27"/>
         </w:rPr>
       </w:pPr>
-      <w:bookmarkStart w:id="39" w:name="_Toc240275464"/>
+      <w:bookmarkStart w:id="39" w:name="_Toc240276746"/>
       <w:r>
         <w:rPr>
           <w:rFonts w:ascii="Montserrat" w:hAnsi="Montserrat"/>
@@ -19156,16 +19182,16 @@
           <w:noProof/>
         </w:rPr>
         <w:drawing>
-          <wp:inline distT="0" distB="0" distL="0" distR="0" wp14:anchorId="3690B784" wp14:editId="6DB80F7C">
+          <wp:inline distT="0" distB="0" distL="0" distR="0" wp14:anchorId="7A97E0AC" wp14:editId="5973D859">
             <wp:extent cx="5303520" cy="4792851"/>
             <wp:effectExtent l="19050" t="19050" r="11430" b="27305"/>
-            <wp:docPr id="1810224478" name="Imagem 48"/>
+            <wp:docPr id="1651759948" name="Imagem 48"/>
             <wp:cNvGraphicFramePr/>
             <a:graphic xmlns:a="http://schemas.openxmlformats.org/drawingml/2006/main">
               <a:graphicData uri="http://schemas.openxmlformats.org/drawingml/2006/picture">
                 <pic:pic xmlns:pic="http://schemas.openxmlformats.org/drawingml/2006/picture">
                   <pic:nvPicPr>
-                    <pic:cNvPr id="1810224478" name=""/>
+                    <pic:cNvPr id="1651759948" name=""/>
                     <pic:cNvPicPr/>
                   </pic:nvPicPr>
                   <pic:blipFill>
@@ -19233,7 +19259,7 @@
           <w:sz w:val="27"/>
         </w:rPr>
       </w:pPr>
-      <w:bookmarkStart w:id="40" w:name="_Toc240275465"/>
+      <w:bookmarkStart w:id="40" w:name="_Toc240276747"/>
       <w:r>
         <w:rPr>
           <w:rFonts w:ascii="Montserrat" w:hAnsi="Montserrat"/>
@@ -19274,16 +19300,16 @@
         </w:rPr>
         <w:lastRenderedPageBreak/>
         <w:drawing>
-          <wp:inline distT="0" distB="0" distL="0" distR="0" wp14:anchorId="1E8AA9EE" wp14:editId="7754CDBC">
+          <wp:inline distT="0" distB="0" distL="0" distR="0" wp14:anchorId="717E23AE" wp14:editId="2E24E3BF">
             <wp:extent cx="5303520" cy="4792851"/>
             <wp:effectExtent l="19050" t="19050" r="11430" b="27305"/>
-            <wp:docPr id="232444497" name="Imagem 49"/>
+            <wp:docPr id="1236100670" name="Imagem 49"/>
             <wp:cNvGraphicFramePr/>
             <a:graphic xmlns:a="http://schemas.openxmlformats.org/drawingml/2006/main">
               <a:graphicData uri="http://schemas.openxmlformats.org/drawingml/2006/picture">
                 <pic:pic xmlns:pic="http://schemas.openxmlformats.org/drawingml/2006/picture">
                   <pic:nvPicPr>
-                    <pic:cNvPr id="232444497" name=""/>
+                    <pic:cNvPr id="1236100670" name=""/>
                     <pic:cNvPicPr/>
                   </pic:nvPicPr>
                   <pic:blipFill>
@@ -19427,7 +19453,7 @@
           <w:sz w:val="27"/>
         </w:rPr>
       </w:pPr>
-      <w:bookmarkStart w:id="41" w:name="_Toc240275466"/>
+      <w:bookmarkStart w:id="41" w:name="_Toc240276748"/>
       <w:r>
         <w:rPr>
           <w:rFonts w:ascii="Montserrat" w:hAnsi="Montserrat"/>
@@ -19692,16 +19718,16 @@
           <w:noProof/>
         </w:rPr>
         <w:drawing>
-          <wp:inline distT="0" distB="0" distL="0" distR="0" wp14:anchorId="7673629A" wp14:editId="5597A727">
+          <wp:inline distT="0" distB="0" distL="0" distR="0" wp14:anchorId="4EEA5A75" wp14:editId="601B75C4">
             <wp:extent cx="5303520" cy="4267180"/>
             <wp:effectExtent l="19050" t="19050" r="11430" b="19685"/>
-            <wp:docPr id="1476041260" name="Imagem 50"/>
+            <wp:docPr id="1008686196" name="Imagem 50"/>
             <wp:cNvGraphicFramePr/>
             <a:graphic xmlns:a="http://schemas.openxmlformats.org/drawingml/2006/main">
               <a:graphicData uri="http://schemas.openxmlformats.org/drawingml/2006/picture">
                 <pic:pic xmlns:pic="http://schemas.openxmlformats.org/drawingml/2006/picture">
                   <pic:nvPicPr>
-                    <pic:cNvPr id="1476041260" name=""/>
+                    <pic:cNvPr id="1008686196" name=""/>
                     <pic:cNvPicPr/>
                   </pic:nvPicPr>
                   <pic:blipFill>
@@ -19769,16 +19795,16 @@
           <w:noProof/>
         </w:rPr>
         <w:drawing>
-          <wp:inline distT="0" distB="0" distL="0" distR="0" wp14:anchorId="74BE17A1" wp14:editId="73B7AFF3">
+          <wp:inline distT="0" distB="0" distL="0" distR="0" wp14:anchorId="091597C7" wp14:editId="4826C076">
             <wp:extent cx="5303520" cy="3382059"/>
             <wp:effectExtent l="19050" t="19050" r="11430" b="27940"/>
-            <wp:docPr id="99214307" name="Imagem 51"/>
+            <wp:docPr id="210967118" name="Imagem 51"/>
             <wp:cNvGraphicFramePr/>
             <a:graphic xmlns:a="http://schemas.openxmlformats.org/drawingml/2006/main">
               <a:graphicData uri="http://schemas.openxmlformats.org/drawingml/2006/picture">
                 <pic:pic xmlns:pic="http://schemas.openxmlformats.org/drawingml/2006/picture">
                   <pic:nvPicPr>
-                    <pic:cNvPr id="99214307" name=""/>
+                    <pic:cNvPr id="210967118" name=""/>
                     <pic:cNvPicPr/>
                   </pic:nvPicPr>
                   <pic:blipFill>
@@ -19846,16 +19872,16 @@
         </w:rPr>
         <w:lastRenderedPageBreak/>
         <w:drawing>
-          <wp:inline distT="0" distB="0" distL="0" distR="0" wp14:anchorId="0023A61C" wp14:editId="4042414B">
+          <wp:inline distT="0" distB="0" distL="0" distR="0" wp14:anchorId="498C80AC" wp14:editId="670B2C25">
             <wp:extent cx="5303520" cy="4417800"/>
             <wp:effectExtent l="19050" t="19050" r="11430" b="20955"/>
-            <wp:docPr id="257937320" name="Imagem 52"/>
+            <wp:docPr id="1064224777" name="Imagem 52"/>
             <wp:cNvGraphicFramePr/>
             <a:graphic xmlns:a="http://schemas.openxmlformats.org/drawingml/2006/main">
               <a:graphicData uri="http://schemas.openxmlformats.org/drawingml/2006/picture">
                 <pic:pic xmlns:pic="http://schemas.openxmlformats.org/drawingml/2006/picture">
                   <pic:nvPicPr>
-                    <pic:cNvPr id="257937320" name=""/>
+                    <pic:cNvPr id="1064224777" name=""/>
                     <pic:cNvPicPr/>
                   </pic:nvPicPr>
                   <pic:blipFill>
@@ -19965,7 +19991,7 @@
           <w:sz w:val="27"/>
         </w:rPr>
       </w:pPr>
-      <w:bookmarkStart w:id="42" w:name="_Toc240275467"/>
+      <w:bookmarkStart w:id="42" w:name="_Toc240276749"/>
       <w:r>
         <w:rPr>
           <w:rFonts w:ascii="Montserrat" w:hAnsi="Montserrat"/>
@@ -20231,16 +20257,16 @@
         </w:rPr>
         <w:lastRenderedPageBreak/>
         <w:drawing>
-          <wp:inline distT="0" distB="0" distL="0" distR="0" wp14:anchorId="398280F9" wp14:editId="5697681B">
+          <wp:inline distT="0" distB="0" distL="0" distR="0" wp14:anchorId="250F1CC5" wp14:editId="3DACE48B">
             <wp:extent cx="5303520" cy="7628836"/>
             <wp:effectExtent l="19050" t="19050" r="11430" b="10795"/>
-            <wp:docPr id="1249476107" name="Imagem 53"/>
+            <wp:docPr id="1315728070" name="Imagem 53"/>
             <wp:cNvGraphicFramePr/>
             <a:graphic xmlns:a="http://schemas.openxmlformats.org/drawingml/2006/main">
               <a:graphicData uri="http://schemas.openxmlformats.org/drawingml/2006/picture">
                 <pic:pic xmlns:pic="http://schemas.openxmlformats.org/drawingml/2006/picture">
                   <pic:nvPicPr>
-                    <pic:cNvPr id="1249476107" name=""/>
+                    <pic:cNvPr id="1315728070" name=""/>
                     <pic:cNvPicPr/>
                   </pic:nvPicPr>
                   <pic:blipFill>
@@ -20372,7 +20398,7 @@
           <w:sz w:val="27"/>
         </w:rPr>
       </w:pPr>
-      <w:bookmarkStart w:id="43" w:name="_Toc240275468"/>
+      <w:bookmarkStart w:id="43" w:name="_Toc240276750"/>
       <w:r>
         <w:rPr>
           <w:rFonts w:ascii="Montserrat" w:hAnsi="Montserrat"/>
@@ -20525,7 +20551,7 @@
           <w:sz w:val="27"/>
         </w:rPr>
       </w:pPr>
-      <w:bookmarkStart w:id="44" w:name="_Toc240275469"/>
+      <w:bookmarkStart w:id="44" w:name="_Toc240276751"/>
       <w:r>
         <w:rPr>
           <w:rFonts w:ascii="Montserrat" w:hAnsi="Montserrat"/>
@@ -20818,16 +20844,16 @@
           <w:noProof/>
         </w:rPr>
         <w:drawing>
-          <wp:inline distT="0" distB="0" distL="0" distR="0" wp14:anchorId="7B856E9A" wp14:editId="15575368">
+          <wp:inline distT="0" distB="0" distL="0" distR="0" wp14:anchorId="720ADA24" wp14:editId="0D322D77">
             <wp:extent cx="5303520" cy="1351384"/>
             <wp:effectExtent l="19050" t="19050" r="11430" b="20320"/>
-            <wp:docPr id="1826309163" name="Imagem 54"/>
+            <wp:docPr id="1771898746" name="Imagem 54"/>
             <wp:cNvGraphicFramePr/>
             <a:graphic xmlns:a="http://schemas.openxmlformats.org/drawingml/2006/main">
               <a:graphicData uri="http://schemas.openxmlformats.org/drawingml/2006/picture">
                 <pic:pic xmlns:pic="http://schemas.openxmlformats.org/drawingml/2006/picture">
                   <pic:nvPicPr>
-                    <pic:cNvPr id="1826309163" name=""/>
+                    <pic:cNvPr id="1771898746" name=""/>
                     <pic:cNvPicPr/>
                   </pic:nvPicPr>
                   <pic:blipFill>
@@ -20895,7 +20921,7 @@
           <w:sz w:val="27"/>
         </w:rPr>
       </w:pPr>
-      <w:bookmarkStart w:id="45" w:name="_Toc240275470"/>
+      <w:bookmarkStart w:id="45" w:name="_Toc240276752"/>
       <w:r>
         <w:rPr>
           <w:rFonts w:ascii="Montserrat" w:hAnsi="Montserrat"/>
@@ -21040,16 +21066,16 @@
           <w:noProof/>
         </w:rPr>
         <w:drawing>
-          <wp:inline distT="0" distB="0" distL="0" distR="0" wp14:anchorId="483D261D" wp14:editId="583D4309">
+          <wp:inline distT="0" distB="0" distL="0" distR="0" wp14:anchorId="6E299AF8" wp14:editId="22F9B86F">
             <wp:extent cx="5303520" cy="1422793"/>
             <wp:effectExtent l="19050" t="19050" r="11430" b="25400"/>
-            <wp:docPr id="13401751" name="Imagem 55"/>
+            <wp:docPr id="649541990" name="Imagem 55"/>
             <wp:cNvGraphicFramePr/>
             <a:graphic xmlns:a="http://schemas.openxmlformats.org/drawingml/2006/main">
               <a:graphicData uri="http://schemas.openxmlformats.org/drawingml/2006/picture">
                 <pic:pic xmlns:pic="http://schemas.openxmlformats.org/drawingml/2006/picture">
                   <pic:nvPicPr>
-                    <pic:cNvPr id="13401751" name=""/>
+                    <pic:cNvPr id="649541990" name=""/>
                     <pic:cNvPicPr/>
                   </pic:nvPicPr>
                   <pic:blipFill>
@@ -21204,16 +21230,16 @@
         </w:rPr>
         <w:lastRenderedPageBreak/>
         <w:drawing>
-          <wp:inline distT="0" distB="0" distL="0" distR="0" wp14:anchorId="71409F47" wp14:editId="6725E058">
+          <wp:inline distT="0" distB="0" distL="0" distR="0" wp14:anchorId="3373D0C3" wp14:editId="5DDA16FA">
             <wp:extent cx="5303520" cy="1841050"/>
             <wp:effectExtent l="19050" t="19050" r="11430" b="26035"/>
-            <wp:docPr id="94736405" name="Imagem 56"/>
+            <wp:docPr id="1637372653" name="Imagem 56"/>
             <wp:cNvGraphicFramePr/>
             <a:graphic xmlns:a="http://schemas.openxmlformats.org/drawingml/2006/main">
               <a:graphicData uri="http://schemas.openxmlformats.org/drawingml/2006/picture">
                 <pic:pic xmlns:pic="http://schemas.openxmlformats.org/drawingml/2006/picture">
                   <pic:nvPicPr>
-                    <pic:cNvPr id="94736405" name=""/>
+                    <pic:cNvPr id="1637372653" name=""/>
                     <pic:cNvPicPr/>
                   </pic:nvPicPr>
                   <pic:blipFill>
@@ -21367,16 +21393,16 @@
           <w:noProof/>
         </w:rPr>
         <w:drawing>
-          <wp:inline distT="0" distB="0" distL="0" distR="0" wp14:anchorId="218607DB" wp14:editId="32780F4C">
+          <wp:inline distT="0" distB="0" distL="0" distR="0" wp14:anchorId="271D12C0" wp14:editId="222A011B">
             <wp:extent cx="5303520" cy="303041"/>
             <wp:effectExtent l="19050" t="19050" r="11430" b="20955"/>
-            <wp:docPr id="63078352" name="Imagem 57"/>
+            <wp:docPr id="1412848412" name="Imagem 57"/>
             <wp:cNvGraphicFramePr/>
             <a:graphic xmlns:a="http://schemas.openxmlformats.org/drawingml/2006/main">
               <a:graphicData uri="http://schemas.openxmlformats.org/drawingml/2006/picture">
                 <pic:pic xmlns:pic="http://schemas.openxmlformats.org/drawingml/2006/picture">
                   <pic:nvPicPr>
-                    <pic:cNvPr id="63078352" name=""/>
+                    <pic:cNvPr id="1412848412" name=""/>
                     <pic:cNvPicPr/>
                   </pic:nvPicPr>
                   <pic:blipFill>
@@ -21444,16 +21470,16 @@
         </w:rPr>
         <w:lastRenderedPageBreak/>
         <w:drawing>
-          <wp:inline distT="0" distB="0" distL="0" distR="0" wp14:anchorId="4AEFC2DD" wp14:editId="66C87774">
+          <wp:inline distT="0" distB="0" distL="0" distR="0" wp14:anchorId="6DFC5B69" wp14:editId="2E7D484D">
             <wp:extent cx="5303520" cy="2983005"/>
             <wp:effectExtent l="19050" t="19050" r="11430" b="27305"/>
-            <wp:docPr id="1628718773" name="Imagem 58"/>
+            <wp:docPr id="1823227822" name="Imagem 58"/>
             <wp:cNvGraphicFramePr/>
             <a:graphic xmlns:a="http://schemas.openxmlformats.org/drawingml/2006/main">
               <a:graphicData uri="http://schemas.openxmlformats.org/drawingml/2006/picture">
                 <pic:pic xmlns:pic="http://schemas.openxmlformats.org/drawingml/2006/picture">
                   <pic:nvPicPr>
-                    <pic:cNvPr id="1628718773" name=""/>
+                    <pic:cNvPr id="1823227822" name=""/>
                     <pic:cNvPicPr/>
                   </pic:nvPicPr>
                   <pic:blipFill>
@@ -21525,7 +21551,7 @@
           <w:sz w:val="34"/>
         </w:rPr>
       </w:pPr>
-      <w:bookmarkStart w:id="46" w:name="_Toc240275471"/>
+      <w:bookmarkStart w:id="46" w:name="_Toc240276753"/>
       <w:r>
         <w:rPr>
           <w:rFonts w:ascii="Montserrat" w:hAnsi="Montserrat"/>
@@ -21769,7 +21795,7 @@
           <w:sz w:val="34"/>
         </w:rPr>
       </w:pPr>
-      <w:bookmarkStart w:id="47" w:name="_Toc240275472"/>
+      <w:bookmarkStart w:id="47" w:name="_Toc240276754"/>
       <w:r>
         <w:rPr>
           <w:rFonts w:ascii="Montserrat" w:hAnsi="Montserrat"/>
@@ -23557,7 +23583,7 @@
 <file path=word/numbering.xml><?xml version="1.0" encoding="utf-8"?>
 <w:numbering xmlns:wpc="http://schemas.microsoft.com/office/word/2010/wordprocessingCanvas" xmlns:cx="http://schemas.microsoft.com/office/drawing/2014/chartex" xmlns:cx1="http://schemas.microsoft.com/office/drawing/2015/9/8/chartex" xmlns:cx2="http://schemas.microsoft.com/office/drawing/2015/10/21/chartex" xmlns:cx3="http://schemas.microsoft.com/office/drawing/2016/5/9/chartex" xmlns:cx4="http://schemas.microsoft.com/office/drawing/2016/5/10/chartex" xmlns:cx5="http://schemas.microsoft.com/office/drawing/2016/5/11/chartex" xmlns:cx6="http://schemas.microsoft.com/office/drawing/2016/5/12/chartex" xmlns:cx7="http://schemas.microsoft.com/office/drawing/2016/5/13/chartex" xmlns:cx8="http://schemas.microsoft.com/office/drawing/2016/5/14/chartex" xmlns:mc="http://schemas.openxmlformats.org/markup-compatibility/2006" xmlns:aink="http://schemas.microsoft.com/office/drawing/2016/ink" xmlns:am3d="http://schemas.microsoft.com/office/drawing/2017/model3d" xmlns:o="urn:schemas-microsoft-com:office:office" xmlns:oel="http://schemas.microsoft.com/office/2019/extlst" xmlns:r="http://schemas.openxmlformats.org/officeDocument/2006/relationships" xmlns:m="http://schemas.openxmlformats.org/officeDocument/2006/math" xmlns:v="urn:schemas-microsoft-com:vml" xmlns:wp14="http://schemas.microsoft.com/office/word/2010/wordprocessingDrawing" xmlns:wp="http://schemas.openxmlformats.org/drawingml/2006/wordprocessingDrawing" xmlns:w10="urn:schemas-microsoft-com:office:word" xmlns:w="http://schemas.openxmlformats.org/wordprocessingml/2006/main" xmlns:w14="http://schemas.microsoft.com/office/word/2010/wordml" xmlns:w15="http://schemas.microsoft.com/office/word/2012/wordml" xmlns:w16cex="http://schemas.microsoft.com/office/word/2018/wordml/cex" xmlns:w16cid="http://schemas.microsoft.com/office/word/2016/wordml/cid" xmlns:w16="http://schemas.microsoft.com/office/word/2018/wordml" xmlns:w16du="http://schemas.microsoft.com/office/word/2023/wordml/word16du" xmlns:w16sdtdh="http://schemas.microsoft.com/office/word/2020/wordml/sdtdatahash" xmlns:w16sdtfl="http://schemas.microsoft.com/office/word/2024/wordml/sdtformatlock" xmlns:w16se="http://schemas.microsoft.com/office/word/2015/wordml/symex" xmlns:wpg="http://schemas.microsoft.com/office/word/2010/wordprocessingGroup" xmlns:wpi="http://schemas.microsoft.com/office/word/2010/wordprocessingInk" xmlns:wne="http://schemas.microsoft.com/office/word/2006/wordml" xmlns:wps="http://schemas.microsoft.com/office/word/2010/wordprocessingShape" mc:Ignorable="w14 w15 w16se w16cid w16 w16cex w16sdtdh w16sdtfl w16du wp14">
   <w:abstractNum w:abstractNumId="0" w15:restartNumberingAfterBreak="0">
-    <w:nsid w:val="001A1AA2"/>
+    <w:nsid w:val="0B241419"/>
     <w:multiLevelType w:val="singleLevel"/>
     <w:tmpl w:val="04160001"/>
     <w:lvl w:ilvl="0">
@@ -23574,7 +23600,7 @@
     </w:lvl>
   </w:abstractNum>
   <w:abstractNum w:abstractNumId="1" w15:restartNumberingAfterBreak="0">
-    <w:nsid w:val="013B6708"/>
+    <w:nsid w:val="0C4E4E40"/>
     <w:multiLevelType w:val="singleLevel"/>
     <w:tmpl w:val="04160001"/>
     <w:lvl w:ilvl="0">
@@ -23591,7 +23617,7 @@
     </w:lvl>
   </w:abstractNum>
   <w:abstractNum w:abstractNumId="2" w15:restartNumberingAfterBreak="0">
-    <w:nsid w:val="01443507"/>
+    <w:nsid w:val="0CB22E0B"/>
     <w:multiLevelType w:val="singleLevel"/>
     <w:tmpl w:val="04160001"/>
     <w:lvl w:ilvl="0">
@@ -23608,7 +23634,7 @@
     </w:lvl>
   </w:abstractNum>
   <w:abstractNum w:abstractNumId="3" w15:restartNumberingAfterBreak="0">
-    <w:nsid w:val="043220D9"/>
+    <w:nsid w:val="12700FD3"/>
     <w:multiLevelType w:val="singleLevel"/>
     <w:tmpl w:val="04160001"/>
     <w:lvl w:ilvl="0">
@@ -23625,7 +23651,7 @@
     </w:lvl>
   </w:abstractNum>
   <w:abstractNum w:abstractNumId="4" w15:restartNumberingAfterBreak="0">
-    <w:nsid w:val="08973A15"/>
+    <w:nsid w:val="168F19DA"/>
     <w:multiLevelType w:val="singleLevel"/>
     <w:tmpl w:val="04160001"/>
     <w:lvl w:ilvl="0">
@@ -23642,7 +23668,7 @@
     </w:lvl>
   </w:abstractNum>
   <w:abstractNum w:abstractNumId="5" w15:restartNumberingAfterBreak="0">
-    <w:nsid w:val="0C4F728A"/>
+    <w:nsid w:val="180413AF"/>
     <w:multiLevelType w:val="singleLevel"/>
     <w:tmpl w:val="04160001"/>
     <w:lvl w:ilvl="0">
@@ -23659,7 +23685,7 @@
     </w:lvl>
   </w:abstractNum>
   <w:abstractNum w:abstractNumId="6" w15:restartNumberingAfterBreak="0">
-    <w:nsid w:val="13C770C8"/>
+    <w:nsid w:val="1BD85BBA"/>
     <w:multiLevelType w:val="singleLevel"/>
     <w:tmpl w:val="04160001"/>
     <w:lvl w:ilvl="0">
@@ -23676,7 +23702,7 @@
     </w:lvl>
   </w:abstractNum>
   <w:abstractNum w:abstractNumId="7" w15:restartNumberingAfterBreak="0">
-    <w:nsid w:val="13FC5AE9"/>
+    <w:nsid w:val="1F5C5365"/>
     <w:multiLevelType w:val="singleLevel"/>
     <w:tmpl w:val="04160001"/>
     <w:lvl w:ilvl="0">
@@ -23693,7 +23719,7 @@
     </w:lvl>
   </w:abstractNum>
   <w:abstractNum w:abstractNumId="8" w15:restartNumberingAfterBreak="0">
-    <w:nsid w:val="149423E7"/>
+    <w:nsid w:val="1FD01609"/>
     <w:multiLevelType w:val="singleLevel"/>
     <w:tmpl w:val="04160001"/>
     <w:lvl w:ilvl="0">
@@ -23710,7 +23736,7 @@
     </w:lvl>
   </w:abstractNum>
   <w:abstractNum w:abstractNumId="9" w15:restartNumberingAfterBreak="0">
-    <w:nsid w:val="183D238F"/>
+    <w:nsid w:val="20FE654A"/>
     <w:multiLevelType w:val="singleLevel"/>
     <w:tmpl w:val="04160001"/>
     <w:lvl w:ilvl="0">
@@ -23727,7 +23753,7 @@
     </w:lvl>
   </w:abstractNum>
   <w:abstractNum w:abstractNumId="10" w15:restartNumberingAfterBreak="0">
-    <w:nsid w:val="21B31A01"/>
+    <w:nsid w:val="26CC2662"/>
     <w:multiLevelType w:val="singleLevel"/>
     <w:tmpl w:val="04160001"/>
     <w:lvl w:ilvl="0">
@@ -23744,7 +23770,7 @@
     </w:lvl>
   </w:abstractNum>
   <w:abstractNum w:abstractNumId="11" w15:restartNumberingAfterBreak="0">
-    <w:nsid w:val="23FE7C4C"/>
+    <w:nsid w:val="2C311AB4"/>
     <w:multiLevelType w:val="singleLevel"/>
     <w:tmpl w:val="04160001"/>
     <w:lvl w:ilvl="0">
@@ -23761,7 +23787,7 @@
     </w:lvl>
   </w:abstractNum>
   <w:abstractNum w:abstractNumId="12" w15:restartNumberingAfterBreak="0">
-    <w:nsid w:val="2E0F21C6"/>
+    <w:nsid w:val="2D13686A"/>
     <w:multiLevelType w:val="singleLevel"/>
     <w:tmpl w:val="04160001"/>
     <w:lvl w:ilvl="0">
@@ -23778,7 +23804,7 @@
     </w:lvl>
   </w:abstractNum>
   <w:abstractNum w:abstractNumId="13" w15:restartNumberingAfterBreak="0">
-    <w:nsid w:val="30C81457"/>
+    <w:nsid w:val="31193F9C"/>
     <w:multiLevelType w:val="singleLevel"/>
     <w:tmpl w:val="04160001"/>
     <w:lvl w:ilvl="0">
@@ -23795,7 +23821,7 @@
     </w:lvl>
   </w:abstractNum>
   <w:abstractNum w:abstractNumId="14" w15:restartNumberingAfterBreak="0">
-    <w:nsid w:val="32B80A4F"/>
+    <w:nsid w:val="322F66B6"/>
     <w:multiLevelType w:val="singleLevel"/>
     <w:tmpl w:val="04160001"/>
     <w:lvl w:ilvl="0">
@@ -23812,7 +23838,7 @@
     </w:lvl>
   </w:abstractNum>
   <w:abstractNum w:abstractNumId="15" w15:restartNumberingAfterBreak="0">
-    <w:nsid w:val="34ED2739"/>
+    <w:nsid w:val="37F6100A"/>
     <w:multiLevelType w:val="singleLevel"/>
     <w:tmpl w:val="04160001"/>
     <w:lvl w:ilvl="0">
@@ -23829,7 +23855,7 @@
     </w:lvl>
   </w:abstractNum>
   <w:abstractNum w:abstractNumId="16" w15:restartNumberingAfterBreak="0">
-    <w:nsid w:val="3A2E2DF6"/>
+    <w:nsid w:val="3F4E427D"/>
     <w:multiLevelType w:val="singleLevel"/>
     <w:tmpl w:val="04160001"/>
     <w:lvl w:ilvl="0">
@@ -23846,7 +23872,7 @@
     </w:lvl>
   </w:abstractNum>
   <w:abstractNum w:abstractNumId="17" w15:restartNumberingAfterBreak="0">
-    <w:nsid w:val="3FCC3041"/>
+    <w:nsid w:val="40BE79BB"/>
     <w:multiLevelType w:val="singleLevel"/>
     <w:tmpl w:val="04160001"/>
     <w:lvl w:ilvl="0">
@@ -23863,7 +23889,7 @@
     </w:lvl>
   </w:abstractNum>
   <w:abstractNum w:abstractNumId="18" w15:restartNumberingAfterBreak="0">
-    <w:nsid w:val="42B84E91"/>
+    <w:nsid w:val="40D7459C"/>
     <w:multiLevelType w:val="singleLevel"/>
     <w:tmpl w:val="04160001"/>
     <w:lvl w:ilvl="0">
@@ -23880,7 +23906,7 @@
     </w:lvl>
   </w:abstractNum>
   <w:abstractNum w:abstractNumId="19" w15:restartNumberingAfterBreak="0">
-    <w:nsid w:val="44F11B2D"/>
+    <w:nsid w:val="423E0F20"/>
     <w:multiLevelType w:val="singleLevel"/>
     <w:tmpl w:val="04160001"/>
     <w:lvl w:ilvl="0">
@@ -23897,7 +23923,7 @@
     </w:lvl>
   </w:abstractNum>
   <w:abstractNum w:abstractNumId="20" w15:restartNumberingAfterBreak="0">
-    <w:nsid w:val="49C72BC6"/>
+    <w:nsid w:val="4E82222D"/>
     <w:multiLevelType w:val="singleLevel"/>
     <w:tmpl w:val="04160001"/>
     <w:lvl w:ilvl="0">
@@ -23914,7 +23940,7 @@
     </w:lvl>
   </w:abstractNum>
   <w:abstractNum w:abstractNumId="21" w15:restartNumberingAfterBreak="0">
-    <w:nsid w:val="4AE624C2"/>
+    <w:nsid w:val="4ECC1AF7"/>
     <w:multiLevelType w:val="singleLevel"/>
     <w:tmpl w:val="04160001"/>
     <w:lvl w:ilvl="0">
@@ -23931,7 +23957,7 @@
     </w:lvl>
   </w:abstractNum>
   <w:abstractNum w:abstractNumId="22" w15:restartNumberingAfterBreak="0">
-    <w:nsid w:val="4F8148A2"/>
+    <w:nsid w:val="50093327"/>
     <w:multiLevelType w:val="singleLevel"/>
     <w:tmpl w:val="04160001"/>
     <w:lvl w:ilvl="0">
@@ -23948,7 +23974,7 @@
     </w:lvl>
   </w:abstractNum>
   <w:abstractNum w:abstractNumId="23" w15:restartNumberingAfterBreak="0">
-    <w:nsid w:val="5F9066B4"/>
+    <w:nsid w:val="5C865592"/>
     <w:multiLevelType w:val="singleLevel"/>
     <w:tmpl w:val="04160001"/>
     <w:lvl w:ilvl="0">
@@ -23965,7 +23991,7 @@
     </w:lvl>
   </w:abstractNum>
   <w:abstractNum w:abstractNumId="24" w15:restartNumberingAfterBreak="0">
-    <w:nsid w:val="5FCC6E8A"/>
+    <w:nsid w:val="5F2B3CE3"/>
     <w:multiLevelType w:val="singleLevel"/>
     <w:tmpl w:val="04160001"/>
     <w:lvl w:ilvl="0">
@@ -23982,7 +24008,7 @@
     </w:lvl>
   </w:abstractNum>
   <w:abstractNum w:abstractNumId="25" w15:restartNumberingAfterBreak="0">
-    <w:nsid w:val="5FFF723C"/>
+    <w:nsid w:val="60393565"/>
     <w:multiLevelType w:val="singleLevel"/>
     <w:tmpl w:val="04160001"/>
     <w:lvl w:ilvl="0">
@@ -23999,7 +24025,7 @@
     </w:lvl>
   </w:abstractNum>
   <w:abstractNum w:abstractNumId="26" w15:restartNumberingAfterBreak="0">
-    <w:nsid w:val="68136ECF"/>
+    <w:nsid w:val="639358EE"/>
     <w:multiLevelType w:val="singleLevel"/>
     <w:tmpl w:val="04160001"/>
     <w:lvl w:ilvl="0">
@@ -24016,7 +24042,7 @@
     </w:lvl>
   </w:abstractNum>
   <w:abstractNum w:abstractNumId="27" w15:restartNumberingAfterBreak="0">
-    <w:nsid w:val="681717E0"/>
+    <w:nsid w:val="68C34238"/>
     <w:multiLevelType w:val="singleLevel"/>
     <w:tmpl w:val="04160001"/>
     <w:lvl w:ilvl="0">
@@ -24033,7 +24059,7 @@
     </w:lvl>
   </w:abstractNum>
   <w:abstractNum w:abstractNumId="28" w15:restartNumberingAfterBreak="0">
-    <w:nsid w:val="6B70799E"/>
+    <w:nsid w:val="6CDD376E"/>
     <w:multiLevelType w:val="singleLevel"/>
     <w:tmpl w:val="04160001"/>
     <w:lvl w:ilvl="0">
@@ -24050,7 +24076,7 @@
     </w:lvl>
   </w:abstractNum>
   <w:abstractNum w:abstractNumId="29" w15:restartNumberingAfterBreak="0">
-    <w:nsid w:val="6C4E465B"/>
+    <w:nsid w:val="705B131A"/>
     <w:multiLevelType w:val="singleLevel"/>
     <w:tmpl w:val="04160001"/>
     <w:lvl w:ilvl="0">
@@ -24067,7 +24093,7 @@
     </w:lvl>
   </w:abstractNum>
   <w:abstractNum w:abstractNumId="30" w15:restartNumberingAfterBreak="0">
-    <w:nsid w:val="733337D7"/>
+    <w:nsid w:val="744002CB"/>
     <w:multiLevelType w:val="singleLevel"/>
     <w:tmpl w:val="04160001"/>
     <w:lvl w:ilvl="0">
@@ -24084,7 +24110,7 @@
     </w:lvl>
   </w:abstractNum>
   <w:abstractNum w:abstractNumId="31" w15:restartNumberingAfterBreak="0">
-    <w:nsid w:val="77CF0F2A"/>
+    <w:nsid w:val="78D67F1E"/>
     <w:multiLevelType w:val="singleLevel"/>
     <w:tmpl w:val="04160001"/>
     <w:lvl w:ilvl="0">
@@ -24101,7 +24127,7 @@
     </w:lvl>
   </w:abstractNum>
   <w:abstractNum w:abstractNumId="32" w15:restartNumberingAfterBreak="0">
-    <w:nsid w:val="77E729B9"/>
+    <w:nsid w:val="7EDE7018"/>
     <w:multiLevelType w:val="singleLevel"/>
     <w:tmpl w:val="04160001"/>
     <w:lvl w:ilvl="0">
@@ -24117,104 +24143,104 @@
       </w:rPr>
     </w:lvl>
   </w:abstractNum>
-  <w:num w:numId="1" w16cid:durableId="1099981576">
+  <w:num w:numId="1" w16cid:durableId="1621495308">
+    <w:abstractNumId w:val="8"/>
+  </w:num>
+  <w:num w:numId="2" w16cid:durableId="846136817">
+    <w:abstractNumId w:val="11"/>
+  </w:num>
+  <w:num w:numId="3" w16cid:durableId="1972008877">
+    <w:abstractNumId w:val="0"/>
+  </w:num>
+  <w:num w:numId="4" w16cid:durableId="1538540893">
+    <w:abstractNumId w:val="22"/>
+  </w:num>
+  <w:num w:numId="5" w16cid:durableId="2134320671">
+    <w:abstractNumId w:val="10"/>
+  </w:num>
+  <w:num w:numId="6" w16cid:durableId="1912808065">
     <w:abstractNumId w:val="29"/>
   </w:num>
-  <w:num w:numId="2" w16cid:durableId="928270619">
+  <w:num w:numId="7" w16cid:durableId="1611469792">
+    <w:abstractNumId w:val="6"/>
+  </w:num>
+  <w:num w:numId="8" w16cid:durableId="1204489401">
+    <w:abstractNumId w:val="17"/>
+  </w:num>
+  <w:num w:numId="9" w16cid:durableId="113064946">
+    <w:abstractNumId w:val="31"/>
+  </w:num>
+  <w:num w:numId="10" w16cid:durableId="328602034">
+    <w:abstractNumId w:val="2"/>
+  </w:num>
+  <w:num w:numId="11" w16cid:durableId="240993826">
+    <w:abstractNumId w:val="20"/>
+  </w:num>
+  <w:num w:numId="12" w16cid:durableId="782581015">
+    <w:abstractNumId w:val="23"/>
+  </w:num>
+  <w:num w:numId="13" w16cid:durableId="2037580681">
+    <w:abstractNumId w:val="18"/>
+  </w:num>
+  <w:num w:numId="14" w16cid:durableId="315649108">
+    <w:abstractNumId w:val="14"/>
+  </w:num>
+  <w:num w:numId="15" w16cid:durableId="549342546">
+    <w:abstractNumId w:val="3"/>
+  </w:num>
+  <w:num w:numId="16" w16cid:durableId="784617897">
+    <w:abstractNumId w:val="30"/>
+  </w:num>
+  <w:num w:numId="17" w16cid:durableId="997465317">
+    <w:abstractNumId w:val="12"/>
+  </w:num>
+  <w:num w:numId="18" w16cid:durableId="1420560869">
+    <w:abstractNumId w:val="15"/>
+  </w:num>
+  <w:num w:numId="19" w16cid:durableId="222065461">
+    <w:abstractNumId w:val="5"/>
+  </w:num>
+  <w:num w:numId="20" w16cid:durableId="1156267541">
+    <w:abstractNumId w:val="24"/>
+  </w:num>
+  <w:num w:numId="21" w16cid:durableId="1430928528">
+    <w:abstractNumId w:val="13"/>
+  </w:num>
+  <w:num w:numId="22" w16cid:durableId="1864436302">
+    <w:abstractNumId w:val="4"/>
+  </w:num>
+  <w:num w:numId="23" w16cid:durableId="223954063">
+    <w:abstractNumId w:val="27"/>
+  </w:num>
+  <w:num w:numId="24" w16cid:durableId="654645480">
+    <w:abstractNumId w:val="9"/>
+  </w:num>
+  <w:num w:numId="25" w16cid:durableId="1242834808">
+    <w:abstractNumId w:val="28"/>
+  </w:num>
+  <w:num w:numId="26" w16cid:durableId="1679119759">
+    <w:abstractNumId w:val="1"/>
+  </w:num>
+  <w:num w:numId="27" w16cid:durableId="797145044">
+    <w:abstractNumId w:val="21"/>
+  </w:num>
+  <w:num w:numId="28" w16cid:durableId="1294170338">
+    <w:abstractNumId w:val="16"/>
+  </w:num>
+  <w:num w:numId="29" w16cid:durableId="10911030">
+    <w:abstractNumId w:val="26"/>
+  </w:num>
+  <w:num w:numId="30" w16cid:durableId="786124868">
+    <w:abstractNumId w:val="32"/>
+  </w:num>
+  <w:num w:numId="31" w16cid:durableId="1798911568">
     <w:abstractNumId w:val="25"/>
   </w:num>
-  <w:num w:numId="3" w16cid:durableId="231543458">
-    <w:abstractNumId w:val="2"/>
+  <w:num w:numId="32" w16cid:durableId="732968768">
+    <w:abstractNumId w:val="19"/>
   </w:num>
-  <w:num w:numId="4" w16cid:durableId="1269510937">
-    <w:abstractNumId w:val="1"/>
-  </w:num>
-  <w:num w:numId="5" w16cid:durableId="1419983274">
-    <w:abstractNumId w:val="27"/>
-  </w:num>
-  <w:num w:numId="6" w16cid:durableId="77871286">
-    <w:abstractNumId w:val="26"/>
-  </w:num>
-  <w:num w:numId="7" w16cid:durableId="1249802842">
-    <w:abstractNumId w:val="12"/>
-  </w:num>
-  <w:num w:numId="8" w16cid:durableId="97872315">
-    <w:abstractNumId w:val="4"/>
-  </w:num>
-  <w:num w:numId="9" w16cid:durableId="634724899">
-    <w:abstractNumId w:val="18"/>
-  </w:num>
-  <w:num w:numId="10" w16cid:durableId="1586458435">
-    <w:abstractNumId w:val="11"/>
-  </w:num>
-  <w:num w:numId="11" w16cid:durableId="1533684858">
-    <w:abstractNumId w:val="32"/>
-  </w:num>
-  <w:num w:numId="12" w16cid:durableId="544409961">
-    <w:abstractNumId w:val="15"/>
-  </w:num>
-  <w:num w:numId="13" w16cid:durableId="585457560">
-    <w:abstractNumId w:val="3"/>
-  </w:num>
-  <w:num w:numId="14" w16cid:durableId="2005936318">
-    <w:abstractNumId w:val="17"/>
-  </w:num>
-  <w:num w:numId="15" w16cid:durableId="3867077">
-    <w:abstractNumId w:val="0"/>
-  </w:num>
-  <w:num w:numId="16" w16cid:durableId="473176721">
-    <w:abstractNumId w:val="30"/>
-  </w:num>
-  <w:num w:numId="17" w16cid:durableId="2014137532">
-    <w:abstractNumId w:val="9"/>
-  </w:num>
-  <w:num w:numId="18" w16cid:durableId="966086922">
-    <w:abstractNumId w:val="13"/>
-  </w:num>
-  <w:num w:numId="19" w16cid:durableId="1741637486">
+  <w:num w:numId="33" w16cid:durableId="1191725588">
     <w:abstractNumId w:val="7"/>
-  </w:num>
-  <w:num w:numId="20" w16cid:durableId="122165104">
-    <w:abstractNumId w:val="28"/>
-  </w:num>
-  <w:num w:numId="21" w16cid:durableId="605843531">
-    <w:abstractNumId w:val="14"/>
-  </w:num>
-  <w:num w:numId="22" w16cid:durableId="918056435">
-    <w:abstractNumId w:val="21"/>
-  </w:num>
-  <w:num w:numId="23" w16cid:durableId="130295740">
-    <w:abstractNumId w:val="5"/>
-  </w:num>
-  <w:num w:numId="24" w16cid:durableId="514808311">
-    <w:abstractNumId w:val="8"/>
-  </w:num>
-  <w:num w:numId="25" w16cid:durableId="1307199030">
-    <w:abstractNumId w:val="22"/>
-  </w:num>
-  <w:num w:numId="26" w16cid:durableId="244267971">
-    <w:abstractNumId w:val="31"/>
-  </w:num>
-  <w:num w:numId="27" w16cid:durableId="1617982120">
-    <w:abstractNumId w:val="24"/>
-  </w:num>
-  <w:num w:numId="28" w16cid:durableId="896818771">
-    <w:abstractNumId w:val="23"/>
-  </w:num>
-  <w:num w:numId="29" w16cid:durableId="771973246">
-    <w:abstractNumId w:val="6"/>
-  </w:num>
-  <w:num w:numId="30" w16cid:durableId="598417370">
-    <w:abstractNumId w:val="10"/>
-  </w:num>
-  <w:num w:numId="31" w16cid:durableId="49693548">
-    <w:abstractNumId w:val="16"/>
-  </w:num>
-  <w:num w:numId="32" w16cid:durableId="282347336">
-    <w:abstractNumId w:val="20"/>
-  </w:num>
-  <w:num w:numId="33" w16cid:durableId="186599310">
-    <w:abstractNumId w:val="19"/>
   </w:num>
 </w:numbering>
 </file>
@@ -24627,7 +24653,7 @@
     <w:link w:val="Ttulo1Char"/>
     <w:uiPriority w:val="9"/>
     <w:qFormat/>
-    <w:rsid w:val="0047292B"/>
+    <w:rsid w:val="004F6F0F"/>
     <w:pPr>
       <w:keepNext/>
       <w:keepLines/>
@@ -24649,7 +24675,7 @@
     <w:uiPriority w:val="9"/>
     <w:unhideWhenUsed/>
     <w:qFormat/>
-    <w:rsid w:val="0047292B"/>
+    <w:rsid w:val="004F6F0F"/>
     <w:pPr>
       <w:keepNext/>
       <w:keepLines/>
@@ -24672,7 +24698,7 @@
     <w:semiHidden/>
     <w:unhideWhenUsed/>
     <w:qFormat/>
-    <w:rsid w:val="0047292B"/>
+    <w:rsid w:val="004F6F0F"/>
     <w:pPr>
       <w:keepNext/>
       <w:keepLines/>
@@ -24695,7 +24721,7 @@
     <w:semiHidden/>
     <w:unhideWhenUsed/>
     <w:qFormat/>
-    <w:rsid w:val="0047292B"/>
+    <w:rsid w:val="004F6F0F"/>
     <w:pPr>
       <w:keepNext/>
       <w:keepLines/>
@@ -24718,7 +24744,7 @@
     <w:semiHidden/>
     <w:unhideWhenUsed/>
     <w:qFormat/>
-    <w:rsid w:val="0047292B"/>
+    <w:rsid w:val="004F6F0F"/>
     <w:pPr>
       <w:keepNext/>
       <w:keepLines/>
@@ -24739,7 +24765,7 @@
     <w:semiHidden/>
     <w:unhideWhenUsed/>
     <w:qFormat/>
-    <w:rsid w:val="0047292B"/>
+    <w:rsid w:val="004F6F0F"/>
     <w:pPr>
       <w:keepNext/>
       <w:keepLines/>
@@ -24762,7 +24788,7 @@
     <w:semiHidden/>
     <w:unhideWhenUsed/>
     <w:qFormat/>
-    <w:rsid w:val="0047292B"/>
+    <w:rsid w:val="004F6F0F"/>
     <w:pPr>
       <w:keepNext/>
       <w:keepLines/>
@@ -24783,7 +24809,7 @@
     <w:semiHidden/>
     <w:unhideWhenUsed/>
     <w:qFormat/>
-    <w:rsid w:val="0047292B"/>
+    <w:rsid w:val="004F6F0F"/>
     <w:pPr>
       <w:keepNext/>
       <w:keepLines/>
@@ -24806,7 +24832,7 @@
     <w:semiHidden/>
     <w:unhideWhenUsed/>
     <w:qFormat/>
-    <w:rsid w:val="0047292B"/>
+    <w:rsid w:val="004F6F0F"/>
     <w:pPr>
       <w:keepNext/>
       <w:keepLines/>
@@ -24850,7 +24876,7 @@
     <w:basedOn w:val="Fontepargpadro"/>
     <w:link w:val="Ttulo1"/>
     <w:uiPriority w:val="9"/>
-    <w:rsid w:val="0047292B"/>
+    <w:rsid w:val="004F6F0F"/>
     <w:rPr>
       <w:rFonts w:asciiTheme="majorHAnsi" w:eastAsiaTheme="majorEastAsia" w:hAnsiTheme="majorHAnsi" w:cstheme="majorBidi"/>
       <w:color w:val="0F4761" w:themeColor="accent1" w:themeShade="BF"/>
@@ -24863,7 +24889,7 @@
     <w:basedOn w:val="Fontepargpadro"/>
     <w:link w:val="Ttulo2"/>
     <w:uiPriority w:val="9"/>
-    <w:rsid w:val="0047292B"/>
+    <w:rsid w:val="004F6F0F"/>
     <w:rPr>
       <w:rFonts w:asciiTheme="majorHAnsi" w:eastAsiaTheme="majorEastAsia" w:hAnsiTheme="majorHAnsi" w:cstheme="majorBidi"/>
       <w:color w:val="0F4761" w:themeColor="accent1" w:themeShade="BF"/>
@@ -24877,7 +24903,7 @@
     <w:link w:val="Ttulo3"/>
     <w:uiPriority w:val="9"/>
     <w:semiHidden/>
-    <w:rsid w:val="0047292B"/>
+    <w:rsid w:val="004F6F0F"/>
     <w:rPr>
       <w:rFonts w:eastAsiaTheme="majorEastAsia" w:cstheme="majorBidi"/>
       <w:color w:val="0F4761" w:themeColor="accent1" w:themeShade="BF"/>
@@ -24891,7 +24917,7 @@
     <w:link w:val="Ttulo4"/>
     <w:uiPriority w:val="9"/>
     <w:semiHidden/>
-    <w:rsid w:val="0047292B"/>
+    <w:rsid w:val="004F6F0F"/>
     <w:rPr>
       <w:rFonts w:eastAsiaTheme="majorEastAsia" w:cstheme="majorBidi"/>
       <w:i/>
@@ -24905,7 +24931,7 @@
     <w:link w:val="Ttulo5"/>
     <w:uiPriority w:val="9"/>
     <w:semiHidden/>
-    <w:rsid w:val="0047292B"/>
+    <w:rsid w:val="004F6F0F"/>
     <w:rPr>
       <w:rFonts w:eastAsiaTheme="majorEastAsia" w:cstheme="majorBidi"/>
       <w:color w:val="0F4761" w:themeColor="accent1" w:themeShade="BF"/>
@@ -24917,7 +24943,7 @@
     <w:link w:val="Ttulo6"/>
     <w:uiPriority w:val="9"/>
     <w:semiHidden/>
-    <w:rsid w:val="0047292B"/>
+    <w:rsid w:val="004F6F0F"/>
     <w:rPr>
       <w:rFonts w:eastAsiaTheme="majorEastAsia" w:cstheme="majorBidi"/>
       <w:i/>
@@ -24931,7 +24957,7 @@
     <w:link w:val="Ttulo7"/>
     <w:uiPriority w:val="9"/>
     <w:semiHidden/>
-    <w:rsid w:val="0047292B"/>
+    <w:rsid w:val="004F6F0F"/>
     <w:rPr>
       <w:rFonts w:eastAsiaTheme="majorEastAsia" w:cstheme="majorBidi"/>
       <w:color w:val="595959" w:themeColor="text1" w:themeTint="A6"/>
@@ -24943,7 +24969,7 @@
     <w:link w:val="Ttulo8"/>
     <w:uiPriority w:val="9"/>
     <w:semiHidden/>
-    <w:rsid w:val="0047292B"/>
+    <w:rsid w:val="004F6F0F"/>
     <w:rPr>
       <w:rFonts w:eastAsiaTheme="majorEastAsia" w:cstheme="majorBidi"/>
       <w:i/>
@@ -24957,7 +24983,7 @@
     <w:link w:val="Ttulo9"/>
     <w:uiPriority w:val="9"/>
     <w:semiHidden/>
-    <w:rsid w:val="0047292B"/>
+    <w:rsid w:val="004F6F0F"/>
     <w:rPr>
       <w:rFonts w:eastAsiaTheme="majorEastAsia" w:cstheme="majorBidi"/>
       <w:color w:val="272727" w:themeColor="text1" w:themeTint="D8"/>
@@ -24970,7 +24996,7 @@
     <w:link w:val="TtuloChar"/>
     <w:uiPriority w:val="10"/>
     <w:qFormat/>
-    <w:rsid w:val="0047292B"/>
+    <w:rsid w:val="004F6F0F"/>
     <w:pPr>
       <w:spacing w:after="80" w:line="240" w:lineRule="auto"/>
       <w:contextualSpacing/>
@@ -24988,7 +25014,7 @@
     <w:basedOn w:val="Fontepargpadro"/>
     <w:link w:val="Ttulo"/>
     <w:uiPriority w:val="10"/>
-    <w:rsid w:val="0047292B"/>
+    <w:rsid w:val="004F6F0F"/>
     <w:rPr>
       <w:rFonts w:asciiTheme="majorHAnsi" w:eastAsiaTheme="majorEastAsia" w:hAnsiTheme="majorHAnsi" w:cstheme="majorBidi"/>
       <w:spacing w:val="-10"/>
@@ -25004,7 +25030,7 @@
     <w:link w:val="SubttuloChar"/>
     <w:uiPriority w:val="11"/>
     <w:qFormat/>
-    <w:rsid w:val="0047292B"/>
+    <w:rsid w:val="004F6F0F"/>
     <w:pPr>
       <w:numPr>
         <w:ilvl w:val="1"/>
@@ -25023,7 +25049,7 @@
     <w:basedOn w:val="Fontepargpadro"/>
     <w:link w:val="Subttulo"/>
     <w:uiPriority w:val="11"/>
-    <w:rsid w:val="0047292B"/>
+    <w:rsid w:val="004F6F0F"/>
     <w:rPr>
       <w:rFonts w:eastAsiaTheme="majorEastAsia" w:cstheme="majorBidi"/>
       <w:color w:val="595959" w:themeColor="text1" w:themeTint="A6"/>
@@ -25039,7 +25065,7 @@
     <w:link w:val="CitaoChar"/>
     <w:uiPriority w:val="29"/>
     <w:qFormat/>
-    <w:rsid w:val="0047292B"/>
+    <w:rsid w:val="004F6F0F"/>
     <w:pPr>
       <w:spacing w:before="160"/>
       <w:jc w:val="center"/>
@@ -25055,7 +25081,7 @@
     <w:basedOn w:val="Fontepargpadro"/>
     <w:link w:val="Citao"/>
     <w:uiPriority w:val="29"/>
-    <w:rsid w:val="0047292B"/>
+    <w:rsid w:val="004F6F0F"/>
     <w:rPr>
       <w:i/>
       <w:iCs/>
@@ -25067,7 +25093,7 @@
     <w:basedOn w:val="Normal"/>
     <w:uiPriority w:val="34"/>
     <w:qFormat/>
-    <w:rsid w:val="0047292B"/>
+    <w:rsid w:val="004F6F0F"/>
     <w:pPr>
       <w:ind w:left="720"/>
       <w:contextualSpacing/>
@@ -25078,7 +25104,7 @@
     <w:basedOn w:val="Fontepargpadro"/>
     <w:uiPriority w:val="21"/>
     <w:qFormat/>
-    <w:rsid w:val="0047292B"/>
+    <w:rsid w:val="004F6F0F"/>
     <w:rPr>
       <w:i/>
       <w:iCs/>
@@ -25092,7 +25118,7 @@
     <w:link w:val="CitaoIntensaChar"/>
     <w:uiPriority w:val="30"/>
     <w:qFormat/>
-    <w:rsid w:val="0047292B"/>
+    <w:rsid w:val="004F6F0F"/>
     <w:pPr>
       <w:pBdr>
         <w:top w:val="single" w:sz="4" w:space="10" w:color="0F4761" w:themeColor="accent1" w:themeShade="BF"/>
@@ -25113,7 +25139,7 @@
     <w:basedOn w:val="Fontepargpadro"/>
     <w:link w:val="CitaoIntensa"/>
     <w:uiPriority w:val="30"/>
-    <w:rsid w:val="0047292B"/>
+    <w:rsid w:val="004F6F0F"/>
     <w:rPr>
       <w:i/>
       <w:iCs/>
@@ -25125,7 +25151,7 @@
     <w:basedOn w:val="Fontepargpadro"/>
     <w:uiPriority w:val="32"/>
     <w:qFormat/>
-    <w:rsid w:val="0047292B"/>
+    <w:rsid w:val="004F6F0F"/>
     <w:rPr>
       <w:b/>
       <w:bCs/>
@@ -25140,7 +25166,7 @@
     <w:link w:val="CabealhoChar"/>
     <w:uiPriority w:val="99"/>
     <w:unhideWhenUsed/>
-    <w:rsid w:val="0047292B"/>
+    <w:rsid w:val="004F6F0F"/>
     <w:pPr>
       <w:tabs>
         <w:tab w:val="center" w:pos="4252"/>
@@ -25154,7 +25180,7 @@
     <w:basedOn w:val="Fontepargpadro"/>
     <w:link w:val="Cabealho"/>
     <w:uiPriority w:val="99"/>
-    <w:rsid w:val="0047292B"/>
+    <w:rsid w:val="004F6F0F"/>
   </w:style>
   <w:style w:type="paragraph" w:styleId="Rodap">
     <w:name w:val="footer"/>
@@ -25162,7 +25188,7 @@
     <w:link w:val="RodapChar"/>
     <w:uiPriority w:val="99"/>
     <w:unhideWhenUsed/>
-    <w:rsid w:val="0047292B"/>
+    <w:rsid w:val="004F6F0F"/>
     <w:pPr>
       <w:tabs>
         <w:tab w:val="center" w:pos="4252"/>
@@ -25176,7 +25202,7 @@
     <w:basedOn w:val="Fontepargpadro"/>
     <w:link w:val="Rodap"/>
     <w:uiPriority w:val="99"/>
-    <w:rsid w:val="0047292B"/>
+    <w:rsid w:val="004F6F0F"/>
   </w:style>
   <w:style w:type="paragraph" w:styleId="Sumrio1">
     <w:name w:val="toc 1"/>
@@ -25185,7 +25211,7 @@
     <w:autoRedefine/>
     <w:uiPriority w:val="39"/>
     <w:unhideWhenUsed/>
-    <w:rsid w:val="0047292B"/>
+    <w:rsid w:val="004F6F0F"/>
     <w:pPr>
       <w:spacing w:after="100"/>
     </w:pPr>
@@ -25197,7 +25223,7 @@
     <w:autoRedefine/>
     <w:uiPriority w:val="39"/>
     <w:unhideWhenUsed/>
-    <w:rsid w:val="0047292B"/>
+    <w:rsid w:val="004F6F0F"/>
     <w:pPr>
       <w:spacing w:after="100"/>
       <w:ind w:left="240"/>

</xml_diff>

<commit_message>
Sincroniza com a produção — aviso ao vivo de edição simultânea (Fase 3, Supabase Realtime)
Co-Authored-By: Claude Sonnet 5 <noreply@anthropic.com>
</commit_message>
<xml_diff>
--- a/Manual de Uso - Ferramenta de Gestao de Projetos.docx
+++ b/Manual de Uso - Ferramenta de Gestao de Projetos.docx
@@ -229,7 +229,7 @@
         <w:rPr>
           <w:noProof/>
         </w:rPr>
-        <w:instrText xml:space="preserve"> PAGEREF _Toc240287059 \h </w:instrText>
+        <w:instrText xml:space="preserve"> PAGEREF _Toc240288816 \h </w:instrText>
       </w:r>
       <w:r>
         <w:rPr>
@@ -290,7 +290,7 @@
         <w:rPr>
           <w:noProof/>
         </w:rPr>
-        <w:instrText xml:space="preserve"> PAGEREF _Toc240287060 \h </w:instrText>
+        <w:instrText xml:space="preserve"> PAGEREF _Toc240288817 \h </w:instrText>
       </w:r>
       <w:r>
         <w:rPr>
@@ -351,7 +351,7 @@
         <w:rPr>
           <w:noProof/>
         </w:rPr>
-        <w:instrText xml:space="preserve"> PAGEREF _Toc240287061 \h </w:instrText>
+        <w:instrText xml:space="preserve"> PAGEREF _Toc240288818 \h </w:instrText>
       </w:r>
       <w:r>
         <w:rPr>
@@ -412,7 +412,7 @@
         <w:rPr>
           <w:noProof/>
         </w:rPr>
-        <w:instrText xml:space="preserve"> PAGEREF _Toc240287062 \h </w:instrText>
+        <w:instrText xml:space="preserve"> PAGEREF _Toc240288819 \h </w:instrText>
       </w:r>
       <w:r>
         <w:rPr>
@@ -429,7 +429,7 @@
         <w:rPr>
           <w:noProof/>
         </w:rPr>
-        <w:t>19</w:t>
+        <w:t>20</w:t>
       </w:r>
       <w:r>
         <w:rPr>
@@ -473,7 +473,7 @@
         <w:rPr>
           <w:noProof/>
         </w:rPr>
-        <w:instrText xml:space="preserve"> PAGEREF _Toc240287063 \h </w:instrText>
+        <w:instrText xml:space="preserve"> PAGEREF _Toc240288820 \h </w:instrText>
       </w:r>
       <w:r>
         <w:rPr>
@@ -490,7 +490,7 @@
         <w:rPr>
           <w:noProof/>
         </w:rPr>
-        <w:t>20</w:t>
+        <w:t>21</w:t>
       </w:r>
       <w:r>
         <w:rPr>
@@ -534,7 +534,7 @@
         <w:rPr>
           <w:noProof/>
         </w:rPr>
-        <w:instrText xml:space="preserve"> PAGEREF _Toc240287064 \h </w:instrText>
+        <w:instrText xml:space="preserve"> PAGEREF _Toc240288821 \h </w:instrText>
       </w:r>
       <w:r>
         <w:rPr>
@@ -595,7 +595,7 @@
         <w:rPr>
           <w:noProof/>
         </w:rPr>
-        <w:instrText xml:space="preserve"> PAGEREF _Toc240287065 \h </w:instrText>
+        <w:instrText xml:space="preserve"> PAGEREF _Toc240288822 \h </w:instrText>
       </w:r>
       <w:r>
         <w:rPr>
@@ -656,7 +656,7 @@
         <w:rPr>
           <w:noProof/>
         </w:rPr>
-        <w:instrText xml:space="preserve"> PAGEREF _Toc240287066 \h </w:instrText>
+        <w:instrText xml:space="preserve"> PAGEREF _Toc240288823 \h </w:instrText>
       </w:r>
       <w:r>
         <w:rPr>
@@ -717,7 +717,7 @@
         <w:rPr>
           <w:noProof/>
         </w:rPr>
-        <w:instrText xml:space="preserve"> PAGEREF _Toc240287067 \h </w:instrText>
+        <w:instrText xml:space="preserve"> PAGEREF _Toc240288824 \h </w:instrText>
       </w:r>
       <w:r>
         <w:rPr>
@@ -778,7 +778,7 @@
         <w:rPr>
           <w:noProof/>
         </w:rPr>
-        <w:instrText xml:space="preserve"> PAGEREF _Toc240287068 \h </w:instrText>
+        <w:instrText xml:space="preserve"> PAGEREF _Toc240288825 \h </w:instrText>
       </w:r>
       <w:r>
         <w:rPr>
@@ -839,7 +839,7 @@
         <w:rPr>
           <w:noProof/>
         </w:rPr>
-        <w:instrText xml:space="preserve"> PAGEREF _Toc240287069 \h </w:instrText>
+        <w:instrText xml:space="preserve"> PAGEREF _Toc240288826 \h </w:instrText>
       </w:r>
       <w:r>
         <w:rPr>
@@ -900,7 +900,7 @@
         <w:rPr>
           <w:noProof/>
         </w:rPr>
-        <w:instrText xml:space="preserve"> PAGEREF _Toc240287070 \h </w:instrText>
+        <w:instrText xml:space="preserve"> PAGEREF _Toc240288827 \h </w:instrText>
       </w:r>
       <w:r>
         <w:rPr>
@@ -961,7 +961,7 @@
         <w:rPr>
           <w:noProof/>
         </w:rPr>
-        <w:instrText xml:space="preserve"> PAGEREF _Toc240287071 \h </w:instrText>
+        <w:instrText xml:space="preserve"> PAGEREF _Toc240288828 \h </w:instrText>
       </w:r>
       <w:r>
         <w:rPr>
@@ -1022,7 +1022,7 @@
         <w:rPr>
           <w:noProof/>
         </w:rPr>
-        <w:instrText xml:space="preserve"> PAGEREF _Toc240287072 \h </w:instrText>
+        <w:instrText xml:space="preserve"> PAGEREF _Toc240288829 \h </w:instrText>
       </w:r>
       <w:r>
         <w:rPr>
@@ -1083,7 +1083,7 @@
         <w:rPr>
           <w:noProof/>
         </w:rPr>
-        <w:instrText xml:space="preserve"> PAGEREF _Toc240287073 \h </w:instrText>
+        <w:instrText xml:space="preserve"> PAGEREF _Toc240288830 \h </w:instrText>
       </w:r>
       <w:r>
         <w:rPr>
@@ -1144,7 +1144,7 @@
         <w:rPr>
           <w:noProof/>
         </w:rPr>
-        <w:instrText xml:space="preserve"> PAGEREF _Toc240287074 \h </w:instrText>
+        <w:instrText xml:space="preserve"> PAGEREF _Toc240288831 \h </w:instrText>
       </w:r>
       <w:r>
         <w:rPr>
@@ -1205,7 +1205,7 @@
         <w:rPr>
           <w:noProof/>
         </w:rPr>
-        <w:instrText xml:space="preserve"> PAGEREF _Toc240287075 \h </w:instrText>
+        <w:instrText xml:space="preserve"> PAGEREF _Toc240288832 \h </w:instrText>
       </w:r>
       <w:r>
         <w:rPr>
@@ -1266,7 +1266,7 @@
         <w:rPr>
           <w:noProof/>
         </w:rPr>
-        <w:instrText xml:space="preserve"> PAGEREF _Toc240287076 \h </w:instrText>
+        <w:instrText xml:space="preserve"> PAGEREF _Toc240288833 \h </w:instrText>
       </w:r>
       <w:r>
         <w:rPr>
@@ -1327,7 +1327,7 @@
         <w:rPr>
           <w:noProof/>
         </w:rPr>
-        <w:instrText xml:space="preserve"> PAGEREF _Toc240287077 \h </w:instrText>
+        <w:instrText xml:space="preserve"> PAGEREF _Toc240288834 \h </w:instrText>
       </w:r>
       <w:r>
         <w:rPr>
@@ -1388,7 +1388,7 @@
         <w:rPr>
           <w:noProof/>
         </w:rPr>
-        <w:instrText xml:space="preserve"> PAGEREF _Toc240287078 \h </w:instrText>
+        <w:instrText xml:space="preserve"> PAGEREF _Toc240288835 \h </w:instrText>
       </w:r>
       <w:r>
         <w:rPr>
@@ -1449,7 +1449,7 @@
         <w:rPr>
           <w:noProof/>
         </w:rPr>
-        <w:instrText xml:space="preserve"> PAGEREF _Toc240287079 \h </w:instrText>
+        <w:instrText xml:space="preserve"> PAGEREF _Toc240288836 \h </w:instrText>
       </w:r>
       <w:r>
         <w:rPr>
@@ -1510,7 +1510,7 @@
         <w:rPr>
           <w:noProof/>
         </w:rPr>
-        <w:instrText xml:space="preserve"> PAGEREF _Toc240287080 \h </w:instrText>
+        <w:instrText xml:space="preserve"> PAGEREF _Toc240288837 \h </w:instrText>
       </w:r>
       <w:r>
         <w:rPr>
@@ -1571,7 +1571,7 @@
         <w:rPr>
           <w:noProof/>
         </w:rPr>
-        <w:instrText xml:space="preserve"> PAGEREF _Toc240287081 \h </w:instrText>
+        <w:instrText xml:space="preserve"> PAGEREF _Toc240288838 \h </w:instrText>
       </w:r>
       <w:r>
         <w:rPr>
@@ -1632,7 +1632,7 @@
         <w:rPr>
           <w:noProof/>
         </w:rPr>
-        <w:instrText xml:space="preserve"> PAGEREF _Toc240287082 \h </w:instrText>
+        <w:instrText xml:space="preserve"> PAGEREF _Toc240288839 \h </w:instrText>
       </w:r>
       <w:r>
         <w:rPr>
@@ -1693,7 +1693,7 @@
         <w:rPr>
           <w:noProof/>
         </w:rPr>
-        <w:instrText xml:space="preserve"> PAGEREF _Toc240287083 \h </w:instrText>
+        <w:instrText xml:space="preserve"> PAGEREF _Toc240288840 \h </w:instrText>
       </w:r>
       <w:r>
         <w:rPr>
@@ -1755,7 +1755,7 @@
         <w:rPr>
           <w:noProof/>
         </w:rPr>
-        <w:instrText xml:space="preserve"> PAGEREF _Toc240287084 \h </w:instrText>
+        <w:instrText xml:space="preserve"> PAGEREF _Toc240288841 \h </w:instrText>
       </w:r>
       <w:r>
         <w:rPr>
@@ -1816,7 +1816,7 @@
         <w:rPr>
           <w:noProof/>
         </w:rPr>
-        <w:instrText xml:space="preserve"> PAGEREF _Toc240287085 \h </w:instrText>
+        <w:instrText xml:space="preserve"> PAGEREF _Toc240288842 \h </w:instrText>
       </w:r>
       <w:r>
         <w:rPr>
@@ -1877,7 +1877,7 @@
         <w:rPr>
           <w:noProof/>
         </w:rPr>
-        <w:instrText xml:space="preserve"> PAGEREF _Toc240287086 \h </w:instrText>
+        <w:instrText xml:space="preserve"> PAGEREF _Toc240288843 \h </w:instrText>
       </w:r>
       <w:r>
         <w:rPr>
@@ -1938,7 +1938,7 @@
         <w:rPr>
           <w:noProof/>
         </w:rPr>
-        <w:instrText xml:space="preserve"> PAGEREF _Toc240287087 \h </w:instrText>
+        <w:instrText xml:space="preserve"> PAGEREF _Toc240288844 \h </w:instrText>
       </w:r>
       <w:r>
         <w:rPr>
@@ -1999,7 +1999,7 @@
         <w:rPr>
           <w:noProof/>
         </w:rPr>
-        <w:instrText xml:space="preserve"> PAGEREF _Toc240287088 \h </w:instrText>
+        <w:instrText xml:space="preserve"> PAGEREF _Toc240288845 \h </w:instrText>
       </w:r>
       <w:r>
         <w:rPr>
@@ -2060,7 +2060,7 @@
         <w:rPr>
           <w:noProof/>
         </w:rPr>
-        <w:instrText xml:space="preserve"> PAGEREF _Toc240287089 \h </w:instrText>
+        <w:instrText xml:space="preserve"> PAGEREF _Toc240288846 \h </w:instrText>
       </w:r>
       <w:r>
         <w:rPr>
@@ -2121,7 +2121,7 @@
         <w:rPr>
           <w:noProof/>
         </w:rPr>
-        <w:instrText xml:space="preserve"> PAGEREF _Toc240287090 \h </w:instrText>
+        <w:instrText xml:space="preserve"> PAGEREF _Toc240288847 \h </w:instrText>
       </w:r>
       <w:r>
         <w:rPr>
@@ -2182,7 +2182,7 @@
         <w:rPr>
           <w:noProof/>
         </w:rPr>
-        <w:instrText xml:space="preserve"> PAGEREF _Toc240287091 \h </w:instrText>
+        <w:instrText xml:space="preserve"> PAGEREF _Toc240288848 \h </w:instrText>
       </w:r>
       <w:r>
         <w:rPr>
@@ -2243,7 +2243,7 @@
         <w:rPr>
           <w:noProof/>
         </w:rPr>
-        <w:instrText xml:space="preserve"> PAGEREF _Toc240287092 \h </w:instrText>
+        <w:instrText xml:space="preserve"> PAGEREF _Toc240288849 \h </w:instrText>
       </w:r>
       <w:r>
         <w:rPr>
@@ -2304,7 +2304,7 @@
         <w:rPr>
           <w:noProof/>
         </w:rPr>
-        <w:instrText xml:space="preserve"> PAGEREF _Toc240287093 \h </w:instrText>
+        <w:instrText xml:space="preserve"> PAGEREF _Toc240288850 \h </w:instrText>
       </w:r>
       <w:r>
         <w:rPr>
@@ -2365,7 +2365,7 @@
         <w:rPr>
           <w:noProof/>
         </w:rPr>
-        <w:instrText xml:space="preserve"> PAGEREF _Toc240287094 \h </w:instrText>
+        <w:instrText xml:space="preserve"> PAGEREF _Toc240288851 \h </w:instrText>
       </w:r>
       <w:r>
         <w:rPr>
@@ -2426,7 +2426,7 @@
         <w:rPr>
           <w:noProof/>
         </w:rPr>
-        <w:instrText xml:space="preserve"> PAGEREF _Toc240287095 \h </w:instrText>
+        <w:instrText xml:space="preserve"> PAGEREF _Toc240288852 \h </w:instrText>
       </w:r>
       <w:r>
         <w:rPr>
@@ -2487,7 +2487,7 @@
         <w:rPr>
           <w:noProof/>
         </w:rPr>
-        <w:instrText xml:space="preserve"> PAGEREF _Toc240287096 \h </w:instrText>
+        <w:instrText xml:space="preserve"> PAGEREF _Toc240288853 \h </w:instrText>
       </w:r>
       <w:r>
         <w:rPr>
@@ -2548,7 +2548,7 @@
         <w:rPr>
           <w:noProof/>
         </w:rPr>
-        <w:instrText xml:space="preserve"> PAGEREF _Toc240287097 \h </w:instrText>
+        <w:instrText xml:space="preserve"> PAGEREF _Toc240288854 \h </w:instrText>
       </w:r>
       <w:r>
         <w:rPr>
@@ -2609,7 +2609,7 @@
         <w:rPr>
           <w:noProof/>
         </w:rPr>
-        <w:instrText xml:space="preserve"> PAGEREF _Toc240287098 \h </w:instrText>
+        <w:instrText xml:space="preserve"> PAGEREF _Toc240288855 \h </w:instrText>
       </w:r>
       <w:r>
         <w:rPr>
@@ -2670,7 +2670,7 @@
         <w:rPr>
           <w:noProof/>
         </w:rPr>
-        <w:instrText xml:space="preserve"> PAGEREF _Toc240287099 \h </w:instrText>
+        <w:instrText xml:space="preserve"> PAGEREF _Toc240288856 \h </w:instrText>
       </w:r>
       <w:r>
         <w:rPr>
@@ -2731,7 +2731,7 @@
         <w:rPr>
           <w:noProof/>
         </w:rPr>
-        <w:instrText xml:space="preserve"> PAGEREF _Toc240287100 \h </w:instrText>
+        <w:instrText xml:space="preserve"> PAGEREF _Toc240288857 \h </w:instrText>
       </w:r>
       <w:r>
         <w:rPr>
@@ -2792,7 +2792,7 @@
         <w:rPr>
           <w:noProof/>
         </w:rPr>
-        <w:instrText xml:space="preserve"> PAGEREF _Toc240287101 \h </w:instrText>
+        <w:instrText xml:space="preserve"> PAGEREF _Toc240288858 \h </w:instrText>
       </w:r>
       <w:r>
         <w:rPr>
@@ -2853,7 +2853,7 @@
         <w:rPr>
           <w:noProof/>
         </w:rPr>
-        <w:instrText xml:space="preserve"> PAGEREF _Toc240287102 \h </w:instrText>
+        <w:instrText xml:space="preserve"> PAGEREF _Toc240288859 \h </w:instrText>
       </w:r>
       <w:r>
         <w:rPr>
@@ -2914,7 +2914,7 @@
         <w:rPr>
           <w:noProof/>
         </w:rPr>
-        <w:instrText xml:space="preserve"> PAGEREF _Toc240287103 \h </w:instrText>
+        <w:instrText xml:space="preserve"> PAGEREF _Toc240288860 \h </w:instrText>
       </w:r>
       <w:r>
         <w:rPr>
@@ -2975,7 +2975,7 @@
         <w:rPr>
           <w:noProof/>
         </w:rPr>
-        <w:instrText xml:space="preserve"> PAGEREF _Toc240287104 \h </w:instrText>
+        <w:instrText xml:space="preserve"> PAGEREF _Toc240288861 \h </w:instrText>
       </w:r>
       <w:r>
         <w:rPr>
@@ -3036,7 +3036,7 @@
         <w:rPr>
           <w:noProof/>
         </w:rPr>
-        <w:instrText xml:space="preserve"> PAGEREF _Toc240287105 \h </w:instrText>
+        <w:instrText xml:space="preserve"> PAGEREF _Toc240288862 \h </w:instrText>
       </w:r>
       <w:r>
         <w:rPr>
@@ -3097,7 +3097,7 @@
         <w:rPr>
           <w:noProof/>
         </w:rPr>
-        <w:instrText xml:space="preserve"> PAGEREF _Toc240287106 \h </w:instrText>
+        <w:instrText xml:space="preserve"> PAGEREF _Toc240288863 \h </w:instrText>
       </w:r>
       <w:r>
         <w:rPr>
@@ -3158,7 +3158,7 @@
         <w:rPr>
           <w:noProof/>
         </w:rPr>
-        <w:instrText xml:space="preserve"> PAGEREF _Toc240287107 \h </w:instrText>
+        <w:instrText xml:space="preserve"> PAGEREF _Toc240288864 \h </w:instrText>
       </w:r>
       <w:r>
         <w:rPr>
@@ -3234,7 +3234,7 @@
           <w:sz w:val="34"/>
         </w:rPr>
       </w:pPr>
-      <w:bookmarkStart w:id="0" w:name="_Toc240287059"/>
+      <w:bookmarkStart w:id="0" w:name="_Toc240288816"/>
       <w:r>
         <w:rPr>
           <w:rFonts w:ascii="Montserrat" w:hAnsi="Montserrat"/>
@@ -3258,7 +3258,7 @@
           <w:sz w:val="27"/>
         </w:rPr>
       </w:pPr>
-      <w:bookmarkStart w:id="1" w:name="_Toc240287060"/>
+      <w:bookmarkStart w:id="1" w:name="_Toc240288817"/>
       <w:r>
         <w:rPr>
           <w:rFonts w:ascii="Montserrat" w:hAnsi="Montserrat"/>
@@ -4717,6 +4717,24 @@
           <w:color w:val="1A1A1A"/>
           <w:sz w:val="22"/>
         </w:rPr>
+        <w:t>Esta e a versao 2.72 do manual. Em relacao a versao 2.71 (14/09/2026), a secao 2.14 - Edicao simultanea ganhou um terceiro mecanismo, ao vivo: se outra pessoa efetivamente salvar uma alteracao no mesmo registro enquanto alguem esta editando, uma faixa vermelha aparece na hora no topo da pagina avisando quem salvou, sem precisar esperar ate a proxima tentativa de salvar para descobrir. Usa atualizacao em tempo real do banco de dados (Supabase Realtime) - nao muda o formato de nenhum dado salvo nem exige nenhuma acao nova do usuario, so torna o aviso mais imediato.</w:t>
+      </w:r>
+    </w:p>
+    <w:p>
+      <w:pPr>
+        <w:spacing w:line="280" w:lineRule="auto"/>
+        <w:rPr>
+          <w:rFonts w:ascii="Montserrat" w:hAnsi="Montserrat"/>
+          <w:color w:val="1A1A1A"/>
+          <w:sz w:val="22"/>
+        </w:rPr>
+      </w:pPr>
+      <w:r>
+        <w:rPr>
+          <w:rFonts w:ascii="Montserrat" w:hAnsi="Montserrat"/>
+          <w:color w:val="1A1A1A"/>
+          <w:sz w:val="22"/>
+        </w:rPr>
         <w:t>O manual nao substitui as Diretrizes para a Gestao de Projetos da UNIALFA (documento institucional que define o framework D01 a D07) nem o documento Regras de Acesso e Permissoes (que detalha cada regra de controle de acesso); ele e o guia operacional de como usar cada ferramenta na pratica.</w:t>
       </w:r>
     </w:p>
@@ -4731,7 +4749,7 @@
           <w:sz w:val="27"/>
         </w:rPr>
       </w:pPr>
-      <w:bookmarkStart w:id="2" w:name="_Toc240287061"/>
+      <w:bookmarkStart w:id="2" w:name="_Toc240288818"/>
       <w:r>
         <w:rPr>
           <w:rFonts w:ascii="Montserrat" w:hAnsi="Montserrat"/>
@@ -4806,6 +4824,7 @@
           <w:color w:val="1A1A1A"/>
           <w:sz w:val="22"/>
         </w:rPr>
+        <w:lastRenderedPageBreak/>
         <w:t>1 ferramenta de apoio a decisao, o Validador de Projetos, que nao gera registros de artefato mas ajuda a avaliar projetos.</w:t>
       </w:r>
     </w:p>
@@ -4896,7 +4915,6 @@
           <w:color w:val="1A1A1A"/>
           <w:sz w:val="22"/>
         </w:rPr>
-        <w:lastRenderedPageBreak/>
         <w:t>Cada formulario de registro tem duas partes: uma tela de preenchimento (+Novo...) e uma tela de consulta (...cadastrados), onde ficam listados todos os registros ja salvos, com opcao de abrir, editar o status ou excluir cada um.</w:t>
       </w:r>
     </w:p>
@@ -4928,16 +4946,16 @@
           <w:noProof/>
         </w:rPr>
         <w:drawing>
-          <wp:inline distT="0" distB="0" distL="0" distR="0" wp14:anchorId="330835C3" wp14:editId="5394F778">
+          <wp:inline distT="0" distB="0" distL="0" distR="0" wp14:anchorId="79AD9976" wp14:editId="3EC09BB9">
             <wp:extent cx="5303520" cy="4792851"/>
             <wp:effectExtent l="19050" t="19050" r="11430" b="27305"/>
-            <wp:docPr id="114046778" name="Imagem 1"/>
+            <wp:docPr id="502590097" name="Imagem 1"/>
             <wp:cNvGraphicFramePr/>
             <a:graphic xmlns:a="http://schemas.openxmlformats.org/drawingml/2006/main">
               <a:graphicData uri="http://schemas.openxmlformats.org/drawingml/2006/picture">
                 <pic:pic xmlns:pic="http://schemas.openxmlformats.org/drawingml/2006/picture">
                   <pic:nvPicPr>
-                    <pic:cNvPr id="114046778" name=""/>
+                    <pic:cNvPr id="502590097" name=""/>
                     <pic:cNvPicPr/>
                   </pic:nvPicPr>
                   <pic:blipFill>
@@ -4991,6 +5009,7 @@
           <w:color w:val="6A6A70"/>
           <w:sz w:val="19"/>
         </w:rPr>
+        <w:lastRenderedPageBreak/>
         <w:t>Mapa de diretrizes - pagina inicial. Nao exige login.</w:t>
       </w:r>
     </w:p>
@@ -5005,7 +5024,7 @@
           <w:sz w:val="27"/>
         </w:rPr>
       </w:pPr>
-      <w:bookmarkStart w:id="3" w:name="_Toc240287062"/>
+      <w:bookmarkStart w:id="3" w:name="_Toc240288819"/>
       <w:r>
         <w:rPr>
           <w:rFonts w:ascii="Montserrat" w:hAnsi="Montserrat"/>
@@ -5044,18 +5063,17 @@
         <w:rPr>
           <w:noProof/>
         </w:rPr>
-        <w:lastRenderedPageBreak/>
         <w:drawing>
-          <wp:inline distT="0" distB="0" distL="0" distR="0" wp14:anchorId="6109CAD8" wp14:editId="269A0188">
+          <wp:inline distT="0" distB="0" distL="0" distR="0" wp14:anchorId="4C812B1A" wp14:editId="4157545F">
             <wp:extent cx="4206240" cy="3801227"/>
             <wp:effectExtent l="19050" t="19050" r="22860" b="27940"/>
-            <wp:docPr id="127829024" name="Imagem 2"/>
+            <wp:docPr id="642962925" name="Imagem 2"/>
             <wp:cNvGraphicFramePr/>
             <a:graphic xmlns:a="http://schemas.openxmlformats.org/drawingml/2006/main">
               <a:graphicData uri="http://schemas.openxmlformats.org/drawingml/2006/picture">
                 <pic:pic xmlns:pic="http://schemas.openxmlformats.org/drawingml/2006/picture">
                   <pic:nvPicPr>
-                    <pic:cNvPr id="127829024" name=""/>
+                    <pic:cNvPr id="642962925" name=""/>
                     <pic:cNvPicPr/>
                   </pic:nvPicPr>
                   <pic:blipFill>
@@ -5228,7 +5246,7 @@
           <w:sz w:val="27"/>
         </w:rPr>
       </w:pPr>
-      <w:bookmarkStart w:id="4" w:name="_Toc240287063"/>
+      <w:bookmarkStart w:id="4" w:name="_Toc240288820"/>
       <w:r>
         <w:rPr>
           <w:rFonts w:ascii="Montserrat" w:hAnsi="Montserrat"/>
@@ -5236,6 +5254,7 @@
           <w:color w:val="B91D2E"/>
           <w:sz w:val="27"/>
         </w:rPr>
+        <w:lastRenderedPageBreak/>
         <w:t>1.4 Como a ferramenta se relaciona com as Diretrizes (D01-D07)</w:t>
       </w:r>
       <w:bookmarkEnd w:id="4"/>
@@ -5310,7 +5329,6 @@
                 <w:color w:val="FFFFFF"/>
                 <w:sz w:val="19"/>
               </w:rPr>
-              <w:lastRenderedPageBreak/>
               <w:t>Passo</w:t>
             </w:r>
           </w:p>
@@ -6467,7 +6485,7 @@
           <w:sz w:val="34"/>
         </w:rPr>
       </w:pPr>
-      <w:bookmarkStart w:id="5" w:name="_Toc240287064"/>
+      <w:bookmarkStart w:id="5" w:name="_Toc240288821"/>
       <w:r>
         <w:rPr>
           <w:rFonts w:ascii="Montserrat" w:hAnsi="Montserrat"/>
@@ -6491,7 +6509,7 @@
           <w:sz w:val="27"/>
         </w:rPr>
       </w:pPr>
-      <w:bookmarkStart w:id="6" w:name="_Toc240287065"/>
+      <w:bookmarkStart w:id="6" w:name="_Toc240288822"/>
       <w:r>
         <w:rPr>
           <w:rFonts w:ascii="Montserrat" w:hAnsi="Montserrat"/>
@@ -6532,7 +6550,7 @@
           <w:sz w:val="27"/>
         </w:rPr>
       </w:pPr>
-      <w:bookmarkStart w:id="7" w:name="_Toc240287066"/>
+      <w:bookmarkStart w:id="7" w:name="_Toc240288823"/>
       <w:r>
         <w:rPr>
           <w:rFonts w:ascii="Montserrat" w:hAnsi="Montserrat"/>
@@ -6651,7 +6669,7 @@
           <w:sz w:val="27"/>
         </w:rPr>
       </w:pPr>
-      <w:bookmarkStart w:id="8" w:name="_Toc240287067"/>
+      <w:bookmarkStart w:id="8" w:name="_Toc240288824"/>
       <w:r>
         <w:rPr>
           <w:rFonts w:ascii="Montserrat" w:hAnsi="Montserrat"/>
@@ -7264,7 +7282,7 @@
           <w:sz w:val="27"/>
         </w:rPr>
       </w:pPr>
-      <w:bookmarkStart w:id="9" w:name="_Toc240287068"/>
+      <w:bookmarkStart w:id="9" w:name="_Toc240288825"/>
       <w:r>
         <w:rPr>
           <w:rFonts w:ascii="Montserrat" w:hAnsi="Montserrat"/>
@@ -7353,16 +7371,16 @@
         </w:rPr>
         <w:lastRenderedPageBreak/>
         <w:drawing>
-          <wp:inline distT="0" distB="0" distL="0" distR="0" wp14:anchorId="5E40A17C" wp14:editId="4FF72CA0">
+          <wp:inline distT="0" distB="0" distL="0" distR="0" wp14:anchorId="67424487" wp14:editId="363C2EB6">
             <wp:extent cx="4937760" cy="4462310"/>
             <wp:effectExtent l="19050" t="19050" r="15240" b="14605"/>
-            <wp:docPr id="1763947822" name="Imagem 3"/>
+            <wp:docPr id="950880725" name="Imagem 3"/>
             <wp:cNvGraphicFramePr/>
             <a:graphic xmlns:a="http://schemas.openxmlformats.org/drawingml/2006/main">
               <a:graphicData uri="http://schemas.openxmlformats.org/drawingml/2006/picture">
                 <pic:pic xmlns:pic="http://schemas.openxmlformats.org/drawingml/2006/picture">
                   <pic:nvPicPr>
-                    <pic:cNvPr id="1763947822" name=""/>
+                    <pic:cNvPr id="950880725" name=""/>
                     <pic:cNvPicPr/>
                   </pic:nvPicPr>
                   <pic:blipFill>
@@ -7430,7 +7448,7 @@
           <w:sz w:val="27"/>
         </w:rPr>
       </w:pPr>
-      <w:bookmarkStart w:id="10" w:name="_Toc240287069"/>
+      <w:bookmarkStart w:id="10" w:name="_Toc240288826"/>
       <w:r>
         <w:rPr>
           <w:rFonts w:ascii="Montserrat" w:hAnsi="Montserrat"/>
@@ -7471,16 +7489,16 @@
         </w:rPr>
         <w:lastRenderedPageBreak/>
         <w:drawing>
-          <wp:inline distT="0" distB="0" distL="0" distR="0" wp14:anchorId="0D5AB24C" wp14:editId="77744391">
+          <wp:inline distT="0" distB="0" distL="0" distR="0" wp14:anchorId="03FE6F96" wp14:editId="4F26A099">
             <wp:extent cx="5120640" cy="4627581"/>
             <wp:effectExtent l="19050" t="19050" r="22860" b="20955"/>
-            <wp:docPr id="602786403" name="Imagem 4"/>
+            <wp:docPr id="175302184" name="Imagem 4"/>
             <wp:cNvGraphicFramePr/>
             <a:graphic xmlns:a="http://schemas.openxmlformats.org/drawingml/2006/main">
               <a:graphicData uri="http://schemas.openxmlformats.org/drawingml/2006/picture">
                 <pic:pic xmlns:pic="http://schemas.openxmlformats.org/drawingml/2006/picture">
                   <pic:nvPicPr>
-                    <pic:cNvPr id="602786403" name=""/>
+                    <pic:cNvPr id="175302184" name=""/>
                     <pic:cNvPicPr/>
                   </pic:nvPicPr>
                   <pic:blipFill>
@@ -7648,7 +7666,7 @@
           <w:sz w:val="27"/>
         </w:rPr>
       </w:pPr>
-      <w:bookmarkStart w:id="11" w:name="_Toc240287070"/>
+      <w:bookmarkStart w:id="11" w:name="_Toc240288827"/>
       <w:r>
         <w:rPr>
           <w:rFonts w:ascii="Montserrat" w:hAnsi="Montserrat"/>
@@ -7688,16 +7706,16 @@
           <w:noProof/>
         </w:rPr>
         <w:drawing>
-          <wp:inline distT="0" distB="0" distL="0" distR="0" wp14:anchorId="4E398A30" wp14:editId="53CE2623">
+          <wp:inline distT="0" distB="0" distL="0" distR="0" wp14:anchorId="4726261D" wp14:editId="2B38E935">
             <wp:extent cx="4206240" cy="3801227"/>
             <wp:effectExtent l="19050" t="19050" r="22860" b="27940"/>
-            <wp:docPr id="1886291499" name="Imagem 5"/>
+            <wp:docPr id="1059253935" name="Imagem 5"/>
             <wp:cNvGraphicFramePr/>
             <a:graphic xmlns:a="http://schemas.openxmlformats.org/drawingml/2006/main">
               <a:graphicData uri="http://schemas.openxmlformats.org/drawingml/2006/picture">
                 <pic:pic xmlns:pic="http://schemas.openxmlformats.org/drawingml/2006/picture">
                   <pic:nvPicPr>
-                    <pic:cNvPr id="1886291499" name=""/>
+                    <pic:cNvPr id="1059253935" name=""/>
                     <pic:cNvPicPr/>
                   </pic:nvPicPr>
                   <pic:blipFill>
@@ -7765,16 +7783,16 @@
         </w:rPr>
         <w:lastRenderedPageBreak/>
         <w:drawing>
-          <wp:inline distT="0" distB="0" distL="0" distR="0" wp14:anchorId="2CB84387" wp14:editId="4E7E068D">
+          <wp:inline distT="0" distB="0" distL="0" distR="0" wp14:anchorId="5A72581C" wp14:editId="254A3751">
             <wp:extent cx="4206240" cy="3801227"/>
             <wp:effectExtent l="19050" t="19050" r="22860" b="27940"/>
-            <wp:docPr id="1504990017" name="Imagem 6"/>
+            <wp:docPr id="1605607303" name="Imagem 6"/>
             <wp:cNvGraphicFramePr/>
             <a:graphic xmlns:a="http://schemas.openxmlformats.org/drawingml/2006/main">
               <a:graphicData uri="http://schemas.openxmlformats.org/drawingml/2006/picture">
                 <pic:pic xmlns:pic="http://schemas.openxmlformats.org/drawingml/2006/picture">
                   <pic:nvPicPr>
-                    <pic:cNvPr id="1504990017" name=""/>
+                    <pic:cNvPr id="1605607303" name=""/>
                     <pic:cNvPicPr/>
                   </pic:nvPicPr>
                   <pic:blipFill>
@@ -7890,7 +7908,7 @@
           <w:sz w:val="27"/>
         </w:rPr>
       </w:pPr>
-      <w:bookmarkStart w:id="12" w:name="_Toc240287071"/>
+      <w:bookmarkStart w:id="12" w:name="_Toc240288828"/>
       <w:r>
         <w:rPr>
           <w:rFonts w:ascii="Montserrat" w:hAnsi="Montserrat"/>
@@ -7958,7 +7976,7 @@
           <w:sz w:val="27"/>
         </w:rPr>
       </w:pPr>
-      <w:bookmarkStart w:id="13" w:name="_Toc240287072"/>
+      <w:bookmarkStart w:id="13" w:name="_Toc240288829"/>
       <w:r>
         <w:rPr>
           <w:rFonts w:ascii="Montserrat" w:hAnsi="Montserrat"/>
@@ -8185,7 +8203,7 @@
           <w:sz w:val="27"/>
         </w:rPr>
       </w:pPr>
-      <w:bookmarkStart w:id="14" w:name="_Toc240287073"/>
+      <w:bookmarkStart w:id="14" w:name="_Toc240288830"/>
       <w:r>
         <w:rPr>
           <w:rFonts w:ascii="Montserrat" w:hAnsi="Montserrat"/>
@@ -8272,8 +8290,18 @@
         </w:numPr>
         <w:spacing w:after="80" w:line="260" w:lineRule="auto"/>
         <w:ind w:left="700"/>
-      </w:pPr>
-      <w:r>
+        <w:rPr>
+          <w:rFonts w:ascii="Montserrat" w:hAnsi="Montserrat"/>
+          <w:color w:val="1A1A1A"/>
+          <w:sz w:val="22"/>
+        </w:rPr>
+      </w:pPr>
+      <w:r>
+        <w:rPr>
+          <w:rFonts w:ascii="Montserrat" w:hAnsi="Montserrat"/>
+          <w:color w:val="1A1A1A"/>
+          <w:sz w:val="22"/>
+        </w:rPr>
         <w:t>Para desativar, basta tocar novamente no botao ja ativo.</w:t>
       </w:r>
     </w:p>
@@ -8334,7 +8362,7 @@
           <w:sz w:val="27"/>
         </w:rPr>
       </w:pPr>
-      <w:bookmarkStart w:id="15" w:name="_Toc240287074"/>
+      <w:bookmarkStart w:id="15" w:name="_Toc240288831"/>
       <w:r>
         <w:rPr>
           <w:rFonts w:ascii="Montserrat" w:hAnsi="Montserrat"/>
@@ -8526,7 +8554,7 @@
           <w:sz w:val="27"/>
         </w:rPr>
       </w:pPr>
-      <w:bookmarkStart w:id="16" w:name="_Toc240287075"/>
+      <w:bookmarkStart w:id="16" w:name="_Toc240288832"/>
       <w:r>
         <w:rPr>
           <w:rFonts w:ascii="Montserrat" w:hAnsi="Montserrat"/>
@@ -8654,7 +8682,7 @@
           <w:sz w:val="27"/>
         </w:rPr>
       </w:pPr>
-      <w:bookmarkStart w:id="17" w:name="_Toc240287076"/>
+      <w:bookmarkStart w:id="17" w:name="_Toc240288833"/>
       <w:r>
         <w:rPr>
           <w:rFonts w:ascii="Montserrat" w:hAnsi="Montserrat"/>
@@ -8984,7 +9012,7 @@
           <w:sz w:val="27"/>
         </w:rPr>
       </w:pPr>
-      <w:bookmarkStart w:id="18" w:name="_Toc240287077"/>
+      <w:bookmarkStart w:id="18" w:name="_Toc240288834"/>
       <w:r>
         <w:rPr>
           <w:rFonts w:ascii="Montserrat" w:hAnsi="Montserrat"/>
@@ -9121,7 +9149,7 @@
           <w:sz w:val="27"/>
         </w:rPr>
       </w:pPr>
-      <w:bookmarkStart w:id="19" w:name="_Toc240287078"/>
+      <w:bookmarkStart w:id="19" w:name="_Toc240288835"/>
       <w:r>
         <w:rPr>
           <w:rFonts w:ascii="Montserrat" w:hAnsi="Montserrat"/>
@@ -9363,6 +9391,24 @@
     </w:p>
     <w:p>
       <w:pPr>
+        <w:spacing w:line="280" w:lineRule="auto"/>
+        <w:rPr>
+          <w:rFonts w:ascii="Montserrat" w:hAnsi="Montserrat"/>
+          <w:color w:val="1A1A1A"/>
+          <w:sz w:val="22"/>
+        </w:rPr>
+      </w:pPr>
+      <w:r>
+        <w:rPr>
+          <w:rFonts w:ascii="Montserrat" w:hAnsi="Montserrat"/>
+          <w:color w:val="1A1A1A"/>
+          <w:sz w:val="22"/>
+        </w:rPr>
+        <w:t>Por fim, ha um terceiro aviso, ao vivo: se, enquanto alguem esta editando, outra pessoa efetivamente salvar uma alteracao nesse mesmo registro, uma faixa vermelha aparece na hora no topo da pagina - Fulano salvou uma alteracao neste registro agora, enquanto voce editava. Atualize a pagina antes de continuar, para nao perder nada. - sem precisar esperar ate a proxima tentativa de salvar para descobrir. Basta clicar em Ok para dispensar o aviso.</w:t>
+      </w:r>
+    </w:p>
+    <w:p>
+      <w:pPr>
         <w:pStyle w:val="Ttulo1"/>
         <w:pageBreakBefore/>
         <w:pBdr>
@@ -9376,7 +9422,7 @@
           <w:sz w:val="34"/>
         </w:rPr>
       </w:pPr>
-      <w:bookmarkStart w:id="20" w:name="_Toc240287079"/>
+      <w:bookmarkStart w:id="20" w:name="_Toc240288836"/>
       <w:r>
         <w:rPr>
           <w:rFonts w:ascii="Montserrat" w:hAnsi="Montserrat"/>
@@ -9418,7 +9464,7 @@
           <w:sz w:val="27"/>
         </w:rPr>
       </w:pPr>
-      <w:bookmarkStart w:id="21" w:name="_Toc240287080"/>
+      <w:bookmarkStart w:id="21" w:name="_Toc240288837"/>
       <w:r>
         <w:rPr>
           <w:rFonts w:ascii="Montserrat" w:hAnsi="Montserrat"/>
@@ -10498,16 +10544,16 @@
         </w:rPr>
         <w:lastRenderedPageBreak/>
         <w:drawing>
-          <wp:inline distT="0" distB="0" distL="0" distR="0" wp14:anchorId="1DA13AFB" wp14:editId="3BDC61A8">
+          <wp:inline distT="0" distB="0" distL="0" distR="0" wp14:anchorId="2BB77E65" wp14:editId="301FAEA7">
             <wp:extent cx="5120640" cy="4627581"/>
             <wp:effectExtent l="19050" t="19050" r="22860" b="20955"/>
-            <wp:docPr id="852489385" name="Imagem 7"/>
+            <wp:docPr id="559257073" name="Imagem 7"/>
             <wp:cNvGraphicFramePr/>
             <a:graphic xmlns:a="http://schemas.openxmlformats.org/drawingml/2006/main">
               <a:graphicData uri="http://schemas.openxmlformats.org/drawingml/2006/picture">
                 <pic:pic xmlns:pic="http://schemas.openxmlformats.org/drawingml/2006/picture">
                   <pic:nvPicPr>
-                    <pic:cNvPr id="852489385" name=""/>
+                    <pic:cNvPr id="559257073" name=""/>
                     <pic:cNvPicPr/>
                   </pic:nvPicPr>
                   <pic:blipFill>
@@ -10575,16 +10621,16 @@
         </w:rPr>
         <w:lastRenderedPageBreak/>
         <w:drawing>
-          <wp:inline distT="0" distB="0" distL="0" distR="0" wp14:anchorId="7FDF8B40" wp14:editId="659D5E90">
+          <wp:inline distT="0" distB="0" distL="0" distR="0" wp14:anchorId="09F5F294" wp14:editId="6D9AFC10">
             <wp:extent cx="5120640" cy="4627581"/>
             <wp:effectExtent l="19050" t="19050" r="22860" b="20955"/>
-            <wp:docPr id="799971615" name="Imagem 8"/>
+            <wp:docPr id="524924847" name="Imagem 8"/>
             <wp:cNvGraphicFramePr/>
             <a:graphic xmlns:a="http://schemas.openxmlformats.org/drawingml/2006/main">
               <a:graphicData uri="http://schemas.openxmlformats.org/drawingml/2006/picture">
                 <pic:pic xmlns:pic="http://schemas.openxmlformats.org/drawingml/2006/picture">
                   <pic:nvPicPr>
-                    <pic:cNvPr id="799971615" name=""/>
+                    <pic:cNvPr id="524924847" name=""/>
                     <pic:cNvPicPr/>
                   </pic:nvPicPr>
                   <pic:blipFill>
@@ -10792,7 +10838,7 @@
           <w:sz w:val="27"/>
         </w:rPr>
       </w:pPr>
-      <w:bookmarkStart w:id="22" w:name="_Toc240287081"/>
+      <w:bookmarkStart w:id="22" w:name="_Toc240288838"/>
       <w:r>
         <w:rPr>
           <w:rFonts w:ascii="Montserrat" w:hAnsi="Montserrat"/>
@@ -11717,16 +11763,16 @@
           <w:noProof/>
         </w:rPr>
         <w:drawing>
-          <wp:inline distT="0" distB="0" distL="0" distR="0" wp14:anchorId="5653ABFE" wp14:editId="7DB75F53">
+          <wp:inline distT="0" distB="0" distL="0" distR="0" wp14:anchorId="34AF165B" wp14:editId="5951288D">
             <wp:extent cx="5120640" cy="4627581"/>
             <wp:effectExtent l="19050" t="19050" r="22860" b="20955"/>
-            <wp:docPr id="627749619" name="Imagem 9"/>
+            <wp:docPr id="1527285328" name="Imagem 9"/>
             <wp:cNvGraphicFramePr/>
             <a:graphic xmlns:a="http://schemas.openxmlformats.org/drawingml/2006/main">
               <a:graphicData uri="http://schemas.openxmlformats.org/drawingml/2006/picture">
                 <pic:pic xmlns:pic="http://schemas.openxmlformats.org/drawingml/2006/picture">
                   <pic:nvPicPr>
-                    <pic:cNvPr id="627749619" name=""/>
+                    <pic:cNvPr id="1527285328" name=""/>
                     <pic:cNvPicPr/>
                   </pic:nvPicPr>
                   <pic:blipFill>
@@ -11794,16 +11840,16 @@
         </w:rPr>
         <w:lastRenderedPageBreak/>
         <w:drawing>
-          <wp:inline distT="0" distB="0" distL="0" distR="0" wp14:anchorId="4671848C" wp14:editId="0DD5F44C">
+          <wp:inline distT="0" distB="0" distL="0" distR="0" wp14:anchorId="46B7E862" wp14:editId="2E2FEEC4">
             <wp:extent cx="5120640" cy="4627581"/>
             <wp:effectExtent l="19050" t="19050" r="22860" b="20955"/>
-            <wp:docPr id="213386253" name="Imagem 10"/>
+            <wp:docPr id="1525425620" name="Imagem 10"/>
             <wp:cNvGraphicFramePr/>
             <a:graphic xmlns:a="http://schemas.openxmlformats.org/drawingml/2006/main">
               <a:graphicData uri="http://schemas.openxmlformats.org/drawingml/2006/picture">
                 <pic:pic xmlns:pic="http://schemas.openxmlformats.org/drawingml/2006/picture">
                   <pic:nvPicPr>
-                    <pic:cNvPr id="213386253" name=""/>
+                    <pic:cNvPr id="1525425620" name=""/>
                     <pic:cNvPicPr/>
                   </pic:nvPicPr>
                   <pic:blipFill>
@@ -11937,7 +11983,7 @@
           <w:sz w:val="27"/>
         </w:rPr>
       </w:pPr>
-      <w:bookmarkStart w:id="23" w:name="_Toc240287082"/>
+      <w:bookmarkStart w:id="23" w:name="_Toc240288839"/>
       <w:r>
         <w:rPr>
           <w:rFonts w:ascii="Montserrat" w:hAnsi="Montserrat"/>
@@ -13003,16 +13049,16 @@
           <w:noProof/>
         </w:rPr>
         <w:drawing>
-          <wp:inline distT="0" distB="0" distL="0" distR="0" wp14:anchorId="2FF76243" wp14:editId="0A262C40">
+          <wp:inline distT="0" distB="0" distL="0" distR="0" wp14:anchorId="4C990E74" wp14:editId="7765984E">
             <wp:extent cx="5120640" cy="3338440"/>
             <wp:effectExtent l="19050" t="19050" r="22860" b="14605"/>
-            <wp:docPr id="820234061" name="Imagem 11"/>
+            <wp:docPr id="2120631648" name="Imagem 11"/>
             <wp:cNvGraphicFramePr/>
             <a:graphic xmlns:a="http://schemas.openxmlformats.org/drawingml/2006/main">
               <a:graphicData uri="http://schemas.openxmlformats.org/drawingml/2006/picture">
                 <pic:pic xmlns:pic="http://schemas.openxmlformats.org/drawingml/2006/picture">
                   <pic:nvPicPr>
-                    <pic:cNvPr id="820234061" name=""/>
+                    <pic:cNvPr id="2120631648" name=""/>
                     <pic:cNvPicPr/>
                   </pic:nvPicPr>
                   <pic:blipFill>
@@ -13080,16 +13126,16 @@
         </w:rPr>
         <w:lastRenderedPageBreak/>
         <w:drawing>
-          <wp:inline distT="0" distB="0" distL="0" distR="0" wp14:anchorId="013EE7EE" wp14:editId="1441FA59">
+          <wp:inline distT="0" distB="0" distL="0" distR="0" wp14:anchorId="2FD3C690" wp14:editId="7260E6C5">
             <wp:extent cx="5120640" cy="4627581"/>
             <wp:effectExtent l="19050" t="19050" r="22860" b="20955"/>
-            <wp:docPr id="106750286" name="Imagem 12"/>
+            <wp:docPr id="1962071656" name="Imagem 12"/>
             <wp:cNvGraphicFramePr/>
             <a:graphic xmlns:a="http://schemas.openxmlformats.org/drawingml/2006/main">
               <a:graphicData uri="http://schemas.openxmlformats.org/drawingml/2006/picture">
                 <pic:pic xmlns:pic="http://schemas.openxmlformats.org/drawingml/2006/picture">
                   <pic:nvPicPr>
-                    <pic:cNvPr id="106750286" name=""/>
+                    <pic:cNvPr id="1962071656" name=""/>
                     <pic:cNvPicPr/>
                   </pic:nvPicPr>
                   <pic:blipFill>
@@ -13293,7 +13339,7 @@
           <w:sz w:val="27"/>
         </w:rPr>
       </w:pPr>
-      <w:bookmarkStart w:id="24" w:name="_Toc240287083"/>
+      <w:bookmarkStart w:id="24" w:name="_Toc240288840"/>
       <w:r>
         <w:rPr>
           <w:rFonts w:ascii="Montserrat" w:hAnsi="Montserrat"/>
@@ -13854,16 +13900,16 @@
           <w:noProof/>
         </w:rPr>
         <w:drawing>
-          <wp:inline distT="0" distB="0" distL="0" distR="0" wp14:anchorId="508C0CBC" wp14:editId="131AEB20">
+          <wp:inline distT="0" distB="0" distL="0" distR="0" wp14:anchorId="761A06D3" wp14:editId="594489F3">
             <wp:extent cx="5120640" cy="4627581"/>
             <wp:effectExtent l="19050" t="19050" r="22860" b="20955"/>
-            <wp:docPr id="1151842662" name="Imagem 13"/>
+            <wp:docPr id="1127119310" name="Imagem 13"/>
             <wp:cNvGraphicFramePr/>
             <a:graphic xmlns:a="http://schemas.openxmlformats.org/drawingml/2006/main">
               <a:graphicData uri="http://schemas.openxmlformats.org/drawingml/2006/picture">
                 <pic:pic xmlns:pic="http://schemas.openxmlformats.org/drawingml/2006/picture">
                   <pic:nvPicPr>
-                    <pic:cNvPr id="1151842662" name=""/>
+                    <pic:cNvPr id="1127119310" name=""/>
                     <pic:cNvPicPr/>
                   </pic:nvPicPr>
                   <pic:blipFill>
@@ -13931,16 +13977,16 @@
         </w:rPr>
         <w:lastRenderedPageBreak/>
         <w:drawing>
-          <wp:inline distT="0" distB="0" distL="0" distR="0" wp14:anchorId="01F2F69F" wp14:editId="63281440">
+          <wp:inline distT="0" distB="0" distL="0" distR="0" wp14:anchorId="2869B01C" wp14:editId="63FDEAC4">
             <wp:extent cx="5120640" cy="4627581"/>
             <wp:effectExtent l="19050" t="19050" r="22860" b="20955"/>
-            <wp:docPr id="65540982" name="Imagem 14"/>
+            <wp:docPr id="2089020919" name="Imagem 14"/>
             <wp:cNvGraphicFramePr/>
             <a:graphic xmlns:a="http://schemas.openxmlformats.org/drawingml/2006/main">
               <a:graphicData uri="http://schemas.openxmlformats.org/drawingml/2006/picture">
                 <pic:pic xmlns:pic="http://schemas.openxmlformats.org/drawingml/2006/picture">
                   <pic:nvPicPr>
-                    <pic:cNvPr id="65540982" name=""/>
+                    <pic:cNvPr id="2089020919" name=""/>
                     <pic:cNvPicPr/>
                   </pic:nvPicPr>
                   <pic:blipFill>
@@ -14192,7 +14238,7 @@
           <w:sz w:val="27"/>
         </w:rPr>
       </w:pPr>
-      <w:bookmarkStart w:id="25" w:name="_Toc240287084"/>
+      <w:bookmarkStart w:id="25" w:name="_Toc240288841"/>
       <w:r>
         <w:rPr>
           <w:rFonts w:ascii="Montserrat" w:hAnsi="Montserrat"/>
@@ -14232,16 +14278,16 @@
           <w:noProof/>
         </w:rPr>
         <w:drawing>
-          <wp:inline distT="0" distB="0" distL="0" distR="0" wp14:anchorId="72CAAB2B" wp14:editId="54A86415">
+          <wp:inline distT="0" distB="0" distL="0" distR="0" wp14:anchorId="1D538EA5" wp14:editId="4E309021">
             <wp:extent cx="5120640" cy="4627581"/>
             <wp:effectExtent l="19050" t="19050" r="22860" b="20955"/>
-            <wp:docPr id="1954618766" name="Imagem 15"/>
+            <wp:docPr id="2027894118" name="Imagem 15"/>
             <wp:cNvGraphicFramePr/>
             <a:graphic xmlns:a="http://schemas.openxmlformats.org/drawingml/2006/main">
               <a:graphicData uri="http://schemas.openxmlformats.org/drawingml/2006/picture">
                 <pic:pic xmlns:pic="http://schemas.openxmlformats.org/drawingml/2006/picture">
                   <pic:nvPicPr>
-                    <pic:cNvPr id="1954618766" name=""/>
+                    <pic:cNvPr id="2027894118" name=""/>
                     <pic:cNvPicPr/>
                   </pic:nvPicPr>
                   <pic:blipFill>
@@ -14309,16 +14355,16 @@
         </w:rPr>
         <w:lastRenderedPageBreak/>
         <w:drawing>
-          <wp:inline distT="0" distB="0" distL="0" distR="0" wp14:anchorId="3A145D07" wp14:editId="48909585">
+          <wp:inline distT="0" distB="0" distL="0" distR="0" wp14:anchorId="7B1DF6B9" wp14:editId="083A1590">
             <wp:extent cx="5120640" cy="4627581"/>
             <wp:effectExtent l="19050" t="19050" r="22860" b="20955"/>
-            <wp:docPr id="369201790" name="Imagem 16"/>
+            <wp:docPr id="780808792" name="Imagem 16"/>
             <wp:cNvGraphicFramePr/>
             <a:graphic xmlns:a="http://schemas.openxmlformats.org/drawingml/2006/main">
               <a:graphicData uri="http://schemas.openxmlformats.org/drawingml/2006/picture">
                 <pic:pic xmlns:pic="http://schemas.openxmlformats.org/drawingml/2006/picture">
                   <pic:nvPicPr>
-                    <pic:cNvPr id="369201790" name=""/>
+                    <pic:cNvPr id="780808792" name=""/>
                     <pic:cNvPicPr/>
                   </pic:nvPicPr>
                   <pic:blipFill>
@@ -14482,16 +14528,16 @@
         </w:rPr>
         <w:lastRenderedPageBreak/>
         <w:drawing>
-          <wp:inline distT="0" distB="0" distL="0" distR="0" wp14:anchorId="18E12108" wp14:editId="07EA283F">
+          <wp:inline distT="0" distB="0" distL="0" distR="0" wp14:anchorId="114D9481" wp14:editId="2CCD54D6">
             <wp:extent cx="5120640" cy="3282818"/>
             <wp:effectExtent l="19050" t="19050" r="22860" b="13335"/>
-            <wp:docPr id="1786388733" name="Imagem 17"/>
+            <wp:docPr id="187875802" name="Imagem 17"/>
             <wp:cNvGraphicFramePr/>
             <a:graphic xmlns:a="http://schemas.openxmlformats.org/drawingml/2006/main">
               <a:graphicData uri="http://schemas.openxmlformats.org/drawingml/2006/picture">
                 <pic:pic xmlns:pic="http://schemas.openxmlformats.org/drawingml/2006/picture">
                   <pic:nvPicPr>
-                    <pic:cNvPr id="1786388733" name=""/>
+                    <pic:cNvPr id="187875802" name=""/>
                     <pic:cNvPicPr/>
                   </pic:nvPicPr>
                   <pic:blipFill>
@@ -14682,7 +14728,7 @@
           <w:sz w:val="27"/>
         </w:rPr>
       </w:pPr>
-      <w:bookmarkStart w:id="26" w:name="_Toc240287085"/>
+      <w:bookmarkStart w:id="26" w:name="_Toc240288842"/>
       <w:r>
         <w:rPr>
           <w:rFonts w:ascii="Montserrat" w:hAnsi="Montserrat"/>
@@ -14722,16 +14768,16 @@
           <w:noProof/>
         </w:rPr>
         <w:drawing>
-          <wp:inline distT="0" distB="0" distL="0" distR="0" wp14:anchorId="15409306" wp14:editId="6F2341AD">
+          <wp:inline distT="0" distB="0" distL="0" distR="0" wp14:anchorId="361D8413" wp14:editId="46FB990F">
             <wp:extent cx="5120640" cy="4627581"/>
             <wp:effectExtent l="19050" t="19050" r="22860" b="20955"/>
-            <wp:docPr id="722093830" name="Imagem 18"/>
+            <wp:docPr id="700835178" name="Imagem 18"/>
             <wp:cNvGraphicFramePr/>
             <a:graphic xmlns:a="http://schemas.openxmlformats.org/drawingml/2006/main">
               <a:graphicData uri="http://schemas.openxmlformats.org/drawingml/2006/picture">
                 <pic:pic xmlns:pic="http://schemas.openxmlformats.org/drawingml/2006/picture">
                   <pic:nvPicPr>
-                    <pic:cNvPr id="722093830" name=""/>
+                    <pic:cNvPr id="700835178" name=""/>
                     <pic:cNvPicPr/>
                   </pic:nvPicPr>
                   <pic:blipFill>
@@ -14799,16 +14845,16 @@
         </w:rPr>
         <w:lastRenderedPageBreak/>
         <w:drawing>
-          <wp:inline distT="0" distB="0" distL="0" distR="0" wp14:anchorId="07F5EAB4" wp14:editId="4DF93BA2">
+          <wp:inline distT="0" distB="0" distL="0" distR="0" wp14:anchorId="5077D951" wp14:editId="710A8287">
             <wp:extent cx="5120640" cy="4627581"/>
             <wp:effectExtent l="19050" t="19050" r="22860" b="20955"/>
-            <wp:docPr id="476318106" name="Imagem 19"/>
+            <wp:docPr id="1576126529" name="Imagem 19"/>
             <wp:cNvGraphicFramePr/>
             <a:graphic xmlns:a="http://schemas.openxmlformats.org/drawingml/2006/main">
               <a:graphicData uri="http://schemas.openxmlformats.org/drawingml/2006/picture">
                 <pic:pic xmlns:pic="http://schemas.openxmlformats.org/drawingml/2006/picture">
                   <pic:nvPicPr>
-                    <pic:cNvPr id="476318106" name=""/>
+                    <pic:cNvPr id="1576126529" name=""/>
                     <pic:cNvPicPr/>
                   </pic:nvPicPr>
                   <pic:blipFill>
@@ -14991,7 +15037,7 @@
           <w:sz w:val="27"/>
         </w:rPr>
       </w:pPr>
-      <w:bookmarkStart w:id="27" w:name="_Toc240287086"/>
+      <w:bookmarkStart w:id="27" w:name="_Toc240288843"/>
       <w:r>
         <w:rPr>
           <w:rFonts w:ascii="Montserrat" w:hAnsi="Montserrat"/>
@@ -15031,16 +15077,16 @@
           <w:noProof/>
         </w:rPr>
         <w:drawing>
-          <wp:inline distT="0" distB="0" distL="0" distR="0" wp14:anchorId="4F8FAA1B" wp14:editId="6996FE87">
+          <wp:inline distT="0" distB="0" distL="0" distR="0" wp14:anchorId="27DB2FA8" wp14:editId="26561508">
             <wp:extent cx="5120640" cy="4627581"/>
             <wp:effectExtent l="19050" t="19050" r="22860" b="20955"/>
-            <wp:docPr id="302276857" name="Imagem 20"/>
+            <wp:docPr id="1356397207" name="Imagem 20"/>
             <wp:cNvGraphicFramePr/>
             <a:graphic xmlns:a="http://schemas.openxmlformats.org/drawingml/2006/main">
               <a:graphicData uri="http://schemas.openxmlformats.org/drawingml/2006/picture">
                 <pic:pic xmlns:pic="http://schemas.openxmlformats.org/drawingml/2006/picture">
                   <pic:nvPicPr>
-                    <pic:cNvPr id="302276857" name=""/>
+                    <pic:cNvPr id="1356397207" name=""/>
                     <pic:cNvPicPr/>
                   </pic:nvPicPr>
                   <pic:blipFill>
@@ -15108,16 +15154,16 @@
         </w:rPr>
         <w:lastRenderedPageBreak/>
         <w:drawing>
-          <wp:inline distT="0" distB="0" distL="0" distR="0" wp14:anchorId="45D72D7E" wp14:editId="4F0465DF">
+          <wp:inline distT="0" distB="0" distL="0" distR="0" wp14:anchorId="26D8FEFB" wp14:editId="0A8F0DBC">
             <wp:extent cx="5120640" cy="4627581"/>
             <wp:effectExtent l="19050" t="19050" r="22860" b="20955"/>
-            <wp:docPr id="1425507464" name="Imagem 21"/>
+            <wp:docPr id="1937785312" name="Imagem 21"/>
             <wp:cNvGraphicFramePr/>
             <a:graphic xmlns:a="http://schemas.openxmlformats.org/drawingml/2006/main">
               <a:graphicData uri="http://schemas.openxmlformats.org/drawingml/2006/picture">
                 <pic:pic xmlns:pic="http://schemas.openxmlformats.org/drawingml/2006/picture">
                   <pic:nvPicPr>
-                    <pic:cNvPr id="1425507464" name=""/>
+                    <pic:cNvPr id="1937785312" name=""/>
                     <pic:cNvPicPr/>
                   </pic:nvPicPr>
                   <pic:blipFill>
@@ -15323,16 +15369,16 @@
           <w:noProof/>
         </w:rPr>
         <w:drawing>
-          <wp:inline distT="0" distB="0" distL="0" distR="0" wp14:anchorId="1FA11705" wp14:editId="7745BD8C">
+          <wp:inline distT="0" distB="0" distL="0" distR="0" wp14:anchorId="421D87C9" wp14:editId="39FE33D8">
             <wp:extent cx="5120640" cy="1757287"/>
             <wp:effectExtent l="19050" t="19050" r="22860" b="14605"/>
-            <wp:docPr id="942217918" name="Imagem 22"/>
+            <wp:docPr id="1525892999" name="Imagem 22"/>
             <wp:cNvGraphicFramePr/>
             <a:graphic xmlns:a="http://schemas.openxmlformats.org/drawingml/2006/main">
               <a:graphicData uri="http://schemas.openxmlformats.org/drawingml/2006/picture">
                 <pic:pic xmlns:pic="http://schemas.openxmlformats.org/drawingml/2006/picture">
                   <pic:nvPicPr>
-                    <pic:cNvPr id="942217918" name=""/>
+                    <pic:cNvPr id="1525892999" name=""/>
                     <pic:cNvPicPr/>
                   </pic:nvPicPr>
                   <pic:blipFill>
@@ -15445,7 +15491,7 @@
           <w:sz w:val="27"/>
         </w:rPr>
       </w:pPr>
-      <w:bookmarkStart w:id="28" w:name="_Toc240287087"/>
+      <w:bookmarkStart w:id="28" w:name="_Toc240288844"/>
       <w:r>
         <w:rPr>
           <w:rFonts w:ascii="Montserrat" w:hAnsi="Montserrat"/>
@@ -15486,16 +15532,16 @@
         </w:rPr>
         <w:lastRenderedPageBreak/>
         <w:drawing>
-          <wp:inline distT="0" distB="0" distL="0" distR="0" wp14:anchorId="24D7CFC5" wp14:editId="6A388DD7">
+          <wp:inline distT="0" distB="0" distL="0" distR="0" wp14:anchorId="68D06BB4" wp14:editId="3D2D22F5">
             <wp:extent cx="5120640" cy="4627581"/>
             <wp:effectExtent l="19050" t="19050" r="22860" b="20955"/>
-            <wp:docPr id="381807207" name="Imagem 23"/>
+            <wp:docPr id="362142147" name="Imagem 23"/>
             <wp:cNvGraphicFramePr/>
             <a:graphic xmlns:a="http://schemas.openxmlformats.org/drawingml/2006/main">
               <a:graphicData uri="http://schemas.openxmlformats.org/drawingml/2006/picture">
                 <pic:pic xmlns:pic="http://schemas.openxmlformats.org/drawingml/2006/picture">
                   <pic:nvPicPr>
-                    <pic:cNvPr id="381807207" name=""/>
+                    <pic:cNvPr id="362142147" name=""/>
                     <pic:cNvPicPr/>
                   </pic:nvPicPr>
                   <pic:blipFill>
@@ -15563,16 +15609,16 @@
         </w:rPr>
         <w:lastRenderedPageBreak/>
         <w:drawing>
-          <wp:inline distT="0" distB="0" distL="0" distR="0" wp14:anchorId="7DB533B8" wp14:editId="45D12497">
+          <wp:inline distT="0" distB="0" distL="0" distR="0" wp14:anchorId="4E29BCD2" wp14:editId="6C99519B">
             <wp:extent cx="5120640" cy="4627581"/>
             <wp:effectExtent l="19050" t="19050" r="22860" b="20955"/>
-            <wp:docPr id="351641533" name="Imagem 24"/>
+            <wp:docPr id="1970465561" name="Imagem 24"/>
             <wp:cNvGraphicFramePr/>
             <a:graphic xmlns:a="http://schemas.openxmlformats.org/drawingml/2006/main">
               <a:graphicData uri="http://schemas.openxmlformats.org/drawingml/2006/picture">
                 <pic:pic xmlns:pic="http://schemas.openxmlformats.org/drawingml/2006/picture">
                   <pic:nvPicPr>
-                    <pic:cNvPr id="351641533" name=""/>
+                    <pic:cNvPr id="1970465561" name=""/>
                     <pic:cNvPicPr/>
                   </pic:nvPicPr>
                   <pic:blipFill>
@@ -15809,7 +15855,7 @@
           <w:sz w:val="27"/>
         </w:rPr>
       </w:pPr>
-      <w:bookmarkStart w:id="29" w:name="_Toc240287088"/>
+      <w:bookmarkStart w:id="29" w:name="_Toc240288845"/>
       <w:r>
         <w:rPr>
           <w:rFonts w:ascii="Montserrat" w:hAnsi="Montserrat"/>
@@ -15849,16 +15895,16 @@
           <w:noProof/>
         </w:rPr>
         <w:drawing>
-          <wp:inline distT="0" distB="0" distL="0" distR="0" wp14:anchorId="41E89E84" wp14:editId="14874D19">
+          <wp:inline distT="0" distB="0" distL="0" distR="0" wp14:anchorId="18D7AD48" wp14:editId="63EB43F8">
             <wp:extent cx="5120640" cy="4627581"/>
             <wp:effectExtent l="19050" t="19050" r="22860" b="20955"/>
-            <wp:docPr id="1245844915" name="Imagem 25"/>
+            <wp:docPr id="696374928" name="Imagem 25"/>
             <wp:cNvGraphicFramePr/>
             <a:graphic xmlns:a="http://schemas.openxmlformats.org/drawingml/2006/main">
               <a:graphicData uri="http://schemas.openxmlformats.org/drawingml/2006/picture">
                 <pic:pic xmlns:pic="http://schemas.openxmlformats.org/drawingml/2006/picture">
                   <pic:nvPicPr>
-                    <pic:cNvPr id="1245844915" name=""/>
+                    <pic:cNvPr id="696374928" name=""/>
                     <pic:cNvPicPr/>
                   </pic:nvPicPr>
                   <pic:blipFill>
@@ -15926,16 +15972,16 @@
         </w:rPr>
         <w:lastRenderedPageBreak/>
         <w:drawing>
-          <wp:inline distT="0" distB="0" distL="0" distR="0" wp14:anchorId="7EFA2D42" wp14:editId="69D6CD89">
+          <wp:inline distT="0" distB="0" distL="0" distR="0" wp14:anchorId="333F471A" wp14:editId="1F1C15DE">
             <wp:extent cx="5120640" cy="4627581"/>
             <wp:effectExtent l="19050" t="19050" r="22860" b="20955"/>
-            <wp:docPr id="291026118" name="Imagem 26"/>
+            <wp:docPr id="568779535" name="Imagem 26"/>
             <wp:cNvGraphicFramePr/>
             <a:graphic xmlns:a="http://schemas.openxmlformats.org/drawingml/2006/main">
               <a:graphicData uri="http://schemas.openxmlformats.org/drawingml/2006/picture">
                 <pic:pic xmlns:pic="http://schemas.openxmlformats.org/drawingml/2006/picture">
                   <pic:nvPicPr>
-                    <pic:cNvPr id="291026118" name=""/>
+                    <pic:cNvPr id="568779535" name=""/>
                     <pic:cNvPicPr/>
                   </pic:nvPicPr>
                   <pic:blipFill>
@@ -16126,7 +16172,7 @@
           <w:sz w:val="27"/>
         </w:rPr>
       </w:pPr>
-      <w:bookmarkStart w:id="30" w:name="_Toc240287089"/>
+      <w:bookmarkStart w:id="30" w:name="_Toc240288846"/>
       <w:r>
         <w:rPr>
           <w:rFonts w:ascii="Montserrat" w:hAnsi="Montserrat"/>
@@ -16166,16 +16212,16 @@
           <w:noProof/>
         </w:rPr>
         <w:drawing>
-          <wp:inline distT="0" distB="0" distL="0" distR="0" wp14:anchorId="191CDE5F" wp14:editId="5A56C986">
+          <wp:inline distT="0" distB="0" distL="0" distR="0" wp14:anchorId="6F48EC5D" wp14:editId="599431E0">
             <wp:extent cx="5120640" cy="4000682"/>
             <wp:effectExtent l="19050" t="19050" r="22860" b="19050"/>
-            <wp:docPr id="1488277033" name="Imagem 27"/>
+            <wp:docPr id="685525546" name="Imagem 27"/>
             <wp:cNvGraphicFramePr/>
             <a:graphic xmlns:a="http://schemas.openxmlformats.org/drawingml/2006/main">
               <a:graphicData uri="http://schemas.openxmlformats.org/drawingml/2006/picture">
                 <pic:pic xmlns:pic="http://schemas.openxmlformats.org/drawingml/2006/picture">
                   <pic:nvPicPr>
-                    <pic:cNvPr id="1488277033" name=""/>
+                    <pic:cNvPr id="685525546" name=""/>
                     <pic:cNvPicPr/>
                   </pic:nvPicPr>
                   <pic:blipFill>
@@ -16699,7 +16745,7 @@
           <w:sz w:val="34"/>
         </w:rPr>
       </w:pPr>
-      <w:bookmarkStart w:id="31" w:name="_Toc240287090"/>
+      <w:bookmarkStart w:id="31" w:name="_Toc240288847"/>
       <w:r>
         <w:rPr>
           <w:rFonts w:ascii="Montserrat" w:hAnsi="Montserrat"/>
@@ -16741,7 +16787,7 @@
           <w:sz w:val="27"/>
         </w:rPr>
       </w:pPr>
-      <w:bookmarkStart w:id="32" w:name="_Toc240287091"/>
+      <w:bookmarkStart w:id="32" w:name="_Toc240288848"/>
       <w:r>
         <w:rPr>
           <w:rFonts w:ascii="Montserrat" w:hAnsi="Montserrat"/>
@@ -16781,16 +16827,16 @@
           <w:noProof/>
         </w:rPr>
         <w:drawing>
-          <wp:inline distT="0" distB="0" distL="0" distR="0" wp14:anchorId="5DB59F5E" wp14:editId="33C3F034">
+          <wp:inline distT="0" distB="0" distL="0" distR="0" wp14:anchorId="19507DCC" wp14:editId="04AD7172">
             <wp:extent cx="5120640" cy="4627581"/>
             <wp:effectExtent l="19050" t="19050" r="22860" b="20955"/>
-            <wp:docPr id="1955577731" name="Imagem 28"/>
+            <wp:docPr id="1024547771" name="Imagem 28"/>
             <wp:cNvGraphicFramePr/>
             <a:graphic xmlns:a="http://schemas.openxmlformats.org/drawingml/2006/main">
               <a:graphicData uri="http://schemas.openxmlformats.org/drawingml/2006/picture">
                 <pic:pic xmlns:pic="http://schemas.openxmlformats.org/drawingml/2006/picture">
                   <pic:nvPicPr>
-                    <pic:cNvPr id="1955577731" name=""/>
+                    <pic:cNvPr id="1024547771" name=""/>
                     <pic:cNvPicPr/>
                   </pic:nvPicPr>
                   <pic:blipFill>
@@ -16858,16 +16904,16 @@
         </w:rPr>
         <w:lastRenderedPageBreak/>
         <w:drawing>
-          <wp:inline distT="0" distB="0" distL="0" distR="0" wp14:anchorId="0FAB8D20" wp14:editId="66A0B7D9">
+          <wp:inline distT="0" distB="0" distL="0" distR="0" wp14:anchorId="491AAEF3" wp14:editId="3424DB53">
             <wp:extent cx="5120640" cy="4627581"/>
             <wp:effectExtent l="19050" t="19050" r="22860" b="20955"/>
-            <wp:docPr id="1511967182" name="Imagem 29"/>
+            <wp:docPr id="1820826008" name="Imagem 29"/>
             <wp:cNvGraphicFramePr/>
             <a:graphic xmlns:a="http://schemas.openxmlformats.org/drawingml/2006/main">
               <a:graphicData uri="http://schemas.openxmlformats.org/drawingml/2006/picture">
                 <pic:pic xmlns:pic="http://schemas.openxmlformats.org/drawingml/2006/picture">
                   <pic:nvPicPr>
-                    <pic:cNvPr id="1511967182" name=""/>
+                    <pic:cNvPr id="1820826008" name=""/>
                     <pic:cNvPicPr/>
                   </pic:nvPicPr>
                   <pic:blipFill>
@@ -16935,16 +16981,16 @@
         </w:rPr>
         <w:lastRenderedPageBreak/>
         <w:drawing>
-          <wp:inline distT="0" distB="0" distL="0" distR="0" wp14:anchorId="7578F0CC" wp14:editId="269C245E">
+          <wp:inline distT="0" distB="0" distL="0" distR="0" wp14:anchorId="0F4BAA66" wp14:editId="7C254986">
             <wp:extent cx="5120640" cy="4627581"/>
             <wp:effectExtent l="19050" t="19050" r="22860" b="20955"/>
-            <wp:docPr id="1713793981" name="Imagem 30"/>
+            <wp:docPr id="1711019407" name="Imagem 30"/>
             <wp:cNvGraphicFramePr/>
             <a:graphic xmlns:a="http://schemas.openxmlformats.org/drawingml/2006/main">
               <a:graphicData uri="http://schemas.openxmlformats.org/drawingml/2006/picture">
                 <pic:pic xmlns:pic="http://schemas.openxmlformats.org/drawingml/2006/picture">
                   <pic:nvPicPr>
-                    <pic:cNvPr id="1713793981" name=""/>
+                    <pic:cNvPr id="1711019407" name=""/>
                     <pic:cNvPicPr/>
                   </pic:nvPicPr>
                   <pic:blipFill>
@@ -17146,16 +17192,16 @@
           <w:noProof/>
         </w:rPr>
         <w:drawing>
-          <wp:inline distT="0" distB="0" distL="0" distR="0" wp14:anchorId="695B285E" wp14:editId="036ECB9A">
+          <wp:inline distT="0" distB="0" distL="0" distR="0" wp14:anchorId="21719EB9" wp14:editId="646E2F12">
             <wp:extent cx="5120640" cy="1715571"/>
             <wp:effectExtent l="19050" t="19050" r="22860" b="18415"/>
-            <wp:docPr id="528591630" name="Imagem 31"/>
+            <wp:docPr id="699957874" name="Imagem 31"/>
             <wp:cNvGraphicFramePr/>
             <a:graphic xmlns:a="http://schemas.openxmlformats.org/drawingml/2006/main">
               <a:graphicData uri="http://schemas.openxmlformats.org/drawingml/2006/picture">
                 <pic:pic xmlns:pic="http://schemas.openxmlformats.org/drawingml/2006/picture">
                   <pic:nvPicPr>
-                    <pic:cNvPr id="528591630" name=""/>
+                    <pic:cNvPr id="699957874" name=""/>
                     <pic:cNvPicPr/>
                   </pic:nvPicPr>
                   <pic:blipFill>
@@ -17292,16 +17338,16 @@
           <w:noProof/>
         </w:rPr>
         <w:drawing>
-          <wp:inline distT="0" distB="0" distL="0" distR="0" wp14:anchorId="0CD640F2" wp14:editId="31B646CF">
+          <wp:inline distT="0" distB="0" distL="0" distR="0" wp14:anchorId="1CC2FA72" wp14:editId="21E8B38B">
             <wp:extent cx="5120640" cy="3282818"/>
             <wp:effectExtent l="19050" t="19050" r="22860" b="13335"/>
-            <wp:docPr id="1145397659" name="Imagem 32"/>
+            <wp:docPr id="1776384242" name="Imagem 32"/>
             <wp:cNvGraphicFramePr/>
             <a:graphic xmlns:a="http://schemas.openxmlformats.org/drawingml/2006/main">
               <a:graphicData uri="http://schemas.openxmlformats.org/drawingml/2006/picture">
                 <pic:pic xmlns:pic="http://schemas.openxmlformats.org/drawingml/2006/picture">
                   <pic:nvPicPr>
-                    <pic:cNvPr id="1145397659" name=""/>
+                    <pic:cNvPr id="1776384242" name=""/>
                     <pic:cNvPicPr/>
                   </pic:nvPicPr>
                   <pic:blipFill>
@@ -17435,16 +17481,16 @@
           <w:noProof/>
         </w:rPr>
         <w:drawing>
-          <wp:inline distT="0" distB="0" distL="0" distR="0" wp14:anchorId="67D6F4A1" wp14:editId="10ED6C14">
+          <wp:inline distT="0" distB="0" distL="0" distR="0" wp14:anchorId="1225DCD4" wp14:editId="3E4902F6">
             <wp:extent cx="5120640" cy="951357"/>
             <wp:effectExtent l="19050" t="19050" r="22860" b="20320"/>
-            <wp:docPr id="963218077" name="Imagem 33"/>
+            <wp:docPr id="1623401111" name="Imagem 33"/>
             <wp:cNvGraphicFramePr/>
             <a:graphic xmlns:a="http://schemas.openxmlformats.org/drawingml/2006/main">
               <a:graphicData uri="http://schemas.openxmlformats.org/drawingml/2006/picture">
                 <pic:pic xmlns:pic="http://schemas.openxmlformats.org/drawingml/2006/picture">
                   <pic:nvPicPr>
-                    <pic:cNvPr id="963218077" name=""/>
+                    <pic:cNvPr id="1623401111" name=""/>
                     <pic:cNvPicPr/>
                   </pic:nvPicPr>
                   <pic:blipFill>
@@ -17556,16 +17602,16 @@
           <w:noProof/>
         </w:rPr>
         <w:drawing>
-          <wp:inline distT="0" distB="0" distL="0" distR="0" wp14:anchorId="17D50CEA" wp14:editId="76030F45">
+          <wp:inline distT="0" distB="0" distL="0" distR="0" wp14:anchorId="32E9E3D2" wp14:editId="01902857">
             <wp:extent cx="5120640" cy="1515102"/>
             <wp:effectExtent l="19050" t="19050" r="22860" b="28575"/>
-            <wp:docPr id="134792519" name="Imagem 34"/>
+            <wp:docPr id="1030429549" name="Imagem 34"/>
             <wp:cNvGraphicFramePr/>
             <a:graphic xmlns:a="http://schemas.openxmlformats.org/drawingml/2006/main">
               <a:graphicData uri="http://schemas.openxmlformats.org/drawingml/2006/picture">
                 <pic:pic xmlns:pic="http://schemas.openxmlformats.org/drawingml/2006/picture">
                   <pic:nvPicPr>
-                    <pic:cNvPr id="134792519" name=""/>
+                    <pic:cNvPr id="1030429549" name=""/>
                     <pic:cNvPicPr/>
                   </pic:nvPicPr>
                   <pic:blipFill>
@@ -17678,16 +17724,16 @@
           <w:noProof/>
         </w:rPr>
         <w:drawing>
-          <wp:inline distT="0" distB="0" distL="0" distR="0" wp14:anchorId="298723CD" wp14:editId="46CE1F16">
+          <wp:inline distT="0" distB="0" distL="0" distR="0" wp14:anchorId="2E72EFA0" wp14:editId="6FD742FF">
             <wp:extent cx="5120640" cy="1391113"/>
             <wp:effectExtent l="19050" t="19050" r="22860" b="19050"/>
-            <wp:docPr id="1187428409" name="Imagem 35"/>
+            <wp:docPr id="432137156" name="Imagem 35"/>
             <wp:cNvGraphicFramePr/>
             <a:graphic xmlns:a="http://schemas.openxmlformats.org/drawingml/2006/main">
               <a:graphicData uri="http://schemas.openxmlformats.org/drawingml/2006/picture">
                 <pic:pic xmlns:pic="http://schemas.openxmlformats.org/drawingml/2006/picture">
                   <pic:nvPicPr>
-                    <pic:cNvPr id="1187428409" name=""/>
+                    <pic:cNvPr id="432137156" name=""/>
                     <pic:cNvPicPr/>
                   </pic:nvPicPr>
                   <pic:blipFill>
@@ -17799,16 +17845,16 @@
           <w:noProof/>
         </w:rPr>
         <w:drawing>
-          <wp:inline distT="0" distB="0" distL="0" distR="0" wp14:anchorId="418E9686" wp14:editId="4F2403FD">
+          <wp:inline distT="0" distB="0" distL="0" distR="0" wp14:anchorId="0BFF1F2B" wp14:editId="03AA4438">
             <wp:extent cx="5120640" cy="1125174"/>
             <wp:effectExtent l="19050" t="19050" r="22860" b="18415"/>
-            <wp:docPr id="1574941464" name="Imagem 36"/>
+            <wp:docPr id="1967076966" name="Imagem 36"/>
             <wp:cNvGraphicFramePr/>
             <a:graphic xmlns:a="http://schemas.openxmlformats.org/drawingml/2006/main">
               <a:graphicData uri="http://schemas.openxmlformats.org/drawingml/2006/picture">
                 <pic:pic xmlns:pic="http://schemas.openxmlformats.org/drawingml/2006/picture">
                   <pic:nvPicPr>
-                    <pic:cNvPr id="1574941464" name=""/>
+                    <pic:cNvPr id="1967076966" name=""/>
                     <pic:cNvPicPr/>
                   </pic:nvPicPr>
                   <pic:blipFill>
@@ -17898,7 +17944,7 @@
           <w:sz w:val="27"/>
         </w:rPr>
       </w:pPr>
-      <w:bookmarkStart w:id="33" w:name="_Toc240287092"/>
+      <w:bookmarkStart w:id="33" w:name="_Toc240288849"/>
       <w:r>
         <w:rPr>
           <w:rFonts w:ascii="Montserrat" w:hAnsi="Montserrat"/>
@@ -17938,16 +17984,16 @@
           <w:noProof/>
         </w:rPr>
         <w:drawing>
-          <wp:inline distT="0" distB="0" distL="0" distR="0" wp14:anchorId="4DD22E3E" wp14:editId="4AD140C1">
+          <wp:inline distT="0" distB="0" distL="0" distR="0" wp14:anchorId="1C2B9A20" wp14:editId="025EE0CA">
             <wp:extent cx="5120640" cy="4627581"/>
             <wp:effectExtent l="19050" t="19050" r="22860" b="20955"/>
-            <wp:docPr id="1887529643" name="Imagem 37"/>
+            <wp:docPr id="1634243" name="Imagem 37"/>
             <wp:cNvGraphicFramePr/>
             <a:graphic xmlns:a="http://schemas.openxmlformats.org/drawingml/2006/main">
               <a:graphicData uri="http://schemas.openxmlformats.org/drawingml/2006/picture">
                 <pic:pic xmlns:pic="http://schemas.openxmlformats.org/drawingml/2006/picture">
                   <pic:nvPicPr>
-                    <pic:cNvPr id="1887529643" name=""/>
+                    <pic:cNvPr id="1634243" name=""/>
                     <pic:cNvPicPr/>
                   </pic:nvPicPr>
                   <pic:blipFill>
@@ -18015,16 +18061,16 @@
         </w:rPr>
         <w:lastRenderedPageBreak/>
         <w:drawing>
-          <wp:inline distT="0" distB="0" distL="0" distR="0" wp14:anchorId="1EE8521D" wp14:editId="71D786CC">
+          <wp:inline distT="0" distB="0" distL="0" distR="0" wp14:anchorId="1035B7D7" wp14:editId="10618213">
             <wp:extent cx="5120640" cy="4627581"/>
             <wp:effectExtent l="19050" t="19050" r="22860" b="20955"/>
-            <wp:docPr id="2022920325" name="Imagem 38"/>
+            <wp:docPr id="1218621459" name="Imagem 38"/>
             <wp:cNvGraphicFramePr/>
             <a:graphic xmlns:a="http://schemas.openxmlformats.org/drawingml/2006/main">
               <a:graphicData uri="http://schemas.openxmlformats.org/drawingml/2006/picture">
                 <pic:pic xmlns:pic="http://schemas.openxmlformats.org/drawingml/2006/picture">
                   <pic:nvPicPr>
-                    <pic:cNvPr id="2022920325" name=""/>
+                    <pic:cNvPr id="1218621459" name=""/>
                     <pic:cNvPicPr/>
                   </pic:nvPicPr>
                   <pic:blipFill>
@@ -18193,16 +18239,16 @@
           <w:noProof/>
         </w:rPr>
         <w:drawing>
-          <wp:inline distT="0" distB="0" distL="0" distR="0" wp14:anchorId="699DC46F" wp14:editId="70AAA99D">
+          <wp:inline distT="0" distB="0" distL="0" distR="0" wp14:anchorId="0111ACE5" wp14:editId="58FD9234">
             <wp:extent cx="5120640" cy="2144319"/>
             <wp:effectExtent l="19050" t="19050" r="22860" b="27940"/>
-            <wp:docPr id="958911221" name="Imagem 39"/>
+            <wp:docPr id="1575438446" name="Imagem 39"/>
             <wp:cNvGraphicFramePr/>
             <a:graphic xmlns:a="http://schemas.openxmlformats.org/drawingml/2006/main">
               <a:graphicData uri="http://schemas.openxmlformats.org/drawingml/2006/picture">
                 <pic:pic xmlns:pic="http://schemas.openxmlformats.org/drawingml/2006/picture">
                   <pic:nvPicPr>
-                    <pic:cNvPr id="958911221" name=""/>
+                    <pic:cNvPr id="1575438446" name=""/>
                     <pic:cNvPicPr/>
                   </pic:nvPicPr>
                   <pic:blipFill>
@@ -18290,16 +18336,16 @@
           <w:noProof/>
         </w:rPr>
         <w:drawing>
-          <wp:inline distT="0" distB="0" distL="0" distR="0" wp14:anchorId="0516F296" wp14:editId="3BE7A620">
+          <wp:inline distT="0" distB="0" distL="0" distR="0" wp14:anchorId="796310F7" wp14:editId="63A32063">
             <wp:extent cx="5120640" cy="1055647"/>
             <wp:effectExtent l="19050" t="19050" r="22860" b="11430"/>
-            <wp:docPr id="849068457" name="Imagem 40"/>
+            <wp:docPr id="45554703" name="Imagem 40"/>
             <wp:cNvGraphicFramePr/>
             <a:graphic xmlns:a="http://schemas.openxmlformats.org/drawingml/2006/main">
               <a:graphicData uri="http://schemas.openxmlformats.org/drawingml/2006/picture">
                 <pic:pic xmlns:pic="http://schemas.openxmlformats.org/drawingml/2006/picture">
                   <pic:nvPicPr>
-                    <pic:cNvPr id="849068457" name=""/>
+                    <pic:cNvPr id="45554703" name=""/>
                     <pic:cNvPicPr/>
                   </pic:nvPicPr>
                   <pic:blipFill>
@@ -18421,16 +18467,16 @@
           <w:noProof/>
         </w:rPr>
         <w:drawing>
-          <wp:inline distT="0" distB="0" distL="0" distR="0" wp14:anchorId="69EFB3F4" wp14:editId="258A66A5">
+          <wp:inline distT="0" distB="0" distL="0" distR="0" wp14:anchorId="51D9DA9E" wp14:editId="0A4A4253">
             <wp:extent cx="5120640" cy="3282818"/>
             <wp:effectExtent l="19050" t="19050" r="22860" b="13335"/>
-            <wp:docPr id="1868396389" name="Imagem 41"/>
+            <wp:docPr id="2068400979" name="Imagem 41"/>
             <wp:cNvGraphicFramePr/>
             <a:graphic xmlns:a="http://schemas.openxmlformats.org/drawingml/2006/main">
               <a:graphicData uri="http://schemas.openxmlformats.org/drawingml/2006/picture">
                 <pic:pic xmlns:pic="http://schemas.openxmlformats.org/drawingml/2006/picture">
                   <pic:nvPicPr>
-                    <pic:cNvPr id="1868396389" name=""/>
+                    <pic:cNvPr id="2068400979" name=""/>
                     <pic:cNvPicPr/>
                   </pic:nvPicPr>
                   <pic:blipFill>
@@ -18564,16 +18610,16 @@
         </w:rPr>
         <w:lastRenderedPageBreak/>
         <w:drawing>
-          <wp:inline distT="0" distB="0" distL="0" distR="0" wp14:anchorId="3350A980" wp14:editId="5580F45E">
+          <wp:inline distT="0" distB="0" distL="0" distR="0" wp14:anchorId="41FB02F2" wp14:editId="6146F569">
             <wp:extent cx="5120640" cy="1978034"/>
             <wp:effectExtent l="19050" t="19050" r="22860" b="22225"/>
-            <wp:docPr id="655291262" name="Imagem 42"/>
+            <wp:docPr id="1781281135" name="Imagem 42"/>
             <wp:cNvGraphicFramePr/>
             <a:graphic xmlns:a="http://schemas.openxmlformats.org/drawingml/2006/main">
               <a:graphicData uri="http://schemas.openxmlformats.org/drawingml/2006/picture">
                 <pic:pic xmlns:pic="http://schemas.openxmlformats.org/drawingml/2006/picture">
                   <pic:nvPicPr>
-                    <pic:cNvPr id="655291262" name=""/>
+                    <pic:cNvPr id="1781281135" name=""/>
                     <pic:cNvPicPr/>
                   </pic:nvPicPr>
                   <pic:blipFill>
@@ -18645,7 +18691,7 @@
           <w:sz w:val="34"/>
         </w:rPr>
       </w:pPr>
-      <w:bookmarkStart w:id="34" w:name="_Toc240287093"/>
+      <w:bookmarkStart w:id="34" w:name="_Toc240288850"/>
       <w:r>
         <w:rPr>
           <w:rFonts w:ascii="Montserrat" w:hAnsi="Montserrat"/>
@@ -18705,7 +18751,7 @@
           <w:sz w:val="27"/>
         </w:rPr>
       </w:pPr>
-      <w:bookmarkStart w:id="35" w:name="_Toc240287094"/>
+      <w:bookmarkStart w:id="35" w:name="_Toc240288851"/>
       <w:r>
         <w:rPr>
           <w:rFonts w:ascii="Montserrat" w:hAnsi="Montserrat"/>
@@ -18745,16 +18791,16 @@
           <w:noProof/>
         </w:rPr>
         <w:drawing>
-          <wp:inline distT="0" distB="0" distL="0" distR="0" wp14:anchorId="0931003A" wp14:editId="01B405D6">
+          <wp:inline distT="0" distB="0" distL="0" distR="0" wp14:anchorId="760C2326" wp14:editId="083E3C54">
             <wp:extent cx="5303520" cy="4792851"/>
             <wp:effectExtent l="19050" t="19050" r="11430" b="27305"/>
-            <wp:docPr id="1885763159" name="Imagem 43"/>
+            <wp:docPr id="1422570251" name="Imagem 43"/>
             <wp:cNvGraphicFramePr/>
             <a:graphic xmlns:a="http://schemas.openxmlformats.org/drawingml/2006/main">
               <a:graphicData uri="http://schemas.openxmlformats.org/drawingml/2006/picture">
                 <pic:pic xmlns:pic="http://schemas.openxmlformats.org/drawingml/2006/picture">
                   <pic:nvPicPr>
-                    <pic:cNvPr id="1885763159" name=""/>
+                    <pic:cNvPr id="1422570251" name=""/>
                     <pic:cNvPicPr/>
                   </pic:nvPicPr>
                   <pic:blipFill>
@@ -18823,7 +18869,7 @@
           <w:sz w:val="27"/>
         </w:rPr>
       </w:pPr>
-      <w:bookmarkStart w:id="36" w:name="_Toc240287095"/>
+      <w:bookmarkStart w:id="36" w:name="_Toc240288852"/>
       <w:r>
         <w:rPr>
           <w:rFonts w:ascii="Montserrat" w:hAnsi="Montserrat"/>
@@ -18863,16 +18909,16 @@
           <w:noProof/>
         </w:rPr>
         <w:drawing>
-          <wp:inline distT="0" distB="0" distL="0" distR="0" wp14:anchorId="24F13E10" wp14:editId="1A8594FF">
+          <wp:inline distT="0" distB="0" distL="0" distR="0" wp14:anchorId="3C001200" wp14:editId="66D2FFE3">
             <wp:extent cx="5303520" cy="4792851"/>
             <wp:effectExtent l="19050" t="19050" r="11430" b="27305"/>
-            <wp:docPr id="1715285266" name="Imagem 44"/>
+            <wp:docPr id="1313384904" name="Imagem 44"/>
             <wp:cNvGraphicFramePr/>
             <a:graphic xmlns:a="http://schemas.openxmlformats.org/drawingml/2006/main">
               <a:graphicData uri="http://schemas.openxmlformats.org/drawingml/2006/picture">
                 <pic:pic xmlns:pic="http://schemas.openxmlformats.org/drawingml/2006/picture">
                   <pic:nvPicPr>
-                    <pic:cNvPr id="1715285266" name=""/>
+                    <pic:cNvPr id="1313384904" name=""/>
                     <pic:cNvPicPr/>
                   </pic:nvPicPr>
                   <pic:blipFill>
@@ -18940,7 +18986,7 @@
           <w:sz w:val="27"/>
         </w:rPr>
       </w:pPr>
-      <w:bookmarkStart w:id="37" w:name="_Toc240287096"/>
+      <w:bookmarkStart w:id="37" w:name="_Toc240288853"/>
       <w:r>
         <w:rPr>
           <w:rFonts w:ascii="Montserrat" w:hAnsi="Montserrat"/>
@@ -18981,16 +19027,16 @@
         </w:rPr>
         <w:lastRenderedPageBreak/>
         <w:drawing>
-          <wp:inline distT="0" distB="0" distL="0" distR="0" wp14:anchorId="5EAD2431" wp14:editId="2E2C8F81">
+          <wp:inline distT="0" distB="0" distL="0" distR="0" wp14:anchorId="14DE7166" wp14:editId="002328A2">
             <wp:extent cx="5303520" cy="4792851"/>
             <wp:effectExtent l="19050" t="19050" r="11430" b="27305"/>
-            <wp:docPr id="1300151218" name="Imagem 45"/>
+            <wp:docPr id="365781109" name="Imagem 45"/>
             <wp:cNvGraphicFramePr/>
             <a:graphic xmlns:a="http://schemas.openxmlformats.org/drawingml/2006/main">
               <a:graphicData uri="http://schemas.openxmlformats.org/drawingml/2006/picture">
                 <pic:pic xmlns:pic="http://schemas.openxmlformats.org/drawingml/2006/picture">
                   <pic:nvPicPr>
-                    <pic:cNvPr id="1300151218" name=""/>
+                    <pic:cNvPr id="365781109" name=""/>
                     <pic:cNvPicPr/>
                   </pic:nvPicPr>
                   <pic:blipFill>
@@ -19058,16 +19104,16 @@
         </w:rPr>
         <w:lastRenderedPageBreak/>
         <w:drawing>
-          <wp:inline distT="0" distB="0" distL="0" distR="0" wp14:anchorId="4E4B67F3" wp14:editId="7B329EB6">
+          <wp:inline distT="0" distB="0" distL="0" distR="0" wp14:anchorId="0A3293E7" wp14:editId="24081AAA">
             <wp:extent cx="5303520" cy="4792851"/>
             <wp:effectExtent l="19050" t="19050" r="11430" b="27305"/>
-            <wp:docPr id="568573285" name="Imagem 46"/>
+            <wp:docPr id="378203152" name="Imagem 46"/>
             <wp:cNvGraphicFramePr/>
             <a:graphic xmlns:a="http://schemas.openxmlformats.org/drawingml/2006/main">
               <a:graphicData uri="http://schemas.openxmlformats.org/drawingml/2006/picture">
                 <pic:pic xmlns:pic="http://schemas.openxmlformats.org/drawingml/2006/picture">
                   <pic:nvPicPr>
-                    <pic:cNvPr id="568573285" name=""/>
+                    <pic:cNvPr id="378203152" name=""/>
                     <pic:cNvPicPr/>
                   </pic:nvPicPr>
                   <pic:blipFill>
@@ -19160,7 +19206,7 @@
           <w:sz w:val="34"/>
         </w:rPr>
       </w:pPr>
-      <w:bookmarkStart w:id="38" w:name="_Toc240287097"/>
+      <w:bookmarkStart w:id="38" w:name="_Toc240288854"/>
       <w:r>
         <w:rPr>
           <w:rFonts w:ascii="Montserrat" w:hAnsi="Montserrat"/>
@@ -19202,7 +19248,7 @@
           <w:sz w:val="27"/>
         </w:rPr>
       </w:pPr>
-      <w:bookmarkStart w:id="39" w:name="_Toc240287098"/>
+      <w:bookmarkStart w:id="39" w:name="_Toc240288855"/>
       <w:r>
         <w:rPr>
           <w:rFonts w:ascii="Montserrat" w:hAnsi="Montserrat"/>
@@ -19242,16 +19288,16 @@
           <w:noProof/>
         </w:rPr>
         <w:drawing>
-          <wp:inline distT="0" distB="0" distL="0" distR="0" wp14:anchorId="32E81541" wp14:editId="3E0E95C0">
+          <wp:inline distT="0" distB="0" distL="0" distR="0" wp14:anchorId="065E0DF2" wp14:editId="3BC03E1E">
             <wp:extent cx="5303520" cy="4792851"/>
             <wp:effectExtent l="19050" t="19050" r="11430" b="27305"/>
-            <wp:docPr id="528937522" name="Imagem 47"/>
+            <wp:docPr id="1084295971" name="Imagem 47"/>
             <wp:cNvGraphicFramePr/>
             <a:graphic xmlns:a="http://schemas.openxmlformats.org/drawingml/2006/main">
               <a:graphicData uri="http://schemas.openxmlformats.org/drawingml/2006/picture">
                 <pic:pic xmlns:pic="http://schemas.openxmlformats.org/drawingml/2006/picture">
                   <pic:nvPicPr>
-                    <pic:cNvPr id="528937522" name=""/>
+                    <pic:cNvPr id="1084295971" name=""/>
                     <pic:cNvPicPr/>
                   </pic:nvPicPr>
                   <pic:blipFill>
@@ -19480,7 +19526,7 @@
           <w:sz w:val="27"/>
         </w:rPr>
       </w:pPr>
-      <w:bookmarkStart w:id="40" w:name="_Toc240287099"/>
+      <w:bookmarkStart w:id="40" w:name="_Toc240288856"/>
       <w:r>
         <w:rPr>
           <w:rFonts w:ascii="Montserrat" w:hAnsi="Montserrat"/>
@@ -19520,16 +19566,16 @@
           <w:noProof/>
         </w:rPr>
         <w:drawing>
-          <wp:inline distT="0" distB="0" distL="0" distR="0" wp14:anchorId="2E6DF951" wp14:editId="024B2A2E">
+          <wp:inline distT="0" distB="0" distL="0" distR="0" wp14:anchorId="3FCDB8D8" wp14:editId="163C1FE8">
             <wp:extent cx="5303520" cy="4792851"/>
             <wp:effectExtent l="19050" t="19050" r="11430" b="27305"/>
-            <wp:docPr id="462019851" name="Imagem 48"/>
+            <wp:docPr id="524176923" name="Imagem 48"/>
             <wp:cNvGraphicFramePr/>
             <a:graphic xmlns:a="http://schemas.openxmlformats.org/drawingml/2006/main">
               <a:graphicData uri="http://schemas.openxmlformats.org/drawingml/2006/picture">
                 <pic:pic xmlns:pic="http://schemas.openxmlformats.org/drawingml/2006/picture">
                   <pic:nvPicPr>
-                    <pic:cNvPr id="462019851" name=""/>
+                    <pic:cNvPr id="524176923" name=""/>
                     <pic:cNvPicPr/>
                   </pic:nvPicPr>
                   <pic:blipFill>
@@ -19597,7 +19643,7 @@
           <w:sz w:val="27"/>
         </w:rPr>
       </w:pPr>
-      <w:bookmarkStart w:id="41" w:name="_Toc240287100"/>
+      <w:bookmarkStart w:id="41" w:name="_Toc240288857"/>
       <w:r>
         <w:rPr>
           <w:rFonts w:ascii="Montserrat" w:hAnsi="Montserrat"/>
@@ -19638,16 +19684,16 @@
         </w:rPr>
         <w:lastRenderedPageBreak/>
         <w:drawing>
-          <wp:inline distT="0" distB="0" distL="0" distR="0" wp14:anchorId="1A662589" wp14:editId="35FE1592">
+          <wp:inline distT="0" distB="0" distL="0" distR="0" wp14:anchorId="0E2F0A52" wp14:editId="5D8B3B0D">
             <wp:extent cx="5303520" cy="4792851"/>
             <wp:effectExtent l="19050" t="19050" r="11430" b="27305"/>
-            <wp:docPr id="1037531326" name="Imagem 49"/>
+            <wp:docPr id="1375247919" name="Imagem 49"/>
             <wp:cNvGraphicFramePr/>
             <a:graphic xmlns:a="http://schemas.openxmlformats.org/drawingml/2006/main">
               <a:graphicData uri="http://schemas.openxmlformats.org/drawingml/2006/picture">
                 <pic:pic xmlns:pic="http://schemas.openxmlformats.org/drawingml/2006/picture">
                   <pic:nvPicPr>
-                    <pic:cNvPr id="1037531326" name=""/>
+                    <pic:cNvPr id="1375247919" name=""/>
                     <pic:cNvPicPr/>
                   </pic:nvPicPr>
                   <pic:blipFill>
@@ -19791,7 +19837,7 @@
           <w:sz w:val="27"/>
         </w:rPr>
       </w:pPr>
-      <w:bookmarkStart w:id="42" w:name="_Toc240287101"/>
+      <w:bookmarkStart w:id="42" w:name="_Toc240288858"/>
       <w:r>
         <w:rPr>
           <w:rFonts w:ascii="Montserrat" w:hAnsi="Montserrat"/>
@@ -20056,16 +20102,16 @@
           <w:noProof/>
         </w:rPr>
         <w:drawing>
-          <wp:inline distT="0" distB="0" distL="0" distR="0" wp14:anchorId="7362C92B" wp14:editId="6EF0AA73">
+          <wp:inline distT="0" distB="0" distL="0" distR="0" wp14:anchorId="7383F946" wp14:editId="296185BB">
             <wp:extent cx="5303520" cy="4267180"/>
             <wp:effectExtent l="19050" t="19050" r="11430" b="19685"/>
-            <wp:docPr id="1005877807" name="Imagem 50"/>
+            <wp:docPr id="245378417" name="Imagem 50"/>
             <wp:cNvGraphicFramePr/>
             <a:graphic xmlns:a="http://schemas.openxmlformats.org/drawingml/2006/main">
               <a:graphicData uri="http://schemas.openxmlformats.org/drawingml/2006/picture">
                 <pic:pic xmlns:pic="http://schemas.openxmlformats.org/drawingml/2006/picture">
                   <pic:nvPicPr>
-                    <pic:cNvPr id="1005877807" name=""/>
+                    <pic:cNvPr id="245378417" name=""/>
                     <pic:cNvPicPr/>
                   </pic:nvPicPr>
                   <pic:blipFill>
@@ -20133,16 +20179,16 @@
           <w:noProof/>
         </w:rPr>
         <w:drawing>
-          <wp:inline distT="0" distB="0" distL="0" distR="0" wp14:anchorId="0D933317" wp14:editId="6F94DC3D">
+          <wp:inline distT="0" distB="0" distL="0" distR="0" wp14:anchorId="4FB6513B" wp14:editId="467AB75C">
             <wp:extent cx="5303520" cy="3382059"/>
             <wp:effectExtent l="19050" t="19050" r="11430" b="27940"/>
-            <wp:docPr id="1776570255" name="Imagem 51"/>
+            <wp:docPr id="1764836037" name="Imagem 51"/>
             <wp:cNvGraphicFramePr/>
             <a:graphic xmlns:a="http://schemas.openxmlformats.org/drawingml/2006/main">
               <a:graphicData uri="http://schemas.openxmlformats.org/drawingml/2006/picture">
                 <pic:pic xmlns:pic="http://schemas.openxmlformats.org/drawingml/2006/picture">
                   <pic:nvPicPr>
-                    <pic:cNvPr id="1776570255" name=""/>
+                    <pic:cNvPr id="1764836037" name=""/>
                     <pic:cNvPicPr/>
                   </pic:nvPicPr>
                   <pic:blipFill>
@@ -20210,16 +20256,16 @@
         </w:rPr>
         <w:lastRenderedPageBreak/>
         <w:drawing>
-          <wp:inline distT="0" distB="0" distL="0" distR="0" wp14:anchorId="1F934344" wp14:editId="1E7E56E3">
+          <wp:inline distT="0" distB="0" distL="0" distR="0" wp14:anchorId="720E5997" wp14:editId="7C11B400">
             <wp:extent cx="5303520" cy="4417800"/>
             <wp:effectExtent l="19050" t="19050" r="11430" b="20955"/>
-            <wp:docPr id="1017861781" name="Imagem 52"/>
+            <wp:docPr id="1516983976" name="Imagem 52"/>
             <wp:cNvGraphicFramePr/>
             <a:graphic xmlns:a="http://schemas.openxmlformats.org/drawingml/2006/main">
               <a:graphicData uri="http://schemas.openxmlformats.org/drawingml/2006/picture">
                 <pic:pic xmlns:pic="http://schemas.openxmlformats.org/drawingml/2006/picture">
                   <pic:nvPicPr>
-                    <pic:cNvPr id="1017861781" name=""/>
+                    <pic:cNvPr id="1516983976" name=""/>
                     <pic:cNvPicPr/>
                   </pic:nvPicPr>
                   <pic:blipFill>
@@ -20329,7 +20375,7 @@
           <w:sz w:val="27"/>
         </w:rPr>
       </w:pPr>
-      <w:bookmarkStart w:id="43" w:name="_Toc240287102"/>
+      <w:bookmarkStart w:id="43" w:name="_Toc240288859"/>
       <w:r>
         <w:rPr>
           <w:rFonts w:ascii="Montserrat" w:hAnsi="Montserrat"/>
@@ -20545,8 +20591,18 @@
         </w:numPr>
         <w:spacing w:after="80" w:line="260" w:lineRule="auto"/>
         <w:ind w:left="700"/>
-      </w:pPr>
-      <w:r>
+        <w:rPr>
+          <w:rFonts w:ascii="Montserrat" w:hAnsi="Montserrat"/>
+          <w:color w:val="1A1A1A"/>
+          <w:sz w:val="22"/>
+        </w:rPr>
+      </w:pPr>
+      <w:r>
+        <w:rPr>
+          <w:rFonts w:ascii="Montserrat" w:hAnsi="Montserrat"/>
+          <w:color w:val="1A1A1A"/>
+          <w:sz w:val="22"/>
+        </w:rPr>
         <w:t>Equipe do projeto: mesma lista de Administracao &gt; Equipes (secao 6.2), com o papel de cada membro vindo do cadastro global de usuarios.</w:t>
       </w:r>
     </w:p>
@@ -20585,16 +20641,16 @@
         </w:rPr>
         <w:lastRenderedPageBreak/>
         <w:drawing>
-          <wp:inline distT="0" distB="0" distL="0" distR="0" wp14:anchorId="7FE6D292" wp14:editId="4A934932">
+          <wp:inline distT="0" distB="0" distL="0" distR="0" wp14:anchorId="034C4424" wp14:editId="5F11D742">
             <wp:extent cx="5303520" cy="7628836"/>
             <wp:effectExtent l="19050" t="19050" r="11430" b="10795"/>
-            <wp:docPr id="660483092" name="Imagem 53"/>
+            <wp:docPr id="146921949" name="Imagem 53"/>
             <wp:cNvGraphicFramePr/>
             <a:graphic xmlns:a="http://schemas.openxmlformats.org/drawingml/2006/main">
               <a:graphicData uri="http://schemas.openxmlformats.org/drawingml/2006/picture">
                 <pic:pic xmlns:pic="http://schemas.openxmlformats.org/drawingml/2006/picture">
                   <pic:nvPicPr>
-                    <pic:cNvPr id="660483092" name=""/>
+                    <pic:cNvPr id="146921949" name=""/>
                     <pic:cNvPicPr/>
                   </pic:nvPicPr>
                   <pic:blipFill>
@@ -20726,7 +20782,7 @@
           <w:sz w:val="27"/>
         </w:rPr>
       </w:pPr>
-      <w:bookmarkStart w:id="44" w:name="_Toc240287103"/>
+      <w:bookmarkStart w:id="44" w:name="_Toc240288860"/>
       <w:r>
         <w:rPr>
           <w:rFonts w:ascii="Montserrat" w:hAnsi="Montserrat"/>
@@ -20879,7 +20935,7 @@
           <w:sz w:val="27"/>
         </w:rPr>
       </w:pPr>
-      <w:bookmarkStart w:id="45" w:name="_Toc240287104"/>
+      <w:bookmarkStart w:id="45" w:name="_Toc240288861"/>
       <w:r>
         <w:rPr>
           <w:rFonts w:ascii="Montserrat" w:hAnsi="Montserrat"/>
@@ -21172,16 +21228,16 @@
           <w:noProof/>
         </w:rPr>
         <w:drawing>
-          <wp:inline distT="0" distB="0" distL="0" distR="0" wp14:anchorId="24447CFE" wp14:editId="0246DE19">
+          <wp:inline distT="0" distB="0" distL="0" distR="0" wp14:anchorId="7D65CEEA" wp14:editId="4E0F05B1">
             <wp:extent cx="5303520" cy="1351384"/>
             <wp:effectExtent l="19050" t="19050" r="11430" b="20320"/>
-            <wp:docPr id="827927691" name="Imagem 54"/>
+            <wp:docPr id="486552656" name="Imagem 54"/>
             <wp:cNvGraphicFramePr/>
             <a:graphic xmlns:a="http://schemas.openxmlformats.org/drawingml/2006/main">
               <a:graphicData uri="http://schemas.openxmlformats.org/drawingml/2006/picture">
                 <pic:pic xmlns:pic="http://schemas.openxmlformats.org/drawingml/2006/picture">
                   <pic:nvPicPr>
-                    <pic:cNvPr id="827927691" name=""/>
+                    <pic:cNvPr id="486552656" name=""/>
                     <pic:cNvPicPr/>
                   </pic:nvPicPr>
                   <pic:blipFill>
@@ -21249,7 +21305,7 @@
           <w:sz w:val="27"/>
         </w:rPr>
       </w:pPr>
-      <w:bookmarkStart w:id="46" w:name="_Toc240287105"/>
+      <w:bookmarkStart w:id="46" w:name="_Toc240288862"/>
       <w:r>
         <w:rPr>
           <w:rFonts w:ascii="Montserrat" w:hAnsi="Montserrat"/>
@@ -21394,16 +21450,16 @@
           <w:noProof/>
         </w:rPr>
         <w:drawing>
-          <wp:inline distT="0" distB="0" distL="0" distR="0" wp14:anchorId="269E3918" wp14:editId="27140C65">
+          <wp:inline distT="0" distB="0" distL="0" distR="0" wp14:anchorId="732359ED" wp14:editId="24E3E31D">
             <wp:extent cx="5303520" cy="1422793"/>
             <wp:effectExtent l="19050" t="19050" r="11430" b="25400"/>
-            <wp:docPr id="1208112780" name="Imagem 55"/>
+            <wp:docPr id="1152542226" name="Imagem 55"/>
             <wp:cNvGraphicFramePr/>
             <a:graphic xmlns:a="http://schemas.openxmlformats.org/drawingml/2006/main">
               <a:graphicData uri="http://schemas.openxmlformats.org/drawingml/2006/picture">
                 <pic:pic xmlns:pic="http://schemas.openxmlformats.org/drawingml/2006/picture">
                   <pic:nvPicPr>
-                    <pic:cNvPr id="1208112780" name=""/>
+                    <pic:cNvPr id="1152542226" name=""/>
                     <pic:cNvPicPr/>
                   </pic:nvPicPr>
                   <pic:blipFill>
@@ -21558,16 +21614,16 @@
         </w:rPr>
         <w:lastRenderedPageBreak/>
         <w:drawing>
-          <wp:inline distT="0" distB="0" distL="0" distR="0" wp14:anchorId="44468C43" wp14:editId="68C64AA9">
+          <wp:inline distT="0" distB="0" distL="0" distR="0" wp14:anchorId="3E1EE8B8" wp14:editId="04CC4EB4">
             <wp:extent cx="5303520" cy="1841050"/>
             <wp:effectExtent l="19050" t="19050" r="11430" b="26035"/>
-            <wp:docPr id="1389653734" name="Imagem 56"/>
+            <wp:docPr id="1803750745" name="Imagem 56"/>
             <wp:cNvGraphicFramePr/>
             <a:graphic xmlns:a="http://schemas.openxmlformats.org/drawingml/2006/main">
               <a:graphicData uri="http://schemas.openxmlformats.org/drawingml/2006/picture">
                 <pic:pic xmlns:pic="http://schemas.openxmlformats.org/drawingml/2006/picture">
                   <pic:nvPicPr>
-                    <pic:cNvPr id="1389653734" name=""/>
+                    <pic:cNvPr id="1803750745" name=""/>
                     <pic:cNvPicPr/>
                   </pic:nvPicPr>
                   <pic:blipFill>
@@ -21721,16 +21777,16 @@
           <w:noProof/>
         </w:rPr>
         <w:drawing>
-          <wp:inline distT="0" distB="0" distL="0" distR="0" wp14:anchorId="2D79CED7" wp14:editId="6973273B">
+          <wp:inline distT="0" distB="0" distL="0" distR="0" wp14:anchorId="3203843B" wp14:editId="6D5BB600">
             <wp:extent cx="5303520" cy="303041"/>
             <wp:effectExtent l="19050" t="19050" r="11430" b="20955"/>
-            <wp:docPr id="110965791" name="Imagem 57"/>
+            <wp:docPr id="907773466" name="Imagem 57"/>
             <wp:cNvGraphicFramePr/>
             <a:graphic xmlns:a="http://schemas.openxmlformats.org/drawingml/2006/main">
               <a:graphicData uri="http://schemas.openxmlformats.org/drawingml/2006/picture">
                 <pic:pic xmlns:pic="http://schemas.openxmlformats.org/drawingml/2006/picture">
                   <pic:nvPicPr>
-                    <pic:cNvPr id="110965791" name=""/>
+                    <pic:cNvPr id="907773466" name=""/>
                     <pic:cNvPicPr/>
                   </pic:nvPicPr>
                   <pic:blipFill>
@@ -21798,16 +21854,16 @@
         </w:rPr>
         <w:lastRenderedPageBreak/>
         <w:drawing>
-          <wp:inline distT="0" distB="0" distL="0" distR="0" wp14:anchorId="50BD120D" wp14:editId="27F41859">
+          <wp:inline distT="0" distB="0" distL="0" distR="0" wp14:anchorId="6F514E1C" wp14:editId="4C54502A">
             <wp:extent cx="5303520" cy="2983005"/>
             <wp:effectExtent l="19050" t="19050" r="11430" b="27305"/>
-            <wp:docPr id="855569360" name="Imagem 58"/>
+            <wp:docPr id="777817110" name="Imagem 58"/>
             <wp:cNvGraphicFramePr/>
             <a:graphic xmlns:a="http://schemas.openxmlformats.org/drawingml/2006/main">
               <a:graphicData uri="http://schemas.openxmlformats.org/drawingml/2006/picture">
                 <pic:pic xmlns:pic="http://schemas.openxmlformats.org/drawingml/2006/picture">
                   <pic:nvPicPr>
-                    <pic:cNvPr id="855569360" name=""/>
+                    <pic:cNvPr id="777817110" name=""/>
                     <pic:cNvPicPr/>
                   </pic:nvPicPr>
                   <pic:blipFill>
@@ -21879,7 +21935,7 @@
           <w:sz w:val="34"/>
         </w:rPr>
       </w:pPr>
-      <w:bookmarkStart w:id="47" w:name="_Toc240287106"/>
+      <w:bookmarkStart w:id="47" w:name="_Toc240288863"/>
       <w:r>
         <w:rPr>
           <w:rFonts w:ascii="Montserrat" w:hAnsi="Montserrat"/>
@@ -22123,7 +22179,7 @@
           <w:sz w:val="34"/>
         </w:rPr>
       </w:pPr>
-      <w:bookmarkStart w:id="48" w:name="_Toc240287107"/>
+      <w:bookmarkStart w:id="48" w:name="_Toc240288864"/>
       <w:r>
         <w:rPr>
           <w:rFonts w:ascii="Montserrat" w:hAnsi="Montserrat"/>
@@ -23911,7 +23967,7 @@
 <file path=word/numbering.xml><?xml version="1.0" encoding="utf-8"?>
 <w:numbering xmlns:wpc="http://schemas.microsoft.com/office/word/2010/wordprocessingCanvas" xmlns:cx="http://schemas.microsoft.com/office/drawing/2014/chartex" xmlns:cx1="http://schemas.microsoft.com/office/drawing/2015/9/8/chartex" xmlns:cx2="http://schemas.microsoft.com/office/drawing/2015/10/21/chartex" xmlns:cx3="http://schemas.microsoft.com/office/drawing/2016/5/9/chartex" xmlns:cx4="http://schemas.microsoft.com/office/drawing/2016/5/10/chartex" xmlns:cx5="http://schemas.microsoft.com/office/drawing/2016/5/11/chartex" xmlns:cx6="http://schemas.microsoft.com/office/drawing/2016/5/12/chartex" xmlns:cx7="http://schemas.microsoft.com/office/drawing/2016/5/13/chartex" xmlns:cx8="http://schemas.microsoft.com/office/drawing/2016/5/14/chartex" xmlns:mc="http://schemas.openxmlformats.org/markup-compatibility/2006" xmlns:aink="http://schemas.microsoft.com/office/drawing/2016/ink" xmlns:am3d="http://schemas.microsoft.com/office/drawing/2017/model3d" xmlns:o="urn:schemas-microsoft-com:office:office" xmlns:oel="http://schemas.microsoft.com/office/2019/extlst" xmlns:r="http://schemas.openxmlformats.org/officeDocument/2006/relationships" xmlns:m="http://schemas.openxmlformats.org/officeDocument/2006/math" xmlns:v="urn:schemas-microsoft-com:vml" xmlns:wp14="http://schemas.microsoft.com/office/word/2010/wordprocessingDrawing" xmlns:wp="http://schemas.openxmlformats.org/drawingml/2006/wordprocessingDrawing" xmlns:w10="urn:schemas-microsoft-com:office:word" xmlns:w="http://schemas.openxmlformats.org/wordprocessingml/2006/main" xmlns:w14="http://schemas.microsoft.com/office/word/2010/wordml" xmlns:w15="http://schemas.microsoft.com/office/word/2012/wordml" xmlns:w16cex="http://schemas.microsoft.com/office/word/2018/wordml/cex" xmlns:w16cid="http://schemas.microsoft.com/office/word/2016/wordml/cid" xmlns:w16="http://schemas.microsoft.com/office/word/2018/wordml" xmlns:w16du="http://schemas.microsoft.com/office/word/2023/wordml/word16du" xmlns:w16sdtdh="http://schemas.microsoft.com/office/word/2020/wordml/sdtdatahash" xmlns:w16sdtfl="http://schemas.microsoft.com/office/word/2024/wordml/sdtformatlock" xmlns:w16se="http://schemas.microsoft.com/office/word/2015/wordml/symex" xmlns:wpg="http://schemas.microsoft.com/office/word/2010/wordprocessingGroup" xmlns:wpi="http://schemas.microsoft.com/office/word/2010/wordprocessingInk" xmlns:wne="http://schemas.microsoft.com/office/word/2006/wordml" xmlns:wps="http://schemas.microsoft.com/office/word/2010/wordprocessingShape" mc:Ignorable="w14 w15 w16se w16cid w16 w16cex w16sdtdh w16sdtfl w16du wp14">
   <w:abstractNum w:abstractNumId="0" w15:restartNumberingAfterBreak="0">
-    <w:nsid w:val="004D2AA0"/>
+    <w:nsid w:val="0E480117"/>
     <w:multiLevelType w:val="singleLevel"/>
     <w:tmpl w:val="04160001"/>
     <w:lvl w:ilvl="0">
@@ -23928,7 +23984,7 @@
     </w:lvl>
   </w:abstractNum>
   <w:abstractNum w:abstractNumId="1" w15:restartNumberingAfterBreak="0">
-    <w:nsid w:val="014016EE"/>
+    <w:nsid w:val="11D254F7"/>
     <w:multiLevelType w:val="singleLevel"/>
     <w:tmpl w:val="04160001"/>
     <w:lvl w:ilvl="0">
@@ -23945,7 +24001,7 @@
     </w:lvl>
   </w:abstractNum>
   <w:abstractNum w:abstractNumId="2" w15:restartNumberingAfterBreak="0">
-    <w:nsid w:val="0CC177D9"/>
+    <w:nsid w:val="123A787D"/>
     <w:multiLevelType w:val="singleLevel"/>
     <w:tmpl w:val="04160001"/>
     <w:lvl w:ilvl="0">
@@ -23962,7 +24018,7 @@
     </w:lvl>
   </w:abstractNum>
   <w:abstractNum w:abstractNumId="3" w15:restartNumberingAfterBreak="0">
-    <w:nsid w:val="0F266991"/>
+    <w:nsid w:val="16044529"/>
     <w:multiLevelType w:val="singleLevel"/>
     <w:tmpl w:val="04160001"/>
     <w:lvl w:ilvl="0">
@@ -23979,7 +24035,7 @@
     </w:lvl>
   </w:abstractNum>
   <w:abstractNum w:abstractNumId="4" w15:restartNumberingAfterBreak="0">
-    <w:nsid w:val="10C57906"/>
+    <w:nsid w:val="1ADB7D52"/>
     <w:multiLevelType w:val="singleLevel"/>
     <w:tmpl w:val="04160001"/>
     <w:lvl w:ilvl="0">
@@ -23996,7 +24052,7 @@
     </w:lvl>
   </w:abstractNum>
   <w:abstractNum w:abstractNumId="5" w15:restartNumberingAfterBreak="0">
-    <w:nsid w:val="10E83FA6"/>
+    <w:nsid w:val="1BDE5607"/>
     <w:multiLevelType w:val="singleLevel"/>
     <w:tmpl w:val="04160001"/>
     <w:lvl w:ilvl="0">
@@ -24013,7 +24069,7 @@
     </w:lvl>
   </w:abstractNum>
   <w:abstractNum w:abstractNumId="6" w15:restartNumberingAfterBreak="0">
-    <w:nsid w:val="151B6652"/>
+    <w:nsid w:val="1CD25925"/>
     <w:multiLevelType w:val="singleLevel"/>
     <w:tmpl w:val="04160001"/>
     <w:lvl w:ilvl="0">
@@ -24030,7 +24086,7 @@
     </w:lvl>
   </w:abstractNum>
   <w:abstractNum w:abstractNumId="7" w15:restartNumberingAfterBreak="0">
-    <w:nsid w:val="18D43A1C"/>
+    <w:nsid w:val="1E3754D4"/>
     <w:multiLevelType w:val="singleLevel"/>
     <w:tmpl w:val="04160001"/>
     <w:lvl w:ilvl="0">
@@ -24047,7 +24103,7 @@
     </w:lvl>
   </w:abstractNum>
   <w:abstractNum w:abstractNumId="8" w15:restartNumberingAfterBreak="0">
-    <w:nsid w:val="19C970C9"/>
+    <w:nsid w:val="22833815"/>
     <w:multiLevelType w:val="singleLevel"/>
     <w:tmpl w:val="04160001"/>
     <w:lvl w:ilvl="0">
@@ -24064,7 +24120,7 @@
     </w:lvl>
   </w:abstractNum>
   <w:abstractNum w:abstractNumId="9" w15:restartNumberingAfterBreak="0">
-    <w:nsid w:val="1A707959"/>
+    <w:nsid w:val="23FA6466"/>
     <w:multiLevelType w:val="singleLevel"/>
     <w:tmpl w:val="04160001"/>
     <w:lvl w:ilvl="0">
@@ -24081,7 +24137,7 @@
     </w:lvl>
   </w:abstractNum>
   <w:abstractNum w:abstractNumId="10" w15:restartNumberingAfterBreak="0">
-    <w:nsid w:val="1D85206A"/>
+    <w:nsid w:val="2C870268"/>
     <w:multiLevelType w:val="singleLevel"/>
     <w:tmpl w:val="04160001"/>
     <w:lvl w:ilvl="0">
@@ -24098,7 +24154,7 @@
     </w:lvl>
   </w:abstractNum>
   <w:abstractNum w:abstractNumId="11" w15:restartNumberingAfterBreak="0">
-    <w:nsid w:val="297941AF"/>
+    <w:nsid w:val="2F365E9E"/>
     <w:multiLevelType w:val="singleLevel"/>
     <w:tmpl w:val="04160001"/>
     <w:lvl w:ilvl="0">
@@ -24115,7 +24171,7 @@
     </w:lvl>
   </w:abstractNum>
   <w:abstractNum w:abstractNumId="12" w15:restartNumberingAfterBreak="0">
-    <w:nsid w:val="330C7E7F"/>
+    <w:nsid w:val="39BB7E14"/>
     <w:multiLevelType w:val="singleLevel"/>
     <w:tmpl w:val="04160001"/>
     <w:lvl w:ilvl="0">
@@ -24132,7 +24188,7 @@
     </w:lvl>
   </w:abstractNum>
   <w:abstractNum w:abstractNumId="13" w15:restartNumberingAfterBreak="0">
-    <w:nsid w:val="3E6911D9"/>
+    <w:nsid w:val="3D966C6E"/>
     <w:multiLevelType w:val="singleLevel"/>
     <w:tmpl w:val="04160001"/>
     <w:lvl w:ilvl="0">
@@ -24149,7 +24205,7 @@
     </w:lvl>
   </w:abstractNum>
   <w:abstractNum w:abstractNumId="14" w15:restartNumberingAfterBreak="0">
-    <w:nsid w:val="42B011C4"/>
+    <w:nsid w:val="3E847E68"/>
     <w:multiLevelType w:val="singleLevel"/>
     <w:tmpl w:val="04160001"/>
     <w:lvl w:ilvl="0">
@@ -24166,7 +24222,7 @@
     </w:lvl>
   </w:abstractNum>
   <w:abstractNum w:abstractNumId="15" w15:restartNumberingAfterBreak="0">
-    <w:nsid w:val="476539CE"/>
+    <w:nsid w:val="3FA02862"/>
     <w:multiLevelType w:val="singleLevel"/>
     <w:tmpl w:val="04160001"/>
     <w:lvl w:ilvl="0">
@@ -24183,7 +24239,7 @@
     </w:lvl>
   </w:abstractNum>
   <w:abstractNum w:abstractNumId="16" w15:restartNumberingAfterBreak="0">
-    <w:nsid w:val="4BDD188A"/>
+    <w:nsid w:val="43683FEC"/>
     <w:multiLevelType w:val="singleLevel"/>
     <w:tmpl w:val="04160001"/>
     <w:lvl w:ilvl="0">
@@ -24200,7 +24256,7 @@
     </w:lvl>
   </w:abstractNum>
   <w:abstractNum w:abstractNumId="17" w15:restartNumberingAfterBreak="0">
-    <w:nsid w:val="4E903496"/>
+    <w:nsid w:val="467B1DBB"/>
     <w:multiLevelType w:val="singleLevel"/>
     <w:tmpl w:val="04160001"/>
     <w:lvl w:ilvl="0">
@@ -24217,7 +24273,7 @@
     </w:lvl>
   </w:abstractNum>
   <w:abstractNum w:abstractNumId="18" w15:restartNumberingAfterBreak="0">
-    <w:nsid w:val="522C257E"/>
+    <w:nsid w:val="478866DA"/>
     <w:multiLevelType w:val="singleLevel"/>
     <w:tmpl w:val="04160001"/>
     <w:lvl w:ilvl="0">
@@ -24234,7 +24290,7 @@
     </w:lvl>
   </w:abstractNum>
   <w:abstractNum w:abstractNumId="19" w15:restartNumberingAfterBreak="0">
-    <w:nsid w:val="57B73DCD"/>
+    <w:nsid w:val="4D7B2977"/>
     <w:multiLevelType w:val="singleLevel"/>
     <w:tmpl w:val="04160001"/>
     <w:lvl w:ilvl="0">
@@ -24251,7 +24307,7 @@
     </w:lvl>
   </w:abstractNum>
   <w:abstractNum w:abstractNumId="20" w15:restartNumberingAfterBreak="0">
-    <w:nsid w:val="5D65232E"/>
+    <w:nsid w:val="57AD6275"/>
     <w:multiLevelType w:val="singleLevel"/>
     <w:tmpl w:val="04160001"/>
     <w:lvl w:ilvl="0">
@@ -24268,7 +24324,7 @@
     </w:lvl>
   </w:abstractNum>
   <w:abstractNum w:abstractNumId="21" w15:restartNumberingAfterBreak="0">
-    <w:nsid w:val="6080505C"/>
+    <w:nsid w:val="58051237"/>
     <w:multiLevelType w:val="singleLevel"/>
     <w:tmpl w:val="04160001"/>
     <w:lvl w:ilvl="0">
@@ -24285,7 +24341,7 @@
     </w:lvl>
   </w:abstractNum>
   <w:abstractNum w:abstractNumId="22" w15:restartNumberingAfterBreak="0">
-    <w:nsid w:val="61733C38"/>
+    <w:nsid w:val="60BB443E"/>
     <w:multiLevelType w:val="singleLevel"/>
     <w:tmpl w:val="04160001"/>
     <w:lvl w:ilvl="0">
@@ -24302,7 +24358,7 @@
     </w:lvl>
   </w:abstractNum>
   <w:abstractNum w:abstractNumId="23" w15:restartNumberingAfterBreak="0">
-    <w:nsid w:val="66743D5B"/>
+    <w:nsid w:val="627623BE"/>
     <w:multiLevelType w:val="singleLevel"/>
     <w:tmpl w:val="04160001"/>
     <w:lvl w:ilvl="0">
@@ -24319,7 +24375,7 @@
     </w:lvl>
   </w:abstractNum>
   <w:abstractNum w:abstractNumId="24" w15:restartNumberingAfterBreak="0">
-    <w:nsid w:val="67C71D22"/>
+    <w:nsid w:val="676B3B4D"/>
     <w:multiLevelType w:val="singleLevel"/>
     <w:tmpl w:val="04160001"/>
     <w:lvl w:ilvl="0">
@@ -24336,7 +24392,7 @@
     </w:lvl>
   </w:abstractNum>
   <w:abstractNum w:abstractNumId="25" w15:restartNumberingAfterBreak="0">
-    <w:nsid w:val="68751063"/>
+    <w:nsid w:val="68EF5FA4"/>
     <w:multiLevelType w:val="singleLevel"/>
     <w:tmpl w:val="04160001"/>
     <w:lvl w:ilvl="0">
@@ -24353,7 +24409,7 @@
     </w:lvl>
   </w:abstractNum>
   <w:abstractNum w:abstractNumId="26" w15:restartNumberingAfterBreak="0">
-    <w:nsid w:val="6B963736"/>
+    <w:nsid w:val="6ADA7B52"/>
     <w:multiLevelType w:val="singleLevel"/>
     <w:tmpl w:val="04160001"/>
     <w:lvl w:ilvl="0">
@@ -24370,7 +24426,7 @@
     </w:lvl>
   </w:abstractNum>
   <w:abstractNum w:abstractNumId="27" w15:restartNumberingAfterBreak="0">
-    <w:nsid w:val="6BD4717A"/>
+    <w:nsid w:val="6D595117"/>
     <w:multiLevelType w:val="singleLevel"/>
     <w:tmpl w:val="04160001"/>
     <w:lvl w:ilvl="0">
@@ -24387,7 +24443,7 @@
     </w:lvl>
   </w:abstractNum>
   <w:abstractNum w:abstractNumId="28" w15:restartNumberingAfterBreak="0">
-    <w:nsid w:val="6CAE1F9F"/>
+    <w:nsid w:val="6E1F59BC"/>
     <w:multiLevelType w:val="singleLevel"/>
     <w:tmpl w:val="04160001"/>
     <w:lvl w:ilvl="0">
@@ -24404,7 +24460,7 @@
     </w:lvl>
   </w:abstractNum>
   <w:abstractNum w:abstractNumId="29" w15:restartNumberingAfterBreak="0">
-    <w:nsid w:val="6DEB25C5"/>
+    <w:nsid w:val="6FAE3D5B"/>
     <w:multiLevelType w:val="singleLevel"/>
     <w:tmpl w:val="04160001"/>
     <w:lvl w:ilvl="0">
@@ -24421,7 +24477,7 @@
     </w:lvl>
   </w:abstractNum>
   <w:abstractNum w:abstractNumId="30" w15:restartNumberingAfterBreak="0">
-    <w:nsid w:val="76137EED"/>
+    <w:nsid w:val="74CA3603"/>
     <w:multiLevelType w:val="singleLevel"/>
     <w:tmpl w:val="04160001"/>
     <w:lvl w:ilvl="0">
@@ -24438,7 +24494,7 @@
     </w:lvl>
   </w:abstractNum>
   <w:abstractNum w:abstractNumId="31" w15:restartNumberingAfterBreak="0">
-    <w:nsid w:val="77803165"/>
+    <w:nsid w:val="75EE06C4"/>
     <w:multiLevelType w:val="singleLevel"/>
     <w:tmpl w:val="04160001"/>
     <w:lvl w:ilvl="0">
@@ -24455,7 +24511,7 @@
     </w:lvl>
   </w:abstractNum>
   <w:abstractNum w:abstractNumId="32" w15:restartNumberingAfterBreak="0">
-    <w:nsid w:val="78A062CC"/>
+    <w:nsid w:val="769B7CC0"/>
     <w:multiLevelType w:val="singleLevel"/>
     <w:tmpl w:val="04160001"/>
     <w:lvl w:ilvl="0">
@@ -24472,7 +24528,7 @@
     </w:lvl>
   </w:abstractNum>
   <w:abstractNum w:abstractNumId="33" w15:restartNumberingAfterBreak="0">
-    <w:nsid w:val="7AAC6D60"/>
+    <w:nsid w:val="7DCA7219"/>
     <w:multiLevelType w:val="singleLevel"/>
     <w:tmpl w:val="04160001"/>
     <w:lvl w:ilvl="0">
@@ -24489,7 +24545,7 @@
     </w:lvl>
   </w:abstractNum>
   <w:abstractNum w:abstractNumId="34" w15:restartNumberingAfterBreak="0">
-    <w:nsid w:val="7F117810"/>
+    <w:nsid w:val="7EC76B62"/>
     <w:multiLevelType w:val="singleLevel"/>
     <w:tmpl w:val="04160001"/>
     <w:lvl w:ilvl="0">
@@ -24505,110 +24561,110 @@
       </w:rPr>
     </w:lvl>
   </w:abstractNum>
-  <w:num w:numId="1" w16cid:durableId="900797453">
+  <w:num w:numId="1" w16cid:durableId="1942910667">
+    <w:abstractNumId w:val="5"/>
+  </w:num>
+  <w:num w:numId="2" w16cid:durableId="349137830">
+    <w:abstractNumId w:val="4"/>
+  </w:num>
+  <w:num w:numId="3" w16cid:durableId="1523862937">
+    <w:abstractNumId w:val="12"/>
+  </w:num>
+  <w:num w:numId="4" w16cid:durableId="1448504673">
+    <w:abstractNumId w:val="27"/>
+  </w:num>
+  <w:num w:numId="5" w16cid:durableId="1058623592">
+    <w:abstractNumId w:val="23"/>
+  </w:num>
+  <w:num w:numId="6" w16cid:durableId="38017070">
+    <w:abstractNumId w:val="20"/>
+  </w:num>
+  <w:num w:numId="7" w16cid:durableId="1723603471">
+    <w:abstractNumId w:val="30"/>
+  </w:num>
+  <w:num w:numId="8" w16cid:durableId="782504139">
+    <w:abstractNumId w:val="34"/>
+  </w:num>
+  <w:num w:numId="9" w16cid:durableId="1351295577">
+    <w:abstractNumId w:val="25"/>
+  </w:num>
+  <w:num w:numId="10" w16cid:durableId="291592455">
+    <w:abstractNumId w:val="10"/>
+  </w:num>
+  <w:num w:numId="11" w16cid:durableId="301156292">
+    <w:abstractNumId w:val="29"/>
+  </w:num>
+  <w:num w:numId="12" w16cid:durableId="632517308">
+    <w:abstractNumId w:val="32"/>
+  </w:num>
+  <w:num w:numId="13" w16cid:durableId="1072696826">
+    <w:abstractNumId w:val="28"/>
+  </w:num>
+  <w:num w:numId="14" w16cid:durableId="921717392">
+    <w:abstractNumId w:val="17"/>
+  </w:num>
+  <w:num w:numId="15" w16cid:durableId="1192376984">
+    <w:abstractNumId w:val="0"/>
+  </w:num>
+  <w:num w:numId="16" w16cid:durableId="636448963">
+    <w:abstractNumId w:val="14"/>
+  </w:num>
+  <w:num w:numId="17" w16cid:durableId="1454901437">
+    <w:abstractNumId w:val="33"/>
+  </w:num>
+  <w:num w:numId="18" w16cid:durableId="156262861">
+    <w:abstractNumId w:val="18"/>
+  </w:num>
+  <w:num w:numId="19" w16cid:durableId="239365165">
+    <w:abstractNumId w:val="16"/>
+  </w:num>
+  <w:num w:numId="20" w16cid:durableId="1439178541">
+    <w:abstractNumId w:val="15"/>
+  </w:num>
+  <w:num w:numId="21" w16cid:durableId="1136534700">
+    <w:abstractNumId w:val="2"/>
+  </w:num>
+  <w:num w:numId="22" w16cid:durableId="2012098216">
+    <w:abstractNumId w:val="6"/>
+  </w:num>
+  <w:num w:numId="23" w16cid:durableId="2090417110">
+    <w:abstractNumId w:val="11"/>
+  </w:num>
+  <w:num w:numId="24" w16cid:durableId="630402403">
+    <w:abstractNumId w:val="24"/>
+  </w:num>
+  <w:num w:numId="25" w16cid:durableId="183515678">
+    <w:abstractNumId w:val="13"/>
+  </w:num>
+  <w:num w:numId="26" w16cid:durableId="975137329">
+    <w:abstractNumId w:val="3"/>
+  </w:num>
+  <w:num w:numId="27" w16cid:durableId="10110447">
+    <w:abstractNumId w:val="7"/>
+  </w:num>
+  <w:num w:numId="28" w16cid:durableId="283775716">
     <w:abstractNumId w:val="26"/>
   </w:num>
-  <w:num w:numId="2" w16cid:durableId="522288962">
+  <w:num w:numId="29" w16cid:durableId="350421665">
+    <w:abstractNumId w:val="1"/>
+  </w:num>
+  <w:num w:numId="30" w16cid:durableId="104546407">
     <w:abstractNumId w:val="22"/>
   </w:num>
-  <w:num w:numId="3" w16cid:durableId="801584383">
-    <w:abstractNumId w:val="24"/>
+  <w:num w:numId="31" w16cid:durableId="964577648">
+    <w:abstractNumId w:val="8"/>
   </w:num>
-  <w:num w:numId="4" w16cid:durableId="1528786903">
-    <w:abstractNumId w:val="29"/>
-  </w:num>
-  <w:num w:numId="5" w16cid:durableId="745303476">
+  <w:num w:numId="32" w16cid:durableId="1638947791">
     <w:abstractNumId w:val="21"/>
   </w:num>
-  <w:num w:numId="6" w16cid:durableId="1165323922">
-    <w:abstractNumId w:val="7"/>
+  <w:num w:numId="33" w16cid:durableId="55905559">
+    <w:abstractNumId w:val="19"/>
   </w:num>
-  <w:num w:numId="7" w16cid:durableId="230578288">
-    <w:abstractNumId w:val="5"/>
-  </w:num>
-  <w:num w:numId="8" w16cid:durableId="1354696673">
-    <w:abstractNumId w:val="33"/>
-  </w:num>
-  <w:num w:numId="9" w16cid:durableId="801310351">
-    <w:abstractNumId w:val="20"/>
-  </w:num>
-  <w:num w:numId="10" w16cid:durableId="1000080570">
-    <w:abstractNumId w:val="1"/>
-  </w:num>
-  <w:num w:numId="11" w16cid:durableId="863984970">
-    <w:abstractNumId w:val="8"/>
-  </w:num>
-  <w:num w:numId="12" w16cid:durableId="1568539707">
-    <w:abstractNumId w:val="25"/>
-  </w:num>
-  <w:num w:numId="13" w16cid:durableId="1089539230">
-    <w:abstractNumId w:val="16"/>
-  </w:num>
-  <w:num w:numId="14" w16cid:durableId="49769552">
+  <w:num w:numId="34" w16cid:durableId="908030926">
     <w:abstractNumId w:val="31"/>
   </w:num>
-  <w:num w:numId="15" w16cid:durableId="456874037">
-    <w:abstractNumId w:val="11"/>
-  </w:num>
-  <w:num w:numId="16" w16cid:durableId="68966398">
-    <w:abstractNumId w:val="32"/>
-  </w:num>
-  <w:num w:numId="17" w16cid:durableId="1095980943">
-    <w:abstractNumId w:val="15"/>
-  </w:num>
-  <w:num w:numId="18" w16cid:durableId="36199048">
-    <w:abstractNumId w:val="19"/>
-  </w:num>
-  <w:num w:numId="19" w16cid:durableId="502165939">
-    <w:abstractNumId w:val="14"/>
-  </w:num>
-  <w:num w:numId="20" w16cid:durableId="57560432">
-    <w:abstractNumId w:val="3"/>
-  </w:num>
-  <w:num w:numId="21" w16cid:durableId="791746039">
-    <w:abstractNumId w:val="18"/>
-  </w:num>
-  <w:num w:numId="22" w16cid:durableId="1052584199">
-    <w:abstractNumId w:val="10"/>
-  </w:num>
-  <w:num w:numId="23" w16cid:durableId="1776246633">
-    <w:abstractNumId w:val="4"/>
-  </w:num>
-  <w:num w:numId="24" w16cid:durableId="1366710594">
-    <w:abstractNumId w:val="0"/>
-  </w:num>
-  <w:num w:numId="25" w16cid:durableId="1215312981">
-    <w:abstractNumId w:val="17"/>
-  </w:num>
-  <w:num w:numId="26" w16cid:durableId="1165703721">
-    <w:abstractNumId w:val="23"/>
-  </w:num>
-  <w:num w:numId="27" w16cid:durableId="1458523768">
+  <w:num w:numId="35" w16cid:durableId="360401678">
     <w:abstractNumId w:val="9"/>
-  </w:num>
-  <w:num w:numId="28" w16cid:durableId="831524083">
-    <w:abstractNumId w:val="27"/>
-  </w:num>
-  <w:num w:numId="29" w16cid:durableId="815343281">
-    <w:abstractNumId w:val="34"/>
-  </w:num>
-  <w:num w:numId="30" w16cid:durableId="2125880268">
-    <w:abstractNumId w:val="30"/>
-  </w:num>
-  <w:num w:numId="31" w16cid:durableId="504053898">
-    <w:abstractNumId w:val="13"/>
-  </w:num>
-  <w:num w:numId="32" w16cid:durableId="1402172854">
-    <w:abstractNumId w:val="6"/>
-  </w:num>
-  <w:num w:numId="33" w16cid:durableId="825512490">
-    <w:abstractNumId w:val="28"/>
-  </w:num>
-  <w:num w:numId="34" w16cid:durableId="102457717">
-    <w:abstractNumId w:val="2"/>
-  </w:num>
-  <w:num w:numId="35" w16cid:durableId="1381128075">
-    <w:abstractNumId w:val="12"/>
   </w:num>
 </w:numbering>
 </file>
@@ -25021,7 +25077,7 @@
     <w:link w:val="Ttulo1Char"/>
     <w:uiPriority w:val="9"/>
     <w:qFormat/>
-    <w:rsid w:val="00460A92"/>
+    <w:rsid w:val="00742FC8"/>
     <w:pPr>
       <w:keepNext/>
       <w:keepLines/>
@@ -25043,7 +25099,7 @@
     <w:uiPriority w:val="9"/>
     <w:unhideWhenUsed/>
     <w:qFormat/>
-    <w:rsid w:val="00460A92"/>
+    <w:rsid w:val="00742FC8"/>
     <w:pPr>
       <w:keepNext/>
       <w:keepLines/>
@@ -25066,7 +25122,7 @@
     <w:semiHidden/>
     <w:unhideWhenUsed/>
     <w:qFormat/>
-    <w:rsid w:val="00460A92"/>
+    <w:rsid w:val="00742FC8"/>
     <w:pPr>
       <w:keepNext/>
       <w:keepLines/>
@@ -25089,7 +25145,7 @@
     <w:semiHidden/>
     <w:unhideWhenUsed/>
     <w:qFormat/>
-    <w:rsid w:val="00460A92"/>
+    <w:rsid w:val="00742FC8"/>
     <w:pPr>
       <w:keepNext/>
       <w:keepLines/>
@@ -25112,7 +25168,7 @@
     <w:semiHidden/>
     <w:unhideWhenUsed/>
     <w:qFormat/>
-    <w:rsid w:val="00460A92"/>
+    <w:rsid w:val="00742FC8"/>
     <w:pPr>
       <w:keepNext/>
       <w:keepLines/>
@@ -25133,7 +25189,7 @@
     <w:semiHidden/>
     <w:unhideWhenUsed/>
     <w:qFormat/>
-    <w:rsid w:val="00460A92"/>
+    <w:rsid w:val="00742FC8"/>
     <w:pPr>
       <w:keepNext/>
       <w:keepLines/>
@@ -25156,7 +25212,7 @@
     <w:semiHidden/>
     <w:unhideWhenUsed/>
     <w:qFormat/>
-    <w:rsid w:val="00460A92"/>
+    <w:rsid w:val="00742FC8"/>
     <w:pPr>
       <w:keepNext/>
       <w:keepLines/>
@@ -25177,7 +25233,7 @@
     <w:semiHidden/>
     <w:unhideWhenUsed/>
     <w:qFormat/>
-    <w:rsid w:val="00460A92"/>
+    <w:rsid w:val="00742FC8"/>
     <w:pPr>
       <w:keepNext/>
       <w:keepLines/>
@@ -25200,7 +25256,7 @@
     <w:semiHidden/>
     <w:unhideWhenUsed/>
     <w:qFormat/>
-    <w:rsid w:val="00460A92"/>
+    <w:rsid w:val="00742FC8"/>
     <w:pPr>
       <w:keepNext/>
       <w:keepLines/>
@@ -25244,7 +25300,7 @@
     <w:basedOn w:val="Fontepargpadro"/>
     <w:link w:val="Ttulo1"/>
     <w:uiPriority w:val="9"/>
-    <w:rsid w:val="00460A92"/>
+    <w:rsid w:val="00742FC8"/>
     <w:rPr>
       <w:rFonts w:asciiTheme="majorHAnsi" w:eastAsiaTheme="majorEastAsia" w:hAnsiTheme="majorHAnsi" w:cstheme="majorBidi"/>
       <w:color w:val="0F4761" w:themeColor="accent1" w:themeShade="BF"/>
@@ -25257,7 +25313,7 @@
     <w:basedOn w:val="Fontepargpadro"/>
     <w:link w:val="Ttulo2"/>
     <w:uiPriority w:val="9"/>
-    <w:rsid w:val="00460A92"/>
+    <w:rsid w:val="00742FC8"/>
     <w:rPr>
       <w:rFonts w:asciiTheme="majorHAnsi" w:eastAsiaTheme="majorEastAsia" w:hAnsiTheme="majorHAnsi" w:cstheme="majorBidi"/>
       <w:color w:val="0F4761" w:themeColor="accent1" w:themeShade="BF"/>
@@ -25271,7 +25327,7 @@
     <w:link w:val="Ttulo3"/>
     <w:uiPriority w:val="9"/>
     <w:semiHidden/>
-    <w:rsid w:val="00460A92"/>
+    <w:rsid w:val="00742FC8"/>
     <w:rPr>
       <w:rFonts w:eastAsiaTheme="majorEastAsia" w:cstheme="majorBidi"/>
       <w:color w:val="0F4761" w:themeColor="accent1" w:themeShade="BF"/>
@@ -25285,7 +25341,7 @@
     <w:link w:val="Ttulo4"/>
     <w:uiPriority w:val="9"/>
     <w:semiHidden/>
-    <w:rsid w:val="00460A92"/>
+    <w:rsid w:val="00742FC8"/>
     <w:rPr>
       <w:rFonts w:eastAsiaTheme="majorEastAsia" w:cstheme="majorBidi"/>
       <w:i/>
@@ -25299,7 +25355,7 @@
     <w:link w:val="Ttulo5"/>
     <w:uiPriority w:val="9"/>
     <w:semiHidden/>
-    <w:rsid w:val="00460A92"/>
+    <w:rsid w:val="00742FC8"/>
     <w:rPr>
       <w:rFonts w:eastAsiaTheme="majorEastAsia" w:cstheme="majorBidi"/>
       <w:color w:val="0F4761" w:themeColor="accent1" w:themeShade="BF"/>
@@ -25311,7 +25367,7 @@
     <w:link w:val="Ttulo6"/>
     <w:uiPriority w:val="9"/>
     <w:semiHidden/>
-    <w:rsid w:val="00460A92"/>
+    <w:rsid w:val="00742FC8"/>
     <w:rPr>
       <w:rFonts w:eastAsiaTheme="majorEastAsia" w:cstheme="majorBidi"/>
       <w:i/>
@@ -25325,7 +25381,7 @@
     <w:link w:val="Ttulo7"/>
     <w:uiPriority w:val="9"/>
     <w:semiHidden/>
-    <w:rsid w:val="00460A92"/>
+    <w:rsid w:val="00742FC8"/>
     <w:rPr>
       <w:rFonts w:eastAsiaTheme="majorEastAsia" w:cstheme="majorBidi"/>
       <w:color w:val="595959" w:themeColor="text1" w:themeTint="A6"/>
@@ -25337,7 +25393,7 @@
     <w:link w:val="Ttulo8"/>
     <w:uiPriority w:val="9"/>
     <w:semiHidden/>
-    <w:rsid w:val="00460A92"/>
+    <w:rsid w:val="00742FC8"/>
     <w:rPr>
       <w:rFonts w:eastAsiaTheme="majorEastAsia" w:cstheme="majorBidi"/>
       <w:i/>
@@ -25351,7 +25407,7 @@
     <w:link w:val="Ttulo9"/>
     <w:uiPriority w:val="9"/>
     <w:semiHidden/>
-    <w:rsid w:val="00460A92"/>
+    <w:rsid w:val="00742FC8"/>
     <w:rPr>
       <w:rFonts w:eastAsiaTheme="majorEastAsia" w:cstheme="majorBidi"/>
       <w:color w:val="272727" w:themeColor="text1" w:themeTint="D8"/>
@@ -25364,7 +25420,7 @@
     <w:link w:val="TtuloChar"/>
     <w:uiPriority w:val="10"/>
     <w:qFormat/>
-    <w:rsid w:val="00460A92"/>
+    <w:rsid w:val="00742FC8"/>
     <w:pPr>
       <w:spacing w:after="80" w:line="240" w:lineRule="auto"/>
       <w:contextualSpacing/>
@@ -25382,7 +25438,7 @@
     <w:basedOn w:val="Fontepargpadro"/>
     <w:link w:val="Ttulo"/>
     <w:uiPriority w:val="10"/>
-    <w:rsid w:val="00460A92"/>
+    <w:rsid w:val="00742FC8"/>
     <w:rPr>
       <w:rFonts w:asciiTheme="majorHAnsi" w:eastAsiaTheme="majorEastAsia" w:hAnsiTheme="majorHAnsi" w:cstheme="majorBidi"/>
       <w:spacing w:val="-10"/>
@@ -25398,7 +25454,7 @@
     <w:link w:val="SubttuloChar"/>
     <w:uiPriority w:val="11"/>
     <w:qFormat/>
-    <w:rsid w:val="00460A92"/>
+    <w:rsid w:val="00742FC8"/>
     <w:pPr>
       <w:numPr>
         <w:ilvl w:val="1"/>
@@ -25417,7 +25473,7 @@
     <w:basedOn w:val="Fontepargpadro"/>
     <w:link w:val="Subttulo"/>
     <w:uiPriority w:val="11"/>
-    <w:rsid w:val="00460A92"/>
+    <w:rsid w:val="00742FC8"/>
     <w:rPr>
       <w:rFonts w:eastAsiaTheme="majorEastAsia" w:cstheme="majorBidi"/>
       <w:color w:val="595959" w:themeColor="text1" w:themeTint="A6"/>
@@ -25433,7 +25489,7 @@
     <w:link w:val="CitaoChar"/>
     <w:uiPriority w:val="29"/>
     <w:qFormat/>
-    <w:rsid w:val="00460A92"/>
+    <w:rsid w:val="00742FC8"/>
     <w:pPr>
       <w:spacing w:before="160"/>
       <w:jc w:val="center"/>
@@ -25449,7 +25505,7 @@
     <w:basedOn w:val="Fontepargpadro"/>
     <w:link w:val="Citao"/>
     <w:uiPriority w:val="29"/>
-    <w:rsid w:val="00460A92"/>
+    <w:rsid w:val="00742FC8"/>
     <w:rPr>
       <w:i/>
       <w:iCs/>
@@ -25461,7 +25517,7 @@
     <w:basedOn w:val="Normal"/>
     <w:uiPriority w:val="34"/>
     <w:qFormat/>
-    <w:rsid w:val="00460A92"/>
+    <w:rsid w:val="00742FC8"/>
     <w:pPr>
       <w:ind w:left="720"/>
       <w:contextualSpacing/>
@@ -25472,7 +25528,7 @@
     <w:basedOn w:val="Fontepargpadro"/>
     <w:uiPriority w:val="21"/>
     <w:qFormat/>
-    <w:rsid w:val="00460A92"/>
+    <w:rsid w:val="00742FC8"/>
     <w:rPr>
       <w:i/>
       <w:iCs/>
@@ -25486,7 +25542,7 @@
     <w:link w:val="CitaoIntensaChar"/>
     <w:uiPriority w:val="30"/>
     <w:qFormat/>
-    <w:rsid w:val="00460A92"/>
+    <w:rsid w:val="00742FC8"/>
     <w:pPr>
       <w:pBdr>
         <w:top w:val="single" w:sz="4" w:space="10" w:color="0F4761" w:themeColor="accent1" w:themeShade="BF"/>
@@ -25507,7 +25563,7 @@
     <w:basedOn w:val="Fontepargpadro"/>
     <w:link w:val="CitaoIntensa"/>
     <w:uiPriority w:val="30"/>
-    <w:rsid w:val="00460A92"/>
+    <w:rsid w:val="00742FC8"/>
     <w:rPr>
       <w:i/>
       <w:iCs/>
@@ -25519,7 +25575,7 @@
     <w:basedOn w:val="Fontepargpadro"/>
     <w:uiPriority w:val="32"/>
     <w:qFormat/>
-    <w:rsid w:val="00460A92"/>
+    <w:rsid w:val="00742FC8"/>
     <w:rPr>
       <w:b/>
       <w:bCs/>
@@ -25534,7 +25590,7 @@
     <w:link w:val="CabealhoChar"/>
     <w:uiPriority w:val="99"/>
     <w:unhideWhenUsed/>
-    <w:rsid w:val="00460A92"/>
+    <w:rsid w:val="00742FC8"/>
     <w:pPr>
       <w:tabs>
         <w:tab w:val="center" w:pos="4252"/>
@@ -25548,7 +25604,7 @@
     <w:basedOn w:val="Fontepargpadro"/>
     <w:link w:val="Cabealho"/>
     <w:uiPriority w:val="99"/>
-    <w:rsid w:val="00460A92"/>
+    <w:rsid w:val="00742FC8"/>
   </w:style>
   <w:style w:type="paragraph" w:styleId="Rodap">
     <w:name w:val="footer"/>
@@ -25556,7 +25612,7 @@
     <w:link w:val="RodapChar"/>
     <w:uiPriority w:val="99"/>
     <w:unhideWhenUsed/>
-    <w:rsid w:val="00460A92"/>
+    <w:rsid w:val="00742FC8"/>
     <w:pPr>
       <w:tabs>
         <w:tab w:val="center" w:pos="4252"/>
@@ -25570,7 +25626,7 @@
     <w:basedOn w:val="Fontepargpadro"/>
     <w:link w:val="Rodap"/>
     <w:uiPriority w:val="99"/>
-    <w:rsid w:val="00460A92"/>
+    <w:rsid w:val="00742FC8"/>
   </w:style>
   <w:style w:type="paragraph" w:styleId="Sumrio1">
     <w:name w:val="toc 1"/>
@@ -25579,7 +25635,7 @@
     <w:autoRedefine/>
     <w:uiPriority w:val="39"/>
     <w:unhideWhenUsed/>
-    <w:rsid w:val="00460A92"/>
+    <w:rsid w:val="00742FC8"/>
     <w:pPr>
       <w:spacing w:after="100"/>
     </w:pPr>
@@ -25591,7 +25647,7 @@
     <w:autoRedefine/>
     <w:uiPriority w:val="39"/>
     <w:unhideWhenUsed/>
-    <w:rsid w:val="00460A92"/>
+    <w:rsid w:val="00742FC8"/>
     <w:pPr>
       <w:spacing w:after="100"/>
       <w:ind w:left="240"/>

</xml_diff>

<commit_message>
Sincroniza com a produção — trava de conflito nas ações rápidas de Gate 1/Gate 2
Co-Authored-By: Claude Sonnet 5 <noreply@anthropic.com>
</commit_message>
<xml_diff>
--- a/Manual de Uso - Ferramenta de Gestao de Projetos.docx
+++ b/Manual de Uso - Ferramenta de Gestao de Projetos.docx
@@ -229,7 +229,7 @@
         <w:rPr>
           <w:noProof/>
         </w:rPr>
-        <w:instrText xml:space="preserve"> PAGEREF _Toc240288816 \h </w:instrText>
+        <w:instrText xml:space="preserve"> PAGEREF _Toc240290717 \h </w:instrText>
       </w:r>
       <w:r>
         <w:rPr>
@@ -290,7 +290,7 @@
         <w:rPr>
           <w:noProof/>
         </w:rPr>
-        <w:instrText xml:space="preserve"> PAGEREF _Toc240288817 \h </w:instrText>
+        <w:instrText xml:space="preserve"> PAGEREF _Toc240290718 \h </w:instrText>
       </w:r>
       <w:r>
         <w:rPr>
@@ -351,7 +351,7 @@
         <w:rPr>
           <w:noProof/>
         </w:rPr>
-        <w:instrText xml:space="preserve"> PAGEREF _Toc240288818 \h </w:instrText>
+        <w:instrText xml:space="preserve"> PAGEREF _Toc240290719 \h </w:instrText>
       </w:r>
       <w:r>
         <w:rPr>
@@ -368,7 +368,7 @@
         <w:rPr>
           <w:noProof/>
         </w:rPr>
-        <w:t>18</w:t>
+        <w:t>19</w:t>
       </w:r>
       <w:r>
         <w:rPr>
@@ -412,7 +412,7 @@
         <w:rPr>
           <w:noProof/>
         </w:rPr>
-        <w:instrText xml:space="preserve"> PAGEREF _Toc240288819 \h </w:instrText>
+        <w:instrText xml:space="preserve"> PAGEREF _Toc240290720 \h </w:instrText>
       </w:r>
       <w:r>
         <w:rPr>
@@ -473,7 +473,7 @@
         <w:rPr>
           <w:noProof/>
         </w:rPr>
-        <w:instrText xml:space="preserve"> PAGEREF _Toc240288820 \h </w:instrText>
+        <w:instrText xml:space="preserve"> PAGEREF _Toc240290721 \h </w:instrText>
       </w:r>
       <w:r>
         <w:rPr>
@@ -534,7 +534,7 @@
         <w:rPr>
           <w:noProof/>
         </w:rPr>
-        <w:instrText xml:space="preserve"> PAGEREF _Toc240288821 \h </w:instrText>
+        <w:instrText xml:space="preserve"> PAGEREF _Toc240290722 \h </w:instrText>
       </w:r>
       <w:r>
         <w:rPr>
@@ -551,7 +551,7 @@
         <w:rPr>
           <w:noProof/>
         </w:rPr>
-        <w:t>22</w:t>
+        <w:t>23</w:t>
       </w:r>
       <w:r>
         <w:rPr>
@@ -595,7 +595,7 @@
         <w:rPr>
           <w:noProof/>
         </w:rPr>
-        <w:instrText xml:space="preserve"> PAGEREF _Toc240288822 \h </w:instrText>
+        <w:instrText xml:space="preserve"> PAGEREF _Toc240290723 \h </w:instrText>
       </w:r>
       <w:r>
         <w:rPr>
@@ -612,7 +612,7 @@
         <w:rPr>
           <w:noProof/>
         </w:rPr>
-        <w:t>22</w:t>
+        <w:t>23</w:t>
       </w:r>
       <w:r>
         <w:rPr>
@@ -656,7 +656,7 @@
         <w:rPr>
           <w:noProof/>
         </w:rPr>
-        <w:instrText xml:space="preserve"> PAGEREF _Toc240288823 \h </w:instrText>
+        <w:instrText xml:space="preserve"> PAGEREF _Toc240290724 \h </w:instrText>
       </w:r>
       <w:r>
         <w:rPr>
@@ -673,7 +673,7 @@
         <w:rPr>
           <w:noProof/>
         </w:rPr>
-        <w:t>22</w:t>
+        <w:t>23</w:t>
       </w:r>
       <w:r>
         <w:rPr>
@@ -717,7 +717,7 @@
         <w:rPr>
           <w:noProof/>
         </w:rPr>
-        <w:instrText xml:space="preserve"> PAGEREF _Toc240288824 \h </w:instrText>
+        <w:instrText xml:space="preserve"> PAGEREF _Toc240290725 \h </w:instrText>
       </w:r>
       <w:r>
         <w:rPr>
@@ -734,7 +734,7 @@
         <w:rPr>
           <w:noProof/>
         </w:rPr>
-        <w:t>22</w:t>
+        <w:t>23</w:t>
       </w:r>
       <w:r>
         <w:rPr>
@@ -778,7 +778,7 @@
         <w:rPr>
           <w:noProof/>
         </w:rPr>
-        <w:instrText xml:space="preserve"> PAGEREF _Toc240288825 \h </w:instrText>
+        <w:instrText xml:space="preserve"> PAGEREF _Toc240290726 \h </w:instrText>
       </w:r>
       <w:r>
         <w:rPr>
@@ -795,7 +795,7 @@
         <w:rPr>
           <w:noProof/>
         </w:rPr>
-        <w:t>23</w:t>
+        <w:t>24</w:t>
       </w:r>
       <w:r>
         <w:rPr>
@@ -839,7 +839,7 @@
         <w:rPr>
           <w:noProof/>
         </w:rPr>
-        <w:instrText xml:space="preserve"> PAGEREF _Toc240288826 \h </w:instrText>
+        <w:instrText xml:space="preserve"> PAGEREF _Toc240290727 \h </w:instrText>
       </w:r>
       <w:r>
         <w:rPr>
@@ -856,7 +856,7 @@
         <w:rPr>
           <w:noProof/>
         </w:rPr>
-        <w:t>24</w:t>
+        <w:t>25</w:t>
       </w:r>
       <w:r>
         <w:rPr>
@@ -900,7 +900,7 @@
         <w:rPr>
           <w:noProof/>
         </w:rPr>
-        <w:instrText xml:space="preserve"> PAGEREF _Toc240288827 \h </w:instrText>
+        <w:instrText xml:space="preserve"> PAGEREF _Toc240290728 \h </w:instrText>
       </w:r>
       <w:r>
         <w:rPr>
@@ -917,7 +917,7 @@
         <w:rPr>
           <w:noProof/>
         </w:rPr>
-        <w:t>26</w:t>
+        <w:t>27</w:t>
       </w:r>
       <w:r>
         <w:rPr>
@@ -961,7 +961,7 @@
         <w:rPr>
           <w:noProof/>
         </w:rPr>
-        <w:instrText xml:space="preserve"> PAGEREF _Toc240288828 \h </w:instrText>
+        <w:instrText xml:space="preserve"> PAGEREF _Toc240290729 \h </w:instrText>
       </w:r>
       <w:r>
         <w:rPr>
@@ -978,7 +978,7 @@
         <w:rPr>
           <w:noProof/>
         </w:rPr>
-        <w:t>27</w:t>
+        <w:t>28</w:t>
       </w:r>
       <w:r>
         <w:rPr>
@@ -1022,7 +1022,7 @@
         <w:rPr>
           <w:noProof/>
         </w:rPr>
-        <w:instrText xml:space="preserve"> PAGEREF _Toc240288829 \h </w:instrText>
+        <w:instrText xml:space="preserve"> PAGEREF _Toc240290730 \h </w:instrText>
       </w:r>
       <w:r>
         <w:rPr>
@@ -1039,7 +1039,7 @@
         <w:rPr>
           <w:noProof/>
         </w:rPr>
-        <w:t>28</w:t>
+        <w:t>29</w:t>
       </w:r>
       <w:r>
         <w:rPr>
@@ -1083,7 +1083,7 @@
         <w:rPr>
           <w:noProof/>
         </w:rPr>
-        <w:instrText xml:space="preserve"> PAGEREF _Toc240288830 \h </w:instrText>
+        <w:instrText xml:space="preserve"> PAGEREF _Toc240290731 \h </w:instrText>
       </w:r>
       <w:r>
         <w:rPr>
@@ -1100,7 +1100,7 @@
         <w:rPr>
           <w:noProof/>
         </w:rPr>
-        <w:t>28</w:t>
+        <w:t>29</w:t>
       </w:r>
       <w:r>
         <w:rPr>
@@ -1144,7 +1144,7 @@
         <w:rPr>
           <w:noProof/>
         </w:rPr>
-        <w:instrText xml:space="preserve"> PAGEREF _Toc240288831 \h </w:instrText>
+        <w:instrText xml:space="preserve"> PAGEREF _Toc240290732 \h </w:instrText>
       </w:r>
       <w:r>
         <w:rPr>
@@ -1161,7 +1161,7 @@
         <w:rPr>
           <w:noProof/>
         </w:rPr>
-        <w:t>29</w:t>
+        <w:t>30</w:t>
       </w:r>
       <w:r>
         <w:rPr>
@@ -1205,7 +1205,7 @@
         <w:rPr>
           <w:noProof/>
         </w:rPr>
-        <w:instrText xml:space="preserve"> PAGEREF _Toc240288832 \h </w:instrText>
+        <w:instrText xml:space="preserve"> PAGEREF _Toc240290733 \h </w:instrText>
       </w:r>
       <w:r>
         <w:rPr>
@@ -1222,7 +1222,7 @@
         <w:rPr>
           <w:noProof/>
         </w:rPr>
-        <w:t>30</w:t>
+        <w:t>31</w:t>
       </w:r>
       <w:r>
         <w:rPr>
@@ -1266,7 +1266,7 @@
         <w:rPr>
           <w:noProof/>
         </w:rPr>
-        <w:instrText xml:space="preserve"> PAGEREF _Toc240288833 \h </w:instrText>
+        <w:instrText xml:space="preserve"> PAGEREF _Toc240290734 \h </w:instrText>
       </w:r>
       <w:r>
         <w:rPr>
@@ -1283,7 +1283,7 @@
         <w:rPr>
           <w:noProof/>
         </w:rPr>
-        <w:t>30</w:t>
+        <w:t>31</w:t>
       </w:r>
       <w:r>
         <w:rPr>
@@ -1327,7 +1327,7 @@
         <w:rPr>
           <w:noProof/>
         </w:rPr>
-        <w:instrText xml:space="preserve"> PAGEREF _Toc240288834 \h </w:instrText>
+        <w:instrText xml:space="preserve"> PAGEREF _Toc240290735 \h </w:instrText>
       </w:r>
       <w:r>
         <w:rPr>
@@ -1344,7 +1344,7 @@
         <w:rPr>
           <w:noProof/>
         </w:rPr>
-        <w:t>32</w:t>
+        <w:t>33</w:t>
       </w:r>
       <w:r>
         <w:rPr>
@@ -1388,7 +1388,7 @@
         <w:rPr>
           <w:noProof/>
         </w:rPr>
-        <w:instrText xml:space="preserve"> PAGEREF _Toc240288835 \h </w:instrText>
+        <w:instrText xml:space="preserve"> PAGEREF _Toc240290736 \h </w:instrText>
       </w:r>
       <w:r>
         <w:rPr>
@@ -1405,7 +1405,7 @@
         <w:rPr>
           <w:noProof/>
         </w:rPr>
-        <w:t>33</w:t>
+        <w:t>34</w:t>
       </w:r>
       <w:r>
         <w:rPr>
@@ -1449,7 +1449,7 @@
         <w:rPr>
           <w:noProof/>
         </w:rPr>
-        <w:instrText xml:space="preserve"> PAGEREF _Toc240288836 \h </w:instrText>
+        <w:instrText xml:space="preserve"> PAGEREF _Toc240290737 \h </w:instrText>
       </w:r>
       <w:r>
         <w:rPr>
@@ -1466,7 +1466,7 @@
         <w:rPr>
           <w:noProof/>
         </w:rPr>
-        <w:t>35</w:t>
+        <w:t>36</w:t>
       </w:r>
       <w:r>
         <w:rPr>
@@ -1510,7 +1510,7 @@
         <w:rPr>
           <w:noProof/>
         </w:rPr>
-        <w:instrText xml:space="preserve"> PAGEREF _Toc240288837 \h </w:instrText>
+        <w:instrText xml:space="preserve"> PAGEREF _Toc240290738 \h </w:instrText>
       </w:r>
       <w:r>
         <w:rPr>
@@ -1527,7 +1527,7 @@
         <w:rPr>
           <w:noProof/>
         </w:rPr>
-        <w:t>35</w:t>
+        <w:t>36</w:t>
       </w:r>
       <w:r>
         <w:rPr>
@@ -1571,7 +1571,7 @@
         <w:rPr>
           <w:noProof/>
         </w:rPr>
-        <w:instrText xml:space="preserve"> PAGEREF _Toc240288838 \h </w:instrText>
+        <w:instrText xml:space="preserve"> PAGEREF _Toc240290739 \h </w:instrText>
       </w:r>
       <w:r>
         <w:rPr>
@@ -1588,7 +1588,7 @@
         <w:rPr>
           <w:noProof/>
         </w:rPr>
-        <w:t>38</w:t>
+        <w:t>39</w:t>
       </w:r>
       <w:r>
         <w:rPr>
@@ -1632,7 +1632,7 @@
         <w:rPr>
           <w:noProof/>
         </w:rPr>
-        <w:instrText xml:space="preserve"> PAGEREF _Toc240288839 \h </w:instrText>
+        <w:instrText xml:space="preserve"> PAGEREF _Toc240290740 \h </w:instrText>
       </w:r>
       <w:r>
         <w:rPr>
@@ -1649,7 +1649,7 @@
         <w:rPr>
           <w:noProof/>
         </w:rPr>
-        <w:t>40</w:t>
+        <w:t>41</w:t>
       </w:r>
       <w:r>
         <w:rPr>
@@ -1693,7 +1693,7 @@
         <w:rPr>
           <w:noProof/>
         </w:rPr>
-        <w:instrText xml:space="preserve"> PAGEREF _Toc240288840 \h </w:instrText>
+        <w:instrText xml:space="preserve"> PAGEREF _Toc240290741 \h </w:instrText>
       </w:r>
       <w:r>
         <w:rPr>
@@ -1710,7 +1710,7 @@
         <w:rPr>
           <w:noProof/>
         </w:rPr>
-        <w:t>44</w:t>
+        <w:t>45</w:t>
       </w:r>
       <w:r>
         <w:rPr>
@@ -1755,7 +1755,7 @@
         <w:rPr>
           <w:noProof/>
         </w:rPr>
-        <w:instrText xml:space="preserve"> PAGEREF _Toc240288841 \h </w:instrText>
+        <w:instrText xml:space="preserve"> PAGEREF _Toc240290742 \h </w:instrText>
       </w:r>
       <w:r>
         <w:rPr>
@@ -1772,7 +1772,7 @@
         <w:rPr>
           <w:noProof/>
         </w:rPr>
-        <w:t>48</w:t>
+        <w:t>49</w:t>
       </w:r>
       <w:r>
         <w:rPr>
@@ -1816,7 +1816,7 @@
         <w:rPr>
           <w:noProof/>
         </w:rPr>
-        <w:instrText xml:space="preserve"> PAGEREF _Toc240288842 \h </w:instrText>
+        <w:instrText xml:space="preserve"> PAGEREF _Toc240290743 \h </w:instrText>
       </w:r>
       <w:r>
         <w:rPr>
@@ -1833,7 +1833,7 @@
         <w:rPr>
           <w:noProof/>
         </w:rPr>
-        <w:t>51</w:t>
+        <w:t>52</w:t>
       </w:r>
       <w:r>
         <w:rPr>
@@ -1877,7 +1877,7 @@
         <w:rPr>
           <w:noProof/>
         </w:rPr>
-        <w:instrText xml:space="preserve"> PAGEREF _Toc240288843 \h </w:instrText>
+        <w:instrText xml:space="preserve"> PAGEREF _Toc240290744 \h </w:instrText>
       </w:r>
       <w:r>
         <w:rPr>
@@ -1894,7 +1894,7 @@
         <w:rPr>
           <w:noProof/>
         </w:rPr>
-        <w:t>53</w:t>
+        <w:t>54</w:t>
       </w:r>
       <w:r>
         <w:rPr>
@@ -1938,7 +1938,7 @@
         <w:rPr>
           <w:noProof/>
         </w:rPr>
-        <w:instrText xml:space="preserve"> PAGEREF _Toc240288844 \h </w:instrText>
+        <w:instrText xml:space="preserve"> PAGEREF _Toc240290745 \h </w:instrText>
       </w:r>
       <w:r>
         <w:rPr>
@@ -1955,7 +1955,7 @@
         <w:rPr>
           <w:noProof/>
         </w:rPr>
-        <w:t>55</w:t>
+        <w:t>56</w:t>
       </w:r>
       <w:r>
         <w:rPr>
@@ -1999,7 +1999,7 @@
         <w:rPr>
           <w:noProof/>
         </w:rPr>
-        <w:instrText xml:space="preserve"> PAGEREF _Toc240288845 \h </w:instrText>
+        <w:instrText xml:space="preserve"> PAGEREF _Toc240290746 \h </w:instrText>
       </w:r>
       <w:r>
         <w:rPr>
@@ -2016,7 +2016,7 @@
         <w:rPr>
           <w:noProof/>
         </w:rPr>
-        <w:t>58</w:t>
+        <w:t>59</w:t>
       </w:r>
       <w:r>
         <w:rPr>
@@ -2060,7 +2060,7 @@
         <w:rPr>
           <w:noProof/>
         </w:rPr>
-        <w:instrText xml:space="preserve"> PAGEREF _Toc240288846 \h </w:instrText>
+        <w:instrText xml:space="preserve"> PAGEREF _Toc240290747 \h </w:instrText>
       </w:r>
       <w:r>
         <w:rPr>
@@ -2077,7 +2077,7 @@
         <w:rPr>
           <w:noProof/>
         </w:rPr>
-        <w:t>60</w:t>
+        <w:t>61</w:t>
       </w:r>
       <w:r>
         <w:rPr>
@@ -2121,7 +2121,7 @@
         <w:rPr>
           <w:noProof/>
         </w:rPr>
-        <w:instrText xml:space="preserve"> PAGEREF _Toc240288847 \h </w:instrText>
+        <w:instrText xml:space="preserve"> PAGEREF _Toc240290748 \h </w:instrText>
       </w:r>
       <w:r>
         <w:rPr>
@@ -2138,7 +2138,7 @@
         <w:rPr>
           <w:noProof/>
         </w:rPr>
-        <w:t>62</w:t>
+        <w:t>63</w:t>
       </w:r>
       <w:r>
         <w:rPr>
@@ -2182,7 +2182,7 @@
         <w:rPr>
           <w:noProof/>
         </w:rPr>
-        <w:instrText xml:space="preserve"> PAGEREF _Toc240288848 \h </w:instrText>
+        <w:instrText xml:space="preserve"> PAGEREF _Toc240290749 \h </w:instrText>
       </w:r>
       <w:r>
         <w:rPr>
@@ -2199,7 +2199,7 @@
         <w:rPr>
           <w:noProof/>
         </w:rPr>
-        <w:t>62</w:t>
+        <w:t>63</w:t>
       </w:r>
       <w:r>
         <w:rPr>
@@ -2243,7 +2243,7 @@
         <w:rPr>
           <w:noProof/>
         </w:rPr>
-        <w:instrText xml:space="preserve"> PAGEREF _Toc240288849 \h </w:instrText>
+        <w:instrText xml:space="preserve"> PAGEREF _Toc240290750 \h </w:instrText>
       </w:r>
       <w:r>
         <w:rPr>
@@ -2260,7 +2260,7 @@
         <w:rPr>
           <w:noProof/>
         </w:rPr>
-        <w:t>69</w:t>
+        <w:t>70</w:t>
       </w:r>
       <w:r>
         <w:rPr>
@@ -2304,7 +2304,7 @@
         <w:rPr>
           <w:noProof/>
         </w:rPr>
-        <w:instrText xml:space="preserve"> PAGEREF _Toc240288850 \h </w:instrText>
+        <w:instrText xml:space="preserve"> PAGEREF _Toc240290751 \h </w:instrText>
       </w:r>
       <w:r>
         <w:rPr>
@@ -2321,7 +2321,7 @@
         <w:rPr>
           <w:noProof/>
         </w:rPr>
-        <w:t>74</w:t>
+        <w:t>75</w:t>
       </w:r>
       <w:r>
         <w:rPr>
@@ -2365,7 +2365,7 @@
         <w:rPr>
           <w:noProof/>
         </w:rPr>
-        <w:instrText xml:space="preserve"> PAGEREF _Toc240288851 \h </w:instrText>
+        <w:instrText xml:space="preserve"> PAGEREF _Toc240290752 \h </w:instrText>
       </w:r>
       <w:r>
         <w:rPr>
@@ -2382,7 +2382,7 @@
         <w:rPr>
           <w:noProof/>
         </w:rPr>
-        <w:t>74</w:t>
+        <w:t>75</w:t>
       </w:r>
       <w:r>
         <w:rPr>
@@ -2426,7 +2426,7 @@
         <w:rPr>
           <w:noProof/>
         </w:rPr>
-        <w:instrText xml:space="preserve"> PAGEREF _Toc240288852 \h </w:instrText>
+        <w:instrText xml:space="preserve"> PAGEREF _Toc240290753 \h </w:instrText>
       </w:r>
       <w:r>
         <w:rPr>
@@ -2443,7 +2443,7 @@
         <w:rPr>
           <w:noProof/>
         </w:rPr>
-        <w:t>75</w:t>
+        <w:t>76</w:t>
       </w:r>
       <w:r>
         <w:rPr>
@@ -2487,7 +2487,7 @@
         <w:rPr>
           <w:noProof/>
         </w:rPr>
-        <w:instrText xml:space="preserve"> PAGEREF _Toc240288853 \h </w:instrText>
+        <w:instrText xml:space="preserve"> PAGEREF _Toc240290754 \h </w:instrText>
       </w:r>
       <w:r>
         <w:rPr>
@@ -2504,7 +2504,7 @@
         <w:rPr>
           <w:noProof/>
         </w:rPr>
-        <w:t>75</w:t>
+        <w:t>76</w:t>
       </w:r>
       <w:r>
         <w:rPr>
@@ -2548,7 +2548,7 @@
         <w:rPr>
           <w:noProof/>
         </w:rPr>
-        <w:instrText xml:space="preserve"> PAGEREF _Toc240288854 \h </w:instrText>
+        <w:instrText xml:space="preserve"> PAGEREF _Toc240290755 \h </w:instrText>
       </w:r>
       <w:r>
         <w:rPr>
@@ -2565,7 +2565,7 @@
         <w:rPr>
           <w:noProof/>
         </w:rPr>
-        <w:t>78</w:t>
+        <w:t>79</w:t>
       </w:r>
       <w:r>
         <w:rPr>
@@ -2609,7 +2609,7 @@
         <w:rPr>
           <w:noProof/>
         </w:rPr>
-        <w:instrText xml:space="preserve"> PAGEREF _Toc240288855 \h </w:instrText>
+        <w:instrText xml:space="preserve"> PAGEREF _Toc240290756 \h </w:instrText>
       </w:r>
       <w:r>
         <w:rPr>
@@ -2626,7 +2626,7 @@
         <w:rPr>
           <w:noProof/>
         </w:rPr>
-        <w:t>78</w:t>
+        <w:t>79</w:t>
       </w:r>
       <w:r>
         <w:rPr>
@@ -2670,7 +2670,7 @@
         <w:rPr>
           <w:noProof/>
         </w:rPr>
-        <w:instrText xml:space="preserve"> PAGEREF _Toc240288856 \h </w:instrText>
+        <w:instrText xml:space="preserve"> PAGEREF _Toc240290757 \h </w:instrText>
       </w:r>
       <w:r>
         <w:rPr>
@@ -2687,7 +2687,7 @@
         <w:rPr>
           <w:noProof/>
         </w:rPr>
-        <w:t>80</w:t>
+        <w:t>81</w:t>
       </w:r>
       <w:r>
         <w:rPr>
@@ -2731,7 +2731,7 @@
         <w:rPr>
           <w:noProof/>
         </w:rPr>
-        <w:instrText xml:space="preserve"> PAGEREF _Toc240288857 \h </w:instrText>
+        <w:instrText xml:space="preserve"> PAGEREF _Toc240290758 \h </w:instrText>
       </w:r>
       <w:r>
         <w:rPr>
@@ -2748,7 +2748,7 @@
         <w:rPr>
           <w:noProof/>
         </w:rPr>
-        <w:t>80</w:t>
+        <w:t>81</w:t>
       </w:r>
       <w:r>
         <w:rPr>
@@ -2792,7 +2792,7 @@
         <w:rPr>
           <w:noProof/>
         </w:rPr>
-        <w:instrText xml:space="preserve"> PAGEREF _Toc240288858 \h </w:instrText>
+        <w:instrText xml:space="preserve"> PAGEREF _Toc240290759 \h </w:instrText>
       </w:r>
       <w:r>
         <w:rPr>
@@ -2809,7 +2809,7 @@
         <w:rPr>
           <w:noProof/>
         </w:rPr>
-        <w:t>82</w:t>
+        <w:t>83</w:t>
       </w:r>
       <w:r>
         <w:rPr>
@@ -2853,7 +2853,7 @@
         <w:rPr>
           <w:noProof/>
         </w:rPr>
-        <w:instrText xml:space="preserve"> PAGEREF _Toc240288859 \h </w:instrText>
+        <w:instrText xml:space="preserve"> PAGEREF _Toc240290760 \h </w:instrText>
       </w:r>
       <w:r>
         <w:rPr>
@@ -2870,7 +2870,7 @@
         <w:rPr>
           <w:noProof/>
         </w:rPr>
-        <w:t>85</w:t>
+        <w:t>86</w:t>
       </w:r>
       <w:r>
         <w:rPr>
@@ -2914,7 +2914,7 @@
         <w:rPr>
           <w:noProof/>
         </w:rPr>
-        <w:instrText xml:space="preserve"> PAGEREF _Toc240288860 \h </w:instrText>
+        <w:instrText xml:space="preserve"> PAGEREF _Toc240290761 \h </w:instrText>
       </w:r>
       <w:r>
         <w:rPr>
@@ -2931,7 +2931,7 @@
         <w:rPr>
           <w:noProof/>
         </w:rPr>
-        <w:t>88</w:t>
+        <w:t>89</w:t>
       </w:r>
       <w:r>
         <w:rPr>
@@ -2975,7 +2975,7 @@
         <w:rPr>
           <w:noProof/>
         </w:rPr>
-        <w:instrText xml:space="preserve"> PAGEREF _Toc240288861 \h </w:instrText>
+        <w:instrText xml:space="preserve"> PAGEREF _Toc240290762 \h </w:instrText>
       </w:r>
       <w:r>
         <w:rPr>
@@ -2992,7 +2992,7 @@
         <w:rPr>
           <w:noProof/>
         </w:rPr>
-        <w:t>89</w:t>
+        <w:t>90</w:t>
       </w:r>
       <w:r>
         <w:rPr>
@@ -3036,7 +3036,7 @@
         <w:rPr>
           <w:noProof/>
         </w:rPr>
-        <w:instrText xml:space="preserve"> PAGEREF _Toc240288862 \h </w:instrText>
+        <w:instrText xml:space="preserve"> PAGEREF _Toc240290763 \h </w:instrText>
       </w:r>
       <w:r>
         <w:rPr>
@@ -3053,7 +3053,7 @@
         <w:rPr>
           <w:noProof/>
         </w:rPr>
-        <w:t>90</w:t>
+        <w:t>91</w:t>
       </w:r>
       <w:r>
         <w:rPr>
@@ -3097,7 +3097,7 @@
         <w:rPr>
           <w:noProof/>
         </w:rPr>
-        <w:instrText xml:space="preserve"> PAGEREF _Toc240288863 \h </w:instrText>
+        <w:instrText xml:space="preserve"> PAGEREF _Toc240290764 \h </w:instrText>
       </w:r>
       <w:r>
         <w:rPr>
@@ -3114,7 +3114,7 @@
         <w:rPr>
           <w:noProof/>
         </w:rPr>
-        <w:t>94</w:t>
+        <w:t>95</w:t>
       </w:r>
       <w:r>
         <w:rPr>
@@ -3158,7 +3158,7 @@
         <w:rPr>
           <w:noProof/>
         </w:rPr>
-        <w:instrText xml:space="preserve"> PAGEREF _Toc240288864 \h </w:instrText>
+        <w:instrText xml:space="preserve"> PAGEREF _Toc240290765 \h </w:instrText>
       </w:r>
       <w:r>
         <w:rPr>
@@ -3175,7 +3175,7 @@
         <w:rPr>
           <w:noProof/>
         </w:rPr>
-        <w:t>95</w:t>
+        <w:t>96</w:t>
       </w:r>
       <w:r>
         <w:rPr>
@@ -3234,7 +3234,7 @@
           <w:sz w:val="34"/>
         </w:rPr>
       </w:pPr>
-      <w:bookmarkStart w:id="0" w:name="_Toc240288816"/>
+      <w:bookmarkStart w:id="0" w:name="_Toc240290717"/>
       <w:r>
         <w:rPr>
           <w:rFonts w:ascii="Montserrat" w:hAnsi="Montserrat"/>
@@ -3258,7 +3258,7 @@
           <w:sz w:val="27"/>
         </w:rPr>
       </w:pPr>
-      <w:bookmarkStart w:id="1" w:name="_Toc240288817"/>
+      <w:bookmarkStart w:id="1" w:name="_Toc240290718"/>
       <w:r>
         <w:rPr>
           <w:rFonts w:ascii="Montserrat" w:hAnsi="Montserrat"/>
@@ -4735,6 +4735,24 @@
           <w:color w:val="1A1A1A"/>
           <w:sz w:val="22"/>
         </w:rPr>
+        <w:t>Esta e a versao 2.73 do manual. Em relacao a versao 2.72 (14/09/2026), a trava de conflito da secao 2.14 - Edicao simultanea foi estendida as acoes rapidas de aprovar/reprovar direto da listagem (Gate 1/Gate 2), que antes nao passavam por ela - so o formulario completo de edicao estava protegido. Sem mudanca visivel de fluxo: a acao continua sendo um clique so, mas agora busca o estado mais recente do registro antes de gravar, evitando sobrescrever silenciosamente uma mudanca feita por outra pessoa entre a abertura da ficha e a decisao do gate.</w:t>
+      </w:r>
+    </w:p>
+    <w:p>
+      <w:pPr>
+        <w:spacing w:line="280" w:lineRule="auto"/>
+        <w:rPr>
+          <w:rFonts w:ascii="Montserrat" w:hAnsi="Montserrat"/>
+          <w:color w:val="1A1A1A"/>
+          <w:sz w:val="22"/>
+        </w:rPr>
+      </w:pPr>
+      <w:r>
+        <w:rPr>
+          <w:rFonts w:ascii="Montserrat" w:hAnsi="Montserrat"/>
+          <w:color w:val="1A1A1A"/>
+          <w:sz w:val="22"/>
+        </w:rPr>
         <w:t>O manual nao substitui as Diretrizes para a Gestao de Projetos da UNIALFA (documento institucional que define o framework D01 a D07) nem o documento Regras de Acesso e Permissoes (que detalha cada regra de controle de acesso); ele e o guia operacional de como usar cada ferramenta na pratica.</w:t>
       </w:r>
     </w:p>
@@ -4749,7 +4767,7 @@
           <w:sz w:val="27"/>
         </w:rPr>
       </w:pPr>
-      <w:bookmarkStart w:id="2" w:name="_Toc240288818"/>
+      <w:bookmarkStart w:id="2" w:name="_Toc240290719"/>
       <w:r>
         <w:rPr>
           <w:rFonts w:ascii="Montserrat" w:hAnsi="Montserrat"/>
@@ -4757,6 +4775,7 @@
           <w:color w:val="B91D2E"/>
           <w:sz w:val="27"/>
         </w:rPr>
+        <w:lastRenderedPageBreak/>
         <w:t>1.2 Visao geral da ferramenta</w:t>
       </w:r>
       <w:bookmarkEnd w:id="2"/>
@@ -4824,7 +4843,6 @@
           <w:color w:val="1A1A1A"/>
           <w:sz w:val="22"/>
         </w:rPr>
-        <w:lastRenderedPageBreak/>
         <w:t>1 ferramenta de apoio a decisao, o Validador de Projetos, que nao gera registros de artefato mas ajuda a avaliar projetos.</w:t>
       </w:r>
     </w:p>
@@ -4945,17 +4963,18 @@
         <w:rPr>
           <w:noProof/>
         </w:rPr>
+        <w:lastRenderedPageBreak/>
         <w:drawing>
-          <wp:inline distT="0" distB="0" distL="0" distR="0" wp14:anchorId="79AD9976" wp14:editId="3EC09BB9">
+          <wp:inline distT="0" distB="0" distL="0" distR="0" wp14:anchorId="227A1678" wp14:editId="1AC63825">
             <wp:extent cx="5303520" cy="4792851"/>
             <wp:effectExtent l="19050" t="19050" r="11430" b="27305"/>
-            <wp:docPr id="502590097" name="Imagem 1"/>
+            <wp:docPr id="1363924051" name="Imagem 1"/>
             <wp:cNvGraphicFramePr/>
             <a:graphic xmlns:a="http://schemas.openxmlformats.org/drawingml/2006/main">
               <a:graphicData uri="http://schemas.openxmlformats.org/drawingml/2006/picture">
                 <pic:pic xmlns:pic="http://schemas.openxmlformats.org/drawingml/2006/picture">
                   <pic:nvPicPr>
-                    <pic:cNvPr id="502590097" name=""/>
+                    <pic:cNvPr id="1363924051" name=""/>
                     <pic:cNvPicPr/>
                   </pic:nvPicPr>
                   <pic:blipFill>
@@ -5009,7 +5028,6 @@
           <w:color w:val="6A6A70"/>
           <w:sz w:val="19"/>
         </w:rPr>
-        <w:lastRenderedPageBreak/>
         <w:t>Mapa de diretrizes - pagina inicial. Nao exige login.</w:t>
       </w:r>
     </w:p>
@@ -5024,7 +5042,7 @@
           <w:sz w:val="27"/>
         </w:rPr>
       </w:pPr>
-      <w:bookmarkStart w:id="3" w:name="_Toc240288819"/>
+      <w:bookmarkStart w:id="3" w:name="_Toc240290720"/>
       <w:r>
         <w:rPr>
           <w:rFonts w:ascii="Montserrat" w:hAnsi="Montserrat"/>
@@ -5063,17 +5081,18 @@
         <w:rPr>
           <w:noProof/>
         </w:rPr>
+        <w:lastRenderedPageBreak/>
         <w:drawing>
-          <wp:inline distT="0" distB="0" distL="0" distR="0" wp14:anchorId="4C812B1A" wp14:editId="4157545F">
+          <wp:inline distT="0" distB="0" distL="0" distR="0" wp14:anchorId="1A73B300" wp14:editId="5297E54A">
             <wp:extent cx="4206240" cy="3801227"/>
             <wp:effectExtent l="19050" t="19050" r="22860" b="27940"/>
-            <wp:docPr id="642962925" name="Imagem 2"/>
+            <wp:docPr id="1265254108" name="Imagem 2"/>
             <wp:cNvGraphicFramePr/>
             <a:graphic xmlns:a="http://schemas.openxmlformats.org/drawingml/2006/main">
               <a:graphicData uri="http://schemas.openxmlformats.org/drawingml/2006/picture">
                 <pic:pic xmlns:pic="http://schemas.openxmlformats.org/drawingml/2006/picture">
                   <pic:nvPicPr>
-                    <pic:cNvPr id="642962925" name=""/>
+                    <pic:cNvPr id="1265254108" name=""/>
                     <pic:cNvPicPr/>
                   </pic:nvPicPr>
                   <pic:blipFill>
@@ -5246,7 +5265,7 @@
           <w:sz w:val="27"/>
         </w:rPr>
       </w:pPr>
-      <w:bookmarkStart w:id="4" w:name="_Toc240288820"/>
+      <w:bookmarkStart w:id="4" w:name="_Toc240290721"/>
       <w:r>
         <w:rPr>
           <w:rFonts w:ascii="Montserrat" w:hAnsi="Montserrat"/>
@@ -5254,7 +5273,6 @@
           <w:color w:val="B91D2E"/>
           <w:sz w:val="27"/>
         </w:rPr>
-        <w:lastRenderedPageBreak/>
         <w:t>1.4 Como a ferramenta se relaciona com as Diretrizes (D01-D07)</w:t>
       </w:r>
       <w:bookmarkEnd w:id="4"/>
@@ -5329,6 +5347,7 @@
                 <w:color w:val="FFFFFF"/>
                 <w:sz w:val="19"/>
               </w:rPr>
+              <w:lastRenderedPageBreak/>
               <w:t>Passo</w:t>
             </w:r>
           </w:p>
@@ -6485,7 +6504,7 @@
           <w:sz w:val="34"/>
         </w:rPr>
       </w:pPr>
-      <w:bookmarkStart w:id="5" w:name="_Toc240288821"/>
+      <w:bookmarkStart w:id="5" w:name="_Toc240290722"/>
       <w:r>
         <w:rPr>
           <w:rFonts w:ascii="Montserrat" w:hAnsi="Montserrat"/>
@@ -6509,7 +6528,7 @@
           <w:sz w:val="27"/>
         </w:rPr>
       </w:pPr>
-      <w:bookmarkStart w:id="6" w:name="_Toc240288822"/>
+      <w:bookmarkStart w:id="6" w:name="_Toc240290723"/>
       <w:r>
         <w:rPr>
           <w:rFonts w:ascii="Montserrat" w:hAnsi="Montserrat"/>
@@ -6550,7 +6569,7 @@
           <w:sz w:val="27"/>
         </w:rPr>
       </w:pPr>
-      <w:bookmarkStart w:id="7" w:name="_Toc240288823"/>
+      <w:bookmarkStart w:id="7" w:name="_Toc240290724"/>
       <w:r>
         <w:rPr>
           <w:rFonts w:ascii="Montserrat" w:hAnsi="Montserrat"/>
@@ -6669,7 +6688,7 @@
           <w:sz w:val="27"/>
         </w:rPr>
       </w:pPr>
-      <w:bookmarkStart w:id="8" w:name="_Toc240288824"/>
+      <w:bookmarkStart w:id="8" w:name="_Toc240290725"/>
       <w:r>
         <w:rPr>
           <w:rFonts w:ascii="Montserrat" w:hAnsi="Montserrat"/>
@@ -7282,7 +7301,7 @@
           <w:sz w:val="27"/>
         </w:rPr>
       </w:pPr>
-      <w:bookmarkStart w:id="9" w:name="_Toc240288825"/>
+      <w:bookmarkStart w:id="9" w:name="_Toc240290726"/>
       <w:r>
         <w:rPr>
           <w:rFonts w:ascii="Montserrat" w:hAnsi="Montserrat"/>
@@ -7371,16 +7390,16 @@
         </w:rPr>
         <w:lastRenderedPageBreak/>
         <w:drawing>
-          <wp:inline distT="0" distB="0" distL="0" distR="0" wp14:anchorId="67424487" wp14:editId="363C2EB6">
+          <wp:inline distT="0" distB="0" distL="0" distR="0" wp14:anchorId="5483C530" wp14:editId="24EFCBEC">
             <wp:extent cx="4937760" cy="4462310"/>
             <wp:effectExtent l="19050" t="19050" r="15240" b="14605"/>
-            <wp:docPr id="950880725" name="Imagem 3"/>
+            <wp:docPr id="1620287221" name="Imagem 3"/>
             <wp:cNvGraphicFramePr/>
             <a:graphic xmlns:a="http://schemas.openxmlformats.org/drawingml/2006/main">
               <a:graphicData uri="http://schemas.openxmlformats.org/drawingml/2006/picture">
                 <pic:pic xmlns:pic="http://schemas.openxmlformats.org/drawingml/2006/picture">
                   <pic:nvPicPr>
-                    <pic:cNvPr id="950880725" name=""/>
+                    <pic:cNvPr id="1620287221" name=""/>
                     <pic:cNvPicPr/>
                   </pic:nvPicPr>
                   <pic:blipFill>
@@ -7448,7 +7467,7 @@
           <w:sz w:val="27"/>
         </w:rPr>
       </w:pPr>
-      <w:bookmarkStart w:id="10" w:name="_Toc240288826"/>
+      <w:bookmarkStart w:id="10" w:name="_Toc240290727"/>
       <w:r>
         <w:rPr>
           <w:rFonts w:ascii="Montserrat" w:hAnsi="Montserrat"/>
@@ -7489,16 +7508,16 @@
         </w:rPr>
         <w:lastRenderedPageBreak/>
         <w:drawing>
-          <wp:inline distT="0" distB="0" distL="0" distR="0" wp14:anchorId="03FE6F96" wp14:editId="4F26A099">
+          <wp:inline distT="0" distB="0" distL="0" distR="0" wp14:anchorId="0E2FDBF2" wp14:editId="7F83641C">
             <wp:extent cx="5120640" cy="4627581"/>
             <wp:effectExtent l="19050" t="19050" r="22860" b="20955"/>
-            <wp:docPr id="175302184" name="Imagem 4"/>
+            <wp:docPr id="1145847704" name="Imagem 4"/>
             <wp:cNvGraphicFramePr/>
             <a:graphic xmlns:a="http://schemas.openxmlformats.org/drawingml/2006/main">
               <a:graphicData uri="http://schemas.openxmlformats.org/drawingml/2006/picture">
                 <pic:pic xmlns:pic="http://schemas.openxmlformats.org/drawingml/2006/picture">
                   <pic:nvPicPr>
-                    <pic:cNvPr id="175302184" name=""/>
+                    <pic:cNvPr id="1145847704" name=""/>
                     <pic:cNvPicPr/>
                   </pic:nvPicPr>
                   <pic:blipFill>
@@ -7666,7 +7685,7 @@
           <w:sz w:val="27"/>
         </w:rPr>
       </w:pPr>
-      <w:bookmarkStart w:id="11" w:name="_Toc240288827"/>
+      <w:bookmarkStart w:id="11" w:name="_Toc240290728"/>
       <w:r>
         <w:rPr>
           <w:rFonts w:ascii="Montserrat" w:hAnsi="Montserrat"/>
@@ -7706,16 +7725,16 @@
           <w:noProof/>
         </w:rPr>
         <w:drawing>
-          <wp:inline distT="0" distB="0" distL="0" distR="0" wp14:anchorId="4726261D" wp14:editId="2B38E935">
+          <wp:inline distT="0" distB="0" distL="0" distR="0" wp14:anchorId="7155D897" wp14:editId="0F8A958C">
             <wp:extent cx="4206240" cy="3801227"/>
             <wp:effectExtent l="19050" t="19050" r="22860" b="27940"/>
-            <wp:docPr id="1059253935" name="Imagem 5"/>
+            <wp:docPr id="816243148" name="Imagem 5"/>
             <wp:cNvGraphicFramePr/>
             <a:graphic xmlns:a="http://schemas.openxmlformats.org/drawingml/2006/main">
               <a:graphicData uri="http://schemas.openxmlformats.org/drawingml/2006/picture">
                 <pic:pic xmlns:pic="http://schemas.openxmlformats.org/drawingml/2006/picture">
                   <pic:nvPicPr>
-                    <pic:cNvPr id="1059253935" name=""/>
+                    <pic:cNvPr id="816243148" name=""/>
                     <pic:cNvPicPr/>
                   </pic:nvPicPr>
                   <pic:blipFill>
@@ -7783,16 +7802,16 @@
         </w:rPr>
         <w:lastRenderedPageBreak/>
         <w:drawing>
-          <wp:inline distT="0" distB="0" distL="0" distR="0" wp14:anchorId="5A72581C" wp14:editId="254A3751">
+          <wp:inline distT="0" distB="0" distL="0" distR="0" wp14:anchorId="19828B2D" wp14:editId="146F5E8A">
             <wp:extent cx="4206240" cy="3801227"/>
             <wp:effectExtent l="19050" t="19050" r="22860" b="27940"/>
-            <wp:docPr id="1605607303" name="Imagem 6"/>
+            <wp:docPr id="1987805283" name="Imagem 6"/>
             <wp:cNvGraphicFramePr/>
             <a:graphic xmlns:a="http://schemas.openxmlformats.org/drawingml/2006/main">
               <a:graphicData uri="http://schemas.openxmlformats.org/drawingml/2006/picture">
                 <pic:pic xmlns:pic="http://schemas.openxmlformats.org/drawingml/2006/picture">
                   <pic:nvPicPr>
-                    <pic:cNvPr id="1605607303" name=""/>
+                    <pic:cNvPr id="1987805283" name=""/>
                     <pic:cNvPicPr/>
                   </pic:nvPicPr>
                   <pic:blipFill>
@@ -7908,7 +7927,7 @@
           <w:sz w:val="27"/>
         </w:rPr>
       </w:pPr>
-      <w:bookmarkStart w:id="12" w:name="_Toc240288828"/>
+      <w:bookmarkStart w:id="12" w:name="_Toc240290729"/>
       <w:r>
         <w:rPr>
           <w:rFonts w:ascii="Montserrat" w:hAnsi="Montserrat"/>
@@ -7976,7 +7995,7 @@
           <w:sz w:val="27"/>
         </w:rPr>
       </w:pPr>
-      <w:bookmarkStart w:id="13" w:name="_Toc240288829"/>
+      <w:bookmarkStart w:id="13" w:name="_Toc240290730"/>
       <w:r>
         <w:rPr>
           <w:rFonts w:ascii="Montserrat" w:hAnsi="Montserrat"/>
@@ -8203,7 +8222,7 @@
           <w:sz w:val="27"/>
         </w:rPr>
       </w:pPr>
-      <w:bookmarkStart w:id="14" w:name="_Toc240288830"/>
+      <w:bookmarkStart w:id="14" w:name="_Toc240290731"/>
       <w:r>
         <w:rPr>
           <w:rFonts w:ascii="Montserrat" w:hAnsi="Montserrat"/>
@@ -8266,18 +8285,8 @@
         </w:numPr>
         <w:spacing w:after="80" w:line="260" w:lineRule="auto"/>
         <w:ind w:left="700"/>
-        <w:rPr>
-          <w:rFonts w:ascii="Montserrat" w:hAnsi="Montserrat"/>
-          <w:color w:val="1A1A1A"/>
-          <w:sz w:val="22"/>
-        </w:rPr>
-      </w:pPr>
-      <w:r>
-        <w:rPr>
-          <w:rFonts w:ascii="Montserrat" w:hAnsi="Montserrat"/>
-          <w:color w:val="1A1A1A"/>
-          <w:sz w:val="22"/>
-        </w:rPr>
+      </w:pPr>
+      <w:r>
         <w:t>Ao tocar no botao, o navegador pede permissao para mostrar notificacoes - aceite para concluir a ativacao. O botao muda para Lembretes ativos.</w:t>
       </w:r>
     </w:p>
@@ -8362,7 +8371,7 @@
           <w:sz w:val="27"/>
         </w:rPr>
       </w:pPr>
-      <w:bookmarkStart w:id="15" w:name="_Toc240288831"/>
+      <w:bookmarkStart w:id="15" w:name="_Toc240290732"/>
       <w:r>
         <w:rPr>
           <w:rFonts w:ascii="Montserrat" w:hAnsi="Montserrat"/>
@@ -8554,7 +8563,7 @@
           <w:sz w:val="27"/>
         </w:rPr>
       </w:pPr>
-      <w:bookmarkStart w:id="16" w:name="_Toc240288832"/>
+      <w:bookmarkStart w:id="16" w:name="_Toc240290733"/>
       <w:r>
         <w:rPr>
           <w:rFonts w:ascii="Montserrat" w:hAnsi="Montserrat"/>
@@ -8682,7 +8691,7 @@
           <w:sz w:val="27"/>
         </w:rPr>
       </w:pPr>
-      <w:bookmarkStart w:id="17" w:name="_Toc240288833"/>
+      <w:bookmarkStart w:id="17" w:name="_Toc240290734"/>
       <w:r>
         <w:rPr>
           <w:rFonts w:ascii="Montserrat" w:hAnsi="Montserrat"/>
@@ -9012,7 +9021,7 @@
           <w:sz w:val="27"/>
         </w:rPr>
       </w:pPr>
-      <w:bookmarkStart w:id="18" w:name="_Toc240288834"/>
+      <w:bookmarkStart w:id="18" w:name="_Toc240290735"/>
       <w:r>
         <w:rPr>
           <w:rFonts w:ascii="Montserrat" w:hAnsi="Montserrat"/>
@@ -9149,7 +9158,7 @@
           <w:sz w:val="27"/>
         </w:rPr>
       </w:pPr>
-      <w:bookmarkStart w:id="19" w:name="_Toc240288835"/>
+      <w:bookmarkStart w:id="19" w:name="_Toc240290736"/>
       <w:r>
         <w:rPr>
           <w:rFonts w:ascii="Montserrat" w:hAnsi="Montserrat"/>
@@ -9422,7 +9431,7 @@
           <w:sz w:val="34"/>
         </w:rPr>
       </w:pPr>
-      <w:bookmarkStart w:id="20" w:name="_Toc240288836"/>
+      <w:bookmarkStart w:id="20" w:name="_Toc240290737"/>
       <w:r>
         <w:rPr>
           <w:rFonts w:ascii="Montserrat" w:hAnsi="Montserrat"/>
@@ -9464,7 +9473,7 @@
           <w:sz w:val="27"/>
         </w:rPr>
       </w:pPr>
-      <w:bookmarkStart w:id="21" w:name="_Toc240288837"/>
+      <w:bookmarkStart w:id="21" w:name="_Toc240290738"/>
       <w:r>
         <w:rPr>
           <w:rFonts w:ascii="Montserrat" w:hAnsi="Montserrat"/>
@@ -10544,16 +10553,16 @@
         </w:rPr>
         <w:lastRenderedPageBreak/>
         <w:drawing>
-          <wp:inline distT="0" distB="0" distL="0" distR="0" wp14:anchorId="2BB77E65" wp14:editId="301FAEA7">
+          <wp:inline distT="0" distB="0" distL="0" distR="0" wp14:anchorId="7AFEEF62" wp14:editId="2BC4CE2B">
             <wp:extent cx="5120640" cy="4627581"/>
             <wp:effectExtent l="19050" t="19050" r="22860" b="20955"/>
-            <wp:docPr id="559257073" name="Imagem 7"/>
+            <wp:docPr id="387267179" name="Imagem 7"/>
             <wp:cNvGraphicFramePr/>
             <a:graphic xmlns:a="http://schemas.openxmlformats.org/drawingml/2006/main">
               <a:graphicData uri="http://schemas.openxmlformats.org/drawingml/2006/picture">
                 <pic:pic xmlns:pic="http://schemas.openxmlformats.org/drawingml/2006/picture">
                   <pic:nvPicPr>
-                    <pic:cNvPr id="559257073" name=""/>
+                    <pic:cNvPr id="387267179" name=""/>
                     <pic:cNvPicPr/>
                   </pic:nvPicPr>
                   <pic:blipFill>
@@ -10621,16 +10630,16 @@
         </w:rPr>
         <w:lastRenderedPageBreak/>
         <w:drawing>
-          <wp:inline distT="0" distB="0" distL="0" distR="0" wp14:anchorId="09F5F294" wp14:editId="6D9AFC10">
+          <wp:inline distT="0" distB="0" distL="0" distR="0" wp14:anchorId="7EF5B888" wp14:editId="54D27AD7">
             <wp:extent cx="5120640" cy="4627581"/>
             <wp:effectExtent l="19050" t="19050" r="22860" b="20955"/>
-            <wp:docPr id="524924847" name="Imagem 8"/>
+            <wp:docPr id="1821160606" name="Imagem 8"/>
             <wp:cNvGraphicFramePr/>
             <a:graphic xmlns:a="http://schemas.openxmlformats.org/drawingml/2006/main">
               <a:graphicData uri="http://schemas.openxmlformats.org/drawingml/2006/picture">
                 <pic:pic xmlns:pic="http://schemas.openxmlformats.org/drawingml/2006/picture">
                   <pic:nvPicPr>
-                    <pic:cNvPr id="524924847" name=""/>
+                    <pic:cNvPr id="1821160606" name=""/>
                     <pic:cNvPicPr/>
                   </pic:nvPicPr>
                   <pic:blipFill>
@@ -10838,7 +10847,7 @@
           <w:sz w:val="27"/>
         </w:rPr>
       </w:pPr>
-      <w:bookmarkStart w:id="22" w:name="_Toc240288838"/>
+      <w:bookmarkStart w:id="22" w:name="_Toc240290739"/>
       <w:r>
         <w:rPr>
           <w:rFonts w:ascii="Montserrat" w:hAnsi="Montserrat"/>
@@ -11763,16 +11772,16 @@
           <w:noProof/>
         </w:rPr>
         <w:drawing>
-          <wp:inline distT="0" distB="0" distL="0" distR="0" wp14:anchorId="34AF165B" wp14:editId="5951288D">
+          <wp:inline distT="0" distB="0" distL="0" distR="0" wp14:anchorId="52649907" wp14:editId="547BBF45">
             <wp:extent cx="5120640" cy="4627581"/>
             <wp:effectExtent l="19050" t="19050" r="22860" b="20955"/>
-            <wp:docPr id="1527285328" name="Imagem 9"/>
+            <wp:docPr id="1266403455" name="Imagem 9"/>
             <wp:cNvGraphicFramePr/>
             <a:graphic xmlns:a="http://schemas.openxmlformats.org/drawingml/2006/main">
               <a:graphicData uri="http://schemas.openxmlformats.org/drawingml/2006/picture">
                 <pic:pic xmlns:pic="http://schemas.openxmlformats.org/drawingml/2006/picture">
                   <pic:nvPicPr>
-                    <pic:cNvPr id="1527285328" name=""/>
+                    <pic:cNvPr id="1266403455" name=""/>
                     <pic:cNvPicPr/>
                   </pic:nvPicPr>
                   <pic:blipFill>
@@ -11840,16 +11849,16 @@
         </w:rPr>
         <w:lastRenderedPageBreak/>
         <w:drawing>
-          <wp:inline distT="0" distB="0" distL="0" distR="0" wp14:anchorId="46B7E862" wp14:editId="2E2FEEC4">
+          <wp:inline distT="0" distB="0" distL="0" distR="0" wp14:anchorId="7955D44C" wp14:editId="38726FA1">
             <wp:extent cx="5120640" cy="4627581"/>
             <wp:effectExtent l="19050" t="19050" r="22860" b="20955"/>
-            <wp:docPr id="1525425620" name="Imagem 10"/>
+            <wp:docPr id="1471882839" name="Imagem 10"/>
             <wp:cNvGraphicFramePr/>
             <a:graphic xmlns:a="http://schemas.openxmlformats.org/drawingml/2006/main">
               <a:graphicData uri="http://schemas.openxmlformats.org/drawingml/2006/picture">
                 <pic:pic xmlns:pic="http://schemas.openxmlformats.org/drawingml/2006/picture">
                   <pic:nvPicPr>
-                    <pic:cNvPr id="1525425620" name=""/>
+                    <pic:cNvPr id="1471882839" name=""/>
                     <pic:cNvPicPr/>
                   </pic:nvPicPr>
                   <pic:blipFill>
@@ -11983,7 +11992,7 @@
           <w:sz w:val="27"/>
         </w:rPr>
       </w:pPr>
-      <w:bookmarkStart w:id="23" w:name="_Toc240288839"/>
+      <w:bookmarkStart w:id="23" w:name="_Toc240290740"/>
       <w:r>
         <w:rPr>
           <w:rFonts w:ascii="Montserrat" w:hAnsi="Montserrat"/>
@@ -13049,16 +13058,16 @@
           <w:noProof/>
         </w:rPr>
         <w:drawing>
-          <wp:inline distT="0" distB="0" distL="0" distR="0" wp14:anchorId="4C990E74" wp14:editId="7765984E">
+          <wp:inline distT="0" distB="0" distL="0" distR="0" wp14:anchorId="169D5D34" wp14:editId="06ECD589">
             <wp:extent cx="5120640" cy="3338440"/>
             <wp:effectExtent l="19050" t="19050" r="22860" b="14605"/>
-            <wp:docPr id="2120631648" name="Imagem 11"/>
+            <wp:docPr id="706220812" name="Imagem 11"/>
             <wp:cNvGraphicFramePr/>
             <a:graphic xmlns:a="http://schemas.openxmlformats.org/drawingml/2006/main">
               <a:graphicData uri="http://schemas.openxmlformats.org/drawingml/2006/picture">
                 <pic:pic xmlns:pic="http://schemas.openxmlformats.org/drawingml/2006/picture">
                   <pic:nvPicPr>
-                    <pic:cNvPr id="2120631648" name=""/>
+                    <pic:cNvPr id="706220812" name=""/>
                     <pic:cNvPicPr/>
                   </pic:nvPicPr>
                   <pic:blipFill>
@@ -13126,16 +13135,16 @@
         </w:rPr>
         <w:lastRenderedPageBreak/>
         <w:drawing>
-          <wp:inline distT="0" distB="0" distL="0" distR="0" wp14:anchorId="2FD3C690" wp14:editId="7260E6C5">
+          <wp:inline distT="0" distB="0" distL="0" distR="0" wp14:anchorId="5D505BE0" wp14:editId="30A93D7B">
             <wp:extent cx="5120640" cy="4627581"/>
             <wp:effectExtent l="19050" t="19050" r="22860" b="20955"/>
-            <wp:docPr id="1962071656" name="Imagem 12"/>
+            <wp:docPr id="1733857051" name="Imagem 12"/>
             <wp:cNvGraphicFramePr/>
             <a:graphic xmlns:a="http://schemas.openxmlformats.org/drawingml/2006/main">
               <a:graphicData uri="http://schemas.openxmlformats.org/drawingml/2006/picture">
                 <pic:pic xmlns:pic="http://schemas.openxmlformats.org/drawingml/2006/picture">
                   <pic:nvPicPr>
-                    <pic:cNvPr id="1962071656" name=""/>
+                    <pic:cNvPr id="1733857051" name=""/>
                     <pic:cNvPicPr/>
                   </pic:nvPicPr>
                   <pic:blipFill>
@@ -13339,7 +13348,7 @@
           <w:sz w:val="27"/>
         </w:rPr>
       </w:pPr>
-      <w:bookmarkStart w:id="24" w:name="_Toc240288840"/>
+      <w:bookmarkStart w:id="24" w:name="_Toc240290741"/>
       <w:r>
         <w:rPr>
           <w:rFonts w:ascii="Montserrat" w:hAnsi="Montserrat"/>
@@ -13900,16 +13909,16 @@
           <w:noProof/>
         </w:rPr>
         <w:drawing>
-          <wp:inline distT="0" distB="0" distL="0" distR="0" wp14:anchorId="761A06D3" wp14:editId="594489F3">
+          <wp:inline distT="0" distB="0" distL="0" distR="0" wp14:anchorId="0E6DB085" wp14:editId="48B5078B">
             <wp:extent cx="5120640" cy="4627581"/>
             <wp:effectExtent l="19050" t="19050" r="22860" b="20955"/>
-            <wp:docPr id="1127119310" name="Imagem 13"/>
+            <wp:docPr id="628591537" name="Imagem 13"/>
             <wp:cNvGraphicFramePr/>
             <a:graphic xmlns:a="http://schemas.openxmlformats.org/drawingml/2006/main">
               <a:graphicData uri="http://schemas.openxmlformats.org/drawingml/2006/picture">
                 <pic:pic xmlns:pic="http://schemas.openxmlformats.org/drawingml/2006/picture">
                   <pic:nvPicPr>
-                    <pic:cNvPr id="1127119310" name=""/>
+                    <pic:cNvPr id="628591537" name=""/>
                     <pic:cNvPicPr/>
                   </pic:nvPicPr>
                   <pic:blipFill>
@@ -13977,16 +13986,16 @@
         </w:rPr>
         <w:lastRenderedPageBreak/>
         <w:drawing>
-          <wp:inline distT="0" distB="0" distL="0" distR="0" wp14:anchorId="2869B01C" wp14:editId="63FDEAC4">
+          <wp:inline distT="0" distB="0" distL="0" distR="0" wp14:anchorId="69A4454D" wp14:editId="4A22CBA9">
             <wp:extent cx="5120640" cy="4627581"/>
             <wp:effectExtent l="19050" t="19050" r="22860" b="20955"/>
-            <wp:docPr id="2089020919" name="Imagem 14"/>
+            <wp:docPr id="1166489806" name="Imagem 14"/>
             <wp:cNvGraphicFramePr/>
             <a:graphic xmlns:a="http://schemas.openxmlformats.org/drawingml/2006/main">
               <a:graphicData uri="http://schemas.openxmlformats.org/drawingml/2006/picture">
                 <pic:pic xmlns:pic="http://schemas.openxmlformats.org/drawingml/2006/picture">
                   <pic:nvPicPr>
-                    <pic:cNvPr id="2089020919" name=""/>
+                    <pic:cNvPr id="1166489806" name=""/>
                     <pic:cNvPicPr/>
                   </pic:nvPicPr>
                   <pic:blipFill>
@@ -14238,7 +14247,7 @@
           <w:sz w:val="27"/>
         </w:rPr>
       </w:pPr>
-      <w:bookmarkStart w:id="25" w:name="_Toc240288841"/>
+      <w:bookmarkStart w:id="25" w:name="_Toc240290742"/>
       <w:r>
         <w:rPr>
           <w:rFonts w:ascii="Montserrat" w:hAnsi="Montserrat"/>
@@ -14278,16 +14287,16 @@
           <w:noProof/>
         </w:rPr>
         <w:drawing>
-          <wp:inline distT="0" distB="0" distL="0" distR="0" wp14:anchorId="1D538EA5" wp14:editId="4E309021">
+          <wp:inline distT="0" distB="0" distL="0" distR="0" wp14:anchorId="57F21272" wp14:editId="6AB269E5">
             <wp:extent cx="5120640" cy="4627581"/>
             <wp:effectExtent l="19050" t="19050" r="22860" b="20955"/>
-            <wp:docPr id="2027894118" name="Imagem 15"/>
+            <wp:docPr id="1297353010" name="Imagem 15"/>
             <wp:cNvGraphicFramePr/>
             <a:graphic xmlns:a="http://schemas.openxmlformats.org/drawingml/2006/main">
               <a:graphicData uri="http://schemas.openxmlformats.org/drawingml/2006/picture">
                 <pic:pic xmlns:pic="http://schemas.openxmlformats.org/drawingml/2006/picture">
                   <pic:nvPicPr>
-                    <pic:cNvPr id="2027894118" name=""/>
+                    <pic:cNvPr id="1297353010" name=""/>
                     <pic:cNvPicPr/>
                   </pic:nvPicPr>
                   <pic:blipFill>
@@ -14355,16 +14364,16 @@
         </w:rPr>
         <w:lastRenderedPageBreak/>
         <w:drawing>
-          <wp:inline distT="0" distB="0" distL="0" distR="0" wp14:anchorId="7B1DF6B9" wp14:editId="083A1590">
+          <wp:inline distT="0" distB="0" distL="0" distR="0" wp14:anchorId="663B7871" wp14:editId="121A476A">
             <wp:extent cx="5120640" cy="4627581"/>
             <wp:effectExtent l="19050" t="19050" r="22860" b="20955"/>
-            <wp:docPr id="780808792" name="Imagem 16"/>
+            <wp:docPr id="265506061" name="Imagem 16"/>
             <wp:cNvGraphicFramePr/>
             <a:graphic xmlns:a="http://schemas.openxmlformats.org/drawingml/2006/main">
               <a:graphicData uri="http://schemas.openxmlformats.org/drawingml/2006/picture">
                 <pic:pic xmlns:pic="http://schemas.openxmlformats.org/drawingml/2006/picture">
                   <pic:nvPicPr>
-                    <pic:cNvPr id="780808792" name=""/>
+                    <pic:cNvPr id="265506061" name=""/>
                     <pic:cNvPicPr/>
                   </pic:nvPicPr>
                   <pic:blipFill>
@@ -14528,16 +14537,16 @@
         </w:rPr>
         <w:lastRenderedPageBreak/>
         <w:drawing>
-          <wp:inline distT="0" distB="0" distL="0" distR="0" wp14:anchorId="114D9481" wp14:editId="2CCD54D6">
+          <wp:inline distT="0" distB="0" distL="0" distR="0" wp14:anchorId="013A5BF5" wp14:editId="7AF97B48">
             <wp:extent cx="5120640" cy="3282818"/>
             <wp:effectExtent l="19050" t="19050" r="22860" b="13335"/>
-            <wp:docPr id="187875802" name="Imagem 17"/>
+            <wp:docPr id="1952987630" name="Imagem 17"/>
             <wp:cNvGraphicFramePr/>
             <a:graphic xmlns:a="http://schemas.openxmlformats.org/drawingml/2006/main">
               <a:graphicData uri="http://schemas.openxmlformats.org/drawingml/2006/picture">
                 <pic:pic xmlns:pic="http://schemas.openxmlformats.org/drawingml/2006/picture">
                   <pic:nvPicPr>
-                    <pic:cNvPr id="187875802" name=""/>
+                    <pic:cNvPr id="1952987630" name=""/>
                     <pic:cNvPicPr/>
                   </pic:nvPicPr>
                   <pic:blipFill>
@@ -14728,7 +14737,7 @@
           <w:sz w:val="27"/>
         </w:rPr>
       </w:pPr>
-      <w:bookmarkStart w:id="26" w:name="_Toc240288842"/>
+      <w:bookmarkStart w:id="26" w:name="_Toc240290743"/>
       <w:r>
         <w:rPr>
           <w:rFonts w:ascii="Montserrat" w:hAnsi="Montserrat"/>
@@ -14768,16 +14777,16 @@
           <w:noProof/>
         </w:rPr>
         <w:drawing>
-          <wp:inline distT="0" distB="0" distL="0" distR="0" wp14:anchorId="361D8413" wp14:editId="46FB990F">
+          <wp:inline distT="0" distB="0" distL="0" distR="0" wp14:anchorId="538DFEC2" wp14:editId="4A4D4A02">
             <wp:extent cx="5120640" cy="4627581"/>
             <wp:effectExtent l="19050" t="19050" r="22860" b="20955"/>
-            <wp:docPr id="700835178" name="Imagem 18"/>
+            <wp:docPr id="2044409713" name="Imagem 18"/>
             <wp:cNvGraphicFramePr/>
             <a:graphic xmlns:a="http://schemas.openxmlformats.org/drawingml/2006/main">
               <a:graphicData uri="http://schemas.openxmlformats.org/drawingml/2006/picture">
                 <pic:pic xmlns:pic="http://schemas.openxmlformats.org/drawingml/2006/picture">
                   <pic:nvPicPr>
-                    <pic:cNvPr id="700835178" name=""/>
+                    <pic:cNvPr id="2044409713" name=""/>
                     <pic:cNvPicPr/>
                   </pic:nvPicPr>
                   <pic:blipFill>
@@ -14845,16 +14854,16 @@
         </w:rPr>
         <w:lastRenderedPageBreak/>
         <w:drawing>
-          <wp:inline distT="0" distB="0" distL="0" distR="0" wp14:anchorId="5077D951" wp14:editId="710A8287">
+          <wp:inline distT="0" distB="0" distL="0" distR="0" wp14:anchorId="44E8414A" wp14:editId="33A69F37">
             <wp:extent cx="5120640" cy="4627581"/>
             <wp:effectExtent l="19050" t="19050" r="22860" b="20955"/>
-            <wp:docPr id="1576126529" name="Imagem 19"/>
+            <wp:docPr id="2003574301" name="Imagem 19"/>
             <wp:cNvGraphicFramePr/>
             <a:graphic xmlns:a="http://schemas.openxmlformats.org/drawingml/2006/main">
               <a:graphicData uri="http://schemas.openxmlformats.org/drawingml/2006/picture">
                 <pic:pic xmlns:pic="http://schemas.openxmlformats.org/drawingml/2006/picture">
                   <pic:nvPicPr>
-                    <pic:cNvPr id="1576126529" name=""/>
+                    <pic:cNvPr id="2003574301" name=""/>
                     <pic:cNvPicPr/>
                   </pic:nvPicPr>
                   <pic:blipFill>
@@ -15037,7 +15046,7 @@
           <w:sz w:val="27"/>
         </w:rPr>
       </w:pPr>
-      <w:bookmarkStart w:id="27" w:name="_Toc240288843"/>
+      <w:bookmarkStart w:id="27" w:name="_Toc240290744"/>
       <w:r>
         <w:rPr>
           <w:rFonts w:ascii="Montserrat" w:hAnsi="Montserrat"/>
@@ -15077,16 +15086,16 @@
           <w:noProof/>
         </w:rPr>
         <w:drawing>
-          <wp:inline distT="0" distB="0" distL="0" distR="0" wp14:anchorId="27DB2FA8" wp14:editId="26561508">
+          <wp:inline distT="0" distB="0" distL="0" distR="0" wp14:anchorId="550A30EA" wp14:editId="3995642F">
             <wp:extent cx="5120640" cy="4627581"/>
             <wp:effectExtent l="19050" t="19050" r="22860" b="20955"/>
-            <wp:docPr id="1356397207" name="Imagem 20"/>
+            <wp:docPr id="496397910" name="Imagem 20"/>
             <wp:cNvGraphicFramePr/>
             <a:graphic xmlns:a="http://schemas.openxmlformats.org/drawingml/2006/main">
               <a:graphicData uri="http://schemas.openxmlformats.org/drawingml/2006/picture">
                 <pic:pic xmlns:pic="http://schemas.openxmlformats.org/drawingml/2006/picture">
                   <pic:nvPicPr>
-                    <pic:cNvPr id="1356397207" name=""/>
+                    <pic:cNvPr id="496397910" name=""/>
                     <pic:cNvPicPr/>
                   </pic:nvPicPr>
                   <pic:blipFill>
@@ -15154,16 +15163,16 @@
         </w:rPr>
         <w:lastRenderedPageBreak/>
         <w:drawing>
-          <wp:inline distT="0" distB="0" distL="0" distR="0" wp14:anchorId="26D8FEFB" wp14:editId="0A8F0DBC">
+          <wp:inline distT="0" distB="0" distL="0" distR="0" wp14:anchorId="5358034B" wp14:editId="62F4FBA7">
             <wp:extent cx="5120640" cy="4627581"/>
             <wp:effectExtent l="19050" t="19050" r="22860" b="20955"/>
-            <wp:docPr id="1937785312" name="Imagem 21"/>
+            <wp:docPr id="2042718772" name="Imagem 21"/>
             <wp:cNvGraphicFramePr/>
             <a:graphic xmlns:a="http://schemas.openxmlformats.org/drawingml/2006/main">
               <a:graphicData uri="http://schemas.openxmlformats.org/drawingml/2006/picture">
                 <pic:pic xmlns:pic="http://schemas.openxmlformats.org/drawingml/2006/picture">
                   <pic:nvPicPr>
-                    <pic:cNvPr id="1937785312" name=""/>
+                    <pic:cNvPr id="2042718772" name=""/>
                     <pic:cNvPicPr/>
                   </pic:nvPicPr>
                   <pic:blipFill>
@@ -15369,16 +15378,16 @@
           <w:noProof/>
         </w:rPr>
         <w:drawing>
-          <wp:inline distT="0" distB="0" distL="0" distR="0" wp14:anchorId="421D87C9" wp14:editId="39FE33D8">
+          <wp:inline distT="0" distB="0" distL="0" distR="0" wp14:anchorId="1967B479" wp14:editId="7FD43EC3">
             <wp:extent cx="5120640" cy="1757287"/>
             <wp:effectExtent l="19050" t="19050" r="22860" b="14605"/>
-            <wp:docPr id="1525892999" name="Imagem 22"/>
+            <wp:docPr id="640957096" name="Imagem 22"/>
             <wp:cNvGraphicFramePr/>
             <a:graphic xmlns:a="http://schemas.openxmlformats.org/drawingml/2006/main">
               <a:graphicData uri="http://schemas.openxmlformats.org/drawingml/2006/picture">
                 <pic:pic xmlns:pic="http://schemas.openxmlformats.org/drawingml/2006/picture">
                   <pic:nvPicPr>
-                    <pic:cNvPr id="1525892999" name=""/>
+                    <pic:cNvPr id="640957096" name=""/>
                     <pic:cNvPicPr/>
                   </pic:nvPicPr>
                   <pic:blipFill>
@@ -15491,7 +15500,7 @@
           <w:sz w:val="27"/>
         </w:rPr>
       </w:pPr>
-      <w:bookmarkStart w:id="28" w:name="_Toc240288844"/>
+      <w:bookmarkStart w:id="28" w:name="_Toc240290745"/>
       <w:r>
         <w:rPr>
           <w:rFonts w:ascii="Montserrat" w:hAnsi="Montserrat"/>
@@ -15532,16 +15541,16 @@
         </w:rPr>
         <w:lastRenderedPageBreak/>
         <w:drawing>
-          <wp:inline distT="0" distB="0" distL="0" distR="0" wp14:anchorId="68D06BB4" wp14:editId="3D2D22F5">
+          <wp:inline distT="0" distB="0" distL="0" distR="0" wp14:anchorId="13B33F2F" wp14:editId="1448A0EF">
             <wp:extent cx="5120640" cy="4627581"/>
             <wp:effectExtent l="19050" t="19050" r="22860" b="20955"/>
-            <wp:docPr id="362142147" name="Imagem 23"/>
+            <wp:docPr id="1303957033" name="Imagem 23"/>
             <wp:cNvGraphicFramePr/>
             <a:graphic xmlns:a="http://schemas.openxmlformats.org/drawingml/2006/main">
               <a:graphicData uri="http://schemas.openxmlformats.org/drawingml/2006/picture">
                 <pic:pic xmlns:pic="http://schemas.openxmlformats.org/drawingml/2006/picture">
                   <pic:nvPicPr>
-                    <pic:cNvPr id="362142147" name=""/>
+                    <pic:cNvPr id="1303957033" name=""/>
                     <pic:cNvPicPr/>
                   </pic:nvPicPr>
                   <pic:blipFill>
@@ -15609,16 +15618,16 @@
         </w:rPr>
         <w:lastRenderedPageBreak/>
         <w:drawing>
-          <wp:inline distT="0" distB="0" distL="0" distR="0" wp14:anchorId="4E29BCD2" wp14:editId="6C99519B">
+          <wp:inline distT="0" distB="0" distL="0" distR="0" wp14:anchorId="2D2F4FA5" wp14:editId="52F93447">
             <wp:extent cx="5120640" cy="4627581"/>
             <wp:effectExtent l="19050" t="19050" r="22860" b="20955"/>
-            <wp:docPr id="1970465561" name="Imagem 24"/>
+            <wp:docPr id="1236773587" name="Imagem 24"/>
             <wp:cNvGraphicFramePr/>
             <a:graphic xmlns:a="http://schemas.openxmlformats.org/drawingml/2006/main">
               <a:graphicData uri="http://schemas.openxmlformats.org/drawingml/2006/picture">
                 <pic:pic xmlns:pic="http://schemas.openxmlformats.org/drawingml/2006/picture">
                   <pic:nvPicPr>
-                    <pic:cNvPr id="1970465561" name=""/>
+                    <pic:cNvPr id="1236773587" name=""/>
                     <pic:cNvPicPr/>
                   </pic:nvPicPr>
                   <pic:blipFill>
@@ -15855,7 +15864,7 @@
           <w:sz w:val="27"/>
         </w:rPr>
       </w:pPr>
-      <w:bookmarkStart w:id="29" w:name="_Toc240288845"/>
+      <w:bookmarkStart w:id="29" w:name="_Toc240290746"/>
       <w:r>
         <w:rPr>
           <w:rFonts w:ascii="Montserrat" w:hAnsi="Montserrat"/>
@@ -15895,16 +15904,16 @@
           <w:noProof/>
         </w:rPr>
         <w:drawing>
-          <wp:inline distT="0" distB="0" distL="0" distR="0" wp14:anchorId="18D7AD48" wp14:editId="63EB43F8">
+          <wp:inline distT="0" distB="0" distL="0" distR="0" wp14:anchorId="4A09C9D8" wp14:editId="783D6D72">
             <wp:extent cx="5120640" cy="4627581"/>
             <wp:effectExtent l="19050" t="19050" r="22860" b="20955"/>
-            <wp:docPr id="696374928" name="Imagem 25"/>
+            <wp:docPr id="1643107189" name="Imagem 25"/>
             <wp:cNvGraphicFramePr/>
             <a:graphic xmlns:a="http://schemas.openxmlformats.org/drawingml/2006/main">
               <a:graphicData uri="http://schemas.openxmlformats.org/drawingml/2006/picture">
                 <pic:pic xmlns:pic="http://schemas.openxmlformats.org/drawingml/2006/picture">
                   <pic:nvPicPr>
-                    <pic:cNvPr id="696374928" name=""/>
+                    <pic:cNvPr id="1643107189" name=""/>
                     <pic:cNvPicPr/>
                   </pic:nvPicPr>
                   <pic:blipFill>
@@ -15972,16 +15981,16 @@
         </w:rPr>
         <w:lastRenderedPageBreak/>
         <w:drawing>
-          <wp:inline distT="0" distB="0" distL="0" distR="0" wp14:anchorId="333F471A" wp14:editId="1F1C15DE">
+          <wp:inline distT="0" distB="0" distL="0" distR="0" wp14:anchorId="07EB59E7" wp14:editId="6F4A3E4A">
             <wp:extent cx="5120640" cy="4627581"/>
             <wp:effectExtent l="19050" t="19050" r="22860" b="20955"/>
-            <wp:docPr id="568779535" name="Imagem 26"/>
+            <wp:docPr id="1220622185" name="Imagem 26"/>
             <wp:cNvGraphicFramePr/>
             <a:graphic xmlns:a="http://schemas.openxmlformats.org/drawingml/2006/main">
               <a:graphicData uri="http://schemas.openxmlformats.org/drawingml/2006/picture">
                 <pic:pic xmlns:pic="http://schemas.openxmlformats.org/drawingml/2006/picture">
                   <pic:nvPicPr>
-                    <pic:cNvPr id="568779535" name=""/>
+                    <pic:cNvPr id="1220622185" name=""/>
                     <pic:cNvPicPr/>
                   </pic:nvPicPr>
                   <pic:blipFill>
@@ -16172,7 +16181,7 @@
           <w:sz w:val="27"/>
         </w:rPr>
       </w:pPr>
-      <w:bookmarkStart w:id="30" w:name="_Toc240288846"/>
+      <w:bookmarkStart w:id="30" w:name="_Toc240290747"/>
       <w:r>
         <w:rPr>
           <w:rFonts w:ascii="Montserrat" w:hAnsi="Montserrat"/>
@@ -16212,16 +16221,16 @@
           <w:noProof/>
         </w:rPr>
         <w:drawing>
-          <wp:inline distT="0" distB="0" distL="0" distR="0" wp14:anchorId="6F48EC5D" wp14:editId="599431E0">
+          <wp:inline distT="0" distB="0" distL="0" distR="0" wp14:anchorId="6359AD0F" wp14:editId="70735ACD">
             <wp:extent cx="5120640" cy="4000682"/>
             <wp:effectExtent l="19050" t="19050" r="22860" b="19050"/>
-            <wp:docPr id="685525546" name="Imagem 27"/>
+            <wp:docPr id="1588192575" name="Imagem 27"/>
             <wp:cNvGraphicFramePr/>
             <a:graphic xmlns:a="http://schemas.openxmlformats.org/drawingml/2006/main">
               <a:graphicData uri="http://schemas.openxmlformats.org/drawingml/2006/picture">
                 <pic:pic xmlns:pic="http://schemas.openxmlformats.org/drawingml/2006/picture">
                   <pic:nvPicPr>
-                    <pic:cNvPr id="685525546" name=""/>
+                    <pic:cNvPr id="1588192575" name=""/>
                     <pic:cNvPicPr/>
                   </pic:nvPicPr>
                   <pic:blipFill>
@@ -16745,7 +16754,7 @@
           <w:sz w:val="34"/>
         </w:rPr>
       </w:pPr>
-      <w:bookmarkStart w:id="31" w:name="_Toc240288847"/>
+      <w:bookmarkStart w:id="31" w:name="_Toc240290748"/>
       <w:r>
         <w:rPr>
           <w:rFonts w:ascii="Montserrat" w:hAnsi="Montserrat"/>
@@ -16787,7 +16796,7 @@
           <w:sz w:val="27"/>
         </w:rPr>
       </w:pPr>
-      <w:bookmarkStart w:id="32" w:name="_Toc240288848"/>
+      <w:bookmarkStart w:id="32" w:name="_Toc240290749"/>
       <w:r>
         <w:rPr>
           <w:rFonts w:ascii="Montserrat" w:hAnsi="Montserrat"/>
@@ -16827,16 +16836,16 @@
           <w:noProof/>
         </w:rPr>
         <w:drawing>
-          <wp:inline distT="0" distB="0" distL="0" distR="0" wp14:anchorId="19507DCC" wp14:editId="04AD7172">
+          <wp:inline distT="0" distB="0" distL="0" distR="0" wp14:anchorId="0A4D920D" wp14:editId="264A6BDD">
             <wp:extent cx="5120640" cy="4627581"/>
             <wp:effectExtent l="19050" t="19050" r="22860" b="20955"/>
-            <wp:docPr id="1024547771" name="Imagem 28"/>
+            <wp:docPr id="997092329" name="Imagem 28"/>
             <wp:cNvGraphicFramePr/>
             <a:graphic xmlns:a="http://schemas.openxmlformats.org/drawingml/2006/main">
               <a:graphicData uri="http://schemas.openxmlformats.org/drawingml/2006/picture">
                 <pic:pic xmlns:pic="http://schemas.openxmlformats.org/drawingml/2006/picture">
                   <pic:nvPicPr>
-                    <pic:cNvPr id="1024547771" name=""/>
+                    <pic:cNvPr id="997092329" name=""/>
                     <pic:cNvPicPr/>
                   </pic:nvPicPr>
                   <pic:blipFill>
@@ -16904,16 +16913,16 @@
         </w:rPr>
         <w:lastRenderedPageBreak/>
         <w:drawing>
-          <wp:inline distT="0" distB="0" distL="0" distR="0" wp14:anchorId="491AAEF3" wp14:editId="3424DB53">
+          <wp:inline distT="0" distB="0" distL="0" distR="0" wp14:anchorId="410D6F54" wp14:editId="74E60972">
             <wp:extent cx="5120640" cy="4627581"/>
             <wp:effectExtent l="19050" t="19050" r="22860" b="20955"/>
-            <wp:docPr id="1820826008" name="Imagem 29"/>
+            <wp:docPr id="741084186" name="Imagem 29"/>
             <wp:cNvGraphicFramePr/>
             <a:graphic xmlns:a="http://schemas.openxmlformats.org/drawingml/2006/main">
               <a:graphicData uri="http://schemas.openxmlformats.org/drawingml/2006/picture">
                 <pic:pic xmlns:pic="http://schemas.openxmlformats.org/drawingml/2006/picture">
                   <pic:nvPicPr>
-                    <pic:cNvPr id="1820826008" name=""/>
+                    <pic:cNvPr id="741084186" name=""/>
                     <pic:cNvPicPr/>
                   </pic:nvPicPr>
                   <pic:blipFill>
@@ -16981,16 +16990,16 @@
         </w:rPr>
         <w:lastRenderedPageBreak/>
         <w:drawing>
-          <wp:inline distT="0" distB="0" distL="0" distR="0" wp14:anchorId="0F4BAA66" wp14:editId="7C254986">
+          <wp:inline distT="0" distB="0" distL="0" distR="0" wp14:anchorId="7B093036" wp14:editId="21704F8C">
             <wp:extent cx="5120640" cy="4627581"/>
             <wp:effectExtent l="19050" t="19050" r="22860" b="20955"/>
-            <wp:docPr id="1711019407" name="Imagem 30"/>
+            <wp:docPr id="1656497393" name="Imagem 30"/>
             <wp:cNvGraphicFramePr/>
             <a:graphic xmlns:a="http://schemas.openxmlformats.org/drawingml/2006/main">
               <a:graphicData uri="http://schemas.openxmlformats.org/drawingml/2006/picture">
                 <pic:pic xmlns:pic="http://schemas.openxmlformats.org/drawingml/2006/picture">
                   <pic:nvPicPr>
-                    <pic:cNvPr id="1711019407" name=""/>
+                    <pic:cNvPr id="1656497393" name=""/>
                     <pic:cNvPicPr/>
                   </pic:nvPicPr>
                   <pic:blipFill>
@@ -17192,16 +17201,16 @@
           <w:noProof/>
         </w:rPr>
         <w:drawing>
-          <wp:inline distT="0" distB="0" distL="0" distR="0" wp14:anchorId="21719EB9" wp14:editId="646E2F12">
+          <wp:inline distT="0" distB="0" distL="0" distR="0" wp14:anchorId="7713759A" wp14:editId="127841D6">
             <wp:extent cx="5120640" cy="1715571"/>
             <wp:effectExtent l="19050" t="19050" r="22860" b="18415"/>
-            <wp:docPr id="699957874" name="Imagem 31"/>
+            <wp:docPr id="875207544" name="Imagem 31"/>
             <wp:cNvGraphicFramePr/>
             <a:graphic xmlns:a="http://schemas.openxmlformats.org/drawingml/2006/main">
               <a:graphicData uri="http://schemas.openxmlformats.org/drawingml/2006/picture">
                 <pic:pic xmlns:pic="http://schemas.openxmlformats.org/drawingml/2006/picture">
                   <pic:nvPicPr>
-                    <pic:cNvPr id="699957874" name=""/>
+                    <pic:cNvPr id="875207544" name=""/>
                     <pic:cNvPicPr/>
                   </pic:nvPicPr>
                   <pic:blipFill>
@@ -17338,16 +17347,16 @@
           <w:noProof/>
         </w:rPr>
         <w:drawing>
-          <wp:inline distT="0" distB="0" distL="0" distR="0" wp14:anchorId="1CC2FA72" wp14:editId="21E8B38B">
+          <wp:inline distT="0" distB="0" distL="0" distR="0" wp14:anchorId="597C328A" wp14:editId="7EB114C6">
             <wp:extent cx="5120640" cy="3282818"/>
             <wp:effectExtent l="19050" t="19050" r="22860" b="13335"/>
-            <wp:docPr id="1776384242" name="Imagem 32"/>
+            <wp:docPr id="188267416" name="Imagem 32"/>
             <wp:cNvGraphicFramePr/>
             <a:graphic xmlns:a="http://schemas.openxmlformats.org/drawingml/2006/main">
               <a:graphicData uri="http://schemas.openxmlformats.org/drawingml/2006/picture">
                 <pic:pic xmlns:pic="http://schemas.openxmlformats.org/drawingml/2006/picture">
                   <pic:nvPicPr>
-                    <pic:cNvPr id="1776384242" name=""/>
+                    <pic:cNvPr id="188267416" name=""/>
                     <pic:cNvPicPr/>
                   </pic:nvPicPr>
                   <pic:blipFill>
@@ -17481,16 +17490,16 @@
           <w:noProof/>
         </w:rPr>
         <w:drawing>
-          <wp:inline distT="0" distB="0" distL="0" distR="0" wp14:anchorId="1225DCD4" wp14:editId="3E4902F6">
+          <wp:inline distT="0" distB="0" distL="0" distR="0" wp14:anchorId="78B5568B" wp14:editId="5DF3BF41">
             <wp:extent cx="5120640" cy="951357"/>
             <wp:effectExtent l="19050" t="19050" r="22860" b="20320"/>
-            <wp:docPr id="1623401111" name="Imagem 33"/>
+            <wp:docPr id="51366354" name="Imagem 33"/>
             <wp:cNvGraphicFramePr/>
             <a:graphic xmlns:a="http://schemas.openxmlformats.org/drawingml/2006/main">
               <a:graphicData uri="http://schemas.openxmlformats.org/drawingml/2006/picture">
                 <pic:pic xmlns:pic="http://schemas.openxmlformats.org/drawingml/2006/picture">
                   <pic:nvPicPr>
-                    <pic:cNvPr id="1623401111" name=""/>
+                    <pic:cNvPr id="51366354" name=""/>
                     <pic:cNvPicPr/>
                   </pic:nvPicPr>
                   <pic:blipFill>
@@ -17602,16 +17611,16 @@
           <w:noProof/>
         </w:rPr>
         <w:drawing>
-          <wp:inline distT="0" distB="0" distL="0" distR="0" wp14:anchorId="32E9E3D2" wp14:editId="01902857">
+          <wp:inline distT="0" distB="0" distL="0" distR="0" wp14:anchorId="23467582" wp14:editId="466E6D61">
             <wp:extent cx="5120640" cy="1515102"/>
             <wp:effectExtent l="19050" t="19050" r="22860" b="28575"/>
-            <wp:docPr id="1030429549" name="Imagem 34"/>
+            <wp:docPr id="2141525389" name="Imagem 34"/>
             <wp:cNvGraphicFramePr/>
             <a:graphic xmlns:a="http://schemas.openxmlformats.org/drawingml/2006/main">
               <a:graphicData uri="http://schemas.openxmlformats.org/drawingml/2006/picture">
                 <pic:pic xmlns:pic="http://schemas.openxmlformats.org/drawingml/2006/picture">
                   <pic:nvPicPr>
-                    <pic:cNvPr id="1030429549" name=""/>
+                    <pic:cNvPr id="2141525389" name=""/>
                     <pic:cNvPicPr/>
                   </pic:nvPicPr>
                   <pic:blipFill>
@@ -17724,16 +17733,16 @@
           <w:noProof/>
         </w:rPr>
         <w:drawing>
-          <wp:inline distT="0" distB="0" distL="0" distR="0" wp14:anchorId="2E72EFA0" wp14:editId="6FD742FF">
+          <wp:inline distT="0" distB="0" distL="0" distR="0" wp14:anchorId="77FD9E0F" wp14:editId="3954687D">
             <wp:extent cx="5120640" cy="1391113"/>
             <wp:effectExtent l="19050" t="19050" r="22860" b="19050"/>
-            <wp:docPr id="432137156" name="Imagem 35"/>
+            <wp:docPr id="933106545" name="Imagem 35"/>
             <wp:cNvGraphicFramePr/>
             <a:graphic xmlns:a="http://schemas.openxmlformats.org/drawingml/2006/main">
               <a:graphicData uri="http://schemas.openxmlformats.org/drawingml/2006/picture">
                 <pic:pic xmlns:pic="http://schemas.openxmlformats.org/drawingml/2006/picture">
                   <pic:nvPicPr>
-                    <pic:cNvPr id="432137156" name=""/>
+                    <pic:cNvPr id="933106545" name=""/>
                     <pic:cNvPicPr/>
                   </pic:nvPicPr>
                   <pic:blipFill>
@@ -17845,16 +17854,16 @@
           <w:noProof/>
         </w:rPr>
         <w:drawing>
-          <wp:inline distT="0" distB="0" distL="0" distR="0" wp14:anchorId="0BFF1F2B" wp14:editId="03AA4438">
+          <wp:inline distT="0" distB="0" distL="0" distR="0" wp14:anchorId="06AF54E5" wp14:editId="77E87866">
             <wp:extent cx="5120640" cy="1125174"/>
             <wp:effectExtent l="19050" t="19050" r="22860" b="18415"/>
-            <wp:docPr id="1967076966" name="Imagem 36"/>
+            <wp:docPr id="1407204779" name="Imagem 36"/>
             <wp:cNvGraphicFramePr/>
             <a:graphic xmlns:a="http://schemas.openxmlformats.org/drawingml/2006/main">
               <a:graphicData uri="http://schemas.openxmlformats.org/drawingml/2006/picture">
                 <pic:pic xmlns:pic="http://schemas.openxmlformats.org/drawingml/2006/picture">
                   <pic:nvPicPr>
-                    <pic:cNvPr id="1967076966" name=""/>
+                    <pic:cNvPr id="1407204779" name=""/>
                     <pic:cNvPicPr/>
                   </pic:nvPicPr>
                   <pic:blipFill>
@@ -17944,7 +17953,7 @@
           <w:sz w:val="27"/>
         </w:rPr>
       </w:pPr>
-      <w:bookmarkStart w:id="33" w:name="_Toc240288849"/>
+      <w:bookmarkStart w:id="33" w:name="_Toc240290750"/>
       <w:r>
         <w:rPr>
           <w:rFonts w:ascii="Montserrat" w:hAnsi="Montserrat"/>
@@ -17984,16 +17993,16 @@
           <w:noProof/>
         </w:rPr>
         <w:drawing>
-          <wp:inline distT="0" distB="0" distL="0" distR="0" wp14:anchorId="1C2B9A20" wp14:editId="025EE0CA">
+          <wp:inline distT="0" distB="0" distL="0" distR="0" wp14:anchorId="282901AC" wp14:editId="1271A77A">
             <wp:extent cx="5120640" cy="4627581"/>
             <wp:effectExtent l="19050" t="19050" r="22860" b="20955"/>
-            <wp:docPr id="1634243" name="Imagem 37"/>
+            <wp:docPr id="90904031" name="Imagem 37"/>
             <wp:cNvGraphicFramePr/>
             <a:graphic xmlns:a="http://schemas.openxmlformats.org/drawingml/2006/main">
               <a:graphicData uri="http://schemas.openxmlformats.org/drawingml/2006/picture">
                 <pic:pic xmlns:pic="http://schemas.openxmlformats.org/drawingml/2006/picture">
                   <pic:nvPicPr>
-                    <pic:cNvPr id="1634243" name=""/>
+                    <pic:cNvPr id="90904031" name=""/>
                     <pic:cNvPicPr/>
                   </pic:nvPicPr>
                   <pic:blipFill>
@@ -18061,16 +18070,16 @@
         </w:rPr>
         <w:lastRenderedPageBreak/>
         <w:drawing>
-          <wp:inline distT="0" distB="0" distL="0" distR="0" wp14:anchorId="1035B7D7" wp14:editId="10618213">
+          <wp:inline distT="0" distB="0" distL="0" distR="0" wp14:anchorId="7DB5D960" wp14:editId="081EED93">
             <wp:extent cx="5120640" cy="4627581"/>
             <wp:effectExtent l="19050" t="19050" r="22860" b="20955"/>
-            <wp:docPr id="1218621459" name="Imagem 38"/>
+            <wp:docPr id="1290671870" name="Imagem 38"/>
             <wp:cNvGraphicFramePr/>
             <a:graphic xmlns:a="http://schemas.openxmlformats.org/drawingml/2006/main">
               <a:graphicData uri="http://schemas.openxmlformats.org/drawingml/2006/picture">
                 <pic:pic xmlns:pic="http://schemas.openxmlformats.org/drawingml/2006/picture">
                   <pic:nvPicPr>
-                    <pic:cNvPr id="1218621459" name=""/>
+                    <pic:cNvPr id="1290671870" name=""/>
                     <pic:cNvPicPr/>
                   </pic:nvPicPr>
                   <pic:blipFill>
@@ -18239,16 +18248,16 @@
           <w:noProof/>
         </w:rPr>
         <w:drawing>
-          <wp:inline distT="0" distB="0" distL="0" distR="0" wp14:anchorId="0111ACE5" wp14:editId="58FD9234">
+          <wp:inline distT="0" distB="0" distL="0" distR="0" wp14:anchorId="5E38188A" wp14:editId="509AD898">
             <wp:extent cx="5120640" cy="2144319"/>
             <wp:effectExtent l="19050" t="19050" r="22860" b="27940"/>
-            <wp:docPr id="1575438446" name="Imagem 39"/>
+            <wp:docPr id="1749654958" name="Imagem 39"/>
             <wp:cNvGraphicFramePr/>
             <a:graphic xmlns:a="http://schemas.openxmlformats.org/drawingml/2006/main">
               <a:graphicData uri="http://schemas.openxmlformats.org/drawingml/2006/picture">
                 <pic:pic xmlns:pic="http://schemas.openxmlformats.org/drawingml/2006/picture">
                   <pic:nvPicPr>
-                    <pic:cNvPr id="1575438446" name=""/>
+                    <pic:cNvPr id="1749654958" name=""/>
                     <pic:cNvPicPr/>
                   </pic:nvPicPr>
                   <pic:blipFill>
@@ -18336,16 +18345,16 @@
           <w:noProof/>
         </w:rPr>
         <w:drawing>
-          <wp:inline distT="0" distB="0" distL="0" distR="0" wp14:anchorId="796310F7" wp14:editId="63A32063">
+          <wp:inline distT="0" distB="0" distL="0" distR="0" wp14:anchorId="378FEA89" wp14:editId="24BD6063">
             <wp:extent cx="5120640" cy="1055647"/>
             <wp:effectExtent l="19050" t="19050" r="22860" b="11430"/>
-            <wp:docPr id="45554703" name="Imagem 40"/>
+            <wp:docPr id="1535614646" name="Imagem 40"/>
             <wp:cNvGraphicFramePr/>
             <a:graphic xmlns:a="http://schemas.openxmlformats.org/drawingml/2006/main">
               <a:graphicData uri="http://schemas.openxmlformats.org/drawingml/2006/picture">
                 <pic:pic xmlns:pic="http://schemas.openxmlformats.org/drawingml/2006/picture">
                   <pic:nvPicPr>
-                    <pic:cNvPr id="45554703" name=""/>
+                    <pic:cNvPr id="1535614646" name=""/>
                     <pic:cNvPicPr/>
                   </pic:nvPicPr>
                   <pic:blipFill>
@@ -18467,16 +18476,16 @@
           <w:noProof/>
         </w:rPr>
         <w:drawing>
-          <wp:inline distT="0" distB="0" distL="0" distR="0" wp14:anchorId="51D9DA9E" wp14:editId="0A4A4253">
+          <wp:inline distT="0" distB="0" distL="0" distR="0" wp14:anchorId="7474C1A1" wp14:editId="463D9774">
             <wp:extent cx="5120640" cy="3282818"/>
             <wp:effectExtent l="19050" t="19050" r="22860" b="13335"/>
-            <wp:docPr id="2068400979" name="Imagem 41"/>
+            <wp:docPr id="1452511653" name="Imagem 41"/>
             <wp:cNvGraphicFramePr/>
             <a:graphic xmlns:a="http://schemas.openxmlformats.org/drawingml/2006/main">
               <a:graphicData uri="http://schemas.openxmlformats.org/drawingml/2006/picture">
                 <pic:pic xmlns:pic="http://schemas.openxmlformats.org/drawingml/2006/picture">
                   <pic:nvPicPr>
-                    <pic:cNvPr id="2068400979" name=""/>
+                    <pic:cNvPr id="1452511653" name=""/>
                     <pic:cNvPicPr/>
                   </pic:nvPicPr>
                   <pic:blipFill>
@@ -18610,16 +18619,16 @@
         </w:rPr>
         <w:lastRenderedPageBreak/>
         <w:drawing>
-          <wp:inline distT="0" distB="0" distL="0" distR="0" wp14:anchorId="41FB02F2" wp14:editId="6146F569">
+          <wp:inline distT="0" distB="0" distL="0" distR="0" wp14:anchorId="76D7FCBA" wp14:editId="2B1F0FF8">
             <wp:extent cx="5120640" cy="1978034"/>
             <wp:effectExtent l="19050" t="19050" r="22860" b="22225"/>
-            <wp:docPr id="1781281135" name="Imagem 42"/>
+            <wp:docPr id="1082208778" name="Imagem 42"/>
             <wp:cNvGraphicFramePr/>
             <a:graphic xmlns:a="http://schemas.openxmlformats.org/drawingml/2006/main">
               <a:graphicData uri="http://schemas.openxmlformats.org/drawingml/2006/picture">
                 <pic:pic xmlns:pic="http://schemas.openxmlformats.org/drawingml/2006/picture">
                   <pic:nvPicPr>
-                    <pic:cNvPr id="1781281135" name=""/>
+                    <pic:cNvPr id="1082208778" name=""/>
                     <pic:cNvPicPr/>
                   </pic:nvPicPr>
                   <pic:blipFill>
@@ -18691,7 +18700,7 @@
           <w:sz w:val="34"/>
         </w:rPr>
       </w:pPr>
-      <w:bookmarkStart w:id="34" w:name="_Toc240288850"/>
+      <w:bookmarkStart w:id="34" w:name="_Toc240290751"/>
       <w:r>
         <w:rPr>
           <w:rFonts w:ascii="Montserrat" w:hAnsi="Montserrat"/>
@@ -18751,7 +18760,7 @@
           <w:sz w:val="27"/>
         </w:rPr>
       </w:pPr>
-      <w:bookmarkStart w:id="35" w:name="_Toc240288851"/>
+      <w:bookmarkStart w:id="35" w:name="_Toc240290752"/>
       <w:r>
         <w:rPr>
           <w:rFonts w:ascii="Montserrat" w:hAnsi="Montserrat"/>
@@ -18791,16 +18800,16 @@
           <w:noProof/>
         </w:rPr>
         <w:drawing>
-          <wp:inline distT="0" distB="0" distL="0" distR="0" wp14:anchorId="760C2326" wp14:editId="083E3C54">
+          <wp:inline distT="0" distB="0" distL="0" distR="0" wp14:anchorId="4F529DC7" wp14:editId="4B730C9E">
             <wp:extent cx="5303520" cy="4792851"/>
             <wp:effectExtent l="19050" t="19050" r="11430" b="27305"/>
-            <wp:docPr id="1422570251" name="Imagem 43"/>
+            <wp:docPr id="1014139133" name="Imagem 43"/>
             <wp:cNvGraphicFramePr/>
             <a:graphic xmlns:a="http://schemas.openxmlformats.org/drawingml/2006/main">
               <a:graphicData uri="http://schemas.openxmlformats.org/drawingml/2006/picture">
                 <pic:pic xmlns:pic="http://schemas.openxmlformats.org/drawingml/2006/picture">
                   <pic:nvPicPr>
-                    <pic:cNvPr id="1422570251" name=""/>
+                    <pic:cNvPr id="1014139133" name=""/>
                     <pic:cNvPicPr/>
                   </pic:nvPicPr>
                   <pic:blipFill>
@@ -18869,7 +18878,7 @@
           <w:sz w:val="27"/>
         </w:rPr>
       </w:pPr>
-      <w:bookmarkStart w:id="36" w:name="_Toc240288852"/>
+      <w:bookmarkStart w:id="36" w:name="_Toc240290753"/>
       <w:r>
         <w:rPr>
           <w:rFonts w:ascii="Montserrat" w:hAnsi="Montserrat"/>
@@ -18909,16 +18918,16 @@
           <w:noProof/>
         </w:rPr>
         <w:drawing>
-          <wp:inline distT="0" distB="0" distL="0" distR="0" wp14:anchorId="3C001200" wp14:editId="66D2FFE3">
+          <wp:inline distT="0" distB="0" distL="0" distR="0" wp14:anchorId="318ED3D0" wp14:editId="527B6123">
             <wp:extent cx="5303520" cy="4792851"/>
             <wp:effectExtent l="19050" t="19050" r="11430" b="27305"/>
-            <wp:docPr id="1313384904" name="Imagem 44"/>
+            <wp:docPr id="983473561" name="Imagem 44"/>
             <wp:cNvGraphicFramePr/>
             <a:graphic xmlns:a="http://schemas.openxmlformats.org/drawingml/2006/main">
               <a:graphicData uri="http://schemas.openxmlformats.org/drawingml/2006/picture">
                 <pic:pic xmlns:pic="http://schemas.openxmlformats.org/drawingml/2006/picture">
                   <pic:nvPicPr>
-                    <pic:cNvPr id="1313384904" name=""/>
+                    <pic:cNvPr id="983473561" name=""/>
                     <pic:cNvPicPr/>
                   </pic:nvPicPr>
                   <pic:blipFill>
@@ -18986,7 +18995,7 @@
           <w:sz w:val="27"/>
         </w:rPr>
       </w:pPr>
-      <w:bookmarkStart w:id="37" w:name="_Toc240288853"/>
+      <w:bookmarkStart w:id="37" w:name="_Toc240290754"/>
       <w:r>
         <w:rPr>
           <w:rFonts w:ascii="Montserrat" w:hAnsi="Montserrat"/>
@@ -19027,16 +19036,16 @@
         </w:rPr>
         <w:lastRenderedPageBreak/>
         <w:drawing>
-          <wp:inline distT="0" distB="0" distL="0" distR="0" wp14:anchorId="14DE7166" wp14:editId="002328A2">
+          <wp:inline distT="0" distB="0" distL="0" distR="0" wp14:anchorId="39D30511" wp14:editId="3014B597">
             <wp:extent cx="5303520" cy="4792851"/>
             <wp:effectExtent l="19050" t="19050" r="11430" b="27305"/>
-            <wp:docPr id="365781109" name="Imagem 45"/>
+            <wp:docPr id="506243623" name="Imagem 45"/>
             <wp:cNvGraphicFramePr/>
             <a:graphic xmlns:a="http://schemas.openxmlformats.org/drawingml/2006/main">
               <a:graphicData uri="http://schemas.openxmlformats.org/drawingml/2006/picture">
                 <pic:pic xmlns:pic="http://schemas.openxmlformats.org/drawingml/2006/picture">
                   <pic:nvPicPr>
-                    <pic:cNvPr id="365781109" name=""/>
+                    <pic:cNvPr id="506243623" name=""/>
                     <pic:cNvPicPr/>
                   </pic:nvPicPr>
                   <pic:blipFill>
@@ -19104,16 +19113,16 @@
         </w:rPr>
         <w:lastRenderedPageBreak/>
         <w:drawing>
-          <wp:inline distT="0" distB="0" distL="0" distR="0" wp14:anchorId="0A3293E7" wp14:editId="24081AAA">
+          <wp:inline distT="0" distB="0" distL="0" distR="0" wp14:anchorId="192F523B" wp14:editId="7A9EE1B7">
             <wp:extent cx="5303520" cy="4792851"/>
             <wp:effectExtent l="19050" t="19050" r="11430" b="27305"/>
-            <wp:docPr id="378203152" name="Imagem 46"/>
+            <wp:docPr id="1108983868" name="Imagem 46"/>
             <wp:cNvGraphicFramePr/>
             <a:graphic xmlns:a="http://schemas.openxmlformats.org/drawingml/2006/main">
               <a:graphicData uri="http://schemas.openxmlformats.org/drawingml/2006/picture">
                 <pic:pic xmlns:pic="http://schemas.openxmlformats.org/drawingml/2006/picture">
                   <pic:nvPicPr>
-                    <pic:cNvPr id="378203152" name=""/>
+                    <pic:cNvPr id="1108983868" name=""/>
                     <pic:cNvPicPr/>
                   </pic:nvPicPr>
                   <pic:blipFill>
@@ -19206,7 +19215,7 @@
           <w:sz w:val="34"/>
         </w:rPr>
       </w:pPr>
-      <w:bookmarkStart w:id="38" w:name="_Toc240288854"/>
+      <w:bookmarkStart w:id="38" w:name="_Toc240290755"/>
       <w:r>
         <w:rPr>
           <w:rFonts w:ascii="Montserrat" w:hAnsi="Montserrat"/>
@@ -19248,7 +19257,7 @@
           <w:sz w:val="27"/>
         </w:rPr>
       </w:pPr>
-      <w:bookmarkStart w:id="39" w:name="_Toc240288855"/>
+      <w:bookmarkStart w:id="39" w:name="_Toc240290756"/>
       <w:r>
         <w:rPr>
           <w:rFonts w:ascii="Montserrat" w:hAnsi="Montserrat"/>
@@ -19288,16 +19297,16 @@
           <w:noProof/>
         </w:rPr>
         <w:drawing>
-          <wp:inline distT="0" distB="0" distL="0" distR="0" wp14:anchorId="065E0DF2" wp14:editId="3BC03E1E">
+          <wp:inline distT="0" distB="0" distL="0" distR="0" wp14:anchorId="7A75598A" wp14:editId="1D1A66FD">
             <wp:extent cx="5303520" cy="4792851"/>
             <wp:effectExtent l="19050" t="19050" r="11430" b="27305"/>
-            <wp:docPr id="1084295971" name="Imagem 47"/>
+            <wp:docPr id="1707073624" name="Imagem 47"/>
             <wp:cNvGraphicFramePr/>
             <a:graphic xmlns:a="http://schemas.openxmlformats.org/drawingml/2006/main">
               <a:graphicData uri="http://schemas.openxmlformats.org/drawingml/2006/picture">
                 <pic:pic xmlns:pic="http://schemas.openxmlformats.org/drawingml/2006/picture">
                   <pic:nvPicPr>
-                    <pic:cNvPr id="1084295971" name=""/>
+                    <pic:cNvPr id="1707073624" name=""/>
                     <pic:cNvPicPr/>
                   </pic:nvPicPr>
                   <pic:blipFill>
@@ -19526,7 +19535,7 @@
           <w:sz w:val="27"/>
         </w:rPr>
       </w:pPr>
-      <w:bookmarkStart w:id="40" w:name="_Toc240288856"/>
+      <w:bookmarkStart w:id="40" w:name="_Toc240290757"/>
       <w:r>
         <w:rPr>
           <w:rFonts w:ascii="Montserrat" w:hAnsi="Montserrat"/>
@@ -19566,16 +19575,16 @@
           <w:noProof/>
         </w:rPr>
         <w:drawing>
-          <wp:inline distT="0" distB="0" distL="0" distR="0" wp14:anchorId="3FCDB8D8" wp14:editId="163C1FE8">
+          <wp:inline distT="0" distB="0" distL="0" distR="0" wp14:anchorId="59FC1C7E" wp14:editId="76D41320">
             <wp:extent cx="5303520" cy="4792851"/>
             <wp:effectExtent l="19050" t="19050" r="11430" b="27305"/>
-            <wp:docPr id="524176923" name="Imagem 48"/>
+            <wp:docPr id="1413068361" name="Imagem 48"/>
             <wp:cNvGraphicFramePr/>
             <a:graphic xmlns:a="http://schemas.openxmlformats.org/drawingml/2006/main">
               <a:graphicData uri="http://schemas.openxmlformats.org/drawingml/2006/picture">
                 <pic:pic xmlns:pic="http://schemas.openxmlformats.org/drawingml/2006/picture">
                   <pic:nvPicPr>
-                    <pic:cNvPr id="524176923" name=""/>
+                    <pic:cNvPr id="1413068361" name=""/>
                     <pic:cNvPicPr/>
                   </pic:nvPicPr>
                   <pic:blipFill>
@@ -19643,7 +19652,7 @@
           <w:sz w:val="27"/>
         </w:rPr>
       </w:pPr>
-      <w:bookmarkStart w:id="41" w:name="_Toc240288857"/>
+      <w:bookmarkStart w:id="41" w:name="_Toc240290758"/>
       <w:r>
         <w:rPr>
           <w:rFonts w:ascii="Montserrat" w:hAnsi="Montserrat"/>
@@ -19684,16 +19693,16 @@
         </w:rPr>
         <w:lastRenderedPageBreak/>
         <w:drawing>
-          <wp:inline distT="0" distB="0" distL="0" distR="0" wp14:anchorId="0E2F0A52" wp14:editId="5D8B3B0D">
+          <wp:inline distT="0" distB="0" distL="0" distR="0" wp14:anchorId="4462BDBE" wp14:editId="6EF3AE74">
             <wp:extent cx="5303520" cy="4792851"/>
             <wp:effectExtent l="19050" t="19050" r="11430" b="27305"/>
-            <wp:docPr id="1375247919" name="Imagem 49"/>
+            <wp:docPr id="137825796" name="Imagem 49"/>
             <wp:cNvGraphicFramePr/>
             <a:graphic xmlns:a="http://schemas.openxmlformats.org/drawingml/2006/main">
               <a:graphicData uri="http://schemas.openxmlformats.org/drawingml/2006/picture">
                 <pic:pic xmlns:pic="http://schemas.openxmlformats.org/drawingml/2006/picture">
                   <pic:nvPicPr>
-                    <pic:cNvPr id="1375247919" name=""/>
+                    <pic:cNvPr id="137825796" name=""/>
                     <pic:cNvPicPr/>
                   </pic:nvPicPr>
                   <pic:blipFill>
@@ -19837,7 +19846,7 @@
           <w:sz w:val="27"/>
         </w:rPr>
       </w:pPr>
-      <w:bookmarkStart w:id="42" w:name="_Toc240288858"/>
+      <w:bookmarkStart w:id="42" w:name="_Toc240290759"/>
       <w:r>
         <w:rPr>
           <w:rFonts w:ascii="Montserrat" w:hAnsi="Montserrat"/>
@@ -20102,16 +20111,16 @@
           <w:noProof/>
         </w:rPr>
         <w:drawing>
-          <wp:inline distT="0" distB="0" distL="0" distR="0" wp14:anchorId="7383F946" wp14:editId="296185BB">
+          <wp:inline distT="0" distB="0" distL="0" distR="0" wp14:anchorId="142659E2" wp14:editId="417C8A56">
             <wp:extent cx="5303520" cy="4267180"/>
             <wp:effectExtent l="19050" t="19050" r="11430" b="19685"/>
-            <wp:docPr id="245378417" name="Imagem 50"/>
+            <wp:docPr id="201101583" name="Imagem 50"/>
             <wp:cNvGraphicFramePr/>
             <a:graphic xmlns:a="http://schemas.openxmlformats.org/drawingml/2006/main">
               <a:graphicData uri="http://schemas.openxmlformats.org/drawingml/2006/picture">
                 <pic:pic xmlns:pic="http://schemas.openxmlformats.org/drawingml/2006/picture">
                   <pic:nvPicPr>
-                    <pic:cNvPr id="245378417" name=""/>
+                    <pic:cNvPr id="201101583" name=""/>
                     <pic:cNvPicPr/>
                   </pic:nvPicPr>
                   <pic:blipFill>
@@ -20179,16 +20188,16 @@
           <w:noProof/>
         </w:rPr>
         <w:drawing>
-          <wp:inline distT="0" distB="0" distL="0" distR="0" wp14:anchorId="4FB6513B" wp14:editId="467AB75C">
+          <wp:inline distT="0" distB="0" distL="0" distR="0" wp14:anchorId="00922F6D" wp14:editId="58B982E6">
             <wp:extent cx="5303520" cy="3382059"/>
             <wp:effectExtent l="19050" t="19050" r="11430" b="27940"/>
-            <wp:docPr id="1764836037" name="Imagem 51"/>
+            <wp:docPr id="462628021" name="Imagem 51"/>
             <wp:cNvGraphicFramePr/>
             <a:graphic xmlns:a="http://schemas.openxmlformats.org/drawingml/2006/main">
               <a:graphicData uri="http://schemas.openxmlformats.org/drawingml/2006/picture">
                 <pic:pic xmlns:pic="http://schemas.openxmlformats.org/drawingml/2006/picture">
                   <pic:nvPicPr>
-                    <pic:cNvPr id="1764836037" name=""/>
+                    <pic:cNvPr id="462628021" name=""/>
                     <pic:cNvPicPr/>
                   </pic:nvPicPr>
                   <pic:blipFill>
@@ -20256,16 +20265,16 @@
         </w:rPr>
         <w:lastRenderedPageBreak/>
         <w:drawing>
-          <wp:inline distT="0" distB="0" distL="0" distR="0" wp14:anchorId="720E5997" wp14:editId="7C11B400">
+          <wp:inline distT="0" distB="0" distL="0" distR="0" wp14:anchorId="7440E8F9" wp14:editId="12EC5A85">
             <wp:extent cx="5303520" cy="4417800"/>
             <wp:effectExtent l="19050" t="19050" r="11430" b="20955"/>
-            <wp:docPr id="1516983976" name="Imagem 52"/>
+            <wp:docPr id="2093413748" name="Imagem 52"/>
             <wp:cNvGraphicFramePr/>
             <a:graphic xmlns:a="http://schemas.openxmlformats.org/drawingml/2006/main">
               <a:graphicData uri="http://schemas.openxmlformats.org/drawingml/2006/picture">
                 <pic:pic xmlns:pic="http://schemas.openxmlformats.org/drawingml/2006/picture">
                   <pic:nvPicPr>
-                    <pic:cNvPr id="1516983976" name=""/>
+                    <pic:cNvPr id="2093413748" name=""/>
                     <pic:cNvPicPr/>
                   </pic:nvPicPr>
                   <pic:blipFill>
@@ -20375,7 +20384,7 @@
           <w:sz w:val="27"/>
         </w:rPr>
       </w:pPr>
-      <w:bookmarkStart w:id="43" w:name="_Toc240288859"/>
+      <w:bookmarkStart w:id="43" w:name="_Toc240290760"/>
       <w:r>
         <w:rPr>
           <w:rFonts w:ascii="Montserrat" w:hAnsi="Montserrat"/>
@@ -20641,16 +20650,16 @@
         </w:rPr>
         <w:lastRenderedPageBreak/>
         <w:drawing>
-          <wp:inline distT="0" distB="0" distL="0" distR="0" wp14:anchorId="034C4424" wp14:editId="5F11D742">
+          <wp:inline distT="0" distB="0" distL="0" distR="0" wp14:anchorId="13333F51" wp14:editId="7A7A810D">
             <wp:extent cx="5303520" cy="7628836"/>
             <wp:effectExtent l="19050" t="19050" r="11430" b="10795"/>
-            <wp:docPr id="146921949" name="Imagem 53"/>
+            <wp:docPr id="1564212443" name="Imagem 53"/>
             <wp:cNvGraphicFramePr/>
             <a:graphic xmlns:a="http://schemas.openxmlformats.org/drawingml/2006/main">
               <a:graphicData uri="http://schemas.openxmlformats.org/drawingml/2006/picture">
                 <pic:pic xmlns:pic="http://schemas.openxmlformats.org/drawingml/2006/picture">
                   <pic:nvPicPr>
-                    <pic:cNvPr id="146921949" name=""/>
+                    <pic:cNvPr id="1564212443" name=""/>
                     <pic:cNvPicPr/>
                   </pic:nvPicPr>
                   <pic:blipFill>
@@ -20782,7 +20791,7 @@
           <w:sz w:val="27"/>
         </w:rPr>
       </w:pPr>
-      <w:bookmarkStart w:id="44" w:name="_Toc240288860"/>
+      <w:bookmarkStart w:id="44" w:name="_Toc240290761"/>
       <w:r>
         <w:rPr>
           <w:rFonts w:ascii="Montserrat" w:hAnsi="Montserrat"/>
@@ -20935,7 +20944,7 @@
           <w:sz w:val="27"/>
         </w:rPr>
       </w:pPr>
-      <w:bookmarkStart w:id="45" w:name="_Toc240288861"/>
+      <w:bookmarkStart w:id="45" w:name="_Toc240290762"/>
       <w:r>
         <w:rPr>
           <w:rFonts w:ascii="Montserrat" w:hAnsi="Montserrat"/>
@@ -21228,16 +21237,16 @@
           <w:noProof/>
         </w:rPr>
         <w:drawing>
-          <wp:inline distT="0" distB="0" distL="0" distR="0" wp14:anchorId="7D65CEEA" wp14:editId="4E0F05B1">
+          <wp:inline distT="0" distB="0" distL="0" distR="0" wp14:anchorId="4C676F51" wp14:editId="1239D0B9">
             <wp:extent cx="5303520" cy="1351384"/>
             <wp:effectExtent l="19050" t="19050" r="11430" b="20320"/>
-            <wp:docPr id="486552656" name="Imagem 54"/>
+            <wp:docPr id="636231734" name="Imagem 54"/>
             <wp:cNvGraphicFramePr/>
             <a:graphic xmlns:a="http://schemas.openxmlformats.org/drawingml/2006/main">
               <a:graphicData uri="http://schemas.openxmlformats.org/drawingml/2006/picture">
                 <pic:pic xmlns:pic="http://schemas.openxmlformats.org/drawingml/2006/picture">
                   <pic:nvPicPr>
-                    <pic:cNvPr id="486552656" name=""/>
+                    <pic:cNvPr id="636231734" name=""/>
                     <pic:cNvPicPr/>
                   </pic:nvPicPr>
                   <pic:blipFill>
@@ -21305,7 +21314,7 @@
           <w:sz w:val="27"/>
         </w:rPr>
       </w:pPr>
-      <w:bookmarkStart w:id="46" w:name="_Toc240288862"/>
+      <w:bookmarkStart w:id="46" w:name="_Toc240290763"/>
       <w:r>
         <w:rPr>
           <w:rFonts w:ascii="Montserrat" w:hAnsi="Montserrat"/>
@@ -21450,16 +21459,16 @@
           <w:noProof/>
         </w:rPr>
         <w:drawing>
-          <wp:inline distT="0" distB="0" distL="0" distR="0" wp14:anchorId="732359ED" wp14:editId="24E3E31D">
+          <wp:inline distT="0" distB="0" distL="0" distR="0" wp14:anchorId="59F4D5EB" wp14:editId="48B81545">
             <wp:extent cx="5303520" cy="1422793"/>
             <wp:effectExtent l="19050" t="19050" r="11430" b="25400"/>
-            <wp:docPr id="1152542226" name="Imagem 55"/>
+            <wp:docPr id="470613502" name="Imagem 55"/>
             <wp:cNvGraphicFramePr/>
             <a:graphic xmlns:a="http://schemas.openxmlformats.org/drawingml/2006/main">
               <a:graphicData uri="http://schemas.openxmlformats.org/drawingml/2006/picture">
                 <pic:pic xmlns:pic="http://schemas.openxmlformats.org/drawingml/2006/picture">
                   <pic:nvPicPr>
-                    <pic:cNvPr id="1152542226" name=""/>
+                    <pic:cNvPr id="470613502" name=""/>
                     <pic:cNvPicPr/>
                   </pic:nvPicPr>
                   <pic:blipFill>
@@ -21614,16 +21623,16 @@
         </w:rPr>
         <w:lastRenderedPageBreak/>
         <w:drawing>
-          <wp:inline distT="0" distB="0" distL="0" distR="0" wp14:anchorId="3E1EE8B8" wp14:editId="04CC4EB4">
+          <wp:inline distT="0" distB="0" distL="0" distR="0" wp14:anchorId="545340E9" wp14:editId="6266E660">
             <wp:extent cx="5303520" cy="1841050"/>
             <wp:effectExtent l="19050" t="19050" r="11430" b="26035"/>
-            <wp:docPr id="1803750745" name="Imagem 56"/>
+            <wp:docPr id="254334249" name="Imagem 56"/>
             <wp:cNvGraphicFramePr/>
             <a:graphic xmlns:a="http://schemas.openxmlformats.org/drawingml/2006/main">
               <a:graphicData uri="http://schemas.openxmlformats.org/drawingml/2006/picture">
                 <pic:pic xmlns:pic="http://schemas.openxmlformats.org/drawingml/2006/picture">
                   <pic:nvPicPr>
-                    <pic:cNvPr id="1803750745" name=""/>
+                    <pic:cNvPr id="254334249" name=""/>
                     <pic:cNvPicPr/>
                   </pic:nvPicPr>
                   <pic:blipFill>
@@ -21777,16 +21786,16 @@
           <w:noProof/>
         </w:rPr>
         <w:drawing>
-          <wp:inline distT="0" distB="0" distL="0" distR="0" wp14:anchorId="3203843B" wp14:editId="6D5BB600">
+          <wp:inline distT="0" distB="0" distL="0" distR="0" wp14:anchorId="5C2C72B9" wp14:editId="5FCB42BE">
             <wp:extent cx="5303520" cy="303041"/>
             <wp:effectExtent l="19050" t="19050" r="11430" b="20955"/>
-            <wp:docPr id="907773466" name="Imagem 57"/>
+            <wp:docPr id="1688215810" name="Imagem 57"/>
             <wp:cNvGraphicFramePr/>
             <a:graphic xmlns:a="http://schemas.openxmlformats.org/drawingml/2006/main">
               <a:graphicData uri="http://schemas.openxmlformats.org/drawingml/2006/picture">
                 <pic:pic xmlns:pic="http://schemas.openxmlformats.org/drawingml/2006/picture">
                   <pic:nvPicPr>
-                    <pic:cNvPr id="907773466" name=""/>
+                    <pic:cNvPr id="1688215810" name=""/>
                     <pic:cNvPicPr/>
                   </pic:nvPicPr>
                   <pic:blipFill>
@@ -21854,16 +21863,16 @@
         </w:rPr>
         <w:lastRenderedPageBreak/>
         <w:drawing>
-          <wp:inline distT="0" distB="0" distL="0" distR="0" wp14:anchorId="6F514E1C" wp14:editId="4C54502A">
+          <wp:inline distT="0" distB="0" distL="0" distR="0" wp14:anchorId="76E07E89" wp14:editId="5ED6C5E9">
             <wp:extent cx="5303520" cy="2983005"/>
             <wp:effectExtent l="19050" t="19050" r="11430" b="27305"/>
-            <wp:docPr id="777817110" name="Imagem 58"/>
+            <wp:docPr id="563016082" name="Imagem 58"/>
             <wp:cNvGraphicFramePr/>
             <a:graphic xmlns:a="http://schemas.openxmlformats.org/drawingml/2006/main">
               <a:graphicData uri="http://schemas.openxmlformats.org/drawingml/2006/picture">
                 <pic:pic xmlns:pic="http://schemas.openxmlformats.org/drawingml/2006/picture">
                   <pic:nvPicPr>
-                    <pic:cNvPr id="777817110" name=""/>
+                    <pic:cNvPr id="563016082" name=""/>
                     <pic:cNvPicPr/>
                   </pic:nvPicPr>
                   <pic:blipFill>
@@ -21935,7 +21944,7 @@
           <w:sz w:val="34"/>
         </w:rPr>
       </w:pPr>
-      <w:bookmarkStart w:id="47" w:name="_Toc240288863"/>
+      <w:bookmarkStart w:id="47" w:name="_Toc240290764"/>
       <w:r>
         <w:rPr>
           <w:rFonts w:ascii="Montserrat" w:hAnsi="Montserrat"/>
@@ -22179,7 +22188,7 @@
           <w:sz w:val="34"/>
         </w:rPr>
       </w:pPr>
-      <w:bookmarkStart w:id="48" w:name="_Toc240288864"/>
+      <w:bookmarkStart w:id="48" w:name="_Toc240290765"/>
       <w:r>
         <w:rPr>
           <w:rFonts w:ascii="Montserrat" w:hAnsi="Montserrat"/>
@@ -23967,7 +23976,7 @@
 <file path=word/numbering.xml><?xml version="1.0" encoding="utf-8"?>
 <w:numbering xmlns:wpc="http://schemas.microsoft.com/office/word/2010/wordprocessingCanvas" xmlns:cx="http://schemas.microsoft.com/office/drawing/2014/chartex" xmlns:cx1="http://schemas.microsoft.com/office/drawing/2015/9/8/chartex" xmlns:cx2="http://schemas.microsoft.com/office/drawing/2015/10/21/chartex" xmlns:cx3="http://schemas.microsoft.com/office/drawing/2016/5/9/chartex" xmlns:cx4="http://schemas.microsoft.com/office/drawing/2016/5/10/chartex" xmlns:cx5="http://schemas.microsoft.com/office/drawing/2016/5/11/chartex" xmlns:cx6="http://schemas.microsoft.com/office/drawing/2016/5/12/chartex" xmlns:cx7="http://schemas.microsoft.com/office/drawing/2016/5/13/chartex" xmlns:cx8="http://schemas.microsoft.com/office/drawing/2016/5/14/chartex" xmlns:mc="http://schemas.openxmlformats.org/markup-compatibility/2006" xmlns:aink="http://schemas.microsoft.com/office/drawing/2016/ink" xmlns:am3d="http://schemas.microsoft.com/office/drawing/2017/model3d" xmlns:o="urn:schemas-microsoft-com:office:office" xmlns:oel="http://schemas.microsoft.com/office/2019/extlst" xmlns:r="http://schemas.openxmlformats.org/officeDocument/2006/relationships" xmlns:m="http://schemas.openxmlformats.org/officeDocument/2006/math" xmlns:v="urn:schemas-microsoft-com:vml" xmlns:wp14="http://schemas.microsoft.com/office/word/2010/wordprocessingDrawing" xmlns:wp="http://schemas.openxmlformats.org/drawingml/2006/wordprocessingDrawing" xmlns:w10="urn:schemas-microsoft-com:office:word" xmlns:w="http://schemas.openxmlformats.org/wordprocessingml/2006/main" xmlns:w14="http://schemas.microsoft.com/office/word/2010/wordml" xmlns:w15="http://schemas.microsoft.com/office/word/2012/wordml" xmlns:w16cex="http://schemas.microsoft.com/office/word/2018/wordml/cex" xmlns:w16cid="http://schemas.microsoft.com/office/word/2016/wordml/cid" xmlns:w16="http://schemas.microsoft.com/office/word/2018/wordml" xmlns:w16du="http://schemas.microsoft.com/office/word/2023/wordml/word16du" xmlns:w16sdtdh="http://schemas.microsoft.com/office/word/2020/wordml/sdtdatahash" xmlns:w16sdtfl="http://schemas.microsoft.com/office/word/2024/wordml/sdtformatlock" xmlns:w16se="http://schemas.microsoft.com/office/word/2015/wordml/symex" xmlns:wpg="http://schemas.microsoft.com/office/word/2010/wordprocessingGroup" xmlns:wpi="http://schemas.microsoft.com/office/word/2010/wordprocessingInk" xmlns:wne="http://schemas.microsoft.com/office/word/2006/wordml" xmlns:wps="http://schemas.microsoft.com/office/word/2010/wordprocessingShape" mc:Ignorable="w14 w15 w16se w16cid w16 w16cex w16sdtdh w16sdtfl w16du wp14">
   <w:abstractNum w:abstractNumId="0" w15:restartNumberingAfterBreak="0">
-    <w:nsid w:val="0E480117"/>
+    <w:nsid w:val="09203697"/>
     <w:multiLevelType w:val="singleLevel"/>
     <w:tmpl w:val="04160001"/>
     <w:lvl w:ilvl="0">
@@ -23984,7 +23993,7 @@
     </w:lvl>
   </w:abstractNum>
   <w:abstractNum w:abstractNumId="1" w15:restartNumberingAfterBreak="0">
-    <w:nsid w:val="11D254F7"/>
+    <w:nsid w:val="098F6A9A"/>
     <w:multiLevelType w:val="singleLevel"/>
     <w:tmpl w:val="04160001"/>
     <w:lvl w:ilvl="0">
@@ -24001,7 +24010,7 @@
     </w:lvl>
   </w:abstractNum>
   <w:abstractNum w:abstractNumId="2" w15:restartNumberingAfterBreak="0">
-    <w:nsid w:val="123A787D"/>
+    <w:nsid w:val="0B003BFE"/>
     <w:multiLevelType w:val="singleLevel"/>
     <w:tmpl w:val="04160001"/>
     <w:lvl w:ilvl="0">
@@ -24018,7 +24027,7 @@
     </w:lvl>
   </w:abstractNum>
   <w:abstractNum w:abstractNumId="3" w15:restartNumberingAfterBreak="0">
-    <w:nsid w:val="16044529"/>
+    <w:nsid w:val="0FBD0500"/>
     <w:multiLevelType w:val="singleLevel"/>
     <w:tmpl w:val="04160001"/>
     <w:lvl w:ilvl="0">
@@ -24035,7 +24044,7 @@
     </w:lvl>
   </w:abstractNum>
   <w:abstractNum w:abstractNumId="4" w15:restartNumberingAfterBreak="0">
-    <w:nsid w:val="1ADB7D52"/>
+    <w:nsid w:val="14C209F4"/>
     <w:multiLevelType w:val="singleLevel"/>
     <w:tmpl w:val="04160001"/>
     <w:lvl w:ilvl="0">
@@ -24052,7 +24061,7 @@
     </w:lvl>
   </w:abstractNum>
   <w:abstractNum w:abstractNumId="5" w15:restartNumberingAfterBreak="0">
-    <w:nsid w:val="1BDE5607"/>
+    <w:nsid w:val="1D1B3BFD"/>
     <w:multiLevelType w:val="singleLevel"/>
     <w:tmpl w:val="04160001"/>
     <w:lvl w:ilvl="0">
@@ -24069,7 +24078,7 @@
     </w:lvl>
   </w:abstractNum>
   <w:abstractNum w:abstractNumId="6" w15:restartNumberingAfterBreak="0">
-    <w:nsid w:val="1CD25925"/>
+    <w:nsid w:val="1D7F469E"/>
     <w:multiLevelType w:val="singleLevel"/>
     <w:tmpl w:val="04160001"/>
     <w:lvl w:ilvl="0">
@@ -24086,7 +24095,7 @@
     </w:lvl>
   </w:abstractNum>
   <w:abstractNum w:abstractNumId="7" w15:restartNumberingAfterBreak="0">
-    <w:nsid w:val="1E3754D4"/>
+    <w:nsid w:val="20157DC8"/>
     <w:multiLevelType w:val="singleLevel"/>
     <w:tmpl w:val="04160001"/>
     <w:lvl w:ilvl="0">
@@ -24103,7 +24112,7 @@
     </w:lvl>
   </w:abstractNum>
   <w:abstractNum w:abstractNumId="8" w15:restartNumberingAfterBreak="0">
-    <w:nsid w:val="22833815"/>
+    <w:nsid w:val="206621A1"/>
     <w:multiLevelType w:val="singleLevel"/>
     <w:tmpl w:val="04160001"/>
     <w:lvl w:ilvl="0">
@@ -24120,7 +24129,7 @@
     </w:lvl>
   </w:abstractNum>
   <w:abstractNum w:abstractNumId="9" w15:restartNumberingAfterBreak="0">
-    <w:nsid w:val="23FA6466"/>
+    <w:nsid w:val="2184723C"/>
     <w:multiLevelType w:val="singleLevel"/>
     <w:tmpl w:val="04160001"/>
     <w:lvl w:ilvl="0">
@@ -24137,7 +24146,7 @@
     </w:lvl>
   </w:abstractNum>
   <w:abstractNum w:abstractNumId="10" w15:restartNumberingAfterBreak="0">
-    <w:nsid w:val="2C870268"/>
+    <w:nsid w:val="227B77BE"/>
     <w:multiLevelType w:val="singleLevel"/>
     <w:tmpl w:val="04160001"/>
     <w:lvl w:ilvl="0">
@@ -24154,7 +24163,7 @@
     </w:lvl>
   </w:abstractNum>
   <w:abstractNum w:abstractNumId="11" w15:restartNumberingAfterBreak="0">
-    <w:nsid w:val="2F365E9E"/>
+    <w:nsid w:val="25795B95"/>
     <w:multiLevelType w:val="singleLevel"/>
     <w:tmpl w:val="04160001"/>
     <w:lvl w:ilvl="0">
@@ -24171,7 +24180,7 @@
     </w:lvl>
   </w:abstractNum>
   <w:abstractNum w:abstractNumId="12" w15:restartNumberingAfterBreak="0">
-    <w:nsid w:val="39BB7E14"/>
+    <w:nsid w:val="2AD911D4"/>
     <w:multiLevelType w:val="singleLevel"/>
     <w:tmpl w:val="04160001"/>
     <w:lvl w:ilvl="0">
@@ -24188,7 +24197,7 @@
     </w:lvl>
   </w:abstractNum>
   <w:abstractNum w:abstractNumId="13" w15:restartNumberingAfterBreak="0">
-    <w:nsid w:val="3D966C6E"/>
+    <w:nsid w:val="371A0DBA"/>
     <w:multiLevelType w:val="singleLevel"/>
     <w:tmpl w:val="04160001"/>
     <w:lvl w:ilvl="0">
@@ -24205,7 +24214,7 @@
     </w:lvl>
   </w:abstractNum>
   <w:abstractNum w:abstractNumId="14" w15:restartNumberingAfterBreak="0">
-    <w:nsid w:val="3E847E68"/>
+    <w:nsid w:val="376130F8"/>
     <w:multiLevelType w:val="singleLevel"/>
     <w:tmpl w:val="04160001"/>
     <w:lvl w:ilvl="0">
@@ -24222,7 +24231,7 @@
     </w:lvl>
   </w:abstractNum>
   <w:abstractNum w:abstractNumId="15" w15:restartNumberingAfterBreak="0">
-    <w:nsid w:val="3FA02862"/>
+    <w:nsid w:val="383A5916"/>
     <w:multiLevelType w:val="singleLevel"/>
     <w:tmpl w:val="04160001"/>
     <w:lvl w:ilvl="0">
@@ -24239,7 +24248,7 @@
     </w:lvl>
   </w:abstractNum>
   <w:abstractNum w:abstractNumId="16" w15:restartNumberingAfterBreak="0">
-    <w:nsid w:val="43683FEC"/>
+    <w:nsid w:val="3B637BEA"/>
     <w:multiLevelType w:val="singleLevel"/>
     <w:tmpl w:val="04160001"/>
     <w:lvl w:ilvl="0">
@@ -24256,7 +24265,7 @@
     </w:lvl>
   </w:abstractNum>
   <w:abstractNum w:abstractNumId="17" w15:restartNumberingAfterBreak="0">
-    <w:nsid w:val="467B1DBB"/>
+    <w:nsid w:val="3FF02586"/>
     <w:multiLevelType w:val="singleLevel"/>
     <w:tmpl w:val="04160001"/>
     <w:lvl w:ilvl="0">
@@ -24273,7 +24282,7 @@
     </w:lvl>
   </w:abstractNum>
   <w:abstractNum w:abstractNumId="18" w15:restartNumberingAfterBreak="0">
-    <w:nsid w:val="478866DA"/>
+    <w:nsid w:val="486A5C36"/>
     <w:multiLevelType w:val="singleLevel"/>
     <w:tmpl w:val="04160001"/>
     <w:lvl w:ilvl="0">
@@ -24290,7 +24299,7 @@
     </w:lvl>
   </w:abstractNum>
   <w:abstractNum w:abstractNumId="19" w15:restartNumberingAfterBreak="0">
-    <w:nsid w:val="4D7B2977"/>
+    <w:nsid w:val="4905185D"/>
     <w:multiLevelType w:val="singleLevel"/>
     <w:tmpl w:val="04160001"/>
     <w:lvl w:ilvl="0">
@@ -24307,7 +24316,7 @@
     </w:lvl>
   </w:abstractNum>
   <w:abstractNum w:abstractNumId="20" w15:restartNumberingAfterBreak="0">
-    <w:nsid w:val="57AD6275"/>
+    <w:nsid w:val="4B6B193D"/>
     <w:multiLevelType w:val="singleLevel"/>
     <w:tmpl w:val="04160001"/>
     <w:lvl w:ilvl="0">
@@ -24324,7 +24333,7 @@
     </w:lvl>
   </w:abstractNum>
   <w:abstractNum w:abstractNumId="21" w15:restartNumberingAfterBreak="0">
-    <w:nsid w:val="58051237"/>
+    <w:nsid w:val="4E21010E"/>
     <w:multiLevelType w:val="singleLevel"/>
     <w:tmpl w:val="04160001"/>
     <w:lvl w:ilvl="0">
@@ -24341,7 +24350,7 @@
     </w:lvl>
   </w:abstractNum>
   <w:abstractNum w:abstractNumId="22" w15:restartNumberingAfterBreak="0">
-    <w:nsid w:val="60BB443E"/>
+    <w:nsid w:val="4F5B235E"/>
     <w:multiLevelType w:val="singleLevel"/>
     <w:tmpl w:val="04160001"/>
     <w:lvl w:ilvl="0">
@@ -24358,7 +24367,7 @@
     </w:lvl>
   </w:abstractNum>
   <w:abstractNum w:abstractNumId="23" w15:restartNumberingAfterBreak="0">
-    <w:nsid w:val="627623BE"/>
+    <w:nsid w:val="53C7479C"/>
     <w:multiLevelType w:val="singleLevel"/>
     <w:tmpl w:val="04160001"/>
     <w:lvl w:ilvl="0">
@@ -24375,7 +24384,7 @@
     </w:lvl>
   </w:abstractNum>
   <w:abstractNum w:abstractNumId="24" w15:restartNumberingAfterBreak="0">
-    <w:nsid w:val="676B3B4D"/>
+    <w:nsid w:val="54260023"/>
     <w:multiLevelType w:val="singleLevel"/>
     <w:tmpl w:val="04160001"/>
     <w:lvl w:ilvl="0">
@@ -24392,7 +24401,7 @@
     </w:lvl>
   </w:abstractNum>
   <w:abstractNum w:abstractNumId="25" w15:restartNumberingAfterBreak="0">
-    <w:nsid w:val="68EF5FA4"/>
+    <w:nsid w:val="597760EA"/>
     <w:multiLevelType w:val="singleLevel"/>
     <w:tmpl w:val="04160001"/>
     <w:lvl w:ilvl="0">
@@ -24409,7 +24418,7 @@
     </w:lvl>
   </w:abstractNum>
   <w:abstractNum w:abstractNumId="26" w15:restartNumberingAfterBreak="0">
-    <w:nsid w:val="6ADA7B52"/>
+    <w:nsid w:val="5EA11692"/>
     <w:multiLevelType w:val="singleLevel"/>
     <w:tmpl w:val="04160001"/>
     <w:lvl w:ilvl="0">
@@ -24426,7 +24435,7 @@
     </w:lvl>
   </w:abstractNum>
   <w:abstractNum w:abstractNumId="27" w15:restartNumberingAfterBreak="0">
-    <w:nsid w:val="6D595117"/>
+    <w:nsid w:val="6EE054B7"/>
     <w:multiLevelType w:val="singleLevel"/>
     <w:tmpl w:val="04160001"/>
     <w:lvl w:ilvl="0">
@@ -24443,7 +24452,7 @@
     </w:lvl>
   </w:abstractNum>
   <w:abstractNum w:abstractNumId="28" w15:restartNumberingAfterBreak="0">
-    <w:nsid w:val="6E1F59BC"/>
+    <w:nsid w:val="6F0D1AC5"/>
     <w:multiLevelType w:val="singleLevel"/>
     <w:tmpl w:val="04160001"/>
     <w:lvl w:ilvl="0">
@@ -24460,7 +24469,7 @@
     </w:lvl>
   </w:abstractNum>
   <w:abstractNum w:abstractNumId="29" w15:restartNumberingAfterBreak="0">
-    <w:nsid w:val="6FAE3D5B"/>
+    <w:nsid w:val="75447FBD"/>
     <w:multiLevelType w:val="singleLevel"/>
     <w:tmpl w:val="04160001"/>
     <w:lvl w:ilvl="0">
@@ -24477,7 +24486,7 @@
     </w:lvl>
   </w:abstractNum>
   <w:abstractNum w:abstractNumId="30" w15:restartNumberingAfterBreak="0">
-    <w:nsid w:val="74CA3603"/>
+    <w:nsid w:val="764B5AE2"/>
     <w:multiLevelType w:val="singleLevel"/>
     <w:tmpl w:val="04160001"/>
     <w:lvl w:ilvl="0">
@@ -24494,7 +24503,7 @@
     </w:lvl>
   </w:abstractNum>
   <w:abstractNum w:abstractNumId="31" w15:restartNumberingAfterBreak="0">
-    <w:nsid w:val="75EE06C4"/>
+    <w:nsid w:val="765F7E92"/>
     <w:multiLevelType w:val="singleLevel"/>
     <w:tmpl w:val="04160001"/>
     <w:lvl w:ilvl="0">
@@ -24511,7 +24520,7 @@
     </w:lvl>
   </w:abstractNum>
   <w:abstractNum w:abstractNumId="32" w15:restartNumberingAfterBreak="0">
-    <w:nsid w:val="769B7CC0"/>
+    <w:nsid w:val="776A7B06"/>
     <w:multiLevelType w:val="singleLevel"/>
     <w:tmpl w:val="04160001"/>
     <w:lvl w:ilvl="0">
@@ -24528,7 +24537,7 @@
     </w:lvl>
   </w:abstractNum>
   <w:abstractNum w:abstractNumId="33" w15:restartNumberingAfterBreak="0">
-    <w:nsid w:val="7DCA7219"/>
+    <w:nsid w:val="7F1107A3"/>
     <w:multiLevelType w:val="singleLevel"/>
     <w:tmpl w:val="04160001"/>
     <w:lvl w:ilvl="0">
@@ -24545,7 +24554,7 @@
     </w:lvl>
   </w:abstractNum>
   <w:abstractNum w:abstractNumId="34" w15:restartNumberingAfterBreak="0">
-    <w:nsid w:val="7EC76B62"/>
+    <w:nsid w:val="7F483B77"/>
     <w:multiLevelType w:val="singleLevel"/>
     <w:tmpl w:val="04160001"/>
     <w:lvl w:ilvl="0">
@@ -24561,110 +24570,110 @@
       </w:rPr>
     </w:lvl>
   </w:abstractNum>
-  <w:num w:numId="1" w16cid:durableId="1942910667">
+  <w:num w:numId="1" w16cid:durableId="286083553">
+    <w:abstractNumId w:val="2"/>
+  </w:num>
+  <w:num w:numId="2" w16cid:durableId="196433845">
+    <w:abstractNumId w:val="31"/>
+  </w:num>
+  <w:num w:numId="3" w16cid:durableId="2036616987">
+    <w:abstractNumId w:val="0"/>
+  </w:num>
+  <w:num w:numId="4" w16cid:durableId="1405252041">
+    <w:abstractNumId w:val="32"/>
+  </w:num>
+  <w:num w:numId="5" w16cid:durableId="1740178145">
+    <w:abstractNumId w:val="9"/>
+  </w:num>
+  <w:num w:numId="6" w16cid:durableId="1591112994">
+    <w:abstractNumId w:val="25"/>
+  </w:num>
+  <w:num w:numId="7" w16cid:durableId="1428696929">
+    <w:abstractNumId w:val="21"/>
+  </w:num>
+  <w:num w:numId="8" w16cid:durableId="625351012">
+    <w:abstractNumId w:val="22"/>
+  </w:num>
+  <w:num w:numId="9" w16cid:durableId="1150439646">
+    <w:abstractNumId w:val="12"/>
+  </w:num>
+  <w:num w:numId="10" w16cid:durableId="395203293">
+    <w:abstractNumId w:val="13"/>
+  </w:num>
+  <w:num w:numId="11" w16cid:durableId="19019005">
+    <w:abstractNumId w:val="3"/>
+  </w:num>
+  <w:num w:numId="12" w16cid:durableId="633684805">
+    <w:abstractNumId w:val="30"/>
+  </w:num>
+  <w:num w:numId="13" w16cid:durableId="1627814840">
+    <w:abstractNumId w:val="6"/>
+  </w:num>
+  <w:num w:numId="14" w16cid:durableId="455872353">
+    <w:abstractNumId w:val="15"/>
+  </w:num>
+  <w:num w:numId="15" w16cid:durableId="1904438356">
+    <w:abstractNumId w:val="4"/>
+  </w:num>
+  <w:num w:numId="16" w16cid:durableId="1301106320">
+    <w:abstractNumId w:val="17"/>
+  </w:num>
+  <w:num w:numId="17" w16cid:durableId="1005136504">
+    <w:abstractNumId w:val="27"/>
+  </w:num>
+  <w:num w:numId="18" w16cid:durableId="99183734">
+    <w:abstractNumId w:val="19"/>
+  </w:num>
+  <w:num w:numId="19" w16cid:durableId="752631513">
+    <w:abstractNumId w:val="24"/>
+  </w:num>
+  <w:num w:numId="20" w16cid:durableId="244150311">
+    <w:abstractNumId w:val="20"/>
+  </w:num>
+  <w:num w:numId="21" w16cid:durableId="1344160399">
+    <w:abstractNumId w:val="8"/>
+  </w:num>
+  <w:num w:numId="22" w16cid:durableId="1582837122">
+    <w:abstractNumId w:val="10"/>
+  </w:num>
+  <w:num w:numId="23" w16cid:durableId="603222710">
+    <w:abstractNumId w:val="34"/>
+  </w:num>
+  <w:num w:numId="24" w16cid:durableId="1610550454">
+    <w:abstractNumId w:val="26"/>
+  </w:num>
+  <w:num w:numId="25" w16cid:durableId="1104300551">
+    <w:abstractNumId w:val="16"/>
+  </w:num>
+  <w:num w:numId="26" w16cid:durableId="774448551">
+    <w:abstractNumId w:val="11"/>
+  </w:num>
+  <w:num w:numId="27" w16cid:durableId="952175233">
     <w:abstractNumId w:val="5"/>
   </w:num>
-  <w:num w:numId="2" w16cid:durableId="349137830">
-    <w:abstractNumId w:val="4"/>
+  <w:num w:numId="28" w16cid:durableId="616646770">
+    <w:abstractNumId w:val="29"/>
   </w:num>
-  <w:num w:numId="3" w16cid:durableId="1523862937">
-    <w:abstractNumId w:val="12"/>
+  <w:num w:numId="29" w16cid:durableId="643510878">
+    <w:abstractNumId w:val="33"/>
   </w:num>
-  <w:num w:numId="4" w16cid:durableId="1448504673">
-    <w:abstractNumId w:val="27"/>
+  <w:num w:numId="30" w16cid:durableId="40709669">
+    <w:abstractNumId w:val="28"/>
   </w:num>
-  <w:num w:numId="5" w16cid:durableId="1058623592">
+  <w:num w:numId="31" w16cid:durableId="1089036708">
+    <w:abstractNumId w:val="1"/>
+  </w:num>
+  <w:num w:numId="32" w16cid:durableId="446631481">
     <w:abstractNumId w:val="23"/>
   </w:num>
-  <w:num w:numId="6" w16cid:durableId="38017070">
-    <w:abstractNumId w:val="20"/>
-  </w:num>
-  <w:num w:numId="7" w16cid:durableId="1723603471">
-    <w:abstractNumId w:val="30"/>
-  </w:num>
-  <w:num w:numId="8" w16cid:durableId="782504139">
-    <w:abstractNumId w:val="34"/>
-  </w:num>
-  <w:num w:numId="9" w16cid:durableId="1351295577">
-    <w:abstractNumId w:val="25"/>
-  </w:num>
-  <w:num w:numId="10" w16cid:durableId="291592455">
-    <w:abstractNumId w:val="10"/>
-  </w:num>
-  <w:num w:numId="11" w16cid:durableId="301156292">
-    <w:abstractNumId w:val="29"/>
-  </w:num>
-  <w:num w:numId="12" w16cid:durableId="632517308">
-    <w:abstractNumId w:val="32"/>
-  </w:num>
-  <w:num w:numId="13" w16cid:durableId="1072696826">
-    <w:abstractNumId w:val="28"/>
-  </w:num>
-  <w:num w:numId="14" w16cid:durableId="921717392">
-    <w:abstractNumId w:val="17"/>
-  </w:num>
-  <w:num w:numId="15" w16cid:durableId="1192376984">
-    <w:abstractNumId w:val="0"/>
-  </w:num>
-  <w:num w:numId="16" w16cid:durableId="636448963">
-    <w:abstractNumId w:val="14"/>
-  </w:num>
-  <w:num w:numId="17" w16cid:durableId="1454901437">
-    <w:abstractNumId w:val="33"/>
-  </w:num>
-  <w:num w:numId="18" w16cid:durableId="156262861">
+  <w:num w:numId="33" w16cid:durableId="278993742">
     <w:abstractNumId w:val="18"/>
   </w:num>
-  <w:num w:numId="19" w16cid:durableId="239365165">
-    <w:abstractNumId w:val="16"/>
-  </w:num>
-  <w:num w:numId="20" w16cid:durableId="1439178541">
-    <w:abstractNumId w:val="15"/>
-  </w:num>
-  <w:num w:numId="21" w16cid:durableId="1136534700">
-    <w:abstractNumId w:val="2"/>
-  </w:num>
-  <w:num w:numId="22" w16cid:durableId="2012098216">
-    <w:abstractNumId w:val="6"/>
-  </w:num>
-  <w:num w:numId="23" w16cid:durableId="2090417110">
-    <w:abstractNumId w:val="11"/>
-  </w:num>
-  <w:num w:numId="24" w16cid:durableId="630402403">
-    <w:abstractNumId w:val="24"/>
-  </w:num>
-  <w:num w:numId="25" w16cid:durableId="183515678">
-    <w:abstractNumId w:val="13"/>
-  </w:num>
-  <w:num w:numId="26" w16cid:durableId="975137329">
-    <w:abstractNumId w:val="3"/>
-  </w:num>
-  <w:num w:numId="27" w16cid:durableId="10110447">
+  <w:num w:numId="34" w16cid:durableId="932518206">
     <w:abstractNumId w:val="7"/>
   </w:num>
-  <w:num w:numId="28" w16cid:durableId="283775716">
-    <w:abstractNumId w:val="26"/>
-  </w:num>
-  <w:num w:numId="29" w16cid:durableId="350421665">
-    <w:abstractNumId w:val="1"/>
-  </w:num>
-  <w:num w:numId="30" w16cid:durableId="104546407">
-    <w:abstractNumId w:val="22"/>
-  </w:num>
-  <w:num w:numId="31" w16cid:durableId="964577648">
-    <w:abstractNumId w:val="8"/>
-  </w:num>
-  <w:num w:numId="32" w16cid:durableId="1638947791">
-    <w:abstractNumId w:val="21"/>
-  </w:num>
-  <w:num w:numId="33" w16cid:durableId="55905559">
-    <w:abstractNumId w:val="19"/>
-  </w:num>
-  <w:num w:numId="34" w16cid:durableId="908030926">
-    <w:abstractNumId w:val="31"/>
-  </w:num>
-  <w:num w:numId="35" w16cid:durableId="360401678">
-    <w:abstractNumId w:val="9"/>
+  <w:num w:numId="35" w16cid:durableId="2084834615">
+    <w:abstractNumId w:val="14"/>
   </w:num>
 </w:numbering>
 </file>
@@ -25077,7 +25086,7 @@
     <w:link w:val="Ttulo1Char"/>
     <w:uiPriority w:val="9"/>
     <w:qFormat/>
-    <w:rsid w:val="00742FC8"/>
+    <w:rsid w:val="00773BB4"/>
     <w:pPr>
       <w:keepNext/>
       <w:keepLines/>
@@ -25099,7 +25108,7 @@
     <w:uiPriority w:val="9"/>
     <w:unhideWhenUsed/>
     <w:qFormat/>
-    <w:rsid w:val="00742FC8"/>
+    <w:rsid w:val="00773BB4"/>
     <w:pPr>
       <w:keepNext/>
       <w:keepLines/>
@@ -25122,7 +25131,7 @@
     <w:semiHidden/>
     <w:unhideWhenUsed/>
     <w:qFormat/>
-    <w:rsid w:val="00742FC8"/>
+    <w:rsid w:val="00773BB4"/>
     <w:pPr>
       <w:keepNext/>
       <w:keepLines/>
@@ -25145,7 +25154,7 @@
     <w:semiHidden/>
     <w:unhideWhenUsed/>
     <w:qFormat/>
-    <w:rsid w:val="00742FC8"/>
+    <w:rsid w:val="00773BB4"/>
     <w:pPr>
       <w:keepNext/>
       <w:keepLines/>
@@ -25168,7 +25177,7 @@
     <w:semiHidden/>
     <w:unhideWhenUsed/>
     <w:qFormat/>
-    <w:rsid w:val="00742FC8"/>
+    <w:rsid w:val="00773BB4"/>
     <w:pPr>
       <w:keepNext/>
       <w:keepLines/>
@@ -25189,7 +25198,7 @@
     <w:semiHidden/>
     <w:unhideWhenUsed/>
     <w:qFormat/>
-    <w:rsid w:val="00742FC8"/>
+    <w:rsid w:val="00773BB4"/>
     <w:pPr>
       <w:keepNext/>
       <w:keepLines/>
@@ -25212,7 +25221,7 @@
     <w:semiHidden/>
     <w:unhideWhenUsed/>
     <w:qFormat/>
-    <w:rsid w:val="00742FC8"/>
+    <w:rsid w:val="00773BB4"/>
     <w:pPr>
       <w:keepNext/>
       <w:keepLines/>
@@ -25233,7 +25242,7 @@
     <w:semiHidden/>
     <w:unhideWhenUsed/>
     <w:qFormat/>
-    <w:rsid w:val="00742FC8"/>
+    <w:rsid w:val="00773BB4"/>
     <w:pPr>
       <w:keepNext/>
       <w:keepLines/>
@@ -25256,7 +25265,7 @@
     <w:semiHidden/>
     <w:unhideWhenUsed/>
     <w:qFormat/>
-    <w:rsid w:val="00742FC8"/>
+    <w:rsid w:val="00773BB4"/>
     <w:pPr>
       <w:keepNext/>
       <w:keepLines/>
@@ -25300,7 +25309,7 @@
     <w:basedOn w:val="Fontepargpadro"/>
     <w:link w:val="Ttulo1"/>
     <w:uiPriority w:val="9"/>
-    <w:rsid w:val="00742FC8"/>
+    <w:rsid w:val="00773BB4"/>
     <w:rPr>
       <w:rFonts w:asciiTheme="majorHAnsi" w:eastAsiaTheme="majorEastAsia" w:hAnsiTheme="majorHAnsi" w:cstheme="majorBidi"/>
       <w:color w:val="0F4761" w:themeColor="accent1" w:themeShade="BF"/>
@@ -25313,7 +25322,7 @@
     <w:basedOn w:val="Fontepargpadro"/>
     <w:link w:val="Ttulo2"/>
     <w:uiPriority w:val="9"/>
-    <w:rsid w:val="00742FC8"/>
+    <w:rsid w:val="00773BB4"/>
     <w:rPr>
       <w:rFonts w:asciiTheme="majorHAnsi" w:eastAsiaTheme="majorEastAsia" w:hAnsiTheme="majorHAnsi" w:cstheme="majorBidi"/>
       <w:color w:val="0F4761" w:themeColor="accent1" w:themeShade="BF"/>
@@ -25327,7 +25336,7 @@
     <w:link w:val="Ttulo3"/>
     <w:uiPriority w:val="9"/>
     <w:semiHidden/>
-    <w:rsid w:val="00742FC8"/>
+    <w:rsid w:val="00773BB4"/>
     <w:rPr>
       <w:rFonts w:eastAsiaTheme="majorEastAsia" w:cstheme="majorBidi"/>
       <w:color w:val="0F4761" w:themeColor="accent1" w:themeShade="BF"/>
@@ -25341,7 +25350,7 @@
     <w:link w:val="Ttulo4"/>
     <w:uiPriority w:val="9"/>
     <w:semiHidden/>
-    <w:rsid w:val="00742FC8"/>
+    <w:rsid w:val="00773BB4"/>
     <w:rPr>
       <w:rFonts w:eastAsiaTheme="majorEastAsia" w:cstheme="majorBidi"/>
       <w:i/>
@@ -25355,7 +25364,7 @@
     <w:link w:val="Ttulo5"/>
     <w:uiPriority w:val="9"/>
     <w:semiHidden/>
-    <w:rsid w:val="00742FC8"/>
+    <w:rsid w:val="00773BB4"/>
     <w:rPr>
       <w:rFonts w:eastAsiaTheme="majorEastAsia" w:cstheme="majorBidi"/>
       <w:color w:val="0F4761" w:themeColor="accent1" w:themeShade="BF"/>
@@ -25367,7 +25376,7 @@
     <w:link w:val="Ttulo6"/>
     <w:uiPriority w:val="9"/>
     <w:semiHidden/>
-    <w:rsid w:val="00742FC8"/>
+    <w:rsid w:val="00773BB4"/>
     <w:rPr>
       <w:rFonts w:eastAsiaTheme="majorEastAsia" w:cstheme="majorBidi"/>
       <w:i/>
@@ -25381,7 +25390,7 @@
     <w:link w:val="Ttulo7"/>
     <w:uiPriority w:val="9"/>
     <w:semiHidden/>
-    <w:rsid w:val="00742FC8"/>
+    <w:rsid w:val="00773BB4"/>
     <w:rPr>
       <w:rFonts w:eastAsiaTheme="majorEastAsia" w:cstheme="majorBidi"/>
       <w:color w:val="595959" w:themeColor="text1" w:themeTint="A6"/>
@@ -25393,7 +25402,7 @@
     <w:link w:val="Ttulo8"/>
     <w:uiPriority w:val="9"/>
     <w:semiHidden/>
-    <w:rsid w:val="00742FC8"/>
+    <w:rsid w:val="00773BB4"/>
     <w:rPr>
       <w:rFonts w:eastAsiaTheme="majorEastAsia" w:cstheme="majorBidi"/>
       <w:i/>
@@ -25407,7 +25416,7 @@
     <w:link w:val="Ttulo9"/>
     <w:uiPriority w:val="9"/>
     <w:semiHidden/>
-    <w:rsid w:val="00742FC8"/>
+    <w:rsid w:val="00773BB4"/>
     <w:rPr>
       <w:rFonts w:eastAsiaTheme="majorEastAsia" w:cstheme="majorBidi"/>
       <w:color w:val="272727" w:themeColor="text1" w:themeTint="D8"/>
@@ -25420,7 +25429,7 @@
     <w:link w:val="TtuloChar"/>
     <w:uiPriority w:val="10"/>
     <w:qFormat/>
-    <w:rsid w:val="00742FC8"/>
+    <w:rsid w:val="00773BB4"/>
     <w:pPr>
       <w:spacing w:after="80" w:line="240" w:lineRule="auto"/>
       <w:contextualSpacing/>
@@ -25438,7 +25447,7 @@
     <w:basedOn w:val="Fontepargpadro"/>
     <w:link w:val="Ttulo"/>
     <w:uiPriority w:val="10"/>
-    <w:rsid w:val="00742FC8"/>
+    <w:rsid w:val="00773BB4"/>
     <w:rPr>
       <w:rFonts w:asciiTheme="majorHAnsi" w:eastAsiaTheme="majorEastAsia" w:hAnsiTheme="majorHAnsi" w:cstheme="majorBidi"/>
       <w:spacing w:val="-10"/>
@@ -25454,7 +25463,7 @@
     <w:link w:val="SubttuloChar"/>
     <w:uiPriority w:val="11"/>
     <w:qFormat/>
-    <w:rsid w:val="00742FC8"/>
+    <w:rsid w:val="00773BB4"/>
     <w:pPr>
       <w:numPr>
         <w:ilvl w:val="1"/>
@@ -25473,7 +25482,7 @@
     <w:basedOn w:val="Fontepargpadro"/>
     <w:link w:val="Subttulo"/>
     <w:uiPriority w:val="11"/>
-    <w:rsid w:val="00742FC8"/>
+    <w:rsid w:val="00773BB4"/>
     <w:rPr>
       <w:rFonts w:eastAsiaTheme="majorEastAsia" w:cstheme="majorBidi"/>
       <w:color w:val="595959" w:themeColor="text1" w:themeTint="A6"/>
@@ -25489,7 +25498,7 @@
     <w:link w:val="CitaoChar"/>
     <w:uiPriority w:val="29"/>
     <w:qFormat/>
-    <w:rsid w:val="00742FC8"/>
+    <w:rsid w:val="00773BB4"/>
     <w:pPr>
       <w:spacing w:before="160"/>
       <w:jc w:val="center"/>
@@ -25505,7 +25514,7 @@
     <w:basedOn w:val="Fontepargpadro"/>
     <w:link w:val="Citao"/>
     <w:uiPriority w:val="29"/>
-    <w:rsid w:val="00742FC8"/>
+    <w:rsid w:val="00773BB4"/>
     <w:rPr>
       <w:i/>
       <w:iCs/>
@@ -25517,7 +25526,7 @@
     <w:basedOn w:val="Normal"/>
     <w:uiPriority w:val="34"/>
     <w:qFormat/>
-    <w:rsid w:val="00742FC8"/>
+    <w:rsid w:val="00773BB4"/>
     <w:pPr>
       <w:ind w:left="720"/>
       <w:contextualSpacing/>
@@ -25528,7 +25537,7 @@
     <w:basedOn w:val="Fontepargpadro"/>
     <w:uiPriority w:val="21"/>
     <w:qFormat/>
-    <w:rsid w:val="00742FC8"/>
+    <w:rsid w:val="00773BB4"/>
     <w:rPr>
       <w:i/>
       <w:iCs/>
@@ -25542,7 +25551,7 @@
     <w:link w:val="CitaoIntensaChar"/>
     <w:uiPriority w:val="30"/>
     <w:qFormat/>
-    <w:rsid w:val="00742FC8"/>
+    <w:rsid w:val="00773BB4"/>
     <w:pPr>
       <w:pBdr>
         <w:top w:val="single" w:sz="4" w:space="10" w:color="0F4761" w:themeColor="accent1" w:themeShade="BF"/>
@@ -25563,7 +25572,7 @@
     <w:basedOn w:val="Fontepargpadro"/>
     <w:link w:val="CitaoIntensa"/>
     <w:uiPriority w:val="30"/>
-    <w:rsid w:val="00742FC8"/>
+    <w:rsid w:val="00773BB4"/>
     <w:rPr>
       <w:i/>
       <w:iCs/>
@@ -25575,7 +25584,7 @@
     <w:basedOn w:val="Fontepargpadro"/>
     <w:uiPriority w:val="32"/>
     <w:qFormat/>
-    <w:rsid w:val="00742FC8"/>
+    <w:rsid w:val="00773BB4"/>
     <w:rPr>
       <w:b/>
       <w:bCs/>
@@ -25590,7 +25599,7 @@
     <w:link w:val="CabealhoChar"/>
     <w:uiPriority w:val="99"/>
     <w:unhideWhenUsed/>
-    <w:rsid w:val="00742FC8"/>
+    <w:rsid w:val="00773BB4"/>
     <w:pPr>
       <w:tabs>
         <w:tab w:val="center" w:pos="4252"/>
@@ -25604,7 +25613,7 @@
     <w:basedOn w:val="Fontepargpadro"/>
     <w:link w:val="Cabealho"/>
     <w:uiPriority w:val="99"/>
-    <w:rsid w:val="00742FC8"/>
+    <w:rsid w:val="00773BB4"/>
   </w:style>
   <w:style w:type="paragraph" w:styleId="Rodap">
     <w:name w:val="footer"/>
@@ -25612,7 +25621,7 @@
     <w:link w:val="RodapChar"/>
     <w:uiPriority w:val="99"/>
     <w:unhideWhenUsed/>
-    <w:rsid w:val="00742FC8"/>
+    <w:rsid w:val="00773BB4"/>
     <w:pPr>
       <w:tabs>
         <w:tab w:val="center" w:pos="4252"/>
@@ -25626,7 +25635,7 @@
     <w:basedOn w:val="Fontepargpadro"/>
     <w:link w:val="Rodap"/>
     <w:uiPriority w:val="99"/>
-    <w:rsid w:val="00742FC8"/>
+    <w:rsid w:val="00773BB4"/>
   </w:style>
   <w:style w:type="paragraph" w:styleId="Sumrio1">
     <w:name w:val="toc 1"/>
@@ -25635,7 +25644,7 @@
     <w:autoRedefine/>
     <w:uiPriority w:val="39"/>
     <w:unhideWhenUsed/>
-    <w:rsid w:val="00742FC8"/>
+    <w:rsid w:val="00773BB4"/>
     <w:pPr>
       <w:spacing w:after="100"/>
     </w:pPr>
@@ -25647,7 +25656,7 @@
     <w:autoRedefine/>
     <w:uiPriority w:val="39"/>
     <w:unhideWhenUsed/>
-    <w:rsid w:val="00742FC8"/>
+    <w:rsid w:val="00773BB4"/>
     <w:pPr>
       <w:spacing w:after="100"/>
       <w:ind w:left="240"/>

</xml_diff>

<commit_message>
Sincroniza com a produção — mesclagem por item no Relatório de Situação e no Relatório de Entregas
Co-Authored-By: Claude Sonnet 5 <noreply@anthropic.com>
</commit_message>
<xml_diff>
--- a/Manual de Uso - Ferramenta de Gestao de Projetos.docx
+++ b/Manual de Uso - Ferramenta de Gestao de Projetos.docx
@@ -229,7 +229,7 @@
         <w:rPr>
           <w:noProof/>
         </w:rPr>
-        <w:instrText xml:space="preserve"> PAGEREF _Toc240290717 \h </w:instrText>
+        <w:instrText xml:space="preserve"> PAGEREF _Toc240294641 \h </w:instrText>
       </w:r>
       <w:r>
         <w:rPr>
@@ -290,7 +290,7 @@
         <w:rPr>
           <w:noProof/>
         </w:rPr>
-        <w:instrText xml:space="preserve"> PAGEREF _Toc240290718 \h </w:instrText>
+        <w:instrText xml:space="preserve"> PAGEREF _Toc240294642 \h </w:instrText>
       </w:r>
       <w:r>
         <w:rPr>
@@ -351,7 +351,7 @@
         <w:rPr>
           <w:noProof/>
         </w:rPr>
-        <w:instrText xml:space="preserve"> PAGEREF _Toc240290719 \h </w:instrText>
+        <w:instrText xml:space="preserve"> PAGEREF _Toc240294643 \h </w:instrText>
       </w:r>
       <w:r>
         <w:rPr>
@@ -412,7 +412,7 @@
         <w:rPr>
           <w:noProof/>
         </w:rPr>
-        <w:instrText xml:space="preserve"> PAGEREF _Toc240290720 \h </w:instrText>
+        <w:instrText xml:space="preserve"> PAGEREF _Toc240294644 \h </w:instrText>
       </w:r>
       <w:r>
         <w:rPr>
@@ -473,7 +473,7 @@
         <w:rPr>
           <w:noProof/>
         </w:rPr>
-        <w:instrText xml:space="preserve"> PAGEREF _Toc240290721 \h </w:instrText>
+        <w:instrText xml:space="preserve"> PAGEREF _Toc240294645 \h </w:instrText>
       </w:r>
       <w:r>
         <w:rPr>
@@ -534,7 +534,7 @@
         <w:rPr>
           <w:noProof/>
         </w:rPr>
-        <w:instrText xml:space="preserve"> PAGEREF _Toc240290722 \h </w:instrText>
+        <w:instrText xml:space="preserve"> PAGEREF _Toc240294646 \h </w:instrText>
       </w:r>
       <w:r>
         <w:rPr>
@@ -595,7 +595,7 @@
         <w:rPr>
           <w:noProof/>
         </w:rPr>
-        <w:instrText xml:space="preserve"> PAGEREF _Toc240290723 \h </w:instrText>
+        <w:instrText xml:space="preserve"> PAGEREF _Toc240294647 \h </w:instrText>
       </w:r>
       <w:r>
         <w:rPr>
@@ -656,7 +656,7 @@
         <w:rPr>
           <w:noProof/>
         </w:rPr>
-        <w:instrText xml:space="preserve"> PAGEREF _Toc240290724 \h </w:instrText>
+        <w:instrText xml:space="preserve"> PAGEREF _Toc240294648 \h </w:instrText>
       </w:r>
       <w:r>
         <w:rPr>
@@ -717,7 +717,7 @@
         <w:rPr>
           <w:noProof/>
         </w:rPr>
-        <w:instrText xml:space="preserve"> PAGEREF _Toc240290725 \h </w:instrText>
+        <w:instrText xml:space="preserve"> PAGEREF _Toc240294649 \h </w:instrText>
       </w:r>
       <w:r>
         <w:rPr>
@@ -778,7 +778,7 @@
         <w:rPr>
           <w:noProof/>
         </w:rPr>
-        <w:instrText xml:space="preserve"> PAGEREF _Toc240290726 \h </w:instrText>
+        <w:instrText xml:space="preserve"> PAGEREF _Toc240294650 \h </w:instrText>
       </w:r>
       <w:r>
         <w:rPr>
@@ -839,7 +839,7 @@
         <w:rPr>
           <w:noProof/>
         </w:rPr>
-        <w:instrText xml:space="preserve"> PAGEREF _Toc240290727 \h </w:instrText>
+        <w:instrText xml:space="preserve"> PAGEREF _Toc240294651 \h </w:instrText>
       </w:r>
       <w:r>
         <w:rPr>
@@ -900,7 +900,7 @@
         <w:rPr>
           <w:noProof/>
         </w:rPr>
-        <w:instrText xml:space="preserve"> PAGEREF _Toc240290728 \h </w:instrText>
+        <w:instrText xml:space="preserve"> PAGEREF _Toc240294652 \h </w:instrText>
       </w:r>
       <w:r>
         <w:rPr>
@@ -961,7 +961,7 @@
         <w:rPr>
           <w:noProof/>
         </w:rPr>
-        <w:instrText xml:space="preserve"> PAGEREF _Toc240290729 \h </w:instrText>
+        <w:instrText xml:space="preserve"> PAGEREF _Toc240294653 \h </w:instrText>
       </w:r>
       <w:r>
         <w:rPr>
@@ -1022,7 +1022,7 @@
         <w:rPr>
           <w:noProof/>
         </w:rPr>
-        <w:instrText xml:space="preserve"> PAGEREF _Toc240290730 \h </w:instrText>
+        <w:instrText xml:space="preserve"> PAGEREF _Toc240294654 \h </w:instrText>
       </w:r>
       <w:r>
         <w:rPr>
@@ -1083,7 +1083,7 @@
         <w:rPr>
           <w:noProof/>
         </w:rPr>
-        <w:instrText xml:space="preserve"> PAGEREF _Toc240290731 \h </w:instrText>
+        <w:instrText xml:space="preserve"> PAGEREF _Toc240294655 \h </w:instrText>
       </w:r>
       <w:r>
         <w:rPr>
@@ -1144,7 +1144,7 @@
         <w:rPr>
           <w:noProof/>
         </w:rPr>
-        <w:instrText xml:space="preserve"> PAGEREF _Toc240290732 \h </w:instrText>
+        <w:instrText xml:space="preserve"> PAGEREF _Toc240294656 \h </w:instrText>
       </w:r>
       <w:r>
         <w:rPr>
@@ -1205,7 +1205,7 @@
         <w:rPr>
           <w:noProof/>
         </w:rPr>
-        <w:instrText xml:space="preserve"> PAGEREF _Toc240290733 \h </w:instrText>
+        <w:instrText xml:space="preserve"> PAGEREF _Toc240294657 \h </w:instrText>
       </w:r>
       <w:r>
         <w:rPr>
@@ -1266,7 +1266,7 @@
         <w:rPr>
           <w:noProof/>
         </w:rPr>
-        <w:instrText xml:space="preserve"> PAGEREF _Toc240290734 \h </w:instrText>
+        <w:instrText xml:space="preserve"> PAGEREF _Toc240294658 \h </w:instrText>
       </w:r>
       <w:r>
         <w:rPr>
@@ -1327,7 +1327,7 @@
         <w:rPr>
           <w:noProof/>
         </w:rPr>
-        <w:instrText xml:space="preserve"> PAGEREF _Toc240290735 \h </w:instrText>
+        <w:instrText xml:space="preserve"> PAGEREF _Toc240294659 \h </w:instrText>
       </w:r>
       <w:r>
         <w:rPr>
@@ -1388,7 +1388,7 @@
         <w:rPr>
           <w:noProof/>
         </w:rPr>
-        <w:instrText xml:space="preserve"> PAGEREF _Toc240290736 \h </w:instrText>
+        <w:instrText xml:space="preserve"> PAGEREF _Toc240294660 \h </w:instrText>
       </w:r>
       <w:r>
         <w:rPr>
@@ -1449,7 +1449,7 @@
         <w:rPr>
           <w:noProof/>
         </w:rPr>
-        <w:instrText xml:space="preserve"> PAGEREF _Toc240290737 \h </w:instrText>
+        <w:instrText xml:space="preserve"> PAGEREF _Toc240294661 \h </w:instrText>
       </w:r>
       <w:r>
         <w:rPr>
@@ -1510,7 +1510,7 @@
         <w:rPr>
           <w:noProof/>
         </w:rPr>
-        <w:instrText xml:space="preserve"> PAGEREF _Toc240290738 \h </w:instrText>
+        <w:instrText xml:space="preserve"> PAGEREF _Toc240294662 \h </w:instrText>
       </w:r>
       <w:r>
         <w:rPr>
@@ -1571,7 +1571,7 @@
         <w:rPr>
           <w:noProof/>
         </w:rPr>
-        <w:instrText xml:space="preserve"> PAGEREF _Toc240290739 \h </w:instrText>
+        <w:instrText xml:space="preserve"> PAGEREF _Toc240294663 \h </w:instrText>
       </w:r>
       <w:r>
         <w:rPr>
@@ -1632,7 +1632,7 @@
         <w:rPr>
           <w:noProof/>
         </w:rPr>
-        <w:instrText xml:space="preserve"> PAGEREF _Toc240290740 \h </w:instrText>
+        <w:instrText xml:space="preserve"> PAGEREF _Toc240294664 \h </w:instrText>
       </w:r>
       <w:r>
         <w:rPr>
@@ -1693,7 +1693,7 @@
         <w:rPr>
           <w:noProof/>
         </w:rPr>
-        <w:instrText xml:space="preserve"> PAGEREF _Toc240290741 \h </w:instrText>
+        <w:instrText xml:space="preserve"> PAGEREF _Toc240294665 \h </w:instrText>
       </w:r>
       <w:r>
         <w:rPr>
@@ -1755,7 +1755,7 @@
         <w:rPr>
           <w:noProof/>
         </w:rPr>
-        <w:instrText xml:space="preserve"> PAGEREF _Toc240290742 \h </w:instrText>
+        <w:instrText xml:space="preserve"> PAGEREF _Toc240294666 \h </w:instrText>
       </w:r>
       <w:r>
         <w:rPr>
@@ -1816,7 +1816,7 @@
         <w:rPr>
           <w:noProof/>
         </w:rPr>
-        <w:instrText xml:space="preserve"> PAGEREF _Toc240290743 \h </w:instrText>
+        <w:instrText xml:space="preserve"> PAGEREF _Toc240294667 \h </w:instrText>
       </w:r>
       <w:r>
         <w:rPr>
@@ -1877,7 +1877,7 @@
         <w:rPr>
           <w:noProof/>
         </w:rPr>
-        <w:instrText xml:space="preserve"> PAGEREF _Toc240290744 \h </w:instrText>
+        <w:instrText xml:space="preserve"> PAGEREF _Toc240294668 \h </w:instrText>
       </w:r>
       <w:r>
         <w:rPr>
@@ -1938,7 +1938,7 @@
         <w:rPr>
           <w:noProof/>
         </w:rPr>
-        <w:instrText xml:space="preserve"> PAGEREF _Toc240290745 \h </w:instrText>
+        <w:instrText xml:space="preserve"> PAGEREF _Toc240294669 \h </w:instrText>
       </w:r>
       <w:r>
         <w:rPr>
@@ -1999,7 +1999,7 @@
         <w:rPr>
           <w:noProof/>
         </w:rPr>
-        <w:instrText xml:space="preserve"> PAGEREF _Toc240290746 \h </w:instrText>
+        <w:instrText xml:space="preserve"> PAGEREF _Toc240294670 \h </w:instrText>
       </w:r>
       <w:r>
         <w:rPr>
@@ -2060,7 +2060,7 @@
         <w:rPr>
           <w:noProof/>
         </w:rPr>
-        <w:instrText xml:space="preserve"> PAGEREF _Toc240290747 \h </w:instrText>
+        <w:instrText xml:space="preserve"> PAGEREF _Toc240294671 \h </w:instrText>
       </w:r>
       <w:r>
         <w:rPr>
@@ -2121,7 +2121,7 @@
         <w:rPr>
           <w:noProof/>
         </w:rPr>
-        <w:instrText xml:space="preserve"> PAGEREF _Toc240290748 \h </w:instrText>
+        <w:instrText xml:space="preserve"> PAGEREF _Toc240294672 \h </w:instrText>
       </w:r>
       <w:r>
         <w:rPr>
@@ -2182,7 +2182,7 @@
         <w:rPr>
           <w:noProof/>
         </w:rPr>
-        <w:instrText xml:space="preserve"> PAGEREF _Toc240290749 \h </w:instrText>
+        <w:instrText xml:space="preserve"> PAGEREF _Toc240294673 \h </w:instrText>
       </w:r>
       <w:r>
         <w:rPr>
@@ -2243,7 +2243,7 @@
         <w:rPr>
           <w:noProof/>
         </w:rPr>
-        <w:instrText xml:space="preserve"> PAGEREF _Toc240290750 \h </w:instrText>
+        <w:instrText xml:space="preserve"> PAGEREF _Toc240294674 \h </w:instrText>
       </w:r>
       <w:r>
         <w:rPr>
@@ -2304,7 +2304,7 @@
         <w:rPr>
           <w:noProof/>
         </w:rPr>
-        <w:instrText xml:space="preserve"> PAGEREF _Toc240290751 \h </w:instrText>
+        <w:instrText xml:space="preserve"> PAGEREF _Toc240294675 \h </w:instrText>
       </w:r>
       <w:r>
         <w:rPr>
@@ -2365,7 +2365,7 @@
         <w:rPr>
           <w:noProof/>
         </w:rPr>
-        <w:instrText xml:space="preserve"> PAGEREF _Toc240290752 \h </w:instrText>
+        <w:instrText xml:space="preserve"> PAGEREF _Toc240294676 \h </w:instrText>
       </w:r>
       <w:r>
         <w:rPr>
@@ -2426,7 +2426,7 @@
         <w:rPr>
           <w:noProof/>
         </w:rPr>
-        <w:instrText xml:space="preserve"> PAGEREF _Toc240290753 \h </w:instrText>
+        <w:instrText xml:space="preserve"> PAGEREF _Toc240294677 \h </w:instrText>
       </w:r>
       <w:r>
         <w:rPr>
@@ -2487,7 +2487,7 @@
         <w:rPr>
           <w:noProof/>
         </w:rPr>
-        <w:instrText xml:space="preserve"> PAGEREF _Toc240290754 \h </w:instrText>
+        <w:instrText xml:space="preserve"> PAGEREF _Toc240294678 \h </w:instrText>
       </w:r>
       <w:r>
         <w:rPr>
@@ -2548,7 +2548,7 @@
         <w:rPr>
           <w:noProof/>
         </w:rPr>
-        <w:instrText xml:space="preserve"> PAGEREF _Toc240290755 \h </w:instrText>
+        <w:instrText xml:space="preserve"> PAGEREF _Toc240294679 \h </w:instrText>
       </w:r>
       <w:r>
         <w:rPr>
@@ -2609,7 +2609,7 @@
         <w:rPr>
           <w:noProof/>
         </w:rPr>
-        <w:instrText xml:space="preserve"> PAGEREF _Toc240290756 \h </w:instrText>
+        <w:instrText xml:space="preserve"> PAGEREF _Toc240294680 \h </w:instrText>
       </w:r>
       <w:r>
         <w:rPr>
@@ -2670,7 +2670,7 @@
         <w:rPr>
           <w:noProof/>
         </w:rPr>
-        <w:instrText xml:space="preserve"> PAGEREF _Toc240290757 \h </w:instrText>
+        <w:instrText xml:space="preserve"> PAGEREF _Toc240294681 \h </w:instrText>
       </w:r>
       <w:r>
         <w:rPr>
@@ -2731,7 +2731,7 @@
         <w:rPr>
           <w:noProof/>
         </w:rPr>
-        <w:instrText xml:space="preserve"> PAGEREF _Toc240290758 \h </w:instrText>
+        <w:instrText xml:space="preserve"> PAGEREF _Toc240294682 \h </w:instrText>
       </w:r>
       <w:r>
         <w:rPr>
@@ -2792,7 +2792,7 @@
         <w:rPr>
           <w:noProof/>
         </w:rPr>
-        <w:instrText xml:space="preserve"> PAGEREF _Toc240290759 \h </w:instrText>
+        <w:instrText xml:space="preserve"> PAGEREF _Toc240294683 \h </w:instrText>
       </w:r>
       <w:r>
         <w:rPr>
@@ -2853,7 +2853,7 @@
         <w:rPr>
           <w:noProof/>
         </w:rPr>
-        <w:instrText xml:space="preserve"> PAGEREF _Toc240290760 \h </w:instrText>
+        <w:instrText xml:space="preserve"> PAGEREF _Toc240294684 \h </w:instrText>
       </w:r>
       <w:r>
         <w:rPr>
@@ -2914,7 +2914,7 @@
         <w:rPr>
           <w:noProof/>
         </w:rPr>
-        <w:instrText xml:space="preserve"> PAGEREF _Toc240290761 \h </w:instrText>
+        <w:instrText xml:space="preserve"> PAGEREF _Toc240294685 \h </w:instrText>
       </w:r>
       <w:r>
         <w:rPr>
@@ -2975,7 +2975,7 @@
         <w:rPr>
           <w:noProof/>
         </w:rPr>
-        <w:instrText xml:space="preserve"> PAGEREF _Toc240290762 \h </w:instrText>
+        <w:instrText xml:space="preserve"> PAGEREF _Toc240294686 \h </w:instrText>
       </w:r>
       <w:r>
         <w:rPr>
@@ -3036,7 +3036,7 @@
         <w:rPr>
           <w:noProof/>
         </w:rPr>
-        <w:instrText xml:space="preserve"> PAGEREF _Toc240290763 \h </w:instrText>
+        <w:instrText xml:space="preserve"> PAGEREF _Toc240294687 \h </w:instrText>
       </w:r>
       <w:r>
         <w:rPr>
@@ -3097,7 +3097,7 @@
         <w:rPr>
           <w:noProof/>
         </w:rPr>
-        <w:instrText xml:space="preserve"> PAGEREF _Toc240290764 \h </w:instrText>
+        <w:instrText xml:space="preserve"> PAGEREF _Toc240294688 \h </w:instrText>
       </w:r>
       <w:r>
         <w:rPr>
@@ -3158,7 +3158,7 @@
         <w:rPr>
           <w:noProof/>
         </w:rPr>
-        <w:instrText xml:space="preserve"> PAGEREF _Toc240290765 \h </w:instrText>
+        <w:instrText xml:space="preserve"> PAGEREF _Toc240294689 \h </w:instrText>
       </w:r>
       <w:r>
         <w:rPr>
@@ -3234,7 +3234,7 @@
           <w:sz w:val="34"/>
         </w:rPr>
       </w:pPr>
-      <w:bookmarkStart w:id="0" w:name="_Toc240290717"/>
+      <w:bookmarkStart w:id="0" w:name="_Toc240294641"/>
       <w:r>
         <w:rPr>
           <w:rFonts w:ascii="Montserrat" w:hAnsi="Montserrat"/>
@@ -3258,7 +3258,7 @@
           <w:sz w:val="27"/>
         </w:rPr>
       </w:pPr>
-      <w:bookmarkStart w:id="1" w:name="_Toc240290718"/>
+      <w:bookmarkStart w:id="1" w:name="_Toc240294642"/>
       <w:r>
         <w:rPr>
           <w:rFonts w:ascii="Montserrat" w:hAnsi="Montserrat"/>
@@ -4753,6 +4753,33 @@
           <w:color w:val="1A1A1A"/>
           <w:sz w:val="22"/>
         </w:rPr>
+        <w:t xml:space="preserve">Esta e a versao 2.74 do manual. Em relacao a versao 2.73 (14/09/2026), o Relatorio de Situacao (secao 4.1) e o Relatorio de Entregas (secao 4.2) pararam de bloquear o salvamento inteiro quando duas pessoas editam projetos diferentes do mesmo relatorio ao mesmo tempo - agora as edicoes sao mescladas automaticamente por projeto/item, e so bloqueiam quando ha colisao real </w:t>
+      </w:r>
+      <w:r>
+        <w:rPr>
+          <w:rFonts w:ascii="Montserrat" w:hAnsi="Montserrat"/>
+          <w:color w:val="1A1A1A"/>
+          <w:sz w:val="22"/>
+        </w:rPr>
+        <w:lastRenderedPageBreak/>
+        <w:t>(mesma linha, ou os campos gerais do relatorio). O Plano de Comunicacao nao muda, por ser um documento unico sem lista de projetos.</w:t>
+      </w:r>
+    </w:p>
+    <w:p>
+      <w:pPr>
+        <w:spacing w:line="280" w:lineRule="auto"/>
+        <w:rPr>
+          <w:rFonts w:ascii="Montserrat" w:hAnsi="Montserrat"/>
+          <w:color w:val="1A1A1A"/>
+          <w:sz w:val="22"/>
+        </w:rPr>
+      </w:pPr>
+      <w:r>
+        <w:rPr>
+          <w:rFonts w:ascii="Montserrat" w:hAnsi="Montserrat"/>
+          <w:color w:val="1A1A1A"/>
+          <w:sz w:val="22"/>
+        </w:rPr>
         <w:t>O manual nao substitui as Diretrizes para a Gestao de Projetos da UNIALFA (documento institucional que define o framework D01 a D07) nem o documento Regras de Acesso e Permissoes (que detalha cada regra de controle de acesso); ele e o guia operacional de como usar cada ferramenta na pratica.</w:t>
       </w:r>
     </w:p>
@@ -4767,7 +4794,7 @@
           <w:sz w:val="27"/>
         </w:rPr>
       </w:pPr>
-      <w:bookmarkStart w:id="2" w:name="_Toc240290719"/>
+      <w:bookmarkStart w:id="2" w:name="_Toc240294643"/>
       <w:r>
         <w:rPr>
           <w:rFonts w:ascii="Montserrat" w:hAnsi="Montserrat"/>
@@ -4775,7 +4802,6 @@
           <w:color w:val="B91D2E"/>
           <w:sz w:val="27"/>
         </w:rPr>
-        <w:lastRenderedPageBreak/>
         <w:t>1.2 Visao geral da ferramenta</w:t>
       </w:r>
       <w:bookmarkEnd w:id="2"/>
@@ -4965,16 +4991,16 @@
         </w:rPr>
         <w:lastRenderedPageBreak/>
         <w:drawing>
-          <wp:inline distT="0" distB="0" distL="0" distR="0" wp14:anchorId="227A1678" wp14:editId="1AC63825">
+          <wp:inline distT="0" distB="0" distL="0" distR="0" wp14:anchorId="12FA0149" wp14:editId="25F6A55E">
             <wp:extent cx="5303520" cy="4792851"/>
             <wp:effectExtent l="19050" t="19050" r="11430" b="27305"/>
-            <wp:docPr id="1363924051" name="Imagem 1"/>
+            <wp:docPr id="1136781759" name="Imagem 1"/>
             <wp:cNvGraphicFramePr/>
             <a:graphic xmlns:a="http://schemas.openxmlformats.org/drawingml/2006/main">
               <a:graphicData uri="http://schemas.openxmlformats.org/drawingml/2006/picture">
                 <pic:pic xmlns:pic="http://schemas.openxmlformats.org/drawingml/2006/picture">
                   <pic:nvPicPr>
-                    <pic:cNvPr id="1363924051" name=""/>
+                    <pic:cNvPr id="1136781759" name=""/>
                     <pic:cNvPicPr/>
                   </pic:nvPicPr>
                   <pic:blipFill>
@@ -5042,7 +5068,7 @@
           <w:sz w:val="27"/>
         </w:rPr>
       </w:pPr>
-      <w:bookmarkStart w:id="3" w:name="_Toc240290720"/>
+      <w:bookmarkStart w:id="3" w:name="_Toc240294644"/>
       <w:r>
         <w:rPr>
           <w:rFonts w:ascii="Montserrat" w:hAnsi="Montserrat"/>
@@ -5083,16 +5109,16 @@
         </w:rPr>
         <w:lastRenderedPageBreak/>
         <w:drawing>
-          <wp:inline distT="0" distB="0" distL="0" distR="0" wp14:anchorId="1A73B300" wp14:editId="5297E54A">
+          <wp:inline distT="0" distB="0" distL="0" distR="0" wp14:anchorId="49673F00" wp14:editId="16010588">
             <wp:extent cx="4206240" cy="3801227"/>
             <wp:effectExtent l="19050" t="19050" r="22860" b="27940"/>
-            <wp:docPr id="1265254108" name="Imagem 2"/>
+            <wp:docPr id="725448931" name="Imagem 2"/>
             <wp:cNvGraphicFramePr/>
             <a:graphic xmlns:a="http://schemas.openxmlformats.org/drawingml/2006/main">
               <a:graphicData uri="http://schemas.openxmlformats.org/drawingml/2006/picture">
                 <pic:pic xmlns:pic="http://schemas.openxmlformats.org/drawingml/2006/picture">
                   <pic:nvPicPr>
-                    <pic:cNvPr id="1265254108" name=""/>
+                    <pic:cNvPr id="725448931" name=""/>
                     <pic:cNvPicPr/>
                   </pic:nvPicPr>
                   <pic:blipFill>
@@ -5265,7 +5291,7 @@
           <w:sz w:val="27"/>
         </w:rPr>
       </w:pPr>
-      <w:bookmarkStart w:id="4" w:name="_Toc240290721"/>
+      <w:bookmarkStart w:id="4" w:name="_Toc240294645"/>
       <w:r>
         <w:rPr>
           <w:rFonts w:ascii="Montserrat" w:hAnsi="Montserrat"/>
@@ -6504,7 +6530,7 @@
           <w:sz w:val="34"/>
         </w:rPr>
       </w:pPr>
-      <w:bookmarkStart w:id="5" w:name="_Toc240290722"/>
+      <w:bookmarkStart w:id="5" w:name="_Toc240294646"/>
       <w:r>
         <w:rPr>
           <w:rFonts w:ascii="Montserrat" w:hAnsi="Montserrat"/>
@@ -6528,7 +6554,7 @@
           <w:sz w:val="27"/>
         </w:rPr>
       </w:pPr>
-      <w:bookmarkStart w:id="6" w:name="_Toc240290723"/>
+      <w:bookmarkStart w:id="6" w:name="_Toc240294647"/>
       <w:r>
         <w:rPr>
           <w:rFonts w:ascii="Montserrat" w:hAnsi="Montserrat"/>
@@ -6569,7 +6595,7 @@
           <w:sz w:val="27"/>
         </w:rPr>
       </w:pPr>
-      <w:bookmarkStart w:id="7" w:name="_Toc240290724"/>
+      <w:bookmarkStart w:id="7" w:name="_Toc240294648"/>
       <w:r>
         <w:rPr>
           <w:rFonts w:ascii="Montserrat" w:hAnsi="Montserrat"/>
@@ -6688,7 +6714,7 @@
           <w:sz w:val="27"/>
         </w:rPr>
       </w:pPr>
-      <w:bookmarkStart w:id="8" w:name="_Toc240290725"/>
+      <w:bookmarkStart w:id="8" w:name="_Toc240294649"/>
       <w:r>
         <w:rPr>
           <w:rFonts w:ascii="Montserrat" w:hAnsi="Montserrat"/>
@@ -7301,7 +7327,7 @@
           <w:sz w:val="27"/>
         </w:rPr>
       </w:pPr>
-      <w:bookmarkStart w:id="9" w:name="_Toc240290726"/>
+      <w:bookmarkStart w:id="9" w:name="_Toc240294650"/>
       <w:r>
         <w:rPr>
           <w:rFonts w:ascii="Montserrat" w:hAnsi="Montserrat"/>
@@ -7390,16 +7416,16 @@
         </w:rPr>
         <w:lastRenderedPageBreak/>
         <w:drawing>
-          <wp:inline distT="0" distB="0" distL="0" distR="0" wp14:anchorId="5483C530" wp14:editId="24EFCBEC">
+          <wp:inline distT="0" distB="0" distL="0" distR="0" wp14:anchorId="0CF42C7D" wp14:editId="28A865CD">
             <wp:extent cx="4937760" cy="4462310"/>
             <wp:effectExtent l="19050" t="19050" r="15240" b="14605"/>
-            <wp:docPr id="1620287221" name="Imagem 3"/>
+            <wp:docPr id="1341830633" name="Imagem 3"/>
             <wp:cNvGraphicFramePr/>
             <a:graphic xmlns:a="http://schemas.openxmlformats.org/drawingml/2006/main">
               <a:graphicData uri="http://schemas.openxmlformats.org/drawingml/2006/picture">
                 <pic:pic xmlns:pic="http://schemas.openxmlformats.org/drawingml/2006/picture">
                   <pic:nvPicPr>
-                    <pic:cNvPr id="1620287221" name=""/>
+                    <pic:cNvPr id="1341830633" name=""/>
                     <pic:cNvPicPr/>
                   </pic:nvPicPr>
                   <pic:blipFill>
@@ -7467,7 +7493,7 @@
           <w:sz w:val="27"/>
         </w:rPr>
       </w:pPr>
-      <w:bookmarkStart w:id="10" w:name="_Toc240290727"/>
+      <w:bookmarkStart w:id="10" w:name="_Toc240294651"/>
       <w:r>
         <w:rPr>
           <w:rFonts w:ascii="Montserrat" w:hAnsi="Montserrat"/>
@@ -7508,16 +7534,16 @@
         </w:rPr>
         <w:lastRenderedPageBreak/>
         <w:drawing>
-          <wp:inline distT="0" distB="0" distL="0" distR="0" wp14:anchorId="0E2FDBF2" wp14:editId="7F83641C">
+          <wp:inline distT="0" distB="0" distL="0" distR="0" wp14:anchorId="19789300" wp14:editId="4AB5DE9D">
             <wp:extent cx="5120640" cy="4627581"/>
             <wp:effectExtent l="19050" t="19050" r="22860" b="20955"/>
-            <wp:docPr id="1145847704" name="Imagem 4"/>
+            <wp:docPr id="373538669" name="Imagem 4"/>
             <wp:cNvGraphicFramePr/>
             <a:graphic xmlns:a="http://schemas.openxmlformats.org/drawingml/2006/main">
               <a:graphicData uri="http://schemas.openxmlformats.org/drawingml/2006/picture">
                 <pic:pic xmlns:pic="http://schemas.openxmlformats.org/drawingml/2006/picture">
                   <pic:nvPicPr>
-                    <pic:cNvPr id="1145847704" name=""/>
+                    <pic:cNvPr id="373538669" name=""/>
                     <pic:cNvPicPr/>
                   </pic:nvPicPr>
                   <pic:blipFill>
@@ -7685,7 +7711,7 @@
           <w:sz w:val="27"/>
         </w:rPr>
       </w:pPr>
-      <w:bookmarkStart w:id="11" w:name="_Toc240290728"/>
+      <w:bookmarkStart w:id="11" w:name="_Toc240294652"/>
       <w:r>
         <w:rPr>
           <w:rFonts w:ascii="Montserrat" w:hAnsi="Montserrat"/>
@@ -7725,16 +7751,16 @@
           <w:noProof/>
         </w:rPr>
         <w:drawing>
-          <wp:inline distT="0" distB="0" distL="0" distR="0" wp14:anchorId="7155D897" wp14:editId="0F8A958C">
+          <wp:inline distT="0" distB="0" distL="0" distR="0" wp14:anchorId="437DA793" wp14:editId="26048221">
             <wp:extent cx="4206240" cy="3801227"/>
             <wp:effectExtent l="19050" t="19050" r="22860" b="27940"/>
-            <wp:docPr id="816243148" name="Imagem 5"/>
+            <wp:docPr id="355738800" name="Imagem 5"/>
             <wp:cNvGraphicFramePr/>
             <a:graphic xmlns:a="http://schemas.openxmlformats.org/drawingml/2006/main">
               <a:graphicData uri="http://schemas.openxmlformats.org/drawingml/2006/picture">
                 <pic:pic xmlns:pic="http://schemas.openxmlformats.org/drawingml/2006/picture">
                   <pic:nvPicPr>
-                    <pic:cNvPr id="816243148" name=""/>
+                    <pic:cNvPr id="355738800" name=""/>
                     <pic:cNvPicPr/>
                   </pic:nvPicPr>
                   <pic:blipFill>
@@ -7802,16 +7828,16 @@
         </w:rPr>
         <w:lastRenderedPageBreak/>
         <w:drawing>
-          <wp:inline distT="0" distB="0" distL="0" distR="0" wp14:anchorId="19828B2D" wp14:editId="146F5E8A">
+          <wp:inline distT="0" distB="0" distL="0" distR="0" wp14:anchorId="18527AB1" wp14:editId="7B5FD1E7">
             <wp:extent cx="4206240" cy="3801227"/>
             <wp:effectExtent l="19050" t="19050" r="22860" b="27940"/>
-            <wp:docPr id="1987805283" name="Imagem 6"/>
+            <wp:docPr id="876547050" name="Imagem 6"/>
             <wp:cNvGraphicFramePr/>
             <a:graphic xmlns:a="http://schemas.openxmlformats.org/drawingml/2006/main">
               <a:graphicData uri="http://schemas.openxmlformats.org/drawingml/2006/picture">
                 <pic:pic xmlns:pic="http://schemas.openxmlformats.org/drawingml/2006/picture">
                   <pic:nvPicPr>
-                    <pic:cNvPr id="1987805283" name=""/>
+                    <pic:cNvPr id="876547050" name=""/>
                     <pic:cNvPicPr/>
                   </pic:nvPicPr>
                   <pic:blipFill>
@@ -7927,7 +7953,7 @@
           <w:sz w:val="27"/>
         </w:rPr>
       </w:pPr>
-      <w:bookmarkStart w:id="12" w:name="_Toc240290729"/>
+      <w:bookmarkStart w:id="12" w:name="_Toc240294653"/>
       <w:r>
         <w:rPr>
           <w:rFonts w:ascii="Montserrat" w:hAnsi="Montserrat"/>
@@ -7995,7 +8021,7 @@
           <w:sz w:val="27"/>
         </w:rPr>
       </w:pPr>
-      <w:bookmarkStart w:id="13" w:name="_Toc240290730"/>
+      <w:bookmarkStart w:id="13" w:name="_Toc240294654"/>
       <w:r>
         <w:rPr>
           <w:rFonts w:ascii="Montserrat" w:hAnsi="Montserrat"/>
@@ -8222,7 +8248,7 @@
           <w:sz w:val="27"/>
         </w:rPr>
       </w:pPr>
-      <w:bookmarkStart w:id="14" w:name="_Toc240290731"/>
+      <w:bookmarkStart w:id="14" w:name="_Toc240294655"/>
       <w:r>
         <w:rPr>
           <w:rFonts w:ascii="Montserrat" w:hAnsi="Montserrat"/>
@@ -8285,8 +8311,16 @@
         </w:numPr>
         <w:spacing w:after="80" w:line="260" w:lineRule="auto"/>
         <w:ind w:left="700"/>
-      </w:pPr>
-      <w:r>
+        <w:rPr>
+          <w:color w:val="1A1A1A"/>
+          <w:sz w:val="22"/>
+        </w:rPr>
+      </w:pPr>
+      <w:r>
+        <w:rPr>
+          <w:color w:val="1A1A1A"/>
+          <w:sz w:val="22"/>
+        </w:rPr>
         <w:t>Ao tocar no botao, o navegador pede permissao para mostrar notificacoes - aceite para concluir a ativacao. O botao muda para Lembretes ativos.</w:t>
       </w:r>
     </w:p>
@@ -8335,8 +8369,16 @@
           <w:color w:val="1A1A1A"/>
           <w:sz w:val="22"/>
         </w:rPr>
+        <w:t xml:space="preserve">Dispara nos mesmos sete momentos da secao 2.8 (registro de nova demanda, Gate 1, Canvas aprovado, TAP aprovado, decisao da SMP, </w:t>
+      </w:r>
+      <w:r>
+        <w:rPr>
+          <w:rFonts w:ascii="Montserrat" w:hAnsi="Montserrat"/>
+          <w:color w:val="1A1A1A"/>
+          <w:sz w:val="22"/>
+        </w:rPr>
         <w:lastRenderedPageBreak/>
-        <w:t>Dispara nos mesmos sete momentos da secao 2.8 (registro de nova demanda, Gate 1, Canvas aprovado, TAP aprovado, decisao da SMP, registro de TEP e Gate 2 pactuado), para os mesmos destinatarios - mas so quem tiver ativado o push naquele navegador/celular recebe a notificacao.</w:t>
+        <w:t>registro de TEP e Gate 2 pactuado), para os mesmos destinatarios - mas so quem tiver ativado o push naquele navegador/celular recebe a notificacao.</w:t>
       </w:r>
     </w:p>
     <w:p>
@@ -8371,7 +8413,7 @@
           <w:sz w:val="27"/>
         </w:rPr>
       </w:pPr>
-      <w:bookmarkStart w:id="15" w:name="_Toc240290732"/>
+      <w:bookmarkStart w:id="15" w:name="_Toc240294656"/>
       <w:r>
         <w:rPr>
           <w:rFonts w:ascii="Montserrat" w:hAnsi="Montserrat"/>
@@ -8548,8 +8590,16 @@
           <w:color w:val="1A1A1A"/>
           <w:sz w:val="22"/>
         </w:rPr>
+        <w:t xml:space="preserve">Cada campo preenchido pela IA (pauta, data/horario, resumo) e cada linha das tabelas de participantes/encaminhamentos/entraves ficam com </w:t>
+      </w:r>
+      <w:r>
+        <w:rPr>
+          <w:rFonts w:ascii="Montserrat" w:hAnsi="Montserrat"/>
+          <w:color w:val="1A1A1A"/>
+          <w:sz w:val="22"/>
+        </w:rPr>
         <w:lastRenderedPageBreak/>
-        <w:t>Cada campo preenchido pela IA (pauta, data/horario, resumo) e cada linha das tabelas de participantes/encaminhamentos/entraves ficam com um selo IA e destaque visual ate serem editados - o mesmo padrao usado no assistente de preenchimento por IA dos demais formularios (secao 2.12).</w:t>
+        <w:t>um selo IA e destaque visual ate serem editados - o mesmo padrao usado no assistente de preenchimento por IA dos demais formularios (secao 2.12).</w:t>
       </w:r>
     </w:p>
     <w:p>
@@ -8563,7 +8613,7 @@
           <w:sz w:val="27"/>
         </w:rPr>
       </w:pPr>
-      <w:bookmarkStart w:id="16" w:name="_Toc240290733"/>
+      <w:bookmarkStart w:id="16" w:name="_Toc240294657"/>
       <w:r>
         <w:rPr>
           <w:rFonts w:ascii="Montserrat" w:hAnsi="Montserrat"/>
@@ -8691,7 +8741,7 @@
           <w:sz w:val="27"/>
         </w:rPr>
       </w:pPr>
-      <w:bookmarkStart w:id="17" w:name="_Toc240290734"/>
+      <w:bookmarkStart w:id="17" w:name="_Toc240294658"/>
       <w:r>
         <w:rPr>
           <w:rFonts w:ascii="Montserrat" w:hAnsi="Montserrat"/>
@@ -8718,7 +8768,7 @@
           <w:color w:val="1A1A1A"/>
           <w:sz w:val="22"/>
         </w:rPr>
-        <w:t xml:space="preserve">O Canvas de Projeto (Passo 2), o TAP (Passo 3), o Planejamento e Desenvolvimento de Projeto (Passo 4), a EAP (Passo 5), a SMP (Passo 7), o TEP </w:t>
+        <w:t xml:space="preserve">O Canvas de Projeto (Passo 2), o TAP (Passo 3), o Planejamento e Desenvolvimento de Projeto (Passo 4), a EAP (Passo 5), a SMP (Passo 7), o TEP (Passo 8) e o RLA (Passo 9) tem um botao Sugerir com IA, que aparece assim que um Projeto vinculado e selecionado. Diferente da importacao de </w:t>
       </w:r>
       <w:r>
         <w:rPr>
@@ -8727,7 +8777,7 @@
           <w:sz w:val="22"/>
         </w:rPr>
         <w:lastRenderedPageBreak/>
-        <w:t>(Passo 8) e o RLA (Passo 9) tem um botao Sugerir com IA, que aparece assim que um Projeto vinculado e selecionado. Diferente da importacao de transcricao (secao 2.10), que le um texto colado pelo usuario, este assistente le os proprios documentos ja registrados do projeto - seguindo a esteira (Demanda alimenta o Canvas; Canvas e Demanda alimentam o TAP; TAP e Canvas alimentam o Planejamento; TAP e Planejamento alimentam a EAP e a SMP; TAP, Planejamento e EAP alimentam o TEP; TEP e SMPs alimentam o RLA), sempre incluindo as Atas de Reuniao do projeto - e usa IA (Claude, pela mesma Supabase Edge Function em espirito da secao 2.10) para sugerir o preenchimento dos campos ainda vazios.</w:t>
+        <w:t>transcricao (secao 2.10), que le um texto colado pelo usuario, este assistente le os proprios documentos ja registrados do projeto - seguindo a esteira (Demanda alimenta o Canvas; Canvas e Demanda alimentam o TAP; TAP e Canvas alimentam o Planejamento; TAP e Planejamento alimentam a EAP e a SMP; TAP, Planejamento e EAP alimentam o TEP; TEP e SMPs alimentam o RLA), sempre incluindo as Atas de Reuniao do projeto - e usa IA (Claude, pela mesma Supabase Edge Function em espirito da secao 2.10) para sugerir o preenchimento dos campos ainda vazios.</w:t>
       </w:r>
     </w:p>
     <w:p>
@@ -8919,8 +8969,16 @@
           <w:color w:val="1A1A1A"/>
           <w:sz w:val="22"/>
         </w:rPr>
+        <w:t xml:space="preserve">No TEP, a IA compara o planejado (TAP, Planejamento, EAP) com o que as Atas mais recentes confirmam como realizado, para redigir a justificativa </w:t>
+      </w:r>
+      <w:r>
+        <w:rPr>
+          <w:rFonts w:ascii="Montserrat" w:hAnsi="Montserrat"/>
+          <w:color w:val="1A1A1A"/>
+          <w:sz w:val="22"/>
+        </w:rPr>
         <w:lastRenderedPageBreak/>
-        <w:t>No TEP, a IA compara o planejado (TAP, Planejamento, EAP) com o que as Atas mais recentes confirmam como realizado, para redigir a justificativa de encerramento, o resumo de atividades encerradas e as consideracoes finais.</w:t>
+        <w:t>de encerramento, o resumo de atividades encerradas e as consideracoes finais.</w:t>
       </w:r>
     </w:p>
     <w:p>
@@ -9021,7 +9079,7 @@
           <w:sz w:val="27"/>
         </w:rPr>
       </w:pPr>
-      <w:bookmarkStart w:id="18" w:name="_Toc240290735"/>
+      <w:bookmarkStart w:id="18" w:name="_Toc240294659"/>
       <w:r>
         <w:rPr>
           <w:rFonts w:ascii="Montserrat" w:hAnsi="Montserrat"/>
@@ -9048,16 +9106,7 @@
           <w:color w:val="1A1A1A"/>
           <w:sz w:val="22"/>
         </w:rPr>
-        <w:t xml:space="preserve">A Solicitacao de Demanda (Passo 1) tem um painel Importar documento preenchido, no topo do formulario, para quem ja preencheu o formulario oficial FORALF00339 em Word ou PDF fora do sistema e agora precisa transcrever esses dados para a tela. O texto pode ser colado diretamente, ou o arquivo (.txt, .docx ou .pdf) anexado pelo botao Anexar arquivo - o sistema extrai o texto </w:t>
-      </w:r>
-      <w:r>
-        <w:rPr>
-          <w:rFonts w:ascii="Montserrat" w:hAnsi="Montserrat"/>
-          <w:color w:val="1A1A1A"/>
-          <w:sz w:val="22"/>
-        </w:rPr>
-        <w:lastRenderedPageBreak/>
-        <w:t>automaticamente para revisao antes de clicar em Analisar e preencher. Limite de 15 MB por arquivo.</w:t>
+        <w:t>A Solicitacao de Demanda (Passo 1) tem um painel Importar documento preenchido, no topo do formulario, para quem ja preencheu o formulario oficial FORALF00339 em Word ou PDF fora do sistema e agora precisa transcrever esses dados para a tela. O texto pode ser colado diretamente, ou o arquivo (.txt, .docx ou .pdf) anexado pelo botao Anexar arquivo - o sistema extrai o texto automaticamente para revisao antes de clicar em Analisar e preencher. Limite de 15 MB por arquivo.</w:t>
       </w:r>
     </w:p>
     <w:p>
@@ -9081,6 +9130,7 @@
           <w:color w:val="1A1A1A"/>
           <w:sz w:val="22"/>
         </w:rPr>
+        <w:lastRenderedPageBreak/>
         <w:t>A IA identifica nome do projeto, solicitante, departamento, justificativa, objetivo, escopo, prazo, orcamento, partes interessadas e anexos, e preenche so os campos ainda vazios do formulario - exatamente como as demais importacoes por IA (secoes 2.10 e 2.12).</w:t>
       </w:r>
     </w:p>
@@ -9158,7 +9208,7 @@
           <w:sz w:val="27"/>
         </w:rPr>
       </w:pPr>
-      <w:bookmarkStart w:id="19" w:name="_Toc240290736"/>
+      <w:bookmarkStart w:id="19" w:name="_Toc240294660"/>
       <w:r>
         <w:rPr>
           <w:rFonts w:ascii="Montserrat" w:hAnsi="Montserrat"/>
@@ -9275,16 +9325,7 @@
           <w:color w:val="1A1A1A"/>
           <w:sz w:val="22"/>
         </w:rPr>
-        <w:t xml:space="preserve">Vale para os 12 formularios de registro. Nos tres relatorios que reunem todos os projetos numa unica tela - Plano de Comunicacao (Passo 10), Relatorio de Situacao (secao 4.1) e Relatorio de Entregas (secao 4.2) - o </w:t>
-      </w:r>
-      <w:r>
-        <w:rPr>
-          <w:rFonts w:ascii="Montserrat" w:hAnsi="Montserrat"/>
-          <w:color w:val="1A1A1A"/>
-          <w:sz w:val="22"/>
-        </w:rPr>
-        <w:lastRenderedPageBreak/>
-        <w:t>aviso aparece se qualquer outra pessoa salvar esse mesmo relatorio entre o momento em que a tela de edicao foi aberta e o Salvar.</w:t>
+        <w:t>Vale para os 12 formularios de registro. No Plano de Comunicacao (Passo 10, documento unico, sem lista de projetos), o aviso aparece se qualquer outra pessoa salvar entre o momento em que a tela de edicao foi aberta e o Salvar.</w:t>
       </w:r>
     </w:p>
     <w:p>
@@ -9305,7 +9346,26 @@
           <w:color w:val="6A6A70"/>
           <w:sz w:val="21"/>
         </w:rPr>
+        <w:lastRenderedPageBreak/>
         <w:t>Isso nao e uma trava de quem chega primeiro bloqueia o registro - duas pessoas podem abrir o mesmo registro ao mesmo tempo sem problema. O aviso so aparece na hora de salvar, e so para quem salvar por ultimo.</w:t>
+      </w:r>
+    </w:p>
+    <w:p>
+      <w:pPr>
+        <w:spacing w:line="280" w:lineRule="auto"/>
+        <w:rPr>
+          <w:rFonts w:ascii="Montserrat" w:hAnsi="Montserrat"/>
+          <w:color w:val="1A1A1A"/>
+          <w:sz w:val="22"/>
+        </w:rPr>
+      </w:pPr>
+      <w:r>
+        <w:rPr>
+          <w:rFonts w:ascii="Montserrat" w:hAnsi="Montserrat"/>
+          <w:color w:val="1A1A1A"/>
+          <w:sz w:val="22"/>
+        </w:rPr>
+        <w:t>No Relatorio de Situacao (secao 4.1) e no Relatorio de Entregas (secao 4.2) - que reunem varios projetos numa unica tela - o sistema e mais esperto: se uma pessoa editar o projeto A e outra editar o projeto B (ou outra parte independente do relatorio) ao mesmo tempo, as duas alteracoes sao salvas juntas automaticamente, sem bloquear ninguem. O aviso de conflito so aparece quando as edicoes realmente colidem: a mesma linha alterada pelas duas pessoas, ou os campos gerais do relatorio (referencia, responsavel, situacao financeira, pactuacao do Gate 2) alterados por outra pessoa durante a edicao.</w:t>
       </w:r>
     </w:p>
     <w:p>
@@ -9431,7 +9491,7 @@
           <w:sz w:val="34"/>
         </w:rPr>
       </w:pPr>
-      <w:bookmarkStart w:id="20" w:name="_Toc240290737"/>
+      <w:bookmarkStart w:id="20" w:name="_Toc240294661"/>
       <w:r>
         <w:rPr>
           <w:rFonts w:ascii="Montserrat" w:hAnsi="Montserrat"/>
@@ -9473,7 +9533,7 @@
           <w:sz w:val="27"/>
         </w:rPr>
       </w:pPr>
-      <w:bookmarkStart w:id="21" w:name="_Toc240290738"/>
+      <w:bookmarkStart w:id="21" w:name="_Toc240294662"/>
       <w:r>
         <w:rPr>
           <w:rFonts w:ascii="Montserrat" w:hAnsi="Montserrat"/>
@@ -10553,16 +10613,16 @@
         </w:rPr>
         <w:lastRenderedPageBreak/>
         <w:drawing>
-          <wp:inline distT="0" distB="0" distL="0" distR="0" wp14:anchorId="7AFEEF62" wp14:editId="2BC4CE2B">
+          <wp:inline distT="0" distB="0" distL="0" distR="0" wp14:anchorId="1518162A" wp14:editId="07302031">
             <wp:extent cx="5120640" cy="4627581"/>
             <wp:effectExtent l="19050" t="19050" r="22860" b="20955"/>
-            <wp:docPr id="387267179" name="Imagem 7"/>
+            <wp:docPr id="1533116760" name="Imagem 7"/>
             <wp:cNvGraphicFramePr/>
             <a:graphic xmlns:a="http://schemas.openxmlformats.org/drawingml/2006/main">
               <a:graphicData uri="http://schemas.openxmlformats.org/drawingml/2006/picture">
                 <pic:pic xmlns:pic="http://schemas.openxmlformats.org/drawingml/2006/picture">
                   <pic:nvPicPr>
-                    <pic:cNvPr id="387267179" name=""/>
+                    <pic:cNvPr id="1533116760" name=""/>
                     <pic:cNvPicPr/>
                   </pic:nvPicPr>
                   <pic:blipFill>
@@ -10630,16 +10690,16 @@
         </w:rPr>
         <w:lastRenderedPageBreak/>
         <w:drawing>
-          <wp:inline distT="0" distB="0" distL="0" distR="0" wp14:anchorId="7EF5B888" wp14:editId="54D27AD7">
+          <wp:inline distT="0" distB="0" distL="0" distR="0" wp14:anchorId="5C1BEBD3" wp14:editId="41B2E852">
             <wp:extent cx="5120640" cy="4627581"/>
             <wp:effectExtent l="19050" t="19050" r="22860" b="20955"/>
-            <wp:docPr id="1821160606" name="Imagem 8"/>
+            <wp:docPr id="1750723360" name="Imagem 8"/>
             <wp:cNvGraphicFramePr/>
             <a:graphic xmlns:a="http://schemas.openxmlformats.org/drawingml/2006/main">
               <a:graphicData uri="http://schemas.openxmlformats.org/drawingml/2006/picture">
                 <pic:pic xmlns:pic="http://schemas.openxmlformats.org/drawingml/2006/picture">
                   <pic:nvPicPr>
-                    <pic:cNvPr id="1821160606" name=""/>
+                    <pic:cNvPr id="1750723360" name=""/>
                     <pic:cNvPicPr/>
                   </pic:nvPicPr>
                   <pic:blipFill>
@@ -10847,7 +10907,7 @@
           <w:sz w:val="27"/>
         </w:rPr>
       </w:pPr>
-      <w:bookmarkStart w:id="22" w:name="_Toc240290739"/>
+      <w:bookmarkStart w:id="22" w:name="_Toc240294663"/>
       <w:r>
         <w:rPr>
           <w:rFonts w:ascii="Montserrat" w:hAnsi="Montserrat"/>
@@ -11772,16 +11832,16 @@
           <w:noProof/>
         </w:rPr>
         <w:drawing>
-          <wp:inline distT="0" distB="0" distL="0" distR="0" wp14:anchorId="52649907" wp14:editId="547BBF45">
+          <wp:inline distT="0" distB="0" distL="0" distR="0" wp14:anchorId="345033CE" wp14:editId="274223BB">
             <wp:extent cx="5120640" cy="4627581"/>
             <wp:effectExtent l="19050" t="19050" r="22860" b="20955"/>
-            <wp:docPr id="1266403455" name="Imagem 9"/>
+            <wp:docPr id="1755531007" name="Imagem 9"/>
             <wp:cNvGraphicFramePr/>
             <a:graphic xmlns:a="http://schemas.openxmlformats.org/drawingml/2006/main">
               <a:graphicData uri="http://schemas.openxmlformats.org/drawingml/2006/picture">
                 <pic:pic xmlns:pic="http://schemas.openxmlformats.org/drawingml/2006/picture">
                   <pic:nvPicPr>
-                    <pic:cNvPr id="1266403455" name=""/>
+                    <pic:cNvPr id="1755531007" name=""/>
                     <pic:cNvPicPr/>
                   </pic:nvPicPr>
                   <pic:blipFill>
@@ -11849,16 +11909,16 @@
         </w:rPr>
         <w:lastRenderedPageBreak/>
         <w:drawing>
-          <wp:inline distT="0" distB="0" distL="0" distR="0" wp14:anchorId="7955D44C" wp14:editId="38726FA1">
+          <wp:inline distT="0" distB="0" distL="0" distR="0" wp14:anchorId="79FFA5B5" wp14:editId="7F79899D">
             <wp:extent cx="5120640" cy="4627581"/>
             <wp:effectExtent l="19050" t="19050" r="22860" b="20955"/>
-            <wp:docPr id="1471882839" name="Imagem 10"/>
+            <wp:docPr id="1890397778" name="Imagem 10"/>
             <wp:cNvGraphicFramePr/>
             <a:graphic xmlns:a="http://schemas.openxmlformats.org/drawingml/2006/main">
               <a:graphicData uri="http://schemas.openxmlformats.org/drawingml/2006/picture">
                 <pic:pic xmlns:pic="http://schemas.openxmlformats.org/drawingml/2006/picture">
                   <pic:nvPicPr>
-                    <pic:cNvPr id="1471882839" name=""/>
+                    <pic:cNvPr id="1890397778" name=""/>
                     <pic:cNvPicPr/>
                   </pic:nvPicPr>
                   <pic:blipFill>
@@ -11992,7 +12052,7 @@
           <w:sz w:val="27"/>
         </w:rPr>
       </w:pPr>
-      <w:bookmarkStart w:id="23" w:name="_Toc240290740"/>
+      <w:bookmarkStart w:id="23" w:name="_Toc240294664"/>
       <w:r>
         <w:rPr>
           <w:rFonts w:ascii="Montserrat" w:hAnsi="Montserrat"/>
@@ -13058,16 +13118,16 @@
           <w:noProof/>
         </w:rPr>
         <w:drawing>
-          <wp:inline distT="0" distB="0" distL="0" distR="0" wp14:anchorId="169D5D34" wp14:editId="06ECD589">
+          <wp:inline distT="0" distB="0" distL="0" distR="0" wp14:anchorId="26B6133A" wp14:editId="0C1C9A8C">
             <wp:extent cx="5120640" cy="3338440"/>
             <wp:effectExtent l="19050" t="19050" r="22860" b="14605"/>
-            <wp:docPr id="706220812" name="Imagem 11"/>
+            <wp:docPr id="726469334" name="Imagem 11"/>
             <wp:cNvGraphicFramePr/>
             <a:graphic xmlns:a="http://schemas.openxmlformats.org/drawingml/2006/main">
               <a:graphicData uri="http://schemas.openxmlformats.org/drawingml/2006/picture">
                 <pic:pic xmlns:pic="http://schemas.openxmlformats.org/drawingml/2006/picture">
                   <pic:nvPicPr>
-                    <pic:cNvPr id="706220812" name=""/>
+                    <pic:cNvPr id="726469334" name=""/>
                     <pic:cNvPicPr/>
                   </pic:nvPicPr>
                   <pic:blipFill>
@@ -13135,16 +13195,16 @@
         </w:rPr>
         <w:lastRenderedPageBreak/>
         <w:drawing>
-          <wp:inline distT="0" distB="0" distL="0" distR="0" wp14:anchorId="5D505BE0" wp14:editId="30A93D7B">
+          <wp:inline distT="0" distB="0" distL="0" distR="0" wp14:anchorId="4E9FE223" wp14:editId="7B6E1E83">
             <wp:extent cx="5120640" cy="4627581"/>
             <wp:effectExtent l="19050" t="19050" r="22860" b="20955"/>
-            <wp:docPr id="1733857051" name="Imagem 12"/>
+            <wp:docPr id="2125905370" name="Imagem 12"/>
             <wp:cNvGraphicFramePr/>
             <a:graphic xmlns:a="http://schemas.openxmlformats.org/drawingml/2006/main">
               <a:graphicData uri="http://schemas.openxmlformats.org/drawingml/2006/picture">
                 <pic:pic xmlns:pic="http://schemas.openxmlformats.org/drawingml/2006/picture">
                   <pic:nvPicPr>
-                    <pic:cNvPr id="1733857051" name=""/>
+                    <pic:cNvPr id="2125905370" name=""/>
                     <pic:cNvPicPr/>
                   </pic:nvPicPr>
                   <pic:blipFill>
@@ -13348,7 +13408,7 @@
           <w:sz w:val="27"/>
         </w:rPr>
       </w:pPr>
-      <w:bookmarkStart w:id="24" w:name="_Toc240290741"/>
+      <w:bookmarkStart w:id="24" w:name="_Toc240294665"/>
       <w:r>
         <w:rPr>
           <w:rFonts w:ascii="Montserrat" w:hAnsi="Montserrat"/>
@@ -13909,16 +13969,16 @@
           <w:noProof/>
         </w:rPr>
         <w:drawing>
-          <wp:inline distT="0" distB="0" distL="0" distR="0" wp14:anchorId="0E6DB085" wp14:editId="48B5078B">
+          <wp:inline distT="0" distB="0" distL="0" distR="0" wp14:anchorId="71F4C32F" wp14:editId="13E88256">
             <wp:extent cx="5120640" cy="4627581"/>
             <wp:effectExtent l="19050" t="19050" r="22860" b="20955"/>
-            <wp:docPr id="628591537" name="Imagem 13"/>
+            <wp:docPr id="230079057" name="Imagem 13"/>
             <wp:cNvGraphicFramePr/>
             <a:graphic xmlns:a="http://schemas.openxmlformats.org/drawingml/2006/main">
               <a:graphicData uri="http://schemas.openxmlformats.org/drawingml/2006/picture">
                 <pic:pic xmlns:pic="http://schemas.openxmlformats.org/drawingml/2006/picture">
                   <pic:nvPicPr>
-                    <pic:cNvPr id="628591537" name=""/>
+                    <pic:cNvPr id="230079057" name=""/>
                     <pic:cNvPicPr/>
                   </pic:nvPicPr>
                   <pic:blipFill>
@@ -13986,16 +14046,16 @@
         </w:rPr>
         <w:lastRenderedPageBreak/>
         <w:drawing>
-          <wp:inline distT="0" distB="0" distL="0" distR="0" wp14:anchorId="69A4454D" wp14:editId="4A22CBA9">
+          <wp:inline distT="0" distB="0" distL="0" distR="0" wp14:anchorId="195EA352" wp14:editId="52C954AB">
             <wp:extent cx="5120640" cy="4627581"/>
             <wp:effectExtent l="19050" t="19050" r="22860" b="20955"/>
-            <wp:docPr id="1166489806" name="Imagem 14"/>
+            <wp:docPr id="1236559887" name="Imagem 14"/>
             <wp:cNvGraphicFramePr/>
             <a:graphic xmlns:a="http://schemas.openxmlformats.org/drawingml/2006/main">
               <a:graphicData uri="http://schemas.openxmlformats.org/drawingml/2006/picture">
                 <pic:pic xmlns:pic="http://schemas.openxmlformats.org/drawingml/2006/picture">
                   <pic:nvPicPr>
-                    <pic:cNvPr id="1166489806" name=""/>
+                    <pic:cNvPr id="1236559887" name=""/>
                     <pic:cNvPicPr/>
                   </pic:nvPicPr>
                   <pic:blipFill>
@@ -14247,7 +14307,7 @@
           <w:sz w:val="27"/>
         </w:rPr>
       </w:pPr>
-      <w:bookmarkStart w:id="25" w:name="_Toc240290742"/>
+      <w:bookmarkStart w:id="25" w:name="_Toc240294666"/>
       <w:r>
         <w:rPr>
           <w:rFonts w:ascii="Montserrat" w:hAnsi="Montserrat"/>
@@ -14287,16 +14347,16 @@
           <w:noProof/>
         </w:rPr>
         <w:drawing>
-          <wp:inline distT="0" distB="0" distL="0" distR="0" wp14:anchorId="57F21272" wp14:editId="6AB269E5">
+          <wp:inline distT="0" distB="0" distL="0" distR="0" wp14:anchorId="4DA29D6A" wp14:editId="2CEE7E86">
             <wp:extent cx="5120640" cy="4627581"/>
             <wp:effectExtent l="19050" t="19050" r="22860" b="20955"/>
-            <wp:docPr id="1297353010" name="Imagem 15"/>
+            <wp:docPr id="28360033" name="Imagem 15"/>
             <wp:cNvGraphicFramePr/>
             <a:graphic xmlns:a="http://schemas.openxmlformats.org/drawingml/2006/main">
               <a:graphicData uri="http://schemas.openxmlformats.org/drawingml/2006/picture">
                 <pic:pic xmlns:pic="http://schemas.openxmlformats.org/drawingml/2006/picture">
                   <pic:nvPicPr>
-                    <pic:cNvPr id="1297353010" name=""/>
+                    <pic:cNvPr id="28360033" name=""/>
                     <pic:cNvPicPr/>
                   </pic:nvPicPr>
                   <pic:blipFill>
@@ -14364,16 +14424,16 @@
         </w:rPr>
         <w:lastRenderedPageBreak/>
         <w:drawing>
-          <wp:inline distT="0" distB="0" distL="0" distR="0" wp14:anchorId="663B7871" wp14:editId="121A476A">
+          <wp:inline distT="0" distB="0" distL="0" distR="0" wp14:anchorId="4D1248F3" wp14:editId="5ECD2FBD">
             <wp:extent cx="5120640" cy="4627581"/>
             <wp:effectExtent l="19050" t="19050" r="22860" b="20955"/>
-            <wp:docPr id="265506061" name="Imagem 16"/>
+            <wp:docPr id="2092908071" name="Imagem 16"/>
             <wp:cNvGraphicFramePr/>
             <a:graphic xmlns:a="http://schemas.openxmlformats.org/drawingml/2006/main">
               <a:graphicData uri="http://schemas.openxmlformats.org/drawingml/2006/picture">
                 <pic:pic xmlns:pic="http://schemas.openxmlformats.org/drawingml/2006/picture">
                   <pic:nvPicPr>
-                    <pic:cNvPr id="265506061" name=""/>
+                    <pic:cNvPr id="2092908071" name=""/>
                     <pic:cNvPicPr/>
                   </pic:nvPicPr>
                   <pic:blipFill>
@@ -14537,16 +14597,16 @@
         </w:rPr>
         <w:lastRenderedPageBreak/>
         <w:drawing>
-          <wp:inline distT="0" distB="0" distL="0" distR="0" wp14:anchorId="013A5BF5" wp14:editId="7AF97B48">
+          <wp:inline distT="0" distB="0" distL="0" distR="0" wp14:anchorId="5DF35E98" wp14:editId="13AE5E46">
             <wp:extent cx="5120640" cy="3282818"/>
             <wp:effectExtent l="19050" t="19050" r="22860" b="13335"/>
-            <wp:docPr id="1952987630" name="Imagem 17"/>
+            <wp:docPr id="455095410" name="Imagem 17"/>
             <wp:cNvGraphicFramePr/>
             <a:graphic xmlns:a="http://schemas.openxmlformats.org/drawingml/2006/main">
               <a:graphicData uri="http://schemas.openxmlformats.org/drawingml/2006/picture">
                 <pic:pic xmlns:pic="http://schemas.openxmlformats.org/drawingml/2006/picture">
                   <pic:nvPicPr>
-                    <pic:cNvPr id="1952987630" name=""/>
+                    <pic:cNvPr id="455095410" name=""/>
                     <pic:cNvPicPr/>
                   </pic:nvPicPr>
                   <pic:blipFill>
@@ -14737,7 +14797,7 @@
           <w:sz w:val="27"/>
         </w:rPr>
       </w:pPr>
-      <w:bookmarkStart w:id="26" w:name="_Toc240290743"/>
+      <w:bookmarkStart w:id="26" w:name="_Toc240294667"/>
       <w:r>
         <w:rPr>
           <w:rFonts w:ascii="Montserrat" w:hAnsi="Montserrat"/>
@@ -14777,16 +14837,16 @@
           <w:noProof/>
         </w:rPr>
         <w:drawing>
-          <wp:inline distT="0" distB="0" distL="0" distR="0" wp14:anchorId="538DFEC2" wp14:editId="4A4D4A02">
+          <wp:inline distT="0" distB="0" distL="0" distR="0" wp14:anchorId="6DD907E3" wp14:editId="6B4D435D">
             <wp:extent cx="5120640" cy="4627581"/>
             <wp:effectExtent l="19050" t="19050" r="22860" b="20955"/>
-            <wp:docPr id="2044409713" name="Imagem 18"/>
+            <wp:docPr id="1855710919" name="Imagem 18"/>
             <wp:cNvGraphicFramePr/>
             <a:graphic xmlns:a="http://schemas.openxmlformats.org/drawingml/2006/main">
               <a:graphicData uri="http://schemas.openxmlformats.org/drawingml/2006/picture">
                 <pic:pic xmlns:pic="http://schemas.openxmlformats.org/drawingml/2006/picture">
                   <pic:nvPicPr>
-                    <pic:cNvPr id="2044409713" name=""/>
+                    <pic:cNvPr id="1855710919" name=""/>
                     <pic:cNvPicPr/>
                   </pic:nvPicPr>
                   <pic:blipFill>
@@ -14854,16 +14914,16 @@
         </w:rPr>
         <w:lastRenderedPageBreak/>
         <w:drawing>
-          <wp:inline distT="0" distB="0" distL="0" distR="0" wp14:anchorId="44E8414A" wp14:editId="33A69F37">
+          <wp:inline distT="0" distB="0" distL="0" distR="0" wp14:anchorId="24E83BEC" wp14:editId="269D1AB8">
             <wp:extent cx="5120640" cy="4627581"/>
             <wp:effectExtent l="19050" t="19050" r="22860" b="20955"/>
-            <wp:docPr id="2003574301" name="Imagem 19"/>
+            <wp:docPr id="1028047808" name="Imagem 19"/>
             <wp:cNvGraphicFramePr/>
             <a:graphic xmlns:a="http://schemas.openxmlformats.org/drawingml/2006/main">
               <a:graphicData uri="http://schemas.openxmlformats.org/drawingml/2006/picture">
                 <pic:pic xmlns:pic="http://schemas.openxmlformats.org/drawingml/2006/picture">
                   <pic:nvPicPr>
-                    <pic:cNvPr id="2003574301" name=""/>
+                    <pic:cNvPr id="1028047808" name=""/>
                     <pic:cNvPicPr/>
                   </pic:nvPicPr>
                   <pic:blipFill>
@@ -15046,7 +15106,7 @@
           <w:sz w:val="27"/>
         </w:rPr>
       </w:pPr>
-      <w:bookmarkStart w:id="27" w:name="_Toc240290744"/>
+      <w:bookmarkStart w:id="27" w:name="_Toc240294668"/>
       <w:r>
         <w:rPr>
           <w:rFonts w:ascii="Montserrat" w:hAnsi="Montserrat"/>
@@ -15086,16 +15146,16 @@
           <w:noProof/>
         </w:rPr>
         <w:drawing>
-          <wp:inline distT="0" distB="0" distL="0" distR="0" wp14:anchorId="550A30EA" wp14:editId="3995642F">
+          <wp:inline distT="0" distB="0" distL="0" distR="0" wp14:anchorId="7DA7E96F" wp14:editId="3145B800">
             <wp:extent cx="5120640" cy="4627581"/>
             <wp:effectExtent l="19050" t="19050" r="22860" b="20955"/>
-            <wp:docPr id="496397910" name="Imagem 20"/>
+            <wp:docPr id="1404930469" name="Imagem 20"/>
             <wp:cNvGraphicFramePr/>
             <a:graphic xmlns:a="http://schemas.openxmlformats.org/drawingml/2006/main">
               <a:graphicData uri="http://schemas.openxmlformats.org/drawingml/2006/picture">
                 <pic:pic xmlns:pic="http://schemas.openxmlformats.org/drawingml/2006/picture">
                   <pic:nvPicPr>
-                    <pic:cNvPr id="496397910" name=""/>
+                    <pic:cNvPr id="1404930469" name=""/>
                     <pic:cNvPicPr/>
                   </pic:nvPicPr>
                   <pic:blipFill>
@@ -15163,16 +15223,16 @@
         </w:rPr>
         <w:lastRenderedPageBreak/>
         <w:drawing>
-          <wp:inline distT="0" distB="0" distL="0" distR="0" wp14:anchorId="5358034B" wp14:editId="62F4FBA7">
+          <wp:inline distT="0" distB="0" distL="0" distR="0" wp14:anchorId="7FE0C123" wp14:editId="42AC056D">
             <wp:extent cx="5120640" cy="4627581"/>
             <wp:effectExtent l="19050" t="19050" r="22860" b="20955"/>
-            <wp:docPr id="2042718772" name="Imagem 21"/>
+            <wp:docPr id="220518719" name="Imagem 21"/>
             <wp:cNvGraphicFramePr/>
             <a:graphic xmlns:a="http://schemas.openxmlformats.org/drawingml/2006/main">
               <a:graphicData uri="http://schemas.openxmlformats.org/drawingml/2006/picture">
                 <pic:pic xmlns:pic="http://schemas.openxmlformats.org/drawingml/2006/picture">
                   <pic:nvPicPr>
-                    <pic:cNvPr id="2042718772" name=""/>
+                    <pic:cNvPr id="220518719" name=""/>
                     <pic:cNvPicPr/>
                   </pic:nvPicPr>
                   <pic:blipFill>
@@ -15378,16 +15438,16 @@
           <w:noProof/>
         </w:rPr>
         <w:drawing>
-          <wp:inline distT="0" distB="0" distL="0" distR="0" wp14:anchorId="1967B479" wp14:editId="7FD43EC3">
+          <wp:inline distT="0" distB="0" distL="0" distR="0" wp14:anchorId="21D82D6F" wp14:editId="3A844D0C">
             <wp:extent cx="5120640" cy="1757287"/>
             <wp:effectExtent l="19050" t="19050" r="22860" b="14605"/>
-            <wp:docPr id="640957096" name="Imagem 22"/>
+            <wp:docPr id="1582025767" name="Imagem 22"/>
             <wp:cNvGraphicFramePr/>
             <a:graphic xmlns:a="http://schemas.openxmlformats.org/drawingml/2006/main">
               <a:graphicData uri="http://schemas.openxmlformats.org/drawingml/2006/picture">
                 <pic:pic xmlns:pic="http://schemas.openxmlformats.org/drawingml/2006/picture">
                   <pic:nvPicPr>
-                    <pic:cNvPr id="640957096" name=""/>
+                    <pic:cNvPr id="1582025767" name=""/>
                     <pic:cNvPicPr/>
                   </pic:nvPicPr>
                   <pic:blipFill>
@@ -15500,7 +15560,7 @@
           <w:sz w:val="27"/>
         </w:rPr>
       </w:pPr>
-      <w:bookmarkStart w:id="28" w:name="_Toc240290745"/>
+      <w:bookmarkStart w:id="28" w:name="_Toc240294669"/>
       <w:r>
         <w:rPr>
           <w:rFonts w:ascii="Montserrat" w:hAnsi="Montserrat"/>
@@ -15541,16 +15601,16 @@
         </w:rPr>
         <w:lastRenderedPageBreak/>
         <w:drawing>
-          <wp:inline distT="0" distB="0" distL="0" distR="0" wp14:anchorId="13B33F2F" wp14:editId="1448A0EF">
+          <wp:inline distT="0" distB="0" distL="0" distR="0" wp14:anchorId="5CFC0BAD" wp14:editId="6FFCEA9F">
             <wp:extent cx="5120640" cy="4627581"/>
             <wp:effectExtent l="19050" t="19050" r="22860" b="20955"/>
-            <wp:docPr id="1303957033" name="Imagem 23"/>
+            <wp:docPr id="506926377" name="Imagem 23"/>
             <wp:cNvGraphicFramePr/>
             <a:graphic xmlns:a="http://schemas.openxmlformats.org/drawingml/2006/main">
               <a:graphicData uri="http://schemas.openxmlformats.org/drawingml/2006/picture">
                 <pic:pic xmlns:pic="http://schemas.openxmlformats.org/drawingml/2006/picture">
                   <pic:nvPicPr>
-                    <pic:cNvPr id="1303957033" name=""/>
+                    <pic:cNvPr id="506926377" name=""/>
                     <pic:cNvPicPr/>
                   </pic:nvPicPr>
                   <pic:blipFill>
@@ -15618,16 +15678,16 @@
         </w:rPr>
         <w:lastRenderedPageBreak/>
         <w:drawing>
-          <wp:inline distT="0" distB="0" distL="0" distR="0" wp14:anchorId="2D2F4FA5" wp14:editId="52F93447">
+          <wp:inline distT="0" distB="0" distL="0" distR="0" wp14:anchorId="1A04C222" wp14:editId="454E5C8A">
             <wp:extent cx="5120640" cy="4627581"/>
             <wp:effectExtent l="19050" t="19050" r="22860" b="20955"/>
-            <wp:docPr id="1236773587" name="Imagem 24"/>
+            <wp:docPr id="1331462317" name="Imagem 24"/>
             <wp:cNvGraphicFramePr/>
             <a:graphic xmlns:a="http://schemas.openxmlformats.org/drawingml/2006/main">
               <a:graphicData uri="http://schemas.openxmlformats.org/drawingml/2006/picture">
                 <pic:pic xmlns:pic="http://schemas.openxmlformats.org/drawingml/2006/picture">
                   <pic:nvPicPr>
-                    <pic:cNvPr id="1236773587" name=""/>
+                    <pic:cNvPr id="1331462317" name=""/>
                     <pic:cNvPicPr/>
                   </pic:nvPicPr>
                   <pic:blipFill>
@@ -15864,7 +15924,7 @@
           <w:sz w:val="27"/>
         </w:rPr>
       </w:pPr>
-      <w:bookmarkStart w:id="29" w:name="_Toc240290746"/>
+      <w:bookmarkStart w:id="29" w:name="_Toc240294670"/>
       <w:r>
         <w:rPr>
           <w:rFonts w:ascii="Montserrat" w:hAnsi="Montserrat"/>
@@ -15904,16 +15964,16 @@
           <w:noProof/>
         </w:rPr>
         <w:drawing>
-          <wp:inline distT="0" distB="0" distL="0" distR="0" wp14:anchorId="4A09C9D8" wp14:editId="783D6D72">
+          <wp:inline distT="0" distB="0" distL="0" distR="0" wp14:anchorId="20FE91AB" wp14:editId="2D1C0F71">
             <wp:extent cx="5120640" cy="4627581"/>
             <wp:effectExtent l="19050" t="19050" r="22860" b="20955"/>
-            <wp:docPr id="1643107189" name="Imagem 25"/>
+            <wp:docPr id="1526221864" name="Imagem 25"/>
             <wp:cNvGraphicFramePr/>
             <a:graphic xmlns:a="http://schemas.openxmlformats.org/drawingml/2006/main">
               <a:graphicData uri="http://schemas.openxmlformats.org/drawingml/2006/picture">
                 <pic:pic xmlns:pic="http://schemas.openxmlformats.org/drawingml/2006/picture">
                   <pic:nvPicPr>
-                    <pic:cNvPr id="1643107189" name=""/>
+                    <pic:cNvPr id="1526221864" name=""/>
                     <pic:cNvPicPr/>
                   </pic:nvPicPr>
                   <pic:blipFill>
@@ -15981,16 +16041,16 @@
         </w:rPr>
         <w:lastRenderedPageBreak/>
         <w:drawing>
-          <wp:inline distT="0" distB="0" distL="0" distR="0" wp14:anchorId="07EB59E7" wp14:editId="6F4A3E4A">
+          <wp:inline distT="0" distB="0" distL="0" distR="0" wp14:anchorId="386BE0B1" wp14:editId="40875347">
             <wp:extent cx="5120640" cy="4627581"/>
             <wp:effectExtent l="19050" t="19050" r="22860" b="20955"/>
-            <wp:docPr id="1220622185" name="Imagem 26"/>
+            <wp:docPr id="640915791" name="Imagem 26"/>
             <wp:cNvGraphicFramePr/>
             <a:graphic xmlns:a="http://schemas.openxmlformats.org/drawingml/2006/main">
               <a:graphicData uri="http://schemas.openxmlformats.org/drawingml/2006/picture">
                 <pic:pic xmlns:pic="http://schemas.openxmlformats.org/drawingml/2006/picture">
                   <pic:nvPicPr>
-                    <pic:cNvPr id="1220622185" name=""/>
+                    <pic:cNvPr id="640915791" name=""/>
                     <pic:cNvPicPr/>
                   </pic:nvPicPr>
                   <pic:blipFill>
@@ -16181,7 +16241,7 @@
           <w:sz w:val="27"/>
         </w:rPr>
       </w:pPr>
-      <w:bookmarkStart w:id="30" w:name="_Toc240290747"/>
+      <w:bookmarkStart w:id="30" w:name="_Toc240294671"/>
       <w:r>
         <w:rPr>
           <w:rFonts w:ascii="Montserrat" w:hAnsi="Montserrat"/>
@@ -16221,16 +16281,16 @@
           <w:noProof/>
         </w:rPr>
         <w:drawing>
-          <wp:inline distT="0" distB="0" distL="0" distR="0" wp14:anchorId="6359AD0F" wp14:editId="70735ACD">
+          <wp:inline distT="0" distB="0" distL="0" distR="0" wp14:anchorId="25C99B29" wp14:editId="56B1BB00">
             <wp:extent cx="5120640" cy="4000682"/>
             <wp:effectExtent l="19050" t="19050" r="22860" b="19050"/>
-            <wp:docPr id="1588192575" name="Imagem 27"/>
+            <wp:docPr id="2035597905" name="Imagem 27"/>
             <wp:cNvGraphicFramePr/>
             <a:graphic xmlns:a="http://schemas.openxmlformats.org/drawingml/2006/main">
               <a:graphicData uri="http://schemas.openxmlformats.org/drawingml/2006/picture">
                 <pic:pic xmlns:pic="http://schemas.openxmlformats.org/drawingml/2006/picture">
                   <pic:nvPicPr>
-                    <pic:cNvPr id="1588192575" name=""/>
+                    <pic:cNvPr id="2035597905" name=""/>
                     <pic:cNvPicPr/>
                   </pic:nvPicPr>
                   <pic:blipFill>
@@ -16754,7 +16814,7 @@
           <w:sz w:val="34"/>
         </w:rPr>
       </w:pPr>
-      <w:bookmarkStart w:id="31" w:name="_Toc240290748"/>
+      <w:bookmarkStart w:id="31" w:name="_Toc240294672"/>
       <w:r>
         <w:rPr>
           <w:rFonts w:ascii="Montserrat" w:hAnsi="Montserrat"/>
@@ -16796,7 +16856,7 @@
           <w:sz w:val="27"/>
         </w:rPr>
       </w:pPr>
-      <w:bookmarkStart w:id="32" w:name="_Toc240290749"/>
+      <w:bookmarkStart w:id="32" w:name="_Toc240294673"/>
       <w:r>
         <w:rPr>
           <w:rFonts w:ascii="Montserrat" w:hAnsi="Montserrat"/>
@@ -16836,16 +16896,16 @@
           <w:noProof/>
         </w:rPr>
         <w:drawing>
-          <wp:inline distT="0" distB="0" distL="0" distR="0" wp14:anchorId="0A4D920D" wp14:editId="264A6BDD">
+          <wp:inline distT="0" distB="0" distL="0" distR="0" wp14:anchorId="15474B64" wp14:editId="632F8CCB">
             <wp:extent cx="5120640" cy="4627581"/>
             <wp:effectExtent l="19050" t="19050" r="22860" b="20955"/>
-            <wp:docPr id="997092329" name="Imagem 28"/>
+            <wp:docPr id="2003507038" name="Imagem 28"/>
             <wp:cNvGraphicFramePr/>
             <a:graphic xmlns:a="http://schemas.openxmlformats.org/drawingml/2006/main">
               <a:graphicData uri="http://schemas.openxmlformats.org/drawingml/2006/picture">
                 <pic:pic xmlns:pic="http://schemas.openxmlformats.org/drawingml/2006/picture">
                   <pic:nvPicPr>
-                    <pic:cNvPr id="997092329" name=""/>
+                    <pic:cNvPr id="2003507038" name=""/>
                     <pic:cNvPicPr/>
                   </pic:nvPicPr>
                   <pic:blipFill>
@@ -16913,16 +16973,16 @@
         </w:rPr>
         <w:lastRenderedPageBreak/>
         <w:drawing>
-          <wp:inline distT="0" distB="0" distL="0" distR="0" wp14:anchorId="410D6F54" wp14:editId="74E60972">
+          <wp:inline distT="0" distB="0" distL="0" distR="0" wp14:anchorId="7F0FE8C2" wp14:editId="0BDC2C7D">
             <wp:extent cx="5120640" cy="4627581"/>
             <wp:effectExtent l="19050" t="19050" r="22860" b="20955"/>
-            <wp:docPr id="741084186" name="Imagem 29"/>
+            <wp:docPr id="1767703365" name="Imagem 29"/>
             <wp:cNvGraphicFramePr/>
             <a:graphic xmlns:a="http://schemas.openxmlformats.org/drawingml/2006/main">
               <a:graphicData uri="http://schemas.openxmlformats.org/drawingml/2006/picture">
                 <pic:pic xmlns:pic="http://schemas.openxmlformats.org/drawingml/2006/picture">
                   <pic:nvPicPr>
-                    <pic:cNvPr id="741084186" name=""/>
+                    <pic:cNvPr id="1767703365" name=""/>
                     <pic:cNvPicPr/>
                   </pic:nvPicPr>
                   <pic:blipFill>
@@ -16990,16 +17050,16 @@
         </w:rPr>
         <w:lastRenderedPageBreak/>
         <w:drawing>
-          <wp:inline distT="0" distB="0" distL="0" distR="0" wp14:anchorId="7B093036" wp14:editId="21704F8C">
+          <wp:inline distT="0" distB="0" distL="0" distR="0" wp14:anchorId="494A1375" wp14:editId="30A29A45">
             <wp:extent cx="5120640" cy="4627581"/>
             <wp:effectExtent l="19050" t="19050" r="22860" b="20955"/>
-            <wp:docPr id="1656497393" name="Imagem 30"/>
+            <wp:docPr id="651952102" name="Imagem 30"/>
             <wp:cNvGraphicFramePr/>
             <a:graphic xmlns:a="http://schemas.openxmlformats.org/drawingml/2006/main">
               <a:graphicData uri="http://schemas.openxmlformats.org/drawingml/2006/picture">
                 <pic:pic xmlns:pic="http://schemas.openxmlformats.org/drawingml/2006/picture">
                   <pic:nvPicPr>
-                    <pic:cNvPr id="1656497393" name=""/>
+                    <pic:cNvPr id="651952102" name=""/>
                     <pic:cNvPicPr/>
                   </pic:nvPicPr>
                   <pic:blipFill>
@@ -17201,16 +17261,16 @@
           <w:noProof/>
         </w:rPr>
         <w:drawing>
-          <wp:inline distT="0" distB="0" distL="0" distR="0" wp14:anchorId="7713759A" wp14:editId="127841D6">
+          <wp:inline distT="0" distB="0" distL="0" distR="0" wp14:anchorId="460444C0" wp14:editId="4C011494">
             <wp:extent cx="5120640" cy="1715571"/>
             <wp:effectExtent l="19050" t="19050" r="22860" b="18415"/>
-            <wp:docPr id="875207544" name="Imagem 31"/>
+            <wp:docPr id="1916607449" name="Imagem 31"/>
             <wp:cNvGraphicFramePr/>
             <a:graphic xmlns:a="http://schemas.openxmlformats.org/drawingml/2006/main">
               <a:graphicData uri="http://schemas.openxmlformats.org/drawingml/2006/picture">
                 <pic:pic xmlns:pic="http://schemas.openxmlformats.org/drawingml/2006/picture">
                   <pic:nvPicPr>
-                    <pic:cNvPr id="875207544" name=""/>
+                    <pic:cNvPr id="1916607449" name=""/>
                     <pic:cNvPicPr/>
                   </pic:nvPicPr>
                   <pic:blipFill>
@@ -17347,16 +17407,16 @@
           <w:noProof/>
         </w:rPr>
         <w:drawing>
-          <wp:inline distT="0" distB="0" distL="0" distR="0" wp14:anchorId="597C328A" wp14:editId="7EB114C6">
+          <wp:inline distT="0" distB="0" distL="0" distR="0" wp14:anchorId="575B726D" wp14:editId="272AA885">
             <wp:extent cx="5120640" cy="3282818"/>
             <wp:effectExtent l="19050" t="19050" r="22860" b="13335"/>
-            <wp:docPr id="188267416" name="Imagem 32"/>
+            <wp:docPr id="1466850848" name="Imagem 32"/>
             <wp:cNvGraphicFramePr/>
             <a:graphic xmlns:a="http://schemas.openxmlformats.org/drawingml/2006/main">
               <a:graphicData uri="http://schemas.openxmlformats.org/drawingml/2006/picture">
                 <pic:pic xmlns:pic="http://schemas.openxmlformats.org/drawingml/2006/picture">
                   <pic:nvPicPr>
-                    <pic:cNvPr id="188267416" name=""/>
+                    <pic:cNvPr id="1466850848" name=""/>
                     <pic:cNvPicPr/>
                   </pic:nvPicPr>
                   <pic:blipFill>
@@ -17490,16 +17550,16 @@
           <w:noProof/>
         </w:rPr>
         <w:drawing>
-          <wp:inline distT="0" distB="0" distL="0" distR="0" wp14:anchorId="78B5568B" wp14:editId="5DF3BF41">
+          <wp:inline distT="0" distB="0" distL="0" distR="0" wp14:anchorId="33CF3FB4" wp14:editId="0B96C635">
             <wp:extent cx="5120640" cy="951357"/>
             <wp:effectExtent l="19050" t="19050" r="22860" b="20320"/>
-            <wp:docPr id="51366354" name="Imagem 33"/>
+            <wp:docPr id="90910448" name="Imagem 33"/>
             <wp:cNvGraphicFramePr/>
             <a:graphic xmlns:a="http://schemas.openxmlformats.org/drawingml/2006/main">
               <a:graphicData uri="http://schemas.openxmlformats.org/drawingml/2006/picture">
                 <pic:pic xmlns:pic="http://schemas.openxmlformats.org/drawingml/2006/picture">
                   <pic:nvPicPr>
-                    <pic:cNvPr id="51366354" name=""/>
+                    <pic:cNvPr id="90910448" name=""/>
                     <pic:cNvPicPr/>
                   </pic:nvPicPr>
                   <pic:blipFill>
@@ -17611,16 +17671,16 @@
           <w:noProof/>
         </w:rPr>
         <w:drawing>
-          <wp:inline distT="0" distB="0" distL="0" distR="0" wp14:anchorId="23467582" wp14:editId="466E6D61">
+          <wp:inline distT="0" distB="0" distL="0" distR="0" wp14:anchorId="3B6572BE" wp14:editId="02D2A0A1">
             <wp:extent cx="5120640" cy="1515102"/>
             <wp:effectExtent l="19050" t="19050" r="22860" b="28575"/>
-            <wp:docPr id="2141525389" name="Imagem 34"/>
+            <wp:docPr id="1440261623" name="Imagem 34"/>
             <wp:cNvGraphicFramePr/>
             <a:graphic xmlns:a="http://schemas.openxmlformats.org/drawingml/2006/main">
               <a:graphicData uri="http://schemas.openxmlformats.org/drawingml/2006/picture">
                 <pic:pic xmlns:pic="http://schemas.openxmlformats.org/drawingml/2006/picture">
                   <pic:nvPicPr>
-                    <pic:cNvPr id="2141525389" name=""/>
+                    <pic:cNvPr id="1440261623" name=""/>
                     <pic:cNvPicPr/>
                   </pic:nvPicPr>
                   <pic:blipFill>
@@ -17733,16 +17793,16 @@
           <w:noProof/>
         </w:rPr>
         <w:drawing>
-          <wp:inline distT="0" distB="0" distL="0" distR="0" wp14:anchorId="77FD9E0F" wp14:editId="3954687D">
+          <wp:inline distT="0" distB="0" distL="0" distR="0" wp14:anchorId="722D2E3D" wp14:editId="3E69F094">
             <wp:extent cx="5120640" cy="1391113"/>
             <wp:effectExtent l="19050" t="19050" r="22860" b="19050"/>
-            <wp:docPr id="933106545" name="Imagem 35"/>
+            <wp:docPr id="569074257" name="Imagem 35"/>
             <wp:cNvGraphicFramePr/>
             <a:graphic xmlns:a="http://schemas.openxmlformats.org/drawingml/2006/main">
               <a:graphicData uri="http://schemas.openxmlformats.org/drawingml/2006/picture">
                 <pic:pic xmlns:pic="http://schemas.openxmlformats.org/drawingml/2006/picture">
                   <pic:nvPicPr>
-                    <pic:cNvPr id="933106545" name=""/>
+                    <pic:cNvPr id="569074257" name=""/>
                     <pic:cNvPicPr/>
                   </pic:nvPicPr>
                   <pic:blipFill>
@@ -17854,16 +17914,16 @@
           <w:noProof/>
         </w:rPr>
         <w:drawing>
-          <wp:inline distT="0" distB="0" distL="0" distR="0" wp14:anchorId="06AF54E5" wp14:editId="77E87866">
+          <wp:inline distT="0" distB="0" distL="0" distR="0" wp14:anchorId="7290AB62" wp14:editId="2F128D5C">
             <wp:extent cx="5120640" cy="1125174"/>
             <wp:effectExtent l="19050" t="19050" r="22860" b="18415"/>
-            <wp:docPr id="1407204779" name="Imagem 36"/>
+            <wp:docPr id="1815457217" name="Imagem 36"/>
             <wp:cNvGraphicFramePr/>
             <a:graphic xmlns:a="http://schemas.openxmlformats.org/drawingml/2006/main">
               <a:graphicData uri="http://schemas.openxmlformats.org/drawingml/2006/picture">
                 <pic:pic xmlns:pic="http://schemas.openxmlformats.org/drawingml/2006/picture">
                   <pic:nvPicPr>
-                    <pic:cNvPr id="1407204779" name=""/>
+                    <pic:cNvPr id="1815457217" name=""/>
                     <pic:cNvPicPr/>
                   </pic:nvPicPr>
                   <pic:blipFill>
@@ -17953,7 +18013,7 @@
           <w:sz w:val="27"/>
         </w:rPr>
       </w:pPr>
-      <w:bookmarkStart w:id="33" w:name="_Toc240290750"/>
+      <w:bookmarkStart w:id="33" w:name="_Toc240294674"/>
       <w:r>
         <w:rPr>
           <w:rFonts w:ascii="Montserrat" w:hAnsi="Montserrat"/>
@@ -17993,16 +18053,16 @@
           <w:noProof/>
         </w:rPr>
         <w:drawing>
-          <wp:inline distT="0" distB="0" distL="0" distR="0" wp14:anchorId="282901AC" wp14:editId="1271A77A">
+          <wp:inline distT="0" distB="0" distL="0" distR="0" wp14:anchorId="0A89B4C5" wp14:editId="0F24A46C">
             <wp:extent cx="5120640" cy="4627581"/>
             <wp:effectExtent l="19050" t="19050" r="22860" b="20955"/>
-            <wp:docPr id="90904031" name="Imagem 37"/>
+            <wp:docPr id="2057967556" name="Imagem 37"/>
             <wp:cNvGraphicFramePr/>
             <a:graphic xmlns:a="http://schemas.openxmlformats.org/drawingml/2006/main">
               <a:graphicData uri="http://schemas.openxmlformats.org/drawingml/2006/picture">
                 <pic:pic xmlns:pic="http://schemas.openxmlformats.org/drawingml/2006/picture">
                   <pic:nvPicPr>
-                    <pic:cNvPr id="90904031" name=""/>
+                    <pic:cNvPr id="2057967556" name=""/>
                     <pic:cNvPicPr/>
                   </pic:nvPicPr>
                   <pic:blipFill>
@@ -18070,16 +18130,16 @@
         </w:rPr>
         <w:lastRenderedPageBreak/>
         <w:drawing>
-          <wp:inline distT="0" distB="0" distL="0" distR="0" wp14:anchorId="7DB5D960" wp14:editId="081EED93">
+          <wp:inline distT="0" distB="0" distL="0" distR="0" wp14:anchorId="3188DCFF" wp14:editId="250F872F">
             <wp:extent cx="5120640" cy="4627581"/>
             <wp:effectExtent l="19050" t="19050" r="22860" b="20955"/>
-            <wp:docPr id="1290671870" name="Imagem 38"/>
+            <wp:docPr id="749879268" name="Imagem 38"/>
             <wp:cNvGraphicFramePr/>
             <a:graphic xmlns:a="http://schemas.openxmlformats.org/drawingml/2006/main">
               <a:graphicData uri="http://schemas.openxmlformats.org/drawingml/2006/picture">
                 <pic:pic xmlns:pic="http://schemas.openxmlformats.org/drawingml/2006/picture">
                   <pic:nvPicPr>
-                    <pic:cNvPr id="1290671870" name=""/>
+                    <pic:cNvPr id="749879268" name=""/>
                     <pic:cNvPicPr/>
                   </pic:nvPicPr>
                   <pic:blipFill>
@@ -18248,16 +18308,16 @@
           <w:noProof/>
         </w:rPr>
         <w:drawing>
-          <wp:inline distT="0" distB="0" distL="0" distR="0" wp14:anchorId="5E38188A" wp14:editId="509AD898">
+          <wp:inline distT="0" distB="0" distL="0" distR="0" wp14:anchorId="70F5B619" wp14:editId="0B56F0AD">
             <wp:extent cx="5120640" cy="2144319"/>
             <wp:effectExtent l="19050" t="19050" r="22860" b="27940"/>
-            <wp:docPr id="1749654958" name="Imagem 39"/>
+            <wp:docPr id="940792100" name="Imagem 39"/>
             <wp:cNvGraphicFramePr/>
             <a:graphic xmlns:a="http://schemas.openxmlformats.org/drawingml/2006/main">
               <a:graphicData uri="http://schemas.openxmlformats.org/drawingml/2006/picture">
                 <pic:pic xmlns:pic="http://schemas.openxmlformats.org/drawingml/2006/picture">
                   <pic:nvPicPr>
-                    <pic:cNvPr id="1749654958" name=""/>
+                    <pic:cNvPr id="940792100" name=""/>
                     <pic:cNvPicPr/>
                   </pic:nvPicPr>
                   <pic:blipFill>
@@ -18345,16 +18405,16 @@
           <w:noProof/>
         </w:rPr>
         <w:drawing>
-          <wp:inline distT="0" distB="0" distL="0" distR="0" wp14:anchorId="378FEA89" wp14:editId="24BD6063">
+          <wp:inline distT="0" distB="0" distL="0" distR="0" wp14:anchorId="3B56383B" wp14:editId="3B4D38D8">
             <wp:extent cx="5120640" cy="1055647"/>
             <wp:effectExtent l="19050" t="19050" r="22860" b="11430"/>
-            <wp:docPr id="1535614646" name="Imagem 40"/>
+            <wp:docPr id="176271961" name="Imagem 40"/>
             <wp:cNvGraphicFramePr/>
             <a:graphic xmlns:a="http://schemas.openxmlformats.org/drawingml/2006/main">
               <a:graphicData uri="http://schemas.openxmlformats.org/drawingml/2006/picture">
                 <pic:pic xmlns:pic="http://schemas.openxmlformats.org/drawingml/2006/picture">
                   <pic:nvPicPr>
-                    <pic:cNvPr id="1535614646" name=""/>
+                    <pic:cNvPr id="176271961" name=""/>
                     <pic:cNvPicPr/>
                   </pic:nvPicPr>
                   <pic:blipFill>
@@ -18476,16 +18536,16 @@
           <w:noProof/>
         </w:rPr>
         <w:drawing>
-          <wp:inline distT="0" distB="0" distL="0" distR="0" wp14:anchorId="7474C1A1" wp14:editId="463D9774">
+          <wp:inline distT="0" distB="0" distL="0" distR="0" wp14:anchorId="70F7395E" wp14:editId="36D847D1">
             <wp:extent cx="5120640" cy="3282818"/>
             <wp:effectExtent l="19050" t="19050" r="22860" b="13335"/>
-            <wp:docPr id="1452511653" name="Imagem 41"/>
+            <wp:docPr id="1354080511" name="Imagem 41"/>
             <wp:cNvGraphicFramePr/>
             <a:graphic xmlns:a="http://schemas.openxmlformats.org/drawingml/2006/main">
               <a:graphicData uri="http://schemas.openxmlformats.org/drawingml/2006/picture">
                 <pic:pic xmlns:pic="http://schemas.openxmlformats.org/drawingml/2006/picture">
                   <pic:nvPicPr>
-                    <pic:cNvPr id="1452511653" name=""/>
+                    <pic:cNvPr id="1354080511" name=""/>
                     <pic:cNvPicPr/>
                   </pic:nvPicPr>
                   <pic:blipFill>
@@ -18619,16 +18679,16 @@
         </w:rPr>
         <w:lastRenderedPageBreak/>
         <w:drawing>
-          <wp:inline distT="0" distB="0" distL="0" distR="0" wp14:anchorId="76D7FCBA" wp14:editId="2B1F0FF8">
+          <wp:inline distT="0" distB="0" distL="0" distR="0" wp14:anchorId="5852EAC9" wp14:editId="5DADBC6E">
             <wp:extent cx="5120640" cy="1978034"/>
             <wp:effectExtent l="19050" t="19050" r="22860" b="22225"/>
-            <wp:docPr id="1082208778" name="Imagem 42"/>
+            <wp:docPr id="107114724" name="Imagem 42"/>
             <wp:cNvGraphicFramePr/>
             <a:graphic xmlns:a="http://schemas.openxmlformats.org/drawingml/2006/main">
               <a:graphicData uri="http://schemas.openxmlformats.org/drawingml/2006/picture">
                 <pic:pic xmlns:pic="http://schemas.openxmlformats.org/drawingml/2006/picture">
                   <pic:nvPicPr>
-                    <pic:cNvPr id="1082208778" name=""/>
+                    <pic:cNvPr id="107114724" name=""/>
                     <pic:cNvPicPr/>
                   </pic:nvPicPr>
                   <pic:blipFill>
@@ -18700,7 +18760,7 @@
           <w:sz w:val="34"/>
         </w:rPr>
       </w:pPr>
-      <w:bookmarkStart w:id="34" w:name="_Toc240290751"/>
+      <w:bookmarkStart w:id="34" w:name="_Toc240294675"/>
       <w:r>
         <w:rPr>
           <w:rFonts w:ascii="Montserrat" w:hAnsi="Montserrat"/>
@@ -18760,7 +18820,7 @@
           <w:sz w:val="27"/>
         </w:rPr>
       </w:pPr>
-      <w:bookmarkStart w:id="35" w:name="_Toc240290752"/>
+      <w:bookmarkStart w:id="35" w:name="_Toc240294676"/>
       <w:r>
         <w:rPr>
           <w:rFonts w:ascii="Montserrat" w:hAnsi="Montserrat"/>
@@ -18800,16 +18860,16 @@
           <w:noProof/>
         </w:rPr>
         <w:drawing>
-          <wp:inline distT="0" distB="0" distL="0" distR="0" wp14:anchorId="4F529DC7" wp14:editId="4B730C9E">
+          <wp:inline distT="0" distB="0" distL="0" distR="0" wp14:anchorId="57D0A55D" wp14:editId="204C80FA">
             <wp:extent cx="5303520" cy="4792851"/>
             <wp:effectExtent l="19050" t="19050" r="11430" b="27305"/>
-            <wp:docPr id="1014139133" name="Imagem 43"/>
+            <wp:docPr id="1603666301" name="Imagem 43"/>
             <wp:cNvGraphicFramePr/>
             <a:graphic xmlns:a="http://schemas.openxmlformats.org/drawingml/2006/main">
               <a:graphicData uri="http://schemas.openxmlformats.org/drawingml/2006/picture">
                 <pic:pic xmlns:pic="http://schemas.openxmlformats.org/drawingml/2006/picture">
                   <pic:nvPicPr>
-                    <pic:cNvPr id="1014139133" name=""/>
+                    <pic:cNvPr id="1603666301" name=""/>
                     <pic:cNvPicPr/>
                   </pic:nvPicPr>
                   <pic:blipFill>
@@ -18878,7 +18938,7 @@
           <w:sz w:val="27"/>
         </w:rPr>
       </w:pPr>
-      <w:bookmarkStart w:id="36" w:name="_Toc240290753"/>
+      <w:bookmarkStart w:id="36" w:name="_Toc240294677"/>
       <w:r>
         <w:rPr>
           <w:rFonts w:ascii="Montserrat" w:hAnsi="Montserrat"/>
@@ -18918,16 +18978,16 @@
           <w:noProof/>
         </w:rPr>
         <w:drawing>
-          <wp:inline distT="0" distB="0" distL="0" distR="0" wp14:anchorId="318ED3D0" wp14:editId="527B6123">
+          <wp:inline distT="0" distB="0" distL="0" distR="0" wp14:anchorId="5BAC4CFB" wp14:editId="5C91E5C9">
             <wp:extent cx="5303520" cy="4792851"/>
             <wp:effectExtent l="19050" t="19050" r="11430" b="27305"/>
-            <wp:docPr id="983473561" name="Imagem 44"/>
+            <wp:docPr id="1554040202" name="Imagem 44"/>
             <wp:cNvGraphicFramePr/>
             <a:graphic xmlns:a="http://schemas.openxmlformats.org/drawingml/2006/main">
               <a:graphicData uri="http://schemas.openxmlformats.org/drawingml/2006/picture">
                 <pic:pic xmlns:pic="http://schemas.openxmlformats.org/drawingml/2006/picture">
                   <pic:nvPicPr>
-                    <pic:cNvPr id="983473561" name=""/>
+                    <pic:cNvPr id="1554040202" name=""/>
                     <pic:cNvPicPr/>
                   </pic:nvPicPr>
                   <pic:blipFill>
@@ -18995,7 +19055,7 @@
           <w:sz w:val="27"/>
         </w:rPr>
       </w:pPr>
-      <w:bookmarkStart w:id="37" w:name="_Toc240290754"/>
+      <w:bookmarkStart w:id="37" w:name="_Toc240294678"/>
       <w:r>
         <w:rPr>
           <w:rFonts w:ascii="Montserrat" w:hAnsi="Montserrat"/>
@@ -19036,16 +19096,16 @@
         </w:rPr>
         <w:lastRenderedPageBreak/>
         <w:drawing>
-          <wp:inline distT="0" distB="0" distL="0" distR="0" wp14:anchorId="39D30511" wp14:editId="3014B597">
+          <wp:inline distT="0" distB="0" distL="0" distR="0" wp14:anchorId="052F0D95" wp14:editId="765AFC1D">
             <wp:extent cx="5303520" cy="4792851"/>
             <wp:effectExtent l="19050" t="19050" r="11430" b="27305"/>
-            <wp:docPr id="506243623" name="Imagem 45"/>
+            <wp:docPr id="2014740103" name="Imagem 45"/>
             <wp:cNvGraphicFramePr/>
             <a:graphic xmlns:a="http://schemas.openxmlformats.org/drawingml/2006/main">
               <a:graphicData uri="http://schemas.openxmlformats.org/drawingml/2006/picture">
                 <pic:pic xmlns:pic="http://schemas.openxmlformats.org/drawingml/2006/picture">
                   <pic:nvPicPr>
-                    <pic:cNvPr id="506243623" name=""/>
+                    <pic:cNvPr id="2014740103" name=""/>
                     <pic:cNvPicPr/>
                   </pic:nvPicPr>
                   <pic:blipFill>
@@ -19113,16 +19173,16 @@
         </w:rPr>
         <w:lastRenderedPageBreak/>
         <w:drawing>
-          <wp:inline distT="0" distB="0" distL="0" distR="0" wp14:anchorId="192F523B" wp14:editId="7A9EE1B7">
+          <wp:inline distT="0" distB="0" distL="0" distR="0" wp14:anchorId="050AD432" wp14:editId="76A28E9D">
             <wp:extent cx="5303520" cy="4792851"/>
             <wp:effectExtent l="19050" t="19050" r="11430" b="27305"/>
-            <wp:docPr id="1108983868" name="Imagem 46"/>
+            <wp:docPr id="880086517" name="Imagem 46"/>
             <wp:cNvGraphicFramePr/>
             <a:graphic xmlns:a="http://schemas.openxmlformats.org/drawingml/2006/main">
               <a:graphicData uri="http://schemas.openxmlformats.org/drawingml/2006/picture">
                 <pic:pic xmlns:pic="http://schemas.openxmlformats.org/drawingml/2006/picture">
                   <pic:nvPicPr>
-                    <pic:cNvPr id="1108983868" name=""/>
+                    <pic:cNvPr id="880086517" name=""/>
                     <pic:cNvPicPr/>
                   </pic:nvPicPr>
                   <pic:blipFill>
@@ -19215,7 +19275,7 @@
           <w:sz w:val="34"/>
         </w:rPr>
       </w:pPr>
-      <w:bookmarkStart w:id="38" w:name="_Toc240290755"/>
+      <w:bookmarkStart w:id="38" w:name="_Toc240294679"/>
       <w:r>
         <w:rPr>
           <w:rFonts w:ascii="Montserrat" w:hAnsi="Montserrat"/>
@@ -19257,7 +19317,7 @@
           <w:sz w:val="27"/>
         </w:rPr>
       </w:pPr>
-      <w:bookmarkStart w:id="39" w:name="_Toc240290756"/>
+      <w:bookmarkStart w:id="39" w:name="_Toc240294680"/>
       <w:r>
         <w:rPr>
           <w:rFonts w:ascii="Montserrat" w:hAnsi="Montserrat"/>
@@ -19297,16 +19357,16 @@
           <w:noProof/>
         </w:rPr>
         <w:drawing>
-          <wp:inline distT="0" distB="0" distL="0" distR="0" wp14:anchorId="7A75598A" wp14:editId="1D1A66FD">
+          <wp:inline distT="0" distB="0" distL="0" distR="0" wp14:anchorId="56E97FBC" wp14:editId="777327CF">
             <wp:extent cx="5303520" cy="4792851"/>
             <wp:effectExtent l="19050" t="19050" r="11430" b="27305"/>
-            <wp:docPr id="1707073624" name="Imagem 47"/>
+            <wp:docPr id="685279352" name="Imagem 47"/>
             <wp:cNvGraphicFramePr/>
             <a:graphic xmlns:a="http://schemas.openxmlformats.org/drawingml/2006/main">
               <a:graphicData uri="http://schemas.openxmlformats.org/drawingml/2006/picture">
                 <pic:pic xmlns:pic="http://schemas.openxmlformats.org/drawingml/2006/picture">
                   <pic:nvPicPr>
-                    <pic:cNvPr id="1707073624" name=""/>
+                    <pic:cNvPr id="685279352" name=""/>
                     <pic:cNvPicPr/>
                   </pic:nvPicPr>
                   <pic:blipFill>
@@ -19535,7 +19595,7 @@
           <w:sz w:val="27"/>
         </w:rPr>
       </w:pPr>
-      <w:bookmarkStart w:id="40" w:name="_Toc240290757"/>
+      <w:bookmarkStart w:id="40" w:name="_Toc240294681"/>
       <w:r>
         <w:rPr>
           <w:rFonts w:ascii="Montserrat" w:hAnsi="Montserrat"/>
@@ -19575,16 +19635,16 @@
           <w:noProof/>
         </w:rPr>
         <w:drawing>
-          <wp:inline distT="0" distB="0" distL="0" distR="0" wp14:anchorId="59FC1C7E" wp14:editId="76D41320">
+          <wp:inline distT="0" distB="0" distL="0" distR="0" wp14:anchorId="7FA97728" wp14:editId="140A8759">
             <wp:extent cx="5303520" cy="4792851"/>
             <wp:effectExtent l="19050" t="19050" r="11430" b="27305"/>
-            <wp:docPr id="1413068361" name="Imagem 48"/>
+            <wp:docPr id="1391106181" name="Imagem 48"/>
             <wp:cNvGraphicFramePr/>
             <a:graphic xmlns:a="http://schemas.openxmlformats.org/drawingml/2006/main">
               <a:graphicData uri="http://schemas.openxmlformats.org/drawingml/2006/picture">
                 <pic:pic xmlns:pic="http://schemas.openxmlformats.org/drawingml/2006/picture">
                   <pic:nvPicPr>
-                    <pic:cNvPr id="1413068361" name=""/>
+                    <pic:cNvPr id="1391106181" name=""/>
                     <pic:cNvPicPr/>
                   </pic:nvPicPr>
                   <pic:blipFill>
@@ -19652,7 +19712,7 @@
           <w:sz w:val="27"/>
         </w:rPr>
       </w:pPr>
-      <w:bookmarkStart w:id="41" w:name="_Toc240290758"/>
+      <w:bookmarkStart w:id="41" w:name="_Toc240294682"/>
       <w:r>
         <w:rPr>
           <w:rFonts w:ascii="Montserrat" w:hAnsi="Montserrat"/>
@@ -19693,16 +19753,16 @@
         </w:rPr>
         <w:lastRenderedPageBreak/>
         <w:drawing>
-          <wp:inline distT="0" distB="0" distL="0" distR="0" wp14:anchorId="4462BDBE" wp14:editId="6EF3AE74">
+          <wp:inline distT="0" distB="0" distL="0" distR="0" wp14:anchorId="3B03E1C8" wp14:editId="0E5352A0">
             <wp:extent cx="5303520" cy="4792851"/>
             <wp:effectExtent l="19050" t="19050" r="11430" b="27305"/>
-            <wp:docPr id="137825796" name="Imagem 49"/>
+            <wp:docPr id="595205703" name="Imagem 49"/>
             <wp:cNvGraphicFramePr/>
             <a:graphic xmlns:a="http://schemas.openxmlformats.org/drawingml/2006/main">
               <a:graphicData uri="http://schemas.openxmlformats.org/drawingml/2006/picture">
                 <pic:pic xmlns:pic="http://schemas.openxmlformats.org/drawingml/2006/picture">
                   <pic:nvPicPr>
-                    <pic:cNvPr id="137825796" name=""/>
+                    <pic:cNvPr id="595205703" name=""/>
                     <pic:cNvPicPr/>
                   </pic:nvPicPr>
                   <pic:blipFill>
@@ -19846,7 +19906,7 @@
           <w:sz w:val="27"/>
         </w:rPr>
       </w:pPr>
-      <w:bookmarkStart w:id="42" w:name="_Toc240290759"/>
+      <w:bookmarkStart w:id="42" w:name="_Toc240294683"/>
       <w:r>
         <w:rPr>
           <w:rFonts w:ascii="Montserrat" w:hAnsi="Montserrat"/>
@@ -20111,16 +20171,16 @@
           <w:noProof/>
         </w:rPr>
         <w:drawing>
-          <wp:inline distT="0" distB="0" distL="0" distR="0" wp14:anchorId="142659E2" wp14:editId="417C8A56">
+          <wp:inline distT="0" distB="0" distL="0" distR="0" wp14:anchorId="12EAC82C" wp14:editId="40675EFE">
             <wp:extent cx="5303520" cy="4267180"/>
             <wp:effectExtent l="19050" t="19050" r="11430" b="19685"/>
-            <wp:docPr id="201101583" name="Imagem 50"/>
+            <wp:docPr id="487583804" name="Imagem 50"/>
             <wp:cNvGraphicFramePr/>
             <a:graphic xmlns:a="http://schemas.openxmlformats.org/drawingml/2006/main">
               <a:graphicData uri="http://schemas.openxmlformats.org/drawingml/2006/picture">
                 <pic:pic xmlns:pic="http://schemas.openxmlformats.org/drawingml/2006/picture">
                   <pic:nvPicPr>
-                    <pic:cNvPr id="201101583" name=""/>
+                    <pic:cNvPr id="487583804" name=""/>
                     <pic:cNvPicPr/>
                   </pic:nvPicPr>
                   <pic:blipFill>
@@ -20188,16 +20248,16 @@
           <w:noProof/>
         </w:rPr>
         <w:drawing>
-          <wp:inline distT="0" distB="0" distL="0" distR="0" wp14:anchorId="00922F6D" wp14:editId="58B982E6">
+          <wp:inline distT="0" distB="0" distL="0" distR="0" wp14:anchorId="570EB402" wp14:editId="48800723">
             <wp:extent cx="5303520" cy="3382059"/>
             <wp:effectExtent l="19050" t="19050" r="11430" b="27940"/>
-            <wp:docPr id="462628021" name="Imagem 51"/>
+            <wp:docPr id="1371561770" name="Imagem 51"/>
             <wp:cNvGraphicFramePr/>
             <a:graphic xmlns:a="http://schemas.openxmlformats.org/drawingml/2006/main">
               <a:graphicData uri="http://schemas.openxmlformats.org/drawingml/2006/picture">
                 <pic:pic xmlns:pic="http://schemas.openxmlformats.org/drawingml/2006/picture">
                   <pic:nvPicPr>
-                    <pic:cNvPr id="462628021" name=""/>
+                    <pic:cNvPr id="1371561770" name=""/>
                     <pic:cNvPicPr/>
                   </pic:nvPicPr>
                   <pic:blipFill>
@@ -20265,16 +20325,16 @@
         </w:rPr>
         <w:lastRenderedPageBreak/>
         <w:drawing>
-          <wp:inline distT="0" distB="0" distL="0" distR="0" wp14:anchorId="7440E8F9" wp14:editId="12EC5A85">
+          <wp:inline distT="0" distB="0" distL="0" distR="0" wp14:anchorId="08EF74CA" wp14:editId="42170614">
             <wp:extent cx="5303520" cy="4417800"/>
             <wp:effectExtent l="19050" t="19050" r="11430" b="20955"/>
-            <wp:docPr id="2093413748" name="Imagem 52"/>
+            <wp:docPr id="693728648" name="Imagem 52"/>
             <wp:cNvGraphicFramePr/>
             <a:graphic xmlns:a="http://schemas.openxmlformats.org/drawingml/2006/main">
               <a:graphicData uri="http://schemas.openxmlformats.org/drawingml/2006/picture">
                 <pic:pic xmlns:pic="http://schemas.openxmlformats.org/drawingml/2006/picture">
                   <pic:nvPicPr>
-                    <pic:cNvPr id="2093413748" name=""/>
+                    <pic:cNvPr id="693728648" name=""/>
                     <pic:cNvPicPr/>
                   </pic:nvPicPr>
                   <pic:blipFill>
@@ -20384,7 +20444,7 @@
           <w:sz w:val="27"/>
         </w:rPr>
       </w:pPr>
-      <w:bookmarkStart w:id="43" w:name="_Toc240290760"/>
+      <w:bookmarkStart w:id="43" w:name="_Toc240294684"/>
       <w:r>
         <w:rPr>
           <w:rFonts w:ascii="Montserrat" w:hAnsi="Montserrat"/>
@@ -20650,16 +20710,16 @@
         </w:rPr>
         <w:lastRenderedPageBreak/>
         <w:drawing>
-          <wp:inline distT="0" distB="0" distL="0" distR="0" wp14:anchorId="13333F51" wp14:editId="7A7A810D">
+          <wp:inline distT="0" distB="0" distL="0" distR="0" wp14:anchorId="6E8B14FF" wp14:editId="21FCB51F">
             <wp:extent cx="5303520" cy="7628836"/>
             <wp:effectExtent l="19050" t="19050" r="11430" b="10795"/>
-            <wp:docPr id="1564212443" name="Imagem 53"/>
+            <wp:docPr id="1764497617" name="Imagem 53"/>
             <wp:cNvGraphicFramePr/>
             <a:graphic xmlns:a="http://schemas.openxmlformats.org/drawingml/2006/main">
               <a:graphicData uri="http://schemas.openxmlformats.org/drawingml/2006/picture">
                 <pic:pic xmlns:pic="http://schemas.openxmlformats.org/drawingml/2006/picture">
                   <pic:nvPicPr>
-                    <pic:cNvPr id="1564212443" name=""/>
+                    <pic:cNvPr id="1764497617" name=""/>
                     <pic:cNvPicPr/>
                   </pic:nvPicPr>
                   <pic:blipFill>
@@ -20791,7 +20851,7 @@
           <w:sz w:val="27"/>
         </w:rPr>
       </w:pPr>
-      <w:bookmarkStart w:id="44" w:name="_Toc240290761"/>
+      <w:bookmarkStart w:id="44" w:name="_Toc240294685"/>
       <w:r>
         <w:rPr>
           <w:rFonts w:ascii="Montserrat" w:hAnsi="Montserrat"/>
@@ -20944,7 +21004,7 @@
           <w:sz w:val="27"/>
         </w:rPr>
       </w:pPr>
-      <w:bookmarkStart w:id="45" w:name="_Toc240290762"/>
+      <w:bookmarkStart w:id="45" w:name="_Toc240294686"/>
       <w:r>
         <w:rPr>
           <w:rFonts w:ascii="Montserrat" w:hAnsi="Montserrat"/>
@@ -21237,16 +21297,16 @@
           <w:noProof/>
         </w:rPr>
         <w:drawing>
-          <wp:inline distT="0" distB="0" distL="0" distR="0" wp14:anchorId="4C676F51" wp14:editId="1239D0B9">
+          <wp:inline distT="0" distB="0" distL="0" distR="0" wp14:anchorId="509FA544" wp14:editId="4880FC5B">
             <wp:extent cx="5303520" cy="1351384"/>
             <wp:effectExtent l="19050" t="19050" r="11430" b="20320"/>
-            <wp:docPr id="636231734" name="Imagem 54"/>
+            <wp:docPr id="1983562010" name="Imagem 54"/>
             <wp:cNvGraphicFramePr/>
             <a:graphic xmlns:a="http://schemas.openxmlformats.org/drawingml/2006/main">
               <a:graphicData uri="http://schemas.openxmlformats.org/drawingml/2006/picture">
                 <pic:pic xmlns:pic="http://schemas.openxmlformats.org/drawingml/2006/picture">
                   <pic:nvPicPr>
-                    <pic:cNvPr id="636231734" name=""/>
+                    <pic:cNvPr id="1983562010" name=""/>
                     <pic:cNvPicPr/>
                   </pic:nvPicPr>
                   <pic:blipFill>
@@ -21314,7 +21374,7 @@
           <w:sz w:val="27"/>
         </w:rPr>
       </w:pPr>
-      <w:bookmarkStart w:id="46" w:name="_Toc240290763"/>
+      <w:bookmarkStart w:id="46" w:name="_Toc240294687"/>
       <w:r>
         <w:rPr>
           <w:rFonts w:ascii="Montserrat" w:hAnsi="Montserrat"/>
@@ -21459,16 +21519,16 @@
           <w:noProof/>
         </w:rPr>
         <w:drawing>
-          <wp:inline distT="0" distB="0" distL="0" distR="0" wp14:anchorId="59F4D5EB" wp14:editId="48B81545">
+          <wp:inline distT="0" distB="0" distL="0" distR="0" wp14:anchorId="116306FA" wp14:editId="7841F593">
             <wp:extent cx="5303520" cy="1422793"/>
             <wp:effectExtent l="19050" t="19050" r="11430" b="25400"/>
-            <wp:docPr id="470613502" name="Imagem 55"/>
+            <wp:docPr id="316324245" name="Imagem 55"/>
             <wp:cNvGraphicFramePr/>
             <a:graphic xmlns:a="http://schemas.openxmlformats.org/drawingml/2006/main">
               <a:graphicData uri="http://schemas.openxmlformats.org/drawingml/2006/picture">
                 <pic:pic xmlns:pic="http://schemas.openxmlformats.org/drawingml/2006/picture">
                   <pic:nvPicPr>
-                    <pic:cNvPr id="470613502" name=""/>
+                    <pic:cNvPr id="316324245" name=""/>
                     <pic:cNvPicPr/>
                   </pic:nvPicPr>
                   <pic:blipFill>
@@ -21623,16 +21683,16 @@
         </w:rPr>
         <w:lastRenderedPageBreak/>
         <w:drawing>
-          <wp:inline distT="0" distB="0" distL="0" distR="0" wp14:anchorId="545340E9" wp14:editId="6266E660">
+          <wp:inline distT="0" distB="0" distL="0" distR="0" wp14:anchorId="25D82605" wp14:editId="7E8F7F41">
             <wp:extent cx="5303520" cy="1841050"/>
             <wp:effectExtent l="19050" t="19050" r="11430" b="26035"/>
-            <wp:docPr id="254334249" name="Imagem 56"/>
+            <wp:docPr id="281970336" name="Imagem 56"/>
             <wp:cNvGraphicFramePr/>
             <a:graphic xmlns:a="http://schemas.openxmlformats.org/drawingml/2006/main">
               <a:graphicData uri="http://schemas.openxmlformats.org/drawingml/2006/picture">
                 <pic:pic xmlns:pic="http://schemas.openxmlformats.org/drawingml/2006/picture">
                   <pic:nvPicPr>
-                    <pic:cNvPr id="254334249" name=""/>
+                    <pic:cNvPr id="281970336" name=""/>
                     <pic:cNvPicPr/>
                   </pic:nvPicPr>
                   <pic:blipFill>
@@ -21786,16 +21846,16 @@
           <w:noProof/>
         </w:rPr>
         <w:drawing>
-          <wp:inline distT="0" distB="0" distL="0" distR="0" wp14:anchorId="5C2C72B9" wp14:editId="5FCB42BE">
+          <wp:inline distT="0" distB="0" distL="0" distR="0" wp14:anchorId="3E36CFBE" wp14:editId="38FD2132">
             <wp:extent cx="5303520" cy="303041"/>
             <wp:effectExtent l="19050" t="19050" r="11430" b="20955"/>
-            <wp:docPr id="1688215810" name="Imagem 57"/>
+            <wp:docPr id="1798298379" name="Imagem 57"/>
             <wp:cNvGraphicFramePr/>
             <a:graphic xmlns:a="http://schemas.openxmlformats.org/drawingml/2006/main">
               <a:graphicData uri="http://schemas.openxmlformats.org/drawingml/2006/picture">
                 <pic:pic xmlns:pic="http://schemas.openxmlformats.org/drawingml/2006/picture">
                   <pic:nvPicPr>
-                    <pic:cNvPr id="1688215810" name=""/>
+                    <pic:cNvPr id="1798298379" name=""/>
                     <pic:cNvPicPr/>
                   </pic:nvPicPr>
                   <pic:blipFill>
@@ -21863,16 +21923,16 @@
         </w:rPr>
         <w:lastRenderedPageBreak/>
         <w:drawing>
-          <wp:inline distT="0" distB="0" distL="0" distR="0" wp14:anchorId="76E07E89" wp14:editId="5ED6C5E9">
+          <wp:inline distT="0" distB="0" distL="0" distR="0" wp14:anchorId="7458837F" wp14:editId="32E357F2">
             <wp:extent cx="5303520" cy="2983005"/>
             <wp:effectExtent l="19050" t="19050" r="11430" b="27305"/>
-            <wp:docPr id="563016082" name="Imagem 58"/>
+            <wp:docPr id="27335764" name="Imagem 58"/>
             <wp:cNvGraphicFramePr/>
             <a:graphic xmlns:a="http://schemas.openxmlformats.org/drawingml/2006/main">
               <a:graphicData uri="http://schemas.openxmlformats.org/drawingml/2006/picture">
                 <pic:pic xmlns:pic="http://schemas.openxmlformats.org/drawingml/2006/picture">
                   <pic:nvPicPr>
-                    <pic:cNvPr id="563016082" name=""/>
+                    <pic:cNvPr id="27335764" name=""/>
                     <pic:cNvPicPr/>
                   </pic:nvPicPr>
                   <pic:blipFill>
@@ -21944,7 +22004,7 @@
           <w:sz w:val="34"/>
         </w:rPr>
       </w:pPr>
-      <w:bookmarkStart w:id="47" w:name="_Toc240290764"/>
+      <w:bookmarkStart w:id="47" w:name="_Toc240294688"/>
       <w:r>
         <w:rPr>
           <w:rFonts w:ascii="Montserrat" w:hAnsi="Montserrat"/>
@@ -22188,7 +22248,7 @@
           <w:sz w:val="34"/>
         </w:rPr>
       </w:pPr>
-      <w:bookmarkStart w:id="48" w:name="_Toc240290765"/>
+      <w:bookmarkStart w:id="48" w:name="_Toc240294689"/>
       <w:r>
         <w:rPr>
           <w:rFonts w:ascii="Montserrat" w:hAnsi="Montserrat"/>
@@ -23976,7 +24036,7 @@
 <file path=word/numbering.xml><?xml version="1.0" encoding="utf-8"?>
 <w:numbering xmlns:wpc="http://schemas.microsoft.com/office/word/2010/wordprocessingCanvas" xmlns:cx="http://schemas.microsoft.com/office/drawing/2014/chartex" xmlns:cx1="http://schemas.microsoft.com/office/drawing/2015/9/8/chartex" xmlns:cx2="http://schemas.microsoft.com/office/drawing/2015/10/21/chartex" xmlns:cx3="http://schemas.microsoft.com/office/drawing/2016/5/9/chartex" xmlns:cx4="http://schemas.microsoft.com/office/drawing/2016/5/10/chartex" xmlns:cx5="http://schemas.microsoft.com/office/drawing/2016/5/11/chartex" xmlns:cx6="http://schemas.microsoft.com/office/drawing/2016/5/12/chartex" xmlns:cx7="http://schemas.microsoft.com/office/drawing/2016/5/13/chartex" xmlns:cx8="http://schemas.microsoft.com/office/drawing/2016/5/14/chartex" xmlns:mc="http://schemas.openxmlformats.org/markup-compatibility/2006" xmlns:aink="http://schemas.microsoft.com/office/drawing/2016/ink" xmlns:am3d="http://schemas.microsoft.com/office/drawing/2017/model3d" xmlns:o="urn:schemas-microsoft-com:office:office" xmlns:oel="http://schemas.microsoft.com/office/2019/extlst" xmlns:r="http://schemas.openxmlformats.org/officeDocument/2006/relationships" xmlns:m="http://schemas.openxmlformats.org/officeDocument/2006/math" xmlns:v="urn:schemas-microsoft-com:vml" xmlns:wp14="http://schemas.microsoft.com/office/word/2010/wordprocessingDrawing" xmlns:wp="http://schemas.openxmlformats.org/drawingml/2006/wordprocessingDrawing" xmlns:w10="urn:schemas-microsoft-com:office:word" xmlns:w="http://schemas.openxmlformats.org/wordprocessingml/2006/main" xmlns:w14="http://schemas.microsoft.com/office/word/2010/wordml" xmlns:w15="http://schemas.microsoft.com/office/word/2012/wordml" xmlns:w16cex="http://schemas.microsoft.com/office/word/2018/wordml/cex" xmlns:w16cid="http://schemas.microsoft.com/office/word/2016/wordml/cid" xmlns:w16="http://schemas.microsoft.com/office/word/2018/wordml" xmlns:w16du="http://schemas.microsoft.com/office/word/2023/wordml/word16du" xmlns:w16sdtdh="http://schemas.microsoft.com/office/word/2020/wordml/sdtdatahash" xmlns:w16sdtfl="http://schemas.microsoft.com/office/word/2024/wordml/sdtformatlock" xmlns:w16se="http://schemas.microsoft.com/office/word/2015/wordml/symex" xmlns:wpg="http://schemas.microsoft.com/office/word/2010/wordprocessingGroup" xmlns:wpi="http://schemas.microsoft.com/office/word/2010/wordprocessingInk" xmlns:wne="http://schemas.microsoft.com/office/word/2006/wordml" xmlns:wps="http://schemas.microsoft.com/office/word/2010/wordprocessingShape" mc:Ignorable="w14 w15 w16se w16cid w16 w16cex w16sdtdh w16sdtfl w16du wp14">
   <w:abstractNum w:abstractNumId="0" w15:restartNumberingAfterBreak="0">
-    <w:nsid w:val="09203697"/>
+    <w:nsid w:val="042103FA"/>
     <w:multiLevelType w:val="singleLevel"/>
     <w:tmpl w:val="04160001"/>
     <w:lvl w:ilvl="0">
@@ -23993,7 +24053,7 @@
     </w:lvl>
   </w:abstractNum>
   <w:abstractNum w:abstractNumId="1" w15:restartNumberingAfterBreak="0">
-    <w:nsid w:val="098F6A9A"/>
+    <w:nsid w:val="0B851F5A"/>
     <w:multiLevelType w:val="singleLevel"/>
     <w:tmpl w:val="04160001"/>
     <w:lvl w:ilvl="0">
@@ -24010,7 +24070,7 @@
     </w:lvl>
   </w:abstractNum>
   <w:abstractNum w:abstractNumId="2" w15:restartNumberingAfterBreak="0">
-    <w:nsid w:val="0B003BFE"/>
+    <w:nsid w:val="0D7913AF"/>
     <w:multiLevelType w:val="singleLevel"/>
     <w:tmpl w:val="04160001"/>
     <w:lvl w:ilvl="0">
@@ -24027,7 +24087,7 @@
     </w:lvl>
   </w:abstractNum>
   <w:abstractNum w:abstractNumId="3" w15:restartNumberingAfterBreak="0">
-    <w:nsid w:val="0FBD0500"/>
+    <w:nsid w:val="16F20A1B"/>
     <w:multiLevelType w:val="singleLevel"/>
     <w:tmpl w:val="04160001"/>
     <w:lvl w:ilvl="0">
@@ -24044,7 +24104,7 @@
     </w:lvl>
   </w:abstractNum>
   <w:abstractNum w:abstractNumId="4" w15:restartNumberingAfterBreak="0">
-    <w:nsid w:val="14C209F4"/>
+    <w:nsid w:val="17AD7598"/>
     <w:multiLevelType w:val="singleLevel"/>
     <w:tmpl w:val="04160001"/>
     <w:lvl w:ilvl="0">
@@ -24061,7 +24121,7 @@
     </w:lvl>
   </w:abstractNum>
   <w:abstractNum w:abstractNumId="5" w15:restartNumberingAfterBreak="0">
-    <w:nsid w:val="1D1B3BFD"/>
+    <w:nsid w:val="18831F33"/>
     <w:multiLevelType w:val="singleLevel"/>
     <w:tmpl w:val="04160001"/>
     <w:lvl w:ilvl="0">
@@ -24078,7 +24138,7 @@
     </w:lvl>
   </w:abstractNum>
   <w:abstractNum w:abstractNumId="6" w15:restartNumberingAfterBreak="0">
-    <w:nsid w:val="1D7F469E"/>
+    <w:nsid w:val="1A393AD5"/>
     <w:multiLevelType w:val="singleLevel"/>
     <w:tmpl w:val="04160001"/>
     <w:lvl w:ilvl="0">
@@ -24095,7 +24155,7 @@
     </w:lvl>
   </w:abstractNum>
   <w:abstractNum w:abstractNumId="7" w15:restartNumberingAfterBreak="0">
-    <w:nsid w:val="20157DC8"/>
+    <w:nsid w:val="1F6473FB"/>
     <w:multiLevelType w:val="singleLevel"/>
     <w:tmpl w:val="04160001"/>
     <w:lvl w:ilvl="0">
@@ -24112,7 +24172,7 @@
     </w:lvl>
   </w:abstractNum>
   <w:abstractNum w:abstractNumId="8" w15:restartNumberingAfterBreak="0">
-    <w:nsid w:val="206621A1"/>
+    <w:nsid w:val="1F830D5B"/>
     <w:multiLevelType w:val="singleLevel"/>
     <w:tmpl w:val="04160001"/>
     <w:lvl w:ilvl="0">
@@ -24129,7 +24189,7 @@
     </w:lvl>
   </w:abstractNum>
   <w:abstractNum w:abstractNumId="9" w15:restartNumberingAfterBreak="0">
-    <w:nsid w:val="2184723C"/>
+    <w:nsid w:val="1F855ED0"/>
     <w:multiLevelType w:val="singleLevel"/>
     <w:tmpl w:val="04160001"/>
     <w:lvl w:ilvl="0">
@@ -24146,7 +24206,7 @@
     </w:lvl>
   </w:abstractNum>
   <w:abstractNum w:abstractNumId="10" w15:restartNumberingAfterBreak="0">
-    <w:nsid w:val="227B77BE"/>
+    <w:nsid w:val="24627A12"/>
     <w:multiLevelType w:val="singleLevel"/>
     <w:tmpl w:val="04160001"/>
     <w:lvl w:ilvl="0">
@@ -24163,7 +24223,7 @@
     </w:lvl>
   </w:abstractNum>
   <w:abstractNum w:abstractNumId="11" w15:restartNumberingAfterBreak="0">
-    <w:nsid w:val="25795B95"/>
+    <w:nsid w:val="282C672C"/>
     <w:multiLevelType w:val="singleLevel"/>
     <w:tmpl w:val="04160001"/>
     <w:lvl w:ilvl="0">
@@ -24180,7 +24240,7 @@
     </w:lvl>
   </w:abstractNum>
   <w:abstractNum w:abstractNumId="12" w15:restartNumberingAfterBreak="0">
-    <w:nsid w:val="2AD911D4"/>
+    <w:nsid w:val="29BD7C2E"/>
     <w:multiLevelType w:val="singleLevel"/>
     <w:tmpl w:val="04160001"/>
     <w:lvl w:ilvl="0">
@@ -24197,7 +24257,7 @@
     </w:lvl>
   </w:abstractNum>
   <w:abstractNum w:abstractNumId="13" w15:restartNumberingAfterBreak="0">
-    <w:nsid w:val="371A0DBA"/>
+    <w:nsid w:val="2E52389E"/>
     <w:multiLevelType w:val="singleLevel"/>
     <w:tmpl w:val="04160001"/>
     <w:lvl w:ilvl="0">
@@ -24214,7 +24274,7 @@
     </w:lvl>
   </w:abstractNum>
   <w:abstractNum w:abstractNumId="14" w15:restartNumberingAfterBreak="0">
-    <w:nsid w:val="376130F8"/>
+    <w:nsid w:val="307238BE"/>
     <w:multiLevelType w:val="singleLevel"/>
     <w:tmpl w:val="04160001"/>
     <w:lvl w:ilvl="0">
@@ -24231,7 +24291,7 @@
     </w:lvl>
   </w:abstractNum>
   <w:abstractNum w:abstractNumId="15" w15:restartNumberingAfterBreak="0">
-    <w:nsid w:val="383A5916"/>
+    <w:nsid w:val="310F47E3"/>
     <w:multiLevelType w:val="singleLevel"/>
     <w:tmpl w:val="04160001"/>
     <w:lvl w:ilvl="0">
@@ -24248,7 +24308,7 @@
     </w:lvl>
   </w:abstractNum>
   <w:abstractNum w:abstractNumId="16" w15:restartNumberingAfterBreak="0">
-    <w:nsid w:val="3B637BEA"/>
+    <w:nsid w:val="3482253E"/>
     <w:multiLevelType w:val="singleLevel"/>
     <w:tmpl w:val="04160001"/>
     <w:lvl w:ilvl="0">
@@ -24265,7 +24325,7 @@
     </w:lvl>
   </w:abstractNum>
   <w:abstractNum w:abstractNumId="17" w15:restartNumberingAfterBreak="0">
-    <w:nsid w:val="3FF02586"/>
+    <w:nsid w:val="368E1734"/>
     <w:multiLevelType w:val="singleLevel"/>
     <w:tmpl w:val="04160001"/>
     <w:lvl w:ilvl="0">
@@ -24282,7 +24342,7 @@
     </w:lvl>
   </w:abstractNum>
   <w:abstractNum w:abstractNumId="18" w15:restartNumberingAfterBreak="0">
-    <w:nsid w:val="486A5C36"/>
+    <w:nsid w:val="3CEB3A0E"/>
     <w:multiLevelType w:val="singleLevel"/>
     <w:tmpl w:val="04160001"/>
     <w:lvl w:ilvl="0">
@@ -24299,7 +24359,7 @@
     </w:lvl>
   </w:abstractNum>
   <w:abstractNum w:abstractNumId="19" w15:restartNumberingAfterBreak="0">
-    <w:nsid w:val="4905185D"/>
+    <w:nsid w:val="3EDC31F7"/>
     <w:multiLevelType w:val="singleLevel"/>
     <w:tmpl w:val="04160001"/>
     <w:lvl w:ilvl="0">
@@ -24316,7 +24376,7 @@
     </w:lvl>
   </w:abstractNum>
   <w:abstractNum w:abstractNumId="20" w15:restartNumberingAfterBreak="0">
-    <w:nsid w:val="4B6B193D"/>
+    <w:nsid w:val="42130AFF"/>
     <w:multiLevelType w:val="singleLevel"/>
     <w:tmpl w:val="04160001"/>
     <w:lvl w:ilvl="0">
@@ -24333,7 +24393,7 @@
     </w:lvl>
   </w:abstractNum>
   <w:abstractNum w:abstractNumId="21" w15:restartNumberingAfterBreak="0">
-    <w:nsid w:val="4E21010E"/>
+    <w:nsid w:val="443B4743"/>
     <w:multiLevelType w:val="singleLevel"/>
     <w:tmpl w:val="04160001"/>
     <w:lvl w:ilvl="0">
@@ -24350,7 +24410,7 @@
     </w:lvl>
   </w:abstractNum>
   <w:abstractNum w:abstractNumId="22" w15:restartNumberingAfterBreak="0">
-    <w:nsid w:val="4F5B235E"/>
+    <w:nsid w:val="453A7948"/>
     <w:multiLevelType w:val="singleLevel"/>
     <w:tmpl w:val="04160001"/>
     <w:lvl w:ilvl="0">
@@ -24367,7 +24427,7 @@
     </w:lvl>
   </w:abstractNum>
   <w:abstractNum w:abstractNumId="23" w15:restartNumberingAfterBreak="0">
-    <w:nsid w:val="53C7479C"/>
+    <w:nsid w:val="48580CE2"/>
     <w:multiLevelType w:val="singleLevel"/>
     <w:tmpl w:val="04160001"/>
     <w:lvl w:ilvl="0">
@@ -24384,7 +24444,7 @@
     </w:lvl>
   </w:abstractNum>
   <w:abstractNum w:abstractNumId="24" w15:restartNumberingAfterBreak="0">
-    <w:nsid w:val="54260023"/>
+    <w:nsid w:val="49B9769A"/>
     <w:multiLevelType w:val="singleLevel"/>
     <w:tmpl w:val="04160001"/>
     <w:lvl w:ilvl="0">
@@ -24401,7 +24461,7 @@
     </w:lvl>
   </w:abstractNum>
   <w:abstractNum w:abstractNumId="25" w15:restartNumberingAfterBreak="0">
-    <w:nsid w:val="597760EA"/>
+    <w:nsid w:val="4C0E7A82"/>
     <w:multiLevelType w:val="singleLevel"/>
     <w:tmpl w:val="04160001"/>
     <w:lvl w:ilvl="0">
@@ -24418,7 +24478,7 @@
     </w:lvl>
   </w:abstractNum>
   <w:abstractNum w:abstractNumId="26" w15:restartNumberingAfterBreak="0">
-    <w:nsid w:val="5EA11692"/>
+    <w:nsid w:val="50BE466A"/>
     <w:multiLevelType w:val="singleLevel"/>
     <w:tmpl w:val="04160001"/>
     <w:lvl w:ilvl="0">
@@ -24435,7 +24495,7 @@
     </w:lvl>
   </w:abstractNum>
   <w:abstractNum w:abstractNumId="27" w15:restartNumberingAfterBreak="0">
-    <w:nsid w:val="6EE054B7"/>
+    <w:nsid w:val="550E4929"/>
     <w:multiLevelType w:val="singleLevel"/>
     <w:tmpl w:val="04160001"/>
     <w:lvl w:ilvl="0">
@@ -24452,7 +24512,7 @@
     </w:lvl>
   </w:abstractNum>
   <w:abstractNum w:abstractNumId="28" w15:restartNumberingAfterBreak="0">
-    <w:nsid w:val="6F0D1AC5"/>
+    <w:nsid w:val="55961265"/>
     <w:multiLevelType w:val="singleLevel"/>
     <w:tmpl w:val="04160001"/>
     <w:lvl w:ilvl="0">
@@ -24469,7 +24529,7 @@
     </w:lvl>
   </w:abstractNum>
   <w:abstractNum w:abstractNumId="29" w15:restartNumberingAfterBreak="0">
-    <w:nsid w:val="75447FBD"/>
+    <w:nsid w:val="651C1E60"/>
     <w:multiLevelType w:val="singleLevel"/>
     <w:tmpl w:val="04160001"/>
     <w:lvl w:ilvl="0">
@@ -24486,7 +24546,7 @@
     </w:lvl>
   </w:abstractNum>
   <w:abstractNum w:abstractNumId="30" w15:restartNumberingAfterBreak="0">
-    <w:nsid w:val="764B5AE2"/>
+    <w:nsid w:val="69AC3626"/>
     <w:multiLevelType w:val="singleLevel"/>
     <w:tmpl w:val="04160001"/>
     <w:lvl w:ilvl="0">
@@ -24503,7 +24563,7 @@
     </w:lvl>
   </w:abstractNum>
   <w:abstractNum w:abstractNumId="31" w15:restartNumberingAfterBreak="0">
-    <w:nsid w:val="765F7E92"/>
+    <w:nsid w:val="6AD700BA"/>
     <w:multiLevelType w:val="singleLevel"/>
     <w:tmpl w:val="04160001"/>
     <w:lvl w:ilvl="0">
@@ -24520,7 +24580,7 @@
     </w:lvl>
   </w:abstractNum>
   <w:abstractNum w:abstractNumId="32" w15:restartNumberingAfterBreak="0">
-    <w:nsid w:val="776A7B06"/>
+    <w:nsid w:val="706F27B1"/>
     <w:multiLevelType w:val="singleLevel"/>
     <w:tmpl w:val="04160001"/>
     <w:lvl w:ilvl="0">
@@ -24537,7 +24597,7 @@
     </w:lvl>
   </w:abstractNum>
   <w:abstractNum w:abstractNumId="33" w15:restartNumberingAfterBreak="0">
-    <w:nsid w:val="7F1107A3"/>
+    <w:nsid w:val="72004589"/>
     <w:multiLevelType w:val="singleLevel"/>
     <w:tmpl w:val="04160001"/>
     <w:lvl w:ilvl="0">
@@ -24554,7 +24614,7 @@
     </w:lvl>
   </w:abstractNum>
   <w:abstractNum w:abstractNumId="34" w15:restartNumberingAfterBreak="0">
-    <w:nsid w:val="7F483B77"/>
+    <w:nsid w:val="7D032AD8"/>
     <w:multiLevelType w:val="singleLevel"/>
     <w:tmpl w:val="04160001"/>
     <w:lvl w:ilvl="0">
@@ -24570,110 +24630,110 @@
       </w:rPr>
     </w:lvl>
   </w:abstractNum>
-  <w:num w:numId="1" w16cid:durableId="286083553">
+  <w:num w:numId="1" w16cid:durableId="2146385281">
+    <w:abstractNumId w:val="26"/>
+  </w:num>
+  <w:num w:numId="2" w16cid:durableId="1317613955">
+    <w:abstractNumId w:val="15"/>
+  </w:num>
+  <w:num w:numId="3" w16cid:durableId="335688638">
+    <w:abstractNumId w:val="25"/>
+  </w:num>
+  <w:num w:numId="4" w16cid:durableId="353262829">
+    <w:abstractNumId w:val="19"/>
+  </w:num>
+  <w:num w:numId="5" w16cid:durableId="1188371861">
+    <w:abstractNumId w:val="8"/>
+  </w:num>
+  <w:num w:numId="6" w16cid:durableId="1117484341">
+    <w:abstractNumId w:val="17"/>
+  </w:num>
+  <w:num w:numId="7" w16cid:durableId="872696451">
+    <w:abstractNumId w:val="21"/>
+  </w:num>
+  <w:num w:numId="8" w16cid:durableId="605312399">
+    <w:abstractNumId w:val="9"/>
+  </w:num>
+  <w:num w:numId="9" w16cid:durableId="319240672">
+    <w:abstractNumId w:val="3"/>
+  </w:num>
+  <w:num w:numId="10" w16cid:durableId="241574690">
+    <w:abstractNumId w:val="0"/>
+  </w:num>
+  <w:num w:numId="11" w16cid:durableId="20204559">
+    <w:abstractNumId w:val="5"/>
+  </w:num>
+  <w:num w:numId="12" w16cid:durableId="360397079">
+    <w:abstractNumId w:val="31"/>
+  </w:num>
+  <w:num w:numId="13" w16cid:durableId="2144497839">
+    <w:abstractNumId w:val="20"/>
+  </w:num>
+  <w:num w:numId="14" w16cid:durableId="203102660">
+    <w:abstractNumId w:val="14"/>
+  </w:num>
+  <w:num w:numId="15" w16cid:durableId="1951662360">
+    <w:abstractNumId w:val="10"/>
+  </w:num>
+  <w:num w:numId="16" w16cid:durableId="788159752">
+    <w:abstractNumId w:val="23"/>
+  </w:num>
+  <w:num w:numId="17" w16cid:durableId="687367902">
+    <w:abstractNumId w:val="13"/>
+  </w:num>
+  <w:num w:numId="18" w16cid:durableId="102962701">
+    <w:abstractNumId w:val="4"/>
+  </w:num>
+  <w:num w:numId="19" w16cid:durableId="928345738">
+    <w:abstractNumId w:val="30"/>
+  </w:num>
+  <w:num w:numId="20" w16cid:durableId="1054961344">
+    <w:abstractNumId w:val="34"/>
+  </w:num>
+  <w:num w:numId="21" w16cid:durableId="367417692">
+    <w:abstractNumId w:val="32"/>
+  </w:num>
+  <w:num w:numId="22" w16cid:durableId="957447323">
+    <w:abstractNumId w:val="12"/>
+  </w:num>
+  <w:num w:numId="23" w16cid:durableId="1398361458">
+    <w:abstractNumId w:val="27"/>
+  </w:num>
+  <w:num w:numId="24" w16cid:durableId="2046060080">
+    <w:abstractNumId w:val="1"/>
+  </w:num>
+  <w:num w:numId="25" w16cid:durableId="1566254906">
+    <w:abstractNumId w:val="7"/>
+  </w:num>
+  <w:num w:numId="26" w16cid:durableId="1630085489">
+    <w:abstractNumId w:val="11"/>
+  </w:num>
+  <w:num w:numId="27" w16cid:durableId="1740833134">
+    <w:abstractNumId w:val="6"/>
+  </w:num>
+  <w:num w:numId="28" w16cid:durableId="751052264">
+    <w:abstractNumId w:val="33"/>
+  </w:num>
+  <w:num w:numId="29" w16cid:durableId="967128015">
+    <w:abstractNumId w:val="22"/>
+  </w:num>
+  <w:num w:numId="30" w16cid:durableId="1150246672">
+    <w:abstractNumId w:val="16"/>
+  </w:num>
+  <w:num w:numId="31" w16cid:durableId="924532018">
+    <w:abstractNumId w:val="28"/>
+  </w:num>
+  <w:num w:numId="32" w16cid:durableId="1752046860">
     <w:abstractNumId w:val="2"/>
   </w:num>
-  <w:num w:numId="2" w16cid:durableId="196433845">
-    <w:abstractNumId w:val="31"/>
+  <w:num w:numId="33" w16cid:durableId="355930411">
+    <w:abstractNumId w:val="29"/>
   </w:num>
-  <w:num w:numId="3" w16cid:durableId="2036616987">
-    <w:abstractNumId w:val="0"/>
-  </w:num>
-  <w:num w:numId="4" w16cid:durableId="1405252041">
-    <w:abstractNumId w:val="32"/>
-  </w:num>
-  <w:num w:numId="5" w16cid:durableId="1740178145">
-    <w:abstractNumId w:val="9"/>
-  </w:num>
-  <w:num w:numId="6" w16cid:durableId="1591112994">
-    <w:abstractNumId w:val="25"/>
-  </w:num>
-  <w:num w:numId="7" w16cid:durableId="1428696929">
-    <w:abstractNumId w:val="21"/>
-  </w:num>
-  <w:num w:numId="8" w16cid:durableId="625351012">
-    <w:abstractNumId w:val="22"/>
-  </w:num>
-  <w:num w:numId="9" w16cid:durableId="1150439646">
-    <w:abstractNumId w:val="12"/>
-  </w:num>
-  <w:num w:numId="10" w16cid:durableId="395203293">
-    <w:abstractNumId w:val="13"/>
-  </w:num>
-  <w:num w:numId="11" w16cid:durableId="19019005">
-    <w:abstractNumId w:val="3"/>
-  </w:num>
-  <w:num w:numId="12" w16cid:durableId="633684805">
-    <w:abstractNumId w:val="30"/>
-  </w:num>
-  <w:num w:numId="13" w16cid:durableId="1627814840">
-    <w:abstractNumId w:val="6"/>
-  </w:num>
-  <w:num w:numId="14" w16cid:durableId="455872353">
-    <w:abstractNumId w:val="15"/>
-  </w:num>
-  <w:num w:numId="15" w16cid:durableId="1904438356">
-    <w:abstractNumId w:val="4"/>
-  </w:num>
-  <w:num w:numId="16" w16cid:durableId="1301106320">
-    <w:abstractNumId w:val="17"/>
-  </w:num>
-  <w:num w:numId="17" w16cid:durableId="1005136504">
-    <w:abstractNumId w:val="27"/>
-  </w:num>
-  <w:num w:numId="18" w16cid:durableId="99183734">
-    <w:abstractNumId w:val="19"/>
-  </w:num>
-  <w:num w:numId="19" w16cid:durableId="752631513">
+  <w:num w:numId="34" w16cid:durableId="1948460072">
     <w:abstractNumId w:val="24"/>
   </w:num>
-  <w:num w:numId="20" w16cid:durableId="244150311">
-    <w:abstractNumId w:val="20"/>
-  </w:num>
-  <w:num w:numId="21" w16cid:durableId="1344160399">
-    <w:abstractNumId w:val="8"/>
-  </w:num>
-  <w:num w:numId="22" w16cid:durableId="1582837122">
-    <w:abstractNumId w:val="10"/>
-  </w:num>
-  <w:num w:numId="23" w16cid:durableId="603222710">
-    <w:abstractNumId w:val="34"/>
-  </w:num>
-  <w:num w:numId="24" w16cid:durableId="1610550454">
-    <w:abstractNumId w:val="26"/>
-  </w:num>
-  <w:num w:numId="25" w16cid:durableId="1104300551">
-    <w:abstractNumId w:val="16"/>
-  </w:num>
-  <w:num w:numId="26" w16cid:durableId="774448551">
-    <w:abstractNumId w:val="11"/>
-  </w:num>
-  <w:num w:numId="27" w16cid:durableId="952175233">
-    <w:abstractNumId w:val="5"/>
-  </w:num>
-  <w:num w:numId="28" w16cid:durableId="616646770">
-    <w:abstractNumId w:val="29"/>
-  </w:num>
-  <w:num w:numId="29" w16cid:durableId="643510878">
-    <w:abstractNumId w:val="33"/>
-  </w:num>
-  <w:num w:numId="30" w16cid:durableId="40709669">
-    <w:abstractNumId w:val="28"/>
-  </w:num>
-  <w:num w:numId="31" w16cid:durableId="1089036708">
-    <w:abstractNumId w:val="1"/>
-  </w:num>
-  <w:num w:numId="32" w16cid:durableId="446631481">
-    <w:abstractNumId w:val="23"/>
-  </w:num>
-  <w:num w:numId="33" w16cid:durableId="278993742">
+  <w:num w:numId="35" w16cid:durableId="1248733507">
     <w:abstractNumId w:val="18"/>
-  </w:num>
-  <w:num w:numId="34" w16cid:durableId="932518206">
-    <w:abstractNumId w:val="7"/>
-  </w:num>
-  <w:num w:numId="35" w16cid:durableId="2084834615">
-    <w:abstractNumId w:val="14"/>
   </w:num>
 </w:numbering>
 </file>
@@ -25086,7 +25146,7 @@
     <w:link w:val="Ttulo1Char"/>
     <w:uiPriority w:val="9"/>
     <w:qFormat/>
-    <w:rsid w:val="00773BB4"/>
+    <w:rsid w:val="007810CF"/>
     <w:pPr>
       <w:keepNext/>
       <w:keepLines/>
@@ -25108,7 +25168,7 @@
     <w:uiPriority w:val="9"/>
     <w:unhideWhenUsed/>
     <w:qFormat/>
-    <w:rsid w:val="00773BB4"/>
+    <w:rsid w:val="007810CF"/>
     <w:pPr>
       <w:keepNext/>
       <w:keepLines/>
@@ -25131,7 +25191,7 @@
     <w:semiHidden/>
     <w:unhideWhenUsed/>
     <w:qFormat/>
-    <w:rsid w:val="00773BB4"/>
+    <w:rsid w:val="007810CF"/>
     <w:pPr>
       <w:keepNext/>
       <w:keepLines/>
@@ -25154,7 +25214,7 @@
     <w:semiHidden/>
     <w:unhideWhenUsed/>
     <w:qFormat/>
-    <w:rsid w:val="00773BB4"/>
+    <w:rsid w:val="007810CF"/>
     <w:pPr>
       <w:keepNext/>
       <w:keepLines/>
@@ -25177,7 +25237,7 @@
     <w:semiHidden/>
     <w:unhideWhenUsed/>
     <w:qFormat/>
-    <w:rsid w:val="00773BB4"/>
+    <w:rsid w:val="007810CF"/>
     <w:pPr>
       <w:keepNext/>
       <w:keepLines/>
@@ -25198,7 +25258,7 @@
     <w:semiHidden/>
     <w:unhideWhenUsed/>
     <w:qFormat/>
-    <w:rsid w:val="00773BB4"/>
+    <w:rsid w:val="007810CF"/>
     <w:pPr>
       <w:keepNext/>
       <w:keepLines/>
@@ -25221,7 +25281,7 @@
     <w:semiHidden/>
     <w:unhideWhenUsed/>
     <w:qFormat/>
-    <w:rsid w:val="00773BB4"/>
+    <w:rsid w:val="007810CF"/>
     <w:pPr>
       <w:keepNext/>
       <w:keepLines/>
@@ -25242,7 +25302,7 @@
     <w:semiHidden/>
     <w:unhideWhenUsed/>
     <w:qFormat/>
-    <w:rsid w:val="00773BB4"/>
+    <w:rsid w:val="007810CF"/>
     <w:pPr>
       <w:keepNext/>
       <w:keepLines/>
@@ -25265,7 +25325,7 @@
     <w:semiHidden/>
     <w:unhideWhenUsed/>
     <w:qFormat/>
-    <w:rsid w:val="00773BB4"/>
+    <w:rsid w:val="007810CF"/>
     <w:pPr>
       <w:keepNext/>
       <w:keepLines/>
@@ -25309,7 +25369,7 @@
     <w:basedOn w:val="Fontepargpadro"/>
     <w:link w:val="Ttulo1"/>
     <w:uiPriority w:val="9"/>
-    <w:rsid w:val="00773BB4"/>
+    <w:rsid w:val="007810CF"/>
     <w:rPr>
       <w:rFonts w:asciiTheme="majorHAnsi" w:eastAsiaTheme="majorEastAsia" w:hAnsiTheme="majorHAnsi" w:cstheme="majorBidi"/>
       <w:color w:val="0F4761" w:themeColor="accent1" w:themeShade="BF"/>
@@ -25322,7 +25382,7 @@
     <w:basedOn w:val="Fontepargpadro"/>
     <w:link w:val="Ttulo2"/>
     <w:uiPriority w:val="9"/>
-    <w:rsid w:val="00773BB4"/>
+    <w:rsid w:val="007810CF"/>
     <w:rPr>
       <w:rFonts w:asciiTheme="majorHAnsi" w:eastAsiaTheme="majorEastAsia" w:hAnsiTheme="majorHAnsi" w:cstheme="majorBidi"/>
       <w:color w:val="0F4761" w:themeColor="accent1" w:themeShade="BF"/>
@@ -25336,7 +25396,7 @@
     <w:link w:val="Ttulo3"/>
     <w:uiPriority w:val="9"/>
     <w:semiHidden/>
-    <w:rsid w:val="00773BB4"/>
+    <w:rsid w:val="007810CF"/>
     <w:rPr>
       <w:rFonts w:eastAsiaTheme="majorEastAsia" w:cstheme="majorBidi"/>
       <w:color w:val="0F4761" w:themeColor="accent1" w:themeShade="BF"/>
@@ -25350,7 +25410,7 @@
     <w:link w:val="Ttulo4"/>
     <w:uiPriority w:val="9"/>
     <w:semiHidden/>
-    <w:rsid w:val="00773BB4"/>
+    <w:rsid w:val="007810CF"/>
     <w:rPr>
       <w:rFonts w:eastAsiaTheme="majorEastAsia" w:cstheme="majorBidi"/>
       <w:i/>
@@ -25364,7 +25424,7 @@
     <w:link w:val="Ttulo5"/>
     <w:uiPriority w:val="9"/>
     <w:semiHidden/>
-    <w:rsid w:val="00773BB4"/>
+    <w:rsid w:val="007810CF"/>
     <w:rPr>
       <w:rFonts w:eastAsiaTheme="majorEastAsia" w:cstheme="majorBidi"/>
       <w:color w:val="0F4761" w:themeColor="accent1" w:themeShade="BF"/>
@@ -25376,7 +25436,7 @@
     <w:link w:val="Ttulo6"/>
     <w:uiPriority w:val="9"/>
     <w:semiHidden/>
-    <w:rsid w:val="00773BB4"/>
+    <w:rsid w:val="007810CF"/>
     <w:rPr>
       <w:rFonts w:eastAsiaTheme="majorEastAsia" w:cstheme="majorBidi"/>
       <w:i/>
@@ -25390,7 +25450,7 @@
     <w:link w:val="Ttulo7"/>
     <w:uiPriority w:val="9"/>
     <w:semiHidden/>
-    <w:rsid w:val="00773BB4"/>
+    <w:rsid w:val="007810CF"/>
     <w:rPr>
       <w:rFonts w:eastAsiaTheme="majorEastAsia" w:cstheme="majorBidi"/>
       <w:color w:val="595959" w:themeColor="text1" w:themeTint="A6"/>
@@ -25402,7 +25462,7 @@
     <w:link w:val="Ttulo8"/>
     <w:uiPriority w:val="9"/>
     <w:semiHidden/>
-    <w:rsid w:val="00773BB4"/>
+    <w:rsid w:val="007810CF"/>
     <w:rPr>
       <w:rFonts w:eastAsiaTheme="majorEastAsia" w:cstheme="majorBidi"/>
       <w:i/>
@@ -25416,7 +25476,7 @@
     <w:link w:val="Ttulo9"/>
     <w:uiPriority w:val="9"/>
     <w:semiHidden/>
-    <w:rsid w:val="00773BB4"/>
+    <w:rsid w:val="007810CF"/>
     <w:rPr>
       <w:rFonts w:eastAsiaTheme="majorEastAsia" w:cstheme="majorBidi"/>
       <w:color w:val="272727" w:themeColor="text1" w:themeTint="D8"/>
@@ -25429,7 +25489,7 @@
     <w:link w:val="TtuloChar"/>
     <w:uiPriority w:val="10"/>
     <w:qFormat/>
-    <w:rsid w:val="00773BB4"/>
+    <w:rsid w:val="007810CF"/>
     <w:pPr>
       <w:spacing w:after="80" w:line="240" w:lineRule="auto"/>
       <w:contextualSpacing/>
@@ -25447,7 +25507,7 @@
     <w:basedOn w:val="Fontepargpadro"/>
     <w:link w:val="Ttulo"/>
     <w:uiPriority w:val="10"/>
-    <w:rsid w:val="00773BB4"/>
+    <w:rsid w:val="007810CF"/>
     <w:rPr>
       <w:rFonts w:asciiTheme="majorHAnsi" w:eastAsiaTheme="majorEastAsia" w:hAnsiTheme="majorHAnsi" w:cstheme="majorBidi"/>
       <w:spacing w:val="-10"/>
@@ -25463,7 +25523,7 @@
     <w:link w:val="SubttuloChar"/>
     <w:uiPriority w:val="11"/>
     <w:qFormat/>
-    <w:rsid w:val="00773BB4"/>
+    <w:rsid w:val="007810CF"/>
     <w:pPr>
       <w:numPr>
         <w:ilvl w:val="1"/>
@@ -25482,7 +25542,7 @@
     <w:basedOn w:val="Fontepargpadro"/>
     <w:link w:val="Subttulo"/>
     <w:uiPriority w:val="11"/>
-    <w:rsid w:val="00773BB4"/>
+    <w:rsid w:val="007810CF"/>
     <w:rPr>
       <w:rFonts w:eastAsiaTheme="majorEastAsia" w:cstheme="majorBidi"/>
       <w:color w:val="595959" w:themeColor="text1" w:themeTint="A6"/>
@@ -25498,7 +25558,7 @@
     <w:link w:val="CitaoChar"/>
     <w:uiPriority w:val="29"/>
     <w:qFormat/>
-    <w:rsid w:val="00773BB4"/>
+    <w:rsid w:val="007810CF"/>
     <w:pPr>
       <w:spacing w:before="160"/>
       <w:jc w:val="center"/>
@@ -25514,7 +25574,7 @@
     <w:basedOn w:val="Fontepargpadro"/>
     <w:link w:val="Citao"/>
     <w:uiPriority w:val="29"/>
-    <w:rsid w:val="00773BB4"/>
+    <w:rsid w:val="007810CF"/>
     <w:rPr>
       <w:i/>
       <w:iCs/>
@@ -25526,7 +25586,7 @@
     <w:basedOn w:val="Normal"/>
     <w:uiPriority w:val="34"/>
     <w:qFormat/>
-    <w:rsid w:val="00773BB4"/>
+    <w:rsid w:val="007810CF"/>
     <w:pPr>
       <w:ind w:left="720"/>
       <w:contextualSpacing/>
@@ -25537,7 +25597,7 @@
     <w:basedOn w:val="Fontepargpadro"/>
     <w:uiPriority w:val="21"/>
     <w:qFormat/>
-    <w:rsid w:val="00773BB4"/>
+    <w:rsid w:val="007810CF"/>
     <w:rPr>
       <w:i/>
       <w:iCs/>
@@ -25551,7 +25611,7 @@
     <w:link w:val="CitaoIntensaChar"/>
     <w:uiPriority w:val="30"/>
     <w:qFormat/>
-    <w:rsid w:val="00773BB4"/>
+    <w:rsid w:val="007810CF"/>
     <w:pPr>
       <w:pBdr>
         <w:top w:val="single" w:sz="4" w:space="10" w:color="0F4761" w:themeColor="accent1" w:themeShade="BF"/>
@@ -25572,7 +25632,7 @@
     <w:basedOn w:val="Fontepargpadro"/>
     <w:link w:val="CitaoIntensa"/>
     <w:uiPriority w:val="30"/>
-    <w:rsid w:val="00773BB4"/>
+    <w:rsid w:val="007810CF"/>
     <w:rPr>
       <w:i/>
       <w:iCs/>
@@ -25584,7 +25644,7 @@
     <w:basedOn w:val="Fontepargpadro"/>
     <w:uiPriority w:val="32"/>
     <w:qFormat/>
-    <w:rsid w:val="00773BB4"/>
+    <w:rsid w:val="007810CF"/>
     <w:rPr>
       <w:b/>
       <w:bCs/>
@@ -25599,7 +25659,7 @@
     <w:link w:val="CabealhoChar"/>
     <w:uiPriority w:val="99"/>
     <w:unhideWhenUsed/>
-    <w:rsid w:val="00773BB4"/>
+    <w:rsid w:val="007810CF"/>
     <w:pPr>
       <w:tabs>
         <w:tab w:val="center" w:pos="4252"/>
@@ -25613,7 +25673,7 @@
     <w:basedOn w:val="Fontepargpadro"/>
     <w:link w:val="Cabealho"/>
     <w:uiPriority w:val="99"/>
-    <w:rsid w:val="00773BB4"/>
+    <w:rsid w:val="007810CF"/>
   </w:style>
   <w:style w:type="paragraph" w:styleId="Rodap">
     <w:name w:val="footer"/>
@@ -25621,7 +25681,7 @@
     <w:link w:val="RodapChar"/>
     <w:uiPriority w:val="99"/>
     <w:unhideWhenUsed/>
-    <w:rsid w:val="00773BB4"/>
+    <w:rsid w:val="007810CF"/>
     <w:pPr>
       <w:tabs>
         <w:tab w:val="center" w:pos="4252"/>
@@ -25635,7 +25695,7 @@
     <w:basedOn w:val="Fontepargpadro"/>
     <w:link w:val="Rodap"/>
     <w:uiPriority w:val="99"/>
-    <w:rsid w:val="00773BB4"/>
+    <w:rsid w:val="007810CF"/>
   </w:style>
   <w:style w:type="paragraph" w:styleId="Sumrio1">
     <w:name w:val="toc 1"/>
@@ -25644,7 +25704,7 @@
     <w:autoRedefine/>
     <w:uiPriority w:val="39"/>
     <w:unhideWhenUsed/>
-    <w:rsid w:val="00773BB4"/>
+    <w:rsid w:val="007810CF"/>
     <w:pPr>
       <w:spacing w:after="100"/>
     </w:pPr>
@@ -25656,7 +25716,7 @@
     <w:autoRedefine/>
     <w:uiPriority w:val="39"/>
     <w:unhideWhenUsed/>
-    <w:rsid w:val="00773BB4"/>
+    <w:rsid w:val="007810CF"/>
     <w:pPr>
       <w:spacing w:after="100"/>
       <w:ind w:left="240"/>

</xml_diff>

<commit_message>
Adiciona Painel de Prazos com aviso automático de vencimento
Sincroniza com produção: nova página "19 - painel-prazos.html", campo
"Responsável (conta)" no cronograma do Planejamento, e documentação
atualizada (Central de Ajuda, Manual de Uso v2.77, Regras de Acesso).

Co-Authored-By: Claude Sonnet 5 <noreply@anthropic.com>
</commit_message>
<xml_diff>
--- a/Manual de Uso - Ferramenta de Gestao de Projetos.docx
+++ b/Manual de Uso - Ferramenta de Gestao de Projetos.docx
@@ -229,7 +229,7 @@
         <w:rPr>
           <w:noProof/>
         </w:rPr>
-        <w:instrText xml:space="preserve"> PAGEREF _Toc240366617 \h </w:instrText>
+        <w:instrText xml:space="preserve"> PAGEREF _Toc240373111 \h </w:instrText>
       </w:r>
       <w:r>
         <w:rPr>
@@ -246,7 +246,7 @@
         <w:rPr>
           <w:noProof/>
         </w:rPr>
-        <w:t>4</w:t>
+        <w:t>5</w:t>
       </w:r>
       <w:r>
         <w:rPr>
@@ -290,7 +290,7 @@
         <w:rPr>
           <w:noProof/>
         </w:rPr>
-        <w:instrText xml:space="preserve"> PAGEREF _Toc240366618 \h </w:instrText>
+        <w:instrText xml:space="preserve"> PAGEREF _Toc240373112 \h </w:instrText>
       </w:r>
       <w:r>
         <w:rPr>
@@ -307,7 +307,7 @@
         <w:rPr>
           <w:noProof/>
         </w:rPr>
-        <w:t>4</w:t>
+        <w:t>5</w:t>
       </w:r>
       <w:r>
         <w:rPr>
@@ -351,7 +351,7 @@
         <w:rPr>
           <w:noProof/>
         </w:rPr>
-        <w:instrText xml:space="preserve"> PAGEREF _Toc240366619 \h </w:instrText>
+        <w:instrText xml:space="preserve"> PAGEREF _Toc240373113 \h </w:instrText>
       </w:r>
       <w:r>
         <w:rPr>
@@ -368,7 +368,7 @@
         <w:rPr>
           <w:noProof/>
         </w:rPr>
-        <w:t>19</w:t>
+        <w:t>20</w:t>
       </w:r>
       <w:r>
         <w:rPr>
@@ -412,7 +412,7 @@
         <w:rPr>
           <w:noProof/>
         </w:rPr>
-        <w:instrText xml:space="preserve"> PAGEREF _Toc240366620 \h </w:instrText>
+        <w:instrText xml:space="preserve"> PAGEREF _Toc240373114 \h </w:instrText>
       </w:r>
       <w:r>
         <w:rPr>
@@ -429,7 +429,7 @@
         <w:rPr>
           <w:noProof/>
         </w:rPr>
-        <w:t>20</w:t>
+        <w:t>21</w:t>
       </w:r>
       <w:r>
         <w:rPr>
@@ -473,7 +473,7 @@
         <w:rPr>
           <w:noProof/>
         </w:rPr>
-        <w:instrText xml:space="preserve"> PAGEREF _Toc240366621 \h </w:instrText>
+        <w:instrText xml:space="preserve"> PAGEREF _Toc240373115 \h </w:instrText>
       </w:r>
       <w:r>
         <w:rPr>
@@ -490,7 +490,7 @@
         <w:rPr>
           <w:noProof/>
         </w:rPr>
-        <w:t>21</w:t>
+        <w:t>22</w:t>
       </w:r>
       <w:r>
         <w:rPr>
@@ -534,7 +534,7 @@
         <w:rPr>
           <w:noProof/>
         </w:rPr>
-        <w:instrText xml:space="preserve"> PAGEREF _Toc240366622 \h </w:instrText>
+        <w:instrText xml:space="preserve"> PAGEREF _Toc240373116 \h </w:instrText>
       </w:r>
       <w:r>
         <w:rPr>
@@ -551,7 +551,7 @@
         <w:rPr>
           <w:noProof/>
         </w:rPr>
-        <w:t>23</w:t>
+        <w:t>24</w:t>
       </w:r>
       <w:r>
         <w:rPr>
@@ -595,7 +595,7 @@
         <w:rPr>
           <w:noProof/>
         </w:rPr>
-        <w:instrText xml:space="preserve"> PAGEREF _Toc240366623 \h </w:instrText>
+        <w:instrText xml:space="preserve"> PAGEREF _Toc240373117 \h </w:instrText>
       </w:r>
       <w:r>
         <w:rPr>
@@ -612,7 +612,7 @@
         <w:rPr>
           <w:noProof/>
         </w:rPr>
-        <w:t>23</w:t>
+        <w:t>24</w:t>
       </w:r>
       <w:r>
         <w:rPr>
@@ -656,7 +656,7 @@
         <w:rPr>
           <w:noProof/>
         </w:rPr>
-        <w:instrText xml:space="preserve"> PAGEREF _Toc240366624 \h </w:instrText>
+        <w:instrText xml:space="preserve"> PAGEREF _Toc240373118 \h </w:instrText>
       </w:r>
       <w:r>
         <w:rPr>
@@ -673,7 +673,7 @@
         <w:rPr>
           <w:noProof/>
         </w:rPr>
-        <w:t>23</w:t>
+        <w:t>24</w:t>
       </w:r>
       <w:r>
         <w:rPr>
@@ -717,7 +717,7 @@
         <w:rPr>
           <w:noProof/>
         </w:rPr>
-        <w:instrText xml:space="preserve"> PAGEREF _Toc240366625 \h </w:instrText>
+        <w:instrText xml:space="preserve"> PAGEREF _Toc240373119 \h </w:instrText>
       </w:r>
       <w:r>
         <w:rPr>
@@ -734,7 +734,7 @@
         <w:rPr>
           <w:noProof/>
         </w:rPr>
-        <w:t>23</w:t>
+        <w:t>24</w:t>
       </w:r>
       <w:r>
         <w:rPr>
@@ -778,7 +778,7 @@
         <w:rPr>
           <w:noProof/>
         </w:rPr>
-        <w:instrText xml:space="preserve"> PAGEREF _Toc240366626 \h </w:instrText>
+        <w:instrText xml:space="preserve"> PAGEREF _Toc240373120 \h </w:instrText>
       </w:r>
       <w:r>
         <w:rPr>
@@ -795,7 +795,7 @@
         <w:rPr>
           <w:noProof/>
         </w:rPr>
-        <w:t>24</w:t>
+        <w:t>25</w:t>
       </w:r>
       <w:r>
         <w:rPr>
@@ -839,7 +839,7 @@
         <w:rPr>
           <w:noProof/>
         </w:rPr>
-        <w:instrText xml:space="preserve"> PAGEREF _Toc240366627 \h </w:instrText>
+        <w:instrText xml:space="preserve"> PAGEREF _Toc240373121 \h </w:instrText>
       </w:r>
       <w:r>
         <w:rPr>
@@ -856,7 +856,7 @@
         <w:rPr>
           <w:noProof/>
         </w:rPr>
-        <w:t>25</w:t>
+        <w:t>26</w:t>
       </w:r>
       <w:r>
         <w:rPr>
@@ -900,7 +900,7 @@
         <w:rPr>
           <w:noProof/>
         </w:rPr>
-        <w:instrText xml:space="preserve"> PAGEREF _Toc240366628 \h </w:instrText>
+        <w:instrText xml:space="preserve"> PAGEREF _Toc240373122 \h </w:instrText>
       </w:r>
       <w:r>
         <w:rPr>
@@ -917,7 +917,7 @@
         <w:rPr>
           <w:noProof/>
         </w:rPr>
-        <w:t>27</w:t>
+        <w:t>28</w:t>
       </w:r>
       <w:r>
         <w:rPr>
@@ -961,7 +961,7 @@
         <w:rPr>
           <w:noProof/>
         </w:rPr>
-        <w:instrText xml:space="preserve"> PAGEREF _Toc240366629 \h </w:instrText>
+        <w:instrText xml:space="preserve"> PAGEREF _Toc240373123 \h </w:instrText>
       </w:r>
       <w:r>
         <w:rPr>
@@ -978,7 +978,7 @@
         <w:rPr>
           <w:noProof/>
         </w:rPr>
-        <w:t>28</w:t>
+        <w:t>29</w:t>
       </w:r>
       <w:r>
         <w:rPr>
@@ -1022,7 +1022,7 @@
         <w:rPr>
           <w:noProof/>
         </w:rPr>
-        <w:instrText xml:space="preserve"> PAGEREF _Toc240366630 \h </w:instrText>
+        <w:instrText xml:space="preserve"> PAGEREF _Toc240373124 \h </w:instrText>
       </w:r>
       <w:r>
         <w:rPr>
@@ -1039,7 +1039,7 @@
         <w:rPr>
           <w:noProof/>
         </w:rPr>
-        <w:t>29</w:t>
+        <w:t>30</w:t>
       </w:r>
       <w:r>
         <w:rPr>
@@ -1083,7 +1083,7 @@
         <w:rPr>
           <w:noProof/>
         </w:rPr>
-        <w:instrText xml:space="preserve"> PAGEREF _Toc240366631 \h </w:instrText>
+        <w:instrText xml:space="preserve"> PAGEREF _Toc240373125 \h </w:instrText>
       </w:r>
       <w:r>
         <w:rPr>
@@ -1100,7 +1100,7 @@
         <w:rPr>
           <w:noProof/>
         </w:rPr>
-        <w:t>29</w:t>
+        <w:t>30</w:t>
       </w:r>
       <w:r>
         <w:rPr>
@@ -1144,7 +1144,7 @@
         <w:rPr>
           <w:noProof/>
         </w:rPr>
-        <w:instrText xml:space="preserve"> PAGEREF _Toc240366632 \h </w:instrText>
+        <w:instrText xml:space="preserve"> PAGEREF _Toc240373126 \h </w:instrText>
       </w:r>
       <w:r>
         <w:rPr>
@@ -1161,7 +1161,7 @@
         <w:rPr>
           <w:noProof/>
         </w:rPr>
-        <w:t>30</w:t>
+        <w:t>31</w:t>
       </w:r>
       <w:r>
         <w:rPr>
@@ -1205,7 +1205,7 @@
         <w:rPr>
           <w:noProof/>
         </w:rPr>
-        <w:instrText xml:space="preserve"> PAGEREF _Toc240366633 \h </w:instrText>
+        <w:instrText xml:space="preserve"> PAGEREF _Toc240373127 \h </w:instrText>
       </w:r>
       <w:r>
         <w:rPr>
@@ -1222,7 +1222,7 @@
         <w:rPr>
           <w:noProof/>
         </w:rPr>
-        <w:t>31</w:t>
+        <w:t>32</w:t>
       </w:r>
       <w:r>
         <w:rPr>
@@ -1266,7 +1266,7 @@
         <w:rPr>
           <w:noProof/>
         </w:rPr>
-        <w:instrText xml:space="preserve"> PAGEREF _Toc240366634 \h </w:instrText>
+        <w:instrText xml:space="preserve"> PAGEREF _Toc240373128 \h </w:instrText>
       </w:r>
       <w:r>
         <w:rPr>
@@ -1283,7 +1283,7 @@
         <w:rPr>
           <w:noProof/>
         </w:rPr>
-        <w:t>31</w:t>
+        <w:t>32</w:t>
       </w:r>
       <w:r>
         <w:rPr>
@@ -1327,7 +1327,7 @@
         <w:rPr>
           <w:noProof/>
         </w:rPr>
-        <w:instrText xml:space="preserve"> PAGEREF _Toc240366635 \h </w:instrText>
+        <w:instrText xml:space="preserve"> PAGEREF _Toc240373129 \h </w:instrText>
       </w:r>
       <w:r>
         <w:rPr>
@@ -1344,7 +1344,7 @@
         <w:rPr>
           <w:noProof/>
         </w:rPr>
-        <w:t>33</w:t>
+        <w:t>34</w:t>
       </w:r>
       <w:r>
         <w:rPr>
@@ -1388,7 +1388,7 @@
         <w:rPr>
           <w:noProof/>
         </w:rPr>
-        <w:instrText xml:space="preserve"> PAGEREF _Toc240366636 \h </w:instrText>
+        <w:instrText xml:space="preserve"> PAGEREF _Toc240373130 \h </w:instrText>
       </w:r>
       <w:r>
         <w:rPr>
@@ -1405,7 +1405,7 @@
         <w:rPr>
           <w:noProof/>
         </w:rPr>
-        <w:t>34</w:t>
+        <w:t>35</w:t>
       </w:r>
       <w:r>
         <w:rPr>
@@ -1449,7 +1449,7 @@
         <w:rPr>
           <w:noProof/>
         </w:rPr>
-        <w:instrText xml:space="preserve"> PAGEREF _Toc240366637 \h </w:instrText>
+        <w:instrText xml:space="preserve"> PAGEREF _Toc240373131 \h </w:instrText>
       </w:r>
       <w:r>
         <w:rPr>
@@ -1466,7 +1466,7 @@
         <w:rPr>
           <w:noProof/>
         </w:rPr>
-        <w:t>35</w:t>
+        <w:t>36</w:t>
       </w:r>
       <w:r>
         <w:rPr>
@@ -1510,7 +1510,7 @@
         <w:rPr>
           <w:noProof/>
         </w:rPr>
-        <w:instrText xml:space="preserve"> PAGEREF _Toc240366638 \h </w:instrText>
+        <w:instrText xml:space="preserve"> PAGEREF _Toc240373132 \h </w:instrText>
       </w:r>
       <w:r>
         <w:rPr>
@@ -1527,7 +1527,7 @@
         <w:rPr>
           <w:noProof/>
         </w:rPr>
-        <w:t>36</w:t>
+        <w:t>37</w:t>
       </w:r>
       <w:r>
         <w:rPr>
@@ -1571,7 +1571,7 @@
         <w:rPr>
           <w:noProof/>
         </w:rPr>
-        <w:instrText xml:space="preserve"> PAGEREF _Toc240366639 \h </w:instrText>
+        <w:instrText xml:space="preserve"> PAGEREF _Toc240373133 \h </w:instrText>
       </w:r>
       <w:r>
         <w:rPr>
@@ -1588,7 +1588,7 @@
         <w:rPr>
           <w:noProof/>
         </w:rPr>
-        <w:t>37</w:t>
+        <w:t>38</w:t>
       </w:r>
       <w:r>
         <w:rPr>
@@ -1632,7 +1632,7 @@
         <w:rPr>
           <w:noProof/>
         </w:rPr>
-        <w:instrText xml:space="preserve"> PAGEREF _Toc240366640 \h </w:instrText>
+        <w:instrText xml:space="preserve"> PAGEREF _Toc240373134 \h </w:instrText>
       </w:r>
       <w:r>
         <w:rPr>
@@ -1649,7 +1649,7 @@
         <w:rPr>
           <w:noProof/>
         </w:rPr>
-        <w:t>37</w:t>
+        <w:t>38</w:t>
       </w:r>
       <w:r>
         <w:rPr>
@@ -1693,7 +1693,7 @@
         <w:rPr>
           <w:noProof/>
         </w:rPr>
-        <w:instrText xml:space="preserve"> PAGEREF _Toc240366641 \h </w:instrText>
+        <w:instrText xml:space="preserve"> PAGEREF _Toc240373135 \h </w:instrText>
       </w:r>
       <w:r>
         <w:rPr>
@@ -1710,7 +1710,7 @@
         <w:rPr>
           <w:noProof/>
         </w:rPr>
-        <w:t>40</w:t>
+        <w:t>41</w:t>
       </w:r>
       <w:r>
         <w:rPr>
@@ -1754,7 +1754,7 @@
         <w:rPr>
           <w:noProof/>
         </w:rPr>
-        <w:instrText xml:space="preserve"> PAGEREF _Toc240366642 \h </w:instrText>
+        <w:instrText xml:space="preserve"> PAGEREF _Toc240373136 \h </w:instrText>
       </w:r>
       <w:r>
         <w:rPr>
@@ -1771,7 +1771,7 @@
         <w:rPr>
           <w:noProof/>
         </w:rPr>
-        <w:t>42</w:t>
+        <w:t>43</w:t>
       </w:r>
       <w:r>
         <w:rPr>
@@ -1816,7 +1816,7 @@
         <w:rPr>
           <w:noProof/>
         </w:rPr>
-        <w:instrText xml:space="preserve"> PAGEREF _Toc240366643 \h </w:instrText>
+        <w:instrText xml:space="preserve"> PAGEREF _Toc240373137 \h </w:instrText>
       </w:r>
       <w:r>
         <w:rPr>
@@ -1833,7 +1833,7 @@
         <w:rPr>
           <w:noProof/>
         </w:rPr>
-        <w:t>46</w:t>
+        <w:t>47</w:t>
       </w:r>
       <w:r>
         <w:rPr>
@@ -1877,7 +1877,7 @@
         <w:rPr>
           <w:noProof/>
         </w:rPr>
-        <w:instrText xml:space="preserve"> PAGEREF _Toc240366644 \h </w:instrText>
+        <w:instrText xml:space="preserve"> PAGEREF _Toc240373138 \h </w:instrText>
       </w:r>
       <w:r>
         <w:rPr>
@@ -1894,7 +1894,7 @@
         <w:rPr>
           <w:noProof/>
         </w:rPr>
-        <w:t>50</w:t>
+        <w:t>51</w:t>
       </w:r>
       <w:r>
         <w:rPr>
@@ -1938,7 +1938,7 @@
         <w:rPr>
           <w:noProof/>
         </w:rPr>
-        <w:instrText xml:space="preserve"> PAGEREF _Toc240366645 \h </w:instrText>
+        <w:instrText xml:space="preserve"> PAGEREF _Toc240373139 \h </w:instrText>
       </w:r>
       <w:r>
         <w:rPr>
@@ -1955,7 +1955,7 @@
         <w:rPr>
           <w:noProof/>
         </w:rPr>
-        <w:t>53</w:t>
+        <w:t>55</w:t>
       </w:r>
       <w:r>
         <w:rPr>
@@ -1999,7 +1999,7 @@
         <w:rPr>
           <w:noProof/>
         </w:rPr>
-        <w:instrText xml:space="preserve"> PAGEREF _Toc240366646 \h </w:instrText>
+        <w:instrText xml:space="preserve"> PAGEREF _Toc240373140 \h </w:instrText>
       </w:r>
       <w:r>
         <w:rPr>
@@ -2016,7 +2016,7 @@
         <w:rPr>
           <w:noProof/>
         </w:rPr>
-        <w:t>55</w:t>
+        <w:t>57</w:t>
       </w:r>
       <w:r>
         <w:rPr>
@@ -2060,7 +2060,7 @@
         <w:rPr>
           <w:noProof/>
         </w:rPr>
-        <w:instrText xml:space="preserve"> PAGEREF _Toc240366647 \h </w:instrText>
+        <w:instrText xml:space="preserve"> PAGEREF _Toc240373141 \h </w:instrText>
       </w:r>
       <w:r>
         <w:rPr>
@@ -2077,7 +2077,7 @@
         <w:rPr>
           <w:noProof/>
         </w:rPr>
-        <w:t>57</w:t>
+        <w:t>59</w:t>
       </w:r>
       <w:r>
         <w:rPr>
@@ -2121,7 +2121,7 @@
         <w:rPr>
           <w:noProof/>
         </w:rPr>
-        <w:instrText xml:space="preserve"> PAGEREF _Toc240366648 \h </w:instrText>
+        <w:instrText xml:space="preserve"> PAGEREF _Toc240373142 \h </w:instrText>
       </w:r>
       <w:r>
         <w:rPr>
@@ -2138,7 +2138,7 @@
         <w:rPr>
           <w:noProof/>
         </w:rPr>
-        <w:t>60</w:t>
+        <w:t>62</w:t>
       </w:r>
       <w:r>
         <w:rPr>
@@ -2182,7 +2182,7 @@
         <w:rPr>
           <w:noProof/>
         </w:rPr>
-        <w:instrText xml:space="preserve"> PAGEREF _Toc240366649 \h </w:instrText>
+        <w:instrText xml:space="preserve"> PAGEREF _Toc240373143 \h </w:instrText>
       </w:r>
       <w:r>
         <w:rPr>
@@ -2199,7 +2199,7 @@
         <w:rPr>
           <w:noProof/>
         </w:rPr>
-        <w:t>62</w:t>
+        <w:t>64</w:t>
       </w:r>
       <w:r>
         <w:rPr>
@@ -2243,7 +2243,7 @@
         <w:rPr>
           <w:noProof/>
         </w:rPr>
-        <w:instrText xml:space="preserve"> PAGEREF _Toc240366650 \h </w:instrText>
+        <w:instrText xml:space="preserve"> PAGEREF _Toc240373144 \h </w:instrText>
       </w:r>
       <w:r>
         <w:rPr>
@@ -2260,7 +2260,7 @@
         <w:rPr>
           <w:noProof/>
         </w:rPr>
-        <w:t>64</w:t>
+        <w:t>66</w:t>
       </w:r>
       <w:r>
         <w:rPr>
@@ -2304,7 +2304,7 @@
         <w:rPr>
           <w:noProof/>
         </w:rPr>
-        <w:instrText xml:space="preserve"> PAGEREF _Toc240366651 \h </w:instrText>
+        <w:instrText xml:space="preserve"> PAGEREF _Toc240373145 \h </w:instrText>
       </w:r>
       <w:r>
         <w:rPr>
@@ -2321,7 +2321,7 @@
         <w:rPr>
           <w:noProof/>
         </w:rPr>
-        <w:t>64</w:t>
+        <w:t>66</w:t>
       </w:r>
       <w:r>
         <w:rPr>
@@ -2365,7 +2365,7 @@
         <w:rPr>
           <w:noProof/>
         </w:rPr>
-        <w:instrText xml:space="preserve"> PAGEREF _Toc240366652 \h </w:instrText>
+        <w:instrText xml:space="preserve"> PAGEREF _Toc240373146 \h </w:instrText>
       </w:r>
       <w:r>
         <w:rPr>
@@ -2382,7 +2382,7 @@
         <w:rPr>
           <w:noProof/>
         </w:rPr>
-        <w:t>71</w:t>
+        <w:t>73</w:t>
       </w:r>
       <w:r>
         <w:rPr>
@@ -2426,7 +2426,7 @@
         <w:rPr>
           <w:noProof/>
         </w:rPr>
-        <w:instrText xml:space="preserve"> PAGEREF _Toc240366653 \h </w:instrText>
+        <w:instrText xml:space="preserve"> PAGEREF _Toc240373147 \h </w:instrText>
       </w:r>
       <w:r>
         <w:rPr>
@@ -2443,7 +2443,7 @@
         <w:rPr>
           <w:noProof/>
         </w:rPr>
-        <w:t>76</w:t>
+        <w:t>78</w:t>
       </w:r>
       <w:r>
         <w:rPr>
@@ -2487,7 +2487,7 @@
         <w:rPr>
           <w:noProof/>
         </w:rPr>
-        <w:instrText xml:space="preserve"> PAGEREF _Toc240366654 \h </w:instrText>
+        <w:instrText xml:space="preserve"> PAGEREF _Toc240373148 \h </w:instrText>
       </w:r>
       <w:r>
         <w:rPr>
@@ -2504,7 +2504,7 @@
         <w:rPr>
           <w:noProof/>
         </w:rPr>
-        <w:t>76</w:t>
+        <w:t>78</w:t>
       </w:r>
       <w:r>
         <w:rPr>
@@ -2548,7 +2548,7 @@
         <w:rPr>
           <w:noProof/>
         </w:rPr>
-        <w:instrText xml:space="preserve"> PAGEREF _Toc240366655 \h </w:instrText>
+        <w:instrText xml:space="preserve"> PAGEREF _Toc240373149 \h </w:instrText>
       </w:r>
       <w:r>
         <w:rPr>
@@ -2565,7 +2565,7 @@
         <w:rPr>
           <w:noProof/>
         </w:rPr>
-        <w:t>77</w:t>
+        <w:t>79</w:t>
       </w:r>
       <w:r>
         <w:rPr>
@@ -2609,7 +2609,7 @@
         <w:rPr>
           <w:noProof/>
         </w:rPr>
-        <w:instrText xml:space="preserve"> PAGEREF _Toc240366656 \h </w:instrText>
+        <w:instrText xml:space="preserve"> PAGEREF _Toc240373150 \h </w:instrText>
       </w:r>
       <w:r>
         <w:rPr>
@@ -2626,7 +2626,7 @@
         <w:rPr>
           <w:noProof/>
         </w:rPr>
-        <w:t>77</w:t>
+        <w:t>79</w:t>
       </w:r>
       <w:r>
         <w:rPr>
@@ -2670,7 +2670,7 @@
         <w:rPr>
           <w:noProof/>
         </w:rPr>
-        <w:instrText xml:space="preserve"> PAGEREF _Toc240366657 \h </w:instrText>
+        <w:instrText xml:space="preserve"> PAGEREF _Toc240373151 \h </w:instrText>
       </w:r>
       <w:r>
         <w:rPr>
@@ -2687,7 +2687,7 @@
         <w:rPr>
           <w:noProof/>
         </w:rPr>
-        <w:t>80</w:t>
+        <w:t>82</w:t>
       </w:r>
       <w:r>
         <w:rPr>
@@ -2731,7 +2731,7 @@
         <w:rPr>
           <w:noProof/>
         </w:rPr>
-        <w:instrText xml:space="preserve"> PAGEREF _Toc240366658 \h </w:instrText>
+        <w:instrText xml:space="preserve"> PAGEREF _Toc240373152 \h </w:instrText>
       </w:r>
       <w:r>
         <w:rPr>
@@ -2748,7 +2748,7 @@
         <w:rPr>
           <w:noProof/>
         </w:rPr>
-        <w:t>80</w:t>
+        <w:t>82</w:t>
       </w:r>
       <w:r>
         <w:rPr>
@@ -2792,7 +2792,7 @@
         <w:rPr>
           <w:noProof/>
         </w:rPr>
-        <w:instrText xml:space="preserve"> PAGEREF _Toc240366659 \h </w:instrText>
+        <w:instrText xml:space="preserve"> PAGEREF _Toc240373153 \h </w:instrText>
       </w:r>
       <w:r>
         <w:rPr>
@@ -2809,7 +2809,7 @@
         <w:rPr>
           <w:noProof/>
         </w:rPr>
-        <w:t>82</w:t>
+        <w:t>84</w:t>
       </w:r>
       <w:r>
         <w:rPr>
@@ -2853,7 +2853,7 @@
         <w:rPr>
           <w:noProof/>
         </w:rPr>
-        <w:instrText xml:space="preserve"> PAGEREF _Toc240366660 \h </w:instrText>
+        <w:instrText xml:space="preserve"> PAGEREF _Toc240373154 \h </w:instrText>
       </w:r>
       <w:r>
         <w:rPr>
@@ -2870,7 +2870,7 @@
         <w:rPr>
           <w:noProof/>
         </w:rPr>
-        <w:t>82</w:t>
+        <w:t>85</w:t>
       </w:r>
       <w:r>
         <w:rPr>
@@ -2914,7 +2914,7 @@
         <w:rPr>
           <w:noProof/>
         </w:rPr>
-        <w:instrText xml:space="preserve"> PAGEREF _Toc240366661 \h </w:instrText>
+        <w:instrText xml:space="preserve"> PAGEREF _Toc240373155 \h </w:instrText>
       </w:r>
       <w:r>
         <w:rPr>
@@ -2931,7 +2931,7 @@
         <w:rPr>
           <w:noProof/>
         </w:rPr>
-        <w:t>84</w:t>
+        <w:t>86</w:t>
       </w:r>
       <w:r>
         <w:rPr>
@@ -2975,7 +2975,7 @@
         <w:rPr>
           <w:noProof/>
         </w:rPr>
-        <w:instrText xml:space="preserve"> PAGEREF _Toc240366662 \h </w:instrText>
+        <w:instrText xml:space="preserve"> PAGEREF _Toc240373156 \h </w:instrText>
       </w:r>
       <w:r>
         <w:rPr>
@@ -2992,7 +2992,7 @@
         <w:rPr>
           <w:noProof/>
         </w:rPr>
-        <w:t>87</w:t>
+        <w:t>90</w:t>
       </w:r>
       <w:r>
         <w:rPr>
@@ -3018,7 +3018,7 @@
           <w:noProof/>
           <w:color w:val="B91D2E"/>
         </w:rPr>
-        <w:t>6.5 Ambiente de Treino</w:t>
+        <w:t>6.4.2 Painel de Prazos</w:t>
       </w:r>
       <w:r>
         <w:rPr>
@@ -3036,7 +3036,7 @@
         <w:rPr>
           <w:noProof/>
         </w:rPr>
-        <w:instrText xml:space="preserve"> PAGEREF _Toc240366663 \h </w:instrText>
+        <w:instrText xml:space="preserve"> PAGEREF _Toc240373157 \h </w:instrText>
       </w:r>
       <w:r>
         <w:rPr>
@@ -3053,7 +3053,7 @@
         <w:rPr>
           <w:noProof/>
         </w:rPr>
-        <w:t>90</w:t>
+        <w:t>93</w:t>
       </w:r>
       <w:r>
         <w:rPr>
@@ -3079,7 +3079,7 @@
           <w:noProof/>
           <w:color w:val="B91D2E"/>
         </w:rPr>
-        <w:t>6.6 Backup automatizado</w:t>
+        <w:t>6.4.3 Aviso automatico de prazo (e-mail e push)</w:t>
       </w:r>
       <w:r>
         <w:rPr>
@@ -3097,7 +3097,7 @@
         <w:rPr>
           <w:noProof/>
         </w:rPr>
-        <w:instrText xml:space="preserve"> PAGEREF _Toc240366664 \h </w:instrText>
+        <w:instrText xml:space="preserve"> PAGEREF _Toc240373158 \h </w:instrText>
       </w:r>
       <w:r>
         <w:rPr>
@@ -3114,7 +3114,7 @@
         <w:rPr>
           <w:noProof/>
         </w:rPr>
-        <w:t>91</w:t>
+        <w:t>94</w:t>
       </w:r>
       <w:r>
         <w:rPr>
@@ -3140,6 +3140,128 @@
           <w:noProof/>
           <w:color w:val="B91D2E"/>
         </w:rPr>
+        <w:t>6.5 Ambiente de Treino</w:t>
+      </w:r>
+      <w:r>
+        <w:rPr>
+          <w:noProof/>
+        </w:rPr>
+        <w:tab/>
+      </w:r>
+      <w:r>
+        <w:rPr>
+          <w:noProof/>
+        </w:rPr>
+        <w:fldChar w:fldCharType="begin"/>
+      </w:r>
+      <w:r>
+        <w:rPr>
+          <w:noProof/>
+        </w:rPr>
+        <w:instrText xml:space="preserve"> PAGEREF _Toc240373159 \h </w:instrText>
+      </w:r>
+      <w:r>
+        <w:rPr>
+          <w:noProof/>
+        </w:rPr>
+      </w:r>
+      <w:r>
+        <w:rPr>
+          <w:noProof/>
+        </w:rPr>
+        <w:fldChar w:fldCharType="separate"/>
+      </w:r>
+      <w:r>
+        <w:rPr>
+          <w:noProof/>
+        </w:rPr>
+        <w:t>94</w:t>
+      </w:r>
+      <w:r>
+        <w:rPr>
+          <w:noProof/>
+        </w:rPr>
+        <w:fldChar w:fldCharType="end"/>
+      </w:r>
+    </w:p>
+    <w:p>
+      <w:pPr>
+        <w:pStyle w:val="Sumrio2"/>
+        <w:tabs>
+          <w:tab w:val="right" w:leader="dot" w:pos="8828"/>
+        </w:tabs>
+        <w:rPr>
+          <w:noProof/>
+        </w:rPr>
+      </w:pPr>
+      <w:r>
+        <w:rPr>
+          <w:rFonts w:ascii="Montserrat" w:hAnsi="Montserrat"/>
+          <w:b/>
+          <w:noProof/>
+          <w:color w:val="B91D2E"/>
+        </w:rPr>
+        <w:t>6.6 Backup automatizado</w:t>
+      </w:r>
+      <w:r>
+        <w:rPr>
+          <w:noProof/>
+        </w:rPr>
+        <w:tab/>
+      </w:r>
+      <w:r>
+        <w:rPr>
+          <w:noProof/>
+        </w:rPr>
+        <w:fldChar w:fldCharType="begin"/>
+      </w:r>
+      <w:r>
+        <w:rPr>
+          <w:noProof/>
+        </w:rPr>
+        <w:instrText xml:space="preserve"> PAGEREF _Toc240373160 \h </w:instrText>
+      </w:r>
+      <w:r>
+        <w:rPr>
+          <w:noProof/>
+        </w:rPr>
+      </w:r>
+      <w:r>
+        <w:rPr>
+          <w:noProof/>
+        </w:rPr>
+        <w:fldChar w:fldCharType="separate"/>
+      </w:r>
+      <w:r>
+        <w:rPr>
+          <w:noProof/>
+        </w:rPr>
+        <w:t>95</w:t>
+      </w:r>
+      <w:r>
+        <w:rPr>
+          <w:noProof/>
+        </w:rPr>
+        <w:fldChar w:fldCharType="end"/>
+      </w:r>
+    </w:p>
+    <w:p>
+      <w:pPr>
+        <w:pStyle w:val="Sumrio2"/>
+        <w:tabs>
+          <w:tab w:val="right" w:leader="dot" w:pos="8828"/>
+        </w:tabs>
+        <w:rPr>
+          <w:noProof/>
+        </w:rPr>
+      </w:pPr>
+      <w:r>
+        <w:rPr>
+          <w:rFonts w:ascii="Montserrat" w:hAnsi="Montserrat"/>
+          <w:b/>
+          <w:noProof/>
+          <w:color w:val="B91D2E"/>
+        </w:rPr>
         <w:t>6.7 Relatorio de Resultados</w:t>
       </w:r>
       <w:r>
@@ -3158,7 +3280,7 @@
         <w:rPr>
           <w:noProof/>
         </w:rPr>
-        <w:instrText xml:space="preserve"> PAGEREF _Toc240366665 \h </w:instrText>
+        <w:instrText xml:space="preserve"> PAGEREF _Toc240373161 \h </w:instrText>
       </w:r>
       <w:r>
         <w:rPr>
@@ -3175,7 +3297,7 @@
         <w:rPr>
           <w:noProof/>
         </w:rPr>
-        <w:t>92</w:t>
+        <w:t>96</w:t>
       </w:r>
       <w:r>
         <w:rPr>
@@ -3219,7 +3341,7 @@
         <w:rPr>
           <w:noProof/>
         </w:rPr>
-        <w:instrText xml:space="preserve"> PAGEREF _Toc240366666 \h </w:instrText>
+        <w:instrText xml:space="preserve"> PAGEREF _Toc240373162 \h </w:instrText>
       </w:r>
       <w:r>
         <w:rPr>
@@ -3236,7 +3358,7 @@
         <w:rPr>
           <w:noProof/>
         </w:rPr>
-        <w:t>96</w:t>
+        <w:t>100</w:t>
       </w:r>
       <w:r>
         <w:rPr>
@@ -3280,7 +3402,7 @@
         <w:rPr>
           <w:noProof/>
         </w:rPr>
-        <w:instrText xml:space="preserve"> PAGEREF _Toc240366667 \h </w:instrText>
+        <w:instrText xml:space="preserve"> PAGEREF _Toc240373163 \h </w:instrText>
       </w:r>
       <w:r>
         <w:rPr>
@@ -3297,7 +3419,7 @@
         <w:rPr>
           <w:noProof/>
         </w:rPr>
-        <w:t>97</w:t>
+        <w:t>101</w:t>
       </w:r>
       <w:r>
         <w:rPr>
@@ -3321,6 +3443,7 @@
           <w:color w:val="1A1A1A"/>
           <w:sz w:val="32"/>
         </w:rPr>
+        <w:lastRenderedPageBreak/>
         <w:fldChar w:fldCharType="end"/>
       </w:r>
     </w:p>
@@ -3356,7 +3479,7 @@
           <w:sz w:val="34"/>
         </w:rPr>
       </w:pPr>
-      <w:bookmarkStart w:id="0" w:name="_Toc240366617"/>
+      <w:bookmarkStart w:id="0" w:name="_Toc240373111"/>
       <w:r>
         <w:rPr>
           <w:rFonts w:ascii="Montserrat" w:hAnsi="Montserrat"/>
@@ -3380,7 +3503,7 @@
           <w:sz w:val="27"/>
         </w:rPr>
       </w:pPr>
-      <w:bookmarkStart w:id="1" w:name="_Toc240366618"/>
+      <w:bookmarkStart w:id="1" w:name="_Toc240373112"/>
       <w:r>
         <w:rPr>
           <w:rFonts w:ascii="Montserrat" w:hAnsi="Montserrat"/>
@@ -4920,6 +5043,24 @@
           <w:color w:val="1A1A1A"/>
           <w:sz w:val="22"/>
         </w:rPr>
+        <w:t>Esta e a versao 2.77 do manual. Em relacao a versao 2.76 (15/09/2026), foi adicionada a nova pagina Painel de Prazos (secao 6.4.2) - uma 17a pagina em Gestao, pensada para ficar aberta numa TV/monitor, com atualizacao automatica a cada 2 minutos, mostrando o cronograma de todos os projetos ativos com marcos atrasados e vencendo em breve em destaque. Junto com ela, um mecanismo diario e automatico de aviso por e-mail/push (secao 6.4.3) passou a notificar quem e responsavel por um marco (5 dias antes, 2 dias antes, no dia e, repetido semanalmente, quando ja atrasado) - o cronograma do Planejamento (Passo 4, aba 3) ganhou o campo opcional Responsavel (conta) para vincular cada marco a uma conta real da equipe do projeto, alem do texto livre Responsavel ja existente. O documento Regras de Acesso e Permissoes tambem foi atualizado (secao 3.4).</w:t>
+      </w:r>
+    </w:p>
+    <w:p>
+      <w:pPr>
+        <w:spacing w:line="280" w:lineRule="auto"/>
+        <w:rPr>
+          <w:rFonts w:ascii="Montserrat" w:hAnsi="Montserrat"/>
+          <w:color w:val="1A1A1A"/>
+          <w:sz w:val="22"/>
+        </w:rPr>
+      </w:pPr>
+      <w:r>
+        <w:rPr>
+          <w:rFonts w:ascii="Montserrat" w:hAnsi="Montserrat"/>
+          <w:color w:val="1A1A1A"/>
+          <w:sz w:val="22"/>
+        </w:rPr>
         <w:t>O manual nao substitui as Diretrizes para a Gestao de Projetos da UNIALFA (documento institucional que define o framework D01 a D07) nem o documento Regras de Acesso e Permissoes (que detalha cada regra de controle de acesso); ele e o guia operacional de como usar cada ferramenta na pratica.</w:t>
       </w:r>
     </w:p>
@@ -4934,7 +5075,7 @@
           <w:sz w:val="27"/>
         </w:rPr>
       </w:pPr>
-      <w:bookmarkStart w:id="2" w:name="_Toc240366619"/>
+      <w:bookmarkStart w:id="2" w:name="_Toc240373113"/>
       <w:r>
         <w:rPr>
           <w:rFonts w:ascii="Montserrat" w:hAnsi="Montserrat"/>
@@ -5099,6 +5240,7 @@
           <w:color w:val="1A1A1A"/>
           <w:sz w:val="22"/>
         </w:rPr>
+        <w:lastRenderedPageBreak/>
         <w:t>Cada formulario de registro tem duas partes: uma tela de preenchimento (+Novo...) e uma tela de consulta (...cadastrados), onde ficam listados todos os registros ja salvos, com opcao de abrir, editar o status ou excluir cada um.</w:t>
       </w:r>
     </w:p>
@@ -5129,18 +5271,17 @@
         <w:rPr>
           <w:noProof/>
         </w:rPr>
-        <w:lastRenderedPageBreak/>
         <w:drawing>
-          <wp:inline distT="0" distB="0" distL="0" distR="0" wp14:anchorId="2503C149" wp14:editId="50C322A5">
+          <wp:inline distT="0" distB="0" distL="0" distR="0" wp14:anchorId="53CE1154" wp14:editId="239AE7E2">
             <wp:extent cx="5303520" cy="4792851"/>
             <wp:effectExtent l="19050" t="19050" r="11430" b="27305"/>
-            <wp:docPr id="2058906140" name="Imagem 1"/>
+            <wp:docPr id="396128479" name="Imagem 1"/>
             <wp:cNvGraphicFramePr/>
             <a:graphic xmlns:a="http://schemas.openxmlformats.org/drawingml/2006/main">
               <a:graphicData uri="http://schemas.openxmlformats.org/drawingml/2006/picture">
                 <pic:pic xmlns:pic="http://schemas.openxmlformats.org/drawingml/2006/picture">
                   <pic:nvPicPr>
-                    <pic:cNvPr id="2058906140" name=""/>
+                    <pic:cNvPr id="396128479" name=""/>
                     <pic:cNvPicPr/>
                   </pic:nvPicPr>
                   <pic:blipFill>
@@ -5208,7 +5349,7 @@
           <w:sz w:val="27"/>
         </w:rPr>
       </w:pPr>
-      <w:bookmarkStart w:id="3" w:name="_Toc240366620"/>
+      <w:bookmarkStart w:id="3" w:name="_Toc240373114"/>
       <w:r>
         <w:rPr>
           <w:rFonts w:ascii="Montserrat" w:hAnsi="Montserrat"/>
@@ -5249,16 +5390,16 @@
         </w:rPr>
         <w:lastRenderedPageBreak/>
         <w:drawing>
-          <wp:inline distT="0" distB="0" distL="0" distR="0" wp14:anchorId="78A8FE0A" wp14:editId="60F3EF7E">
+          <wp:inline distT="0" distB="0" distL="0" distR="0" wp14:anchorId="45D4AFDE" wp14:editId="6852592B">
             <wp:extent cx="4206240" cy="3801227"/>
             <wp:effectExtent l="19050" t="19050" r="22860" b="27940"/>
-            <wp:docPr id="496293441" name="Imagem 2"/>
+            <wp:docPr id="869793535" name="Imagem 2"/>
             <wp:cNvGraphicFramePr/>
             <a:graphic xmlns:a="http://schemas.openxmlformats.org/drawingml/2006/main">
               <a:graphicData uri="http://schemas.openxmlformats.org/drawingml/2006/picture">
                 <pic:pic xmlns:pic="http://schemas.openxmlformats.org/drawingml/2006/picture">
                   <pic:nvPicPr>
-                    <pic:cNvPr id="496293441" name=""/>
+                    <pic:cNvPr id="869793535" name=""/>
                     <pic:cNvPicPr/>
                   </pic:nvPicPr>
                   <pic:blipFill>
@@ -5431,7 +5572,7 @@
           <w:sz w:val="27"/>
         </w:rPr>
       </w:pPr>
-      <w:bookmarkStart w:id="4" w:name="_Toc240366621"/>
+      <w:bookmarkStart w:id="4" w:name="_Toc240373115"/>
       <w:r>
         <w:rPr>
           <w:rFonts w:ascii="Montserrat" w:hAnsi="Montserrat"/>
@@ -6670,7 +6811,7 @@
           <w:sz w:val="34"/>
         </w:rPr>
       </w:pPr>
-      <w:bookmarkStart w:id="5" w:name="_Toc240366622"/>
+      <w:bookmarkStart w:id="5" w:name="_Toc240373116"/>
       <w:r>
         <w:rPr>
           <w:rFonts w:ascii="Montserrat" w:hAnsi="Montserrat"/>
@@ -6694,7 +6835,7 @@
           <w:sz w:val="27"/>
         </w:rPr>
       </w:pPr>
-      <w:bookmarkStart w:id="6" w:name="_Toc240366623"/>
+      <w:bookmarkStart w:id="6" w:name="_Toc240373117"/>
       <w:r>
         <w:rPr>
           <w:rFonts w:ascii="Montserrat" w:hAnsi="Montserrat"/>
@@ -6735,7 +6876,7 @@
           <w:sz w:val="27"/>
         </w:rPr>
       </w:pPr>
-      <w:bookmarkStart w:id="7" w:name="_Toc240366624"/>
+      <w:bookmarkStart w:id="7" w:name="_Toc240373118"/>
       <w:r>
         <w:rPr>
           <w:rFonts w:ascii="Montserrat" w:hAnsi="Montserrat"/>
@@ -6854,7 +6995,7 @@
           <w:sz w:val="27"/>
         </w:rPr>
       </w:pPr>
-      <w:bookmarkStart w:id="8" w:name="_Toc240366625"/>
+      <w:bookmarkStart w:id="8" w:name="_Toc240373119"/>
       <w:r>
         <w:rPr>
           <w:rFonts w:ascii="Montserrat" w:hAnsi="Montserrat"/>
@@ -7467,7 +7608,7 @@
           <w:sz w:val="27"/>
         </w:rPr>
       </w:pPr>
-      <w:bookmarkStart w:id="9" w:name="_Toc240366626"/>
+      <w:bookmarkStart w:id="9" w:name="_Toc240373120"/>
       <w:r>
         <w:rPr>
           <w:rFonts w:ascii="Montserrat" w:hAnsi="Montserrat"/>
@@ -7556,16 +7697,16 @@
         </w:rPr>
         <w:lastRenderedPageBreak/>
         <w:drawing>
-          <wp:inline distT="0" distB="0" distL="0" distR="0" wp14:anchorId="1C7B23DC" wp14:editId="149CB265">
+          <wp:inline distT="0" distB="0" distL="0" distR="0" wp14:anchorId="1D503960" wp14:editId="1B8E9E98">
             <wp:extent cx="4937760" cy="4462310"/>
             <wp:effectExtent l="19050" t="19050" r="15240" b="14605"/>
-            <wp:docPr id="1309274295" name="Imagem 3"/>
+            <wp:docPr id="1154731913" name="Imagem 3"/>
             <wp:cNvGraphicFramePr/>
             <a:graphic xmlns:a="http://schemas.openxmlformats.org/drawingml/2006/main">
               <a:graphicData uri="http://schemas.openxmlformats.org/drawingml/2006/picture">
                 <pic:pic xmlns:pic="http://schemas.openxmlformats.org/drawingml/2006/picture">
                   <pic:nvPicPr>
-                    <pic:cNvPr id="1309274295" name=""/>
+                    <pic:cNvPr id="1154731913" name=""/>
                     <pic:cNvPicPr/>
                   </pic:nvPicPr>
                   <pic:blipFill>
@@ -7633,7 +7774,7 @@
           <w:sz w:val="27"/>
         </w:rPr>
       </w:pPr>
-      <w:bookmarkStart w:id="10" w:name="_Toc240366627"/>
+      <w:bookmarkStart w:id="10" w:name="_Toc240373121"/>
       <w:r>
         <w:rPr>
           <w:rFonts w:ascii="Montserrat" w:hAnsi="Montserrat"/>
@@ -7674,16 +7815,16 @@
         </w:rPr>
         <w:lastRenderedPageBreak/>
         <w:drawing>
-          <wp:inline distT="0" distB="0" distL="0" distR="0" wp14:anchorId="4ED40500" wp14:editId="6F03A40E">
+          <wp:inline distT="0" distB="0" distL="0" distR="0" wp14:anchorId="318C4150" wp14:editId="5A7834F9">
             <wp:extent cx="5120640" cy="4627581"/>
             <wp:effectExtent l="19050" t="19050" r="22860" b="20955"/>
-            <wp:docPr id="309959834" name="Imagem 4"/>
+            <wp:docPr id="1096508658" name="Imagem 4"/>
             <wp:cNvGraphicFramePr/>
             <a:graphic xmlns:a="http://schemas.openxmlformats.org/drawingml/2006/main">
               <a:graphicData uri="http://schemas.openxmlformats.org/drawingml/2006/picture">
                 <pic:pic xmlns:pic="http://schemas.openxmlformats.org/drawingml/2006/picture">
                   <pic:nvPicPr>
-                    <pic:cNvPr id="309959834" name=""/>
+                    <pic:cNvPr id="1096508658" name=""/>
                     <pic:cNvPicPr/>
                   </pic:nvPicPr>
                   <pic:blipFill>
@@ -7866,7 +8007,7 @@
           <w:sz w:val="27"/>
         </w:rPr>
       </w:pPr>
-      <w:bookmarkStart w:id="11" w:name="_Toc240366628"/>
+      <w:bookmarkStart w:id="11" w:name="_Toc240373122"/>
       <w:r>
         <w:rPr>
           <w:rFonts w:ascii="Montserrat" w:hAnsi="Montserrat"/>
@@ -7906,16 +8047,16 @@
           <w:noProof/>
         </w:rPr>
         <w:drawing>
-          <wp:inline distT="0" distB="0" distL="0" distR="0" wp14:anchorId="06D53DFE" wp14:editId="6CE9D096">
+          <wp:inline distT="0" distB="0" distL="0" distR="0" wp14:anchorId="31908EAD" wp14:editId="13E8E2D2">
             <wp:extent cx="4206240" cy="3801227"/>
             <wp:effectExtent l="19050" t="19050" r="22860" b="27940"/>
-            <wp:docPr id="1001424920" name="Imagem 5"/>
+            <wp:docPr id="1063509427" name="Imagem 5"/>
             <wp:cNvGraphicFramePr/>
             <a:graphic xmlns:a="http://schemas.openxmlformats.org/drawingml/2006/main">
               <a:graphicData uri="http://schemas.openxmlformats.org/drawingml/2006/picture">
                 <pic:pic xmlns:pic="http://schemas.openxmlformats.org/drawingml/2006/picture">
                   <pic:nvPicPr>
-                    <pic:cNvPr id="1001424920" name=""/>
+                    <pic:cNvPr id="1063509427" name=""/>
                     <pic:cNvPicPr/>
                   </pic:nvPicPr>
                   <pic:blipFill>
@@ -7983,16 +8124,16 @@
         </w:rPr>
         <w:lastRenderedPageBreak/>
         <w:drawing>
-          <wp:inline distT="0" distB="0" distL="0" distR="0" wp14:anchorId="6F31C840" wp14:editId="549ED8A3">
+          <wp:inline distT="0" distB="0" distL="0" distR="0" wp14:anchorId="161D40DE" wp14:editId="1C58C0CB">
             <wp:extent cx="4206240" cy="3801227"/>
             <wp:effectExtent l="19050" t="19050" r="22860" b="27940"/>
-            <wp:docPr id="714542336" name="Imagem 6"/>
+            <wp:docPr id="635546386" name="Imagem 6"/>
             <wp:cNvGraphicFramePr/>
             <a:graphic xmlns:a="http://schemas.openxmlformats.org/drawingml/2006/main">
               <a:graphicData uri="http://schemas.openxmlformats.org/drawingml/2006/picture">
                 <pic:pic xmlns:pic="http://schemas.openxmlformats.org/drawingml/2006/picture">
                   <pic:nvPicPr>
-                    <pic:cNvPr id="714542336" name=""/>
+                    <pic:cNvPr id="635546386" name=""/>
                     <pic:cNvPicPr/>
                   </pic:nvPicPr>
                   <pic:blipFill>
@@ -8108,7 +8249,7 @@
           <w:sz w:val="27"/>
         </w:rPr>
       </w:pPr>
-      <w:bookmarkStart w:id="12" w:name="_Toc240366629"/>
+      <w:bookmarkStart w:id="12" w:name="_Toc240373123"/>
       <w:r>
         <w:rPr>
           <w:rFonts w:ascii="Montserrat" w:hAnsi="Montserrat"/>
@@ -8176,7 +8317,7 @@
           <w:sz w:val="27"/>
         </w:rPr>
       </w:pPr>
-      <w:bookmarkStart w:id="13" w:name="_Toc240366630"/>
+      <w:bookmarkStart w:id="13" w:name="_Toc240373124"/>
       <w:r>
         <w:rPr>
           <w:rFonts w:ascii="Montserrat" w:hAnsi="Montserrat"/>
@@ -8403,7 +8544,7 @@
           <w:sz w:val="27"/>
         </w:rPr>
       </w:pPr>
-      <w:bookmarkStart w:id="14" w:name="_Toc240366631"/>
+      <w:bookmarkStart w:id="14" w:name="_Toc240373125"/>
       <w:r>
         <w:rPr>
           <w:rFonts w:ascii="Montserrat" w:hAnsi="Montserrat"/>
@@ -8562,7 +8703,7 @@
           <w:sz w:val="27"/>
         </w:rPr>
       </w:pPr>
-      <w:bookmarkStart w:id="15" w:name="_Toc240366632"/>
+      <w:bookmarkStart w:id="15" w:name="_Toc240373126"/>
       <w:r>
         <w:rPr>
           <w:rFonts w:ascii="Montserrat" w:hAnsi="Montserrat"/>
@@ -8754,7 +8895,7 @@
           <w:sz w:val="27"/>
         </w:rPr>
       </w:pPr>
-      <w:bookmarkStart w:id="16" w:name="_Toc240366633"/>
+      <w:bookmarkStart w:id="16" w:name="_Toc240373127"/>
       <w:r>
         <w:rPr>
           <w:rFonts w:ascii="Montserrat" w:hAnsi="Montserrat"/>
@@ -8882,7 +9023,7 @@
           <w:sz w:val="27"/>
         </w:rPr>
       </w:pPr>
-      <w:bookmarkStart w:id="17" w:name="_Toc240366634"/>
+      <w:bookmarkStart w:id="17" w:name="_Toc240373128"/>
       <w:r>
         <w:rPr>
           <w:rFonts w:ascii="Montserrat" w:hAnsi="Montserrat"/>
@@ -9212,7 +9353,7 @@
           <w:sz w:val="27"/>
         </w:rPr>
       </w:pPr>
-      <w:bookmarkStart w:id="18" w:name="_Toc240366635"/>
+      <w:bookmarkStart w:id="18" w:name="_Toc240373129"/>
       <w:r>
         <w:rPr>
           <w:rFonts w:ascii="Montserrat" w:hAnsi="Montserrat"/>
@@ -9349,7 +9490,7 @@
           <w:sz w:val="27"/>
         </w:rPr>
       </w:pPr>
-      <w:bookmarkStart w:id="19" w:name="_Toc240366636"/>
+      <w:bookmarkStart w:id="19" w:name="_Toc240373130"/>
       <w:r>
         <w:rPr>
           <w:rFonts w:ascii="Montserrat" w:hAnsi="Montserrat"/>
@@ -9628,7 +9769,7 @@
           <w:sz w:val="27"/>
         </w:rPr>
       </w:pPr>
-      <w:bookmarkStart w:id="20" w:name="_Toc240366637"/>
+      <w:bookmarkStart w:id="20" w:name="_Toc240373131"/>
       <w:r>
         <w:rPr>
           <w:rFonts w:ascii="Montserrat" w:hAnsi="Montserrat"/>
@@ -9805,7 +9946,7 @@
           <w:sz w:val="27"/>
         </w:rPr>
       </w:pPr>
-      <w:bookmarkStart w:id="21" w:name="_Toc240366638"/>
+      <w:bookmarkStart w:id="21" w:name="_Toc240373132"/>
       <w:r>
         <w:rPr>
           <w:rFonts w:ascii="Montserrat" w:hAnsi="Montserrat"/>
@@ -9919,7 +10060,7 @@
           <w:sz w:val="34"/>
         </w:rPr>
       </w:pPr>
-      <w:bookmarkStart w:id="22" w:name="_Toc240366639"/>
+      <w:bookmarkStart w:id="22" w:name="_Toc240373133"/>
       <w:r>
         <w:rPr>
           <w:rFonts w:ascii="Montserrat" w:hAnsi="Montserrat"/>
@@ -9961,7 +10102,7 @@
           <w:sz w:val="27"/>
         </w:rPr>
       </w:pPr>
-      <w:bookmarkStart w:id="23" w:name="_Toc240366640"/>
+      <w:bookmarkStart w:id="23" w:name="_Toc240373134"/>
       <w:r>
         <w:rPr>
           <w:rFonts w:ascii="Montserrat" w:hAnsi="Montserrat"/>
@@ -11041,16 +11182,16 @@
         </w:rPr>
         <w:lastRenderedPageBreak/>
         <w:drawing>
-          <wp:inline distT="0" distB="0" distL="0" distR="0" wp14:anchorId="41D99C44" wp14:editId="07CC5E53">
+          <wp:inline distT="0" distB="0" distL="0" distR="0" wp14:anchorId="5E1338DC" wp14:editId="4A8EAE3D">
             <wp:extent cx="5120640" cy="4627581"/>
             <wp:effectExtent l="19050" t="19050" r="22860" b="20955"/>
-            <wp:docPr id="1285299580" name="Imagem 7"/>
+            <wp:docPr id="1147296385" name="Imagem 7"/>
             <wp:cNvGraphicFramePr/>
             <a:graphic xmlns:a="http://schemas.openxmlformats.org/drawingml/2006/main">
               <a:graphicData uri="http://schemas.openxmlformats.org/drawingml/2006/picture">
                 <pic:pic xmlns:pic="http://schemas.openxmlformats.org/drawingml/2006/picture">
                   <pic:nvPicPr>
-                    <pic:cNvPr id="1285299580" name=""/>
+                    <pic:cNvPr id="1147296385" name=""/>
                     <pic:cNvPicPr/>
                   </pic:nvPicPr>
                   <pic:blipFill>
@@ -11118,16 +11259,16 @@
         </w:rPr>
         <w:lastRenderedPageBreak/>
         <w:drawing>
-          <wp:inline distT="0" distB="0" distL="0" distR="0" wp14:anchorId="1ED676BD" wp14:editId="3849F586">
+          <wp:inline distT="0" distB="0" distL="0" distR="0" wp14:anchorId="339BDDB7" wp14:editId="12A1EE35">
             <wp:extent cx="5120640" cy="4627581"/>
             <wp:effectExtent l="19050" t="19050" r="22860" b="20955"/>
-            <wp:docPr id="2140934559" name="Imagem 8"/>
+            <wp:docPr id="1552360888" name="Imagem 8"/>
             <wp:cNvGraphicFramePr/>
             <a:graphic xmlns:a="http://schemas.openxmlformats.org/drawingml/2006/main">
               <a:graphicData uri="http://schemas.openxmlformats.org/drawingml/2006/picture">
                 <pic:pic xmlns:pic="http://schemas.openxmlformats.org/drawingml/2006/picture">
                   <pic:nvPicPr>
-                    <pic:cNvPr id="2140934559" name=""/>
+                    <pic:cNvPr id="1552360888" name=""/>
                     <pic:cNvPicPr/>
                   </pic:nvPicPr>
                   <pic:blipFill>
@@ -11335,7 +11476,7 @@
           <w:sz w:val="27"/>
         </w:rPr>
       </w:pPr>
-      <w:bookmarkStart w:id="24" w:name="_Toc240366641"/>
+      <w:bookmarkStart w:id="24" w:name="_Toc240373135"/>
       <w:r>
         <w:rPr>
           <w:rFonts w:ascii="Montserrat" w:hAnsi="Montserrat"/>
@@ -12260,16 +12401,16 @@
           <w:noProof/>
         </w:rPr>
         <w:drawing>
-          <wp:inline distT="0" distB="0" distL="0" distR="0" wp14:anchorId="2E88FF97" wp14:editId="03E6A781">
+          <wp:inline distT="0" distB="0" distL="0" distR="0" wp14:anchorId="0341A43A" wp14:editId="14AD6F05">
             <wp:extent cx="5120640" cy="4627581"/>
             <wp:effectExtent l="19050" t="19050" r="22860" b="20955"/>
-            <wp:docPr id="792379148" name="Imagem 9"/>
+            <wp:docPr id="1231558416" name="Imagem 9"/>
             <wp:cNvGraphicFramePr/>
             <a:graphic xmlns:a="http://schemas.openxmlformats.org/drawingml/2006/main">
               <a:graphicData uri="http://schemas.openxmlformats.org/drawingml/2006/picture">
                 <pic:pic xmlns:pic="http://schemas.openxmlformats.org/drawingml/2006/picture">
                   <pic:nvPicPr>
-                    <pic:cNvPr id="792379148" name=""/>
+                    <pic:cNvPr id="1231558416" name=""/>
                     <pic:cNvPicPr/>
                   </pic:nvPicPr>
                   <pic:blipFill>
@@ -12337,16 +12478,16 @@
         </w:rPr>
         <w:lastRenderedPageBreak/>
         <w:drawing>
-          <wp:inline distT="0" distB="0" distL="0" distR="0" wp14:anchorId="69C118FF" wp14:editId="3F41A9E6">
+          <wp:inline distT="0" distB="0" distL="0" distR="0" wp14:anchorId="4627F72C" wp14:editId="63D6BB48">
             <wp:extent cx="5120640" cy="4627581"/>
             <wp:effectExtent l="19050" t="19050" r="22860" b="20955"/>
-            <wp:docPr id="1738797512" name="Imagem 10"/>
+            <wp:docPr id="1681727678" name="Imagem 10"/>
             <wp:cNvGraphicFramePr/>
             <a:graphic xmlns:a="http://schemas.openxmlformats.org/drawingml/2006/main">
               <a:graphicData uri="http://schemas.openxmlformats.org/drawingml/2006/picture">
                 <pic:pic xmlns:pic="http://schemas.openxmlformats.org/drawingml/2006/picture">
                   <pic:nvPicPr>
-                    <pic:cNvPr id="1738797512" name=""/>
+                    <pic:cNvPr id="1681727678" name=""/>
                     <pic:cNvPicPr/>
                   </pic:nvPicPr>
                   <pic:blipFill>
@@ -12480,7 +12621,7 @@
           <w:sz w:val="27"/>
         </w:rPr>
       </w:pPr>
-      <w:bookmarkStart w:id="25" w:name="_Toc240366642"/>
+      <w:bookmarkStart w:id="25" w:name="_Toc240373136"/>
       <w:r>
         <w:rPr>
           <w:rFonts w:ascii="Montserrat" w:hAnsi="Montserrat"/>
@@ -13546,16 +13687,16 @@
           <w:noProof/>
         </w:rPr>
         <w:drawing>
-          <wp:inline distT="0" distB="0" distL="0" distR="0" wp14:anchorId="744A365A" wp14:editId="641A23AE">
+          <wp:inline distT="0" distB="0" distL="0" distR="0" wp14:anchorId="3E1C17F7" wp14:editId="298E3F61">
             <wp:extent cx="5120640" cy="3338440"/>
             <wp:effectExtent l="19050" t="19050" r="22860" b="14605"/>
-            <wp:docPr id="1677807755" name="Imagem 11"/>
+            <wp:docPr id="1407715702" name="Imagem 11"/>
             <wp:cNvGraphicFramePr/>
             <a:graphic xmlns:a="http://schemas.openxmlformats.org/drawingml/2006/main">
               <a:graphicData uri="http://schemas.openxmlformats.org/drawingml/2006/picture">
                 <pic:pic xmlns:pic="http://schemas.openxmlformats.org/drawingml/2006/picture">
                   <pic:nvPicPr>
-                    <pic:cNvPr id="1677807755" name=""/>
+                    <pic:cNvPr id="1407715702" name=""/>
                     <pic:cNvPicPr/>
                   </pic:nvPicPr>
                   <pic:blipFill>
@@ -13623,16 +13764,16 @@
         </w:rPr>
         <w:lastRenderedPageBreak/>
         <w:drawing>
-          <wp:inline distT="0" distB="0" distL="0" distR="0" wp14:anchorId="6609EE17" wp14:editId="34A78D2A">
+          <wp:inline distT="0" distB="0" distL="0" distR="0" wp14:anchorId="24302F31" wp14:editId="79C4EF70">
             <wp:extent cx="5120640" cy="4627581"/>
             <wp:effectExtent l="19050" t="19050" r="22860" b="20955"/>
-            <wp:docPr id="2122056739" name="Imagem 12"/>
+            <wp:docPr id="857571290" name="Imagem 12"/>
             <wp:cNvGraphicFramePr/>
             <a:graphic xmlns:a="http://schemas.openxmlformats.org/drawingml/2006/main">
               <a:graphicData uri="http://schemas.openxmlformats.org/drawingml/2006/picture">
                 <pic:pic xmlns:pic="http://schemas.openxmlformats.org/drawingml/2006/picture">
                   <pic:nvPicPr>
-                    <pic:cNvPr id="2122056739" name=""/>
+                    <pic:cNvPr id="857571290" name=""/>
                     <pic:cNvPicPr/>
                   </pic:nvPicPr>
                   <pic:blipFill>
@@ -13836,7 +13977,7 @@
           <w:sz w:val="27"/>
         </w:rPr>
       </w:pPr>
-      <w:bookmarkStart w:id="26" w:name="_Toc240366643"/>
+      <w:bookmarkStart w:id="26" w:name="_Toc240373137"/>
       <w:r>
         <w:rPr>
           <w:rFonts w:ascii="Montserrat" w:hAnsi="Montserrat"/>
@@ -14397,16 +14538,16 @@
           <w:noProof/>
         </w:rPr>
         <w:drawing>
-          <wp:inline distT="0" distB="0" distL="0" distR="0" wp14:anchorId="701FC428" wp14:editId="792C5AB7">
+          <wp:inline distT="0" distB="0" distL="0" distR="0" wp14:anchorId="5E799468" wp14:editId="03559D45">
             <wp:extent cx="5120640" cy="4627581"/>
             <wp:effectExtent l="19050" t="19050" r="22860" b="20955"/>
-            <wp:docPr id="351799996" name="Imagem 13"/>
+            <wp:docPr id="1141780281" name="Imagem 13"/>
             <wp:cNvGraphicFramePr/>
             <a:graphic xmlns:a="http://schemas.openxmlformats.org/drawingml/2006/main">
               <a:graphicData uri="http://schemas.openxmlformats.org/drawingml/2006/picture">
                 <pic:pic xmlns:pic="http://schemas.openxmlformats.org/drawingml/2006/picture">
                   <pic:nvPicPr>
-                    <pic:cNvPr id="351799996" name=""/>
+                    <pic:cNvPr id="1141780281" name=""/>
                     <pic:cNvPicPr/>
                   </pic:nvPicPr>
                   <pic:blipFill>
@@ -14474,16 +14615,16 @@
         </w:rPr>
         <w:lastRenderedPageBreak/>
         <w:drawing>
-          <wp:inline distT="0" distB="0" distL="0" distR="0" wp14:anchorId="5C33A0B5" wp14:editId="43D36BF3">
+          <wp:inline distT="0" distB="0" distL="0" distR="0" wp14:anchorId="3BE4F881" wp14:editId="13035B77">
             <wp:extent cx="5120640" cy="4627581"/>
             <wp:effectExtent l="19050" t="19050" r="22860" b="20955"/>
-            <wp:docPr id="730827371" name="Imagem 14"/>
+            <wp:docPr id="191620847" name="Imagem 14"/>
             <wp:cNvGraphicFramePr/>
             <a:graphic xmlns:a="http://schemas.openxmlformats.org/drawingml/2006/main">
               <a:graphicData uri="http://schemas.openxmlformats.org/drawingml/2006/picture">
                 <pic:pic xmlns:pic="http://schemas.openxmlformats.org/drawingml/2006/picture">
                   <pic:nvPicPr>
-                    <pic:cNvPr id="730827371" name=""/>
+                    <pic:cNvPr id="191620847" name=""/>
                     <pic:cNvPicPr/>
                   </pic:nvPicPr>
                   <pic:blipFill>
@@ -14696,6 +14837,25 @@
           <w:color w:val="1A1A1A"/>
           <w:sz w:val="22"/>
         </w:rPr>
+        <w:t>Responsavel (conta): alem do campo de texto livre Responsavel, cada marco tem um segundo campo opcional, Responsavel (conta) - um seletor com as contas que fazem parte da equipe do projeto selecionado (secao 2.5). Diferente do texto livre, que e so uma anotacao, esse campo vincula o marco a uma conta de verdade: e a partir dele (mais o papel Gerente de Projetos da equipe do projeto) que o sistema sabe para quem mandar o aviso automatico de prazo (secao 6.4.3) e para popular o Painel de Prazos (secao 6.4.2). Preencher esse campo e opcional - um marco sem Responsavel (conta) continua funcionando normalmente, so nao gera aviso individual.</w:t>
+      </w:r>
+    </w:p>
+    <w:p>
+      <w:pPr>
+        <w:spacing w:line="280" w:lineRule="auto"/>
+        <w:rPr>
+          <w:rFonts w:ascii="Montserrat" w:hAnsi="Montserrat"/>
+          <w:color w:val="1A1A1A"/>
+          <w:sz w:val="22"/>
+        </w:rPr>
+      </w:pPr>
+      <w:r>
+        <w:rPr>
+          <w:rFonts w:ascii="Montserrat" w:hAnsi="Montserrat"/>
+          <w:color w:val="1A1A1A"/>
+          <w:sz w:val="22"/>
+        </w:rPr>
+        <w:lastRenderedPageBreak/>
         <w:t>Tarefas dentro de um marco: quando um marco precisar de mais detalhe, o botao + Tarefas (ultima coluna da tabela) abre uma lista simples logo abaixo da linha - nome da tarefa e uma caixa de concluida, sem data ou responsavel proprios (quem tem isso e o marco). O botao muda para Tarefas (2/3), por exemplo, mostrando quantas ja foram concluidas, e fica com contorno laranja enquanto houver alguma pendente. E totalmente opcional - um marco sem nenhuma tarefa continua funcionando normalmente. Ao lado do botao + Adicionar linha, um resumo mostra o percentual de tarefas concluidas somando todos os marcos do cronograma.</w:t>
       </w:r>
     </w:p>
@@ -14720,7 +14880,6 @@
           <w:color w:val="1A1A1A"/>
           <w:sz w:val="22"/>
         </w:rPr>
-        <w:lastRenderedPageBreak/>
         <w:t>Assistente de preenchimento por IA: apos selecionar o Projeto vinculado, o botao Sugerir com IA le a Solicitacao de Demanda, o TAP, o Canvas e as Atas de Reuniao do projeto e sugere o Solicitante (capa), o preenchimento da aba Pre-projeto (incluindo Macro fases, resumidas dos entregaveis/escopo do TAP), um rascunho inicial do cronograma (aba 3, quando ainda vazio) e a Introducao/Situacao atual/Proposta de mudanca/Beneficios na aba Viabilidade. O campo Negocio (capa) fica de fora, por nao ter fonte confiavel nos documentos (secao 2.12).</w:t>
       </w:r>
     </w:p>
@@ -14735,7 +14894,7 @@
           <w:sz w:val="27"/>
         </w:rPr>
       </w:pPr>
-      <w:bookmarkStart w:id="27" w:name="_Toc240366644"/>
+      <w:bookmarkStart w:id="27" w:name="_Toc240373138"/>
       <w:r>
         <w:rPr>
           <w:rFonts w:ascii="Montserrat" w:hAnsi="Montserrat"/>
@@ -14774,17 +14933,18 @@
         <w:rPr>
           <w:noProof/>
         </w:rPr>
+        <w:lastRenderedPageBreak/>
         <w:drawing>
-          <wp:inline distT="0" distB="0" distL="0" distR="0" wp14:anchorId="490577AF" wp14:editId="71E7EAFB">
+          <wp:inline distT="0" distB="0" distL="0" distR="0" wp14:anchorId="005C2A10" wp14:editId="5E21DA60">
             <wp:extent cx="5120640" cy="4627581"/>
             <wp:effectExtent l="19050" t="19050" r="22860" b="20955"/>
-            <wp:docPr id="1381991061" name="Imagem 15"/>
+            <wp:docPr id="1776143327" name="Imagem 15"/>
             <wp:cNvGraphicFramePr/>
             <a:graphic xmlns:a="http://schemas.openxmlformats.org/drawingml/2006/main">
               <a:graphicData uri="http://schemas.openxmlformats.org/drawingml/2006/picture">
                 <pic:pic xmlns:pic="http://schemas.openxmlformats.org/drawingml/2006/picture">
                   <pic:nvPicPr>
-                    <pic:cNvPr id="1381991061" name=""/>
+                    <pic:cNvPr id="1776143327" name=""/>
                     <pic:cNvPicPr/>
                   </pic:nvPicPr>
                   <pic:blipFill>
@@ -14852,16 +15012,16 @@
         </w:rPr>
         <w:lastRenderedPageBreak/>
         <w:drawing>
-          <wp:inline distT="0" distB="0" distL="0" distR="0" wp14:anchorId="2E5808C1" wp14:editId="5C11B1F4">
+          <wp:inline distT="0" distB="0" distL="0" distR="0" wp14:anchorId="323AB17E" wp14:editId="7519D26A">
             <wp:extent cx="5120640" cy="4627581"/>
             <wp:effectExtent l="19050" t="19050" r="22860" b="20955"/>
-            <wp:docPr id="221974020" name="Imagem 16"/>
+            <wp:docPr id="1159794744" name="Imagem 16"/>
             <wp:cNvGraphicFramePr/>
             <a:graphic xmlns:a="http://schemas.openxmlformats.org/drawingml/2006/main">
               <a:graphicData uri="http://schemas.openxmlformats.org/drawingml/2006/picture">
                 <pic:pic xmlns:pic="http://schemas.openxmlformats.org/drawingml/2006/picture">
                   <pic:nvPicPr>
-                    <pic:cNvPr id="221974020" name=""/>
+                    <pic:cNvPr id="1159794744" name=""/>
                     <pic:cNvPicPr/>
                   </pic:nvPicPr>
                   <pic:blipFill>
@@ -15025,16 +15185,16 @@
         </w:rPr>
         <w:lastRenderedPageBreak/>
         <w:drawing>
-          <wp:inline distT="0" distB="0" distL="0" distR="0" wp14:anchorId="7C98493E" wp14:editId="54EE41A7">
+          <wp:inline distT="0" distB="0" distL="0" distR="0" wp14:anchorId="5F87361A" wp14:editId="2865D55F">
             <wp:extent cx="5120640" cy="3282818"/>
             <wp:effectExtent l="19050" t="19050" r="22860" b="13335"/>
-            <wp:docPr id="290449014" name="Imagem 17"/>
+            <wp:docPr id="887854894" name="Imagem 17"/>
             <wp:cNvGraphicFramePr/>
             <a:graphic xmlns:a="http://schemas.openxmlformats.org/drawingml/2006/main">
               <a:graphicData uri="http://schemas.openxmlformats.org/drawingml/2006/picture">
                 <pic:pic xmlns:pic="http://schemas.openxmlformats.org/drawingml/2006/picture">
                   <pic:nvPicPr>
-                    <pic:cNvPr id="290449014" name=""/>
+                    <pic:cNvPr id="887854894" name=""/>
                     <pic:cNvPicPr/>
                   </pic:nvPicPr>
                   <pic:blipFill>
@@ -15225,7 +15385,7 @@
           <w:sz w:val="27"/>
         </w:rPr>
       </w:pPr>
-      <w:bookmarkStart w:id="28" w:name="_Toc240366645"/>
+      <w:bookmarkStart w:id="28" w:name="_Toc240373139"/>
       <w:r>
         <w:rPr>
           <w:rFonts w:ascii="Montserrat" w:hAnsi="Montserrat"/>
@@ -15265,16 +15425,16 @@
           <w:noProof/>
         </w:rPr>
         <w:drawing>
-          <wp:inline distT="0" distB="0" distL="0" distR="0" wp14:anchorId="6A360C56" wp14:editId="4CBFF6FA">
+          <wp:inline distT="0" distB="0" distL="0" distR="0" wp14:anchorId="065D06E6" wp14:editId="20362822">
             <wp:extent cx="5120640" cy="4627581"/>
             <wp:effectExtent l="19050" t="19050" r="22860" b="20955"/>
-            <wp:docPr id="2104994576" name="Imagem 18"/>
+            <wp:docPr id="1915625833" name="Imagem 18"/>
             <wp:cNvGraphicFramePr/>
             <a:graphic xmlns:a="http://schemas.openxmlformats.org/drawingml/2006/main">
               <a:graphicData uri="http://schemas.openxmlformats.org/drawingml/2006/picture">
                 <pic:pic xmlns:pic="http://schemas.openxmlformats.org/drawingml/2006/picture">
                   <pic:nvPicPr>
-                    <pic:cNvPr id="2104994576" name=""/>
+                    <pic:cNvPr id="1915625833" name=""/>
                     <pic:cNvPicPr/>
                   </pic:nvPicPr>
                   <pic:blipFill>
@@ -15342,16 +15502,16 @@
         </w:rPr>
         <w:lastRenderedPageBreak/>
         <w:drawing>
-          <wp:inline distT="0" distB="0" distL="0" distR="0" wp14:anchorId="02AE9E12" wp14:editId="2479933C">
+          <wp:inline distT="0" distB="0" distL="0" distR="0" wp14:anchorId="0F93E26B" wp14:editId="7A8B5C1D">
             <wp:extent cx="5120640" cy="4627581"/>
             <wp:effectExtent l="19050" t="19050" r="22860" b="20955"/>
-            <wp:docPr id="268205154" name="Imagem 19"/>
+            <wp:docPr id="1341847693" name="Imagem 19"/>
             <wp:cNvGraphicFramePr/>
             <a:graphic xmlns:a="http://schemas.openxmlformats.org/drawingml/2006/main">
               <a:graphicData uri="http://schemas.openxmlformats.org/drawingml/2006/picture">
                 <pic:pic xmlns:pic="http://schemas.openxmlformats.org/drawingml/2006/picture">
                   <pic:nvPicPr>
-                    <pic:cNvPr id="268205154" name=""/>
+                    <pic:cNvPr id="1341847693" name=""/>
                     <pic:cNvPicPr/>
                   </pic:nvPicPr>
                   <pic:blipFill>
@@ -15534,7 +15694,7 @@
           <w:sz w:val="27"/>
         </w:rPr>
       </w:pPr>
-      <w:bookmarkStart w:id="29" w:name="_Toc240366646"/>
+      <w:bookmarkStart w:id="29" w:name="_Toc240373140"/>
       <w:r>
         <w:rPr>
           <w:rFonts w:ascii="Montserrat" w:hAnsi="Montserrat"/>
@@ -15574,16 +15734,16 @@
           <w:noProof/>
         </w:rPr>
         <w:drawing>
-          <wp:inline distT="0" distB="0" distL="0" distR="0" wp14:anchorId="709862EC" wp14:editId="1B8B0D19">
+          <wp:inline distT="0" distB="0" distL="0" distR="0" wp14:anchorId="04F72E14" wp14:editId="0D176535">
             <wp:extent cx="5120640" cy="4627581"/>
             <wp:effectExtent l="19050" t="19050" r="22860" b="20955"/>
-            <wp:docPr id="1178890216" name="Imagem 20"/>
+            <wp:docPr id="1734403886" name="Imagem 20"/>
             <wp:cNvGraphicFramePr/>
             <a:graphic xmlns:a="http://schemas.openxmlformats.org/drawingml/2006/main">
               <a:graphicData uri="http://schemas.openxmlformats.org/drawingml/2006/picture">
                 <pic:pic xmlns:pic="http://schemas.openxmlformats.org/drawingml/2006/picture">
                   <pic:nvPicPr>
-                    <pic:cNvPr id="1178890216" name=""/>
+                    <pic:cNvPr id="1734403886" name=""/>
                     <pic:cNvPicPr/>
                   </pic:nvPicPr>
                   <pic:blipFill>
@@ -15651,16 +15811,16 @@
         </w:rPr>
         <w:lastRenderedPageBreak/>
         <w:drawing>
-          <wp:inline distT="0" distB="0" distL="0" distR="0" wp14:anchorId="27A71A7F" wp14:editId="54C93DE5">
+          <wp:inline distT="0" distB="0" distL="0" distR="0" wp14:anchorId="05E035D2" wp14:editId="419A649A">
             <wp:extent cx="5120640" cy="4627581"/>
             <wp:effectExtent l="19050" t="19050" r="22860" b="20955"/>
-            <wp:docPr id="645258450" name="Imagem 21"/>
+            <wp:docPr id="1231222807" name="Imagem 21"/>
             <wp:cNvGraphicFramePr/>
             <a:graphic xmlns:a="http://schemas.openxmlformats.org/drawingml/2006/main">
               <a:graphicData uri="http://schemas.openxmlformats.org/drawingml/2006/picture">
                 <pic:pic xmlns:pic="http://schemas.openxmlformats.org/drawingml/2006/picture">
                   <pic:nvPicPr>
-                    <pic:cNvPr id="645258450" name=""/>
+                    <pic:cNvPr id="1231222807" name=""/>
                     <pic:cNvPicPr/>
                   </pic:nvPicPr>
                   <pic:blipFill>
@@ -15866,16 +16026,16 @@
           <w:noProof/>
         </w:rPr>
         <w:drawing>
-          <wp:inline distT="0" distB="0" distL="0" distR="0" wp14:anchorId="57DBE5E3" wp14:editId="0FFA7831">
+          <wp:inline distT="0" distB="0" distL="0" distR="0" wp14:anchorId="0797A610" wp14:editId="2120B029">
             <wp:extent cx="5120640" cy="1757287"/>
             <wp:effectExtent l="19050" t="19050" r="22860" b="14605"/>
-            <wp:docPr id="708953558" name="Imagem 22"/>
+            <wp:docPr id="1586617701" name="Imagem 22"/>
             <wp:cNvGraphicFramePr/>
             <a:graphic xmlns:a="http://schemas.openxmlformats.org/drawingml/2006/main">
               <a:graphicData uri="http://schemas.openxmlformats.org/drawingml/2006/picture">
                 <pic:pic xmlns:pic="http://schemas.openxmlformats.org/drawingml/2006/picture">
                   <pic:nvPicPr>
-                    <pic:cNvPr id="708953558" name=""/>
+                    <pic:cNvPr id="1586617701" name=""/>
                     <pic:cNvPicPr/>
                   </pic:nvPicPr>
                   <pic:blipFill>
@@ -15988,7 +16148,7 @@
           <w:sz w:val="27"/>
         </w:rPr>
       </w:pPr>
-      <w:bookmarkStart w:id="30" w:name="_Toc240366647"/>
+      <w:bookmarkStart w:id="30" w:name="_Toc240373141"/>
       <w:r>
         <w:rPr>
           <w:rFonts w:ascii="Montserrat" w:hAnsi="Montserrat"/>
@@ -16029,16 +16189,16 @@
         </w:rPr>
         <w:lastRenderedPageBreak/>
         <w:drawing>
-          <wp:inline distT="0" distB="0" distL="0" distR="0" wp14:anchorId="031E9FDE" wp14:editId="4AA04CC5">
+          <wp:inline distT="0" distB="0" distL="0" distR="0" wp14:anchorId="543D8717" wp14:editId="698F9DD5">
             <wp:extent cx="5120640" cy="4627581"/>
             <wp:effectExtent l="19050" t="19050" r="22860" b="20955"/>
-            <wp:docPr id="1273054512" name="Imagem 23"/>
+            <wp:docPr id="1031449501" name="Imagem 23"/>
             <wp:cNvGraphicFramePr/>
             <a:graphic xmlns:a="http://schemas.openxmlformats.org/drawingml/2006/main">
               <a:graphicData uri="http://schemas.openxmlformats.org/drawingml/2006/picture">
                 <pic:pic xmlns:pic="http://schemas.openxmlformats.org/drawingml/2006/picture">
                   <pic:nvPicPr>
-                    <pic:cNvPr id="1273054512" name=""/>
+                    <pic:cNvPr id="1031449501" name=""/>
                     <pic:cNvPicPr/>
                   </pic:nvPicPr>
                   <pic:blipFill>
@@ -16106,16 +16266,16 @@
         </w:rPr>
         <w:lastRenderedPageBreak/>
         <w:drawing>
-          <wp:inline distT="0" distB="0" distL="0" distR="0" wp14:anchorId="1E6BC13E" wp14:editId="3C7F6C65">
+          <wp:inline distT="0" distB="0" distL="0" distR="0" wp14:anchorId="7442DE28" wp14:editId="6B50FD9F">
             <wp:extent cx="5120640" cy="4627581"/>
             <wp:effectExtent l="19050" t="19050" r="22860" b="20955"/>
-            <wp:docPr id="1182487551" name="Imagem 24"/>
+            <wp:docPr id="591585184" name="Imagem 24"/>
             <wp:cNvGraphicFramePr/>
             <a:graphic xmlns:a="http://schemas.openxmlformats.org/drawingml/2006/main">
               <a:graphicData uri="http://schemas.openxmlformats.org/drawingml/2006/picture">
                 <pic:pic xmlns:pic="http://schemas.openxmlformats.org/drawingml/2006/picture">
                   <pic:nvPicPr>
-                    <pic:cNvPr id="1182487551" name=""/>
+                    <pic:cNvPr id="591585184" name=""/>
                     <pic:cNvPicPr/>
                   </pic:nvPicPr>
                   <pic:blipFill>
@@ -16352,7 +16512,7 @@
           <w:sz w:val="27"/>
         </w:rPr>
       </w:pPr>
-      <w:bookmarkStart w:id="31" w:name="_Toc240366648"/>
+      <w:bookmarkStart w:id="31" w:name="_Toc240373142"/>
       <w:r>
         <w:rPr>
           <w:rFonts w:ascii="Montserrat" w:hAnsi="Montserrat"/>
@@ -16392,16 +16552,16 @@
           <w:noProof/>
         </w:rPr>
         <w:drawing>
-          <wp:inline distT="0" distB="0" distL="0" distR="0" wp14:anchorId="2B8D5256" wp14:editId="30D7637B">
+          <wp:inline distT="0" distB="0" distL="0" distR="0" wp14:anchorId="409C66D3" wp14:editId="1A0A98C8">
             <wp:extent cx="5120640" cy="4627581"/>
             <wp:effectExtent l="19050" t="19050" r="22860" b="20955"/>
-            <wp:docPr id="1198634412" name="Imagem 25"/>
+            <wp:docPr id="76374980" name="Imagem 25"/>
             <wp:cNvGraphicFramePr/>
             <a:graphic xmlns:a="http://schemas.openxmlformats.org/drawingml/2006/main">
               <a:graphicData uri="http://schemas.openxmlformats.org/drawingml/2006/picture">
                 <pic:pic xmlns:pic="http://schemas.openxmlformats.org/drawingml/2006/picture">
                   <pic:nvPicPr>
-                    <pic:cNvPr id="1198634412" name=""/>
+                    <pic:cNvPr id="76374980" name=""/>
                     <pic:cNvPicPr/>
                   </pic:nvPicPr>
                   <pic:blipFill>
@@ -16469,16 +16629,16 @@
         </w:rPr>
         <w:lastRenderedPageBreak/>
         <w:drawing>
-          <wp:inline distT="0" distB="0" distL="0" distR="0" wp14:anchorId="363DB1B5" wp14:editId="3DFD5F1E">
+          <wp:inline distT="0" distB="0" distL="0" distR="0" wp14:anchorId="62432855" wp14:editId="31A47FAB">
             <wp:extent cx="5120640" cy="4627581"/>
             <wp:effectExtent l="19050" t="19050" r="22860" b="20955"/>
-            <wp:docPr id="1920666420" name="Imagem 26"/>
+            <wp:docPr id="794863372" name="Imagem 26"/>
             <wp:cNvGraphicFramePr/>
             <a:graphic xmlns:a="http://schemas.openxmlformats.org/drawingml/2006/main">
               <a:graphicData uri="http://schemas.openxmlformats.org/drawingml/2006/picture">
                 <pic:pic xmlns:pic="http://schemas.openxmlformats.org/drawingml/2006/picture">
                   <pic:nvPicPr>
-                    <pic:cNvPr id="1920666420" name=""/>
+                    <pic:cNvPr id="794863372" name=""/>
                     <pic:cNvPicPr/>
                   </pic:nvPicPr>
                   <pic:blipFill>
@@ -16669,7 +16829,7 @@
           <w:sz w:val="27"/>
         </w:rPr>
       </w:pPr>
-      <w:bookmarkStart w:id="32" w:name="_Toc240366649"/>
+      <w:bookmarkStart w:id="32" w:name="_Toc240373143"/>
       <w:r>
         <w:rPr>
           <w:rFonts w:ascii="Montserrat" w:hAnsi="Montserrat"/>
@@ -16709,16 +16869,16 @@
           <w:noProof/>
         </w:rPr>
         <w:drawing>
-          <wp:inline distT="0" distB="0" distL="0" distR="0" wp14:anchorId="1728EF49" wp14:editId="542CC56D">
+          <wp:inline distT="0" distB="0" distL="0" distR="0" wp14:anchorId="4CBEC268" wp14:editId="76259F2F">
             <wp:extent cx="5120640" cy="4000682"/>
             <wp:effectExtent l="19050" t="19050" r="22860" b="19050"/>
-            <wp:docPr id="99915525" name="Imagem 27"/>
+            <wp:docPr id="1123553967" name="Imagem 27"/>
             <wp:cNvGraphicFramePr/>
             <a:graphic xmlns:a="http://schemas.openxmlformats.org/drawingml/2006/main">
               <a:graphicData uri="http://schemas.openxmlformats.org/drawingml/2006/picture">
                 <pic:pic xmlns:pic="http://schemas.openxmlformats.org/drawingml/2006/picture">
                   <pic:nvPicPr>
-                    <pic:cNvPr id="99915525" name=""/>
+                    <pic:cNvPr id="1123553967" name=""/>
                     <pic:cNvPicPr/>
                   </pic:nvPicPr>
                   <pic:blipFill>
@@ -17242,7 +17402,7 @@
           <w:sz w:val="34"/>
         </w:rPr>
       </w:pPr>
-      <w:bookmarkStart w:id="33" w:name="_Toc240366650"/>
+      <w:bookmarkStart w:id="33" w:name="_Toc240373144"/>
       <w:r>
         <w:rPr>
           <w:rFonts w:ascii="Montserrat" w:hAnsi="Montserrat"/>
@@ -17284,7 +17444,7 @@
           <w:sz w:val="27"/>
         </w:rPr>
       </w:pPr>
-      <w:bookmarkStart w:id="34" w:name="_Toc240366651"/>
+      <w:bookmarkStart w:id="34" w:name="_Toc240373145"/>
       <w:r>
         <w:rPr>
           <w:rFonts w:ascii="Montserrat" w:hAnsi="Montserrat"/>
@@ -17324,16 +17484,16 @@
           <w:noProof/>
         </w:rPr>
         <w:drawing>
-          <wp:inline distT="0" distB="0" distL="0" distR="0" wp14:anchorId="6D4BDCD8" wp14:editId="68C62334">
+          <wp:inline distT="0" distB="0" distL="0" distR="0" wp14:anchorId="4AE8DA83" wp14:editId="03582616">
             <wp:extent cx="5120640" cy="4627581"/>
             <wp:effectExtent l="19050" t="19050" r="22860" b="20955"/>
-            <wp:docPr id="579177752" name="Imagem 28"/>
+            <wp:docPr id="167700109" name="Imagem 28"/>
             <wp:cNvGraphicFramePr/>
             <a:graphic xmlns:a="http://schemas.openxmlformats.org/drawingml/2006/main">
               <a:graphicData uri="http://schemas.openxmlformats.org/drawingml/2006/picture">
                 <pic:pic xmlns:pic="http://schemas.openxmlformats.org/drawingml/2006/picture">
                   <pic:nvPicPr>
-                    <pic:cNvPr id="579177752" name=""/>
+                    <pic:cNvPr id="167700109" name=""/>
                     <pic:cNvPicPr/>
                   </pic:nvPicPr>
                   <pic:blipFill>
@@ -17401,16 +17561,16 @@
         </w:rPr>
         <w:lastRenderedPageBreak/>
         <w:drawing>
-          <wp:inline distT="0" distB="0" distL="0" distR="0" wp14:anchorId="4D30DE4B" wp14:editId="5CF50047">
+          <wp:inline distT="0" distB="0" distL="0" distR="0" wp14:anchorId="4BC4E48E" wp14:editId="11C62A3C">
             <wp:extent cx="5120640" cy="4627581"/>
             <wp:effectExtent l="19050" t="19050" r="22860" b="20955"/>
-            <wp:docPr id="1670435438" name="Imagem 29"/>
+            <wp:docPr id="1290892" name="Imagem 29"/>
             <wp:cNvGraphicFramePr/>
             <a:graphic xmlns:a="http://schemas.openxmlformats.org/drawingml/2006/main">
               <a:graphicData uri="http://schemas.openxmlformats.org/drawingml/2006/picture">
                 <pic:pic xmlns:pic="http://schemas.openxmlformats.org/drawingml/2006/picture">
                   <pic:nvPicPr>
-                    <pic:cNvPr id="1670435438" name=""/>
+                    <pic:cNvPr id="1290892" name=""/>
                     <pic:cNvPicPr/>
                   </pic:nvPicPr>
                   <pic:blipFill>
@@ -17478,16 +17638,16 @@
         </w:rPr>
         <w:lastRenderedPageBreak/>
         <w:drawing>
-          <wp:inline distT="0" distB="0" distL="0" distR="0" wp14:anchorId="53647D03" wp14:editId="35E4D34D">
+          <wp:inline distT="0" distB="0" distL="0" distR="0" wp14:anchorId="391F5344" wp14:editId="29689928">
             <wp:extent cx="5120640" cy="4627581"/>
             <wp:effectExtent l="19050" t="19050" r="22860" b="20955"/>
-            <wp:docPr id="1692712046" name="Imagem 30"/>
+            <wp:docPr id="1891783687" name="Imagem 30"/>
             <wp:cNvGraphicFramePr/>
             <a:graphic xmlns:a="http://schemas.openxmlformats.org/drawingml/2006/main">
               <a:graphicData uri="http://schemas.openxmlformats.org/drawingml/2006/picture">
                 <pic:pic xmlns:pic="http://schemas.openxmlformats.org/drawingml/2006/picture">
                   <pic:nvPicPr>
-                    <pic:cNvPr id="1692712046" name=""/>
+                    <pic:cNvPr id="1891783687" name=""/>
                     <pic:cNvPicPr/>
                   </pic:nvPicPr>
                   <pic:blipFill>
@@ -17689,16 +17849,16 @@
           <w:noProof/>
         </w:rPr>
         <w:drawing>
-          <wp:inline distT="0" distB="0" distL="0" distR="0" wp14:anchorId="0B3FC97C" wp14:editId="16BAA7D3">
+          <wp:inline distT="0" distB="0" distL="0" distR="0" wp14:anchorId="4C92F358" wp14:editId="582DCFE8">
             <wp:extent cx="5120640" cy="1715571"/>
             <wp:effectExtent l="19050" t="19050" r="22860" b="18415"/>
-            <wp:docPr id="2050638577" name="Imagem 31"/>
+            <wp:docPr id="1048546967" name="Imagem 31"/>
             <wp:cNvGraphicFramePr/>
             <a:graphic xmlns:a="http://schemas.openxmlformats.org/drawingml/2006/main">
               <a:graphicData uri="http://schemas.openxmlformats.org/drawingml/2006/picture">
                 <pic:pic xmlns:pic="http://schemas.openxmlformats.org/drawingml/2006/picture">
                   <pic:nvPicPr>
-                    <pic:cNvPr id="2050638577" name=""/>
+                    <pic:cNvPr id="1048546967" name=""/>
                     <pic:cNvPicPr/>
                   </pic:nvPicPr>
                   <pic:blipFill>
@@ -17835,16 +17995,16 @@
           <w:noProof/>
         </w:rPr>
         <w:drawing>
-          <wp:inline distT="0" distB="0" distL="0" distR="0" wp14:anchorId="7ABE0D3C" wp14:editId="3AF9AA15">
+          <wp:inline distT="0" distB="0" distL="0" distR="0" wp14:anchorId="352719D8" wp14:editId="572A051B">
             <wp:extent cx="5120640" cy="3282818"/>
             <wp:effectExtent l="19050" t="19050" r="22860" b="13335"/>
-            <wp:docPr id="585964601" name="Imagem 32"/>
+            <wp:docPr id="201176260" name="Imagem 32"/>
             <wp:cNvGraphicFramePr/>
             <a:graphic xmlns:a="http://schemas.openxmlformats.org/drawingml/2006/main">
               <a:graphicData uri="http://schemas.openxmlformats.org/drawingml/2006/picture">
                 <pic:pic xmlns:pic="http://schemas.openxmlformats.org/drawingml/2006/picture">
                   <pic:nvPicPr>
-                    <pic:cNvPr id="585964601" name=""/>
+                    <pic:cNvPr id="201176260" name=""/>
                     <pic:cNvPicPr/>
                   </pic:nvPicPr>
                   <pic:blipFill>
@@ -17978,16 +18138,16 @@
           <w:noProof/>
         </w:rPr>
         <w:drawing>
-          <wp:inline distT="0" distB="0" distL="0" distR="0" wp14:anchorId="21A7A82B" wp14:editId="476A2020">
+          <wp:inline distT="0" distB="0" distL="0" distR="0" wp14:anchorId="6D7E6598" wp14:editId="5E8CE476">
             <wp:extent cx="5120640" cy="951357"/>
             <wp:effectExtent l="19050" t="19050" r="22860" b="20320"/>
-            <wp:docPr id="831033800" name="Imagem 33"/>
+            <wp:docPr id="980601981" name="Imagem 33"/>
             <wp:cNvGraphicFramePr/>
             <a:graphic xmlns:a="http://schemas.openxmlformats.org/drawingml/2006/main">
               <a:graphicData uri="http://schemas.openxmlformats.org/drawingml/2006/picture">
                 <pic:pic xmlns:pic="http://schemas.openxmlformats.org/drawingml/2006/picture">
                   <pic:nvPicPr>
-                    <pic:cNvPr id="831033800" name=""/>
+                    <pic:cNvPr id="980601981" name=""/>
                     <pic:cNvPicPr/>
                   </pic:nvPicPr>
                   <pic:blipFill>
@@ -18099,16 +18259,16 @@
           <w:noProof/>
         </w:rPr>
         <w:drawing>
-          <wp:inline distT="0" distB="0" distL="0" distR="0" wp14:anchorId="47A119F5" wp14:editId="10832772">
+          <wp:inline distT="0" distB="0" distL="0" distR="0" wp14:anchorId="5C95E9FB" wp14:editId="0DF93184">
             <wp:extent cx="5120640" cy="1515102"/>
             <wp:effectExtent l="19050" t="19050" r="22860" b="28575"/>
-            <wp:docPr id="1223736218" name="Imagem 34"/>
+            <wp:docPr id="499485104" name="Imagem 34"/>
             <wp:cNvGraphicFramePr/>
             <a:graphic xmlns:a="http://schemas.openxmlformats.org/drawingml/2006/main">
               <a:graphicData uri="http://schemas.openxmlformats.org/drawingml/2006/picture">
                 <pic:pic xmlns:pic="http://schemas.openxmlformats.org/drawingml/2006/picture">
                   <pic:nvPicPr>
-                    <pic:cNvPr id="1223736218" name=""/>
+                    <pic:cNvPr id="499485104" name=""/>
                     <pic:cNvPicPr/>
                   </pic:nvPicPr>
                   <pic:blipFill>
@@ -18221,16 +18381,16 @@
           <w:noProof/>
         </w:rPr>
         <w:drawing>
-          <wp:inline distT="0" distB="0" distL="0" distR="0" wp14:anchorId="5B974105" wp14:editId="44EE3445">
+          <wp:inline distT="0" distB="0" distL="0" distR="0" wp14:anchorId="105E2149" wp14:editId="29A73296">
             <wp:extent cx="5120640" cy="1391113"/>
             <wp:effectExtent l="19050" t="19050" r="22860" b="19050"/>
-            <wp:docPr id="683249748" name="Imagem 35"/>
+            <wp:docPr id="934334358" name="Imagem 35"/>
             <wp:cNvGraphicFramePr/>
             <a:graphic xmlns:a="http://schemas.openxmlformats.org/drawingml/2006/main">
               <a:graphicData uri="http://schemas.openxmlformats.org/drawingml/2006/picture">
                 <pic:pic xmlns:pic="http://schemas.openxmlformats.org/drawingml/2006/picture">
                   <pic:nvPicPr>
-                    <pic:cNvPr id="683249748" name=""/>
+                    <pic:cNvPr id="934334358" name=""/>
                     <pic:cNvPicPr/>
                   </pic:nvPicPr>
                   <pic:blipFill>
@@ -18342,16 +18502,16 @@
           <w:noProof/>
         </w:rPr>
         <w:drawing>
-          <wp:inline distT="0" distB="0" distL="0" distR="0" wp14:anchorId="02A13E80" wp14:editId="02FC8011">
+          <wp:inline distT="0" distB="0" distL="0" distR="0" wp14:anchorId="58FDDD2F" wp14:editId="126BB7D4">
             <wp:extent cx="5120640" cy="1125174"/>
             <wp:effectExtent l="19050" t="19050" r="22860" b="18415"/>
-            <wp:docPr id="994002346" name="Imagem 36"/>
+            <wp:docPr id="2092159990" name="Imagem 36"/>
             <wp:cNvGraphicFramePr/>
             <a:graphic xmlns:a="http://schemas.openxmlformats.org/drawingml/2006/main">
               <a:graphicData uri="http://schemas.openxmlformats.org/drawingml/2006/picture">
                 <pic:pic xmlns:pic="http://schemas.openxmlformats.org/drawingml/2006/picture">
                   <pic:nvPicPr>
-                    <pic:cNvPr id="994002346" name=""/>
+                    <pic:cNvPr id="2092159990" name=""/>
                     <pic:cNvPicPr/>
                   </pic:nvPicPr>
                   <pic:blipFill>
@@ -18441,7 +18601,7 @@
           <w:sz w:val="27"/>
         </w:rPr>
       </w:pPr>
-      <w:bookmarkStart w:id="35" w:name="_Toc240366652"/>
+      <w:bookmarkStart w:id="35" w:name="_Toc240373146"/>
       <w:r>
         <w:rPr>
           <w:rFonts w:ascii="Montserrat" w:hAnsi="Montserrat"/>
@@ -18481,16 +18641,16 @@
           <w:noProof/>
         </w:rPr>
         <w:drawing>
-          <wp:inline distT="0" distB="0" distL="0" distR="0" wp14:anchorId="36607A18" wp14:editId="27BC1945">
+          <wp:inline distT="0" distB="0" distL="0" distR="0" wp14:anchorId="622BB44E" wp14:editId="6A7DAC26">
             <wp:extent cx="5120640" cy="4627581"/>
             <wp:effectExtent l="19050" t="19050" r="22860" b="20955"/>
-            <wp:docPr id="934626191" name="Imagem 37"/>
+            <wp:docPr id="992350636" name="Imagem 37"/>
             <wp:cNvGraphicFramePr/>
             <a:graphic xmlns:a="http://schemas.openxmlformats.org/drawingml/2006/main">
               <a:graphicData uri="http://schemas.openxmlformats.org/drawingml/2006/picture">
                 <pic:pic xmlns:pic="http://schemas.openxmlformats.org/drawingml/2006/picture">
                   <pic:nvPicPr>
-                    <pic:cNvPr id="934626191" name=""/>
+                    <pic:cNvPr id="992350636" name=""/>
                     <pic:cNvPicPr/>
                   </pic:nvPicPr>
                   <pic:blipFill>
@@ -18558,16 +18718,16 @@
         </w:rPr>
         <w:lastRenderedPageBreak/>
         <w:drawing>
-          <wp:inline distT="0" distB="0" distL="0" distR="0" wp14:anchorId="65A424D5" wp14:editId="3E213829">
+          <wp:inline distT="0" distB="0" distL="0" distR="0" wp14:anchorId="63BF3B0F" wp14:editId="59CDD365">
             <wp:extent cx="5120640" cy="4627581"/>
             <wp:effectExtent l="19050" t="19050" r="22860" b="20955"/>
-            <wp:docPr id="143220898" name="Imagem 38"/>
+            <wp:docPr id="1906275943" name="Imagem 38"/>
             <wp:cNvGraphicFramePr/>
             <a:graphic xmlns:a="http://schemas.openxmlformats.org/drawingml/2006/main">
               <a:graphicData uri="http://schemas.openxmlformats.org/drawingml/2006/picture">
                 <pic:pic xmlns:pic="http://schemas.openxmlformats.org/drawingml/2006/picture">
                   <pic:nvPicPr>
-                    <pic:cNvPr id="143220898" name=""/>
+                    <pic:cNvPr id="1906275943" name=""/>
                     <pic:cNvPicPr/>
                   </pic:nvPicPr>
                   <pic:blipFill>
@@ -18736,16 +18896,16 @@
           <w:noProof/>
         </w:rPr>
         <w:drawing>
-          <wp:inline distT="0" distB="0" distL="0" distR="0" wp14:anchorId="2FC19CEC" wp14:editId="7A543B9F">
+          <wp:inline distT="0" distB="0" distL="0" distR="0" wp14:anchorId="46F7E0FF" wp14:editId="73535047">
             <wp:extent cx="5120640" cy="2144319"/>
             <wp:effectExtent l="19050" t="19050" r="22860" b="27940"/>
-            <wp:docPr id="1481970799" name="Imagem 39"/>
+            <wp:docPr id="361138060" name="Imagem 39"/>
             <wp:cNvGraphicFramePr/>
             <a:graphic xmlns:a="http://schemas.openxmlformats.org/drawingml/2006/main">
               <a:graphicData uri="http://schemas.openxmlformats.org/drawingml/2006/picture">
                 <pic:pic xmlns:pic="http://schemas.openxmlformats.org/drawingml/2006/picture">
                   <pic:nvPicPr>
-                    <pic:cNvPr id="1481970799" name=""/>
+                    <pic:cNvPr id="361138060" name=""/>
                     <pic:cNvPicPr/>
                   </pic:nvPicPr>
                   <pic:blipFill>
@@ -18833,16 +18993,16 @@
           <w:noProof/>
         </w:rPr>
         <w:drawing>
-          <wp:inline distT="0" distB="0" distL="0" distR="0" wp14:anchorId="4663B4BC" wp14:editId="776DD6CB">
+          <wp:inline distT="0" distB="0" distL="0" distR="0" wp14:anchorId="797FF2C8" wp14:editId="18C48C9E">
             <wp:extent cx="5120640" cy="1055647"/>
             <wp:effectExtent l="19050" t="19050" r="22860" b="11430"/>
-            <wp:docPr id="914570192" name="Imagem 40"/>
+            <wp:docPr id="410783800" name="Imagem 40"/>
             <wp:cNvGraphicFramePr/>
             <a:graphic xmlns:a="http://schemas.openxmlformats.org/drawingml/2006/main">
               <a:graphicData uri="http://schemas.openxmlformats.org/drawingml/2006/picture">
                 <pic:pic xmlns:pic="http://schemas.openxmlformats.org/drawingml/2006/picture">
                   <pic:nvPicPr>
-                    <pic:cNvPr id="914570192" name=""/>
+                    <pic:cNvPr id="410783800" name=""/>
                     <pic:cNvPicPr/>
                   </pic:nvPicPr>
                   <pic:blipFill>
@@ -18964,16 +19124,16 @@
           <w:noProof/>
         </w:rPr>
         <w:drawing>
-          <wp:inline distT="0" distB="0" distL="0" distR="0" wp14:anchorId="47D3810B" wp14:editId="2F29D3A7">
+          <wp:inline distT="0" distB="0" distL="0" distR="0" wp14:anchorId="459811E9" wp14:editId="5099A218">
             <wp:extent cx="5120640" cy="3282818"/>
             <wp:effectExtent l="19050" t="19050" r="22860" b="13335"/>
-            <wp:docPr id="1477121327" name="Imagem 41"/>
+            <wp:docPr id="478582745" name="Imagem 41"/>
             <wp:cNvGraphicFramePr/>
             <a:graphic xmlns:a="http://schemas.openxmlformats.org/drawingml/2006/main">
               <a:graphicData uri="http://schemas.openxmlformats.org/drawingml/2006/picture">
                 <pic:pic xmlns:pic="http://schemas.openxmlformats.org/drawingml/2006/picture">
                   <pic:nvPicPr>
-                    <pic:cNvPr id="1477121327" name=""/>
+                    <pic:cNvPr id="478582745" name=""/>
                     <pic:cNvPicPr/>
                   </pic:nvPicPr>
                   <pic:blipFill>
@@ -19107,16 +19267,16 @@
         </w:rPr>
         <w:lastRenderedPageBreak/>
         <w:drawing>
-          <wp:inline distT="0" distB="0" distL="0" distR="0" wp14:anchorId="1FE640D8" wp14:editId="3A0386C0">
+          <wp:inline distT="0" distB="0" distL="0" distR="0" wp14:anchorId="4A4DDC54" wp14:editId="5D672BC5">
             <wp:extent cx="5120640" cy="1978034"/>
             <wp:effectExtent l="19050" t="19050" r="22860" b="22225"/>
-            <wp:docPr id="53129119" name="Imagem 42"/>
+            <wp:docPr id="310566213" name="Imagem 42"/>
             <wp:cNvGraphicFramePr/>
             <a:graphic xmlns:a="http://schemas.openxmlformats.org/drawingml/2006/main">
               <a:graphicData uri="http://schemas.openxmlformats.org/drawingml/2006/picture">
                 <pic:pic xmlns:pic="http://schemas.openxmlformats.org/drawingml/2006/picture">
                   <pic:nvPicPr>
-                    <pic:cNvPr id="53129119" name=""/>
+                    <pic:cNvPr id="310566213" name=""/>
                     <pic:cNvPicPr/>
                   </pic:nvPicPr>
                   <pic:blipFill>
@@ -19188,7 +19348,7 @@
           <w:sz w:val="34"/>
         </w:rPr>
       </w:pPr>
-      <w:bookmarkStart w:id="36" w:name="_Toc240366653"/>
+      <w:bookmarkStart w:id="36" w:name="_Toc240373147"/>
       <w:r>
         <w:rPr>
           <w:rFonts w:ascii="Montserrat" w:hAnsi="Montserrat"/>
@@ -19248,7 +19408,7 @@
           <w:sz w:val="27"/>
         </w:rPr>
       </w:pPr>
-      <w:bookmarkStart w:id="37" w:name="_Toc240366654"/>
+      <w:bookmarkStart w:id="37" w:name="_Toc240373148"/>
       <w:r>
         <w:rPr>
           <w:rFonts w:ascii="Montserrat" w:hAnsi="Montserrat"/>
@@ -19288,16 +19448,16 @@
           <w:noProof/>
         </w:rPr>
         <w:drawing>
-          <wp:inline distT="0" distB="0" distL="0" distR="0" wp14:anchorId="17D2DC82" wp14:editId="66A5DACE">
+          <wp:inline distT="0" distB="0" distL="0" distR="0" wp14:anchorId="05A2131F" wp14:editId="4AF2EACE">
             <wp:extent cx="5303520" cy="4792851"/>
             <wp:effectExtent l="19050" t="19050" r="11430" b="27305"/>
-            <wp:docPr id="656339555" name="Imagem 43"/>
+            <wp:docPr id="424102076" name="Imagem 43"/>
             <wp:cNvGraphicFramePr/>
             <a:graphic xmlns:a="http://schemas.openxmlformats.org/drawingml/2006/main">
               <a:graphicData uri="http://schemas.openxmlformats.org/drawingml/2006/picture">
                 <pic:pic xmlns:pic="http://schemas.openxmlformats.org/drawingml/2006/picture">
                   <pic:nvPicPr>
-                    <pic:cNvPr id="656339555" name=""/>
+                    <pic:cNvPr id="424102076" name=""/>
                     <pic:cNvPicPr/>
                   </pic:nvPicPr>
                   <pic:blipFill>
@@ -19366,7 +19526,7 @@
           <w:sz w:val="27"/>
         </w:rPr>
       </w:pPr>
-      <w:bookmarkStart w:id="38" w:name="_Toc240366655"/>
+      <w:bookmarkStart w:id="38" w:name="_Toc240373149"/>
       <w:r>
         <w:rPr>
           <w:rFonts w:ascii="Montserrat" w:hAnsi="Montserrat"/>
@@ -19406,16 +19566,16 @@
           <w:noProof/>
         </w:rPr>
         <w:drawing>
-          <wp:inline distT="0" distB="0" distL="0" distR="0" wp14:anchorId="24417F3E" wp14:editId="00037A76">
+          <wp:inline distT="0" distB="0" distL="0" distR="0" wp14:anchorId="0E51027D" wp14:editId="2964B1C0">
             <wp:extent cx="5303520" cy="4792851"/>
             <wp:effectExtent l="19050" t="19050" r="11430" b="27305"/>
-            <wp:docPr id="263193155" name="Imagem 44"/>
+            <wp:docPr id="79157620" name="Imagem 44"/>
             <wp:cNvGraphicFramePr/>
             <a:graphic xmlns:a="http://schemas.openxmlformats.org/drawingml/2006/main">
               <a:graphicData uri="http://schemas.openxmlformats.org/drawingml/2006/picture">
                 <pic:pic xmlns:pic="http://schemas.openxmlformats.org/drawingml/2006/picture">
                   <pic:nvPicPr>
-                    <pic:cNvPr id="263193155" name=""/>
+                    <pic:cNvPr id="79157620" name=""/>
                     <pic:cNvPicPr/>
                   </pic:nvPicPr>
                   <pic:blipFill>
@@ -19483,7 +19643,7 @@
           <w:sz w:val="27"/>
         </w:rPr>
       </w:pPr>
-      <w:bookmarkStart w:id="39" w:name="_Toc240366656"/>
+      <w:bookmarkStart w:id="39" w:name="_Toc240373150"/>
       <w:r>
         <w:rPr>
           <w:rFonts w:ascii="Montserrat" w:hAnsi="Montserrat"/>
@@ -19524,16 +19684,16 @@
         </w:rPr>
         <w:lastRenderedPageBreak/>
         <w:drawing>
-          <wp:inline distT="0" distB="0" distL="0" distR="0" wp14:anchorId="3448F739" wp14:editId="0BB527BC">
+          <wp:inline distT="0" distB="0" distL="0" distR="0" wp14:anchorId="3A303B51" wp14:editId="67F12B95">
             <wp:extent cx="5303520" cy="4792851"/>
             <wp:effectExtent l="19050" t="19050" r="11430" b="27305"/>
-            <wp:docPr id="1366218573" name="Imagem 45"/>
+            <wp:docPr id="1810510422" name="Imagem 45"/>
             <wp:cNvGraphicFramePr/>
             <a:graphic xmlns:a="http://schemas.openxmlformats.org/drawingml/2006/main">
               <a:graphicData uri="http://schemas.openxmlformats.org/drawingml/2006/picture">
                 <pic:pic xmlns:pic="http://schemas.openxmlformats.org/drawingml/2006/picture">
                   <pic:nvPicPr>
-                    <pic:cNvPr id="1366218573" name=""/>
+                    <pic:cNvPr id="1810510422" name=""/>
                     <pic:cNvPicPr/>
                   </pic:nvPicPr>
                   <pic:blipFill>
@@ -19601,16 +19761,16 @@
         </w:rPr>
         <w:lastRenderedPageBreak/>
         <w:drawing>
-          <wp:inline distT="0" distB="0" distL="0" distR="0" wp14:anchorId="79236242" wp14:editId="39333AB5">
+          <wp:inline distT="0" distB="0" distL="0" distR="0" wp14:anchorId="6D038E49" wp14:editId="689F7FAC">
             <wp:extent cx="5303520" cy="4792851"/>
             <wp:effectExtent l="19050" t="19050" r="11430" b="27305"/>
-            <wp:docPr id="1242552113" name="Imagem 46"/>
+            <wp:docPr id="1204892252" name="Imagem 46"/>
             <wp:cNvGraphicFramePr/>
             <a:graphic xmlns:a="http://schemas.openxmlformats.org/drawingml/2006/main">
               <a:graphicData uri="http://schemas.openxmlformats.org/drawingml/2006/picture">
                 <pic:pic xmlns:pic="http://schemas.openxmlformats.org/drawingml/2006/picture">
                   <pic:nvPicPr>
-                    <pic:cNvPr id="1242552113" name=""/>
+                    <pic:cNvPr id="1204892252" name=""/>
                     <pic:cNvPicPr/>
                   </pic:nvPicPr>
                   <pic:blipFill>
@@ -19703,7 +19863,7 @@
           <w:sz w:val="34"/>
         </w:rPr>
       </w:pPr>
-      <w:bookmarkStart w:id="40" w:name="_Toc240366657"/>
+      <w:bookmarkStart w:id="40" w:name="_Toc240373151"/>
       <w:r>
         <w:rPr>
           <w:rFonts w:ascii="Montserrat" w:hAnsi="Montserrat"/>
@@ -19731,7 +19891,7 @@
           <w:color w:val="1A1A1A"/>
           <w:sz w:val="22"/>
         </w:rPr>
-        <w:t>Tres paginas independentes, listadas no menu lateral em Gestao: a Administracao (gerencia usuarios, equipes e configuracoes, sempre restrita a Admin - secao 2.3), o Painel Executivo (visao consolidada e agregada de todo o sistema, com acesso configuravel por papel - secao 6.3) e o Relatorio de Resultados (indicadores estrategicos e plano de acao para a reuniao mensal de resultados, tambem com acesso configuravel por papel - secoes 6.3 e 6.7).</w:t>
+        <w:t>Quatro paginas independentes, listadas no menu lateral em Gestao: a Administracao (gerencia usuarios, equipes e configuracoes, sempre restrita a Admin - secao 2.3), o Painel Executivo (visao consolidada e agregada de todo o sistema, com acesso configuravel por papel - secao 6.3), o Painel de Prazos (cronograma dos projetos em andamento com avisos automaticos de prazo, tambem com acesso configuravel por papel - secoes 6.3 e 6.4.2) e o Relatorio de Resultados (indicadores estrategicos e plano de acao para a reuniao mensal de resultados, tambem com acesso configuravel por papel - secoes 6.3 e 6.7).</w:t>
       </w:r>
     </w:p>
     <w:p>
@@ -19745,7 +19905,7 @@
           <w:sz w:val="27"/>
         </w:rPr>
       </w:pPr>
-      <w:bookmarkStart w:id="41" w:name="_Toc240366658"/>
+      <w:bookmarkStart w:id="41" w:name="_Toc240373152"/>
       <w:r>
         <w:rPr>
           <w:rFonts w:ascii="Montserrat" w:hAnsi="Montserrat"/>
@@ -19785,16 +19945,16 @@
           <w:noProof/>
         </w:rPr>
         <w:drawing>
-          <wp:inline distT="0" distB="0" distL="0" distR="0" wp14:anchorId="36F8A75A" wp14:editId="532B6837">
+          <wp:inline distT="0" distB="0" distL="0" distR="0" wp14:anchorId="16AB8FD5" wp14:editId="779A51B1">
             <wp:extent cx="5303520" cy="4792851"/>
             <wp:effectExtent l="19050" t="19050" r="11430" b="27305"/>
-            <wp:docPr id="1130727966" name="Imagem 47"/>
+            <wp:docPr id="527168072" name="Imagem 47"/>
             <wp:cNvGraphicFramePr/>
             <a:graphic xmlns:a="http://schemas.openxmlformats.org/drawingml/2006/main">
               <a:graphicData uri="http://schemas.openxmlformats.org/drawingml/2006/picture">
                 <pic:pic xmlns:pic="http://schemas.openxmlformats.org/drawingml/2006/picture">
                   <pic:nvPicPr>
-                    <pic:cNvPr id="1130727966" name=""/>
+                    <pic:cNvPr id="527168072" name=""/>
                     <pic:cNvPicPr/>
                   </pic:nvPicPr>
                   <pic:blipFill>
@@ -19848,6 +20008,7 @@
           <w:color w:val="6A6A70"/>
           <w:sz w:val="19"/>
         </w:rPr>
+        <w:lastRenderedPageBreak/>
         <w:t>Aba Usuarios: nome, telefone, papel atual e seletor de alteracao de papel por usuario.</w:t>
       </w:r>
     </w:p>
@@ -19866,7 +20027,6 @@
           <w:color w:val="1A1A1A"/>
           <w:sz w:val="22"/>
         </w:rPr>
-        <w:lastRenderedPageBreak/>
         <w:t>No topo da lista, o Admin pode pre-cadastrar uma pessoa que ainda nao fez login, preenchendo nome, telefone (opcional), e-mail e papel e clicando em + Adicionar usuario. Enquanto a pessoa nao faz o primeiro login, ela aparece na lista com o selo Pendente - 1o login, e o Admin ainda pode ajustar telefone e papel ou remover o pre-cadastro pelo botao Remover.</w:t>
       </w:r>
     </w:p>
@@ -19987,28 +20147,37 @@
           <w:color w:val="6A6A70"/>
           <w:sz w:val="21"/>
         </w:rPr>
-        <w:t>Remover aqui apaga so o perfil (papel, nome, telefone) do sistema - nao impede a pessoa de logar de novo depois; se logar, um perfil novo e criado do zero, com o papel padrao Solicitante. Os tres formularios que sao documentos unicos e compartilhados (Plano de Comunicacao, Relatorio de Situacao e Relatorio de Entregas) nao entram na checagem automatica, por nao terem o conceito de quem criou o registro.</w:t>
-      </w:r>
-    </w:p>
-    <w:p>
-      <w:pPr>
-        <w:spacing w:before="160" w:after="200"/>
-        <w:ind w:left="283"/>
+        <w:t xml:space="preserve">Remover aqui apaga so o perfil (papel, nome, telefone) do sistema - nao impede a pessoa de logar de novo depois; se logar, um perfil novo e criado do zero, com o papel padrao Solicitante. Os tres formularios que sao documentos unicos e compartilhados (Plano de Comunicacao, Relatorio de Situacao e Relatorio de </w:t>
+      </w:r>
+      <w:r>
         <w:rPr>
           <w:rFonts w:ascii="Montserrat" w:hAnsi="Montserrat"/>
           <w:i/>
           <w:color w:val="6A6A70"/>
           <w:sz w:val="21"/>
         </w:rPr>
-      </w:pPr>
-      <w:r>
+        <w:lastRenderedPageBreak/>
+        <w:t>Entregas) nao entram na checagem automatica, por nao terem o conceito de quem criou o registro.</w:t>
+      </w:r>
+    </w:p>
+    <w:p>
+      <w:pPr>
+        <w:spacing w:before="160" w:after="200"/>
+        <w:ind w:left="283"/>
         <w:rPr>
           <w:rFonts w:ascii="Montserrat" w:hAnsi="Montserrat"/>
           <w:i/>
           <w:color w:val="6A6A70"/>
           <w:sz w:val="21"/>
         </w:rPr>
-        <w:lastRenderedPageBreak/>
+      </w:pPr>
+      <w:r>
+        <w:rPr>
+          <w:rFonts w:ascii="Montserrat" w:hAnsi="Montserrat"/>
+          <w:i/>
+          <w:color w:val="6A6A70"/>
+          <w:sz w:val="21"/>
+        </w:rPr>
         <w:t>A propria remocao tambem fica registrada: antes de excluir o perfil, o sistema grava no historico de alteracoes (a mesma tabela usada pelo Ver historico) quem removeu quem, com qual papel a pessoa estava e quando - mesmo que o perfil nao exista mais para abrir o historico depois pela tela.</w:t>
       </w:r>
     </w:p>
@@ -20023,7 +20192,7 @@
           <w:sz w:val="27"/>
         </w:rPr>
       </w:pPr>
-      <w:bookmarkStart w:id="42" w:name="_Toc240366659"/>
+      <w:bookmarkStart w:id="42" w:name="_Toc240373153"/>
       <w:r>
         <w:rPr>
           <w:rFonts w:ascii="Montserrat" w:hAnsi="Montserrat"/>
@@ -20063,16 +20232,16 @@
           <w:noProof/>
         </w:rPr>
         <w:drawing>
-          <wp:inline distT="0" distB="0" distL="0" distR="0" wp14:anchorId="7D8C62C9" wp14:editId="566E1DA2">
+          <wp:inline distT="0" distB="0" distL="0" distR="0" wp14:anchorId="0D7EF630" wp14:editId="69216562">
             <wp:extent cx="5303520" cy="4792851"/>
             <wp:effectExtent l="19050" t="19050" r="11430" b="27305"/>
-            <wp:docPr id="659430355" name="Imagem 48"/>
+            <wp:docPr id="1733128128" name="Imagem 48"/>
             <wp:cNvGraphicFramePr/>
             <a:graphic xmlns:a="http://schemas.openxmlformats.org/drawingml/2006/main">
               <a:graphicData uri="http://schemas.openxmlformats.org/drawingml/2006/picture">
                 <pic:pic xmlns:pic="http://schemas.openxmlformats.org/drawingml/2006/picture">
                   <pic:nvPicPr>
-                    <pic:cNvPr id="659430355" name=""/>
+                    <pic:cNvPr id="1733128128" name=""/>
                     <pic:cNvPicPr/>
                   </pic:nvPicPr>
                   <pic:blipFill>
@@ -20140,7 +20309,7 @@
           <w:sz w:val="27"/>
         </w:rPr>
       </w:pPr>
-      <w:bookmarkStart w:id="43" w:name="_Toc240366660"/>
+      <w:bookmarkStart w:id="43" w:name="_Toc240373154"/>
       <w:r>
         <w:rPr>
           <w:rFonts w:ascii="Montserrat" w:hAnsi="Montserrat"/>
@@ -20148,6 +20317,7 @@
           <w:color w:val="B91D2E"/>
           <w:sz w:val="27"/>
         </w:rPr>
+        <w:lastRenderedPageBreak/>
         <w:t>6.3 Configuracoes</w:t>
       </w:r>
       <w:bookmarkEnd w:id="43"/>
@@ -20179,18 +20349,17 @@
         <w:rPr>
           <w:noProof/>
         </w:rPr>
-        <w:lastRenderedPageBreak/>
         <w:drawing>
-          <wp:inline distT="0" distB="0" distL="0" distR="0" wp14:anchorId="2F749810" wp14:editId="615C1E08">
+          <wp:inline distT="0" distB="0" distL="0" distR="0" wp14:anchorId="5C89C3CE" wp14:editId="3E38C057">
             <wp:extent cx="5303520" cy="4792851"/>
             <wp:effectExtent l="19050" t="19050" r="11430" b="27305"/>
-            <wp:docPr id="179099069" name="Imagem 49"/>
+            <wp:docPr id="1807264839" name="Imagem 49"/>
             <wp:cNvGraphicFramePr/>
             <a:graphic xmlns:a="http://schemas.openxmlformats.org/drawingml/2006/main">
               <a:graphicData uri="http://schemas.openxmlformats.org/drawingml/2006/picture">
                 <pic:pic xmlns:pic="http://schemas.openxmlformats.org/drawingml/2006/picture">
                   <pic:nvPicPr>
-                    <pic:cNvPr id="179099069" name=""/>
+                    <pic:cNvPr id="1807264839" name=""/>
                     <pic:cNvPicPr/>
                   </pic:nvPicPr>
                   <pic:blipFill>
@@ -20262,7 +20431,7 @@
           <w:color w:val="1A1A1A"/>
           <w:sz w:val="22"/>
         </w:rPr>
-        <w:t>Logo abaixo, quatro grupos de caixas de selecao controlam quem pode ver o Painel Executivo, o Relatorio de Resultados, o Relatorio de Situacao de Projetos e o Relatorio de Entregas e Beneficios: o Admin marca um ou mais papeis por pagina, e quem tiver um papel fora da lista marcada ve Acesso restrito ao tentar abrir aquela pagina. Por padrao, o Painel Executivo e o Relatorio de Resultados comecam marcados so para Admin (mesmo comportamento de antes), e os dois relatorios finais comecam com todos os papeis marcados (acesso livre, tambem o comportamento de antes) - a restricao so entra em vigor se o Admin desmarcar algum papel.</w:t>
+        <w:t>Logo abaixo, cinco grupos de caixas de selecao controlam quem pode ver o Painel Executivo, o Painel de Prazos, o Relatorio de Resultados, o Relatorio de Situacao de Projetos e o Relatorio de Entregas e Beneficios: o Admin marca um ou mais papeis por pagina, e quem tiver um papel fora da lista marcada ve Acesso restrito ao tentar abrir aquela pagina. Por padrao, o Painel Executivo, o Painel de Prazos e o Relatorio de Resultados comecam marcados so para Admin (mesmo comportamento de antes), e os dois relatorios finais comecam com todos os papeis marcados (acesso livre, tambem o comportamento de antes) - a restricao so entra em vigor se o Admin desmarcar algum papel.</w:t>
       </w:r>
     </w:p>
     <w:p>
@@ -20280,7 +20449,8 @@
           <w:color w:val="1A1A1A"/>
           <w:sz w:val="22"/>
         </w:rPr>
-        <w:t>Um quinto grupo, Quem pode editar o Plano de Comunicacao de Projeto, controla so a aba Editar dados desse formulario (Passo 10) - diferente dos quatro grupos acima, que controlam a pagina inteira. Comeca marcado apenas para PMO/Admin; qualquer papel fora da lista continua vendo e imprimindo o Painel normalmente, so nao consegue editar.</w:t>
+        <w:lastRenderedPageBreak/>
+        <w:t>Um sexto grupo, Quem pode editar o Plano de Comunicacao de Projeto, controla so a aba Editar dados desse formulario (Passo 10) - diferente dos cinco grupos acima, que controlam a pagina inteira. Comeca marcado apenas para PMO/Admin; qualquer papel fora da lista continua vendo e imprimindo o Painel normalmente, so nao consegue editar.</w:t>
       </w:r>
     </w:p>
     <w:p>
@@ -20301,8 +20471,7 @@
           <w:color w:val="6A6A70"/>
           <w:sz w:val="21"/>
         </w:rPr>
-        <w:lastRenderedPageBreak/>
-        <w:t>O papel Admin sempre tem acesso a essas cinco configuracoes, mesmo que fique desmarcado por engano - isso evita que o proprio Admin perca o acesso e fique sem como reverter a configuracao.</w:t>
+        <w:t>O papel Admin sempre tem acesso a essas seis configuracoes, mesmo que fique desmarcado por engano - isso evita que o proprio Admin perca o acesso e fique sem como reverter a configuracao.</w:t>
       </w:r>
     </w:p>
     <w:p>
@@ -20334,7 +20503,7 @@
           <w:sz w:val="27"/>
         </w:rPr>
       </w:pPr>
-      <w:bookmarkStart w:id="44" w:name="_Toc240366661"/>
+      <w:bookmarkStart w:id="44" w:name="_Toc240373155"/>
       <w:r>
         <w:rPr>
           <w:rFonts w:ascii="Montserrat" w:hAnsi="Montserrat"/>
@@ -20457,7 +20626,16 @@
           <w:color w:val="1A1A1A"/>
           <w:sz w:val="22"/>
         </w:rPr>
-        <w:t>Custos por categoria (portfolio): tabela listando cada categoria de custo (casada pelo nome, o mesmo casamento do Comparativo por categoria do Relatorio de Situacao, secao 4.1) com em quantos projetos do portfolio ela tem estimativa no TAP e em quantos desses o Realizado ultrapassou o Estimado - para achar categorias que estouram o orcamento de forma sistematica, nao so num projeto isolado. So entram projetos com Projeto vinculado, custo estimado no TAP e custo realizado registrado.</w:t>
+        <w:t xml:space="preserve">Custos por categoria (portfolio): tabela listando cada categoria de custo (casada pelo nome, o mesmo casamento do Comparativo por categoria do Relatorio de Situacao, secao 4.1) com em quantos projetos do portfolio ela tem estimativa no TAP e em quantos desses o Realizado ultrapassou o Estimado - para achar categorias que estouram o orcamento de forma </w:t>
+      </w:r>
+      <w:r>
+        <w:rPr>
+          <w:rFonts w:ascii="Montserrat" w:hAnsi="Montserrat"/>
+          <w:color w:val="1A1A1A"/>
+          <w:sz w:val="22"/>
+        </w:rPr>
+        <w:lastRenderedPageBreak/>
+        <w:t>sistematica, nao so num projeto isolado. So entram projetos com Projeto vinculado, custo estimado no TAP e custo realizado registrado.</w:t>
       </w:r>
     </w:p>
     <w:p>
@@ -20481,16 +20659,7 @@
           <w:color w:val="1A1A1A"/>
           <w:sz w:val="22"/>
         </w:rPr>
-        <w:t xml:space="preserve">Entregas da EAP (portfolio): % de entregas (nivel 2) concluidas somando todas as EAPs cadastradas, e em quantos projetos existe pelo menos uma entrega atrasada - mesmo casamento pelo nome com o cronograma do </w:t>
-      </w:r>
-      <w:r>
-        <w:rPr>
-          <w:rFonts w:ascii="Montserrat" w:hAnsi="Montserrat"/>
-          <w:color w:val="1A1A1A"/>
-          <w:sz w:val="22"/>
-        </w:rPr>
-        <w:lastRenderedPageBreak/>
-        <w:t>Planejamento e mesmo calculo automatico ja usado na propria EAP (Passo 5, secao 6.4.1).</w:t>
+        <w:t>Entregas da EAP (portfolio): % de entregas (nivel 2) concluidas somando todas as EAPs cadastradas, e em quantos projetos existe pelo menos uma entrega atrasada - mesmo casamento pelo nome com o cronograma do Planejamento e mesmo calculo automatico ja usado na propria EAP (Passo 5, secao 6.4.1).</w:t>
       </w:r>
     </w:p>
     <w:p>
@@ -20550,8 +20719,18 @@
         </w:numPr>
         <w:spacing w:after="80" w:line="260" w:lineRule="auto"/>
         <w:ind w:left="700"/>
-      </w:pPr>
-      <w:r>
+        <w:rPr>
+          <w:rFonts w:ascii="Montserrat" w:hAnsi="Montserrat"/>
+          <w:color w:val="1A1A1A"/>
+          <w:sz w:val="22"/>
+        </w:rPr>
+      </w:pPr>
+      <w:r>
+        <w:rPr>
+          <w:rFonts w:ascii="Montserrat" w:hAnsi="Montserrat"/>
+          <w:color w:val="1A1A1A"/>
+          <w:sz w:val="22"/>
+        </w:rPr>
         <w:t>Portfolio de projetos: contagem de projetos Aprovados, Encerrados (Concluido/Paralisado/Cancelado, via TEP), Reprovados e em avaliacao no Gate 1, a partir do cadastro compartilhado (secao 2.5).</w:t>
       </w:r>
     </w:p>
@@ -20588,17 +20767,18 @@
         <w:rPr>
           <w:noProof/>
         </w:rPr>
+        <w:lastRenderedPageBreak/>
         <w:drawing>
-          <wp:inline distT="0" distB="0" distL="0" distR="0" wp14:anchorId="41FF018E" wp14:editId="0A3BE726">
+          <wp:inline distT="0" distB="0" distL="0" distR="0" wp14:anchorId="4D23F8D3" wp14:editId="7DBA0530">
             <wp:extent cx="5303520" cy="4267180"/>
             <wp:effectExtent l="19050" t="19050" r="11430" b="19685"/>
-            <wp:docPr id="1825666687" name="Imagem 50"/>
+            <wp:docPr id="808959969" name="Imagem 50"/>
             <wp:cNvGraphicFramePr/>
             <a:graphic xmlns:a="http://schemas.openxmlformats.org/drawingml/2006/main">
               <a:graphicData uri="http://schemas.openxmlformats.org/drawingml/2006/picture">
                 <pic:pic xmlns:pic="http://schemas.openxmlformats.org/drawingml/2006/picture">
                   <pic:nvPicPr>
-                    <pic:cNvPr id="1825666687" name=""/>
+                    <pic:cNvPr id="808959969" name=""/>
                     <pic:cNvPicPr/>
                   </pic:nvPicPr>
                   <pic:blipFill>
@@ -20652,7 +20832,6 @@
           <w:color w:val="6A6A70"/>
           <w:sz w:val="19"/>
         </w:rPr>
-        <w:lastRenderedPageBreak/>
         <w:t>Painel Executivo: Gates de aprovacao e indicadores de governanca do Relatorio de Situacao.</w:t>
       </w:r>
     </w:p>
@@ -20665,17 +20844,18 @@
         <w:rPr>
           <w:noProof/>
         </w:rPr>
+        <w:lastRenderedPageBreak/>
         <w:drawing>
-          <wp:inline distT="0" distB="0" distL="0" distR="0" wp14:anchorId="442E50DB" wp14:editId="61ABDF5C">
+          <wp:inline distT="0" distB="0" distL="0" distR="0" wp14:anchorId="01C3D825" wp14:editId="2467BBD5">
             <wp:extent cx="5303520" cy="3382059"/>
             <wp:effectExtent l="19050" t="19050" r="11430" b="27940"/>
-            <wp:docPr id="554076035" name="Imagem 51"/>
+            <wp:docPr id="322404471" name="Imagem 51"/>
             <wp:cNvGraphicFramePr/>
             <a:graphic xmlns:a="http://schemas.openxmlformats.org/drawingml/2006/main">
               <a:graphicData uri="http://schemas.openxmlformats.org/drawingml/2006/picture">
                 <pic:pic xmlns:pic="http://schemas.openxmlformats.org/drawingml/2006/picture">
                   <pic:nvPicPr>
-                    <pic:cNvPr id="554076035" name=""/>
+                    <pic:cNvPr id="322404471" name=""/>
                     <pic:cNvPicPr/>
                   </pic:nvPicPr>
                   <pic:blipFill>
@@ -20743,16 +20923,16 @@
         </w:rPr>
         <w:lastRenderedPageBreak/>
         <w:drawing>
-          <wp:inline distT="0" distB="0" distL="0" distR="0" wp14:anchorId="05445745" wp14:editId="342DFED7">
+          <wp:inline distT="0" distB="0" distL="0" distR="0" wp14:anchorId="07296076" wp14:editId="3F2630D4">
             <wp:extent cx="5303520" cy="4417800"/>
             <wp:effectExtent l="19050" t="19050" r="11430" b="20955"/>
-            <wp:docPr id="1681167202" name="Imagem 52"/>
+            <wp:docPr id="549589073" name="Imagem 52"/>
             <wp:cNvGraphicFramePr/>
             <a:graphic xmlns:a="http://schemas.openxmlformats.org/drawingml/2006/main">
               <a:graphicData uri="http://schemas.openxmlformats.org/drawingml/2006/picture">
                 <pic:pic xmlns:pic="http://schemas.openxmlformats.org/drawingml/2006/picture">
                   <pic:nvPicPr>
-                    <pic:cNvPr id="1681167202" name=""/>
+                    <pic:cNvPr id="549589073" name=""/>
                     <pic:cNvPicPr/>
                   </pic:nvPicPr>
                   <pic:blipFill>
@@ -20862,7 +21042,7 @@
           <w:sz w:val="27"/>
         </w:rPr>
       </w:pPr>
-      <w:bookmarkStart w:id="45" w:name="_Toc240366662"/>
+      <w:bookmarkStart w:id="45" w:name="_Toc240373156"/>
       <w:r>
         <w:rPr>
           <w:rFonts w:ascii="Montserrat" w:hAnsi="Montserrat"/>
@@ -21128,16 +21308,16 @@
         </w:rPr>
         <w:lastRenderedPageBreak/>
         <w:drawing>
-          <wp:inline distT="0" distB="0" distL="0" distR="0" wp14:anchorId="2EE4E046" wp14:editId="62C6056A">
+          <wp:inline distT="0" distB="0" distL="0" distR="0" wp14:anchorId="7EC8E6D9" wp14:editId="6612E7DA">
             <wp:extent cx="5303520" cy="7628836"/>
             <wp:effectExtent l="19050" t="19050" r="11430" b="10795"/>
-            <wp:docPr id="2042800952" name="Imagem 53"/>
+            <wp:docPr id="1858892871" name="Imagem 53"/>
             <wp:cNvGraphicFramePr/>
             <a:graphic xmlns:a="http://schemas.openxmlformats.org/drawingml/2006/main">
               <a:graphicData uri="http://schemas.openxmlformats.org/drawingml/2006/picture">
                 <pic:pic xmlns:pic="http://schemas.openxmlformats.org/drawingml/2006/picture">
                   <pic:nvPicPr>
-                    <pic:cNvPr id="2042800952" name=""/>
+                    <pic:cNvPr id="1858892871" name=""/>
                     <pic:cNvPicPr/>
                   </pic:nvPicPr>
                   <pic:blipFill>
@@ -21269,7 +21449,7 @@
           <w:sz w:val="27"/>
         </w:rPr>
       </w:pPr>
-      <w:bookmarkStart w:id="46" w:name="_Toc240366663"/>
+      <w:bookmarkStart w:id="46" w:name="_Toc240373157"/>
       <w:r>
         <w:rPr>
           <w:rFonts w:ascii="Montserrat" w:hAnsi="Montserrat"/>
@@ -21277,7 +21457,7 @@
           <w:color w:val="B91D2E"/>
           <w:sz w:val="27"/>
         </w:rPr>
-        <w:t>6.5 Ambiente de Treino</w:t>
+        <w:t>6.4.2 Painel de Prazos</w:t>
       </w:r>
       <w:bookmarkEnd w:id="46"/>
     </w:p>
@@ -21296,25 +21476,7 @@
           <w:color w:val="1A1A1A"/>
           <w:sz w:val="22"/>
         </w:rPr>
-        <w:t>O sistema tem um ambiente de treinamento/demonstracao totalmente separado da producao - mesma ferramenta, mesmo schema de dados, mas um banco proprio, populado com 7 projetos ficticios cobrindo o ciclo completo (de uma Solicitacao de Demanda ainda pendente ate um projeto totalmente encerrado com TEP e RLA). Serve para apresentacoes, estudo e capacitacao sem tocar em nenhum dado real. Veja o roteiro Como rodar o Ambiente de Treinamento para o endereco, as contas de acesso e o passo a passo completo.</w:t>
-      </w:r>
-    </w:p>
-    <w:p>
-      <w:pPr>
-        <w:spacing w:line="280" w:lineRule="auto"/>
-        <w:rPr>
-          <w:rFonts w:ascii="Montserrat" w:hAnsi="Montserrat"/>
-          <w:color w:val="1A1A1A"/>
-          <w:sz w:val="22"/>
-        </w:rPr>
-      </w:pPr>
-      <w:r>
-        <w:rPr>
-          <w:rFonts w:ascii="Montserrat" w:hAnsi="Montserrat"/>
-          <w:color w:val="1A1A1A"/>
-          <w:sz w:val="22"/>
-        </w:rPr>
-        <w:t>Quando a Administracao e acessada em producao, aparece uma quarta aba, Ambiente de Treino, com um unico botao: Resetar ambiente de treinamento. Ao clicar (e confirmar o aviso), o sistema apaga todos os projetos e registros de formulario atualmente no ambiente de treinamento e recria os 7 projetos de exemplo do zero - util para deixar o ambiente limpo antes de uma nova turma, sem precisar rodar nenhum comando manualmente.</w:t>
+        <w:t>Pagina pensada para ficar aberta numa TV ou monitor da sala de projetos, atualizando sozinha a cada 2 minutos, com o cronograma (marcos do Planejamento e Desenvolvimento de Projeto, Passo 4) de todos os projetos ainda ativos - projetos ja encerrados via TEP nao entram. Por padrao so o Admin ve esta pagina, mas isso pode ser ampliado para outros papeis em Administracao &gt; Configuracoes (secao 6.3), da mesma forma que o Painel Executivo.</w:t>
       </w:r>
     </w:p>
     <w:p>
@@ -21338,7 +21500,7 @@
           <w:color w:val="1A1A1A"/>
           <w:sz w:val="22"/>
         </w:rPr>
-        <w:t>A aba so aparece quando a Administracao e acessada pelo endereco de producao - quem acessa a Administracao pelo proprio ambiente de treinamento nao ve essa opcao.</w:t>
+        <w:t>Tres indicadores no topo: total de marcos atrasados no portfolio (sem Conclusao real, com o Termino previsto ja vencido), total de marcos vencendo em ate 5 dias, e % de marcos concluidos somando todos os projetos ativos.</w:t>
       </w:r>
     </w:p>
     <w:p>
@@ -21362,32 +21524,7 @@
           <w:color w:val="1A1A1A"/>
           <w:sz w:val="22"/>
         </w:rPr>
-        <w:lastRenderedPageBreak/>
-        <w:t>Nao afeta nenhum dado de producao em nenhuma hipotese - a acao roda numa Edge Function que so tem permissao de escrita no banco do ambiente de treinamento.</w:t>
-      </w:r>
-    </w:p>
-    <w:p>
-      <w:pPr>
-        <w:pStyle w:val="PargrafodaLista"/>
-        <w:numPr>
-          <w:ilvl w:val="0"/>
-          <w:numId w:val="34"/>
-        </w:numPr>
-        <w:spacing w:after="80" w:line="260" w:lineRule="auto"/>
-        <w:ind w:left="700"/>
-        <w:rPr>
-          <w:rFonts w:ascii="Montserrat" w:hAnsi="Montserrat"/>
-          <w:color w:val="1A1A1A"/>
-          <w:sz w:val="22"/>
-        </w:rPr>
-      </w:pPr>
-      <w:r>
-        <w:rPr>
-          <w:rFonts w:ascii="Montserrat" w:hAnsi="Montserrat"/>
-          <w:color w:val="1A1A1A"/>
-          <w:sz w:val="22"/>
-        </w:rPr>
-        <w:t>As 6 contas fixas de treinamento e as configuracoes do ambiente de treino nao sao apagadas pelo reset - so os projetos e os registros de formulario.</w:t>
+        <w:t>Um cartao por projeto ativo com Planejamento registrado, ordenado com os projetos com mais marcos atrasados primeiro: nome do projeto, gerente, barra de % concluido, e a lista dos marcos atrasados (destacados em vermelho) e vencendo em breve (destacados em amarelo), cada um com o responsavel do cronograma e ha quantos dias esta atrasado ou em quantos dias vence. Um projeto sem nenhum marco atrasado ou vencendo mostra Tudo em dia.</w:t>
       </w:r>
     </w:p>
     <w:p>
@@ -21408,7 +21545,8 @@
           <w:color w:val="6A6A70"/>
           <w:sz w:val="21"/>
         </w:rPr>
-        <w:t>Assim como as outras acoes exclusivas de Admin, a Edge Function confere o papel do usuario direto no banco de producao antes de fazer qualquer alteracao - nao basta ver o botao na tela.</w:t>
+        <w:lastRenderedPageBreak/>
+        <w:t>Este painel so mostra os dados - quem efetivamente recebe um aviso por e-mail/push quando um prazo se aproxima e o mecanismo descrito a seguir, que roda sozinho todo dia sem precisar desta tela aberta.</w:t>
       </w:r>
     </w:p>
     <w:p>
@@ -21422,7 +21560,7 @@
           <w:sz w:val="27"/>
         </w:rPr>
       </w:pPr>
-      <w:bookmarkStart w:id="47" w:name="_Toc240366664"/>
+      <w:bookmarkStart w:id="47" w:name="_Toc240373158"/>
       <w:r>
         <w:rPr>
           <w:rFonts w:ascii="Montserrat" w:hAnsi="Montserrat"/>
@@ -21430,7 +21568,7 @@
           <w:color w:val="B91D2E"/>
           <w:sz w:val="27"/>
         </w:rPr>
-        <w:t>6.6 Backup automatizado</w:t>
+        <w:t>6.4.3 Aviso automatico de prazo (e-mail e push)</w:t>
       </w:r>
       <w:bookmarkEnd w:id="47"/>
     </w:p>
@@ -21449,7 +21587,7 @@
           <w:color w:val="1A1A1A"/>
           <w:sz w:val="22"/>
         </w:rPr>
-        <w:t>No fim da aba Configuracoes (secao 6.3), um bloco separado deixa o Admin/PMO definir os parametros de uma rotina de backup periodico do sistema inteiro (banco de dados, arquivos anexados e codigo-fonte) para um destino fora do GitHub - complemento operacional a proposta Backup Automatizado entregue separadamente.</w:t>
+        <w:t>Complementando o Painel de Prazos, um mecanismo roda sozinho uma vez por dia (sem depender de ninguem abrir o sistema) e avisa por e-mail - e por push, para quem tiver ativado (secao 2.9) - quando um marco do cronograma esta chegando ou ja passou do prazo, sem Conclusao real preenchida:</w:t>
       </w:r>
     </w:p>
     <w:p>
@@ -21473,7 +21611,7 @@
           <w:color w:val="1A1A1A"/>
           <w:sz w:val="22"/>
         </w:rPr>
-        <w:t>Habilitar backup automatizado: interruptor geral da rotina.</w:t>
+        <w:t>5 dias antes do Termino previsto.</w:t>
       </w:r>
     </w:p>
     <w:p>
@@ -21497,7 +21635,7 @@
           <w:color w:val="1A1A1A"/>
           <w:sz w:val="22"/>
         </w:rPr>
-        <w:t>Destino: OneDrive/SharePoint institucional, outro armazenamento de nuvem ou servidor da instituicao, mais o caminho/pasta exato onde gravar.</w:t>
+        <w:t>2 dias antes.</w:t>
       </w:r>
     </w:p>
     <w:p>
@@ -21521,7 +21659,7 @@
           <w:color w:val="1A1A1A"/>
           <w:sz w:val="22"/>
         </w:rPr>
-        <w:t>Frequencia: diaria ou semanal.</w:t>
+        <w:t>No dia do vencimento.</w:t>
       </w:r>
     </w:p>
     <w:p>
@@ -21545,7 +21683,127 @@
           <w:color w:val="1A1A1A"/>
           <w:sz w:val="22"/>
         </w:rPr>
-        <w:t>Retencao (dias, opcional): depois de quantos dias os backups antigos podem ser descartados; vazio mantem tudo indefinidamente.</w:t>
+        <w:t>Atrasado - repete a cada 7 dias enquanto o marco continuar sem Conclusao real, para nao lembrar todo dia da mesma pendencia.</w:t>
+      </w:r>
+    </w:p>
+    <w:p>
+      <w:pPr>
+        <w:spacing w:line="280" w:lineRule="auto"/>
+        <w:rPr>
+          <w:rFonts w:ascii="Montserrat" w:hAnsi="Montserrat"/>
+          <w:color w:val="1A1A1A"/>
+          <w:sz w:val="22"/>
+        </w:rPr>
+      </w:pPr>
+      <w:r>
+        <w:rPr>
+          <w:rFonts w:ascii="Montserrat" w:hAnsi="Montserrat"/>
+          <w:color w:val="1A1A1A"/>
+          <w:sz w:val="22"/>
+        </w:rPr>
+        <w:t>Quem recebe cada aviso: a conta vinculada no novo campo Responsavel (conta) do cronograma (Passo 4, aba 3), quando preenchido, mais toda conta com papel Gerente de Projetos que estiver na equipe daquele projeto (secao 2.5) - nao o campo de texto livre Gerente do cadastro do projeto. Se nenhum dos dois existir para aquele marco, ninguem recebe o aviso automatico, mas o indicador visual no Painel de Prazos continua aparecendo normalmente.</w:t>
+      </w:r>
+    </w:p>
+    <w:p>
+      <w:pPr>
+        <w:spacing w:before="160" w:after="200"/>
+        <w:ind w:left="283"/>
+        <w:rPr>
+          <w:rFonts w:ascii="Montserrat" w:hAnsi="Montserrat"/>
+          <w:i/>
+          <w:color w:val="6A6A70"/>
+          <w:sz w:val="21"/>
+        </w:rPr>
+      </w:pPr>
+      <w:r>
+        <w:rPr>
+          <w:rFonts w:ascii="Montserrat" w:hAnsi="Montserrat"/>
+          <w:i/>
+          <w:color w:val="6A6A70"/>
+          <w:sz w:val="21"/>
+        </w:rPr>
+        <w:t>O campo Responsavel (conta) e nao a pessoa preenche o texto livre Responsavel ja existente: e um segundo campo, um seletor com as contas que fazem parte da equipe do projeto selecionado. O texto livre Responsavel continua existindo do lado, sem nenhuma mudanca - o campo novo serve so para o sistema saber para qual conta mandar o aviso automatico.</w:t>
+      </w:r>
+    </w:p>
+    <w:p>
+      <w:pPr>
+        <w:spacing w:before="160" w:after="200"/>
+        <w:ind w:left="283"/>
+        <w:rPr>
+          <w:rFonts w:ascii="Montserrat" w:hAnsi="Montserrat"/>
+          <w:i/>
+          <w:color w:val="6A6A70"/>
+          <w:sz w:val="21"/>
+        </w:rPr>
+      </w:pPr>
+      <w:r>
+        <w:rPr>
+          <w:rFonts w:ascii="Montserrat" w:hAnsi="Montserrat"/>
+          <w:i/>
+          <w:color w:val="6A6A70"/>
+          <w:sz w:val="21"/>
+        </w:rPr>
+        <w:t>Cada aviso e enviado uma unica vez por marco e por janela (5 dias, 2 dias, no dia) - nao repete todo dia dentro da mesma janela. Ja o aviso de atraso repete a cada 7 dias, para continuar chegando enquanto a pendencia nao for resolvida, sem virar um lembrete diario.</w:t>
+      </w:r>
+    </w:p>
+    <w:p>
+      <w:pPr>
+        <w:pStyle w:val="Ttulo2"/>
+        <w:spacing w:before="320" w:after="120"/>
+        <w:rPr>
+          <w:rFonts w:ascii="Montserrat" w:hAnsi="Montserrat"/>
+          <w:b/>
+          <w:color w:val="B91D2E"/>
+          <w:sz w:val="27"/>
+        </w:rPr>
+      </w:pPr>
+      <w:bookmarkStart w:id="48" w:name="_Toc240373159"/>
+      <w:r>
+        <w:rPr>
+          <w:rFonts w:ascii="Montserrat" w:hAnsi="Montserrat"/>
+          <w:b/>
+          <w:color w:val="B91D2E"/>
+          <w:sz w:val="27"/>
+        </w:rPr>
+        <w:t>6.5 Ambiente de Treino</w:t>
+      </w:r>
+      <w:bookmarkEnd w:id="48"/>
+    </w:p>
+    <w:p>
+      <w:pPr>
+        <w:spacing w:line="280" w:lineRule="auto"/>
+        <w:rPr>
+          <w:rFonts w:ascii="Montserrat" w:hAnsi="Montserrat"/>
+          <w:color w:val="1A1A1A"/>
+          <w:sz w:val="22"/>
+        </w:rPr>
+      </w:pPr>
+      <w:r>
+        <w:rPr>
+          <w:rFonts w:ascii="Montserrat" w:hAnsi="Montserrat"/>
+          <w:color w:val="1A1A1A"/>
+          <w:sz w:val="22"/>
+        </w:rPr>
+        <w:t>O sistema tem um ambiente de treinamento/demonstracao totalmente separado da producao - mesma ferramenta, mesmo schema de dados, mas um banco proprio, populado com 7 projetos ficticios cobrindo o ciclo completo (de uma Solicitacao de Demanda ainda pendente ate um projeto totalmente encerrado com TEP e RLA). Serve para apresentacoes, estudo e capacitacao sem tocar em nenhum dado real. Veja o roteiro Como rodar o Ambiente de Treinamento para o endereco, as contas de acesso e o passo a passo completo.</w:t>
+      </w:r>
+    </w:p>
+    <w:p>
+      <w:pPr>
+        <w:spacing w:line="280" w:lineRule="auto"/>
+        <w:rPr>
+          <w:rFonts w:ascii="Montserrat" w:hAnsi="Montserrat"/>
+          <w:color w:val="1A1A1A"/>
+          <w:sz w:val="22"/>
+        </w:rPr>
+      </w:pPr>
+      <w:r>
+        <w:rPr>
+          <w:rFonts w:ascii="Montserrat" w:hAnsi="Montserrat"/>
+          <w:color w:val="1A1A1A"/>
+          <w:sz w:val="22"/>
+        </w:rPr>
+        <w:lastRenderedPageBreak/>
+        <w:t>Quando a Administracao e acessada em producao, aparece uma quarta aba, Ambiente de Treino, com um unico botao: Resetar ambiente de treinamento. Ao clicar (e confirmar o aviso), o sistema apaga todos os projetos e registros de formulario atualmente no ambiente de treinamento e recria os 7 projetos de exemplo do zero - util para deixar o ambiente limpo antes de uma nova turma, sem precisar rodar nenhum comando manualmente.</w:t>
       </w:r>
     </w:p>
     <w:p>
@@ -21553,7 +21811,7 @@
         <w:pStyle w:val="PargrafodaLista"/>
         <w:numPr>
           <w:ilvl w:val="0"/>
-          <w:numId w:val="35"/>
+          <w:numId w:val="36"/>
         </w:numPr>
         <w:spacing w:after="80" w:line="260" w:lineRule="auto"/>
         <w:ind w:left="700"/>
@@ -21569,7 +21827,7 @@
           <w:color w:val="1A1A1A"/>
           <w:sz w:val="22"/>
         </w:rPr>
-        <w:t>E-mail de alerta: para onde avisar automaticamente se uma execucao falhar.</w:t>
+        <w:t>A aba so aparece quando a Administracao e acessada pelo endereco de producao - quem acessa a Administracao pelo proprio ambiente de treinamento nao ve essa opcao.</w:t>
       </w:r>
     </w:p>
     <w:p>
@@ -21577,7 +21835,7 @@
         <w:pStyle w:val="PargrafodaLista"/>
         <w:numPr>
           <w:ilvl w:val="0"/>
-          <w:numId w:val="35"/>
+          <w:numId w:val="36"/>
         </w:numPr>
         <w:spacing w:after="80" w:line="260" w:lineRule="auto"/>
         <w:ind w:left="700"/>
@@ -21593,7 +21851,7 @@
           <w:color w:val="1A1A1A"/>
           <w:sz w:val="22"/>
         </w:rPr>
-        <w:t>E-mails com acesso ao destino externo: campo de registro/referencia de quem deveria ter permissao na pasta de destino - conceder esse acesso de fato continua sendo feito manualmente onde o destino estiver (OneDrive, repositorio etc.).</w:t>
+        <w:t>Nao afeta nenhum dado de producao em nenhuma hipotese - a acao roda numa Edge Function que so tem permissao de escrita no banco do ambiente de treinamento.</w:t>
       </w:r>
     </w:p>
     <w:p>
@@ -21601,7 +21859,7 @@
         <w:pStyle w:val="PargrafodaLista"/>
         <w:numPr>
           <w:ilvl w:val="0"/>
-          <w:numId w:val="35"/>
+          <w:numId w:val="36"/>
         </w:numPr>
         <w:spacing w:after="80" w:line="260" w:lineRule="auto"/>
         <w:ind w:left="700"/>
@@ -21617,7 +21875,69 @@
           <w:color w:val="1A1A1A"/>
           <w:sz w:val="22"/>
         </w:rPr>
-        <w:t>Quem pode gerenciar essas configuracoes: papeis liberados para alterar esta tela, alem do PMO/Admin, que sempre tem acesso.</w:t>
+        <w:t>As 6 contas fixas de treinamento e as configuracoes do ambiente de treino nao sao apagadas pelo reset - so os projetos e os registros de formulario.</w:t>
+      </w:r>
+    </w:p>
+    <w:p>
+      <w:pPr>
+        <w:spacing w:before="160" w:after="200"/>
+        <w:ind w:left="283"/>
+        <w:rPr>
+          <w:rFonts w:ascii="Montserrat" w:hAnsi="Montserrat"/>
+          <w:i/>
+          <w:color w:val="6A6A70"/>
+          <w:sz w:val="21"/>
+        </w:rPr>
+      </w:pPr>
+      <w:r>
+        <w:rPr>
+          <w:rFonts w:ascii="Montserrat" w:hAnsi="Montserrat"/>
+          <w:i/>
+          <w:color w:val="6A6A70"/>
+          <w:sz w:val="21"/>
+        </w:rPr>
+        <w:t>Assim como as outras acoes exclusivas de Admin, a Edge Function confere o papel do usuario direto no banco de producao antes de fazer qualquer alteracao - nao basta ver o botao na tela.</w:t>
+      </w:r>
+    </w:p>
+    <w:p>
+      <w:pPr>
+        <w:pStyle w:val="Ttulo2"/>
+        <w:spacing w:before="320" w:after="120"/>
+        <w:rPr>
+          <w:rFonts w:ascii="Montserrat" w:hAnsi="Montserrat"/>
+          <w:b/>
+          <w:color w:val="B91D2E"/>
+          <w:sz w:val="27"/>
+        </w:rPr>
+      </w:pPr>
+      <w:bookmarkStart w:id="49" w:name="_Toc240373160"/>
+      <w:r>
+        <w:rPr>
+          <w:rFonts w:ascii="Montserrat" w:hAnsi="Montserrat"/>
+          <w:b/>
+          <w:color w:val="B91D2E"/>
+          <w:sz w:val="27"/>
+        </w:rPr>
+        <w:t>6.6 Backup automatizado</w:t>
+      </w:r>
+      <w:bookmarkEnd w:id="49"/>
+    </w:p>
+    <w:p>
+      <w:pPr>
+        <w:spacing w:line="280" w:lineRule="auto"/>
+        <w:rPr>
+          <w:rFonts w:ascii="Montserrat" w:hAnsi="Montserrat"/>
+          <w:color w:val="1A1A1A"/>
+          <w:sz w:val="22"/>
+        </w:rPr>
+      </w:pPr>
+      <w:r>
+        <w:rPr>
+          <w:rFonts w:ascii="Montserrat" w:hAnsi="Montserrat"/>
+          <w:color w:val="1A1A1A"/>
+          <w:sz w:val="22"/>
+        </w:rPr>
+        <w:t>No fim da aba Configuracoes (secao 6.3), um bloco separado deixa o Admin/PMO definir os parametros de uma rotina de backup periodico do sistema inteiro (banco de dados, arquivos anexados e codigo-fonte) para um destino fora do GitHub - complemento operacional a proposta Backup Automatizado entregue separadamente.</w:t>
       </w:r>
     </w:p>
     <w:p>
@@ -21625,7 +21945,7 @@
         <w:pStyle w:val="PargrafodaLista"/>
         <w:numPr>
           <w:ilvl w:val="0"/>
-          <w:numId w:val="35"/>
+          <w:numId w:val="37"/>
         </w:numPr>
         <w:spacing w:after="80" w:line="260" w:lineRule="auto"/>
         <w:ind w:left="700"/>
@@ -21641,6 +21961,175 @@
           <w:color w:val="1A1A1A"/>
           <w:sz w:val="22"/>
         </w:rPr>
+        <w:t>Habilitar backup automatizado: interruptor geral da rotina.</w:t>
+      </w:r>
+    </w:p>
+    <w:p>
+      <w:pPr>
+        <w:pStyle w:val="PargrafodaLista"/>
+        <w:numPr>
+          <w:ilvl w:val="0"/>
+          <w:numId w:val="37"/>
+        </w:numPr>
+        <w:spacing w:after="80" w:line="260" w:lineRule="auto"/>
+        <w:ind w:left="700"/>
+        <w:rPr>
+          <w:rFonts w:ascii="Montserrat" w:hAnsi="Montserrat"/>
+          <w:color w:val="1A1A1A"/>
+          <w:sz w:val="22"/>
+        </w:rPr>
+      </w:pPr>
+      <w:r>
+        <w:rPr>
+          <w:rFonts w:ascii="Montserrat" w:hAnsi="Montserrat"/>
+          <w:color w:val="1A1A1A"/>
+          <w:sz w:val="22"/>
+        </w:rPr>
+        <w:t>Destino: OneDrive/SharePoint institucional, outro armazenamento de nuvem ou servidor da instituicao, mais o caminho/pasta exato onde gravar.</w:t>
+      </w:r>
+    </w:p>
+    <w:p>
+      <w:pPr>
+        <w:pStyle w:val="PargrafodaLista"/>
+        <w:numPr>
+          <w:ilvl w:val="0"/>
+          <w:numId w:val="37"/>
+        </w:numPr>
+        <w:spacing w:after="80" w:line="260" w:lineRule="auto"/>
+        <w:ind w:left="700"/>
+        <w:rPr>
+          <w:rFonts w:ascii="Montserrat" w:hAnsi="Montserrat"/>
+          <w:color w:val="1A1A1A"/>
+          <w:sz w:val="22"/>
+        </w:rPr>
+      </w:pPr>
+      <w:r>
+        <w:rPr>
+          <w:rFonts w:ascii="Montserrat" w:hAnsi="Montserrat"/>
+          <w:color w:val="1A1A1A"/>
+          <w:sz w:val="22"/>
+        </w:rPr>
+        <w:t>Frequencia: diaria ou semanal.</w:t>
+      </w:r>
+    </w:p>
+    <w:p>
+      <w:pPr>
+        <w:pStyle w:val="PargrafodaLista"/>
+        <w:numPr>
+          <w:ilvl w:val="0"/>
+          <w:numId w:val="37"/>
+        </w:numPr>
+        <w:spacing w:after="80" w:line="260" w:lineRule="auto"/>
+        <w:ind w:left="700"/>
+        <w:rPr>
+          <w:rFonts w:ascii="Montserrat" w:hAnsi="Montserrat"/>
+          <w:color w:val="1A1A1A"/>
+          <w:sz w:val="22"/>
+        </w:rPr>
+      </w:pPr>
+      <w:r>
+        <w:rPr>
+          <w:rFonts w:ascii="Montserrat" w:hAnsi="Montserrat"/>
+          <w:color w:val="1A1A1A"/>
+          <w:sz w:val="22"/>
+        </w:rPr>
+        <w:t>Retencao (dias, opcional): depois de quantos dias os backups antigos podem ser descartados; vazio mantem tudo indefinidamente.</w:t>
+      </w:r>
+    </w:p>
+    <w:p>
+      <w:pPr>
+        <w:pStyle w:val="PargrafodaLista"/>
+        <w:numPr>
+          <w:ilvl w:val="0"/>
+          <w:numId w:val="37"/>
+        </w:numPr>
+        <w:spacing w:after="80" w:line="260" w:lineRule="auto"/>
+        <w:ind w:left="700"/>
+        <w:rPr>
+          <w:rFonts w:ascii="Montserrat" w:hAnsi="Montserrat"/>
+          <w:color w:val="1A1A1A"/>
+          <w:sz w:val="22"/>
+        </w:rPr>
+      </w:pPr>
+      <w:r>
+        <w:rPr>
+          <w:rFonts w:ascii="Montserrat" w:hAnsi="Montserrat"/>
+          <w:color w:val="1A1A1A"/>
+          <w:sz w:val="22"/>
+        </w:rPr>
+        <w:t>E-mail de alerta: para onde avisar automaticamente se uma execucao falhar.</w:t>
+      </w:r>
+    </w:p>
+    <w:p>
+      <w:pPr>
+        <w:pStyle w:val="PargrafodaLista"/>
+        <w:numPr>
+          <w:ilvl w:val="0"/>
+          <w:numId w:val="37"/>
+        </w:numPr>
+        <w:spacing w:after="80" w:line="260" w:lineRule="auto"/>
+        <w:ind w:left="700"/>
+        <w:rPr>
+          <w:rFonts w:ascii="Montserrat" w:hAnsi="Montserrat"/>
+          <w:color w:val="1A1A1A"/>
+          <w:sz w:val="22"/>
+        </w:rPr>
+      </w:pPr>
+      <w:r>
+        <w:rPr>
+          <w:rFonts w:ascii="Montserrat" w:hAnsi="Montserrat"/>
+          <w:color w:val="1A1A1A"/>
+          <w:sz w:val="22"/>
+        </w:rPr>
+        <w:t>E-mails com acesso ao destino externo: campo de registro/referencia de quem deveria ter permissao na pasta de destino - conceder esse acesso de fato continua sendo feito manualmente onde o destino estiver (OneDrive, repositorio etc.).</w:t>
+      </w:r>
+    </w:p>
+    <w:p>
+      <w:pPr>
+        <w:pStyle w:val="PargrafodaLista"/>
+        <w:numPr>
+          <w:ilvl w:val="0"/>
+          <w:numId w:val="37"/>
+        </w:numPr>
+        <w:spacing w:after="80" w:line="260" w:lineRule="auto"/>
+        <w:ind w:left="700"/>
+        <w:rPr>
+          <w:rFonts w:ascii="Montserrat" w:hAnsi="Montserrat"/>
+          <w:color w:val="1A1A1A"/>
+          <w:sz w:val="22"/>
+        </w:rPr>
+      </w:pPr>
+      <w:r>
+        <w:rPr>
+          <w:rFonts w:ascii="Montserrat" w:hAnsi="Montserrat"/>
+          <w:color w:val="1A1A1A"/>
+          <w:sz w:val="22"/>
+        </w:rPr>
+        <w:t>Quem pode gerenciar essas configuracoes: papeis liberados para alterar esta tela, alem do PMO/Admin, que sempre tem acesso.</w:t>
+      </w:r>
+    </w:p>
+    <w:p>
+      <w:pPr>
+        <w:pStyle w:val="PargrafodaLista"/>
+        <w:numPr>
+          <w:ilvl w:val="0"/>
+          <w:numId w:val="37"/>
+        </w:numPr>
+        <w:spacing w:after="80" w:line="260" w:lineRule="auto"/>
+        <w:ind w:left="700"/>
+        <w:rPr>
+          <w:rFonts w:ascii="Montserrat" w:hAnsi="Montserrat"/>
+          <w:color w:val="1A1A1A"/>
+          <w:sz w:val="22"/>
+        </w:rPr>
+      </w:pPr>
+      <w:r>
+        <w:rPr>
+          <w:rFonts w:ascii="Montserrat" w:hAnsi="Montserrat"/>
+          <w:color w:val="1A1A1A"/>
+          <w:sz w:val="22"/>
+        </w:rPr>
+        <w:lastRenderedPageBreak/>
         <w:t>Ultima execucao: data/hora e status (sucesso ou falha) da ultima vez que a rotina automatizada rodou, preenchido por ela mesma.</w:t>
       </w:r>
     </w:p>
@@ -21683,7 +22172,6 @@
           <w:color w:val="6A6A70"/>
           <w:sz w:val="21"/>
         </w:rPr>
-        <w:lastRenderedPageBreak/>
         <w:t>Destino no SharePoint confirmado: desde 28/08/2026, o envio da copia externa para o SharePoint institucional esta confirmado funcionando de ponta a ponta, com o aplicativo usando apenas a permissao Sites.Selected (acesso restrito a um unico site, o modelo de menor privilegio recomendado desde o inicio) - sem depender de nenhuma permissao ampla sobre todos os sites da instituicao.</w:t>
       </w:r>
     </w:p>
@@ -21715,16 +22203,16 @@
           <w:noProof/>
         </w:rPr>
         <w:drawing>
-          <wp:inline distT="0" distB="0" distL="0" distR="0" wp14:anchorId="061F6EC5" wp14:editId="3D1D2EB2">
+          <wp:inline distT="0" distB="0" distL="0" distR="0" wp14:anchorId="212A39B5" wp14:editId="1B110981">
             <wp:extent cx="5303520" cy="1351384"/>
             <wp:effectExtent l="19050" t="19050" r="11430" b="20320"/>
-            <wp:docPr id="1887437223" name="Imagem 54"/>
+            <wp:docPr id="1772774793" name="Imagem 54"/>
             <wp:cNvGraphicFramePr/>
             <a:graphic xmlns:a="http://schemas.openxmlformats.org/drawingml/2006/main">
               <a:graphicData uri="http://schemas.openxmlformats.org/drawingml/2006/picture">
                 <pic:pic xmlns:pic="http://schemas.openxmlformats.org/drawingml/2006/picture">
                   <pic:nvPicPr>
-                    <pic:cNvPr id="1887437223" name=""/>
+                    <pic:cNvPr id="1772774793" name=""/>
                     <pic:cNvPicPr/>
                   </pic:nvPicPr>
                   <pic:blipFill>
@@ -21792,7 +22280,7 @@
           <w:sz w:val="27"/>
         </w:rPr>
       </w:pPr>
-      <w:bookmarkStart w:id="48" w:name="_Toc240366665"/>
+      <w:bookmarkStart w:id="50" w:name="_Toc240373161"/>
       <w:r>
         <w:rPr>
           <w:rFonts w:ascii="Montserrat" w:hAnsi="Montserrat"/>
@@ -21802,7 +22290,7 @@
         </w:rPr>
         <w:t>6.7 Relatorio de Resultados</w:t>
       </w:r>
-      <w:bookmarkEnd w:id="48"/>
+      <w:bookmarkEnd w:id="50"/>
     </w:p>
     <w:p>
       <w:pPr>
@@ -21827,7 +22315,7 @@
         <w:pStyle w:val="PargrafodaLista"/>
         <w:numPr>
           <w:ilvl w:val="0"/>
-          <w:numId w:val="36"/>
+          <w:numId w:val="38"/>
         </w:numPr>
         <w:spacing w:after="80" w:line="260" w:lineRule="auto"/>
         <w:ind w:left="700"/>
@@ -21843,7 +22331,16 @@
           <w:color w:val="1A1A1A"/>
           <w:sz w:val="22"/>
         </w:rPr>
-        <w:t>Marcos no prazo: % dos marcos de projetos ainda ativos no Relatorio de Situacao (secao 4.1) que NAO estao atrasados - a data-alvo (do cronograma do Planejamento) ainda nao passou, o marco ja tem Conclusao real preenchida no Planejamento, ou o marco esta marcado como Concluido/Cancelado.</w:t>
+        <w:t xml:space="preserve">Marcos no prazo: % dos marcos de projetos ainda ativos no Relatorio de Situacao (secao 4.1) que NAO estao atrasados - a data-alvo (do cronograma do Planejamento) ainda nao passou, o marco ja tem </w:t>
+      </w:r>
+      <w:r>
+        <w:rPr>
+          <w:rFonts w:ascii="Montserrat" w:hAnsi="Montserrat"/>
+          <w:color w:val="1A1A1A"/>
+          <w:sz w:val="22"/>
+        </w:rPr>
+        <w:lastRenderedPageBreak/>
+        <w:t>Conclusao real preenchida no Planejamento, ou o marco esta marcado como Concluido/Cancelado.</w:t>
       </w:r>
     </w:p>
     <w:p>
@@ -21851,7 +22348,7 @@
         <w:pStyle w:val="PargrafodaLista"/>
         <w:numPr>
           <w:ilvl w:val="0"/>
-          <w:numId w:val="36"/>
+          <w:numId w:val="38"/>
         </w:numPr>
         <w:spacing w:after="80" w:line="260" w:lineRule="auto"/>
         <w:ind w:left="700"/>
@@ -21875,7 +22372,7 @@
         <w:pStyle w:val="PargrafodaLista"/>
         <w:numPr>
           <w:ilvl w:val="0"/>
-          <w:numId w:val="36"/>
+          <w:numId w:val="38"/>
         </w:numPr>
         <w:spacing w:after="80" w:line="260" w:lineRule="auto"/>
         <w:ind w:left="700"/>
@@ -21899,7 +22396,7 @@
         <w:pStyle w:val="PargrafodaLista"/>
         <w:numPr>
           <w:ilvl w:val="0"/>
-          <w:numId w:val="36"/>
+          <w:numId w:val="38"/>
         </w:numPr>
         <w:spacing w:after="80" w:line="260" w:lineRule="auto"/>
         <w:ind w:left="700"/>
@@ -21915,16 +22412,7 @@
           <w:color w:val="1A1A1A"/>
           <w:sz w:val="22"/>
         </w:rPr>
-        <w:t xml:space="preserve">Projetos sem risco alto/critico: % dos projetos com TAP registrado (com Projeto vinculado) que nao tem nenhum risco em aberto (Status diferente de Encerrado) com severidade Alto ou Critico - a mesma matriz </w:t>
-      </w:r>
-      <w:r>
-        <w:rPr>
-          <w:rFonts w:ascii="Montserrat" w:hAnsi="Montserrat"/>
-          <w:color w:val="1A1A1A"/>
-          <w:sz w:val="22"/>
-        </w:rPr>
-        <w:lastRenderedPageBreak/>
-        <w:t>de severidade da Matriz de risco do TAP (Passo 3, secao 9), agregada em nivel de portfolio.</w:t>
+        <w:t>Projetos sem risco alto/critico: % dos projetos com TAP registrado (com Projeto vinculado) que nao tem nenhum risco em aberto (Status diferente de Encerrado) com severidade Alto ou Critico - a mesma matriz de severidade da Matriz de risco do TAP (Passo 3, secao 9), agregada em nivel de portfolio.</w:t>
       </w:r>
     </w:p>
     <w:p>
@@ -21937,16 +22425,16 @@
           <w:noProof/>
         </w:rPr>
         <w:drawing>
-          <wp:inline distT="0" distB="0" distL="0" distR="0" wp14:anchorId="0A850869" wp14:editId="4B38C50E">
+          <wp:inline distT="0" distB="0" distL="0" distR="0" wp14:anchorId="3B5E8B24" wp14:editId="6DC32BD8">
             <wp:extent cx="5303520" cy="1422793"/>
             <wp:effectExtent l="19050" t="19050" r="11430" b="25400"/>
-            <wp:docPr id="395343784" name="Imagem 55"/>
+            <wp:docPr id="1906000879" name="Imagem 55"/>
             <wp:cNvGraphicFramePr/>
             <a:graphic xmlns:a="http://schemas.openxmlformats.org/drawingml/2006/main">
               <a:graphicData uri="http://schemas.openxmlformats.org/drawingml/2006/picture">
                 <pic:pic xmlns:pic="http://schemas.openxmlformats.org/drawingml/2006/picture">
                   <pic:nvPicPr>
-                    <pic:cNvPr id="395343784" name=""/>
+                    <pic:cNvPr id="1906000879" name=""/>
                     <pic:cNvPicPr/>
                   </pic:nvPicPr>
                   <pic:blipFill>
@@ -22063,7 +22551,17 @@
           <w:color w:val="6A6A70"/>
           <w:sz w:val="21"/>
         </w:rPr>
-        <w:t>O Planejamento guarda tanto a data-alvo (Termino previsto) quanto a Conclusao real de cada marco, entao o indicador ja distingue um marco que terminou no prazo de um que so ainda nao venceu. Projetos dentro do orcamento e Entraves resolvidos continuam aparecendo como travessao (-) quando nao ha dado suficiente para calcular, em vez de mostrar um numero sem base.</w:t>
+        <w:t xml:space="preserve">O Planejamento guarda tanto a data-alvo (Termino previsto) quanto a Conclusao real de cada marco, entao o indicador ja distingue um marco que terminou no prazo de um que so ainda nao venceu. Projetos dentro do orcamento e Entraves resolvidos continuam aparecendo como travessao (-) </w:t>
+      </w:r>
+      <w:r>
+        <w:rPr>
+          <w:rFonts w:ascii="Montserrat" w:hAnsi="Montserrat"/>
+          <w:i/>
+          <w:color w:val="6A6A70"/>
+          <w:sz w:val="21"/>
+        </w:rPr>
+        <w:lastRenderedPageBreak/>
+        <w:t>quando nao ha dado suficiente para calcular, em vez de mostrar um numero sem base.</w:t>
       </w:r>
     </w:p>
     <w:p>
@@ -22071,7 +22569,7 @@
         <w:pStyle w:val="PargrafodaLista"/>
         <w:numPr>
           <w:ilvl w:val="0"/>
-          <w:numId w:val="37"/>
+          <w:numId w:val="39"/>
         </w:numPr>
         <w:spacing w:after="80" w:line="260" w:lineRule="auto"/>
         <w:ind w:left="700"/>
@@ -22099,18 +22597,17 @@
         <w:rPr>
           <w:noProof/>
         </w:rPr>
-        <w:lastRenderedPageBreak/>
         <w:drawing>
-          <wp:inline distT="0" distB="0" distL="0" distR="0" wp14:anchorId="5E6E8437" wp14:editId="2E23B6FB">
+          <wp:inline distT="0" distB="0" distL="0" distR="0" wp14:anchorId="5504CE4F" wp14:editId="350A4FFF">
             <wp:extent cx="5303520" cy="1841050"/>
             <wp:effectExtent l="19050" t="19050" r="11430" b="26035"/>
-            <wp:docPr id="520992127" name="Imagem 56"/>
+            <wp:docPr id="1074097155" name="Imagem 56"/>
             <wp:cNvGraphicFramePr/>
             <a:graphic xmlns:a="http://schemas.openxmlformats.org/drawingml/2006/main">
               <a:graphicData uri="http://schemas.openxmlformats.org/drawingml/2006/picture">
                 <pic:pic xmlns:pic="http://schemas.openxmlformats.org/drawingml/2006/picture">
                   <pic:nvPicPr>
-                    <pic:cNvPr id="520992127" name=""/>
+                    <pic:cNvPr id="1074097155" name=""/>
                     <pic:cNvPicPr/>
                   </pic:nvPicPr>
                   <pic:blipFill>
@@ -22211,7 +22708,7 @@
         <w:pStyle w:val="PargrafodaLista"/>
         <w:numPr>
           <w:ilvl w:val="0"/>
-          <w:numId w:val="37"/>
+          <w:numId w:val="39"/>
         </w:numPr>
         <w:spacing w:after="80" w:line="260" w:lineRule="auto"/>
         <w:ind w:left="700"/>
@@ -22235,7 +22732,7 @@
         <w:pStyle w:val="PargrafodaLista"/>
         <w:numPr>
           <w:ilvl w:val="0"/>
-          <w:numId w:val="37"/>
+          <w:numId w:val="39"/>
         </w:numPr>
         <w:spacing w:after="80" w:line="260" w:lineRule="auto"/>
         <w:ind w:left="700"/>
@@ -22264,16 +22761,16 @@
           <w:noProof/>
         </w:rPr>
         <w:drawing>
-          <wp:inline distT="0" distB="0" distL="0" distR="0" wp14:anchorId="74178E2C" wp14:editId="1DEF27C4">
+          <wp:inline distT="0" distB="0" distL="0" distR="0" wp14:anchorId="2625075E" wp14:editId="38E70465">
             <wp:extent cx="5303520" cy="303041"/>
             <wp:effectExtent l="19050" t="19050" r="11430" b="20955"/>
-            <wp:docPr id="2133676851" name="Imagem 57"/>
+            <wp:docPr id="1311697229" name="Imagem 57"/>
             <wp:cNvGraphicFramePr/>
             <a:graphic xmlns:a="http://schemas.openxmlformats.org/drawingml/2006/main">
               <a:graphicData uri="http://schemas.openxmlformats.org/drawingml/2006/picture">
                 <pic:pic xmlns:pic="http://schemas.openxmlformats.org/drawingml/2006/picture">
                   <pic:nvPicPr>
-                    <pic:cNvPr id="2133676851" name=""/>
+                    <pic:cNvPr id="1311697229" name=""/>
                     <pic:cNvPicPr/>
                   </pic:nvPicPr>
                   <pic:blipFill>
@@ -22341,16 +22838,16 @@
         </w:rPr>
         <w:lastRenderedPageBreak/>
         <w:drawing>
-          <wp:inline distT="0" distB="0" distL="0" distR="0" wp14:anchorId="60D009A1" wp14:editId="418987D5">
+          <wp:inline distT="0" distB="0" distL="0" distR="0" wp14:anchorId="1150E12F" wp14:editId="7B7FEFF6">
             <wp:extent cx="5303520" cy="2983005"/>
             <wp:effectExtent l="19050" t="19050" r="11430" b="27305"/>
-            <wp:docPr id="2013291810" name="Imagem 58"/>
+            <wp:docPr id="22758070" name="Imagem 58"/>
             <wp:cNvGraphicFramePr/>
             <a:graphic xmlns:a="http://schemas.openxmlformats.org/drawingml/2006/main">
               <a:graphicData uri="http://schemas.openxmlformats.org/drawingml/2006/picture">
                 <pic:pic xmlns:pic="http://schemas.openxmlformats.org/drawingml/2006/picture">
                   <pic:nvPicPr>
-                    <pic:cNvPr id="2013291810" name=""/>
+                    <pic:cNvPr id="22758070" name=""/>
                     <pic:cNvPicPr/>
                   </pic:nvPicPr>
                   <pic:blipFill>
@@ -22422,7 +22919,7 @@
           <w:sz w:val="34"/>
         </w:rPr>
       </w:pPr>
-      <w:bookmarkStart w:id="49" w:name="_Toc240366666"/>
+      <w:bookmarkStart w:id="51" w:name="_Toc240373162"/>
       <w:r>
         <w:rPr>
           <w:rFonts w:ascii="Montserrat" w:hAnsi="Montserrat"/>
@@ -22433,7 +22930,7 @@
         <w:lastRenderedPageBreak/>
         <w:t>7. Perguntas frequentes</w:t>
       </w:r>
-      <w:bookmarkEnd w:id="49"/>
+      <w:bookmarkEnd w:id="51"/>
     </w:p>
     <w:p>
       <w:pPr>
@@ -22666,7 +23163,7 @@
           <w:sz w:val="34"/>
         </w:rPr>
       </w:pPr>
-      <w:bookmarkStart w:id="50" w:name="_Toc240366667"/>
+      <w:bookmarkStart w:id="52" w:name="_Toc240373163"/>
       <w:r>
         <w:rPr>
           <w:rFonts w:ascii="Montserrat" w:hAnsi="Montserrat"/>
@@ -22677,7 +23174,7 @@
         <w:lastRenderedPageBreak/>
         <w:t>8. Anexo - Tabela de artefatos</w:t>
       </w:r>
-      <w:bookmarkEnd w:id="50"/>
+      <w:bookmarkEnd w:id="52"/>
     </w:p>
     <w:tbl>
       <w:tblPr>
@@ -24454,7 +24951,7 @@
 <file path=word/numbering.xml><?xml version="1.0" encoding="utf-8"?>
 <w:numbering xmlns:wpc="http://schemas.microsoft.com/office/word/2010/wordprocessingCanvas" xmlns:cx="http://schemas.microsoft.com/office/drawing/2014/chartex" xmlns:cx1="http://schemas.microsoft.com/office/drawing/2015/9/8/chartex" xmlns:cx2="http://schemas.microsoft.com/office/drawing/2015/10/21/chartex" xmlns:cx3="http://schemas.microsoft.com/office/drawing/2016/5/9/chartex" xmlns:cx4="http://schemas.microsoft.com/office/drawing/2016/5/10/chartex" xmlns:cx5="http://schemas.microsoft.com/office/drawing/2016/5/11/chartex" xmlns:cx6="http://schemas.microsoft.com/office/drawing/2016/5/12/chartex" xmlns:cx7="http://schemas.microsoft.com/office/drawing/2016/5/13/chartex" xmlns:cx8="http://schemas.microsoft.com/office/drawing/2016/5/14/chartex" xmlns:mc="http://schemas.openxmlformats.org/markup-compatibility/2006" xmlns:aink="http://schemas.microsoft.com/office/drawing/2016/ink" xmlns:am3d="http://schemas.microsoft.com/office/drawing/2017/model3d" xmlns:o="urn:schemas-microsoft-com:office:office" xmlns:oel="http://schemas.microsoft.com/office/2019/extlst" xmlns:r="http://schemas.openxmlformats.org/officeDocument/2006/relationships" xmlns:m="http://schemas.openxmlformats.org/officeDocument/2006/math" xmlns:v="urn:schemas-microsoft-com:vml" xmlns:wp14="http://schemas.microsoft.com/office/word/2010/wordprocessingDrawing" xmlns:wp="http://schemas.openxmlformats.org/drawingml/2006/wordprocessingDrawing" xmlns:w10="urn:schemas-microsoft-com:office:word" xmlns:w="http://schemas.openxmlformats.org/wordprocessingml/2006/main" xmlns:w14="http://schemas.microsoft.com/office/word/2010/wordml" xmlns:w15="http://schemas.microsoft.com/office/word/2012/wordml" xmlns:w16cex="http://schemas.microsoft.com/office/word/2018/wordml/cex" xmlns:w16cid="http://schemas.microsoft.com/office/word/2016/wordml/cid" xmlns:w16="http://schemas.microsoft.com/office/word/2018/wordml" xmlns:w16du="http://schemas.microsoft.com/office/word/2023/wordml/word16du" xmlns:w16sdtdh="http://schemas.microsoft.com/office/word/2020/wordml/sdtdatahash" xmlns:w16sdtfl="http://schemas.microsoft.com/office/word/2024/wordml/sdtformatlock" xmlns:w16se="http://schemas.microsoft.com/office/word/2015/wordml/symex" xmlns:wpg="http://schemas.microsoft.com/office/word/2010/wordprocessingGroup" xmlns:wpi="http://schemas.microsoft.com/office/word/2010/wordprocessingInk" xmlns:wne="http://schemas.microsoft.com/office/word/2006/wordml" xmlns:wps="http://schemas.microsoft.com/office/word/2010/wordprocessingShape" mc:Ignorable="w14 w15 w16se w16cid w16 w16cex w16sdtdh w16sdtfl w16du wp14">
   <w:abstractNum w:abstractNumId="0" w15:restartNumberingAfterBreak="0">
-    <w:nsid w:val="00020AAF"/>
+    <w:nsid w:val="02744266"/>
     <w:multiLevelType w:val="singleLevel"/>
     <w:tmpl w:val="04160001"/>
     <w:lvl w:ilvl="0">
@@ -24471,7 +24968,7 @@
     </w:lvl>
   </w:abstractNum>
   <w:abstractNum w:abstractNumId="1" w15:restartNumberingAfterBreak="0">
-    <w:nsid w:val="0771292C"/>
+    <w:nsid w:val="044328C2"/>
     <w:multiLevelType w:val="singleLevel"/>
     <w:tmpl w:val="04160001"/>
     <w:lvl w:ilvl="0">
@@ -24488,7 +24985,7 @@
     </w:lvl>
   </w:abstractNum>
   <w:abstractNum w:abstractNumId="2" w15:restartNumberingAfterBreak="0">
-    <w:nsid w:val="13F60736"/>
+    <w:nsid w:val="05EB4104"/>
     <w:multiLevelType w:val="singleLevel"/>
     <w:tmpl w:val="04160001"/>
     <w:lvl w:ilvl="0">
@@ -24505,7 +25002,7 @@
     </w:lvl>
   </w:abstractNum>
   <w:abstractNum w:abstractNumId="3" w15:restartNumberingAfterBreak="0">
-    <w:nsid w:val="155508E7"/>
+    <w:nsid w:val="08DC1E7B"/>
     <w:multiLevelType w:val="singleLevel"/>
     <w:tmpl w:val="04160001"/>
     <w:lvl w:ilvl="0">
@@ -24522,7 +25019,7 @@
     </w:lvl>
   </w:abstractNum>
   <w:abstractNum w:abstractNumId="4" w15:restartNumberingAfterBreak="0">
-    <w:nsid w:val="1D533028"/>
+    <w:nsid w:val="0BA85592"/>
     <w:multiLevelType w:val="singleLevel"/>
     <w:tmpl w:val="04160001"/>
     <w:lvl w:ilvl="0">
@@ -24539,7 +25036,7 @@
     </w:lvl>
   </w:abstractNum>
   <w:abstractNum w:abstractNumId="5" w15:restartNumberingAfterBreak="0">
-    <w:nsid w:val="26C87214"/>
+    <w:nsid w:val="0C931354"/>
     <w:multiLevelType w:val="singleLevel"/>
     <w:tmpl w:val="04160001"/>
     <w:lvl w:ilvl="0">
@@ -24556,7 +25053,7 @@
     </w:lvl>
   </w:abstractNum>
   <w:abstractNum w:abstractNumId="6" w15:restartNumberingAfterBreak="0">
-    <w:nsid w:val="28DA5D65"/>
+    <w:nsid w:val="0FB66E6C"/>
     <w:multiLevelType w:val="singleLevel"/>
     <w:tmpl w:val="04160001"/>
     <w:lvl w:ilvl="0">
@@ -24573,7 +25070,7 @@
     </w:lvl>
   </w:abstractNum>
   <w:abstractNum w:abstractNumId="7" w15:restartNumberingAfterBreak="0">
-    <w:nsid w:val="30AE3C94"/>
+    <w:nsid w:val="12B6016F"/>
     <w:multiLevelType w:val="singleLevel"/>
     <w:tmpl w:val="04160001"/>
     <w:lvl w:ilvl="0">
@@ -24590,7 +25087,7 @@
     </w:lvl>
   </w:abstractNum>
   <w:abstractNum w:abstractNumId="8" w15:restartNumberingAfterBreak="0">
-    <w:nsid w:val="38571408"/>
+    <w:nsid w:val="16310F04"/>
     <w:multiLevelType w:val="singleLevel"/>
     <w:tmpl w:val="04160001"/>
     <w:lvl w:ilvl="0">
@@ -24607,7 +25104,7 @@
     </w:lvl>
   </w:abstractNum>
   <w:abstractNum w:abstractNumId="9" w15:restartNumberingAfterBreak="0">
-    <w:nsid w:val="3A602379"/>
+    <w:nsid w:val="1C436144"/>
     <w:multiLevelType w:val="singleLevel"/>
     <w:tmpl w:val="04160001"/>
     <w:lvl w:ilvl="0">
@@ -24624,7 +25121,7 @@
     </w:lvl>
   </w:abstractNum>
   <w:abstractNum w:abstractNumId="10" w15:restartNumberingAfterBreak="0">
-    <w:nsid w:val="3AC273E0"/>
+    <w:nsid w:val="25EA37A0"/>
     <w:multiLevelType w:val="singleLevel"/>
     <w:tmpl w:val="04160001"/>
     <w:lvl w:ilvl="0">
@@ -24641,7 +25138,7 @@
     </w:lvl>
   </w:abstractNum>
   <w:abstractNum w:abstractNumId="11" w15:restartNumberingAfterBreak="0">
-    <w:nsid w:val="3E7003A9"/>
+    <w:nsid w:val="2BB33176"/>
     <w:multiLevelType w:val="singleLevel"/>
     <w:tmpl w:val="04160001"/>
     <w:lvl w:ilvl="0">
@@ -24658,7 +25155,7 @@
     </w:lvl>
   </w:abstractNum>
   <w:abstractNum w:abstractNumId="12" w15:restartNumberingAfterBreak="0">
-    <w:nsid w:val="402F1510"/>
+    <w:nsid w:val="30C24068"/>
     <w:multiLevelType w:val="singleLevel"/>
     <w:tmpl w:val="04160001"/>
     <w:lvl w:ilvl="0">
@@ -24675,7 +25172,7 @@
     </w:lvl>
   </w:abstractNum>
   <w:abstractNum w:abstractNumId="13" w15:restartNumberingAfterBreak="0">
-    <w:nsid w:val="454E00F3"/>
+    <w:nsid w:val="32B036F6"/>
     <w:multiLevelType w:val="singleLevel"/>
     <w:tmpl w:val="04160001"/>
     <w:lvl w:ilvl="0">
@@ -24692,7 +25189,7 @@
     </w:lvl>
   </w:abstractNum>
   <w:abstractNum w:abstractNumId="14" w15:restartNumberingAfterBreak="0">
-    <w:nsid w:val="457258C7"/>
+    <w:nsid w:val="34E918C5"/>
     <w:multiLevelType w:val="singleLevel"/>
     <w:tmpl w:val="04160001"/>
     <w:lvl w:ilvl="0">
@@ -24709,7 +25206,7 @@
     </w:lvl>
   </w:abstractNum>
   <w:abstractNum w:abstractNumId="15" w15:restartNumberingAfterBreak="0">
-    <w:nsid w:val="4AC530D2"/>
+    <w:nsid w:val="3A4A7417"/>
     <w:multiLevelType w:val="singleLevel"/>
     <w:tmpl w:val="04160001"/>
     <w:lvl w:ilvl="0">
@@ -24726,7 +25223,7 @@
     </w:lvl>
   </w:abstractNum>
   <w:abstractNum w:abstractNumId="16" w15:restartNumberingAfterBreak="0">
-    <w:nsid w:val="4F0B2D9F"/>
+    <w:nsid w:val="3B6543D1"/>
     <w:multiLevelType w:val="singleLevel"/>
     <w:tmpl w:val="04160001"/>
     <w:lvl w:ilvl="0">
@@ -24743,7 +25240,7 @@
     </w:lvl>
   </w:abstractNum>
   <w:abstractNum w:abstractNumId="17" w15:restartNumberingAfterBreak="0">
-    <w:nsid w:val="54521622"/>
+    <w:nsid w:val="3B6C53A0"/>
     <w:multiLevelType w:val="singleLevel"/>
     <w:tmpl w:val="04160001"/>
     <w:lvl w:ilvl="0">
@@ -24760,7 +25257,7 @@
     </w:lvl>
   </w:abstractNum>
   <w:abstractNum w:abstractNumId="18" w15:restartNumberingAfterBreak="0">
-    <w:nsid w:val="54B313FF"/>
+    <w:nsid w:val="3B7D5C03"/>
     <w:multiLevelType w:val="singleLevel"/>
     <w:tmpl w:val="04160001"/>
     <w:lvl w:ilvl="0">
@@ -24777,7 +25274,7 @@
     </w:lvl>
   </w:abstractNum>
   <w:abstractNum w:abstractNumId="19" w15:restartNumberingAfterBreak="0">
-    <w:nsid w:val="550F78EC"/>
+    <w:nsid w:val="3BA31F31"/>
     <w:multiLevelType w:val="singleLevel"/>
     <w:tmpl w:val="04160001"/>
     <w:lvl w:ilvl="0">
@@ -24794,7 +25291,7 @@
     </w:lvl>
   </w:abstractNum>
   <w:abstractNum w:abstractNumId="20" w15:restartNumberingAfterBreak="0">
-    <w:nsid w:val="566C2874"/>
+    <w:nsid w:val="3BCD6C08"/>
     <w:multiLevelType w:val="singleLevel"/>
     <w:tmpl w:val="04160001"/>
     <w:lvl w:ilvl="0">
@@ -24811,7 +25308,7 @@
     </w:lvl>
   </w:abstractNum>
   <w:abstractNum w:abstractNumId="21" w15:restartNumberingAfterBreak="0">
-    <w:nsid w:val="58ED39F0"/>
+    <w:nsid w:val="48B45D47"/>
     <w:multiLevelType w:val="singleLevel"/>
     <w:tmpl w:val="04160001"/>
     <w:lvl w:ilvl="0">
@@ -24828,7 +25325,7 @@
     </w:lvl>
   </w:abstractNum>
   <w:abstractNum w:abstractNumId="22" w15:restartNumberingAfterBreak="0">
-    <w:nsid w:val="5F592E12"/>
+    <w:nsid w:val="494527EE"/>
     <w:multiLevelType w:val="singleLevel"/>
     <w:tmpl w:val="04160001"/>
     <w:lvl w:ilvl="0">
@@ -24845,7 +25342,7 @@
     </w:lvl>
   </w:abstractNum>
   <w:abstractNum w:abstractNumId="23" w15:restartNumberingAfterBreak="0">
-    <w:nsid w:val="62DE35E7"/>
+    <w:nsid w:val="4B1E774E"/>
     <w:multiLevelType w:val="singleLevel"/>
     <w:tmpl w:val="04160001"/>
     <w:lvl w:ilvl="0">
@@ -24862,7 +25359,7 @@
     </w:lvl>
   </w:abstractNum>
   <w:abstractNum w:abstractNumId="24" w15:restartNumberingAfterBreak="0">
-    <w:nsid w:val="64E3316B"/>
+    <w:nsid w:val="4EA2725B"/>
     <w:multiLevelType w:val="singleLevel"/>
     <w:tmpl w:val="04160001"/>
     <w:lvl w:ilvl="0">
@@ -24879,7 +25376,7 @@
     </w:lvl>
   </w:abstractNum>
   <w:abstractNum w:abstractNumId="25" w15:restartNumberingAfterBreak="0">
-    <w:nsid w:val="68490724"/>
+    <w:nsid w:val="4FC163AF"/>
     <w:multiLevelType w:val="singleLevel"/>
     <w:tmpl w:val="04160001"/>
     <w:lvl w:ilvl="0">
@@ -24896,7 +25393,7 @@
     </w:lvl>
   </w:abstractNum>
   <w:abstractNum w:abstractNumId="26" w15:restartNumberingAfterBreak="0">
-    <w:nsid w:val="6A311B5B"/>
+    <w:nsid w:val="56B80795"/>
     <w:multiLevelType w:val="singleLevel"/>
     <w:tmpl w:val="04160001"/>
     <w:lvl w:ilvl="0">
@@ -24913,7 +25410,7 @@
     </w:lvl>
   </w:abstractNum>
   <w:abstractNum w:abstractNumId="27" w15:restartNumberingAfterBreak="0">
-    <w:nsid w:val="6D036B3D"/>
+    <w:nsid w:val="5962563F"/>
     <w:multiLevelType w:val="singleLevel"/>
     <w:tmpl w:val="04160001"/>
     <w:lvl w:ilvl="0">
@@ -24930,7 +25427,7 @@
     </w:lvl>
   </w:abstractNum>
   <w:abstractNum w:abstractNumId="28" w15:restartNumberingAfterBreak="0">
-    <w:nsid w:val="6E7F428A"/>
+    <w:nsid w:val="5E3D0CAC"/>
     <w:multiLevelType w:val="singleLevel"/>
     <w:tmpl w:val="04160001"/>
     <w:lvl w:ilvl="0">
@@ -24947,7 +25444,7 @@
     </w:lvl>
   </w:abstractNum>
   <w:abstractNum w:abstractNumId="29" w15:restartNumberingAfterBreak="0">
-    <w:nsid w:val="6F061AC1"/>
+    <w:nsid w:val="5E5A75BD"/>
     <w:multiLevelType w:val="singleLevel"/>
     <w:tmpl w:val="04160001"/>
     <w:lvl w:ilvl="0">
@@ -24964,7 +25461,7 @@
     </w:lvl>
   </w:abstractNum>
   <w:abstractNum w:abstractNumId="30" w15:restartNumberingAfterBreak="0">
-    <w:nsid w:val="72E340A3"/>
+    <w:nsid w:val="62AD5D65"/>
     <w:multiLevelType w:val="singleLevel"/>
     <w:tmpl w:val="04160001"/>
     <w:lvl w:ilvl="0">
@@ -24981,7 +25478,7 @@
     </w:lvl>
   </w:abstractNum>
   <w:abstractNum w:abstractNumId="31" w15:restartNumberingAfterBreak="0">
-    <w:nsid w:val="75517198"/>
+    <w:nsid w:val="670C0C03"/>
     <w:multiLevelType w:val="singleLevel"/>
     <w:tmpl w:val="04160001"/>
     <w:lvl w:ilvl="0">
@@ -24998,7 +25495,7 @@
     </w:lvl>
   </w:abstractNum>
   <w:abstractNum w:abstractNumId="32" w15:restartNumberingAfterBreak="0">
-    <w:nsid w:val="758A7C02"/>
+    <w:nsid w:val="67D40986"/>
     <w:multiLevelType w:val="singleLevel"/>
     <w:tmpl w:val="04160001"/>
     <w:lvl w:ilvl="0">
@@ -25015,7 +25512,7 @@
     </w:lvl>
   </w:abstractNum>
   <w:abstractNum w:abstractNumId="33" w15:restartNumberingAfterBreak="0">
-    <w:nsid w:val="76CF36CE"/>
+    <w:nsid w:val="6968014D"/>
     <w:multiLevelType w:val="singleLevel"/>
     <w:tmpl w:val="04160001"/>
     <w:lvl w:ilvl="0">
@@ -25032,7 +25529,7 @@
     </w:lvl>
   </w:abstractNum>
   <w:abstractNum w:abstractNumId="34" w15:restartNumberingAfterBreak="0">
-    <w:nsid w:val="78093348"/>
+    <w:nsid w:val="6C6B1913"/>
     <w:multiLevelType w:val="singleLevel"/>
     <w:tmpl w:val="04160001"/>
     <w:lvl w:ilvl="0">
@@ -25049,7 +25546,7 @@
     </w:lvl>
   </w:abstractNum>
   <w:abstractNum w:abstractNumId="35" w15:restartNumberingAfterBreak="0">
-    <w:nsid w:val="7DAC7249"/>
+    <w:nsid w:val="6CD5053B"/>
     <w:multiLevelType w:val="singleLevel"/>
     <w:tmpl w:val="04160001"/>
     <w:lvl w:ilvl="0">
@@ -25066,7 +25563,7 @@
     </w:lvl>
   </w:abstractNum>
   <w:abstractNum w:abstractNumId="36" w15:restartNumberingAfterBreak="0">
-    <w:nsid w:val="7DC544B7"/>
+    <w:nsid w:val="6D0E051C"/>
     <w:multiLevelType w:val="singleLevel"/>
     <w:tmpl w:val="04160001"/>
     <w:lvl w:ilvl="0">
@@ -25082,116 +25579,156 @@
       </w:rPr>
     </w:lvl>
   </w:abstractNum>
-  <w:num w:numId="1" w16cid:durableId="1040469803">
+  <w:abstractNum w:abstractNumId="37" w15:restartNumberingAfterBreak="0">
+    <w:nsid w:val="72880D2A"/>
+    <w:multiLevelType w:val="singleLevel"/>
+    <w:tmpl w:val="04160001"/>
+    <w:lvl w:ilvl="0">
+      <w:start w:val="1"/>
+      <w:numFmt w:val="bullet"/>
+      <w:lvlText w:val=""/>
+      <w:lvlJc w:val="left"/>
+      <w:pPr>
+        <w:ind w:left="720" w:hanging="360"/>
+      </w:pPr>
+      <w:rPr>
+        <w:rFonts w:ascii="Symbol" w:hAnsi="Symbol" w:hint="default"/>
+      </w:rPr>
+    </w:lvl>
+  </w:abstractNum>
+  <w:abstractNum w:abstractNumId="38" w15:restartNumberingAfterBreak="0">
+    <w:nsid w:val="78C566A4"/>
+    <w:multiLevelType w:val="singleLevel"/>
+    <w:tmpl w:val="04160001"/>
+    <w:lvl w:ilvl="0">
+      <w:start w:val="1"/>
+      <w:numFmt w:val="bullet"/>
+      <w:lvlText w:val=""/>
+      <w:lvlJc w:val="left"/>
+      <w:pPr>
+        <w:ind w:left="720" w:hanging="360"/>
+      </w:pPr>
+      <w:rPr>
+        <w:rFonts w:ascii="Symbol" w:hAnsi="Symbol" w:hint="default"/>
+      </w:rPr>
+    </w:lvl>
+  </w:abstractNum>
+  <w:num w:numId="1" w16cid:durableId="711686651">
+    <w:abstractNumId w:val="37"/>
+  </w:num>
+  <w:num w:numId="2" w16cid:durableId="2041083552">
+    <w:abstractNumId w:val="16"/>
+  </w:num>
+  <w:num w:numId="3" w16cid:durableId="1352074263">
+    <w:abstractNumId w:val="9"/>
+  </w:num>
+  <w:num w:numId="4" w16cid:durableId="5982030">
+    <w:abstractNumId w:val="21"/>
+  </w:num>
+  <w:num w:numId="5" w16cid:durableId="125903420">
+    <w:abstractNumId w:val="4"/>
+  </w:num>
+  <w:num w:numId="6" w16cid:durableId="259526275">
+    <w:abstractNumId w:val="30"/>
+  </w:num>
+  <w:num w:numId="7" w16cid:durableId="1485318931">
+    <w:abstractNumId w:val="19"/>
+  </w:num>
+  <w:num w:numId="8" w16cid:durableId="1746881859">
+    <w:abstractNumId w:val="24"/>
+  </w:num>
+  <w:num w:numId="9" w16cid:durableId="1479104026">
+    <w:abstractNumId w:val="36"/>
+  </w:num>
+  <w:num w:numId="10" w16cid:durableId="1102339616">
+    <w:abstractNumId w:val="20"/>
+  </w:num>
+  <w:num w:numId="11" w16cid:durableId="1345327585">
+    <w:abstractNumId w:val="3"/>
+  </w:num>
+  <w:num w:numId="12" w16cid:durableId="112067728">
+    <w:abstractNumId w:val="17"/>
+  </w:num>
+  <w:num w:numId="13" w16cid:durableId="1212228275">
+    <w:abstractNumId w:val="38"/>
+  </w:num>
+  <w:num w:numId="14" w16cid:durableId="2117289895">
+    <w:abstractNumId w:val="8"/>
+  </w:num>
+  <w:num w:numId="15" w16cid:durableId="387463166">
+    <w:abstractNumId w:val="26"/>
+  </w:num>
+  <w:num w:numId="16" w16cid:durableId="1905527168">
+    <w:abstractNumId w:val="13"/>
+  </w:num>
+  <w:num w:numId="17" w16cid:durableId="622150997">
+    <w:abstractNumId w:val="1"/>
+  </w:num>
+  <w:num w:numId="18" w16cid:durableId="405150976">
+    <w:abstractNumId w:val="14"/>
+  </w:num>
+  <w:num w:numId="19" w16cid:durableId="1855654327">
+    <w:abstractNumId w:val="34"/>
+  </w:num>
+  <w:num w:numId="20" w16cid:durableId="1963226605">
+    <w:abstractNumId w:val="27"/>
+  </w:num>
+  <w:num w:numId="21" w16cid:durableId="1627661533">
+    <w:abstractNumId w:val="33"/>
+  </w:num>
+  <w:num w:numId="22" w16cid:durableId="344212748">
+    <w:abstractNumId w:val="6"/>
+  </w:num>
+  <w:num w:numId="23" w16cid:durableId="1976374632">
+    <w:abstractNumId w:val="31"/>
+  </w:num>
+  <w:num w:numId="24" w16cid:durableId="1356036194">
+    <w:abstractNumId w:val="10"/>
+  </w:num>
+  <w:num w:numId="25" w16cid:durableId="2092577465">
+    <w:abstractNumId w:val="7"/>
+  </w:num>
+  <w:num w:numId="26" w16cid:durableId="1620720077">
+    <w:abstractNumId w:val="11"/>
+  </w:num>
+  <w:num w:numId="27" w16cid:durableId="100996286">
     <w:abstractNumId w:val="32"/>
   </w:num>
-  <w:num w:numId="2" w16cid:durableId="1876111962">
-    <w:abstractNumId w:val="19"/>
+  <w:num w:numId="28" w16cid:durableId="1686204255">
+    <w:abstractNumId w:val="29"/>
   </w:num>
-  <w:num w:numId="3" w16cid:durableId="1420131733">
-    <w:abstractNumId w:val="4"/>
+  <w:num w:numId="29" w16cid:durableId="1573806214">
+    <w:abstractNumId w:val="22"/>
   </w:num>
-  <w:num w:numId="4" w16cid:durableId="502165346">
-    <w:abstractNumId w:val="13"/>
+  <w:num w:numId="30" w16cid:durableId="769666389">
+    <w:abstractNumId w:val="23"/>
   </w:num>
-  <w:num w:numId="5" w16cid:durableId="527329655">
-    <w:abstractNumId w:val="21"/>
+  <w:num w:numId="31" w16cid:durableId="1785494921">
+    <w:abstractNumId w:val="25"/>
   </w:num>
-  <w:num w:numId="6" w16cid:durableId="261425285">
+  <w:num w:numId="32" w16cid:durableId="2121680521">
+    <w:abstractNumId w:val="15"/>
+  </w:num>
+  <w:num w:numId="33" w16cid:durableId="1442335172">
+    <w:abstractNumId w:val="12"/>
+  </w:num>
+  <w:num w:numId="34" w16cid:durableId="342897079">
+    <w:abstractNumId w:val="0"/>
+  </w:num>
+  <w:num w:numId="35" w16cid:durableId="182282890">
     <w:abstractNumId w:val="2"/>
   </w:num>
-  <w:num w:numId="7" w16cid:durableId="1292251328">
-    <w:abstractNumId w:val="26"/>
+  <w:num w:numId="36" w16cid:durableId="859195850">
+    <w:abstractNumId w:val="5"/>
   </w:num>
-  <w:num w:numId="8" w16cid:durableId="485586300">
+  <w:num w:numId="37" w16cid:durableId="2089617540">
+    <w:abstractNumId w:val="28"/>
+  </w:num>
+  <w:num w:numId="38" w16cid:durableId="141773499">
     <w:abstractNumId w:val="18"/>
   </w:num>
-  <w:num w:numId="9" w16cid:durableId="324626762">
-    <w:abstractNumId w:val="34"/>
-  </w:num>
-  <w:num w:numId="10" w16cid:durableId="1295259934">
-    <w:abstractNumId w:val="20"/>
-  </w:num>
-  <w:num w:numId="11" w16cid:durableId="1457025397">
-    <w:abstractNumId w:val="31"/>
-  </w:num>
-  <w:num w:numId="12" w16cid:durableId="852261697">
-    <w:abstractNumId w:val="9"/>
-  </w:num>
-  <w:num w:numId="13" w16cid:durableId="1638023557">
-    <w:abstractNumId w:val="15"/>
-  </w:num>
-  <w:num w:numId="14" w16cid:durableId="1263490926">
-    <w:abstractNumId w:val="16"/>
-  </w:num>
-  <w:num w:numId="15" w16cid:durableId="79178746">
-    <w:abstractNumId w:val="23"/>
-  </w:num>
-  <w:num w:numId="16" w16cid:durableId="1746762835">
-    <w:abstractNumId w:val="12"/>
-  </w:num>
-  <w:num w:numId="17" w16cid:durableId="106854114">
-    <w:abstractNumId w:val="36"/>
-  </w:num>
-  <w:num w:numId="18" w16cid:durableId="800879633">
-    <w:abstractNumId w:val="0"/>
-  </w:num>
-  <w:num w:numId="19" w16cid:durableId="1301574745">
-    <w:abstractNumId w:val="17"/>
-  </w:num>
-  <w:num w:numId="20" w16cid:durableId="1014110779">
-    <w:abstractNumId w:val="28"/>
-  </w:num>
-  <w:num w:numId="21" w16cid:durableId="1482115766">
-    <w:abstractNumId w:val="33"/>
-  </w:num>
-  <w:num w:numId="22" w16cid:durableId="48917669">
-    <w:abstractNumId w:val="8"/>
-  </w:num>
-  <w:num w:numId="23" w16cid:durableId="1753502985">
-    <w:abstractNumId w:val="1"/>
-  </w:num>
-  <w:num w:numId="24" w16cid:durableId="1777284167">
-    <w:abstractNumId w:val="11"/>
-  </w:num>
-  <w:num w:numId="25" w16cid:durableId="743337903">
-    <w:abstractNumId w:val="24"/>
-  </w:num>
-  <w:num w:numId="26" w16cid:durableId="918951635">
-    <w:abstractNumId w:val="22"/>
-  </w:num>
-  <w:num w:numId="27" w16cid:durableId="2081782379">
-    <w:abstractNumId w:val="7"/>
-  </w:num>
-  <w:num w:numId="28" w16cid:durableId="707532813">
-    <w:abstractNumId w:val="27"/>
-  </w:num>
-  <w:num w:numId="29" w16cid:durableId="2079356558">
-    <w:abstractNumId w:val="25"/>
-  </w:num>
-  <w:num w:numId="30" w16cid:durableId="1618027034">
+  <w:num w:numId="39" w16cid:durableId="1101490565">
     <w:abstractNumId w:val="35"/>
-  </w:num>
-  <w:num w:numId="31" w16cid:durableId="1078406499">
-    <w:abstractNumId w:val="29"/>
-  </w:num>
-  <w:num w:numId="32" w16cid:durableId="690453739">
-    <w:abstractNumId w:val="3"/>
-  </w:num>
-  <w:num w:numId="33" w16cid:durableId="686322686">
-    <w:abstractNumId w:val="5"/>
-  </w:num>
-  <w:num w:numId="34" w16cid:durableId="585651261">
-    <w:abstractNumId w:val="30"/>
-  </w:num>
-  <w:num w:numId="35" w16cid:durableId="748233303">
-    <w:abstractNumId w:val="6"/>
-  </w:num>
-  <w:num w:numId="36" w16cid:durableId="1139153546">
-    <w:abstractNumId w:val="14"/>
-  </w:num>
-  <w:num w:numId="37" w16cid:durableId="1680235757">
-    <w:abstractNumId w:val="10"/>
   </w:num>
 </w:numbering>
 </file>
@@ -25604,7 +26141,7 @@
     <w:link w:val="Ttulo1Char"/>
     <w:uiPriority w:val="9"/>
     <w:qFormat/>
-    <w:rsid w:val="00770A35"/>
+    <w:rsid w:val="004334E4"/>
     <w:pPr>
       <w:keepNext/>
       <w:keepLines/>
@@ -25626,7 +26163,7 @@
     <w:uiPriority w:val="9"/>
     <w:unhideWhenUsed/>
     <w:qFormat/>
-    <w:rsid w:val="00770A35"/>
+    <w:rsid w:val="004334E4"/>
     <w:pPr>
       <w:keepNext/>
       <w:keepLines/>
@@ -25649,7 +26186,7 @@
     <w:semiHidden/>
     <w:unhideWhenUsed/>
     <w:qFormat/>
-    <w:rsid w:val="00770A35"/>
+    <w:rsid w:val="004334E4"/>
     <w:pPr>
       <w:keepNext/>
       <w:keepLines/>
@@ -25672,7 +26209,7 @@
     <w:semiHidden/>
     <w:unhideWhenUsed/>
     <w:qFormat/>
-    <w:rsid w:val="00770A35"/>
+    <w:rsid w:val="004334E4"/>
     <w:pPr>
       <w:keepNext/>
       <w:keepLines/>
@@ -25695,7 +26232,7 @@
     <w:semiHidden/>
     <w:unhideWhenUsed/>
     <w:qFormat/>
-    <w:rsid w:val="00770A35"/>
+    <w:rsid w:val="004334E4"/>
     <w:pPr>
       <w:keepNext/>
       <w:keepLines/>
@@ -25716,7 +26253,7 @@
     <w:semiHidden/>
     <w:unhideWhenUsed/>
     <w:qFormat/>
-    <w:rsid w:val="00770A35"/>
+    <w:rsid w:val="004334E4"/>
     <w:pPr>
       <w:keepNext/>
       <w:keepLines/>
@@ -25739,7 +26276,7 @@
     <w:semiHidden/>
     <w:unhideWhenUsed/>
     <w:qFormat/>
-    <w:rsid w:val="00770A35"/>
+    <w:rsid w:val="004334E4"/>
     <w:pPr>
       <w:keepNext/>
       <w:keepLines/>
@@ -25760,7 +26297,7 @@
     <w:semiHidden/>
     <w:unhideWhenUsed/>
     <w:qFormat/>
-    <w:rsid w:val="00770A35"/>
+    <w:rsid w:val="004334E4"/>
     <w:pPr>
       <w:keepNext/>
       <w:keepLines/>
@@ -25783,7 +26320,7 @@
     <w:semiHidden/>
     <w:unhideWhenUsed/>
     <w:qFormat/>
-    <w:rsid w:val="00770A35"/>
+    <w:rsid w:val="004334E4"/>
     <w:pPr>
       <w:keepNext/>
       <w:keepLines/>
@@ -25827,7 +26364,7 @@
     <w:basedOn w:val="Fontepargpadro"/>
     <w:link w:val="Ttulo1"/>
     <w:uiPriority w:val="9"/>
-    <w:rsid w:val="00770A35"/>
+    <w:rsid w:val="004334E4"/>
     <w:rPr>
       <w:rFonts w:asciiTheme="majorHAnsi" w:eastAsiaTheme="majorEastAsia" w:hAnsiTheme="majorHAnsi" w:cstheme="majorBidi"/>
       <w:color w:val="0F4761" w:themeColor="accent1" w:themeShade="BF"/>
@@ -25840,7 +26377,7 @@
     <w:basedOn w:val="Fontepargpadro"/>
     <w:link w:val="Ttulo2"/>
     <w:uiPriority w:val="9"/>
-    <w:rsid w:val="00770A35"/>
+    <w:rsid w:val="004334E4"/>
     <w:rPr>
       <w:rFonts w:asciiTheme="majorHAnsi" w:eastAsiaTheme="majorEastAsia" w:hAnsiTheme="majorHAnsi" w:cstheme="majorBidi"/>
       <w:color w:val="0F4761" w:themeColor="accent1" w:themeShade="BF"/>
@@ -25854,7 +26391,7 @@
     <w:link w:val="Ttulo3"/>
     <w:uiPriority w:val="9"/>
     <w:semiHidden/>
-    <w:rsid w:val="00770A35"/>
+    <w:rsid w:val="004334E4"/>
     <w:rPr>
       <w:rFonts w:eastAsiaTheme="majorEastAsia" w:cstheme="majorBidi"/>
       <w:color w:val="0F4761" w:themeColor="accent1" w:themeShade="BF"/>
@@ -25868,7 +26405,7 @@
     <w:link w:val="Ttulo4"/>
     <w:uiPriority w:val="9"/>
     <w:semiHidden/>
-    <w:rsid w:val="00770A35"/>
+    <w:rsid w:val="004334E4"/>
     <w:rPr>
       <w:rFonts w:eastAsiaTheme="majorEastAsia" w:cstheme="majorBidi"/>
       <w:i/>
@@ -25882,7 +26419,7 @@
     <w:link w:val="Ttulo5"/>
     <w:uiPriority w:val="9"/>
     <w:semiHidden/>
-    <w:rsid w:val="00770A35"/>
+    <w:rsid w:val="004334E4"/>
     <w:rPr>
       <w:rFonts w:eastAsiaTheme="majorEastAsia" w:cstheme="majorBidi"/>
       <w:color w:val="0F4761" w:themeColor="accent1" w:themeShade="BF"/>
@@ -25894,7 +26431,7 @@
     <w:link w:val="Ttulo6"/>
     <w:uiPriority w:val="9"/>
     <w:semiHidden/>
-    <w:rsid w:val="00770A35"/>
+    <w:rsid w:val="004334E4"/>
     <w:rPr>
       <w:rFonts w:eastAsiaTheme="majorEastAsia" w:cstheme="majorBidi"/>
       <w:i/>
@@ -25908,7 +26445,7 @@
     <w:link w:val="Ttulo7"/>
     <w:uiPriority w:val="9"/>
     <w:semiHidden/>
-    <w:rsid w:val="00770A35"/>
+    <w:rsid w:val="004334E4"/>
     <w:rPr>
       <w:rFonts w:eastAsiaTheme="majorEastAsia" w:cstheme="majorBidi"/>
       <w:color w:val="595959" w:themeColor="text1" w:themeTint="A6"/>
@@ -25920,7 +26457,7 @@
     <w:link w:val="Ttulo8"/>
     <w:uiPriority w:val="9"/>
     <w:semiHidden/>
-    <w:rsid w:val="00770A35"/>
+    <w:rsid w:val="004334E4"/>
     <w:rPr>
       <w:rFonts w:eastAsiaTheme="majorEastAsia" w:cstheme="majorBidi"/>
       <w:i/>
@@ -25934,7 +26471,7 @@
     <w:link w:val="Ttulo9"/>
     <w:uiPriority w:val="9"/>
     <w:semiHidden/>
-    <w:rsid w:val="00770A35"/>
+    <w:rsid w:val="004334E4"/>
     <w:rPr>
       <w:rFonts w:eastAsiaTheme="majorEastAsia" w:cstheme="majorBidi"/>
       <w:color w:val="272727" w:themeColor="text1" w:themeTint="D8"/>
@@ -25947,7 +26484,7 @@
     <w:link w:val="TtuloChar"/>
     <w:uiPriority w:val="10"/>
     <w:qFormat/>
-    <w:rsid w:val="00770A35"/>
+    <w:rsid w:val="004334E4"/>
     <w:pPr>
       <w:spacing w:after="80" w:line="240" w:lineRule="auto"/>
       <w:contextualSpacing/>
@@ -25965,7 +26502,7 @@
     <w:basedOn w:val="Fontepargpadro"/>
     <w:link w:val="Ttulo"/>
     <w:uiPriority w:val="10"/>
-    <w:rsid w:val="00770A35"/>
+    <w:rsid w:val="004334E4"/>
     <w:rPr>
       <w:rFonts w:asciiTheme="majorHAnsi" w:eastAsiaTheme="majorEastAsia" w:hAnsiTheme="majorHAnsi" w:cstheme="majorBidi"/>
       <w:spacing w:val="-10"/>
@@ -25981,7 +26518,7 @@
     <w:link w:val="SubttuloChar"/>
     <w:uiPriority w:val="11"/>
     <w:qFormat/>
-    <w:rsid w:val="00770A35"/>
+    <w:rsid w:val="004334E4"/>
     <w:pPr>
       <w:numPr>
         <w:ilvl w:val="1"/>
@@ -26000,7 +26537,7 @@
     <w:basedOn w:val="Fontepargpadro"/>
     <w:link w:val="Subttulo"/>
     <w:uiPriority w:val="11"/>
-    <w:rsid w:val="00770A35"/>
+    <w:rsid w:val="004334E4"/>
     <w:rPr>
       <w:rFonts w:eastAsiaTheme="majorEastAsia" w:cstheme="majorBidi"/>
       <w:color w:val="595959" w:themeColor="text1" w:themeTint="A6"/>
@@ -26016,7 +26553,7 @@
     <w:link w:val="CitaoChar"/>
     <w:uiPriority w:val="29"/>
     <w:qFormat/>
-    <w:rsid w:val="00770A35"/>
+    <w:rsid w:val="004334E4"/>
     <w:pPr>
       <w:spacing w:before="160"/>
       <w:jc w:val="center"/>
@@ -26032,7 +26569,7 @@
     <w:basedOn w:val="Fontepargpadro"/>
     <w:link w:val="Citao"/>
     <w:uiPriority w:val="29"/>
-    <w:rsid w:val="00770A35"/>
+    <w:rsid w:val="004334E4"/>
     <w:rPr>
       <w:i/>
       <w:iCs/>
@@ -26044,7 +26581,7 @@
     <w:basedOn w:val="Normal"/>
     <w:uiPriority w:val="34"/>
     <w:qFormat/>
-    <w:rsid w:val="00770A35"/>
+    <w:rsid w:val="004334E4"/>
     <w:pPr>
       <w:ind w:left="720"/>
       <w:contextualSpacing/>
@@ -26055,7 +26592,7 @@
     <w:basedOn w:val="Fontepargpadro"/>
     <w:uiPriority w:val="21"/>
     <w:qFormat/>
-    <w:rsid w:val="00770A35"/>
+    <w:rsid w:val="004334E4"/>
     <w:rPr>
       <w:i/>
       <w:iCs/>
@@ -26069,7 +26606,7 @@
     <w:link w:val="CitaoIntensaChar"/>
     <w:uiPriority w:val="30"/>
     <w:qFormat/>
-    <w:rsid w:val="00770A35"/>
+    <w:rsid w:val="004334E4"/>
     <w:pPr>
       <w:pBdr>
         <w:top w:val="single" w:sz="4" w:space="10" w:color="0F4761" w:themeColor="accent1" w:themeShade="BF"/>
@@ -26090,7 +26627,7 @@
     <w:basedOn w:val="Fontepargpadro"/>
     <w:link w:val="CitaoIntensa"/>
     <w:uiPriority w:val="30"/>
-    <w:rsid w:val="00770A35"/>
+    <w:rsid w:val="004334E4"/>
     <w:rPr>
       <w:i/>
       <w:iCs/>
@@ -26102,7 +26639,7 @@
     <w:basedOn w:val="Fontepargpadro"/>
     <w:uiPriority w:val="32"/>
     <w:qFormat/>
-    <w:rsid w:val="00770A35"/>
+    <w:rsid w:val="004334E4"/>
     <w:rPr>
       <w:b/>
       <w:bCs/>
@@ -26117,7 +26654,7 @@
     <w:link w:val="CabealhoChar"/>
     <w:uiPriority w:val="99"/>
     <w:unhideWhenUsed/>
-    <w:rsid w:val="00770A35"/>
+    <w:rsid w:val="004334E4"/>
     <w:pPr>
       <w:tabs>
         <w:tab w:val="center" w:pos="4252"/>
@@ -26131,7 +26668,7 @@
     <w:basedOn w:val="Fontepargpadro"/>
     <w:link w:val="Cabealho"/>
     <w:uiPriority w:val="99"/>
-    <w:rsid w:val="00770A35"/>
+    <w:rsid w:val="004334E4"/>
   </w:style>
   <w:style w:type="paragraph" w:styleId="Rodap">
     <w:name w:val="footer"/>
@@ -26139,7 +26676,7 @@
     <w:link w:val="RodapChar"/>
     <w:uiPriority w:val="99"/>
     <w:unhideWhenUsed/>
-    <w:rsid w:val="00770A35"/>
+    <w:rsid w:val="004334E4"/>
     <w:pPr>
       <w:tabs>
         <w:tab w:val="center" w:pos="4252"/>
@@ -26153,7 +26690,7 @@
     <w:basedOn w:val="Fontepargpadro"/>
     <w:link w:val="Rodap"/>
     <w:uiPriority w:val="99"/>
-    <w:rsid w:val="00770A35"/>
+    <w:rsid w:val="004334E4"/>
   </w:style>
   <w:style w:type="paragraph" w:styleId="Sumrio1">
     <w:name w:val="toc 1"/>
@@ -26162,7 +26699,7 @@
     <w:autoRedefine/>
     <w:uiPriority w:val="39"/>
     <w:unhideWhenUsed/>
-    <w:rsid w:val="00770A35"/>
+    <w:rsid w:val="004334E4"/>
     <w:pPr>
       <w:spacing w:after="100"/>
     </w:pPr>
@@ -26174,7 +26711,7 @@
     <w:autoRedefine/>
     <w:uiPriority w:val="39"/>
     <w:unhideWhenUsed/>
-    <w:rsid w:val="00770A35"/>
+    <w:rsid w:val="004334E4"/>
     <w:pPr>
       <w:spacing w:after="100"/>
       <w:ind w:left="240"/>

</xml_diff>

<commit_message>
Cria conta de usuário na hora, sem esperar o primeiro login
Sincroniza com produção: "+ Adicionar usuário" agora cria a conta de
verdade na hora (Edge Function criar-usuario-admin, já implantada
neste ambiente de treino), em vez de só um pré-cadastro pendente.

Co-Authored-By: Claude Sonnet 5 <noreply@anthropic.com>
</commit_message>
<xml_diff>
--- a/Manual de Uso - Ferramenta de Gestao de Projetos.docx
+++ b/Manual de Uso - Ferramenta de Gestao de Projetos.docx
@@ -229,7 +229,7 @@
         <w:rPr>
           <w:noProof/>
         </w:rPr>
-        <w:instrText xml:space="preserve"> PAGEREF _Toc240373111 \h </w:instrText>
+        <w:instrText xml:space="preserve"> PAGEREF _Toc240376161 \h </w:instrText>
       </w:r>
       <w:r>
         <w:rPr>
@@ -290,7 +290,7 @@
         <w:rPr>
           <w:noProof/>
         </w:rPr>
-        <w:instrText xml:space="preserve"> PAGEREF _Toc240373112 \h </w:instrText>
+        <w:instrText xml:space="preserve"> PAGEREF _Toc240376162 \h </w:instrText>
       </w:r>
       <w:r>
         <w:rPr>
@@ -351,7 +351,7 @@
         <w:rPr>
           <w:noProof/>
         </w:rPr>
-        <w:instrText xml:space="preserve"> PAGEREF _Toc240373113 \h </w:instrText>
+        <w:instrText xml:space="preserve"> PAGEREF _Toc240376163 \h </w:instrText>
       </w:r>
       <w:r>
         <w:rPr>
@@ -412,7 +412,7 @@
         <w:rPr>
           <w:noProof/>
         </w:rPr>
-        <w:instrText xml:space="preserve"> PAGEREF _Toc240373114 \h </w:instrText>
+        <w:instrText xml:space="preserve"> PAGEREF _Toc240376164 \h </w:instrText>
       </w:r>
       <w:r>
         <w:rPr>
@@ -429,7 +429,7 @@
         <w:rPr>
           <w:noProof/>
         </w:rPr>
-        <w:t>21</w:t>
+        <w:t>22</w:t>
       </w:r>
       <w:r>
         <w:rPr>
@@ -473,7 +473,7 @@
         <w:rPr>
           <w:noProof/>
         </w:rPr>
-        <w:instrText xml:space="preserve"> PAGEREF _Toc240373115 \h </w:instrText>
+        <w:instrText xml:space="preserve"> PAGEREF _Toc240376165 \h </w:instrText>
       </w:r>
       <w:r>
         <w:rPr>
@@ -490,7 +490,7 @@
         <w:rPr>
           <w:noProof/>
         </w:rPr>
-        <w:t>22</w:t>
+        <w:t>23</w:t>
       </w:r>
       <w:r>
         <w:rPr>
@@ -534,7 +534,7 @@
         <w:rPr>
           <w:noProof/>
         </w:rPr>
-        <w:instrText xml:space="preserve"> PAGEREF _Toc240373116 \h </w:instrText>
+        <w:instrText xml:space="preserve"> PAGEREF _Toc240376166 \h </w:instrText>
       </w:r>
       <w:r>
         <w:rPr>
@@ -595,7 +595,7 @@
         <w:rPr>
           <w:noProof/>
         </w:rPr>
-        <w:instrText xml:space="preserve"> PAGEREF _Toc240373117 \h </w:instrText>
+        <w:instrText xml:space="preserve"> PAGEREF _Toc240376167 \h </w:instrText>
       </w:r>
       <w:r>
         <w:rPr>
@@ -656,7 +656,7 @@
         <w:rPr>
           <w:noProof/>
         </w:rPr>
-        <w:instrText xml:space="preserve"> PAGEREF _Toc240373118 \h </w:instrText>
+        <w:instrText xml:space="preserve"> PAGEREF _Toc240376168 \h </w:instrText>
       </w:r>
       <w:r>
         <w:rPr>
@@ -717,7 +717,7 @@
         <w:rPr>
           <w:noProof/>
         </w:rPr>
-        <w:instrText xml:space="preserve"> PAGEREF _Toc240373119 \h </w:instrText>
+        <w:instrText xml:space="preserve"> PAGEREF _Toc240376169 \h </w:instrText>
       </w:r>
       <w:r>
         <w:rPr>
@@ -778,7 +778,7 @@
         <w:rPr>
           <w:noProof/>
         </w:rPr>
-        <w:instrText xml:space="preserve"> PAGEREF _Toc240373120 \h </w:instrText>
+        <w:instrText xml:space="preserve"> PAGEREF _Toc240376170 \h </w:instrText>
       </w:r>
       <w:r>
         <w:rPr>
@@ -839,7 +839,7 @@
         <w:rPr>
           <w:noProof/>
         </w:rPr>
-        <w:instrText xml:space="preserve"> PAGEREF _Toc240373121 \h </w:instrText>
+        <w:instrText xml:space="preserve"> PAGEREF _Toc240376171 \h </w:instrText>
       </w:r>
       <w:r>
         <w:rPr>
@@ -900,7 +900,7 @@
         <w:rPr>
           <w:noProof/>
         </w:rPr>
-        <w:instrText xml:space="preserve"> PAGEREF _Toc240373122 \h </w:instrText>
+        <w:instrText xml:space="preserve"> PAGEREF _Toc240376172 \h </w:instrText>
       </w:r>
       <w:r>
         <w:rPr>
@@ -961,7 +961,7 @@
         <w:rPr>
           <w:noProof/>
         </w:rPr>
-        <w:instrText xml:space="preserve"> PAGEREF _Toc240373123 \h </w:instrText>
+        <w:instrText xml:space="preserve"> PAGEREF _Toc240376173 \h </w:instrText>
       </w:r>
       <w:r>
         <w:rPr>
@@ -1022,7 +1022,7 @@
         <w:rPr>
           <w:noProof/>
         </w:rPr>
-        <w:instrText xml:space="preserve"> PAGEREF _Toc240373124 \h </w:instrText>
+        <w:instrText xml:space="preserve"> PAGEREF _Toc240376174 \h </w:instrText>
       </w:r>
       <w:r>
         <w:rPr>
@@ -1083,7 +1083,7 @@
         <w:rPr>
           <w:noProof/>
         </w:rPr>
-        <w:instrText xml:space="preserve"> PAGEREF _Toc240373125 \h </w:instrText>
+        <w:instrText xml:space="preserve"> PAGEREF _Toc240376175 \h </w:instrText>
       </w:r>
       <w:r>
         <w:rPr>
@@ -1144,7 +1144,7 @@
         <w:rPr>
           <w:noProof/>
         </w:rPr>
-        <w:instrText xml:space="preserve"> PAGEREF _Toc240373126 \h </w:instrText>
+        <w:instrText xml:space="preserve"> PAGEREF _Toc240376176 \h </w:instrText>
       </w:r>
       <w:r>
         <w:rPr>
@@ -1205,7 +1205,7 @@
         <w:rPr>
           <w:noProof/>
         </w:rPr>
-        <w:instrText xml:space="preserve"> PAGEREF _Toc240373127 \h </w:instrText>
+        <w:instrText xml:space="preserve"> PAGEREF _Toc240376177 \h </w:instrText>
       </w:r>
       <w:r>
         <w:rPr>
@@ -1266,7 +1266,7 @@
         <w:rPr>
           <w:noProof/>
         </w:rPr>
-        <w:instrText xml:space="preserve"> PAGEREF _Toc240373128 \h </w:instrText>
+        <w:instrText xml:space="preserve"> PAGEREF _Toc240376178 \h </w:instrText>
       </w:r>
       <w:r>
         <w:rPr>
@@ -1327,7 +1327,7 @@
         <w:rPr>
           <w:noProof/>
         </w:rPr>
-        <w:instrText xml:space="preserve"> PAGEREF _Toc240373129 \h </w:instrText>
+        <w:instrText xml:space="preserve"> PAGEREF _Toc240376179 \h </w:instrText>
       </w:r>
       <w:r>
         <w:rPr>
@@ -1388,7 +1388,7 @@
         <w:rPr>
           <w:noProof/>
         </w:rPr>
-        <w:instrText xml:space="preserve"> PAGEREF _Toc240373130 \h </w:instrText>
+        <w:instrText xml:space="preserve"> PAGEREF _Toc240376180 \h </w:instrText>
       </w:r>
       <w:r>
         <w:rPr>
@@ -1449,7 +1449,7 @@
         <w:rPr>
           <w:noProof/>
         </w:rPr>
-        <w:instrText xml:space="preserve"> PAGEREF _Toc240373131 \h </w:instrText>
+        <w:instrText xml:space="preserve"> PAGEREF _Toc240376181 \h </w:instrText>
       </w:r>
       <w:r>
         <w:rPr>
@@ -1510,7 +1510,7 @@
         <w:rPr>
           <w:noProof/>
         </w:rPr>
-        <w:instrText xml:space="preserve"> PAGEREF _Toc240373132 \h </w:instrText>
+        <w:instrText xml:space="preserve"> PAGEREF _Toc240376182 \h </w:instrText>
       </w:r>
       <w:r>
         <w:rPr>
@@ -1571,7 +1571,7 @@
         <w:rPr>
           <w:noProof/>
         </w:rPr>
-        <w:instrText xml:space="preserve"> PAGEREF _Toc240373133 \h </w:instrText>
+        <w:instrText xml:space="preserve"> PAGEREF _Toc240376183 \h </w:instrText>
       </w:r>
       <w:r>
         <w:rPr>
@@ -1632,7 +1632,7 @@
         <w:rPr>
           <w:noProof/>
         </w:rPr>
-        <w:instrText xml:space="preserve"> PAGEREF _Toc240373134 \h </w:instrText>
+        <w:instrText xml:space="preserve"> PAGEREF _Toc240376184 \h </w:instrText>
       </w:r>
       <w:r>
         <w:rPr>
@@ -1693,7 +1693,7 @@
         <w:rPr>
           <w:noProof/>
         </w:rPr>
-        <w:instrText xml:space="preserve"> PAGEREF _Toc240373135 \h </w:instrText>
+        <w:instrText xml:space="preserve"> PAGEREF _Toc240376185 \h </w:instrText>
       </w:r>
       <w:r>
         <w:rPr>
@@ -1754,7 +1754,7 @@
         <w:rPr>
           <w:noProof/>
         </w:rPr>
-        <w:instrText xml:space="preserve"> PAGEREF _Toc240373136 \h </w:instrText>
+        <w:instrText xml:space="preserve"> PAGEREF _Toc240376186 \h </w:instrText>
       </w:r>
       <w:r>
         <w:rPr>
@@ -1816,7 +1816,7 @@
         <w:rPr>
           <w:noProof/>
         </w:rPr>
-        <w:instrText xml:space="preserve"> PAGEREF _Toc240373137 \h </w:instrText>
+        <w:instrText xml:space="preserve"> PAGEREF _Toc240376187 \h </w:instrText>
       </w:r>
       <w:r>
         <w:rPr>
@@ -1877,7 +1877,7 @@
         <w:rPr>
           <w:noProof/>
         </w:rPr>
-        <w:instrText xml:space="preserve"> PAGEREF _Toc240373138 \h </w:instrText>
+        <w:instrText xml:space="preserve"> PAGEREF _Toc240376188 \h </w:instrText>
       </w:r>
       <w:r>
         <w:rPr>
@@ -1938,7 +1938,7 @@
         <w:rPr>
           <w:noProof/>
         </w:rPr>
-        <w:instrText xml:space="preserve"> PAGEREF _Toc240373139 \h </w:instrText>
+        <w:instrText xml:space="preserve"> PAGEREF _Toc240376189 \h </w:instrText>
       </w:r>
       <w:r>
         <w:rPr>
@@ -1999,7 +1999,7 @@
         <w:rPr>
           <w:noProof/>
         </w:rPr>
-        <w:instrText xml:space="preserve"> PAGEREF _Toc240373140 \h </w:instrText>
+        <w:instrText xml:space="preserve"> PAGEREF _Toc240376190 \h </w:instrText>
       </w:r>
       <w:r>
         <w:rPr>
@@ -2060,7 +2060,7 @@
         <w:rPr>
           <w:noProof/>
         </w:rPr>
-        <w:instrText xml:space="preserve"> PAGEREF _Toc240373141 \h </w:instrText>
+        <w:instrText xml:space="preserve"> PAGEREF _Toc240376191 \h </w:instrText>
       </w:r>
       <w:r>
         <w:rPr>
@@ -2121,7 +2121,7 @@
         <w:rPr>
           <w:noProof/>
         </w:rPr>
-        <w:instrText xml:space="preserve"> PAGEREF _Toc240373142 \h </w:instrText>
+        <w:instrText xml:space="preserve"> PAGEREF _Toc240376192 \h </w:instrText>
       </w:r>
       <w:r>
         <w:rPr>
@@ -2182,7 +2182,7 @@
         <w:rPr>
           <w:noProof/>
         </w:rPr>
-        <w:instrText xml:space="preserve"> PAGEREF _Toc240373143 \h </w:instrText>
+        <w:instrText xml:space="preserve"> PAGEREF _Toc240376193 \h </w:instrText>
       </w:r>
       <w:r>
         <w:rPr>
@@ -2243,7 +2243,7 @@
         <w:rPr>
           <w:noProof/>
         </w:rPr>
-        <w:instrText xml:space="preserve"> PAGEREF _Toc240373144 \h </w:instrText>
+        <w:instrText xml:space="preserve"> PAGEREF _Toc240376194 \h </w:instrText>
       </w:r>
       <w:r>
         <w:rPr>
@@ -2304,7 +2304,7 @@
         <w:rPr>
           <w:noProof/>
         </w:rPr>
-        <w:instrText xml:space="preserve"> PAGEREF _Toc240373145 \h </w:instrText>
+        <w:instrText xml:space="preserve"> PAGEREF _Toc240376195 \h </w:instrText>
       </w:r>
       <w:r>
         <w:rPr>
@@ -2365,7 +2365,7 @@
         <w:rPr>
           <w:noProof/>
         </w:rPr>
-        <w:instrText xml:space="preserve"> PAGEREF _Toc240373146 \h </w:instrText>
+        <w:instrText xml:space="preserve"> PAGEREF _Toc240376196 \h </w:instrText>
       </w:r>
       <w:r>
         <w:rPr>
@@ -2426,7 +2426,7 @@
         <w:rPr>
           <w:noProof/>
         </w:rPr>
-        <w:instrText xml:space="preserve"> PAGEREF _Toc240373147 \h </w:instrText>
+        <w:instrText xml:space="preserve"> PAGEREF _Toc240376197 \h </w:instrText>
       </w:r>
       <w:r>
         <w:rPr>
@@ -2487,7 +2487,7 @@
         <w:rPr>
           <w:noProof/>
         </w:rPr>
-        <w:instrText xml:space="preserve"> PAGEREF _Toc240373148 \h </w:instrText>
+        <w:instrText xml:space="preserve"> PAGEREF _Toc240376198 \h </w:instrText>
       </w:r>
       <w:r>
         <w:rPr>
@@ -2548,7 +2548,7 @@
         <w:rPr>
           <w:noProof/>
         </w:rPr>
-        <w:instrText xml:space="preserve"> PAGEREF _Toc240373149 \h </w:instrText>
+        <w:instrText xml:space="preserve"> PAGEREF _Toc240376199 \h </w:instrText>
       </w:r>
       <w:r>
         <w:rPr>
@@ -2609,7 +2609,7 @@
         <w:rPr>
           <w:noProof/>
         </w:rPr>
-        <w:instrText xml:space="preserve"> PAGEREF _Toc240373150 \h </w:instrText>
+        <w:instrText xml:space="preserve"> PAGEREF _Toc240376200 \h </w:instrText>
       </w:r>
       <w:r>
         <w:rPr>
@@ -2670,7 +2670,7 @@
         <w:rPr>
           <w:noProof/>
         </w:rPr>
-        <w:instrText xml:space="preserve"> PAGEREF _Toc240373151 \h </w:instrText>
+        <w:instrText xml:space="preserve"> PAGEREF _Toc240376201 \h </w:instrText>
       </w:r>
       <w:r>
         <w:rPr>
@@ -2731,7 +2731,7 @@
         <w:rPr>
           <w:noProof/>
         </w:rPr>
-        <w:instrText xml:space="preserve"> PAGEREF _Toc240373152 \h </w:instrText>
+        <w:instrText xml:space="preserve"> PAGEREF _Toc240376202 \h </w:instrText>
       </w:r>
       <w:r>
         <w:rPr>
@@ -2792,7 +2792,7 @@
         <w:rPr>
           <w:noProof/>
         </w:rPr>
-        <w:instrText xml:space="preserve"> PAGEREF _Toc240373153 \h </w:instrText>
+        <w:instrText xml:space="preserve"> PAGEREF _Toc240376203 \h </w:instrText>
       </w:r>
       <w:r>
         <w:rPr>
@@ -2853,7 +2853,7 @@
         <w:rPr>
           <w:noProof/>
         </w:rPr>
-        <w:instrText xml:space="preserve"> PAGEREF _Toc240373154 \h </w:instrText>
+        <w:instrText xml:space="preserve"> PAGEREF _Toc240376204 \h </w:instrText>
       </w:r>
       <w:r>
         <w:rPr>
@@ -2914,7 +2914,7 @@
         <w:rPr>
           <w:noProof/>
         </w:rPr>
-        <w:instrText xml:space="preserve"> PAGEREF _Toc240373155 \h </w:instrText>
+        <w:instrText xml:space="preserve"> PAGEREF _Toc240376205 \h </w:instrText>
       </w:r>
       <w:r>
         <w:rPr>
@@ -2931,7 +2931,7 @@
         <w:rPr>
           <w:noProof/>
         </w:rPr>
-        <w:t>86</w:t>
+        <w:t>87</w:t>
       </w:r>
       <w:r>
         <w:rPr>
@@ -2975,7 +2975,7 @@
         <w:rPr>
           <w:noProof/>
         </w:rPr>
-        <w:instrText xml:space="preserve"> PAGEREF _Toc240373156 \h </w:instrText>
+        <w:instrText xml:space="preserve"> PAGEREF _Toc240376206 \h </w:instrText>
       </w:r>
       <w:r>
         <w:rPr>
@@ -3036,7 +3036,7 @@
         <w:rPr>
           <w:noProof/>
         </w:rPr>
-        <w:instrText xml:space="preserve"> PAGEREF _Toc240373157 \h </w:instrText>
+        <w:instrText xml:space="preserve"> PAGEREF _Toc240376207 \h </w:instrText>
       </w:r>
       <w:r>
         <w:rPr>
@@ -3097,7 +3097,7 @@
         <w:rPr>
           <w:noProof/>
         </w:rPr>
-        <w:instrText xml:space="preserve"> PAGEREF _Toc240373158 \h </w:instrText>
+        <w:instrText xml:space="preserve"> PAGEREF _Toc240376208 \h </w:instrText>
       </w:r>
       <w:r>
         <w:rPr>
@@ -3158,7 +3158,7 @@
         <w:rPr>
           <w:noProof/>
         </w:rPr>
-        <w:instrText xml:space="preserve"> PAGEREF _Toc240373159 \h </w:instrText>
+        <w:instrText xml:space="preserve"> PAGEREF _Toc240376209 \h </w:instrText>
       </w:r>
       <w:r>
         <w:rPr>
@@ -3219,7 +3219,7 @@
         <w:rPr>
           <w:noProof/>
         </w:rPr>
-        <w:instrText xml:space="preserve"> PAGEREF _Toc240373160 \h </w:instrText>
+        <w:instrText xml:space="preserve"> PAGEREF _Toc240376210 \h </w:instrText>
       </w:r>
       <w:r>
         <w:rPr>
@@ -3280,7 +3280,7 @@
         <w:rPr>
           <w:noProof/>
         </w:rPr>
-        <w:instrText xml:space="preserve"> PAGEREF _Toc240373161 \h </w:instrText>
+        <w:instrText xml:space="preserve"> PAGEREF _Toc240376211 \h </w:instrText>
       </w:r>
       <w:r>
         <w:rPr>
@@ -3341,7 +3341,7 @@
         <w:rPr>
           <w:noProof/>
         </w:rPr>
-        <w:instrText xml:space="preserve"> PAGEREF _Toc240373162 \h </w:instrText>
+        <w:instrText xml:space="preserve"> PAGEREF _Toc240376212 \h </w:instrText>
       </w:r>
       <w:r>
         <w:rPr>
@@ -3402,7 +3402,7 @@
         <w:rPr>
           <w:noProof/>
         </w:rPr>
-        <w:instrText xml:space="preserve"> PAGEREF _Toc240373163 \h </w:instrText>
+        <w:instrText xml:space="preserve"> PAGEREF _Toc240376213 \h </w:instrText>
       </w:r>
       <w:r>
         <w:rPr>
@@ -3479,7 +3479,7 @@
           <w:sz w:val="34"/>
         </w:rPr>
       </w:pPr>
-      <w:bookmarkStart w:id="0" w:name="_Toc240373111"/>
+      <w:bookmarkStart w:id="0" w:name="_Toc240376161"/>
       <w:r>
         <w:rPr>
           <w:rFonts w:ascii="Montserrat" w:hAnsi="Montserrat"/>
@@ -3503,7 +3503,7 @@
           <w:sz w:val="27"/>
         </w:rPr>
       </w:pPr>
-      <w:bookmarkStart w:id="1" w:name="_Toc240373112"/>
+      <w:bookmarkStart w:id="1" w:name="_Toc240376162"/>
       <w:r>
         <w:rPr>
           <w:rFonts w:ascii="Montserrat" w:hAnsi="Montserrat"/>
@@ -5061,6 +5061,24 @@
           <w:color w:val="1A1A1A"/>
           <w:sz w:val="22"/>
         </w:rPr>
+        <w:t>Esta e a versao 2.78 do manual. Em relacao a versao 2.77 (15/09/2026), + Adicionar usuario (secao 6.1) passou a criar a conta de verdade na hora (via Supabase Auth Admin API), em vez de so um pre-cadastro que virava conta no primeiro login - agora a pessoa ja pode ser adicionada a equipe de um projeto (secao 6.2) sem esperar ela logar. Pre-cadastros antigos ainda funcionam e ganharam um botao Criar conta agora para converte-los imediatamente.</w:t>
+      </w:r>
+    </w:p>
+    <w:p>
+      <w:pPr>
+        <w:spacing w:line="280" w:lineRule="auto"/>
+        <w:rPr>
+          <w:rFonts w:ascii="Montserrat" w:hAnsi="Montserrat"/>
+          <w:color w:val="1A1A1A"/>
+          <w:sz w:val="22"/>
+        </w:rPr>
+      </w:pPr>
+      <w:r>
+        <w:rPr>
+          <w:rFonts w:ascii="Montserrat" w:hAnsi="Montserrat"/>
+          <w:color w:val="1A1A1A"/>
+          <w:sz w:val="22"/>
+        </w:rPr>
         <w:t>O manual nao substitui as Diretrizes para a Gestao de Projetos da UNIALFA (documento institucional que define o framework D01 a D07) nem o documento Regras de Acesso e Permissoes (que detalha cada regra de controle de acesso); ele e o guia operacional de como usar cada ferramenta na pratica.</w:t>
       </w:r>
     </w:p>
@@ -5075,7 +5093,7 @@
           <w:sz w:val="27"/>
         </w:rPr>
       </w:pPr>
-      <w:bookmarkStart w:id="2" w:name="_Toc240373113"/>
+      <w:bookmarkStart w:id="2" w:name="_Toc240376163"/>
       <w:r>
         <w:rPr>
           <w:rFonts w:ascii="Montserrat" w:hAnsi="Montserrat"/>
@@ -5150,6 +5168,7 @@
           <w:color w:val="1A1A1A"/>
           <w:sz w:val="22"/>
         </w:rPr>
+        <w:lastRenderedPageBreak/>
         <w:t>1 ferramenta de apoio a decisao, o Validador de Projetos, que nao gera registros de artefato mas ajuda a avaliar projetos.</w:t>
       </w:r>
     </w:p>
@@ -5240,7 +5259,6 @@
           <w:color w:val="1A1A1A"/>
           <w:sz w:val="22"/>
         </w:rPr>
-        <w:lastRenderedPageBreak/>
         <w:t>Cada formulario de registro tem duas partes: uma tela de preenchimento (+Novo...) e uma tela de consulta (...cadastrados), onde ficam listados todos os registros ja salvos, com opcao de abrir, editar o status ou excluir cada um.</w:t>
       </w:r>
     </w:p>
@@ -5272,16 +5290,16 @@
           <w:noProof/>
         </w:rPr>
         <w:drawing>
-          <wp:inline distT="0" distB="0" distL="0" distR="0" wp14:anchorId="53CE1154" wp14:editId="239AE7E2">
+          <wp:inline distT="0" distB="0" distL="0" distR="0" wp14:anchorId="2381FEC7" wp14:editId="11E0BA83">
             <wp:extent cx="5303520" cy="4792851"/>
             <wp:effectExtent l="19050" t="19050" r="11430" b="27305"/>
-            <wp:docPr id="396128479" name="Imagem 1"/>
+            <wp:docPr id="1456791694" name="Imagem 1"/>
             <wp:cNvGraphicFramePr/>
             <a:graphic xmlns:a="http://schemas.openxmlformats.org/drawingml/2006/main">
               <a:graphicData uri="http://schemas.openxmlformats.org/drawingml/2006/picture">
                 <pic:pic xmlns:pic="http://schemas.openxmlformats.org/drawingml/2006/picture">
                   <pic:nvPicPr>
-                    <pic:cNvPr id="396128479" name=""/>
+                    <pic:cNvPr id="1456791694" name=""/>
                     <pic:cNvPicPr/>
                   </pic:nvPicPr>
                   <pic:blipFill>
@@ -5335,6 +5353,7 @@
           <w:color w:val="6A6A70"/>
           <w:sz w:val="19"/>
         </w:rPr>
+        <w:lastRenderedPageBreak/>
         <w:t>Mapa de diretrizes - pagina inicial. Nao exige login.</w:t>
       </w:r>
     </w:p>
@@ -5349,7 +5368,7 @@
           <w:sz w:val="27"/>
         </w:rPr>
       </w:pPr>
-      <w:bookmarkStart w:id="3" w:name="_Toc240373114"/>
+      <w:bookmarkStart w:id="3" w:name="_Toc240376164"/>
       <w:r>
         <w:rPr>
           <w:rFonts w:ascii="Montserrat" w:hAnsi="Montserrat"/>
@@ -5388,18 +5407,17 @@
         <w:rPr>
           <w:noProof/>
         </w:rPr>
-        <w:lastRenderedPageBreak/>
         <w:drawing>
-          <wp:inline distT="0" distB="0" distL="0" distR="0" wp14:anchorId="45D4AFDE" wp14:editId="6852592B">
+          <wp:inline distT="0" distB="0" distL="0" distR="0" wp14:anchorId="1A5D93C8" wp14:editId="15844D9B">
             <wp:extent cx="4206240" cy="3801227"/>
             <wp:effectExtent l="19050" t="19050" r="22860" b="27940"/>
-            <wp:docPr id="869793535" name="Imagem 2"/>
+            <wp:docPr id="1552752672" name="Imagem 2"/>
             <wp:cNvGraphicFramePr/>
             <a:graphic xmlns:a="http://schemas.openxmlformats.org/drawingml/2006/main">
               <a:graphicData uri="http://schemas.openxmlformats.org/drawingml/2006/picture">
                 <pic:pic xmlns:pic="http://schemas.openxmlformats.org/drawingml/2006/picture">
                   <pic:nvPicPr>
-                    <pic:cNvPr id="869793535" name=""/>
+                    <pic:cNvPr id="1552752672" name=""/>
                     <pic:cNvPicPr/>
                   </pic:nvPicPr>
                   <pic:blipFill>
@@ -5572,7 +5590,7 @@
           <w:sz w:val="27"/>
         </w:rPr>
       </w:pPr>
-      <w:bookmarkStart w:id="4" w:name="_Toc240373115"/>
+      <w:bookmarkStart w:id="4" w:name="_Toc240376165"/>
       <w:r>
         <w:rPr>
           <w:rFonts w:ascii="Montserrat" w:hAnsi="Montserrat"/>
@@ -5580,6 +5598,7 @@
           <w:color w:val="B91D2E"/>
           <w:sz w:val="27"/>
         </w:rPr>
+        <w:lastRenderedPageBreak/>
         <w:t>1.4 Como a ferramenta se relaciona com as Diretrizes (D01-D07)</w:t>
       </w:r>
       <w:bookmarkEnd w:id="4"/>
@@ -5654,7 +5673,6 @@
                 <w:color w:val="FFFFFF"/>
                 <w:sz w:val="19"/>
               </w:rPr>
-              <w:lastRenderedPageBreak/>
               <w:t>Passo</w:t>
             </w:r>
           </w:p>
@@ -6811,7 +6829,7 @@
           <w:sz w:val="34"/>
         </w:rPr>
       </w:pPr>
-      <w:bookmarkStart w:id="5" w:name="_Toc240373116"/>
+      <w:bookmarkStart w:id="5" w:name="_Toc240376166"/>
       <w:r>
         <w:rPr>
           <w:rFonts w:ascii="Montserrat" w:hAnsi="Montserrat"/>
@@ -6835,7 +6853,7 @@
           <w:sz w:val="27"/>
         </w:rPr>
       </w:pPr>
-      <w:bookmarkStart w:id="6" w:name="_Toc240373117"/>
+      <w:bookmarkStart w:id="6" w:name="_Toc240376167"/>
       <w:r>
         <w:rPr>
           <w:rFonts w:ascii="Montserrat" w:hAnsi="Montserrat"/>
@@ -6876,7 +6894,7 @@
           <w:sz w:val="27"/>
         </w:rPr>
       </w:pPr>
-      <w:bookmarkStart w:id="7" w:name="_Toc240373118"/>
+      <w:bookmarkStart w:id="7" w:name="_Toc240376168"/>
       <w:r>
         <w:rPr>
           <w:rFonts w:ascii="Montserrat" w:hAnsi="Montserrat"/>
@@ -6995,7 +7013,7 @@
           <w:sz w:val="27"/>
         </w:rPr>
       </w:pPr>
-      <w:bookmarkStart w:id="8" w:name="_Toc240373119"/>
+      <w:bookmarkStart w:id="8" w:name="_Toc240376169"/>
       <w:r>
         <w:rPr>
           <w:rFonts w:ascii="Montserrat" w:hAnsi="Montserrat"/>
@@ -7608,7 +7626,7 @@
           <w:sz w:val="27"/>
         </w:rPr>
       </w:pPr>
-      <w:bookmarkStart w:id="9" w:name="_Toc240373120"/>
+      <w:bookmarkStart w:id="9" w:name="_Toc240376170"/>
       <w:r>
         <w:rPr>
           <w:rFonts w:ascii="Montserrat" w:hAnsi="Montserrat"/>
@@ -7697,16 +7715,16 @@
         </w:rPr>
         <w:lastRenderedPageBreak/>
         <w:drawing>
-          <wp:inline distT="0" distB="0" distL="0" distR="0" wp14:anchorId="1D503960" wp14:editId="1B8E9E98">
+          <wp:inline distT="0" distB="0" distL="0" distR="0" wp14:anchorId="00E2FFA6" wp14:editId="5F2AF763">
             <wp:extent cx="4937760" cy="4462310"/>
             <wp:effectExtent l="19050" t="19050" r="15240" b="14605"/>
-            <wp:docPr id="1154731913" name="Imagem 3"/>
+            <wp:docPr id="164054137" name="Imagem 3"/>
             <wp:cNvGraphicFramePr/>
             <a:graphic xmlns:a="http://schemas.openxmlformats.org/drawingml/2006/main">
               <a:graphicData uri="http://schemas.openxmlformats.org/drawingml/2006/picture">
                 <pic:pic xmlns:pic="http://schemas.openxmlformats.org/drawingml/2006/picture">
                   <pic:nvPicPr>
-                    <pic:cNvPr id="1154731913" name=""/>
+                    <pic:cNvPr id="164054137" name=""/>
                     <pic:cNvPicPr/>
                   </pic:nvPicPr>
                   <pic:blipFill>
@@ -7774,7 +7792,7 @@
           <w:sz w:val="27"/>
         </w:rPr>
       </w:pPr>
-      <w:bookmarkStart w:id="10" w:name="_Toc240373121"/>
+      <w:bookmarkStart w:id="10" w:name="_Toc240376171"/>
       <w:r>
         <w:rPr>
           <w:rFonts w:ascii="Montserrat" w:hAnsi="Montserrat"/>
@@ -7815,16 +7833,16 @@
         </w:rPr>
         <w:lastRenderedPageBreak/>
         <w:drawing>
-          <wp:inline distT="0" distB="0" distL="0" distR="0" wp14:anchorId="318C4150" wp14:editId="5A7834F9">
+          <wp:inline distT="0" distB="0" distL="0" distR="0" wp14:anchorId="798199D6" wp14:editId="4C3FA460">
             <wp:extent cx="5120640" cy="4627581"/>
             <wp:effectExtent l="19050" t="19050" r="22860" b="20955"/>
-            <wp:docPr id="1096508658" name="Imagem 4"/>
+            <wp:docPr id="553386357" name="Imagem 4"/>
             <wp:cNvGraphicFramePr/>
             <a:graphic xmlns:a="http://schemas.openxmlformats.org/drawingml/2006/main">
               <a:graphicData uri="http://schemas.openxmlformats.org/drawingml/2006/picture">
                 <pic:pic xmlns:pic="http://schemas.openxmlformats.org/drawingml/2006/picture">
                   <pic:nvPicPr>
-                    <pic:cNvPr id="1096508658" name=""/>
+                    <pic:cNvPr id="553386357" name=""/>
                     <pic:cNvPicPr/>
                   </pic:nvPicPr>
                   <pic:blipFill>
@@ -8007,7 +8025,7 @@
           <w:sz w:val="27"/>
         </w:rPr>
       </w:pPr>
-      <w:bookmarkStart w:id="11" w:name="_Toc240373122"/>
+      <w:bookmarkStart w:id="11" w:name="_Toc240376172"/>
       <w:r>
         <w:rPr>
           <w:rFonts w:ascii="Montserrat" w:hAnsi="Montserrat"/>
@@ -8047,16 +8065,16 @@
           <w:noProof/>
         </w:rPr>
         <w:drawing>
-          <wp:inline distT="0" distB="0" distL="0" distR="0" wp14:anchorId="31908EAD" wp14:editId="13E8E2D2">
+          <wp:inline distT="0" distB="0" distL="0" distR="0" wp14:anchorId="408ED4B0" wp14:editId="62814D6E">
             <wp:extent cx="4206240" cy="3801227"/>
             <wp:effectExtent l="19050" t="19050" r="22860" b="27940"/>
-            <wp:docPr id="1063509427" name="Imagem 5"/>
+            <wp:docPr id="502162131" name="Imagem 5"/>
             <wp:cNvGraphicFramePr/>
             <a:graphic xmlns:a="http://schemas.openxmlformats.org/drawingml/2006/main">
               <a:graphicData uri="http://schemas.openxmlformats.org/drawingml/2006/picture">
                 <pic:pic xmlns:pic="http://schemas.openxmlformats.org/drawingml/2006/picture">
                   <pic:nvPicPr>
-                    <pic:cNvPr id="1063509427" name=""/>
+                    <pic:cNvPr id="502162131" name=""/>
                     <pic:cNvPicPr/>
                   </pic:nvPicPr>
                   <pic:blipFill>
@@ -8124,16 +8142,16 @@
         </w:rPr>
         <w:lastRenderedPageBreak/>
         <w:drawing>
-          <wp:inline distT="0" distB="0" distL="0" distR="0" wp14:anchorId="161D40DE" wp14:editId="1C58C0CB">
+          <wp:inline distT="0" distB="0" distL="0" distR="0" wp14:anchorId="06318A0B" wp14:editId="76DB9F75">
             <wp:extent cx="4206240" cy="3801227"/>
             <wp:effectExtent l="19050" t="19050" r="22860" b="27940"/>
-            <wp:docPr id="635546386" name="Imagem 6"/>
+            <wp:docPr id="452235340" name="Imagem 6"/>
             <wp:cNvGraphicFramePr/>
             <a:graphic xmlns:a="http://schemas.openxmlformats.org/drawingml/2006/main">
               <a:graphicData uri="http://schemas.openxmlformats.org/drawingml/2006/picture">
                 <pic:pic xmlns:pic="http://schemas.openxmlformats.org/drawingml/2006/picture">
                   <pic:nvPicPr>
-                    <pic:cNvPr id="635546386" name=""/>
+                    <pic:cNvPr id="452235340" name=""/>
                     <pic:cNvPicPr/>
                   </pic:nvPicPr>
                   <pic:blipFill>
@@ -8249,7 +8267,7 @@
           <w:sz w:val="27"/>
         </w:rPr>
       </w:pPr>
-      <w:bookmarkStart w:id="12" w:name="_Toc240373123"/>
+      <w:bookmarkStart w:id="12" w:name="_Toc240376173"/>
       <w:r>
         <w:rPr>
           <w:rFonts w:ascii="Montserrat" w:hAnsi="Montserrat"/>
@@ -8317,7 +8335,7 @@
           <w:sz w:val="27"/>
         </w:rPr>
       </w:pPr>
-      <w:bookmarkStart w:id="13" w:name="_Toc240373124"/>
+      <w:bookmarkStart w:id="13" w:name="_Toc240376174"/>
       <w:r>
         <w:rPr>
           <w:rFonts w:ascii="Montserrat" w:hAnsi="Montserrat"/>
@@ -8544,7 +8562,7 @@
           <w:sz w:val="27"/>
         </w:rPr>
       </w:pPr>
-      <w:bookmarkStart w:id="14" w:name="_Toc240373125"/>
+      <w:bookmarkStart w:id="14" w:name="_Toc240376175"/>
       <w:r>
         <w:rPr>
           <w:rFonts w:ascii="Montserrat" w:hAnsi="Montserrat"/>
@@ -8703,7 +8721,7 @@
           <w:sz w:val="27"/>
         </w:rPr>
       </w:pPr>
-      <w:bookmarkStart w:id="15" w:name="_Toc240373126"/>
+      <w:bookmarkStart w:id="15" w:name="_Toc240376176"/>
       <w:r>
         <w:rPr>
           <w:rFonts w:ascii="Montserrat" w:hAnsi="Montserrat"/>
@@ -8895,7 +8913,7 @@
           <w:sz w:val="27"/>
         </w:rPr>
       </w:pPr>
-      <w:bookmarkStart w:id="16" w:name="_Toc240373127"/>
+      <w:bookmarkStart w:id="16" w:name="_Toc240376177"/>
       <w:r>
         <w:rPr>
           <w:rFonts w:ascii="Montserrat" w:hAnsi="Montserrat"/>
@@ -9023,7 +9041,7 @@
           <w:sz w:val="27"/>
         </w:rPr>
       </w:pPr>
-      <w:bookmarkStart w:id="17" w:name="_Toc240373128"/>
+      <w:bookmarkStart w:id="17" w:name="_Toc240376178"/>
       <w:r>
         <w:rPr>
           <w:rFonts w:ascii="Montserrat" w:hAnsi="Montserrat"/>
@@ -9353,7 +9371,7 @@
           <w:sz w:val="27"/>
         </w:rPr>
       </w:pPr>
-      <w:bookmarkStart w:id="18" w:name="_Toc240373129"/>
+      <w:bookmarkStart w:id="18" w:name="_Toc240376179"/>
       <w:r>
         <w:rPr>
           <w:rFonts w:ascii="Montserrat" w:hAnsi="Montserrat"/>
@@ -9490,7 +9508,7 @@
           <w:sz w:val="27"/>
         </w:rPr>
       </w:pPr>
-      <w:bookmarkStart w:id="19" w:name="_Toc240373130"/>
+      <w:bookmarkStart w:id="19" w:name="_Toc240376180"/>
       <w:r>
         <w:rPr>
           <w:rFonts w:ascii="Montserrat" w:hAnsi="Montserrat"/>
@@ -9769,7 +9787,7 @@
           <w:sz w:val="27"/>
         </w:rPr>
       </w:pPr>
-      <w:bookmarkStart w:id="20" w:name="_Toc240373131"/>
+      <w:bookmarkStart w:id="20" w:name="_Toc240376181"/>
       <w:r>
         <w:rPr>
           <w:rFonts w:ascii="Montserrat" w:hAnsi="Montserrat"/>
@@ -9946,7 +9964,7 @@
           <w:sz w:val="27"/>
         </w:rPr>
       </w:pPr>
-      <w:bookmarkStart w:id="21" w:name="_Toc240373132"/>
+      <w:bookmarkStart w:id="21" w:name="_Toc240376182"/>
       <w:r>
         <w:rPr>
           <w:rFonts w:ascii="Montserrat" w:hAnsi="Montserrat"/>
@@ -10060,7 +10078,7 @@
           <w:sz w:val="34"/>
         </w:rPr>
       </w:pPr>
-      <w:bookmarkStart w:id="22" w:name="_Toc240373133"/>
+      <w:bookmarkStart w:id="22" w:name="_Toc240376183"/>
       <w:r>
         <w:rPr>
           <w:rFonts w:ascii="Montserrat" w:hAnsi="Montserrat"/>
@@ -10102,7 +10120,7 @@
           <w:sz w:val="27"/>
         </w:rPr>
       </w:pPr>
-      <w:bookmarkStart w:id="23" w:name="_Toc240373134"/>
+      <w:bookmarkStart w:id="23" w:name="_Toc240376184"/>
       <w:r>
         <w:rPr>
           <w:rFonts w:ascii="Montserrat" w:hAnsi="Montserrat"/>
@@ -11182,16 +11200,16 @@
         </w:rPr>
         <w:lastRenderedPageBreak/>
         <w:drawing>
-          <wp:inline distT="0" distB="0" distL="0" distR="0" wp14:anchorId="5E1338DC" wp14:editId="4A8EAE3D">
+          <wp:inline distT="0" distB="0" distL="0" distR="0" wp14:anchorId="600EFA12" wp14:editId="6B185A0A">
             <wp:extent cx="5120640" cy="4627581"/>
             <wp:effectExtent l="19050" t="19050" r="22860" b="20955"/>
-            <wp:docPr id="1147296385" name="Imagem 7"/>
+            <wp:docPr id="2097344205" name="Imagem 7"/>
             <wp:cNvGraphicFramePr/>
             <a:graphic xmlns:a="http://schemas.openxmlformats.org/drawingml/2006/main">
               <a:graphicData uri="http://schemas.openxmlformats.org/drawingml/2006/picture">
                 <pic:pic xmlns:pic="http://schemas.openxmlformats.org/drawingml/2006/picture">
                   <pic:nvPicPr>
-                    <pic:cNvPr id="1147296385" name=""/>
+                    <pic:cNvPr id="2097344205" name=""/>
                     <pic:cNvPicPr/>
                   </pic:nvPicPr>
                   <pic:blipFill>
@@ -11259,16 +11277,16 @@
         </w:rPr>
         <w:lastRenderedPageBreak/>
         <w:drawing>
-          <wp:inline distT="0" distB="0" distL="0" distR="0" wp14:anchorId="339BDDB7" wp14:editId="12A1EE35">
+          <wp:inline distT="0" distB="0" distL="0" distR="0" wp14:anchorId="7E638212" wp14:editId="74CB3582">
             <wp:extent cx="5120640" cy="4627581"/>
             <wp:effectExtent l="19050" t="19050" r="22860" b="20955"/>
-            <wp:docPr id="1552360888" name="Imagem 8"/>
+            <wp:docPr id="616215625" name="Imagem 8"/>
             <wp:cNvGraphicFramePr/>
             <a:graphic xmlns:a="http://schemas.openxmlformats.org/drawingml/2006/main">
               <a:graphicData uri="http://schemas.openxmlformats.org/drawingml/2006/picture">
                 <pic:pic xmlns:pic="http://schemas.openxmlformats.org/drawingml/2006/picture">
                   <pic:nvPicPr>
-                    <pic:cNvPr id="1552360888" name=""/>
+                    <pic:cNvPr id="616215625" name=""/>
                     <pic:cNvPicPr/>
                   </pic:nvPicPr>
                   <pic:blipFill>
@@ -11476,7 +11494,7 @@
           <w:sz w:val="27"/>
         </w:rPr>
       </w:pPr>
-      <w:bookmarkStart w:id="24" w:name="_Toc240373135"/>
+      <w:bookmarkStart w:id="24" w:name="_Toc240376185"/>
       <w:r>
         <w:rPr>
           <w:rFonts w:ascii="Montserrat" w:hAnsi="Montserrat"/>
@@ -12401,16 +12419,16 @@
           <w:noProof/>
         </w:rPr>
         <w:drawing>
-          <wp:inline distT="0" distB="0" distL="0" distR="0" wp14:anchorId="0341A43A" wp14:editId="14AD6F05">
+          <wp:inline distT="0" distB="0" distL="0" distR="0" wp14:anchorId="0608E8C3" wp14:editId="0D4CB6E1">
             <wp:extent cx="5120640" cy="4627581"/>
             <wp:effectExtent l="19050" t="19050" r="22860" b="20955"/>
-            <wp:docPr id="1231558416" name="Imagem 9"/>
+            <wp:docPr id="999960464" name="Imagem 9"/>
             <wp:cNvGraphicFramePr/>
             <a:graphic xmlns:a="http://schemas.openxmlformats.org/drawingml/2006/main">
               <a:graphicData uri="http://schemas.openxmlformats.org/drawingml/2006/picture">
                 <pic:pic xmlns:pic="http://schemas.openxmlformats.org/drawingml/2006/picture">
                   <pic:nvPicPr>
-                    <pic:cNvPr id="1231558416" name=""/>
+                    <pic:cNvPr id="999960464" name=""/>
                     <pic:cNvPicPr/>
                   </pic:nvPicPr>
                   <pic:blipFill>
@@ -12478,16 +12496,16 @@
         </w:rPr>
         <w:lastRenderedPageBreak/>
         <w:drawing>
-          <wp:inline distT="0" distB="0" distL="0" distR="0" wp14:anchorId="4627F72C" wp14:editId="63D6BB48">
+          <wp:inline distT="0" distB="0" distL="0" distR="0" wp14:anchorId="5518D311" wp14:editId="02BEA4FD">
             <wp:extent cx="5120640" cy="4627581"/>
             <wp:effectExtent l="19050" t="19050" r="22860" b="20955"/>
-            <wp:docPr id="1681727678" name="Imagem 10"/>
+            <wp:docPr id="1740237615" name="Imagem 10"/>
             <wp:cNvGraphicFramePr/>
             <a:graphic xmlns:a="http://schemas.openxmlformats.org/drawingml/2006/main">
               <a:graphicData uri="http://schemas.openxmlformats.org/drawingml/2006/picture">
                 <pic:pic xmlns:pic="http://schemas.openxmlformats.org/drawingml/2006/picture">
                   <pic:nvPicPr>
-                    <pic:cNvPr id="1681727678" name=""/>
+                    <pic:cNvPr id="1740237615" name=""/>
                     <pic:cNvPicPr/>
                   </pic:nvPicPr>
                   <pic:blipFill>
@@ -12621,7 +12639,7 @@
           <w:sz w:val="27"/>
         </w:rPr>
       </w:pPr>
-      <w:bookmarkStart w:id="25" w:name="_Toc240373136"/>
+      <w:bookmarkStart w:id="25" w:name="_Toc240376186"/>
       <w:r>
         <w:rPr>
           <w:rFonts w:ascii="Montserrat" w:hAnsi="Montserrat"/>
@@ -13687,16 +13705,16 @@
           <w:noProof/>
         </w:rPr>
         <w:drawing>
-          <wp:inline distT="0" distB="0" distL="0" distR="0" wp14:anchorId="3E1C17F7" wp14:editId="298E3F61">
+          <wp:inline distT="0" distB="0" distL="0" distR="0" wp14:anchorId="63F13E95" wp14:editId="39E13A9B">
             <wp:extent cx="5120640" cy="3338440"/>
             <wp:effectExtent l="19050" t="19050" r="22860" b="14605"/>
-            <wp:docPr id="1407715702" name="Imagem 11"/>
+            <wp:docPr id="1363421148" name="Imagem 11"/>
             <wp:cNvGraphicFramePr/>
             <a:graphic xmlns:a="http://schemas.openxmlformats.org/drawingml/2006/main">
               <a:graphicData uri="http://schemas.openxmlformats.org/drawingml/2006/picture">
                 <pic:pic xmlns:pic="http://schemas.openxmlformats.org/drawingml/2006/picture">
                   <pic:nvPicPr>
-                    <pic:cNvPr id="1407715702" name=""/>
+                    <pic:cNvPr id="1363421148" name=""/>
                     <pic:cNvPicPr/>
                   </pic:nvPicPr>
                   <pic:blipFill>
@@ -13764,16 +13782,16 @@
         </w:rPr>
         <w:lastRenderedPageBreak/>
         <w:drawing>
-          <wp:inline distT="0" distB="0" distL="0" distR="0" wp14:anchorId="24302F31" wp14:editId="79C4EF70">
+          <wp:inline distT="0" distB="0" distL="0" distR="0" wp14:anchorId="311E9076" wp14:editId="2E40987A">
             <wp:extent cx="5120640" cy="4627581"/>
             <wp:effectExtent l="19050" t="19050" r="22860" b="20955"/>
-            <wp:docPr id="857571290" name="Imagem 12"/>
+            <wp:docPr id="916338613" name="Imagem 12"/>
             <wp:cNvGraphicFramePr/>
             <a:graphic xmlns:a="http://schemas.openxmlformats.org/drawingml/2006/main">
               <a:graphicData uri="http://schemas.openxmlformats.org/drawingml/2006/picture">
                 <pic:pic xmlns:pic="http://schemas.openxmlformats.org/drawingml/2006/picture">
                   <pic:nvPicPr>
-                    <pic:cNvPr id="857571290" name=""/>
+                    <pic:cNvPr id="916338613" name=""/>
                     <pic:cNvPicPr/>
                   </pic:nvPicPr>
                   <pic:blipFill>
@@ -13977,7 +13995,7 @@
           <w:sz w:val="27"/>
         </w:rPr>
       </w:pPr>
-      <w:bookmarkStart w:id="26" w:name="_Toc240373137"/>
+      <w:bookmarkStart w:id="26" w:name="_Toc240376187"/>
       <w:r>
         <w:rPr>
           <w:rFonts w:ascii="Montserrat" w:hAnsi="Montserrat"/>
@@ -14538,16 +14556,16 @@
           <w:noProof/>
         </w:rPr>
         <w:drawing>
-          <wp:inline distT="0" distB="0" distL="0" distR="0" wp14:anchorId="5E799468" wp14:editId="03559D45">
+          <wp:inline distT="0" distB="0" distL="0" distR="0" wp14:anchorId="664E679D" wp14:editId="7CBC0F8F">
             <wp:extent cx="5120640" cy="4627581"/>
             <wp:effectExtent l="19050" t="19050" r="22860" b="20955"/>
-            <wp:docPr id="1141780281" name="Imagem 13"/>
+            <wp:docPr id="511360943" name="Imagem 13"/>
             <wp:cNvGraphicFramePr/>
             <a:graphic xmlns:a="http://schemas.openxmlformats.org/drawingml/2006/main">
               <a:graphicData uri="http://schemas.openxmlformats.org/drawingml/2006/picture">
                 <pic:pic xmlns:pic="http://schemas.openxmlformats.org/drawingml/2006/picture">
                   <pic:nvPicPr>
-                    <pic:cNvPr id="1141780281" name=""/>
+                    <pic:cNvPr id="511360943" name=""/>
                     <pic:cNvPicPr/>
                   </pic:nvPicPr>
                   <pic:blipFill>
@@ -14615,16 +14633,16 @@
         </w:rPr>
         <w:lastRenderedPageBreak/>
         <w:drawing>
-          <wp:inline distT="0" distB="0" distL="0" distR="0" wp14:anchorId="3BE4F881" wp14:editId="13035B77">
+          <wp:inline distT="0" distB="0" distL="0" distR="0" wp14:anchorId="27D840E2" wp14:editId="6EB2EDD1">
             <wp:extent cx="5120640" cy="4627581"/>
             <wp:effectExtent l="19050" t="19050" r="22860" b="20955"/>
-            <wp:docPr id="191620847" name="Imagem 14"/>
+            <wp:docPr id="358451200" name="Imagem 14"/>
             <wp:cNvGraphicFramePr/>
             <a:graphic xmlns:a="http://schemas.openxmlformats.org/drawingml/2006/main">
               <a:graphicData uri="http://schemas.openxmlformats.org/drawingml/2006/picture">
                 <pic:pic xmlns:pic="http://schemas.openxmlformats.org/drawingml/2006/picture">
                   <pic:nvPicPr>
-                    <pic:cNvPr id="191620847" name=""/>
+                    <pic:cNvPr id="358451200" name=""/>
                     <pic:cNvPicPr/>
                   </pic:nvPicPr>
                   <pic:blipFill>
@@ -14894,7 +14912,7 @@
           <w:sz w:val="27"/>
         </w:rPr>
       </w:pPr>
-      <w:bookmarkStart w:id="27" w:name="_Toc240373138"/>
+      <w:bookmarkStart w:id="27" w:name="_Toc240376188"/>
       <w:r>
         <w:rPr>
           <w:rFonts w:ascii="Montserrat" w:hAnsi="Montserrat"/>
@@ -14935,16 +14953,16 @@
         </w:rPr>
         <w:lastRenderedPageBreak/>
         <w:drawing>
-          <wp:inline distT="0" distB="0" distL="0" distR="0" wp14:anchorId="005C2A10" wp14:editId="5E21DA60">
+          <wp:inline distT="0" distB="0" distL="0" distR="0" wp14:anchorId="6BB9EE72" wp14:editId="69B3AE41">
             <wp:extent cx="5120640" cy="4627581"/>
             <wp:effectExtent l="19050" t="19050" r="22860" b="20955"/>
-            <wp:docPr id="1776143327" name="Imagem 15"/>
+            <wp:docPr id="1760035522" name="Imagem 15"/>
             <wp:cNvGraphicFramePr/>
             <a:graphic xmlns:a="http://schemas.openxmlformats.org/drawingml/2006/main">
               <a:graphicData uri="http://schemas.openxmlformats.org/drawingml/2006/picture">
                 <pic:pic xmlns:pic="http://schemas.openxmlformats.org/drawingml/2006/picture">
                   <pic:nvPicPr>
-                    <pic:cNvPr id="1776143327" name=""/>
+                    <pic:cNvPr id="1760035522" name=""/>
                     <pic:cNvPicPr/>
                   </pic:nvPicPr>
                   <pic:blipFill>
@@ -15012,16 +15030,16 @@
         </w:rPr>
         <w:lastRenderedPageBreak/>
         <w:drawing>
-          <wp:inline distT="0" distB="0" distL="0" distR="0" wp14:anchorId="323AB17E" wp14:editId="7519D26A">
+          <wp:inline distT="0" distB="0" distL="0" distR="0" wp14:anchorId="1933F979" wp14:editId="59C05DBA">
             <wp:extent cx="5120640" cy="4627581"/>
             <wp:effectExtent l="19050" t="19050" r="22860" b="20955"/>
-            <wp:docPr id="1159794744" name="Imagem 16"/>
+            <wp:docPr id="876533679" name="Imagem 16"/>
             <wp:cNvGraphicFramePr/>
             <a:graphic xmlns:a="http://schemas.openxmlformats.org/drawingml/2006/main">
               <a:graphicData uri="http://schemas.openxmlformats.org/drawingml/2006/picture">
                 <pic:pic xmlns:pic="http://schemas.openxmlformats.org/drawingml/2006/picture">
                   <pic:nvPicPr>
-                    <pic:cNvPr id="1159794744" name=""/>
+                    <pic:cNvPr id="876533679" name=""/>
                     <pic:cNvPicPr/>
                   </pic:nvPicPr>
                   <pic:blipFill>
@@ -15185,16 +15203,16 @@
         </w:rPr>
         <w:lastRenderedPageBreak/>
         <w:drawing>
-          <wp:inline distT="0" distB="0" distL="0" distR="0" wp14:anchorId="5F87361A" wp14:editId="2865D55F">
+          <wp:inline distT="0" distB="0" distL="0" distR="0" wp14:anchorId="2328DA5A" wp14:editId="00824BDA">
             <wp:extent cx="5120640" cy="3282818"/>
             <wp:effectExtent l="19050" t="19050" r="22860" b="13335"/>
-            <wp:docPr id="887854894" name="Imagem 17"/>
+            <wp:docPr id="641383074" name="Imagem 17"/>
             <wp:cNvGraphicFramePr/>
             <a:graphic xmlns:a="http://schemas.openxmlformats.org/drawingml/2006/main">
               <a:graphicData uri="http://schemas.openxmlformats.org/drawingml/2006/picture">
                 <pic:pic xmlns:pic="http://schemas.openxmlformats.org/drawingml/2006/picture">
                   <pic:nvPicPr>
-                    <pic:cNvPr id="887854894" name=""/>
+                    <pic:cNvPr id="641383074" name=""/>
                     <pic:cNvPicPr/>
                   </pic:nvPicPr>
                   <pic:blipFill>
@@ -15385,7 +15403,7 @@
           <w:sz w:val="27"/>
         </w:rPr>
       </w:pPr>
-      <w:bookmarkStart w:id="28" w:name="_Toc240373139"/>
+      <w:bookmarkStart w:id="28" w:name="_Toc240376189"/>
       <w:r>
         <w:rPr>
           <w:rFonts w:ascii="Montserrat" w:hAnsi="Montserrat"/>
@@ -15425,16 +15443,16 @@
           <w:noProof/>
         </w:rPr>
         <w:drawing>
-          <wp:inline distT="0" distB="0" distL="0" distR="0" wp14:anchorId="065D06E6" wp14:editId="20362822">
+          <wp:inline distT="0" distB="0" distL="0" distR="0" wp14:anchorId="0C941F09" wp14:editId="6A6B4B95">
             <wp:extent cx="5120640" cy="4627581"/>
             <wp:effectExtent l="19050" t="19050" r="22860" b="20955"/>
-            <wp:docPr id="1915625833" name="Imagem 18"/>
+            <wp:docPr id="306954282" name="Imagem 18"/>
             <wp:cNvGraphicFramePr/>
             <a:graphic xmlns:a="http://schemas.openxmlformats.org/drawingml/2006/main">
               <a:graphicData uri="http://schemas.openxmlformats.org/drawingml/2006/picture">
                 <pic:pic xmlns:pic="http://schemas.openxmlformats.org/drawingml/2006/picture">
                   <pic:nvPicPr>
-                    <pic:cNvPr id="1915625833" name=""/>
+                    <pic:cNvPr id="306954282" name=""/>
                     <pic:cNvPicPr/>
                   </pic:nvPicPr>
                   <pic:blipFill>
@@ -15502,16 +15520,16 @@
         </w:rPr>
         <w:lastRenderedPageBreak/>
         <w:drawing>
-          <wp:inline distT="0" distB="0" distL="0" distR="0" wp14:anchorId="0F93E26B" wp14:editId="7A8B5C1D">
+          <wp:inline distT="0" distB="0" distL="0" distR="0" wp14:anchorId="03CAEC89" wp14:editId="44FF18DB">
             <wp:extent cx="5120640" cy="4627581"/>
             <wp:effectExtent l="19050" t="19050" r="22860" b="20955"/>
-            <wp:docPr id="1341847693" name="Imagem 19"/>
+            <wp:docPr id="1577220880" name="Imagem 19"/>
             <wp:cNvGraphicFramePr/>
             <a:graphic xmlns:a="http://schemas.openxmlformats.org/drawingml/2006/main">
               <a:graphicData uri="http://schemas.openxmlformats.org/drawingml/2006/picture">
                 <pic:pic xmlns:pic="http://schemas.openxmlformats.org/drawingml/2006/picture">
                   <pic:nvPicPr>
-                    <pic:cNvPr id="1341847693" name=""/>
+                    <pic:cNvPr id="1577220880" name=""/>
                     <pic:cNvPicPr/>
                   </pic:nvPicPr>
                   <pic:blipFill>
@@ -15694,7 +15712,7 @@
           <w:sz w:val="27"/>
         </w:rPr>
       </w:pPr>
-      <w:bookmarkStart w:id="29" w:name="_Toc240373140"/>
+      <w:bookmarkStart w:id="29" w:name="_Toc240376190"/>
       <w:r>
         <w:rPr>
           <w:rFonts w:ascii="Montserrat" w:hAnsi="Montserrat"/>
@@ -15734,16 +15752,16 @@
           <w:noProof/>
         </w:rPr>
         <w:drawing>
-          <wp:inline distT="0" distB="0" distL="0" distR="0" wp14:anchorId="04F72E14" wp14:editId="0D176535">
+          <wp:inline distT="0" distB="0" distL="0" distR="0" wp14:anchorId="08CF3D98" wp14:editId="3967C32B">
             <wp:extent cx="5120640" cy="4627581"/>
             <wp:effectExtent l="19050" t="19050" r="22860" b="20955"/>
-            <wp:docPr id="1734403886" name="Imagem 20"/>
+            <wp:docPr id="1186472509" name="Imagem 20"/>
             <wp:cNvGraphicFramePr/>
             <a:graphic xmlns:a="http://schemas.openxmlformats.org/drawingml/2006/main">
               <a:graphicData uri="http://schemas.openxmlformats.org/drawingml/2006/picture">
                 <pic:pic xmlns:pic="http://schemas.openxmlformats.org/drawingml/2006/picture">
                   <pic:nvPicPr>
-                    <pic:cNvPr id="1734403886" name=""/>
+                    <pic:cNvPr id="1186472509" name=""/>
                     <pic:cNvPicPr/>
                   </pic:nvPicPr>
                   <pic:blipFill>
@@ -15811,16 +15829,16 @@
         </w:rPr>
         <w:lastRenderedPageBreak/>
         <w:drawing>
-          <wp:inline distT="0" distB="0" distL="0" distR="0" wp14:anchorId="05E035D2" wp14:editId="419A649A">
+          <wp:inline distT="0" distB="0" distL="0" distR="0" wp14:anchorId="6C93209F" wp14:editId="5626C852">
             <wp:extent cx="5120640" cy="4627581"/>
             <wp:effectExtent l="19050" t="19050" r="22860" b="20955"/>
-            <wp:docPr id="1231222807" name="Imagem 21"/>
+            <wp:docPr id="1693990840" name="Imagem 21"/>
             <wp:cNvGraphicFramePr/>
             <a:graphic xmlns:a="http://schemas.openxmlformats.org/drawingml/2006/main">
               <a:graphicData uri="http://schemas.openxmlformats.org/drawingml/2006/picture">
                 <pic:pic xmlns:pic="http://schemas.openxmlformats.org/drawingml/2006/picture">
                   <pic:nvPicPr>
-                    <pic:cNvPr id="1231222807" name=""/>
+                    <pic:cNvPr id="1693990840" name=""/>
                     <pic:cNvPicPr/>
                   </pic:nvPicPr>
                   <pic:blipFill>
@@ -16026,16 +16044,16 @@
           <w:noProof/>
         </w:rPr>
         <w:drawing>
-          <wp:inline distT="0" distB="0" distL="0" distR="0" wp14:anchorId="0797A610" wp14:editId="2120B029">
+          <wp:inline distT="0" distB="0" distL="0" distR="0" wp14:anchorId="0282C628" wp14:editId="44CC7E6D">
             <wp:extent cx="5120640" cy="1757287"/>
             <wp:effectExtent l="19050" t="19050" r="22860" b="14605"/>
-            <wp:docPr id="1586617701" name="Imagem 22"/>
+            <wp:docPr id="257703565" name="Imagem 22"/>
             <wp:cNvGraphicFramePr/>
             <a:graphic xmlns:a="http://schemas.openxmlformats.org/drawingml/2006/main">
               <a:graphicData uri="http://schemas.openxmlformats.org/drawingml/2006/picture">
                 <pic:pic xmlns:pic="http://schemas.openxmlformats.org/drawingml/2006/picture">
                   <pic:nvPicPr>
-                    <pic:cNvPr id="1586617701" name=""/>
+                    <pic:cNvPr id="257703565" name=""/>
                     <pic:cNvPicPr/>
                   </pic:nvPicPr>
                   <pic:blipFill>
@@ -16148,7 +16166,7 @@
           <w:sz w:val="27"/>
         </w:rPr>
       </w:pPr>
-      <w:bookmarkStart w:id="30" w:name="_Toc240373141"/>
+      <w:bookmarkStart w:id="30" w:name="_Toc240376191"/>
       <w:r>
         <w:rPr>
           <w:rFonts w:ascii="Montserrat" w:hAnsi="Montserrat"/>
@@ -16189,16 +16207,16 @@
         </w:rPr>
         <w:lastRenderedPageBreak/>
         <w:drawing>
-          <wp:inline distT="0" distB="0" distL="0" distR="0" wp14:anchorId="543D8717" wp14:editId="698F9DD5">
+          <wp:inline distT="0" distB="0" distL="0" distR="0" wp14:anchorId="6777BCFE" wp14:editId="228FFB48">
             <wp:extent cx="5120640" cy="4627581"/>
             <wp:effectExtent l="19050" t="19050" r="22860" b="20955"/>
-            <wp:docPr id="1031449501" name="Imagem 23"/>
+            <wp:docPr id="2075950210" name="Imagem 23"/>
             <wp:cNvGraphicFramePr/>
             <a:graphic xmlns:a="http://schemas.openxmlformats.org/drawingml/2006/main">
               <a:graphicData uri="http://schemas.openxmlformats.org/drawingml/2006/picture">
                 <pic:pic xmlns:pic="http://schemas.openxmlformats.org/drawingml/2006/picture">
                   <pic:nvPicPr>
-                    <pic:cNvPr id="1031449501" name=""/>
+                    <pic:cNvPr id="2075950210" name=""/>
                     <pic:cNvPicPr/>
                   </pic:nvPicPr>
                   <pic:blipFill>
@@ -16266,16 +16284,16 @@
         </w:rPr>
         <w:lastRenderedPageBreak/>
         <w:drawing>
-          <wp:inline distT="0" distB="0" distL="0" distR="0" wp14:anchorId="7442DE28" wp14:editId="6B50FD9F">
+          <wp:inline distT="0" distB="0" distL="0" distR="0" wp14:anchorId="38655ADB" wp14:editId="13C97E9C">
             <wp:extent cx="5120640" cy="4627581"/>
             <wp:effectExtent l="19050" t="19050" r="22860" b="20955"/>
-            <wp:docPr id="591585184" name="Imagem 24"/>
+            <wp:docPr id="223758141" name="Imagem 24"/>
             <wp:cNvGraphicFramePr/>
             <a:graphic xmlns:a="http://schemas.openxmlformats.org/drawingml/2006/main">
               <a:graphicData uri="http://schemas.openxmlformats.org/drawingml/2006/picture">
                 <pic:pic xmlns:pic="http://schemas.openxmlformats.org/drawingml/2006/picture">
                   <pic:nvPicPr>
-                    <pic:cNvPr id="591585184" name=""/>
+                    <pic:cNvPr id="223758141" name=""/>
                     <pic:cNvPicPr/>
                   </pic:nvPicPr>
                   <pic:blipFill>
@@ -16512,7 +16530,7 @@
           <w:sz w:val="27"/>
         </w:rPr>
       </w:pPr>
-      <w:bookmarkStart w:id="31" w:name="_Toc240373142"/>
+      <w:bookmarkStart w:id="31" w:name="_Toc240376192"/>
       <w:r>
         <w:rPr>
           <w:rFonts w:ascii="Montserrat" w:hAnsi="Montserrat"/>
@@ -16552,16 +16570,16 @@
           <w:noProof/>
         </w:rPr>
         <w:drawing>
-          <wp:inline distT="0" distB="0" distL="0" distR="0" wp14:anchorId="409C66D3" wp14:editId="1A0A98C8">
+          <wp:inline distT="0" distB="0" distL="0" distR="0" wp14:anchorId="0DF81504" wp14:editId="62D739DF">
             <wp:extent cx="5120640" cy="4627581"/>
             <wp:effectExtent l="19050" t="19050" r="22860" b="20955"/>
-            <wp:docPr id="76374980" name="Imagem 25"/>
+            <wp:docPr id="1373314891" name="Imagem 25"/>
             <wp:cNvGraphicFramePr/>
             <a:graphic xmlns:a="http://schemas.openxmlformats.org/drawingml/2006/main">
               <a:graphicData uri="http://schemas.openxmlformats.org/drawingml/2006/picture">
                 <pic:pic xmlns:pic="http://schemas.openxmlformats.org/drawingml/2006/picture">
                   <pic:nvPicPr>
-                    <pic:cNvPr id="76374980" name=""/>
+                    <pic:cNvPr id="1373314891" name=""/>
                     <pic:cNvPicPr/>
                   </pic:nvPicPr>
                   <pic:blipFill>
@@ -16629,16 +16647,16 @@
         </w:rPr>
         <w:lastRenderedPageBreak/>
         <w:drawing>
-          <wp:inline distT="0" distB="0" distL="0" distR="0" wp14:anchorId="62432855" wp14:editId="31A47FAB">
+          <wp:inline distT="0" distB="0" distL="0" distR="0" wp14:anchorId="734B7402" wp14:editId="6C6D43AF">
             <wp:extent cx="5120640" cy="4627581"/>
             <wp:effectExtent l="19050" t="19050" r="22860" b="20955"/>
-            <wp:docPr id="794863372" name="Imagem 26"/>
+            <wp:docPr id="1106405769" name="Imagem 26"/>
             <wp:cNvGraphicFramePr/>
             <a:graphic xmlns:a="http://schemas.openxmlformats.org/drawingml/2006/main">
               <a:graphicData uri="http://schemas.openxmlformats.org/drawingml/2006/picture">
                 <pic:pic xmlns:pic="http://schemas.openxmlformats.org/drawingml/2006/picture">
                   <pic:nvPicPr>
-                    <pic:cNvPr id="794863372" name=""/>
+                    <pic:cNvPr id="1106405769" name=""/>
                     <pic:cNvPicPr/>
                   </pic:nvPicPr>
                   <pic:blipFill>
@@ -16829,7 +16847,7 @@
           <w:sz w:val="27"/>
         </w:rPr>
       </w:pPr>
-      <w:bookmarkStart w:id="32" w:name="_Toc240373143"/>
+      <w:bookmarkStart w:id="32" w:name="_Toc240376193"/>
       <w:r>
         <w:rPr>
           <w:rFonts w:ascii="Montserrat" w:hAnsi="Montserrat"/>
@@ -16869,16 +16887,16 @@
           <w:noProof/>
         </w:rPr>
         <w:drawing>
-          <wp:inline distT="0" distB="0" distL="0" distR="0" wp14:anchorId="4CBEC268" wp14:editId="76259F2F">
+          <wp:inline distT="0" distB="0" distL="0" distR="0" wp14:anchorId="3874A290" wp14:editId="38CBA091">
             <wp:extent cx="5120640" cy="4000682"/>
             <wp:effectExtent l="19050" t="19050" r="22860" b="19050"/>
-            <wp:docPr id="1123553967" name="Imagem 27"/>
+            <wp:docPr id="738415901" name="Imagem 27"/>
             <wp:cNvGraphicFramePr/>
             <a:graphic xmlns:a="http://schemas.openxmlformats.org/drawingml/2006/main">
               <a:graphicData uri="http://schemas.openxmlformats.org/drawingml/2006/picture">
                 <pic:pic xmlns:pic="http://schemas.openxmlformats.org/drawingml/2006/picture">
                   <pic:nvPicPr>
-                    <pic:cNvPr id="1123553967" name=""/>
+                    <pic:cNvPr id="738415901" name=""/>
                     <pic:cNvPicPr/>
                   </pic:nvPicPr>
                   <pic:blipFill>
@@ -17402,7 +17420,7 @@
           <w:sz w:val="34"/>
         </w:rPr>
       </w:pPr>
-      <w:bookmarkStart w:id="33" w:name="_Toc240373144"/>
+      <w:bookmarkStart w:id="33" w:name="_Toc240376194"/>
       <w:r>
         <w:rPr>
           <w:rFonts w:ascii="Montserrat" w:hAnsi="Montserrat"/>
@@ -17444,7 +17462,7 @@
           <w:sz w:val="27"/>
         </w:rPr>
       </w:pPr>
-      <w:bookmarkStart w:id="34" w:name="_Toc240373145"/>
+      <w:bookmarkStart w:id="34" w:name="_Toc240376195"/>
       <w:r>
         <w:rPr>
           <w:rFonts w:ascii="Montserrat" w:hAnsi="Montserrat"/>
@@ -17484,16 +17502,16 @@
           <w:noProof/>
         </w:rPr>
         <w:drawing>
-          <wp:inline distT="0" distB="0" distL="0" distR="0" wp14:anchorId="4AE8DA83" wp14:editId="03582616">
+          <wp:inline distT="0" distB="0" distL="0" distR="0" wp14:anchorId="6EAAFF36" wp14:editId="7A5FAA9A">
             <wp:extent cx="5120640" cy="4627581"/>
             <wp:effectExtent l="19050" t="19050" r="22860" b="20955"/>
-            <wp:docPr id="167700109" name="Imagem 28"/>
+            <wp:docPr id="1234084506" name="Imagem 28"/>
             <wp:cNvGraphicFramePr/>
             <a:graphic xmlns:a="http://schemas.openxmlformats.org/drawingml/2006/main">
               <a:graphicData uri="http://schemas.openxmlformats.org/drawingml/2006/picture">
                 <pic:pic xmlns:pic="http://schemas.openxmlformats.org/drawingml/2006/picture">
                   <pic:nvPicPr>
-                    <pic:cNvPr id="167700109" name=""/>
+                    <pic:cNvPr id="1234084506" name=""/>
                     <pic:cNvPicPr/>
                   </pic:nvPicPr>
                   <pic:blipFill>
@@ -17561,16 +17579,16 @@
         </w:rPr>
         <w:lastRenderedPageBreak/>
         <w:drawing>
-          <wp:inline distT="0" distB="0" distL="0" distR="0" wp14:anchorId="4BC4E48E" wp14:editId="11C62A3C">
+          <wp:inline distT="0" distB="0" distL="0" distR="0" wp14:anchorId="3672F771" wp14:editId="7347154D">
             <wp:extent cx="5120640" cy="4627581"/>
             <wp:effectExtent l="19050" t="19050" r="22860" b="20955"/>
-            <wp:docPr id="1290892" name="Imagem 29"/>
+            <wp:docPr id="604170183" name="Imagem 29"/>
             <wp:cNvGraphicFramePr/>
             <a:graphic xmlns:a="http://schemas.openxmlformats.org/drawingml/2006/main">
               <a:graphicData uri="http://schemas.openxmlformats.org/drawingml/2006/picture">
                 <pic:pic xmlns:pic="http://schemas.openxmlformats.org/drawingml/2006/picture">
                   <pic:nvPicPr>
-                    <pic:cNvPr id="1290892" name=""/>
+                    <pic:cNvPr id="604170183" name=""/>
                     <pic:cNvPicPr/>
                   </pic:nvPicPr>
                   <pic:blipFill>
@@ -17638,16 +17656,16 @@
         </w:rPr>
         <w:lastRenderedPageBreak/>
         <w:drawing>
-          <wp:inline distT="0" distB="0" distL="0" distR="0" wp14:anchorId="391F5344" wp14:editId="29689928">
+          <wp:inline distT="0" distB="0" distL="0" distR="0" wp14:anchorId="23977366" wp14:editId="7FF94715">
             <wp:extent cx="5120640" cy="4627581"/>
             <wp:effectExtent l="19050" t="19050" r="22860" b="20955"/>
-            <wp:docPr id="1891783687" name="Imagem 30"/>
+            <wp:docPr id="249593638" name="Imagem 30"/>
             <wp:cNvGraphicFramePr/>
             <a:graphic xmlns:a="http://schemas.openxmlformats.org/drawingml/2006/main">
               <a:graphicData uri="http://schemas.openxmlformats.org/drawingml/2006/picture">
                 <pic:pic xmlns:pic="http://schemas.openxmlformats.org/drawingml/2006/picture">
                   <pic:nvPicPr>
-                    <pic:cNvPr id="1891783687" name=""/>
+                    <pic:cNvPr id="249593638" name=""/>
                     <pic:cNvPicPr/>
                   </pic:nvPicPr>
                   <pic:blipFill>
@@ -17849,16 +17867,16 @@
           <w:noProof/>
         </w:rPr>
         <w:drawing>
-          <wp:inline distT="0" distB="0" distL="0" distR="0" wp14:anchorId="4C92F358" wp14:editId="582DCFE8">
+          <wp:inline distT="0" distB="0" distL="0" distR="0" wp14:anchorId="6AC0DD58" wp14:editId="3ABBAB16">
             <wp:extent cx="5120640" cy="1715571"/>
             <wp:effectExtent l="19050" t="19050" r="22860" b="18415"/>
-            <wp:docPr id="1048546967" name="Imagem 31"/>
+            <wp:docPr id="250526538" name="Imagem 31"/>
             <wp:cNvGraphicFramePr/>
             <a:graphic xmlns:a="http://schemas.openxmlformats.org/drawingml/2006/main">
               <a:graphicData uri="http://schemas.openxmlformats.org/drawingml/2006/picture">
                 <pic:pic xmlns:pic="http://schemas.openxmlformats.org/drawingml/2006/picture">
                   <pic:nvPicPr>
-                    <pic:cNvPr id="1048546967" name=""/>
+                    <pic:cNvPr id="250526538" name=""/>
                     <pic:cNvPicPr/>
                   </pic:nvPicPr>
                   <pic:blipFill>
@@ -17995,16 +18013,16 @@
           <w:noProof/>
         </w:rPr>
         <w:drawing>
-          <wp:inline distT="0" distB="0" distL="0" distR="0" wp14:anchorId="352719D8" wp14:editId="572A051B">
+          <wp:inline distT="0" distB="0" distL="0" distR="0" wp14:anchorId="7C01F30D" wp14:editId="42E744D1">
             <wp:extent cx="5120640" cy="3282818"/>
             <wp:effectExtent l="19050" t="19050" r="22860" b="13335"/>
-            <wp:docPr id="201176260" name="Imagem 32"/>
+            <wp:docPr id="879600404" name="Imagem 32"/>
             <wp:cNvGraphicFramePr/>
             <a:graphic xmlns:a="http://schemas.openxmlformats.org/drawingml/2006/main">
               <a:graphicData uri="http://schemas.openxmlformats.org/drawingml/2006/picture">
                 <pic:pic xmlns:pic="http://schemas.openxmlformats.org/drawingml/2006/picture">
                   <pic:nvPicPr>
-                    <pic:cNvPr id="201176260" name=""/>
+                    <pic:cNvPr id="879600404" name=""/>
                     <pic:cNvPicPr/>
                   </pic:nvPicPr>
                   <pic:blipFill>
@@ -18138,16 +18156,16 @@
           <w:noProof/>
         </w:rPr>
         <w:drawing>
-          <wp:inline distT="0" distB="0" distL="0" distR="0" wp14:anchorId="6D7E6598" wp14:editId="5E8CE476">
+          <wp:inline distT="0" distB="0" distL="0" distR="0" wp14:anchorId="24C4D685" wp14:editId="1F502144">
             <wp:extent cx="5120640" cy="951357"/>
             <wp:effectExtent l="19050" t="19050" r="22860" b="20320"/>
-            <wp:docPr id="980601981" name="Imagem 33"/>
+            <wp:docPr id="673597386" name="Imagem 33"/>
             <wp:cNvGraphicFramePr/>
             <a:graphic xmlns:a="http://schemas.openxmlformats.org/drawingml/2006/main">
               <a:graphicData uri="http://schemas.openxmlformats.org/drawingml/2006/picture">
                 <pic:pic xmlns:pic="http://schemas.openxmlformats.org/drawingml/2006/picture">
                   <pic:nvPicPr>
-                    <pic:cNvPr id="980601981" name=""/>
+                    <pic:cNvPr id="673597386" name=""/>
                     <pic:cNvPicPr/>
                   </pic:nvPicPr>
                   <pic:blipFill>
@@ -18259,16 +18277,16 @@
           <w:noProof/>
         </w:rPr>
         <w:drawing>
-          <wp:inline distT="0" distB="0" distL="0" distR="0" wp14:anchorId="5C95E9FB" wp14:editId="0DF93184">
+          <wp:inline distT="0" distB="0" distL="0" distR="0" wp14:anchorId="7EA1440D" wp14:editId="604A9374">
             <wp:extent cx="5120640" cy="1515102"/>
             <wp:effectExtent l="19050" t="19050" r="22860" b="28575"/>
-            <wp:docPr id="499485104" name="Imagem 34"/>
+            <wp:docPr id="1720041573" name="Imagem 34"/>
             <wp:cNvGraphicFramePr/>
             <a:graphic xmlns:a="http://schemas.openxmlformats.org/drawingml/2006/main">
               <a:graphicData uri="http://schemas.openxmlformats.org/drawingml/2006/picture">
                 <pic:pic xmlns:pic="http://schemas.openxmlformats.org/drawingml/2006/picture">
                   <pic:nvPicPr>
-                    <pic:cNvPr id="499485104" name=""/>
+                    <pic:cNvPr id="1720041573" name=""/>
                     <pic:cNvPicPr/>
                   </pic:nvPicPr>
                   <pic:blipFill>
@@ -18381,16 +18399,16 @@
           <w:noProof/>
         </w:rPr>
         <w:drawing>
-          <wp:inline distT="0" distB="0" distL="0" distR="0" wp14:anchorId="105E2149" wp14:editId="29A73296">
+          <wp:inline distT="0" distB="0" distL="0" distR="0" wp14:anchorId="38CF621C" wp14:editId="40F0E80A">
             <wp:extent cx="5120640" cy="1391113"/>
             <wp:effectExtent l="19050" t="19050" r="22860" b="19050"/>
-            <wp:docPr id="934334358" name="Imagem 35"/>
+            <wp:docPr id="1354446959" name="Imagem 35"/>
             <wp:cNvGraphicFramePr/>
             <a:graphic xmlns:a="http://schemas.openxmlformats.org/drawingml/2006/main">
               <a:graphicData uri="http://schemas.openxmlformats.org/drawingml/2006/picture">
                 <pic:pic xmlns:pic="http://schemas.openxmlformats.org/drawingml/2006/picture">
                   <pic:nvPicPr>
-                    <pic:cNvPr id="934334358" name=""/>
+                    <pic:cNvPr id="1354446959" name=""/>
                     <pic:cNvPicPr/>
                   </pic:nvPicPr>
                   <pic:blipFill>
@@ -18502,16 +18520,16 @@
           <w:noProof/>
         </w:rPr>
         <w:drawing>
-          <wp:inline distT="0" distB="0" distL="0" distR="0" wp14:anchorId="58FDDD2F" wp14:editId="126BB7D4">
+          <wp:inline distT="0" distB="0" distL="0" distR="0" wp14:anchorId="63596804" wp14:editId="4561F3DE">
             <wp:extent cx="5120640" cy="1125174"/>
             <wp:effectExtent l="19050" t="19050" r="22860" b="18415"/>
-            <wp:docPr id="2092159990" name="Imagem 36"/>
+            <wp:docPr id="1556265203" name="Imagem 36"/>
             <wp:cNvGraphicFramePr/>
             <a:graphic xmlns:a="http://schemas.openxmlformats.org/drawingml/2006/main">
               <a:graphicData uri="http://schemas.openxmlformats.org/drawingml/2006/picture">
                 <pic:pic xmlns:pic="http://schemas.openxmlformats.org/drawingml/2006/picture">
                   <pic:nvPicPr>
-                    <pic:cNvPr id="2092159990" name=""/>
+                    <pic:cNvPr id="1556265203" name=""/>
                     <pic:cNvPicPr/>
                   </pic:nvPicPr>
                   <pic:blipFill>
@@ -18601,7 +18619,7 @@
           <w:sz w:val="27"/>
         </w:rPr>
       </w:pPr>
-      <w:bookmarkStart w:id="35" w:name="_Toc240373146"/>
+      <w:bookmarkStart w:id="35" w:name="_Toc240376196"/>
       <w:r>
         <w:rPr>
           <w:rFonts w:ascii="Montserrat" w:hAnsi="Montserrat"/>
@@ -18641,16 +18659,16 @@
           <w:noProof/>
         </w:rPr>
         <w:drawing>
-          <wp:inline distT="0" distB="0" distL="0" distR="0" wp14:anchorId="622BB44E" wp14:editId="6A7DAC26">
+          <wp:inline distT="0" distB="0" distL="0" distR="0" wp14:anchorId="0744E1B7" wp14:editId="0DA3291F">
             <wp:extent cx="5120640" cy="4627581"/>
             <wp:effectExtent l="19050" t="19050" r="22860" b="20955"/>
-            <wp:docPr id="992350636" name="Imagem 37"/>
+            <wp:docPr id="478061357" name="Imagem 37"/>
             <wp:cNvGraphicFramePr/>
             <a:graphic xmlns:a="http://schemas.openxmlformats.org/drawingml/2006/main">
               <a:graphicData uri="http://schemas.openxmlformats.org/drawingml/2006/picture">
                 <pic:pic xmlns:pic="http://schemas.openxmlformats.org/drawingml/2006/picture">
                   <pic:nvPicPr>
-                    <pic:cNvPr id="992350636" name=""/>
+                    <pic:cNvPr id="478061357" name=""/>
                     <pic:cNvPicPr/>
                   </pic:nvPicPr>
                   <pic:blipFill>
@@ -18718,16 +18736,16 @@
         </w:rPr>
         <w:lastRenderedPageBreak/>
         <w:drawing>
-          <wp:inline distT="0" distB="0" distL="0" distR="0" wp14:anchorId="63BF3B0F" wp14:editId="59CDD365">
+          <wp:inline distT="0" distB="0" distL="0" distR="0" wp14:anchorId="4A989A25" wp14:editId="3B9436F0">
             <wp:extent cx="5120640" cy="4627581"/>
             <wp:effectExtent l="19050" t="19050" r="22860" b="20955"/>
-            <wp:docPr id="1906275943" name="Imagem 38"/>
+            <wp:docPr id="1296241275" name="Imagem 38"/>
             <wp:cNvGraphicFramePr/>
             <a:graphic xmlns:a="http://schemas.openxmlformats.org/drawingml/2006/main">
               <a:graphicData uri="http://schemas.openxmlformats.org/drawingml/2006/picture">
                 <pic:pic xmlns:pic="http://schemas.openxmlformats.org/drawingml/2006/picture">
                   <pic:nvPicPr>
-                    <pic:cNvPr id="1906275943" name=""/>
+                    <pic:cNvPr id="1296241275" name=""/>
                     <pic:cNvPicPr/>
                   </pic:nvPicPr>
                   <pic:blipFill>
@@ -18896,16 +18914,16 @@
           <w:noProof/>
         </w:rPr>
         <w:drawing>
-          <wp:inline distT="0" distB="0" distL="0" distR="0" wp14:anchorId="46F7E0FF" wp14:editId="73535047">
+          <wp:inline distT="0" distB="0" distL="0" distR="0" wp14:anchorId="35239157" wp14:editId="16A5DFFF">
             <wp:extent cx="5120640" cy="2144319"/>
             <wp:effectExtent l="19050" t="19050" r="22860" b="27940"/>
-            <wp:docPr id="361138060" name="Imagem 39"/>
+            <wp:docPr id="1826636647" name="Imagem 39"/>
             <wp:cNvGraphicFramePr/>
             <a:graphic xmlns:a="http://schemas.openxmlformats.org/drawingml/2006/main">
               <a:graphicData uri="http://schemas.openxmlformats.org/drawingml/2006/picture">
                 <pic:pic xmlns:pic="http://schemas.openxmlformats.org/drawingml/2006/picture">
                   <pic:nvPicPr>
-                    <pic:cNvPr id="361138060" name=""/>
+                    <pic:cNvPr id="1826636647" name=""/>
                     <pic:cNvPicPr/>
                   </pic:nvPicPr>
                   <pic:blipFill>
@@ -18993,16 +19011,16 @@
           <w:noProof/>
         </w:rPr>
         <w:drawing>
-          <wp:inline distT="0" distB="0" distL="0" distR="0" wp14:anchorId="797FF2C8" wp14:editId="18C48C9E">
+          <wp:inline distT="0" distB="0" distL="0" distR="0" wp14:anchorId="507F366B" wp14:editId="5317D9D8">
             <wp:extent cx="5120640" cy="1055647"/>
             <wp:effectExtent l="19050" t="19050" r="22860" b="11430"/>
-            <wp:docPr id="410783800" name="Imagem 40"/>
+            <wp:docPr id="1957385362" name="Imagem 40"/>
             <wp:cNvGraphicFramePr/>
             <a:graphic xmlns:a="http://schemas.openxmlformats.org/drawingml/2006/main">
               <a:graphicData uri="http://schemas.openxmlformats.org/drawingml/2006/picture">
                 <pic:pic xmlns:pic="http://schemas.openxmlformats.org/drawingml/2006/picture">
                   <pic:nvPicPr>
-                    <pic:cNvPr id="410783800" name=""/>
+                    <pic:cNvPr id="1957385362" name=""/>
                     <pic:cNvPicPr/>
                   </pic:nvPicPr>
                   <pic:blipFill>
@@ -19124,16 +19142,16 @@
           <w:noProof/>
         </w:rPr>
         <w:drawing>
-          <wp:inline distT="0" distB="0" distL="0" distR="0" wp14:anchorId="459811E9" wp14:editId="5099A218">
+          <wp:inline distT="0" distB="0" distL="0" distR="0" wp14:anchorId="50FD9069" wp14:editId="63D9F63D">
             <wp:extent cx="5120640" cy="3282818"/>
             <wp:effectExtent l="19050" t="19050" r="22860" b="13335"/>
-            <wp:docPr id="478582745" name="Imagem 41"/>
+            <wp:docPr id="1044595642" name="Imagem 41"/>
             <wp:cNvGraphicFramePr/>
             <a:graphic xmlns:a="http://schemas.openxmlformats.org/drawingml/2006/main">
               <a:graphicData uri="http://schemas.openxmlformats.org/drawingml/2006/picture">
                 <pic:pic xmlns:pic="http://schemas.openxmlformats.org/drawingml/2006/picture">
                   <pic:nvPicPr>
-                    <pic:cNvPr id="478582745" name=""/>
+                    <pic:cNvPr id="1044595642" name=""/>
                     <pic:cNvPicPr/>
                   </pic:nvPicPr>
                   <pic:blipFill>
@@ -19267,16 +19285,16 @@
         </w:rPr>
         <w:lastRenderedPageBreak/>
         <w:drawing>
-          <wp:inline distT="0" distB="0" distL="0" distR="0" wp14:anchorId="4A4DDC54" wp14:editId="5D672BC5">
+          <wp:inline distT="0" distB="0" distL="0" distR="0" wp14:anchorId="597359E2" wp14:editId="4B55CEFC">
             <wp:extent cx="5120640" cy="1978034"/>
             <wp:effectExtent l="19050" t="19050" r="22860" b="22225"/>
-            <wp:docPr id="310566213" name="Imagem 42"/>
+            <wp:docPr id="1479435981" name="Imagem 42"/>
             <wp:cNvGraphicFramePr/>
             <a:graphic xmlns:a="http://schemas.openxmlformats.org/drawingml/2006/main">
               <a:graphicData uri="http://schemas.openxmlformats.org/drawingml/2006/picture">
                 <pic:pic xmlns:pic="http://schemas.openxmlformats.org/drawingml/2006/picture">
                   <pic:nvPicPr>
-                    <pic:cNvPr id="310566213" name=""/>
+                    <pic:cNvPr id="1479435981" name=""/>
                     <pic:cNvPicPr/>
                   </pic:nvPicPr>
                   <pic:blipFill>
@@ -19348,7 +19366,7 @@
           <w:sz w:val="34"/>
         </w:rPr>
       </w:pPr>
-      <w:bookmarkStart w:id="36" w:name="_Toc240373147"/>
+      <w:bookmarkStart w:id="36" w:name="_Toc240376197"/>
       <w:r>
         <w:rPr>
           <w:rFonts w:ascii="Montserrat" w:hAnsi="Montserrat"/>
@@ -19408,7 +19426,7 @@
           <w:sz w:val="27"/>
         </w:rPr>
       </w:pPr>
-      <w:bookmarkStart w:id="37" w:name="_Toc240373148"/>
+      <w:bookmarkStart w:id="37" w:name="_Toc240376198"/>
       <w:r>
         <w:rPr>
           <w:rFonts w:ascii="Montserrat" w:hAnsi="Montserrat"/>
@@ -19448,16 +19466,16 @@
           <w:noProof/>
         </w:rPr>
         <w:drawing>
-          <wp:inline distT="0" distB="0" distL="0" distR="0" wp14:anchorId="05A2131F" wp14:editId="4AF2EACE">
+          <wp:inline distT="0" distB="0" distL="0" distR="0" wp14:anchorId="050A6592" wp14:editId="07944115">
             <wp:extent cx="5303520" cy="4792851"/>
             <wp:effectExtent l="19050" t="19050" r="11430" b="27305"/>
-            <wp:docPr id="424102076" name="Imagem 43"/>
+            <wp:docPr id="1870792598" name="Imagem 43"/>
             <wp:cNvGraphicFramePr/>
             <a:graphic xmlns:a="http://schemas.openxmlformats.org/drawingml/2006/main">
               <a:graphicData uri="http://schemas.openxmlformats.org/drawingml/2006/picture">
                 <pic:pic xmlns:pic="http://schemas.openxmlformats.org/drawingml/2006/picture">
                   <pic:nvPicPr>
-                    <pic:cNvPr id="424102076" name=""/>
+                    <pic:cNvPr id="1870792598" name=""/>
                     <pic:cNvPicPr/>
                   </pic:nvPicPr>
                   <pic:blipFill>
@@ -19526,7 +19544,7 @@
           <w:sz w:val="27"/>
         </w:rPr>
       </w:pPr>
-      <w:bookmarkStart w:id="38" w:name="_Toc240373149"/>
+      <w:bookmarkStart w:id="38" w:name="_Toc240376199"/>
       <w:r>
         <w:rPr>
           <w:rFonts w:ascii="Montserrat" w:hAnsi="Montserrat"/>
@@ -19566,16 +19584,16 @@
           <w:noProof/>
         </w:rPr>
         <w:drawing>
-          <wp:inline distT="0" distB="0" distL="0" distR="0" wp14:anchorId="0E51027D" wp14:editId="2964B1C0">
+          <wp:inline distT="0" distB="0" distL="0" distR="0" wp14:anchorId="5CB77B8D" wp14:editId="0BA8F9A8">
             <wp:extent cx="5303520" cy="4792851"/>
             <wp:effectExtent l="19050" t="19050" r="11430" b="27305"/>
-            <wp:docPr id="79157620" name="Imagem 44"/>
+            <wp:docPr id="2101072933" name="Imagem 44"/>
             <wp:cNvGraphicFramePr/>
             <a:graphic xmlns:a="http://schemas.openxmlformats.org/drawingml/2006/main">
               <a:graphicData uri="http://schemas.openxmlformats.org/drawingml/2006/picture">
                 <pic:pic xmlns:pic="http://schemas.openxmlformats.org/drawingml/2006/picture">
                   <pic:nvPicPr>
-                    <pic:cNvPr id="79157620" name=""/>
+                    <pic:cNvPr id="2101072933" name=""/>
                     <pic:cNvPicPr/>
                   </pic:nvPicPr>
                   <pic:blipFill>
@@ -19643,7 +19661,7 @@
           <w:sz w:val="27"/>
         </w:rPr>
       </w:pPr>
-      <w:bookmarkStart w:id="39" w:name="_Toc240373150"/>
+      <w:bookmarkStart w:id="39" w:name="_Toc240376200"/>
       <w:r>
         <w:rPr>
           <w:rFonts w:ascii="Montserrat" w:hAnsi="Montserrat"/>
@@ -19684,16 +19702,16 @@
         </w:rPr>
         <w:lastRenderedPageBreak/>
         <w:drawing>
-          <wp:inline distT="0" distB="0" distL="0" distR="0" wp14:anchorId="3A303B51" wp14:editId="67F12B95">
+          <wp:inline distT="0" distB="0" distL="0" distR="0" wp14:anchorId="28416A28" wp14:editId="348DD64E">
             <wp:extent cx="5303520" cy="4792851"/>
             <wp:effectExtent l="19050" t="19050" r="11430" b="27305"/>
-            <wp:docPr id="1810510422" name="Imagem 45"/>
+            <wp:docPr id="1149052275" name="Imagem 45"/>
             <wp:cNvGraphicFramePr/>
             <a:graphic xmlns:a="http://schemas.openxmlformats.org/drawingml/2006/main">
               <a:graphicData uri="http://schemas.openxmlformats.org/drawingml/2006/picture">
                 <pic:pic xmlns:pic="http://schemas.openxmlformats.org/drawingml/2006/picture">
                   <pic:nvPicPr>
-                    <pic:cNvPr id="1810510422" name=""/>
+                    <pic:cNvPr id="1149052275" name=""/>
                     <pic:cNvPicPr/>
                   </pic:nvPicPr>
                   <pic:blipFill>
@@ -19761,16 +19779,16 @@
         </w:rPr>
         <w:lastRenderedPageBreak/>
         <w:drawing>
-          <wp:inline distT="0" distB="0" distL="0" distR="0" wp14:anchorId="6D038E49" wp14:editId="689F7FAC">
+          <wp:inline distT="0" distB="0" distL="0" distR="0" wp14:anchorId="2E3C2A74" wp14:editId="5434D2A6">
             <wp:extent cx="5303520" cy="4792851"/>
             <wp:effectExtent l="19050" t="19050" r="11430" b="27305"/>
-            <wp:docPr id="1204892252" name="Imagem 46"/>
+            <wp:docPr id="604152977" name="Imagem 46"/>
             <wp:cNvGraphicFramePr/>
             <a:graphic xmlns:a="http://schemas.openxmlformats.org/drawingml/2006/main">
               <a:graphicData uri="http://schemas.openxmlformats.org/drawingml/2006/picture">
                 <pic:pic xmlns:pic="http://schemas.openxmlformats.org/drawingml/2006/picture">
                   <pic:nvPicPr>
-                    <pic:cNvPr id="1204892252" name=""/>
+                    <pic:cNvPr id="604152977" name=""/>
                     <pic:cNvPicPr/>
                   </pic:nvPicPr>
                   <pic:blipFill>
@@ -19863,7 +19881,7 @@
           <w:sz w:val="34"/>
         </w:rPr>
       </w:pPr>
-      <w:bookmarkStart w:id="40" w:name="_Toc240373151"/>
+      <w:bookmarkStart w:id="40" w:name="_Toc240376201"/>
       <w:r>
         <w:rPr>
           <w:rFonts w:ascii="Montserrat" w:hAnsi="Montserrat"/>
@@ -19905,7 +19923,7 @@
           <w:sz w:val="27"/>
         </w:rPr>
       </w:pPr>
-      <w:bookmarkStart w:id="41" w:name="_Toc240373152"/>
+      <w:bookmarkStart w:id="41" w:name="_Toc240376202"/>
       <w:r>
         <w:rPr>
           <w:rFonts w:ascii="Montserrat" w:hAnsi="Montserrat"/>
@@ -19945,16 +19963,16 @@
           <w:noProof/>
         </w:rPr>
         <w:drawing>
-          <wp:inline distT="0" distB="0" distL="0" distR="0" wp14:anchorId="16AB8FD5" wp14:editId="779A51B1">
+          <wp:inline distT="0" distB="0" distL="0" distR="0" wp14:anchorId="79BEEF8D" wp14:editId="47EB961A">
             <wp:extent cx="5303520" cy="4792851"/>
             <wp:effectExtent l="19050" t="19050" r="11430" b="27305"/>
-            <wp:docPr id="527168072" name="Imagem 47"/>
+            <wp:docPr id="782762280" name="Imagem 47"/>
             <wp:cNvGraphicFramePr/>
             <a:graphic xmlns:a="http://schemas.openxmlformats.org/drawingml/2006/main">
               <a:graphicData uri="http://schemas.openxmlformats.org/drawingml/2006/picture">
                 <pic:pic xmlns:pic="http://schemas.openxmlformats.org/drawingml/2006/picture">
                   <pic:nvPicPr>
-                    <pic:cNvPr id="527168072" name=""/>
+                    <pic:cNvPr id="782762280" name=""/>
                     <pic:cNvPicPr/>
                   </pic:nvPicPr>
                   <pic:blipFill>
@@ -20027,7 +20045,7 @@
           <w:color w:val="1A1A1A"/>
           <w:sz w:val="22"/>
         </w:rPr>
-        <w:t>No topo da lista, o Admin pode pre-cadastrar uma pessoa que ainda nao fez login, preenchendo nome, telefone (opcional), e-mail e papel e clicando em + Adicionar usuario. Enquanto a pessoa nao faz o primeiro login, ela aparece na lista com o selo Pendente - 1o login, e o Admin ainda pode ajustar telefone e papel ou remover o pre-cadastro pelo botao Remover.</w:t>
+        <w:t>No topo da lista, o Admin pode cadastrar uma pessoa que ainda nao fez login, preenchendo nome, telefone (opcional), e-mail e papel e clicando em + Adicionar usuario. A conta e criada de verdade na hora (via Supabase Auth) - a pessoa ja aparece na lista de usuarios normalmente, com o papel e o nome definidos, e ja pode ser adicionada a equipe de qualquer projeto (secao 6.2) sem precisar esperar ela logar.</w:t>
       </w:r>
     </w:p>
     <w:p>
@@ -20048,7 +20066,25 @@
           <w:color w:val="6A6A70"/>
           <w:sz w:val="21"/>
         </w:rPr>
-        <w:t>Quando a pessoa pre-cadastrada faz o primeiro login, o sistema aplica automaticamente o nome, telefone e papel definidos pelo Admin ao perfil recem-criado - ela nao entra mais como Solicitante por padrao, e o pre-cadastro pendente desaparece da lista.</w:t>
+        <w:t>Quando a pessoa eventualmente fizer o primeiro login (link magico ou Microsoft), o Supabase Auth reconhece o e-mail e autentica direto na conta ja criada - nao gera uma conta duplicada, e o perfil (nome, telefone, papel) ja definido pelo Admin permanece do jeito que estava.</w:t>
+      </w:r>
+    </w:p>
+    <w:p>
+      <w:pPr>
+        <w:spacing w:line="280" w:lineRule="auto"/>
+        <w:rPr>
+          <w:rFonts w:ascii="Montserrat" w:hAnsi="Montserrat"/>
+          <w:color w:val="1A1A1A"/>
+          <w:sz w:val="22"/>
+        </w:rPr>
+      </w:pPr>
+      <w:r>
+        <w:rPr>
+          <w:rFonts w:ascii="Montserrat" w:hAnsi="Montserrat"/>
+          <w:color w:val="1A1A1A"/>
+          <w:sz w:val="22"/>
+        </w:rPr>
+        <w:t>Antes de 15/09/2026, cadastrar alguem aqui criava so um pre-cadastro pendente, que so virava conta de verdade no primeiro login da pessoa - por isso ela nao podia ser adicionada a uma equipe antes disso. Um pre-cadastro feito daquele jeito (selo Pendente - 1o login na lista) ainda funciona: o Admin pode ajustar telefone e papel, remove-lo pelo botao Remover, ou usar o novo botao Criar conta agora para converte-lo numa conta de verdade imediatamente, sem esperar o login.</w:t>
       </w:r>
     </w:p>
     <w:p>
@@ -20126,7 +20162,16 @@
           <w:color w:val="1A1A1A"/>
           <w:sz w:val="22"/>
         </w:rPr>
-        <w:t>Cada usuario ja cadastrado (menos o proprio Admin logado) tem um botao Remover na ultima coluna. Ao clicar, o sistema checa na hora se a pessoa faz parte da equipe de algum projeto, criou algum projeto, tem registro criado em seu nome em algum dos 9 formularios que gravam essa informacao, ou tem alguma inscricao de notificacao push registrada nesse e-mail. Se algum desses vinculos existir, a remocao e recusada e o Admin ve exatamente qual foi o motivo; caso contrario, pede confirmacao final antes de excluir o perfil.</w:t>
+        <w:t xml:space="preserve">Cada usuario ja cadastrado (menos o proprio Admin logado) tem um botao Remover na ultima coluna. Ao clicar, o sistema checa na hora se a pessoa faz parte da equipe de algum projeto, criou algum projeto, tem registro criado em seu nome em algum dos 9 formularios que gravam essa informacao, ou tem </w:t>
+      </w:r>
+      <w:r>
+        <w:rPr>
+          <w:rFonts w:ascii="Montserrat" w:hAnsi="Montserrat"/>
+          <w:color w:val="1A1A1A"/>
+          <w:sz w:val="22"/>
+        </w:rPr>
+        <w:lastRenderedPageBreak/>
+        <w:t>alguma inscricao de notificacao push registrada nesse e-mail. Se algum desses vinculos existir, a remocao e recusada e o Admin ve exatamente qual foi o motivo; caso contrario, pede confirmacao final antes de excluir o perfil.</w:t>
       </w:r>
     </w:p>
     <w:p>
@@ -20147,37 +20192,27 @@
           <w:color w:val="6A6A70"/>
           <w:sz w:val="21"/>
         </w:rPr>
-        <w:t xml:space="preserve">Remover aqui apaga so o perfil (papel, nome, telefone) do sistema - nao impede a pessoa de logar de novo depois; se logar, um perfil novo e criado do zero, com o papel padrao Solicitante. Os tres formularios que sao documentos unicos e compartilhados (Plano de Comunicacao, Relatorio de Situacao e Relatorio de </w:t>
-      </w:r>
-      <w:r>
+        <w:t>Remover aqui apaga so o perfil (papel, nome, telefone) do sistema - nao impede a pessoa de logar de novo depois; se logar, um perfil novo e criado do zero, com o papel padrao Solicitante. Os tres formularios que sao documentos unicos e compartilhados (Plano de Comunicacao, Relatorio de Situacao e Relatorio de Entregas) nao entram na checagem automatica, por nao terem o conceito de quem criou o registro.</w:t>
+      </w:r>
+    </w:p>
+    <w:p>
+      <w:pPr>
+        <w:spacing w:before="160" w:after="200"/>
+        <w:ind w:left="283"/>
         <w:rPr>
           <w:rFonts w:ascii="Montserrat" w:hAnsi="Montserrat"/>
           <w:i/>
           <w:color w:val="6A6A70"/>
           <w:sz w:val="21"/>
         </w:rPr>
-        <w:lastRenderedPageBreak/>
-        <w:t>Entregas) nao entram na checagem automatica, por nao terem o conceito de quem criou o registro.</w:t>
-      </w:r>
-    </w:p>
-    <w:p>
-      <w:pPr>
-        <w:spacing w:before="160" w:after="200"/>
-        <w:ind w:left="283"/>
+      </w:pPr>
+      <w:r>
         <w:rPr>
           <w:rFonts w:ascii="Montserrat" w:hAnsi="Montserrat"/>
           <w:i/>
           <w:color w:val="6A6A70"/>
           <w:sz w:val="21"/>
         </w:rPr>
-      </w:pPr>
-      <w:r>
-        <w:rPr>
-          <w:rFonts w:ascii="Montserrat" w:hAnsi="Montserrat"/>
-          <w:i/>
-          <w:color w:val="6A6A70"/>
-          <w:sz w:val="21"/>
-        </w:rPr>
         <w:t>A propria remocao tambem fica registrada: antes de excluir o perfil, o sistema grava no historico de alteracoes (a mesma tabela usada pelo Ver historico) quem removeu quem, com qual papel a pessoa estava e quando - mesmo que o perfil nao exista mais para abrir o historico depois pela tela.</w:t>
       </w:r>
     </w:p>
@@ -20192,7 +20227,7 @@
           <w:sz w:val="27"/>
         </w:rPr>
       </w:pPr>
-      <w:bookmarkStart w:id="42" w:name="_Toc240373153"/>
+      <w:bookmarkStart w:id="42" w:name="_Toc240376203"/>
       <w:r>
         <w:rPr>
           <w:rFonts w:ascii="Montserrat" w:hAnsi="Montserrat"/>
@@ -20219,7 +20254,7 @@
           <w:color w:val="1A1A1A"/>
           <w:sz w:val="22"/>
         </w:rPr>
-        <w:t>Define quem faz parte da equipe de cada projeto - a base da restricao por equipe descrita na secao 2.5. Selecione um projeto, escolha um papel e clique em + Adicionar a equipe.</w:t>
+        <w:t>Define quem faz parte da equipe de cada projeto - a base da restricao por equipe descrita na secao 2.5. Selecione um projeto, escolha uma pessoa na lista e clique em + Adicionar a equipe.</w:t>
       </w:r>
     </w:p>
     <w:p>
@@ -20231,17 +20266,18 @@
         <w:rPr>
           <w:noProof/>
         </w:rPr>
+        <w:lastRenderedPageBreak/>
         <w:drawing>
-          <wp:inline distT="0" distB="0" distL="0" distR="0" wp14:anchorId="0D7EF630" wp14:editId="69216562">
+          <wp:inline distT="0" distB="0" distL="0" distR="0" wp14:anchorId="3073A743" wp14:editId="1A8762D8">
             <wp:extent cx="5303520" cy="4792851"/>
             <wp:effectExtent l="19050" t="19050" r="11430" b="27305"/>
-            <wp:docPr id="1733128128" name="Imagem 48"/>
+            <wp:docPr id="458632454" name="Imagem 48"/>
             <wp:cNvGraphicFramePr/>
             <a:graphic xmlns:a="http://schemas.openxmlformats.org/drawingml/2006/main">
               <a:graphicData uri="http://schemas.openxmlformats.org/drawingml/2006/picture">
                 <pic:pic xmlns:pic="http://schemas.openxmlformats.org/drawingml/2006/picture">
                   <pic:nvPicPr>
-                    <pic:cNvPr id="1733128128" name=""/>
+                    <pic:cNvPr id="458632454" name=""/>
                     <pic:cNvPicPr/>
                   </pic:nvPicPr>
                   <pic:blipFill>
@@ -20300,6 +20336,27 @@
     </w:p>
     <w:p>
       <w:pPr>
+        <w:spacing w:before="160" w:after="200"/>
+        <w:ind w:left="283"/>
+        <w:rPr>
+          <w:rFonts w:ascii="Montserrat" w:hAnsi="Montserrat"/>
+          <w:i/>
+          <w:color w:val="6A6A70"/>
+          <w:sz w:val="21"/>
+        </w:rPr>
+      </w:pPr>
+      <w:r>
+        <w:rPr>
+          <w:rFonts w:ascii="Montserrat" w:hAnsi="Montserrat"/>
+          <w:i/>
+          <w:color w:val="6A6A70"/>
+          <w:sz w:val="21"/>
+        </w:rPr>
+        <w:t>A lista de + Adicionar a equipe so mostra contas de verdade (secao 6.1), sem contar quem ja esta na equipe daquele projeto - se alguem que deveria aparecer nao estiver na lista, confira se essa pessoa ja tem conta criada (nao um pre-cadastro antigo ainda pendente) e se ela ja nao faz parte da equipe.</w:t>
+      </w:r>
+    </w:p>
+    <w:p>
+      <w:pPr>
         <w:pStyle w:val="Ttulo2"/>
         <w:spacing w:before="320" w:after="120"/>
         <w:rPr>
@@ -20309,7 +20366,7 @@
           <w:sz w:val="27"/>
         </w:rPr>
       </w:pPr>
-      <w:bookmarkStart w:id="43" w:name="_Toc240373154"/>
+      <w:bookmarkStart w:id="43" w:name="_Toc240376204"/>
       <w:r>
         <w:rPr>
           <w:rFonts w:ascii="Montserrat" w:hAnsi="Montserrat"/>
@@ -20317,7 +20374,6 @@
           <w:color w:val="B91D2E"/>
           <w:sz w:val="27"/>
         </w:rPr>
-        <w:lastRenderedPageBreak/>
         <w:t>6.3 Configuracoes</w:t>
       </w:r>
       <w:bookmarkEnd w:id="43"/>
@@ -20349,17 +20405,18 @@
         <w:rPr>
           <w:noProof/>
         </w:rPr>
+        <w:lastRenderedPageBreak/>
         <w:drawing>
-          <wp:inline distT="0" distB="0" distL="0" distR="0" wp14:anchorId="5C89C3CE" wp14:editId="3E38C057">
+          <wp:inline distT="0" distB="0" distL="0" distR="0" wp14:anchorId="7E9EE408" wp14:editId="4A39F21E">
             <wp:extent cx="5303520" cy="4792851"/>
             <wp:effectExtent l="19050" t="19050" r="11430" b="27305"/>
-            <wp:docPr id="1807264839" name="Imagem 49"/>
+            <wp:docPr id="362120249" name="Imagem 49"/>
             <wp:cNvGraphicFramePr/>
             <a:graphic xmlns:a="http://schemas.openxmlformats.org/drawingml/2006/main">
               <a:graphicData uri="http://schemas.openxmlformats.org/drawingml/2006/picture">
                 <pic:pic xmlns:pic="http://schemas.openxmlformats.org/drawingml/2006/picture">
                   <pic:nvPicPr>
-                    <pic:cNvPr id="1807264839" name=""/>
+                    <pic:cNvPr id="362120249" name=""/>
                     <pic:cNvPicPr/>
                   </pic:nvPicPr>
                   <pic:blipFill>
@@ -20449,7 +20506,6 @@
           <w:color w:val="1A1A1A"/>
           <w:sz w:val="22"/>
         </w:rPr>
-        <w:lastRenderedPageBreak/>
         <w:t>Um sexto grupo, Quem pode editar o Plano de Comunicacao de Projeto, controla so a aba Editar dados desse formulario (Passo 10) - diferente dos cinco grupos acima, que controlam a pagina inteira. Comeca marcado apenas para PMO/Admin; qualquer papel fora da lista continua vendo e imprimindo o Painel normalmente, so nao consegue editar.</w:t>
       </w:r>
     </w:p>
@@ -20471,6 +20527,7 @@
           <w:color w:val="6A6A70"/>
           <w:sz w:val="21"/>
         </w:rPr>
+        <w:lastRenderedPageBreak/>
         <w:t>O papel Admin sempre tem acesso a essas seis configuracoes, mesmo que fique desmarcado por engano - isso evita que o proprio Admin perca o acesso e fique sem como reverter a configuracao.</w:t>
       </w:r>
     </w:p>
@@ -20503,7 +20560,7 @@
           <w:sz w:val="27"/>
         </w:rPr>
       </w:pPr>
-      <w:bookmarkStart w:id="44" w:name="_Toc240373155"/>
+      <w:bookmarkStart w:id="44" w:name="_Toc240376205"/>
       <w:r>
         <w:rPr>
           <w:rFonts w:ascii="Montserrat" w:hAnsi="Montserrat"/>
@@ -20626,16 +20683,7 @@
           <w:color w:val="1A1A1A"/>
           <w:sz w:val="22"/>
         </w:rPr>
-        <w:t xml:space="preserve">Custos por categoria (portfolio): tabela listando cada categoria de custo (casada pelo nome, o mesmo casamento do Comparativo por categoria do Relatorio de Situacao, secao 4.1) com em quantos projetos do portfolio ela tem estimativa no TAP e em quantos desses o Realizado ultrapassou o Estimado - para achar categorias que estouram o orcamento de forma </w:t>
-      </w:r>
-      <w:r>
-        <w:rPr>
-          <w:rFonts w:ascii="Montserrat" w:hAnsi="Montserrat"/>
-          <w:color w:val="1A1A1A"/>
-          <w:sz w:val="22"/>
-        </w:rPr>
-        <w:lastRenderedPageBreak/>
-        <w:t>sistematica, nao so num projeto isolado. So entram projetos com Projeto vinculado, custo estimado no TAP e custo realizado registrado.</w:t>
+        <w:t>Custos por categoria (portfolio): tabela listando cada categoria de custo (casada pelo nome, o mesmo casamento do Comparativo por categoria do Relatorio de Situacao, secao 4.1) com em quantos projetos do portfolio ela tem estimativa no TAP e em quantos desses o Realizado ultrapassou o Estimado - para achar categorias que estouram o orcamento de forma sistematica, nao so num projeto isolado. So entram projetos com Projeto vinculado, custo estimado no TAP e custo realizado registrado.</w:t>
       </w:r>
     </w:p>
     <w:p>
@@ -20659,7 +20707,16 @@
           <w:color w:val="1A1A1A"/>
           <w:sz w:val="22"/>
         </w:rPr>
-        <w:t>Entregas da EAP (portfolio): % de entregas (nivel 2) concluidas somando todas as EAPs cadastradas, e em quantos projetos existe pelo menos uma entrega atrasada - mesmo casamento pelo nome com o cronograma do Planejamento e mesmo calculo automatico ja usado na propria EAP (Passo 5, secao 6.4.1).</w:t>
+        <w:t xml:space="preserve">Entregas da EAP (portfolio): % de entregas (nivel 2) concluidas somando todas as EAPs cadastradas, e em quantos projetos existe pelo menos uma entrega atrasada - mesmo casamento pelo nome com o cronograma do </w:t>
+      </w:r>
+      <w:r>
+        <w:rPr>
+          <w:rFonts w:ascii="Montserrat" w:hAnsi="Montserrat"/>
+          <w:color w:val="1A1A1A"/>
+          <w:sz w:val="22"/>
+        </w:rPr>
+        <w:lastRenderedPageBreak/>
+        <w:t>Planejamento e mesmo calculo automatico ja usado na propria EAP (Passo 5, secao 6.4.1).</w:t>
       </w:r>
     </w:p>
     <w:p>
@@ -20767,18 +20824,17 @@
         <w:rPr>
           <w:noProof/>
         </w:rPr>
-        <w:lastRenderedPageBreak/>
         <w:drawing>
-          <wp:inline distT="0" distB="0" distL="0" distR="0" wp14:anchorId="4D23F8D3" wp14:editId="7DBA0530">
+          <wp:inline distT="0" distB="0" distL="0" distR="0" wp14:anchorId="410BD6D8" wp14:editId="3F6C6674">
             <wp:extent cx="5303520" cy="4267180"/>
             <wp:effectExtent l="19050" t="19050" r="11430" b="19685"/>
-            <wp:docPr id="808959969" name="Imagem 50"/>
+            <wp:docPr id="921670672" name="Imagem 50"/>
             <wp:cNvGraphicFramePr/>
             <a:graphic xmlns:a="http://schemas.openxmlformats.org/drawingml/2006/main">
               <a:graphicData uri="http://schemas.openxmlformats.org/drawingml/2006/picture">
                 <pic:pic xmlns:pic="http://schemas.openxmlformats.org/drawingml/2006/picture">
                   <pic:nvPicPr>
-                    <pic:cNvPr id="808959969" name=""/>
+                    <pic:cNvPr id="921670672" name=""/>
                     <pic:cNvPicPr/>
                   </pic:nvPicPr>
                   <pic:blipFill>
@@ -20832,6 +20888,7 @@
           <w:color w:val="6A6A70"/>
           <w:sz w:val="19"/>
         </w:rPr>
+        <w:lastRenderedPageBreak/>
         <w:t>Painel Executivo: Gates de aprovacao e indicadores de governanca do Relatorio de Situacao.</w:t>
       </w:r>
     </w:p>
@@ -20844,18 +20901,17 @@
         <w:rPr>
           <w:noProof/>
         </w:rPr>
-        <w:lastRenderedPageBreak/>
         <w:drawing>
-          <wp:inline distT="0" distB="0" distL="0" distR="0" wp14:anchorId="01C3D825" wp14:editId="2467BBD5">
+          <wp:inline distT="0" distB="0" distL="0" distR="0" wp14:anchorId="64A3EB5F" wp14:editId="4D26AB17">
             <wp:extent cx="5303520" cy="3382059"/>
             <wp:effectExtent l="19050" t="19050" r="11430" b="27940"/>
-            <wp:docPr id="322404471" name="Imagem 51"/>
+            <wp:docPr id="45547024" name="Imagem 51"/>
             <wp:cNvGraphicFramePr/>
             <a:graphic xmlns:a="http://schemas.openxmlformats.org/drawingml/2006/main">
               <a:graphicData uri="http://schemas.openxmlformats.org/drawingml/2006/picture">
                 <pic:pic xmlns:pic="http://schemas.openxmlformats.org/drawingml/2006/picture">
                   <pic:nvPicPr>
-                    <pic:cNvPr id="322404471" name=""/>
+                    <pic:cNvPr id="45547024" name=""/>
                     <pic:cNvPicPr/>
                   </pic:nvPicPr>
                   <pic:blipFill>
@@ -20923,16 +20979,16 @@
         </w:rPr>
         <w:lastRenderedPageBreak/>
         <w:drawing>
-          <wp:inline distT="0" distB="0" distL="0" distR="0" wp14:anchorId="07296076" wp14:editId="3F2630D4">
+          <wp:inline distT="0" distB="0" distL="0" distR="0" wp14:anchorId="7B6A0D11" wp14:editId="71DACD1F">
             <wp:extent cx="5303520" cy="4417800"/>
             <wp:effectExtent l="19050" t="19050" r="11430" b="20955"/>
-            <wp:docPr id="549589073" name="Imagem 52"/>
+            <wp:docPr id="668687507" name="Imagem 52"/>
             <wp:cNvGraphicFramePr/>
             <a:graphic xmlns:a="http://schemas.openxmlformats.org/drawingml/2006/main">
               <a:graphicData uri="http://schemas.openxmlformats.org/drawingml/2006/picture">
                 <pic:pic xmlns:pic="http://schemas.openxmlformats.org/drawingml/2006/picture">
                   <pic:nvPicPr>
-                    <pic:cNvPr id="549589073" name=""/>
+                    <pic:cNvPr id="668687507" name=""/>
                     <pic:cNvPicPr/>
                   </pic:nvPicPr>
                   <pic:blipFill>
@@ -21042,7 +21098,7 @@
           <w:sz w:val="27"/>
         </w:rPr>
       </w:pPr>
-      <w:bookmarkStart w:id="45" w:name="_Toc240373156"/>
+      <w:bookmarkStart w:id="45" w:name="_Toc240376206"/>
       <w:r>
         <w:rPr>
           <w:rFonts w:ascii="Montserrat" w:hAnsi="Montserrat"/>
@@ -21308,16 +21364,16 @@
         </w:rPr>
         <w:lastRenderedPageBreak/>
         <w:drawing>
-          <wp:inline distT="0" distB="0" distL="0" distR="0" wp14:anchorId="7EC8E6D9" wp14:editId="6612E7DA">
+          <wp:inline distT="0" distB="0" distL="0" distR="0" wp14:anchorId="11126899" wp14:editId="296FAFAF">
             <wp:extent cx="5303520" cy="7628836"/>
             <wp:effectExtent l="19050" t="19050" r="11430" b="10795"/>
-            <wp:docPr id="1858892871" name="Imagem 53"/>
+            <wp:docPr id="194882784" name="Imagem 53"/>
             <wp:cNvGraphicFramePr/>
             <a:graphic xmlns:a="http://schemas.openxmlformats.org/drawingml/2006/main">
               <a:graphicData uri="http://schemas.openxmlformats.org/drawingml/2006/picture">
                 <pic:pic xmlns:pic="http://schemas.openxmlformats.org/drawingml/2006/picture">
                   <pic:nvPicPr>
-                    <pic:cNvPr id="1858892871" name=""/>
+                    <pic:cNvPr id="194882784" name=""/>
                     <pic:cNvPicPr/>
                   </pic:nvPicPr>
                   <pic:blipFill>
@@ -21449,7 +21505,7 @@
           <w:sz w:val="27"/>
         </w:rPr>
       </w:pPr>
-      <w:bookmarkStart w:id="46" w:name="_Toc240373157"/>
+      <w:bookmarkStart w:id="46" w:name="_Toc240376207"/>
       <w:r>
         <w:rPr>
           <w:rFonts w:ascii="Montserrat" w:hAnsi="Montserrat"/>
@@ -21560,7 +21616,7 @@
           <w:sz w:val="27"/>
         </w:rPr>
       </w:pPr>
-      <w:bookmarkStart w:id="47" w:name="_Toc240373158"/>
+      <w:bookmarkStart w:id="47" w:name="_Toc240376208"/>
       <w:r>
         <w:rPr>
           <w:rFonts w:ascii="Montserrat" w:hAnsi="Montserrat"/>
@@ -21757,7 +21813,7 @@
           <w:sz w:val="27"/>
         </w:rPr>
       </w:pPr>
-      <w:bookmarkStart w:id="48" w:name="_Toc240373159"/>
+      <w:bookmarkStart w:id="48" w:name="_Toc240376209"/>
       <w:r>
         <w:rPr>
           <w:rFonts w:ascii="Montserrat" w:hAnsi="Montserrat"/>
@@ -21910,7 +21966,7 @@
           <w:sz w:val="27"/>
         </w:rPr>
       </w:pPr>
-      <w:bookmarkStart w:id="49" w:name="_Toc240373160"/>
+      <w:bookmarkStart w:id="49" w:name="_Toc240376210"/>
       <w:r>
         <w:rPr>
           <w:rFonts w:ascii="Montserrat" w:hAnsi="Montserrat"/>
@@ -22203,16 +22259,16 @@
           <w:noProof/>
         </w:rPr>
         <w:drawing>
-          <wp:inline distT="0" distB="0" distL="0" distR="0" wp14:anchorId="212A39B5" wp14:editId="1B110981">
+          <wp:inline distT="0" distB="0" distL="0" distR="0" wp14:anchorId="37CE78DF" wp14:editId="78676F0C">
             <wp:extent cx="5303520" cy="1351384"/>
             <wp:effectExtent l="19050" t="19050" r="11430" b="20320"/>
-            <wp:docPr id="1772774793" name="Imagem 54"/>
+            <wp:docPr id="257592931" name="Imagem 54"/>
             <wp:cNvGraphicFramePr/>
             <a:graphic xmlns:a="http://schemas.openxmlformats.org/drawingml/2006/main">
               <a:graphicData uri="http://schemas.openxmlformats.org/drawingml/2006/picture">
                 <pic:pic xmlns:pic="http://schemas.openxmlformats.org/drawingml/2006/picture">
                   <pic:nvPicPr>
-                    <pic:cNvPr id="1772774793" name=""/>
+                    <pic:cNvPr id="257592931" name=""/>
                     <pic:cNvPicPr/>
                   </pic:nvPicPr>
                   <pic:blipFill>
@@ -22280,7 +22336,7 @@
           <w:sz w:val="27"/>
         </w:rPr>
       </w:pPr>
-      <w:bookmarkStart w:id="50" w:name="_Toc240373161"/>
+      <w:bookmarkStart w:id="50" w:name="_Toc240376211"/>
       <w:r>
         <w:rPr>
           <w:rFonts w:ascii="Montserrat" w:hAnsi="Montserrat"/>
@@ -22425,16 +22481,16 @@
           <w:noProof/>
         </w:rPr>
         <w:drawing>
-          <wp:inline distT="0" distB="0" distL="0" distR="0" wp14:anchorId="3B5E8B24" wp14:editId="6DC32BD8">
+          <wp:inline distT="0" distB="0" distL="0" distR="0" wp14:anchorId="3D7BCD44" wp14:editId="49E9AF27">
             <wp:extent cx="5303520" cy="1422793"/>
             <wp:effectExtent l="19050" t="19050" r="11430" b="25400"/>
-            <wp:docPr id="1906000879" name="Imagem 55"/>
+            <wp:docPr id="341980309" name="Imagem 55"/>
             <wp:cNvGraphicFramePr/>
             <a:graphic xmlns:a="http://schemas.openxmlformats.org/drawingml/2006/main">
               <a:graphicData uri="http://schemas.openxmlformats.org/drawingml/2006/picture">
                 <pic:pic xmlns:pic="http://schemas.openxmlformats.org/drawingml/2006/picture">
                   <pic:nvPicPr>
-                    <pic:cNvPr id="1906000879" name=""/>
+                    <pic:cNvPr id="341980309" name=""/>
                     <pic:cNvPicPr/>
                   </pic:nvPicPr>
                   <pic:blipFill>
@@ -22598,16 +22654,16 @@
           <w:noProof/>
         </w:rPr>
         <w:drawing>
-          <wp:inline distT="0" distB="0" distL="0" distR="0" wp14:anchorId="5504CE4F" wp14:editId="350A4FFF">
+          <wp:inline distT="0" distB="0" distL="0" distR="0" wp14:anchorId="5B386B25" wp14:editId="7573B720">
             <wp:extent cx="5303520" cy="1841050"/>
             <wp:effectExtent l="19050" t="19050" r="11430" b="26035"/>
-            <wp:docPr id="1074097155" name="Imagem 56"/>
+            <wp:docPr id="1752879795" name="Imagem 56"/>
             <wp:cNvGraphicFramePr/>
             <a:graphic xmlns:a="http://schemas.openxmlformats.org/drawingml/2006/main">
               <a:graphicData uri="http://schemas.openxmlformats.org/drawingml/2006/picture">
                 <pic:pic xmlns:pic="http://schemas.openxmlformats.org/drawingml/2006/picture">
                   <pic:nvPicPr>
-                    <pic:cNvPr id="1074097155" name=""/>
+                    <pic:cNvPr id="1752879795" name=""/>
                     <pic:cNvPicPr/>
                   </pic:nvPicPr>
                   <pic:blipFill>
@@ -22761,16 +22817,16 @@
           <w:noProof/>
         </w:rPr>
         <w:drawing>
-          <wp:inline distT="0" distB="0" distL="0" distR="0" wp14:anchorId="2625075E" wp14:editId="38E70465">
+          <wp:inline distT="0" distB="0" distL="0" distR="0" wp14:anchorId="61F80C24" wp14:editId="562EC9E8">
             <wp:extent cx="5303520" cy="303041"/>
             <wp:effectExtent l="19050" t="19050" r="11430" b="20955"/>
-            <wp:docPr id="1311697229" name="Imagem 57"/>
+            <wp:docPr id="995131327" name="Imagem 57"/>
             <wp:cNvGraphicFramePr/>
             <a:graphic xmlns:a="http://schemas.openxmlformats.org/drawingml/2006/main">
               <a:graphicData uri="http://schemas.openxmlformats.org/drawingml/2006/picture">
                 <pic:pic xmlns:pic="http://schemas.openxmlformats.org/drawingml/2006/picture">
                   <pic:nvPicPr>
-                    <pic:cNvPr id="1311697229" name=""/>
+                    <pic:cNvPr id="995131327" name=""/>
                     <pic:cNvPicPr/>
                   </pic:nvPicPr>
                   <pic:blipFill>
@@ -22838,16 +22894,16 @@
         </w:rPr>
         <w:lastRenderedPageBreak/>
         <w:drawing>
-          <wp:inline distT="0" distB="0" distL="0" distR="0" wp14:anchorId="1150E12F" wp14:editId="7B7FEFF6">
+          <wp:inline distT="0" distB="0" distL="0" distR="0" wp14:anchorId="395A2E4E" wp14:editId="006EE173">
             <wp:extent cx="5303520" cy="2983005"/>
             <wp:effectExtent l="19050" t="19050" r="11430" b="27305"/>
-            <wp:docPr id="22758070" name="Imagem 58"/>
+            <wp:docPr id="892602547" name="Imagem 58"/>
             <wp:cNvGraphicFramePr/>
             <a:graphic xmlns:a="http://schemas.openxmlformats.org/drawingml/2006/main">
               <a:graphicData uri="http://schemas.openxmlformats.org/drawingml/2006/picture">
                 <pic:pic xmlns:pic="http://schemas.openxmlformats.org/drawingml/2006/picture">
                   <pic:nvPicPr>
-                    <pic:cNvPr id="22758070" name=""/>
+                    <pic:cNvPr id="892602547" name=""/>
                     <pic:cNvPicPr/>
                   </pic:nvPicPr>
                   <pic:blipFill>
@@ -22919,7 +22975,7 @@
           <w:sz w:val="34"/>
         </w:rPr>
       </w:pPr>
-      <w:bookmarkStart w:id="51" w:name="_Toc240373162"/>
+      <w:bookmarkStart w:id="51" w:name="_Toc240376212"/>
       <w:r>
         <w:rPr>
           <w:rFonts w:ascii="Montserrat" w:hAnsi="Montserrat"/>
@@ -23163,7 +23219,7 @@
           <w:sz w:val="34"/>
         </w:rPr>
       </w:pPr>
-      <w:bookmarkStart w:id="52" w:name="_Toc240373163"/>
+      <w:bookmarkStart w:id="52" w:name="_Toc240376213"/>
       <w:r>
         <w:rPr>
           <w:rFonts w:ascii="Montserrat" w:hAnsi="Montserrat"/>
@@ -24951,7 +25007,7 @@
 <file path=word/numbering.xml><?xml version="1.0" encoding="utf-8"?>
 <w:numbering xmlns:wpc="http://schemas.microsoft.com/office/word/2010/wordprocessingCanvas" xmlns:cx="http://schemas.microsoft.com/office/drawing/2014/chartex" xmlns:cx1="http://schemas.microsoft.com/office/drawing/2015/9/8/chartex" xmlns:cx2="http://schemas.microsoft.com/office/drawing/2015/10/21/chartex" xmlns:cx3="http://schemas.microsoft.com/office/drawing/2016/5/9/chartex" xmlns:cx4="http://schemas.microsoft.com/office/drawing/2016/5/10/chartex" xmlns:cx5="http://schemas.microsoft.com/office/drawing/2016/5/11/chartex" xmlns:cx6="http://schemas.microsoft.com/office/drawing/2016/5/12/chartex" xmlns:cx7="http://schemas.microsoft.com/office/drawing/2016/5/13/chartex" xmlns:cx8="http://schemas.microsoft.com/office/drawing/2016/5/14/chartex" xmlns:mc="http://schemas.openxmlformats.org/markup-compatibility/2006" xmlns:aink="http://schemas.microsoft.com/office/drawing/2016/ink" xmlns:am3d="http://schemas.microsoft.com/office/drawing/2017/model3d" xmlns:o="urn:schemas-microsoft-com:office:office" xmlns:oel="http://schemas.microsoft.com/office/2019/extlst" xmlns:r="http://schemas.openxmlformats.org/officeDocument/2006/relationships" xmlns:m="http://schemas.openxmlformats.org/officeDocument/2006/math" xmlns:v="urn:schemas-microsoft-com:vml" xmlns:wp14="http://schemas.microsoft.com/office/word/2010/wordprocessingDrawing" xmlns:wp="http://schemas.openxmlformats.org/drawingml/2006/wordprocessingDrawing" xmlns:w10="urn:schemas-microsoft-com:office:word" xmlns:w="http://schemas.openxmlformats.org/wordprocessingml/2006/main" xmlns:w14="http://schemas.microsoft.com/office/word/2010/wordml" xmlns:w15="http://schemas.microsoft.com/office/word/2012/wordml" xmlns:w16cex="http://schemas.microsoft.com/office/word/2018/wordml/cex" xmlns:w16cid="http://schemas.microsoft.com/office/word/2016/wordml/cid" xmlns:w16="http://schemas.microsoft.com/office/word/2018/wordml" xmlns:w16du="http://schemas.microsoft.com/office/word/2023/wordml/word16du" xmlns:w16sdtdh="http://schemas.microsoft.com/office/word/2020/wordml/sdtdatahash" xmlns:w16sdtfl="http://schemas.microsoft.com/office/word/2024/wordml/sdtformatlock" xmlns:w16se="http://schemas.microsoft.com/office/word/2015/wordml/symex" xmlns:wpg="http://schemas.microsoft.com/office/word/2010/wordprocessingGroup" xmlns:wpi="http://schemas.microsoft.com/office/word/2010/wordprocessingInk" xmlns:wne="http://schemas.microsoft.com/office/word/2006/wordml" xmlns:wps="http://schemas.microsoft.com/office/word/2010/wordprocessingShape" mc:Ignorable="w14 w15 w16se w16cid w16 w16cex w16sdtdh w16sdtfl w16du wp14">
   <w:abstractNum w:abstractNumId="0" w15:restartNumberingAfterBreak="0">
-    <w:nsid w:val="02744266"/>
+    <w:nsid w:val="00E33A19"/>
     <w:multiLevelType w:val="singleLevel"/>
     <w:tmpl w:val="04160001"/>
     <w:lvl w:ilvl="0">
@@ -24968,7 +25024,7 @@
     </w:lvl>
   </w:abstractNum>
   <w:abstractNum w:abstractNumId="1" w15:restartNumberingAfterBreak="0">
-    <w:nsid w:val="044328C2"/>
+    <w:nsid w:val="04387FD3"/>
     <w:multiLevelType w:val="singleLevel"/>
     <w:tmpl w:val="04160001"/>
     <w:lvl w:ilvl="0">
@@ -24985,7 +25041,7 @@
     </w:lvl>
   </w:abstractNum>
   <w:abstractNum w:abstractNumId="2" w15:restartNumberingAfterBreak="0">
-    <w:nsid w:val="05EB4104"/>
+    <w:nsid w:val="07602B20"/>
     <w:multiLevelType w:val="singleLevel"/>
     <w:tmpl w:val="04160001"/>
     <w:lvl w:ilvl="0">
@@ -25002,7 +25058,7 @@
     </w:lvl>
   </w:abstractNum>
   <w:abstractNum w:abstractNumId="3" w15:restartNumberingAfterBreak="0">
-    <w:nsid w:val="08DC1E7B"/>
+    <w:nsid w:val="08C40370"/>
     <w:multiLevelType w:val="singleLevel"/>
     <w:tmpl w:val="04160001"/>
     <w:lvl w:ilvl="0">
@@ -25019,7 +25075,7 @@
     </w:lvl>
   </w:abstractNum>
   <w:abstractNum w:abstractNumId="4" w15:restartNumberingAfterBreak="0">
-    <w:nsid w:val="0BA85592"/>
+    <w:nsid w:val="0D051AEF"/>
     <w:multiLevelType w:val="singleLevel"/>
     <w:tmpl w:val="04160001"/>
     <w:lvl w:ilvl="0">
@@ -25036,7 +25092,7 @@
     </w:lvl>
   </w:abstractNum>
   <w:abstractNum w:abstractNumId="5" w15:restartNumberingAfterBreak="0">
-    <w:nsid w:val="0C931354"/>
+    <w:nsid w:val="11F16D66"/>
     <w:multiLevelType w:val="singleLevel"/>
     <w:tmpl w:val="04160001"/>
     <w:lvl w:ilvl="0">
@@ -25053,7 +25109,7 @@
     </w:lvl>
   </w:abstractNum>
   <w:abstractNum w:abstractNumId="6" w15:restartNumberingAfterBreak="0">
-    <w:nsid w:val="0FB66E6C"/>
+    <w:nsid w:val="1409627B"/>
     <w:multiLevelType w:val="singleLevel"/>
     <w:tmpl w:val="04160001"/>
     <w:lvl w:ilvl="0">
@@ -25070,7 +25126,7 @@
     </w:lvl>
   </w:abstractNum>
   <w:abstractNum w:abstractNumId="7" w15:restartNumberingAfterBreak="0">
-    <w:nsid w:val="12B6016F"/>
+    <w:nsid w:val="155D397F"/>
     <w:multiLevelType w:val="singleLevel"/>
     <w:tmpl w:val="04160001"/>
     <w:lvl w:ilvl="0">
@@ -25087,7 +25143,7 @@
     </w:lvl>
   </w:abstractNum>
   <w:abstractNum w:abstractNumId="8" w15:restartNumberingAfterBreak="0">
-    <w:nsid w:val="16310F04"/>
+    <w:nsid w:val="182452EB"/>
     <w:multiLevelType w:val="singleLevel"/>
     <w:tmpl w:val="04160001"/>
     <w:lvl w:ilvl="0">
@@ -25104,7 +25160,7 @@
     </w:lvl>
   </w:abstractNum>
   <w:abstractNum w:abstractNumId="9" w15:restartNumberingAfterBreak="0">
-    <w:nsid w:val="1C436144"/>
+    <w:nsid w:val="18ED7301"/>
     <w:multiLevelType w:val="singleLevel"/>
     <w:tmpl w:val="04160001"/>
     <w:lvl w:ilvl="0">
@@ -25121,7 +25177,7 @@
     </w:lvl>
   </w:abstractNum>
   <w:abstractNum w:abstractNumId="10" w15:restartNumberingAfterBreak="0">
-    <w:nsid w:val="25EA37A0"/>
+    <w:nsid w:val="1CF11208"/>
     <w:multiLevelType w:val="singleLevel"/>
     <w:tmpl w:val="04160001"/>
     <w:lvl w:ilvl="0">
@@ -25138,7 +25194,7 @@
     </w:lvl>
   </w:abstractNum>
   <w:abstractNum w:abstractNumId="11" w15:restartNumberingAfterBreak="0">
-    <w:nsid w:val="2BB33176"/>
+    <w:nsid w:val="1FCF1044"/>
     <w:multiLevelType w:val="singleLevel"/>
     <w:tmpl w:val="04160001"/>
     <w:lvl w:ilvl="0">
@@ -25155,7 +25211,7 @@
     </w:lvl>
   </w:abstractNum>
   <w:abstractNum w:abstractNumId="12" w15:restartNumberingAfterBreak="0">
-    <w:nsid w:val="30C24068"/>
+    <w:nsid w:val="220D7C5D"/>
     <w:multiLevelType w:val="singleLevel"/>
     <w:tmpl w:val="04160001"/>
     <w:lvl w:ilvl="0">
@@ -25172,7 +25228,7 @@
     </w:lvl>
   </w:abstractNum>
   <w:abstractNum w:abstractNumId="13" w15:restartNumberingAfterBreak="0">
-    <w:nsid w:val="32B036F6"/>
+    <w:nsid w:val="24AD2B66"/>
     <w:multiLevelType w:val="singleLevel"/>
     <w:tmpl w:val="04160001"/>
     <w:lvl w:ilvl="0">
@@ -25189,7 +25245,7 @@
     </w:lvl>
   </w:abstractNum>
   <w:abstractNum w:abstractNumId="14" w15:restartNumberingAfterBreak="0">
-    <w:nsid w:val="34E918C5"/>
+    <w:nsid w:val="2516032D"/>
     <w:multiLevelType w:val="singleLevel"/>
     <w:tmpl w:val="04160001"/>
     <w:lvl w:ilvl="0">
@@ -25206,7 +25262,7 @@
     </w:lvl>
   </w:abstractNum>
   <w:abstractNum w:abstractNumId="15" w15:restartNumberingAfterBreak="0">
-    <w:nsid w:val="3A4A7417"/>
+    <w:nsid w:val="297A798D"/>
     <w:multiLevelType w:val="singleLevel"/>
     <w:tmpl w:val="04160001"/>
     <w:lvl w:ilvl="0">
@@ -25223,7 +25279,7 @@
     </w:lvl>
   </w:abstractNum>
   <w:abstractNum w:abstractNumId="16" w15:restartNumberingAfterBreak="0">
-    <w:nsid w:val="3B6543D1"/>
+    <w:nsid w:val="2F854B97"/>
     <w:multiLevelType w:val="singleLevel"/>
     <w:tmpl w:val="04160001"/>
     <w:lvl w:ilvl="0">
@@ -25240,7 +25296,7 @@
     </w:lvl>
   </w:abstractNum>
   <w:abstractNum w:abstractNumId="17" w15:restartNumberingAfterBreak="0">
-    <w:nsid w:val="3B6C53A0"/>
+    <w:nsid w:val="307E088B"/>
     <w:multiLevelType w:val="singleLevel"/>
     <w:tmpl w:val="04160001"/>
     <w:lvl w:ilvl="0">
@@ -25257,7 +25313,7 @@
     </w:lvl>
   </w:abstractNum>
   <w:abstractNum w:abstractNumId="18" w15:restartNumberingAfterBreak="0">
-    <w:nsid w:val="3B7D5C03"/>
+    <w:nsid w:val="32005684"/>
     <w:multiLevelType w:val="singleLevel"/>
     <w:tmpl w:val="04160001"/>
     <w:lvl w:ilvl="0">
@@ -25274,7 +25330,7 @@
     </w:lvl>
   </w:abstractNum>
   <w:abstractNum w:abstractNumId="19" w15:restartNumberingAfterBreak="0">
-    <w:nsid w:val="3BA31F31"/>
+    <w:nsid w:val="362D1F90"/>
     <w:multiLevelType w:val="singleLevel"/>
     <w:tmpl w:val="04160001"/>
     <w:lvl w:ilvl="0">
@@ -25291,7 +25347,7 @@
     </w:lvl>
   </w:abstractNum>
   <w:abstractNum w:abstractNumId="20" w15:restartNumberingAfterBreak="0">
-    <w:nsid w:val="3BCD6C08"/>
+    <w:nsid w:val="3C1A78DA"/>
     <w:multiLevelType w:val="singleLevel"/>
     <w:tmpl w:val="04160001"/>
     <w:lvl w:ilvl="0">
@@ -25308,7 +25364,7 @@
     </w:lvl>
   </w:abstractNum>
   <w:abstractNum w:abstractNumId="21" w15:restartNumberingAfterBreak="0">
-    <w:nsid w:val="48B45D47"/>
+    <w:nsid w:val="3C3279A3"/>
     <w:multiLevelType w:val="singleLevel"/>
     <w:tmpl w:val="04160001"/>
     <w:lvl w:ilvl="0">
@@ -25325,7 +25381,7 @@
     </w:lvl>
   </w:abstractNum>
   <w:abstractNum w:abstractNumId="22" w15:restartNumberingAfterBreak="0">
-    <w:nsid w:val="494527EE"/>
+    <w:nsid w:val="3D3B32B5"/>
     <w:multiLevelType w:val="singleLevel"/>
     <w:tmpl w:val="04160001"/>
     <w:lvl w:ilvl="0">
@@ -25342,7 +25398,7 @@
     </w:lvl>
   </w:abstractNum>
   <w:abstractNum w:abstractNumId="23" w15:restartNumberingAfterBreak="0">
-    <w:nsid w:val="4B1E774E"/>
+    <w:nsid w:val="42AF0447"/>
     <w:multiLevelType w:val="singleLevel"/>
     <w:tmpl w:val="04160001"/>
     <w:lvl w:ilvl="0">
@@ -25359,7 +25415,7 @@
     </w:lvl>
   </w:abstractNum>
   <w:abstractNum w:abstractNumId="24" w15:restartNumberingAfterBreak="0">
-    <w:nsid w:val="4EA2725B"/>
+    <w:nsid w:val="473C0436"/>
     <w:multiLevelType w:val="singleLevel"/>
     <w:tmpl w:val="04160001"/>
     <w:lvl w:ilvl="0">
@@ -25376,7 +25432,7 @@
     </w:lvl>
   </w:abstractNum>
   <w:abstractNum w:abstractNumId="25" w15:restartNumberingAfterBreak="0">
-    <w:nsid w:val="4FC163AF"/>
+    <w:nsid w:val="4D213104"/>
     <w:multiLevelType w:val="singleLevel"/>
     <w:tmpl w:val="04160001"/>
     <w:lvl w:ilvl="0">
@@ -25393,7 +25449,7 @@
     </w:lvl>
   </w:abstractNum>
   <w:abstractNum w:abstractNumId="26" w15:restartNumberingAfterBreak="0">
-    <w:nsid w:val="56B80795"/>
+    <w:nsid w:val="4E0B5389"/>
     <w:multiLevelType w:val="singleLevel"/>
     <w:tmpl w:val="04160001"/>
     <w:lvl w:ilvl="0">
@@ -25410,7 +25466,7 @@
     </w:lvl>
   </w:abstractNum>
   <w:abstractNum w:abstractNumId="27" w15:restartNumberingAfterBreak="0">
-    <w:nsid w:val="5962563F"/>
+    <w:nsid w:val="5224765C"/>
     <w:multiLevelType w:val="singleLevel"/>
     <w:tmpl w:val="04160001"/>
     <w:lvl w:ilvl="0">
@@ -25427,7 +25483,7 @@
     </w:lvl>
   </w:abstractNum>
   <w:abstractNum w:abstractNumId="28" w15:restartNumberingAfterBreak="0">
-    <w:nsid w:val="5E3D0CAC"/>
+    <w:nsid w:val="57860B50"/>
     <w:multiLevelType w:val="singleLevel"/>
     <w:tmpl w:val="04160001"/>
     <w:lvl w:ilvl="0">
@@ -25444,7 +25500,7 @@
     </w:lvl>
   </w:abstractNum>
   <w:abstractNum w:abstractNumId="29" w15:restartNumberingAfterBreak="0">
-    <w:nsid w:val="5E5A75BD"/>
+    <w:nsid w:val="62465C36"/>
     <w:multiLevelType w:val="singleLevel"/>
     <w:tmpl w:val="04160001"/>
     <w:lvl w:ilvl="0">
@@ -25461,7 +25517,7 @@
     </w:lvl>
   </w:abstractNum>
   <w:abstractNum w:abstractNumId="30" w15:restartNumberingAfterBreak="0">
-    <w:nsid w:val="62AD5D65"/>
+    <w:nsid w:val="63A86D16"/>
     <w:multiLevelType w:val="singleLevel"/>
     <w:tmpl w:val="04160001"/>
     <w:lvl w:ilvl="0">
@@ -25478,7 +25534,7 @@
     </w:lvl>
   </w:abstractNum>
   <w:abstractNum w:abstractNumId="31" w15:restartNumberingAfterBreak="0">
-    <w:nsid w:val="670C0C03"/>
+    <w:nsid w:val="640024AA"/>
     <w:multiLevelType w:val="singleLevel"/>
     <w:tmpl w:val="04160001"/>
     <w:lvl w:ilvl="0">
@@ -25495,7 +25551,7 @@
     </w:lvl>
   </w:abstractNum>
   <w:abstractNum w:abstractNumId="32" w15:restartNumberingAfterBreak="0">
-    <w:nsid w:val="67D40986"/>
+    <w:nsid w:val="6AA80F33"/>
     <w:multiLevelType w:val="singleLevel"/>
     <w:tmpl w:val="04160001"/>
     <w:lvl w:ilvl="0">
@@ -25512,7 +25568,7 @@
     </w:lvl>
   </w:abstractNum>
   <w:abstractNum w:abstractNumId="33" w15:restartNumberingAfterBreak="0">
-    <w:nsid w:val="6968014D"/>
+    <w:nsid w:val="6D47099E"/>
     <w:multiLevelType w:val="singleLevel"/>
     <w:tmpl w:val="04160001"/>
     <w:lvl w:ilvl="0">
@@ -25529,7 +25585,7 @@
     </w:lvl>
   </w:abstractNum>
   <w:abstractNum w:abstractNumId="34" w15:restartNumberingAfterBreak="0">
-    <w:nsid w:val="6C6B1913"/>
+    <w:nsid w:val="6D5226F2"/>
     <w:multiLevelType w:val="singleLevel"/>
     <w:tmpl w:val="04160001"/>
     <w:lvl w:ilvl="0">
@@ -25546,7 +25602,7 @@
     </w:lvl>
   </w:abstractNum>
   <w:abstractNum w:abstractNumId="35" w15:restartNumberingAfterBreak="0">
-    <w:nsid w:val="6CD5053B"/>
+    <w:nsid w:val="75BD1CB5"/>
     <w:multiLevelType w:val="singleLevel"/>
     <w:tmpl w:val="04160001"/>
     <w:lvl w:ilvl="0">
@@ -25563,7 +25619,7 @@
     </w:lvl>
   </w:abstractNum>
   <w:abstractNum w:abstractNumId="36" w15:restartNumberingAfterBreak="0">
-    <w:nsid w:val="6D0E051C"/>
+    <w:nsid w:val="796B453F"/>
     <w:multiLevelType w:val="singleLevel"/>
     <w:tmpl w:val="04160001"/>
     <w:lvl w:ilvl="0">
@@ -25580,7 +25636,7 @@
     </w:lvl>
   </w:abstractNum>
   <w:abstractNum w:abstractNumId="37" w15:restartNumberingAfterBreak="0">
-    <w:nsid w:val="72880D2A"/>
+    <w:nsid w:val="79DE7E9F"/>
     <w:multiLevelType w:val="singleLevel"/>
     <w:tmpl w:val="04160001"/>
     <w:lvl w:ilvl="0">
@@ -25597,7 +25653,7 @@
     </w:lvl>
   </w:abstractNum>
   <w:abstractNum w:abstractNumId="38" w15:restartNumberingAfterBreak="0">
-    <w:nsid w:val="78C566A4"/>
+    <w:nsid w:val="7F763630"/>
     <w:multiLevelType w:val="singleLevel"/>
     <w:tmpl w:val="04160001"/>
     <w:lvl w:ilvl="0">
@@ -25613,122 +25669,122 @@
       </w:rPr>
     </w:lvl>
   </w:abstractNum>
-  <w:num w:numId="1" w16cid:durableId="711686651">
+  <w:num w:numId="1" w16cid:durableId="1038699721">
+    <w:abstractNumId w:val="3"/>
+  </w:num>
+  <w:num w:numId="2" w16cid:durableId="2030788900">
+    <w:abstractNumId w:val="30"/>
+  </w:num>
+  <w:num w:numId="3" w16cid:durableId="970331713">
+    <w:abstractNumId w:val="38"/>
+  </w:num>
+  <w:num w:numId="4" w16cid:durableId="476844917">
+    <w:abstractNumId w:val="11"/>
+  </w:num>
+  <w:num w:numId="5" w16cid:durableId="1045761389">
+    <w:abstractNumId w:val="19"/>
+  </w:num>
+  <w:num w:numId="6" w16cid:durableId="936139484">
+    <w:abstractNumId w:val="1"/>
+  </w:num>
+  <w:num w:numId="7" w16cid:durableId="346173733">
+    <w:abstractNumId w:val="5"/>
+  </w:num>
+  <w:num w:numId="8" w16cid:durableId="1985160231">
+    <w:abstractNumId w:val="7"/>
+  </w:num>
+  <w:num w:numId="9" w16cid:durableId="933635911">
+    <w:abstractNumId w:val="6"/>
+  </w:num>
+  <w:num w:numId="10" w16cid:durableId="708722431">
+    <w:abstractNumId w:val="34"/>
+  </w:num>
+  <w:num w:numId="11" w16cid:durableId="1466318614">
+    <w:abstractNumId w:val="0"/>
+  </w:num>
+  <w:num w:numId="12" w16cid:durableId="949049514">
+    <w:abstractNumId w:val="24"/>
+  </w:num>
+  <w:num w:numId="13" w16cid:durableId="755640014">
+    <w:abstractNumId w:val="35"/>
+  </w:num>
+  <w:num w:numId="14" w16cid:durableId="132800337">
     <w:abstractNumId w:val="37"/>
   </w:num>
-  <w:num w:numId="2" w16cid:durableId="2041083552">
+  <w:num w:numId="15" w16cid:durableId="1829713347">
     <w:abstractNumId w:val="16"/>
   </w:num>
-  <w:num w:numId="3" w16cid:durableId="1352074263">
+  <w:num w:numId="16" w16cid:durableId="1521549609">
+    <w:abstractNumId w:val="14"/>
+  </w:num>
+  <w:num w:numId="17" w16cid:durableId="707490815">
+    <w:abstractNumId w:val="26"/>
+  </w:num>
+  <w:num w:numId="18" w16cid:durableId="2029790353">
+    <w:abstractNumId w:val="2"/>
+  </w:num>
+  <w:num w:numId="19" w16cid:durableId="1747070852">
+    <w:abstractNumId w:val="8"/>
+  </w:num>
+  <w:num w:numId="20" w16cid:durableId="1291394991">
+    <w:abstractNumId w:val="21"/>
+  </w:num>
+  <w:num w:numId="21" w16cid:durableId="1049959270">
+    <w:abstractNumId w:val="23"/>
+  </w:num>
+  <w:num w:numId="22" w16cid:durableId="956331763">
+    <w:abstractNumId w:val="10"/>
+  </w:num>
+  <w:num w:numId="23" w16cid:durableId="1778480623">
+    <w:abstractNumId w:val="18"/>
+  </w:num>
+  <w:num w:numId="24" w16cid:durableId="147333919">
+    <w:abstractNumId w:val="13"/>
+  </w:num>
+  <w:num w:numId="25" w16cid:durableId="2114545722">
+    <w:abstractNumId w:val="28"/>
+  </w:num>
+  <w:num w:numId="26" w16cid:durableId="1391003518">
     <w:abstractNumId w:val="9"/>
   </w:num>
-  <w:num w:numId="4" w16cid:durableId="5982030">
-    <w:abstractNumId w:val="21"/>
+  <w:num w:numId="27" w16cid:durableId="85424487">
+    <w:abstractNumId w:val="22"/>
   </w:num>
-  <w:num w:numId="5" w16cid:durableId="125903420">
+  <w:num w:numId="28" w16cid:durableId="620914176">
+    <w:abstractNumId w:val="25"/>
+  </w:num>
+  <w:num w:numId="29" w16cid:durableId="1588805874">
+    <w:abstractNumId w:val="27"/>
+  </w:num>
+  <w:num w:numId="30" w16cid:durableId="257955500">
+    <w:abstractNumId w:val="36"/>
+  </w:num>
+  <w:num w:numId="31" w16cid:durableId="1432119756">
     <w:abstractNumId w:val="4"/>
   </w:num>
-  <w:num w:numId="6" w16cid:durableId="259526275">
-    <w:abstractNumId w:val="30"/>
+  <w:num w:numId="32" w16cid:durableId="1838880990">
+    <w:abstractNumId w:val="15"/>
   </w:num>
-  <w:num w:numId="7" w16cid:durableId="1485318931">
-    <w:abstractNumId w:val="19"/>
+  <w:num w:numId="33" w16cid:durableId="1295018380">
+    <w:abstractNumId w:val="32"/>
   </w:num>
-  <w:num w:numId="8" w16cid:durableId="1746881859">
-    <w:abstractNumId w:val="24"/>
-  </w:num>
-  <w:num w:numId="9" w16cid:durableId="1479104026">
-    <w:abstractNumId w:val="36"/>
-  </w:num>
-  <w:num w:numId="10" w16cid:durableId="1102339616">
+  <w:num w:numId="34" w16cid:durableId="1949383554">
     <w:abstractNumId w:val="20"/>
   </w:num>
-  <w:num w:numId="11" w16cid:durableId="1345327585">
-    <w:abstractNumId w:val="3"/>
+  <w:num w:numId="35" w16cid:durableId="2058048868">
+    <w:abstractNumId w:val="12"/>
   </w:num>
-  <w:num w:numId="12" w16cid:durableId="112067728">
-    <w:abstractNumId w:val="17"/>
+  <w:num w:numId="36" w16cid:durableId="1780376004">
+    <w:abstractNumId w:val="29"/>
   </w:num>
-  <w:num w:numId="13" w16cid:durableId="1212228275">
-    <w:abstractNumId w:val="38"/>
-  </w:num>
-  <w:num w:numId="14" w16cid:durableId="2117289895">
-    <w:abstractNumId w:val="8"/>
-  </w:num>
-  <w:num w:numId="15" w16cid:durableId="387463166">
-    <w:abstractNumId w:val="26"/>
-  </w:num>
-  <w:num w:numId="16" w16cid:durableId="1905527168">
-    <w:abstractNumId w:val="13"/>
-  </w:num>
-  <w:num w:numId="17" w16cid:durableId="622150997">
-    <w:abstractNumId w:val="1"/>
-  </w:num>
-  <w:num w:numId="18" w16cid:durableId="405150976">
-    <w:abstractNumId w:val="14"/>
-  </w:num>
-  <w:num w:numId="19" w16cid:durableId="1855654327">
-    <w:abstractNumId w:val="34"/>
-  </w:num>
-  <w:num w:numId="20" w16cid:durableId="1963226605">
-    <w:abstractNumId w:val="27"/>
-  </w:num>
-  <w:num w:numId="21" w16cid:durableId="1627661533">
+  <w:num w:numId="37" w16cid:durableId="877594279">
     <w:abstractNumId w:val="33"/>
   </w:num>
-  <w:num w:numId="22" w16cid:durableId="344212748">
-    <w:abstractNumId w:val="6"/>
-  </w:num>
-  <w:num w:numId="23" w16cid:durableId="1976374632">
+  <w:num w:numId="38" w16cid:durableId="1550456962">
     <w:abstractNumId w:val="31"/>
   </w:num>
-  <w:num w:numId="24" w16cid:durableId="1356036194">
-    <w:abstractNumId w:val="10"/>
-  </w:num>
-  <w:num w:numId="25" w16cid:durableId="2092577465">
-    <w:abstractNumId w:val="7"/>
-  </w:num>
-  <w:num w:numId="26" w16cid:durableId="1620720077">
-    <w:abstractNumId w:val="11"/>
-  </w:num>
-  <w:num w:numId="27" w16cid:durableId="100996286">
-    <w:abstractNumId w:val="32"/>
-  </w:num>
-  <w:num w:numId="28" w16cid:durableId="1686204255">
-    <w:abstractNumId w:val="29"/>
-  </w:num>
-  <w:num w:numId="29" w16cid:durableId="1573806214">
-    <w:abstractNumId w:val="22"/>
-  </w:num>
-  <w:num w:numId="30" w16cid:durableId="769666389">
-    <w:abstractNumId w:val="23"/>
-  </w:num>
-  <w:num w:numId="31" w16cid:durableId="1785494921">
-    <w:abstractNumId w:val="25"/>
-  </w:num>
-  <w:num w:numId="32" w16cid:durableId="2121680521">
-    <w:abstractNumId w:val="15"/>
-  </w:num>
-  <w:num w:numId="33" w16cid:durableId="1442335172">
-    <w:abstractNumId w:val="12"/>
-  </w:num>
-  <w:num w:numId="34" w16cid:durableId="342897079">
-    <w:abstractNumId w:val="0"/>
-  </w:num>
-  <w:num w:numId="35" w16cid:durableId="182282890">
-    <w:abstractNumId w:val="2"/>
-  </w:num>
-  <w:num w:numId="36" w16cid:durableId="859195850">
-    <w:abstractNumId w:val="5"/>
-  </w:num>
-  <w:num w:numId="37" w16cid:durableId="2089617540">
-    <w:abstractNumId w:val="28"/>
-  </w:num>
-  <w:num w:numId="38" w16cid:durableId="141773499">
-    <w:abstractNumId w:val="18"/>
-  </w:num>
-  <w:num w:numId="39" w16cid:durableId="1101490565">
-    <w:abstractNumId w:val="35"/>
+  <w:num w:numId="39" w16cid:durableId="1837718821">
+    <w:abstractNumId w:val="17"/>
   </w:num>
 </w:numbering>
 </file>
@@ -26141,7 +26197,7 @@
     <w:link w:val="Ttulo1Char"/>
     <w:uiPriority w:val="9"/>
     <w:qFormat/>
-    <w:rsid w:val="004334E4"/>
+    <w:rsid w:val="005104B7"/>
     <w:pPr>
       <w:keepNext/>
       <w:keepLines/>
@@ -26163,7 +26219,7 @@
     <w:uiPriority w:val="9"/>
     <w:unhideWhenUsed/>
     <w:qFormat/>
-    <w:rsid w:val="004334E4"/>
+    <w:rsid w:val="005104B7"/>
     <w:pPr>
       <w:keepNext/>
       <w:keepLines/>
@@ -26186,7 +26242,7 @@
     <w:semiHidden/>
     <w:unhideWhenUsed/>
     <w:qFormat/>
-    <w:rsid w:val="004334E4"/>
+    <w:rsid w:val="005104B7"/>
     <w:pPr>
       <w:keepNext/>
       <w:keepLines/>
@@ -26209,7 +26265,7 @@
     <w:semiHidden/>
     <w:unhideWhenUsed/>
     <w:qFormat/>
-    <w:rsid w:val="004334E4"/>
+    <w:rsid w:val="005104B7"/>
     <w:pPr>
       <w:keepNext/>
       <w:keepLines/>
@@ -26232,7 +26288,7 @@
     <w:semiHidden/>
     <w:unhideWhenUsed/>
     <w:qFormat/>
-    <w:rsid w:val="004334E4"/>
+    <w:rsid w:val="005104B7"/>
     <w:pPr>
       <w:keepNext/>
       <w:keepLines/>
@@ -26253,7 +26309,7 @@
     <w:semiHidden/>
     <w:unhideWhenUsed/>
     <w:qFormat/>
-    <w:rsid w:val="004334E4"/>
+    <w:rsid w:val="005104B7"/>
     <w:pPr>
       <w:keepNext/>
       <w:keepLines/>
@@ -26276,7 +26332,7 @@
     <w:semiHidden/>
     <w:unhideWhenUsed/>
     <w:qFormat/>
-    <w:rsid w:val="004334E4"/>
+    <w:rsid w:val="005104B7"/>
     <w:pPr>
       <w:keepNext/>
       <w:keepLines/>
@@ -26297,7 +26353,7 @@
     <w:semiHidden/>
     <w:unhideWhenUsed/>
     <w:qFormat/>
-    <w:rsid w:val="004334E4"/>
+    <w:rsid w:val="005104B7"/>
     <w:pPr>
       <w:keepNext/>
       <w:keepLines/>
@@ -26320,7 +26376,7 @@
     <w:semiHidden/>
     <w:unhideWhenUsed/>
     <w:qFormat/>
-    <w:rsid w:val="004334E4"/>
+    <w:rsid w:val="005104B7"/>
     <w:pPr>
       <w:keepNext/>
       <w:keepLines/>
@@ -26364,7 +26420,7 @@
     <w:basedOn w:val="Fontepargpadro"/>
     <w:link w:val="Ttulo1"/>
     <w:uiPriority w:val="9"/>
-    <w:rsid w:val="004334E4"/>
+    <w:rsid w:val="005104B7"/>
     <w:rPr>
       <w:rFonts w:asciiTheme="majorHAnsi" w:eastAsiaTheme="majorEastAsia" w:hAnsiTheme="majorHAnsi" w:cstheme="majorBidi"/>
       <w:color w:val="0F4761" w:themeColor="accent1" w:themeShade="BF"/>
@@ -26377,7 +26433,7 @@
     <w:basedOn w:val="Fontepargpadro"/>
     <w:link w:val="Ttulo2"/>
     <w:uiPriority w:val="9"/>
-    <w:rsid w:val="004334E4"/>
+    <w:rsid w:val="005104B7"/>
     <w:rPr>
       <w:rFonts w:asciiTheme="majorHAnsi" w:eastAsiaTheme="majorEastAsia" w:hAnsiTheme="majorHAnsi" w:cstheme="majorBidi"/>
       <w:color w:val="0F4761" w:themeColor="accent1" w:themeShade="BF"/>
@@ -26391,7 +26447,7 @@
     <w:link w:val="Ttulo3"/>
     <w:uiPriority w:val="9"/>
     <w:semiHidden/>
-    <w:rsid w:val="004334E4"/>
+    <w:rsid w:val="005104B7"/>
     <w:rPr>
       <w:rFonts w:eastAsiaTheme="majorEastAsia" w:cstheme="majorBidi"/>
       <w:color w:val="0F4761" w:themeColor="accent1" w:themeShade="BF"/>
@@ -26405,7 +26461,7 @@
     <w:link w:val="Ttulo4"/>
     <w:uiPriority w:val="9"/>
     <w:semiHidden/>
-    <w:rsid w:val="004334E4"/>
+    <w:rsid w:val="005104B7"/>
     <w:rPr>
       <w:rFonts w:eastAsiaTheme="majorEastAsia" w:cstheme="majorBidi"/>
       <w:i/>
@@ -26419,7 +26475,7 @@
     <w:link w:val="Ttulo5"/>
     <w:uiPriority w:val="9"/>
     <w:semiHidden/>
-    <w:rsid w:val="004334E4"/>
+    <w:rsid w:val="005104B7"/>
     <w:rPr>
       <w:rFonts w:eastAsiaTheme="majorEastAsia" w:cstheme="majorBidi"/>
       <w:color w:val="0F4761" w:themeColor="accent1" w:themeShade="BF"/>
@@ -26431,7 +26487,7 @@
     <w:link w:val="Ttulo6"/>
     <w:uiPriority w:val="9"/>
     <w:semiHidden/>
-    <w:rsid w:val="004334E4"/>
+    <w:rsid w:val="005104B7"/>
     <w:rPr>
       <w:rFonts w:eastAsiaTheme="majorEastAsia" w:cstheme="majorBidi"/>
       <w:i/>
@@ -26445,7 +26501,7 @@
     <w:link w:val="Ttulo7"/>
     <w:uiPriority w:val="9"/>
     <w:semiHidden/>
-    <w:rsid w:val="004334E4"/>
+    <w:rsid w:val="005104B7"/>
     <w:rPr>
       <w:rFonts w:eastAsiaTheme="majorEastAsia" w:cstheme="majorBidi"/>
       <w:color w:val="595959" w:themeColor="text1" w:themeTint="A6"/>
@@ -26457,7 +26513,7 @@
     <w:link w:val="Ttulo8"/>
     <w:uiPriority w:val="9"/>
     <w:semiHidden/>
-    <w:rsid w:val="004334E4"/>
+    <w:rsid w:val="005104B7"/>
     <w:rPr>
       <w:rFonts w:eastAsiaTheme="majorEastAsia" w:cstheme="majorBidi"/>
       <w:i/>
@@ -26471,7 +26527,7 @@
     <w:link w:val="Ttulo9"/>
     <w:uiPriority w:val="9"/>
     <w:semiHidden/>
-    <w:rsid w:val="004334E4"/>
+    <w:rsid w:val="005104B7"/>
     <w:rPr>
       <w:rFonts w:eastAsiaTheme="majorEastAsia" w:cstheme="majorBidi"/>
       <w:color w:val="272727" w:themeColor="text1" w:themeTint="D8"/>
@@ -26484,7 +26540,7 @@
     <w:link w:val="TtuloChar"/>
     <w:uiPriority w:val="10"/>
     <w:qFormat/>
-    <w:rsid w:val="004334E4"/>
+    <w:rsid w:val="005104B7"/>
     <w:pPr>
       <w:spacing w:after="80" w:line="240" w:lineRule="auto"/>
       <w:contextualSpacing/>
@@ -26502,7 +26558,7 @@
     <w:basedOn w:val="Fontepargpadro"/>
     <w:link w:val="Ttulo"/>
     <w:uiPriority w:val="10"/>
-    <w:rsid w:val="004334E4"/>
+    <w:rsid w:val="005104B7"/>
     <w:rPr>
       <w:rFonts w:asciiTheme="majorHAnsi" w:eastAsiaTheme="majorEastAsia" w:hAnsiTheme="majorHAnsi" w:cstheme="majorBidi"/>
       <w:spacing w:val="-10"/>
@@ -26518,7 +26574,7 @@
     <w:link w:val="SubttuloChar"/>
     <w:uiPriority w:val="11"/>
     <w:qFormat/>
-    <w:rsid w:val="004334E4"/>
+    <w:rsid w:val="005104B7"/>
     <w:pPr>
       <w:numPr>
         <w:ilvl w:val="1"/>
@@ -26537,7 +26593,7 @@
     <w:basedOn w:val="Fontepargpadro"/>
     <w:link w:val="Subttulo"/>
     <w:uiPriority w:val="11"/>
-    <w:rsid w:val="004334E4"/>
+    <w:rsid w:val="005104B7"/>
     <w:rPr>
       <w:rFonts w:eastAsiaTheme="majorEastAsia" w:cstheme="majorBidi"/>
       <w:color w:val="595959" w:themeColor="text1" w:themeTint="A6"/>
@@ -26553,7 +26609,7 @@
     <w:link w:val="CitaoChar"/>
     <w:uiPriority w:val="29"/>
     <w:qFormat/>
-    <w:rsid w:val="004334E4"/>
+    <w:rsid w:val="005104B7"/>
     <w:pPr>
       <w:spacing w:before="160"/>
       <w:jc w:val="center"/>
@@ -26569,7 +26625,7 @@
     <w:basedOn w:val="Fontepargpadro"/>
     <w:link w:val="Citao"/>
     <w:uiPriority w:val="29"/>
-    <w:rsid w:val="004334E4"/>
+    <w:rsid w:val="005104B7"/>
     <w:rPr>
       <w:i/>
       <w:iCs/>
@@ -26581,7 +26637,7 @@
     <w:basedOn w:val="Normal"/>
     <w:uiPriority w:val="34"/>
     <w:qFormat/>
-    <w:rsid w:val="004334E4"/>
+    <w:rsid w:val="005104B7"/>
     <w:pPr>
       <w:ind w:left="720"/>
       <w:contextualSpacing/>
@@ -26592,7 +26648,7 @@
     <w:basedOn w:val="Fontepargpadro"/>
     <w:uiPriority w:val="21"/>
     <w:qFormat/>
-    <w:rsid w:val="004334E4"/>
+    <w:rsid w:val="005104B7"/>
     <w:rPr>
       <w:i/>
       <w:iCs/>
@@ -26606,7 +26662,7 @@
     <w:link w:val="CitaoIntensaChar"/>
     <w:uiPriority w:val="30"/>
     <w:qFormat/>
-    <w:rsid w:val="004334E4"/>
+    <w:rsid w:val="005104B7"/>
     <w:pPr>
       <w:pBdr>
         <w:top w:val="single" w:sz="4" w:space="10" w:color="0F4761" w:themeColor="accent1" w:themeShade="BF"/>
@@ -26627,7 +26683,7 @@
     <w:basedOn w:val="Fontepargpadro"/>
     <w:link w:val="CitaoIntensa"/>
     <w:uiPriority w:val="30"/>
-    <w:rsid w:val="004334E4"/>
+    <w:rsid w:val="005104B7"/>
     <w:rPr>
       <w:i/>
       <w:iCs/>
@@ -26639,7 +26695,7 @@
     <w:basedOn w:val="Fontepargpadro"/>
     <w:uiPriority w:val="32"/>
     <w:qFormat/>
-    <w:rsid w:val="004334E4"/>
+    <w:rsid w:val="005104B7"/>
     <w:rPr>
       <w:b/>
       <w:bCs/>
@@ -26654,7 +26710,7 @@
     <w:link w:val="CabealhoChar"/>
     <w:uiPriority w:val="99"/>
     <w:unhideWhenUsed/>
-    <w:rsid w:val="004334E4"/>
+    <w:rsid w:val="005104B7"/>
     <w:pPr>
       <w:tabs>
         <w:tab w:val="center" w:pos="4252"/>
@@ -26668,7 +26724,7 @@
     <w:basedOn w:val="Fontepargpadro"/>
     <w:link w:val="Cabealho"/>
     <w:uiPriority w:val="99"/>
-    <w:rsid w:val="004334E4"/>
+    <w:rsid w:val="005104B7"/>
   </w:style>
   <w:style w:type="paragraph" w:styleId="Rodap">
     <w:name w:val="footer"/>
@@ -26676,7 +26732,7 @@
     <w:link w:val="RodapChar"/>
     <w:uiPriority w:val="99"/>
     <w:unhideWhenUsed/>
-    <w:rsid w:val="004334E4"/>
+    <w:rsid w:val="005104B7"/>
     <w:pPr>
       <w:tabs>
         <w:tab w:val="center" w:pos="4252"/>
@@ -26690,7 +26746,7 @@
     <w:basedOn w:val="Fontepargpadro"/>
     <w:link w:val="Rodap"/>
     <w:uiPriority w:val="99"/>
-    <w:rsid w:val="004334E4"/>
+    <w:rsid w:val="005104B7"/>
   </w:style>
   <w:style w:type="paragraph" w:styleId="Sumrio1">
     <w:name w:val="toc 1"/>
@@ -26699,7 +26755,7 @@
     <w:autoRedefine/>
     <w:uiPriority w:val="39"/>
     <w:unhideWhenUsed/>
-    <w:rsid w:val="004334E4"/>
+    <w:rsid w:val="005104B7"/>
     <w:pPr>
       <w:spacing w:after="100"/>
     </w:pPr>
@@ -26711,7 +26767,7 @@
     <w:autoRedefine/>
     <w:uiPriority w:val="39"/>
     <w:unhideWhenUsed/>
-    <w:rsid w:val="004334E4"/>
+    <w:rsid w:val="005104B7"/>
     <w:pPr>
       <w:spacing w:after="100"/>
       <w:ind w:left="240"/>

</xml_diff>